<commit_message>
Validation Design done pheeew that was esy
</commit_message>
<xml_diff>
--- a/Design.docx
+++ b/Design.docx
@@ -104,6 +104,9 @@
         <w:jc w:val="center"/>
       </w:pPr>
       <w:r>
+        <w:rPr>
+          <w:noProof/>
+        </w:rPr>
         <w:drawing>
           <wp:inline distT="0" distB="0" distL="0" distR="0" wp14:anchorId="7A33AE35" wp14:editId="2BAF158D">
             <wp:extent cx="5715000" cy="1428750"/>
@@ -157,27 +160,7 @@
           <w:sz w:val="20"/>
           <w:szCs w:val="20"/>
         </w:rPr>
-        <w:t xml:space="preserve">Initial </w:t>
-      </w:r>
-      <w:r>
-        <w:rPr>
-          <w:i/>
-          <w:iCs/>
-          <w:color w:val="595959"/>
-          <w:sz w:val="20"/>
-          <w:szCs w:val="20"/>
-        </w:rPr>
-        <w:t>ERD</w:t>
-      </w:r>
-      <w:r>
-        <w:rPr>
-          <w:i/>
-          <w:iCs/>
-          <w:color w:val="595959"/>
-          <w:sz w:val="20"/>
-          <w:szCs w:val="20"/>
-        </w:rPr>
-        <w:t xml:space="preserve"> showing the two many-to-many relationships</w:t>
+        <w:t>Initial ERD showing the two many-to-many relationships</w:t>
       </w:r>
     </w:p>
     <w:p>
@@ -219,6 +202,9 @@
         <w:jc w:val="center"/>
       </w:pPr>
       <w:r>
+        <w:rPr>
+          <w:noProof/>
+        </w:rPr>
         <w:drawing>
           <wp:inline distT="0" distB="0" distL="0" distR="0" wp14:anchorId="76DA8415" wp14:editId="380A0CDF">
             <wp:extent cx="5715000" cy="4400550"/>
@@ -479,12 +465,6 @@
         <w:gridCol w:w="1400"/>
       </w:tblGrid>
       <w:tr>
-        <w:tblPrEx>
-          <w:tblCellMar>
-            <w:top w:w="0" w:type="dxa"/>
-            <w:bottom w:w="0" w:type="dxa"/>
-          </w:tblCellMar>
-        </w:tblPrEx>
         <w:tc>
           <w:tcPr>
             <w:tcW w:w="2100" w:type="dxa"/>
@@ -602,12 +582,6 @@
         </w:tc>
       </w:tr>
       <w:tr>
-        <w:tblPrEx>
-          <w:tblCellMar>
-            <w:top w:w="0" w:type="dxa"/>
-            <w:bottom w:w="0" w:type="dxa"/>
-          </w:tblCellMar>
-        </w:tblPrEx>
         <w:tc>
           <w:tcPr>
             <w:tcW w:w="2100" w:type="dxa"/>
@@ -705,12 +679,6 @@
         </w:tc>
       </w:tr>
       <w:tr>
-        <w:tblPrEx>
-          <w:tblCellMar>
-            <w:top w:w="0" w:type="dxa"/>
-            <w:bottom w:w="0" w:type="dxa"/>
-          </w:tblCellMar>
-        </w:tblPrEx>
         <w:tc>
           <w:tcPr>
             <w:tcW w:w="2100" w:type="dxa"/>
@@ -815,12 +783,6 @@
         </w:tc>
       </w:tr>
       <w:tr>
-        <w:tblPrEx>
-          <w:tblCellMar>
-            <w:top w:w="0" w:type="dxa"/>
-            <w:bottom w:w="0" w:type="dxa"/>
-          </w:tblCellMar>
-        </w:tblPrEx>
         <w:tc>
           <w:tcPr>
             <w:tcW w:w="2100" w:type="dxa"/>
@@ -925,12 +887,6 @@
         </w:tc>
       </w:tr>
       <w:tr>
-        <w:tblPrEx>
-          <w:tblCellMar>
-            <w:top w:w="0" w:type="dxa"/>
-            <w:bottom w:w="0" w:type="dxa"/>
-          </w:tblCellMar>
-        </w:tblPrEx>
         <w:tc>
           <w:tcPr>
             <w:tcW w:w="2100" w:type="dxa"/>
@@ -1027,12 +983,6 @@
         </w:tc>
       </w:tr>
       <w:tr>
-        <w:tblPrEx>
-          <w:tblCellMar>
-            <w:top w:w="0" w:type="dxa"/>
-            <w:bottom w:w="0" w:type="dxa"/>
-          </w:tblCellMar>
-        </w:tblPrEx>
         <w:tc>
           <w:tcPr>
             <w:tcW w:w="2100" w:type="dxa"/>
@@ -1210,12 +1160,6 @@
         <w:gridCol w:w="1400"/>
       </w:tblGrid>
       <w:tr>
-        <w:tblPrEx>
-          <w:tblCellMar>
-            <w:top w:w="0" w:type="dxa"/>
-            <w:bottom w:w="0" w:type="dxa"/>
-          </w:tblCellMar>
-        </w:tblPrEx>
         <w:tc>
           <w:tcPr>
             <w:tcW w:w="2100" w:type="dxa"/>
@@ -1333,12 +1277,6 @@
         </w:tc>
       </w:tr>
       <w:tr>
-        <w:tblPrEx>
-          <w:tblCellMar>
-            <w:top w:w="0" w:type="dxa"/>
-            <w:bottom w:w="0" w:type="dxa"/>
-          </w:tblCellMar>
-        </w:tblPrEx>
         <w:tc>
           <w:tcPr>
             <w:tcW w:w="2100" w:type="dxa"/>
@@ -1435,12 +1373,6 @@
         </w:tc>
       </w:tr>
       <w:tr>
-        <w:tblPrEx>
-          <w:tblCellMar>
-            <w:top w:w="0" w:type="dxa"/>
-            <w:bottom w:w="0" w:type="dxa"/>
-          </w:tblCellMar>
-        </w:tblPrEx>
         <w:tc>
           <w:tcPr>
             <w:tcW w:w="2100" w:type="dxa"/>
@@ -1545,12 +1477,6 @@
         </w:tc>
       </w:tr>
       <w:tr>
-        <w:tblPrEx>
-          <w:tblCellMar>
-            <w:top w:w="0" w:type="dxa"/>
-            <w:bottom w:w="0" w:type="dxa"/>
-          </w:tblCellMar>
-        </w:tblPrEx>
         <w:tc>
           <w:tcPr>
             <w:tcW w:w="2100" w:type="dxa"/>
@@ -1720,12 +1646,6 @@
         <w:gridCol w:w="1400"/>
       </w:tblGrid>
       <w:tr>
-        <w:tblPrEx>
-          <w:tblCellMar>
-            <w:top w:w="0" w:type="dxa"/>
-            <w:bottom w:w="0" w:type="dxa"/>
-          </w:tblCellMar>
-        </w:tblPrEx>
         <w:tc>
           <w:tcPr>
             <w:tcW w:w="2100" w:type="dxa"/>
@@ -1843,12 +1763,6 @@
         </w:tc>
       </w:tr>
       <w:tr>
-        <w:tblPrEx>
-          <w:tblCellMar>
-            <w:top w:w="0" w:type="dxa"/>
-            <w:bottom w:w="0" w:type="dxa"/>
-          </w:tblCellMar>
-        </w:tblPrEx>
         <w:tc>
           <w:tcPr>
             <w:tcW w:w="2100" w:type="dxa"/>
@@ -1945,12 +1859,6 @@
         </w:tc>
       </w:tr>
       <w:tr>
-        <w:tblPrEx>
-          <w:tblCellMar>
-            <w:top w:w="0" w:type="dxa"/>
-            <w:bottom w:w="0" w:type="dxa"/>
-          </w:tblCellMar>
-        </w:tblPrEx>
         <w:tc>
           <w:tcPr>
             <w:tcW w:w="2100" w:type="dxa"/>
@@ -2063,12 +1971,6 @@
         </w:tc>
       </w:tr>
       <w:tr>
-        <w:tblPrEx>
-          <w:tblCellMar>
-            <w:top w:w="0" w:type="dxa"/>
-            <w:bottom w:w="0" w:type="dxa"/>
-          </w:tblCellMar>
-        </w:tblPrEx>
         <w:tc>
           <w:tcPr>
             <w:tcW w:w="2100" w:type="dxa"/>
@@ -2181,12 +2083,6 @@
         </w:tc>
       </w:tr>
       <w:tr>
-        <w:tblPrEx>
-          <w:tblCellMar>
-            <w:top w:w="0" w:type="dxa"/>
-            <w:bottom w:w="0" w:type="dxa"/>
-          </w:tblCellMar>
-        </w:tblPrEx>
         <w:tc>
           <w:tcPr>
             <w:tcW w:w="2100" w:type="dxa"/>
@@ -2283,12 +2179,6 @@
         </w:tc>
       </w:tr>
       <w:tr>
-        <w:tblPrEx>
-          <w:tblCellMar>
-            <w:top w:w="0" w:type="dxa"/>
-            <w:bottom w:w="0" w:type="dxa"/>
-          </w:tblCellMar>
-        </w:tblPrEx>
         <w:tc>
           <w:tcPr>
             <w:tcW w:w="2100" w:type="dxa"/>
@@ -2393,12 +2283,6 @@
         </w:tc>
       </w:tr>
       <w:tr>
-        <w:tblPrEx>
-          <w:tblCellMar>
-            <w:top w:w="0" w:type="dxa"/>
-            <w:bottom w:w="0" w:type="dxa"/>
-          </w:tblCellMar>
-        </w:tblPrEx>
         <w:tc>
           <w:tcPr>
             <w:tcW w:w="2100" w:type="dxa"/>
@@ -2568,16 +2452,10 @@
         <w:gridCol w:w="1400"/>
       </w:tblGrid>
       <w:tr>
-        <w:tblPrEx>
-          <w:tblCellMar>
-            <w:top w:w="0" w:type="dxa"/>
-            <w:bottom w:w="0" w:type="dxa"/>
-          </w:tblCellMar>
-        </w:tblPrEx>
         <w:tc>
           <w:tcPr>
             <w:tcW w:w="2100" w:type="dxa"/>
-            <w:shd w:val="clear" w:color="auto" w:fill="D9E2F3"/>
+            <w:shd w:val="clear" w:color="auto" w:fill="F2CEED" w:themeFill="accent5" w:themeFillTint="33"/>
             <w:tcMar>
               <w:top w:w="50" w:type="dxa"/>
               <w:left w:w="90" w:type="dxa"/>
@@ -2600,7 +2478,7 @@
         <w:tc>
           <w:tcPr>
             <w:tcW w:w="1450" w:type="dxa"/>
-            <w:shd w:val="clear" w:color="auto" w:fill="D9E2F3"/>
+            <w:shd w:val="clear" w:color="auto" w:fill="F2CEED" w:themeFill="accent5" w:themeFillTint="33"/>
             <w:tcMar>
               <w:top w:w="50" w:type="dxa"/>
               <w:left w:w="90" w:type="dxa"/>
@@ -2623,7 +2501,7 @@
         <w:tc>
           <w:tcPr>
             <w:tcW w:w="950" w:type="dxa"/>
-            <w:shd w:val="clear" w:color="auto" w:fill="D9E2F3"/>
+            <w:shd w:val="clear" w:color="auto" w:fill="F2CEED" w:themeFill="accent5" w:themeFillTint="33"/>
             <w:tcMar>
               <w:top w:w="50" w:type="dxa"/>
               <w:left w:w="90" w:type="dxa"/>
@@ -2646,7 +2524,7 @@
         <w:tc>
           <w:tcPr>
             <w:tcW w:w="3460" w:type="dxa"/>
-            <w:shd w:val="clear" w:color="auto" w:fill="D9E2F3"/>
+            <w:shd w:val="clear" w:color="auto" w:fill="F2CEED" w:themeFill="accent5" w:themeFillTint="33"/>
             <w:tcMar>
               <w:top w:w="50" w:type="dxa"/>
               <w:left w:w="90" w:type="dxa"/>
@@ -2669,7 +2547,7 @@
         <w:tc>
           <w:tcPr>
             <w:tcW w:w="1400" w:type="dxa"/>
-            <w:shd w:val="clear" w:color="auto" w:fill="D9E2F3"/>
+            <w:shd w:val="clear" w:color="auto" w:fill="F2CEED" w:themeFill="accent5" w:themeFillTint="33"/>
             <w:tcMar>
               <w:top w:w="50" w:type="dxa"/>
               <w:left w:w="90" w:type="dxa"/>
@@ -2691,12 +2569,6 @@
         </w:tc>
       </w:tr>
       <w:tr>
-        <w:tblPrEx>
-          <w:tblCellMar>
-            <w:top w:w="0" w:type="dxa"/>
-            <w:bottom w:w="0" w:type="dxa"/>
-          </w:tblCellMar>
-        </w:tblPrEx>
         <w:tc>
           <w:tcPr>
             <w:tcW w:w="2100" w:type="dxa"/>
@@ -2793,12 +2665,6 @@
         </w:tc>
       </w:tr>
       <w:tr>
-        <w:tblPrEx>
-          <w:tblCellMar>
-            <w:top w:w="0" w:type="dxa"/>
-            <w:bottom w:w="0" w:type="dxa"/>
-          </w:tblCellMar>
-        </w:tblPrEx>
         <w:tc>
           <w:tcPr>
             <w:tcW w:w="2100" w:type="dxa"/>
@@ -2911,12 +2777,6 @@
         </w:tc>
       </w:tr>
       <w:tr>
-        <w:tblPrEx>
-          <w:tblCellMar>
-            <w:top w:w="0" w:type="dxa"/>
-            <w:bottom w:w="0" w:type="dxa"/>
-          </w:tblCellMar>
-        </w:tblPrEx>
         <w:tc>
           <w:tcPr>
             <w:tcW w:w="2100" w:type="dxa"/>
@@ -3021,12 +2881,6 @@
         </w:tc>
       </w:tr>
       <w:tr>
-        <w:tblPrEx>
-          <w:tblCellMar>
-            <w:top w:w="0" w:type="dxa"/>
-            <w:bottom w:w="0" w:type="dxa"/>
-          </w:tblCellMar>
-        </w:tblPrEx>
         <w:tc>
           <w:tcPr>
             <w:tcW w:w="2100" w:type="dxa"/>
@@ -3196,16 +3050,10 @@
         <w:gridCol w:w="1583"/>
       </w:tblGrid>
       <w:tr>
-        <w:tblPrEx>
-          <w:tblCellMar>
-            <w:top w:w="0" w:type="dxa"/>
-            <w:bottom w:w="0" w:type="dxa"/>
-          </w:tblCellMar>
-        </w:tblPrEx>
         <w:tc>
           <w:tcPr>
             <w:tcW w:w="2100" w:type="dxa"/>
-            <w:shd w:val="clear" w:color="auto" w:fill="D9E2F3"/>
+            <w:shd w:val="clear" w:color="auto" w:fill="F2CEED" w:themeFill="accent5" w:themeFillTint="33"/>
             <w:tcMar>
               <w:top w:w="50" w:type="dxa"/>
               <w:left w:w="90" w:type="dxa"/>
@@ -3228,7 +3076,7 @@
         <w:tc>
           <w:tcPr>
             <w:tcW w:w="1450" w:type="dxa"/>
-            <w:shd w:val="clear" w:color="auto" w:fill="D9E2F3"/>
+            <w:shd w:val="clear" w:color="auto" w:fill="F2CEED" w:themeFill="accent5" w:themeFillTint="33"/>
             <w:tcMar>
               <w:top w:w="50" w:type="dxa"/>
               <w:left w:w="90" w:type="dxa"/>
@@ -3251,7 +3099,7 @@
         <w:tc>
           <w:tcPr>
             <w:tcW w:w="950" w:type="dxa"/>
-            <w:shd w:val="clear" w:color="auto" w:fill="D9E2F3"/>
+            <w:shd w:val="clear" w:color="auto" w:fill="F2CEED" w:themeFill="accent5" w:themeFillTint="33"/>
             <w:tcMar>
               <w:top w:w="50" w:type="dxa"/>
               <w:left w:w="90" w:type="dxa"/>
@@ -3274,7 +3122,7 @@
         <w:tc>
           <w:tcPr>
             <w:tcW w:w="3460" w:type="dxa"/>
-            <w:shd w:val="clear" w:color="auto" w:fill="D9E2F3"/>
+            <w:shd w:val="clear" w:color="auto" w:fill="F2CEED" w:themeFill="accent5" w:themeFillTint="33"/>
             <w:tcMar>
               <w:top w:w="50" w:type="dxa"/>
               <w:left w:w="90" w:type="dxa"/>
@@ -3297,7 +3145,7 @@
         <w:tc>
           <w:tcPr>
             <w:tcW w:w="1400" w:type="dxa"/>
-            <w:shd w:val="clear" w:color="auto" w:fill="D9E2F3"/>
+            <w:shd w:val="clear" w:color="auto" w:fill="F2CEED" w:themeFill="accent5" w:themeFillTint="33"/>
             <w:tcMar>
               <w:top w:w="50" w:type="dxa"/>
               <w:left w:w="90" w:type="dxa"/>
@@ -3319,12 +3167,6 @@
         </w:tc>
       </w:tr>
       <w:tr>
-        <w:tblPrEx>
-          <w:tblCellMar>
-            <w:top w:w="0" w:type="dxa"/>
-            <w:bottom w:w="0" w:type="dxa"/>
-          </w:tblCellMar>
-        </w:tblPrEx>
         <w:tc>
           <w:tcPr>
             <w:tcW w:w="2100" w:type="dxa"/>
@@ -3421,12 +3263,6 @@
         </w:tc>
       </w:tr>
       <w:tr>
-        <w:tblPrEx>
-          <w:tblCellMar>
-            <w:top w:w="0" w:type="dxa"/>
-            <w:bottom w:w="0" w:type="dxa"/>
-          </w:tblCellMar>
-        </w:tblPrEx>
         <w:tc>
           <w:tcPr>
             <w:tcW w:w="2100" w:type="dxa"/>
@@ -3531,12 +3367,6 @@
         </w:tc>
       </w:tr>
       <w:tr>
-        <w:tblPrEx>
-          <w:tblCellMar>
-            <w:top w:w="0" w:type="dxa"/>
-            <w:bottom w:w="0" w:type="dxa"/>
-          </w:tblCellMar>
-        </w:tblPrEx>
         <w:tc>
           <w:tcPr>
             <w:tcW w:w="2100" w:type="dxa"/>
@@ -3641,12 +3471,6 @@
         </w:tc>
       </w:tr>
       <w:tr>
-        <w:tblPrEx>
-          <w:tblCellMar>
-            <w:top w:w="0" w:type="dxa"/>
-            <w:bottom w:w="0" w:type="dxa"/>
-          </w:tblCellMar>
-        </w:tblPrEx>
         <w:tc>
           <w:tcPr>
             <w:tcW w:w="2100" w:type="dxa"/>
@@ -3751,12 +3575,6 @@
         </w:tc>
       </w:tr>
       <w:tr>
-        <w:tblPrEx>
-          <w:tblCellMar>
-            <w:top w:w="0" w:type="dxa"/>
-            <w:bottom w:w="0" w:type="dxa"/>
-          </w:tblCellMar>
-        </w:tblPrEx>
         <w:tc>
           <w:tcPr>
             <w:tcW w:w="2100" w:type="dxa"/>
@@ -3934,12 +3752,6 @@
         <w:gridCol w:w="1400"/>
       </w:tblGrid>
       <w:tr>
-        <w:tblPrEx>
-          <w:tblCellMar>
-            <w:top w:w="0" w:type="dxa"/>
-            <w:bottom w:w="0" w:type="dxa"/>
-          </w:tblCellMar>
-        </w:tblPrEx>
         <w:tc>
           <w:tcPr>
             <w:tcW w:w="2100" w:type="dxa"/>
@@ -4057,12 +3869,6 @@
         </w:tc>
       </w:tr>
       <w:tr>
-        <w:tblPrEx>
-          <w:tblCellMar>
-            <w:top w:w="0" w:type="dxa"/>
-            <w:bottom w:w="0" w:type="dxa"/>
-          </w:tblCellMar>
-        </w:tblPrEx>
         <w:tc>
           <w:tcPr>
             <w:tcW w:w="2100" w:type="dxa"/>
@@ -4159,12 +3965,6 @@
         </w:tc>
       </w:tr>
       <w:tr>
-        <w:tblPrEx>
-          <w:tblCellMar>
-            <w:top w:w="0" w:type="dxa"/>
-            <w:bottom w:w="0" w:type="dxa"/>
-          </w:tblCellMar>
-        </w:tblPrEx>
         <w:tc>
           <w:tcPr>
             <w:tcW w:w="2100" w:type="dxa"/>
@@ -4277,12 +4077,6 @@
         </w:tc>
       </w:tr>
       <w:tr>
-        <w:tblPrEx>
-          <w:tblCellMar>
-            <w:top w:w="0" w:type="dxa"/>
-            <w:bottom w:w="0" w:type="dxa"/>
-          </w:tblCellMar>
-        </w:tblPrEx>
         <w:tc>
           <w:tcPr>
             <w:tcW w:w="2100" w:type="dxa"/>
@@ -4396,12 +4190,6 @@
         </w:tc>
       </w:tr>
       <w:tr>
-        <w:tblPrEx>
-          <w:tblCellMar>
-            <w:top w:w="0" w:type="dxa"/>
-            <w:bottom w:w="0" w:type="dxa"/>
-          </w:tblCellMar>
-        </w:tblPrEx>
         <w:tc>
           <w:tcPr>
             <w:tcW w:w="2100" w:type="dxa"/>
@@ -4498,12 +4286,6 @@
         </w:tc>
       </w:tr>
       <w:tr>
-        <w:tblPrEx>
-          <w:tblCellMar>
-            <w:top w:w="0" w:type="dxa"/>
-            <w:bottom w:w="0" w:type="dxa"/>
-          </w:tblCellMar>
-        </w:tblPrEx>
         <w:tc>
           <w:tcPr>
             <w:tcW w:w="2100" w:type="dxa"/>
@@ -4673,12 +4455,6 @@
         <w:gridCol w:w="1400"/>
       </w:tblGrid>
       <w:tr>
-        <w:tblPrEx>
-          <w:tblCellMar>
-            <w:top w:w="0" w:type="dxa"/>
-            <w:bottom w:w="0" w:type="dxa"/>
-          </w:tblCellMar>
-        </w:tblPrEx>
         <w:tc>
           <w:tcPr>
             <w:tcW w:w="2100" w:type="dxa"/>
@@ -4796,12 +4572,6 @@
         </w:tc>
       </w:tr>
       <w:tr>
-        <w:tblPrEx>
-          <w:tblCellMar>
-            <w:top w:w="0" w:type="dxa"/>
-            <w:bottom w:w="0" w:type="dxa"/>
-          </w:tblCellMar>
-        </w:tblPrEx>
         <w:tc>
           <w:tcPr>
             <w:tcW w:w="2100" w:type="dxa"/>
@@ -4898,12 +4668,6 @@
         </w:tc>
       </w:tr>
       <w:tr>
-        <w:tblPrEx>
-          <w:tblCellMar>
-            <w:top w:w="0" w:type="dxa"/>
-            <w:bottom w:w="0" w:type="dxa"/>
-          </w:tblCellMar>
-        </w:tblPrEx>
         <w:tc>
           <w:tcPr>
             <w:tcW w:w="2100" w:type="dxa"/>
@@ -5016,12 +4780,6 @@
         </w:tc>
       </w:tr>
       <w:tr>
-        <w:tblPrEx>
-          <w:tblCellMar>
-            <w:top w:w="0" w:type="dxa"/>
-            <w:bottom w:w="0" w:type="dxa"/>
-          </w:tblCellMar>
-        </w:tblPrEx>
         <w:tc>
           <w:tcPr>
             <w:tcW w:w="2100" w:type="dxa"/>
@@ -5207,12 +4965,6 @@
         <w:gridCol w:w="1400"/>
       </w:tblGrid>
       <w:tr>
-        <w:tblPrEx>
-          <w:tblCellMar>
-            <w:top w:w="0" w:type="dxa"/>
-            <w:bottom w:w="0" w:type="dxa"/>
-          </w:tblCellMar>
-        </w:tblPrEx>
         <w:tc>
           <w:tcPr>
             <w:tcW w:w="2100" w:type="dxa"/>
@@ -5330,12 +5082,6 @@
         </w:tc>
       </w:tr>
       <w:tr>
-        <w:tblPrEx>
-          <w:tblCellMar>
-            <w:top w:w="0" w:type="dxa"/>
-            <w:bottom w:w="0" w:type="dxa"/>
-          </w:tblCellMar>
-        </w:tblPrEx>
         <w:tc>
           <w:tcPr>
             <w:tcW w:w="2100" w:type="dxa"/>
@@ -5432,12 +5178,6 @@
         </w:tc>
       </w:tr>
       <w:tr>
-        <w:tblPrEx>
-          <w:tblCellMar>
-            <w:top w:w="0" w:type="dxa"/>
-            <w:bottom w:w="0" w:type="dxa"/>
-          </w:tblCellMar>
-        </w:tblPrEx>
         <w:tc>
           <w:tcPr>
             <w:tcW w:w="2100" w:type="dxa"/>
@@ -5542,12 +5282,6 @@
         </w:tc>
       </w:tr>
       <w:tr>
-        <w:tblPrEx>
-          <w:tblCellMar>
-            <w:top w:w="0" w:type="dxa"/>
-            <w:bottom w:w="0" w:type="dxa"/>
-          </w:tblCellMar>
-        </w:tblPrEx>
         <w:tc>
           <w:tcPr>
             <w:tcW w:w="2100" w:type="dxa"/>
@@ -5644,12 +5378,6 @@
         </w:tc>
       </w:tr>
       <w:tr>
-        <w:tblPrEx>
-          <w:tblCellMar>
-            <w:top w:w="0" w:type="dxa"/>
-            <w:bottom w:w="0" w:type="dxa"/>
-          </w:tblCellMar>
-        </w:tblPrEx>
         <w:tc>
           <w:tcPr>
             <w:tcW w:w="2100" w:type="dxa"/>
@@ -5827,12 +5555,6 @@
         <w:gridCol w:w="1400"/>
       </w:tblGrid>
       <w:tr>
-        <w:tblPrEx>
-          <w:tblCellMar>
-            <w:top w:w="0" w:type="dxa"/>
-            <w:bottom w:w="0" w:type="dxa"/>
-          </w:tblCellMar>
-        </w:tblPrEx>
         <w:tc>
           <w:tcPr>
             <w:tcW w:w="2100" w:type="dxa"/>
@@ -5950,12 +5672,6 @@
         </w:tc>
       </w:tr>
       <w:tr>
-        <w:tblPrEx>
-          <w:tblCellMar>
-            <w:top w:w="0" w:type="dxa"/>
-            <w:bottom w:w="0" w:type="dxa"/>
-          </w:tblCellMar>
-        </w:tblPrEx>
         <w:tc>
           <w:tcPr>
             <w:tcW w:w="2100" w:type="dxa"/>
@@ -6053,12 +5769,6 @@
         </w:tc>
       </w:tr>
       <w:tr>
-        <w:tblPrEx>
-          <w:tblCellMar>
-            <w:top w:w="0" w:type="dxa"/>
-            <w:bottom w:w="0" w:type="dxa"/>
-          </w:tblCellMar>
-        </w:tblPrEx>
         <w:tc>
           <w:tcPr>
             <w:tcW w:w="2100" w:type="dxa"/>
@@ -6171,12 +5881,6 @@
         </w:tc>
       </w:tr>
       <w:tr>
-        <w:tblPrEx>
-          <w:tblCellMar>
-            <w:top w:w="0" w:type="dxa"/>
-            <w:bottom w:w="0" w:type="dxa"/>
-          </w:tblCellMar>
-        </w:tblPrEx>
         <w:tc>
           <w:tcPr>
             <w:tcW w:w="2100" w:type="dxa"/>
@@ -6289,12 +5993,6 @@
         </w:tc>
       </w:tr>
       <w:tr>
-        <w:tblPrEx>
-          <w:tblCellMar>
-            <w:top w:w="0" w:type="dxa"/>
-            <w:bottom w:w="0" w:type="dxa"/>
-          </w:tblCellMar>
-        </w:tblPrEx>
         <w:tc>
           <w:tcPr>
             <w:tcW w:w="2100" w:type="dxa"/>
@@ -6462,12 +6160,6 @@
         <w:gridCol w:w="1400"/>
       </w:tblGrid>
       <w:tr>
-        <w:tblPrEx>
-          <w:tblCellMar>
-            <w:top w:w="0" w:type="dxa"/>
-            <w:bottom w:w="0" w:type="dxa"/>
-          </w:tblCellMar>
-        </w:tblPrEx>
         <w:tc>
           <w:tcPr>
             <w:tcW w:w="2100" w:type="dxa"/>
@@ -6585,12 +6277,6 @@
         </w:tc>
       </w:tr>
       <w:tr>
-        <w:tblPrEx>
-          <w:tblCellMar>
-            <w:top w:w="0" w:type="dxa"/>
-            <w:bottom w:w="0" w:type="dxa"/>
-          </w:tblCellMar>
-        </w:tblPrEx>
         <w:tc>
           <w:tcPr>
             <w:tcW w:w="2100" w:type="dxa"/>
@@ -6687,12 +6373,6 @@
         </w:tc>
       </w:tr>
       <w:tr>
-        <w:tblPrEx>
-          <w:tblCellMar>
-            <w:top w:w="0" w:type="dxa"/>
-            <w:bottom w:w="0" w:type="dxa"/>
-          </w:tblCellMar>
-        </w:tblPrEx>
         <w:tc>
           <w:tcPr>
             <w:tcW w:w="2100" w:type="dxa"/>
@@ -6795,12 +6475,6 @@
         </w:tc>
       </w:tr>
       <w:tr>
-        <w:tblPrEx>
-          <w:tblCellMar>
-            <w:top w:w="0" w:type="dxa"/>
-            <w:bottom w:w="0" w:type="dxa"/>
-          </w:tblCellMar>
-        </w:tblPrEx>
         <w:tc>
           <w:tcPr>
             <w:tcW w:w="2100" w:type="dxa"/>
@@ -6905,12 +6579,6 @@
         </w:tc>
       </w:tr>
       <w:tr>
-        <w:tblPrEx>
-          <w:tblCellMar>
-            <w:top w:w="0" w:type="dxa"/>
-            <w:bottom w:w="0" w:type="dxa"/>
-          </w:tblCellMar>
-        </w:tblPrEx>
         <w:tc>
           <w:tcPr>
             <w:tcW w:w="2100" w:type="dxa"/>
@@ -7080,12 +6748,6 @@
         <w:gridCol w:w="1400"/>
       </w:tblGrid>
       <w:tr>
-        <w:tblPrEx>
-          <w:tblCellMar>
-            <w:top w:w="0" w:type="dxa"/>
-            <w:bottom w:w="0" w:type="dxa"/>
-          </w:tblCellMar>
-        </w:tblPrEx>
         <w:tc>
           <w:tcPr>
             <w:tcW w:w="2100" w:type="dxa"/>
@@ -7203,12 +6865,6 @@
         </w:tc>
       </w:tr>
       <w:tr>
-        <w:tblPrEx>
-          <w:tblCellMar>
-            <w:top w:w="0" w:type="dxa"/>
-            <w:bottom w:w="0" w:type="dxa"/>
-          </w:tblCellMar>
-        </w:tblPrEx>
         <w:tc>
           <w:tcPr>
             <w:tcW w:w="2100" w:type="dxa"/>
@@ -7305,12 +6961,6 @@
         </w:tc>
       </w:tr>
       <w:tr>
-        <w:tblPrEx>
-          <w:tblCellMar>
-            <w:top w:w="0" w:type="dxa"/>
-            <w:bottom w:w="0" w:type="dxa"/>
-          </w:tblCellMar>
-        </w:tblPrEx>
         <w:tc>
           <w:tcPr>
             <w:tcW w:w="2100" w:type="dxa"/>
@@ -7407,12 +7057,6 @@
         </w:tc>
       </w:tr>
       <w:tr>
-        <w:tblPrEx>
-          <w:tblCellMar>
-            <w:top w:w="0" w:type="dxa"/>
-            <w:bottom w:w="0" w:type="dxa"/>
-          </w:tblCellMar>
-        </w:tblPrEx>
         <w:tc>
           <w:tcPr>
             <w:tcW w:w="2100" w:type="dxa"/>
@@ -7517,12 +7161,6 @@
         </w:tc>
       </w:tr>
       <w:tr>
-        <w:tblPrEx>
-          <w:tblCellMar>
-            <w:top w:w="0" w:type="dxa"/>
-            <w:bottom w:w="0" w:type="dxa"/>
-          </w:tblCellMar>
-        </w:tblPrEx>
         <w:tc>
           <w:tcPr>
             <w:tcW w:w="2100" w:type="dxa"/>
@@ -7693,12 +7331,6 @@
         <w:gridCol w:w="1400"/>
       </w:tblGrid>
       <w:tr>
-        <w:tblPrEx>
-          <w:tblCellMar>
-            <w:top w:w="0" w:type="dxa"/>
-            <w:bottom w:w="0" w:type="dxa"/>
-          </w:tblCellMar>
-        </w:tblPrEx>
         <w:tc>
           <w:tcPr>
             <w:tcW w:w="2100" w:type="dxa"/>
@@ -7816,12 +7448,6 @@
         </w:tc>
       </w:tr>
       <w:tr>
-        <w:tblPrEx>
-          <w:tblCellMar>
-            <w:top w:w="0" w:type="dxa"/>
-            <w:bottom w:w="0" w:type="dxa"/>
-          </w:tblCellMar>
-        </w:tblPrEx>
         <w:tc>
           <w:tcPr>
             <w:tcW w:w="2100" w:type="dxa"/>
@@ -8003,12 +7629,6 @@
         <w:gridCol w:w="9360"/>
       </w:tblGrid>
       <w:tr>
-        <w:tblPrEx>
-          <w:tblCellMar>
-            <w:top w:w="0" w:type="dxa"/>
-            <w:bottom w:w="0" w:type="dxa"/>
-          </w:tblCellMar>
-        </w:tblPrEx>
         <w:tc>
           <w:tcPr>
             <w:tcW w:w="9360" w:type="dxa"/>
@@ -8018,7 +7638,7 @@
               <w:bottom w:val="single" w:sz="2" w:space="0" w:color="C9D3E3"/>
               <w:right w:val="single" w:sz="2" w:space="0" w:color="C9D3E3"/>
             </w:tcBorders>
-            <w:shd w:val="clear" w:color="auto" w:fill="F4F6F9"/>
+            <w:shd w:val="clear" w:color="auto" w:fill="F2CEED" w:themeFill="accent5" w:themeFillTint="33"/>
             <w:tcMar>
               <w:top w:w="120" w:type="dxa"/>
               <w:left w:w="160" w:type="dxa"/>
@@ -8262,46 +7882,6 @@
         <w:spacing w:before="120" w:after="120"/>
         <w:jc w:val="center"/>
       </w:pPr>
-      <w:r>
-        <w:drawing>
-          <wp:inline distT="0" distB="0" distL="0" distR="0" wp14:anchorId="6CE69969" wp14:editId="0BEA6657">
-            <wp:extent cx="2781520" cy="6416040"/>
-            <wp:effectExtent l="0" t="0" r="0" b="3810"/>
-            <wp:docPr id="73595962" name="Picture 73595962"/>
-            <wp:cNvGraphicFramePr>
-              <a:graphicFrameLocks xmlns:a="http://schemas.openxmlformats.org/drawingml/2006/main" noChangeAspect="1"/>
-            </wp:cNvGraphicFramePr>
-            <a:graphic xmlns:a="http://schemas.openxmlformats.org/drawingml/2006/main">
-              <a:graphicData uri="http://schemas.openxmlformats.org/drawingml/2006/picture">
-                <pic:pic xmlns:pic="http://schemas.openxmlformats.org/drawingml/2006/picture">
-                  <pic:nvPicPr>
-                    <pic:cNvPr id="0" name=""/>
-                    <pic:cNvPicPr>
-                      <a:picLocks noChangeAspect="1" noChangeArrowheads="1"/>
-                    </pic:cNvPicPr>
-                  </pic:nvPicPr>
-                  <pic:blipFill>
-                    <a:blip r:embed="rId9"/>
-                    <a:srcRect/>
-                    <a:stretch>
-                      <a:fillRect/>
-                    </a:stretch>
-                  </pic:blipFill>
-                  <pic:spPr bwMode="auto">
-                    <a:xfrm>
-                      <a:off x="0" y="0"/>
-                      <a:ext cx="2782914" cy="6419256"/>
-                    </a:xfrm>
-                    <a:prstGeom prst="rect">
-                      <a:avLst/>
-                    </a:prstGeom>
-                  </pic:spPr>
-                </pic:pic>
-              </a:graphicData>
-            </a:graphic>
-          </wp:inline>
-        </w:drawing>
-      </w:r>
     </w:p>
     <w:p>
       <w:pPr>
@@ -8332,12 +7912,6 @@
         <w:gridCol w:w="9360"/>
       </w:tblGrid>
       <w:tr>
-        <w:tblPrEx>
-          <w:tblCellMar>
-            <w:top w:w="0" w:type="dxa"/>
-            <w:bottom w:w="0" w:type="dxa"/>
-          </w:tblCellMar>
-        </w:tblPrEx>
         <w:tc>
           <w:tcPr>
             <w:tcW w:w="9360" w:type="dxa"/>
@@ -8347,7 +7921,7 @@
               <w:bottom w:val="single" w:sz="2" w:space="0" w:color="C9D3E3"/>
               <w:right w:val="single" w:sz="2" w:space="0" w:color="C9D3E3"/>
             </w:tcBorders>
-            <w:shd w:val="clear" w:color="auto" w:fill="F4F6F9"/>
+            <w:shd w:val="clear" w:color="auto" w:fill="F2CEED" w:themeFill="accent5" w:themeFillTint="33"/>
             <w:tcMar>
               <w:top w:w="120" w:type="dxa"/>
               <w:left w:w="160" w:type="dxa"/>
@@ -8362,7 +7936,6 @@
                 <w:sz w:val="19"/>
                 <w:szCs w:val="19"/>
               </w:rPr>
-              <w:lastRenderedPageBreak/>
               <w:t>GET the screen capacity entered by the manager</w:t>
             </w:r>
           </w:p>
@@ -8773,47 +8346,6 @@
         <w:spacing w:before="120" w:after="120"/>
         <w:jc w:val="center"/>
       </w:pPr>
-      <w:r>
-        <w:lastRenderedPageBreak/>
-        <w:drawing>
-          <wp:inline distT="0" distB="0" distL="0" distR="0" wp14:anchorId="1AC40B24" wp14:editId="6DEC1A53">
-            <wp:extent cx="3048000" cy="6248400"/>
-            <wp:effectExtent l="0" t="0" r="0" b="0"/>
-            <wp:docPr id="231307237" name="Picture 231307237"/>
-            <wp:cNvGraphicFramePr>
-              <a:graphicFrameLocks xmlns:a="http://schemas.openxmlformats.org/drawingml/2006/main" noChangeAspect="1"/>
-            </wp:cNvGraphicFramePr>
-            <a:graphic xmlns:a="http://schemas.openxmlformats.org/drawingml/2006/main">
-              <a:graphicData uri="http://schemas.openxmlformats.org/drawingml/2006/picture">
-                <pic:pic xmlns:pic="http://schemas.openxmlformats.org/drawingml/2006/picture">
-                  <pic:nvPicPr>
-                    <pic:cNvPr id="0" name=""/>
-                    <pic:cNvPicPr>
-                      <a:picLocks noChangeAspect="1" noChangeArrowheads="1"/>
-                    </pic:cNvPicPr>
-                  </pic:nvPicPr>
-                  <pic:blipFill>
-                    <a:blip r:embed="rId10"/>
-                    <a:srcRect/>
-                    <a:stretch>
-                      <a:fillRect/>
-                    </a:stretch>
-                  </pic:blipFill>
-                  <pic:spPr bwMode="auto">
-                    <a:xfrm>
-                      <a:off x="0" y="0"/>
-                      <a:ext cx="3048000" cy="6248400"/>
-                    </a:xfrm>
-                    <a:prstGeom prst="rect">
-                      <a:avLst/>
-                    </a:prstGeom>
-                  </pic:spPr>
-                </pic:pic>
-              </a:graphicData>
-            </a:graphic>
-          </wp:inline>
-        </w:drawing>
-      </w:r>
     </w:p>
     <w:p>
       <w:pPr>
@@ -8844,12 +8376,6 @@
         <w:gridCol w:w="9360"/>
       </w:tblGrid>
       <w:tr>
-        <w:tblPrEx>
-          <w:tblCellMar>
-            <w:top w:w="0" w:type="dxa"/>
-            <w:bottom w:w="0" w:type="dxa"/>
-          </w:tblCellMar>
-        </w:tblPrEx>
         <w:tc>
           <w:tcPr>
             <w:tcW w:w="9360" w:type="dxa"/>
@@ -8859,7 +8385,7 @@
               <w:bottom w:val="single" w:sz="2" w:space="0" w:color="C9D3E3"/>
               <w:right w:val="single" w:sz="2" w:space="0" w:color="C9D3E3"/>
             </w:tcBorders>
-            <w:shd w:val="clear" w:color="auto" w:fill="F4F6F9"/>
+            <w:shd w:val="clear" w:color="auto" w:fill="F2CEED" w:themeFill="accent5" w:themeFillTint="33"/>
             <w:tcMar>
               <w:top w:w="120" w:type="dxa"/>
               <w:left w:w="160" w:type="dxa"/>
@@ -9000,6 +8526,7 @@
                 <w:sz w:val="19"/>
                 <w:szCs w:val="19"/>
               </w:rPr>
+              <w:lastRenderedPageBreak/>
               <w:t xml:space="preserve">INSERT a new record into </w:t>
             </w:r>
             <w:proofErr w:type="spellStart"/>
@@ -9028,7 +8555,6 @@
                 <w:sz w:val="19"/>
                 <w:szCs w:val="19"/>
               </w:rPr>
-              <w:lastRenderedPageBreak/>
               <w:t xml:space="preserve">       today's date and the calculated total cost</w:t>
             </w:r>
           </w:p>
@@ -9203,12 +8729,6 @@
         <w:gridCol w:w="9360"/>
       </w:tblGrid>
       <w:tr>
-        <w:tblPrEx>
-          <w:tblCellMar>
-            <w:top w:w="0" w:type="dxa"/>
-            <w:bottom w:w="0" w:type="dxa"/>
-          </w:tblCellMar>
-        </w:tblPrEx>
         <w:tc>
           <w:tcPr>
             <w:tcW w:w="9360" w:type="dxa"/>
@@ -9218,7 +8738,7 @@
               <w:bottom w:val="single" w:sz="2" w:space="0" w:color="C9D3E3"/>
               <w:right w:val="single" w:sz="2" w:space="0" w:color="C9D3E3"/>
             </w:tcBorders>
-            <w:shd w:val="clear" w:color="auto" w:fill="F4F6F9"/>
+            <w:shd w:val="clear" w:color="auto" w:fill="F2CEED" w:themeFill="accent5" w:themeFillTint="33"/>
             <w:tcMar>
               <w:top w:w="120" w:type="dxa"/>
               <w:left w:w="160" w:type="dxa"/>
@@ -9431,12 +8951,6 @@
         <w:gridCol w:w="9360"/>
       </w:tblGrid>
       <w:tr>
-        <w:tblPrEx>
-          <w:tblCellMar>
-            <w:top w:w="0" w:type="dxa"/>
-            <w:bottom w:w="0" w:type="dxa"/>
-          </w:tblCellMar>
-        </w:tblPrEx>
         <w:tc>
           <w:tcPr>
             <w:tcW w:w="9360" w:type="dxa"/>
@@ -9446,7 +8960,7 @@
               <w:bottom w:val="single" w:sz="2" w:space="0" w:color="C9D3E3"/>
               <w:right w:val="single" w:sz="2" w:space="0" w:color="C9D3E3"/>
             </w:tcBorders>
-            <w:shd w:val="clear" w:color="auto" w:fill="F4F6F9"/>
+            <w:shd w:val="clear" w:color="auto" w:fill="F2CEED" w:themeFill="accent5" w:themeFillTint="33"/>
             <w:tcMar>
               <w:top w:w="120" w:type="dxa"/>
               <w:left w:w="160" w:type="dxa"/>
@@ -9748,12 +9262,6 @@
         <w:gridCol w:w="9360"/>
       </w:tblGrid>
       <w:tr>
-        <w:tblPrEx>
-          <w:tblCellMar>
-            <w:top w:w="0" w:type="dxa"/>
-            <w:bottom w:w="0" w:type="dxa"/>
-          </w:tblCellMar>
-        </w:tblPrEx>
         <w:tc>
           <w:tcPr>
             <w:tcW w:w="9360" w:type="dxa"/>
@@ -9763,7 +9271,7 @@
               <w:bottom w:val="single" w:sz="2" w:space="0" w:color="C9D3E3"/>
               <w:right w:val="single" w:sz="2" w:space="0" w:color="C9D3E3"/>
             </w:tcBorders>
-            <w:shd w:val="clear" w:color="auto" w:fill="F4F6F9"/>
+            <w:shd w:val="clear" w:color="auto" w:fill="F2CEED" w:themeFill="accent5" w:themeFillTint="33"/>
             <w:tcMar>
               <w:top w:w="120" w:type="dxa"/>
               <w:left w:w="160" w:type="dxa"/>
@@ -10116,12 +9624,6 @@
         <w:gridCol w:w="9360"/>
       </w:tblGrid>
       <w:tr>
-        <w:tblPrEx>
-          <w:tblCellMar>
-            <w:top w:w="0" w:type="dxa"/>
-            <w:bottom w:w="0" w:type="dxa"/>
-          </w:tblCellMar>
-        </w:tblPrEx>
         <w:tc>
           <w:tcPr>
             <w:tcW w:w="9360" w:type="dxa"/>
@@ -10131,7 +9633,7 @@
               <w:bottom w:val="single" w:sz="2" w:space="0" w:color="C9D3E3"/>
               <w:right w:val="single" w:sz="2" w:space="0" w:color="C9D3E3"/>
             </w:tcBorders>
-            <w:shd w:val="clear" w:color="auto" w:fill="F4F6F9"/>
+            <w:shd w:val="clear" w:color="auto" w:fill="F2CEED" w:themeFill="accent5" w:themeFillTint="33"/>
             <w:tcMar>
               <w:top w:w="120" w:type="dxa"/>
               <w:left w:w="160" w:type="dxa"/>
@@ -10319,12 +9821,6 @@
         <w:gridCol w:w="9360"/>
       </w:tblGrid>
       <w:tr>
-        <w:tblPrEx>
-          <w:tblCellMar>
-            <w:top w:w="0" w:type="dxa"/>
-            <w:bottom w:w="0" w:type="dxa"/>
-          </w:tblCellMar>
-        </w:tblPrEx>
         <w:tc>
           <w:tcPr>
             <w:tcW w:w="9360" w:type="dxa"/>
@@ -10334,7 +9830,7 @@
               <w:bottom w:val="single" w:sz="2" w:space="0" w:color="C9D3E3"/>
               <w:right w:val="single" w:sz="2" w:space="0" w:color="C9D3E3"/>
             </w:tcBorders>
-            <w:shd w:val="clear" w:color="auto" w:fill="F4F6F9"/>
+            <w:shd w:val="clear" w:color="auto" w:fill="F2CEED" w:themeFill="accent5" w:themeFillTint="33"/>
             <w:tcMar>
               <w:top w:w="120" w:type="dxa"/>
               <w:left w:w="160" w:type="dxa"/>
@@ -10554,13 +10050,2965 @@
       </w:pPr>
     </w:p>
     <w:p/>
+    <w:p>
+      <w:pPr>
+        <w:pStyle w:val="Heading2"/>
+        <w:rPr>
+          <w:b/>
+          <w:bCs/>
+          <w:color w:val="000000" w:themeColor="text1"/>
+        </w:rPr>
+      </w:pPr>
+      <w:r>
+        <w:rPr>
+          <w:b/>
+          <w:bCs/>
+          <w:color w:val="000000" w:themeColor="text1"/>
+        </w:rPr>
+        <w:t>Validation</w:t>
+      </w:r>
+    </w:p>
+    <w:p>
+      <w:pPr>
+        <w:spacing w:after="160" w:line="276" w:lineRule="auto"/>
+      </w:pPr>
+      <w:r>
+        <w:t xml:space="preserve">Validation is the process of checking that data entered into the system is sensible and complete before it is accepted and saved to the database. It cannot guarantee that data is correct, for example it cannot tell whether a customer has typed the right surname, but it can stop clearly invalid or missing data from getting in, which protects the integrity of the database. Several different types of validation are used across the </w:t>
+      </w:r>
+      <w:proofErr w:type="spellStart"/>
+      <w:r>
+        <w:t>Filmtopia</w:t>
+      </w:r>
+      <w:proofErr w:type="spellEnd"/>
+      <w:r>
+        <w:t xml:space="preserve"> system, and these are explained below before being applied to each input in turn.</w:t>
+      </w:r>
+    </w:p>
+    <w:p>
+      <w:pPr>
+        <w:spacing w:after="160" w:line="276" w:lineRule="auto"/>
+      </w:pPr>
+      <w:r>
+        <w:t xml:space="preserve">A presence check makes sure a required field has not been left blank. A type check makes sure the data is of the right kind, for example that a number has been entered where a number is expected. A length check makes sure an entry is </w:t>
+      </w:r>
+      <w:proofErr w:type="spellStart"/>
+      <w:r>
+        <w:t>not longer</w:t>
+      </w:r>
+      <w:proofErr w:type="spellEnd"/>
+      <w:r>
+        <w:t xml:space="preserve"> than the field allows. A range check makes sure a number or date falls between sensible limits. A format check makes sure an entry follows a required pattern, such as a time being written as HH:MM. Finally a lookup check, sometimes called a referential check, makes sure that a chosen value actually exists in another table, for example that a screening is being created for a film that really exists. The tables below set out the validation applied to each input, grouped by the form it appears on.</w:t>
+      </w:r>
+    </w:p>
+    <w:p>
+      <w:pPr>
+        <w:pStyle w:val="Heading3"/>
+        <w:rPr>
+          <w:b/>
+          <w:bCs/>
+          <w:color w:val="000000" w:themeColor="text1"/>
+        </w:rPr>
+      </w:pPr>
+      <w:r>
+        <w:rPr>
+          <w:b/>
+          <w:bCs/>
+          <w:color w:val="000000" w:themeColor="text1"/>
+        </w:rPr>
+        <w:t>Login Form</w:t>
+      </w:r>
+    </w:p>
+    <w:tbl>
+      <w:tblPr>
+        <w:tblW w:w="9360" w:type="dxa"/>
+        <w:tblBorders>
+          <w:top w:val="single" w:sz="1" w:space="0" w:color="BFBFBF"/>
+          <w:left w:val="single" w:sz="1" w:space="0" w:color="BFBFBF"/>
+          <w:bottom w:val="single" w:sz="1" w:space="0" w:color="BFBFBF"/>
+          <w:right w:val="single" w:sz="1" w:space="0" w:color="BFBFBF"/>
+          <w:insideH w:val="single" w:sz="1" w:space="0" w:color="BFBFBF"/>
+          <w:insideV w:val="single" w:sz="1" w:space="0" w:color="BFBFBF"/>
+        </w:tblBorders>
+        <w:tblCellMar>
+          <w:left w:w="10" w:type="dxa"/>
+          <w:right w:w="10" w:type="dxa"/>
+        </w:tblCellMar>
+        <w:tblLook w:val="0000" w:firstRow="0" w:lastRow="0" w:firstColumn="0" w:lastColumn="0" w:noHBand="0" w:noVBand="0"/>
+      </w:tblPr>
+      <w:tblGrid>
+        <w:gridCol w:w="1900"/>
+        <w:gridCol w:w="1900"/>
+        <w:gridCol w:w="3360"/>
+        <w:gridCol w:w="2200"/>
+      </w:tblGrid>
+      <w:tr>
+        <w:tblPrEx>
+          <w:tblCellMar>
+            <w:top w:w="0" w:type="dxa"/>
+            <w:bottom w:w="0" w:type="dxa"/>
+          </w:tblCellMar>
+        </w:tblPrEx>
+        <w:tc>
+          <w:tcPr>
+            <w:tcW w:w="1900" w:type="dxa"/>
+            <w:shd w:val="clear" w:color="auto" w:fill="D9E2F3"/>
+            <w:tcMar>
+              <w:top w:w="50" w:type="dxa"/>
+              <w:left w:w="90" w:type="dxa"/>
+              <w:bottom w:w="50" w:type="dxa"/>
+              <w:right w:w="90" w:type="dxa"/>
+            </w:tcMar>
+          </w:tcPr>
+          <w:p>
+            <w:r>
+              <w:rPr>
+                <w:b/>
+                <w:bCs/>
+                <w:sz w:val="19"/>
+                <w:szCs w:val="19"/>
+              </w:rPr>
+              <w:t>Field</w:t>
+            </w:r>
+          </w:p>
+        </w:tc>
+        <w:tc>
+          <w:tcPr>
+            <w:tcW w:w="1900" w:type="dxa"/>
+            <w:shd w:val="clear" w:color="auto" w:fill="D9E2F3"/>
+            <w:tcMar>
+              <w:top w:w="50" w:type="dxa"/>
+              <w:left w:w="90" w:type="dxa"/>
+              <w:bottom w:w="50" w:type="dxa"/>
+              <w:right w:w="90" w:type="dxa"/>
+            </w:tcMar>
+          </w:tcPr>
+          <w:p>
+            <w:r>
+              <w:rPr>
+                <w:b/>
+                <w:bCs/>
+                <w:sz w:val="19"/>
+                <w:szCs w:val="19"/>
+              </w:rPr>
+              <w:t>Validation Type</w:t>
+            </w:r>
+          </w:p>
+        </w:tc>
+        <w:tc>
+          <w:tcPr>
+            <w:tcW w:w="3360" w:type="dxa"/>
+            <w:shd w:val="clear" w:color="auto" w:fill="D9E2F3"/>
+            <w:tcMar>
+              <w:top w:w="50" w:type="dxa"/>
+              <w:left w:w="90" w:type="dxa"/>
+              <w:bottom w:w="50" w:type="dxa"/>
+              <w:right w:w="90" w:type="dxa"/>
+            </w:tcMar>
+          </w:tcPr>
+          <w:p>
+            <w:r>
+              <w:rPr>
+                <w:b/>
+                <w:bCs/>
+                <w:sz w:val="19"/>
+                <w:szCs w:val="19"/>
+              </w:rPr>
+              <w:t>Rule</w:t>
+            </w:r>
+          </w:p>
+        </w:tc>
+        <w:tc>
+          <w:tcPr>
+            <w:tcW w:w="2200" w:type="dxa"/>
+            <w:shd w:val="clear" w:color="auto" w:fill="D9E2F3"/>
+            <w:tcMar>
+              <w:top w:w="50" w:type="dxa"/>
+              <w:left w:w="90" w:type="dxa"/>
+              <w:bottom w:w="50" w:type="dxa"/>
+              <w:right w:w="90" w:type="dxa"/>
+            </w:tcMar>
+          </w:tcPr>
+          <w:p>
+            <w:r>
+              <w:rPr>
+                <w:b/>
+                <w:bCs/>
+                <w:sz w:val="19"/>
+                <w:szCs w:val="19"/>
+              </w:rPr>
+              <w:t>Error Message</w:t>
+            </w:r>
+          </w:p>
+        </w:tc>
+      </w:tr>
+      <w:tr>
+        <w:tblPrEx>
+          <w:tblCellMar>
+            <w:top w:w="0" w:type="dxa"/>
+            <w:bottom w:w="0" w:type="dxa"/>
+          </w:tblCellMar>
+        </w:tblPrEx>
+        <w:tc>
+          <w:tcPr>
+            <w:tcW w:w="1900" w:type="dxa"/>
+            <w:tcMar>
+              <w:top w:w="50" w:type="dxa"/>
+              <w:left w:w="90" w:type="dxa"/>
+              <w:bottom w:w="50" w:type="dxa"/>
+              <w:right w:w="90" w:type="dxa"/>
+            </w:tcMar>
+          </w:tcPr>
+          <w:p>
+            <w:r>
+              <w:rPr>
+                <w:sz w:val="19"/>
+                <w:szCs w:val="19"/>
+              </w:rPr>
+              <w:t>Username</w:t>
+            </w:r>
+          </w:p>
+        </w:tc>
+        <w:tc>
+          <w:tcPr>
+            <w:tcW w:w="1900" w:type="dxa"/>
+            <w:tcMar>
+              <w:top w:w="50" w:type="dxa"/>
+              <w:left w:w="90" w:type="dxa"/>
+              <w:bottom w:w="50" w:type="dxa"/>
+              <w:right w:w="90" w:type="dxa"/>
+            </w:tcMar>
+          </w:tcPr>
+          <w:p>
+            <w:r>
+              <w:rPr>
+                <w:sz w:val="19"/>
+                <w:szCs w:val="19"/>
+              </w:rPr>
+              <w:t>Presence</w:t>
+            </w:r>
+          </w:p>
+        </w:tc>
+        <w:tc>
+          <w:tcPr>
+            <w:tcW w:w="3360" w:type="dxa"/>
+            <w:tcMar>
+              <w:top w:w="50" w:type="dxa"/>
+              <w:left w:w="90" w:type="dxa"/>
+              <w:bottom w:w="50" w:type="dxa"/>
+              <w:right w:w="90" w:type="dxa"/>
+            </w:tcMar>
+          </w:tcPr>
+          <w:p>
+            <w:r>
+              <w:rPr>
+                <w:sz w:val="19"/>
+                <w:szCs w:val="19"/>
+              </w:rPr>
+              <w:t>Must not be left blank</w:t>
+            </w:r>
+          </w:p>
+        </w:tc>
+        <w:tc>
+          <w:tcPr>
+            <w:tcW w:w="2200" w:type="dxa"/>
+            <w:tcMar>
+              <w:top w:w="50" w:type="dxa"/>
+              <w:left w:w="90" w:type="dxa"/>
+              <w:bottom w:w="50" w:type="dxa"/>
+              <w:right w:w="90" w:type="dxa"/>
+            </w:tcMar>
+          </w:tcPr>
+          <w:p>
+            <w:r>
+              <w:rPr>
+                <w:sz w:val="19"/>
+                <w:szCs w:val="19"/>
+              </w:rPr>
+              <w:t>"Please enter a username"</w:t>
+            </w:r>
+          </w:p>
+        </w:tc>
+      </w:tr>
+      <w:tr>
+        <w:tblPrEx>
+          <w:tblCellMar>
+            <w:top w:w="0" w:type="dxa"/>
+            <w:bottom w:w="0" w:type="dxa"/>
+          </w:tblCellMar>
+        </w:tblPrEx>
+        <w:tc>
+          <w:tcPr>
+            <w:tcW w:w="1900" w:type="dxa"/>
+            <w:tcMar>
+              <w:top w:w="50" w:type="dxa"/>
+              <w:left w:w="90" w:type="dxa"/>
+              <w:bottom w:w="50" w:type="dxa"/>
+              <w:right w:w="90" w:type="dxa"/>
+            </w:tcMar>
+          </w:tcPr>
+          <w:p>
+            <w:r>
+              <w:rPr>
+                <w:sz w:val="19"/>
+                <w:szCs w:val="19"/>
+              </w:rPr>
+              <w:t>Password</w:t>
+            </w:r>
+          </w:p>
+        </w:tc>
+        <w:tc>
+          <w:tcPr>
+            <w:tcW w:w="1900" w:type="dxa"/>
+            <w:tcMar>
+              <w:top w:w="50" w:type="dxa"/>
+              <w:left w:w="90" w:type="dxa"/>
+              <w:bottom w:w="50" w:type="dxa"/>
+              <w:right w:w="90" w:type="dxa"/>
+            </w:tcMar>
+          </w:tcPr>
+          <w:p>
+            <w:r>
+              <w:rPr>
+                <w:sz w:val="19"/>
+                <w:szCs w:val="19"/>
+              </w:rPr>
+              <w:t>Presence</w:t>
+            </w:r>
+          </w:p>
+        </w:tc>
+        <w:tc>
+          <w:tcPr>
+            <w:tcW w:w="3360" w:type="dxa"/>
+            <w:tcMar>
+              <w:top w:w="50" w:type="dxa"/>
+              <w:left w:w="90" w:type="dxa"/>
+              <w:bottom w:w="50" w:type="dxa"/>
+              <w:right w:w="90" w:type="dxa"/>
+            </w:tcMar>
+          </w:tcPr>
+          <w:p>
+            <w:r>
+              <w:rPr>
+                <w:sz w:val="19"/>
+                <w:szCs w:val="19"/>
+              </w:rPr>
+              <w:t>Must not be left blank</w:t>
+            </w:r>
+          </w:p>
+        </w:tc>
+        <w:tc>
+          <w:tcPr>
+            <w:tcW w:w="2200" w:type="dxa"/>
+            <w:tcMar>
+              <w:top w:w="50" w:type="dxa"/>
+              <w:left w:w="90" w:type="dxa"/>
+              <w:bottom w:w="50" w:type="dxa"/>
+              <w:right w:w="90" w:type="dxa"/>
+            </w:tcMar>
+          </w:tcPr>
+          <w:p>
+            <w:r>
+              <w:rPr>
+                <w:sz w:val="19"/>
+                <w:szCs w:val="19"/>
+              </w:rPr>
+              <w:t>"Please enter a password"</w:t>
+            </w:r>
+          </w:p>
+        </w:tc>
+      </w:tr>
+    </w:tbl>
+    <w:p>
+      <w:pPr>
+        <w:spacing w:after="120"/>
+      </w:pPr>
+    </w:p>
+    <w:p>
+      <w:pPr>
+        <w:pStyle w:val="Heading3"/>
+        <w:rPr>
+          <w:b/>
+          <w:bCs/>
+          <w:color w:val="000000" w:themeColor="text1"/>
+        </w:rPr>
+      </w:pPr>
+      <w:r>
+        <w:rPr>
+          <w:b/>
+          <w:bCs/>
+          <w:color w:val="000000" w:themeColor="text1"/>
+        </w:rPr>
+        <w:t>Add Film Form</w:t>
+      </w:r>
+    </w:p>
+    <w:tbl>
+      <w:tblPr>
+        <w:tblW w:w="9360" w:type="dxa"/>
+        <w:tblBorders>
+          <w:top w:val="single" w:sz="1" w:space="0" w:color="BFBFBF"/>
+          <w:left w:val="single" w:sz="1" w:space="0" w:color="BFBFBF"/>
+          <w:bottom w:val="single" w:sz="1" w:space="0" w:color="BFBFBF"/>
+          <w:right w:val="single" w:sz="1" w:space="0" w:color="BFBFBF"/>
+          <w:insideH w:val="single" w:sz="1" w:space="0" w:color="BFBFBF"/>
+          <w:insideV w:val="single" w:sz="1" w:space="0" w:color="BFBFBF"/>
+        </w:tblBorders>
+        <w:tblCellMar>
+          <w:left w:w="10" w:type="dxa"/>
+          <w:right w:w="10" w:type="dxa"/>
+        </w:tblCellMar>
+        <w:tblLook w:val="0000" w:firstRow="0" w:lastRow="0" w:firstColumn="0" w:lastColumn="0" w:noHBand="0" w:noVBand="0"/>
+      </w:tblPr>
+      <w:tblGrid>
+        <w:gridCol w:w="1900"/>
+        <w:gridCol w:w="1900"/>
+        <w:gridCol w:w="3360"/>
+        <w:gridCol w:w="2200"/>
+      </w:tblGrid>
+      <w:tr>
+        <w:tblPrEx>
+          <w:tblCellMar>
+            <w:top w:w="0" w:type="dxa"/>
+            <w:bottom w:w="0" w:type="dxa"/>
+          </w:tblCellMar>
+        </w:tblPrEx>
+        <w:tc>
+          <w:tcPr>
+            <w:tcW w:w="1900" w:type="dxa"/>
+            <w:shd w:val="clear" w:color="auto" w:fill="D9E2F3"/>
+            <w:tcMar>
+              <w:top w:w="50" w:type="dxa"/>
+              <w:left w:w="90" w:type="dxa"/>
+              <w:bottom w:w="50" w:type="dxa"/>
+              <w:right w:w="90" w:type="dxa"/>
+            </w:tcMar>
+          </w:tcPr>
+          <w:p>
+            <w:r>
+              <w:rPr>
+                <w:b/>
+                <w:bCs/>
+                <w:sz w:val="19"/>
+                <w:szCs w:val="19"/>
+              </w:rPr>
+              <w:t>Field</w:t>
+            </w:r>
+          </w:p>
+        </w:tc>
+        <w:tc>
+          <w:tcPr>
+            <w:tcW w:w="1900" w:type="dxa"/>
+            <w:shd w:val="clear" w:color="auto" w:fill="D9E2F3"/>
+            <w:tcMar>
+              <w:top w:w="50" w:type="dxa"/>
+              <w:left w:w="90" w:type="dxa"/>
+              <w:bottom w:w="50" w:type="dxa"/>
+              <w:right w:w="90" w:type="dxa"/>
+            </w:tcMar>
+          </w:tcPr>
+          <w:p>
+            <w:r>
+              <w:rPr>
+                <w:b/>
+                <w:bCs/>
+                <w:sz w:val="19"/>
+                <w:szCs w:val="19"/>
+              </w:rPr>
+              <w:t>Validation Type</w:t>
+            </w:r>
+          </w:p>
+        </w:tc>
+        <w:tc>
+          <w:tcPr>
+            <w:tcW w:w="3360" w:type="dxa"/>
+            <w:shd w:val="clear" w:color="auto" w:fill="D9E2F3"/>
+            <w:tcMar>
+              <w:top w:w="50" w:type="dxa"/>
+              <w:left w:w="90" w:type="dxa"/>
+              <w:bottom w:w="50" w:type="dxa"/>
+              <w:right w:w="90" w:type="dxa"/>
+            </w:tcMar>
+          </w:tcPr>
+          <w:p>
+            <w:r>
+              <w:rPr>
+                <w:b/>
+                <w:bCs/>
+                <w:sz w:val="19"/>
+                <w:szCs w:val="19"/>
+              </w:rPr>
+              <w:t>Rule</w:t>
+            </w:r>
+          </w:p>
+        </w:tc>
+        <w:tc>
+          <w:tcPr>
+            <w:tcW w:w="2200" w:type="dxa"/>
+            <w:shd w:val="clear" w:color="auto" w:fill="D9E2F3"/>
+            <w:tcMar>
+              <w:top w:w="50" w:type="dxa"/>
+              <w:left w:w="90" w:type="dxa"/>
+              <w:bottom w:w="50" w:type="dxa"/>
+              <w:right w:w="90" w:type="dxa"/>
+            </w:tcMar>
+          </w:tcPr>
+          <w:p>
+            <w:r>
+              <w:rPr>
+                <w:b/>
+                <w:bCs/>
+                <w:sz w:val="19"/>
+                <w:szCs w:val="19"/>
+              </w:rPr>
+              <w:t>Error Message</w:t>
+            </w:r>
+          </w:p>
+        </w:tc>
+      </w:tr>
+      <w:tr>
+        <w:tblPrEx>
+          <w:tblCellMar>
+            <w:top w:w="0" w:type="dxa"/>
+            <w:bottom w:w="0" w:type="dxa"/>
+          </w:tblCellMar>
+        </w:tblPrEx>
+        <w:tc>
+          <w:tcPr>
+            <w:tcW w:w="1900" w:type="dxa"/>
+            <w:tcMar>
+              <w:top w:w="50" w:type="dxa"/>
+              <w:left w:w="90" w:type="dxa"/>
+              <w:bottom w:w="50" w:type="dxa"/>
+              <w:right w:w="90" w:type="dxa"/>
+            </w:tcMar>
+          </w:tcPr>
+          <w:p>
+            <w:proofErr w:type="spellStart"/>
+            <w:r>
+              <w:rPr>
+                <w:sz w:val="19"/>
+                <w:szCs w:val="19"/>
+              </w:rPr>
+              <w:t>FilmTitle</w:t>
+            </w:r>
+            <w:proofErr w:type="spellEnd"/>
+          </w:p>
+        </w:tc>
+        <w:tc>
+          <w:tcPr>
+            <w:tcW w:w="1900" w:type="dxa"/>
+            <w:tcMar>
+              <w:top w:w="50" w:type="dxa"/>
+              <w:left w:w="90" w:type="dxa"/>
+              <w:bottom w:w="50" w:type="dxa"/>
+              <w:right w:w="90" w:type="dxa"/>
+            </w:tcMar>
+          </w:tcPr>
+          <w:p>
+            <w:r>
+              <w:rPr>
+                <w:sz w:val="19"/>
+                <w:szCs w:val="19"/>
+              </w:rPr>
+              <w:t>Presence, Length</w:t>
+            </w:r>
+          </w:p>
+        </w:tc>
+        <w:tc>
+          <w:tcPr>
+            <w:tcW w:w="3360" w:type="dxa"/>
+            <w:tcMar>
+              <w:top w:w="50" w:type="dxa"/>
+              <w:left w:w="90" w:type="dxa"/>
+              <w:bottom w:w="50" w:type="dxa"/>
+              <w:right w:w="90" w:type="dxa"/>
+            </w:tcMar>
+          </w:tcPr>
+          <w:p>
+            <w:r>
+              <w:rPr>
+                <w:sz w:val="19"/>
+                <w:szCs w:val="19"/>
+              </w:rPr>
+              <w:t>Must not be blank and must be 100 characters or fewer</w:t>
+            </w:r>
+          </w:p>
+        </w:tc>
+        <w:tc>
+          <w:tcPr>
+            <w:tcW w:w="2200" w:type="dxa"/>
+            <w:tcMar>
+              <w:top w:w="50" w:type="dxa"/>
+              <w:left w:w="90" w:type="dxa"/>
+              <w:bottom w:w="50" w:type="dxa"/>
+              <w:right w:w="90" w:type="dxa"/>
+            </w:tcMar>
+          </w:tcPr>
+          <w:p>
+            <w:r>
+              <w:rPr>
+                <w:sz w:val="19"/>
+                <w:szCs w:val="19"/>
+              </w:rPr>
+              <w:t>"Please enter a film title"</w:t>
+            </w:r>
+          </w:p>
+        </w:tc>
+      </w:tr>
+      <w:tr>
+        <w:tblPrEx>
+          <w:tblCellMar>
+            <w:top w:w="0" w:type="dxa"/>
+            <w:bottom w:w="0" w:type="dxa"/>
+          </w:tblCellMar>
+        </w:tblPrEx>
+        <w:tc>
+          <w:tcPr>
+            <w:tcW w:w="1900" w:type="dxa"/>
+            <w:tcMar>
+              <w:top w:w="50" w:type="dxa"/>
+              <w:left w:w="90" w:type="dxa"/>
+              <w:bottom w:w="50" w:type="dxa"/>
+              <w:right w:w="90" w:type="dxa"/>
+            </w:tcMar>
+          </w:tcPr>
+          <w:p>
+            <w:proofErr w:type="spellStart"/>
+            <w:r>
+              <w:rPr>
+                <w:sz w:val="19"/>
+                <w:szCs w:val="19"/>
+              </w:rPr>
+              <w:t>FilmAgeRating</w:t>
+            </w:r>
+            <w:proofErr w:type="spellEnd"/>
+          </w:p>
+        </w:tc>
+        <w:tc>
+          <w:tcPr>
+            <w:tcW w:w="1900" w:type="dxa"/>
+            <w:tcMar>
+              <w:top w:w="50" w:type="dxa"/>
+              <w:left w:w="90" w:type="dxa"/>
+              <w:bottom w:w="50" w:type="dxa"/>
+              <w:right w:w="90" w:type="dxa"/>
+            </w:tcMar>
+          </w:tcPr>
+          <w:p>
+            <w:r>
+              <w:rPr>
+                <w:sz w:val="19"/>
+                <w:szCs w:val="19"/>
+              </w:rPr>
+              <w:t>Presence, Lookup</w:t>
+            </w:r>
+          </w:p>
+        </w:tc>
+        <w:tc>
+          <w:tcPr>
+            <w:tcW w:w="3360" w:type="dxa"/>
+            <w:tcMar>
+              <w:top w:w="50" w:type="dxa"/>
+              <w:left w:w="90" w:type="dxa"/>
+              <w:bottom w:w="50" w:type="dxa"/>
+              <w:right w:w="90" w:type="dxa"/>
+            </w:tcMar>
+          </w:tcPr>
+          <w:p>
+            <w:r>
+              <w:rPr>
+                <w:sz w:val="19"/>
+                <w:szCs w:val="19"/>
+              </w:rPr>
+              <w:t>Must be chosen from the allowed ratings (U, PG, 12A, 15, 18)</w:t>
+            </w:r>
+          </w:p>
+        </w:tc>
+        <w:tc>
+          <w:tcPr>
+            <w:tcW w:w="2200" w:type="dxa"/>
+            <w:tcMar>
+              <w:top w:w="50" w:type="dxa"/>
+              <w:left w:w="90" w:type="dxa"/>
+              <w:bottom w:w="50" w:type="dxa"/>
+              <w:right w:w="90" w:type="dxa"/>
+            </w:tcMar>
+          </w:tcPr>
+          <w:p>
+            <w:r>
+              <w:rPr>
+                <w:sz w:val="19"/>
+                <w:szCs w:val="19"/>
+              </w:rPr>
+              <w:t>"Please select an age rating"</w:t>
+            </w:r>
+          </w:p>
+        </w:tc>
+      </w:tr>
+      <w:tr>
+        <w:tblPrEx>
+          <w:tblCellMar>
+            <w:top w:w="0" w:type="dxa"/>
+            <w:bottom w:w="0" w:type="dxa"/>
+          </w:tblCellMar>
+        </w:tblPrEx>
+        <w:tc>
+          <w:tcPr>
+            <w:tcW w:w="1900" w:type="dxa"/>
+            <w:tcMar>
+              <w:top w:w="50" w:type="dxa"/>
+              <w:left w:w="90" w:type="dxa"/>
+              <w:bottom w:w="50" w:type="dxa"/>
+              <w:right w:w="90" w:type="dxa"/>
+            </w:tcMar>
+          </w:tcPr>
+          <w:p>
+            <w:proofErr w:type="spellStart"/>
+            <w:r>
+              <w:rPr>
+                <w:sz w:val="19"/>
+                <w:szCs w:val="19"/>
+              </w:rPr>
+              <w:lastRenderedPageBreak/>
+              <w:t>FilmDuration</w:t>
+            </w:r>
+            <w:proofErr w:type="spellEnd"/>
+          </w:p>
+        </w:tc>
+        <w:tc>
+          <w:tcPr>
+            <w:tcW w:w="1900" w:type="dxa"/>
+            <w:tcMar>
+              <w:top w:w="50" w:type="dxa"/>
+              <w:left w:w="90" w:type="dxa"/>
+              <w:bottom w:w="50" w:type="dxa"/>
+              <w:right w:w="90" w:type="dxa"/>
+            </w:tcMar>
+          </w:tcPr>
+          <w:p>
+            <w:r>
+              <w:rPr>
+                <w:sz w:val="19"/>
+                <w:szCs w:val="19"/>
+              </w:rPr>
+              <w:t>Presence, Type, Range</w:t>
+            </w:r>
+          </w:p>
+        </w:tc>
+        <w:tc>
+          <w:tcPr>
+            <w:tcW w:w="3360" w:type="dxa"/>
+            <w:tcMar>
+              <w:top w:w="50" w:type="dxa"/>
+              <w:left w:w="90" w:type="dxa"/>
+              <w:bottom w:w="50" w:type="dxa"/>
+              <w:right w:w="90" w:type="dxa"/>
+            </w:tcMar>
+          </w:tcPr>
+          <w:p>
+            <w:r>
+              <w:rPr>
+                <w:sz w:val="19"/>
+                <w:szCs w:val="19"/>
+              </w:rPr>
+              <w:t>Must be a whole number between 1 and 300 minutes</w:t>
+            </w:r>
+          </w:p>
+        </w:tc>
+        <w:tc>
+          <w:tcPr>
+            <w:tcW w:w="2200" w:type="dxa"/>
+            <w:tcMar>
+              <w:top w:w="50" w:type="dxa"/>
+              <w:left w:w="90" w:type="dxa"/>
+              <w:bottom w:w="50" w:type="dxa"/>
+              <w:right w:w="90" w:type="dxa"/>
+            </w:tcMar>
+          </w:tcPr>
+          <w:p>
+            <w:r>
+              <w:rPr>
+                <w:sz w:val="19"/>
+                <w:szCs w:val="19"/>
+              </w:rPr>
+              <w:t>"Duration must be a whole number of minutes"</w:t>
+            </w:r>
+          </w:p>
+        </w:tc>
+      </w:tr>
+      <w:tr>
+        <w:tblPrEx>
+          <w:tblCellMar>
+            <w:top w:w="0" w:type="dxa"/>
+            <w:bottom w:w="0" w:type="dxa"/>
+          </w:tblCellMar>
+        </w:tblPrEx>
+        <w:tc>
+          <w:tcPr>
+            <w:tcW w:w="1900" w:type="dxa"/>
+            <w:tcMar>
+              <w:top w:w="50" w:type="dxa"/>
+              <w:left w:w="90" w:type="dxa"/>
+              <w:bottom w:w="50" w:type="dxa"/>
+              <w:right w:w="90" w:type="dxa"/>
+            </w:tcMar>
+          </w:tcPr>
+          <w:p>
+            <w:proofErr w:type="spellStart"/>
+            <w:r>
+              <w:rPr>
+                <w:sz w:val="19"/>
+                <w:szCs w:val="19"/>
+              </w:rPr>
+              <w:t>FilmDescription</w:t>
+            </w:r>
+            <w:proofErr w:type="spellEnd"/>
+          </w:p>
+        </w:tc>
+        <w:tc>
+          <w:tcPr>
+            <w:tcW w:w="1900" w:type="dxa"/>
+            <w:tcMar>
+              <w:top w:w="50" w:type="dxa"/>
+              <w:left w:w="90" w:type="dxa"/>
+              <w:bottom w:w="50" w:type="dxa"/>
+              <w:right w:w="90" w:type="dxa"/>
+            </w:tcMar>
+          </w:tcPr>
+          <w:p>
+            <w:r>
+              <w:rPr>
+                <w:sz w:val="19"/>
+                <w:szCs w:val="19"/>
+              </w:rPr>
+              <w:t>Length</w:t>
+            </w:r>
+          </w:p>
+        </w:tc>
+        <w:tc>
+          <w:tcPr>
+            <w:tcW w:w="3360" w:type="dxa"/>
+            <w:tcMar>
+              <w:top w:w="50" w:type="dxa"/>
+              <w:left w:w="90" w:type="dxa"/>
+              <w:bottom w:w="50" w:type="dxa"/>
+              <w:right w:w="90" w:type="dxa"/>
+            </w:tcMar>
+          </w:tcPr>
+          <w:p>
+            <w:r>
+              <w:rPr>
+                <w:sz w:val="19"/>
+                <w:szCs w:val="19"/>
+              </w:rPr>
+              <w:t>Must be 255 characters or fewer</w:t>
+            </w:r>
+          </w:p>
+        </w:tc>
+        <w:tc>
+          <w:tcPr>
+            <w:tcW w:w="2200" w:type="dxa"/>
+            <w:tcMar>
+              <w:top w:w="50" w:type="dxa"/>
+              <w:left w:w="90" w:type="dxa"/>
+              <w:bottom w:w="50" w:type="dxa"/>
+              <w:right w:w="90" w:type="dxa"/>
+            </w:tcMar>
+          </w:tcPr>
+          <w:p>
+            <w:r>
+              <w:rPr>
+                <w:sz w:val="19"/>
+                <w:szCs w:val="19"/>
+              </w:rPr>
+              <w:t>"The description is too long"</w:t>
+            </w:r>
+          </w:p>
+        </w:tc>
+      </w:tr>
+    </w:tbl>
+    <w:p>
+      <w:pPr>
+        <w:spacing w:after="120"/>
+      </w:pPr>
+    </w:p>
+    <w:p>
+      <w:pPr>
+        <w:pStyle w:val="Heading3"/>
+        <w:rPr>
+          <w:b/>
+          <w:bCs/>
+          <w:color w:val="000000" w:themeColor="text1"/>
+        </w:rPr>
+      </w:pPr>
+      <w:r>
+        <w:rPr>
+          <w:b/>
+          <w:bCs/>
+          <w:color w:val="000000" w:themeColor="text1"/>
+        </w:rPr>
+        <w:t>Add Screen Form</w:t>
+      </w:r>
+    </w:p>
+    <w:tbl>
+      <w:tblPr>
+        <w:tblW w:w="9360" w:type="dxa"/>
+        <w:tblBorders>
+          <w:top w:val="single" w:sz="1" w:space="0" w:color="BFBFBF"/>
+          <w:left w:val="single" w:sz="1" w:space="0" w:color="BFBFBF"/>
+          <w:bottom w:val="single" w:sz="1" w:space="0" w:color="BFBFBF"/>
+          <w:right w:val="single" w:sz="1" w:space="0" w:color="BFBFBF"/>
+          <w:insideH w:val="single" w:sz="1" w:space="0" w:color="BFBFBF"/>
+          <w:insideV w:val="single" w:sz="1" w:space="0" w:color="BFBFBF"/>
+        </w:tblBorders>
+        <w:tblCellMar>
+          <w:left w:w="10" w:type="dxa"/>
+          <w:right w:w="10" w:type="dxa"/>
+        </w:tblCellMar>
+        <w:tblLook w:val="0000" w:firstRow="0" w:lastRow="0" w:firstColumn="0" w:lastColumn="0" w:noHBand="0" w:noVBand="0"/>
+      </w:tblPr>
+      <w:tblGrid>
+        <w:gridCol w:w="1900"/>
+        <w:gridCol w:w="1900"/>
+        <w:gridCol w:w="3360"/>
+        <w:gridCol w:w="2200"/>
+      </w:tblGrid>
+      <w:tr>
+        <w:tblPrEx>
+          <w:tblCellMar>
+            <w:top w:w="0" w:type="dxa"/>
+            <w:bottom w:w="0" w:type="dxa"/>
+          </w:tblCellMar>
+        </w:tblPrEx>
+        <w:tc>
+          <w:tcPr>
+            <w:tcW w:w="1900" w:type="dxa"/>
+            <w:shd w:val="clear" w:color="auto" w:fill="D9E2F3"/>
+            <w:tcMar>
+              <w:top w:w="50" w:type="dxa"/>
+              <w:left w:w="90" w:type="dxa"/>
+              <w:bottom w:w="50" w:type="dxa"/>
+              <w:right w:w="90" w:type="dxa"/>
+            </w:tcMar>
+          </w:tcPr>
+          <w:p>
+            <w:r>
+              <w:rPr>
+                <w:b/>
+                <w:bCs/>
+                <w:sz w:val="19"/>
+                <w:szCs w:val="19"/>
+              </w:rPr>
+              <w:t>Field</w:t>
+            </w:r>
+          </w:p>
+        </w:tc>
+        <w:tc>
+          <w:tcPr>
+            <w:tcW w:w="1900" w:type="dxa"/>
+            <w:shd w:val="clear" w:color="auto" w:fill="D9E2F3"/>
+            <w:tcMar>
+              <w:top w:w="50" w:type="dxa"/>
+              <w:left w:w="90" w:type="dxa"/>
+              <w:bottom w:w="50" w:type="dxa"/>
+              <w:right w:w="90" w:type="dxa"/>
+            </w:tcMar>
+          </w:tcPr>
+          <w:p>
+            <w:r>
+              <w:rPr>
+                <w:b/>
+                <w:bCs/>
+                <w:sz w:val="19"/>
+                <w:szCs w:val="19"/>
+              </w:rPr>
+              <w:t>Validation Type</w:t>
+            </w:r>
+          </w:p>
+        </w:tc>
+        <w:tc>
+          <w:tcPr>
+            <w:tcW w:w="3360" w:type="dxa"/>
+            <w:shd w:val="clear" w:color="auto" w:fill="D9E2F3"/>
+            <w:tcMar>
+              <w:top w:w="50" w:type="dxa"/>
+              <w:left w:w="90" w:type="dxa"/>
+              <w:bottom w:w="50" w:type="dxa"/>
+              <w:right w:w="90" w:type="dxa"/>
+            </w:tcMar>
+          </w:tcPr>
+          <w:p>
+            <w:r>
+              <w:rPr>
+                <w:b/>
+                <w:bCs/>
+                <w:sz w:val="19"/>
+                <w:szCs w:val="19"/>
+              </w:rPr>
+              <w:t>Rule</w:t>
+            </w:r>
+          </w:p>
+        </w:tc>
+        <w:tc>
+          <w:tcPr>
+            <w:tcW w:w="2200" w:type="dxa"/>
+            <w:shd w:val="clear" w:color="auto" w:fill="D9E2F3"/>
+            <w:tcMar>
+              <w:top w:w="50" w:type="dxa"/>
+              <w:left w:w="90" w:type="dxa"/>
+              <w:bottom w:w="50" w:type="dxa"/>
+              <w:right w:w="90" w:type="dxa"/>
+            </w:tcMar>
+          </w:tcPr>
+          <w:p>
+            <w:r>
+              <w:rPr>
+                <w:b/>
+                <w:bCs/>
+                <w:sz w:val="19"/>
+                <w:szCs w:val="19"/>
+              </w:rPr>
+              <w:t>Error Message</w:t>
+            </w:r>
+          </w:p>
+        </w:tc>
+      </w:tr>
+      <w:tr>
+        <w:tblPrEx>
+          <w:tblCellMar>
+            <w:top w:w="0" w:type="dxa"/>
+            <w:bottom w:w="0" w:type="dxa"/>
+          </w:tblCellMar>
+        </w:tblPrEx>
+        <w:tc>
+          <w:tcPr>
+            <w:tcW w:w="1900" w:type="dxa"/>
+            <w:tcMar>
+              <w:top w:w="50" w:type="dxa"/>
+              <w:left w:w="90" w:type="dxa"/>
+              <w:bottom w:w="50" w:type="dxa"/>
+              <w:right w:w="90" w:type="dxa"/>
+            </w:tcMar>
+          </w:tcPr>
+          <w:p>
+            <w:proofErr w:type="spellStart"/>
+            <w:r>
+              <w:rPr>
+                <w:sz w:val="19"/>
+                <w:szCs w:val="19"/>
+              </w:rPr>
+              <w:t>ScreenName</w:t>
+            </w:r>
+            <w:proofErr w:type="spellEnd"/>
+          </w:p>
+        </w:tc>
+        <w:tc>
+          <w:tcPr>
+            <w:tcW w:w="1900" w:type="dxa"/>
+            <w:tcMar>
+              <w:top w:w="50" w:type="dxa"/>
+              <w:left w:w="90" w:type="dxa"/>
+              <w:bottom w:w="50" w:type="dxa"/>
+              <w:right w:w="90" w:type="dxa"/>
+            </w:tcMar>
+          </w:tcPr>
+          <w:p>
+            <w:r>
+              <w:rPr>
+                <w:sz w:val="19"/>
+                <w:szCs w:val="19"/>
+              </w:rPr>
+              <w:t>Presence, Length</w:t>
+            </w:r>
+          </w:p>
+        </w:tc>
+        <w:tc>
+          <w:tcPr>
+            <w:tcW w:w="3360" w:type="dxa"/>
+            <w:tcMar>
+              <w:top w:w="50" w:type="dxa"/>
+              <w:left w:w="90" w:type="dxa"/>
+              <w:bottom w:w="50" w:type="dxa"/>
+              <w:right w:w="90" w:type="dxa"/>
+            </w:tcMar>
+          </w:tcPr>
+          <w:p>
+            <w:r>
+              <w:rPr>
+                <w:sz w:val="19"/>
+                <w:szCs w:val="19"/>
+              </w:rPr>
+              <w:t>Must not be blank and must be 30 characters or fewer</w:t>
+            </w:r>
+          </w:p>
+        </w:tc>
+        <w:tc>
+          <w:tcPr>
+            <w:tcW w:w="2200" w:type="dxa"/>
+            <w:tcMar>
+              <w:top w:w="50" w:type="dxa"/>
+              <w:left w:w="90" w:type="dxa"/>
+              <w:bottom w:w="50" w:type="dxa"/>
+              <w:right w:w="90" w:type="dxa"/>
+            </w:tcMar>
+          </w:tcPr>
+          <w:p>
+            <w:r>
+              <w:rPr>
+                <w:sz w:val="19"/>
+                <w:szCs w:val="19"/>
+              </w:rPr>
+              <w:t>"Please enter a screen name"</w:t>
+            </w:r>
+          </w:p>
+        </w:tc>
+      </w:tr>
+      <w:tr>
+        <w:tblPrEx>
+          <w:tblCellMar>
+            <w:top w:w="0" w:type="dxa"/>
+            <w:bottom w:w="0" w:type="dxa"/>
+          </w:tblCellMar>
+        </w:tblPrEx>
+        <w:tc>
+          <w:tcPr>
+            <w:tcW w:w="1900" w:type="dxa"/>
+            <w:tcMar>
+              <w:top w:w="50" w:type="dxa"/>
+              <w:left w:w="90" w:type="dxa"/>
+              <w:bottom w:w="50" w:type="dxa"/>
+              <w:right w:w="90" w:type="dxa"/>
+            </w:tcMar>
+          </w:tcPr>
+          <w:p>
+            <w:proofErr w:type="spellStart"/>
+            <w:r>
+              <w:rPr>
+                <w:sz w:val="19"/>
+                <w:szCs w:val="19"/>
+              </w:rPr>
+              <w:t>ScreenCapacity</w:t>
+            </w:r>
+            <w:proofErr w:type="spellEnd"/>
+          </w:p>
+        </w:tc>
+        <w:tc>
+          <w:tcPr>
+            <w:tcW w:w="1900" w:type="dxa"/>
+            <w:tcMar>
+              <w:top w:w="50" w:type="dxa"/>
+              <w:left w:w="90" w:type="dxa"/>
+              <w:bottom w:w="50" w:type="dxa"/>
+              <w:right w:w="90" w:type="dxa"/>
+            </w:tcMar>
+          </w:tcPr>
+          <w:p>
+            <w:r>
+              <w:rPr>
+                <w:sz w:val="19"/>
+                <w:szCs w:val="19"/>
+              </w:rPr>
+              <w:t>Presence, Type, Range</w:t>
+            </w:r>
+          </w:p>
+        </w:tc>
+        <w:tc>
+          <w:tcPr>
+            <w:tcW w:w="3360" w:type="dxa"/>
+            <w:tcMar>
+              <w:top w:w="50" w:type="dxa"/>
+              <w:left w:w="90" w:type="dxa"/>
+              <w:bottom w:w="50" w:type="dxa"/>
+              <w:right w:w="90" w:type="dxa"/>
+            </w:tcMar>
+          </w:tcPr>
+          <w:p>
+            <w:r>
+              <w:rPr>
+                <w:sz w:val="19"/>
+                <w:szCs w:val="19"/>
+              </w:rPr>
+              <w:t>Must be a whole number between 1 and 300</w:t>
+            </w:r>
+          </w:p>
+        </w:tc>
+        <w:tc>
+          <w:tcPr>
+            <w:tcW w:w="2200" w:type="dxa"/>
+            <w:tcMar>
+              <w:top w:w="50" w:type="dxa"/>
+              <w:left w:w="90" w:type="dxa"/>
+              <w:bottom w:w="50" w:type="dxa"/>
+              <w:right w:w="90" w:type="dxa"/>
+            </w:tcMar>
+          </w:tcPr>
+          <w:p>
+            <w:r>
+              <w:rPr>
+                <w:sz w:val="19"/>
+                <w:szCs w:val="19"/>
+              </w:rPr>
+              <w:t>"Capacity must be a whole number"</w:t>
+            </w:r>
+          </w:p>
+        </w:tc>
+      </w:tr>
+    </w:tbl>
+    <w:p>
+      <w:pPr>
+        <w:spacing w:after="120"/>
+      </w:pPr>
+    </w:p>
+    <w:p>
+      <w:pPr>
+        <w:pStyle w:val="Heading3"/>
+        <w:rPr>
+          <w:b/>
+          <w:bCs/>
+          <w:color w:val="000000" w:themeColor="text1"/>
+        </w:rPr>
+      </w:pPr>
+      <w:r>
+        <w:rPr>
+          <w:b/>
+          <w:bCs/>
+          <w:color w:val="000000" w:themeColor="text1"/>
+        </w:rPr>
+        <w:t>Add Screening Form</w:t>
+      </w:r>
+    </w:p>
+    <w:tbl>
+      <w:tblPr>
+        <w:tblW w:w="9360" w:type="dxa"/>
+        <w:tblBorders>
+          <w:top w:val="single" w:sz="1" w:space="0" w:color="BFBFBF"/>
+          <w:left w:val="single" w:sz="1" w:space="0" w:color="BFBFBF"/>
+          <w:bottom w:val="single" w:sz="1" w:space="0" w:color="BFBFBF"/>
+          <w:right w:val="single" w:sz="1" w:space="0" w:color="BFBFBF"/>
+          <w:insideH w:val="single" w:sz="1" w:space="0" w:color="BFBFBF"/>
+          <w:insideV w:val="single" w:sz="1" w:space="0" w:color="BFBFBF"/>
+        </w:tblBorders>
+        <w:tblCellMar>
+          <w:left w:w="10" w:type="dxa"/>
+          <w:right w:w="10" w:type="dxa"/>
+        </w:tblCellMar>
+        <w:tblLook w:val="0000" w:firstRow="0" w:lastRow="0" w:firstColumn="0" w:lastColumn="0" w:noHBand="0" w:noVBand="0"/>
+      </w:tblPr>
+      <w:tblGrid>
+        <w:gridCol w:w="1900"/>
+        <w:gridCol w:w="1900"/>
+        <w:gridCol w:w="3360"/>
+        <w:gridCol w:w="2200"/>
+      </w:tblGrid>
+      <w:tr>
+        <w:tblPrEx>
+          <w:tblCellMar>
+            <w:top w:w="0" w:type="dxa"/>
+            <w:bottom w:w="0" w:type="dxa"/>
+          </w:tblCellMar>
+        </w:tblPrEx>
+        <w:tc>
+          <w:tcPr>
+            <w:tcW w:w="1900" w:type="dxa"/>
+            <w:shd w:val="clear" w:color="auto" w:fill="D9E2F3"/>
+            <w:tcMar>
+              <w:top w:w="50" w:type="dxa"/>
+              <w:left w:w="90" w:type="dxa"/>
+              <w:bottom w:w="50" w:type="dxa"/>
+              <w:right w:w="90" w:type="dxa"/>
+            </w:tcMar>
+          </w:tcPr>
+          <w:p>
+            <w:r>
+              <w:rPr>
+                <w:b/>
+                <w:bCs/>
+                <w:sz w:val="19"/>
+                <w:szCs w:val="19"/>
+              </w:rPr>
+              <w:t>Field</w:t>
+            </w:r>
+          </w:p>
+        </w:tc>
+        <w:tc>
+          <w:tcPr>
+            <w:tcW w:w="1900" w:type="dxa"/>
+            <w:shd w:val="clear" w:color="auto" w:fill="D9E2F3"/>
+            <w:tcMar>
+              <w:top w:w="50" w:type="dxa"/>
+              <w:left w:w="90" w:type="dxa"/>
+              <w:bottom w:w="50" w:type="dxa"/>
+              <w:right w:w="90" w:type="dxa"/>
+            </w:tcMar>
+          </w:tcPr>
+          <w:p>
+            <w:r>
+              <w:rPr>
+                <w:b/>
+                <w:bCs/>
+                <w:sz w:val="19"/>
+                <w:szCs w:val="19"/>
+              </w:rPr>
+              <w:t>Validation Type</w:t>
+            </w:r>
+          </w:p>
+        </w:tc>
+        <w:tc>
+          <w:tcPr>
+            <w:tcW w:w="3360" w:type="dxa"/>
+            <w:shd w:val="clear" w:color="auto" w:fill="D9E2F3"/>
+            <w:tcMar>
+              <w:top w:w="50" w:type="dxa"/>
+              <w:left w:w="90" w:type="dxa"/>
+              <w:bottom w:w="50" w:type="dxa"/>
+              <w:right w:w="90" w:type="dxa"/>
+            </w:tcMar>
+          </w:tcPr>
+          <w:p>
+            <w:r>
+              <w:rPr>
+                <w:b/>
+                <w:bCs/>
+                <w:sz w:val="19"/>
+                <w:szCs w:val="19"/>
+              </w:rPr>
+              <w:t>Rule</w:t>
+            </w:r>
+          </w:p>
+        </w:tc>
+        <w:tc>
+          <w:tcPr>
+            <w:tcW w:w="2200" w:type="dxa"/>
+            <w:shd w:val="clear" w:color="auto" w:fill="D9E2F3"/>
+            <w:tcMar>
+              <w:top w:w="50" w:type="dxa"/>
+              <w:left w:w="90" w:type="dxa"/>
+              <w:bottom w:w="50" w:type="dxa"/>
+              <w:right w:w="90" w:type="dxa"/>
+            </w:tcMar>
+          </w:tcPr>
+          <w:p>
+            <w:r>
+              <w:rPr>
+                <w:b/>
+                <w:bCs/>
+                <w:sz w:val="19"/>
+                <w:szCs w:val="19"/>
+              </w:rPr>
+              <w:t>Error Message</w:t>
+            </w:r>
+          </w:p>
+        </w:tc>
+      </w:tr>
+      <w:tr>
+        <w:tblPrEx>
+          <w:tblCellMar>
+            <w:top w:w="0" w:type="dxa"/>
+            <w:bottom w:w="0" w:type="dxa"/>
+          </w:tblCellMar>
+        </w:tblPrEx>
+        <w:tc>
+          <w:tcPr>
+            <w:tcW w:w="1900" w:type="dxa"/>
+            <w:tcMar>
+              <w:top w:w="50" w:type="dxa"/>
+              <w:left w:w="90" w:type="dxa"/>
+              <w:bottom w:w="50" w:type="dxa"/>
+              <w:right w:w="90" w:type="dxa"/>
+            </w:tcMar>
+          </w:tcPr>
+          <w:p>
+            <w:r>
+              <w:rPr>
+                <w:sz w:val="19"/>
+                <w:szCs w:val="19"/>
+              </w:rPr>
+              <w:t>Film</w:t>
+            </w:r>
+          </w:p>
+        </w:tc>
+        <w:tc>
+          <w:tcPr>
+            <w:tcW w:w="1900" w:type="dxa"/>
+            <w:tcMar>
+              <w:top w:w="50" w:type="dxa"/>
+              <w:left w:w="90" w:type="dxa"/>
+              <w:bottom w:w="50" w:type="dxa"/>
+              <w:right w:w="90" w:type="dxa"/>
+            </w:tcMar>
+          </w:tcPr>
+          <w:p>
+            <w:r>
+              <w:rPr>
+                <w:sz w:val="19"/>
+                <w:szCs w:val="19"/>
+              </w:rPr>
+              <w:t>Presence, Lookup</w:t>
+            </w:r>
+          </w:p>
+        </w:tc>
+        <w:tc>
+          <w:tcPr>
+            <w:tcW w:w="3360" w:type="dxa"/>
+            <w:tcMar>
+              <w:top w:w="50" w:type="dxa"/>
+              <w:left w:w="90" w:type="dxa"/>
+              <w:bottom w:w="50" w:type="dxa"/>
+              <w:right w:w="90" w:type="dxa"/>
+            </w:tcMar>
+          </w:tcPr>
+          <w:p>
+            <w:r>
+              <w:rPr>
+                <w:sz w:val="19"/>
+                <w:szCs w:val="19"/>
+              </w:rPr>
+              <w:t>A film must be selected from the existing films</w:t>
+            </w:r>
+          </w:p>
+        </w:tc>
+        <w:tc>
+          <w:tcPr>
+            <w:tcW w:w="2200" w:type="dxa"/>
+            <w:tcMar>
+              <w:top w:w="50" w:type="dxa"/>
+              <w:left w:w="90" w:type="dxa"/>
+              <w:bottom w:w="50" w:type="dxa"/>
+              <w:right w:w="90" w:type="dxa"/>
+            </w:tcMar>
+          </w:tcPr>
+          <w:p>
+            <w:r>
+              <w:rPr>
+                <w:sz w:val="19"/>
+                <w:szCs w:val="19"/>
+              </w:rPr>
+              <w:t>"Please select a film"</w:t>
+            </w:r>
+          </w:p>
+        </w:tc>
+      </w:tr>
+      <w:tr>
+        <w:tblPrEx>
+          <w:tblCellMar>
+            <w:top w:w="0" w:type="dxa"/>
+            <w:bottom w:w="0" w:type="dxa"/>
+          </w:tblCellMar>
+        </w:tblPrEx>
+        <w:tc>
+          <w:tcPr>
+            <w:tcW w:w="1900" w:type="dxa"/>
+            <w:tcMar>
+              <w:top w:w="50" w:type="dxa"/>
+              <w:left w:w="90" w:type="dxa"/>
+              <w:bottom w:w="50" w:type="dxa"/>
+              <w:right w:w="90" w:type="dxa"/>
+            </w:tcMar>
+          </w:tcPr>
+          <w:p>
+            <w:r>
+              <w:rPr>
+                <w:sz w:val="19"/>
+                <w:szCs w:val="19"/>
+              </w:rPr>
+              <w:t>Screen</w:t>
+            </w:r>
+          </w:p>
+        </w:tc>
+        <w:tc>
+          <w:tcPr>
+            <w:tcW w:w="1900" w:type="dxa"/>
+            <w:tcMar>
+              <w:top w:w="50" w:type="dxa"/>
+              <w:left w:w="90" w:type="dxa"/>
+              <w:bottom w:w="50" w:type="dxa"/>
+              <w:right w:w="90" w:type="dxa"/>
+            </w:tcMar>
+          </w:tcPr>
+          <w:p>
+            <w:r>
+              <w:rPr>
+                <w:sz w:val="19"/>
+                <w:szCs w:val="19"/>
+              </w:rPr>
+              <w:t>Presence, Lookup</w:t>
+            </w:r>
+          </w:p>
+        </w:tc>
+        <w:tc>
+          <w:tcPr>
+            <w:tcW w:w="3360" w:type="dxa"/>
+            <w:tcMar>
+              <w:top w:w="50" w:type="dxa"/>
+              <w:left w:w="90" w:type="dxa"/>
+              <w:bottom w:w="50" w:type="dxa"/>
+              <w:right w:w="90" w:type="dxa"/>
+            </w:tcMar>
+          </w:tcPr>
+          <w:p>
+            <w:r>
+              <w:rPr>
+                <w:sz w:val="19"/>
+                <w:szCs w:val="19"/>
+              </w:rPr>
+              <w:t>A screen must be selected from the existing screens</w:t>
+            </w:r>
+          </w:p>
+        </w:tc>
+        <w:tc>
+          <w:tcPr>
+            <w:tcW w:w="2200" w:type="dxa"/>
+            <w:tcMar>
+              <w:top w:w="50" w:type="dxa"/>
+              <w:left w:w="90" w:type="dxa"/>
+              <w:bottom w:w="50" w:type="dxa"/>
+              <w:right w:w="90" w:type="dxa"/>
+            </w:tcMar>
+          </w:tcPr>
+          <w:p>
+            <w:r>
+              <w:rPr>
+                <w:sz w:val="19"/>
+                <w:szCs w:val="19"/>
+              </w:rPr>
+              <w:t>"Please select a screen"</w:t>
+            </w:r>
+          </w:p>
+        </w:tc>
+      </w:tr>
+      <w:tr>
+        <w:tblPrEx>
+          <w:tblCellMar>
+            <w:top w:w="0" w:type="dxa"/>
+            <w:bottom w:w="0" w:type="dxa"/>
+          </w:tblCellMar>
+        </w:tblPrEx>
+        <w:tc>
+          <w:tcPr>
+            <w:tcW w:w="1900" w:type="dxa"/>
+            <w:tcMar>
+              <w:top w:w="50" w:type="dxa"/>
+              <w:left w:w="90" w:type="dxa"/>
+              <w:bottom w:w="50" w:type="dxa"/>
+              <w:right w:w="90" w:type="dxa"/>
+            </w:tcMar>
+          </w:tcPr>
+          <w:p>
+            <w:proofErr w:type="spellStart"/>
+            <w:r>
+              <w:rPr>
+                <w:sz w:val="19"/>
+                <w:szCs w:val="19"/>
+              </w:rPr>
+              <w:t>ScreeningDate</w:t>
+            </w:r>
+            <w:proofErr w:type="spellEnd"/>
+          </w:p>
+        </w:tc>
+        <w:tc>
+          <w:tcPr>
+            <w:tcW w:w="1900" w:type="dxa"/>
+            <w:tcMar>
+              <w:top w:w="50" w:type="dxa"/>
+              <w:left w:w="90" w:type="dxa"/>
+              <w:bottom w:w="50" w:type="dxa"/>
+              <w:right w:w="90" w:type="dxa"/>
+            </w:tcMar>
+          </w:tcPr>
+          <w:p>
+            <w:r>
+              <w:rPr>
+                <w:sz w:val="19"/>
+                <w:szCs w:val="19"/>
+              </w:rPr>
+              <w:t>Presence, Format, Range</w:t>
+            </w:r>
+          </w:p>
+        </w:tc>
+        <w:tc>
+          <w:tcPr>
+            <w:tcW w:w="3360" w:type="dxa"/>
+            <w:tcMar>
+              <w:top w:w="50" w:type="dxa"/>
+              <w:left w:w="90" w:type="dxa"/>
+              <w:bottom w:w="50" w:type="dxa"/>
+              <w:right w:w="90" w:type="dxa"/>
+            </w:tcMar>
+          </w:tcPr>
+          <w:p>
+            <w:r>
+              <w:rPr>
+                <w:sz w:val="19"/>
+                <w:szCs w:val="19"/>
+              </w:rPr>
+              <w:t>Must be a valid date and must not be in the past</w:t>
+            </w:r>
+          </w:p>
+        </w:tc>
+        <w:tc>
+          <w:tcPr>
+            <w:tcW w:w="2200" w:type="dxa"/>
+            <w:tcMar>
+              <w:top w:w="50" w:type="dxa"/>
+              <w:left w:w="90" w:type="dxa"/>
+              <w:bottom w:w="50" w:type="dxa"/>
+              <w:right w:w="90" w:type="dxa"/>
+            </w:tcMar>
+          </w:tcPr>
+          <w:p>
+            <w:r>
+              <w:rPr>
+                <w:sz w:val="19"/>
+                <w:szCs w:val="19"/>
+              </w:rPr>
+              <w:t>"Please enter a valid date that is not in the past"</w:t>
+            </w:r>
+          </w:p>
+        </w:tc>
+      </w:tr>
+      <w:tr>
+        <w:tblPrEx>
+          <w:tblCellMar>
+            <w:top w:w="0" w:type="dxa"/>
+            <w:bottom w:w="0" w:type="dxa"/>
+          </w:tblCellMar>
+        </w:tblPrEx>
+        <w:tc>
+          <w:tcPr>
+            <w:tcW w:w="1900" w:type="dxa"/>
+            <w:tcMar>
+              <w:top w:w="50" w:type="dxa"/>
+              <w:left w:w="90" w:type="dxa"/>
+              <w:bottom w:w="50" w:type="dxa"/>
+              <w:right w:w="90" w:type="dxa"/>
+            </w:tcMar>
+          </w:tcPr>
+          <w:p>
+            <w:proofErr w:type="spellStart"/>
+            <w:r>
+              <w:rPr>
+                <w:sz w:val="19"/>
+                <w:szCs w:val="19"/>
+              </w:rPr>
+              <w:t>ScreeningTime</w:t>
+            </w:r>
+            <w:proofErr w:type="spellEnd"/>
+          </w:p>
+        </w:tc>
+        <w:tc>
+          <w:tcPr>
+            <w:tcW w:w="1900" w:type="dxa"/>
+            <w:tcMar>
+              <w:top w:w="50" w:type="dxa"/>
+              <w:left w:w="90" w:type="dxa"/>
+              <w:bottom w:w="50" w:type="dxa"/>
+              <w:right w:w="90" w:type="dxa"/>
+            </w:tcMar>
+          </w:tcPr>
+          <w:p>
+            <w:r>
+              <w:rPr>
+                <w:sz w:val="19"/>
+                <w:szCs w:val="19"/>
+              </w:rPr>
+              <w:t>Presence, Format</w:t>
+            </w:r>
+          </w:p>
+        </w:tc>
+        <w:tc>
+          <w:tcPr>
+            <w:tcW w:w="3360" w:type="dxa"/>
+            <w:tcMar>
+              <w:top w:w="50" w:type="dxa"/>
+              <w:left w:w="90" w:type="dxa"/>
+              <w:bottom w:w="50" w:type="dxa"/>
+              <w:right w:w="90" w:type="dxa"/>
+            </w:tcMar>
+          </w:tcPr>
+          <w:p>
+            <w:r>
+              <w:rPr>
+                <w:sz w:val="19"/>
+                <w:szCs w:val="19"/>
+              </w:rPr>
+              <w:t>Must be a valid time in 24 hour HH:MM format</w:t>
+            </w:r>
+          </w:p>
+        </w:tc>
+        <w:tc>
+          <w:tcPr>
+            <w:tcW w:w="2200" w:type="dxa"/>
+            <w:tcMar>
+              <w:top w:w="50" w:type="dxa"/>
+              <w:left w:w="90" w:type="dxa"/>
+              <w:bottom w:w="50" w:type="dxa"/>
+              <w:right w:w="90" w:type="dxa"/>
+            </w:tcMar>
+          </w:tcPr>
+          <w:p>
+            <w:r>
+              <w:rPr>
+                <w:sz w:val="19"/>
+                <w:szCs w:val="19"/>
+              </w:rPr>
+              <w:t>"Please enter a time in the format HH:MM"</w:t>
+            </w:r>
+          </w:p>
+        </w:tc>
+      </w:tr>
+      <w:tr>
+        <w:tblPrEx>
+          <w:tblCellMar>
+            <w:top w:w="0" w:type="dxa"/>
+            <w:bottom w:w="0" w:type="dxa"/>
+          </w:tblCellMar>
+        </w:tblPrEx>
+        <w:tc>
+          <w:tcPr>
+            <w:tcW w:w="1900" w:type="dxa"/>
+            <w:tcMar>
+              <w:top w:w="50" w:type="dxa"/>
+              <w:left w:w="90" w:type="dxa"/>
+              <w:bottom w:w="50" w:type="dxa"/>
+              <w:right w:w="90" w:type="dxa"/>
+            </w:tcMar>
+          </w:tcPr>
+          <w:p>
+            <w:proofErr w:type="spellStart"/>
+            <w:r>
+              <w:rPr>
+                <w:sz w:val="19"/>
+                <w:szCs w:val="19"/>
+              </w:rPr>
+              <w:t>TicketPrice</w:t>
+            </w:r>
+            <w:proofErr w:type="spellEnd"/>
+          </w:p>
+        </w:tc>
+        <w:tc>
+          <w:tcPr>
+            <w:tcW w:w="1900" w:type="dxa"/>
+            <w:tcMar>
+              <w:top w:w="50" w:type="dxa"/>
+              <w:left w:w="90" w:type="dxa"/>
+              <w:bottom w:w="50" w:type="dxa"/>
+              <w:right w:w="90" w:type="dxa"/>
+            </w:tcMar>
+          </w:tcPr>
+          <w:p>
+            <w:r>
+              <w:rPr>
+                <w:sz w:val="19"/>
+                <w:szCs w:val="19"/>
+              </w:rPr>
+              <w:t>Presence, Type, Range</w:t>
+            </w:r>
+          </w:p>
+        </w:tc>
+        <w:tc>
+          <w:tcPr>
+            <w:tcW w:w="3360" w:type="dxa"/>
+            <w:tcMar>
+              <w:top w:w="50" w:type="dxa"/>
+              <w:left w:w="90" w:type="dxa"/>
+              <w:bottom w:w="50" w:type="dxa"/>
+              <w:right w:w="90" w:type="dxa"/>
+            </w:tcMar>
+          </w:tcPr>
+          <w:p>
+            <w:r>
+              <w:rPr>
+                <w:sz w:val="19"/>
+                <w:szCs w:val="19"/>
+              </w:rPr>
+              <w:t>Must be a positive amount under 100</w:t>
+            </w:r>
+          </w:p>
+        </w:tc>
+        <w:tc>
+          <w:tcPr>
+            <w:tcW w:w="2200" w:type="dxa"/>
+            <w:tcMar>
+              <w:top w:w="50" w:type="dxa"/>
+              <w:left w:w="90" w:type="dxa"/>
+              <w:bottom w:w="50" w:type="dxa"/>
+              <w:right w:w="90" w:type="dxa"/>
+            </w:tcMar>
+          </w:tcPr>
+          <w:p>
+            <w:r>
+              <w:rPr>
+                <w:sz w:val="19"/>
+                <w:szCs w:val="19"/>
+              </w:rPr>
+              <w:t>"Ticket price must be a positive amount"</w:t>
+            </w:r>
+          </w:p>
+        </w:tc>
+      </w:tr>
+    </w:tbl>
+    <w:p>
+      <w:pPr>
+        <w:spacing w:after="120"/>
+      </w:pPr>
+    </w:p>
+    <w:p>
+      <w:pPr>
+        <w:pStyle w:val="Heading3"/>
+        <w:rPr>
+          <w:b/>
+          <w:bCs/>
+          <w:color w:val="000000" w:themeColor="text1"/>
+        </w:rPr>
+      </w:pPr>
+      <w:r>
+        <w:rPr>
+          <w:b/>
+          <w:bCs/>
+          <w:color w:val="000000" w:themeColor="text1"/>
+        </w:rPr>
+        <w:t>Customer Details (Booking)</w:t>
+      </w:r>
+    </w:p>
+    <w:tbl>
+      <w:tblPr>
+        <w:tblW w:w="9360" w:type="dxa"/>
+        <w:tblBorders>
+          <w:top w:val="single" w:sz="1" w:space="0" w:color="BFBFBF"/>
+          <w:left w:val="single" w:sz="1" w:space="0" w:color="BFBFBF"/>
+          <w:bottom w:val="single" w:sz="1" w:space="0" w:color="BFBFBF"/>
+          <w:right w:val="single" w:sz="1" w:space="0" w:color="BFBFBF"/>
+          <w:insideH w:val="single" w:sz="1" w:space="0" w:color="BFBFBF"/>
+          <w:insideV w:val="single" w:sz="1" w:space="0" w:color="BFBFBF"/>
+        </w:tblBorders>
+        <w:tblCellMar>
+          <w:left w:w="10" w:type="dxa"/>
+          <w:right w:w="10" w:type="dxa"/>
+        </w:tblCellMar>
+        <w:tblLook w:val="0000" w:firstRow="0" w:lastRow="0" w:firstColumn="0" w:lastColumn="0" w:noHBand="0" w:noVBand="0"/>
+      </w:tblPr>
+      <w:tblGrid>
+        <w:gridCol w:w="1900"/>
+        <w:gridCol w:w="1900"/>
+        <w:gridCol w:w="3360"/>
+        <w:gridCol w:w="2200"/>
+      </w:tblGrid>
+      <w:tr>
+        <w:tblPrEx>
+          <w:tblCellMar>
+            <w:top w:w="0" w:type="dxa"/>
+            <w:bottom w:w="0" w:type="dxa"/>
+          </w:tblCellMar>
+        </w:tblPrEx>
+        <w:tc>
+          <w:tcPr>
+            <w:tcW w:w="1900" w:type="dxa"/>
+            <w:shd w:val="clear" w:color="auto" w:fill="D9E2F3"/>
+            <w:tcMar>
+              <w:top w:w="50" w:type="dxa"/>
+              <w:left w:w="90" w:type="dxa"/>
+              <w:bottom w:w="50" w:type="dxa"/>
+              <w:right w:w="90" w:type="dxa"/>
+            </w:tcMar>
+          </w:tcPr>
+          <w:p>
+            <w:r>
+              <w:rPr>
+                <w:b/>
+                <w:bCs/>
+                <w:sz w:val="19"/>
+                <w:szCs w:val="19"/>
+              </w:rPr>
+              <w:t>Field</w:t>
+            </w:r>
+          </w:p>
+        </w:tc>
+        <w:tc>
+          <w:tcPr>
+            <w:tcW w:w="1900" w:type="dxa"/>
+            <w:shd w:val="clear" w:color="auto" w:fill="D9E2F3"/>
+            <w:tcMar>
+              <w:top w:w="50" w:type="dxa"/>
+              <w:left w:w="90" w:type="dxa"/>
+              <w:bottom w:w="50" w:type="dxa"/>
+              <w:right w:w="90" w:type="dxa"/>
+            </w:tcMar>
+          </w:tcPr>
+          <w:p>
+            <w:r>
+              <w:rPr>
+                <w:b/>
+                <w:bCs/>
+                <w:sz w:val="19"/>
+                <w:szCs w:val="19"/>
+              </w:rPr>
+              <w:t>Validation Type</w:t>
+            </w:r>
+          </w:p>
+        </w:tc>
+        <w:tc>
+          <w:tcPr>
+            <w:tcW w:w="3360" w:type="dxa"/>
+            <w:shd w:val="clear" w:color="auto" w:fill="D9E2F3"/>
+            <w:tcMar>
+              <w:top w:w="50" w:type="dxa"/>
+              <w:left w:w="90" w:type="dxa"/>
+              <w:bottom w:w="50" w:type="dxa"/>
+              <w:right w:w="90" w:type="dxa"/>
+            </w:tcMar>
+          </w:tcPr>
+          <w:p>
+            <w:r>
+              <w:rPr>
+                <w:b/>
+                <w:bCs/>
+                <w:sz w:val="19"/>
+                <w:szCs w:val="19"/>
+              </w:rPr>
+              <w:t>Rule</w:t>
+            </w:r>
+          </w:p>
+        </w:tc>
+        <w:tc>
+          <w:tcPr>
+            <w:tcW w:w="2200" w:type="dxa"/>
+            <w:shd w:val="clear" w:color="auto" w:fill="D9E2F3"/>
+            <w:tcMar>
+              <w:top w:w="50" w:type="dxa"/>
+              <w:left w:w="90" w:type="dxa"/>
+              <w:bottom w:w="50" w:type="dxa"/>
+              <w:right w:w="90" w:type="dxa"/>
+            </w:tcMar>
+          </w:tcPr>
+          <w:p>
+            <w:r>
+              <w:rPr>
+                <w:b/>
+                <w:bCs/>
+                <w:sz w:val="19"/>
+                <w:szCs w:val="19"/>
+              </w:rPr>
+              <w:t>Error Message</w:t>
+            </w:r>
+          </w:p>
+        </w:tc>
+      </w:tr>
+      <w:tr>
+        <w:tblPrEx>
+          <w:tblCellMar>
+            <w:top w:w="0" w:type="dxa"/>
+            <w:bottom w:w="0" w:type="dxa"/>
+          </w:tblCellMar>
+        </w:tblPrEx>
+        <w:tc>
+          <w:tcPr>
+            <w:tcW w:w="1900" w:type="dxa"/>
+            <w:tcMar>
+              <w:top w:w="50" w:type="dxa"/>
+              <w:left w:w="90" w:type="dxa"/>
+              <w:bottom w:w="50" w:type="dxa"/>
+              <w:right w:w="90" w:type="dxa"/>
+            </w:tcMar>
+          </w:tcPr>
+          <w:p>
+            <w:proofErr w:type="spellStart"/>
+            <w:r>
+              <w:rPr>
+                <w:sz w:val="19"/>
+                <w:szCs w:val="19"/>
+              </w:rPr>
+              <w:t>CustomerForename</w:t>
+            </w:r>
+            <w:proofErr w:type="spellEnd"/>
+          </w:p>
+        </w:tc>
+        <w:tc>
+          <w:tcPr>
+            <w:tcW w:w="1900" w:type="dxa"/>
+            <w:tcMar>
+              <w:top w:w="50" w:type="dxa"/>
+              <w:left w:w="90" w:type="dxa"/>
+              <w:bottom w:w="50" w:type="dxa"/>
+              <w:right w:w="90" w:type="dxa"/>
+            </w:tcMar>
+          </w:tcPr>
+          <w:p>
+            <w:r>
+              <w:rPr>
+                <w:sz w:val="19"/>
+                <w:szCs w:val="19"/>
+              </w:rPr>
+              <w:t>Presence, Length</w:t>
+            </w:r>
+          </w:p>
+        </w:tc>
+        <w:tc>
+          <w:tcPr>
+            <w:tcW w:w="3360" w:type="dxa"/>
+            <w:tcMar>
+              <w:top w:w="50" w:type="dxa"/>
+              <w:left w:w="90" w:type="dxa"/>
+              <w:bottom w:w="50" w:type="dxa"/>
+              <w:right w:w="90" w:type="dxa"/>
+            </w:tcMar>
+          </w:tcPr>
+          <w:p>
+            <w:r>
+              <w:rPr>
+                <w:sz w:val="19"/>
+                <w:szCs w:val="19"/>
+              </w:rPr>
+              <w:t>Must not be blank and must be 30 characters or fewer</w:t>
+            </w:r>
+          </w:p>
+        </w:tc>
+        <w:tc>
+          <w:tcPr>
+            <w:tcW w:w="2200" w:type="dxa"/>
+            <w:tcMar>
+              <w:top w:w="50" w:type="dxa"/>
+              <w:left w:w="90" w:type="dxa"/>
+              <w:bottom w:w="50" w:type="dxa"/>
+              <w:right w:w="90" w:type="dxa"/>
+            </w:tcMar>
+          </w:tcPr>
+          <w:p>
+            <w:r>
+              <w:rPr>
+                <w:sz w:val="19"/>
+                <w:szCs w:val="19"/>
+              </w:rPr>
+              <w:t>"Please enter a first name"</w:t>
+            </w:r>
+          </w:p>
+        </w:tc>
+      </w:tr>
+      <w:tr>
+        <w:tblPrEx>
+          <w:tblCellMar>
+            <w:top w:w="0" w:type="dxa"/>
+            <w:bottom w:w="0" w:type="dxa"/>
+          </w:tblCellMar>
+        </w:tblPrEx>
+        <w:tc>
+          <w:tcPr>
+            <w:tcW w:w="1900" w:type="dxa"/>
+            <w:tcMar>
+              <w:top w:w="50" w:type="dxa"/>
+              <w:left w:w="90" w:type="dxa"/>
+              <w:bottom w:w="50" w:type="dxa"/>
+              <w:right w:w="90" w:type="dxa"/>
+            </w:tcMar>
+          </w:tcPr>
+          <w:p>
+            <w:proofErr w:type="spellStart"/>
+            <w:r>
+              <w:rPr>
+                <w:sz w:val="19"/>
+                <w:szCs w:val="19"/>
+              </w:rPr>
+              <w:t>CustomerSurname</w:t>
+            </w:r>
+            <w:proofErr w:type="spellEnd"/>
+          </w:p>
+        </w:tc>
+        <w:tc>
+          <w:tcPr>
+            <w:tcW w:w="1900" w:type="dxa"/>
+            <w:tcMar>
+              <w:top w:w="50" w:type="dxa"/>
+              <w:left w:w="90" w:type="dxa"/>
+              <w:bottom w:w="50" w:type="dxa"/>
+              <w:right w:w="90" w:type="dxa"/>
+            </w:tcMar>
+          </w:tcPr>
+          <w:p>
+            <w:r>
+              <w:rPr>
+                <w:sz w:val="19"/>
+                <w:szCs w:val="19"/>
+              </w:rPr>
+              <w:t>Presence, Length</w:t>
+            </w:r>
+          </w:p>
+        </w:tc>
+        <w:tc>
+          <w:tcPr>
+            <w:tcW w:w="3360" w:type="dxa"/>
+            <w:tcMar>
+              <w:top w:w="50" w:type="dxa"/>
+              <w:left w:w="90" w:type="dxa"/>
+              <w:bottom w:w="50" w:type="dxa"/>
+              <w:right w:w="90" w:type="dxa"/>
+            </w:tcMar>
+          </w:tcPr>
+          <w:p>
+            <w:r>
+              <w:rPr>
+                <w:sz w:val="19"/>
+                <w:szCs w:val="19"/>
+              </w:rPr>
+              <w:t>Must not be blank and must be 30 characters or fewer</w:t>
+            </w:r>
+          </w:p>
+        </w:tc>
+        <w:tc>
+          <w:tcPr>
+            <w:tcW w:w="2200" w:type="dxa"/>
+            <w:tcMar>
+              <w:top w:w="50" w:type="dxa"/>
+              <w:left w:w="90" w:type="dxa"/>
+              <w:bottom w:w="50" w:type="dxa"/>
+              <w:right w:w="90" w:type="dxa"/>
+            </w:tcMar>
+          </w:tcPr>
+          <w:p>
+            <w:r>
+              <w:rPr>
+                <w:sz w:val="19"/>
+                <w:szCs w:val="19"/>
+              </w:rPr>
+              <w:t>"Please enter a surname"</w:t>
+            </w:r>
+          </w:p>
+        </w:tc>
+      </w:tr>
+      <w:tr>
+        <w:tblPrEx>
+          <w:tblCellMar>
+            <w:top w:w="0" w:type="dxa"/>
+            <w:bottom w:w="0" w:type="dxa"/>
+          </w:tblCellMar>
+        </w:tblPrEx>
+        <w:tc>
+          <w:tcPr>
+            <w:tcW w:w="1900" w:type="dxa"/>
+            <w:tcMar>
+              <w:top w:w="50" w:type="dxa"/>
+              <w:left w:w="90" w:type="dxa"/>
+              <w:bottom w:w="50" w:type="dxa"/>
+              <w:right w:w="90" w:type="dxa"/>
+            </w:tcMar>
+          </w:tcPr>
+          <w:p>
+            <w:proofErr w:type="spellStart"/>
+            <w:r>
+              <w:rPr>
+                <w:sz w:val="19"/>
+                <w:szCs w:val="19"/>
+              </w:rPr>
+              <w:t>CustomerEmail</w:t>
+            </w:r>
+            <w:proofErr w:type="spellEnd"/>
+          </w:p>
+        </w:tc>
+        <w:tc>
+          <w:tcPr>
+            <w:tcW w:w="1900" w:type="dxa"/>
+            <w:tcMar>
+              <w:top w:w="50" w:type="dxa"/>
+              <w:left w:w="90" w:type="dxa"/>
+              <w:bottom w:w="50" w:type="dxa"/>
+              <w:right w:w="90" w:type="dxa"/>
+            </w:tcMar>
+          </w:tcPr>
+          <w:p>
+            <w:r>
+              <w:rPr>
+                <w:sz w:val="19"/>
+                <w:szCs w:val="19"/>
+              </w:rPr>
+              <w:t>Presence, Format</w:t>
+            </w:r>
+          </w:p>
+        </w:tc>
+        <w:tc>
+          <w:tcPr>
+            <w:tcW w:w="3360" w:type="dxa"/>
+            <w:tcMar>
+              <w:top w:w="50" w:type="dxa"/>
+              <w:left w:w="90" w:type="dxa"/>
+              <w:bottom w:w="50" w:type="dxa"/>
+              <w:right w:w="90" w:type="dxa"/>
+            </w:tcMar>
+          </w:tcPr>
+          <w:p>
+            <w:r>
+              <w:rPr>
+                <w:sz w:val="19"/>
+                <w:szCs w:val="19"/>
+              </w:rPr>
+              <w:t>Must contain an @ symbol and a domain</w:t>
+            </w:r>
+          </w:p>
+        </w:tc>
+        <w:tc>
+          <w:tcPr>
+            <w:tcW w:w="2200" w:type="dxa"/>
+            <w:tcMar>
+              <w:top w:w="50" w:type="dxa"/>
+              <w:left w:w="90" w:type="dxa"/>
+              <w:bottom w:w="50" w:type="dxa"/>
+              <w:right w:w="90" w:type="dxa"/>
+            </w:tcMar>
+          </w:tcPr>
+          <w:p>
+            <w:r>
+              <w:rPr>
+                <w:sz w:val="19"/>
+                <w:szCs w:val="19"/>
+              </w:rPr>
+              <w:t>"Please enter a valid email address"</w:t>
+            </w:r>
+          </w:p>
+        </w:tc>
+      </w:tr>
+      <w:tr>
+        <w:tblPrEx>
+          <w:tblCellMar>
+            <w:top w:w="0" w:type="dxa"/>
+            <w:bottom w:w="0" w:type="dxa"/>
+          </w:tblCellMar>
+        </w:tblPrEx>
+        <w:tc>
+          <w:tcPr>
+            <w:tcW w:w="1900" w:type="dxa"/>
+            <w:tcMar>
+              <w:top w:w="50" w:type="dxa"/>
+              <w:left w:w="90" w:type="dxa"/>
+              <w:bottom w:w="50" w:type="dxa"/>
+              <w:right w:w="90" w:type="dxa"/>
+            </w:tcMar>
+          </w:tcPr>
+          <w:p>
+            <w:proofErr w:type="spellStart"/>
+            <w:r>
+              <w:rPr>
+                <w:sz w:val="19"/>
+                <w:szCs w:val="19"/>
+              </w:rPr>
+              <w:t>CustomerPhone</w:t>
+            </w:r>
+            <w:proofErr w:type="spellEnd"/>
+          </w:p>
+        </w:tc>
+        <w:tc>
+          <w:tcPr>
+            <w:tcW w:w="1900" w:type="dxa"/>
+            <w:tcMar>
+              <w:top w:w="50" w:type="dxa"/>
+              <w:left w:w="90" w:type="dxa"/>
+              <w:bottom w:w="50" w:type="dxa"/>
+              <w:right w:w="90" w:type="dxa"/>
+            </w:tcMar>
+          </w:tcPr>
+          <w:p>
+            <w:r>
+              <w:rPr>
+                <w:sz w:val="19"/>
+                <w:szCs w:val="19"/>
+              </w:rPr>
+              <w:t>Presence, Type, Length</w:t>
+            </w:r>
+          </w:p>
+        </w:tc>
+        <w:tc>
+          <w:tcPr>
+            <w:tcW w:w="3360" w:type="dxa"/>
+            <w:tcMar>
+              <w:top w:w="50" w:type="dxa"/>
+              <w:left w:w="90" w:type="dxa"/>
+              <w:bottom w:w="50" w:type="dxa"/>
+              <w:right w:w="90" w:type="dxa"/>
+            </w:tcMar>
+          </w:tcPr>
+          <w:p>
+            <w:r>
+              <w:rPr>
+                <w:sz w:val="19"/>
+                <w:szCs w:val="19"/>
+              </w:rPr>
+              <w:t>Must be 11 digits with no letters</w:t>
+            </w:r>
+          </w:p>
+        </w:tc>
+        <w:tc>
+          <w:tcPr>
+            <w:tcW w:w="2200" w:type="dxa"/>
+            <w:tcMar>
+              <w:top w:w="50" w:type="dxa"/>
+              <w:left w:w="90" w:type="dxa"/>
+              <w:bottom w:w="50" w:type="dxa"/>
+              <w:right w:w="90" w:type="dxa"/>
+            </w:tcMar>
+          </w:tcPr>
+          <w:p>
+            <w:r>
+              <w:rPr>
+                <w:sz w:val="19"/>
+                <w:szCs w:val="19"/>
+              </w:rPr>
+              <w:t>"Please enter a valid phone number"</w:t>
+            </w:r>
+          </w:p>
+        </w:tc>
+      </w:tr>
+    </w:tbl>
+    <w:p>
+      <w:pPr>
+        <w:spacing w:after="120"/>
+      </w:pPr>
+    </w:p>
+    <w:p>
+      <w:pPr>
+        <w:pStyle w:val="Heading3"/>
+        <w:rPr>
+          <w:b/>
+          <w:bCs/>
+          <w:color w:val="000000" w:themeColor="text1"/>
+        </w:rPr>
+      </w:pPr>
+      <w:r>
+        <w:rPr>
+          <w:b/>
+          <w:bCs/>
+          <w:color w:val="000000" w:themeColor="text1"/>
+        </w:rPr>
+        <w:t>Seat Selection and Food Order (Booking)</w:t>
+      </w:r>
+    </w:p>
+    <w:tbl>
+      <w:tblPr>
+        <w:tblW w:w="9360" w:type="dxa"/>
+        <w:tblBorders>
+          <w:top w:val="single" w:sz="1" w:space="0" w:color="BFBFBF"/>
+          <w:left w:val="single" w:sz="1" w:space="0" w:color="BFBFBF"/>
+          <w:bottom w:val="single" w:sz="1" w:space="0" w:color="BFBFBF"/>
+          <w:right w:val="single" w:sz="1" w:space="0" w:color="BFBFBF"/>
+          <w:insideH w:val="single" w:sz="1" w:space="0" w:color="BFBFBF"/>
+          <w:insideV w:val="single" w:sz="1" w:space="0" w:color="BFBFBF"/>
+        </w:tblBorders>
+        <w:tblCellMar>
+          <w:left w:w="10" w:type="dxa"/>
+          <w:right w:w="10" w:type="dxa"/>
+        </w:tblCellMar>
+        <w:tblLook w:val="0000" w:firstRow="0" w:lastRow="0" w:firstColumn="0" w:lastColumn="0" w:noHBand="0" w:noVBand="0"/>
+      </w:tblPr>
+      <w:tblGrid>
+        <w:gridCol w:w="1900"/>
+        <w:gridCol w:w="1900"/>
+        <w:gridCol w:w="3360"/>
+        <w:gridCol w:w="2200"/>
+      </w:tblGrid>
+      <w:tr>
+        <w:tblPrEx>
+          <w:tblCellMar>
+            <w:top w:w="0" w:type="dxa"/>
+            <w:bottom w:w="0" w:type="dxa"/>
+          </w:tblCellMar>
+        </w:tblPrEx>
+        <w:tc>
+          <w:tcPr>
+            <w:tcW w:w="1900" w:type="dxa"/>
+            <w:shd w:val="clear" w:color="auto" w:fill="D9E2F3"/>
+            <w:tcMar>
+              <w:top w:w="50" w:type="dxa"/>
+              <w:left w:w="90" w:type="dxa"/>
+              <w:bottom w:w="50" w:type="dxa"/>
+              <w:right w:w="90" w:type="dxa"/>
+            </w:tcMar>
+          </w:tcPr>
+          <w:p>
+            <w:r>
+              <w:rPr>
+                <w:b/>
+                <w:bCs/>
+                <w:sz w:val="19"/>
+                <w:szCs w:val="19"/>
+              </w:rPr>
+              <w:t>Field</w:t>
+            </w:r>
+          </w:p>
+        </w:tc>
+        <w:tc>
+          <w:tcPr>
+            <w:tcW w:w="1900" w:type="dxa"/>
+            <w:shd w:val="clear" w:color="auto" w:fill="D9E2F3"/>
+            <w:tcMar>
+              <w:top w:w="50" w:type="dxa"/>
+              <w:left w:w="90" w:type="dxa"/>
+              <w:bottom w:w="50" w:type="dxa"/>
+              <w:right w:w="90" w:type="dxa"/>
+            </w:tcMar>
+          </w:tcPr>
+          <w:p>
+            <w:r>
+              <w:rPr>
+                <w:b/>
+                <w:bCs/>
+                <w:sz w:val="19"/>
+                <w:szCs w:val="19"/>
+              </w:rPr>
+              <w:t>Validation Type</w:t>
+            </w:r>
+          </w:p>
+        </w:tc>
+        <w:tc>
+          <w:tcPr>
+            <w:tcW w:w="3360" w:type="dxa"/>
+            <w:shd w:val="clear" w:color="auto" w:fill="D9E2F3"/>
+            <w:tcMar>
+              <w:top w:w="50" w:type="dxa"/>
+              <w:left w:w="90" w:type="dxa"/>
+              <w:bottom w:w="50" w:type="dxa"/>
+              <w:right w:w="90" w:type="dxa"/>
+            </w:tcMar>
+          </w:tcPr>
+          <w:p>
+            <w:r>
+              <w:rPr>
+                <w:b/>
+                <w:bCs/>
+                <w:sz w:val="19"/>
+                <w:szCs w:val="19"/>
+              </w:rPr>
+              <w:t>Rule</w:t>
+            </w:r>
+          </w:p>
+        </w:tc>
+        <w:tc>
+          <w:tcPr>
+            <w:tcW w:w="2200" w:type="dxa"/>
+            <w:shd w:val="clear" w:color="auto" w:fill="D9E2F3"/>
+            <w:tcMar>
+              <w:top w:w="50" w:type="dxa"/>
+              <w:left w:w="90" w:type="dxa"/>
+              <w:bottom w:w="50" w:type="dxa"/>
+              <w:right w:w="90" w:type="dxa"/>
+            </w:tcMar>
+          </w:tcPr>
+          <w:p>
+            <w:r>
+              <w:rPr>
+                <w:b/>
+                <w:bCs/>
+                <w:sz w:val="19"/>
+                <w:szCs w:val="19"/>
+              </w:rPr>
+              <w:t>Error Message</w:t>
+            </w:r>
+          </w:p>
+        </w:tc>
+      </w:tr>
+      <w:tr>
+        <w:tblPrEx>
+          <w:tblCellMar>
+            <w:top w:w="0" w:type="dxa"/>
+            <w:bottom w:w="0" w:type="dxa"/>
+          </w:tblCellMar>
+        </w:tblPrEx>
+        <w:tc>
+          <w:tcPr>
+            <w:tcW w:w="1900" w:type="dxa"/>
+            <w:tcMar>
+              <w:top w:w="50" w:type="dxa"/>
+              <w:left w:w="90" w:type="dxa"/>
+              <w:bottom w:w="50" w:type="dxa"/>
+              <w:right w:w="90" w:type="dxa"/>
+            </w:tcMar>
+          </w:tcPr>
+          <w:p>
+            <w:r>
+              <w:rPr>
+                <w:sz w:val="19"/>
+                <w:szCs w:val="19"/>
+              </w:rPr>
+              <w:lastRenderedPageBreak/>
+              <w:t>Selected seats</w:t>
+            </w:r>
+          </w:p>
+        </w:tc>
+        <w:tc>
+          <w:tcPr>
+            <w:tcW w:w="1900" w:type="dxa"/>
+            <w:tcMar>
+              <w:top w:w="50" w:type="dxa"/>
+              <w:left w:w="90" w:type="dxa"/>
+              <w:bottom w:w="50" w:type="dxa"/>
+              <w:right w:w="90" w:type="dxa"/>
+            </w:tcMar>
+          </w:tcPr>
+          <w:p>
+            <w:r>
+              <w:rPr>
+                <w:sz w:val="19"/>
+                <w:szCs w:val="19"/>
+              </w:rPr>
+              <w:t>Presence</w:t>
+            </w:r>
+          </w:p>
+        </w:tc>
+        <w:tc>
+          <w:tcPr>
+            <w:tcW w:w="3360" w:type="dxa"/>
+            <w:tcMar>
+              <w:top w:w="50" w:type="dxa"/>
+              <w:left w:w="90" w:type="dxa"/>
+              <w:bottom w:w="50" w:type="dxa"/>
+              <w:right w:w="90" w:type="dxa"/>
+            </w:tcMar>
+          </w:tcPr>
+          <w:p>
+            <w:r>
+              <w:rPr>
+                <w:sz w:val="19"/>
+                <w:szCs w:val="19"/>
+              </w:rPr>
+              <w:t>At least one seat must be selected</w:t>
+            </w:r>
+          </w:p>
+        </w:tc>
+        <w:tc>
+          <w:tcPr>
+            <w:tcW w:w="2200" w:type="dxa"/>
+            <w:tcMar>
+              <w:top w:w="50" w:type="dxa"/>
+              <w:left w:w="90" w:type="dxa"/>
+              <w:bottom w:w="50" w:type="dxa"/>
+              <w:right w:w="90" w:type="dxa"/>
+            </w:tcMar>
+          </w:tcPr>
+          <w:p>
+            <w:r>
+              <w:rPr>
+                <w:sz w:val="19"/>
+                <w:szCs w:val="19"/>
+              </w:rPr>
+              <w:t>"Please select at least one seat"</w:t>
+            </w:r>
+          </w:p>
+        </w:tc>
+      </w:tr>
+      <w:tr>
+        <w:tblPrEx>
+          <w:tblCellMar>
+            <w:top w:w="0" w:type="dxa"/>
+            <w:bottom w:w="0" w:type="dxa"/>
+          </w:tblCellMar>
+        </w:tblPrEx>
+        <w:tc>
+          <w:tcPr>
+            <w:tcW w:w="1900" w:type="dxa"/>
+            <w:tcMar>
+              <w:top w:w="50" w:type="dxa"/>
+              <w:left w:w="90" w:type="dxa"/>
+              <w:bottom w:w="50" w:type="dxa"/>
+              <w:right w:w="90" w:type="dxa"/>
+            </w:tcMar>
+          </w:tcPr>
+          <w:p>
+            <w:r>
+              <w:rPr>
+                <w:sz w:val="19"/>
+                <w:szCs w:val="19"/>
+              </w:rPr>
+              <w:t>Seat availability</w:t>
+            </w:r>
+          </w:p>
+        </w:tc>
+        <w:tc>
+          <w:tcPr>
+            <w:tcW w:w="1900" w:type="dxa"/>
+            <w:tcMar>
+              <w:top w:w="50" w:type="dxa"/>
+              <w:left w:w="90" w:type="dxa"/>
+              <w:bottom w:w="50" w:type="dxa"/>
+              <w:right w:w="90" w:type="dxa"/>
+            </w:tcMar>
+          </w:tcPr>
+          <w:p>
+            <w:r>
+              <w:rPr>
+                <w:sz w:val="19"/>
+                <w:szCs w:val="19"/>
+              </w:rPr>
+              <w:t>Lookup</w:t>
+            </w:r>
+          </w:p>
+        </w:tc>
+        <w:tc>
+          <w:tcPr>
+            <w:tcW w:w="3360" w:type="dxa"/>
+            <w:tcMar>
+              <w:top w:w="50" w:type="dxa"/>
+              <w:left w:w="90" w:type="dxa"/>
+              <w:bottom w:w="50" w:type="dxa"/>
+              <w:right w:w="90" w:type="dxa"/>
+            </w:tcMar>
+          </w:tcPr>
+          <w:p>
+            <w:r>
+              <w:rPr>
+                <w:sz w:val="19"/>
+                <w:szCs w:val="19"/>
+              </w:rPr>
+              <w:t>A chosen seat must not already be booked for the screening</w:t>
+            </w:r>
+          </w:p>
+        </w:tc>
+        <w:tc>
+          <w:tcPr>
+            <w:tcW w:w="2200" w:type="dxa"/>
+            <w:tcMar>
+              <w:top w:w="50" w:type="dxa"/>
+              <w:left w:w="90" w:type="dxa"/>
+              <w:bottom w:w="50" w:type="dxa"/>
+              <w:right w:w="90" w:type="dxa"/>
+            </w:tcMar>
+          </w:tcPr>
+          <w:p>
+            <w:r>
+              <w:rPr>
+                <w:sz w:val="19"/>
+                <w:szCs w:val="19"/>
+              </w:rPr>
+              <w:t>"That seat has already been taken"</w:t>
+            </w:r>
+          </w:p>
+        </w:tc>
+      </w:tr>
+      <w:tr>
+        <w:tblPrEx>
+          <w:tblCellMar>
+            <w:top w:w="0" w:type="dxa"/>
+            <w:bottom w:w="0" w:type="dxa"/>
+          </w:tblCellMar>
+        </w:tblPrEx>
+        <w:tc>
+          <w:tcPr>
+            <w:tcW w:w="1900" w:type="dxa"/>
+            <w:tcMar>
+              <w:top w:w="50" w:type="dxa"/>
+              <w:left w:w="90" w:type="dxa"/>
+              <w:bottom w:w="50" w:type="dxa"/>
+              <w:right w:w="90" w:type="dxa"/>
+            </w:tcMar>
+          </w:tcPr>
+          <w:p>
+            <w:r>
+              <w:rPr>
+                <w:sz w:val="19"/>
+                <w:szCs w:val="19"/>
+              </w:rPr>
+              <w:t>Food quantity</w:t>
+            </w:r>
+          </w:p>
+        </w:tc>
+        <w:tc>
+          <w:tcPr>
+            <w:tcW w:w="1900" w:type="dxa"/>
+            <w:tcMar>
+              <w:top w:w="50" w:type="dxa"/>
+              <w:left w:w="90" w:type="dxa"/>
+              <w:bottom w:w="50" w:type="dxa"/>
+              <w:right w:w="90" w:type="dxa"/>
+            </w:tcMar>
+          </w:tcPr>
+          <w:p>
+            <w:r>
+              <w:rPr>
+                <w:sz w:val="19"/>
+                <w:szCs w:val="19"/>
+              </w:rPr>
+              <w:t>Type, Range</w:t>
+            </w:r>
+          </w:p>
+        </w:tc>
+        <w:tc>
+          <w:tcPr>
+            <w:tcW w:w="3360" w:type="dxa"/>
+            <w:tcMar>
+              <w:top w:w="50" w:type="dxa"/>
+              <w:left w:w="90" w:type="dxa"/>
+              <w:bottom w:w="50" w:type="dxa"/>
+              <w:right w:w="90" w:type="dxa"/>
+            </w:tcMar>
+          </w:tcPr>
+          <w:p>
+            <w:r>
+              <w:rPr>
+                <w:sz w:val="19"/>
+                <w:szCs w:val="19"/>
+              </w:rPr>
+              <w:t>Must be a whole number between 1 and 20</w:t>
+            </w:r>
+          </w:p>
+        </w:tc>
+        <w:tc>
+          <w:tcPr>
+            <w:tcW w:w="2200" w:type="dxa"/>
+            <w:tcMar>
+              <w:top w:w="50" w:type="dxa"/>
+              <w:left w:w="90" w:type="dxa"/>
+              <w:bottom w:w="50" w:type="dxa"/>
+              <w:right w:w="90" w:type="dxa"/>
+            </w:tcMar>
+          </w:tcPr>
+          <w:p>
+            <w:r>
+              <w:rPr>
+                <w:sz w:val="19"/>
+                <w:szCs w:val="19"/>
+              </w:rPr>
+              <w:t>"Quantity must be between 1 and 20"</w:t>
+            </w:r>
+          </w:p>
+        </w:tc>
+      </w:tr>
+    </w:tbl>
+    <w:p>
+      <w:pPr>
+        <w:spacing w:after="120"/>
+      </w:pPr>
+    </w:p>
+    <w:p>
+      <w:pPr>
+        <w:pStyle w:val="Heading3"/>
+        <w:rPr>
+          <w:b/>
+          <w:bCs/>
+          <w:color w:val="000000" w:themeColor="text1"/>
+        </w:rPr>
+      </w:pPr>
+      <w:r>
+        <w:rPr>
+          <w:b/>
+          <w:bCs/>
+          <w:color w:val="000000" w:themeColor="text1"/>
+        </w:rPr>
+        <w:t>Sales Report</w:t>
+      </w:r>
+    </w:p>
+    <w:tbl>
+      <w:tblPr>
+        <w:tblW w:w="9360" w:type="dxa"/>
+        <w:tblBorders>
+          <w:top w:val="single" w:sz="1" w:space="0" w:color="BFBFBF"/>
+          <w:left w:val="single" w:sz="1" w:space="0" w:color="BFBFBF"/>
+          <w:bottom w:val="single" w:sz="1" w:space="0" w:color="BFBFBF"/>
+          <w:right w:val="single" w:sz="1" w:space="0" w:color="BFBFBF"/>
+          <w:insideH w:val="single" w:sz="1" w:space="0" w:color="BFBFBF"/>
+          <w:insideV w:val="single" w:sz="1" w:space="0" w:color="BFBFBF"/>
+        </w:tblBorders>
+        <w:tblCellMar>
+          <w:left w:w="10" w:type="dxa"/>
+          <w:right w:w="10" w:type="dxa"/>
+        </w:tblCellMar>
+        <w:tblLook w:val="0000" w:firstRow="0" w:lastRow="0" w:firstColumn="0" w:lastColumn="0" w:noHBand="0" w:noVBand="0"/>
+      </w:tblPr>
+      <w:tblGrid>
+        <w:gridCol w:w="1900"/>
+        <w:gridCol w:w="1900"/>
+        <w:gridCol w:w="3360"/>
+        <w:gridCol w:w="2200"/>
+      </w:tblGrid>
+      <w:tr>
+        <w:tblPrEx>
+          <w:tblCellMar>
+            <w:top w:w="0" w:type="dxa"/>
+            <w:bottom w:w="0" w:type="dxa"/>
+          </w:tblCellMar>
+        </w:tblPrEx>
+        <w:tc>
+          <w:tcPr>
+            <w:tcW w:w="1900" w:type="dxa"/>
+            <w:shd w:val="clear" w:color="auto" w:fill="D9E2F3"/>
+            <w:tcMar>
+              <w:top w:w="50" w:type="dxa"/>
+              <w:left w:w="90" w:type="dxa"/>
+              <w:bottom w:w="50" w:type="dxa"/>
+              <w:right w:w="90" w:type="dxa"/>
+            </w:tcMar>
+          </w:tcPr>
+          <w:p>
+            <w:r>
+              <w:rPr>
+                <w:b/>
+                <w:bCs/>
+                <w:sz w:val="19"/>
+                <w:szCs w:val="19"/>
+              </w:rPr>
+              <w:t>Field</w:t>
+            </w:r>
+          </w:p>
+        </w:tc>
+        <w:tc>
+          <w:tcPr>
+            <w:tcW w:w="1900" w:type="dxa"/>
+            <w:shd w:val="clear" w:color="auto" w:fill="D9E2F3"/>
+            <w:tcMar>
+              <w:top w:w="50" w:type="dxa"/>
+              <w:left w:w="90" w:type="dxa"/>
+              <w:bottom w:w="50" w:type="dxa"/>
+              <w:right w:w="90" w:type="dxa"/>
+            </w:tcMar>
+          </w:tcPr>
+          <w:p>
+            <w:r>
+              <w:rPr>
+                <w:b/>
+                <w:bCs/>
+                <w:sz w:val="19"/>
+                <w:szCs w:val="19"/>
+              </w:rPr>
+              <w:t>Validation Type</w:t>
+            </w:r>
+          </w:p>
+        </w:tc>
+        <w:tc>
+          <w:tcPr>
+            <w:tcW w:w="3360" w:type="dxa"/>
+            <w:shd w:val="clear" w:color="auto" w:fill="D9E2F3"/>
+            <w:tcMar>
+              <w:top w:w="50" w:type="dxa"/>
+              <w:left w:w="90" w:type="dxa"/>
+              <w:bottom w:w="50" w:type="dxa"/>
+              <w:right w:w="90" w:type="dxa"/>
+            </w:tcMar>
+          </w:tcPr>
+          <w:p>
+            <w:r>
+              <w:rPr>
+                <w:b/>
+                <w:bCs/>
+                <w:sz w:val="19"/>
+                <w:szCs w:val="19"/>
+              </w:rPr>
+              <w:t>Rule</w:t>
+            </w:r>
+          </w:p>
+        </w:tc>
+        <w:tc>
+          <w:tcPr>
+            <w:tcW w:w="2200" w:type="dxa"/>
+            <w:shd w:val="clear" w:color="auto" w:fill="D9E2F3"/>
+            <w:tcMar>
+              <w:top w:w="50" w:type="dxa"/>
+              <w:left w:w="90" w:type="dxa"/>
+              <w:bottom w:w="50" w:type="dxa"/>
+              <w:right w:w="90" w:type="dxa"/>
+            </w:tcMar>
+          </w:tcPr>
+          <w:p>
+            <w:r>
+              <w:rPr>
+                <w:b/>
+                <w:bCs/>
+                <w:sz w:val="19"/>
+                <w:szCs w:val="19"/>
+              </w:rPr>
+              <w:t>Error Message</w:t>
+            </w:r>
+          </w:p>
+        </w:tc>
+      </w:tr>
+      <w:tr>
+        <w:tblPrEx>
+          <w:tblCellMar>
+            <w:top w:w="0" w:type="dxa"/>
+            <w:bottom w:w="0" w:type="dxa"/>
+          </w:tblCellMar>
+        </w:tblPrEx>
+        <w:tc>
+          <w:tcPr>
+            <w:tcW w:w="1900" w:type="dxa"/>
+            <w:tcMar>
+              <w:top w:w="50" w:type="dxa"/>
+              <w:left w:w="90" w:type="dxa"/>
+              <w:bottom w:w="50" w:type="dxa"/>
+              <w:right w:w="90" w:type="dxa"/>
+            </w:tcMar>
+          </w:tcPr>
+          <w:p>
+            <w:r>
+              <w:rPr>
+                <w:sz w:val="19"/>
+                <w:szCs w:val="19"/>
+              </w:rPr>
+              <w:t>Date range</w:t>
+            </w:r>
+          </w:p>
+        </w:tc>
+        <w:tc>
+          <w:tcPr>
+            <w:tcW w:w="1900" w:type="dxa"/>
+            <w:tcMar>
+              <w:top w:w="50" w:type="dxa"/>
+              <w:left w:w="90" w:type="dxa"/>
+              <w:bottom w:w="50" w:type="dxa"/>
+              <w:right w:w="90" w:type="dxa"/>
+            </w:tcMar>
+          </w:tcPr>
+          <w:p>
+            <w:r>
+              <w:rPr>
+                <w:sz w:val="19"/>
+                <w:szCs w:val="19"/>
+              </w:rPr>
+              <w:t>Range</w:t>
+            </w:r>
+          </w:p>
+        </w:tc>
+        <w:tc>
+          <w:tcPr>
+            <w:tcW w:w="3360" w:type="dxa"/>
+            <w:tcMar>
+              <w:top w:w="50" w:type="dxa"/>
+              <w:left w:w="90" w:type="dxa"/>
+              <w:bottom w:w="50" w:type="dxa"/>
+              <w:right w:w="90" w:type="dxa"/>
+            </w:tcMar>
+          </w:tcPr>
+          <w:p>
+            <w:r>
+              <w:rPr>
+                <w:sz w:val="19"/>
+                <w:szCs w:val="19"/>
+              </w:rPr>
+              <w:t>The end date must not be earlier than the start date</w:t>
+            </w:r>
+          </w:p>
+        </w:tc>
+        <w:tc>
+          <w:tcPr>
+            <w:tcW w:w="2200" w:type="dxa"/>
+            <w:tcMar>
+              <w:top w:w="50" w:type="dxa"/>
+              <w:left w:w="90" w:type="dxa"/>
+              <w:bottom w:w="50" w:type="dxa"/>
+              <w:right w:w="90" w:type="dxa"/>
+            </w:tcMar>
+          </w:tcPr>
+          <w:p>
+            <w:r>
+              <w:rPr>
+                <w:sz w:val="19"/>
+                <w:szCs w:val="19"/>
+              </w:rPr>
+              <w:t>"The end date cannot be before the start date"</w:t>
+            </w:r>
+          </w:p>
+        </w:tc>
+      </w:tr>
+    </w:tbl>
+    <w:p/>
+    <w:p/>
     <w:sectPr>
-      <w:headerReference w:type="even" r:id="rId11"/>
-      <w:headerReference w:type="default" r:id="rId12"/>
-      <w:footerReference w:type="even" r:id="rId13"/>
-      <w:footerReference w:type="default" r:id="rId14"/>
-      <w:headerReference w:type="first" r:id="rId15"/>
-      <w:footerReference w:type="first" r:id="rId16"/>
+      <w:headerReference w:type="even" r:id="rId9"/>
+      <w:headerReference w:type="default" r:id="rId10"/>
+      <w:footerReference w:type="even" r:id="rId11"/>
+      <w:footerReference w:type="default" r:id="rId12"/>
+      <w:headerReference w:type="first" r:id="rId13"/>
+      <w:footerReference w:type="first" r:id="rId14"/>
       <w:pgSz w:w="12240" w:h="15840"/>
       <w:pgMar w:top="1440" w:right="1440" w:bottom="1440" w:left="1440" w:header="720" w:footer="720" w:gutter="0"/>
       <w:pgBorders w:offsetFrom="page">
@@ -10664,7 +13112,6 @@
         <w:docPartUnique/>
       </w:docPartObj>
     </w:sdtPr>
-    <w:sdtEndPr/>
     <w:sdtContent>
       <w:p>
         <w:pPr>
@@ -11721,6 +14168,25 @@
       <w14:ligatures w14:val="none"/>
     </w:rPr>
   </w:style>
+  <w:style w:type="table" w:styleId="TableGrid">
+    <w:name w:val="Table Grid"/>
+    <w:basedOn w:val="TableNormal"/>
+    <w:uiPriority w:val="39"/>
+    <w:rsid w:val="006E2F09"/>
+    <w:pPr>
+      <w:spacing w:after="0" w:line="240" w:lineRule="auto"/>
+    </w:pPr>
+    <w:tblPr>
+      <w:tblBorders>
+        <w:top w:val="single" w:sz="4" w:space="0" w:color="auto"/>
+        <w:left w:val="single" w:sz="4" w:space="0" w:color="auto"/>
+        <w:bottom w:val="single" w:sz="4" w:space="0" w:color="auto"/>
+        <w:right w:val="single" w:sz="4" w:space="0" w:color="auto"/>
+        <w:insideH w:val="single" w:sz="4" w:space="0" w:color="auto"/>
+        <w:insideV w:val="single" w:sz="4" w:space="0" w:color="auto"/>
+      </w:tblBorders>
+    </w:tblPr>
+  </w:style>
 </w:styles>
 </file>
 

</xml_diff>

<commit_message>
couple of pie charts left in investigation
</commit_message>
<xml_diff>
--- a/Design.docx
+++ b/Design.docx
@@ -11,23 +11,13 @@
           <w:color w:val="A02B93" w:themeColor="accent5"/>
         </w:rPr>
       </w:pPr>
-      <w:proofErr w:type="spellStart"/>
       <w:r>
         <w:rPr>
           <w:b/>
           <w:bCs/>
           <w:color w:val="A02B93" w:themeColor="accent5"/>
         </w:rPr>
-        <w:t>Filmtopia</w:t>
-      </w:r>
-      <w:proofErr w:type="spellEnd"/>
-      <w:r>
-        <w:rPr>
-          <w:b/>
-          <w:bCs/>
-          <w:color w:val="A02B93" w:themeColor="accent5"/>
-        </w:rPr>
-        <w:t xml:space="preserve"> Project Design</w:t>
+        <w:t>Filmtopia Project Design</w:t>
       </w:r>
     </w:p>
     <w:p>
@@ -53,23 +43,7 @@
         <w:spacing w:after="160" w:line="276" w:lineRule="auto"/>
       </w:pPr>
       <w:r>
-        <w:t xml:space="preserve">The purpose of this section is to specify the data structures that the </w:t>
-      </w:r>
-      <w:proofErr w:type="spellStart"/>
-      <w:r>
-        <w:t>Filmtopia</w:t>
-      </w:r>
-      <w:proofErr w:type="spellEnd"/>
-      <w:r>
-        <w:t xml:space="preserve"> system will use to store its data. As the system is built around a Microsoft Access database accessed through </w:t>
-      </w:r>
-      <w:proofErr w:type="spellStart"/>
-      <w:r>
-        <w:t>OleDb</w:t>
-      </w:r>
-      <w:proofErr w:type="spellEnd"/>
-      <w:r>
-        <w:t>, these data structures take the form of database tables rather than arrays or other in memory structures. Each table and the relationships between them are described below, along with the way the data in those tables will be accessed. A key aim throughout the design has been to make sure the table structure is fully normalised to third normal form so that data is never repeated unnecessarily and the database cannot end up in an inconsistent state.</w:t>
+        <w:t>The purpose of this section is to specify the data structures that the Filmtopia system will use to store its data. As the system is built around a Microsoft Access database accessed through OleDb, these data structures take the form of database tables rather than arrays or other in memory structures. Each table and the relationships between them are described below, along with the way the data in those tables will be accessed. A key aim throughout the design has been to make sure the table structure is fully normalised to third normal form so that data is never repeated unnecessarily and the database cannot end up in an inconsistent state.</w:t>
       </w:r>
     </w:p>
     <w:p>
@@ -177,23 +151,7 @@
       </w:pPr>
       <w:r>
         <w:lastRenderedPageBreak/>
-        <w:t xml:space="preserve">The way to resolve a many to many relationship is to create a new link table that sits between the two original entities, turning the single many to many relationship into two separate one to many relationships. For the booking and seat relationship this link table is </w:t>
-      </w:r>
-      <w:proofErr w:type="spellStart"/>
-      <w:r>
-        <w:t>tblBookingSeat</w:t>
-      </w:r>
-      <w:proofErr w:type="spellEnd"/>
-      <w:r>
-        <w:t xml:space="preserve">, and for the booking and food item relationship it is </w:t>
-      </w:r>
-      <w:proofErr w:type="spellStart"/>
-      <w:r>
-        <w:t>tblOrderItem</w:t>
-      </w:r>
-      <w:proofErr w:type="spellEnd"/>
-      <w:r>
-        <w:t>. Each link table holds its own primary key along with the two foreign keys that point back to the tables it joins. The diagram below shows the final design once these link tables have been added, with the primary key of each table shown in bold and the foreign keys shown in italics.</w:t>
+        <w:t>The way to resolve a many to many relationship is to create a new link table that sits between the two original entities, turning the single many to many relationship into two separate one to many relationships. For the booking and seat relationship this link table is tblBookingSeat, and for the booking and food item relationship it is tblOrderItem. Each link table holds its own primary key along with the two foreign keys that point back to the tables it joins. The diagram below shows the final design once these link tables have been added, with the primary key of each table shown in bold and the foreign keys shown in italics.</w:t>
       </w:r>
     </w:p>
     <w:p>
@@ -266,59 +224,11 @@
         <w:spacing w:after="160" w:line="276" w:lineRule="auto"/>
       </w:pPr>
       <w:r>
-        <w:t xml:space="preserve">In this final design the foreign keys are produced by copying the primary key from the one end of each relationship to the many end. For example the </w:t>
-      </w:r>
-      <w:proofErr w:type="spellStart"/>
-      <w:r>
-        <w:t>ScreeningID</w:t>
-      </w:r>
-      <w:proofErr w:type="spellEnd"/>
-      <w:r>
-        <w:t xml:space="preserve"> primary key from </w:t>
-      </w:r>
-      <w:proofErr w:type="spellStart"/>
-      <w:r>
-        <w:t>tblScreening</w:t>
-      </w:r>
-      <w:proofErr w:type="spellEnd"/>
-      <w:r>
-        <w:t xml:space="preserve"> is copied into </w:t>
-      </w:r>
-      <w:proofErr w:type="spellStart"/>
-      <w:r>
-        <w:t>tblBooking</w:t>
-      </w:r>
-      <w:proofErr w:type="spellEnd"/>
-      <w:r>
-        <w:t xml:space="preserve"> as a foreign key, because one screening can have many bookings. The same pattern is followed throughout, which keeps every relationship as a clean one to many. The structure is normalised to third normal form because every non key field in each table depends only on the whole of that table's primary key, with no field depending on another non key field and no repeating groups of data anywhere in the design. Three further tables exist in the system that do not appear in this diagram because </w:t>
+        <w:t xml:space="preserve">In this final design the foreign keys are produced by copying the primary key from the one end of each relationship to the many end. For example the ScreeningID primary key from tblScreening is copied into tblBooking as a foreign key, because one screening can have many bookings. The same pattern is followed throughout, which keeps every relationship as a clean one to many. The structure is normalised to third normal form because every non key field in each table depends only on the whole of that table's primary key, with no field depending on another non key field and no repeating groups of data anywhere in the design. Three further tables exist in the system that do not appear in this diagram because </w:t>
       </w:r>
       <w:r>
         <w:lastRenderedPageBreak/>
-        <w:t xml:space="preserve">they are standalone and not related to the others through foreign keys. These are </w:t>
-      </w:r>
-      <w:proofErr w:type="spellStart"/>
-      <w:r>
-        <w:t>tblLogin</w:t>
-      </w:r>
-      <w:proofErr w:type="spellEnd"/>
-      <w:r>
-        <w:t xml:space="preserve">, which holds the user accounts, </w:t>
-      </w:r>
-      <w:proofErr w:type="spellStart"/>
-      <w:r>
-        <w:t>tblLogs</w:t>
-      </w:r>
-      <w:proofErr w:type="spellEnd"/>
-      <w:r>
-        <w:t xml:space="preserve">, which records system events, and </w:t>
-      </w:r>
-      <w:proofErr w:type="spellStart"/>
-      <w:r>
-        <w:t>tblVersionControl</w:t>
-      </w:r>
-      <w:proofErr w:type="spellEnd"/>
-      <w:r>
-        <w:t>, which holds the application version. They are included in the table designs below for completeness.</w:t>
+        <w:t>they are standalone and not related to the others through foreign keys. These are tblLogin, which holds the user accounts, tblLogs, which records system events, and tblVersionControl, which holds the application version. They are included in the table designs below for completeness.</w:t>
       </w:r>
     </w:p>
     <w:p>
@@ -378,23 +288,7 @@
         <w:spacing w:after="160" w:line="276" w:lineRule="auto"/>
       </w:pPr>
       <w:r>
-        <w:t xml:space="preserve">The </w:t>
-      </w:r>
-      <w:proofErr w:type="spellStart"/>
-      <w:r>
-        <w:t>Filmtopia</w:t>
-      </w:r>
-      <w:proofErr w:type="spellEnd"/>
-      <w:r>
-        <w:t xml:space="preserve"> tables are stored within a Microsoft Access database and are accessed from the Visual Basic .NET application using SQL queries sent through an </w:t>
-      </w:r>
-      <w:proofErr w:type="spellStart"/>
-      <w:r>
-        <w:t>OleDb</w:t>
-      </w:r>
-      <w:proofErr w:type="spellEnd"/>
-      <w:r>
-        <w:t xml:space="preserve"> connection, specifically SELECT, INSERT, UPDATE and DELETE queries. The database management system stores the tables as direct access files and maintains indexes on the primary keys so that looking a record up by its primary key is fast and does not require reading through every record. Where a search is carried out on a field that is not indexed, the database falls back to a sequential search through the table.</w:t>
+        <w:t>The Filmtopia tables are stored within a Microsoft Access database and are accessed from the Visual Basic .NET application using SQL queries sent through an OleDb connection, specifically SELECT, INSERT, UPDATE and DELETE queries. The database management system stores the tables as direct access files and maintains indexes on the primary keys so that looking a record up by its primary key is fast and does not require reading through every record. Where a search is carried out on a field that is not indexed, the database falls back to a sequential search through the table.</w:t>
       </w:r>
     </w:p>
     <w:p>
@@ -406,7 +300,6 @@
           <w:color w:val="000000" w:themeColor="text1"/>
         </w:rPr>
       </w:pPr>
-      <w:proofErr w:type="spellStart"/>
       <w:r>
         <w:rPr>
           <w:b/>
@@ -415,7 +308,6 @@
         </w:rPr>
         <w:t>tblFilm</w:t>
       </w:r>
-      <w:proofErr w:type="spellEnd"/>
     </w:p>
     <w:p>
       <w:pPr>
@@ -593,7 +485,6 @@
             </w:tcMar>
           </w:tcPr>
           <w:p>
-            <w:proofErr w:type="spellStart"/>
             <w:r>
               <w:rPr>
                 <w:sz w:val="19"/>
@@ -602,7 +493,6 @@
               <w:lastRenderedPageBreak/>
               <w:t>FilmID</w:t>
             </w:r>
-            <w:proofErr w:type="spellEnd"/>
           </w:p>
         </w:tc>
         <w:tc>
@@ -690,7 +580,6 @@
             </w:tcMar>
           </w:tcPr>
           <w:p>
-            <w:proofErr w:type="spellStart"/>
             <w:r>
               <w:rPr>
                 <w:sz w:val="19"/>
@@ -698,7 +587,6 @@
               </w:rPr>
               <w:t>FilmTitle</w:t>
             </w:r>
-            <w:proofErr w:type="spellEnd"/>
           </w:p>
         </w:tc>
         <w:tc>
@@ -794,7 +682,6 @@
             </w:tcMar>
           </w:tcPr>
           <w:p>
-            <w:proofErr w:type="spellStart"/>
             <w:r>
               <w:rPr>
                 <w:sz w:val="19"/>
@@ -802,7 +689,6 @@
               </w:rPr>
               <w:t>FilmAgeRating</w:t>
             </w:r>
-            <w:proofErr w:type="spellEnd"/>
           </w:p>
         </w:tc>
         <w:tc>
@@ -898,7 +784,6 @@
             </w:tcMar>
           </w:tcPr>
           <w:p>
-            <w:proofErr w:type="spellStart"/>
             <w:r>
               <w:rPr>
                 <w:sz w:val="19"/>
@@ -906,7 +791,6 @@
               </w:rPr>
               <w:t>FilmDuration</w:t>
             </w:r>
-            <w:proofErr w:type="spellEnd"/>
           </w:p>
         </w:tc>
         <w:tc>
@@ -994,7 +878,6 @@
             </w:tcMar>
           </w:tcPr>
           <w:p>
-            <w:proofErr w:type="spellStart"/>
             <w:r>
               <w:rPr>
                 <w:sz w:val="19"/>
@@ -1002,7 +885,6 @@
               </w:rPr>
               <w:t>FilmDescription</w:t>
             </w:r>
-            <w:proofErr w:type="spellEnd"/>
           </w:p>
         </w:tc>
         <w:tc>
@@ -1101,7 +983,6 @@
           <w:color w:val="000000" w:themeColor="text1"/>
         </w:rPr>
       </w:pPr>
-      <w:proofErr w:type="spellStart"/>
       <w:r>
         <w:rPr>
           <w:b/>
@@ -1110,7 +991,6 @@
         </w:rPr>
         <w:t>tblScreen</w:t>
       </w:r>
-      <w:proofErr w:type="spellEnd"/>
     </w:p>
     <w:p>
       <w:pPr>
@@ -1288,7 +1168,6 @@
             </w:tcMar>
           </w:tcPr>
           <w:p>
-            <w:proofErr w:type="spellStart"/>
             <w:r>
               <w:rPr>
                 <w:sz w:val="19"/>
@@ -1296,7 +1175,6 @@
               </w:rPr>
               <w:t>ScreenID</w:t>
             </w:r>
-            <w:proofErr w:type="spellEnd"/>
           </w:p>
         </w:tc>
         <w:tc>
@@ -1384,7 +1262,6 @@
             </w:tcMar>
           </w:tcPr>
           <w:p>
-            <w:proofErr w:type="spellStart"/>
             <w:r>
               <w:rPr>
                 <w:sz w:val="19"/>
@@ -1392,7 +1269,6 @@
               </w:rPr>
               <w:t>ScreenName</w:t>
             </w:r>
-            <w:proofErr w:type="spellEnd"/>
           </w:p>
         </w:tc>
         <w:tc>
@@ -1488,7 +1364,6 @@
             </w:tcMar>
           </w:tcPr>
           <w:p>
-            <w:proofErr w:type="spellStart"/>
             <w:r>
               <w:rPr>
                 <w:sz w:val="19"/>
@@ -1496,7 +1371,6 @@
               </w:rPr>
               <w:t>ScreenCapacity</w:t>
             </w:r>
-            <w:proofErr w:type="spellEnd"/>
           </w:p>
         </w:tc>
         <w:tc>
@@ -1587,7 +1461,6 @@
           <w:color w:val="000000" w:themeColor="text1"/>
         </w:rPr>
       </w:pPr>
-      <w:proofErr w:type="spellStart"/>
       <w:r>
         <w:rPr>
           <w:b/>
@@ -1596,7 +1469,6 @@
         </w:rPr>
         <w:t>tblScreening</w:t>
       </w:r>
-      <w:proofErr w:type="spellEnd"/>
     </w:p>
     <w:p>
       <w:pPr>
@@ -1774,7 +1646,6 @@
             </w:tcMar>
           </w:tcPr>
           <w:p>
-            <w:proofErr w:type="spellStart"/>
             <w:r>
               <w:rPr>
                 <w:sz w:val="19"/>
@@ -1782,7 +1653,6 @@
               </w:rPr>
               <w:t>ScreeningID</w:t>
             </w:r>
-            <w:proofErr w:type="spellEnd"/>
           </w:p>
         </w:tc>
         <w:tc>
@@ -1870,7 +1740,6 @@
             </w:tcMar>
           </w:tcPr>
           <w:p>
-            <w:proofErr w:type="spellStart"/>
             <w:r>
               <w:rPr>
                 <w:sz w:val="19"/>
@@ -1878,7 +1747,6 @@
               </w:rPr>
               <w:t>FilmID</w:t>
             </w:r>
-            <w:proofErr w:type="spellEnd"/>
           </w:p>
         </w:tc>
         <w:tc>
@@ -1929,23 +1797,7 @@
                 <w:sz w:val="19"/>
                 <w:szCs w:val="19"/>
               </w:rPr>
-              <w:t xml:space="preserve">The film being shown (Foreign Key to </w:t>
-            </w:r>
-            <w:proofErr w:type="spellStart"/>
-            <w:r>
-              <w:rPr>
-                <w:sz w:val="19"/>
-                <w:szCs w:val="19"/>
-              </w:rPr>
-              <w:t>tblFilm</w:t>
-            </w:r>
-            <w:proofErr w:type="spellEnd"/>
-            <w:r>
-              <w:rPr>
-                <w:sz w:val="19"/>
-                <w:szCs w:val="19"/>
-              </w:rPr>
-              <w:t>)</w:t>
+              <w:t>The film being shown (Foreign Key to tblFilm)</w:t>
             </w:r>
           </w:p>
         </w:tc>
@@ -1982,7 +1834,6 @@
             </w:tcMar>
           </w:tcPr>
           <w:p>
-            <w:proofErr w:type="spellStart"/>
             <w:r>
               <w:rPr>
                 <w:sz w:val="19"/>
@@ -1990,7 +1841,6 @@
               </w:rPr>
               <w:t>ScreenID</w:t>
             </w:r>
-            <w:proofErr w:type="spellEnd"/>
           </w:p>
         </w:tc>
         <w:tc>
@@ -2041,23 +1891,7 @@
                 <w:sz w:val="19"/>
                 <w:szCs w:val="19"/>
               </w:rPr>
-              <w:t xml:space="preserve">The screen it is shown in (Foreign Key to </w:t>
-            </w:r>
-            <w:proofErr w:type="spellStart"/>
-            <w:r>
-              <w:rPr>
-                <w:sz w:val="19"/>
-                <w:szCs w:val="19"/>
-              </w:rPr>
-              <w:t>tblScreen</w:t>
-            </w:r>
-            <w:proofErr w:type="spellEnd"/>
-            <w:r>
-              <w:rPr>
-                <w:sz w:val="19"/>
-                <w:szCs w:val="19"/>
-              </w:rPr>
-              <w:t>)</w:t>
+              <w:t>The screen it is shown in (Foreign Key to tblScreen)</w:t>
             </w:r>
           </w:p>
         </w:tc>
@@ -2094,7 +1928,6 @@
             </w:tcMar>
           </w:tcPr>
           <w:p>
-            <w:proofErr w:type="spellStart"/>
             <w:r>
               <w:rPr>
                 <w:sz w:val="19"/>
@@ -2102,7 +1935,6 @@
               </w:rPr>
               <w:t>ScreeningDate</w:t>
             </w:r>
-            <w:proofErr w:type="spellEnd"/>
           </w:p>
         </w:tc>
         <w:tc>
@@ -2190,7 +2022,6 @@
             </w:tcMar>
           </w:tcPr>
           <w:p>
-            <w:proofErr w:type="spellStart"/>
             <w:r>
               <w:rPr>
                 <w:sz w:val="19"/>
@@ -2198,7 +2029,6 @@
               </w:rPr>
               <w:t>ScreeningTime</w:t>
             </w:r>
-            <w:proofErr w:type="spellEnd"/>
           </w:p>
         </w:tc>
         <w:tc>
@@ -2294,7 +2124,6 @@
             </w:tcMar>
           </w:tcPr>
           <w:p>
-            <w:proofErr w:type="spellStart"/>
             <w:r>
               <w:rPr>
                 <w:sz w:val="19"/>
@@ -2302,7 +2131,6 @@
               </w:rPr>
               <w:t>TicketPrice</w:t>
             </w:r>
-            <w:proofErr w:type="spellEnd"/>
           </w:p>
         </w:tc>
         <w:tc>
@@ -2393,7 +2221,6 @@
           <w:color w:val="000000" w:themeColor="text1"/>
         </w:rPr>
       </w:pPr>
-      <w:proofErr w:type="spellStart"/>
       <w:r>
         <w:rPr>
           <w:b/>
@@ -2402,7 +2229,6 @@
         </w:rPr>
         <w:t>tblSeat</w:t>
       </w:r>
-      <w:proofErr w:type="spellEnd"/>
     </w:p>
     <w:p>
       <w:pPr>
@@ -2580,7 +2406,6 @@
             </w:tcMar>
           </w:tcPr>
           <w:p>
-            <w:proofErr w:type="spellStart"/>
             <w:r>
               <w:rPr>
                 <w:sz w:val="19"/>
@@ -2588,7 +2413,6 @@
               </w:rPr>
               <w:t>SeatID</w:t>
             </w:r>
-            <w:proofErr w:type="spellEnd"/>
           </w:p>
         </w:tc>
         <w:tc>
@@ -2676,7 +2500,6 @@
             </w:tcMar>
           </w:tcPr>
           <w:p>
-            <w:proofErr w:type="spellStart"/>
             <w:r>
               <w:rPr>
                 <w:sz w:val="19"/>
@@ -2684,7 +2507,6 @@
               </w:rPr>
               <w:t>ScreenID</w:t>
             </w:r>
-            <w:proofErr w:type="spellEnd"/>
           </w:p>
         </w:tc>
         <w:tc>
@@ -2735,23 +2557,7 @@
                 <w:sz w:val="19"/>
                 <w:szCs w:val="19"/>
               </w:rPr>
-              <w:t xml:space="preserve">The screen the seat belongs to (Foreign Key to </w:t>
-            </w:r>
-            <w:proofErr w:type="spellStart"/>
-            <w:r>
-              <w:rPr>
-                <w:sz w:val="19"/>
-                <w:szCs w:val="19"/>
-              </w:rPr>
-              <w:t>tblScreen</w:t>
-            </w:r>
-            <w:proofErr w:type="spellEnd"/>
-            <w:r>
-              <w:rPr>
-                <w:sz w:val="19"/>
-                <w:szCs w:val="19"/>
-              </w:rPr>
-              <w:t>)</w:t>
+              <w:t>The screen the seat belongs to (Foreign Key to tblScreen)</w:t>
             </w:r>
           </w:p>
         </w:tc>
@@ -2788,7 +2594,6 @@
             </w:tcMar>
           </w:tcPr>
           <w:p>
-            <w:proofErr w:type="spellStart"/>
             <w:r>
               <w:rPr>
                 <w:sz w:val="19"/>
@@ -2796,7 +2601,6 @@
               </w:rPr>
               <w:t>SeatRow</w:t>
             </w:r>
-            <w:proofErr w:type="spellEnd"/>
           </w:p>
         </w:tc>
         <w:tc>
@@ -2892,7 +2696,6 @@
             </w:tcMar>
           </w:tcPr>
           <w:p>
-            <w:proofErr w:type="spellStart"/>
             <w:r>
               <w:rPr>
                 <w:sz w:val="19"/>
@@ -2900,7 +2703,6 @@
               </w:rPr>
               <w:t>SeatNumber</w:t>
             </w:r>
-            <w:proofErr w:type="spellEnd"/>
           </w:p>
         </w:tc>
         <w:tc>
@@ -2991,7 +2793,6 @@
           <w:color w:val="000000" w:themeColor="text1"/>
         </w:rPr>
       </w:pPr>
-      <w:proofErr w:type="spellStart"/>
       <w:r>
         <w:rPr>
           <w:b/>
@@ -3000,7 +2801,6 @@
         </w:rPr>
         <w:t>tblCustomer</w:t>
       </w:r>
-      <w:proofErr w:type="spellEnd"/>
     </w:p>
     <w:p>
       <w:pPr>
@@ -3178,7 +2978,6 @@
             </w:tcMar>
           </w:tcPr>
           <w:p>
-            <w:proofErr w:type="spellStart"/>
             <w:r>
               <w:rPr>
                 <w:sz w:val="19"/>
@@ -3186,7 +2985,6 @@
               </w:rPr>
               <w:t>CustomerID</w:t>
             </w:r>
-            <w:proofErr w:type="spellEnd"/>
           </w:p>
         </w:tc>
         <w:tc>
@@ -3274,7 +3072,6 @@
             </w:tcMar>
           </w:tcPr>
           <w:p>
-            <w:proofErr w:type="spellStart"/>
             <w:r>
               <w:rPr>
                 <w:sz w:val="19"/>
@@ -3282,7 +3079,6 @@
               </w:rPr>
               <w:t>CustomerForename</w:t>
             </w:r>
-            <w:proofErr w:type="spellEnd"/>
           </w:p>
         </w:tc>
         <w:tc>
@@ -3378,7 +3174,6 @@
             </w:tcMar>
           </w:tcPr>
           <w:p>
-            <w:proofErr w:type="spellStart"/>
             <w:r>
               <w:rPr>
                 <w:sz w:val="19"/>
@@ -3386,7 +3181,6 @@
               </w:rPr>
               <w:t>CustomerSurname</w:t>
             </w:r>
-            <w:proofErr w:type="spellEnd"/>
           </w:p>
         </w:tc>
         <w:tc>
@@ -3482,7 +3276,6 @@
             </w:tcMar>
           </w:tcPr>
           <w:p>
-            <w:proofErr w:type="spellStart"/>
             <w:r>
               <w:rPr>
                 <w:sz w:val="19"/>
@@ -3490,7 +3283,6 @@
               </w:rPr>
               <w:t>CustomerEmail</w:t>
             </w:r>
-            <w:proofErr w:type="spellEnd"/>
           </w:p>
         </w:tc>
         <w:tc>
@@ -3586,7 +3378,6 @@
             </w:tcMar>
           </w:tcPr>
           <w:p>
-            <w:proofErr w:type="spellStart"/>
             <w:r>
               <w:rPr>
                 <w:sz w:val="19"/>
@@ -3594,7 +3385,6 @@
               </w:rPr>
               <w:t>CustomerPhone</w:t>
             </w:r>
-            <w:proofErr w:type="spellEnd"/>
           </w:p>
         </w:tc>
         <w:tc>
@@ -3693,7 +3483,6 @@
           <w:color w:val="000000" w:themeColor="text1"/>
         </w:rPr>
       </w:pPr>
-      <w:proofErr w:type="spellStart"/>
       <w:r>
         <w:rPr>
           <w:b/>
@@ -3702,7 +3491,6 @@
         </w:rPr>
         <w:t>tblBooking</w:t>
       </w:r>
-      <w:proofErr w:type="spellEnd"/>
     </w:p>
     <w:p>
       <w:pPr>
@@ -3880,7 +3668,6 @@
             </w:tcMar>
           </w:tcPr>
           <w:p>
-            <w:proofErr w:type="spellStart"/>
             <w:r>
               <w:rPr>
                 <w:sz w:val="19"/>
@@ -3888,7 +3675,6 @@
               </w:rPr>
               <w:t>BookingID</w:t>
             </w:r>
-            <w:proofErr w:type="spellEnd"/>
           </w:p>
         </w:tc>
         <w:tc>
@@ -3976,7 +3762,6 @@
             </w:tcMar>
           </w:tcPr>
           <w:p>
-            <w:proofErr w:type="spellStart"/>
             <w:r>
               <w:rPr>
                 <w:sz w:val="19"/>
@@ -3984,7 +3769,6 @@
               </w:rPr>
               <w:t>CustomerID</w:t>
             </w:r>
-            <w:proofErr w:type="spellEnd"/>
           </w:p>
         </w:tc>
         <w:tc>
@@ -4035,23 +3819,7 @@
                 <w:sz w:val="19"/>
                 <w:szCs w:val="19"/>
               </w:rPr>
-              <w:t xml:space="preserve">The customer who made the booking (Foreign Key to </w:t>
-            </w:r>
-            <w:proofErr w:type="spellStart"/>
-            <w:r>
-              <w:rPr>
-                <w:sz w:val="19"/>
-                <w:szCs w:val="19"/>
-              </w:rPr>
-              <w:t>tblCustomer</w:t>
-            </w:r>
-            <w:proofErr w:type="spellEnd"/>
-            <w:r>
-              <w:rPr>
-                <w:sz w:val="19"/>
-                <w:szCs w:val="19"/>
-              </w:rPr>
-              <w:t>)</w:t>
+              <w:t>The customer who made the booking (Foreign Key to tblCustomer)</w:t>
             </w:r>
           </w:p>
         </w:tc>
@@ -4088,7 +3856,6 @@
             </w:tcMar>
           </w:tcPr>
           <w:p>
-            <w:proofErr w:type="spellStart"/>
             <w:r>
               <w:rPr>
                 <w:sz w:val="19"/>
@@ -4097,7 +3864,6 @@
               <w:lastRenderedPageBreak/>
               <w:t>ScreeningID</w:t>
             </w:r>
-            <w:proofErr w:type="spellEnd"/>
           </w:p>
         </w:tc>
         <w:tc>
@@ -4148,23 +3914,7 @@
                 <w:sz w:val="19"/>
                 <w:szCs w:val="19"/>
               </w:rPr>
-              <w:t xml:space="preserve">The screening booked (Foreign Key to </w:t>
-            </w:r>
-            <w:proofErr w:type="spellStart"/>
-            <w:r>
-              <w:rPr>
-                <w:sz w:val="19"/>
-                <w:szCs w:val="19"/>
-              </w:rPr>
-              <w:t>tblScreening</w:t>
-            </w:r>
-            <w:proofErr w:type="spellEnd"/>
-            <w:r>
-              <w:rPr>
-                <w:sz w:val="19"/>
-                <w:szCs w:val="19"/>
-              </w:rPr>
-              <w:t>)</w:t>
+              <w:t>The screening booked (Foreign Key to tblScreening)</w:t>
             </w:r>
           </w:p>
         </w:tc>
@@ -4201,7 +3951,6 @@
             </w:tcMar>
           </w:tcPr>
           <w:p>
-            <w:proofErr w:type="spellStart"/>
             <w:r>
               <w:rPr>
                 <w:sz w:val="19"/>
@@ -4209,7 +3958,6 @@
               </w:rPr>
               <w:t>BookingDate</w:t>
             </w:r>
-            <w:proofErr w:type="spellEnd"/>
           </w:p>
         </w:tc>
         <w:tc>
@@ -4297,7 +4045,6 @@
             </w:tcMar>
           </w:tcPr>
           <w:p>
-            <w:proofErr w:type="spellStart"/>
             <w:r>
               <w:rPr>
                 <w:sz w:val="19"/>
@@ -4305,7 +4052,6 @@
               </w:rPr>
               <w:t>TotalCost</w:t>
             </w:r>
-            <w:proofErr w:type="spellEnd"/>
           </w:p>
         </w:tc>
         <w:tc>
@@ -4396,7 +4142,6 @@
           <w:color w:val="000000" w:themeColor="text1"/>
         </w:rPr>
       </w:pPr>
-      <w:proofErr w:type="spellStart"/>
       <w:r>
         <w:rPr>
           <w:b/>
@@ -4405,7 +4150,6 @@
         </w:rPr>
         <w:t>tblBookingSeat</w:t>
       </w:r>
-      <w:proofErr w:type="spellEnd"/>
     </w:p>
     <w:p>
       <w:pPr>
@@ -4583,7 +4327,6 @@
             </w:tcMar>
           </w:tcPr>
           <w:p>
-            <w:proofErr w:type="spellStart"/>
             <w:r>
               <w:rPr>
                 <w:sz w:val="19"/>
@@ -4591,7 +4334,6 @@
               </w:rPr>
               <w:t>BookingSeatID</w:t>
             </w:r>
-            <w:proofErr w:type="spellEnd"/>
           </w:p>
         </w:tc>
         <w:tc>
@@ -4679,7 +4421,6 @@
             </w:tcMar>
           </w:tcPr>
           <w:p>
-            <w:proofErr w:type="spellStart"/>
             <w:r>
               <w:rPr>
                 <w:sz w:val="19"/>
@@ -4687,7 +4428,6 @@
               </w:rPr>
               <w:t>BookingID</w:t>
             </w:r>
-            <w:proofErr w:type="spellEnd"/>
           </w:p>
         </w:tc>
         <w:tc>
@@ -4738,23 +4478,7 @@
                 <w:sz w:val="19"/>
                 <w:szCs w:val="19"/>
               </w:rPr>
-              <w:t xml:space="preserve">The booking this seat belongs to (Foreign Key to </w:t>
-            </w:r>
-            <w:proofErr w:type="spellStart"/>
-            <w:r>
-              <w:rPr>
-                <w:sz w:val="19"/>
-                <w:szCs w:val="19"/>
-              </w:rPr>
-              <w:t>tblBooking</w:t>
-            </w:r>
-            <w:proofErr w:type="spellEnd"/>
-            <w:r>
-              <w:rPr>
-                <w:sz w:val="19"/>
-                <w:szCs w:val="19"/>
-              </w:rPr>
-              <w:t>)</w:t>
+              <w:t>The booking this seat belongs to (Foreign Key to tblBooking)</w:t>
             </w:r>
           </w:p>
         </w:tc>
@@ -4791,7 +4515,6 @@
             </w:tcMar>
           </w:tcPr>
           <w:p>
-            <w:proofErr w:type="spellStart"/>
             <w:r>
               <w:rPr>
                 <w:sz w:val="19"/>
@@ -4799,7 +4522,6 @@
               </w:rPr>
               <w:t>SeatID</w:t>
             </w:r>
-            <w:proofErr w:type="spellEnd"/>
           </w:p>
         </w:tc>
         <w:tc>
@@ -4850,23 +4572,7 @@
                 <w:sz w:val="19"/>
                 <w:szCs w:val="19"/>
               </w:rPr>
-              <w:t xml:space="preserve">The seat that was booked (Foreign Key to </w:t>
-            </w:r>
-            <w:proofErr w:type="spellStart"/>
-            <w:r>
-              <w:rPr>
-                <w:sz w:val="19"/>
-                <w:szCs w:val="19"/>
-              </w:rPr>
-              <w:t>tblSeat</w:t>
-            </w:r>
-            <w:proofErr w:type="spellEnd"/>
-            <w:r>
-              <w:rPr>
-                <w:sz w:val="19"/>
-                <w:szCs w:val="19"/>
-              </w:rPr>
-              <w:t>)</w:t>
+              <w:t>The seat that was booked (Foreign Key to tblSeat)</w:t>
             </w:r>
           </w:p>
         </w:tc>
@@ -4906,7 +4612,6 @@
           <w:color w:val="000000" w:themeColor="text1"/>
         </w:rPr>
       </w:pPr>
-      <w:proofErr w:type="spellStart"/>
       <w:r>
         <w:rPr>
           <w:b/>
@@ -4915,7 +4620,6 @@
         </w:rPr>
         <w:t>tblFoodItem</w:t>
       </w:r>
-      <w:proofErr w:type="spellEnd"/>
     </w:p>
     <w:p>
       <w:pPr>
@@ -5093,7 +4797,6 @@
             </w:tcMar>
           </w:tcPr>
           <w:p>
-            <w:proofErr w:type="spellStart"/>
             <w:r>
               <w:rPr>
                 <w:sz w:val="19"/>
@@ -5101,7 +4804,6 @@
               </w:rPr>
               <w:t>FoodItemID</w:t>
             </w:r>
-            <w:proofErr w:type="spellEnd"/>
           </w:p>
         </w:tc>
         <w:tc>
@@ -5189,7 +4891,6 @@
             </w:tcMar>
           </w:tcPr>
           <w:p>
-            <w:proofErr w:type="spellStart"/>
             <w:r>
               <w:rPr>
                 <w:sz w:val="19"/>
@@ -5197,7 +4898,6 @@
               </w:rPr>
               <w:t>FoodItemName</w:t>
             </w:r>
-            <w:proofErr w:type="spellEnd"/>
           </w:p>
         </w:tc>
         <w:tc>
@@ -5293,7 +4993,6 @@
             </w:tcMar>
           </w:tcPr>
           <w:p>
-            <w:proofErr w:type="spellStart"/>
             <w:r>
               <w:rPr>
                 <w:sz w:val="19"/>
@@ -5301,7 +5000,6 @@
               </w:rPr>
               <w:t>FoodItemPrice</w:t>
             </w:r>
-            <w:proofErr w:type="spellEnd"/>
           </w:p>
         </w:tc>
         <w:tc>
@@ -5389,7 +5087,6 @@
             </w:tcMar>
           </w:tcPr>
           <w:p>
-            <w:proofErr w:type="spellStart"/>
             <w:r>
               <w:rPr>
                 <w:sz w:val="19"/>
@@ -5397,7 +5094,6 @@
               </w:rPr>
               <w:t>FoodItemCategory</w:t>
             </w:r>
-            <w:proofErr w:type="spellEnd"/>
           </w:p>
         </w:tc>
         <w:tc>
@@ -5496,7 +5192,6 @@
           <w:color w:val="000000" w:themeColor="text1"/>
         </w:rPr>
       </w:pPr>
-      <w:proofErr w:type="spellStart"/>
       <w:r>
         <w:rPr>
           <w:b/>
@@ -5505,7 +5200,6 @@
         </w:rPr>
         <w:t>tblOrderItem</w:t>
       </w:r>
-      <w:proofErr w:type="spellEnd"/>
     </w:p>
     <w:p>
       <w:pPr>
@@ -5683,7 +5377,6 @@
             </w:tcMar>
           </w:tcPr>
           <w:p>
-            <w:proofErr w:type="spellStart"/>
             <w:r>
               <w:rPr>
                 <w:sz w:val="19"/>
@@ -5692,7 +5385,6 @@
               <w:lastRenderedPageBreak/>
               <w:t>OrderItemID</w:t>
             </w:r>
-            <w:proofErr w:type="spellEnd"/>
           </w:p>
         </w:tc>
         <w:tc>
@@ -5780,7 +5472,6 @@
             </w:tcMar>
           </w:tcPr>
           <w:p>
-            <w:proofErr w:type="spellStart"/>
             <w:r>
               <w:rPr>
                 <w:sz w:val="19"/>
@@ -5788,7 +5479,6 @@
               </w:rPr>
               <w:t>BookingID</w:t>
             </w:r>
-            <w:proofErr w:type="spellEnd"/>
           </w:p>
         </w:tc>
         <w:tc>
@@ -5839,23 +5529,7 @@
                 <w:sz w:val="19"/>
                 <w:szCs w:val="19"/>
               </w:rPr>
-              <w:t xml:space="preserve">The booking the item was added to (Foreign Key to </w:t>
-            </w:r>
-            <w:proofErr w:type="spellStart"/>
-            <w:r>
-              <w:rPr>
-                <w:sz w:val="19"/>
-                <w:szCs w:val="19"/>
-              </w:rPr>
-              <w:t>tblBooking</w:t>
-            </w:r>
-            <w:proofErr w:type="spellEnd"/>
-            <w:r>
-              <w:rPr>
-                <w:sz w:val="19"/>
-                <w:szCs w:val="19"/>
-              </w:rPr>
-              <w:t>)</w:t>
+              <w:t>The booking the item was added to (Foreign Key to tblBooking)</w:t>
             </w:r>
           </w:p>
         </w:tc>
@@ -5892,7 +5566,6 @@
             </w:tcMar>
           </w:tcPr>
           <w:p>
-            <w:proofErr w:type="spellStart"/>
             <w:r>
               <w:rPr>
                 <w:sz w:val="19"/>
@@ -5900,7 +5573,6 @@
               </w:rPr>
               <w:t>FoodItemID</w:t>
             </w:r>
-            <w:proofErr w:type="spellEnd"/>
           </w:p>
         </w:tc>
         <w:tc>
@@ -5951,23 +5623,7 @@
                 <w:sz w:val="19"/>
                 <w:szCs w:val="19"/>
               </w:rPr>
-              <w:t xml:space="preserve">The food item ordered (Foreign Key to </w:t>
-            </w:r>
-            <w:proofErr w:type="spellStart"/>
-            <w:r>
-              <w:rPr>
-                <w:sz w:val="19"/>
-                <w:szCs w:val="19"/>
-              </w:rPr>
-              <w:t>tblFoodItem</w:t>
-            </w:r>
-            <w:proofErr w:type="spellEnd"/>
-            <w:r>
-              <w:rPr>
-                <w:sz w:val="19"/>
-                <w:szCs w:val="19"/>
-              </w:rPr>
-              <w:t>)</w:t>
+              <w:t>The food item ordered (Foreign Key to tblFoodItem)</w:t>
             </w:r>
           </w:p>
         </w:tc>
@@ -6101,7 +5757,6 @@
           <w:color w:val="000000" w:themeColor="text1"/>
         </w:rPr>
       </w:pPr>
-      <w:proofErr w:type="spellStart"/>
       <w:r>
         <w:rPr>
           <w:b/>
@@ -6110,7 +5765,6 @@
         </w:rPr>
         <w:t>tblLogin</w:t>
       </w:r>
-      <w:proofErr w:type="spellEnd"/>
     </w:p>
     <w:p>
       <w:pPr>
@@ -6288,7 +5942,6 @@
             </w:tcMar>
           </w:tcPr>
           <w:p>
-            <w:proofErr w:type="spellStart"/>
             <w:r>
               <w:rPr>
                 <w:sz w:val="19"/>
@@ -6296,7 +5949,6 @@
               </w:rPr>
               <w:t>LoginID</w:t>
             </w:r>
-            <w:proofErr w:type="spellEnd"/>
           </w:p>
         </w:tc>
         <w:tc>
@@ -6566,7 +6218,6 @@
             </w:tcMar>
           </w:tcPr>
           <w:p>
-            <w:proofErr w:type="spellStart"/>
             <w:r>
               <w:rPr>
                 <w:sz w:val="19"/>
@@ -6574,7 +6225,6 @@
               </w:rPr>
               <w:t>MTIz</w:t>
             </w:r>
-            <w:proofErr w:type="spellEnd"/>
           </w:p>
         </w:tc>
       </w:tr>
@@ -6590,7 +6240,6 @@
             </w:tcMar>
           </w:tcPr>
           <w:p>
-            <w:proofErr w:type="spellStart"/>
             <w:r>
               <w:rPr>
                 <w:sz w:val="19"/>
@@ -6598,7 +6247,6 @@
               </w:rPr>
               <w:t>AccessLevel</w:t>
             </w:r>
-            <w:proofErr w:type="spellEnd"/>
           </w:p>
         </w:tc>
         <w:tc>
@@ -6689,7 +6337,6 @@
           <w:color w:val="000000" w:themeColor="text1"/>
         </w:rPr>
       </w:pPr>
-      <w:proofErr w:type="spellStart"/>
       <w:r>
         <w:rPr>
           <w:b/>
@@ -6698,7 +6345,6 @@
         </w:rPr>
         <w:t>tblLogs</w:t>
       </w:r>
-      <w:proofErr w:type="spellEnd"/>
     </w:p>
     <w:p>
       <w:pPr>
@@ -6876,7 +6522,6 @@
             </w:tcMar>
           </w:tcPr>
           <w:p>
-            <w:proofErr w:type="spellStart"/>
             <w:r>
               <w:rPr>
                 <w:sz w:val="19"/>
@@ -6884,7 +6529,6 @@
               </w:rPr>
               <w:t>LogID</w:t>
             </w:r>
-            <w:proofErr w:type="spellEnd"/>
           </w:p>
         </w:tc>
         <w:tc>
@@ -6972,7 +6616,6 @@
             </w:tcMar>
           </w:tcPr>
           <w:p>
-            <w:proofErr w:type="spellStart"/>
             <w:r>
               <w:rPr>
                 <w:sz w:val="19"/>
@@ -6980,7 +6623,6 @@
               </w:rPr>
               <w:t>LogDateTime</w:t>
             </w:r>
-            <w:proofErr w:type="spellEnd"/>
           </w:p>
         </w:tc>
         <w:tc>
@@ -7068,7 +6710,6 @@
             </w:tcMar>
           </w:tcPr>
           <w:p>
-            <w:proofErr w:type="spellStart"/>
             <w:r>
               <w:rPr>
                 <w:sz w:val="19"/>
@@ -7076,7 +6717,6 @@
               </w:rPr>
               <w:t>LogType</w:t>
             </w:r>
-            <w:proofErr w:type="spellEnd"/>
           </w:p>
         </w:tc>
         <w:tc>
@@ -7172,7 +6812,6 @@
             </w:tcMar>
           </w:tcPr>
           <w:p>
-            <w:proofErr w:type="spellStart"/>
             <w:r>
               <w:rPr>
                 <w:sz w:val="19"/>
@@ -7180,7 +6819,6 @@
               </w:rPr>
               <w:t>LogMessage</w:t>
             </w:r>
-            <w:proofErr w:type="spellEnd"/>
           </w:p>
         </w:tc>
         <w:tc>
@@ -7271,7 +6909,6 @@
           <w:color w:val="000000" w:themeColor="text1"/>
         </w:rPr>
       </w:pPr>
-      <w:proofErr w:type="spellStart"/>
       <w:r>
         <w:rPr>
           <w:b/>
@@ -7281,7 +6918,6 @@
         <w:lastRenderedPageBreak/>
         <w:t>tblVersionControl</w:t>
       </w:r>
-      <w:proofErr w:type="spellEnd"/>
     </w:p>
     <w:p>
       <w:pPr>
@@ -7579,15 +7215,7 @@
         <w:spacing w:after="160" w:line="276" w:lineRule="auto"/>
       </w:pPr>
       <w:r>
-        <w:t xml:space="preserve">This section describes the processing that takes place inside the </w:t>
-      </w:r>
-      <w:proofErr w:type="spellStart"/>
-      <w:r>
-        <w:t>Filmtopia</w:t>
-      </w:r>
-      <w:proofErr w:type="spellEnd"/>
-      <w:r>
-        <w:t xml:space="preserve"> system. Rather than listing every button on every form it focuses on the stages where there is real logic going on, since these are the parts of the system that need to be thought through carefully before any code is written. Each stage is described in plain English pseudocode rather than in Visual Basic, so that the logic is clear and separate from the eventual code, and the two most important algorithms are also shown as flowcharts. Each stage is linked back to the objectives it helps to meet.</w:t>
+        <w:t>This section describes the processing that takes place inside the Filmtopia system. Rather than listing every button on every form it focuses on the stages where there is real logic going on, since these are the parts of the system that need to be thought through carefully before any code is written. Each stage is described in plain English pseudocode rather than in Visual Basic, so that the logic is clear and separate from the eventual code, and the two most important algorithms are also shown as flowcharts. Each stage is linked back to the objectives it helps to meet.</w:t>
       </w:r>
     </w:p>
     <w:p>
@@ -7703,25 +7331,27 @@
                 <w:sz w:val="19"/>
                 <w:szCs w:val="19"/>
               </w:rPr>
-              <w:t xml:space="preserve">    LOOK UP the username in </w:t>
-            </w:r>
-            <w:proofErr w:type="spellStart"/>
+              <w:t xml:space="preserve">    LOOK UP the username in tblLogin using an SQL SELECT query</w:t>
+            </w:r>
+          </w:p>
+          <w:p>
             <w:r>
               <w:rPr>
                 <w:rFonts w:ascii="Courier New" w:eastAsia="Courier New" w:hAnsi="Courier New" w:cs="Courier New"/>
                 <w:sz w:val="19"/>
                 <w:szCs w:val="19"/>
               </w:rPr>
-              <w:t>tblLogin</w:t>
-            </w:r>
-            <w:proofErr w:type="spellEnd"/>
+              <w:t xml:space="preserve">    IF no matching username is found THEN</w:t>
+            </w:r>
+          </w:p>
+          <w:p>
             <w:r>
               <w:rPr>
                 <w:rFonts w:ascii="Courier New" w:eastAsia="Courier New" w:hAnsi="Courier New" w:cs="Courier New"/>
                 <w:sz w:val="19"/>
                 <w:szCs w:val="19"/>
               </w:rPr>
-              <w:t xml:space="preserve"> using an SQL SELECT query</w:t>
+              <w:t xml:space="preserve">        DISPLAY "Login details not recognised"</w:t>
             </w:r>
           </w:p>
           <w:p>
@@ -7731,7 +7361,7 @@
                 <w:sz w:val="19"/>
                 <w:szCs w:val="19"/>
               </w:rPr>
-              <w:t xml:space="preserve">    IF no matching username is found THEN</w:t>
+              <w:t xml:space="preserve">    ELSE IF the stored password does not match the encoded password THEN</w:t>
             </w:r>
           </w:p>
           <w:p>
@@ -7751,7 +7381,7 @@
                 <w:sz w:val="19"/>
                 <w:szCs w:val="19"/>
               </w:rPr>
-              <w:t xml:space="preserve">    ELSE IF the stored password does not match the encoded password THEN</w:t>
+              <w:t xml:space="preserve">    ELSE</w:t>
             </w:r>
           </w:p>
           <w:p>
@@ -7761,45 +7391,7 @@
                 <w:sz w:val="19"/>
                 <w:szCs w:val="19"/>
               </w:rPr>
-              <w:t xml:space="preserve">        DISPLAY "Login details not recognised"</w:t>
-            </w:r>
-          </w:p>
-          <w:p>
-            <w:r>
-              <w:rPr>
-                <w:rFonts w:ascii="Courier New" w:eastAsia="Courier New" w:hAnsi="Courier New" w:cs="Courier New"/>
-                <w:sz w:val="19"/>
-                <w:szCs w:val="19"/>
-              </w:rPr>
-              <w:t xml:space="preserve">    ELSE</w:t>
-            </w:r>
-          </w:p>
-          <w:p>
-            <w:r>
-              <w:rPr>
-                <w:rFonts w:ascii="Courier New" w:eastAsia="Courier New" w:hAnsi="Courier New" w:cs="Courier New"/>
-                <w:sz w:val="19"/>
-                <w:szCs w:val="19"/>
-              </w:rPr>
-              <w:t xml:space="preserve">        STORE the user's </w:t>
-            </w:r>
-            <w:proofErr w:type="spellStart"/>
-            <w:r>
-              <w:rPr>
-                <w:rFonts w:ascii="Courier New" w:eastAsia="Courier New" w:hAnsi="Courier New" w:cs="Courier New"/>
-                <w:sz w:val="19"/>
-                <w:szCs w:val="19"/>
-              </w:rPr>
-              <w:t>AccessLevel</w:t>
-            </w:r>
-            <w:proofErr w:type="spellEnd"/>
-            <w:r>
-              <w:rPr>
-                <w:rFonts w:ascii="Courier New" w:eastAsia="Courier New" w:hAnsi="Courier New" w:cs="Courier New"/>
-                <w:sz w:val="19"/>
-                <w:szCs w:val="19"/>
-              </w:rPr>
-              <w:t xml:space="preserve"> for the session</w:t>
+              <w:t xml:space="preserve">        STORE the user's AccessLevel for the session</w:t>
             </w:r>
           </w:p>
           <w:p>
@@ -7946,25 +7538,27 @@
                 <w:sz w:val="19"/>
                 <w:szCs w:val="19"/>
               </w:rPr>
-              <w:t xml:space="preserve">SET </w:t>
-            </w:r>
-            <w:proofErr w:type="spellStart"/>
+              <w:t>SET seatsPerRow to 10</w:t>
+            </w:r>
+          </w:p>
+          <w:p>
             <w:r>
               <w:rPr>
                 <w:rFonts w:ascii="Courier New" w:eastAsia="Courier New" w:hAnsi="Courier New" w:cs="Courier New"/>
                 <w:sz w:val="19"/>
                 <w:szCs w:val="19"/>
               </w:rPr>
-              <w:t>seatsPerRow</w:t>
-            </w:r>
-            <w:proofErr w:type="spellEnd"/>
+              <w:t>SET rowLetter to "A"</w:t>
+            </w:r>
+          </w:p>
+          <w:p>
             <w:r>
               <w:rPr>
                 <w:rFonts w:ascii="Courier New" w:eastAsia="Courier New" w:hAnsi="Courier New" w:cs="Courier New"/>
                 <w:sz w:val="19"/>
                 <w:szCs w:val="19"/>
               </w:rPr>
-              <w:t xml:space="preserve"> to 10</w:t>
+              <w:t>SET seatsMade to 0</w:t>
             </w:r>
           </w:p>
           <w:p>
@@ -7974,25 +7568,27 @@
                 <w:sz w:val="19"/>
                 <w:szCs w:val="19"/>
               </w:rPr>
-              <w:t xml:space="preserve">SET </w:t>
-            </w:r>
-            <w:proofErr w:type="spellStart"/>
+              <w:t>WHILE seatsMade is less than capacity</w:t>
+            </w:r>
+          </w:p>
+          <w:p>
             <w:r>
               <w:rPr>
                 <w:rFonts w:ascii="Courier New" w:eastAsia="Courier New" w:hAnsi="Courier New" w:cs="Courier New"/>
                 <w:sz w:val="19"/>
                 <w:szCs w:val="19"/>
               </w:rPr>
-              <w:t>rowLetter</w:t>
-            </w:r>
-            <w:proofErr w:type="spellEnd"/>
+              <w:t xml:space="preserve">    FOR seatNumber from 1 to seatsPerRow</w:t>
+            </w:r>
+          </w:p>
+          <w:p>
             <w:r>
               <w:rPr>
                 <w:rFonts w:ascii="Courier New" w:eastAsia="Courier New" w:hAnsi="Courier New" w:cs="Courier New"/>
                 <w:sz w:val="19"/>
                 <w:szCs w:val="19"/>
               </w:rPr>
-              <w:t xml:space="preserve"> to "A"</w:t>
+              <w:t xml:space="preserve">        IF seatsMade is less than capacity THEN</w:t>
             </w:r>
           </w:p>
           <w:p>
@@ -8002,25 +7598,27 @@
                 <w:sz w:val="19"/>
                 <w:szCs w:val="19"/>
               </w:rPr>
-              <w:t xml:space="preserve">SET </w:t>
-            </w:r>
-            <w:proofErr w:type="spellStart"/>
+              <w:t xml:space="preserve">            INSERT a seat into tblSeat with the current ScreenID,</w:t>
+            </w:r>
+          </w:p>
+          <w:p>
             <w:r>
               <w:rPr>
                 <w:rFonts w:ascii="Courier New" w:eastAsia="Courier New" w:hAnsi="Courier New" w:cs="Courier New"/>
                 <w:sz w:val="19"/>
                 <w:szCs w:val="19"/>
               </w:rPr>
-              <w:t>seatsMade</w:t>
-            </w:r>
-            <w:proofErr w:type="spellEnd"/>
+              <w:t xml:space="preserve">                   rowLetter and seatNumber using an SQL INSERT</w:t>
+            </w:r>
+          </w:p>
+          <w:p>
             <w:r>
               <w:rPr>
                 <w:rFonts w:ascii="Courier New" w:eastAsia="Courier New" w:hAnsi="Courier New" w:cs="Courier New"/>
                 <w:sz w:val="19"/>
                 <w:szCs w:val="19"/>
               </w:rPr>
-              <w:t xml:space="preserve"> to 0</w:t>
+              <w:t xml:space="preserve">            ADD 1 to seatsMade</w:t>
             </w:r>
           </w:p>
           <w:p>
@@ -8030,261 +7628,27 @@
                 <w:sz w:val="19"/>
                 <w:szCs w:val="19"/>
               </w:rPr>
-              <w:t xml:space="preserve">WHILE </w:t>
-            </w:r>
-            <w:proofErr w:type="spellStart"/>
+              <w:t xml:space="preserve">        END IF</w:t>
+            </w:r>
+          </w:p>
+          <w:p>
             <w:r>
               <w:rPr>
                 <w:rFonts w:ascii="Courier New" w:eastAsia="Courier New" w:hAnsi="Courier New" w:cs="Courier New"/>
                 <w:sz w:val="19"/>
                 <w:szCs w:val="19"/>
               </w:rPr>
-              <w:t>seatsMade</w:t>
-            </w:r>
-            <w:proofErr w:type="spellEnd"/>
+              <w:t xml:space="preserve">    NEXT seatNumber</w:t>
+            </w:r>
+          </w:p>
+          <w:p>
             <w:r>
               <w:rPr>
                 <w:rFonts w:ascii="Courier New" w:eastAsia="Courier New" w:hAnsi="Courier New" w:cs="Courier New"/>
                 <w:sz w:val="19"/>
                 <w:szCs w:val="19"/>
               </w:rPr>
-              <w:t xml:space="preserve"> is less than capacity</w:t>
-            </w:r>
-          </w:p>
-          <w:p>
-            <w:r>
-              <w:rPr>
-                <w:rFonts w:ascii="Courier New" w:eastAsia="Courier New" w:hAnsi="Courier New" w:cs="Courier New"/>
-                <w:sz w:val="19"/>
-                <w:szCs w:val="19"/>
-              </w:rPr>
-              <w:t xml:space="preserve">    FOR </w:t>
-            </w:r>
-            <w:proofErr w:type="spellStart"/>
-            <w:r>
-              <w:rPr>
-                <w:rFonts w:ascii="Courier New" w:eastAsia="Courier New" w:hAnsi="Courier New" w:cs="Courier New"/>
-                <w:sz w:val="19"/>
-                <w:szCs w:val="19"/>
-              </w:rPr>
-              <w:t>seatNumber</w:t>
-            </w:r>
-            <w:proofErr w:type="spellEnd"/>
-            <w:r>
-              <w:rPr>
-                <w:rFonts w:ascii="Courier New" w:eastAsia="Courier New" w:hAnsi="Courier New" w:cs="Courier New"/>
-                <w:sz w:val="19"/>
-                <w:szCs w:val="19"/>
-              </w:rPr>
-              <w:t xml:space="preserve"> from 1 to </w:t>
-            </w:r>
-            <w:proofErr w:type="spellStart"/>
-            <w:r>
-              <w:rPr>
-                <w:rFonts w:ascii="Courier New" w:eastAsia="Courier New" w:hAnsi="Courier New" w:cs="Courier New"/>
-                <w:sz w:val="19"/>
-                <w:szCs w:val="19"/>
-              </w:rPr>
-              <w:t>seatsPerRow</w:t>
-            </w:r>
-            <w:proofErr w:type="spellEnd"/>
-          </w:p>
-          <w:p>
-            <w:r>
-              <w:rPr>
-                <w:rFonts w:ascii="Courier New" w:eastAsia="Courier New" w:hAnsi="Courier New" w:cs="Courier New"/>
-                <w:sz w:val="19"/>
-                <w:szCs w:val="19"/>
-              </w:rPr>
-              <w:t xml:space="preserve">        IF </w:t>
-            </w:r>
-            <w:proofErr w:type="spellStart"/>
-            <w:r>
-              <w:rPr>
-                <w:rFonts w:ascii="Courier New" w:eastAsia="Courier New" w:hAnsi="Courier New" w:cs="Courier New"/>
-                <w:sz w:val="19"/>
-                <w:szCs w:val="19"/>
-              </w:rPr>
-              <w:t>seatsMade</w:t>
-            </w:r>
-            <w:proofErr w:type="spellEnd"/>
-            <w:r>
-              <w:rPr>
-                <w:rFonts w:ascii="Courier New" w:eastAsia="Courier New" w:hAnsi="Courier New" w:cs="Courier New"/>
-                <w:sz w:val="19"/>
-                <w:szCs w:val="19"/>
-              </w:rPr>
-              <w:t xml:space="preserve"> is less than capacity THEN</w:t>
-            </w:r>
-          </w:p>
-          <w:p>
-            <w:r>
-              <w:rPr>
-                <w:rFonts w:ascii="Courier New" w:eastAsia="Courier New" w:hAnsi="Courier New" w:cs="Courier New"/>
-                <w:sz w:val="19"/>
-                <w:szCs w:val="19"/>
-              </w:rPr>
-              <w:t xml:space="preserve">            INSERT a seat into </w:t>
-            </w:r>
-            <w:proofErr w:type="spellStart"/>
-            <w:r>
-              <w:rPr>
-                <w:rFonts w:ascii="Courier New" w:eastAsia="Courier New" w:hAnsi="Courier New" w:cs="Courier New"/>
-                <w:sz w:val="19"/>
-                <w:szCs w:val="19"/>
-              </w:rPr>
-              <w:t>tblSeat</w:t>
-            </w:r>
-            <w:proofErr w:type="spellEnd"/>
-            <w:r>
-              <w:rPr>
-                <w:rFonts w:ascii="Courier New" w:eastAsia="Courier New" w:hAnsi="Courier New" w:cs="Courier New"/>
-                <w:sz w:val="19"/>
-                <w:szCs w:val="19"/>
-              </w:rPr>
-              <w:t xml:space="preserve"> with the current </w:t>
-            </w:r>
-            <w:proofErr w:type="spellStart"/>
-            <w:r>
-              <w:rPr>
-                <w:rFonts w:ascii="Courier New" w:eastAsia="Courier New" w:hAnsi="Courier New" w:cs="Courier New"/>
-                <w:sz w:val="19"/>
-                <w:szCs w:val="19"/>
-              </w:rPr>
-              <w:t>ScreenID</w:t>
-            </w:r>
-            <w:proofErr w:type="spellEnd"/>
-            <w:r>
-              <w:rPr>
-                <w:rFonts w:ascii="Courier New" w:eastAsia="Courier New" w:hAnsi="Courier New" w:cs="Courier New"/>
-                <w:sz w:val="19"/>
-                <w:szCs w:val="19"/>
-              </w:rPr>
-              <w:t>,</w:t>
-            </w:r>
-          </w:p>
-          <w:p>
-            <w:r>
-              <w:rPr>
-                <w:rFonts w:ascii="Courier New" w:eastAsia="Courier New" w:hAnsi="Courier New" w:cs="Courier New"/>
-                <w:sz w:val="19"/>
-                <w:szCs w:val="19"/>
-              </w:rPr>
-              <w:t xml:space="preserve">                   </w:t>
-            </w:r>
-            <w:proofErr w:type="spellStart"/>
-            <w:r>
-              <w:rPr>
-                <w:rFonts w:ascii="Courier New" w:eastAsia="Courier New" w:hAnsi="Courier New" w:cs="Courier New"/>
-                <w:sz w:val="19"/>
-                <w:szCs w:val="19"/>
-              </w:rPr>
-              <w:t>rowLetter</w:t>
-            </w:r>
-            <w:proofErr w:type="spellEnd"/>
-            <w:r>
-              <w:rPr>
-                <w:rFonts w:ascii="Courier New" w:eastAsia="Courier New" w:hAnsi="Courier New" w:cs="Courier New"/>
-                <w:sz w:val="19"/>
-                <w:szCs w:val="19"/>
-              </w:rPr>
-              <w:t xml:space="preserve"> and </w:t>
-            </w:r>
-            <w:proofErr w:type="spellStart"/>
-            <w:r>
-              <w:rPr>
-                <w:rFonts w:ascii="Courier New" w:eastAsia="Courier New" w:hAnsi="Courier New" w:cs="Courier New"/>
-                <w:sz w:val="19"/>
-                <w:szCs w:val="19"/>
-              </w:rPr>
-              <w:t>seatNumber</w:t>
-            </w:r>
-            <w:proofErr w:type="spellEnd"/>
-            <w:r>
-              <w:rPr>
-                <w:rFonts w:ascii="Courier New" w:eastAsia="Courier New" w:hAnsi="Courier New" w:cs="Courier New"/>
-                <w:sz w:val="19"/>
-                <w:szCs w:val="19"/>
-              </w:rPr>
-              <w:t xml:space="preserve"> using an SQL INSERT</w:t>
-            </w:r>
-          </w:p>
-          <w:p>
-            <w:r>
-              <w:rPr>
-                <w:rFonts w:ascii="Courier New" w:eastAsia="Courier New" w:hAnsi="Courier New" w:cs="Courier New"/>
-                <w:sz w:val="19"/>
-                <w:szCs w:val="19"/>
-              </w:rPr>
-              <w:t xml:space="preserve">            ADD 1 to </w:t>
-            </w:r>
-            <w:proofErr w:type="spellStart"/>
-            <w:r>
-              <w:rPr>
-                <w:rFonts w:ascii="Courier New" w:eastAsia="Courier New" w:hAnsi="Courier New" w:cs="Courier New"/>
-                <w:sz w:val="19"/>
-                <w:szCs w:val="19"/>
-              </w:rPr>
-              <w:t>seatsMade</w:t>
-            </w:r>
-            <w:proofErr w:type="spellEnd"/>
-          </w:p>
-          <w:p>
-            <w:r>
-              <w:rPr>
-                <w:rFonts w:ascii="Courier New" w:eastAsia="Courier New" w:hAnsi="Courier New" w:cs="Courier New"/>
-                <w:sz w:val="19"/>
-                <w:szCs w:val="19"/>
-              </w:rPr>
-              <w:t xml:space="preserve">        END IF</w:t>
-            </w:r>
-          </w:p>
-          <w:p>
-            <w:r>
-              <w:rPr>
-                <w:rFonts w:ascii="Courier New" w:eastAsia="Courier New" w:hAnsi="Courier New" w:cs="Courier New"/>
-                <w:sz w:val="19"/>
-                <w:szCs w:val="19"/>
-              </w:rPr>
-              <w:t xml:space="preserve">    NEXT </w:t>
-            </w:r>
-            <w:proofErr w:type="spellStart"/>
-            <w:r>
-              <w:rPr>
-                <w:rFonts w:ascii="Courier New" w:eastAsia="Courier New" w:hAnsi="Courier New" w:cs="Courier New"/>
-                <w:sz w:val="19"/>
-                <w:szCs w:val="19"/>
-              </w:rPr>
-              <w:t>seatNumber</w:t>
-            </w:r>
-            <w:proofErr w:type="spellEnd"/>
-          </w:p>
-          <w:p>
-            <w:r>
-              <w:rPr>
-                <w:rFonts w:ascii="Courier New" w:eastAsia="Courier New" w:hAnsi="Courier New" w:cs="Courier New"/>
-                <w:sz w:val="19"/>
-                <w:szCs w:val="19"/>
-              </w:rPr>
-              <w:t xml:space="preserve">    MOVE </w:t>
-            </w:r>
-            <w:proofErr w:type="spellStart"/>
-            <w:r>
-              <w:rPr>
-                <w:rFonts w:ascii="Courier New" w:eastAsia="Courier New" w:hAnsi="Courier New" w:cs="Courier New"/>
-                <w:sz w:val="19"/>
-                <w:szCs w:val="19"/>
-              </w:rPr>
-              <w:t>rowLetter</w:t>
-            </w:r>
-            <w:proofErr w:type="spellEnd"/>
-            <w:r>
-              <w:rPr>
-                <w:rFonts w:ascii="Courier New" w:eastAsia="Courier New" w:hAnsi="Courier New" w:cs="Courier New"/>
-                <w:sz w:val="19"/>
-                <w:szCs w:val="19"/>
-              </w:rPr>
-              <w:t xml:space="preserve"> on to the next letter of the alphabet</w:t>
+              <w:t xml:space="preserve">    MOVE rowLetter on to the next letter of the alphabet</w:t>
             </w:r>
           </w:p>
           <w:p>
@@ -8420,43 +7784,47 @@
                 <w:sz w:val="19"/>
                 <w:szCs w:val="19"/>
               </w:rPr>
-              <w:t xml:space="preserve">    LOOK UP </w:t>
-            </w:r>
-            <w:proofErr w:type="spellStart"/>
+              <w:t xml:space="preserve">    LOOK UP tblBookingSeat joined to tblBooking to see whether</w:t>
+            </w:r>
+          </w:p>
+          <w:p>
             <w:r>
               <w:rPr>
                 <w:rFonts w:ascii="Courier New" w:eastAsia="Courier New" w:hAnsi="Courier New" w:cs="Courier New"/>
                 <w:sz w:val="19"/>
                 <w:szCs w:val="19"/>
               </w:rPr>
-              <w:t>tblBookingSeat</w:t>
-            </w:r>
-            <w:proofErr w:type="spellEnd"/>
+              <w:t xml:space="preserve">        that seat is already booked for this screening (SQL SELECT)</w:t>
+            </w:r>
+          </w:p>
+          <w:p>
             <w:r>
               <w:rPr>
                 <w:rFonts w:ascii="Courier New" w:eastAsia="Courier New" w:hAnsi="Courier New" w:cs="Courier New"/>
                 <w:sz w:val="19"/>
                 <w:szCs w:val="19"/>
               </w:rPr>
-              <w:t xml:space="preserve"> joined to </w:t>
-            </w:r>
-            <w:proofErr w:type="spellStart"/>
+              <w:t xml:space="preserve">    IF the seat is already booked THEN</w:t>
+            </w:r>
+          </w:p>
+          <w:p>
             <w:r>
               <w:rPr>
                 <w:rFonts w:ascii="Courier New" w:eastAsia="Courier New" w:hAnsi="Courier New" w:cs="Courier New"/>
                 <w:sz w:val="19"/>
                 <w:szCs w:val="19"/>
               </w:rPr>
-              <w:t>tblBooking</w:t>
-            </w:r>
-            <w:proofErr w:type="spellEnd"/>
+              <w:t xml:space="preserve">        DISPLAY "One or more of the selected seats has been taken"</w:t>
+            </w:r>
+          </w:p>
+          <w:p>
             <w:r>
               <w:rPr>
                 <w:rFonts w:ascii="Courier New" w:eastAsia="Courier New" w:hAnsi="Courier New" w:cs="Courier New"/>
                 <w:sz w:val="19"/>
                 <w:szCs w:val="19"/>
               </w:rPr>
-              <w:t xml:space="preserve"> to see whether</w:t>
+              <w:t xml:space="preserve">        STOP the booking</w:t>
             </w:r>
           </w:p>
           <w:p>
@@ -8466,7 +7834,7 @@
                 <w:sz w:val="19"/>
                 <w:szCs w:val="19"/>
               </w:rPr>
-              <w:t xml:space="preserve">        that seat is already booked for this screening (SQL SELECT)</w:t>
+              <w:t xml:space="preserve">    END IF</w:t>
             </w:r>
           </w:p>
           <w:p>
@@ -8476,7 +7844,7 @@
                 <w:sz w:val="19"/>
                 <w:szCs w:val="19"/>
               </w:rPr>
-              <w:t xml:space="preserve">    IF the seat is already booked THEN</w:t>
+              <w:t>NEXT seat</w:t>
             </w:r>
           </w:p>
           <w:p>
@@ -8486,7 +7854,8 @@
                 <w:sz w:val="19"/>
                 <w:szCs w:val="19"/>
               </w:rPr>
-              <w:t xml:space="preserve">        DISPLAY "One or more of the selected seats has been taken"</w:t>
+              <w:lastRenderedPageBreak/>
+              <w:t>INSERT a new record into tblBooking with the customer, screening,</w:t>
             </w:r>
           </w:p>
           <w:p>
@@ -8496,7 +7865,7 @@
                 <w:sz w:val="19"/>
                 <w:szCs w:val="19"/>
               </w:rPr>
-              <w:t xml:space="preserve">        STOP the booking</w:t>
+              <w:t xml:space="preserve">       today's date and the calculated total cost</w:t>
             </w:r>
           </w:p>
           <w:p>
@@ -8506,7 +7875,7 @@
                 <w:sz w:val="19"/>
                 <w:szCs w:val="19"/>
               </w:rPr>
-              <w:t xml:space="preserve">    END IF</w:t>
+              <w:t>GET the new BookingID that was created</w:t>
             </w:r>
           </w:p>
           <w:p>
@@ -8516,7 +7885,7 @@
                 <w:sz w:val="19"/>
                 <w:szCs w:val="19"/>
               </w:rPr>
-              <w:t>NEXT seat</w:t>
+              <w:t>FOR each chosen seat</w:t>
             </w:r>
           </w:p>
           <w:p>
@@ -8526,131 +7895,8 @@
                 <w:sz w:val="19"/>
                 <w:szCs w:val="19"/>
               </w:rPr>
-              <w:lastRenderedPageBreak/>
-              <w:t xml:space="preserve">INSERT a new record into </w:t>
-            </w:r>
-            <w:proofErr w:type="spellStart"/>
-            <w:r>
-              <w:rPr>
-                <w:rFonts w:ascii="Courier New" w:eastAsia="Courier New" w:hAnsi="Courier New" w:cs="Courier New"/>
-                <w:sz w:val="19"/>
-                <w:szCs w:val="19"/>
-              </w:rPr>
-              <w:t>tblBooking</w:t>
-            </w:r>
-            <w:proofErr w:type="spellEnd"/>
-            <w:r>
-              <w:rPr>
-                <w:rFonts w:ascii="Courier New" w:eastAsia="Courier New" w:hAnsi="Courier New" w:cs="Courier New"/>
-                <w:sz w:val="19"/>
-                <w:szCs w:val="19"/>
-              </w:rPr>
-              <w:t xml:space="preserve"> with the customer, screening,</w:t>
-            </w:r>
-          </w:p>
-          <w:p>
-            <w:r>
-              <w:rPr>
-                <w:rFonts w:ascii="Courier New" w:eastAsia="Courier New" w:hAnsi="Courier New" w:cs="Courier New"/>
-                <w:sz w:val="19"/>
-                <w:szCs w:val="19"/>
-              </w:rPr>
-              <w:t xml:space="preserve">       today's date and the calculated total cost</w:t>
-            </w:r>
-          </w:p>
-          <w:p>
-            <w:r>
-              <w:rPr>
-                <w:rFonts w:ascii="Courier New" w:eastAsia="Courier New" w:hAnsi="Courier New" w:cs="Courier New"/>
-                <w:sz w:val="19"/>
-                <w:szCs w:val="19"/>
-              </w:rPr>
-              <w:t xml:space="preserve">GET the new </w:t>
-            </w:r>
-            <w:proofErr w:type="spellStart"/>
-            <w:r>
-              <w:rPr>
-                <w:rFonts w:ascii="Courier New" w:eastAsia="Courier New" w:hAnsi="Courier New" w:cs="Courier New"/>
-                <w:sz w:val="19"/>
-                <w:szCs w:val="19"/>
-              </w:rPr>
-              <w:t>BookingID</w:t>
-            </w:r>
-            <w:proofErr w:type="spellEnd"/>
-            <w:r>
-              <w:rPr>
-                <w:rFonts w:ascii="Courier New" w:eastAsia="Courier New" w:hAnsi="Courier New" w:cs="Courier New"/>
-                <w:sz w:val="19"/>
-                <w:szCs w:val="19"/>
-              </w:rPr>
-              <w:t xml:space="preserve"> that was created</w:t>
-            </w:r>
-          </w:p>
-          <w:p>
-            <w:r>
-              <w:rPr>
-                <w:rFonts w:ascii="Courier New" w:eastAsia="Courier New" w:hAnsi="Courier New" w:cs="Courier New"/>
-                <w:sz w:val="19"/>
-                <w:szCs w:val="19"/>
-              </w:rPr>
-              <w:t>FOR each chosen seat</w:t>
-            </w:r>
-          </w:p>
-          <w:p>
-            <w:r>
-              <w:rPr>
-                <w:rFonts w:ascii="Courier New" w:eastAsia="Courier New" w:hAnsi="Courier New" w:cs="Courier New"/>
-                <w:sz w:val="19"/>
-                <w:szCs w:val="19"/>
-              </w:rPr>
-              <w:t xml:space="preserve">    INSERT a record into </w:t>
-            </w:r>
-            <w:proofErr w:type="spellStart"/>
-            <w:r>
-              <w:rPr>
-                <w:rFonts w:ascii="Courier New" w:eastAsia="Courier New" w:hAnsi="Courier New" w:cs="Courier New"/>
-                <w:sz w:val="19"/>
-                <w:szCs w:val="19"/>
-              </w:rPr>
-              <w:t>tblBookingSeat</w:t>
-            </w:r>
-            <w:proofErr w:type="spellEnd"/>
-            <w:r>
-              <w:rPr>
-                <w:rFonts w:ascii="Courier New" w:eastAsia="Courier New" w:hAnsi="Courier New" w:cs="Courier New"/>
-                <w:sz w:val="19"/>
-                <w:szCs w:val="19"/>
-              </w:rPr>
-              <w:t xml:space="preserve"> linking </w:t>
-            </w:r>
-            <w:proofErr w:type="spellStart"/>
-            <w:r>
-              <w:rPr>
-                <w:rFonts w:ascii="Courier New" w:eastAsia="Courier New" w:hAnsi="Courier New" w:cs="Courier New"/>
-                <w:sz w:val="19"/>
-                <w:szCs w:val="19"/>
-              </w:rPr>
-              <w:t>BookingID</w:t>
-            </w:r>
-            <w:proofErr w:type="spellEnd"/>
-            <w:r>
-              <w:rPr>
-                <w:rFonts w:ascii="Courier New" w:eastAsia="Courier New" w:hAnsi="Courier New" w:cs="Courier New"/>
-                <w:sz w:val="19"/>
-                <w:szCs w:val="19"/>
-              </w:rPr>
-              <w:t xml:space="preserve"> to </w:t>
-            </w:r>
-            <w:proofErr w:type="spellStart"/>
-            <w:r>
-              <w:rPr>
-                <w:rFonts w:ascii="Courier New" w:eastAsia="Courier New" w:hAnsi="Courier New" w:cs="Courier New"/>
-                <w:sz w:val="19"/>
-                <w:szCs w:val="19"/>
-              </w:rPr>
-              <w:t>SeatID</w:t>
-            </w:r>
-            <w:proofErr w:type="spellEnd"/>
+              <w:t xml:space="preserve">    INSERT a record into tblBookingSeat linking BookingID to SeatID</w:t>
+            </w:r>
           </w:p>
           <w:p>
             <w:r>
@@ -8753,18 +7999,18 @@
                 <w:sz w:val="19"/>
                 <w:szCs w:val="19"/>
               </w:rPr>
-              <w:t xml:space="preserve">GET the selected screening and its </w:t>
-            </w:r>
-            <w:proofErr w:type="spellStart"/>
+              <w:t>GET the selected screening and its ScreenID</w:t>
+            </w:r>
+          </w:p>
+          <w:p>
             <w:r>
               <w:rPr>
                 <w:rFonts w:ascii="Courier New" w:eastAsia="Courier New" w:hAnsi="Courier New" w:cs="Courier New"/>
                 <w:sz w:val="19"/>
                 <w:szCs w:val="19"/>
               </w:rPr>
-              <w:t>ScreenID</w:t>
-            </w:r>
-            <w:proofErr w:type="spellEnd"/>
+              <w:t>SELECT all seats for that screen from tblSeat,</w:t>
+            </w:r>
           </w:p>
           <w:p>
             <w:r>
@@ -8773,66 +8019,28 @@
                 <w:sz w:val="19"/>
                 <w:szCs w:val="19"/>
               </w:rPr>
-              <w:t xml:space="preserve">SELECT all seats for that screen from </w:t>
-            </w:r>
-            <w:proofErr w:type="spellStart"/>
+              <w:t xml:space="preserve">       ordered by row then seat number</w:t>
+            </w:r>
+          </w:p>
+          <w:p>
             <w:r>
               <w:rPr>
                 <w:rFonts w:ascii="Courier New" w:eastAsia="Courier New" w:hAnsi="Courier New" w:cs="Courier New"/>
                 <w:sz w:val="19"/>
                 <w:szCs w:val="19"/>
               </w:rPr>
-              <w:t>tblSeat</w:t>
-            </w:r>
-            <w:proofErr w:type="spellEnd"/>
+              <w:t>SELECT all seats already booked for this screening</w:t>
+            </w:r>
+          </w:p>
+          <w:p>
             <w:r>
               <w:rPr>
                 <w:rFonts w:ascii="Courier New" w:eastAsia="Courier New" w:hAnsi="Courier New" w:cs="Courier New"/>
                 <w:sz w:val="19"/>
                 <w:szCs w:val="19"/>
               </w:rPr>
-              <w:t>,</w:t>
-            </w:r>
-          </w:p>
-          <w:p>
-            <w:r>
-              <w:rPr>
-                <w:rFonts w:ascii="Courier New" w:eastAsia="Courier New" w:hAnsi="Courier New" w:cs="Courier New"/>
-                <w:sz w:val="19"/>
-                <w:szCs w:val="19"/>
-              </w:rPr>
-              <w:t xml:space="preserve">       ordered by row then seat number</w:t>
-            </w:r>
-          </w:p>
-          <w:p>
-            <w:r>
-              <w:rPr>
-                <w:rFonts w:ascii="Courier New" w:eastAsia="Courier New" w:hAnsi="Courier New" w:cs="Courier New"/>
-                <w:sz w:val="19"/>
-                <w:szCs w:val="19"/>
-              </w:rPr>
-              <w:t>SELECT all seats already booked for this screening</w:t>
-            </w:r>
-          </w:p>
-          <w:p>
-            <w:r>
-              <w:rPr>
-                <w:rFonts w:ascii="Courier New" w:eastAsia="Courier New" w:hAnsi="Courier New" w:cs="Courier New"/>
-                <w:sz w:val="19"/>
-                <w:szCs w:val="19"/>
-              </w:rPr>
-              <w:t xml:space="preserve">       from </w:t>
-            </w:r>
-            <w:proofErr w:type="spellStart"/>
-            <w:r>
-              <w:rPr>
-                <w:rFonts w:ascii="Courier New" w:eastAsia="Courier New" w:hAnsi="Courier New" w:cs="Courier New"/>
-                <w:sz w:val="19"/>
-                <w:szCs w:val="19"/>
-              </w:rPr>
-              <w:t>tblBookingSeat</w:t>
-            </w:r>
-            <w:proofErr w:type="spellEnd"/>
+              <w:t xml:space="preserve">       from tblBookingSeat</w:t>
+            </w:r>
           </w:p>
           <w:p>
             <w:r>
@@ -8975,25 +8183,27 @@
                 <w:sz w:val="19"/>
                 <w:szCs w:val="19"/>
               </w:rPr>
-              <w:t xml:space="preserve">SET </w:t>
-            </w:r>
-            <w:proofErr w:type="spellStart"/>
+              <w:t>SET foodTotal to 0</w:t>
+            </w:r>
+          </w:p>
+          <w:p>
             <w:r>
               <w:rPr>
                 <w:rFonts w:ascii="Courier New" w:eastAsia="Courier New" w:hAnsi="Courier New" w:cs="Courier New"/>
                 <w:sz w:val="19"/>
                 <w:szCs w:val="19"/>
               </w:rPr>
-              <w:t>foodTotal</w:t>
-            </w:r>
-            <w:proofErr w:type="spellEnd"/>
+              <w:t>FOR each food item the customer has added</w:t>
+            </w:r>
+          </w:p>
+          <w:p>
             <w:r>
               <w:rPr>
                 <w:rFonts w:ascii="Courier New" w:eastAsia="Courier New" w:hAnsi="Courier New" w:cs="Courier New"/>
                 <w:sz w:val="19"/>
                 <w:szCs w:val="19"/>
               </w:rPr>
-              <w:t xml:space="preserve"> to 0</w:t>
+              <w:t xml:space="preserve">    LOOK UP the item price in tblFoodItem</w:t>
             </w:r>
           </w:p>
           <w:p>
@@ -9003,7 +8213,7 @@
                 <w:sz w:val="19"/>
                 <w:szCs w:val="19"/>
               </w:rPr>
-              <w:t>FOR each food item the customer has added</w:t>
+              <w:t xml:space="preserve">    CALCULATE lineCost as price multiplied by quantity</w:t>
             </w:r>
           </w:p>
           <w:p>
@@ -9013,18 +8223,18 @@
                 <w:sz w:val="19"/>
                 <w:szCs w:val="19"/>
               </w:rPr>
-              <w:t xml:space="preserve">    LOOK UP the item price in </w:t>
-            </w:r>
-            <w:proofErr w:type="spellStart"/>
+              <w:t xml:space="preserve">    ADD lineCost to foodTotal</w:t>
+            </w:r>
+          </w:p>
+          <w:p>
             <w:r>
               <w:rPr>
                 <w:rFonts w:ascii="Courier New" w:eastAsia="Courier New" w:hAnsi="Courier New" w:cs="Courier New"/>
                 <w:sz w:val="19"/>
                 <w:szCs w:val="19"/>
               </w:rPr>
-              <w:t>tblFoodItem</w:t>
-            </w:r>
-            <w:proofErr w:type="spellEnd"/>
+              <w:t>NEXT item</w:t>
+            </w:r>
           </w:p>
           <w:p>
             <w:r>
@@ -9033,185 +8243,27 @@
                 <w:sz w:val="19"/>
                 <w:szCs w:val="19"/>
               </w:rPr>
-              <w:t xml:space="preserve">    CALCULATE </w:t>
-            </w:r>
-            <w:proofErr w:type="spellStart"/>
+              <w:t>CALCULATE seatTotal as number of seats times the ticket price</w:t>
+            </w:r>
+          </w:p>
+          <w:p>
             <w:r>
               <w:rPr>
                 <w:rFonts w:ascii="Courier New" w:eastAsia="Courier New" w:hAnsi="Courier New" w:cs="Courier New"/>
                 <w:sz w:val="19"/>
                 <w:szCs w:val="19"/>
               </w:rPr>
-              <w:t>lineCost</w:t>
-            </w:r>
-            <w:proofErr w:type="spellEnd"/>
+              <w:t>CALCULATE totalCost as seatTotal plus foodTotal</w:t>
+            </w:r>
+          </w:p>
+          <w:p>
             <w:r>
               <w:rPr>
                 <w:rFonts w:ascii="Courier New" w:eastAsia="Courier New" w:hAnsi="Courier New" w:cs="Courier New"/>
                 <w:sz w:val="19"/>
                 <w:szCs w:val="19"/>
               </w:rPr>
-              <w:t xml:space="preserve"> as price multiplied by quantity</w:t>
-            </w:r>
-          </w:p>
-          <w:p>
-            <w:r>
-              <w:rPr>
-                <w:rFonts w:ascii="Courier New" w:eastAsia="Courier New" w:hAnsi="Courier New" w:cs="Courier New"/>
-                <w:sz w:val="19"/>
-                <w:szCs w:val="19"/>
-              </w:rPr>
-              <w:t xml:space="preserve">    ADD </w:t>
-            </w:r>
-            <w:proofErr w:type="spellStart"/>
-            <w:r>
-              <w:rPr>
-                <w:rFonts w:ascii="Courier New" w:eastAsia="Courier New" w:hAnsi="Courier New" w:cs="Courier New"/>
-                <w:sz w:val="19"/>
-                <w:szCs w:val="19"/>
-              </w:rPr>
-              <w:t>lineCost</w:t>
-            </w:r>
-            <w:proofErr w:type="spellEnd"/>
-            <w:r>
-              <w:rPr>
-                <w:rFonts w:ascii="Courier New" w:eastAsia="Courier New" w:hAnsi="Courier New" w:cs="Courier New"/>
-                <w:sz w:val="19"/>
-                <w:szCs w:val="19"/>
-              </w:rPr>
-              <w:t xml:space="preserve"> to </w:t>
-            </w:r>
-            <w:proofErr w:type="spellStart"/>
-            <w:r>
-              <w:rPr>
-                <w:rFonts w:ascii="Courier New" w:eastAsia="Courier New" w:hAnsi="Courier New" w:cs="Courier New"/>
-                <w:sz w:val="19"/>
-                <w:szCs w:val="19"/>
-              </w:rPr>
-              <w:t>foodTotal</w:t>
-            </w:r>
-            <w:proofErr w:type="spellEnd"/>
-          </w:p>
-          <w:p>
-            <w:r>
-              <w:rPr>
-                <w:rFonts w:ascii="Courier New" w:eastAsia="Courier New" w:hAnsi="Courier New" w:cs="Courier New"/>
-                <w:sz w:val="19"/>
-                <w:szCs w:val="19"/>
-              </w:rPr>
-              <w:t>NEXT item</w:t>
-            </w:r>
-          </w:p>
-          <w:p>
-            <w:r>
-              <w:rPr>
-                <w:rFonts w:ascii="Courier New" w:eastAsia="Courier New" w:hAnsi="Courier New" w:cs="Courier New"/>
-                <w:sz w:val="19"/>
-                <w:szCs w:val="19"/>
-              </w:rPr>
-              <w:t xml:space="preserve">CALCULATE </w:t>
-            </w:r>
-            <w:proofErr w:type="spellStart"/>
-            <w:r>
-              <w:rPr>
-                <w:rFonts w:ascii="Courier New" w:eastAsia="Courier New" w:hAnsi="Courier New" w:cs="Courier New"/>
-                <w:sz w:val="19"/>
-                <w:szCs w:val="19"/>
-              </w:rPr>
-              <w:t>seatTotal</w:t>
-            </w:r>
-            <w:proofErr w:type="spellEnd"/>
-            <w:r>
-              <w:rPr>
-                <w:rFonts w:ascii="Courier New" w:eastAsia="Courier New" w:hAnsi="Courier New" w:cs="Courier New"/>
-                <w:sz w:val="19"/>
-                <w:szCs w:val="19"/>
-              </w:rPr>
-              <w:t xml:space="preserve"> as number of seats times the ticket price</w:t>
-            </w:r>
-          </w:p>
-          <w:p>
-            <w:r>
-              <w:rPr>
-                <w:rFonts w:ascii="Courier New" w:eastAsia="Courier New" w:hAnsi="Courier New" w:cs="Courier New"/>
-                <w:sz w:val="19"/>
-                <w:szCs w:val="19"/>
-              </w:rPr>
-              <w:t xml:space="preserve">CALCULATE </w:t>
-            </w:r>
-            <w:proofErr w:type="spellStart"/>
-            <w:r>
-              <w:rPr>
-                <w:rFonts w:ascii="Courier New" w:eastAsia="Courier New" w:hAnsi="Courier New" w:cs="Courier New"/>
-                <w:sz w:val="19"/>
-                <w:szCs w:val="19"/>
-              </w:rPr>
-              <w:t>totalCost</w:t>
-            </w:r>
-            <w:proofErr w:type="spellEnd"/>
-            <w:r>
-              <w:rPr>
-                <w:rFonts w:ascii="Courier New" w:eastAsia="Courier New" w:hAnsi="Courier New" w:cs="Courier New"/>
-                <w:sz w:val="19"/>
-                <w:szCs w:val="19"/>
-              </w:rPr>
-              <w:t xml:space="preserve"> as </w:t>
-            </w:r>
-            <w:proofErr w:type="spellStart"/>
-            <w:r>
-              <w:rPr>
-                <w:rFonts w:ascii="Courier New" w:eastAsia="Courier New" w:hAnsi="Courier New" w:cs="Courier New"/>
-                <w:sz w:val="19"/>
-                <w:szCs w:val="19"/>
-              </w:rPr>
-              <w:t>seatTotal</w:t>
-            </w:r>
-            <w:proofErr w:type="spellEnd"/>
-            <w:r>
-              <w:rPr>
-                <w:rFonts w:ascii="Courier New" w:eastAsia="Courier New" w:hAnsi="Courier New" w:cs="Courier New"/>
-                <w:sz w:val="19"/>
-                <w:szCs w:val="19"/>
-              </w:rPr>
-              <w:t xml:space="preserve"> plus </w:t>
-            </w:r>
-            <w:proofErr w:type="spellStart"/>
-            <w:r>
-              <w:rPr>
-                <w:rFonts w:ascii="Courier New" w:eastAsia="Courier New" w:hAnsi="Courier New" w:cs="Courier New"/>
-                <w:sz w:val="19"/>
-                <w:szCs w:val="19"/>
-              </w:rPr>
-              <w:t>foodTotal</w:t>
-            </w:r>
-            <w:proofErr w:type="spellEnd"/>
-          </w:p>
-          <w:p>
-            <w:r>
-              <w:rPr>
-                <w:rFonts w:ascii="Courier New" w:eastAsia="Courier New" w:hAnsi="Courier New" w:cs="Courier New"/>
-                <w:sz w:val="19"/>
-                <w:szCs w:val="19"/>
-              </w:rPr>
-              <w:t xml:space="preserve">DISPLAY </w:t>
-            </w:r>
-            <w:proofErr w:type="spellStart"/>
-            <w:r>
-              <w:rPr>
-                <w:rFonts w:ascii="Courier New" w:eastAsia="Courier New" w:hAnsi="Courier New" w:cs="Courier New"/>
-                <w:sz w:val="19"/>
-                <w:szCs w:val="19"/>
-              </w:rPr>
-              <w:t>totalCost</w:t>
-            </w:r>
-            <w:proofErr w:type="spellEnd"/>
-            <w:r>
-              <w:rPr>
-                <w:rFonts w:ascii="Courier New" w:eastAsia="Courier New" w:hAnsi="Courier New" w:cs="Courier New"/>
-                <w:sz w:val="19"/>
-                <w:szCs w:val="19"/>
-              </w:rPr>
-              <w:t xml:space="preserve"> to the customer</w:t>
+              <w:t>DISPLAY totalCost to the customer</w:t>
             </w:r>
           </w:p>
         </w:tc>
@@ -9326,43 +8378,47 @@
                 <w:sz w:val="19"/>
                 <w:szCs w:val="19"/>
               </w:rPr>
-              <w:t xml:space="preserve">    SELECT all bookings from </w:t>
-            </w:r>
-            <w:proofErr w:type="spellStart"/>
+              <w:t xml:space="preserve">    SELECT all bookings from tblBooking where BookingDate is</w:t>
+            </w:r>
+          </w:p>
+          <w:p>
             <w:r>
               <w:rPr>
                 <w:rFonts w:ascii="Courier New" w:eastAsia="Courier New" w:hAnsi="Courier New" w:cs="Courier New"/>
                 <w:sz w:val="19"/>
                 <w:szCs w:val="19"/>
               </w:rPr>
-              <w:t>tblBooking</w:t>
-            </w:r>
-            <w:proofErr w:type="spellEnd"/>
+              <w:t xml:space="preserve">        between the start and end date (SQL SELECT)</w:t>
+            </w:r>
+          </w:p>
+          <w:p>
             <w:r>
               <w:rPr>
                 <w:rFonts w:ascii="Courier New" w:eastAsia="Courier New" w:hAnsi="Courier New" w:cs="Courier New"/>
                 <w:sz w:val="19"/>
                 <w:szCs w:val="19"/>
               </w:rPr>
-              <w:t xml:space="preserve"> where </w:t>
-            </w:r>
-            <w:proofErr w:type="spellStart"/>
+              <w:t xml:space="preserve">    SET totalTickets to 0</w:t>
+            </w:r>
+          </w:p>
+          <w:p>
             <w:r>
               <w:rPr>
                 <w:rFonts w:ascii="Courier New" w:eastAsia="Courier New" w:hAnsi="Courier New" w:cs="Courier New"/>
                 <w:sz w:val="19"/>
                 <w:szCs w:val="19"/>
               </w:rPr>
-              <w:t>BookingDate</w:t>
-            </w:r>
-            <w:proofErr w:type="spellEnd"/>
+              <w:t xml:space="preserve">    SET totalRevenue to 0</w:t>
+            </w:r>
+          </w:p>
+          <w:p>
             <w:r>
               <w:rPr>
                 <w:rFonts w:ascii="Courier New" w:eastAsia="Courier New" w:hAnsi="Courier New" w:cs="Courier New"/>
                 <w:sz w:val="19"/>
                 <w:szCs w:val="19"/>
               </w:rPr>
-              <w:t xml:space="preserve"> is</w:t>
+              <w:t xml:space="preserve">    FOR each booking returned</w:t>
             </w:r>
           </w:p>
           <w:p>
@@ -9372,7 +8428,7 @@
                 <w:sz w:val="19"/>
                 <w:szCs w:val="19"/>
               </w:rPr>
-              <w:t xml:space="preserve">        between the start and end date (SQL SELECT)</w:t>
+              <w:t xml:space="preserve">        COUNT the seats linked to it in tblBookingSeat</w:t>
             </w:r>
           </w:p>
           <w:p>
@@ -9382,25 +8438,27 @@
                 <w:sz w:val="19"/>
                 <w:szCs w:val="19"/>
               </w:rPr>
-              <w:t xml:space="preserve">    SET </w:t>
-            </w:r>
-            <w:proofErr w:type="spellStart"/>
+              <w:t xml:space="preserve">        ADD that count to totalTickets</w:t>
+            </w:r>
+          </w:p>
+          <w:p>
             <w:r>
               <w:rPr>
                 <w:rFonts w:ascii="Courier New" w:eastAsia="Courier New" w:hAnsi="Courier New" w:cs="Courier New"/>
                 <w:sz w:val="19"/>
                 <w:szCs w:val="19"/>
               </w:rPr>
-              <w:t>totalTickets</w:t>
-            </w:r>
-            <w:proofErr w:type="spellEnd"/>
+              <w:t xml:space="preserve">        ADD the booking's TotalCost to totalRevenue</w:t>
+            </w:r>
+          </w:p>
+          <w:p>
             <w:r>
               <w:rPr>
                 <w:rFonts w:ascii="Courier New" w:eastAsia="Courier New" w:hAnsi="Courier New" w:cs="Courier New"/>
                 <w:sz w:val="19"/>
                 <w:szCs w:val="19"/>
               </w:rPr>
-              <w:t xml:space="preserve"> to 0</w:t>
+              <w:t xml:space="preserve">    NEXT booking</w:t>
             </w:r>
           </w:p>
           <w:p>
@@ -9410,162 +8468,8 @@
                 <w:sz w:val="19"/>
                 <w:szCs w:val="19"/>
               </w:rPr>
-              <w:t xml:space="preserve">    SET </w:t>
-            </w:r>
-            <w:proofErr w:type="spellStart"/>
-            <w:r>
-              <w:rPr>
-                <w:rFonts w:ascii="Courier New" w:eastAsia="Courier New" w:hAnsi="Courier New" w:cs="Courier New"/>
-                <w:sz w:val="19"/>
-                <w:szCs w:val="19"/>
-              </w:rPr>
-              <w:t>totalRevenue</w:t>
-            </w:r>
-            <w:proofErr w:type="spellEnd"/>
-            <w:r>
-              <w:rPr>
-                <w:rFonts w:ascii="Courier New" w:eastAsia="Courier New" w:hAnsi="Courier New" w:cs="Courier New"/>
-                <w:sz w:val="19"/>
-                <w:szCs w:val="19"/>
-              </w:rPr>
-              <w:t xml:space="preserve"> to 0</w:t>
-            </w:r>
-          </w:p>
-          <w:p>
-            <w:r>
-              <w:rPr>
-                <w:rFonts w:ascii="Courier New" w:eastAsia="Courier New" w:hAnsi="Courier New" w:cs="Courier New"/>
-                <w:sz w:val="19"/>
-                <w:szCs w:val="19"/>
-              </w:rPr>
-              <w:t xml:space="preserve">    FOR each booking returned</w:t>
-            </w:r>
-          </w:p>
-          <w:p>
-            <w:r>
-              <w:rPr>
-                <w:rFonts w:ascii="Courier New" w:eastAsia="Courier New" w:hAnsi="Courier New" w:cs="Courier New"/>
-                <w:sz w:val="19"/>
-                <w:szCs w:val="19"/>
-              </w:rPr>
-              <w:t xml:space="preserve">        COUNT the seats linked to it in </w:t>
-            </w:r>
-            <w:proofErr w:type="spellStart"/>
-            <w:r>
-              <w:rPr>
-                <w:rFonts w:ascii="Courier New" w:eastAsia="Courier New" w:hAnsi="Courier New" w:cs="Courier New"/>
-                <w:sz w:val="19"/>
-                <w:szCs w:val="19"/>
-              </w:rPr>
-              <w:t>tblBookingSeat</w:t>
-            </w:r>
-            <w:proofErr w:type="spellEnd"/>
-          </w:p>
-          <w:p>
-            <w:r>
-              <w:rPr>
-                <w:rFonts w:ascii="Courier New" w:eastAsia="Courier New" w:hAnsi="Courier New" w:cs="Courier New"/>
-                <w:sz w:val="19"/>
-                <w:szCs w:val="19"/>
-              </w:rPr>
-              <w:t xml:space="preserve">        ADD that count to </w:t>
-            </w:r>
-            <w:proofErr w:type="spellStart"/>
-            <w:r>
-              <w:rPr>
-                <w:rFonts w:ascii="Courier New" w:eastAsia="Courier New" w:hAnsi="Courier New" w:cs="Courier New"/>
-                <w:sz w:val="19"/>
-                <w:szCs w:val="19"/>
-              </w:rPr>
-              <w:t>totalTickets</w:t>
-            </w:r>
-            <w:proofErr w:type="spellEnd"/>
-          </w:p>
-          <w:p>
-            <w:r>
-              <w:rPr>
-                <w:rFonts w:ascii="Courier New" w:eastAsia="Courier New" w:hAnsi="Courier New" w:cs="Courier New"/>
-                <w:sz w:val="19"/>
-                <w:szCs w:val="19"/>
-              </w:rPr>
-              <w:t xml:space="preserve">        ADD the booking's </w:t>
-            </w:r>
-            <w:proofErr w:type="spellStart"/>
-            <w:r>
-              <w:rPr>
-                <w:rFonts w:ascii="Courier New" w:eastAsia="Courier New" w:hAnsi="Courier New" w:cs="Courier New"/>
-                <w:sz w:val="19"/>
-                <w:szCs w:val="19"/>
-              </w:rPr>
-              <w:t>TotalCost</w:t>
-            </w:r>
-            <w:proofErr w:type="spellEnd"/>
-            <w:r>
-              <w:rPr>
-                <w:rFonts w:ascii="Courier New" w:eastAsia="Courier New" w:hAnsi="Courier New" w:cs="Courier New"/>
-                <w:sz w:val="19"/>
-                <w:szCs w:val="19"/>
-              </w:rPr>
-              <w:t xml:space="preserve"> to </w:t>
-            </w:r>
-            <w:proofErr w:type="spellStart"/>
-            <w:r>
-              <w:rPr>
-                <w:rFonts w:ascii="Courier New" w:eastAsia="Courier New" w:hAnsi="Courier New" w:cs="Courier New"/>
-                <w:sz w:val="19"/>
-                <w:szCs w:val="19"/>
-              </w:rPr>
-              <w:t>totalRevenue</w:t>
-            </w:r>
-            <w:proofErr w:type="spellEnd"/>
-          </w:p>
-          <w:p>
-            <w:r>
-              <w:rPr>
-                <w:rFonts w:ascii="Courier New" w:eastAsia="Courier New" w:hAnsi="Courier New" w:cs="Courier New"/>
-                <w:sz w:val="19"/>
-                <w:szCs w:val="19"/>
-              </w:rPr>
-              <w:t xml:space="preserve">    NEXT booking</w:t>
-            </w:r>
-          </w:p>
-          <w:p>
-            <w:r>
-              <w:rPr>
-                <w:rFonts w:ascii="Courier New" w:eastAsia="Courier New" w:hAnsi="Courier New" w:cs="Courier New"/>
-                <w:sz w:val="19"/>
-                <w:szCs w:val="19"/>
-              </w:rPr>
-              <w:t xml:space="preserve">    DISPLAY </w:t>
-            </w:r>
-            <w:proofErr w:type="spellStart"/>
-            <w:r>
-              <w:rPr>
-                <w:rFonts w:ascii="Courier New" w:eastAsia="Courier New" w:hAnsi="Courier New" w:cs="Courier New"/>
-                <w:sz w:val="19"/>
-                <w:szCs w:val="19"/>
-              </w:rPr>
-              <w:t>totalTickets</w:t>
-            </w:r>
-            <w:proofErr w:type="spellEnd"/>
-            <w:r>
-              <w:rPr>
-                <w:rFonts w:ascii="Courier New" w:eastAsia="Courier New" w:hAnsi="Courier New" w:cs="Courier New"/>
-                <w:sz w:val="19"/>
-                <w:szCs w:val="19"/>
-              </w:rPr>
-              <w:t xml:space="preserve"> and </w:t>
-            </w:r>
-            <w:proofErr w:type="spellStart"/>
-            <w:r>
-              <w:rPr>
-                <w:rFonts w:ascii="Courier New" w:eastAsia="Courier New" w:hAnsi="Courier New" w:cs="Courier New"/>
-                <w:sz w:val="19"/>
-                <w:szCs w:val="19"/>
-              </w:rPr>
-              <w:t>totalRevenue</w:t>
-            </w:r>
-            <w:proofErr w:type="spellEnd"/>
+              <w:t xml:space="preserve">    DISPLAY totalTickets and totalRevenue</w:t>
+            </w:r>
           </w:p>
           <w:p>
             <w:r>
@@ -9688,18 +8592,8 @@
                 <w:sz w:val="19"/>
                 <w:szCs w:val="19"/>
               </w:rPr>
-              <w:t xml:space="preserve">    SELECT bookings joined to customers where </w:t>
-            </w:r>
-            <w:proofErr w:type="spellStart"/>
-            <w:r>
-              <w:rPr>
-                <w:rFonts w:ascii="Courier New" w:eastAsia="Courier New" w:hAnsi="Courier New" w:cs="Courier New"/>
-                <w:sz w:val="19"/>
-                <w:szCs w:val="19"/>
-              </w:rPr>
-              <w:t>CustomerSurname</w:t>
-            </w:r>
-            <w:proofErr w:type="spellEnd"/>
+              <w:t xml:space="preserve">    SELECT bookings joined to customers where CustomerSurname</w:t>
+            </w:r>
           </w:p>
           <w:p>
             <w:r>
@@ -9797,15 +8691,7 @@
         <w:spacing w:after="160" w:line="276" w:lineRule="auto"/>
       </w:pPr>
       <w:r>
-        <w:t xml:space="preserve">When a booking is cancelled its seats need to become available again. Because availability is worked out from the link table, simply removing the booking's records from </w:t>
-      </w:r>
-      <w:proofErr w:type="spellStart"/>
-      <w:r>
-        <w:t>tblBookingSeat</w:t>
-      </w:r>
-      <w:proofErr w:type="spellEnd"/>
-      <w:r>
-        <w:t xml:space="preserve"> frees those seats automatically with no separate step needed.</w:t>
+        <w:t>When a booking is cancelled its seats need to become available again. Because availability is worked out from the link table, simply removing the booking's records from tblBookingSeat frees those seats automatically with no separate step needed.</w:t>
       </w:r>
     </w:p>
     <w:tbl>
@@ -9845,25 +8731,27 @@
                 <w:sz w:val="19"/>
                 <w:szCs w:val="19"/>
               </w:rPr>
-              <w:t xml:space="preserve">GET the </w:t>
-            </w:r>
-            <w:proofErr w:type="spellStart"/>
+              <w:t>GET the BookingID of the booking to cancel</w:t>
+            </w:r>
+          </w:p>
+          <w:p>
             <w:r>
               <w:rPr>
                 <w:rFonts w:ascii="Courier New" w:eastAsia="Courier New" w:hAnsi="Courier New" w:cs="Courier New"/>
                 <w:sz w:val="19"/>
                 <w:szCs w:val="19"/>
               </w:rPr>
-              <w:t>BookingID</w:t>
-            </w:r>
-            <w:proofErr w:type="spellEnd"/>
+              <w:t>DISPLAY "Are you sure you want to cancel this booking?"</w:t>
+            </w:r>
+          </w:p>
+          <w:p>
             <w:r>
               <w:rPr>
                 <w:rFonts w:ascii="Courier New" w:eastAsia="Courier New" w:hAnsi="Courier New" w:cs="Courier New"/>
                 <w:sz w:val="19"/>
                 <w:szCs w:val="19"/>
               </w:rPr>
-              <w:t xml:space="preserve"> of the booking to cancel</w:t>
+              <w:t>IF the user confirms THEN</w:t>
             </w:r>
           </w:p>
           <w:p>
@@ -9873,7 +8761,7 @@
                 <w:sz w:val="19"/>
                 <w:szCs w:val="19"/>
               </w:rPr>
-              <w:t>DISPLAY "Are you sure you want to cancel this booking?"</w:t>
+              <w:t xml:space="preserve">    DELETE all records in tblBookingSeat for that BookingID</w:t>
             </w:r>
           </w:p>
           <w:p>
@@ -9883,7 +8771,7 @@
                 <w:sz w:val="19"/>
                 <w:szCs w:val="19"/>
               </w:rPr>
-              <w:t>IF the user confirms THEN</w:t>
+              <w:t xml:space="preserve">    DELETE all records in tblOrderItem for that BookingID</w:t>
             </w:r>
           </w:p>
           <w:p>
@@ -9893,113 +8781,9 @@
                 <w:sz w:val="19"/>
                 <w:szCs w:val="19"/>
               </w:rPr>
-              <w:t xml:space="preserve">    DELETE all records in </w:t>
-            </w:r>
-            <w:proofErr w:type="spellStart"/>
-            <w:r>
-              <w:rPr>
-                <w:rFonts w:ascii="Courier New" w:eastAsia="Courier New" w:hAnsi="Courier New" w:cs="Courier New"/>
-                <w:sz w:val="19"/>
-                <w:szCs w:val="19"/>
-              </w:rPr>
-              <w:t>tblBookingSeat</w:t>
-            </w:r>
-            <w:proofErr w:type="spellEnd"/>
-            <w:r>
-              <w:rPr>
-                <w:rFonts w:ascii="Courier New" w:eastAsia="Courier New" w:hAnsi="Courier New" w:cs="Courier New"/>
-                <w:sz w:val="19"/>
-                <w:szCs w:val="19"/>
-              </w:rPr>
-              <w:t xml:space="preserve"> for that </w:t>
-            </w:r>
-            <w:proofErr w:type="spellStart"/>
-            <w:r>
-              <w:rPr>
-                <w:rFonts w:ascii="Courier New" w:eastAsia="Courier New" w:hAnsi="Courier New" w:cs="Courier New"/>
-                <w:sz w:val="19"/>
-                <w:szCs w:val="19"/>
-              </w:rPr>
-              <w:t>BookingID</w:t>
-            </w:r>
-            <w:proofErr w:type="spellEnd"/>
-          </w:p>
-          <w:p>
-            <w:r>
-              <w:rPr>
-                <w:rFonts w:ascii="Courier New" w:eastAsia="Courier New" w:hAnsi="Courier New" w:cs="Courier New"/>
-                <w:sz w:val="19"/>
-                <w:szCs w:val="19"/>
-              </w:rPr>
-              <w:t xml:space="preserve">    DELETE all records in </w:t>
-            </w:r>
-            <w:proofErr w:type="spellStart"/>
-            <w:r>
-              <w:rPr>
-                <w:rFonts w:ascii="Courier New" w:eastAsia="Courier New" w:hAnsi="Courier New" w:cs="Courier New"/>
-                <w:sz w:val="19"/>
-                <w:szCs w:val="19"/>
-              </w:rPr>
-              <w:t>tblOrderItem</w:t>
-            </w:r>
-            <w:proofErr w:type="spellEnd"/>
-            <w:r>
-              <w:rPr>
-                <w:rFonts w:ascii="Courier New" w:eastAsia="Courier New" w:hAnsi="Courier New" w:cs="Courier New"/>
-                <w:sz w:val="19"/>
-                <w:szCs w:val="19"/>
-              </w:rPr>
-              <w:t xml:space="preserve"> for that </w:t>
-            </w:r>
-            <w:proofErr w:type="spellStart"/>
-            <w:r>
-              <w:rPr>
-                <w:rFonts w:ascii="Courier New" w:eastAsia="Courier New" w:hAnsi="Courier New" w:cs="Courier New"/>
-                <w:sz w:val="19"/>
-                <w:szCs w:val="19"/>
-              </w:rPr>
-              <w:t>BookingID</w:t>
-            </w:r>
-            <w:proofErr w:type="spellEnd"/>
-          </w:p>
-          <w:p>
-            <w:r>
-              <w:rPr>
-                <w:rFonts w:ascii="Courier New" w:eastAsia="Courier New" w:hAnsi="Courier New" w:cs="Courier New"/>
-                <w:sz w:val="19"/>
-                <w:szCs w:val="19"/>
-              </w:rPr>
               <w:lastRenderedPageBreak/>
-              <w:t xml:space="preserve">    DELETE the record in </w:t>
-            </w:r>
-            <w:proofErr w:type="spellStart"/>
-            <w:r>
-              <w:rPr>
-                <w:rFonts w:ascii="Courier New" w:eastAsia="Courier New" w:hAnsi="Courier New" w:cs="Courier New"/>
-                <w:sz w:val="19"/>
-                <w:szCs w:val="19"/>
-              </w:rPr>
-              <w:t>tblBooking</w:t>
-            </w:r>
-            <w:proofErr w:type="spellEnd"/>
-            <w:r>
-              <w:rPr>
-                <w:rFonts w:ascii="Courier New" w:eastAsia="Courier New" w:hAnsi="Courier New" w:cs="Courier New"/>
-                <w:sz w:val="19"/>
-                <w:szCs w:val="19"/>
-              </w:rPr>
-              <w:t xml:space="preserve"> for that </w:t>
-            </w:r>
-            <w:proofErr w:type="spellStart"/>
-            <w:r>
-              <w:rPr>
-                <w:rFonts w:ascii="Courier New" w:eastAsia="Courier New" w:hAnsi="Courier New" w:cs="Courier New"/>
-                <w:sz w:val="19"/>
-                <w:szCs w:val="19"/>
-              </w:rPr>
-              <w:t>BookingID</w:t>
-            </w:r>
-            <w:proofErr w:type="spellEnd"/>
+              <w:t xml:space="preserve">    DELETE the record in tblBooking for that BookingID</w:t>
+            </w:r>
           </w:p>
           <w:p>
             <w:r>
@@ -10073,15 +8857,7 @@
         <w:spacing w:after="160" w:line="276" w:lineRule="auto"/>
       </w:pPr>
       <w:r>
-        <w:t xml:space="preserve">Validation is the process of checking that data entered into the system is sensible and complete before it is accepted and saved to the database. It cannot guarantee that data is correct, for example it cannot tell whether a customer has typed the right surname, but it can stop clearly invalid or missing data from getting in, which protects the integrity of the database. Several different types of validation are used across the </w:t>
-      </w:r>
-      <w:proofErr w:type="spellStart"/>
-      <w:r>
-        <w:t>Filmtopia</w:t>
-      </w:r>
-      <w:proofErr w:type="spellEnd"/>
-      <w:r>
-        <w:t xml:space="preserve"> system, and these are explained below before being applied to each input in turn.</w:t>
+        <w:t>Validation is the process of checking that data entered into the system is sensible and complete before it is accepted and saved to the database. It cannot guarantee that data is correct, for example it cannot tell whether a customer has typed the right surname, but it can stop clearly invalid or missing data from getting in, which protects the integrity of the database. Several different types of validation are used across the Filmtopia system, and these are explained below before being applied to each input in turn.</w:t>
       </w:r>
     </w:p>
     <w:p>
@@ -10089,15 +8865,7 @@
         <w:spacing w:after="160" w:line="276" w:lineRule="auto"/>
       </w:pPr>
       <w:r>
-        <w:t xml:space="preserve">A presence check makes sure a required field has not been left blank. A type check makes sure the data is of the right kind, for example that a number has been entered where a number is expected. A length check makes sure an entry is </w:t>
-      </w:r>
-      <w:proofErr w:type="spellStart"/>
-      <w:r>
-        <w:t>not longer</w:t>
-      </w:r>
-      <w:proofErr w:type="spellEnd"/>
-      <w:r>
-        <w:t xml:space="preserve"> than the field allows. A range check makes sure a number or date falls between sensible limits. A format check makes sure an entry follows a required pattern, such as a time being written as HH:MM. Finally a lookup check, sometimes called a referential check, makes sure that a chosen value actually exists in another table, for example that a screening is being created for a film that really exists. The tables below set out the validation applied to each input, grouped by the form it appears on.</w:t>
+        <w:t>A presence check makes sure a required field has not been left blank. A type check makes sure the data is of the right kind, for example that a number has been entered where a number is expected. A length check makes sure an entry is not longer than the field allows. A range check makes sure a number or date falls between sensible limits. A format check makes sure an entry follows a required pattern, such as a time being written as HH:MM. Finally a lookup check, sometimes called a referential check, makes sure that a chosen value actually exists in another table, for example that a screening is being created for a film that really exists. The tables below set out the validation applied to each input, grouped by the form it appears on.</w:t>
       </w:r>
     </w:p>
     <w:p>
@@ -10142,12 +8910,6 @@
         <w:gridCol w:w="2200"/>
       </w:tblGrid>
       <w:tr>
-        <w:tblPrEx>
-          <w:tblCellMar>
-            <w:top w:w="0" w:type="dxa"/>
-            <w:bottom w:w="0" w:type="dxa"/>
-          </w:tblCellMar>
-        </w:tblPrEx>
         <w:tc>
           <w:tcPr>
             <w:tcW w:w="1900" w:type="dxa"/>
@@ -10242,12 +9004,6 @@
         </w:tc>
       </w:tr>
       <w:tr>
-        <w:tblPrEx>
-          <w:tblCellMar>
-            <w:top w:w="0" w:type="dxa"/>
-            <w:bottom w:w="0" w:type="dxa"/>
-          </w:tblCellMar>
-        </w:tblPrEx>
         <w:tc>
           <w:tcPr>
             <w:tcW w:w="1900" w:type="dxa"/>
@@ -10330,12 +9086,6 @@
         </w:tc>
       </w:tr>
       <w:tr>
-        <w:tblPrEx>
-          <w:tblCellMar>
-            <w:top w:w="0" w:type="dxa"/>
-            <w:bottom w:w="0" w:type="dxa"/>
-          </w:tblCellMar>
-        </w:tblPrEx>
         <w:tc>
           <w:tcPr>
             <w:tcW w:w="1900" w:type="dxa"/>
@@ -10465,12 +9215,6 @@
         <w:gridCol w:w="2200"/>
       </w:tblGrid>
       <w:tr>
-        <w:tblPrEx>
-          <w:tblCellMar>
-            <w:top w:w="0" w:type="dxa"/>
-            <w:bottom w:w="0" w:type="dxa"/>
-          </w:tblCellMar>
-        </w:tblPrEx>
         <w:tc>
           <w:tcPr>
             <w:tcW w:w="1900" w:type="dxa"/>
@@ -10565,12 +9309,6 @@
         </w:tc>
       </w:tr>
       <w:tr>
-        <w:tblPrEx>
-          <w:tblCellMar>
-            <w:top w:w="0" w:type="dxa"/>
-            <w:bottom w:w="0" w:type="dxa"/>
-          </w:tblCellMar>
-        </w:tblPrEx>
         <w:tc>
           <w:tcPr>
             <w:tcW w:w="1900" w:type="dxa"/>
@@ -10582,7 +9320,6 @@
             </w:tcMar>
           </w:tcPr>
           <w:p>
-            <w:proofErr w:type="spellStart"/>
             <w:r>
               <w:rPr>
                 <w:sz w:val="19"/>
@@ -10590,7 +9327,6 @@
               </w:rPr>
               <w:t>FilmTitle</w:t>
             </w:r>
-            <w:proofErr w:type="spellEnd"/>
           </w:p>
         </w:tc>
         <w:tc>
@@ -10655,12 +9391,6 @@
         </w:tc>
       </w:tr>
       <w:tr>
-        <w:tblPrEx>
-          <w:tblCellMar>
-            <w:top w:w="0" w:type="dxa"/>
-            <w:bottom w:w="0" w:type="dxa"/>
-          </w:tblCellMar>
-        </w:tblPrEx>
         <w:tc>
           <w:tcPr>
             <w:tcW w:w="1900" w:type="dxa"/>
@@ -10672,7 +9402,6 @@
             </w:tcMar>
           </w:tcPr>
           <w:p>
-            <w:proofErr w:type="spellStart"/>
             <w:r>
               <w:rPr>
                 <w:sz w:val="19"/>
@@ -10680,7 +9409,6 @@
               </w:rPr>
               <w:t>FilmAgeRating</w:t>
             </w:r>
-            <w:proofErr w:type="spellEnd"/>
           </w:p>
         </w:tc>
         <w:tc>
@@ -10745,12 +9473,6 @@
         </w:tc>
       </w:tr>
       <w:tr>
-        <w:tblPrEx>
-          <w:tblCellMar>
-            <w:top w:w="0" w:type="dxa"/>
-            <w:bottom w:w="0" w:type="dxa"/>
-          </w:tblCellMar>
-        </w:tblPrEx>
         <w:tc>
           <w:tcPr>
             <w:tcW w:w="1900" w:type="dxa"/>
@@ -10762,7 +9484,6 @@
             </w:tcMar>
           </w:tcPr>
           <w:p>
-            <w:proofErr w:type="spellStart"/>
             <w:r>
               <w:rPr>
                 <w:sz w:val="19"/>
@@ -10771,7 +9492,6 @@
               <w:lastRenderedPageBreak/>
               <w:t>FilmDuration</w:t>
             </w:r>
-            <w:proofErr w:type="spellEnd"/>
           </w:p>
         </w:tc>
         <w:tc>
@@ -10836,12 +9556,6 @@
         </w:tc>
       </w:tr>
       <w:tr>
-        <w:tblPrEx>
-          <w:tblCellMar>
-            <w:top w:w="0" w:type="dxa"/>
-            <w:bottom w:w="0" w:type="dxa"/>
-          </w:tblCellMar>
-        </w:tblPrEx>
         <w:tc>
           <w:tcPr>
             <w:tcW w:w="1900" w:type="dxa"/>
@@ -10853,7 +9567,6 @@
             </w:tcMar>
           </w:tcPr>
           <w:p>
-            <w:proofErr w:type="spellStart"/>
             <w:r>
               <w:rPr>
                 <w:sz w:val="19"/>
@@ -10861,7 +9574,6 @@
               </w:rPr>
               <w:t>FilmDescription</w:t>
             </w:r>
-            <w:proofErr w:type="spellEnd"/>
           </w:p>
         </w:tc>
         <w:tc>
@@ -10973,12 +9685,6 @@
         <w:gridCol w:w="2200"/>
       </w:tblGrid>
       <w:tr>
-        <w:tblPrEx>
-          <w:tblCellMar>
-            <w:top w:w="0" w:type="dxa"/>
-            <w:bottom w:w="0" w:type="dxa"/>
-          </w:tblCellMar>
-        </w:tblPrEx>
         <w:tc>
           <w:tcPr>
             <w:tcW w:w="1900" w:type="dxa"/>
@@ -11073,12 +9779,6 @@
         </w:tc>
       </w:tr>
       <w:tr>
-        <w:tblPrEx>
-          <w:tblCellMar>
-            <w:top w:w="0" w:type="dxa"/>
-            <w:bottom w:w="0" w:type="dxa"/>
-          </w:tblCellMar>
-        </w:tblPrEx>
         <w:tc>
           <w:tcPr>
             <w:tcW w:w="1900" w:type="dxa"/>
@@ -11090,7 +9790,6 @@
             </w:tcMar>
           </w:tcPr>
           <w:p>
-            <w:proofErr w:type="spellStart"/>
             <w:r>
               <w:rPr>
                 <w:sz w:val="19"/>
@@ -11098,7 +9797,6 @@
               </w:rPr>
               <w:t>ScreenName</w:t>
             </w:r>
-            <w:proofErr w:type="spellEnd"/>
           </w:p>
         </w:tc>
         <w:tc>
@@ -11163,12 +9861,6 @@
         </w:tc>
       </w:tr>
       <w:tr>
-        <w:tblPrEx>
-          <w:tblCellMar>
-            <w:top w:w="0" w:type="dxa"/>
-            <w:bottom w:w="0" w:type="dxa"/>
-          </w:tblCellMar>
-        </w:tblPrEx>
         <w:tc>
           <w:tcPr>
             <w:tcW w:w="1900" w:type="dxa"/>
@@ -11180,7 +9872,6 @@
             </w:tcMar>
           </w:tcPr>
           <w:p>
-            <w:proofErr w:type="spellStart"/>
             <w:r>
               <w:rPr>
                 <w:sz w:val="19"/>
@@ -11188,7 +9879,6 @@
               </w:rPr>
               <w:t>ScreenCapacity</w:t>
             </w:r>
-            <w:proofErr w:type="spellEnd"/>
           </w:p>
         </w:tc>
         <w:tc>
@@ -11247,7 +9937,28 @@
                 <w:sz w:val="19"/>
                 <w:szCs w:val="19"/>
               </w:rPr>
-              <w:t>"Capacity must be a whole number"</w:t>
+              <w:t xml:space="preserve">"Capacity must be a </w:t>
+            </w:r>
+            <w:r>
+              <w:rPr>
+                <w:sz w:val="19"/>
+                <w:szCs w:val="19"/>
+              </w:rPr>
+              <w:t>multiple of 10 (e.g. 10, 20, 30 ,40)</w:t>
+            </w:r>
+            <w:r>
+              <w:rPr>
+                <w:sz w:val="19"/>
+                <w:szCs w:val="19"/>
+              </w:rPr>
+              <w:t xml:space="preserve"> </w:t>
+            </w:r>
+            <w:r>
+              <w:rPr>
+                <w:sz w:val="19"/>
+                <w:szCs w:val="19"/>
+              </w:rPr>
+              <w:t>“</w:t>
             </w:r>
           </w:p>
         </w:tc>
@@ -11300,12 +10011,6 @@
         <w:gridCol w:w="2200"/>
       </w:tblGrid>
       <w:tr>
-        <w:tblPrEx>
-          <w:tblCellMar>
-            <w:top w:w="0" w:type="dxa"/>
-            <w:bottom w:w="0" w:type="dxa"/>
-          </w:tblCellMar>
-        </w:tblPrEx>
         <w:tc>
           <w:tcPr>
             <w:tcW w:w="1900" w:type="dxa"/>
@@ -11400,12 +10105,6 @@
         </w:tc>
       </w:tr>
       <w:tr>
-        <w:tblPrEx>
-          <w:tblCellMar>
-            <w:top w:w="0" w:type="dxa"/>
-            <w:bottom w:w="0" w:type="dxa"/>
-          </w:tblCellMar>
-        </w:tblPrEx>
         <w:tc>
           <w:tcPr>
             <w:tcW w:w="1900" w:type="dxa"/>
@@ -11488,12 +10187,6 @@
         </w:tc>
       </w:tr>
       <w:tr>
-        <w:tblPrEx>
-          <w:tblCellMar>
-            <w:top w:w="0" w:type="dxa"/>
-            <w:bottom w:w="0" w:type="dxa"/>
-          </w:tblCellMar>
-        </w:tblPrEx>
         <w:tc>
           <w:tcPr>
             <w:tcW w:w="1900" w:type="dxa"/>
@@ -11576,12 +10269,6 @@
         </w:tc>
       </w:tr>
       <w:tr>
-        <w:tblPrEx>
-          <w:tblCellMar>
-            <w:top w:w="0" w:type="dxa"/>
-            <w:bottom w:w="0" w:type="dxa"/>
-          </w:tblCellMar>
-        </w:tblPrEx>
         <w:tc>
           <w:tcPr>
             <w:tcW w:w="1900" w:type="dxa"/>
@@ -11593,7 +10280,6 @@
             </w:tcMar>
           </w:tcPr>
           <w:p>
-            <w:proofErr w:type="spellStart"/>
             <w:r>
               <w:rPr>
                 <w:sz w:val="19"/>
@@ -11601,7 +10287,6 @@
               </w:rPr>
               <w:t>ScreeningDate</w:t>
             </w:r>
-            <w:proofErr w:type="spellEnd"/>
           </w:p>
         </w:tc>
         <w:tc>
@@ -11666,12 +10351,6 @@
         </w:tc>
       </w:tr>
       <w:tr>
-        <w:tblPrEx>
-          <w:tblCellMar>
-            <w:top w:w="0" w:type="dxa"/>
-            <w:bottom w:w="0" w:type="dxa"/>
-          </w:tblCellMar>
-        </w:tblPrEx>
         <w:tc>
           <w:tcPr>
             <w:tcW w:w="1900" w:type="dxa"/>
@@ -11683,7 +10362,6 @@
             </w:tcMar>
           </w:tcPr>
           <w:p>
-            <w:proofErr w:type="spellStart"/>
             <w:r>
               <w:rPr>
                 <w:sz w:val="19"/>
@@ -11691,7 +10369,6 @@
               </w:rPr>
               <w:t>ScreeningTime</w:t>
             </w:r>
-            <w:proofErr w:type="spellEnd"/>
           </w:p>
         </w:tc>
         <w:tc>
@@ -11756,12 +10433,6 @@
         </w:tc>
       </w:tr>
       <w:tr>
-        <w:tblPrEx>
-          <w:tblCellMar>
-            <w:top w:w="0" w:type="dxa"/>
-            <w:bottom w:w="0" w:type="dxa"/>
-          </w:tblCellMar>
-        </w:tblPrEx>
         <w:tc>
           <w:tcPr>
             <w:tcW w:w="1900" w:type="dxa"/>
@@ -11773,7 +10444,6 @@
             </w:tcMar>
           </w:tcPr>
           <w:p>
-            <w:proofErr w:type="spellStart"/>
             <w:r>
               <w:rPr>
                 <w:sz w:val="19"/>
@@ -11781,7 +10451,6 @@
               </w:rPr>
               <w:t>TicketPrice</w:t>
             </w:r>
-            <w:proofErr w:type="spellEnd"/>
           </w:p>
         </w:tc>
         <w:tc>
@@ -11893,12 +10562,6 @@
         <w:gridCol w:w="2200"/>
       </w:tblGrid>
       <w:tr>
-        <w:tblPrEx>
-          <w:tblCellMar>
-            <w:top w:w="0" w:type="dxa"/>
-            <w:bottom w:w="0" w:type="dxa"/>
-          </w:tblCellMar>
-        </w:tblPrEx>
         <w:tc>
           <w:tcPr>
             <w:tcW w:w="1900" w:type="dxa"/>
@@ -11993,12 +10656,6 @@
         </w:tc>
       </w:tr>
       <w:tr>
-        <w:tblPrEx>
-          <w:tblCellMar>
-            <w:top w:w="0" w:type="dxa"/>
-            <w:bottom w:w="0" w:type="dxa"/>
-          </w:tblCellMar>
-        </w:tblPrEx>
         <w:tc>
           <w:tcPr>
             <w:tcW w:w="1900" w:type="dxa"/>
@@ -12010,7 +10667,6 @@
             </w:tcMar>
           </w:tcPr>
           <w:p>
-            <w:proofErr w:type="spellStart"/>
             <w:r>
               <w:rPr>
                 <w:sz w:val="19"/>
@@ -12018,7 +10674,6 @@
               </w:rPr>
               <w:t>CustomerForename</w:t>
             </w:r>
-            <w:proofErr w:type="spellEnd"/>
           </w:p>
         </w:tc>
         <w:tc>
@@ -12083,12 +10738,6 @@
         </w:tc>
       </w:tr>
       <w:tr>
-        <w:tblPrEx>
-          <w:tblCellMar>
-            <w:top w:w="0" w:type="dxa"/>
-            <w:bottom w:w="0" w:type="dxa"/>
-          </w:tblCellMar>
-        </w:tblPrEx>
         <w:tc>
           <w:tcPr>
             <w:tcW w:w="1900" w:type="dxa"/>
@@ -12100,7 +10749,6 @@
             </w:tcMar>
           </w:tcPr>
           <w:p>
-            <w:proofErr w:type="spellStart"/>
             <w:r>
               <w:rPr>
                 <w:sz w:val="19"/>
@@ -12108,7 +10756,6 @@
               </w:rPr>
               <w:t>CustomerSurname</w:t>
             </w:r>
-            <w:proofErr w:type="spellEnd"/>
           </w:p>
         </w:tc>
         <w:tc>
@@ -12173,12 +10820,6 @@
         </w:tc>
       </w:tr>
       <w:tr>
-        <w:tblPrEx>
-          <w:tblCellMar>
-            <w:top w:w="0" w:type="dxa"/>
-            <w:bottom w:w="0" w:type="dxa"/>
-          </w:tblCellMar>
-        </w:tblPrEx>
         <w:tc>
           <w:tcPr>
             <w:tcW w:w="1900" w:type="dxa"/>
@@ -12190,7 +10831,6 @@
             </w:tcMar>
           </w:tcPr>
           <w:p>
-            <w:proofErr w:type="spellStart"/>
             <w:r>
               <w:rPr>
                 <w:sz w:val="19"/>
@@ -12198,7 +10838,6 @@
               </w:rPr>
               <w:t>CustomerEmail</w:t>
             </w:r>
-            <w:proofErr w:type="spellEnd"/>
           </w:p>
         </w:tc>
         <w:tc>
@@ -12263,12 +10902,6 @@
         </w:tc>
       </w:tr>
       <w:tr>
-        <w:tblPrEx>
-          <w:tblCellMar>
-            <w:top w:w="0" w:type="dxa"/>
-            <w:bottom w:w="0" w:type="dxa"/>
-          </w:tblCellMar>
-        </w:tblPrEx>
         <w:tc>
           <w:tcPr>
             <w:tcW w:w="1900" w:type="dxa"/>
@@ -12280,7 +10913,6 @@
             </w:tcMar>
           </w:tcPr>
           <w:p>
-            <w:proofErr w:type="spellStart"/>
             <w:r>
               <w:rPr>
                 <w:sz w:val="19"/>
@@ -12288,7 +10920,6 @@
               </w:rPr>
               <w:t>CustomerPhone</w:t>
             </w:r>
-            <w:proofErr w:type="spellEnd"/>
           </w:p>
         </w:tc>
         <w:tc>
@@ -12373,6 +11004,7 @@
           <w:bCs/>
           <w:color w:val="000000" w:themeColor="text1"/>
         </w:rPr>
+        <w:lastRenderedPageBreak/>
         <w:t>Seat Selection and Food Order (Booking)</w:t>
       </w:r>
     </w:p>
@@ -12400,12 +11032,6 @@
         <w:gridCol w:w="2200"/>
       </w:tblGrid>
       <w:tr>
-        <w:tblPrEx>
-          <w:tblCellMar>
-            <w:top w:w="0" w:type="dxa"/>
-            <w:bottom w:w="0" w:type="dxa"/>
-          </w:tblCellMar>
-        </w:tblPrEx>
         <w:tc>
           <w:tcPr>
             <w:tcW w:w="1900" w:type="dxa"/>
@@ -12500,12 +11126,6 @@
         </w:tc>
       </w:tr>
       <w:tr>
-        <w:tblPrEx>
-          <w:tblCellMar>
-            <w:top w:w="0" w:type="dxa"/>
-            <w:bottom w:w="0" w:type="dxa"/>
-          </w:tblCellMar>
-        </w:tblPrEx>
         <w:tc>
           <w:tcPr>
             <w:tcW w:w="1900" w:type="dxa"/>
@@ -12522,7 +11142,6 @@
                 <w:sz w:val="19"/>
                 <w:szCs w:val="19"/>
               </w:rPr>
-              <w:lastRenderedPageBreak/>
               <w:t>Selected seats</w:t>
             </w:r>
           </w:p>
@@ -12589,12 +11208,6 @@
         </w:tc>
       </w:tr>
       <w:tr>
-        <w:tblPrEx>
-          <w:tblCellMar>
-            <w:top w:w="0" w:type="dxa"/>
-            <w:bottom w:w="0" w:type="dxa"/>
-          </w:tblCellMar>
-        </w:tblPrEx>
         <w:tc>
           <w:tcPr>
             <w:tcW w:w="1900" w:type="dxa"/>
@@ -12677,12 +11290,6 @@
         </w:tc>
       </w:tr>
       <w:tr>
-        <w:tblPrEx>
-          <w:tblCellMar>
-            <w:top w:w="0" w:type="dxa"/>
-            <w:bottom w:w="0" w:type="dxa"/>
-          </w:tblCellMar>
-        </w:tblPrEx>
         <w:tc>
           <w:tcPr>
             <w:tcW w:w="1900" w:type="dxa"/>
@@ -12812,12 +11419,6 @@
         <w:gridCol w:w="2200"/>
       </w:tblGrid>
       <w:tr>
-        <w:tblPrEx>
-          <w:tblCellMar>
-            <w:top w:w="0" w:type="dxa"/>
-            <w:bottom w:w="0" w:type="dxa"/>
-          </w:tblCellMar>
-        </w:tblPrEx>
         <w:tc>
           <w:tcPr>
             <w:tcW w:w="1900" w:type="dxa"/>
@@ -12912,12 +11513,6 @@
         </w:tc>
       </w:tr>
       <w:tr>
-        <w:tblPrEx>
-          <w:tblCellMar>
-            <w:top w:w="0" w:type="dxa"/>
-            <w:bottom w:w="0" w:type="dxa"/>
-          </w:tblCellMar>
-        </w:tblPrEx>
         <w:tc>
           <w:tcPr>
             <w:tcW w:w="1900" w:type="dxa"/>

</xml_diff>

<commit_message>
added more objectives to investigation, added more questions to discussion, unfinished.
</commit_message>
<xml_diff>
--- a/Design.docx
+++ b/Design.docx
@@ -7458,7 +7458,39 @@
           <w:color w:val="000000" w:themeColor="text1"/>
         </w:rPr>
         <w:lastRenderedPageBreak/>
-        <w:t>Automatic Seat Generation (Objective 7)</w:t>
+        <w:t>Automatic Seat Generati</w:t>
+      </w:r>
+      <w:r>
+        <w:rPr>
+          <w:b/>
+          <w:bCs/>
+          <w:color w:val="000000" w:themeColor="text1"/>
+        </w:rPr>
+        <w:t>`</w:t>
+      </w:r>
+      <w:r>
+        <w:rPr>
+          <w:b/>
+          <w:bCs/>
+          <w:color w:val="000000" w:themeColor="text1"/>
+        </w:rPr>
+        <w:t xml:space="preserve">on (Objective </w:t>
+      </w:r>
+      <w:r>
+        <w:rPr>
+          <w:b/>
+          <w:bCs/>
+          <w:color w:val="000000" w:themeColor="text1"/>
+        </w:rPr>
+        <w:t>16</w:t>
+      </w:r>
+      <w:r>
+        <w:rPr>
+          <w:b/>
+          <w:bCs/>
+          <w:color w:val="000000" w:themeColor="text1"/>
+        </w:rPr>
+        <w:t>)</w:t>
       </w:r>
     </w:p>
     <w:p>
@@ -7488,7 +7520,14 @@
           <w:sz w:val="20"/>
           <w:szCs w:val="20"/>
         </w:rPr>
-        <w:t xml:space="preserve"> Flowchart of the automatic seat generation algorithm</w:t>
+        <w:t xml:space="preserve"> </w:t>
+      </w:r>
+      <w:r>
+        <w:rPr>
+          <w:sz w:val="20"/>
+          <w:szCs w:val="20"/>
+        </w:rPr>
+        <w:t>Flowchart of the automatic seat generation algorithm</w:t>
       </w:r>
     </w:p>
     <w:tbl>

</xml_diff>

<commit_message>
Added a Range check for txtDuration in frmFilms, made sure only positive values are added.
</commit_message>
<xml_diff>
--- a/Design.docx
+++ b/Design.docx
@@ -11,13 +11,23 @@
           <w:color w:val="A02B93" w:themeColor="accent5"/>
         </w:rPr>
       </w:pPr>
+      <w:proofErr w:type="spellStart"/>
       <w:r>
         <w:rPr>
           <w:b/>
           <w:bCs/>
           <w:color w:val="A02B93" w:themeColor="accent5"/>
         </w:rPr>
-        <w:t>Filmtopia Project Design</w:t>
+        <w:t>Filmtopia</w:t>
+      </w:r>
+      <w:proofErr w:type="spellEnd"/>
+      <w:r>
+        <w:rPr>
+          <w:b/>
+          <w:bCs/>
+          <w:color w:val="A02B93" w:themeColor="accent5"/>
+        </w:rPr>
+        <w:t xml:space="preserve"> Project Design</w:t>
       </w:r>
     </w:p>
     <w:p>
@@ -43,7 +53,23 @@
         <w:spacing w:after="160" w:line="276" w:lineRule="auto"/>
       </w:pPr>
       <w:r>
-        <w:t>The purpose of this section is to specify the data structures that the Filmtopia system will use to store its data. As the system is built around a Microsoft Access database accessed through OleDb, these data structures take the form of database tables rather than arrays or other in memory structures. Each table and the relationships between them are described below, along with the way the data in those tables will be accessed. A key aim throughout the design has been to make sure the table structure is fully normalised to third normal form so that data is never repeated unnecessarily and the database cannot end up in an inconsistent state.</w:t>
+        <w:t xml:space="preserve">The purpose of this section is to specify the data structures that the </w:t>
+      </w:r>
+      <w:proofErr w:type="spellStart"/>
+      <w:r>
+        <w:t>Filmtopia</w:t>
+      </w:r>
+      <w:proofErr w:type="spellEnd"/>
+      <w:r>
+        <w:t xml:space="preserve"> system will use to store its data. As the system is built around a Microsoft Access database accessed through </w:t>
+      </w:r>
+      <w:proofErr w:type="spellStart"/>
+      <w:r>
+        <w:t>OleDb</w:t>
+      </w:r>
+      <w:proofErr w:type="spellEnd"/>
+      <w:r>
+        <w:t>, these data structures take the form of database tables rather than arrays or other in memory structures. Each table and the relationships between them are described below, along with the way the data in those tables will be accessed. A key aim throughout the design has been to make sure the table structure is fully normalised to third normal form so that data is never repeated unnecessarily and the database cannot end up in an inconsistent state.</w:t>
       </w:r>
     </w:p>
     <w:p>
@@ -142,7 +168,31 @@
         <w:spacing w:after="160" w:line="276" w:lineRule="auto"/>
       </w:pPr>
       <w:r>
-        <w:t>Most of these relationships are straightforward one to many relationships. For example one film can have many screenings but each screening shows only one film, and one screen contains many seats but each seat belongs to only one screen. Two relationships however are many to many, and these are shown in red above. A single booking can include several seats, and at the same time a single seat can be booked across many different bookings over time. In the same way a single booking can include several food items, and a single food item can appear on many bookings. Many to many relationships cannot be represented directly in a relational database without causing repeated data, so they need to be resolved.</w:t>
+        <w:t xml:space="preserve">Most of these relationships are straightforward one to many relationships. For </w:t>
+      </w:r>
+      <w:proofErr w:type="gramStart"/>
+      <w:r>
+        <w:t>example</w:t>
+      </w:r>
+      <w:proofErr w:type="gramEnd"/>
+      <w:r>
+        <w:t xml:space="preserve"> one film can have many </w:t>
+      </w:r>
+      <w:proofErr w:type="gramStart"/>
+      <w:r>
+        <w:t>screenings</w:t>
+      </w:r>
+      <w:proofErr w:type="gramEnd"/>
+      <w:r>
+        <w:t xml:space="preserve"> but each screening shows only one film, and one screen contains many </w:t>
+      </w:r>
+      <w:proofErr w:type="gramStart"/>
+      <w:r>
+        <w:t>seats</w:t>
+      </w:r>
+      <w:proofErr w:type="gramEnd"/>
+      <w:r>
+        <w:t xml:space="preserve"> but each seat belongs to only one screen. Two relationships however are many to many, and these are shown in red above. A single booking can include several seats, and at the same time a single seat can be booked across many different bookings over time. In the same way a single booking can include several food items, and a single food item can appear on many bookings. Many to many relationships cannot be represented directly in a relational database without causing repeated data, so they need to be resolved.</w:t>
       </w:r>
     </w:p>
     <w:p>
@@ -151,7 +201,39 @@
       </w:pPr>
       <w:r>
         <w:lastRenderedPageBreak/>
-        <w:t>The way to resolve a many to many relationship is to create a new link table that sits between the two original entities, turning the single many to many relationship into two separate one to many relationships. For the booking and seat relationship this link table is tblBookingSeat, and for the booking and food item relationship it is tblOrderItem. Each link table holds its own primary key along with the two foreign keys that point back to the tables it joins. The diagram below shows the final design once these link tables have been added, with the primary key of each table shown in bold and the foreign keys shown in italics.</w:t>
+        <w:t xml:space="preserve">The way to resolve a many to many </w:t>
+      </w:r>
+      <w:proofErr w:type="gramStart"/>
+      <w:r>
+        <w:t>relationship</w:t>
+      </w:r>
+      <w:proofErr w:type="gramEnd"/>
+      <w:r>
+        <w:t xml:space="preserve"> is to create a new link table that sits between the two original entities, turning the single many to many </w:t>
+      </w:r>
+      <w:proofErr w:type="gramStart"/>
+      <w:r>
+        <w:t>relationship</w:t>
+      </w:r>
+      <w:proofErr w:type="gramEnd"/>
+      <w:r>
+        <w:t xml:space="preserve"> into two separate one to many relationships. For the booking and seat relationship this link table is </w:t>
+      </w:r>
+      <w:proofErr w:type="spellStart"/>
+      <w:r>
+        <w:t>tblBookingSeat</w:t>
+      </w:r>
+      <w:proofErr w:type="spellEnd"/>
+      <w:r>
+        <w:t xml:space="preserve">, and for the booking and food item relationship it is </w:t>
+      </w:r>
+      <w:proofErr w:type="spellStart"/>
+      <w:r>
+        <w:t>tblOrderItem</w:t>
+      </w:r>
+      <w:proofErr w:type="spellEnd"/>
+      <w:r>
+        <w:t>. Each link table holds its own primary key along with the two foreign keys that point back to the tables it joins. The diagram below shows the final design once these link tables have been added, with the primary key of each table shown in bold and the foreign keys shown in italics.</w:t>
       </w:r>
     </w:p>
     <w:p>
@@ -224,11 +306,75 @@
         <w:spacing w:after="160" w:line="276" w:lineRule="auto"/>
       </w:pPr>
       <w:r>
-        <w:t xml:space="preserve">In this final design the foreign keys are produced by copying the primary key from the one end of each relationship to the many end. For example the ScreeningID primary key from tblScreening is copied into tblBooking as a foreign key, because one screening can have many bookings. The same pattern is followed throughout, which keeps every relationship as a clean one to many. The structure is normalised to third normal form because every non key field in each table depends only on the whole of that table's primary key, with no field depending on another non key field and no repeating groups of data anywhere in the design. Three further tables exist in the system that do not appear in this diagram because </w:t>
+        <w:t xml:space="preserve">In this final design the foreign keys are produced by copying the primary key from the one end of each relationship to the many </w:t>
+      </w:r>
+      <w:proofErr w:type="gramStart"/>
+      <w:r>
+        <w:t>end</w:t>
+      </w:r>
+      <w:proofErr w:type="gramEnd"/>
+      <w:r>
+        <w:t xml:space="preserve">. For </w:t>
+      </w:r>
+      <w:proofErr w:type="gramStart"/>
+      <w:r>
+        <w:t>example</w:t>
+      </w:r>
+      <w:proofErr w:type="gramEnd"/>
+      <w:r>
+        <w:t xml:space="preserve"> the </w:t>
+      </w:r>
+      <w:proofErr w:type="spellStart"/>
+      <w:r>
+        <w:t>ScreeningID</w:t>
+      </w:r>
+      <w:proofErr w:type="spellEnd"/>
+      <w:r>
+        <w:t xml:space="preserve"> primary key from </w:t>
+      </w:r>
+      <w:proofErr w:type="spellStart"/>
+      <w:r>
+        <w:t>tblScreening</w:t>
+      </w:r>
+      <w:proofErr w:type="spellEnd"/>
+      <w:r>
+        <w:t xml:space="preserve"> is copied into </w:t>
+      </w:r>
+      <w:proofErr w:type="spellStart"/>
+      <w:r>
+        <w:t>tblBooking</w:t>
+      </w:r>
+      <w:proofErr w:type="spellEnd"/>
+      <w:r>
+        <w:t xml:space="preserve"> as a foreign key, because one screening can have many bookings. The same pattern is followed throughout, which keeps every relationship as a clean one to many. The structure is normalised to third normal form because every non key field in each table depends only on the whole of that table's primary key, with no field depending on another non key field and no repeating groups of data anywhere in the design. Three further tables exist in the system that do not appear in this diagram because </w:t>
       </w:r>
       <w:r>
         <w:lastRenderedPageBreak/>
-        <w:t>they are standalone and not related to the others through foreign keys. These are tblLogin, which holds the user accounts, tblLogs, which records system events, and tblVersionControl, which holds the application version. They are included in the table designs below for completeness.</w:t>
+        <w:t xml:space="preserve">they are standalone and not related to the others through foreign keys. These are </w:t>
+      </w:r>
+      <w:proofErr w:type="spellStart"/>
+      <w:r>
+        <w:t>tblLogin</w:t>
+      </w:r>
+      <w:proofErr w:type="spellEnd"/>
+      <w:r>
+        <w:t xml:space="preserve">, which holds the user accounts, </w:t>
+      </w:r>
+      <w:proofErr w:type="spellStart"/>
+      <w:r>
+        <w:t>tblLogs</w:t>
+      </w:r>
+      <w:proofErr w:type="spellEnd"/>
+      <w:r>
+        <w:t xml:space="preserve">, which records system events, and </w:t>
+      </w:r>
+      <w:proofErr w:type="spellStart"/>
+      <w:r>
+        <w:t>tblVersionControl</w:t>
+      </w:r>
+      <w:proofErr w:type="spellEnd"/>
+      <w:r>
+        <w:t>, which holds the application version. They are included in the table designs below for completeness.</w:t>
       </w:r>
     </w:p>
     <w:p>
@@ -280,7 +426,31 @@
         <w:spacing w:after="160" w:line="276" w:lineRule="auto"/>
       </w:pPr>
       <w:r>
-        <w:t>There are four general ways in which records can be stored and accessed in a file. In a serial file the records are simply stored one after another in the order they were added, with no particular ordering, so finding a record means reading through the file from the beginning until it is found. A sequential file is similar but the records are kept in order of a key field, which means a search can stop early once it has passed the point where the record would have been. In a random or direct access file the position of a record is calculated directly from its key using an algorithm, so the record can be jumped to straight away without reading the ones before it. Finally an indexed sequential file keeps the records in order but also maintains a separate index of key values and their positions, so a record can be found quickly through the index while the file can still be read in order when needed.</w:t>
+        <w:t xml:space="preserve">There are four general ways in which records can be stored and accessed in a file. In a serial file the records are simply stored one after another in the order they were added, with no </w:t>
+      </w:r>
+      <w:proofErr w:type="gramStart"/>
+      <w:r>
+        <w:t>particular ordering</w:t>
+      </w:r>
+      <w:proofErr w:type="gramEnd"/>
+      <w:r>
+        <w:t xml:space="preserve">, so finding a record means reading through the file from the beginning until it is found. A sequential file is </w:t>
+      </w:r>
+      <w:proofErr w:type="gramStart"/>
+      <w:r>
+        <w:t>similar</w:t>
+      </w:r>
+      <w:proofErr w:type="gramEnd"/>
+      <w:r>
+        <w:t xml:space="preserve"> but the records are kept in order of a key field, which means a search can stop early once it has passed the point where the record would have been. In a random or direct access file the position of a record is calculated directly from its key using an algorithm, so the record can be jumped to straight away without reading the ones before it. </w:t>
+      </w:r>
+      <w:proofErr w:type="gramStart"/>
+      <w:r>
+        <w:t>Finally</w:t>
+      </w:r>
+      <w:proofErr w:type="gramEnd"/>
+      <w:r>
+        <w:t xml:space="preserve"> an indexed sequential file keeps the records in order but also maintains a separate index of key values and their positions, so a record can be found quickly through the index while the file can still be read in order when needed.</w:t>
       </w:r>
     </w:p>
     <w:p>
@@ -288,7 +458,23 @@
         <w:spacing w:after="160" w:line="276" w:lineRule="auto"/>
       </w:pPr>
       <w:r>
-        <w:t>The Filmtopia tables are stored within a Microsoft Access database and are accessed from the Visual Basic .NET application using SQL queries sent through an OleDb connection, specifically SELECT, INSERT, UPDATE and DELETE queries. The database management system stores the tables as direct access files and maintains indexes on the primary keys so that looking a record up by its primary key is fast and does not require reading through every record. Where a search is carried out on a field that is not indexed, the database falls back to a sequential search through the table.</w:t>
+        <w:t xml:space="preserve">The </w:t>
+      </w:r>
+      <w:proofErr w:type="spellStart"/>
+      <w:r>
+        <w:t>Filmtopia</w:t>
+      </w:r>
+      <w:proofErr w:type="spellEnd"/>
+      <w:r>
+        <w:t xml:space="preserve"> tables are stored within a Microsoft Access database and are accessed from the Visual Basic .NET application using SQL queries sent through an </w:t>
+      </w:r>
+      <w:proofErr w:type="spellStart"/>
+      <w:r>
+        <w:t>OleDb</w:t>
+      </w:r>
+      <w:proofErr w:type="spellEnd"/>
+      <w:r>
+        <w:t xml:space="preserve"> connection, specifically SELECT, INSERT, UPDATE and DELETE queries. The database management system stores the tables as direct access files and maintains indexes on the primary keys so that looking a record up by its primary key is fast and does not require reading through every record. Where a search is carried out on a field that is not indexed, the database falls back to a sequential search through the table.</w:t>
       </w:r>
     </w:p>
     <w:p>
@@ -300,6 +486,7 @@
           <w:color w:val="000000" w:themeColor="text1"/>
         </w:rPr>
       </w:pPr>
+      <w:proofErr w:type="spellStart"/>
       <w:r>
         <w:rPr>
           <w:b/>
@@ -308,6 +495,7 @@
         </w:rPr>
         <w:t>tblFilm</w:t>
       </w:r>
+      <w:proofErr w:type="spellEnd"/>
     </w:p>
     <w:p>
       <w:pPr>
@@ -360,7 +548,7 @@
         <w:tc>
           <w:tcPr>
             <w:tcW w:w="2100" w:type="dxa"/>
-            <w:shd w:val="clear" w:color="auto" w:fill="D9E2F3"/>
+            <w:shd w:val="clear" w:color="auto" w:fill="F2CEED" w:themeFill="accent5" w:themeFillTint="33"/>
             <w:tcMar>
               <w:top w:w="50" w:type="dxa"/>
               <w:left w:w="90" w:type="dxa"/>
@@ -383,7 +571,7 @@
         <w:tc>
           <w:tcPr>
             <w:tcW w:w="1450" w:type="dxa"/>
-            <w:shd w:val="clear" w:color="auto" w:fill="D9E2F3"/>
+            <w:shd w:val="clear" w:color="auto" w:fill="F2CEED" w:themeFill="accent5" w:themeFillTint="33"/>
             <w:tcMar>
               <w:top w:w="50" w:type="dxa"/>
               <w:left w:w="90" w:type="dxa"/>
@@ -406,7 +594,7 @@
         <w:tc>
           <w:tcPr>
             <w:tcW w:w="950" w:type="dxa"/>
-            <w:shd w:val="clear" w:color="auto" w:fill="D9E2F3"/>
+            <w:shd w:val="clear" w:color="auto" w:fill="F2CEED" w:themeFill="accent5" w:themeFillTint="33"/>
             <w:tcMar>
               <w:top w:w="50" w:type="dxa"/>
               <w:left w:w="90" w:type="dxa"/>
@@ -429,7 +617,7 @@
         <w:tc>
           <w:tcPr>
             <w:tcW w:w="3460" w:type="dxa"/>
-            <w:shd w:val="clear" w:color="auto" w:fill="D9E2F3"/>
+            <w:shd w:val="clear" w:color="auto" w:fill="F2CEED" w:themeFill="accent5" w:themeFillTint="33"/>
             <w:tcMar>
               <w:top w:w="50" w:type="dxa"/>
               <w:left w:w="90" w:type="dxa"/>
@@ -452,7 +640,7 @@
         <w:tc>
           <w:tcPr>
             <w:tcW w:w="1400" w:type="dxa"/>
-            <w:shd w:val="clear" w:color="auto" w:fill="D9E2F3"/>
+            <w:shd w:val="clear" w:color="auto" w:fill="F2CEED" w:themeFill="accent5" w:themeFillTint="33"/>
             <w:tcMar>
               <w:top w:w="50" w:type="dxa"/>
               <w:left w:w="90" w:type="dxa"/>
@@ -485,6 +673,7 @@
             </w:tcMar>
           </w:tcPr>
           <w:p>
+            <w:proofErr w:type="spellStart"/>
             <w:r>
               <w:rPr>
                 <w:sz w:val="19"/>
@@ -493,6 +682,7 @@
               <w:lastRenderedPageBreak/>
               <w:t>FilmID</w:t>
             </w:r>
+            <w:proofErr w:type="spellEnd"/>
           </w:p>
         </w:tc>
         <w:tc>
@@ -580,6 +770,7 @@
             </w:tcMar>
           </w:tcPr>
           <w:p>
+            <w:proofErr w:type="spellStart"/>
             <w:r>
               <w:rPr>
                 <w:sz w:val="19"/>
@@ -587,6 +778,7 @@
               </w:rPr>
               <w:t>FilmTitle</w:t>
             </w:r>
+            <w:proofErr w:type="spellEnd"/>
           </w:p>
         </w:tc>
         <w:tc>
@@ -682,6 +874,7 @@
             </w:tcMar>
           </w:tcPr>
           <w:p>
+            <w:proofErr w:type="spellStart"/>
             <w:r>
               <w:rPr>
                 <w:sz w:val="19"/>
@@ -689,6 +882,7 @@
               </w:rPr>
               <w:t>FilmAgeRating</w:t>
             </w:r>
+            <w:proofErr w:type="spellEnd"/>
           </w:p>
         </w:tc>
         <w:tc>
@@ -784,6 +978,7 @@
             </w:tcMar>
           </w:tcPr>
           <w:p>
+            <w:proofErr w:type="spellStart"/>
             <w:r>
               <w:rPr>
                 <w:sz w:val="19"/>
@@ -791,6 +986,7 @@
               </w:rPr>
               <w:t>FilmDuration</w:t>
             </w:r>
+            <w:proofErr w:type="spellEnd"/>
           </w:p>
         </w:tc>
         <w:tc>
@@ -878,6 +1074,7 @@
             </w:tcMar>
           </w:tcPr>
           <w:p>
+            <w:proofErr w:type="spellStart"/>
             <w:r>
               <w:rPr>
                 <w:sz w:val="19"/>
@@ -885,6 +1082,7 @@
               </w:rPr>
               <w:t>FilmDescription</w:t>
             </w:r>
+            <w:proofErr w:type="spellEnd"/>
           </w:p>
         </w:tc>
         <w:tc>
@@ -983,6 +1181,7 @@
           <w:color w:val="000000" w:themeColor="text1"/>
         </w:rPr>
       </w:pPr>
+      <w:proofErr w:type="spellStart"/>
       <w:r>
         <w:rPr>
           <w:b/>
@@ -991,6 +1190,7 @@
         </w:rPr>
         <w:t>tblScreen</w:t>
       </w:r>
+      <w:proofErr w:type="spellEnd"/>
     </w:p>
     <w:p>
       <w:pPr>
@@ -1012,7 +1212,15 @@
         <w:t xml:space="preserve">Expected number of records: </w:t>
       </w:r>
       <w:r>
-        <w:t>A small fixed number, typically 3 to 8, matching the number of physical screens the cinema has.</w:t>
+        <w:t xml:space="preserve">A </w:t>
+      </w:r>
+      <w:proofErr w:type="gramStart"/>
+      <w:r>
+        <w:t>small fixed</w:t>
+      </w:r>
+      <w:proofErr w:type="gramEnd"/>
+      <w:r>
+        <w:t xml:space="preserve"> number, typically 3 to 8, matching the number of physical screens the cinema has.</w:t>
       </w:r>
     </w:p>
     <w:tbl>
@@ -1043,7 +1251,7 @@
         <w:tc>
           <w:tcPr>
             <w:tcW w:w="2100" w:type="dxa"/>
-            <w:shd w:val="clear" w:color="auto" w:fill="D9E2F3"/>
+            <w:shd w:val="clear" w:color="auto" w:fill="F2CEED" w:themeFill="accent5" w:themeFillTint="33"/>
             <w:tcMar>
               <w:top w:w="50" w:type="dxa"/>
               <w:left w:w="90" w:type="dxa"/>
@@ -1066,7 +1274,7 @@
         <w:tc>
           <w:tcPr>
             <w:tcW w:w="1450" w:type="dxa"/>
-            <w:shd w:val="clear" w:color="auto" w:fill="D9E2F3"/>
+            <w:shd w:val="clear" w:color="auto" w:fill="F2CEED" w:themeFill="accent5" w:themeFillTint="33"/>
             <w:tcMar>
               <w:top w:w="50" w:type="dxa"/>
               <w:left w:w="90" w:type="dxa"/>
@@ -1089,7 +1297,7 @@
         <w:tc>
           <w:tcPr>
             <w:tcW w:w="950" w:type="dxa"/>
-            <w:shd w:val="clear" w:color="auto" w:fill="D9E2F3"/>
+            <w:shd w:val="clear" w:color="auto" w:fill="F2CEED" w:themeFill="accent5" w:themeFillTint="33"/>
             <w:tcMar>
               <w:top w:w="50" w:type="dxa"/>
               <w:left w:w="90" w:type="dxa"/>
@@ -1112,7 +1320,7 @@
         <w:tc>
           <w:tcPr>
             <w:tcW w:w="3460" w:type="dxa"/>
-            <w:shd w:val="clear" w:color="auto" w:fill="D9E2F3"/>
+            <w:shd w:val="clear" w:color="auto" w:fill="F2CEED" w:themeFill="accent5" w:themeFillTint="33"/>
             <w:tcMar>
               <w:top w:w="50" w:type="dxa"/>
               <w:left w:w="90" w:type="dxa"/>
@@ -1135,7 +1343,7 @@
         <w:tc>
           <w:tcPr>
             <w:tcW w:w="1400" w:type="dxa"/>
-            <w:shd w:val="clear" w:color="auto" w:fill="D9E2F3"/>
+            <w:shd w:val="clear" w:color="auto" w:fill="F2CEED" w:themeFill="accent5" w:themeFillTint="33"/>
             <w:tcMar>
               <w:top w:w="50" w:type="dxa"/>
               <w:left w:w="90" w:type="dxa"/>
@@ -1168,6 +1376,7 @@
             </w:tcMar>
           </w:tcPr>
           <w:p>
+            <w:proofErr w:type="spellStart"/>
             <w:r>
               <w:rPr>
                 <w:sz w:val="19"/>
@@ -1175,6 +1384,7 @@
               </w:rPr>
               <w:t>ScreenID</w:t>
             </w:r>
+            <w:proofErr w:type="spellEnd"/>
           </w:p>
         </w:tc>
         <w:tc>
@@ -1262,6 +1472,7 @@
             </w:tcMar>
           </w:tcPr>
           <w:p>
+            <w:proofErr w:type="spellStart"/>
             <w:r>
               <w:rPr>
                 <w:sz w:val="19"/>
@@ -1269,6 +1480,7 @@
               </w:rPr>
               <w:t>ScreenName</w:t>
             </w:r>
+            <w:proofErr w:type="spellEnd"/>
           </w:p>
         </w:tc>
         <w:tc>
@@ -1364,6 +1576,7 @@
             </w:tcMar>
           </w:tcPr>
           <w:p>
+            <w:proofErr w:type="spellStart"/>
             <w:r>
               <w:rPr>
                 <w:sz w:val="19"/>
@@ -1371,6 +1584,7 @@
               </w:rPr>
               <w:t>ScreenCapacity</w:t>
             </w:r>
+            <w:proofErr w:type="spellEnd"/>
           </w:p>
         </w:tc>
         <w:tc>
@@ -1461,6 +1675,7 @@
           <w:color w:val="000000" w:themeColor="text1"/>
         </w:rPr>
       </w:pPr>
+      <w:proofErr w:type="spellStart"/>
       <w:r>
         <w:rPr>
           <w:b/>
@@ -1469,6 +1684,7 @@
         </w:rPr>
         <w:t>tblScreening</w:t>
       </w:r>
+      <w:proofErr w:type="spellEnd"/>
     </w:p>
     <w:p>
       <w:pPr>
@@ -1490,7 +1706,15 @@
         <w:t xml:space="preserve">Expected number of records: </w:t>
       </w:r>
       <w:r>
-        <w:t>Several hundred per month, since each screen runs a number of screenings every day.</w:t>
+        <w:t xml:space="preserve">Several hundred per month, since each screen runs </w:t>
+      </w:r>
+      <w:proofErr w:type="gramStart"/>
+      <w:r>
+        <w:t>a number of</w:t>
+      </w:r>
+      <w:proofErr w:type="gramEnd"/>
+      <w:r>
+        <w:t xml:space="preserve"> screenings every day.</w:t>
       </w:r>
     </w:p>
     <w:tbl>
@@ -1521,7 +1745,7 @@
         <w:tc>
           <w:tcPr>
             <w:tcW w:w="2100" w:type="dxa"/>
-            <w:shd w:val="clear" w:color="auto" w:fill="D9E2F3"/>
+            <w:shd w:val="clear" w:color="auto" w:fill="F2CEED" w:themeFill="accent5" w:themeFillTint="33"/>
             <w:tcMar>
               <w:top w:w="50" w:type="dxa"/>
               <w:left w:w="90" w:type="dxa"/>
@@ -1544,7 +1768,7 @@
         <w:tc>
           <w:tcPr>
             <w:tcW w:w="1450" w:type="dxa"/>
-            <w:shd w:val="clear" w:color="auto" w:fill="D9E2F3"/>
+            <w:shd w:val="clear" w:color="auto" w:fill="F2CEED" w:themeFill="accent5" w:themeFillTint="33"/>
             <w:tcMar>
               <w:top w:w="50" w:type="dxa"/>
               <w:left w:w="90" w:type="dxa"/>
@@ -1567,7 +1791,7 @@
         <w:tc>
           <w:tcPr>
             <w:tcW w:w="950" w:type="dxa"/>
-            <w:shd w:val="clear" w:color="auto" w:fill="D9E2F3"/>
+            <w:shd w:val="clear" w:color="auto" w:fill="F2CEED" w:themeFill="accent5" w:themeFillTint="33"/>
             <w:tcMar>
               <w:top w:w="50" w:type="dxa"/>
               <w:left w:w="90" w:type="dxa"/>
@@ -1590,7 +1814,7 @@
         <w:tc>
           <w:tcPr>
             <w:tcW w:w="3460" w:type="dxa"/>
-            <w:shd w:val="clear" w:color="auto" w:fill="D9E2F3"/>
+            <w:shd w:val="clear" w:color="auto" w:fill="F2CEED" w:themeFill="accent5" w:themeFillTint="33"/>
             <w:tcMar>
               <w:top w:w="50" w:type="dxa"/>
               <w:left w:w="90" w:type="dxa"/>
@@ -1613,7 +1837,7 @@
         <w:tc>
           <w:tcPr>
             <w:tcW w:w="1400" w:type="dxa"/>
-            <w:shd w:val="clear" w:color="auto" w:fill="D9E2F3"/>
+            <w:shd w:val="clear" w:color="auto" w:fill="F2CEED" w:themeFill="accent5" w:themeFillTint="33"/>
             <w:tcMar>
               <w:top w:w="50" w:type="dxa"/>
               <w:left w:w="90" w:type="dxa"/>
@@ -1646,6 +1870,7 @@
             </w:tcMar>
           </w:tcPr>
           <w:p>
+            <w:proofErr w:type="spellStart"/>
             <w:r>
               <w:rPr>
                 <w:sz w:val="19"/>
@@ -1653,6 +1878,7 @@
               </w:rPr>
               <w:t>ScreeningID</w:t>
             </w:r>
+            <w:proofErr w:type="spellEnd"/>
           </w:p>
         </w:tc>
         <w:tc>
@@ -1740,6 +1966,7 @@
             </w:tcMar>
           </w:tcPr>
           <w:p>
+            <w:proofErr w:type="spellStart"/>
             <w:r>
               <w:rPr>
                 <w:sz w:val="19"/>
@@ -1747,6 +1974,7 @@
               </w:rPr>
               <w:t>FilmID</w:t>
             </w:r>
+            <w:proofErr w:type="spellEnd"/>
           </w:p>
         </w:tc>
         <w:tc>
@@ -1797,7 +2025,23 @@
                 <w:sz w:val="19"/>
                 <w:szCs w:val="19"/>
               </w:rPr>
-              <w:t>The film being shown (Foreign Key to tblFilm)</w:t>
+              <w:t xml:space="preserve">The film being shown (Foreign Key to </w:t>
+            </w:r>
+            <w:proofErr w:type="spellStart"/>
+            <w:r>
+              <w:rPr>
+                <w:sz w:val="19"/>
+                <w:szCs w:val="19"/>
+              </w:rPr>
+              <w:t>tblFilm</w:t>
+            </w:r>
+            <w:proofErr w:type="spellEnd"/>
+            <w:r>
+              <w:rPr>
+                <w:sz w:val="19"/>
+                <w:szCs w:val="19"/>
+              </w:rPr>
+              <w:t>)</w:t>
             </w:r>
           </w:p>
         </w:tc>
@@ -1834,6 +2078,7 @@
             </w:tcMar>
           </w:tcPr>
           <w:p>
+            <w:proofErr w:type="spellStart"/>
             <w:r>
               <w:rPr>
                 <w:sz w:val="19"/>
@@ -1841,6 +2086,7 @@
               </w:rPr>
               <w:t>ScreenID</w:t>
             </w:r>
+            <w:proofErr w:type="spellEnd"/>
           </w:p>
         </w:tc>
         <w:tc>
@@ -1891,7 +2137,23 @@
                 <w:sz w:val="19"/>
                 <w:szCs w:val="19"/>
               </w:rPr>
-              <w:t>The screen it is shown in (Foreign Key to tblScreen)</w:t>
+              <w:t xml:space="preserve">The screen it is shown in (Foreign Key to </w:t>
+            </w:r>
+            <w:proofErr w:type="spellStart"/>
+            <w:r>
+              <w:rPr>
+                <w:sz w:val="19"/>
+                <w:szCs w:val="19"/>
+              </w:rPr>
+              <w:t>tblScreen</w:t>
+            </w:r>
+            <w:proofErr w:type="spellEnd"/>
+            <w:r>
+              <w:rPr>
+                <w:sz w:val="19"/>
+                <w:szCs w:val="19"/>
+              </w:rPr>
+              <w:t>)</w:t>
             </w:r>
           </w:p>
         </w:tc>
@@ -1928,6 +2190,7 @@
             </w:tcMar>
           </w:tcPr>
           <w:p>
+            <w:proofErr w:type="spellStart"/>
             <w:r>
               <w:rPr>
                 <w:sz w:val="19"/>
@@ -1935,6 +2198,7 @@
               </w:rPr>
               <w:t>ScreeningDate</w:t>
             </w:r>
+            <w:proofErr w:type="spellEnd"/>
           </w:p>
         </w:tc>
         <w:tc>
@@ -2022,6 +2286,7 @@
             </w:tcMar>
           </w:tcPr>
           <w:p>
+            <w:proofErr w:type="spellStart"/>
             <w:r>
               <w:rPr>
                 <w:sz w:val="19"/>
@@ -2029,6 +2294,7 @@
               </w:rPr>
               <w:t>ScreeningTime</w:t>
             </w:r>
+            <w:proofErr w:type="spellEnd"/>
           </w:p>
         </w:tc>
         <w:tc>
@@ -2087,7 +2353,23 @@
                 <w:sz w:val="19"/>
                 <w:szCs w:val="19"/>
               </w:rPr>
-              <w:t>The start time of the screening in 24 hour format</w:t>
+              <w:t xml:space="preserve">The start time of the screening in </w:t>
+            </w:r>
+            <w:proofErr w:type="gramStart"/>
+            <w:r>
+              <w:rPr>
+                <w:sz w:val="19"/>
+                <w:szCs w:val="19"/>
+              </w:rPr>
+              <w:t>24 hour</w:t>
+            </w:r>
+            <w:proofErr w:type="gramEnd"/>
+            <w:r>
+              <w:rPr>
+                <w:sz w:val="19"/>
+                <w:szCs w:val="19"/>
+              </w:rPr>
+              <w:t xml:space="preserve"> format</w:t>
             </w:r>
           </w:p>
         </w:tc>
@@ -2124,6 +2406,7 @@
             </w:tcMar>
           </w:tcPr>
           <w:p>
+            <w:proofErr w:type="spellStart"/>
             <w:r>
               <w:rPr>
                 <w:sz w:val="19"/>
@@ -2131,6 +2414,7 @@
               </w:rPr>
               <w:t>TicketPrice</w:t>
             </w:r>
+            <w:proofErr w:type="spellEnd"/>
           </w:p>
         </w:tc>
         <w:tc>
@@ -2221,6 +2505,7 @@
           <w:color w:val="000000" w:themeColor="text1"/>
         </w:rPr>
       </w:pPr>
+      <w:proofErr w:type="spellStart"/>
       <w:r>
         <w:rPr>
           <w:b/>
@@ -2229,6 +2514,7 @@
         </w:rPr>
         <w:t>tblSeat</w:t>
       </w:r>
+      <w:proofErr w:type="spellEnd"/>
     </w:p>
     <w:p>
       <w:pPr>
@@ -2250,7 +2536,15 @@
         <w:t xml:space="preserve">Expected number of records: </w:t>
       </w:r>
       <w:r>
-        <w:t>One record per physical seat. For example three screens of 60 seats would give 180 records, so a few hundred in total.</w:t>
+        <w:t xml:space="preserve">One record per physical seat. For </w:t>
+      </w:r>
+      <w:proofErr w:type="gramStart"/>
+      <w:r>
+        <w:t>example</w:t>
+      </w:r>
+      <w:proofErr w:type="gramEnd"/>
+      <w:r>
+        <w:t xml:space="preserve"> three screens of 60 seats would give 180 records, so a few hundred in total.</w:t>
       </w:r>
     </w:p>
     <w:tbl>
@@ -2406,6 +2700,7 @@
             </w:tcMar>
           </w:tcPr>
           <w:p>
+            <w:proofErr w:type="spellStart"/>
             <w:r>
               <w:rPr>
                 <w:sz w:val="19"/>
@@ -2413,6 +2708,7 @@
               </w:rPr>
               <w:t>SeatID</w:t>
             </w:r>
+            <w:proofErr w:type="spellEnd"/>
           </w:p>
         </w:tc>
         <w:tc>
@@ -2500,6 +2796,7 @@
             </w:tcMar>
           </w:tcPr>
           <w:p>
+            <w:proofErr w:type="spellStart"/>
             <w:r>
               <w:rPr>
                 <w:sz w:val="19"/>
@@ -2507,6 +2804,7 @@
               </w:rPr>
               <w:t>ScreenID</w:t>
             </w:r>
+            <w:proofErr w:type="spellEnd"/>
           </w:p>
         </w:tc>
         <w:tc>
@@ -2557,7 +2855,23 @@
                 <w:sz w:val="19"/>
                 <w:szCs w:val="19"/>
               </w:rPr>
-              <w:t>The screen the seat belongs to (Foreign Key to tblScreen)</w:t>
+              <w:t xml:space="preserve">The screen the seat belongs to (Foreign Key to </w:t>
+            </w:r>
+            <w:proofErr w:type="spellStart"/>
+            <w:r>
+              <w:rPr>
+                <w:sz w:val="19"/>
+                <w:szCs w:val="19"/>
+              </w:rPr>
+              <w:t>tblScreen</w:t>
+            </w:r>
+            <w:proofErr w:type="spellEnd"/>
+            <w:r>
+              <w:rPr>
+                <w:sz w:val="19"/>
+                <w:szCs w:val="19"/>
+              </w:rPr>
+              <w:t>)</w:t>
             </w:r>
           </w:p>
         </w:tc>
@@ -2594,6 +2908,7 @@
             </w:tcMar>
           </w:tcPr>
           <w:p>
+            <w:proofErr w:type="spellStart"/>
             <w:r>
               <w:rPr>
                 <w:sz w:val="19"/>
@@ -2601,6 +2916,7 @@
               </w:rPr>
               <w:t>SeatRow</w:t>
             </w:r>
+            <w:proofErr w:type="spellEnd"/>
           </w:p>
         </w:tc>
         <w:tc>
@@ -2696,6 +3012,7 @@
             </w:tcMar>
           </w:tcPr>
           <w:p>
+            <w:proofErr w:type="spellStart"/>
             <w:r>
               <w:rPr>
                 <w:sz w:val="19"/>
@@ -2703,6 +3020,7 @@
               </w:rPr>
               <w:t>SeatNumber</w:t>
             </w:r>
+            <w:proofErr w:type="spellEnd"/>
           </w:p>
         </w:tc>
         <w:tc>
@@ -2793,6 +3111,7 @@
           <w:color w:val="000000" w:themeColor="text1"/>
         </w:rPr>
       </w:pPr>
+      <w:proofErr w:type="spellStart"/>
       <w:r>
         <w:rPr>
           <w:b/>
@@ -2801,6 +3120,7 @@
         </w:rPr>
         <w:t>tblCustomer</w:t>
       </w:r>
+      <w:proofErr w:type="spellEnd"/>
     </w:p>
     <w:p>
       <w:pPr>
@@ -2978,6 +3298,7 @@
             </w:tcMar>
           </w:tcPr>
           <w:p>
+            <w:proofErr w:type="spellStart"/>
             <w:r>
               <w:rPr>
                 <w:sz w:val="19"/>
@@ -2985,6 +3306,7 @@
               </w:rPr>
               <w:t>CustomerID</w:t>
             </w:r>
+            <w:proofErr w:type="spellEnd"/>
           </w:p>
         </w:tc>
         <w:tc>
@@ -3072,6 +3394,7 @@
             </w:tcMar>
           </w:tcPr>
           <w:p>
+            <w:proofErr w:type="spellStart"/>
             <w:r>
               <w:rPr>
                 <w:sz w:val="19"/>
@@ -3079,6 +3402,7 @@
               </w:rPr>
               <w:t>CustomerForename</w:t>
             </w:r>
+            <w:proofErr w:type="spellEnd"/>
           </w:p>
         </w:tc>
         <w:tc>
@@ -3174,6 +3498,7 @@
             </w:tcMar>
           </w:tcPr>
           <w:p>
+            <w:proofErr w:type="spellStart"/>
             <w:r>
               <w:rPr>
                 <w:sz w:val="19"/>
@@ -3181,6 +3506,7 @@
               </w:rPr>
               <w:t>CustomerSurname</w:t>
             </w:r>
+            <w:proofErr w:type="spellEnd"/>
           </w:p>
         </w:tc>
         <w:tc>
@@ -3276,6 +3602,7 @@
             </w:tcMar>
           </w:tcPr>
           <w:p>
+            <w:proofErr w:type="spellStart"/>
             <w:r>
               <w:rPr>
                 <w:sz w:val="19"/>
@@ -3283,6 +3610,7 @@
               </w:rPr>
               <w:t>CustomerEmail</w:t>
             </w:r>
+            <w:proofErr w:type="spellEnd"/>
           </w:p>
         </w:tc>
         <w:tc>
@@ -3378,6 +3706,7 @@
             </w:tcMar>
           </w:tcPr>
           <w:p>
+            <w:proofErr w:type="spellStart"/>
             <w:r>
               <w:rPr>
                 <w:sz w:val="19"/>
@@ -3385,6 +3714,7 @@
               </w:rPr>
               <w:t>CustomerPhone</w:t>
             </w:r>
+            <w:proofErr w:type="spellEnd"/>
           </w:p>
         </w:tc>
         <w:tc>
@@ -3483,6 +3813,7 @@
           <w:color w:val="000000" w:themeColor="text1"/>
         </w:rPr>
       </w:pPr>
+      <w:proofErr w:type="spellStart"/>
       <w:r>
         <w:rPr>
           <w:b/>
@@ -3491,6 +3822,7 @@
         </w:rPr>
         <w:t>tblBooking</w:t>
       </w:r>
+      <w:proofErr w:type="spellEnd"/>
     </w:p>
     <w:p>
       <w:pPr>
@@ -3668,6 +4000,7 @@
             </w:tcMar>
           </w:tcPr>
           <w:p>
+            <w:proofErr w:type="spellStart"/>
             <w:r>
               <w:rPr>
                 <w:sz w:val="19"/>
@@ -3675,6 +4008,7 @@
               </w:rPr>
               <w:t>BookingID</w:t>
             </w:r>
+            <w:proofErr w:type="spellEnd"/>
           </w:p>
         </w:tc>
         <w:tc>
@@ -3762,6 +4096,7 @@
             </w:tcMar>
           </w:tcPr>
           <w:p>
+            <w:proofErr w:type="spellStart"/>
             <w:r>
               <w:rPr>
                 <w:sz w:val="19"/>
@@ -3769,6 +4104,7 @@
               </w:rPr>
               <w:t>CustomerID</w:t>
             </w:r>
+            <w:proofErr w:type="spellEnd"/>
           </w:p>
         </w:tc>
         <w:tc>
@@ -3819,7 +4155,23 @@
                 <w:sz w:val="19"/>
                 <w:szCs w:val="19"/>
               </w:rPr>
-              <w:t>The customer who made the booking (Foreign Key to tblCustomer)</w:t>
+              <w:t xml:space="preserve">The customer who made the booking (Foreign Key to </w:t>
+            </w:r>
+            <w:proofErr w:type="spellStart"/>
+            <w:r>
+              <w:rPr>
+                <w:sz w:val="19"/>
+                <w:szCs w:val="19"/>
+              </w:rPr>
+              <w:t>tblCustomer</w:t>
+            </w:r>
+            <w:proofErr w:type="spellEnd"/>
+            <w:r>
+              <w:rPr>
+                <w:sz w:val="19"/>
+                <w:szCs w:val="19"/>
+              </w:rPr>
+              <w:t>)</w:t>
             </w:r>
           </w:p>
         </w:tc>
@@ -3856,6 +4208,7 @@
             </w:tcMar>
           </w:tcPr>
           <w:p>
+            <w:proofErr w:type="spellStart"/>
             <w:r>
               <w:rPr>
                 <w:sz w:val="19"/>
@@ -3864,6 +4217,7 @@
               <w:lastRenderedPageBreak/>
               <w:t>ScreeningID</w:t>
             </w:r>
+            <w:proofErr w:type="spellEnd"/>
           </w:p>
         </w:tc>
         <w:tc>
@@ -3914,7 +4268,23 @@
                 <w:sz w:val="19"/>
                 <w:szCs w:val="19"/>
               </w:rPr>
-              <w:t>The screening booked (Foreign Key to tblScreening)</w:t>
+              <w:t xml:space="preserve">The screening booked (Foreign Key to </w:t>
+            </w:r>
+            <w:proofErr w:type="spellStart"/>
+            <w:r>
+              <w:rPr>
+                <w:sz w:val="19"/>
+                <w:szCs w:val="19"/>
+              </w:rPr>
+              <w:t>tblScreening</w:t>
+            </w:r>
+            <w:proofErr w:type="spellEnd"/>
+            <w:r>
+              <w:rPr>
+                <w:sz w:val="19"/>
+                <w:szCs w:val="19"/>
+              </w:rPr>
+              <w:t>)</w:t>
             </w:r>
           </w:p>
         </w:tc>
@@ -3951,6 +4321,7 @@
             </w:tcMar>
           </w:tcPr>
           <w:p>
+            <w:proofErr w:type="spellStart"/>
             <w:r>
               <w:rPr>
                 <w:sz w:val="19"/>
@@ -3958,6 +4329,7 @@
               </w:rPr>
               <w:t>BookingDate</w:t>
             </w:r>
+            <w:proofErr w:type="spellEnd"/>
           </w:p>
         </w:tc>
         <w:tc>
@@ -4045,6 +4417,7 @@
             </w:tcMar>
           </w:tcPr>
           <w:p>
+            <w:proofErr w:type="spellStart"/>
             <w:r>
               <w:rPr>
                 <w:sz w:val="19"/>
@@ -4052,6 +4425,7 @@
               </w:rPr>
               <w:t>TotalCost</w:t>
             </w:r>
+            <w:proofErr w:type="spellEnd"/>
           </w:p>
         </w:tc>
         <w:tc>
@@ -4142,6 +4516,7 @@
           <w:color w:val="000000" w:themeColor="text1"/>
         </w:rPr>
       </w:pPr>
+      <w:proofErr w:type="spellStart"/>
       <w:r>
         <w:rPr>
           <w:b/>
@@ -4150,13 +4525,22 @@
         </w:rPr>
         <w:t>tblBookingSeat</w:t>
       </w:r>
+      <w:proofErr w:type="spellEnd"/>
     </w:p>
     <w:p>
       <w:pPr>
         <w:spacing w:after="160" w:line="276" w:lineRule="auto"/>
       </w:pPr>
       <w:r>
-        <w:t>This is a link table that resolves the many to many relationship between bookings and seats. Each record links one booking to one seat that was reserved as part of it.</w:t>
+        <w:t xml:space="preserve">This is a link table that resolves the many to many </w:t>
+      </w:r>
+      <w:proofErr w:type="gramStart"/>
+      <w:r>
+        <w:t>relationship</w:t>
+      </w:r>
+      <w:proofErr w:type="gramEnd"/>
+      <w:r>
+        <w:t xml:space="preserve"> between bookings and seats. Each record links one booking to one seat that was reserved as part of it.</w:t>
       </w:r>
     </w:p>
     <w:p>
@@ -4327,6 +4711,7 @@
             </w:tcMar>
           </w:tcPr>
           <w:p>
+            <w:proofErr w:type="spellStart"/>
             <w:r>
               <w:rPr>
                 <w:sz w:val="19"/>
@@ -4334,6 +4719,7 @@
               </w:rPr>
               <w:t>BookingSeatID</w:t>
             </w:r>
+            <w:proofErr w:type="spellEnd"/>
           </w:p>
         </w:tc>
         <w:tc>
@@ -4421,6 +4807,7 @@
             </w:tcMar>
           </w:tcPr>
           <w:p>
+            <w:proofErr w:type="spellStart"/>
             <w:r>
               <w:rPr>
                 <w:sz w:val="19"/>
@@ -4428,6 +4815,7 @@
               </w:rPr>
               <w:t>BookingID</w:t>
             </w:r>
+            <w:proofErr w:type="spellEnd"/>
           </w:p>
         </w:tc>
         <w:tc>
@@ -4478,7 +4866,23 @@
                 <w:sz w:val="19"/>
                 <w:szCs w:val="19"/>
               </w:rPr>
-              <w:t>The booking this seat belongs to (Foreign Key to tblBooking)</w:t>
+              <w:t xml:space="preserve">The booking this seat belongs to (Foreign Key to </w:t>
+            </w:r>
+            <w:proofErr w:type="spellStart"/>
+            <w:r>
+              <w:rPr>
+                <w:sz w:val="19"/>
+                <w:szCs w:val="19"/>
+              </w:rPr>
+              <w:t>tblBooking</w:t>
+            </w:r>
+            <w:proofErr w:type="spellEnd"/>
+            <w:r>
+              <w:rPr>
+                <w:sz w:val="19"/>
+                <w:szCs w:val="19"/>
+              </w:rPr>
+              <w:t>)</w:t>
             </w:r>
           </w:p>
         </w:tc>
@@ -4515,6 +4919,7 @@
             </w:tcMar>
           </w:tcPr>
           <w:p>
+            <w:proofErr w:type="spellStart"/>
             <w:r>
               <w:rPr>
                 <w:sz w:val="19"/>
@@ -4522,6 +4927,7 @@
               </w:rPr>
               <w:t>SeatID</w:t>
             </w:r>
+            <w:proofErr w:type="spellEnd"/>
           </w:p>
         </w:tc>
         <w:tc>
@@ -4572,7 +4978,23 @@
                 <w:sz w:val="19"/>
                 <w:szCs w:val="19"/>
               </w:rPr>
-              <w:t>The seat that was booked (Foreign Key to tblSeat)</w:t>
+              <w:t xml:space="preserve">The seat that was booked (Foreign Key to </w:t>
+            </w:r>
+            <w:proofErr w:type="spellStart"/>
+            <w:r>
+              <w:rPr>
+                <w:sz w:val="19"/>
+                <w:szCs w:val="19"/>
+              </w:rPr>
+              <w:t>tblSeat</w:t>
+            </w:r>
+            <w:proofErr w:type="spellEnd"/>
+            <w:r>
+              <w:rPr>
+                <w:sz w:val="19"/>
+                <w:szCs w:val="19"/>
+              </w:rPr>
+              <w:t>)</w:t>
             </w:r>
           </w:p>
         </w:tc>
@@ -4612,6 +5034,7 @@
           <w:color w:val="000000" w:themeColor="text1"/>
         </w:rPr>
       </w:pPr>
+      <w:proofErr w:type="spellStart"/>
       <w:r>
         <w:rPr>
           <w:b/>
@@ -4620,6 +5043,7 @@
         </w:rPr>
         <w:t>tblFoodItem</w:t>
       </w:r>
+      <w:proofErr w:type="spellEnd"/>
     </w:p>
     <w:p>
       <w:pPr>
@@ -4797,6 +5221,7 @@
             </w:tcMar>
           </w:tcPr>
           <w:p>
+            <w:proofErr w:type="spellStart"/>
             <w:r>
               <w:rPr>
                 <w:sz w:val="19"/>
@@ -4804,6 +5229,7 @@
               </w:rPr>
               <w:t>FoodItemID</w:t>
             </w:r>
+            <w:proofErr w:type="spellEnd"/>
           </w:p>
         </w:tc>
         <w:tc>
@@ -4891,6 +5317,7 @@
             </w:tcMar>
           </w:tcPr>
           <w:p>
+            <w:proofErr w:type="spellStart"/>
             <w:r>
               <w:rPr>
                 <w:sz w:val="19"/>
@@ -4898,6 +5325,7 @@
               </w:rPr>
               <w:t>FoodItemName</w:t>
             </w:r>
+            <w:proofErr w:type="spellEnd"/>
           </w:p>
         </w:tc>
         <w:tc>
@@ -4993,6 +5421,7 @@
             </w:tcMar>
           </w:tcPr>
           <w:p>
+            <w:proofErr w:type="spellStart"/>
             <w:r>
               <w:rPr>
                 <w:sz w:val="19"/>
@@ -5000,6 +5429,7 @@
               </w:rPr>
               <w:t>FoodItemPrice</w:t>
             </w:r>
+            <w:proofErr w:type="spellEnd"/>
           </w:p>
         </w:tc>
         <w:tc>
@@ -5087,6 +5517,7 @@
             </w:tcMar>
           </w:tcPr>
           <w:p>
+            <w:proofErr w:type="spellStart"/>
             <w:r>
               <w:rPr>
                 <w:sz w:val="19"/>
@@ -5094,6 +5525,7 @@
               </w:rPr>
               <w:t>FoodItemCategory</w:t>
             </w:r>
+            <w:proofErr w:type="spellEnd"/>
           </w:p>
         </w:tc>
         <w:tc>
@@ -5192,6 +5624,7 @@
           <w:color w:val="000000" w:themeColor="text1"/>
         </w:rPr>
       </w:pPr>
+      <w:proofErr w:type="spellStart"/>
       <w:r>
         <w:rPr>
           <w:b/>
@@ -5200,13 +5633,22 @@
         </w:rPr>
         <w:t>tblOrderItem</w:t>
       </w:r>
+      <w:proofErr w:type="spellEnd"/>
     </w:p>
     <w:p>
       <w:pPr>
         <w:spacing w:after="160" w:line="276" w:lineRule="auto"/>
       </w:pPr>
       <w:r>
-        <w:t>This is a link table that resolves the many to many relationship between bookings and food items. Each record records one food item and the quantity ordered against a booking.</w:t>
+        <w:t xml:space="preserve">This is a link table that resolves the many to many </w:t>
+      </w:r>
+      <w:proofErr w:type="gramStart"/>
+      <w:r>
+        <w:t>relationship</w:t>
+      </w:r>
+      <w:proofErr w:type="gramEnd"/>
+      <w:r>
+        <w:t xml:space="preserve"> between bookings and food items. Each record records one food item and the quantity ordered against a booking.</w:t>
       </w:r>
     </w:p>
     <w:p>
@@ -5377,6 +5819,7 @@
             </w:tcMar>
           </w:tcPr>
           <w:p>
+            <w:proofErr w:type="spellStart"/>
             <w:r>
               <w:rPr>
                 <w:sz w:val="19"/>
@@ -5385,6 +5828,7 @@
               <w:lastRenderedPageBreak/>
               <w:t>OrderItemID</w:t>
             </w:r>
+            <w:proofErr w:type="spellEnd"/>
           </w:p>
         </w:tc>
         <w:tc>
@@ -5472,6 +5916,7 @@
             </w:tcMar>
           </w:tcPr>
           <w:p>
+            <w:proofErr w:type="spellStart"/>
             <w:r>
               <w:rPr>
                 <w:sz w:val="19"/>
@@ -5479,6 +5924,7 @@
               </w:rPr>
               <w:t>BookingID</w:t>
             </w:r>
+            <w:proofErr w:type="spellEnd"/>
           </w:p>
         </w:tc>
         <w:tc>
@@ -5529,7 +5975,23 @@
                 <w:sz w:val="19"/>
                 <w:szCs w:val="19"/>
               </w:rPr>
-              <w:t>The booking the item was added to (Foreign Key to tblBooking)</w:t>
+              <w:t xml:space="preserve">The booking the item was added to (Foreign Key to </w:t>
+            </w:r>
+            <w:proofErr w:type="spellStart"/>
+            <w:r>
+              <w:rPr>
+                <w:sz w:val="19"/>
+                <w:szCs w:val="19"/>
+              </w:rPr>
+              <w:t>tblBooking</w:t>
+            </w:r>
+            <w:proofErr w:type="spellEnd"/>
+            <w:r>
+              <w:rPr>
+                <w:sz w:val="19"/>
+                <w:szCs w:val="19"/>
+              </w:rPr>
+              <w:t>)</w:t>
             </w:r>
           </w:p>
         </w:tc>
@@ -5566,6 +6028,7 @@
             </w:tcMar>
           </w:tcPr>
           <w:p>
+            <w:proofErr w:type="spellStart"/>
             <w:r>
               <w:rPr>
                 <w:sz w:val="19"/>
@@ -5573,6 +6036,7 @@
               </w:rPr>
               <w:t>FoodItemID</w:t>
             </w:r>
+            <w:proofErr w:type="spellEnd"/>
           </w:p>
         </w:tc>
         <w:tc>
@@ -5623,7 +6087,23 @@
                 <w:sz w:val="19"/>
                 <w:szCs w:val="19"/>
               </w:rPr>
-              <w:t>The food item ordered (Foreign Key to tblFoodItem)</w:t>
+              <w:t xml:space="preserve">The food item ordered (Foreign Key to </w:t>
+            </w:r>
+            <w:proofErr w:type="spellStart"/>
+            <w:r>
+              <w:rPr>
+                <w:sz w:val="19"/>
+                <w:szCs w:val="19"/>
+              </w:rPr>
+              <w:t>tblFoodItem</w:t>
+            </w:r>
+            <w:proofErr w:type="spellEnd"/>
+            <w:r>
+              <w:rPr>
+                <w:sz w:val="19"/>
+                <w:szCs w:val="19"/>
+              </w:rPr>
+              <w:t>)</w:t>
             </w:r>
           </w:p>
         </w:tc>
@@ -5757,6 +6237,7 @@
           <w:color w:val="000000" w:themeColor="text1"/>
         </w:rPr>
       </w:pPr>
+      <w:proofErr w:type="spellStart"/>
       <w:r>
         <w:rPr>
           <w:b/>
@@ -5765,6 +6246,7 @@
         </w:rPr>
         <w:t>tblLogin</w:t>
       </w:r>
+      <w:proofErr w:type="spellEnd"/>
     </w:p>
     <w:p>
       <w:pPr>
@@ -5942,6 +6424,7 @@
             </w:tcMar>
           </w:tcPr>
           <w:p>
+            <w:proofErr w:type="spellStart"/>
             <w:r>
               <w:rPr>
                 <w:sz w:val="19"/>
@@ -5949,6 +6432,7 @@
               </w:rPr>
               <w:t>LoginID</w:t>
             </w:r>
+            <w:proofErr w:type="spellEnd"/>
           </w:p>
         </w:tc>
         <w:tc>
@@ -6218,6 +6702,7 @@
             </w:tcMar>
           </w:tcPr>
           <w:p>
+            <w:proofErr w:type="spellStart"/>
             <w:r>
               <w:rPr>
                 <w:sz w:val="19"/>
@@ -6225,6 +6710,7 @@
               </w:rPr>
               <w:t>MTIz</w:t>
             </w:r>
+            <w:proofErr w:type="spellEnd"/>
           </w:p>
         </w:tc>
       </w:tr>
@@ -6240,6 +6726,7 @@
             </w:tcMar>
           </w:tcPr>
           <w:p>
+            <w:proofErr w:type="spellStart"/>
             <w:r>
               <w:rPr>
                 <w:sz w:val="19"/>
@@ -6247,6 +6734,7 @@
               </w:rPr>
               <w:t>AccessLevel</w:t>
             </w:r>
+            <w:proofErr w:type="spellEnd"/>
           </w:p>
         </w:tc>
         <w:tc>
@@ -6337,6 +6825,7 @@
           <w:color w:val="000000" w:themeColor="text1"/>
         </w:rPr>
       </w:pPr>
+      <w:proofErr w:type="spellStart"/>
       <w:r>
         <w:rPr>
           <w:b/>
@@ -6345,6 +6834,7 @@
         </w:rPr>
         <w:t>tblLogs</w:t>
       </w:r>
+      <w:proofErr w:type="spellEnd"/>
     </w:p>
     <w:p>
       <w:pPr>
@@ -6522,6 +7012,7 @@
             </w:tcMar>
           </w:tcPr>
           <w:p>
+            <w:proofErr w:type="spellStart"/>
             <w:r>
               <w:rPr>
                 <w:sz w:val="19"/>
@@ -6529,6 +7020,7 @@
               </w:rPr>
               <w:t>LogID</w:t>
             </w:r>
+            <w:proofErr w:type="spellEnd"/>
           </w:p>
         </w:tc>
         <w:tc>
@@ -6616,6 +7108,7 @@
             </w:tcMar>
           </w:tcPr>
           <w:p>
+            <w:proofErr w:type="spellStart"/>
             <w:r>
               <w:rPr>
                 <w:sz w:val="19"/>
@@ -6623,6 +7116,7 @@
               </w:rPr>
               <w:t>LogDateTime</w:t>
             </w:r>
+            <w:proofErr w:type="spellEnd"/>
           </w:p>
         </w:tc>
         <w:tc>
@@ -6710,6 +7204,7 @@
             </w:tcMar>
           </w:tcPr>
           <w:p>
+            <w:proofErr w:type="spellStart"/>
             <w:r>
               <w:rPr>
                 <w:sz w:val="19"/>
@@ -6717,6 +7212,7 @@
               </w:rPr>
               <w:t>LogType</w:t>
             </w:r>
+            <w:proofErr w:type="spellEnd"/>
           </w:p>
         </w:tc>
         <w:tc>
@@ -6812,6 +7308,7 @@
             </w:tcMar>
           </w:tcPr>
           <w:p>
+            <w:proofErr w:type="spellStart"/>
             <w:r>
               <w:rPr>
                 <w:sz w:val="19"/>
@@ -6819,6 +7316,7 @@
               </w:rPr>
               <w:t>LogMessage</w:t>
             </w:r>
+            <w:proofErr w:type="spellEnd"/>
           </w:p>
         </w:tc>
         <w:tc>
@@ -6909,6 +7407,7 @@
           <w:color w:val="000000" w:themeColor="text1"/>
         </w:rPr>
       </w:pPr>
+      <w:proofErr w:type="spellStart"/>
       <w:r>
         <w:rPr>
           <w:b/>
@@ -6918,6 +7417,7 @@
         <w:lastRenderedPageBreak/>
         <w:t>tblVersionControl</w:t>
       </w:r>
+      <w:proofErr w:type="spellEnd"/>
     </w:p>
     <w:p>
       <w:pPr>
@@ -7215,7 +7715,15 @@
         <w:spacing w:after="160" w:line="276" w:lineRule="auto"/>
       </w:pPr>
       <w:r>
-        <w:t>This section describes the processing that takes place inside the Filmtopia system. Rather than listing every button on every form it focuses on the stages where there is real logic going on, since these are the parts of the system that need to be thought through carefully before any code is written. Each stage is described in plain English pseudocode rather than in Visual Basic, so that the logic is clear and separate from the eventual code, and the two most important algorithms are also shown as flowcharts. Each stage is linked back to the objectives it helps to meet.</w:t>
+        <w:t xml:space="preserve">This section describes the processing that takes place inside the </w:t>
+      </w:r>
+      <w:proofErr w:type="spellStart"/>
+      <w:r>
+        <w:t>Filmtopia</w:t>
+      </w:r>
+      <w:proofErr w:type="spellEnd"/>
+      <w:r>
+        <w:t xml:space="preserve"> system. Rather than listing every button on every form it focuses on the stages where there is real logic going on, since these are the parts of the system that need to be thought through carefully before any code is written. Each stage is described in plain English pseudocode rather than in Visual Basic, so that the logic is clear and separate from the eventual code, and the two most important algorithms are also shown as flowcharts. Each stage is linked back to the objectives it helps to meet.</w:t>
       </w:r>
     </w:p>
     <w:p>
@@ -7241,7 +7749,15 @@
         <w:spacing w:after="160" w:line="276" w:lineRule="auto"/>
       </w:pPr>
       <w:r>
-        <w:t>When the system starts the user has to log in. The processing checks the entered details against the stored accounts and, if they match, remembers the user's access level so the rest of the system knows whether to show staff or manager options.</w:t>
+        <w:t xml:space="preserve">When the system starts the user </w:t>
+      </w:r>
+      <w:proofErr w:type="gramStart"/>
+      <w:r>
+        <w:t>has to</w:t>
+      </w:r>
+      <w:proofErr w:type="gramEnd"/>
+      <w:r>
+        <w:t xml:space="preserve"> log in. The processing checks the entered details against the stored accounts and, if they match, remembers the user's access level so the rest of the system knows whether to show staff or manager options.</w:t>
       </w:r>
     </w:p>
     <w:tbl>
@@ -7331,7 +7847,25 @@
                 <w:sz w:val="19"/>
                 <w:szCs w:val="19"/>
               </w:rPr>
-              <w:t xml:space="preserve">    LOOK UP the username in tblLogin using an SQL SELECT query</w:t>
+              <w:t xml:space="preserve">    LOOK UP the username in </w:t>
+            </w:r>
+            <w:proofErr w:type="spellStart"/>
+            <w:r>
+              <w:rPr>
+                <w:rFonts w:ascii="Courier New" w:eastAsia="Courier New" w:hAnsi="Courier New" w:cs="Courier New"/>
+                <w:sz w:val="19"/>
+                <w:szCs w:val="19"/>
+              </w:rPr>
+              <w:t>tblLogin</w:t>
+            </w:r>
+            <w:proofErr w:type="spellEnd"/>
+            <w:r>
+              <w:rPr>
+                <w:rFonts w:ascii="Courier New" w:eastAsia="Courier New" w:hAnsi="Courier New" w:cs="Courier New"/>
+                <w:sz w:val="19"/>
+                <w:szCs w:val="19"/>
+              </w:rPr>
+              <w:t xml:space="preserve"> using an SQL SELECT query</w:t>
             </w:r>
           </w:p>
           <w:p>
@@ -7361,7 +7895,25 @@
                 <w:sz w:val="19"/>
                 <w:szCs w:val="19"/>
               </w:rPr>
-              <w:t xml:space="preserve">    ELSE IF the stored password does not match the encoded password THEN</w:t>
+              <w:t xml:space="preserve">    ELSE IF the stored password does not match the encoded </w:t>
+            </w:r>
+            <w:proofErr w:type="gramStart"/>
+            <w:r>
+              <w:rPr>
+                <w:rFonts w:ascii="Courier New" w:eastAsia="Courier New" w:hAnsi="Courier New" w:cs="Courier New"/>
+                <w:sz w:val="19"/>
+                <w:szCs w:val="19"/>
+              </w:rPr>
+              <w:t>password</w:t>
+            </w:r>
+            <w:proofErr w:type="gramEnd"/>
+            <w:r>
+              <w:rPr>
+                <w:rFonts w:ascii="Courier New" w:eastAsia="Courier New" w:hAnsi="Courier New" w:cs="Courier New"/>
+                <w:sz w:val="19"/>
+                <w:szCs w:val="19"/>
+              </w:rPr>
+              <w:t xml:space="preserve"> THEN</w:t>
             </w:r>
           </w:p>
           <w:p>
@@ -7391,7 +7943,25 @@
                 <w:sz w:val="19"/>
                 <w:szCs w:val="19"/>
               </w:rPr>
-              <w:t xml:space="preserve">        STORE the user's AccessLevel for the session</w:t>
+              <w:t xml:space="preserve">        STORE the user's </w:t>
+            </w:r>
+            <w:proofErr w:type="spellStart"/>
+            <w:r>
+              <w:rPr>
+                <w:rFonts w:ascii="Courier New" w:eastAsia="Courier New" w:hAnsi="Courier New" w:cs="Courier New"/>
+                <w:sz w:val="19"/>
+                <w:szCs w:val="19"/>
+              </w:rPr>
+              <w:t>AccessLevel</w:t>
+            </w:r>
+            <w:proofErr w:type="spellEnd"/>
+            <w:r>
+              <w:rPr>
+                <w:rFonts w:ascii="Courier New" w:eastAsia="Courier New" w:hAnsi="Courier New" w:cs="Courier New"/>
+                <w:sz w:val="19"/>
+                <w:szCs w:val="19"/>
+              </w:rPr>
+              <w:t xml:space="preserve"> for the session</w:t>
             </w:r>
           </w:p>
           <w:p>
@@ -7458,7 +8028,16 @@
           <w:color w:val="000000" w:themeColor="text1"/>
         </w:rPr>
         <w:lastRenderedPageBreak/>
-        <w:t>Automatic Seat Generati</w:t>
+        <w:t xml:space="preserve">Automatic Seat </w:t>
+      </w:r>
+      <w:proofErr w:type="spellStart"/>
+      <w:r>
+        <w:rPr>
+          <w:b/>
+          <w:bCs/>
+          <w:color w:val="000000" w:themeColor="text1"/>
+        </w:rPr>
+        <w:t>Generati</w:t>
       </w:r>
       <w:r>
         <w:rPr>
@@ -7474,7 +8053,16 @@
           <w:bCs/>
           <w:color w:val="000000" w:themeColor="text1"/>
         </w:rPr>
-        <w:t xml:space="preserve">on (Objective </w:t>
+        <w:t>on</w:t>
+      </w:r>
+      <w:proofErr w:type="spellEnd"/>
+      <w:r>
+        <w:rPr>
+          <w:b/>
+          <w:bCs/>
+          <w:color w:val="000000" w:themeColor="text1"/>
+        </w:rPr>
+        <w:t xml:space="preserve"> (Objective </w:t>
       </w:r>
       <w:r>
         <w:rPr>
@@ -7498,7 +8086,31 @@
         <w:spacing w:after="160" w:line="276" w:lineRule="auto"/>
       </w:pPr>
       <w:r>
-        <w:t>When a manager creates a new screen the system generates all of that screen's seats automatically rather than asking anyone to type them in by hand. The seats are laid out in rows of ten, with each row given the next letter of the alphabet, and generation stops once the screen's capacity has been reached. This is the smarter and more reliable approach because the seats are always created in exactly the same consistent way.</w:t>
+        <w:t xml:space="preserve">When a manager creates a new </w:t>
+      </w:r>
+      <w:proofErr w:type="gramStart"/>
+      <w:r>
+        <w:t>screen</w:t>
+      </w:r>
+      <w:proofErr w:type="gramEnd"/>
+      <w:r>
+        <w:t xml:space="preserve"> the system generates </w:t>
+      </w:r>
+      <w:proofErr w:type="gramStart"/>
+      <w:r>
+        <w:t>all of</w:t>
+      </w:r>
+      <w:proofErr w:type="gramEnd"/>
+      <w:r>
+        <w:t xml:space="preserve"> that screen's seats automatically rather than asking anyone to type them in by hand. The seats are laid out in rows of ten, with each row given the next letter of the alphabet, and generation stops once the screen's capacity has been reached. This is the smarter and more reliable approach because the seats are always created in </w:t>
+      </w:r>
+      <w:proofErr w:type="gramStart"/>
+      <w:r>
+        <w:t>exactly the same</w:t>
+      </w:r>
+      <w:proofErr w:type="gramEnd"/>
+      <w:r>
+        <w:t xml:space="preserve"> consistent way.</w:t>
       </w:r>
     </w:p>
     <w:p>
@@ -7577,88 +8189,288 @@
                 <w:sz w:val="19"/>
                 <w:szCs w:val="19"/>
               </w:rPr>
-              <w:t>SET seatsPerRow to 10</w:t>
-            </w:r>
-          </w:p>
-          <w:p>
-            <w:r>
-              <w:rPr>
-                <w:rFonts w:ascii="Courier New" w:eastAsia="Courier New" w:hAnsi="Courier New" w:cs="Courier New"/>
-                <w:sz w:val="19"/>
-                <w:szCs w:val="19"/>
-              </w:rPr>
-              <w:t>SET rowLetter to "A"</w:t>
-            </w:r>
-          </w:p>
-          <w:p>
-            <w:r>
-              <w:rPr>
-                <w:rFonts w:ascii="Courier New" w:eastAsia="Courier New" w:hAnsi="Courier New" w:cs="Courier New"/>
-                <w:sz w:val="19"/>
-                <w:szCs w:val="19"/>
-              </w:rPr>
-              <w:t>SET seatsMade to 0</w:t>
-            </w:r>
-          </w:p>
-          <w:p>
-            <w:r>
-              <w:rPr>
-                <w:rFonts w:ascii="Courier New" w:eastAsia="Courier New" w:hAnsi="Courier New" w:cs="Courier New"/>
-                <w:sz w:val="19"/>
-                <w:szCs w:val="19"/>
-              </w:rPr>
-              <w:t>WHILE seatsMade is less than capacity</w:t>
-            </w:r>
-          </w:p>
-          <w:p>
-            <w:r>
-              <w:rPr>
-                <w:rFonts w:ascii="Courier New" w:eastAsia="Courier New" w:hAnsi="Courier New" w:cs="Courier New"/>
-                <w:sz w:val="19"/>
-                <w:szCs w:val="19"/>
-              </w:rPr>
-              <w:t xml:space="preserve">    FOR seatNumber from 1 to seatsPerRow</w:t>
-            </w:r>
-          </w:p>
-          <w:p>
-            <w:r>
-              <w:rPr>
-                <w:rFonts w:ascii="Courier New" w:eastAsia="Courier New" w:hAnsi="Courier New" w:cs="Courier New"/>
-                <w:sz w:val="19"/>
-                <w:szCs w:val="19"/>
-              </w:rPr>
-              <w:t xml:space="preserve">        IF seatsMade is less than capacity THEN</w:t>
-            </w:r>
-          </w:p>
-          <w:p>
-            <w:r>
-              <w:rPr>
-                <w:rFonts w:ascii="Courier New" w:eastAsia="Courier New" w:hAnsi="Courier New" w:cs="Courier New"/>
-                <w:sz w:val="19"/>
-                <w:szCs w:val="19"/>
-              </w:rPr>
-              <w:t xml:space="preserve">            INSERT a seat into tblSeat with the current ScreenID,</w:t>
-            </w:r>
-          </w:p>
-          <w:p>
-            <w:r>
-              <w:rPr>
-                <w:rFonts w:ascii="Courier New" w:eastAsia="Courier New" w:hAnsi="Courier New" w:cs="Courier New"/>
-                <w:sz w:val="19"/>
-                <w:szCs w:val="19"/>
-              </w:rPr>
-              <w:t xml:space="preserve">                   rowLetter and seatNumber using an SQL INSERT</w:t>
-            </w:r>
-          </w:p>
-          <w:p>
-            <w:r>
-              <w:rPr>
-                <w:rFonts w:ascii="Courier New" w:eastAsia="Courier New" w:hAnsi="Courier New" w:cs="Courier New"/>
-                <w:sz w:val="19"/>
-                <w:szCs w:val="19"/>
-              </w:rPr>
-              <w:t xml:space="preserve">            ADD 1 to seatsMade</w:t>
-            </w:r>
+              <w:t xml:space="preserve">SET </w:t>
+            </w:r>
+            <w:proofErr w:type="spellStart"/>
+            <w:r>
+              <w:rPr>
+                <w:rFonts w:ascii="Courier New" w:eastAsia="Courier New" w:hAnsi="Courier New" w:cs="Courier New"/>
+                <w:sz w:val="19"/>
+                <w:szCs w:val="19"/>
+              </w:rPr>
+              <w:t>seatsPerRow</w:t>
+            </w:r>
+            <w:proofErr w:type="spellEnd"/>
+            <w:r>
+              <w:rPr>
+                <w:rFonts w:ascii="Courier New" w:eastAsia="Courier New" w:hAnsi="Courier New" w:cs="Courier New"/>
+                <w:sz w:val="19"/>
+                <w:szCs w:val="19"/>
+              </w:rPr>
+              <w:t xml:space="preserve"> to 10</w:t>
+            </w:r>
+          </w:p>
+          <w:p>
+            <w:r>
+              <w:rPr>
+                <w:rFonts w:ascii="Courier New" w:eastAsia="Courier New" w:hAnsi="Courier New" w:cs="Courier New"/>
+                <w:sz w:val="19"/>
+                <w:szCs w:val="19"/>
+              </w:rPr>
+              <w:t xml:space="preserve">SET </w:t>
+            </w:r>
+            <w:proofErr w:type="spellStart"/>
+            <w:r>
+              <w:rPr>
+                <w:rFonts w:ascii="Courier New" w:eastAsia="Courier New" w:hAnsi="Courier New" w:cs="Courier New"/>
+                <w:sz w:val="19"/>
+                <w:szCs w:val="19"/>
+              </w:rPr>
+              <w:t>rowLetter</w:t>
+            </w:r>
+            <w:proofErr w:type="spellEnd"/>
+            <w:r>
+              <w:rPr>
+                <w:rFonts w:ascii="Courier New" w:eastAsia="Courier New" w:hAnsi="Courier New" w:cs="Courier New"/>
+                <w:sz w:val="19"/>
+                <w:szCs w:val="19"/>
+              </w:rPr>
+              <w:t xml:space="preserve"> to "A"</w:t>
+            </w:r>
+          </w:p>
+          <w:p>
+            <w:r>
+              <w:rPr>
+                <w:rFonts w:ascii="Courier New" w:eastAsia="Courier New" w:hAnsi="Courier New" w:cs="Courier New"/>
+                <w:sz w:val="19"/>
+                <w:szCs w:val="19"/>
+              </w:rPr>
+              <w:t xml:space="preserve">SET </w:t>
+            </w:r>
+            <w:proofErr w:type="spellStart"/>
+            <w:r>
+              <w:rPr>
+                <w:rFonts w:ascii="Courier New" w:eastAsia="Courier New" w:hAnsi="Courier New" w:cs="Courier New"/>
+                <w:sz w:val="19"/>
+                <w:szCs w:val="19"/>
+              </w:rPr>
+              <w:t>seatsMade</w:t>
+            </w:r>
+            <w:proofErr w:type="spellEnd"/>
+            <w:r>
+              <w:rPr>
+                <w:rFonts w:ascii="Courier New" w:eastAsia="Courier New" w:hAnsi="Courier New" w:cs="Courier New"/>
+                <w:sz w:val="19"/>
+                <w:szCs w:val="19"/>
+              </w:rPr>
+              <w:t xml:space="preserve"> to 0</w:t>
+            </w:r>
+          </w:p>
+          <w:p>
+            <w:r>
+              <w:rPr>
+                <w:rFonts w:ascii="Courier New" w:eastAsia="Courier New" w:hAnsi="Courier New" w:cs="Courier New"/>
+                <w:sz w:val="19"/>
+                <w:szCs w:val="19"/>
+              </w:rPr>
+              <w:t xml:space="preserve">WHILE </w:t>
+            </w:r>
+            <w:proofErr w:type="spellStart"/>
+            <w:r>
+              <w:rPr>
+                <w:rFonts w:ascii="Courier New" w:eastAsia="Courier New" w:hAnsi="Courier New" w:cs="Courier New"/>
+                <w:sz w:val="19"/>
+                <w:szCs w:val="19"/>
+              </w:rPr>
+              <w:t>seatsMade</w:t>
+            </w:r>
+            <w:proofErr w:type="spellEnd"/>
+            <w:r>
+              <w:rPr>
+                <w:rFonts w:ascii="Courier New" w:eastAsia="Courier New" w:hAnsi="Courier New" w:cs="Courier New"/>
+                <w:sz w:val="19"/>
+                <w:szCs w:val="19"/>
+              </w:rPr>
+              <w:t xml:space="preserve"> is less than capacity</w:t>
+            </w:r>
+          </w:p>
+          <w:p>
+            <w:r>
+              <w:rPr>
+                <w:rFonts w:ascii="Courier New" w:eastAsia="Courier New" w:hAnsi="Courier New" w:cs="Courier New"/>
+                <w:sz w:val="19"/>
+                <w:szCs w:val="19"/>
+              </w:rPr>
+              <w:t xml:space="preserve">    FOR </w:t>
+            </w:r>
+            <w:proofErr w:type="spellStart"/>
+            <w:r>
+              <w:rPr>
+                <w:rFonts w:ascii="Courier New" w:eastAsia="Courier New" w:hAnsi="Courier New" w:cs="Courier New"/>
+                <w:sz w:val="19"/>
+                <w:szCs w:val="19"/>
+              </w:rPr>
+              <w:t>seatNumber</w:t>
+            </w:r>
+            <w:proofErr w:type="spellEnd"/>
+            <w:r>
+              <w:rPr>
+                <w:rFonts w:ascii="Courier New" w:eastAsia="Courier New" w:hAnsi="Courier New" w:cs="Courier New"/>
+                <w:sz w:val="19"/>
+                <w:szCs w:val="19"/>
+              </w:rPr>
+              <w:t xml:space="preserve"> from 1 to </w:t>
+            </w:r>
+            <w:proofErr w:type="spellStart"/>
+            <w:r>
+              <w:rPr>
+                <w:rFonts w:ascii="Courier New" w:eastAsia="Courier New" w:hAnsi="Courier New" w:cs="Courier New"/>
+                <w:sz w:val="19"/>
+                <w:szCs w:val="19"/>
+              </w:rPr>
+              <w:t>seatsPerRow</w:t>
+            </w:r>
+            <w:proofErr w:type="spellEnd"/>
+          </w:p>
+          <w:p>
+            <w:r>
+              <w:rPr>
+                <w:rFonts w:ascii="Courier New" w:eastAsia="Courier New" w:hAnsi="Courier New" w:cs="Courier New"/>
+                <w:sz w:val="19"/>
+                <w:szCs w:val="19"/>
+              </w:rPr>
+              <w:t xml:space="preserve">        IF </w:t>
+            </w:r>
+            <w:proofErr w:type="spellStart"/>
+            <w:r>
+              <w:rPr>
+                <w:rFonts w:ascii="Courier New" w:eastAsia="Courier New" w:hAnsi="Courier New" w:cs="Courier New"/>
+                <w:sz w:val="19"/>
+                <w:szCs w:val="19"/>
+              </w:rPr>
+              <w:t>seatsMade</w:t>
+            </w:r>
+            <w:proofErr w:type="spellEnd"/>
+            <w:r>
+              <w:rPr>
+                <w:rFonts w:ascii="Courier New" w:eastAsia="Courier New" w:hAnsi="Courier New" w:cs="Courier New"/>
+                <w:sz w:val="19"/>
+                <w:szCs w:val="19"/>
+              </w:rPr>
+              <w:t xml:space="preserve"> is less than capacity THEN</w:t>
+            </w:r>
+          </w:p>
+          <w:p>
+            <w:r>
+              <w:rPr>
+                <w:rFonts w:ascii="Courier New" w:eastAsia="Courier New" w:hAnsi="Courier New" w:cs="Courier New"/>
+                <w:sz w:val="19"/>
+                <w:szCs w:val="19"/>
+              </w:rPr>
+              <w:t xml:space="preserve">            INSERT a seat into </w:t>
+            </w:r>
+            <w:proofErr w:type="spellStart"/>
+            <w:r>
+              <w:rPr>
+                <w:rFonts w:ascii="Courier New" w:eastAsia="Courier New" w:hAnsi="Courier New" w:cs="Courier New"/>
+                <w:sz w:val="19"/>
+                <w:szCs w:val="19"/>
+              </w:rPr>
+              <w:t>tblSeat</w:t>
+            </w:r>
+            <w:proofErr w:type="spellEnd"/>
+            <w:r>
+              <w:rPr>
+                <w:rFonts w:ascii="Courier New" w:eastAsia="Courier New" w:hAnsi="Courier New" w:cs="Courier New"/>
+                <w:sz w:val="19"/>
+                <w:szCs w:val="19"/>
+              </w:rPr>
+              <w:t xml:space="preserve"> with the current </w:t>
+            </w:r>
+            <w:proofErr w:type="spellStart"/>
+            <w:r>
+              <w:rPr>
+                <w:rFonts w:ascii="Courier New" w:eastAsia="Courier New" w:hAnsi="Courier New" w:cs="Courier New"/>
+                <w:sz w:val="19"/>
+                <w:szCs w:val="19"/>
+              </w:rPr>
+              <w:t>ScreenID</w:t>
+            </w:r>
+            <w:proofErr w:type="spellEnd"/>
+            <w:r>
+              <w:rPr>
+                <w:rFonts w:ascii="Courier New" w:eastAsia="Courier New" w:hAnsi="Courier New" w:cs="Courier New"/>
+                <w:sz w:val="19"/>
+                <w:szCs w:val="19"/>
+              </w:rPr>
+              <w:t>,</w:t>
+            </w:r>
+          </w:p>
+          <w:p>
+            <w:r>
+              <w:rPr>
+                <w:rFonts w:ascii="Courier New" w:eastAsia="Courier New" w:hAnsi="Courier New" w:cs="Courier New"/>
+                <w:sz w:val="19"/>
+                <w:szCs w:val="19"/>
+              </w:rPr>
+              <w:t xml:space="preserve">                   </w:t>
+            </w:r>
+            <w:proofErr w:type="spellStart"/>
+            <w:r>
+              <w:rPr>
+                <w:rFonts w:ascii="Courier New" w:eastAsia="Courier New" w:hAnsi="Courier New" w:cs="Courier New"/>
+                <w:sz w:val="19"/>
+                <w:szCs w:val="19"/>
+              </w:rPr>
+              <w:t>rowLetter</w:t>
+            </w:r>
+            <w:proofErr w:type="spellEnd"/>
+            <w:r>
+              <w:rPr>
+                <w:rFonts w:ascii="Courier New" w:eastAsia="Courier New" w:hAnsi="Courier New" w:cs="Courier New"/>
+                <w:sz w:val="19"/>
+                <w:szCs w:val="19"/>
+              </w:rPr>
+              <w:t xml:space="preserve"> and </w:t>
+            </w:r>
+            <w:proofErr w:type="spellStart"/>
+            <w:r>
+              <w:rPr>
+                <w:rFonts w:ascii="Courier New" w:eastAsia="Courier New" w:hAnsi="Courier New" w:cs="Courier New"/>
+                <w:sz w:val="19"/>
+                <w:szCs w:val="19"/>
+              </w:rPr>
+              <w:t>seatNumber</w:t>
+            </w:r>
+            <w:proofErr w:type="spellEnd"/>
+            <w:r>
+              <w:rPr>
+                <w:rFonts w:ascii="Courier New" w:eastAsia="Courier New" w:hAnsi="Courier New" w:cs="Courier New"/>
+                <w:sz w:val="19"/>
+                <w:szCs w:val="19"/>
+              </w:rPr>
+              <w:t xml:space="preserve"> using an SQL INSERT</w:t>
+            </w:r>
+          </w:p>
+          <w:p>
+            <w:r>
+              <w:rPr>
+                <w:rFonts w:ascii="Courier New" w:eastAsia="Courier New" w:hAnsi="Courier New" w:cs="Courier New"/>
+                <w:sz w:val="19"/>
+                <w:szCs w:val="19"/>
+              </w:rPr>
+              <w:t xml:space="preserve">            ADD 1 to </w:t>
+            </w:r>
+            <w:proofErr w:type="spellStart"/>
+            <w:r>
+              <w:rPr>
+                <w:rFonts w:ascii="Courier New" w:eastAsia="Courier New" w:hAnsi="Courier New" w:cs="Courier New"/>
+                <w:sz w:val="19"/>
+                <w:szCs w:val="19"/>
+              </w:rPr>
+              <w:t>seatsMade</w:t>
+            </w:r>
+            <w:proofErr w:type="spellEnd"/>
           </w:p>
           <w:p>
             <w:r>
@@ -7677,17 +8489,45 @@
                 <w:sz w:val="19"/>
                 <w:szCs w:val="19"/>
               </w:rPr>
-              <w:t xml:space="preserve">    NEXT seatNumber</w:t>
-            </w:r>
-          </w:p>
-          <w:p>
-            <w:r>
-              <w:rPr>
-                <w:rFonts w:ascii="Courier New" w:eastAsia="Courier New" w:hAnsi="Courier New" w:cs="Courier New"/>
-                <w:sz w:val="19"/>
-                <w:szCs w:val="19"/>
-              </w:rPr>
-              <w:t xml:space="preserve">    MOVE rowLetter on to the next letter of the alphabet</w:t>
+              <w:t xml:space="preserve">    NEXT </w:t>
+            </w:r>
+            <w:proofErr w:type="spellStart"/>
+            <w:r>
+              <w:rPr>
+                <w:rFonts w:ascii="Courier New" w:eastAsia="Courier New" w:hAnsi="Courier New" w:cs="Courier New"/>
+                <w:sz w:val="19"/>
+                <w:szCs w:val="19"/>
+              </w:rPr>
+              <w:t>seatNumber</w:t>
+            </w:r>
+            <w:proofErr w:type="spellEnd"/>
+          </w:p>
+          <w:p>
+            <w:r>
+              <w:rPr>
+                <w:rFonts w:ascii="Courier New" w:eastAsia="Courier New" w:hAnsi="Courier New" w:cs="Courier New"/>
+                <w:sz w:val="19"/>
+                <w:szCs w:val="19"/>
+              </w:rPr>
+              <w:t xml:space="preserve">    MOVE </w:t>
+            </w:r>
+            <w:proofErr w:type="spellStart"/>
+            <w:r>
+              <w:rPr>
+                <w:rFonts w:ascii="Courier New" w:eastAsia="Courier New" w:hAnsi="Courier New" w:cs="Courier New"/>
+                <w:sz w:val="19"/>
+                <w:szCs w:val="19"/>
+              </w:rPr>
+              <w:t>rowLetter</w:t>
+            </w:r>
+            <w:proofErr w:type="spellEnd"/>
+            <w:r>
+              <w:rPr>
+                <w:rFonts w:ascii="Courier New" w:eastAsia="Courier New" w:hAnsi="Courier New" w:cs="Courier New"/>
+                <w:sz w:val="19"/>
+                <w:szCs w:val="19"/>
+              </w:rPr>
+              <w:t xml:space="preserve"> on to the next letter of the alphabet</w:t>
             </w:r>
           </w:p>
           <w:p>
@@ -7741,7 +8581,15 @@
         <w:spacing w:after="160" w:line="276" w:lineRule="auto"/>
       </w:pPr>
       <w:r>
-        <w:t>This is the most important piece of processing in the whole system because it is where double bookings are prevented. Before a booking is saved, every seat the customer has chosen is checked against the seats already booked for that screening. Only if all of the chosen seats are still free does the booking go ahead. Because seat availability is worked out from the link table rather than stored as a flag, it can never get out of step with the actual bookings.</w:t>
+        <w:t xml:space="preserve">This is the most important piece of processing in the whole system because it is where double bookings are prevented. Before a booking is saved, every seat the customer has chosen is checked against the seats already booked for that screening. Only if </w:t>
+      </w:r>
+      <w:proofErr w:type="gramStart"/>
+      <w:r>
+        <w:t>all of</w:t>
+      </w:r>
+      <w:proofErr w:type="gramEnd"/>
+      <w:r>
+        <w:t xml:space="preserve"> the chosen seats are still free does the booking go ahead. Because seat availability is worked out from the link table rather than stored as a flag, it can never get out of step with the actual bookings.</w:t>
       </w:r>
     </w:p>
     <w:p>
@@ -7823,7 +8671,43 @@
                 <w:sz w:val="19"/>
                 <w:szCs w:val="19"/>
               </w:rPr>
-              <w:t xml:space="preserve">    LOOK UP tblBookingSeat joined to tblBooking to see whether</w:t>
+              <w:t xml:space="preserve">    LOOK UP </w:t>
+            </w:r>
+            <w:proofErr w:type="spellStart"/>
+            <w:r>
+              <w:rPr>
+                <w:rFonts w:ascii="Courier New" w:eastAsia="Courier New" w:hAnsi="Courier New" w:cs="Courier New"/>
+                <w:sz w:val="19"/>
+                <w:szCs w:val="19"/>
+              </w:rPr>
+              <w:t>tblBookingSeat</w:t>
+            </w:r>
+            <w:proofErr w:type="spellEnd"/>
+            <w:r>
+              <w:rPr>
+                <w:rFonts w:ascii="Courier New" w:eastAsia="Courier New" w:hAnsi="Courier New" w:cs="Courier New"/>
+                <w:sz w:val="19"/>
+                <w:szCs w:val="19"/>
+              </w:rPr>
+              <w:t xml:space="preserve"> joined to </w:t>
+            </w:r>
+            <w:proofErr w:type="spellStart"/>
+            <w:r>
+              <w:rPr>
+                <w:rFonts w:ascii="Courier New" w:eastAsia="Courier New" w:hAnsi="Courier New" w:cs="Courier New"/>
+                <w:sz w:val="19"/>
+                <w:szCs w:val="19"/>
+              </w:rPr>
+              <w:t>tblBooking</w:t>
+            </w:r>
+            <w:proofErr w:type="spellEnd"/>
+            <w:r>
+              <w:rPr>
+                <w:rFonts w:ascii="Courier New" w:eastAsia="Courier New" w:hAnsi="Courier New" w:cs="Courier New"/>
+                <w:sz w:val="19"/>
+                <w:szCs w:val="19"/>
+              </w:rPr>
+              <w:t xml:space="preserve"> to see whether</w:t>
             </w:r>
           </w:p>
           <w:p>
@@ -7894,7 +8778,25 @@
                 <w:szCs w:val="19"/>
               </w:rPr>
               <w:lastRenderedPageBreak/>
-              <w:t>INSERT a new record into tblBooking with the customer, screening,</w:t>
+              <w:t xml:space="preserve">INSERT a new record into </w:t>
+            </w:r>
+            <w:proofErr w:type="spellStart"/>
+            <w:r>
+              <w:rPr>
+                <w:rFonts w:ascii="Courier New" w:eastAsia="Courier New" w:hAnsi="Courier New" w:cs="Courier New"/>
+                <w:sz w:val="19"/>
+                <w:szCs w:val="19"/>
+              </w:rPr>
+              <w:t>tblBooking</w:t>
+            </w:r>
+            <w:proofErr w:type="spellEnd"/>
+            <w:r>
+              <w:rPr>
+                <w:rFonts w:ascii="Courier New" w:eastAsia="Courier New" w:hAnsi="Courier New" w:cs="Courier New"/>
+                <w:sz w:val="19"/>
+                <w:szCs w:val="19"/>
+              </w:rPr>
+              <w:t xml:space="preserve"> with the customer, screening,</w:t>
             </w:r>
           </w:p>
           <w:p>
@@ -7914,7 +8816,25 @@
                 <w:sz w:val="19"/>
                 <w:szCs w:val="19"/>
               </w:rPr>
-              <w:t>GET the new BookingID that was created</w:t>
+              <w:t xml:space="preserve">GET the new </w:t>
+            </w:r>
+            <w:proofErr w:type="spellStart"/>
+            <w:r>
+              <w:rPr>
+                <w:rFonts w:ascii="Courier New" w:eastAsia="Courier New" w:hAnsi="Courier New" w:cs="Courier New"/>
+                <w:sz w:val="19"/>
+                <w:szCs w:val="19"/>
+              </w:rPr>
+              <w:t>BookingID</w:t>
+            </w:r>
+            <w:proofErr w:type="spellEnd"/>
+            <w:r>
+              <w:rPr>
+                <w:rFonts w:ascii="Courier New" w:eastAsia="Courier New" w:hAnsi="Courier New" w:cs="Courier New"/>
+                <w:sz w:val="19"/>
+                <w:szCs w:val="19"/>
+              </w:rPr>
+              <w:t xml:space="preserve"> that was created</w:t>
             </w:r>
           </w:p>
           <w:p>
@@ -7934,8 +8854,54 @@
                 <w:sz w:val="19"/>
                 <w:szCs w:val="19"/>
               </w:rPr>
-              <w:t xml:space="preserve">    INSERT a record into tblBookingSeat linking BookingID to SeatID</w:t>
-            </w:r>
+              <w:t xml:space="preserve">    INSERT a record into </w:t>
+            </w:r>
+            <w:proofErr w:type="spellStart"/>
+            <w:r>
+              <w:rPr>
+                <w:rFonts w:ascii="Courier New" w:eastAsia="Courier New" w:hAnsi="Courier New" w:cs="Courier New"/>
+                <w:sz w:val="19"/>
+                <w:szCs w:val="19"/>
+              </w:rPr>
+              <w:t>tblBookingSeat</w:t>
+            </w:r>
+            <w:proofErr w:type="spellEnd"/>
+            <w:r>
+              <w:rPr>
+                <w:rFonts w:ascii="Courier New" w:eastAsia="Courier New" w:hAnsi="Courier New" w:cs="Courier New"/>
+                <w:sz w:val="19"/>
+                <w:szCs w:val="19"/>
+              </w:rPr>
+              <w:t xml:space="preserve"> linking </w:t>
+            </w:r>
+            <w:proofErr w:type="spellStart"/>
+            <w:r>
+              <w:rPr>
+                <w:rFonts w:ascii="Courier New" w:eastAsia="Courier New" w:hAnsi="Courier New" w:cs="Courier New"/>
+                <w:sz w:val="19"/>
+                <w:szCs w:val="19"/>
+              </w:rPr>
+              <w:t>BookingID</w:t>
+            </w:r>
+            <w:proofErr w:type="spellEnd"/>
+            <w:r>
+              <w:rPr>
+                <w:rFonts w:ascii="Courier New" w:eastAsia="Courier New" w:hAnsi="Courier New" w:cs="Courier New"/>
+                <w:sz w:val="19"/>
+                <w:szCs w:val="19"/>
+              </w:rPr>
+              <w:t xml:space="preserve"> to </w:t>
+            </w:r>
+            <w:proofErr w:type="spellStart"/>
+            <w:r>
+              <w:rPr>
+                <w:rFonts w:ascii="Courier New" w:eastAsia="Courier New" w:hAnsi="Courier New" w:cs="Courier New"/>
+                <w:sz w:val="19"/>
+                <w:szCs w:val="19"/>
+              </w:rPr>
+              <w:t>SeatID</w:t>
+            </w:r>
+            <w:proofErr w:type="spellEnd"/>
           </w:p>
           <w:p>
             <w:r>
@@ -7998,7 +8964,23 @@
         <w:spacing w:after="160" w:line="276" w:lineRule="auto"/>
       </w:pPr>
       <w:r>
-        <w:t>When a screening is chosen the system draws a map of the screen so the customer or member of staff can see at a glance which seats are free. Every seat for the screen is drawn as a button, and each one is coloured depending on whether it has already been booked for that particular screening.</w:t>
+        <w:t xml:space="preserve">When a screening is chosen the system draws a map of the screen so the customer or member of staff can see </w:t>
+      </w:r>
+      <w:proofErr w:type="gramStart"/>
+      <w:r>
+        <w:t>at a glance</w:t>
+      </w:r>
+      <w:proofErr w:type="gramEnd"/>
+      <w:r>
+        <w:t xml:space="preserve"> which seats are free. Every seat for the screen is drawn as a button, and each one is coloured depending on whether it has already been booked for that </w:t>
+      </w:r>
+      <w:proofErr w:type="gramStart"/>
+      <w:r>
+        <w:t>particular screening</w:t>
+      </w:r>
+      <w:proofErr w:type="gramEnd"/>
+      <w:r>
+        <w:t>.</w:t>
       </w:r>
     </w:p>
     <w:tbl>
@@ -8038,17 +9020,45 @@
                 <w:sz w:val="19"/>
                 <w:szCs w:val="19"/>
               </w:rPr>
-              <w:t>GET the selected screening and its ScreenID</w:t>
-            </w:r>
-          </w:p>
-          <w:p>
-            <w:r>
-              <w:rPr>
-                <w:rFonts w:ascii="Courier New" w:eastAsia="Courier New" w:hAnsi="Courier New" w:cs="Courier New"/>
-                <w:sz w:val="19"/>
-                <w:szCs w:val="19"/>
-              </w:rPr>
-              <w:t>SELECT all seats for that screen from tblSeat,</w:t>
+              <w:t xml:space="preserve">GET the selected screening and its </w:t>
+            </w:r>
+            <w:proofErr w:type="spellStart"/>
+            <w:r>
+              <w:rPr>
+                <w:rFonts w:ascii="Courier New" w:eastAsia="Courier New" w:hAnsi="Courier New" w:cs="Courier New"/>
+                <w:sz w:val="19"/>
+                <w:szCs w:val="19"/>
+              </w:rPr>
+              <w:t>ScreenID</w:t>
+            </w:r>
+            <w:proofErr w:type="spellEnd"/>
+          </w:p>
+          <w:p>
+            <w:r>
+              <w:rPr>
+                <w:rFonts w:ascii="Courier New" w:eastAsia="Courier New" w:hAnsi="Courier New" w:cs="Courier New"/>
+                <w:sz w:val="19"/>
+                <w:szCs w:val="19"/>
+              </w:rPr>
+              <w:t xml:space="preserve">SELECT all seats for that screen from </w:t>
+            </w:r>
+            <w:proofErr w:type="spellStart"/>
+            <w:r>
+              <w:rPr>
+                <w:rFonts w:ascii="Courier New" w:eastAsia="Courier New" w:hAnsi="Courier New" w:cs="Courier New"/>
+                <w:sz w:val="19"/>
+                <w:szCs w:val="19"/>
+              </w:rPr>
+              <w:t>tblSeat</w:t>
+            </w:r>
+            <w:proofErr w:type="spellEnd"/>
+            <w:r>
+              <w:rPr>
+                <w:rFonts w:ascii="Courier New" w:eastAsia="Courier New" w:hAnsi="Courier New" w:cs="Courier New"/>
+                <w:sz w:val="19"/>
+                <w:szCs w:val="19"/>
+              </w:rPr>
+              <w:t>,</w:t>
             </w:r>
           </w:p>
           <w:p>
@@ -8078,8 +9088,18 @@
                 <w:sz w:val="19"/>
                 <w:szCs w:val="19"/>
               </w:rPr>
-              <w:t xml:space="preserve">       from tblBookingSeat</w:t>
-            </w:r>
+              <w:t xml:space="preserve">       from </w:t>
+            </w:r>
+            <w:proofErr w:type="spellStart"/>
+            <w:r>
+              <w:rPr>
+                <w:rFonts w:ascii="Courier New" w:eastAsia="Courier New" w:hAnsi="Courier New" w:cs="Courier New"/>
+                <w:sz w:val="19"/>
+                <w:szCs w:val="19"/>
+              </w:rPr>
+              <w:t>tblBookingSeat</w:t>
+            </w:r>
+            <w:proofErr w:type="spellEnd"/>
           </w:p>
           <w:p>
             <w:r>
@@ -8098,7 +9118,25 @@
                 <w:sz w:val="19"/>
                 <w:szCs w:val="19"/>
               </w:rPr>
-              <w:t xml:space="preserve">    IF the seat is in the booked list THEN</w:t>
+              <w:t xml:space="preserve">    IF the seat is in the booked </w:t>
+            </w:r>
+            <w:proofErr w:type="gramStart"/>
+            <w:r>
+              <w:rPr>
+                <w:rFonts w:ascii="Courier New" w:eastAsia="Courier New" w:hAnsi="Courier New" w:cs="Courier New"/>
+                <w:sz w:val="19"/>
+                <w:szCs w:val="19"/>
+              </w:rPr>
+              <w:t>list</w:t>
+            </w:r>
+            <w:proofErr w:type="gramEnd"/>
+            <w:r>
+              <w:rPr>
+                <w:rFonts w:ascii="Courier New" w:eastAsia="Courier New" w:hAnsi="Courier New" w:cs="Courier New"/>
+                <w:sz w:val="19"/>
+                <w:szCs w:val="19"/>
+              </w:rPr>
+              <w:t xml:space="preserve"> THEN</w:t>
             </w:r>
           </w:p>
           <w:p>
@@ -8222,7 +9260,25 @@
                 <w:sz w:val="19"/>
                 <w:szCs w:val="19"/>
               </w:rPr>
-              <w:t>SET foodTotal to 0</w:t>
+              <w:t xml:space="preserve">SET </w:t>
+            </w:r>
+            <w:proofErr w:type="spellStart"/>
+            <w:r>
+              <w:rPr>
+                <w:rFonts w:ascii="Courier New" w:eastAsia="Courier New" w:hAnsi="Courier New" w:cs="Courier New"/>
+                <w:sz w:val="19"/>
+                <w:szCs w:val="19"/>
+              </w:rPr>
+              <w:t>foodTotal</w:t>
+            </w:r>
+            <w:proofErr w:type="spellEnd"/>
+            <w:r>
+              <w:rPr>
+                <w:rFonts w:ascii="Courier New" w:eastAsia="Courier New" w:hAnsi="Courier New" w:cs="Courier New"/>
+                <w:sz w:val="19"/>
+                <w:szCs w:val="19"/>
+              </w:rPr>
+              <w:t xml:space="preserve"> to 0</w:t>
             </w:r>
           </w:p>
           <w:p>
@@ -8242,28 +9298,84 @@
                 <w:sz w:val="19"/>
                 <w:szCs w:val="19"/>
               </w:rPr>
-              <w:t xml:space="preserve">    LOOK UP the item price in tblFoodItem</w:t>
-            </w:r>
-          </w:p>
-          <w:p>
-            <w:r>
-              <w:rPr>
-                <w:rFonts w:ascii="Courier New" w:eastAsia="Courier New" w:hAnsi="Courier New" w:cs="Courier New"/>
-                <w:sz w:val="19"/>
-                <w:szCs w:val="19"/>
-              </w:rPr>
-              <w:t xml:space="preserve">    CALCULATE lineCost as price multiplied by quantity</w:t>
-            </w:r>
-          </w:p>
-          <w:p>
-            <w:r>
-              <w:rPr>
-                <w:rFonts w:ascii="Courier New" w:eastAsia="Courier New" w:hAnsi="Courier New" w:cs="Courier New"/>
-                <w:sz w:val="19"/>
-                <w:szCs w:val="19"/>
-              </w:rPr>
-              <w:t xml:space="preserve">    ADD lineCost to foodTotal</w:t>
-            </w:r>
+              <w:t xml:space="preserve">    LOOK UP the item price in </w:t>
+            </w:r>
+            <w:proofErr w:type="spellStart"/>
+            <w:r>
+              <w:rPr>
+                <w:rFonts w:ascii="Courier New" w:eastAsia="Courier New" w:hAnsi="Courier New" w:cs="Courier New"/>
+                <w:sz w:val="19"/>
+                <w:szCs w:val="19"/>
+              </w:rPr>
+              <w:t>tblFoodItem</w:t>
+            </w:r>
+            <w:proofErr w:type="spellEnd"/>
+          </w:p>
+          <w:p>
+            <w:r>
+              <w:rPr>
+                <w:rFonts w:ascii="Courier New" w:eastAsia="Courier New" w:hAnsi="Courier New" w:cs="Courier New"/>
+                <w:sz w:val="19"/>
+                <w:szCs w:val="19"/>
+              </w:rPr>
+              <w:t xml:space="preserve">    CALCULATE </w:t>
+            </w:r>
+            <w:proofErr w:type="spellStart"/>
+            <w:r>
+              <w:rPr>
+                <w:rFonts w:ascii="Courier New" w:eastAsia="Courier New" w:hAnsi="Courier New" w:cs="Courier New"/>
+                <w:sz w:val="19"/>
+                <w:szCs w:val="19"/>
+              </w:rPr>
+              <w:t>lineCost</w:t>
+            </w:r>
+            <w:proofErr w:type="spellEnd"/>
+            <w:r>
+              <w:rPr>
+                <w:rFonts w:ascii="Courier New" w:eastAsia="Courier New" w:hAnsi="Courier New" w:cs="Courier New"/>
+                <w:sz w:val="19"/>
+                <w:szCs w:val="19"/>
+              </w:rPr>
+              <w:t xml:space="preserve"> as price multiplied by quantity</w:t>
+            </w:r>
+          </w:p>
+          <w:p>
+            <w:r>
+              <w:rPr>
+                <w:rFonts w:ascii="Courier New" w:eastAsia="Courier New" w:hAnsi="Courier New" w:cs="Courier New"/>
+                <w:sz w:val="19"/>
+                <w:szCs w:val="19"/>
+              </w:rPr>
+              <w:t xml:space="preserve">    ADD </w:t>
+            </w:r>
+            <w:proofErr w:type="spellStart"/>
+            <w:r>
+              <w:rPr>
+                <w:rFonts w:ascii="Courier New" w:eastAsia="Courier New" w:hAnsi="Courier New" w:cs="Courier New"/>
+                <w:sz w:val="19"/>
+                <w:szCs w:val="19"/>
+              </w:rPr>
+              <w:t>lineCost</w:t>
+            </w:r>
+            <w:proofErr w:type="spellEnd"/>
+            <w:r>
+              <w:rPr>
+                <w:rFonts w:ascii="Courier New" w:eastAsia="Courier New" w:hAnsi="Courier New" w:cs="Courier New"/>
+                <w:sz w:val="19"/>
+                <w:szCs w:val="19"/>
+              </w:rPr>
+              <w:t xml:space="preserve"> to </w:t>
+            </w:r>
+            <w:proofErr w:type="spellStart"/>
+            <w:r>
+              <w:rPr>
+                <w:rFonts w:ascii="Courier New" w:eastAsia="Courier New" w:hAnsi="Courier New" w:cs="Courier New"/>
+                <w:sz w:val="19"/>
+                <w:szCs w:val="19"/>
+              </w:rPr>
+              <w:t>foodTotal</w:t>
+            </w:r>
+            <w:proofErr w:type="spellEnd"/>
           </w:p>
           <w:p>
             <w:r>
@@ -8282,27 +9394,109 @@
                 <w:sz w:val="19"/>
                 <w:szCs w:val="19"/>
               </w:rPr>
-              <w:t>CALCULATE seatTotal as number of seats times the ticket price</w:t>
-            </w:r>
-          </w:p>
-          <w:p>
-            <w:r>
-              <w:rPr>
-                <w:rFonts w:ascii="Courier New" w:eastAsia="Courier New" w:hAnsi="Courier New" w:cs="Courier New"/>
-                <w:sz w:val="19"/>
-                <w:szCs w:val="19"/>
-              </w:rPr>
-              <w:t>CALCULATE totalCost as seatTotal plus foodTotal</w:t>
-            </w:r>
-          </w:p>
-          <w:p>
-            <w:r>
-              <w:rPr>
-                <w:rFonts w:ascii="Courier New" w:eastAsia="Courier New" w:hAnsi="Courier New" w:cs="Courier New"/>
-                <w:sz w:val="19"/>
-                <w:szCs w:val="19"/>
-              </w:rPr>
-              <w:t>DISPLAY totalCost to the customer</w:t>
+              <w:t xml:space="preserve">CALCULATE </w:t>
+            </w:r>
+            <w:proofErr w:type="spellStart"/>
+            <w:r>
+              <w:rPr>
+                <w:rFonts w:ascii="Courier New" w:eastAsia="Courier New" w:hAnsi="Courier New" w:cs="Courier New"/>
+                <w:sz w:val="19"/>
+                <w:szCs w:val="19"/>
+              </w:rPr>
+              <w:t>seatTotal</w:t>
+            </w:r>
+            <w:proofErr w:type="spellEnd"/>
+            <w:r>
+              <w:rPr>
+                <w:rFonts w:ascii="Courier New" w:eastAsia="Courier New" w:hAnsi="Courier New" w:cs="Courier New"/>
+                <w:sz w:val="19"/>
+                <w:szCs w:val="19"/>
+              </w:rPr>
+              <w:t xml:space="preserve"> as number of seats times the ticket price</w:t>
+            </w:r>
+          </w:p>
+          <w:p>
+            <w:r>
+              <w:rPr>
+                <w:rFonts w:ascii="Courier New" w:eastAsia="Courier New" w:hAnsi="Courier New" w:cs="Courier New"/>
+                <w:sz w:val="19"/>
+                <w:szCs w:val="19"/>
+              </w:rPr>
+              <w:t xml:space="preserve">CALCULATE </w:t>
+            </w:r>
+            <w:proofErr w:type="spellStart"/>
+            <w:r>
+              <w:rPr>
+                <w:rFonts w:ascii="Courier New" w:eastAsia="Courier New" w:hAnsi="Courier New" w:cs="Courier New"/>
+                <w:sz w:val="19"/>
+                <w:szCs w:val="19"/>
+              </w:rPr>
+              <w:t>totalCost</w:t>
+            </w:r>
+            <w:proofErr w:type="spellEnd"/>
+            <w:r>
+              <w:rPr>
+                <w:rFonts w:ascii="Courier New" w:eastAsia="Courier New" w:hAnsi="Courier New" w:cs="Courier New"/>
+                <w:sz w:val="19"/>
+                <w:szCs w:val="19"/>
+              </w:rPr>
+              <w:t xml:space="preserve"> as </w:t>
+            </w:r>
+            <w:proofErr w:type="spellStart"/>
+            <w:r>
+              <w:rPr>
+                <w:rFonts w:ascii="Courier New" w:eastAsia="Courier New" w:hAnsi="Courier New" w:cs="Courier New"/>
+                <w:sz w:val="19"/>
+                <w:szCs w:val="19"/>
+              </w:rPr>
+              <w:t>seatTotal</w:t>
+            </w:r>
+            <w:proofErr w:type="spellEnd"/>
+            <w:r>
+              <w:rPr>
+                <w:rFonts w:ascii="Courier New" w:eastAsia="Courier New" w:hAnsi="Courier New" w:cs="Courier New"/>
+                <w:sz w:val="19"/>
+                <w:szCs w:val="19"/>
+              </w:rPr>
+              <w:t xml:space="preserve"> plus </w:t>
+            </w:r>
+            <w:proofErr w:type="spellStart"/>
+            <w:r>
+              <w:rPr>
+                <w:rFonts w:ascii="Courier New" w:eastAsia="Courier New" w:hAnsi="Courier New" w:cs="Courier New"/>
+                <w:sz w:val="19"/>
+                <w:szCs w:val="19"/>
+              </w:rPr>
+              <w:t>foodTotal</w:t>
+            </w:r>
+            <w:proofErr w:type="spellEnd"/>
+          </w:p>
+          <w:p>
+            <w:r>
+              <w:rPr>
+                <w:rFonts w:ascii="Courier New" w:eastAsia="Courier New" w:hAnsi="Courier New" w:cs="Courier New"/>
+                <w:sz w:val="19"/>
+                <w:szCs w:val="19"/>
+              </w:rPr>
+              <w:t xml:space="preserve">DISPLAY </w:t>
+            </w:r>
+            <w:proofErr w:type="spellStart"/>
+            <w:r>
+              <w:rPr>
+                <w:rFonts w:ascii="Courier New" w:eastAsia="Courier New" w:hAnsi="Courier New" w:cs="Courier New"/>
+                <w:sz w:val="19"/>
+                <w:szCs w:val="19"/>
+              </w:rPr>
+              <w:t>totalCost</w:t>
+            </w:r>
+            <w:proofErr w:type="spellEnd"/>
+            <w:r>
+              <w:rPr>
+                <w:rFonts w:ascii="Courier New" w:eastAsia="Courier New" w:hAnsi="Courier New" w:cs="Courier New"/>
+                <w:sz w:val="19"/>
+                <w:szCs w:val="19"/>
+              </w:rPr>
+              <w:t xml:space="preserve"> to the customer</w:t>
             </w:r>
           </w:p>
         </w:tc>
@@ -8337,7 +9531,15 @@
         <w:spacing w:after="160" w:line="276" w:lineRule="auto"/>
       </w:pPr>
       <w:r>
-        <w:t>The manager can produce a sales report for a chosen range of dates. The processing gathers every booking made within that range, then totals up the number of tickets sold and the revenue taken.</w:t>
+        <w:t xml:space="preserve">The manager can produce a sales report for a chosen range of dates. The processing gathers every booking made within that range, then totals up the number of tickets </w:t>
+      </w:r>
+      <w:proofErr w:type="gramStart"/>
+      <w:r>
+        <w:t>sold</w:t>
+      </w:r>
+      <w:proofErr w:type="gramEnd"/>
+      <w:r>
+        <w:t xml:space="preserve"> and the revenue taken.</w:t>
       </w:r>
     </w:p>
     <w:tbl>
@@ -8417,7 +9619,43 @@
                 <w:sz w:val="19"/>
                 <w:szCs w:val="19"/>
               </w:rPr>
-              <w:t xml:space="preserve">    SELECT all bookings from tblBooking where BookingDate is</w:t>
+              <w:t xml:space="preserve">    SELECT all bookings from </w:t>
+            </w:r>
+            <w:proofErr w:type="spellStart"/>
+            <w:r>
+              <w:rPr>
+                <w:rFonts w:ascii="Courier New" w:eastAsia="Courier New" w:hAnsi="Courier New" w:cs="Courier New"/>
+                <w:sz w:val="19"/>
+                <w:szCs w:val="19"/>
+              </w:rPr>
+              <w:t>tblBooking</w:t>
+            </w:r>
+            <w:proofErr w:type="spellEnd"/>
+            <w:r>
+              <w:rPr>
+                <w:rFonts w:ascii="Courier New" w:eastAsia="Courier New" w:hAnsi="Courier New" w:cs="Courier New"/>
+                <w:sz w:val="19"/>
+                <w:szCs w:val="19"/>
+              </w:rPr>
+              <w:t xml:space="preserve"> where </w:t>
+            </w:r>
+            <w:proofErr w:type="spellStart"/>
+            <w:r>
+              <w:rPr>
+                <w:rFonts w:ascii="Courier New" w:eastAsia="Courier New" w:hAnsi="Courier New" w:cs="Courier New"/>
+                <w:sz w:val="19"/>
+                <w:szCs w:val="19"/>
+              </w:rPr>
+              <w:t>BookingDate</w:t>
+            </w:r>
+            <w:proofErr w:type="spellEnd"/>
+            <w:r>
+              <w:rPr>
+                <w:rFonts w:ascii="Courier New" w:eastAsia="Courier New" w:hAnsi="Courier New" w:cs="Courier New"/>
+                <w:sz w:val="19"/>
+                <w:szCs w:val="19"/>
+              </w:rPr>
+              <w:t xml:space="preserve"> is</w:t>
             </w:r>
           </w:p>
           <w:p>
@@ -8437,17 +9675,53 @@
                 <w:sz w:val="19"/>
                 <w:szCs w:val="19"/>
               </w:rPr>
-              <w:t xml:space="preserve">    SET totalTickets to 0</w:t>
-            </w:r>
-          </w:p>
-          <w:p>
-            <w:r>
-              <w:rPr>
-                <w:rFonts w:ascii="Courier New" w:eastAsia="Courier New" w:hAnsi="Courier New" w:cs="Courier New"/>
-                <w:sz w:val="19"/>
-                <w:szCs w:val="19"/>
-              </w:rPr>
-              <w:t xml:space="preserve">    SET totalRevenue to 0</w:t>
+              <w:t xml:space="preserve">    SET </w:t>
+            </w:r>
+            <w:proofErr w:type="spellStart"/>
+            <w:r>
+              <w:rPr>
+                <w:rFonts w:ascii="Courier New" w:eastAsia="Courier New" w:hAnsi="Courier New" w:cs="Courier New"/>
+                <w:sz w:val="19"/>
+                <w:szCs w:val="19"/>
+              </w:rPr>
+              <w:t>totalTickets</w:t>
+            </w:r>
+            <w:proofErr w:type="spellEnd"/>
+            <w:r>
+              <w:rPr>
+                <w:rFonts w:ascii="Courier New" w:eastAsia="Courier New" w:hAnsi="Courier New" w:cs="Courier New"/>
+                <w:sz w:val="19"/>
+                <w:szCs w:val="19"/>
+              </w:rPr>
+              <w:t xml:space="preserve"> to 0</w:t>
+            </w:r>
+          </w:p>
+          <w:p>
+            <w:r>
+              <w:rPr>
+                <w:rFonts w:ascii="Courier New" w:eastAsia="Courier New" w:hAnsi="Courier New" w:cs="Courier New"/>
+                <w:sz w:val="19"/>
+                <w:szCs w:val="19"/>
+              </w:rPr>
+              <w:t xml:space="preserve">    SET </w:t>
+            </w:r>
+            <w:proofErr w:type="spellStart"/>
+            <w:r>
+              <w:rPr>
+                <w:rFonts w:ascii="Courier New" w:eastAsia="Courier New" w:hAnsi="Courier New" w:cs="Courier New"/>
+                <w:sz w:val="19"/>
+                <w:szCs w:val="19"/>
+              </w:rPr>
+              <w:t>totalRevenue</w:t>
+            </w:r>
+            <w:proofErr w:type="spellEnd"/>
+            <w:r>
+              <w:rPr>
+                <w:rFonts w:ascii="Courier New" w:eastAsia="Courier New" w:hAnsi="Courier New" w:cs="Courier New"/>
+                <w:sz w:val="19"/>
+                <w:szCs w:val="19"/>
+              </w:rPr>
+              <w:t xml:space="preserve"> to 0</w:t>
             </w:r>
           </w:p>
           <w:p>
@@ -8467,28 +9741,76 @@
                 <w:sz w:val="19"/>
                 <w:szCs w:val="19"/>
               </w:rPr>
-              <w:t xml:space="preserve">        COUNT the seats linked to it in tblBookingSeat</w:t>
-            </w:r>
-          </w:p>
-          <w:p>
-            <w:r>
-              <w:rPr>
-                <w:rFonts w:ascii="Courier New" w:eastAsia="Courier New" w:hAnsi="Courier New" w:cs="Courier New"/>
-                <w:sz w:val="19"/>
-                <w:szCs w:val="19"/>
-              </w:rPr>
-              <w:t xml:space="preserve">        ADD that count to totalTickets</w:t>
-            </w:r>
-          </w:p>
-          <w:p>
-            <w:r>
-              <w:rPr>
-                <w:rFonts w:ascii="Courier New" w:eastAsia="Courier New" w:hAnsi="Courier New" w:cs="Courier New"/>
-                <w:sz w:val="19"/>
-                <w:szCs w:val="19"/>
-              </w:rPr>
-              <w:t xml:space="preserve">        ADD the booking's TotalCost to totalRevenue</w:t>
-            </w:r>
+              <w:t xml:space="preserve">        COUNT the seats linked to it in </w:t>
+            </w:r>
+            <w:proofErr w:type="spellStart"/>
+            <w:r>
+              <w:rPr>
+                <w:rFonts w:ascii="Courier New" w:eastAsia="Courier New" w:hAnsi="Courier New" w:cs="Courier New"/>
+                <w:sz w:val="19"/>
+                <w:szCs w:val="19"/>
+              </w:rPr>
+              <w:t>tblBookingSeat</w:t>
+            </w:r>
+            <w:proofErr w:type="spellEnd"/>
+          </w:p>
+          <w:p>
+            <w:r>
+              <w:rPr>
+                <w:rFonts w:ascii="Courier New" w:eastAsia="Courier New" w:hAnsi="Courier New" w:cs="Courier New"/>
+                <w:sz w:val="19"/>
+                <w:szCs w:val="19"/>
+              </w:rPr>
+              <w:t xml:space="preserve">        ADD that count to </w:t>
+            </w:r>
+            <w:proofErr w:type="spellStart"/>
+            <w:r>
+              <w:rPr>
+                <w:rFonts w:ascii="Courier New" w:eastAsia="Courier New" w:hAnsi="Courier New" w:cs="Courier New"/>
+                <w:sz w:val="19"/>
+                <w:szCs w:val="19"/>
+              </w:rPr>
+              <w:t>totalTickets</w:t>
+            </w:r>
+            <w:proofErr w:type="spellEnd"/>
+          </w:p>
+          <w:p>
+            <w:r>
+              <w:rPr>
+                <w:rFonts w:ascii="Courier New" w:eastAsia="Courier New" w:hAnsi="Courier New" w:cs="Courier New"/>
+                <w:sz w:val="19"/>
+                <w:szCs w:val="19"/>
+              </w:rPr>
+              <w:t xml:space="preserve">        ADD the booking's </w:t>
+            </w:r>
+            <w:proofErr w:type="spellStart"/>
+            <w:r>
+              <w:rPr>
+                <w:rFonts w:ascii="Courier New" w:eastAsia="Courier New" w:hAnsi="Courier New" w:cs="Courier New"/>
+                <w:sz w:val="19"/>
+                <w:szCs w:val="19"/>
+              </w:rPr>
+              <w:t>TotalCost</w:t>
+            </w:r>
+            <w:proofErr w:type="spellEnd"/>
+            <w:r>
+              <w:rPr>
+                <w:rFonts w:ascii="Courier New" w:eastAsia="Courier New" w:hAnsi="Courier New" w:cs="Courier New"/>
+                <w:sz w:val="19"/>
+                <w:szCs w:val="19"/>
+              </w:rPr>
+              <w:t xml:space="preserve"> to </w:t>
+            </w:r>
+            <w:proofErr w:type="spellStart"/>
+            <w:r>
+              <w:rPr>
+                <w:rFonts w:ascii="Courier New" w:eastAsia="Courier New" w:hAnsi="Courier New" w:cs="Courier New"/>
+                <w:sz w:val="19"/>
+                <w:szCs w:val="19"/>
+              </w:rPr>
+              <w:t>totalRevenue</w:t>
+            </w:r>
+            <w:proofErr w:type="spellEnd"/>
           </w:p>
           <w:p>
             <w:r>
@@ -8507,8 +9829,36 @@
                 <w:sz w:val="19"/>
                 <w:szCs w:val="19"/>
               </w:rPr>
-              <w:t xml:space="preserve">    DISPLAY totalTickets and totalRevenue</w:t>
-            </w:r>
+              <w:t xml:space="preserve">    DISPLAY </w:t>
+            </w:r>
+            <w:proofErr w:type="spellStart"/>
+            <w:r>
+              <w:rPr>
+                <w:rFonts w:ascii="Courier New" w:eastAsia="Courier New" w:hAnsi="Courier New" w:cs="Courier New"/>
+                <w:sz w:val="19"/>
+                <w:szCs w:val="19"/>
+              </w:rPr>
+              <w:t>totalTickets</w:t>
+            </w:r>
+            <w:proofErr w:type="spellEnd"/>
+            <w:r>
+              <w:rPr>
+                <w:rFonts w:ascii="Courier New" w:eastAsia="Courier New" w:hAnsi="Courier New" w:cs="Courier New"/>
+                <w:sz w:val="19"/>
+                <w:szCs w:val="19"/>
+              </w:rPr>
+              <w:t xml:space="preserve"> and </w:t>
+            </w:r>
+            <w:proofErr w:type="spellStart"/>
+            <w:r>
+              <w:rPr>
+                <w:rFonts w:ascii="Courier New" w:eastAsia="Courier New" w:hAnsi="Courier New" w:cs="Courier New"/>
+                <w:sz w:val="19"/>
+                <w:szCs w:val="19"/>
+              </w:rPr>
+              <w:t>totalRevenue</w:t>
+            </w:r>
+            <w:proofErr w:type="spellEnd"/>
           </w:p>
           <w:p>
             <w:r>
@@ -8631,8 +9981,18 @@
                 <w:sz w:val="19"/>
                 <w:szCs w:val="19"/>
               </w:rPr>
-              <w:t xml:space="preserve">    SELECT bookings joined to customers where CustomerSurname</w:t>
-            </w:r>
+              <w:t xml:space="preserve">    SELECT bookings joined to customers where </w:t>
+            </w:r>
+            <w:proofErr w:type="spellStart"/>
+            <w:r>
+              <w:rPr>
+                <w:rFonts w:ascii="Courier New" w:eastAsia="Courier New" w:hAnsi="Courier New" w:cs="Courier New"/>
+                <w:sz w:val="19"/>
+                <w:szCs w:val="19"/>
+              </w:rPr>
+              <w:t>CustomerSurname</w:t>
+            </w:r>
+            <w:proofErr w:type="spellEnd"/>
           </w:p>
           <w:p>
             <w:r>
@@ -8730,7 +10090,15 @@
         <w:spacing w:after="160" w:line="276" w:lineRule="auto"/>
       </w:pPr>
       <w:r>
-        <w:t>When a booking is cancelled its seats need to become available again. Because availability is worked out from the link table, simply removing the booking's records from tblBookingSeat frees those seats automatically with no separate step needed.</w:t>
+        <w:t xml:space="preserve">When a booking is cancelled its seats need to become available again. Because availability is worked out from the link table, simply removing the booking's records from </w:t>
+      </w:r>
+      <w:proofErr w:type="spellStart"/>
+      <w:r>
+        <w:t>tblBookingSeat</w:t>
+      </w:r>
+      <w:proofErr w:type="spellEnd"/>
+      <w:r>
+        <w:t xml:space="preserve"> frees those seats automatically with no separate step needed.</w:t>
       </w:r>
     </w:p>
     <w:tbl>
@@ -8770,7 +10138,25 @@
                 <w:sz w:val="19"/>
                 <w:szCs w:val="19"/>
               </w:rPr>
-              <w:t>GET the BookingID of the booking to cancel</w:t>
+              <w:t xml:space="preserve">GET the </w:t>
+            </w:r>
+            <w:proofErr w:type="spellStart"/>
+            <w:r>
+              <w:rPr>
+                <w:rFonts w:ascii="Courier New" w:eastAsia="Courier New" w:hAnsi="Courier New" w:cs="Courier New"/>
+                <w:sz w:val="19"/>
+                <w:szCs w:val="19"/>
+              </w:rPr>
+              <w:t>BookingID</w:t>
+            </w:r>
+            <w:proofErr w:type="spellEnd"/>
+            <w:r>
+              <w:rPr>
+                <w:rFonts w:ascii="Courier New" w:eastAsia="Courier New" w:hAnsi="Courier New" w:cs="Courier New"/>
+                <w:sz w:val="19"/>
+                <w:szCs w:val="19"/>
+              </w:rPr>
+              <w:t xml:space="preserve"> of the booking to cancel</w:t>
             </w:r>
           </w:p>
           <w:p>
@@ -8800,18 +10186,74 @@
                 <w:sz w:val="19"/>
                 <w:szCs w:val="19"/>
               </w:rPr>
-              <w:t xml:space="preserve">    DELETE all records in tblBookingSeat for that BookingID</w:t>
-            </w:r>
-          </w:p>
-          <w:p>
-            <w:r>
-              <w:rPr>
-                <w:rFonts w:ascii="Courier New" w:eastAsia="Courier New" w:hAnsi="Courier New" w:cs="Courier New"/>
-                <w:sz w:val="19"/>
-                <w:szCs w:val="19"/>
-              </w:rPr>
-              <w:t xml:space="preserve">    DELETE all records in tblOrderItem for that BookingID</w:t>
-            </w:r>
+              <w:t xml:space="preserve">    DELETE all records in </w:t>
+            </w:r>
+            <w:proofErr w:type="spellStart"/>
+            <w:r>
+              <w:rPr>
+                <w:rFonts w:ascii="Courier New" w:eastAsia="Courier New" w:hAnsi="Courier New" w:cs="Courier New"/>
+                <w:sz w:val="19"/>
+                <w:szCs w:val="19"/>
+              </w:rPr>
+              <w:t>tblBookingSeat</w:t>
+            </w:r>
+            <w:proofErr w:type="spellEnd"/>
+            <w:r>
+              <w:rPr>
+                <w:rFonts w:ascii="Courier New" w:eastAsia="Courier New" w:hAnsi="Courier New" w:cs="Courier New"/>
+                <w:sz w:val="19"/>
+                <w:szCs w:val="19"/>
+              </w:rPr>
+              <w:t xml:space="preserve"> for that </w:t>
+            </w:r>
+            <w:proofErr w:type="spellStart"/>
+            <w:r>
+              <w:rPr>
+                <w:rFonts w:ascii="Courier New" w:eastAsia="Courier New" w:hAnsi="Courier New" w:cs="Courier New"/>
+                <w:sz w:val="19"/>
+                <w:szCs w:val="19"/>
+              </w:rPr>
+              <w:t>BookingID</w:t>
+            </w:r>
+            <w:proofErr w:type="spellEnd"/>
+          </w:p>
+          <w:p>
+            <w:r>
+              <w:rPr>
+                <w:rFonts w:ascii="Courier New" w:eastAsia="Courier New" w:hAnsi="Courier New" w:cs="Courier New"/>
+                <w:sz w:val="19"/>
+                <w:szCs w:val="19"/>
+              </w:rPr>
+              <w:t xml:space="preserve">    DELETE all records in </w:t>
+            </w:r>
+            <w:proofErr w:type="spellStart"/>
+            <w:r>
+              <w:rPr>
+                <w:rFonts w:ascii="Courier New" w:eastAsia="Courier New" w:hAnsi="Courier New" w:cs="Courier New"/>
+                <w:sz w:val="19"/>
+                <w:szCs w:val="19"/>
+              </w:rPr>
+              <w:t>tblOrderItem</w:t>
+            </w:r>
+            <w:proofErr w:type="spellEnd"/>
+            <w:r>
+              <w:rPr>
+                <w:rFonts w:ascii="Courier New" w:eastAsia="Courier New" w:hAnsi="Courier New" w:cs="Courier New"/>
+                <w:sz w:val="19"/>
+                <w:szCs w:val="19"/>
+              </w:rPr>
+              <w:t xml:space="preserve"> for that </w:t>
+            </w:r>
+            <w:proofErr w:type="spellStart"/>
+            <w:r>
+              <w:rPr>
+                <w:rFonts w:ascii="Courier New" w:eastAsia="Courier New" w:hAnsi="Courier New" w:cs="Courier New"/>
+                <w:sz w:val="19"/>
+                <w:szCs w:val="19"/>
+              </w:rPr>
+              <w:t>BookingID</w:t>
+            </w:r>
+            <w:proofErr w:type="spellEnd"/>
           </w:p>
           <w:p>
             <w:r>
@@ -8821,8 +10263,36 @@
                 <w:szCs w:val="19"/>
               </w:rPr>
               <w:lastRenderedPageBreak/>
-              <w:t xml:space="preserve">    DELETE the record in tblBooking for that BookingID</w:t>
-            </w:r>
+              <w:t xml:space="preserve">    DELETE the record in </w:t>
+            </w:r>
+            <w:proofErr w:type="spellStart"/>
+            <w:r>
+              <w:rPr>
+                <w:rFonts w:ascii="Courier New" w:eastAsia="Courier New" w:hAnsi="Courier New" w:cs="Courier New"/>
+                <w:sz w:val="19"/>
+                <w:szCs w:val="19"/>
+              </w:rPr>
+              <w:t>tblBooking</w:t>
+            </w:r>
+            <w:proofErr w:type="spellEnd"/>
+            <w:r>
+              <w:rPr>
+                <w:rFonts w:ascii="Courier New" w:eastAsia="Courier New" w:hAnsi="Courier New" w:cs="Courier New"/>
+                <w:sz w:val="19"/>
+                <w:szCs w:val="19"/>
+              </w:rPr>
+              <w:t xml:space="preserve"> for that </w:t>
+            </w:r>
+            <w:proofErr w:type="spellStart"/>
+            <w:r>
+              <w:rPr>
+                <w:rFonts w:ascii="Courier New" w:eastAsia="Courier New" w:hAnsi="Courier New" w:cs="Courier New"/>
+                <w:sz w:val="19"/>
+                <w:szCs w:val="19"/>
+              </w:rPr>
+              <w:t>BookingID</w:t>
+            </w:r>
+            <w:proofErr w:type="spellEnd"/>
           </w:p>
           <w:p>
             <w:r>
@@ -8896,7 +10366,23 @@
         <w:spacing w:after="160" w:line="276" w:lineRule="auto"/>
       </w:pPr>
       <w:r>
-        <w:t>Validation is the process of checking that data entered into the system is sensible and complete before it is accepted and saved to the database. It cannot guarantee that data is correct, for example it cannot tell whether a customer has typed the right surname, but it can stop clearly invalid or missing data from getting in, which protects the integrity of the database. Several different types of validation are used across the Filmtopia system, and these are explained below before being applied to each input in turn.</w:t>
+        <w:t xml:space="preserve">Validation is the process of checking that data </w:t>
+      </w:r>
+      <w:proofErr w:type="gramStart"/>
+      <w:r>
+        <w:t>entered into</w:t>
+      </w:r>
+      <w:proofErr w:type="gramEnd"/>
+      <w:r>
+        <w:t xml:space="preserve"> the system is sensible and complete before it is accepted and saved to the database. It cannot guarantee that data is correct, for example it cannot tell whether a customer has typed the right surname, but it can stop clearly invalid or missing data from getting in, which protects the integrity of the database. Several different types of validation are used across the </w:t>
+      </w:r>
+      <w:proofErr w:type="spellStart"/>
+      <w:r>
+        <w:t>Filmtopia</w:t>
+      </w:r>
+      <w:proofErr w:type="spellEnd"/>
+      <w:r>
+        <w:t xml:space="preserve"> system, and these are explained below before being applied to each input in turn.</w:t>
       </w:r>
     </w:p>
     <w:p>
@@ -8904,7 +10390,47 @@
         <w:spacing w:after="160" w:line="276" w:lineRule="auto"/>
       </w:pPr>
       <w:r>
-        <w:t>A presence check makes sure a required field has not been left blank. A type check makes sure the data is of the right kind, for example that a number has been entered where a number is expected. A length check makes sure an entry is not longer than the field allows. A range check makes sure a number or date falls between sensible limits. A format check makes sure an entry follows a required pattern, such as a time being written as HH:MM. Finally a lookup check, sometimes called a referential check, makes sure that a chosen value actually exists in another table, for example that a screening is being created for a film that really exists. The tables below set out the validation applied to each input, grouped by the form it appears on.</w:t>
+        <w:t xml:space="preserve">A presence check makes sure a required field has not been left blank. A </w:t>
+      </w:r>
+      <w:proofErr w:type="gramStart"/>
+      <w:r>
+        <w:t>type</w:t>
+      </w:r>
+      <w:proofErr w:type="gramEnd"/>
+      <w:r>
+        <w:t xml:space="preserve"> check makes sure the data is of the right kind, for example that a number has been entered where a number is expected. A length check makes sure an entry is </w:t>
+      </w:r>
+      <w:proofErr w:type="spellStart"/>
+      <w:r>
+        <w:t>not longer</w:t>
+      </w:r>
+      <w:proofErr w:type="spellEnd"/>
+      <w:r>
+        <w:t xml:space="preserve"> than the field allows. A range check makes sure a number or date falls between sensible limits. A format check makes sure an entry follows a required pattern, such as a time being written as </w:t>
+      </w:r>
+      <w:proofErr w:type="gramStart"/>
+      <w:r>
+        <w:t>HH:MM.</w:t>
+      </w:r>
+      <w:proofErr w:type="gramEnd"/>
+      <w:r>
+        <w:t xml:space="preserve"> </w:t>
+      </w:r>
+      <w:proofErr w:type="gramStart"/>
+      <w:r>
+        <w:t>Finally</w:t>
+      </w:r>
+      <w:proofErr w:type="gramEnd"/>
+      <w:r>
+        <w:t xml:space="preserve"> a lookup check, sometimes called a referential check, makes sure that a chosen value </w:t>
+      </w:r>
+      <w:proofErr w:type="gramStart"/>
+      <w:r>
+        <w:t>actually exists</w:t>
+      </w:r>
+      <w:proofErr w:type="gramEnd"/>
+      <w:r>
+        <w:t xml:space="preserve"> in another table, for example that a screening is being created for a film that really exists. The tables below set out the validation applied to each input, grouped by the form it appears on.</w:t>
       </w:r>
     </w:p>
     <w:p>
@@ -9359,6 +10885,7 @@
             </w:tcMar>
           </w:tcPr>
           <w:p>
+            <w:proofErr w:type="spellStart"/>
             <w:r>
               <w:rPr>
                 <w:sz w:val="19"/>
@@ -9366,6 +10893,7 @@
               </w:rPr>
               <w:t>FilmTitle</w:t>
             </w:r>
+            <w:proofErr w:type="spellEnd"/>
           </w:p>
         </w:tc>
         <w:tc>
@@ -9441,6 +10969,7 @@
             </w:tcMar>
           </w:tcPr>
           <w:p>
+            <w:proofErr w:type="spellStart"/>
             <w:r>
               <w:rPr>
                 <w:sz w:val="19"/>
@@ -9448,6 +10977,7 @@
               </w:rPr>
               <w:t>FilmAgeRating</w:t>
             </w:r>
+            <w:proofErr w:type="spellEnd"/>
           </w:p>
         </w:tc>
         <w:tc>
@@ -9523,6 +11053,7 @@
             </w:tcMar>
           </w:tcPr>
           <w:p>
+            <w:proofErr w:type="spellStart"/>
             <w:r>
               <w:rPr>
                 <w:sz w:val="19"/>
@@ -9531,6 +11062,7 @@
               <w:lastRenderedPageBreak/>
               <w:t>FilmDuration</w:t>
             </w:r>
+            <w:proofErr w:type="spellEnd"/>
           </w:p>
         </w:tc>
         <w:tc>
@@ -9606,6 +11138,7 @@
             </w:tcMar>
           </w:tcPr>
           <w:p>
+            <w:proofErr w:type="spellStart"/>
             <w:r>
               <w:rPr>
                 <w:sz w:val="19"/>
@@ -9613,6 +11146,7 @@
               </w:rPr>
               <w:t>FilmDescription</w:t>
             </w:r>
+            <w:proofErr w:type="spellEnd"/>
           </w:p>
         </w:tc>
         <w:tc>
@@ -9829,6 +11363,7 @@
             </w:tcMar>
           </w:tcPr>
           <w:p>
+            <w:proofErr w:type="spellStart"/>
             <w:r>
               <w:rPr>
                 <w:sz w:val="19"/>
@@ -9836,6 +11371,7 @@
               </w:rPr>
               <w:t>ScreenName</w:t>
             </w:r>
+            <w:proofErr w:type="spellEnd"/>
           </w:p>
         </w:tc>
         <w:tc>
@@ -9911,6 +11447,7 @@
             </w:tcMar>
           </w:tcPr>
           <w:p>
+            <w:proofErr w:type="spellStart"/>
             <w:r>
               <w:rPr>
                 <w:sz w:val="19"/>
@@ -9918,6 +11455,7 @@
               </w:rPr>
               <w:t>ScreenCapacity</w:t>
             </w:r>
+            <w:proofErr w:type="spellEnd"/>
           </w:p>
         </w:tc>
         <w:tc>
@@ -10319,6 +11857,7 @@
             </w:tcMar>
           </w:tcPr>
           <w:p>
+            <w:proofErr w:type="spellStart"/>
             <w:r>
               <w:rPr>
                 <w:sz w:val="19"/>
@@ -10326,6 +11865,7 @@
               </w:rPr>
               <w:t>ScreeningDate</w:t>
             </w:r>
+            <w:proofErr w:type="spellEnd"/>
           </w:p>
         </w:tc>
         <w:tc>
@@ -10401,6 +11941,7 @@
             </w:tcMar>
           </w:tcPr>
           <w:p>
+            <w:proofErr w:type="spellStart"/>
             <w:r>
               <w:rPr>
                 <w:sz w:val="19"/>
@@ -10408,6 +11949,7 @@
               </w:rPr>
               <w:t>ScreeningTime</w:t>
             </w:r>
+            <w:proofErr w:type="spellEnd"/>
           </w:p>
         </w:tc>
         <w:tc>
@@ -10446,7 +11988,23 @@
                 <w:sz w:val="19"/>
                 <w:szCs w:val="19"/>
               </w:rPr>
-              <w:t>Must be a valid time in 24 hour HH:MM format</w:t>
+              <w:t xml:space="preserve">Must be a valid time in </w:t>
+            </w:r>
+            <w:proofErr w:type="gramStart"/>
+            <w:r>
+              <w:rPr>
+                <w:sz w:val="19"/>
+                <w:szCs w:val="19"/>
+              </w:rPr>
+              <w:t>24 hour</w:t>
+            </w:r>
+            <w:proofErr w:type="gramEnd"/>
+            <w:r>
+              <w:rPr>
+                <w:sz w:val="19"/>
+                <w:szCs w:val="19"/>
+              </w:rPr>
+              <w:t xml:space="preserve"> HH:MM format</w:t>
             </w:r>
           </w:p>
         </w:tc>
@@ -10483,6 +12041,7 @@
             </w:tcMar>
           </w:tcPr>
           <w:p>
+            <w:proofErr w:type="spellStart"/>
             <w:r>
               <w:rPr>
                 <w:sz w:val="19"/>
@@ -10490,6 +12049,7 @@
               </w:rPr>
               <w:t>TicketPrice</w:t>
             </w:r>
+            <w:proofErr w:type="spellEnd"/>
           </w:p>
         </w:tc>
         <w:tc>
@@ -10706,6 +12266,7 @@
             </w:tcMar>
           </w:tcPr>
           <w:p>
+            <w:proofErr w:type="spellStart"/>
             <w:r>
               <w:rPr>
                 <w:sz w:val="19"/>
@@ -10713,6 +12274,7 @@
               </w:rPr>
               <w:t>CustomerForename</w:t>
             </w:r>
+            <w:proofErr w:type="spellEnd"/>
           </w:p>
         </w:tc>
         <w:tc>
@@ -10788,6 +12350,7 @@
             </w:tcMar>
           </w:tcPr>
           <w:p>
+            <w:proofErr w:type="spellStart"/>
             <w:r>
               <w:rPr>
                 <w:sz w:val="19"/>
@@ -10795,6 +12358,7 @@
               </w:rPr>
               <w:t>CustomerSurname</w:t>
             </w:r>
+            <w:proofErr w:type="spellEnd"/>
           </w:p>
         </w:tc>
         <w:tc>
@@ -10870,6 +12434,7 @@
             </w:tcMar>
           </w:tcPr>
           <w:p>
+            <w:proofErr w:type="spellStart"/>
             <w:r>
               <w:rPr>
                 <w:sz w:val="19"/>
@@ -10877,6 +12442,7 @@
               </w:rPr>
               <w:t>CustomerEmail</w:t>
             </w:r>
+            <w:proofErr w:type="spellEnd"/>
           </w:p>
         </w:tc>
         <w:tc>
@@ -10952,6 +12518,7 @@
             </w:tcMar>
           </w:tcPr>
           <w:p>
+            <w:proofErr w:type="spellStart"/>
             <w:r>
               <w:rPr>
                 <w:sz w:val="19"/>
@@ -10959,6 +12526,7 @@
               </w:rPr>
               <w:t>CustomerPhone</w:t>
             </w:r>
+            <w:proofErr w:type="spellEnd"/>
           </w:p>
         </w:tc>
         <w:tc>

</xml_diff>

<commit_message>
added intro to the inputs outputs and ui in the Design doc
</commit_message>
<xml_diff>
--- a/Design.docx
+++ b/Design.docx
@@ -28,6 +28,127 @@
           <w:color w:val="A02B93" w:themeColor="accent5"/>
         </w:rPr>
         <w:t xml:space="preserve"> Project Design</w:t>
+      </w:r>
+    </w:p>
+    <w:p>
+      <w:pPr>
+        <w:pStyle w:val="Heading2"/>
+        <w:spacing w:before="260" w:after="120"/>
+      </w:pPr>
+      <w:r>
+        <w:rPr>
+          <w:rFonts w:ascii="Aptos Display" w:eastAsia="Aptos Display" w:hAnsi="Aptos Display" w:cs="Aptos Display"/>
+          <w:b/>
+          <w:bCs/>
+          <w:color w:val="000000"/>
+        </w:rPr>
+        <w:t>Inputs, Outputs and User Interface Design</w:t>
+      </w:r>
+    </w:p>
+    <w:p>
+      <w:pPr>
+        <w:spacing w:after="160" w:line="276" w:lineRule="auto"/>
+      </w:pPr>
+      <w:r>
+        <w:rPr>
+          <w:rFonts w:ascii="Aptos" w:eastAsia="Aptos" w:hAnsi="Aptos" w:cs="Aptos"/>
+        </w:rPr>
+        <w:t xml:space="preserve">The purpose of this section is to design the way that the user will interact with the </w:t>
+      </w:r>
+      <w:proofErr w:type="spellStart"/>
+      <w:r>
+        <w:rPr>
+          <w:rFonts w:ascii="Aptos" w:eastAsia="Aptos" w:hAnsi="Aptos" w:cs="Aptos"/>
+        </w:rPr>
+        <w:t>Filmtopia</w:t>
+      </w:r>
+      <w:proofErr w:type="spellEnd"/>
+      <w:r>
+        <w:rPr>
+          <w:rFonts w:ascii="Aptos" w:eastAsia="Aptos" w:hAnsi="Aptos" w:cs="Aptos"/>
+        </w:rPr>
+        <w:t xml:space="preserve"> system before any of it is actually built. In other words this is where I plan out every form the user will see, the information that goes into each one and the information that comes back out, so that when I move on to writing the code I already have a clear picture of what I am building rather than making it up as I go along. I have taken each objective in turn as a heading and described how the interface will behave for that objective, and for every form or report involved I have drawn a wireframe showing roughly where the labels, text boxes and buttons will sit. These drawings are deliberately kept simple so that it is obvious they are design sketches and not screenshots of a finished program.</w:t>
+      </w:r>
+    </w:p>
+    <w:p>
+      <w:pPr>
+        <w:spacing w:after="160" w:line="276" w:lineRule="auto"/>
+      </w:pPr>
+      <w:r>
+        <w:rPr>
+          <w:rFonts w:ascii="Aptos" w:eastAsia="Aptos" w:hAnsi="Aptos" w:cs="Aptos"/>
+        </w:rPr>
+        <w:t xml:space="preserve">Before going through the objectives one at a time it is worth explaining a couple of decisions that apply across the whole system. </w:t>
+      </w:r>
+      <w:proofErr w:type="spellStart"/>
+      <w:r>
+        <w:rPr>
+          <w:rFonts w:ascii="Aptos" w:eastAsia="Aptos" w:hAnsi="Aptos" w:cs="Aptos"/>
+        </w:rPr>
+        <w:t>Filmtopia</w:t>
+      </w:r>
+      <w:proofErr w:type="spellEnd"/>
+      <w:r>
+        <w:rPr>
+          <w:rFonts w:ascii="Aptos" w:eastAsia="Aptos" w:hAnsi="Aptos" w:cs="Aptos"/>
+        </w:rPr>
+        <w:t xml:space="preserve"> is built as a Windows Forms desktop application, so every screen is a form made up of standard controls such as text boxes, labels, buttons and data grids. I have chosen to name my controls using a short prefix that describes what each one is, for example txt for a text box, </w:t>
+      </w:r>
+      <w:proofErr w:type="spellStart"/>
+      <w:r>
+        <w:rPr>
+          <w:rFonts w:ascii="Aptos" w:eastAsia="Aptos" w:hAnsi="Aptos" w:cs="Aptos"/>
+        </w:rPr>
+        <w:t>btn</w:t>
+      </w:r>
+      <w:proofErr w:type="spellEnd"/>
+      <w:r>
+        <w:rPr>
+          <w:rFonts w:ascii="Aptos" w:eastAsia="Aptos" w:hAnsi="Aptos" w:cs="Aptos"/>
+        </w:rPr>
+        <w:t xml:space="preserve"> for a button, </w:t>
+      </w:r>
+      <w:proofErr w:type="spellStart"/>
+      <w:r>
+        <w:rPr>
+          <w:rFonts w:ascii="Aptos" w:eastAsia="Aptos" w:hAnsi="Aptos" w:cs="Aptos"/>
+        </w:rPr>
+        <w:t>lbl</w:t>
+      </w:r>
+      <w:proofErr w:type="spellEnd"/>
+      <w:r>
+        <w:rPr>
+          <w:rFonts w:ascii="Aptos" w:eastAsia="Aptos" w:hAnsi="Aptos" w:cs="Aptos"/>
+        </w:rPr>
+        <w:t xml:space="preserve"> for a label, </w:t>
+      </w:r>
+      <w:proofErr w:type="spellStart"/>
+      <w:r>
+        <w:rPr>
+          <w:rFonts w:ascii="Aptos" w:eastAsia="Aptos" w:hAnsi="Aptos" w:cs="Aptos"/>
+        </w:rPr>
+        <w:t>cbo</w:t>
+      </w:r>
+      <w:proofErr w:type="spellEnd"/>
+      <w:r>
+        <w:rPr>
+          <w:rFonts w:ascii="Aptos" w:eastAsia="Aptos" w:hAnsi="Aptos" w:cs="Aptos"/>
+        </w:rPr>
+        <w:t xml:space="preserve"> for a combo box and </w:t>
+      </w:r>
+      <w:proofErr w:type="spellStart"/>
+      <w:r>
+        <w:rPr>
+          <w:rFonts w:ascii="Aptos" w:eastAsia="Aptos" w:hAnsi="Aptos" w:cs="Aptos"/>
+        </w:rPr>
+        <w:t>dgv</w:t>
+      </w:r>
+      <w:proofErr w:type="spellEnd"/>
+      <w:r>
+        <w:rPr>
+          <w:rFonts w:ascii="Aptos" w:eastAsia="Aptos" w:hAnsi="Aptos" w:cs="Aptos"/>
+        </w:rPr>
+        <w:t xml:space="preserve"> for a data grid view, followed by a word describing its job. This is because a consistent naming convention makes the code far easier to read later on and stops me getting confused between similarly named items. I have also decided not to worry too much about the finer details of colour at this stage, this is because the guidance makes clear that the interface will be refined after the prototype in section 5.2, so it makes sense to settle the layout and the flow first and then tidy up the appearance once I know everything works.</w:t>
       </w:r>
     </w:p>
     <w:p>
@@ -176,7 +297,6 @@
         <w:spacing w:after="160" w:line="276" w:lineRule="auto"/>
       </w:pPr>
       <w:r>
-        <w:lastRenderedPageBreak/>
         <w:t xml:space="preserve">The way to resolve a many to many relationship is to create a new link table that sits between the two original entities, turning the single many to many relationship into two separate one to many relationships. For the booking and seat relationship this link table is </w:t>
       </w:r>
       <w:proofErr w:type="spellStart"/>
@@ -290,11 +410,7 @@
       </w:r>
       <w:proofErr w:type="spellEnd"/>
       <w:r>
-        <w:t xml:space="preserve"> as a foreign key, because one screening can have many bookings. The same pattern is followed throughout, which keeps every relationship as a clean one to many. The structure is normalised to third normal form because every non key field in each table depends only on the whole of that table's primary key, with no field depending on another non key field and no repeating groups of data anywhere in the design. Three further tables exist in the system that do not appear in this diagram because </w:t>
-      </w:r>
-      <w:r>
-        <w:lastRenderedPageBreak/>
-        <w:t xml:space="preserve">they are standalone and not related to the others through foreign keys. These are </w:t>
+        <w:t xml:space="preserve"> as a foreign key, because one screening can have many bookings. The same pattern is followed throughout, which keeps every relationship as a clean one to many. The structure is normalised to third normal form because every non key field in each table depends only on the whole of that table's primary key, with no field depending on another non key field and no repeating groups of data anywhere in the design. Three further tables exist in the system that do not appear in this diagram because they are standalone and not related to the others through foreign keys. These are </w:t>
       </w:r>
       <w:proofErr w:type="spellStart"/>
       <w:r>
@@ -599,7 +715,6 @@
                 <w:sz w:val="19"/>
                 <w:szCs w:val="19"/>
               </w:rPr>
-              <w:lastRenderedPageBreak/>
               <w:t>FilmID</w:t>
             </w:r>
             <w:proofErr w:type="spellEnd"/>
@@ -4094,7 +4209,6 @@
                 <w:sz w:val="19"/>
                 <w:szCs w:val="19"/>
               </w:rPr>
-              <w:lastRenderedPageBreak/>
               <w:t>ScreeningID</w:t>
             </w:r>
             <w:proofErr w:type="spellEnd"/>
@@ -5689,7 +5803,6 @@
                 <w:sz w:val="19"/>
                 <w:szCs w:val="19"/>
               </w:rPr>
-              <w:lastRenderedPageBreak/>
               <w:t>OrderItemID</w:t>
             </w:r>
             <w:proofErr w:type="spellEnd"/>
@@ -7278,7 +7391,6 @@
           <w:bCs/>
           <w:color w:val="000000" w:themeColor="text1"/>
         </w:rPr>
-        <w:lastRenderedPageBreak/>
         <w:t>tblVersionControl</w:t>
       </w:r>
       <w:proofErr w:type="spellEnd"/>
@@ -7865,7 +7977,6 @@
           <w:bCs/>
           <w:color w:val="000000" w:themeColor="text1"/>
         </w:rPr>
-        <w:lastRenderedPageBreak/>
         <w:t xml:space="preserve">Automatic Seat </w:t>
       </w:r>
       <w:r>
@@ -8581,7 +8692,6 @@
                 <w:sz w:val="19"/>
                 <w:szCs w:val="19"/>
               </w:rPr>
-              <w:lastRenderedPageBreak/>
               <w:t xml:space="preserve">INSERT a new record into </w:t>
             </w:r>
             <w:proofErr w:type="spellStart"/>
@@ -9292,7 +9402,6 @@
           <w:bCs/>
           <w:color w:val="000000" w:themeColor="text1"/>
         </w:rPr>
-        <w:lastRenderedPageBreak/>
         <w:t>Generating a Sales Report (Objective 8)</w:t>
       </w:r>
     </w:p>
@@ -10024,7 +10133,6 @@
                 <w:sz w:val="19"/>
                 <w:szCs w:val="19"/>
               </w:rPr>
-              <w:lastRenderedPageBreak/>
               <w:t xml:space="preserve">    DELETE the record in </w:t>
             </w:r>
             <w:proofErr w:type="spellStart"/>
@@ -10781,7 +10889,6 @@
                 <w:sz w:val="19"/>
                 <w:szCs w:val="19"/>
               </w:rPr>
-              <w:lastRenderedPageBreak/>
               <w:t>FilmDuration</w:t>
             </w:r>
             <w:proofErr w:type="spellEnd"/>
@@ -12317,7 +12424,6 @@
           <w:bCs/>
           <w:color w:val="000000" w:themeColor="text1"/>
         </w:rPr>
-        <w:lastRenderedPageBreak/>
         <w:t>Seat Selection and Food Order (Booking)</w:t>
       </w:r>
     </w:p>
@@ -13020,6 +13126,7 @@
         <w:docPartUnique/>
       </w:docPartObj>
     </w:sdtPr>
+    <w:sdtEndPr/>
     <w:sdtContent>
       <w:p>
         <w:pPr>

</xml_diff>

<commit_message>
added description for objective 10 in design doc
</commit_message>
<xml_diff>
--- a/Design.docx
+++ b/Design.docx
@@ -11,23 +11,13 @@
           <w:color w:val="A02B93" w:themeColor="accent5"/>
         </w:rPr>
       </w:pPr>
-      <w:proofErr w:type="spellStart"/>
       <w:r>
         <w:rPr>
           <w:b/>
           <w:bCs/>
           <w:color w:val="A02B93" w:themeColor="accent5"/>
         </w:rPr>
-        <w:t>Filmtopia</w:t>
-      </w:r>
-      <w:proofErr w:type="spellEnd"/>
-      <w:r>
-        <w:rPr>
-          <w:b/>
-          <w:bCs/>
-          <w:color w:val="A02B93" w:themeColor="accent5"/>
-        </w:rPr>
-        <w:t xml:space="preserve"> Project Design</w:t>
+        <w:t>Filmtopia Project Design</w:t>
       </w:r>
     </w:p>
     <w:p>
@@ -53,21 +43,36 @@
         <w:rPr>
           <w:rFonts w:ascii="Aptos" w:eastAsia="Aptos" w:hAnsi="Aptos" w:cs="Aptos"/>
         </w:rPr>
-        <w:t xml:space="preserve">The purpose of this section is to design the way that the user will interact with the </w:t>
+        <w:t>The purpose of this section is to design the way that the user will interact with the Filmtopia system before any of it is actually built. In other words this is where I plan out every form the user will see, the information that goes into each one and the information that comes back out, so that when I move on to writing the code I already have a clear picture of what I am building rather than making it up as I go along. I have taken each objective in turn as a heading and described how the interface will behave for that objective, and for every form or report involved I have drawn a wireframe showing roughly where the labels, text boxes and buttons will sit. These drawings are deliberately kept simple so that it is obvious they are design sketches and not screenshots of a finished program.</w:t>
       </w:r>
-      <w:proofErr w:type="spellStart"/>
+    </w:p>
+    <w:p>
+      <w:pPr>
+        <w:spacing w:after="160" w:line="276" w:lineRule="auto"/>
+        <w:rPr>
+          <w:rFonts w:ascii="Aptos" w:eastAsia="Aptos" w:hAnsi="Aptos" w:cs="Aptos"/>
+        </w:rPr>
+      </w:pPr>
       <w:r>
         <w:rPr>
           <w:rFonts w:ascii="Aptos" w:eastAsia="Aptos" w:hAnsi="Aptos" w:cs="Aptos"/>
         </w:rPr>
-        <w:t>Filmtopia</w:t>
+        <w:t>Before going through the objectives one at a time it is worth explaining a couple of decisions that apply across the whole system. Filmtopia is built as a Windows Forms desktop application, so every screen is a form made up of standard controls such as text boxes, labels, buttons and data grids. I have chosen to name my controls using a short prefix that describes what each one is, for example txt for a text box, btn for a button, lbl for a label, cbo for a combo box and dgv for a data grid view, followed by a word describing its job. This is because a consistent naming convention makes the code far easier to read later on and stops me getting confused between similarly named items. I have also decided not to worry too much about the finer details of colour at this stage, this is because the guidance makes clear that the interface will be refined after the prototype in section 5.2, so it makes sense to settle the layout and the flow first and then tidy up the appearance once I know everything works.</w:t>
       </w:r>
-      <w:proofErr w:type="spellEnd"/>
+    </w:p>
+    <w:p>
+      <w:pPr>
+        <w:pStyle w:val="Heading3"/>
+        <w:spacing w:before="260" w:after="120"/>
+      </w:pPr>
       <w:r>
         <w:rPr>
-          <w:rFonts w:ascii="Aptos" w:eastAsia="Aptos" w:hAnsi="Aptos" w:cs="Aptos"/>
+          <w:rFonts w:ascii="Aptos Display" w:eastAsia="Aptos Display" w:hAnsi="Aptos Display" w:cs="Aptos Display"/>
+          <w:b/>
+          <w:bCs/>
+          <w:color w:val="000000"/>
         </w:rPr>
-        <w:t xml:space="preserve"> system before any of it is actually built. In other words this is where I plan out every form the user will see, the information that goes into each one and the information that comes back out, so that when I move on to writing the code I already have a clear picture of what I am building rather than making it up as I go along. I have taken each objective in turn as a heading and described how the interface will behave for that objective, and for every form or report involved I have drawn a wireframe showing roughly where the labels, text boxes and buttons will sit. These drawings are deliberately kept simple so that it is obvious they are design sketches and not screenshots of a finished program.</w:t>
+        <w:t>User Login and Access Levels (Objective 10)</w:t>
       </w:r>
     </w:p>
     <w:p>
@@ -78,77 +83,116 @@
         <w:rPr>
           <w:rFonts w:ascii="Aptos" w:eastAsia="Aptos" w:hAnsi="Aptos" w:cs="Aptos"/>
         </w:rPr>
-        <w:t xml:space="preserve">Before going through the objectives one at a time it is worth explaining a couple of decisions that apply across the whole system. </w:t>
+        <w:t>The first thing any user meets when they open Filmtopia is the login screen, so this is where the design naturally starts. The objective here is to make sure that customers, staff and managers are not all able to do the same things, because a normal member of staff being able to reach the manager's sales reports or the audit log would be a serious security weakness. To achieve this the system asks for a username and a password on a small login form, checks them against the tblLogin table, and reads back an access level number that then decides what the user is allowed to see.</w:t>
       </w:r>
-      <w:proofErr w:type="spellStart"/>
+    </w:p>
+    <w:p>
+      <w:pPr>
+        <w:spacing w:after="160" w:line="276" w:lineRule="auto"/>
+      </w:pPr>
       <w:r>
         <w:rPr>
           <w:rFonts w:ascii="Aptos" w:eastAsia="Aptos" w:hAnsi="Aptos" w:cs="Aptos"/>
         </w:rPr>
-        <w:t>Filmtopia</w:t>
+        <w:t xml:space="preserve">The login form itself is deliberately kept small and uncomplicated. It has a header panel across the top showing the name Filmtopia and the subtitle Cinema Management System </w:t>
       </w:r>
-      <w:proofErr w:type="spellEnd"/>
       <w:r>
         <w:rPr>
           <w:rFonts w:ascii="Aptos" w:eastAsia="Aptos" w:hAnsi="Aptos" w:cs="Aptos"/>
         </w:rPr>
-        <w:t xml:space="preserve"> is built as a Windows Forms desktop application, so every screen is a form made up of standard controls such as text boxes, labels, buttons and data grids. I have chosen to name my controls using a short prefix that describes what each one is, for example txt for a text box, </w:t>
+        <w:lastRenderedPageBreak/>
+        <w:t>so the user knows straight away what they are logging into. Below that are two labels, Username and Password, each sitting next to its own text box, which I have named txtUsername and txtPassword. The password box will have its characters masked so that anyone standing nearby cannot read what is being typed. Underneath the boxes are two buttons, a Log In button named btnLogin which carries out the check, and a Cancel button named btnClose which closes the program if the user changes their mind. A small version label sits at the very bottom of the form.</w:t>
       </w:r>
-      <w:proofErr w:type="spellStart"/>
+    </w:p>
+    <w:p>
+      <w:pPr>
+        <w:pBdr>
+          <w:top w:val="single" w:sz="6" w:space="6" w:color="A02B93"/>
+          <w:left w:val="single" w:sz="6" w:space="6" w:color="A02B93"/>
+          <w:bottom w:val="single" w:sz="6" w:space="6" w:color="A02B93"/>
+          <w:right w:val="single" w:sz="6" w:space="6" w:color="A02B93"/>
+        </w:pBdr>
+        <w:shd w:val="clear" w:color="auto" w:fill="F7E9F3"/>
+        <w:spacing w:before="120" w:after="200"/>
+      </w:pPr>
+      <w:r>
+        <w:rPr>
+          <w:rFonts w:ascii="Aptos" w:eastAsia="Aptos" w:hAnsi="Aptos" w:cs="Aptos"/>
+          <w:b/>
+          <w:bCs/>
+          <w:color w:val="A02B93"/>
+          <w:sz w:val="22"/>
+          <w:szCs w:val="22"/>
+        </w:rPr>
+        <w:t>Login Form (frmLogin)</w:t>
+      </w:r>
+    </w:p>
+    <w:p>
+      <w:pPr>
+        <w:spacing w:after="160" w:line="276" w:lineRule="auto"/>
+      </w:pPr>
       <w:r>
         <w:rPr>
           <w:rFonts w:ascii="Aptos" w:eastAsia="Aptos" w:hAnsi="Aptos" w:cs="Aptos"/>
         </w:rPr>
-        <w:t>btn</w:t>
+        <w:t>The only input to this form is the username and password typed by the user. The output, once the button is pressed, is either entry into the main menu or a message box telling the user that their details were not recognised. The process that happens in between is a lookup against the tblLogin table for a matching username, a comparison of the stored password, and if everything matches, the storing of that user's access level in a variable called UserAccessLevel that the rest of the program can read. I have chosen buttons here rather than, for example, expecting the user to press the Enter key, this is because a clearly labelled Log In button leaves no doubt about what to do and is friendlier for staff who are not especially technical.</w:t>
       </w:r>
-      <w:proofErr w:type="spellEnd"/>
+    </w:p>
+    <w:p>
+      <w:pPr>
+        <w:spacing w:after="160" w:line="276" w:lineRule="auto"/>
+      </w:pPr>
       <w:r>
         <w:rPr>
           <w:rFonts w:ascii="Aptos" w:eastAsia="Aptos" w:hAnsi="Aptos" w:cs="Aptos"/>
         </w:rPr>
-        <w:t xml:space="preserve"> for a button, </w:t>
+        <w:t>Once a user has logged in successfully they are taken to the main menu, which is the form named frmMainForm and acts as the hub for the whole system. Every other part of Filmtopia is reached from here by pressing a button, which I felt was a far more sophisticated and easier to follow approach than burying features inside drop-down menus that a busy member of staff would have to go hunting through. The menu shows a welcome message at the top and then a column of buttons down the content area, one for each area of the system, for example Bookings, Find Booking, Screenings, Films, Screens, Food, Reports, Customers, Logs and a Logout button.</w:t>
       </w:r>
-      <w:proofErr w:type="spellStart"/>
+    </w:p>
+    <w:p>
+      <w:pPr>
+        <w:spacing w:after="160" w:line="276" w:lineRule="auto"/>
+      </w:pPr>
       <w:r>
         <w:rPr>
           <w:rFonts w:ascii="Aptos" w:eastAsia="Aptos" w:hAnsi="Aptos" w:cs="Aptos"/>
         </w:rPr>
-        <w:t>lbl</w:t>
+        <w:t>What makes this form important for the objective is that the buttons shown depend entirely on the access level that was read at login. This is because a manager, whose access level is 1, needs to see everything, whereas a normal member of staff, whose access level is 2, should only see the day to day booking functions. When a manager logs in the group box is titled Filmtopia Admin and the management buttons for Films, Screens, Food, Reports and Logs are all made visible. When a member of staff logs in those same buttons are hidden and the group box is titled Filmtopia Staff, leaving them with just the booking related functions. In this way a single form quietly enforces the whole access level objective without the staff member ever seeing an option they are not allowed to use.</w:t>
       </w:r>
-      <w:proofErr w:type="spellEnd"/>
+    </w:p>
+    <w:p>
+      <w:pPr>
+        <w:pBdr>
+          <w:top w:val="single" w:sz="6" w:space="6" w:color="A02B93"/>
+          <w:left w:val="single" w:sz="6" w:space="6" w:color="A02B93"/>
+          <w:bottom w:val="single" w:sz="6" w:space="6" w:color="A02B93"/>
+          <w:right w:val="single" w:sz="6" w:space="6" w:color="A02B93"/>
+        </w:pBdr>
+        <w:shd w:val="clear" w:color="auto" w:fill="F7E9F3"/>
+        <w:spacing w:before="120" w:after="200"/>
+      </w:pPr>
+      <w:r>
+        <w:rPr>
+          <w:rFonts w:ascii="Aptos" w:eastAsia="Aptos" w:hAnsi="Aptos" w:cs="Aptos"/>
+          <w:b/>
+          <w:bCs/>
+          <w:color w:val="A02B93"/>
+          <w:sz w:val="22"/>
+          <w:szCs w:val="22"/>
+        </w:rPr>
+        <w:lastRenderedPageBreak/>
+        <w:t>Main Menu (frmMainForm)</w:t>
+      </w:r>
+    </w:p>
+    <w:p>
+      <w:pPr>
+        <w:spacing w:after="160" w:line="276" w:lineRule="auto"/>
+      </w:pPr>
       <w:r>
         <w:rPr>
           <w:rFonts w:ascii="Aptos" w:eastAsia="Aptos" w:hAnsi="Aptos" w:cs="Aptos"/>
         </w:rPr>
-        <w:t xml:space="preserve"> for a label, </w:t>
-      </w:r>
-      <w:proofErr w:type="spellStart"/>
-      <w:r>
-        <w:rPr>
-          <w:rFonts w:ascii="Aptos" w:eastAsia="Aptos" w:hAnsi="Aptos" w:cs="Aptos"/>
-        </w:rPr>
-        <w:t>cbo</w:t>
-      </w:r>
-      <w:proofErr w:type="spellEnd"/>
-      <w:r>
-        <w:rPr>
-          <w:rFonts w:ascii="Aptos" w:eastAsia="Aptos" w:hAnsi="Aptos" w:cs="Aptos"/>
-        </w:rPr>
-        <w:t xml:space="preserve"> for a combo box and </w:t>
-      </w:r>
-      <w:proofErr w:type="spellStart"/>
-      <w:r>
-        <w:rPr>
-          <w:rFonts w:ascii="Aptos" w:eastAsia="Aptos" w:hAnsi="Aptos" w:cs="Aptos"/>
-        </w:rPr>
-        <w:t>dgv</w:t>
-      </w:r>
-      <w:proofErr w:type="spellEnd"/>
-      <w:r>
-        <w:rPr>
-          <w:rFonts w:ascii="Aptos" w:eastAsia="Aptos" w:hAnsi="Aptos" w:cs="Aptos"/>
-        </w:rPr>
-        <w:t xml:space="preserve"> for a data grid view, followed by a word describing its job. This is because a consistent naming convention makes the code far easier to read later on and stops me getting confused between similarly named items. I have also decided not to worry too much about the finer details of colour at this stage, this is because the guidance makes clear that the interface will be refined after the prototype in section 5.2, so it makes sense to settle the layout and the flow first and then tidy up the appearance once I know everything works.</w:t>
+        <w:t>The input to the main menu is simply the button the user chooses to press. The output is the opening of whichever form that button is linked to. There is no data entry on this screen at all, this is because its only job is navigation, and keeping it free of clutter makes it obvious where everything lives.</w:t>
       </w:r>
     </w:p>
     <w:p>
@@ -174,23 +218,7 @@
         <w:spacing w:after="160" w:line="276" w:lineRule="auto"/>
       </w:pPr>
       <w:r>
-        <w:t xml:space="preserve">The purpose of this section is to specify the data structures that the </w:t>
-      </w:r>
-      <w:proofErr w:type="spellStart"/>
-      <w:r>
-        <w:t>Filmtopia</w:t>
-      </w:r>
-      <w:proofErr w:type="spellEnd"/>
-      <w:r>
-        <w:t xml:space="preserve"> system will use to store its data. As the system is built around a Microsoft Access database accessed through </w:t>
-      </w:r>
-      <w:proofErr w:type="spellStart"/>
-      <w:r>
-        <w:t>OleDb</w:t>
-      </w:r>
-      <w:proofErr w:type="spellEnd"/>
-      <w:r>
-        <w:t>, these data structures take the form of database tables rather than arrays or other in memory structures. Each table and the relationships between them are described below, along with the way the data in those tables will be accessed. A key aim throughout the design has been to make sure the table structure is fully normalised to third normal form so that data is never repeated unnecessarily and the database cannot end up in an inconsistent state.</w:t>
+        <w:t>The purpose of this section is to specify the data structures that the Filmtopia system will use to store its data. As the system is built around a Microsoft Access database accessed through OleDb, these data structures take the form of database tables rather than arrays or other in memory structures. Each table and the relationships between them are described below, along with the way the data in those tables will be accessed. A key aim throughout the design has been to make sure the table structure is fully normalised to third normal form so that data is never repeated unnecessarily and the database cannot end up in an inconsistent state.</w:t>
       </w:r>
     </w:p>
     <w:p>
@@ -297,23 +325,7 @@
         <w:spacing w:after="160" w:line="276" w:lineRule="auto"/>
       </w:pPr>
       <w:r>
-        <w:t xml:space="preserve">The way to resolve a many to many relationship is to create a new link table that sits between the two original entities, turning the single many to many relationship into two separate one to many relationships. For the booking and seat relationship this link table is </w:t>
-      </w:r>
-      <w:proofErr w:type="spellStart"/>
-      <w:r>
-        <w:t>tblBookingSeat</w:t>
-      </w:r>
-      <w:proofErr w:type="spellEnd"/>
-      <w:r>
-        <w:t xml:space="preserve">, and for the booking and food item relationship it is </w:t>
-      </w:r>
-      <w:proofErr w:type="spellStart"/>
-      <w:r>
-        <w:t>tblOrderItem</w:t>
-      </w:r>
-      <w:proofErr w:type="spellEnd"/>
-      <w:r>
-        <w:t>. Each link table holds its own primary key along with the two foreign keys that point back to the tables it joins. The diagram below shows the final design once these link tables have been added, with the primary key of each table shown in bold and the foreign keys shown in italics.</w:t>
+        <w:t>The way to resolve a many to many relationship is to create a new link table that sits between the two original entities, turning the single many to many relationship into two separate one to many relationships. For the booking and seat relationship this link table is tblBookingSeat, and for the booking and food item relationship it is tblOrderItem. Each link table holds its own primary key along with the two foreign keys that point back to the tables it joins. The diagram below shows the final design once these link tables have been added, with the primary key of each table shown in bold and the foreign keys shown in italics.</w:t>
       </w:r>
     </w:p>
     <w:p>
@@ -386,55 +398,7 @@
         <w:spacing w:after="160" w:line="276" w:lineRule="auto"/>
       </w:pPr>
       <w:r>
-        <w:t xml:space="preserve">In this final design the foreign keys are produced by copying the primary key from the one end of each relationship to the many end. For example the </w:t>
-      </w:r>
-      <w:proofErr w:type="spellStart"/>
-      <w:r>
-        <w:t>ScreeningID</w:t>
-      </w:r>
-      <w:proofErr w:type="spellEnd"/>
-      <w:r>
-        <w:t xml:space="preserve"> primary key from </w:t>
-      </w:r>
-      <w:proofErr w:type="spellStart"/>
-      <w:r>
-        <w:t>tblScreening</w:t>
-      </w:r>
-      <w:proofErr w:type="spellEnd"/>
-      <w:r>
-        <w:t xml:space="preserve"> is copied into </w:t>
-      </w:r>
-      <w:proofErr w:type="spellStart"/>
-      <w:r>
-        <w:t>tblBooking</w:t>
-      </w:r>
-      <w:proofErr w:type="spellEnd"/>
-      <w:r>
-        <w:t xml:space="preserve"> as a foreign key, because one screening can have many bookings. The same pattern is followed throughout, which keeps every relationship as a clean one to many. The structure is normalised to third normal form because every non key field in each table depends only on the whole of that table's primary key, with no field depending on another non key field and no repeating groups of data anywhere in the design. Three further tables exist in the system that do not appear in this diagram because they are standalone and not related to the others through foreign keys. These are </w:t>
-      </w:r>
-      <w:proofErr w:type="spellStart"/>
-      <w:r>
-        <w:t>tblLogin</w:t>
-      </w:r>
-      <w:proofErr w:type="spellEnd"/>
-      <w:r>
-        <w:t xml:space="preserve">, which holds the user accounts, </w:t>
-      </w:r>
-      <w:proofErr w:type="spellStart"/>
-      <w:r>
-        <w:t>tblLogs</w:t>
-      </w:r>
-      <w:proofErr w:type="spellEnd"/>
-      <w:r>
-        <w:t xml:space="preserve">, which records system events, and </w:t>
-      </w:r>
-      <w:proofErr w:type="spellStart"/>
-      <w:r>
-        <w:t>tblVersionControl</w:t>
-      </w:r>
-      <w:proofErr w:type="spellEnd"/>
-      <w:r>
-        <w:t>, which holds the application version. They are included in the table designs below for completeness.</w:t>
+        <w:t>In this final design the foreign keys are produced by copying the primary key from the one end of each relationship to the many end. For example the ScreeningID primary key from tblScreening is copied into tblBooking as a foreign key, because one screening can have many bookings. The same pattern is followed throughout, which keeps every relationship as a clean one to many. The structure is normalised to third normal form because every non key field in each table depends only on the whole of that table's primary key, with no field depending on another non key field and no repeating groups of data anywhere in the design. Three further tables exist in the system that do not appear in this diagram because they are standalone and not related to the others through foreign keys. These are tblLogin, which holds the user accounts, tblLogs, which records system events, and tblVersionControl, which holds the application version. They are included in the table designs below for completeness.</w:t>
       </w:r>
     </w:p>
     <w:p>
@@ -494,23 +458,7 @@
         <w:spacing w:after="160" w:line="276" w:lineRule="auto"/>
       </w:pPr>
       <w:r>
-        <w:t xml:space="preserve">The </w:t>
-      </w:r>
-      <w:proofErr w:type="spellStart"/>
-      <w:r>
-        <w:t>Filmtopia</w:t>
-      </w:r>
-      <w:proofErr w:type="spellEnd"/>
-      <w:r>
-        <w:t xml:space="preserve"> tables are stored within a Microsoft Access database and are accessed from the Visual Basic .NET application using SQL queries sent through an </w:t>
-      </w:r>
-      <w:proofErr w:type="spellStart"/>
-      <w:r>
-        <w:t>OleDb</w:t>
-      </w:r>
-      <w:proofErr w:type="spellEnd"/>
-      <w:r>
-        <w:t xml:space="preserve"> connection, specifically SELECT, INSERT, UPDATE and DELETE queries. The database management system stores the tables as direct access files and maintains indexes on the primary keys so that looking a record up by its primary key is fast and does not require reading through every record. Where a search is carried out on a field that is not indexed, the database falls back to a sequential search through the table.</w:t>
+        <w:t>The Filmtopia tables are stored within a Microsoft Access database and are accessed from the Visual Basic .NET application using SQL queries sent through an OleDb connection, specifically SELECT, INSERT, UPDATE and DELETE queries. The database management system stores the tables as direct access files and maintains indexes on the primary keys so that looking a record up by its primary key is fast and does not require reading through every record. Where a search is carried out on a field that is not indexed, the database falls back to a sequential search through the table.</w:t>
       </w:r>
     </w:p>
     <w:p>
@@ -522,7 +470,6 @@
           <w:color w:val="000000" w:themeColor="text1"/>
         </w:rPr>
       </w:pPr>
-      <w:proofErr w:type="spellStart"/>
       <w:r>
         <w:rPr>
           <w:b/>
@@ -531,7 +478,6 @@
         </w:rPr>
         <w:t>tblFilm</w:t>
       </w:r>
-      <w:proofErr w:type="spellEnd"/>
     </w:p>
     <w:p>
       <w:pPr>
@@ -709,7 +655,6 @@
             </w:tcMar>
           </w:tcPr>
           <w:p>
-            <w:proofErr w:type="spellStart"/>
             <w:r>
               <w:rPr>
                 <w:sz w:val="19"/>
@@ -717,7 +662,6 @@
               </w:rPr>
               <w:t>FilmID</w:t>
             </w:r>
-            <w:proofErr w:type="spellEnd"/>
           </w:p>
         </w:tc>
         <w:tc>
@@ -805,7 +749,6 @@
             </w:tcMar>
           </w:tcPr>
           <w:p>
-            <w:proofErr w:type="spellStart"/>
             <w:r>
               <w:rPr>
                 <w:sz w:val="19"/>
@@ -813,7 +756,6 @@
               </w:rPr>
               <w:t>FilmTitle</w:t>
             </w:r>
-            <w:proofErr w:type="spellEnd"/>
           </w:p>
         </w:tc>
         <w:tc>
@@ -909,7 +851,6 @@
             </w:tcMar>
           </w:tcPr>
           <w:p>
-            <w:proofErr w:type="spellStart"/>
             <w:r>
               <w:rPr>
                 <w:sz w:val="19"/>
@@ -917,7 +858,6 @@
               </w:rPr>
               <w:t>FilmAgeRating</w:t>
             </w:r>
-            <w:proofErr w:type="spellEnd"/>
           </w:p>
         </w:tc>
         <w:tc>
@@ -1013,7 +953,6 @@
             </w:tcMar>
           </w:tcPr>
           <w:p>
-            <w:proofErr w:type="spellStart"/>
             <w:r>
               <w:rPr>
                 <w:sz w:val="19"/>
@@ -1021,7 +960,6 @@
               </w:rPr>
               <w:t>FilmDuration</w:t>
             </w:r>
-            <w:proofErr w:type="spellEnd"/>
           </w:p>
         </w:tc>
         <w:tc>
@@ -1109,7 +1047,6 @@
             </w:tcMar>
           </w:tcPr>
           <w:p>
-            <w:proofErr w:type="spellStart"/>
             <w:r>
               <w:rPr>
                 <w:sz w:val="19"/>
@@ -1117,7 +1054,6 @@
               </w:rPr>
               <w:t>FilmDescription</w:t>
             </w:r>
-            <w:proofErr w:type="spellEnd"/>
           </w:p>
         </w:tc>
         <w:tc>
@@ -1216,7 +1152,6 @@
           <w:color w:val="000000" w:themeColor="text1"/>
         </w:rPr>
       </w:pPr>
-      <w:proofErr w:type="spellStart"/>
       <w:r>
         <w:rPr>
           <w:b/>
@@ -1225,7 +1160,6 @@
         </w:rPr>
         <w:t>tblScreen</w:t>
       </w:r>
-      <w:proofErr w:type="spellEnd"/>
     </w:p>
     <w:p>
       <w:pPr>
@@ -1403,7 +1337,6 @@
             </w:tcMar>
           </w:tcPr>
           <w:p>
-            <w:proofErr w:type="spellStart"/>
             <w:r>
               <w:rPr>
                 <w:sz w:val="19"/>
@@ -1411,7 +1344,6 @@
               </w:rPr>
               <w:t>ScreenID</w:t>
             </w:r>
-            <w:proofErr w:type="spellEnd"/>
           </w:p>
         </w:tc>
         <w:tc>
@@ -1499,7 +1431,6 @@
             </w:tcMar>
           </w:tcPr>
           <w:p>
-            <w:proofErr w:type="spellStart"/>
             <w:r>
               <w:rPr>
                 <w:sz w:val="19"/>
@@ -1507,7 +1438,6 @@
               </w:rPr>
               <w:t>ScreenName</w:t>
             </w:r>
-            <w:proofErr w:type="spellEnd"/>
           </w:p>
         </w:tc>
         <w:tc>
@@ -1603,7 +1533,6 @@
             </w:tcMar>
           </w:tcPr>
           <w:p>
-            <w:proofErr w:type="spellStart"/>
             <w:r>
               <w:rPr>
                 <w:sz w:val="19"/>
@@ -1611,7 +1540,6 @@
               </w:rPr>
               <w:t>ScreenCapacity</w:t>
             </w:r>
-            <w:proofErr w:type="spellEnd"/>
           </w:p>
         </w:tc>
         <w:tc>
@@ -1702,7 +1630,6 @@
           <w:color w:val="000000" w:themeColor="text1"/>
         </w:rPr>
       </w:pPr>
-      <w:proofErr w:type="spellStart"/>
       <w:r>
         <w:rPr>
           <w:b/>
@@ -1711,7 +1638,6 @@
         </w:rPr>
         <w:t>tblScreening</w:t>
       </w:r>
-      <w:proofErr w:type="spellEnd"/>
     </w:p>
     <w:p>
       <w:pPr>
@@ -1889,7 +1815,6 @@
             </w:tcMar>
           </w:tcPr>
           <w:p>
-            <w:proofErr w:type="spellStart"/>
             <w:r>
               <w:rPr>
                 <w:sz w:val="19"/>
@@ -1897,7 +1822,6 @@
               </w:rPr>
               <w:t>ScreeningID</w:t>
             </w:r>
-            <w:proofErr w:type="spellEnd"/>
           </w:p>
         </w:tc>
         <w:tc>
@@ -1985,7 +1909,6 @@
             </w:tcMar>
           </w:tcPr>
           <w:p>
-            <w:proofErr w:type="spellStart"/>
             <w:r>
               <w:rPr>
                 <w:sz w:val="19"/>
@@ -1993,7 +1916,6 @@
               </w:rPr>
               <w:t>FilmID</w:t>
             </w:r>
-            <w:proofErr w:type="spellEnd"/>
           </w:p>
         </w:tc>
         <w:tc>
@@ -2044,23 +1966,7 @@
                 <w:sz w:val="19"/>
                 <w:szCs w:val="19"/>
               </w:rPr>
-              <w:t xml:space="preserve">The film being shown (Foreign Key to </w:t>
-            </w:r>
-            <w:proofErr w:type="spellStart"/>
-            <w:r>
-              <w:rPr>
-                <w:sz w:val="19"/>
-                <w:szCs w:val="19"/>
-              </w:rPr>
-              <w:t>tblFilm</w:t>
-            </w:r>
-            <w:proofErr w:type="spellEnd"/>
-            <w:r>
-              <w:rPr>
-                <w:sz w:val="19"/>
-                <w:szCs w:val="19"/>
-              </w:rPr>
-              <w:t>)</w:t>
+              <w:t>The film being shown (Foreign Key to tblFilm)</w:t>
             </w:r>
           </w:p>
         </w:tc>
@@ -2097,7 +2003,6 @@
             </w:tcMar>
           </w:tcPr>
           <w:p>
-            <w:proofErr w:type="spellStart"/>
             <w:r>
               <w:rPr>
                 <w:sz w:val="19"/>
@@ -2105,7 +2010,6 @@
               </w:rPr>
               <w:t>ScreenID</w:t>
             </w:r>
-            <w:proofErr w:type="spellEnd"/>
           </w:p>
         </w:tc>
         <w:tc>
@@ -2156,23 +2060,7 @@
                 <w:sz w:val="19"/>
                 <w:szCs w:val="19"/>
               </w:rPr>
-              <w:t xml:space="preserve">The screen it is shown in (Foreign Key to </w:t>
-            </w:r>
-            <w:proofErr w:type="spellStart"/>
-            <w:r>
-              <w:rPr>
-                <w:sz w:val="19"/>
-                <w:szCs w:val="19"/>
-              </w:rPr>
-              <w:t>tblScreen</w:t>
-            </w:r>
-            <w:proofErr w:type="spellEnd"/>
-            <w:r>
-              <w:rPr>
-                <w:sz w:val="19"/>
-                <w:szCs w:val="19"/>
-              </w:rPr>
-              <w:t>)</w:t>
+              <w:t>The screen it is shown in (Foreign Key to tblScreen)</w:t>
             </w:r>
           </w:p>
         </w:tc>
@@ -2209,7 +2097,6 @@
             </w:tcMar>
           </w:tcPr>
           <w:p>
-            <w:proofErr w:type="spellStart"/>
             <w:r>
               <w:rPr>
                 <w:sz w:val="19"/>
@@ -2217,7 +2104,6 @@
               </w:rPr>
               <w:t>ScreeningDate</w:t>
             </w:r>
-            <w:proofErr w:type="spellEnd"/>
           </w:p>
         </w:tc>
         <w:tc>
@@ -2305,7 +2191,6 @@
             </w:tcMar>
           </w:tcPr>
           <w:p>
-            <w:proofErr w:type="spellStart"/>
             <w:r>
               <w:rPr>
                 <w:sz w:val="19"/>
@@ -2313,7 +2198,6 @@
               </w:rPr>
               <w:t>ScreeningTime</w:t>
             </w:r>
-            <w:proofErr w:type="spellEnd"/>
           </w:p>
         </w:tc>
         <w:tc>
@@ -2409,7 +2293,6 @@
             </w:tcMar>
           </w:tcPr>
           <w:p>
-            <w:proofErr w:type="spellStart"/>
             <w:r>
               <w:rPr>
                 <w:sz w:val="19"/>
@@ -2417,7 +2300,6 @@
               </w:rPr>
               <w:t>TicketPrice</w:t>
             </w:r>
-            <w:proofErr w:type="spellEnd"/>
           </w:p>
         </w:tc>
         <w:tc>
@@ -2508,7 +2390,6 @@
           <w:color w:val="000000" w:themeColor="text1"/>
         </w:rPr>
       </w:pPr>
-      <w:proofErr w:type="spellStart"/>
       <w:r>
         <w:rPr>
           <w:b/>
@@ -2517,7 +2398,6 @@
         </w:rPr>
         <w:t>tblSeat</w:t>
       </w:r>
-      <w:proofErr w:type="spellEnd"/>
     </w:p>
     <w:p>
       <w:pPr>
@@ -2695,7 +2575,6 @@
             </w:tcMar>
           </w:tcPr>
           <w:p>
-            <w:proofErr w:type="spellStart"/>
             <w:r>
               <w:rPr>
                 <w:sz w:val="19"/>
@@ -2703,7 +2582,6 @@
               </w:rPr>
               <w:t>SeatID</w:t>
             </w:r>
-            <w:proofErr w:type="spellEnd"/>
           </w:p>
         </w:tc>
         <w:tc>
@@ -2791,7 +2669,6 @@
             </w:tcMar>
           </w:tcPr>
           <w:p>
-            <w:proofErr w:type="spellStart"/>
             <w:r>
               <w:rPr>
                 <w:sz w:val="19"/>
@@ -2799,7 +2676,6 @@
               </w:rPr>
               <w:t>ScreenID</w:t>
             </w:r>
-            <w:proofErr w:type="spellEnd"/>
           </w:p>
         </w:tc>
         <w:tc>
@@ -2850,23 +2726,7 @@
                 <w:sz w:val="19"/>
                 <w:szCs w:val="19"/>
               </w:rPr>
-              <w:t xml:space="preserve">The screen the seat belongs to (Foreign Key to </w:t>
-            </w:r>
-            <w:proofErr w:type="spellStart"/>
-            <w:r>
-              <w:rPr>
-                <w:sz w:val="19"/>
-                <w:szCs w:val="19"/>
-              </w:rPr>
-              <w:t>tblScreen</w:t>
-            </w:r>
-            <w:proofErr w:type="spellEnd"/>
-            <w:r>
-              <w:rPr>
-                <w:sz w:val="19"/>
-                <w:szCs w:val="19"/>
-              </w:rPr>
-              <w:t>)</w:t>
+              <w:t>The screen the seat belongs to (Foreign Key to tblScreen)</w:t>
             </w:r>
           </w:p>
         </w:tc>
@@ -2903,7 +2763,6 @@
             </w:tcMar>
           </w:tcPr>
           <w:p>
-            <w:proofErr w:type="spellStart"/>
             <w:r>
               <w:rPr>
                 <w:sz w:val="19"/>
@@ -2911,7 +2770,6 @@
               </w:rPr>
               <w:t>SeatRow</w:t>
             </w:r>
-            <w:proofErr w:type="spellEnd"/>
           </w:p>
         </w:tc>
         <w:tc>
@@ -3007,7 +2865,6 @@
             </w:tcMar>
           </w:tcPr>
           <w:p>
-            <w:proofErr w:type="spellStart"/>
             <w:r>
               <w:rPr>
                 <w:sz w:val="19"/>
@@ -3015,7 +2872,6 @@
               </w:rPr>
               <w:t>SeatNumber</w:t>
             </w:r>
-            <w:proofErr w:type="spellEnd"/>
           </w:p>
         </w:tc>
         <w:tc>
@@ -3106,7 +2962,6 @@
           <w:color w:val="000000" w:themeColor="text1"/>
         </w:rPr>
       </w:pPr>
-      <w:proofErr w:type="spellStart"/>
       <w:r>
         <w:rPr>
           <w:b/>
@@ -3115,7 +2970,6 @@
         </w:rPr>
         <w:t>tblCustomer</w:t>
       </w:r>
-      <w:proofErr w:type="spellEnd"/>
     </w:p>
     <w:p>
       <w:pPr>
@@ -3293,7 +3147,6 @@
             </w:tcMar>
           </w:tcPr>
           <w:p>
-            <w:proofErr w:type="spellStart"/>
             <w:r>
               <w:rPr>
                 <w:sz w:val="19"/>
@@ -3301,7 +3154,6 @@
               </w:rPr>
               <w:t>CustomerID</w:t>
             </w:r>
-            <w:proofErr w:type="spellEnd"/>
           </w:p>
         </w:tc>
         <w:tc>
@@ -3389,7 +3241,6 @@
             </w:tcMar>
           </w:tcPr>
           <w:p>
-            <w:proofErr w:type="spellStart"/>
             <w:r>
               <w:rPr>
                 <w:sz w:val="19"/>
@@ -3397,7 +3248,6 @@
               </w:rPr>
               <w:t>CustomerForename</w:t>
             </w:r>
-            <w:proofErr w:type="spellEnd"/>
           </w:p>
         </w:tc>
         <w:tc>
@@ -3493,7 +3343,6 @@
             </w:tcMar>
           </w:tcPr>
           <w:p>
-            <w:proofErr w:type="spellStart"/>
             <w:r>
               <w:rPr>
                 <w:sz w:val="19"/>
@@ -3501,7 +3350,6 @@
               </w:rPr>
               <w:t>CustomerSurname</w:t>
             </w:r>
-            <w:proofErr w:type="spellEnd"/>
           </w:p>
         </w:tc>
         <w:tc>
@@ -3597,7 +3445,6 @@
             </w:tcMar>
           </w:tcPr>
           <w:p>
-            <w:proofErr w:type="spellStart"/>
             <w:r>
               <w:rPr>
                 <w:sz w:val="19"/>
@@ -3605,7 +3452,6 @@
               </w:rPr>
               <w:t>CustomerEmail</w:t>
             </w:r>
-            <w:proofErr w:type="spellEnd"/>
           </w:p>
         </w:tc>
         <w:tc>
@@ -3701,7 +3547,6 @@
             </w:tcMar>
           </w:tcPr>
           <w:p>
-            <w:proofErr w:type="spellStart"/>
             <w:r>
               <w:rPr>
                 <w:sz w:val="19"/>
@@ -3709,7 +3554,6 @@
               </w:rPr>
               <w:t>CustomerPhone</w:t>
             </w:r>
-            <w:proofErr w:type="spellEnd"/>
           </w:p>
         </w:tc>
         <w:tc>
@@ -3808,7 +3652,6 @@
           <w:color w:val="000000" w:themeColor="text1"/>
         </w:rPr>
       </w:pPr>
-      <w:proofErr w:type="spellStart"/>
       <w:r>
         <w:rPr>
           <w:b/>
@@ -3817,7 +3660,6 @@
         </w:rPr>
         <w:t>tblBooking</w:t>
       </w:r>
-      <w:proofErr w:type="spellEnd"/>
     </w:p>
     <w:p>
       <w:pPr>
@@ -3995,7 +3837,6 @@
             </w:tcMar>
           </w:tcPr>
           <w:p>
-            <w:proofErr w:type="spellStart"/>
             <w:r>
               <w:rPr>
                 <w:sz w:val="19"/>
@@ -4003,7 +3844,6 @@
               </w:rPr>
               <w:t>BookingID</w:t>
             </w:r>
-            <w:proofErr w:type="spellEnd"/>
           </w:p>
         </w:tc>
         <w:tc>
@@ -4091,7 +3931,6 @@
             </w:tcMar>
           </w:tcPr>
           <w:p>
-            <w:proofErr w:type="spellStart"/>
             <w:r>
               <w:rPr>
                 <w:sz w:val="19"/>
@@ -4099,7 +3938,6 @@
               </w:rPr>
               <w:t>CustomerID</w:t>
             </w:r>
-            <w:proofErr w:type="spellEnd"/>
           </w:p>
         </w:tc>
         <w:tc>
@@ -4150,23 +3988,7 @@
                 <w:sz w:val="19"/>
                 <w:szCs w:val="19"/>
               </w:rPr>
-              <w:t xml:space="preserve">The customer who made the booking (Foreign Key to </w:t>
-            </w:r>
-            <w:proofErr w:type="spellStart"/>
-            <w:r>
-              <w:rPr>
-                <w:sz w:val="19"/>
-                <w:szCs w:val="19"/>
-              </w:rPr>
-              <w:t>tblCustomer</w:t>
-            </w:r>
-            <w:proofErr w:type="spellEnd"/>
-            <w:r>
-              <w:rPr>
-                <w:sz w:val="19"/>
-                <w:szCs w:val="19"/>
-              </w:rPr>
-              <w:t>)</w:t>
+              <w:t>The customer who made the booking (Foreign Key to tblCustomer)</w:t>
             </w:r>
           </w:p>
         </w:tc>
@@ -4203,7 +4025,6 @@
             </w:tcMar>
           </w:tcPr>
           <w:p>
-            <w:proofErr w:type="spellStart"/>
             <w:r>
               <w:rPr>
                 <w:sz w:val="19"/>
@@ -4211,7 +4032,6 @@
               </w:rPr>
               <w:t>ScreeningID</w:t>
             </w:r>
-            <w:proofErr w:type="spellEnd"/>
           </w:p>
         </w:tc>
         <w:tc>
@@ -4262,23 +4082,7 @@
                 <w:sz w:val="19"/>
                 <w:szCs w:val="19"/>
               </w:rPr>
-              <w:t xml:space="preserve">The screening booked (Foreign Key to </w:t>
-            </w:r>
-            <w:proofErr w:type="spellStart"/>
-            <w:r>
-              <w:rPr>
-                <w:sz w:val="19"/>
-                <w:szCs w:val="19"/>
-              </w:rPr>
-              <w:t>tblScreening</w:t>
-            </w:r>
-            <w:proofErr w:type="spellEnd"/>
-            <w:r>
-              <w:rPr>
-                <w:sz w:val="19"/>
-                <w:szCs w:val="19"/>
-              </w:rPr>
-              <w:t>)</w:t>
+              <w:t>The screening booked (Foreign Key to tblScreening)</w:t>
             </w:r>
           </w:p>
         </w:tc>
@@ -4315,7 +4119,6 @@
             </w:tcMar>
           </w:tcPr>
           <w:p>
-            <w:proofErr w:type="spellStart"/>
             <w:r>
               <w:rPr>
                 <w:sz w:val="19"/>
@@ -4323,7 +4126,6 @@
               </w:rPr>
               <w:t>BookingDate</w:t>
             </w:r>
-            <w:proofErr w:type="spellEnd"/>
           </w:p>
         </w:tc>
         <w:tc>
@@ -4411,7 +4213,6 @@
             </w:tcMar>
           </w:tcPr>
           <w:p>
-            <w:proofErr w:type="spellStart"/>
             <w:r>
               <w:rPr>
                 <w:sz w:val="19"/>
@@ -4419,7 +4220,6 @@
               </w:rPr>
               <w:t>TotalCost</w:t>
             </w:r>
-            <w:proofErr w:type="spellEnd"/>
           </w:p>
         </w:tc>
         <w:tc>
@@ -4510,7 +4310,6 @@
           <w:color w:val="000000" w:themeColor="text1"/>
         </w:rPr>
       </w:pPr>
-      <w:proofErr w:type="spellStart"/>
       <w:r>
         <w:rPr>
           <w:b/>
@@ -4519,7 +4318,6 @@
         </w:rPr>
         <w:t>tblBookingSeat</w:t>
       </w:r>
-      <w:proofErr w:type="spellEnd"/>
     </w:p>
     <w:p>
       <w:pPr>
@@ -4697,7 +4495,6 @@
             </w:tcMar>
           </w:tcPr>
           <w:p>
-            <w:proofErr w:type="spellStart"/>
             <w:r>
               <w:rPr>
                 <w:sz w:val="19"/>
@@ -4705,7 +4502,6 @@
               </w:rPr>
               <w:t>BookingSeatID</w:t>
             </w:r>
-            <w:proofErr w:type="spellEnd"/>
           </w:p>
         </w:tc>
         <w:tc>
@@ -4793,7 +4589,6 @@
             </w:tcMar>
           </w:tcPr>
           <w:p>
-            <w:proofErr w:type="spellStart"/>
             <w:r>
               <w:rPr>
                 <w:sz w:val="19"/>
@@ -4801,7 +4596,6 @@
               </w:rPr>
               <w:t>BookingID</w:t>
             </w:r>
-            <w:proofErr w:type="spellEnd"/>
           </w:p>
         </w:tc>
         <w:tc>
@@ -4852,23 +4646,7 @@
                 <w:sz w:val="19"/>
                 <w:szCs w:val="19"/>
               </w:rPr>
-              <w:t xml:space="preserve">The booking this seat belongs to (Foreign Key to </w:t>
-            </w:r>
-            <w:proofErr w:type="spellStart"/>
-            <w:r>
-              <w:rPr>
-                <w:sz w:val="19"/>
-                <w:szCs w:val="19"/>
-              </w:rPr>
-              <w:t>tblBooking</w:t>
-            </w:r>
-            <w:proofErr w:type="spellEnd"/>
-            <w:r>
-              <w:rPr>
-                <w:sz w:val="19"/>
-                <w:szCs w:val="19"/>
-              </w:rPr>
-              <w:t>)</w:t>
+              <w:t>The booking this seat belongs to (Foreign Key to tblBooking)</w:t>
             </w:r>
           </w:p>
         </w:tc>
@@ -4905,7 +4683,6 @@
             </w:tcMar>
           </w:tcPr>
           <w:p>
-            <w:proofErr w:type="spellStart"/>
             <w:r>
               <w:rPr>
                 <w:sz w:val="19"/>
@@ -4913,7 +4690,6 @@
               </w:rPr>
               <w:t>SeatID</w:t>
             </w:r>
-            <w:proofErr w:type="spellEnd"/>
           </w:p>
         </w:tc>
         <w:tc>
@@ -4964,23 +4740,7 @@
                 <w:sz w:val="19"/>
                 <w:szCs w:val="19"/>
               </w:rPr>
-              <w:t xml:space="preserve">The seat that was booked (Foreign Key to </w:t>
-            </w:r>
-            <w:proofErr w:type="spellStart"/>
-            <w:r>
-              <w:rPr>
-                <w:sz w:val="19"/>
-                <w:szCs w:val="19"/>
-              </w:rPr>
-              <w:t>tblSeat</w:t>
-            </w:r>
-            <w:proofErr w:type="spellEnd"/>
-            <w:r>
-              <w:rPr>
-                <w:sz w:val="19"/>
-                <w:szCs w:val="19"/>
-              </w:rPr>
-              <w:t>)</w:t>
+              <w:t>The seat that was booked (Foreign Key to tblSeat)</w:t>
             </w:r>
           </w:p>
         </w:tc>
@@ -5020,7 +4780,6 @@
           <w:color w:val="000000" w:themeColor="text1"/>
         </w:rPr>
       </w:pPr>
-      <w:proofErr w:type="spellStart"/>
       <w:r>
         <w:rPr>
           <w:b/>
@@ -5029,7 +4788,6 @@
         </w:rPr>
         <w:t>tblFoodItem</w:t>
       </w:r>
-      <w:proofErr w:type="spellEnd"/>
     </w:p>
     <w:p>
       <w:pPr>
@@ -5207,7 +4965,6 @@
             </w:tcMar>
           </w:tcPr>
           <w:p>
-            <w:proofErr w:type="spellStart"/>
             <w:r>
               <w:rPr>
                 <w:sz w:val="19"/>
@@ -5215,7 +4972,6 @@
               </w:rPr>
               <w:t>FoodItemID</w:t>
             </w:r>
-            <w:proofErr w:type="spellEnd"/>
           </w:p>
         </w:tc>
         <w:tc>
@@ -5303,7 +5059,6 @@
             </w:tcMar>
           </w:tcPr>
           <w:p>
-            <w:proofErr w:type="spellStart"/>
             <w:r>
               <w:rPr>
                 <w:sz w:val="19"/>
@@ -5311,7 +5066,6 @@
               </w:rPr>
               <w:t>FoodItemName</w:t>
             </w:r>
-            <w:proofErr w:type="spellEnd"/>
           </w:p>
         </w:tc>
         <w:tc>
@@ -5407,7 +5161,6 @@
             </w:tcMar>
           </w:tcPr>
           <w:p>
-            <w:proofErr w:type="spellStart"/>
             <w:r>
               <w:rPr>
                 <w:sz w:val="19"/>
@@ -5415,7 +5168,6 @@
               </w:rPr>
               <w:t>FoodItemPrice</w:t>
             </w:r>
-            <w:proofErr w:type="spellEnd"/>
           </w:p>
         </w:tc>
         <w:tc>
@@ -5503,7 +5255,6 @@
             </w:tcMar>
           </w:tcPr>
           <w:p>
-            <w:proofErr w:type="spellStart"/>
             <w:r>
               <w:rPr>
                 <w:sz w:val="19"/>
@@ -5511,7 +5262,6 @@
               </w:rPr>
               <w:t>FoodItemCategory</w:t>
             </w:r>
-            <w:proofErr w:type="spellEnd"/>
           </w:p>
         </w:tc>
         <w:tc>
@@ -5610,7 +5360,6 @@
           <w:color w:val="000000" w:themeColor="text1"/>
         </w:rPr>
       </w:pPr>
-      <w:proofErr w:type="spellStart"/>
       <w:r>
         <w:rPr>
           <w:b/>
@@ -5619,7 +5368,6 @@
         </w:rPr>
         <w:t>tblOrderItem</w:t>
       </w:r>
-      <w:proofErr w:type="spellEnd"/>
     </w:p>
     <w:p>
       <w:pPr>
@@ -5797,7 +5545,6 @@
             </w:tcMar>
           </w:tcPr>
           <w:p>
-            <w:proofErr w:type="spellStart"/>
             <w:r>
               <w:rPr>
                 <w:sz w:val="19"/>
@@ -5805,7 +5552,6 @@
               </w:rPr>
               <w:t>OrderItemID</w:t>
             </w:r>
-            <w:proofErr w:type="spellEnd"/>
           </w:p>
         </w:tc>
         <w:tc>
@@ -5893,7 +5639,6 @@
             </w:tcMar>
           </w:tcPr>
           <w:p>
-            <w:proofErr w:type="spellStart"/>
             <w:r>
               <w:rPr>
                 <w:sz w:val="19"/>
@@ -5901,7 +5646,6 @@
               </w:rPr>
               <w:t>BookingID</w:t>
             </w:r>
-            <w:proofErr w:type="spellEnd"/>
           </w:p>
         </w:tc>
         <w:tc>
@@ -5952,23 +5696,7 @@
                 <w:sz w:val="19"/>
                 <w:szCs w:val="19"/>
               </w:rPr>
-              <w:t xml:space="preserve">The booking the item was added to (Foreign Key to </w:t>
-            </w:r>
-            <w:proofErr w:type="spellStart"/>
-            <w:r>
-              <w:rPr>
-                <w:sz w:val="19"/>
-                <w:szCs w:val="19"/>
-              </w:rPr>
-              <w:t>tblBooking</w:t>
-            </w:r>
-            <w:proofErr w:type="spellEnd"/>
-            <w:r>
-              <w:rPr>
-                <w:sz w:val="19"/>
-                <w:szCs w:val="19"/>
-              </w:rPr>
-              <w:t>)</w:t>
+              <w:t>The booking the item was added to (Foreign Key to tblBooking)</w:t>
             </w:r>
           </w:p>
         </w:tc>
@@ -6005,7 +5733,6 @@
             </w:tcMar>
           </w:tcPr>
           <w:p>
-            <w:proofErr w:type="spellStart"/>
             <w:r>
               <w:rPr>
                 <w:sz w:val="19"/>
@@ -6013,7 +5740,6 @@
               </w:rPr>
               <w:t>FoodItemID</w:t>
             </w:r>
-            <w:proofErr w:type="spellEnd"/>
           </w:p>
         </w:tc>
         <w:tc>
@@ -6064,23 +5790,7 @@
                 <w:sz w:val="19"/>
                 <w:szCs w:val="19"/>
               </w:rPr>
-              <w:t xml:space="preserve">The food item ordered (Foreign Key to </w:t>
-            </w:r>
-            <w:proofErr w:type="spellStart"/>
-            <w:r>
-              <w:rPr>
-                <w:sz w:val="19"/>
-                <w:szCs w:val="19"/>
-              </w:rPr>
-              <w:t>tblFoodItem</w:t>
-            </w:r>
-            <w:proofErr w:type="spellEnd"/>
-            <w:r>
-              <w:rPr>
-                <w:sz w:val="19"/>
-                <w:szCs w:val="19"/>
-              </w:rPr>
-              <w:t>)</w:t>
+              <w:t>The food item ordered (Foreign Key to tblFoodItem)</w:t>
             </w:r>
           </w:p>
         </w:tc>
@@ -6214,7 +5924,6 @@
           <w:color w:val="000000" w:themeColor="text1"/>
         </w:rPr>
       </w:pPr>
-      <w:proofErr w:type="spellStart"/>
       <w:r>
         <w:rPr>
           <w:b/>
@@ -6223,7 +5932,6 @@
         </w:rPr>
         <w:t>tblLogin</w:t>
       </w:r>
-      <w:proofErr w:type="spellEnd"/>
     </w:p>
     <w:p>
       <w:pPr>
@@ -6401,7 +6109,6 @@
             </w:tcMar>
           </w:tcPr>
           <w:p>
-            <w:proofErr w:type="spellStart"/>
             <w:r>
               <w:rPr>
                 <w:sz w:val="19"/>
@@ -6409,7 +6116,6 @@
               </w:rPr>
               <w:t>LoginID</w:t>
             </w:r>
-            <w:proofErr w:type="spellEnd"/>
           </w:p>
         </w:tc>
         <w:tc>
@@ -6679,7 +6385,6 @@
             </w:tcMar>
           </w:tcPr>
           <w:p>
-            <w:proofErr w:type="spellStart"/>
             <w:r>
               <w:rPr>
                 <w:sz w:val="19"/>
@@ -6687,7 +6392,6 @@
               </w:rPr>
               <w:t>MTIz</w:t>
             </w:r>
-            <w:proofErr w:type="spellEnd"/>
           </w:p>
         </w:tc>
       </w:tr>
@@ -6703,7 +6407,6 @@
             </w:tcMar>
           </w:tcPr>
           <w:p>
-            <w:proofErr w:type="spellStart"/>
             <w:r>
               <w:rPr>
                 <w:sz w:val="19"/>
@@ -6711,7 +6414,6 @@
               </w:rPr>
               <w:t>AccessLevel</w:t>
             </w:r>
-            <w:proofErr w:type="spellEnd"/>
           </w:p>
         </w:tc>
         <w:tc>
@@ -6802,7 +6504,6 @@
           <w:color w:val="000000" w:themeColor="text1"/>
         </w:rPr>
       </w:pPr>
-      <w:proofErr w:type="spellStart"/>
       <w:r>
         <w:rPr>
           <w:b/>
@@ -6811,7 +6512,6 @@
         </w:rPr>
         <w:t>tblLogs</w:t>
       </w:r>
-      <w:proofErr w:type="spellEnd"/>
     </w:p>
     <w:p>
       <w:pPr>
@@ -6989,7 +6689,6 @@
             </w:tcMar>
           </w:tcPr>
           <w:p>
-            <w:proofErr w:type="spellStart"/>
             <w:r>
               <w:rPr>
                 <w:sz w:val="19"/>
@@ -6997,7 +6696,6 @@
               </w:rPr>
               <w:t>LogID</w:t>
             </w:r>
-            <w:proofErr w:type="spellEnd"/>
           </w:p>
         </w:tc>
         <w:tc>
@@ -7085,7 +6783,6 @@
             </w:tcMar>
           </w:tcPr>
           <w:p>
-            <w:proofErr w:type="spellStart"/>
             <w:r>
               <w:rPr>
                 <w:sz w:val="19"/>
@@ -7093,7 +6790,6 @@
               </w:rPr>
               <w:t>LogDateTime</w:t>
             </w:r>
-            <w:proofErr w:type="spellEnd"/>
           </w:p>
         </w:tc>
         <w:tc>
@@ -7181,7 +6877,6 @@
             </w:tcMar>
           </w:tcPr>
           <w:p>
-            <w:proofErr w:type="spellStart"/>
             <w:r>
               <w:rPr>
                 <w:sz w:val="19"/>
@@ -7189,7 +6884,6 @@
               </w:rPr>
               <w:t>LogType</w:t>
             </w:r>
-            <w:proofErr w:type="spellEnd"/>
           </w:p>
         </w:tc>
         <w:tc>
@@ -7285,7 +6979,6 @@
             </w:tcMar>
           </w:tcPr>
           <w:p>
-            <w:proofErr w:type="spellStart"/>
             <w:r>
               <w:rPr>
                 <w:sz w:val="19"/>
@@ -7293,7 +6986,6 @@
               </w:rPr>
               <w:t>LogMessage</w:t>
             </w:r>
-            <w:proofErr w:type="spellEnd"/>
           </w:p>
         </w:tc>
         <w:tc>
@@ -7384,7 +7076,6 @@
           <w:color w:val="000000" w:themeColor="text1"/>
         </w:rPr>
       </w:pPr>
-      <w:proofErr w:type="spellStart"/>
       <w:r>
         <w:rPr>
           <w:b/>
@@ -7393,7 +7084,6 @@
         </w:rPr>
         <w:t>tblVersionControl</w:t>
       </w:r>
-      <w:proofErr w:type="spellEnd"/>
     </w:p>
     <w:p>
       <w:pPr>
@@ -7691,15 +7381,7 @@
         <w:spacing w:after="160" w:line="276" w:lineRule="auto"/>
       </w:pPr>
       <w:r>
-        <w:t xml:space="preserve">This section describes the processing that takes place inside the </w:t>
-      </w:r>
-      <w:proofErr w:type="spellStart"/>
-      <w:r>
-        <w:t>Filmtopia</w:t>
-      </w:r>
-      <w:proofErr w:type="spellEnd"/>
-      <w:r>
-        <w:t xml:space="preserve"> system. Rather than listing every button on every form it focuses on the stages where there is real logic going on, since these are the parts of the system that need to be thought through carefully before any code is written. Each stage is described in plain English pseudocode rather than in Visual Basic, so that the logic is clear and separate from the eventual code, and the two most important algorithms are also shown as flowcharts. Each stage is linked back to the objectives it helps to meet.</w:t>
+        <w:t>This section describes the processing that takes place inside the Filmtopia system. Rather than listing every button on every form it focuses on the stages where there is real logic going on, since these are the parts of the system that need to be thought through carefully before any code is written. Each stage is described in plain English pseudocode rather than in Visual Basic, so that the logic is clear and separate from the eventual code, and the two most important algorithms are also shown as flowcharts. Each stage is linked back to the objectives it helps to meet.</w:t>
       </w:r>
     </w:p>
     <w:p>
@@ -7815,25 +7497,27 @@
                 <w:sz w:val="19"/>
                 <w:szCs w:val="19"/>
               </w:rPr>
-              <w:t xml:space="preserve">    LOOK UP the username in </w:t>
-            </w:r>
-            <w:proofErr w:type="spellStart"/>
+              <w:t xml:space="preserve">    LOOK UP the username in tblLogin using an SQL SELECT query</w:t>
+            </w:r>
+          </w:p>
+          <w:p>
             <w:r>
               <w:rPr>
                 <w:rFonts w:ascii="Courier New" w:eastAsia="Courier New" w:hAnsi="Courier New" w:cs="Courier New"/>
                 <w:sz w:val="19"/>
                 <w:szCs w:val="19"/>
               </w:rPr>
-              <w:t>tblLogin</w:t>
-            </w:r>
-            <w:proofErr w:type="spellEnd"/>
+              <w:t xml:space="preserve">    IF no matching username is found THEN</w:t>
+            </w:r>
+          </w:p>
+          <w:p>
             <w:r>
               <w:rPr>
                 <w:rFonts w:ascii="Courier New" w:eastAsia="Courier New" w:hAnsi="Courier New" w:cs="Courier New"/>
                 <w:sz w:val="19"/>
                 <w:szCs w:val="19"/>
               </w:rPr>
-              <w:t xml:space="preserve"> using an SQL SELECT query</w:t>
+              <w:t xml:space="preserve">        DISPLAY "Login details not recognised"</w:t>
             </w:r>
           </w:p>
           <w:p>
@@ -7843,7 +7527,7 @@
                 <w:sz w:val="19"/>
                 <w:szCs w:val="19"/>
               </w:rPr>
-              <w:t xml:space="preserve">    IF no matching username is found THEN</w:t>
+              <w:t xml:space="preserve">    ELSE IF the stored password does not match the encoded password THEN</w:t>
             </w:r>
           </w:p>
           <w:p>
@@ -7863,7 +7547,7 @@
                 <w:sz w:val="19"/>
                 <w:szCs w:val="19"/>
               </w:rPr>
-              <w:t xml:space="preserve">    ELSE IF the stored password does not match the encoded password THEN</w:t>
+              <w:t xml:space="preserve">    ELSE</w:t>
             </w:r>
           </w:p>
           <w:p>
@@ -7873,45 +7557,7 @@
                 <w:sz w:val="19"/>
                 <w:szCs w:val="19"/>
               </w:rPr>
-              <w:t xml:space="preserve">        DISPLAY "Login details not recognised"</w:t>
-            </w:r>
-          </w:p>
-          <w:p>
-            <w:r>
-              <w:rPr>
-                <w:rFonts w:ascii="Courier New" w:eastAsia="Courier New" w:hAnsi="Courier New" w:cs="Courier New"/>
-                <w:sz w:val="19"/>
-                <w:szCs w:val="19"/>
-              </w:rPr>
-              <w:t xml:space="preserve">    ELSE</w:t>
-            </w:r>
-          </w:p>
-          <w:p>
-            <w:r>
-              <w:rPr>
-                <w:rFonts w:ascii="Courier New" w:eastAsia="Courier New" w:hAnsi="Courier New" w:cs="Courier New"/>
-                <w:sz w:val="19"/>
-                <w:szCs w:val="19"/>
-              </w:rPr>
-              <w:t xml:space="preserve">        STORE the user's </w:t>
-            </w:r>
-            <w:proofErr w:type="spellStart"/>
-            <w:r>
-              <w:rPr>
-                <w:rFonts w:ascii="Courier New" w:eastAsia="Courier New" w:hAnsi="Courier New" w:cs="Courier New"/>
-                <w:sz w:val="19"/>
-                <w:szCs w:val="19"/>
-              </w:rPr>
-              <w:t>AccessLevel</w:t>
-            </w:r>
-            <w:proofErr w:type="spellEnd"/>
-            <w:r>
-              <w:rPr>
-                <w:rFonts w:ascii="Courier New" w:eastAsia="Courier New" w:hAnsi="Courier New" w:cs="Courier New"/>
-                <w:sz w:val="19"/>
-                <w:szCs w:val="19"/>
-              </w:rPr>
-              <w:t xml:space="preserve"> for the session</w:t>
+              <w:t xml:space="preserve">        STORE the user's AccessLevel for the session</w:t>
             </w:r>
           </w:p>
           <w:p>
@@ -8112,25 +7758,27 @@
                 <w:sz w:val="19"/>
                 <w:szCs w:val="19"/>
               </w:rPr>
-              <w:t xml:space="preserve">SET </w:t>
-            </w:r>
-            <w:proofErr w:type="spellStart"/>
+              <w:t>SET seatsPerRow to 10</w:t>
+            </w:r>
+          </w:p>
+          <w:p>
             <w:r>
               <w:rPr>
                 <w:rFonts w:ascii="Courier New" w:eastAsia="Courier New" w:hAnsi="Courier New" w:cs="Courier New"/>
                 <w:sz w:val="19"/>
                 <w:szCs w:val="19"/>
               </w:rPr>
-              <w:t>seatsPerRow</w:t>
-            </w:r>
-            <w:proofErr w:type="spellEnd"/>
+              <w:t>SET rowLetter to "A"</w:t>
+            </w:r>
+          </w:p>
+          <w:p>
             <w:r>
               <w:rPr>
                 <w:rFonts w:ascii="Courier New" w:eastAsia="Courier New" w:hAnsi="Courier New" w:cs="Courier New"/>
                 <w:sz w:val="19"/>
                 <w:szCs w:val="19"/>
               </w:rPr>
-              <w:t xml:space="preserve"> to 10</w:t>
+              <w:t>SET seatsMade to 0</w:t>
             </w:r>
           </w:p>
           <w:p>
@@ -8140,25 +7788,27 @@
                 <w:sz w:val="19"/>
                 <w:szCs w:val="19"/>
               </w:rPr>
-              <w:t xml:space="preserve">SET </w:t>
-            </w:r>
-            <w:proofErr w:type="spellStart"/>
+              <w:t>WHILE seatsMade is less than capacity</w:t>
+            </w:r>
+          </w:p>
+          <w:p>
             <w:r>
               <w:rPr>
                 <w:rFonts w:ascii="Courier New" w:eastAsia="Courier New" w:hAnsi="Courier New" w:cs="Courier New"/>
                 <w:sz w:val="19"/>
                 <w:szCs w:val="19"/>
               </w:rPr>
-              <w:t>rowLetter</w:t>
-            </w:r>
-            <w:proofErr w:type="spellEnd"/>
+              <w:t xml:space="preserve">    FOR seatNumber from 1 to seatsPerRow</w:t>
+            </w:r>
+          </w:p>
+          <w:p>
             <w:r>
               <w:rPr>
                 <w:rFonts w:ascii="Courier New" w:eastAsia="Courier New" w:hAnsi="Courier New" w:cs="Courier New"/>
                 <w:sz w:val="19"/>
                 <w:szCs w:val="19"/>
               </w:rPr>
-              <w:t xml:space="preserve"> to "A"</w:t>
+              <w:t xml:space="preserve">        IF seatsMade is less than capacity THEN</w:t>
             </w:r>
           </w:p>
           <w:p>
@@ -8168,25 +7818,27 @@
                 <w:sz w:val="19"/>
                 <w:szCs w:val="19"/>
               </w:rPr>
-              <w:t xml:space="preserve">SET </w:t>
-            </w:r>
-            <w:proofErr w:type="spellStart"/>
+              <w:t xml:space="preserve">            INSERT a seat into tblSeat with the current ScreenID,</w:t>
+            </w:r>
+          </w:p>
+          <w:p>
             <w:r>
               <w:rPr>
                 <w:rFonts w:ascii="Courier New" w:eastAsia="Courier New" w:hAnsi="Courier New" w:cs="Courier New"/>
                 <w:sz w:val="19"/>
                 <w:szCs w:val="19"/>
               </w:rPr>
-              <w:t>seatsMade</w:t>
-            </w:r>
-            <w:proofErr w:type="spellEnd"/>
+              <w:t xml:space="preserve">                   rowLetter and seatNumber using an SQL INSERT</w:t>
+            </w:r>
+          </w:p>
+          <w:p>
             <w:r>
               <w:rPr>
                 <w:rFonts w:ascii="Courier New" w:eastAsia="Courier New" w:hAnsi="Courier New" w:cs="Courier New"/>
                 <w:sz w:val="19"/>
                 <w:szCs w:val="19"/>
               </w:rPr>
-              <w:t xml:space="preserve"> to 0</w:t>
+              <w:t xml:space="preserve">            ADD 1 to seatsMade</w:t>
             </w:r>
           </w:p>
           <w:p>
@@ -8196,261 +7848,27 @@
                 <w:sz w:val="19"/>
                 <w:szCs w:val="19"/>
               </w:rPr>
-              <w:t xml:space="preserve">WHILE </w:t>
-            </w:r>
-            <w:proofErr w:type="spellStart"/>
+              <w:t xml:space="preserve">        END IF</w:t>
+            </w:r>
+          </w:p>
+          <w:p>
             <w:r>
               <w:rPr>
                 <w:rFonts w:ascii="Courier New" w:eastAsia="Courier New" w:hAnsi="Courier New" w:cs="Courier New"/>
                 <w:sz w:val="19"/>
                 <w:szCs w:val="19"/>
               </w:rPr>
-              <w:t>seatsMade</w:t>
-            </w:r>
-            <w:proofErr w:type="spellEnd"/>
+              <w:t xml:space="preserve">    NEXT seatNumber</w:t>
+            </w:r>
+          </w:p>
+          <w:p>
             <w:r>
               <w:rPr>
                 <w:rFonts w:ascii="Courier New" w:eastAsia="Courier New" w:hAnsi="Courier New" w:cs="Courier New"/>
                 <w:sz w:val="19"/>
                 <w:szCs w:val="19"/>
               </w:rPr>
-              <w:t xml:space="preserve"> is less than capacity</w:t>
-            </w:r>
-          </w:p>
-          <w:p>
-            <w:r>
-              <w:rPr>
-                <w:rFonts w:ascii="Courier New" w:eastAsia="Courier New" w:hAnsi="Courier New" w:cs="Courier New"/>
-                <w:sz w:val="19"/>
-                <w:szCs w:val="19"/>
-              </w:rPr>
-              <w:t xml:space="preserve">    FOR </w:t>
-            </w:r>
-            <w:proofErr w:type="spellStart"/>
-            <w:r>
-              <w:rPr>
-                <w:rFonts w:ascii="Courier New" w:eastAsia="Courier New" w:hAnsi="Courier New" w:cs="Courier New"/>
-                <w:sz w:val="19"/>
-                <w:szCs w:val="19"/>
-              </w:rPr>
-              <w:t>seatNumber</w:t>
-            </w:r>
-            <w:proofErr w:type="spellEnd"/>
-            <w:r>
-              <w:rPr>
-                <w:rFonts w:ascii="Courier New" w:eastAsia="Courier New" w:hAnsi="Courier New" w:cs="Courier New"/>
-                <w:sz w:val="19"/>
-                <w:szCs w:val="19"/>
-              </w:rPr>
-              <w:t xml:space="preserve"> from 1 to </w:t>
-            </w:r>
-            <w:proofErr w:type="spellStart"/>
-            <w:r>
-              <w:rPr>
-                <w:rFonts w:ascii="Courier New" w:eastAsia="Courier New" w:hAnsi="Courier New" w:cs="Courier New"/>
-                <w:sz w:val="19"/>
-                <w:szCs w:val="19"/>
-              </w:rPr>
-              <w:t>seatsPerRow</w:t>
-            </w:r>
-            <w:proofErr w:type="spellEnd"/>
-          </w:p>
-          <w:p>
-            <w:r>
-              <w:rPr>
-                <w:rFonts w:ascii="Courier New" w:eastAsia="Courier New" w:hAnsi="Courier New" w:cs="Courier New"/>
-                <w:sz w:val="19"/>
-                <w:szCs w:val="19"/>
-              </w:rPr>
-              <w:t xml:space="preserve">        IF </w:t>
-            </w:r>
-            <w:proofErr w:type="spellStart"/>
-            <w:r>
-              <w:rPr>
-                <w:rFonts w:ascii="Courier New" w:eastAsia="Courier New" w:hAnsi="Courier New" w:cs="Courier New"/>
-                <w:sz w:val="19"/>
-                <w:szCs w:val="19"/>
-              </w:rPr>
-              <w:t>seatsMade</w:t>
-            </w:r>
-            <w:proofErr w:type="spellEnd"/>
-            <w:r>
-              <w:rPr>
-                <w:rFonts w:ascii="Courier New" w:eastAsia="Courier New" w:hAnsi="Courier New" w:cs="Courier New"/>
-                <w:sz w:val="19"/>
-                <w:szCs w:val="19"/>
-              </w:rPr>
-              <w:t xml:space="preserve"> is less than capacity THEN</w:t>
-            </w:r>
-          </w:p>
-          <w:p>
-            <w:r>
-              <w:rPr>
-                <w:rFonts w:ascii="Courier New" w:eastAsia="Courier New" w:hAnsi="Courier New" w:cs="Courier New"/>
-                <w:sz w:val="19"/>
-                <w:szCs w:val="19"/>
-              </w:rPr>
-              <w:t xml:space="preserve">            INSERT a seat into </w:t>
-            </w:r>
-            <w:proofErr w:type="spellStart"/>
-            <w:r>
-              <w:rPr>
-                <w:rFonts w:ascii="Courier New" w:eastAsia="Courier New" w:hAnsi="Courier New" w:cs="Courier New"/>
-                <w:sz w:val="19"/>
-                <w:szCs w:val="19"/>
-              </w:rPr>
-              <w:t>tblSeat</w:t>
-            </w:r>
-            <w:proofErr w:type="spellEnd"/>
-            <w:r>
-              <w:rPr>
-                <w:rFonts w:ascii="Courier New" w:eastAsia="Courier New" w:hAnsi="Courier New" w:cs="Courier New"/>
-                <w:sz w:val="19"/>
-                <w:szCs w:val="19"/>
-              </w:rPr>
-              <w:t xml:space="preserve"> with the current </w:t>
-            </w:r>
-            <w:proofErr w:type="spellStart"/>
-            <w:r>
-              <w:rPr>
-                <w:rFonts w:ascii="Courier New" w:eastAsia="Courier New" w:hAnsi="Courier New" w:cs="Courier New"/>
-                <w:sz w:val="19"/>
-                <w:szCs w:val="19"/>
-              </w:rPr>
-              <w:t>ScreenID</w:t>
-            </w:r>
-            <w:proofErr w:type="spellEnd"/>
-            <w:r>
-              <w:rPr>
-                <w:rFonts w:ascii="Courier New" w:eastAsia="Courier New" w:hAnsi="Courier New" w:cs="Courier New"/>
-                <w:sz w:val="19"/>
-                <w:szCs w:val="19"/>
-              </w:rPr>
-              <w:t>,</w:t>
-            </w:r>
-          </w:p>
-          <w:p>
-            <w:r>
-              <w:rPr>
-                <w:rFonts w:ascii="Courier New" w:eastAsia="Courier New" w:hAnsi="Courier New" w:cs="Courier New"/>
-                <w:sz w:val="19"/>
-                <w:szCs w:val="19"/>
-              </w:rPr>
-              <w:t xml:space="preserve">                   </w:t>
-            </w:r>
-            <w:proofErr w:type="spellStart"/>
-            <w:r>
-              <w:rPr>
-                <w:rFonts w:ascii="Courier New" w:eastAsia="Courier New" w:hAnsi="Courier New" w:cs="Courier New"/>
-                <w:sz w:val="19"/>
-                <w:szCs w:val="19"/>
-              </w:rPr>
-              <w:t>rowLetter</w:t>
-            </w:r>
-            <w:proofErr w:type="spellEnd"/>
-            <w:r>
-              <w:rPr>
-                <w:rFonts w:ascii="Courier New" w:eastAsia="Courier New" w:hAnsi="Courier New" w:cs="Courier New"/>
-                <w:sz w:val="19"/>
-                <w:szCs w:val="19"/>
-              </w:rPr>
-              <w:t xml:space="preserve"> and </w:t>
-            </w:r>
-            <w:proofErr w:type="spellStart"/>
-            <w:r>
-              <w:rPr>
-                <w:rFonts w:ascii="Courier New" w:eastAsia="Courier New" w:hAnsi="Courier New" w:cs="Courier New"/>
-                <w:sz w:val="19"/>
-                <w:szCs w:val="19"/>
-              </w:rPr>
-              <w:t>seatNumber</w:t>
-            </w:r>
-            <w:proofErr w:type="spellEnd"/>
-            <w:r>
-              <w:rPr>
-                <w:rFonts w:ascii="Courier New" w:eastAsia="Courier New" w:hAnsi="Courier New" w:cs="Courier New"/>
-                <w:sz w:val="19"/>
-                <w:szCs w:val="19"/>
-              </w:rPr>
-              <w:t xml:space="preserve"> using an SQL INSERT</w:t>
-            </w:r>
-          </w:p>
-          <w:p>
-            <w:r>
-              <w:rPr>
-                <w:rFonts w:ascii="Courier New" w:eastAsia="Courier New" w:hAnsi="Courier New" w:cs="Courier New"/>
-                <w:sz w:val="19"/>
-                <w:szCs w:val="19"/>
-              </w:rPr>
-              <w:t xml:space="preserve">            ADD 1 to </w:t>
-            </w:r>
-            <w:proofErr w:type="spellStart"/>
-            <w:r>
-              <w:rPr>
-                <w:rFonts w:ascii="Courier New" w:eastAsia="Courier New" w:hAnsi="Courier New" w:cs="Courier New"/>
-                <w:sz w:val="19"/>
-                <w:szCs w:val="19"/>
-              </w:rPr>
-              <w:t>seatsMade</w:t>
-            </w:r>
-            <w:proofErr w:type="spellEnd"/>
-          </w:p>
-          <w:p>
-            <w:r>
-              <w:rPr>
-                <w:rFonts w:ascii="Courier New" w:eastAsia="Courier New" w:hAnsi="Courier New" w:cs="Courier New"/>
-                <w:sz w:val="19"/>
-                <w:szCs w:val="19"/>
-              </w:rPr>
-              <w:t xml:space="preserve">        END IF</w:t>
-            </w:r>
-          </w:p>
-          <w:p>
-            <w:r>
-              <w:rPr>
-                <w:rFonts w:ascii="Courier New" w:eastAsia="Courier New" w:hAnsi="Courier New" w:cs="Courier New"/>
-                <w:sz w:val="19"/>
-                <w:szCs w:val="19"/>
-              </w:rPr>
-              <w:t xml:space="preserve">    NEXT </w:t>
-            </w:r>
-            <w:proofErr w:type="spellStart"/>
-            <w:r>
-              <w:rPr>
-                <w:rFonts w:ascii="Courier New" w:eastAsia="Courier New" w:hAnsi="Courier New" w:cs="Courier New"/>
-                <w:sz w:val="19"/>
-                <w:szCs w:val="19"/>
-              </w:rPr>
-              <w:t>seatNumber</w:t>
-            </w:r>
-            <w:proofErr w:type="spellEnd"/>
-          </w:p>
-          <w:p>
-            <w:r>
-              <w:rPr>
-                <w:rFonts w:ascii="Courier New" w:eastAsia="Courier New" w:hAnsi="Courier New" w:cs="Courier New"/>
-                <w:sz w:val="19"/>
-                <w:szCs w:val="19"/>
-              </w:rPr>
-              <w:t xml:space="preserve">    MOVE </w:t>
-            </w:r>
-            <w:proofErr w:type="spellStart"/>
-            <w:r>
-              <w:rPr>
-                <w:rFonts w:ascii="Courier New" w:eastAsia="Courier New" w:hAnsi="Courier New" w:cs="Courier New"/>
-                <w:sz w:val="19"/>
-                <w:szCs w:val="19"/>
-              </w:rPr>
-              <w:t>rowLetter</w:t>
-            </w:r>
-            <w:proofErr w:type="spellEnd"/>
-            <w:r>
-              <w:rPr>
-                <w:rFonts w:ascii="Courier New" w:eastAsia="Courier New" w:hAnsi="Courier New" w:cs="Courier New"/>
-                <w:sz w:val="19"/>
-                <w:szCs w:val="19"/>
-              </w:rPr>
-              <w:t xml:space="preserve"> on to the next letter of the alphabet</w:t>
+              <w:t xml:space="preserve">    MOVE rowLetter on to the next letter of the alphabet</w:t>
             </w:r>
           </w:p>
           <w:p>
@@ -8586,43 +8004,47 @@
                 <w:sz w:val="19"/>
                 <w:szCs w:val="19"/>
               </w:rPr>
-              <w:t xml:space="preserve">    LOOK UP </w:t>
-            </w:r>
-            <w:proofErr w:type="spellStart"/>
+              <w:t xml:space="preserve">    LOOK UP tblBookingSeat joined to tblBooking to see whether</w:t>
+            </w:r>
+          </w:p>
+          <w:p>
             <w:r>
               <w:rPr>
                 <w:rFonts w:ascii="Courier New" w:eastAsia="Courier New" w:hAnsi="Courier New" w:cs="Courier New"/>
                 <w:sz w:val="19"/>
                 <w:szCs w:val="19"/>
               </w:rPr>
-              <w:t>tblBookingSeat</w:t>
-            </w:r>
-            <w:proofErr w:type="spellEnd"/>
+              <w:t xml:space="preserve">        that seat is already booked for this screening (SQL SELECT)</w:t>
+            </w:r>
+          </w:p>
+          <w:p>
             <w:r>
               <w:rPr>
                 <w:rFonts w:ascii="Courier New" w:eastAsia="Courier New" w:hAnsi="Courier New" w:cs="Courier New"/>
                 <w:sz w:val="19"/>
                 <w:szCs w:val="19"/>
               </w:rPr>
-              <w:t xml:space="preserve"> joined to </w:t>
-            </w:r>
-            <w:proofErr w:type="spellStart"/>
+              <w:t xml:space="preserve">    IF the seat is already booked THEN</w:t>
+            </w:r>
+          </w:p>
+          <w:p>
             <w:r>
               <w:rPr>
                 <w:rFonts w:ascii="Courier New" w:eastAsia="Courier New" w:hAnsi="Courier New" w:cs="Courier New"/>
                 <w:sz w:val="19"/>
                 <w:szCs w:val="19"/>
               </w:rPr>
-              <w:t>tblBooking</w:t>
-            </w:r>
-            <w:proofErr w:type="spellEnd"/>
+              <w:t xml:space="preserve">        DISPLAY "One or more of the selected seats has been taken"</w:t>
+            </w:r>
+          </w:p>
+          <w:p>
             <w:r>
               <w:rPr>
                 <w:rFonts w:ascii="Courier New" w:eastAsia="Courier New" w:hAnsi="Courier New" w:cs="Courier New"/>
                 <w:sz w:val="19"/>
                 <w:szCs w:val="19"/>
               </w:rPr>
-              <w:t xml:space="preserve"> to see whether</w:t>
+              <w:t xml:space="preserve">        STOP the booking</w:t>
             </w:r>
           </w:p>
           <w:p>
@@ -8632,7 +8054,7 @@
                 <w:sz w:val="19"/>
                 <w:szCs w:val="19"/>
               </w:rPr>
-              <w:t xml:space="preserve">        that seat is already booked for this screening (SQL SELECT)</w:t>
+              <w:t xml:space="preserve">    END IF</w:t>
             </w:r>
           </w:p>
           <w:p>
@@ -8642,7 +8064,7 @@
                 <w:sz w:val="19"/>
                 <w:szCs w:val="19"/>
               </w:rPr>
-              <w:t xml:space="preserve">    IF the seat is already booked THEN</w:t>
+              <w:t>NEXT seat</w:t>
             </w:r>
           </w:p>
           <w:p>
@@ -8652,7 +8074,7 @@
                 <w:sz w:val="19"/>
                 <w:szCs w:val="19"/>
               </w:rPr>
-              <w:t xml:space="preserve">        DISPLAY "One or more of the selected seats has been taken"</w:t>
+              <w:t>INSERT a new record into tblBooking with the customer, screening,</w:t>
             </w:r>
           </w:p>
           <w:p>
@@ -8662,7 +8084,7 @@
                 <w:sz w:val="19"/>
                 <w:szCs w:val="19"/>
               </w:rPr>
-              <w:t xml:space="preserve">        STOP the booking</w:t>
+              <w:t xml:space="preserve">       today's date and the calculated total cost</w:t>
             </w:r>
           </w:p>
           <w:p>
@@ -8672,7 +8094,7 @@
                 <w:sz w:val="19"/>
                 <w:szCs w:val="19"/>
               </w:rPr>
-              <w:t xml:space="preserve">    END IF</w:t>
+              <w:t>GET the new BookingID that was created</w:t>
             </w:r>
           </w:p>
           <w:p>
@@ -8682,7 +8104,7 @@
                 <w:sz w:val="19"/>
                 <w:szCs w:val="19"/>
               </w:rPr>
-              <w:t>NEXT seat</w:t>
+              <w:t>FOR each chosen seat</w:t>
             </w:r>
           </w:p>
           <w:p>
@@ -8692,130 +8114,8 @@
                 <w:sz w:val="19"/>
                 <w:szCs w:val="19"/>
               </w:rPr>
-              <w:t xml:space="preserve">INSERT a new record into </w:t>
-            </w:r>
-            <w:proofErr w:type="spellStart"/>
-            <w:r>
-              <w:rPr>
-                <w:rFonts w:ascii="Courier New" w:eastAsia="Courier New" w:hAnsi="Courier New" w:cs="Courier New"/>
-                <w:sz w:val="19"/>
-                <w:szCs w:val="19"/>
-              </w:rPr>
-              <w:t>tblBooking</w:t>
-            </w:r>
-            <w:proofErr w:type="spellEnd"/>
-            <w:r>
-              <w:rPr>
-                <w:rFonts w:ascii="Courier New" w:eastAsia="Courier New" w:hAnsi="Courier New" w:cs="Courier New"/>
-                <w:sz w:val="19"/>
-                <w:szCs w:val="19"/>
-              </w:rPr>
-              <w:t xml:space="preserve"> with the customer, screening,</w:t>
-            </w:r>
-          </w:p>
-          <w:p>
-            <w:r>
-              <w:rPr>
-                <w:rFonts w:ascii="Courier New" w:eastAsia="Courier New" w:hAnsi="Courier New" w:cs="Courier New"/>
-                <w:sz w:val="19"/>
-                <w:szCs w:val="19"/>
-              </w:rPr>
-              <w:t xml:space="preserve">       today's date and the calculated total cost</w:t>
-            </w:r>
-          </w:p>
-          <w:p>
-            <w:r>
-              <w:rPr>
-                <w:rFonts w:ascii="Courier New" w:eastAsia="Courier New" w:hAnsi="Courier New" w:cs="Courier New"/>
-                <w:sz w:val="19"/>
-                <w:szCs w:val="19"/>
-              </w:rPr>
-              <w:t xml:space="preserve">GET the new </w:t>
-            </w:r>
-            <w:proofErr w:type="spellStart"/>
-            <w:r>
-              <w:rPr>
-                <w:rFonts w:ascii="Courier New" w:eastAsia="Courier New" w:hAnsi="Courier New" w:cs="Courier New"/>
-                <w:sz w:val="19"/>
-                <w:szCs w:val="19"/>
-              </w:rPr>
-              <w:t>BookingID</w:t>
-            </w:r>
-            <w:proofErr w:type="spellEnd"/>
-            <w:r>
-              <w:rPr>
-                <w:rFonts w:ascii="Courier New" w:eastAsia="Courier New" w:hAnsi="Courier New" w:cs="Courier New"/>
-                <w:sz w:val="19"/>
-                <w:szCs w:val="19"/>
-              </w:rPr>
-              <w:t xml:space="preserve"> that was created</w:t>
-            </w:r>
-          </w:p>
-          <w:p>
-            <w:r>
-              <w:rPr>
-                <w:rFonts w:ascii="Courier New" w:eastAsia="Courier New" w:hAnsi="Courier New" w:cs="Courier New"/>
-                <w:sz w:val="19"/>
-                <w:szCs w:val="19"/>
-              </w:rPr>
-              <w:t>FOR each chosen seat</w:t>
-            </w:r>
-          </w:p>
-          <w:p>
-            <w:r>
-              <w:rPr>
-                <w:rFonts w:ascii="Courier New" w:eastAsia="Courier New" w:hAnsi="Courier New" w:cs="Courier New"/>
-                <w:sz w:val="19"/>
-                <w:szCs w:val="19"/>
-              </w:rPr>
-              <w:t xml:space="preserve">    INSERT a record into </w:t>
-            </w:r>
-            <w:proofErr w:type="spellStart"/>
-            <w:r>
-              <w:rPr>
-                <w:rFonts w:ascii="Courier New" w:eastAsia="Courier New" w:hAnsi="Courier New" w:cs="Courier New"/>
-                <w:sz w:val="19"/>
-                <w:szCs w:val="19"/>
-              </w:rPr>
-              <w:t>tblBookingSeat</w:t>
-            </w:r>
-            <w:proofErr w:type="spellEnd"/>
-            <w:r>
-              <w:rPr>
-                <w:rFonts w:ascii="Courier New" w:eastAsia="Courier New" w:hAnsi="Courier New" w:cs="Courier New"/>
-                <w:sz w:val="19"/>
-                <w:szCs w:val="19"/>
-              </w:rPr>
-              <w:t xml:space="preserve"> linking </w:t>
-            </w:r>
-            <w:proofErr w:type="spellStart"/>
-            <w:r>
-              <w:rPr>
-                <w:rFonts w:ascii="Courier New" w:eastAsia="Courier New" w:hAnsi="Courier New" w:cs="Courier New"/>
-                <w:sz w:val="19"/>
-                <w:szCs w:val="19"/>
-              </w:rPr>
-              <w:t>BookingID</w:t>
-            </w:r>
-            <w:proofErr w:type="spellEnd"/>
-            <w:r>
-              <w:rPr>
-                <w:rFonts w:ascii="Courier New" w:eastAsia="Courier New" w:hAnsi="Courier New" w:cs="Courier New"/>
-                <w:sz w:val="19"/>
-                <w:szCs w:val="19"/>
-              </w:rPr>
-              <w:t xml:space="preserve"> to </w:t>
-            </w:r>
-            <w:proofErr w:type="spellStart"/>
-            <w:r>
-              <w:rPr>
-                <w:rFonts w:ascii="Courier New" w:eastAsia="Courier New" w:hAnsi="Courier New" w:cs="Courier New"/>
-                <w:sz w:val="19"/>
-                <w:szCs w:val="19"/>
-              </w:rPr>
-              <w:t>SeatID</w:t>
-            </w:r>
-            <w:proofErr w:type="spellEnd"/>
+              <w:t xml:space="preserve">    INSERT a record into tblBookingSeat linking BookingID to SeatID</w:t>
+            </w:r>
           </w:p>
           <w:p>
             <w:r>
@@ -8918,18 +8218,18 @@
                 <w:sz w:val="19"/>
                 <w:szCs w:val="19"/>
               </w:rPr>
-              <w:t xml:space="preserve">GET the selected screening and its </w:t>
-            </w:r>
-            <w:proofErr w:type="spellStart"/>
+              <w:t>GET the selected screening and its ScreenID</w:t>
+            </w:r>
+          </w:p>
+          <w:p>
             <w:r>
               <w:rPr>
                 <w:rFonts w:ascii="Courier New" w:eastAsia="Courier New" w:hAnsi="Courier New" w:cs="Courier New"/>
                 <w:sz w:val="19"/>
                 <w:szCs w:val="19"/>
               </w:rPr>
-              <w:t>ScreenID</w:t>
-            </w:r>
-            <w:proofErr w:type="spellEnd"/>
+              <w:t>SELECT all seats for that screen from tblSeat,</w:t>
+            </w:r>
           </w:p>
           <w:p>
             <w:r>
@@ -8938,66 +8238,28 @@
                 <w:sz w:val="19"/>
                 <w:szCs w:val="19"/>
               </w:rPr>
-              <w:t xml:space="preserve">SELECT all seats for that screen from </w:t>
-            </w:r>
-            <w:proofErr w:type="spellStart"/>
+              <w:t xml:space="preserve">       ordered by row then seat number</w:t>
+            </w:r>
+          </w:p>
+          <w:p>
             <w:r>
               <w:rPr>
                 <w:rFonts w:ascii="Courier New" w:eastAsia="Courier New" w:hAnsi="Courier New" w:cs="Courier New"/>
                 <w:sz w:val="19"/>
                 <w:szCs w:val="19"/>
               </w:rPr>
-              <w:t>tblSeat</w:t>
-            </w:r>
-            <w:proofErr w:type="spellEnd"/>
+              <w:t>SELECT all seats already booked for this screening</w:t>
+            </w:r>
+          </w:p>
+          <w:p>
             <w:r>
               <w:rPr>
                 <w:rFonts w:ascii="Courier New" w:eastAsia="Courier New" w:hAnsi="Courier New" w:cs="Courier New"/>
                 <w:sz w:val="19"/>
                 <w:szCs w:val="19"/>
               </w:rPr>
-              <w:t>,</w:t>
-            </w:r>
-          </w:p>
-          <w:p>
-            <w:r>
-              <w:rPr>
-                <w:rFonts w:ascii="Courier New" w:eastAsia="Courier New" w:hAnsi="Courier New" w:cs="Courier New"/>
-                <w:sz w:val="19"/>
-                <w:szCs w:val="19"/>
-              </w:rPr>
-              <w:t xml:space="preserve">       ordered by row then seat number</w:t>
-            </w:r>
-          </w:p>
-          <w:p>
-            <w:r>
-              <w:rPr>
-                <w:rFonts w:ascii="Courier New" w:eastAsia="Courier New" w:hAnsi="Courier New" w:cs="Courier New"/>
-                <w:sz w:val="19"/>
-                <w:szCs w:val="19"/>
-              </w:rPr>
-              <w:t>SELECT all seats already booked for this screening</w:t>
-            </w:r>
-          </w:p>
-          <w:p>
-            <w:r>
-              <w:rPr>
-                <w:rFonts w:ascii="Courier New" w:eastAsia="Courier New" w:hAnsi="Courier New" w:cs="Courier New"/>
-                <w:sz w:val="19"/>
-                <w:szCs w:val="19"/>
-              </w:rPr>
-              <w:t xml:space="preserve">       from </w:t>
-            </w:r>
-            <w:proofErr w:type="spellStart"/>
-            <w:r>
-              <w:rPr>
-                <w:rFonts w:ascii="Courier New" w:eastAsia="Courier New" w:hAnsi="Courier New" w:cs="Courier New"/>
-                <w:sz w:val="19"/>
-                <w:szCs w:val="19"/>
-              </w:rPr>
-              <w:t>tblBookingSeat</w:t>
-            </w:r>
-            <w:proofErr w:type="spellEnd"/>
+              <w:t xml:space="preserve">       from tblBookingSeat</w:t>
+            </w:r>
           </w:p>
           <w:p>
             <w:r>
@@ -9140,25 +8402,27 @@
                 <w:sz w:val="19"/>
                 <w:szCs w:val="19"/>
               </w:rPr>
-              <w:t xml:space="preserve">SET </w:t>
-            </w:r>
-            <w:proofErr w:type="spellStart"/>
+              <w:t>SET foodTotal to 0</w:t>
+            </w:r>
+          </w:p>
+          <w:p>
             <w:r>
               <w:rPr>
                 <w:rFonts w:ascii="Courier New" w:eastAsia="Courier New" w:hAnsi="Courier New" w:cs="Courier New"/>
                 <w:sz w:val="19"/>
                 <w:szCs w:val="19"/>
               </w:rPr>
-              <w:t>foodTotal</w:t>
-            </w:r>
-            <w:proofErr w:type="spellEnd"/>
+              <w:t>FOR each food item the customer has added</w:t>
+            </w:r>
+          </w:p>
+          <w:p>
             <w:r>
               <w:rPr>
                 <w:rFonts w:ascii="Courier New" w:eastAsia="Courier New" w:hAnsi="Courier New" w:cs="Courier New"/>
                 <w:sz w:val="19"/>
                 <w:szCs w:val="19"/>
               </w:rPr>
-              <w:t xml:space="preserve"> to 0</w:t>
+              <w:t xml:space="preserve">    LOOK UP the item price in tblFoodItem</w:t>
             </w:r>
           </w:p>
           <w:p>
@@ -9168,7 +8432,7 @@
                 <w:sz w:val="19"/>
                 <w:szCs w:val="19"/>
               </w:rPr>
-              <w:t>FOR each food item the customer has added</w:t>
+              <w:t xml:space="preserve">    CALCULATE lineCost as price multiplied by quantity</w:t>
             </w:r>
           </w:p>
           <w:p>
@@ -9178,18 +8442,18 @@
                 <w:sz w:val="19"/>
                 <w:szCs w:val="19"/>
               </w:rPr>
-              <w:t xml:space="preserve">    LOOK UP the item price in </w:t>
-            </w:r>
-            <w:proofErr w:type="spellStart"/>
+              <w:t xml:space="preserve">    ADD lineCost to foodTotal</w:t>
+            </w:r>
+          </w:p>
+          <w:p>
             <w:r>
               <w:rPr>
                 <w:rFonts w:ascii="Courier New" w:eastAsia="Courier New" w:hAnsi="Courier New" w:cs="Courier New"/>
                 <w:sz w:val="19"/>
                 <w:szCs w:val="19"/>
               </w:rPr>
-              <w:t>tblFoodItem</w:t>
-            </w:r>
-            <w:proofErr w:type="spellEnd"/>
+              <w:t>NEXT item</w:t>
+            </w:r>
           </w:p>
           <w:p>
             <w:r>
@@ -9198,185 +8462,27 @@
                 <w:sz w:val="19"/>
                 <w:szCs w:val="19"/>
               </w:rPr>
-              <w:t xml:space="preserve">    CALCULATE </w:t>
-            </w:r>
-            <w:proofErr w:type="spellStart"/>
+              <w:t>CALCULATE seatTotal as number of seats times the ticket price</w:t>
+            </w:r>
+          </w:p>
+          <w:p>
             <w:r>
               <w:rPr>
                 <w:rFonts w:ascii="Courier New" w:eastAsia="Courier New" w:hAnsi="Courier New" w:cs="Courier New"/>
                 <w:sz w:val="19"/>
                 <w:szCs w:val="19"/>
               </w:rPr>
-              <w:t>lineCost</w:t>
-            </w:r>
-            <w:proofErr w:type="spellEnd"/>
+              <w:t>CALCULATE totalCost as seatTotal plus foodTotal</w:t>
+            </w:r>
+          </w:p>
+          <w:p>
             <w:r>
               <w:rPr>
                 <w:rFonts w:ascii="Courier New" w:eastAsia="Courier New" w:hAnsi="Courier New" w:cs="Courier New"/>
                 <w:sz w:val="19"/>
                 <w:szCs w:val="19"/>
               </w:rPr>
-              <w:t xml:space="preserve"> as price multiplied by quantity</w:t>
-            </w:r>
-          </w:p>
-          <w:p>
-            <w:r>
-              <w:rPr>
-                <w:rFonts w:ascii="Courier New" w:eastAsia="Courier New" w:hAnsi="Courier New" w:cs="Courier New"/>
-                <w:sz w:val="19"/>
-                <w:szCs w:val="19"/>
-              </w:rPr>
-              <w:t xml:space="preserve">    ADD </w:t>
-            </w:r>
-            <w:proofErr w:type="spellStart"/>
-            <w:r>
-              <w:rPr>
-                <w:rFonts w:ascii="Courier New" w:eastAsia="Courier New" w:hAnsi="Courier New" w:cs="Courier New"/>
-                <w:sz w:val="19"/>
-                <w:szCs w:val="19"/>
-              </w:rPr>
-              <w:t>lineCost</w:t>
-            </w:r>
-            <w:proofErr w:type="spellEnd"/>
-            <w:r>
-              <w:rPr>
-                <w:rFonts w:ascii="Courier New" w:eastAsia="Courier New" w:hAnsi="Courier New" w:cs="Courier New"/>
-                <w:sz w:val="19"/>
-                <w:szCs w:val="19"/>
-              </w:rPr>
-              <w:t xml:space="preserve"> to </w:t>
-            </w:r>
-            <w:proofErr w:type="spellStart"/>
-            <w:r>
-              <w:rPr>
-                <w:rFonts w:ascii="Courier New" w:eastAsia="Courier New" w:hAnsi="Courier New" w:cs="Courier New"/>
-                <w:sz w:val="19"/>
-                <w:szCs w:val="19"/>
-              </w:rPr>
-              <w:t>foodTotal</w:t>
-            </w:r>
-            <w:proofErr w:type="spellEnd"/>
-          </w:p>
-          <w:p>
-            <w:r>
-              <w:rPr>
-                <w:rFonts w:ascii="Courier New" w:eastAsia="Courier New" w:hAnsi="Courier New" w:cs="Courier New"/>
-                <w:sz w:val="19"/>
-                <w:szCs w:val="19"/>
-              </w:rPr>
-              <w:t>NEXT item</w:t>
-            </w:r>
-          </w:p>
-          <w:p>
-            <w:r>
-              <w:rPr>
-                <w:rFonts w:ascii="Courier New" w:eastAsia="Courier New" w:hAnsi="Courier New" w:cs="Courier New"/>
-                <w:sz w:val="19"/>
-                <w:szCs w:val="19"/>
-              </w:rPr>
-              <w:t xml:space="preserve">CALCULATE </w:t>
-            </w:r>
-            <w:proofErr w:type="spellStart"/>
-            <w:r>
-              <w:rPr>
-                <w:rFonts w:ascii="Courier New" w:eastAsia="Courier New" w:hAnsi="Courier New" w:cs="Courier New"/>
-                <w:sz w:val="19"/>
-                <w:szCs w:val="19"/>
-              </w:rPr>
-              <w:t>seatTotal</w:t>
-            </w:r>
-            <w:proofErr w:type="spellEnd"/>
-            <w:r>
-              <w:rPr>
-                <w:rFonts w:ascii="Courier New" w:eastAsia="Courier New" w:hAnsi="Courier New" w:cs="Courier New"/>
-                <w:sz w:val="19"/>
-                <w:szCs w:val="19"/>
-              </w:rPr>
-              <w:t xml:space="preserve"> as number of seats times the ticket price</w:t>
-            </w:r>
-          </w:p>
-          <w:p>
-            <w:r>
-              <w:rPr>
-                <w:rFonts w:ascii="Courier New" w:eastAsia="Courier New" w:hAnsi="Courier New" w:cs="Courier New"/>
-                <w:sz w:val="19"/>
-                <w:szCs w:val="19"/>
-              </w:rPr>
-              <w:t xml:space="preserve">CALCULATE </w:t>
-            </w:r>
-            <w:proofErr w:type="spellStart"/>
-            <w:r>
-              <w:rPr>
-                <w:rFonts w:ascii="Courier New" w:eastAsia="Courier New" w:hAnsi="Courier New" w:cs="Courier New"/>
-                <w:sz w:val="19"/>
-                <w:szCs w:val="19"/>
-              </w:rPr>
-              <w:t>totalCost</w:t>
-            </w:r>
-            <w:proofErr w:type="spellEnd"/>
-            <w:r>
-              <w:rPr>
-                <w:rFonts w:ascii="Courier New" w:eastAsia="Courier New" w:hAnsi="Courier New" w:cs="Courier New"/>
-                <w:sz w:val="19"/>
-                <w:szCs w:val="19"/>
-              </w:rPr>
-              <w:t xml:space="preserve"> as </w:t>
-            </w:r>
-            <w:proofErr w:type="spellStart"/>
-            <w:r>
-              <w:rPr>
-                <w:rFonts w:ascii="Courier New" w:eastAsia="Courier New" w:hAnsi="Courier New" w:cs="Courier New"/>
-                <w:sz w:val="19"/>
-                <w:szCs w:val="19"/>
-              </w:rPr>
-              <w:t>seatTotal</w:t>
-            </w:r>
-            <w:proofErr w:type="spellEnd"/>
-            <w:r>
-              <w:rPr>
-                <w:rFonts w:ascii="Courier New" w:eastAsia="Courier New" w:hAnsi="Courier New" w:cs="Courier New"/>
-                <w:sz w:val="19"/>
-                <w:szCs w:val="19"/>
-              </w:rPr>
-              <w:t xml:space="preserve"> plus </w:t>
-            </w:r>
-            <w:proofErr w:type="spellStart"/>
-            <w:r>
-              <w:rPr>
-                <w:rFonts w:ascii="Courier New" w:eastAsia="Courier New" w:hAnsi="Courier New" w:cs="Courier New"/>
-                <w:sz w:val="19"/>
-                <w:szCs w:val="19"/>
-              </w:rPr>
-              <w:t>foodTotal</w:t>
-            </w:r>
-            <w:proofErr w:type="spellEnd"/>
-          </w:p>
-          <w:p>
-            <w:r>
-              <w:rPr>
-                <w:rFonts w:ascii="Courier New" w:eastAsia="Courier New" w:hAnsi="Courier New" w:cs="Courier New"/>
-                <w:sz w:val="19"/>
-                <w:szCs w:val="19"/>
-              </w:rPr>
-              <w:t xml:space="preserve">DISPLAY </w:t>
-            </w:r>
-            <w:proofErr w:type="spellStart"/>
-            <w:r>
-              <w:rPr>
-                <w:rFonts w:ascii="Courier New" w:eastAsia="Courier New" w:hAnsi="Courier New" w:cs="Courier New"/>
-                <w:sz w:val="19"/>
-                <w:szCs w:val="19"/>
-              </w:rPr>
-              <w:t>totalCost</w:t>
-            </w:r>
-            <w:proofErr w:type="spellEnd"/>
-            <w:r>
-              <w:rPr>
-                <w:rFonts w:ascii="Courier New" w:eastAsia="Courier New" w:hAnsi="Courier New" w:cs="Courier New"/>
-                <w:sz w:val="19"/>
-                <w:szCs w:val="19"/>
-              </w:rPr>
-              <w:t xml:space="preserve"> to the customer</w:t>
+              <w:t>DISPLAY totalCost to the customer</w:t>
             </w:r>
           </w:p>
         </w:tc>
@@ -9490,43 +8596,47 @@
                 <w:sz w:val="19"/>
                 <w:szCs w:val="19"/>
               </w:rPr>
-              <w:t xml:space="preserve">    SELECT all bookings from </w:t>
-            </w:r>
-            <w:proofErr w:type="spellStart"/>
+              <w:t xml:space="preserve">    SELECT all bookings from tblBooking where BookingDate is</w:t>
+            </w:r>
+          </w:p>
+          <w:p>
             <w:r>
               <w:rPr>
                 <w:rFonts w:ascii="Courier New" w:eastAsia="Courier New" w:hAnsi="Courier New" w:cs="Courier New"/>
                 <w:sz w:val="19"/>
                 <w:szCs w:val="19"/>
               </w:rPr>
-              <w:t>tblBooking</w:t>
-            </w:r>
-            <w:proofErr w:type="spellEnd"/>
+              <w:t xml:space="preserve">        between the start and end date (SQL SELECT)</w:t>
+            </w:r>
+          </w:p>
+          <w:p>
             <w:r>
               <w:rPr>
                 <w:rFonts w:ascii="Courier New" w:eastAsia="Courier New" w:hAnsi="Courier New" w:cs="Courier New"/>
                 <w:sz w:val="19"/>
                 <w:szCs w:val="19"/>
               </w:rPr>
-              <w:t xml:space="preserve"> where </w:t>
-            </w:r>
-            <w:proofErr w:type="spellStart"/>
+              <w:t xml:space="preserve">    SET totalTickets to 0</w:t>
+            </w:r>
+          </w:p>
+          <w:p>
             <w:r>
               <w:rPr>
                 <w:rFonts w:ascii="Courier New" w:eastAsia="Courier New" w:hAnsi="Courier New" w:cs="Courier New"/>
                 <w:sz w:val="19"/>
                 <w:szCs w:val="19"/>
               </w:rPr>
-              <w:t>BookingDate</w:t>
-            </w:r>
-            <w:proofErr w:type="spellEnd"/>
+              <w:t xml:space="preserve">    SET totalRevenue to 0</w:t>
+            </w:r>
+          </w:p>
+          <w:p>
             <w:r>
               <w:rPr>
                 <w:rFonts w:ascii="Courier New" w:eastAsia="Courier New" w:hAnsi="Courier New" w:cs="Courier New"/>
                 <w:sz w:val="19"/>
                 <w:szCs w:val="19"/>
               </w:rPr>
-              <w:t xml:space="preserve"> is</w:t>
+              <w:t xml:space="preserve">    FOR each booking returned</w:t>
             </w:r>
           </w:p>
           <w:p>
@@ -9536,7 +8646,7 @@
                 <w:sz w:val="19"/>
                 <w:szCs w:val="19"/>
               </w:rPr>
-              <w:t xml:space="preserve">        between the start and end date (SQL SELECT)</w:t>
+              <w:t xml:space="preserve">        COUNT the seats linked to it in tblBookingSeat</w:t>
             </w:r>
           </w:p>
           <w:p>
@@ -9546,25 +8656,27 @@
                 <w:sz w:val="19"/>
                 <w:szCs w:val="19"/>
               </w:rPr>
-              <w:t xml:space="preserve">    SET </w:t>
-            </w:r>
-            <w:proofErr w:type="spellStart"/>
+              <w:t xml:space="preserve">        ADD that count to totalTickets</w:t>
+            </w:r>
+          </w:p>
+          <w:p>
             <w:r>
               <w:rPr>
                 <w:rFonts w:ascii="Courier New" w:eastAsia="Courier New" w:hAnsi="Courier New" w:cs="Courier New"/>
                 <w:sz w:val="19"/>
                 <w:szCs w:val="19"/>
               </w:rPr>
-              <w:t>totalTickets</w:t>
-            </w:r>
-            <w:proofErr w:type="spellEnd"/>
+              <w:t xml:space="preserve">        ADD the booking's TotalCost to totalRevenue</w:t>
+            </w:r>
+          </w:p>
+          <w:p>
             <w:r>
               <w:rPr>
                 <w:rFonts w:ascii="Courier New" w:eastAsia="Courier New" w:hAnsi="Courier New" w:cs="Courier New"/>
                 <w:sz w:val="19"/>
                 <w:szCs w:val="19"/>
               </w:rPr>
-              <w:t xml:space="preserve"> to 0</w:t>
+              <w:t xml:space="preserve">    NEXT booking</w:t>
             </w:r>
           </w:p>
           <w:p>
@@ -9574,162 +8686,8 @@
                 <w:sz w:val="19"/>
                 <w:szCs w:val="19"/>
               </w:rPr>
-              <w:t xml:space="preserve">    SET </w:t>
-            </w:r>
-            <w:proofErr w:type="spellStart"/>
-            <w:r>
-              <w:rPr>
-                <w:rFonts w:ascii="Courier New" w:eastAsia="Courier New" w:hAnsi="Courier New" w:cs="Courier New"/>
-                <w:sz w:val="19"/>
-                <w:szCs w:val="19"/>
-              </w:rPr>
-              <w:t>totalRevenue</w:t>
-            </w:r>
-            <w:proofErr w:type="spellEnd"/>
-            <w:r>
-              <w:rPr>
-                <w:rFonts w:ascii="Courier New" w:eastAsia="Courier New" w:hAnsi="Courier New" w:cs="Courier New"/>
-                <w:sz w:val="19"/>
-                <w:szCs w:val="19"/>
-              </w:rPr>
-              <w:t xml:space="preserve"> to 0</w:t>
-            </w:r>
-          </w:p>
-          <w:p>
-            <w:r>
-              <w:rPr>
-                <w:rFonts w:ascii="Courier New" w:eastAsia="Courier New" w:hAnsi="Courier New" w:cs="Courier New"/>
-                <w:sz w:val="19"/>
-                <w:szCs w:val="19"/>
-              </w:rPr>
-              <w:t xml:space="preserve">    FOR each booking returned</w:t>
-            </w:r>
-          </w:p>
-          <w:p>
-            <w:r>
-              <w:rPr>
-                <w:rFonts w:ascii="Courier New" w:eastAsia="Courier New" w:hAnsi="Courier New" w:cs="Courier New"/>
-                <w:sz w:val="19"/>
-                <w:szCs w:val="19"/>
-              </w:rPr>
-              <w:t xml:space="preserve">        COUNT the seats linked to it in </w:t>
-            </w:r>
-            <w:proofErr w:type="spellStart"/>
-            <w:r>
-              <w:rPr>
-                <w:rFonts w:ascii="Courier New" w:eastAsia="Courier New" w:hAnsi="Courier New" w:cs="Courier New"/>
-                <w:sz w:val="19"/>
-                <w:szCs w:val="19"/>
-              </w:rPr>
-              <w:t>tblBookingSeat</w:t>
-            </w:r>
-            <w:proofErr w:type="spellEnd"/>
-          </w:p>
-          <w:p>
-            <w:r>
-              <w:rPr>
-                <w:rFonts w:ascii="Courier New" w:eastAsia="Courier New" w:hAnsi="Courier New" w:cs="Courier New"/>
-                <w:sz w:val="19"/>
-                <w:szCs w:val="19"/>
-              </w:rPr>
-              <w:t xml:space="preserve">        ADD that count to </w:t>
-            </w:r>
-            <w:proofErr w:type="spellStart"/>
-            <w:r>
-              <w:rPr>
-                <w:rFonts w:ascii="Courier New" w:eastAsia="Courier New" w:hAnsi="Courier New" w:cs="Courier New"/>
-                <w:sz w:val="19"/>
-                <w:szCs w:val="19"/>
-              </w:rPr>
-              <w:t>totalTickets</w:t>
-            </w:r>
-            <w:proofErr w:type="spellEnd"/>
-          </w:p>
-          <w:p>
-            <w:r>
-              <w:rPr>
-                <w:rFonts w:ascii="Courier New" w:eastAsia="Courier New" w:hAnsi="Courier New" w:cs="Courier New"/>
-                <w:sz w:val="19"/>
-                <w:szCs w:val="19"/>
-              </w:rPr>
-              <w:t xml:space="preserve">        ADD the booking's </w:t>
-            </w:r>
-            <w:proofErr w:type="spellStart"/>
-            <w:r>
-              <w:rPr>
-                <w:rFonts w:ascii="Courier New" w:eastAsia="Courier New" w:hAnsi="Courier New" w:cs="Courier New"/>
-                <w:sz w:val="19"/>
-                <w:szCs w:val="19"/>
-              </w:rPr>
-              <w:t>TotalCost</w:t>
-            </w:r>
-            <w:proofErr w:type="spellEnd"/>
-            <w:r>
-              <w:rPr>
-                <w:rFonts w:ascii="Courier New" w:eastAsia="Courier New" w:hAnsi="Courier New" w:cs="Courier New"/>
-                <w:sz w:val="19"/>
-                <w:szCs w:val="19"/>
-              </w:rPr>
-              <w:t xml:space="preserve"> to </w:t>
-            </w:r>
-            <w:proofErr w:type="spellStart"/>
-            <w:r>
-              <w:rPr>
-                <w:rFonts w:ascii="Courier New" w:eastAsia="Courier New" w:hAnsi="Courier New" w:cs="Courier New"/>
-                <w:sz w:val="19"/>
-                <w:szCs w:val="19"/>
-              </w:rPr>
-              <w:t>totalRevenue</w:t>
-            </w:r>
-            <w:proofErr w:type="spellEnd"/>
-          </w:p>
-          <w:p>
-            <w:r>
-              <w:rPr>
-                <w:rFonts w:ascii="Courier New" w:eastAsia="Courier New" w:hAnsi="Courier New" w:cs="Courier New"/>
-                <w:sz w:val="19"/>
-                <w:szCs w:val="19"/>
-              </w:rPr>
-              <w:t xml:space="preserve">    NEXT booking</w:t>
-            </w:r>
-          </w:p>
-          <w:p>
-            <w:r>
-              <w:rPr>
-                <w:rFonts w:ascii="Courier New" w:eastAsia="Courier New" w:hAnsi="Courier New" w:cs="Courier New"/>
-                <w:sz w:val="19"/>
-                <w:szCs w:val="19"/>
-              </w:rPr>
-              <w:t xml:space="preserve">    DISPLAY </w:t>
-            </w:r>
-            <w:proofErr w:type="spellStart"/>
-            <w:r>
-              <w:rPr>
-                <w:rFonts w:ascii="Courier New" w:eastAsia="Courier New" w:hAnsi="Courier New" w:cs="Courier New"/>
-                <w:sz w:val="19"/>
-                <w:szCs w:val="19"/>
-              </w:rPr>
-              <w:t>totalTickets</w:t>
-            </w:r>
-            <w:proofErr w:type="spellEnd"/>
-            <w:r>
-              <w:rPr>
-                <w:rFonts w:ascii="Courier New" w:eastAsia="Courier New" w:hAnsi="Courier New" w:cs="Courier New"/>
-                <w:sz w:val="19"/>
-                <w:szCs w:val="19"/>
-              </w:rPr>
-              <w:t xml:space="preserve"> and </w:t>
-            </w:r>
-            <w:proofErr w:type="spellStart"/>
-            <w:r>
-              <w:rPr>
-                <w:rFonts w:ascii="Courier New" w:eastAsia="Courier New" w:hAnsi="Courier New" w:cs="Courier New"/>
-                <w:sz w:val="19"/>
-                <w:szCs w:val="19"/>
-              </w:rPr>
-              <w:t>totalRevenue</w:t>
-            </w:r>
-            <w:proofErr w:type="spellEnd"/>
+              <w:t xml:space="preserve">    DISPLAY totalTickets and totalRevenue</w:t>
+            </w:r>
           </w:p>
           <w:p>
             <w:r>
@@ -9852,18 +8810,8 @@
                 <w:sz w:val="19"/>
                 <w:szCs w:val="19"/>
               </w:rPr>
-              <w:t xml:space="preserve">    SELECT bookings joined to customers where </w:t>
-            </w:r>
-            <w:proofErr w:type="spellStart"/>
-            <w:r>
-              <w:rPr>
-                <w:rFonts w:ascii="Courier New" w:eastAsia="Courier New" w:hAnsi="Courier New" w:cs="Courier New"/>
-                <w:sz w:val="19"/>
-                <w:szCs w:val="19"/>
-              </w:rPr>
-              <w:t>CustomerSurname</w:t>
-            </w:r>
-            <w:proofErr w:type="spellEnd"/>
+              <w:t xml:space="preserve">    SELECT bookings joined to customers where CustomerSurname</w:t>
+            </w:r>
           </w:p>
           <w:p>
             <w:r>
@@ -9961,15 +8909,7 @@
         <w:spacing w:after="160" w:line="276" w:lineRule="auto"/>
       </w:pPr>
       <w:r>
-        <w:t xml:space="preserve">When a booking is cancelled its seats need to become available again. Because availability is worked out from the link table, simply removing the booking's records from </w:t>
-      </w:r>
-      <w:proofErr w:type="spellStart"/>
-      <w:r>
-        <w:t>tblBookingSeat</w:t>
-      </w:r>
-      <w:proofErr w:type="spellEnd"/>
-      <w:r>
-        <w:t xml:space="preserve"> frees those seats automatically with no separate step needed.</w:t>
+        <w:t>When a booking is cancelled its seats need to become available again. Because availability is worked out from the link table, simply removing the booking's records from tblBookingSeat frees those seats automatically with no separate step needed.</w:t>
       </w:r>
     </w:p>
     <w:tbl>
@@ -10009,25 +8949,27 @@
                 <w:sz w:val="19"/>
                 <w:szCs w:val="19"/>
               </w:rPr>
-              <w:t xml:space="preserve">GET the </w:t>
-            </w:r>
-            <w:proofErr w:type="spellStart"/>
+              <w:t>GET the BookingID of the booking to cancel</w:t>
+            </w:r>
+          </w:p>
+          <w:p>
             <w:r>
               <w:rPr>
                 <w:rFonts w:ascii="Courier New" w:eastAsia="Courier New" w:hAnsi="Courier New" w:cs="Courier New"/>
                 <w:sz w:val="19"/>
                 <w:szCs w:val="19"/>
               </w:rPr>
-              <w:t>BookingID</w:t>
-            </w:r>
-            <w:proofErr w:type="spellEnd"/>
+              <w:t>DISPLAY "Are you sure you want to cancel this booking?"</w:t>
+            </w:r>
+          </w:p>
+          <w:p>
             <w:r>
               <w:rPr>
                 <w:rFonts w:ascii="Courier New" w:eastAsia="Courier New" w:hAnsi="Courier New" w:cs="Courier New"/>
                 <w:sz w:val="19"/>
                 <w:szCs w:val="19"/>
               </w:rPr>
-              <w:t xml:space="preserve"> of the booking to cancel</w:t>
+              <w:t>IF the user confirms THEN</w:t>
             </w:r>
           </w:p>
           <w:p>
@@ -10037,7 +8979,7 @@
                 <w:sz w:val="19"/>
                 <w:szCs w:val="19"/>
               </w:rPr>
-              <w:t>DISPLAY "Are you sure you want to cancel this booking?"</w:t>
+              <w:t xml:space="preserve">    DELETE all records in tblBookingSeat for that BookingID</w:t>
             </w:r>
           </w:p>
           <w:p>
@@ -10047,7 +8989,7 @@
                 <w:sz w:val="19"/>
                 <w:szCs w:val="19"/>
               </w:rPr>
-              <w:t>IF the user confirms THEN</w:t>
+              <w:t xml:space="preserve">    DELETE all records in tblOrderItem for that BookingID</w:t>
             </w:r>
           </w:p>
           <w:p>
@@ -10057,112 +8999,8 @@
                 <w:sz w:val="19"/>
                 <w:szCs w:val="19"/>
               </w:rPr>
-              <w:t xml:space="preserve">    DELETE all records in </w:t>
-            </w:r>
-            <w:proofErr w:type="spellStart"/>
-            <w:r>
-              <w:rPr>
-                <w:rFonts w:ascii="Courier New" w:eastAsia="Courier New" w:hAnsi="Courier New" w:cs="Courier New"/>
-                <w:sz w:val="19"/>
-                <w:szCs w:val="19"/>
-              </w:rPr>
-              <w:t>tblBookingSeat</w:t>
-            </w:r>
-            <w:proofErr w:type="spellEnd"/>
-            <w:r>
-              <w:rPr>
-                <w:rFonts w:ascii="Courier New" w:eastAsia="Courier New" w:hAnsi="Courier New" w:cs="Courier New"/>
-                <w:sz w:val="19"/>
-                <w:szCs w:val="19"/>
-              </w:rPr>
-              <w:t xml:space="preserve"> for that </w:t>
-            </w:r>
-            <w:proofErr w:type="spellStart"/>
-            <w:r>
-              <w:rPr>
-                <w:rFonts w:ascii="Courier New" w:eastAsia="Courier New" w:hAnsi="Courier New" w:cs="Courier New"/>
-                <w:sz w:val="19"/>
-                <w:szCs w:val="19"/>
-              </w:rPr>
-              <w:t>BookingID</w:t>
-            </w:r>
-            <w:proofErr w:type="spellEnd"/>
-          </w:p>
-          <w:p>
-            <w:r>
-              <w:rPr>
-                <w:rFonts w:ascii="Courier New" w:eastAsia="Courier New" w:hAnsi="Courier New" w:cs="Courier New"/>
-                <w:sz w:val="19"/>
-                <w:szCs w:val="19"/>
-              </w:rPr>
-              <w:t xml:space="preserve">    DELETE all records in </w:t>
-            </w:r>
-            <w:proofErr w:type="spellStart"/>
-            <w:r>
-              <w:rPr>
-                <w:rFonts w:ascii="Courier New" w:eastAsia="Courier New" w:hAnsi="Courier New" w:cs="Courier New"/>
-                <w:sz w:val="19"/>
-                <w:szCs w:val="19"/>
-              </w:rPr>
-              <w:t>tblOrderItem</w:t>
-            </w:r>
-            <w:proofErr w:type="spellEnd"/>
-            <w:r>
-              <w:rPr>
-                <w:rFonts w:ascii="Courier New" w:eastAsia="Courier New" w:hAnsi="Courier New" w:cs="Courier New"/>
-                <w:sz w:val="19"/>
-                <w:szCs w:val="19"/>
-              </w:rPr>
-              <w:t xml:space="preserve"> for that </w:t>
-            </w:r>
-            <w:proofErr w:type="spellStart"/>
-            <w:r>
-              <w:rPr>
-                <w:rFonts w:ascii="Courier New" w:eastAsia="Courier New" w:hAnsi="Courier New" w:cs="Courier New"/>
-                <w:sz w:val="19"/>
-                <w:szCs w:val="19"/>
-              </w:rPr>
-              <w:t>BookingID</w:t>
-            </w:r>
-            <w:proofErr w:type="spellEnd"/>
-          </w:p>
-          <w:p>
-            <w:r>
-              <w:rPr>
-                <w:rFonts w:ascii="Courier New" w:eastAsia="Courier New" w:hAnsi="Courier New" w:cs="Courier New"/>
-                <w:sz w:val="19"/>
-                <w:szCs w:val="19"/>
-              </w:rPr>
-              <w:t xml:space="preserve">    DELETE the record in </w:t>
-            </w:r>
-            <w:proofErr w:type="spellStart"/>
-            <w:r>
-              <w:rPr>
-                <w:rFonts w:ascii="Courier New" w:eastAsia="Courier New" w:hAnsi="Courier New" w:cs="Courier New"/>
-                <w:sz w:val="19"/>
-                <w:szCs w:val="19"/>
-              </w:rPr>
-              <w:t>tblBooking</w:t>
-            </w:r>
-            <w:proofErr w:type="spellEnd"/>
-            <w:r>
-              <w:rPr>
-                <w:rFonts w:ascii="Courier New" w:eastAsia="Courier New" w:hAnsi="Courier New" w:cs="Courier New"/>
-                <w:sz w:val="19"/>
-                <w:szCs w:val="19"/>
-              </w:rPr>
-              <w:t xml:space="preserve"> for that </w:t>
-            </w:r>
-            <w:proofErr w:type="spellStart"/>
-            <w:r>
-              <w:rPr>
-                <w:rFonts w:ascii="Courier New" w:eastAsia="Courier New" w:hAnsi="Courier New" w:cs="Courier New"/>
-                <w:sz w:val="19"/>
-                <w:szCs w:val="19"/>
-              </w:rPr>
-              <w:t>BookingID</w:t>
-            </w:r>
-            <w:proofErr w:type="spellEnd"/>
+              <w:t xml:space="preserve">    DELETE the record in tblBooking for that BookingID</w:t>
+            </w:r>
           </w:p>
           <w:p>
             <w:r>
@@ -10236,15 +9074,7 @@
         <w:spacing w:after="160" w:line="276" w:lineRule="auto"/>
       </w:pPr>
       <w:r>
-        <w:t xml:space="preserve">Validation is the process of checking that data entered into the system is sensible and complete before it is accepted and saved to the database. It cannot guarantee that data is correct, for example it cannot tell whether a customer has typed the right surname, but it can stop clearly invalid or missing data from getting in, which protects the integrity of the database. Several different types of validation are used across the </w:t>
-      </w:r>
-      <w:proofErr w:type="spellStart"/>
-      <w:r>
-        <w:t>Filmtopia</w:t>
-      </w:r>
-      <w:proofErr w:type="spellEnd"/>
-      <w:r>
-        <w:t xml:space="preserve"> system, and these are explained below before being applied to each input in turn.</w:t>
+        <w:t>Validation is the process of checking that data entered into the system is sensible and complete before it is accepted and saved to the database. It cannot guarantee that data is correct, for example it cannot tell whether a customer has typed the right surname, but it can stop clearly invalid or missing data from getting in, which protects the integrity of the database. Several different types of validation are used across the Filmtopia system, and these are explained below before being applied to each input in turn.</w:t>
       </w:r>
     </w:p>
     <w:p>
@@ -10252,15 +9082,7 @@
         <w:spacing w:after="160" w:line="276" w:lineRule="auto"/>
       </w:pPr>
       <w:r>
-        <w:t xml:space="preserve">A presence check makes sure a required field has not been left blank. A type check makes sure the data is of the right kind, for example that a number has been entered where a number is expected. A length check makes sure an entry is </w:t>
-      </w:r>
-      <w:proofErr w:type="spellStart"/>
-      <w:r>
-        <w:t>not longer</w:t>
-      </w:r>
-      <w:proofErr w:type="spellEnd"/>
-      <w:r>
-        <w:t xml:space="preserve"> than the field allows. A range check makes sure a number or date falls between sensible limits. A format check makes sure an entry follows a required pattern, such as a time being written as HH:MM. Finally a lookup check, sometimes called a referential check, makes sure that a chosen value actually exists in another table, for example that a screening is being created for a film that really exists. The tables below set out the validation applied to each input, grouped by the form it appears on.</w:t>
+        <w:t>A presence check makes sure a required field has not been left blank. A type check makes sure the data is of the right kind, for example that a number has been entered where a number is expected. A length check makes sure an entry is not longer than the field allows. A range check makes sure a number or date falls between sensible limits. A format check makes sure an entry follows a required pattern, such as a time being written as HH:MM. Finally a lookup check, sometimes called a referential check, makes sure that a chosen value actually exists in another table, for example that a screening is being created for a film that really exists. The tables below set out the validation applied to each input, grouped by the form it appears on.</w:t>
       </w:r>
     </w:p>
     <w:p>
@@ -10715,7 +9537,6 @@
             </w:tcMar>
           </w:tcPr>
           <w:p>
-            <w:proofErr w:type="spellStart"/>
             <w:r>
               <w:rPr>
                 <w:sz w:val="19"/>
@@ -10723,7 +9544,6 @@
               </w:rPr>
               <w:t>FilmTitle</w:t>
             </w:r>
-            <w:proofErr w:type="spellEnd"/>
           </w:p>
         </w:tc>
         <w:tc>
@@ -10799,7 +9619,6 @@
             </w:tcMar>
           </w:tcPr>
           <w:p>
-            <w:proofErr w:type="spellStart"/>
             <w:r>
               <w:rPr>
                 <w:sz w:val="19"/>
@@ -10807,7 +9626,6 @@
               </w:rPr>
               <w:t>FilmAgeRating</w:t>
             </w:r>
-            <w:proofErr w:type="spellEnd"/>
           </w:p>
         </w:tc>
         <w:tc>
@@ -10883,7 +9701,6 @@
             </w:tcMar>
           </w:tcPr>
           <w:p>
-            <w:proofErr w:type="spellStart"/>
             <w:r>
               <w:rPr>
                 <w:sz w:val="19"/>
@@ -10891,7 +9708,6 @@
               </w:rPr>
               <w:t>FilmDuration</w:t>
             </w:r>
-            <w:proofErr w:type="spellEnd"/>
           </w:p>
         </w:tc>
         <w:tc>
@@ -10967,7 +9783,6 @@
             </w:tcMar>
           </w:tcPr>
           <w:p>
-            <w:proofErr w:type="spellStart"/>
             <w:r>
               <w:rPr>
                 <w:sz w:val="19"/>
@@ -10975,7 +9790,6 @@
               </w:rPr>
               <w:t>FilmDescription</w:t>
             </w:r>
-            <w:proofErr w:type="spellEnd"/>
           </w:p>
         </w:tc>
         <w:tc>
@@ -11192,7 +10006,6 @@
             </w:tcMar>
           </w:tcPr>
           <w:p>
-            <w:proofErr w:type="spellStart"/>
             <w:r>
               <w:rPr>
                 <w:sz w:val="19"/>
@@ -11200,7 +10013,6 @@
               </w:rPr>
               <w:t>ScreenName</w:t>
             </w:r>
-            <w:proofErr w:type="spellEnd"/>
           </w:p>
         </w:tc>
         <w:tc>
@@ -11276,7 +10088,6 @@
             </w:tcMar>
           </w:tcPr>
           <w:p>
-            <w:proofErr w:type="spellStart"/>
             <w:r>
               <w:rPr>
                 <w:sz w:val="19"/>
@@ -11284,7 +10095,6 @@
               </w:rPr>
               <w:t>ScreenCapacity</w:t>
             </w:r>
-            <w:proofErr w:type="spellEnd"/>
           </w:p>
         </w:tc>
         <w:tc>
@@ -11686,7 +10496,6 @@
             </w:tcMar>
           </w:tcPr>
           <w:p>
-            <w:proofErr w:type="spellStart"/>
             <w:r>
               <w:rPr>
                 <w:sz w:val="19"/>
@@ -11694,7 +10503,6 @@
               </w:rPr>
               <w:t>ScreeningDate</w:t>
             </w:r>
-            <w:proofErr w:type="spellEnd"/>
           </w:p>
         </w:tc>
         <w:tc>
@@ -11770,7 +10578,6 @@
             </w:tcMar>
           </w:tcPr>
           <w:p>
-            <w:proofErr w:type="spellStart"/>
             <w:r>
               <w:rPr>
                 <w:sz w:val="19"/>
@@ -11778,7 +10585,6 @@
               </w:rPr>
               <w:t>ScreeningTime</w:t>
             </w:r>
-            <w:proofErr w:type="spellEnd"/>
           </w:p>
         </w:tc>
         <w:tc>
@@ -11854,7 +10660,6 @@
             </w:tcMar>
           </w:tcPr>
           <w:p>
-            <w:proofErr w:type="spellStart"/>
             <w:r>
               <w:rPr>
                 <w:sz w:val="19"/>
@@ -11862,7 +10667,6 @@
               </w:rPr>
               <w:t>TicketPrice</w:t>
             </w:r>
-            <w:proofErr w:type="spellEnd"/>
           </w:p>
         </w:tc>
         <w:tc>
@@ -12079,7 +10883,6 @@
             </w:tcMar>
           </w:tcPr>
           <w:p>
-            <w:proofErr w:type="spellStart"/>
             <w:r>
               <w:rPr>
                 <w:sz w:val="19"/>
@@ -12087,7 +10890,6 @@
               </w:rPr>
               <w:t>CustomerForename</w:t>
             </w:r>
-            <w:proofErr w:type="spellEnd"/>
           </w:p>
         </w:tc>
         <w:tc>
@@ -12163,7 +10965,6 @@
             </w:tcMar>
           </w:tcPr>
           <w:p>
-            <w:proofErr w:type="spellStart"/>
             <w:r>
               <w:rPr>
                 <w:sz w:val="19"/>
@@ -12171,7 +10972,6 @@
               </w:rPr>
               <w:t>CustomerSurname</w:t>
             </w:r>
-            <w:proofErr w:type="spellEnd"/>
           </w:p>
         </w:tc>
         <w:tc>
@@ -12247,7 +11047,6 @@
             </w:tcMar>
           </w:tcPr>
           <w:p>
-            <w:proofErr w:type="spellStart"/>
             <w:r>
               <w:rPr>
                 <w:sz w:val="19"/>
@@ -12255,7 +11054,6 @@
               </w:rPr>
               <w:t>CustomerEmail</w:t>
             </w:r>
-            <w:proofErr w:type="spellEnd"/>
           </w:p>
         </w:tc>
         <w:tc>
@@ -12331,7 +11129,6 @@
             </w:tcMar>
           </w:tcPr>
           <w:p>
-            <w:proofErr w:type="spellStart"/>
             <w:r>
               <w:rPr>
                 <w:sz w:val="19"/>
@@ -12339,7 +11136,6 @@
               </w:rPr>
               <w:t>CustomerPhone</w:t>
             </w:r>
-            <w:proofErr w:type="spellEnd"/>
           </w:p>
         </w:tc>
         <w:tc>

</xml_diff>

<commit_message>
added description for objective 6 in design doc
</commit_message>
<xml_diff>
--- a/Design.docx
+++ b/Design.docx
@@ -11,13 +11,23 @@
           <w:color w:val="A02B93" w:themeColor="accent5"/>
         </w:rPr>
       </w:pPr>
+      <w:proofErr w:type="spellStart"/>
       <w:r>
         <w:rPr>
           <w:b/>
           <w:bCs/>
           <w:color w:val="A02B93" w:themeColor="accent5"/>
         </w:rPr>
-        <w:t>Filmtopia Project Design</w:t>
+        <w:t>Filmtopia</w:t>
+      </w:r>
+      <w:proofErr w:type="spellEnd"/>
+      <w:r>
+        <w:rPr>
+          <w:b/>
+          <w:bCs/>
+          <w:color w:val="A02B93" w:themeColor="accent5"/>
+        </w:rPr>
+        <w:t xml:space="preserve"> Project Design</w:t>
       </w:r>
     </w:p>
     <w:p>
@@ -43,7 +53,21 @@
         <w:rPr>
           <w:rFonts w:ascii="Aptos" w:eastAsia="Aptos" w:hAnsi="Aptos" w:cs="Aptos"/>
         </w:rPr>
-        <w:t>The purpose of this section is to design the way that the user will interact with the Filmtopia system before any of it is actually built. In other words this is where I plan out every form the user will see, the information that goes into each one and the information that comes back out, so that when I move on to writing the code I already have a clear picture of what I am building rather than making it up as I go along. I have taken each objective in turn as a heading and described how the interface will behave for that objective, and for every form or report involved I have drawn a wireframe showing roughly where the labels, text boxes and buttons will sit. These drawings are deliberately kept simple so that it is obvious they are design sketches and not screenshots of a finished program.</w:t>
+        <w:t xml:space="preserve">The purpose of this section is to design the way that the user will interact with the </w:t>
+      </w:r>
+      <w:proofErr w:type="spellStart"/>
+      <w:r>
+        <w:rPr>
+          <w:rFonts w:ascii="Aptos" w:eastAsia="Aptos" w:hAnsi="Aptos" w:cs="Aptos"/>
+        </w:rPr>
+        <w:t>Filmtopia</w:t>
+      </w:r>
+      <w:proofErr w:type="spellEnd"/>
+      <w:r>
+        <w:rPr>
+          <w:rFonts w:ascii="Aptos" w:eastAsia="Aptos" w:hAnsi="Aptos" w:cs="Aptos"/>
+        </w:rPr>
+        <w:t xml:space="preserve"> system before any of it is actually built. In other words this is where I plan out every form the user will see, the information that goes into each one and the information that comes back out, so that when I move on to writing the code I already have a clear picture of what I am building rather than making it up as I go along. I have taken each objective in turn as a heading and described how the interface will behave for that objective, and for every form or report involved I have drawn a wireframe showing roughly where the labels, text boxes and buttons will sit. These drawings are deliberately kept simple so that it is obvious they are design sketches and not screenshots of a finished program.</w:t>
       </w:r>
     </w:p>
     <w:p>
@@ -57,7 +81,77 @@
         <w:rPr>
           <w:rFonts w:ascii="Aptos" w:eastAsia="Aptos" w:hAnsi="Aptos" w:cs="Aptos"/>
         </w:rPr>
-        <w:t>Before going through the objectives one at a time it is worth explaining a couple of decisions that apply across the whole system. Filmtopia is built as a Windows Forms desktop application, so every screen is a form made up of standard controls such as text boxes, labels, buttons and data grids. I have chosen to name my controls using a short prefix that describes what each one is, for example txt for a text box, btn for a button, lbl for a label, cbo for a combo box and dgv for a data grid view, followed by a word describing its job. This is because a consistent naming convention makes the code far easier to read later on and stops me getting confused between similarly named items. I have also decided not to worry too much about the finer details of colour at this stage, this is because the guidance makes clear that the interface will be refined after the prototype in section 5.2, so it makes sense to settle the layout and the flow first and then tidy up the appearance once I know everything works.</w:t>
+        <w:t xml:space="preserve">Before going through the objectives one at a time it is worth explaining a couple of decisions that apply across the whole system. </w:t>
+      </w:r>
+      <w:proofErr w:type="spellStart"/>
+      <w:r>
+        <w:rPr>
+          <w:rFonts w:ascii="Aptos" w:eastAsia="Aptos" w:hAnsi="Aptos" w:cs="Aptos"/>
+        </w:rPr>
+        <w:t>Filmtopia</w:t>
+      </w:r>
+      <w:proofErr w:type="spellEnd"/>
+      <w:r>
+        <w:rPr>
+          <w:rFonts w:ascii="Aptos" w:eastAsia="Aptos" w:hAnsi="Aptos" w:cs="Aptos"/>
+        </w:rPr>
+        <w:t xml:space="preserve"> is built as a Windows Forms desktop application, so every screen is a form made up of standard controls such as text boxes, labels, buttons and data grids. I have chosen to name my controls using a short prefix that describes what each one is, for example txt for a text box, </w:t>
+      </w:r>
+      <w:proofErr w:type="spellStart"/>
+      <w:r>
+        <w:rPr>
+          <w:rFonts w:ascii="Aptos" w:eastAsia="Aptos" w:hAnsi="Aptos" w:cs="Aptos"/>
+        </w:rPr>
+        <w:t>btn</w:t>
+      </w:r>
+      <w:proofErr w:type="spellEnd"/>
+      <w:r>
+        <w:rPr>
+          <w:rFonts w:ascii="Aptos" w:eastAsia="Aptos" w:hAnsi="Aptos" w:cs="Aptos"/>
+        </w:rPr>
+        <w:t xml:space="preserve"> for a button, </w:t>
+      </w:r>
+      <w:proofErr w:type="spellStart"/>
+      <w:r>
+        <w:rPr>
+          <w:rFonts w:ascii="Aptos" w:eastAsia="Aptos" w:hAnsi="Aptos" w:cs="Aptos"/>
+        </w:rPr>
+        <w:t>lbl</w:t>
+      </w:r>
+      <w:proofErr w:type="spellEnd"/>
+      <w:r>
+        <w:rPr>
+          <w:rFonts w:ascii="Aptos" w:eastAsia="Aptos" w:hAnsi="Aptos" w:cs="Aptos"/>
+        </w:rPr>
+        <w:t xml:space="preserve"> for a label, </w:t>
+      </w:r>
+      <w:proofErr w:type="spellStart"/>
+      <w:r>
+        <w:rPr>
+          <w:rFonts w:ascii="Aptos" w:eastAsia="Aptos" w:hAnsi="Aptos" w:cs="Aptos"/>
+        </w:rPr>
+        <w:t>cbo</w:t>
+      </w:r>
+      <w:proofErr w:type="spellEnd"/>
+      <w:r>
+        <w:rPr>
+          <w:rFonts w:ascii="Aptos" w:eastAsia="Aptos" w:hAnsi="Aptos" w:cs="Aptos"/>
+        </w:rPr>
+        <w:t xml:space="preserve"> for a combo box and </w:t>
+      </w:r>
+      <w:proofErr w:type="spellStart"/>
+      <w:r>
+        <w:rPr>
+          <w:rFonts w:ascii="Aptos" w:eastAsia="Aptos" w:hAnsi="Aptos" w:cs="Aptos"/>
+        </w:rPr>
+        <w:t>dgv</w:t>
+      </w:r>
+      <w:proofErr w:type="spellEnd"/>
+      <w:r>
+        <w:rPr>
+          <w:rFonts w:ascii="Aptos" w:eastAsia="Aptos" w:hAnsi="Aptos" w:cs="Aptos"/>
+        </w:rPr>
+        <w:t xml:space="preserve"> for a data grid view, followed by a word describing its job. This is because a consistent naming convention makes the code far easier to read later on and stops me getting confused between similarly named items. I have also decided not to worry too much about the finer details of colour at this stage, this is because the guidance makes clear that the interface will be refined after the prototype in section 5.2, so it makes sense to settle the layout and the flow first and then tidy up the appearance once I know everything works.</w:t>
       </w:r>
     </w:p>
     <w:p>
@@ -83,7 +177,35 @@
         <w:rPr>
           <w:rFonts w:ascii="Aptos" w:eastAsia="Aptos" w:hAnsi="Aptos" w:cs="Aptos"/>
         </w:rPr>
-        <w:t>The first thing any user meets when they open Filmtopia is the login screen, so this is where the design naturally starts. The objective here is to make sure that customers, staff and managers are not all able to do the same things, because a normal member of staff being able to reach the manager's sales reports or the audit log would be a serious security weakness. To achieve this the system asks for a username and a password on a small login form, checks them against the tblLogin table, and reads back an access level number that then decides what the user is allowed to see.</w:t>
+        <w:t xml:space="preserve">The first thing any user meets when they open </w:t>
+      </w:r>
+      <w:proofErr w:type="spellStart"/>
+      <w:r>
+        <w:rPr>
+          <w:rFonts w:ascii="Aptos" w:eastAsia="Aptos" w:hAnsi="Aptos" w:cs="Aptos"/>
+        </w:rPr>
+        <w:t>Filmtopia</w:t>
+      </w:r>
+      <w:proofErr w:type="spellEnd"/>
+      <w:r>
+        <w:rPr>
+          <w:rFonts w:ascii="Aptos" w:eastAsia="Aptos" w:hAnsi="Aptos" w:cs="Aptos"/>
+        </w:rPr>
+        <w:t xml:space="preserve"> is the login screen, so this is where the design naturally starts. The objective here is to make sure that customers, staff and managers are not all able to do the same things, because a normal member of staff being able to reach the manager's sales reports or the audit log would be a serious security weakness. To achieve this the system asks for a username and a password on a small login form, checks them against the </w:t>
+      </w:r>
+      <w:proofErr w:type="spellStart"/>
+      <w:r>
+        <w:rPr>
+          <w:rFonts w:ascii="Aptos" w:eastAsia="Aptos" w:hAnsi="Aptos" w:cs="Aptos"/>
+        </w:rPr>
+        <w:t>tblLogin</w:t>
+      </w:r>
+      <w:proofErr w:type="spellEnd"/>
+      <w:r>
+        <w:rPr>
+          <w:rFonts w:ascii="Aptos" w:eastAsia="Aptos" w:hAnsi="Aptos" w:cs="Aptos"/>
+        </w:rPr>
+        <w:t xml:space="preserve"> table, and reads back an access level number that then decides what the user is allowed to see.</w:t>
       </w:r>
     </w:p>
     <w:p>
@@ -94,14 +216,84 @@
         <w:rPr>
           <w:rFonts w:ascii="Aptos" w:eastAsia="Aptos" w:hAnsi="Aptos" w:cs="Aptos"/>
         </w:rPr>
-        <w:t xml:space="preserve">The login form itself is deliberately kept small and uncomplicated. It has a header panel across the top showing the name Filmtopia and the subtitle Cinema Management System </w:t>
-      </w:r>
+        <w:t xml:space="preserve">The login form itself is deliberately kept small and uncomplicated. It has a header panel across the top showing the name </w:t>
+      </w:r>
+      <w:proofErr w:type="spellStart"/>
       <w:r>
         <w:rPr>
           <w:rFonts w:ascii="Aptos" w:eastAsia="Aptos" w:hAnsi="Aptos" w:cs="Aptos"/>
         </w:rPr>
+        <w:t>Filmtopia</w:t>
+      </w:r>
+      <w:proofErr w:type="spellEnd"/>
+      <w:r>
+        <w:rPr>
+          <w:rFonts w:ascii="Aptos" w:eastAsia="Aptos" w:hAnsi="Aptos" w:cs="Aptos"/>
+        </w:rPr>
+        <w:t xml:space="preserve"> and the subtitle Cinema Management System </w:t>
+      </w:r>
+      <w:r>
+        <w:rPr>
+          <w:rFonts w:ascii="Aptos" w:eastAsia="Aptos" w:hAnsi="Aptos" w:cs="Aptos"/>
+        </w:rPr>
         <w:lastRenderedPageBreak/>
-        <w:t>so the user knows straight away what they are logging into. Below that are two labels, Username and Password, each sitting next to its own text box, which I have named txtUsername and txtPassword. The password box will have its characters masked so that anyone standing nearby cannot read what is being typed. Underneath the boxes are two buttons, a Log In button named btnLogin which carries out the check, and a Cancel button named btnClose which closes the program if the user changes their mind. A small version label sits at the very bottom of the form.</w:t>
+        <w:t xml:space="preserve">so the user knows straight away what they are logging into. Below that are two labels, Username and Password, each sitting next to its own text box, which I have named </w:t>
+      </w:r>
+      <w:proofErr w:type="spellStart"/>
+      <w:r>
+        <w:rPr>
+          <w:rFonts w:ascii="Aptos" w:eastAsia="Aptos" w:hAnsi="Aptos" w:cs="Aptos"/>
+        </w:rPr>
+        <w:t>txtUsername</w:t>
+      </w:r>
+      <w:proofErr w:type="spellEnd"/>
+      <w:r>
+        <w:rPr>
+          <w:rFonts w:ascii="Aptos" w:eastAsia="Aptos" w:hAnsi="Aptos" w:cs="Aptos"/>
+        </w:rPr>
+        <w:t xml:space="preserve"> and </w:t>
+      </w:r>
+      <w:proofErr w:type="spellStart"/>
+      <w:r>
+        <w:rPr>
+          <w:rFonts w:ascii="Aptos" w:eastAsia="Aptos" w:hAnsi="Aptos" w:cs="Aptos"/>
+        </w:rPr>
+        <w:t>txtPassword</w:t>
+      </w:r>
+      <w:proofErr w:type="spellEnd"/>
+      <w:r>
+        <w:rPr>
+          <w:rFonts w:ascii="Aptos" w:eastAsia="Aptos" w:hAnsi="Aptos" w:cs="Aptos"/>
+        </w:rPr>
+        <w:t xml:space="preserve">. The password box will have its characters masked so that anyone standing nearby cannot read what is being typed. Underneath the boxes are two buttons, a Log In button named </w:t>
+      </w:r>
+      <w:proofErr w:type="spellStart"/>
+      <w:r>
+        <w:rPr>
+          <w:rFonts w:ascii="Aptos" w:eastAsia="Aptos" w:hAnsi="Aptos" w:cs="Aptos"/>
+        </w:rPr>
+        <w:t>btnLogin</w:t>
+      </w:r>
+      <w:proofErr w:type="spellEnd"/>
+      <w:r>
+        <w:rPr>
+          <w:rFonts w:ascii="Aptos" w:eastAsia="Aptos" w:hAnsi="Aptos" w:cs="Aptos"/>
+        </w:rPr>
+        <w:t xml:space="preserve"> which carries out the check, and a Cancel button named </w:t>
+      </w:r>
+      <w:proofErr w:type="spellStart"/>
+      <w:r>
+        <w:rPr>
+          <w:rFonts w:ascii="Aptos" w:eastAsia="Aptos" w:hAnsi="Aptos" w:cs="Aptos"/>
+        </w:rPr>
+        <w:t>btnClose</w:t>
+      </w:r>
+      <w:proofErr w:type="spellEnd"/>
+      <w:r>
+        <w:rPr>
+          <w:rFonts w:ascii="Aptos" w:eastAsia="Aptos" w:hAnsi="Aptos" w:cs="Aptos"/>
+        </w:rPr>
+        <w:t xml:space="preserve"> which closes the program if the user changes their mind. A small version label sits at the very bottom of the form.</w:t>
       </w:r>
     </w:p>
     <w:p>
@@ -124,7 +316,31 @@
           <w:sz w:val="22"/>
           <w:szCs w:val="22"/>
         </w:rPr>
-        <w:t>Login Form (frmLogin)</w:t>
+        <w:t>Login Form (</w:t>
+      </w:r>
+      <w:proofErr w:type="spellStart"/>
+      <w:r>
+        <w:rPr>
+          <w:rFonts w:ascii="Aptos" w:eastAsia="Aptos" w:hAnsi="Aptos" w:cs="Aptos"/>
+          <w:b/>
+          <w:bCs/>
+          <w:color w:val="A02B93"/>
+          <w:sz w:val="22"/>
+          <w:szCs w:val="22"/>
+        </w:rPr>
+        <w:t>frmLogin</w:t>
+      </w:r>
+      <w:proofErr w:type="spellEnd"/>
+      <w:r>
+        <w:rPr>
+          <w:rFonts w:ascii="Aptos" w:eastAsia="Aptos" w:hAnsi="Aptos" w:cs="Aptos"/>
+          <w:b/>
+          <w:bCs/>
+          <w:color w:val="A02B93"/>
+          <w:sz w:val="22"/>
+          <w:szCs w:val="22"/>
+        </w:rPr>
+        <w:t>)</w:t>
       </w:r>
     </w:p>
     <w:p>
@@ -135,7 +351,35 @@
         <w:rPr>
           <w:rFonts w:ascii="Aptos" w:eastAsia="Aptos" w:hAnsi="Aptos" w:cs="Aptos"/>
         </w:rPr>
-        <w:t>The only input to this form is the username and password typed by the user. The output, once the button is pressed, is either entry into the main menu or a message box telling the user that their details were not recognised. The process that happens in between is a lookup against the tblLogin table for a matching username, a comparison of the stored password, and if everything matches, the storing of that user's access level in a variable called UserAccessLevel that the rest of the program can read. I have chosen buttons here rather than, for example, expecting the user to press the Enter key, this is because a clearly labelled Log In button leaves no doubt about what to do and is friendlier for staff who are not especially technical.</w:t>
+        <w:t xml:space="preserve">The only input to this form is the username and password typed by the user. The output, once the button is pressed, is either entry into the main menu or a message box telling the user that their details were not recognised. The process that happens in between is a lookup against the </w:t>
+      </w:r>
+      <w:proofErr w:type="spellStart"/>
+      <w:r>
+        <w:rPr>
+          <w:rFonts w:ascii="Aptos" w:eastAsia="Aptos" w:hAnsi="Aptos" w:cs="Aptos"/>
+        </w:rPr>
+        <w:t>tblLogin</w:t>
+      </w:r>
+      <w:proofErr w:type="spellEnd"/>
+      <w:r>
+        <w:rPr>
+          <w:rFonts w:ascii="Aptos" w:eastAsia="Aptos" w:hAnsi="Aptos" w:cs="Aptos"/>
+        </w:rPr>
+        <w:t xml:space="preserve"> table for a matching username, a comparison of the stored password, and if everything matches, the storing of that user's access level in a variable called </w:t>
+      </w:r>
+      <w:proofErr w:type="spellStart"/>
+      <w:r>
+        <w:rPr>
+          <w:rFonts w:ascii="Aptos" w:eastAsia="Aptos" w:hAnsi="Aptos" w:cs="Aptos"/>
+        </w:rPr>
+        <w:t>UserAccessLevel</w:t>
+      </w:r>
+      <w:proofErr w:type="spellEnd"/>
+      <w:r>
+        <w:rPr>
+          <w:rFonts w:ascii="Aptos" w:eastAsia="Aptos" w:hAnsi="Aptos" w:cs="Aptos"/>
+        </w:rPr>
+        <w:t xml:space="preserve"> that the rest of the program can read. I have chosen buttons here rather than, for example, expecting the user to press the Enter key, this is because a clearly labelled Log In button leaves no doubt about what to do and is friendlier for staff who are not especially technical.</w:t>
       </w:r>
     </w:p>
     <w:p>
@@ -146,7 +390,35 @@
         <w:rPr>
           <w:rFonts w:ascii="Aptos" w:eastAsia="Aptos" w:hAnsi="Aptos" w:cs="Aptos"/>
         </w:rPr>
-        <w:t>Once a user has logged in successfully they are taken to the main menu, which is the form named frmMainForm and acts as the hub for the whole system. Every other part of Filmtopia is reached from here by pressing a button, which I felt was a far more sophisticated and easier to follow approach than burying features inside drop-down menus that a busy member of staff would have to go hunting through. The menu shows a welcome message at the top and then a column of buttons down the content area, one for each area of the system, for example Bookings, Find Booking, Screenings, Films, Screens, Food, Reports, Customers, Logs and a Logout button.</w:t>
+        <w:t xml:space="preserve">Once a user has logged in successfully they are taken to the main menu, which is the form named </w:t>
+      </w:r>
+      <w:proofErr w:type="spellStart"/>
+      <w:r>
+        <w:rPr>
+          <w:rFonts w:ascii="Aptos" w:eastAsia="Aptos" w:hAnsi="Aptos" w:cs="Aptos"/>
+        </w:rPr>
+        <w:t>frmMainForm</w:t>
+      </w:r>
+      <w:proofErr w:type="spellEnd"/>
+      <w:r>
+        <w:rPr>
+          <w:rFonts w:ascii="Aptos" w:eastAsia="Aptos" w:hAnsi="Aptos" w:cs="Aptos"/>
+        </w:rPr>
+        <w:t xml:space="preserve"> and acts as the hub for the whole system. Every other part of </w:t>
+      </w:r>
+      <w:proofErr w:type="spellStart"/>
+      <w:r>
+        <w:rPr>
+          <w:rFonts w:ascii="Aptos" w:eastAsia="Aptos" w:hAnsi="Aptos" w:cs="Aptos"/>
+        </w:rPr>
+        <w:t>Filmtopia</w:t>
+      </w:r>
+      <w:proofErr w:type="spellEnd"/>
+      <w:r>
+        <w:rPr>
+          <w:rFonts w:ascii="Aptos" w:eastAsia="Aptos" w:hAnsi="Aptos" w:cs="Aptos"/>
+        </w:rPr>
+        <w:t xml:space="preserve"> is reached from here by pressing a button, which I felt was a far more sophisticated and easier to follow approach than burying features inside drop-down menus that a busy member of staff would have to go hunting through. The menu shows a welcome message at the top and then a column of buttons down the content area, one for each area of the system, for example Bookings, Find Booking, Screenings, Films, Screens, Food, Reports, Customers, Logs and a Logout button.</w:t>
       </w:r>
     </w:p>
     <w:p>
@@ -157,7 +429,35 @@
         <w:rPr>
           <w:rFonts w:ascii="Aptos" w:eastAsia="Aptos" w:hAnsi="Aptos" w:cs="Aptos"/>
         </w:rPr>
-        <w:t>What makes this form important for the objective is that the buttons shown depend entirely on the access level that was read at login. This is because a manager, whose access level is 1, needs to see everything, whereas a normal member of staff, whose access level is 2, should only see the day to day booking functions. When a manager logs in the group box is titled Filmtopia Admin and the management buttons for Films, Screens, Food, Reports and Logs are all made visible. When a member of staff logs in those same buttons are hidden and the group box is titled Filmtopia Staff, leaving them with just the booking related functions. In this way a single form quietly enforces the whole access level objective without the staff member ever seeing an option they are not allowed to use.</w:t>
+        <w:t xml:space="preserve">What makes this form important for the objective is that the buttons shown depend entirely on the access level that was read at login. This is because a manager, whose access level is 1, needs to see everything, whereas a normal member of staff, whose access level is 2, should only see the day to day booking functions. When a manager logs in the group box is titled </w:t>
+      </w:r>
+      <w:proofErr w:type="spellStart"/>
+      <w:r>
+        <w:rPr>
+          <w:rFonts w:ascii="Aptos" w:eastAsia="Aptos" w:hAnsi="Aptos" w:cs="Aptos"/>
+        </w:rPr>
+        <w:t>Filmtopia</w:t>
+      </w:r>
+      <w:proofErr w:type="spellEnd"/>
+      <w:r>
+        <w:rPr>
+          <w:rFonts w:ascii="Aptos" w:eastAsia="Aptos" w:hAnsi="Aptos" w:cs="Aptos"/>
+        </w:rPr>
+        <w:t xml:space="preserve"> Admin and the management buttons for Films, Screens, Food, Reports and Logs are all made visible. When a member of staff logs in those same buttons are hidden and the group box is titled </w:t>
+      </w:r>
+      <w:proofErr w:type="spellStart"/>
+      <w:r>
+        <w:rPr>
+          <w:rFonts w:ascii="Aptos" w:eastAsia="Aptos" w:hAnsi="Aptos" w:cs="Aptos"/>
+        </w:rPr>
+        <w:t>Filmtopia</w:t>
+      </w:r>
+      <w:proofErr w:type="spellEnd"/>
+      <w:r>
+        <w:rPr>
+          <w:rFonts w:ascii="Aptos" w:eastAsia="Aptos" w:hAnsi="Aptos" w:cs="Aptos"/>
+        </w:rPr>
+        <w:t xml:space="preserve"> Staff, leaving them with just the booking related functions. In this way a single form quietly enforces the whole access level objective without the staff member ever seeing an option they are not allowed to use.</w:t>
       </w:r>
     </w:p>
     <w:p>
@@ -181,7 +481,31 @@
           <w:szCs w:val="22"/>
         </w:rPr>
         <w:lastRenderedPageBreak/>
-        <w:t>Main Menu (frmMainForm)</w:t>
+        <w:t>Main Menu (</w:t>
+      </w:r>
+      <w:proofErr w:type="spellStart"/>
+      <w:r>
+        <w:rPr>
+          <w:rFonts w:ascii="Aptos" w:eastAsia="Aptos" w:hAnsi="Aptos" w:cs="Aptos"/>
+          <w:b/>
+          <w:bCs/>
+          <w:color w:val="A02B93"/>
+          <w:sz w:val="22"/>
+          <w:szCs w:val="22"/>
+        </w:rPr>
+        <w:t>frmMainForm</w:t>
+      </w:r>
+      <w:proofErr w:type="spellEnd"/>
+      <w:r>
+        <w:rPr>
+          <w:rFonts w:ascii="Aptos" w:eastAsia="Aptos" w:hAnsi="Aptos" w:cs="Aptos"/>
+          <w:b/>
+          <w:bCs/>
+          <w:color w:val="A02B93"/>
+          <w:sz w:val="22"/>
+          <w:szCs w:val="22"/>
+        </w:rPr>
+        <w:t>)</w:t>
       </w:r>
     </w:p>
     <w:p>
@@ -197,20 +521,17 @@
     </w:p>
     <w:p>
       <w:pPr>
-        <w:pStyle w:val="Heading2"/>
-        <w:rPr>
+        <w:pStyle w:val="Heading3"/>
+        <w:spacing w:before="260" w:after="120"/>
+      </w:pPr>
+      <w:r>
+        <w:rPr>
+          <w:rFonts w:ascii="Aptos Display" w:eastAsia="Aptos Display" w:hAnsi="Aptos Display" w:cs="Aptos Display"/>
           <w:b/>
           <w:bCs/>
-          <w:color w:val="000000" w:themeColor="text1"/>
-        </w:rPr>
-      </w:pPr>
-      <w:r>
-        <w:rPr>
-          <w:b/>
-          <w:bCs/>
-          <w:color w:val="000000" w:themeColor="text1"/>
-        </w:rPr>
-        <w:t>Data Structures and Methods of Access</w:t>
+          <w:color w:val="000000"/>
+        </w:rPr>
+        <w:t>Adding New Films (Objective 6)</w:t>
       </w:r>
     </w:p>
     <w:p>
@@ -218,7 +539,298 @@
         <w:spacing w:after="160" w:line="276" w:lineRule="auto"/>
       </w:pPr>
       <w:r>
-        <w:t>The purpose of this section is to specify the data structures that the Filmtopia system will use to store its data. As the system is built around a Microsoft Access database accessed through OleDb, these data structures take the form of database tables rather than arrays or other in memory structures. Each table and the relationships between them are described below, along with the way the data in those tables will be accessed. A key aim throughout the design has been to make sure the table structure is fully normalised to third normal form so that data is never repeated unnecessarily and the database cannot end up in an inconsistent state.</w:t>
+        <w:rPr>
+          <w:rFonts w:ascii="Aptos" w:eastAsia="Aptos" w:hAnsi="Aptos" w:cs="Aptos"/>
+        </w:rPr>
+        <w:t xml:space="preserve">Moving on to the management side of the system, one of the first jobs a manager or member of staff needs to do is add the films that the cinema is showing, because without any films in the system there is nothing for a screening to be attached to. This objective is handled by a single form named </w:t>
+      </w:r>
+      <w:proofErr w:type="spellStart"/>
+      <w:r>
+        <w:rPr>
+          <w:rFonts w:ascii="Aptos" w:eastAsia="Aptos" w:hAnsi="Aptos" w:cs="Aptos"/>
+        </w:rPr>
+        <w:t>frmFilms</w:t>
+      </w:r>
+      <w:proofErr w:type="spellEnd"/>
+      <w:r>
+        <w:rPr>
+          <w:rFonts w:ascii="Aptos" w:eastAsia="Aptos" w:hAnsi="Aptos" w:cs="Aptos"/>
+        </w:rPr>
+        <w:t xml:space="preserve"> which lets the user add a new film, edit an existing one, or remove one that is no longer being shown.</w:t>
+      </w:r>
+    </w:p>
+    <w:p>
+      <w:pPr>
+        <w:spacing w:after="160" w:line="276" w:lineRule="auto"/>
+      </w:pPr>
+      <w:r>
+        <w:rPr>
+          <w:rFonts w:ascii="Aptos" w:eastAsia="Aptos" w:hAnsi="Aptos" w:cs="Aptos"/>
+        </w:rPr>
+        <w:t xml:space="preserve">The form is split into two halves. On one side is a data grid view named </w:t>
+      </w:r>
+      <w:proofErr w:type="spellStart"/>
+      <w:r>
+        <w:rPr>
+          <w:rFonts w:ascii="Aptos" w:eastAsia="Aptos" w:hAnsi="Aptos" w:cs="Aptos"/>
+        </w:rPr>
+        <w:t>dgvFilms</w:t>
+      </w:r>
+      <w:proofErr w:type="spellEnd"/>
+      <w:r>
+        <w:rPr>
+          <w:rFonts w:ascii="Aptos" w:eastAsia="Aptos" w:hAnsi="Aptos" w:cs="Aptos"/>
+        </w:rPr>
+        <w:t xml:space="preserve"> which lists every film already stored in the system, showing its title, age rating, duration and description in a table so the user can see at a glance what is already there. On the other side is a set of input boxes for the details of a film, made up of a label and a text box for each field, which I have named </w:t>
+      </w:r>
+      <w:proofErr w:type="spellStart"/>
+      <w:r>
+        <w:rPr>
+          <w:rFonts w:ascii="Aptos" w:eastAsia="Aptos" w:hAnsi="Aptos" w:cs="Aptos"/>
+        </w:rPr>
+        <w:t>txtTitle</w:t>
+      </w:r>
+      <w:proofErr w:type="spellEnd"/>
+      <w:r>
+        <w:rPr>
+          <w:rFonts w:ascii="Aptos" w:eastAsia="Aptos" w:hAnsi="Aptos" w:cs="Aptos"/>
+        </w:rPr>
+        <w:t xml:space="preserve">, </w:t>
+      </w:r>
+      <w:proofErr w:type="spellStart"/>
+      <w:r>
+        <w:rPr>
+          <w:rFonts w:ascii="Aptos" w:eastAsia="Aptos" w:hAnsi="Aptos" w:cs="Aptos"/>
+        </w:rPr>
+        <w:t>txtAgeRating</w:t>
+      </w:r>
+      <w:proofErr w:type="spellEnd"/>
+      <w:r>
+        <w:rPr>
+          <w:rFonts w:ascii="Aptos" w:eastAsia="Aptos" w:hAnsi="Aptos" w:cs="Aptos"/>
+        </w:rPr>
+        <w:t xml:space="preserve">, </w:t>
+      </w:r>
+      <w:proofErr w:type="spellStart"/>
+      <w:r>
+        <w:rPr>
+          <w:rFonts w:ascii="Aptos" w:eastAsia="Aptos" w:hAnsi="Aptos" w:cs="Aptos"/>
+        </w:rPr>
+        <w:t>txtDuration</w:t>
+      </w:r>
+      <w:proofErr w:type="spellEnd"/>
+      <w:r>
+        <w:rPr>
+          <w:rFonts w:ascii="Aptos" w:eastAsia="Aptos" w:hAnsi="Aptos" w:cs="Aptos"/>
+        </w:rPr>
+        <w:t xml:space="preserve"> and </w:t>
+      </w:r>
+      <w:proofErr w:type="spellStart"/>
+      <w:r>
+        <w:rPr>
+          <w:rFonts w:ascii="Aptos" w:eastAsia="Aptos" w:hAnsi="Aptos" w:cs="Aptos"/>
+        </w:rPr>
+        <w:t>txtDescription</w:t>
+      </w:r>
+      <w:proofErr w:type="spellEnd"/>
+      <w:r>
+        <w:rPr>
+          <w:rFonts w:ascii="Aptos" w:eastAsia="Aptos" w:hAnsi="Aptos" w:cs="Aptos"/>
+        </w:rPr>
+        <w:t xml:space="preserve">. Beneath these are four buttons, Add, Update, Delete and Clear, which I have named </w:t>
+      </w:r>
+      <w:proofErr w:type="spellStart"/>
+      <w:r>
+        <w:rPr>
+          <w:rFonts w:ascii="Aptos" w:eastAsia="Aptos" w:hAnsi="Aptos" w:cs="Aptos"/>
+        </w:rPr>
+        <w:t>btnAdd</w:t>
+      </w:r>
+      <w:proofErr w:type="spellEnd"/>
+      <w:r>
+        <w:rPr>
+          <w:rFonts w:ascii="Aptos" w:eastAsia="Aptos" w:hAnsi="Aptos" w:cs="Aptos"/>
+        </w:rPr>
+        <w:t xml:space="preserve">, </w:t>
+      </w:r>
+      <w:proofErr w:type="spellStart"/>
+      <w:r>
+        <w:rPr>
+          <w:rFonts w:ascii="Aptos" w:eastAsia="Aptos" w:hAnsi="Aptos" w:cs="Aptos"/>
+        </w:rPr>
+        <w:t>btnUpdate</w:t>
+      </w:r>
+      <w:proofErr w:type="spellEnd"/>
+      <w:r>
+        <w:rPr>
+          <w:rFonts w:ascii="Aptos" w:eastAsia="Aptos" w:hAnsi="Aptos" w:cs="Aptos"/>
+        </w:rPr>
+        <w:t xml:space="preserve">, </w:t>
+      </w:r>
+      <w:proofErr w:type="spellStart"/>
+      <w:r>
+        <w:rPr>
+          <w:rFonts w:ascii="Aptos" w:eastAsia="Aptos" w:hAnsi="Aptos" w:cs="Aptos"/>
+        </w:rPr>
+        <w:t>btnDelete</w:t>
+      </w:r>
+      <w:proofErr w:type="spellEnd"/>
+      <w:r>
+        <w:rPr>
+          <w:rFonts w:ascii="Aptos" w:eastAsia="Aptos" w:hAnsi="Aptos" w:cs="Aptos"/>
+        </w:rPr>
+        <w:t xml:space="preserve"> and </w:t>
+      </w:r>
+      <w:proofErr w:type="spellStart"/>
+      <w:r>
+        <w:rPr>
+          <w:rFonts w:ascii="Aptos" w:eastAsia="Aptos" w:hAnsi="Aptos" w:cs="Aptos"/>
+        </w:rPr>
+        <w:t>btnClear</w:t>
+      </w:r>
+      <w:proofErr w:type="spellEnd"/>
+      <w:r>
+        <w:rPr>
+          <w:rFonts w:ascii="Aptos" w:eastAsia="Aptos" w:hAnsi="Aptos" w:cs="Aptos"/>
+        </w:rPr>
+        <w:t>.</w:t>
+      </w:r>
+    </w:p>
+    <w:p>
+      <w:pPr>
+        <w:pBdr>
+          <w:top w:val="single" w:sz="6" w:space="6" w:color="A02B93"/>
+          <w:left w:val="single" w:sz="6" w:space="6" w:color="A02B93"/>
+          <w:bottom w:val="single" w:sz="6" w:space="6" w:color="A02B93"/>
+          <w:right w:val="single" w:sz="6" w:space="6" w:color="A02B93"/>
+        </w:pBdr>
+        <w:shd w:val="clear" w:color="auto" w:fill="F7E9F3"/>
+        <w:spacing w:before="120" w:after="200"/>
+      </w:pPr>
+      <w:r>
+        <w:rPr>
+          <w:rFonts w:ascii="Aptos" w:eastAsia="Aptos" w:hAnsi="Aptos" w:cs="Aptos"/>
+          <w:b/>
+          <w:bCs/>
+          <w:color w:val="A02B93"/>
+          <w:sz w:val="22"/>
+          <w:szCs w:val="22"/>
+        </w:rPr>
+        <w:t>Add Films Form (</w:t>
+      </w:r>
+      <w:proofErr w:type="spellStart"/>
+      <w:r>
+        <w:rPr>
+          <w:rFonts w:ascii="Aptos" w:eastAsia="Aptos" w:hAnsi="Aptos" w:cs="Aptos"/>
+          <w:b/>
+          <w:bCs/>
+          <w:color w:val="A02B93"/>
+          <w:sz w:val="22"/>
+          <w:szCs w:val="22"/>
+        </w:rPr>
+        <w:t>frmFilms</w:t>
+      </w:r>
+      <w:proofErr w:type="spellEnd"/>
+      <w:r>
+        <w:rPr>
+          <w:rFonts w:ascii="Aptos" w:eastAsia="Aptos" w:hAnsi="Aptos" w:cs="Aptos"/>
+          <w:b/>
+          <w:bCs/>
+          <w:color w:val="A02B93"/>
+          <w:sz w:val="22"/>
+          <w:szCs w:val="22"/>
+        </w:rPr>
+        <w:t>)</w:t>
+      </w:r>
+    </w:p>
+    <w:p>
+      <w:pPr>
+        <w:spacing w:after="160" w:line="276" w:lineRule="auto"/>
+      </w:pPr>
+      <w:r>
+        <w:rPr>
+          <w:rFonts w:ascii="Aptos" w:eastAsia="Aptos" w:hAnsi="Aptos" w:cs="Aptos"/>
+        </w:rPr>
+        <w:t xml:space="preserve">The inputs to this form are the four film details typed into the text boxes. The outputs are the updated list of films shown in the grid and, where appropriate, a message box confirming that a film has been added or warning the user if something has gone wrong. The processes behind the buttons are straightforward database operations, for example the Add button takes whatever is in the text boxes and inserts a new record into the </w:t>
+      </w:r>
+      <w:proofErr w:type="spellStart"/>
+      <w:r>
+        <w:rPr>
+          <w:rFonts w:ascii="Aptos" w:eastAsia="Aptos" w:hAnsi="Aptos" w:cs="Aptos"/>
+        </w:rPr>
+        <w:t>tblFilm</w:t>
+      </w:r>
+      <w:proofErr w:type="spellEnd"/>
+      <w:r>
+        <w:rPr>
+          <w:rFonts w:ascii="Aptos" w:eastAsia="Aptos" w:hAnsi="Aptos" w:cs="Aptos"/>
+        </w:rPr>
+        <w:t xml:space="preserve"> table, whereas the Update button changes the record for the film currently selected in the grid, and the Delete button removes it. The Clear button simply empties the text boxes so the user can start again.</w:t>
+      </w:r>
+    </w:p>
+    <w:p>
+      <w:pPr>
+        <w:spacing w:after="160" w:line="276" w:lineRule="auto"/>
+      </w:pPr>
+      <w:r>
+        <w:rPr>
+          <w:rFonts w:ascii="Aptos" w:eastAsia="Aptos" w:hAnsi="Aptos" w:cs="Aptos"/>
+        </w:rPr>
+        <w:t xml:space="preserve">I have laid the form out with the list on one side and the editing boxes on the other, this is because it lets the user see the existing data and the thing they are editing at the same time rather than flipping between two separate screens. I have again used clearly labelled buttons for each action, this is because it makes it obvious what each one does and avoids the user accidentally deleting a film when they only meant to update it. This same pattern, a list on one side and input boxes with Add, Update, Delete and Clear buttons on the other, </w:t>
+      </w:r>
+      <w:r>
+        <w:rPr>
+          <w:rFonts w:ascii="Aptos" w:eastAsia="Aptos" w:hAnsi="Aptos" w:cs="Aptos"/>
+        </w:rPr>
+        <w:lastRenderedPageBreak/>
+        <w:t>is reused across several of the management forms, so where a later objective uses the same layout I will refer back to this description rather than repeating it.</w:t>
+      </w:r>
+    </w:p>
+    <w:p>
+      <w:pPr>
+        <w:spacing w:after="160" w:line="276" w:lineRule="auto"/>
+      </w:pPr>
+    </w:p>
+    <w:p>
+      <w:pPr>
+        <w:pStyle w:val="Heading2"/>
+        <w:rPr>
+          <w:b/>
+          <w:bCs/>
+          <w:color w:val="000000" w:themeColor="text1"/>
+        </w:rPr>
+      </w:pPr>
+      <w:r>
+        <w:rPr>
+          <w:b/>
+          <w:bCs/>
+          <w:color w:val="000000" w:themeColor="text1"/>
+        </w:rPr>
+        <w:t>Data Structures and Methods of Access</w:t>
+      </w:r>
+    </w:p>
+    <w:p>
+      <w:pPr>
+        <w:spacing w:after="160" w:line="276" w:lineRule="auto"/>
+      </w:pPr>
+      <w:r>
+        <w:t xml:space="preserve">The purpose of this section is to specify the data structures that the </w:t>
+      </w:r>
+      <w:proofErr w:type="spellStart"/>
+      <w:r>
+        <w:t>Filmtopia</w:t>
+      </w:r>
+      <w:proofErr w:type="spellEnd"/>
+      <w:r>
+        <w:t xml:space="preserve"> system will use to store its data. As the system is built around a Microsoft Access database accessed through </w:t>
+      </w:r>
+      <w:proofErr w:type="spellStart"/>
+      <w:r>
+        <w:t>OleDb</w:t>
+      </w:r>
+      <w:proofErr w:type="spellEnd"/>
+      <w:r>
+        <w:t>, these data structures take the form of database tables rather than arrays or other in memory structures. Each table and the relationships between them are described below, along with the way the data in those tables will be accessed. A key aim throughout the design has been to make sure the table structure is fully normalised to third normal form so that data is never repeated unnecessarily and the database cannot end up in an inconsistent state.</w:t>
       </w:r>
     </w:p>
     <w:p>
@@ -325,7 +937,23 @@
         <w:spacing w:after="160" w:line="276" w:lineRule="auto"/>
       </w:pPr>
       <w:r>
-        <w:t>The way to resolve a many to many relationship is to create a new link table that sits between the two original entities, turning the single many to many relationship into two separate one to many relationships. For the booking and seat relationship this link table is tblBookingSeat, and for the booking and food item relationship it is tblOrderItem. Each link table holds its own primary key along with the two foreign keys that point back to the tables it joins. The diagram below shows the final design once these link tables have been added, with the primary key of each table shown in bold and the foreign keys shown in italics.</w:t>
+        <w:t xml:space="preserve">The way to resolve a many to many relationship is to create a new link table that sits between the two original entities, turning the single many to many relationship into two separate one to many relationships. For the booking and seat relationship this link table is </w:t>
+      </w:r>
+      <w:proofErr w:type="spellStart"/>
+      <w:r>
+        <w:t>tblBookingSeat</w:t>
+      </w:r>
+      <w:proofErr w:type="spellEnd"/>
+      <w:r>
+        <w:t xml:space="preserve">, and for the booking and food item relationship it is </w:t>
+      </w:r>
+      <w:proofErr w:type="spellStart"/>
+      <w:r>
+        <w:t>tblOrderItem</w:t>
+      </w:r>
+      <w:proofErr w:type="spellEnd"/>
+      <w:r>
+        <w:t>. Each link table holds its own primary key along with the two foreign keys that point back to the tables it joins. The diagram below shows the final design once these link tables have been added, with the primary key of each table shown in bold and the foreign keys shown in italics.</w:t>
       </w:r>
     </w:p>
     <w:p>
@@ -398,7 +1026,55 @@
         <w:spacing w:after="160" w:line="276" w:lineRule="auto"/>
       </w:pPr>
       <w:r>
-        <w:t>In this final design the foreign keys are produced by copying the primary key from the one end of each relationship to the many end. For example the ScreeningID primary key from tblScreening is copied into tblBooking as a foreign key, because one screening can have many bookings. The same pattern is followed throughout, which keeps every relationship as a clean one to many. The structure is normalised to third normal form because every non key field in each table depends only on the whole of that table's primary key, with no field depending on another non key field and no repeating groups of data anywhere in the design. Three further tables exist in the system that do not appear in this diagram because they are standalone and not related to the others through foreign keys. These are tblLogin, which holds the user accounts, tblLogs, which records system events, and tblVersionControl, which holds the application version. They are included in the table designs below for completeness.</w:t>
+        <w:t xml:space="preserve">In this final design the foreign keys are produced by copying the primary key from the one end of each relationship to the many end. For example the </w:t>
+      </w:r>
+      <w:proofErr w:type="spellStart"/>
+      <w:r>
+        <w:t>ScreeningID</w:t>
+      </w:r>
+      <w:proofErr w:type="spellEnd"/>
+      <w:r>
+        <w:t xml:space="preserve"> primary key from </w:t>
+      </w:r>
+      <w:proofErr w:type="spellStart"/>
+      <w:r>
+        <w:t>tblScreening</w:t>
+      </w:r>
+      <w:proofErr w:type="spellEnd"/>
+      <w:r>
+        <w:t xml:space="preserve"> is copied into </w:t>
+      </w:r>
+      <w:proofErr w:type="spellStart"/>
+      <w:r>
+        <w:t>tblBooking</w:t>
+      </w:r>
+      <w:proofErr w:type="spellEnd"/>
+      <w:r>
+        <w:t xml:space="preserve"> as a foreign key, because one screening can have many bookings. The same pattern is followed throughout, which keeps every relationship as a clean one to many. The structure is normalised to third normal form because every non key field in each table depends only on the whole of that table's primary key, with no field depending on another non key field and no repeating groups of data anywhere in the design. Three further tables exist in the system that do not appear in this diagram because they are standalone and not related to the others through foreign keys. These are </w:t>
+      </w:r>
+      <w:proofErr w:type="spellStart"/>
+      <w:r>
+        <w:t>tblLogin</w:t>
+      </w:r>
+      <w:proofErr w:type="spellEnd"/>
+      <w:r>
+        <w:t xml:space="preserve">, which holds the user accounts, </w:t>
+      </w:r>
+      <w:proofErr w:type="spellStart"/>
+      <w:r>
+        <w:t>tblLogs</w:t>
+      </w:r>
+      <w:proofErr w:type="spellEnd"/>
+      <w:r>
+        <w:t xml:space="preserve">, which records system events, and </w:t>
+      </w:r>
+      <w:proofErr w:type="spellStart"/>
+      <w:r>
+        <w:t>tblVersionControl</w:t>
+      </w:r>
+      <w:proofErr w:type="spellEnd"/>
+      <w:r>
+        <w:t>, which holds the application version. They are included in the table designs below for completeness.</w:t>
       </w:r>
     </w:p>
     <w:p>
@@ -458,7 +1134,23 @@
         <w:spacing w:after="160" w:line="276" w:lineRule="auto"/>
       </w:pPr>
       <w:r>
-        <w:t>The Filmtopia tables are stored within a Microsoft Access database and are accessed from the Visual Basic .NET application using SQL queries sent through an OleDb connection, specifically SELECT, INSERT, UPDATE and DELETE queries. The database management system stores the tables as direct access files and maintains indexes on the primary keys so that looking a record up by its primary key is fast and does not require reading through every record. Where a search is carried out on a field that is not indexed, the database falls back to a sequential search through the table.</w:t>
+        <w:t xml:space="preserve">The </w:t>
+      </w:r>
+      <w:proofErr w:type="spellStart"/>
+      <w:r>
+        <w:t>Filmtopia</w:t>
+      </w:r>
+      <w:proofErr w:type="spellEnd"/>
+      <w:r>
+        <w:t xml:space="preserve"> tables are stored within a Microsoft Access database and are accessed from the Visual Basic .NET application using SQL queries sent through an </w:t>
+      </w:r>
+      <w:proofErr w:type="spellStart"/>
+      <w:r>
+        <w:t>OleDb</w:t>
+      </w:r>
+      <w:proofErr w:type="spellEnd"/>
+      <w:r>
+        <w:t xml:space="preserve"> connection, specifically SELECT, INSERT, UPDATE and DELETE queries. The database management system stores the tables as direct access files and maintains indexes on the primary keys so that looking a record up by its primary key is fast and does not require reading through every record. Where a search is carried out on a field that is not indexed, the database falls back to a sequential search through the table.</w:t>
       </w:r>
     </w:p>
     <w:p>
@@ -470,6 +1162,7 @@
           <w:color w:val="000000" w:themeColor="text1"/>
         </w:rPr>
       </w:pPr>
+      <w:proofErr w:type="spellStart"/>
       <w:r>
         <w:rPr>
           <w:b/>
@@ -478,6 +1171,7 @@
         </w:rPr>
         <w:t>tblFilm</w:t>
       </w:r>
+      <w:proofErr w:type="spellEnd"/>
     </w:p>
     <w:p>
       <w:pPr>
@@ -655,6 +1349,7 @@
             </w:tcMar>
           </w:tcPr>
           <w:p>
+            <w:proofErr w:type="spellStart"/>
             <w:r>
               <w:rPr>
                 <w:sz w:val="19"/>
@@ -662,6 +1357,7 @@
               </w:rPr>
               <w:t>FilmID</w:t>
             </w:r>
+            <w:proofErr w:type="spellEnd"/>
           </w:p>
         </w:tc>
         <w:tc>
@@ -749,6 +1445,7 @@
             </w:tcMar>
           </w:tcPr>
           <w:p>
+            <w:proofErr w:type="spellStart"/>
             <w:r>
               <w:rPr>
                 <w:sz w:val="19"/>
@@ -756,6 +1453,7 @@
               </w:rPr>
               <w:t>FilmTitle</w:t>
             </w:r>
+            <w:proofErr w:type="spellEnd"/>
           </w:p>
         </w:tc>
         <w:tc>
@@ -851,6 +1549,7 @@
             </w:tcMar>
           </w:tcPr>
           <w:p>
+            <w:proofErr w:type="spellStart"/>
             <w:r>
               <w:rPr>
                 <w:sz w:val="19"/>
@@ -858,6 +1557,7 @@
               </w:rPr>
               <w:t>FilmAgeRating</w:t>
             </w:r>
+            <w:proofErr w:type="spellEnd"/>
           </w:p>
         </w:tc>
         <w:tc>
@@ -953,6 +1653,7 @@
             </w:tcMar>
           </w:tcPr>
           <w:p>
+            <w:proofErr w:type="spellStart"/>
             <w:r>
               <w:rPr>
                 <w:sz w:val="19"/>
@@ -960,6 +1661,7 @@
               </w:rPr>
               <w:t>FilmDuration</w:t>
             </w:r>
+            <w:proofErr w:type="spellEnd"/>
           </w:p>
         </w:tc>
         <w:tc>
@@ -1047,6 +1749,7 @@
             </w:tcMar>
           </w:tcPr>
           <w:p>
+            <w:proofErr w:type="spellStart"/>
             <w:r>
               <w:rPr>
                 <w:sz w:val="19"/>
@@ -1054,6 +1757,7 @@
               </w:rPr>
               <w:t>FilmDescription</w:t>
             </w:r>
+            <w:proofErr w:type="spellEnd"/>
           </w:p>
         </w:tc>
         <w:tc>
@@ -1152,6 +1856,7 @@
           <w:color w:val="000000" w:themeColor="text1"/>
         </w:rPr>
       </w:pPr>
+      <w:proofErr w:type="spellStart"/>
       <w:r>
         <w:rPr>
           <w:b/>
@@ -1160,6 +1865,7 @@
         </w:rPr>
         <w:t>tblScreen</w:t>
       </w:r>
+      <w:proofErr w:type="spellEnd"/>
     </w:p>
     <w:p>
       <w:pPr>
@@ -1337,6 +2043,7 @@
             </w:tcMar>
           </w:tcPr>
           <w:p>
+            <w:proofErr w:type="spellStart"/>
             <w:r>
               <w:rPr>
                 <w:sz w:val="19"/>
@@ -1344,6 +2051,7 @@
               </w:rPr>
               <w:t>ScreenID</w:t>
             </w:r>
+            <w:proofErr w:type="spellEnd"/>
           </w:p>
         </w:tc>
         <w:tc>
@@ -1431,6 +2139,7 @@
             </w:tcMar>
           </w:tcPr>
           <w:p>
+            <w:proofErr w:type="spellStart"/>
             <w:r>
               <w:rPr>
                 <w:sz w:val="19"/>
@@ -1438,6 +2147,7 @@
               </w:rPr>
               <w:t>ScreenName</w:t>
             </w:r>
+            <w:proofErr w:type="spellEnd"/>
           </w:p>
         </w:tc>
         <w:tc>
@@ -1533,6 +2243,7 @@
             </w:tcMar>
           </w:tcPr>
           <w:p>
+            <w:proofErr w:type="spellStart"/>
             <w:r>
               <w:rPr>
                 <w:sz w:val="19"/>
@@ -1540,6 +2251,7 @@
               </w:rPr>
               <w:t>ScreenCapacity</w:t>
             </w:r>
+            <w:proofErr w:type="spellEnd"/>
           </w:p>
         </w:tc>
         <w:tc>
@@ -1630,6 +2342,7 @@
           <w:color w:val="000000" w:themeColor="text1"/>
         </w:rPr>
       </w:pPr>
+      <w:proofErr w:type="spellStart"/>
       <w:r>
         <w:rPr>
           <w:b/>
@@ -1638,6 +2351,7 @@
         </w:rPr>
         <w:t>tblScreening</w:t>
       </w:r>
+      <w:proofErr w:type="spellEnd"/>
     </w:p>
     <w:p>
       <w:pPr>
@@ -1815,6 +2529,7 @@
             </w:tcMar>
           </w:tcPr>
           <w:p>
+            <w:proofErr w:type="spellStart"/>
             <w:r>
               <w:rPr>
                 <w:sz w:val="19"/>
@@ -1822,6 +2537,7 @@
               </w:rPr>
               <w:t>ScreeningID</w:t>
             </w:r>
+            <w:proofErr w:type="spellEnd"/>
           </w:p>
         </w:tc>
         <w:tc>
@@ -1909,6 +2625,7 @@
             </w:tcMar>
           </w:tcPr>
           <w:p>
+            <w:proofErr w:type="spellStart"/>
             <w:r>
               <w:rPr>
                 <w:sz w:val="19"/>
@@ -1916,6 +2633,7 @@
               </w:rPr>
               <w:t>FilmID</w:t>
             </w:r>
+            <w:proofErr w:type="spellEnd"/>
           </w:p>
         </w:tc>
         <w:tc>
@@ -1966,7 +2684,23 @@
                 <w:sz w:val="19"/>
                 <w:szCs w:val="19"/>
               </w:rPr>
-              <w:t>The film being shown (Foreign Key to tblFilm)</w:t>
+              <w:t xml:space="preserve">The film being shown (Foreign Key to </w:t>
+            </w:r>
+            <w:proofErr w:type="spellStart"/>
+            <w:r>
+              <w:rPr>
+                <w:sz w:val="19"/>
+                <w:szCs w:val="19"/>
+              </w:rPr>
+              <w:t>tblFilm</w:t>
+            </w:r>
+            <w:proofErr w:type="spellEnd"/>
+            <w:r>
+              <w:rPr>
+                <w:sz w:val="19"/>
+                <w:szCs w:val="19"/>
+              </w:rPr>
+              <w:t>)</w:t>
             </w:r>
           </w:p>
         </w:tc>
@@ -2003,6 +2737,7 @@
             </w:tcMar>
           </w:tcPr>
           <w:p>
+            <w:proofErr w:type="spellStart"/>
             <w:r>
               <w:rPr>
                 <w:sz w:val="19"/>
@@ -2010,6 +2745,7 @@
               </w:rPr>
               <w:t>ScreenID</w:t>
             </w:r>
+            <w:proofErr w:type="spellEnd"/>
           </w:p>
         </w:tc>
         <w:tc>
@@ -2060,7 +2796,23 @@
                 <w:sz w:val="19"/>
                 <w:szCs w:val="19"/>
               </w:rPr>
-              <w:t>The screen it is shown in (Foreign Key to tblScreen)</w:t>
+              <w:t xml:space="preserve">The screen it is shown in (Foreign Key to </w:t>
+            </w:r>
+            <w:proofErr w:type="spellStart"/>
+            <w:r>
+              <w:rPr>
+                <w:sz w:val="19"/>
+                <w:szCs w:val="19"/>
+              </w:rPr>
+              <w:t>tblScreen</w:t>
+            </w:r>
+            <w:proofErr w:type="spellEnd"/>
+            <w:r>
+              <w:rPr>
+                <w:sz w:val="19"/>
+                <w:szCs w:val="19"/>
+              </w:rPr>
+              <w:t>)</w:t>
             </w:r>
           </w:p>
         </w:tc>
@@ -2097,6 +2849,7 @@
             </w:tcMar>
           </w:tcPr>
           <w:p>
+            <w:proofErr w:type="spellStart"/>
             <w:r>
               <w:rPr>
                 <w:sz w:val="19"/>
@@ -2104,6 +2857,7 @@
               </w:rPr>
               <w:t>ScreeningDate</w:t>
             </w:r>
+            <w:proofErr w:type="spellEnd"/>
           </w:p>
         </w:tc>
         <w:tc>
@@ -2191,6 +2945,7 @@
             </w:tcMar>
           </w:tcPr>
           <w:p>
+            <w:proofErr w:type="spellStart"/>
             <w:r>
               <w:rPr>
                 <w:sz w:val="19"/>
@@ -2198,6 +2953,7 @@
               </w:rPr>
               <w:t>ScreeningTime</w:t>
             </w:r>
+            <w:proofErr w:type="spellEnd"/>
           </w:p>
         </w:tc>
         <w:tc>
@@ -2293,6 +3049,7 @@
             </w:tcMar>
           </w:tcPr>
           <w:p>
+            <w:proofErr w:type="spellStart"/>
             <w:r>
               <w:rPr>
                 <w:sz w:val="19"/>
@@ -2300,6 +3057,7 @@
               </w:rPr>
               <w:t>TicketPrice</w:t>
             </w:r>
+            <w:proofErr w:type="spellEnd"/>
           </w:p>
         </w:tc>
         <w:tc>
@@ -2390,6 +3148,7 @@
           <w:color w:val="000000" w:themeColor="text1"/>
         </w:rPr>
       </w:pPr>
+      <w:proofErr w:type="spellStart"/>
       <w:r>
         <w:rPr>
           <w:b/>
@@ -2398,6 +3157,7 @@
         </w:rPr>
         <w:t>tblSeat</w:t>
       </w:r>
+      <w:proofErr w:type="spellEnd"/>
     </w:p>
     <w:p>
       <w:pPr>
@@ -2575,6 +3335,7 @@
             </w:tcMar>
           </w:tcPr>
           <w:p>
+            <w:proofErr w:type="spellStart"/>
             <w:r>
               <w:rPr>
                 <w:sz w:val="19"/>
@@ -2582,6 +3343,7 @@
               </w:rPr>
               <w:t>SeatID</w:t>
             </w:r>
+            <w:proofErr w:type="spellEnd"/>
           </w:p>
         </w:tc>
         <w:tc>
@@ -2669,6 +3431,7 @@
             </w:tcMar>
           </w:tcPr>
           <w:p>
+            <w:proofErr w:type="spellStart"/>
             <w:r>
               <w:rPr>
                 <w:sz w:val="19"/>
@@ -2676,6 +3439,7 @@
               </w:rPr>
               <w:t>ScreenID</w:t>
             </w:r>
+            <w:proofErr w:type="spellEnd"/>
           </w:p>
         </w:tc>
         <w:tc>
@@ -2726,7 +3490,23 @@
                 <w:sz w:val="19"/>
                 <w:szCs w:val="19"/>
               </w:rPr>
-              <w:t>The screen the seat belongs to (Foreign Key to tblScreen)</w:t>
+              <w:t xml:space="preserve">The screen the seat belongs to (Foreign Key to </w:t>
+            </w:r>
+            <w:proofErr w:type="spellStart"/>
+            <w:r>
+              <w:rPr>
+                <w:sz w:val="19"/>
+                <w:szCs w:val="19"/>
+              </w:rPr>
+              <w:t>tblScreen</w:t>
+            </w:r>
+            <w:proofErr w:type="spellEnd"/>
+            <w:r>
+              <w:rPr>
+                <w:sz w:val="19"/>
+                <w:szCs w:val="19"/>
+              </w:rPr>
+              <w:t>)</w:t>
             </w:r>
           </w:p>
         </w:tc>
@@ -2763,6 +3543,7 @@
             </w:tcMar>
           </w:tcPr>
           <w:p>
+            <w:proofErr w:type="spellStart"/>
             <w:r>
               <w:rPr>
                 <w:sz w:val="19"/>
@@ -2770,6 +3551,7 @@
               </w:rPr>
               <w:t>SeatRow</w:t>
             </w:r>
+            <w:proofErr w:type="spellEnd"/>
           </w:p>
         </w:tc>
         <w:tc>
@@ -2865,6 +3647,7 @@
             </w:tcMar>
           </w:tcPr>
           <w:p>
+            <w:proofErr w:type="spellStart"/>
             <w:r>
               <w:rPr>
                 <w:sz w:val="19"/>
@@ -2872,6 +3655,7 @@
               </w:rPr>
               <w:t>SeatNumber</w:t>
             </w:r>
+            <w:proofErr w:type="spellEnd"/>
           </w:p>
         </w:tc>
         <w:tc>
@@ -2962,6 +3746,7 @@
           <w:color w:val="000000" w:themeColor="text1"/>
         </w:rPr>
       </w:pPr>
+      <w:proofErr w:type="spellStart"/>
       <w:r>
         <w:rPr>
           <w:b/>
@@ -2970,6 +3755,7 @@
         </w:rPr>
         <w:t>tblCustomer</w:t>
       </w:r>
+      <w:proofErr w:type="spellEnd"/>
     </w:p>
     <w:p>
       <w:pPr>
@@ -3147,6 +3933,7 @@
             </w:tcMar>
           </w:tcPr>
           <w:p>
+            <w:proofErr w:type="spellStart"/>
             <w:r>
               <w:rPr>
                 <w:sz w:val="19"/>
@@ -3154,6 +3941,7 @@
               </w:rPr>
               <w:t>CustomerID</w:t>
             </w:r>
+            <w:proofErr w:type="spellEnd"/>
           </w:p>
         </w:tc>
         <w:tc>
@@ -3241,6 +4029,7 @@
             </w:tcMar>
           </w:tcPr>
           <w:p>
+            <w:proofErr w:type="spellStart"/>
             <w:r>
               <w:rPr>
                 <w:sz w:val="19"/>
@@ -3248,6 +4037,7 @@
               </w:rPr>
               <w:t>CustomerForename</w:t>
             </w:r>
+            <w:proofErr w:type="spellEnd"/>
           </w:p>
         </w:tc>
         <w:tc>
@@ -3343,6 +4133,7 @@
             </w:tcMar>
           </w:tcPr>
           <w:p>
+            <w:proofErr w:type="spellStart"/>
             <w:r>
               <w:rPr>
                 <w:sz w:val="19"/>
@@ -3350,6 +4141,7 @@
               </w:rPr>
               <w:t>CustomerSurname</w:t>
             </w:r>
+            <w:proofErr w:type="spellEnd"/>
           </w:p>
         </w:tc>
         <w:tc>
@@ -3445,6 +4237,7 @@
             </w:tcMar>
           </w:tcPr>
           <w:p>
+            <w:proofErr w:type="spellStart"/>
             <w:r>
               <w:rPr>
                 <w:sz w:val="19"/>
@@ -3452,6 +4245,7 @@
               </w:rPr>
               <w:t>CustomerEmail</w:t>
             </w:r>
+            <w:proofErr w:type="spellEnd"/>
           </w:p>
         </w:tc>
         <w:tc>
@@ -3547,6 +4341,7 @@
             </w:tcMar>
           </w:tcPr>
           <w:p>
+            <w:proofErr w:type="spellStart"/>
             <w:r>
               <w:rPr>
                 <w:sz w:val="19"/>
@@ -3554,6 +4349,7 @@
               </w:rPr>
               <w:t>CustomerPhone</w:t>
             </w:r>
+            <w:proofErr w:type="spellEnd"/>
           </w:p>
         </w:tc>
         <w:tc>
@@ -3652,6 +4448,7 @@
           <w:color w:val="000000" w:themeColor="text1"/>
         </w:rPr>
       </w:pPr>
+      <w:proofErr w:type="spellStart"/>
       <w:r>
         <w:rPr>
           <w:b/>
@@ -3660,6 +4457,7 @@
         </w:rPr>
         <w:t>tblBooking</w:t>
       </w:r>
+      <w:proofErr w:type="spellEnd"/>
     </w:p>
     <w:p>
       <w:pPr>
@@ -3837,6 +4635,7 @@
             </w:tcMar>
           </w:tcPr>
           <w:p>
+            <w:proofErr w:type="spellStart"/>
             <w:r>
               <w:rPr>
                 <w:sz w:val="19"/>
@@ -3844,6 +4643,7 @@
               </w:rPr>
               <w:t>BookingID</w:t>
             </w:r>
+            <w:proofErr w:type="spellEnd"/>
           </w:p>
         </w:tc>
         <w:tc>
@@ -3931,6 +4731,7 @@
             </w:tcMar>
           </w:tcPr>
           <w:p>
+            <w:proofErr w:type="spellStart"/>
             <w:r>
               <w:rPr>
                 <w:sz w:val="19"/>
@@ -3938,6 +4739,7 @@
               </w:rPr>
               <w:t>CustomerID</w:t>
             </w:r>
+            <w:proofErr w:type="spellEnd"/>
           </w:p>
         </w:tc>
         <w:tc>
@@ -3988,7 +4790,23 @@
                 <w:sz w:val="19"/>
                 <w:szCs w:val="19"/>
               </w:rPr>
-              <w:t>The customer who made the booking (Foreign Key to tblCustomer)</w:t>
+              <w:t xml:space="preserve">The customer who made the booking (Foreign Key to </w:t>
+            </w:r>
+            <w:proofErr w:type="spellStart"/>
+            <w:r>
+              <w:rPr>
+                <w:sz w:val="19"/>
+                <w:szCs w:val="19"/>
+              </w:rPr>
+              <w:t>tblCustomer</w:t>
+            </w:r>
+            <w:proofErr w:type="spellEnd"/>
+            <w:r>
+              <w:rPr>
+                <w:sz w:val="19"/>
+                <w:szCs w:val="19"/>
+              </w:rPr>
+              <w:t>)</w:t>
             </w:r>
           </w:p>
         </w:tc>
@@ -4025,6 +4843,7 @@
             </w:tcMar>
           </w:tcPr>
           <w:p>
+            <w:proofErr w:type="spellStart"/>
             <w:r>
               <w:rPr>
                 <w:sz w:val="19"/>
@@ -4032,6 +4851,7 @@
               </w:rPr>
               <w:t>ScreeningID</w:t>
             </w:r>
+            <w:proofErr w:type="spellEnd"/>
           </w:p>
         </w:tc>
         <w:tc>
@@ -4082,7 +4902,23 @@
                 <w:sz w:val="19"/>
                 <w:szCs w:val="19"/>
               </w:rPr>
-              <w:t>The screening booked (Foreign Key to tblScreening)</w:t>
+              <w:t xml:space="preserve">The screening booked (Foreign Key to </w:t>
+            </w:r>
+            <w:proofErr w:type="spellStart"/>
+            <w:r>
+              <w:rPr>
+                <w:sz w:val="19"/>
+                <w:szCs w:val="19"/>
+              </w:rPr>
+              <w:t>tblScreening</w:t>
+            </w:r>
+            <w:proofErr w:type="spellEnd"/>
+            <w:r>
+              <w:rPr>
+                <w:sz w:val="19"/>
+                <w:szCs w:val="19"/>
+              </w:rPr>
+              <w:t>)</w:t>
             </w:r>
           </w:p>
         </w:tc>
@@ -4119,6 +4955,7 @@
             </w:tcMar>
           </w:tcPr>
           <w:p>
+            <w:proofErr w:type="spellStart"/>
             <w:r>
               <w:rPr>
                 <w:sz w:val="19"/>
@@ -4126,6 +4963,7 @@
               </w:rPr>
               <w:t>BookingDate</w:t>
             </w:r>
+            <w:proofErr w:type="spellEnd"/>
           </w:p>
         </w:tc>
         <w:tc>
@@ -4213,6 +5051,7 @@
             </w:tcMar>
           </w:tcPr>
           <w:p>
+            <w:proofErr w:type="spellStart"/>
             <w:r>
               <w:rPr>
                 <w:sz w:val="19"/>
@@ -4220,6 +5059,7 @@
               </w:rPr>
               <w:t>TotalCost</w:t>
             </w:r>
+            <w:proofErr w:type="spellEnd"/>
           </w:p>
         </w:tc>
         <w:tc>
@@ -4310,6 +5150,7 @@
           <w:color w:val="000000" w:themeColor="text1"/>
         </w:rPr>
       </w:pPr>
+      <w:proofErr w:type="spellStart"/>
       <w:r>
         <w:rPr>
           <w:b/>
@@ -4318,6 +5159,7 @@
         </w:rPr>
         <w:t>tblBookingSeat</w:t>
       </w:r>
+      <w:proofErr w:type="spellEnd"/>
     </w:p>
     <w:p>
       <w:pPr>
@@ -4495,6 +5337,7 @@
             </w:tcMar>
           </w:tcPr>
           <w:p>
+            <w:proofErr w:type="spellStart"/>
             <w:r>
               <w:rPr>
                 <w:sz w:val="19"/>
@@ -4502,6 +5345,7 @@
               </w:rPr>
               <w:t>BookingSeatID</w:t>
             </w:r>
+            <w:proofErr w:type="spellEnd"/>
           </w:p>
         </w:tc>
         <w:tc>
@@ -4589,6 +5433,7 @@
             </w:tcMar>
           </w:tcPr>
           <w:p>
+            <w:proofErr w:type="spellStart"/>
             <w:r>
               <w:rPr>
                 <w:sz w:val="19"/>
@@ -4596,6 +5441,7 @@
               </w:rPr>
               <w:t>BookingID</w:t>
             </w:r>
+            <w:proofErr w:type="spellEnd"/>
           </w:p>
         </w:tc>
         <w:tc>
@@ -4646,7 +5492,23 @@
                 <w:sz w:val="19"/>
                 <w:szCs w:val="19"/>
               </w:rPr>
-              <w:t>The booking this seat belongs to (Foreign Key to tblBooking)</w:t>
+              <w:t xml:space="preserve">The booking this seat belongs to (Foreign Key to </w:t>
+            </w:r>
+            <w:proofErr w:type="spellStart"/>
+            <w:r>
+              <w:rPr>
+                <w:sz w:val="19"/>
+                <w:szCs w:val="19"/>
+              </w:rPr>
+              <w:t>tblBooking</w:t>
+            </w:r>
+            <w:proofErr w:type="spellEnd"/>
+            <w:r>
+              <w:rPr>
+                <w:sz w:val="19"/>
+                <w:szCs w:val="19"/>
+              </w:rPr>
+              <w:t>)</w:t>
             </w:r>
           </w:p>
         </w:tc>
@@ -4683,6 +5545,7 @@
             </w:tcMar>
           </w:tcPr>
           <w:p>
+            <w:proofErr w:type="spellStart"/>
             <w:r>
               <w:rPr>
                 <w:sz w:val="19"/>
@@ -4690,6 +5553,7 @@
               </w:rPr>
               <w:t>SeatID</w:t>
             </w:r>
+            <w:proofErr w:type="spellEnd"/>
           </w:p>
         </w:tc>
         <w:tc>
@@ -4740,7 +5604,23 @@
                 <w:sz w:val="19"/>
                 <w:szCs w:val="19"/>
               </w:rPr>
-              <w:t>The seat that was booked (Foreign Key to tblSeat)</w:t>
+              <w:t xml:space="preserve">The seat that was booked (Foreign Key to </w:t>
+            </w:r>
+            <w:proofErr w:type="spellStart"/>
+            <w:r>
+              <w:rPr>
+                <w:sz w:val="19"/>
+                <w:szCs w:val="19"/>
+              </w:rPr>
+              <w:t>tblSeat</w:t>
+            </w:r>
+            <w:proofErr w:type="spellEnd"/>
+            <w:r>
+              <w:rPr>
+                <w:sz w:val="19"/>
+                <w:szCs w:val="19"/>
+              </w:rPr>
+              <w:t>)</w:t>
             </w:r>
           </w:p>
         </w:tc>
@@ -4780,6 +5660,7 @@
           <w:color w:val="000000" w:themeColor="text1"/>
         </w:rPr>
       </w:pPr>
+      <w:proofErr w:type="spellStart"/>
       <w:r>
         <w:rPr>
           <w:b/>
@@ -4788,6 +5669,7 @@
         </w:rPr>
         <w:t>tblFoodItem</w:t>
       </w:r>
+      <w:proofErr w:type="spellEnd"/>
     </w:p>
     <w:p>
       <w:pPr>
@@ -4965,6 +5847,7 @@
             </w:tcMar>
           </w:tcPr>
           <w:p>
+            <w:proofErr w:type="spellStart"/>
             <w:r>
               <w:rPr>
                 <w:sz w:val="19"/>
@@ -4972,6 +5855,7 @@
               </w:rPr>
               <w:t>FoodItemID</w:t>
             </w:r>
+            <w:proofErr w:type="spellEnd"/>
           </w:p>
         </w:tc>
         <w:tc>
@@ -5059,6 +5943,7 @@
             </w:tcMar>
           </w:tcPr>
           <w:p>
+            <w:proofErr w:type="spellStart"/>
             <w:r>
               <w:rPr>
                 <w:sz w:val="19"/>
@@ -5066,6 +5951,7 @@
               </w:rPr>
               <w:t>FoodItemName</w:t>
             </w:r>
+            <w:proofErr w:type="spellEnd"/>
           </w:p>
         </w:tc>
         <w:tc>
@@ -5161,6 +6047,7 @@
             </w:tcMar>
           </w:tcPr>
           <w:p>
+            <w:proofErr w:type="spellStart"/>
             <w:r>
               <w:rPr>
                 <w:sz w:val="19"/>
@@ -5168,6 +6055,7 @@
               </w:rPr>
               <w:t>FoodItemPrice</w:t>
             </w:r>
+            <w:proofErr w:type="spellEnd"/>
           </w:p>
         </w:tc>
         <w:tc>
@@ -5255,6 +6143,7 @@
             </w:tcMar>
           </w:tcPr>
           <w:p>
+            <w:proofErr w:type="spellStart"/>
             <w:r>
               <w:rPr>
                 <w:sz w:val="19"/>
@@ -5262,6 +6151,7 @@
               </w:rPr>
               <w:t>FoodItemCategory</w:t>
             </w:r>
+            <w:proofErr w:type="spellEnd"/>
           </w:p>
         </w:tc>
         <w:tc>
@@ -5360,6 +6250,7 @@
           <w:color w:val="000000" w:themeColor="text1"/>
         </w:rPr>
       </w:pPr>
+      <w:proofErr w:type="spellStart"/>
       <w:r>
         <w:rPr>
           <w:b/>
@@ -5368,6 +6259,7 @@
         </w:rPr>
         <w:t>tblOrderItem</w:t>
       </w:r>
+      <w:proofErr w:type="spellEnd"/>
     </w:p>
     <w:p>
       <w:pPr>
@@ -5545,6 +6437,7 @@
             </w:tcMar>
           </w:tcPr>
           <w:p>
+            <w:proofErr w:type="spellStart"/>
             <w:r>
               <w:rPr>
                 <w:sz w:val="19"/>
@@ -5552,6 +6445,7 @@
               </w:rPr>
               <w:t>OrderItemID</w:t>
             </w:r>
+            <w:proofErr w:type="spellEnd"/>
           </w:p>
         </w:tc>
         <w:tc>
@@ -5639,6 +6533,7 @@
             </w:tcMar>
           </w:tcPr>
           <w:p>
+            <w:proofErr w:type="spellStart"/>
             <w:r>
               <w:rPr>
                 <w:sz w:val="19"/>
@@ -5646,6 +6541,7 @@
               </w:rPr>
               <w:t>BookingID</w:t>
             </w:r>
+            <w:proofErr w:type="spellEnd"/>
           </w:p>
         </w:tc>
         <w:tc>
@@ -5696,7 +6592,23 @@
                 <w:sz w:val="19"/>
                 <w:szCs w:val="19"/>
               </w:rPr>
-              <w:t>The booking the item was added to (Foreign Key to tblBooking)</w:t>
+              <w:t xml:space="preserve">The booking the item was added to (Foreign Key to </w:t>
+            </w:r>
+            <w:proofErr w:type="spellStart"/>
+            <w:r>
+              <w:rPr>
+                <w:sz w:val="19"/>
+                <w:szCs w:val="19"/>
+              </w:rPr>
+              <w:t>tblBooking</w:t>
+            </w:r>
+            <w:proofErr w:type="spellEnd"/>
+            <w:r>
+              <w:rPr>
+                <w:sz w:val="19"/>
+                <w:szCs w:val="19"/>
+              </w:rPr>
+              <w:t>)</w:t>
             </w:r>
           </w:p>
         </w:tc>
@@ -5733,6 +6645,7 @@
             </w:tcMar>
           </w:tcPr>
           <w:p>
+            <w:proofErr w:type="spellStart"/>
             <w:r>
               <w:rPr>
                 <w:sz w:val="19"/>
@@ -5740,6 +6653,7 @@
               </w:rPr>
               <w:t>FoodItemID</w:t>
             </w:r>
+            <w:proofErr w:type="spellEnd"/>
           </w:p>
         </w:tc>
         <w:tc>
@@ -5790,7 +6704,23 @@
                 <w:sz w:val="19"/>
                 <w:szCs w:val="19"/>
               </w:rPr>
-              <w:t>The food item ordered (Foreign Key to tblFoodItem)</w:t>
+              <w:t xml:space="preserve">The food item ordered (Foreign Key to </w:t>
+            </w:r>
+            <w:proofErr w:type="spellStart"/>
+            <w:r>
+              <w:rPr>
+                <w:sz w:val="19"/>
+                <w:szCs w:val="19"/>
+              </w:rPr>
+              <w:t>tblFoodItem</w:t>
+            </w:r>
+            <w:proofErr w:type="spellEnd"/>
+            <w:r>
+              <w:rPr>
+                <w:sz w:val="19"/>
+                <w:szCs w:val="19"/>
+              </w:rPr>
+              <w:t>)</w:t>
             </w:r>
           </w:p>
         </w:tc>
@@ -5924,6 +6854,7 @@
           <w:color w:val="000000" w:themeColor="text1"/>
         </w:rPr>
       </w:pPr>
+      <w:proofErr w:type="spellStart"/>
       <w:r>
         <w:rPr>
           <w:b/>
@@ -5932,6 +6863,7 @@
         </w:rPr>
         <w:t>tblLogin</w:t>
       </w:r>
+      <w:proofErr w:type="spellEnd"/>
     </w:p>
     <w:p>
       <w:pPr>
@@ -6109,6 +7041,7 @@
             </w:tcMar>
           </w:tcPr>
           <w:p>
+            <w:proofErr w:type="spellStart"/>
             <w:r>
               <w:rPr>
                 <w:sz w:val="19"/>
@@ -6116,6 +7049,7 @@
               </w:rPr>
               <w:t>LoginID</w:t>
             </w:r>
+            <w:proofErr w:type="spellEnd"/>
           </w:p>
         </w:tc>
         <w:tc>
@@ -6385,6 +7319,7 @@
             </w:tcMar>
           </w:tcPr>
           <w:p>
+            <w:proofErr w:type="spellStart"/>
             <w:r>
               <w:rPr>
                 <w:sz w:val="19"/>
@@ -6392,6 +7327,7 @@
               </w:rPr>
               <w:t>MTIz</w:t>
             </w:r>
+            <w:proofErr w:type="spellEnd"/>
           </w:p>
         </w:tc>
       </w:tr>
@@ -6407,6 +7343,7 @@
             </w:tcMar>
           </w:tcPr>
           <w:p>
+            <w:proofErr w:type="spellStart"/>
             <w:r>
               <w:rPr>
                 <w:sz w:val="19"/>
@@ -6414,6 +7351,7 @@
               </w:rPr>
               <w:t>AccessLevel</w:t>
             </w:r>
+            <w:proofErr w:type="spellEnd"/>
           </w:p>
         </w:tc>
         <w:tc>
@@ -6504,6 +7442,7 @@
           <w:color w:val="000000" w:themeColor="text1"/>
         </w:rPr>
       </w:pPr>
+      <w:proofErr w:type="spellStart"/>
       <w:r>
         <w:rPr>
           <w:b/>
@@ -6512,6 +7451,7 @@
         </w:rPr>
         <w:t>tblLogs</w:t>
       </w:r>
+      <w:proofErr w:type="spellEnd"/>
     </w:p>
     <w:p>
       <w:pPr>
@@ -6689,6 +7629,7 @@
             </w:tcMar>
           </w:tcPr>
           <w:p>
+            <w:proofErr w:type="spellStart"/>
             <w:r>
               <w:rPr>
                 <w:sz w:val="19"/>
@@ -6696,6 +7637,7 @@
               </w:rPr>
               <w:t>LogID</w:t>
             </w:r>
+            <w:proofErr w:type="spellEnd"/>
           </w:p>
         </w:tc>
         <w:tc>
@@ -6783,6 +7725,7 @@
             </w:tcMar>
           </w:tcPr>
           <w:p>
+            <w:proofErr w:type="spellStart"/>
             <w:r>
               <w:rPr>
                 <w:sz w:val="19"/>
@@ -6790,6 +7733,7 @@
               </w:rPr>
               <w:t>LogDateTime</w:t>
             </w:r>
+            <w:proofErr w:type="spellEnd"/>
           </w:p>
         </w:tc>
         <w:tc>
@@ -6877,6 +7821,7 @@
             </w:tcMar>
           </w:tcPr>
           <w:p>
+            <w:proofErr w:type="spellStart"/>
             <w:r>
               <w:rPr>
                 <w:sz w:val="19"/>
@@ -6884,6 +7829,7 @@
               </w:rPr>
               <w:t>LogType</w:t>
             </w:r>
+            <w:proofErr w:type="spellEnd"/>
           </w:p>
         </w:tc>
         <w:tc>
@@ -6979,6 +7925,7 @@
             </w:tcMar>
           </w:tcPr>
           <w:p>
+            <w:proofErr w:type="spellStart"/>
             <w:r>
               <w:rPr>
                 <w:sz w:val="19"/>
@@ -6986,6 +7933,7 @@
               </w:rPr>
               <w:t>LogMessage</w:t>
             </w:r>
+            <w:proofErr w:type="spellEnd"/>
           </w:p>
         </w:tc>
         <w:tc>
@@ -7076,6 +8024,7 @@
           <w:color w:val="000000" w:themeColor="text1"/>
         </w:rPr>
       </w:pPr>
+      <w:proofErr w:type="spellStart"/>
       <w:r>
         <w:rPr>
           <w:b/>
@@ -7084,6 +8033,7 @@
         </w:rPr>
         <w:t>tblVersionControl</w:t>
       </w:r>
+      <w:proofErr w:type="spellEnd"/>
     </w:p>
     <w:p>
       <w:pPr>
@@ -7381,7 +8331,15 @@
         <w:spacing w:after="160" w:line="276" w:lineRule="auto"/>
       </w:pPr>
       <w:r>
-        <w:t>This section describes the processing that takes place inside the Filmtopia system. Rather than listing every button on every form it focuses on the stages where there is real logic going on, since these are the parts of the system that need to be thought through carefully before any code is written. Each stage is described in plain English pseudocode rather than in Visual Basic, so that the logic is clear and separate from the eventual code, and the two most important algorithms are also shown as flowcharts. Each stage is linked back to the objectives it helps to meet.</w:t>
+        <w:t xml:space="preserve">This section describes the processing that takes place inside the </w:t>
+      </w:r>
+      <w:proofErr w:type="spellStart"/>
+      <w:r>
+        <w:t>Filmtopia</w:t>
+      </w:r>
+      <w:proofErr w:type="spellEnd"/>
+      <w:r>
+        <w:t xml:space="preserve"> system. Rather than listing every button on every form it focuses on the stages where there is real logic going on, since these are the parts of the system that need to be thought through carefully before any code is written. Each stage is described in plain English pseudocode rather than in Visual Basic, so that the logic is clear and separate from the eventual code, and the two most important algorithms are also shown as flowcharts. Each stage is linked back to the objectives it helps to meet.</w:t>
       </w:r>
     </w:p>
     <w:p>
@@ -7497,7 +8455,25 @@
                 <w:sz w:val="19"/>
                 <w:szCs w:val="19"/>
               </w:rPr>
-              <w:t xml:space="preserve">    LOOK UP the username in tblLogin using an SQL SELECT query</w:t>
+              <w:t xml:space="preserve">    LOOK UP the username in </w:t>
+            </w:r>
+            <w:proofErr w:type="spellStart"/>
+            <w:r>
+              <w:rPr>
+                <w:rFonts w:ascii="Courier New" w:eastAsia="Courier New" w:hAnsi="Courier New" w:cs="Courier New"/>
+                <w:sz w:val="19"/>
+                <w:szCs w:val="19"/>
+              </w:rPr>
+              <w:t>tblLogin</w:t>
+            </w:r>
+            <w:proofErr w:type="spellEnd"/>
+            <w:r>
+              <w:rPr>
+                <w:rFonts w:ascii="Courier New" w:eastAsia="Courier New" w:hAnsi="Courier New" w:cs="Courier New"/>
+                <w:sz w:val="19"/>
+                <w:szCs w:val="19"/>
+              </w:rPr>
+              <w:t xml:space="preserve"> using an SQL SELECT query</w:t>
             </w:r>
           </w:p>
           <w:p>
@@ -7557,7 +8533,25 @@
                 <w:sz w:val="19"/>
                 <w:szCs w:val="19"/>
               </w:rPr>
-              <w:t xml:space="preserve">        STORE the user's AccessLevel for the session</w:t>
+              <w:t xml:space="preserve">        STORE the user's </w:t>
+            </w:r>
+            <w:proofErr w:type="spellStart"/>
+            <w:r>
+              <w:rPr>
+                <w:rFonts w:ascii="Courier New" w:eastAsia="Courier New" w:hAnsi="Courier New" w:cs="Courier New"/>
+                <w:sz w:val="19"/>
+                <w:szCs w:val="19"/>
+              </w:rPr>
+              <w:t>AccessLevel</w:t>
+            </w:r>
+            <w:proofErr w:type="spellEnd"/>
+            <w:r>
+              <w:rPr>
+                <w:rFonts w:ascii="Courier New" w:eastAsia="Courier New" w:hAnsi="Courier New" w:cs="Courier New"/>
+                <w:sz w:val="19"/>
+                <w:szCs w:val="19"/>
+              </w:rPr>
+              <w:t xml:space="preserve"> for the session</w:t>
             </w:r>
           </w:p>
           <w:p>
@@ -7758,88 +8752,288 @@
                 <w:sz w:val="19"/>
                 <w:szCs w:val="19"/>
               </w:rPr>
-              <w:t>SET seatsPerRow to 10</w:t>
-            </w:r>
-          </w:p>
-          <w:p>
-            <w:r>
-              <w:rPr>
-                <w:rFonts w:ascii="Courier New" w:eastAsia="Courier New" w:hAnsi="Courier New" w:cs="Courier New"/>
-                <w:sz w:val="19"/>
-                <w:szCs w:val="19"/>
-              </w:rPr>
-              <w:t>SET rowLetter to "A"</w:t>
-            </w:r>
-          </w:p>
-          <w:p>
-            <w:r>
-              <w:rPr>
-                <w:rFonts w:ascii="Courier New" w:eastAsia="Courier New" w:hAnsi="Courier New" w:cs="Courier New"/>
-                <w:sz w:val="19"/>
-                <w:szCs w:val="19"/>
-              </w:rPr>
-              <w:t>SET seatsMade to 0</w:t>
-            </w:r>
-          </w:p>
-          <w:p>
-            <w:r>
-              <w:rPr>
-                <w:rFonts w:ascii="Courier New" w:eastAsia="Courier New" w:hAnsi="Courier New" w:cs="Courier New"/>
-                <w:sz w:val="19"/>
-                <w:szCs w:val="19"/>
-              </w:rPr>
-              <w:t>WHILE seatsMade is less than capacity</w:t>
-            </w:r>
-          </w:p>
-          <w:p>
-            <w:r>
-              <w:rPr>
-                <w:rFonts w:ascii="Courier New" w:eastAsia="Courier New" w:hAnsi="Courier New" w:cs="Courier New"/>
-                <w:sz w:val="19"/>
-                <w:szCs w:val="19"/>
-              </w:rPr>
-              <w:t xml:space="preserve">    FOR seatNumber from 1 to seatsPerRow</w:t>
-            </w:r>
-          </w:p>
-          <w:p>
-            <w:r>
-              <w:rPr>
-                <w:rFonts w:ascii="Courier New" w:eastAsia="Courier New" w:hAnsi="Courier New" w:cs="Courier New"/>
-                <w:sz w:val="19"/>
-                <w:szCs w:val="19"/>
-              </w:rPr>
-              <w:t xml:space="preserve">        IF seatsMade is less than capacity THEN</w:t>
-            </w:r>
-          </w:p>
-          <w:p>
-            <w:r>
-              <w:rPr>
-                <w:rFonts w:ascii="Courier New" w:eastAsia="Courier New" w:hAnsi="Courier New" w:cs="Courier New"/>
-                <w:sz w:val="19"/>
-                <w:szCs w:val="19"/>
-              </w:rPr>
-              <w:t xml:space="preserve">            INSERT a seat into tblSeat with the current ScreenID,</w:t>
-            </w:r>
-          </w:p>
-          <w:p>
-            <w:r>
-              <w:rPr>
-                <w:rFonts w:ascii="Courier New" w:eastAsia="Courier New" w:hAnsi="Courier New" w:cs="Courier New"/>
-                <w:sz w:val="19"/>
-                <w:szCs w:val="19"/>
-              </w:rPr>
-              <w:t xml:space="preserve">                   rowLetter and seatNumber using an SQL INSERT</w:t>
-            </w:r>
-          </w:p>
-          <w:p>
-            <w:r>
-              <w:rPr>
-                <w:rFonts w:ascii="Courier New" w:eastAsia="Courier New" w:hAnsi="Courier New" w:cs="Courier New"/>
-                <w:sz w:val="19"/>
-                <w:szCs w:val="19"/>
-              </w:rPr>
-              <w:t xml:space="preserve">            ADD 1 to seatsMade</w:t>
-            </w:r>
+              <w:t xml:space="preserve">SET </w:t>
+            </w:r>
+            <w:proofErr w:type="spellStart"/>
+            <w:r>
+              <w:rPr>
+                <w:rFonts w:ascii="Courier New" w:eastAsia="Courier New" w:hAnsi="Courier New" w:cs="Courier New"/>
+                <w:sz w:val="19"/>
+                <w:szCs w:val="19"/>
+              </w:rPr>
+              <w:t>seatsPerRow</w:t>
+            </w:r>
+            <w:proofErr w:type="spellEnd"/>
+            <w:r>
+              <w:rPr>
+                <w:rFonts w:ascii="Courier New" w:eastAsia="Courier New" w:hAnsi="Courier New" w:cs="Courier New"/>
+                <w:sz w:val="19"/>
+                <w:szCs w:val="19"/>
+              </w:rPr>
+              <w:t xml:space="preserve"> to 10</w:t>
+            </w:r>
+          </w:p>
+          <w:p>
+            <w:r>
+              <w:rPr>
+                <w:rFonts w:ascii="Courier New" w:eastAsia="Courier New" w:hAnsi="Courier New" w:cs="Courier New"/>
+                <w:sz w:val="19"/>
+                <w:szCs w:val="19"/>
+              </w:rPr>
+              <w:t xml:space="preserve">SET </w:t>
+            </w:r>
+            <w:proofErr w:type="spellStart"/>
+            <w:r>
+              <w:rPr>
+                <w:rFonts w:ascii="Courier New" w:eastAsia="Courier New" w:hAnsi="Courier New" w:cs="Courier New"/>
+                <w:sz w:val="19"/>
+                <w:szCs w:val="19"/>
+              </w:rPr>
+              <w:t>rowLetter</w:t>
+            </w:r>
+            <w:proofErr w:type="spellEnd"/>
+            <w:r>
+              <w:rPr>
+                <w:rFonts w:ascii="Courier New" w:eastAsia="Courier New" w:hAnsi="Courier New" w:cs="Courier New"/>
+                <w:sz w:val="19"/>
+                <w:szCs w:val="19"/>
+              </w:rPr>
+              <w:t xml:space="preserve"> to "A"</w:t>
+            </w:r>
+          </w:p>
+          <w:p>
+            <w:r>
+              <w:rPr>
+                <w:rFonts w:ascii="Courier New" w:eastAsia="Courier New" w:hAnsi="Courier New" w:cs="Courier New"/>
+                <w:sz w:val="19"/>
+                <w:szCs w:val="19"/>
+              </w:rPr>
+              <w:t xml:space="preserve">SET </w:t>
+            </w:r>
+            <w:proofErr w:type="spellStart"/>
+            <w:r>
+              <w:rPr>
+                <w:rFonts w:ascii="Courier New" w:eastAsia="Courier New" w:hAnsi="Courier New" w:cs="Courier New"/>
+                <w:sz w:val="19"/>
+                <w:szCs w:val="19"/>
+              </w:rPr>
+              <w:t>seatsMade</w:t>
+            </w:r>
+            <w:proofErr w:type="spellEnd"/>
+            <w:r>
+              <w:rPr>
+                <w:rFonts w:ascii="Courier New" w:eastAsia="Courier New" w:hAnsi="Courier New" w:cs="Courier New"/>
+                <w:sz w:val="19"/>
+                <w:szCs w:val="19"/>
+              </w:rPr>
+              <w:t xml:space="preserve"> to 0</w:t>
+            </w:r>
+          </w:p>
+          <w:p>
+            <w:r>
+              <w:rPr>
+                <w:rFonts w:ascii="Courier New" w:eastAsia="Courier New" w:hAnsi="Courier New" w:cs="Courier New"/>
+                <w:sz w:val="19"/>
+                <w:szCs w:val="19"/>
+              </w:rPr>
+              <w:t xml:space="preserve">WHILE </w:t>
+            </w:r>
+            <w:proofErr w:type="spellStart"/>
+            <w:r>
+              <w:rPr>
+                <w:rFonts w:ascii="Courier New" w:eastAsia="Courier New" w:hAnsi="Courier New" w:cs="Courier New"/>
+                <w:sz w:val="19"/>
+                <w:szCs w:val="19"/>
+              </w:rPr>
+              <w:t>seatsMade</w:t>
+            </w:r>
+            <w:proofErr w:type="spellEnd"/>
+            <w:r>
+              <w:rPr>
+                <w:rFonts w:ascii="Courier New" w:eastAsia="Courier New" w:hAnsi="Courier New" w:cs="Courier New"/>
+                <w:sz w:val="19"/>
+                <w:szCs w:val="19"/>
+              </w:rPr>
+              <w:t xml:space="preserve"> is less than capacity</w:t>
+            </w:r>
+          </w:p>
+          <w:p>
+            <w:r>
+              <w:rPr>
+                <w:rFonts w:ascii="Courier New" w:eastAsia="Courier New" w:hAnsi="Courier New" w:cs="Courier New"/>
+                <w:sz w:val="19"/>
+                <w:szCs w:val="19"/>
+              </w:rPr>
+              <w:t xml:space="preserve">    FOR </w:t>
+            </w:r>
+            <w:proofErr w:type="spellStart"/>
+            <w:r>
+              <w:rPr>
+                <w:rFonts w:ascii="Courier New" w:eastAsia="Courier New" w:hAnsi="Courier New" w:cs="Courier New"/>
+                <w:sz w:val="19"/>
+                <w:szCs w:val="19"/>
+              </w:rPr>
+              <w:t>seatNumber</w:t>
+            </w:r>
+            <w:proofErr w:type="spellEnd"/>
+            <w:r>
+              <w:rPr>
+                <w:rFonts w:ascii="Courier New" w:eastAsia="Courier New" w:hAnsi="Courier New" w:cs="Courier New"/>
+                <w:sz w:val="19"/>
+                <w:szCs w:val="19"/>
+              </w:rPr>
+              <w:t xml:space="preserve"> from 1 to </w:t>
+            </w:r>
+            <w:proofErr w:type="spellStart"/>
+            <w:r>
+              <w:rPr>
+                <w:rFonts w:ascii="Courier New" w:eastAsia="Courier New" w:hAnsi="Courier New" w:cs="Courier New"/>
+                <w:sz w:val="19"/>
+                <w:szCs w:val="19"/>
+              </w:rPr>
+              <w:t>seatsPerRow</w:t>
+            </w:r>
+            <w:proofErr w:type="spellEnd"/>
+          </w:p>
+          <w:p>
+            <w:r>
+              <w:rPr>
+                <w:rFonts w:ascii="Courier New" w:eastAsia="Courier New" w:hAnsi="Courier New" w:cs="Courier New"/>
+                <w:sz w:val="19"/>
+                <w:szCs w:val="19"/>
+              </w:rPr>
+              <w:t xml:space="preserve">        IF </w:t>
+            </w:r>
+            <w:proofErr w:type="spellStart"/>
+            <w:r>
+              <w:rPr>
+                <w:rFonts w:ascii="Courier New" w:eastAsia="Courier New" w:hAnsi="Courier New" w:cs="Courier New"/>
+                <w:sz w:val="19"/>
+                <w:szCs w:val="19"/>
+              </w:rPr>
+              <w:t>seatsMade</w:t>
+            </w:r>
+            <w:proofErr w:type="spellEnd"/>
+            <w:r>
+              <w:rPr>
+                <w:rFonts w:ascii="Courier New" w:eastAsia="Courier New" w:hAnsi="Courier New" w:cs="Courier New"/>
+                <w:sz w:val="19"/>
+                <w:szCs w:val="19"/>
+              </w:rPr>
+              <w:t xml:space="preserve"> is less than capacity THEN</w:t>
+            </w:r>
+          </w:p>
+          <w:p>
+            <w:r>
+              <w:rPr>
+                <w:rFonts w:ascii="Courier New" w:eastAsia="Courier New" w:hAnsi="Courier New" w:cs="Courier New"/>
+                <w:sz w:val="19"/>
+                <w:szCs w:val="19"/>
+              </w:rPr>
+              <w:t xml:space="preserve">            INSERT a seat into </w:t>
+            </w:r>
+            <w:proofErr w:type="spellStart"/>
+            <w:r>
+              <w:rPr>
+                <w:rFonts w:ascii="Courier New" w:eastAsia="Courier New" w:hAnsi="Courier New" w:cs="Courier New"/>
+                <w:sz w:val="19"/>
+                <w:szCs w:val="19"/>
+              </w:rPr>
+              <w:t>tblSeat</w:t>
+            </w:r>
+            <w:proofErr w:type="spellEnd"/>
+            <w:r>
+              <w:rPr>
+                <w:rFonts w:ascii="Courier New" w:eastAsia="Courier New" w:hAnsi="Courier New" w:cs="Courier New"/>
+                <w:sz w:val="19"/>
+                <w:szCs w:val="19"/>
+              </w:rPr>
+              <w:t xml:space="preserve"> with the current </w:t>
+            </w:r>
+            <w:proofErr w:type="spellStart"/>
+            <w:r>
+              <w:rPr>
+                <w:rFonts w:ascii="Courier New" w:eastAsia="Courier New" w:hAnsi="Courier New" w:cs="Courier New"/>
+                <w:sz w:val="19"/>
+                <w:szCs w:val="19"/>
+              </w:rPr>
+              <w:t>ScreenID</w:t>
+            </w:r>
+            <w:proofErr w:type="spellEnd"/>
+            <w:r>
+              <w:rPr>
+                <w:rFonts w:ascii="Courier New" w:eastAsia="Courier New" w:hAnsi="Courier New" w:cs="Courier New"/>
+                <w:sz w:val="19"/>
+                <w:szCs w:val="19"/>
+              </w:rPr>
+              <w:t>,</w:t>
+            </w:r>
+          </w:p>
+          <w:p>
+            <w:r>
+              <w:rPr>
+                <w:rFonts w:ascii="Courier New" w:eastAsia="Courier New" w:hAnsi="Courier New" w:cs="Courier New"/>
+                <w:sz w:val="19"/>
+                <w:szCs w:val="19"/>
+              </w:rPr>
+              <w:t xml:space="preserve">                   </w:t>
+            </w:r>
+            <w:proofErr w:type="spellStart"/>
+            <w:r>
+              <w:rPr>
+                <w:rFonts w:ascii="Courier New" w:eastAsia="Courier New" w:hAnsi="Courier New" w:cs="Courier New"/>
+                <w:sz w:val="19"/>
+                <w:szCs w:val="19"/>
+              </w:rPr>
+              <w:t>rowLetter</w:t>
+            </w:r>
+            <w:proofErr w:type="spellEnd"/>
+            <w:r>
+              <w:rPr>
+                <w:rFonts w:ascii="Courier New" w:eastAsia="Courier New" w:hAnsi="Courier New" w:cs="Courier New"/>
+                <w:sz w:val="19"/>
+                <w:szCs w:val="19"/>
+              </w:rPr>
+              <w:t xml:space="preserve"> and </w:t>
+            </w:r>
+            <w:proofErr w:type="spellStart"/>
+            <w:r>
+              <w:rPr>
+                <w:rFonts w:ascii="Courier New" w:eastAsia="Courier New" w:hAnsi="Courier New" w:cs="Courier New"/>
+                <w:sz w:val="19"/>
+                <w:szCs w:val="19"/>
+              </w:rPr>
+              <w:t>seatNumber</w:t>
+            </w:r>
+            <w:proofErr w:type="spellEnd"/>
+            <w:r>
+              <w:rPr>
+                <w:rFonts w:ascii="Courier New" w:eastAsia="Courier New" w:hAnsi="Courier New" w:cs="Courier New"/>
+                <w:sz w:val="19"/>
+                <w:szCs w:val="19"/>
+              </w:rPr>
+              <w:t xml:space="preserve"> using an SQL INSERT</w:t>
+            </w:r>
+          </w:p>
+          <w:p>
+            <w:r>
+              <w:rPr>
+                <w:rFonts w:ascii="Courier New" w:eastAsia="Courier New" w:hAnsi="Courier New" w:cs="Courier New"/>
+                <w:sz w:val="19"/>
+                <w:szCs w:val="19"/>
+              </w:rPr>
+              <w:t xml:space="preserve">            ADD 1 to </w:t>
+            </w:r>
+            <w:proofErr w:type="spellStart"/>
+            <w:r>
+              <w:rPr>
+                <w:rFonts w:ascii="Courier New" w:eastAsia="Courier New" w:hAnsi="Courier New" w:cs="Courier New"/>
+                <w:sz w:val="19"/>
+                <w:szCs w:val="19"/>
+              </w:rPr>
+              <w:t>seatsMade</w:t>
+            </w:r>
+            <w:proofErr w:type="spellEnd"/>
           </w:p>
           <w:p>
             <w:r>
@@ -7858,17 +9052,45 @@
                 <w:sz w:val="19"/>
                 <w:szCs w:val="19"/>
               </w:rPr>
-              <w:t xml:space="preserve">    NEXT seatNumber</w:t>
-            </w:r>
-          </w:p>
-          <w:p>
-            <w:r>
-              <w:rPr>
-                <w:rFonts w:ascii="Courier New" w:eastAsia="Courier New" w:hAnsi="Courier New" w:cs="Courier New"/>
-                <w:sz w:val="19"/>
-                <w:szCs w:val="19"/>
-              </w:rPr>
-              <w:t xml:space="preserve">    MOVE rowLetter on to the next letter of the alphabet</w:t>
+              <w:t xml:space="preserve">    NEXT </w:t>
+            </w:r>
+            <w:proofErr w:type="spellStart"/>
+            <w:r>
+              <w:rPr>
+                <w:rFonts w:ascii="Courier New" w:eastAsia="Courier New" w:hAnsi="Courier New" w:cs="Courier New"/>
+                <w:sz w:val="19"/>
+                <w:szCs w:val="19"/>
+              </w:rPr>
+              <w:t>seatNumber</w:t>
+            </w:r>
+            <w:proofErr w:type="spellEnd"/>
+          </w:p>
+          <w:p>
+            <w:r>
+              <w:rPr>
+                <w:rFonts w:ascii="Courier New" w:eastAsia="Courier New" w:hAnsi="Courier New" w:cs="Courier New"/>
+                <w:sz w:val="19"/>
+                <w:szCs w:val="19"/>
+              </w:rPr>
+              <w:t xml:space="preserve">    MOVE </w:t>
+            </w:r>
+            <w:proofErr w:type="spellStart"/>
+            <w:r>
+              <w:rPr>
+                <w:rFonts w:ascii="Courier New" w:eastAsia="Courier New" w:hAnsi="Courier New" w:cs="Courier New"/>
+                <w:sz w:val="19"/>
+                <w:szCs w:val="19"/>
+              </w:rPr>
+              <w:t>rowLetter</w:t>
+            </w:r>
+            <w:proofErr w:type="spellEnd"/>
+            <w:r>
+              <w:rPr>
+                <w:rFonts w:ascii="Courier New" w:eastAsia="Courier New" w:hAnsi="Courier New" w:cs="Courier New"/>
+                <w:sz w:val="19"/>
+                <w:szCs w:val="19"/>
+              </w:rPr>
+              <w:t xml:space="preserve"> on to the next letter of the alphabet</w:t>
             </w:r>
           </w:p>
           <w:p>
@@ -8004,7 +9226,43 @@
                 <w:sz w:val="19"/>
                 <w:szCs w:val="19"/>
               </w:rPr>
-              <w:t xml:space="preserve">    LOOK UP tblBookingSeat joined to tblBooking to see whether</w:t>
+              <w:t xml:space="preserve">    LOOK UP </w:t>
+            </w:r>
+            <w:proofErr w:type="spellStart"/>
+            <w:r>
+              <w:rPr>
+                <w:rFonts w:ascii="Courier New" w:eastAsia="Courier New" w:hAnsi="Courier New" w:cs="Courier New"/>
+                <w:sz w:val="19"/>
+                <w:szCs w:val="19"/>
+              </w:rPr>
+              <w:t>tblBookingSeat</w:t>
+            </w:r>
+            <w:proofErr w:type="spellEnd"/>
+            <w:r>
+              <w:rPr>
+                <w:rFonts w:ascii="Courier New" w:eastAsia="Courier New" w:hAnsi="Courier New" w:cs="Courier New"/>
+                <w:sz w:val="19"/>
+                <w:szCs w:val="19"/>
+              </w:rPr>
+              <w:t xml:space="preserve"> joined to </w:t>
+            </w:r>
+            <w:proofErr w:type="spellStart"/>
+            <w:r>
+              <w:rPr>
+                <w:rFonts w:ascii="Courier New" w:eastAsia="Courier New" w:hAnsi="Courier New" w:cs="Courier New"/>
+                <w:sz w:val="19"/>
+                <w:szCs w:val="19"/>
+              </w:rPr>
+              <w:t>tblBooking</w:t>
+            </w:r>
+            <w:proofErr w:type="spellEnd"/>
+            <w:r>
+              <w:rPr>
+                <w:rFonts w:ascii="Courier New" w:eastAsia="Courier New" w:hAnsi="Courier New" w:cs="Courier New"/>
+                <w:sz w:val="19"/>
+                <w:szCs w:val="19"/>
+              </w:rPr>
+              <w:t xml:space="preserve"> to see whether</w:t>
             </w:r>
           </w:p>
           <w:p>
@@ -8074,7 +9332,25 @@
                 <w:sz w:val="19"/>
                 <w:szCs w:val="19"/>
               </w:rPr>
-              <w:t>INSERT a new record into tblBooking with the customer, screening,</w:t>
+              <w:t xml:space="preserve">INSERT a new record into </w:t>
+            </w:r>
+            <w:proofErr w:type="spellStart"/>
+            <w:r>
+              <w:rPr>
+                <w:rFonts w:ascii="Courier New" w:eastAsia="Courier New" w:hAnsi="Courier New" w:cs="Courier New"/>
+                <w:sz w:val="19"/>
+                <w:szCs w:val="19"/>
+              </w:rPr>
+              <w:t>tblBooking</w:t>
+            </w:r>
+            <w:proofErr w:type="spellEnd"/>
+            <w:r>
+              <w:rPr>
+                <w:rFonts w:ascii="Courier New" w:eastAsia="Courier New" w:hAnsi="Courier New" w:cs="Courier New"/>
+                <w:sz w:val="19"/>
+                <w:szCs w:val="19"/>
+              </w:rPr>
+              <w:t xml:space="preserve"> with the customer, screening,</w:t>
             </w:r>
           </w:p>
           <w:p>
@@ -8094,7 +9370,25 @@
                 <w:sz w:val="19"/>
                 <w:szCs w:val="19"/>
               </w:rPr>
-              <w:t>GET the new BookingID that was created</w:t>
+              <w:t xml:space="preserve">GET the new </w:t>
+            </w:r>
+            <w:proofErr w:type="spellStart"/>
+            <w:r>
+              <w:rPr>
+                <w:rFonts w:ascii="Courier New" w:eastAsia="Courier New" w:hAnsi="Courier New" w:cs="Courier New"/>
+                <w:sz w:val="19"/>
+                <w:szCs w:val="19"/>
+              </w:rPr>
+              <w:t>BookingID</w:t>
+            </w:r>
+            <w:proofErr w:type="spellEnd"/>
+            <w:r>
+              <w:rPr>
+                <w:rFonts w:ascii="Courier New" w:eastAsia="Courier New" w:hAnsi="Courier New" w:cs="Courier New"/>
+                <w:sz w:val="19"/>
+                <w:szCs w:val="19"/>
+              </w:rPr>
+              <w:t xml:space="preserve"> that was created</w:t>
             </w:r>
           </w:p>
           <w:p>
@@ -8114,8 +9408,54 @@
                 <w:sz w:val="19"/>
                 <w:szCs w:val="19"/>
               </w:rPr>
-              <w:t xml:space="preserve">    INSERT a record into tblBookingSeat linking BookingID to SeatID</w:t>
-            </w:r>
+              <w:t xml:space="preserve">    INSERT a record into </w:t>
+            </w:r>
+            <w:proofErr w:type="spellStart"/>
+            <w:r>
+              <w:rPr>
+                <w:rFonts w:ascii="Courier New" w:eastAsia="Courier New" w:hAnsi="Courier New" w:cs="Courier New"/>
+                <w:sz w:val="19"/>
+                <w:szCs w:val="19"/>
+              </w:rPr>
+              <w:t>tblBookingSeat</w:t>
+            </w:r>
+            <w:proofErr w:type="spellEnd"/>
+            <w:r>
+              <w:rPr>
+                <w:rFonts w:ascii="Courier New" w:eastAsia="Courier New" w:hAnsi="Courier New" w:cs="Courier New"/>
+                <w:sz w:val="19"/>
+                <w:szCs w:val="19"/>
+              </w:rPr>
+              <w:t xml:space="preserve"> linking </w:t>
+            </w:r>
+            <w:proofErr w:type="spellStart"/>
+            <w:r>
+              <w:rPr>
+                <w:rFonts w:ascii="Courier New" w:eastAsia="Courier New" w:hAnsi="Courier New" w:cs="Courier New"/>
+                <w:sz w:val="19"/>
+                <w:szCs w:val="19"/>
+              </w:rPr>
+              <w:t>BookingID</w:t>
+            </w:r>
+            <w:proofErr w:type="spellEnd"/>
+            <w:r>
+              <w:rPr>
+                <w:rFonts w:ascii="Courier New" w:eastAsia="Courier New" w:hAnsi="Courier New" w:cs="Courier New"/>
+                <w:sz w:val="19"/>
+                <w:szCs w:val="19"/>
+              </w:rPr>
+              <w:t xml:space="preserve"> to </w:t>
+            </w:r>
+            <w:proofErr w:type="spellStart"/>
+            <w:r>
+              <w:rPr>
+                <w:rFonts w:ascii="Courier New" w:eastAsia="Courier New" w:hAnsi="Courier New" w:cs="Courier New"/>
+                <w:sz w:val="19"/>
+                <w:szCs w:val="19"/>
+              </w:rPr>
+              <w:t>SeatID</w:t>
+            </w:r>
+            <w:proofErr w:type="spellEnd"/>
           </w:p>
           <w:p>
             <w:r>
@@ -8218,17 +9558,45 @@
                 <w:sz w:val="19"/>
                 <w:szCs w:val="19"/>
               </w:rPr>
-              <w:t>GET the selected screening and its ScreenID</w:t>
-            </w:r>
-          </w:p>
-          <w:p>
-            <w:r>
-              <w:rPr>
-                <w:rFonts w:ascii="Courier New" w:eastAsia="Courier New" w:hAnsi="Courier New" w:cs="Courier New"/>
-                <w:sz w:val="19"/>
-                <w:szCs w:val="19"/>
-              </w:rPr>
-              <w:t>SELECT all seats for that screen from tblSeat,</w:t>
+              <w:t xml:space="preserve">GET the selected screening and its </w:t>
+            </w:r>
+            <w:proofErr w:type="spellStart"/>
+            <w:r>
+              <w:rPr>
+                <w:rFonts w:ascii="Courier New" w:eastAsia="Courier New" w:hAnsi="Courier New" w:cs="Courier New"/>
+                <w:sz w:val="19"/>
+                <w:szCs w:val="19"/>
+              </w:rPr>
+              <w:t>ScreenID</w:t>
+            </w:r>
+            <w:proofErr w:type="spellEnd"/>
+          </w:p>
+          <w:p>
+            <w:r>
+              <w:rPr>
+                <w:rFonts w:ascii="Courier New" w:eastAsia="Courier New" w:hAnsi="Courier New" w:cs="Courier New"/>
+                <w:sz w:val="19"/>
+                <w:szCs w:val="19"/>
+              </w:rPr>
+              <w:t xml:space="preserve">SELECT all seats for that screen from </w:t>
+            </w:r>
+            <w:proofErr w:type="spellStart"/>
+            <w:r>
+              <w:rPr>
+                <w:rFonts w:ascii="Courier New" w:eastAsia="Courier New" w:hAnsi="Courier New" w:cs="Courier New"/>
+                <w:sz w:val="19"/>
+                <w:szCs w:val="19"/>
+              </w:rPr>
+              <w:t>tblSeat</w:t>
+            </w:r>
+            <w:proofErr w:type="spellEnd"/>
+            <w:r>
+              <w:rPr>
+                <w:rFonts w:ascii="Courier New" w:eastAsia="Courier New" w:hAnsi="Courier New" w:cs="Courier New"/>
+                <w:sz w:val="19"/>
+                <w:szCs w:val="19"/>
+              </w:rPr>
+              <w:t>,</w:t>
             </w:r>
           </w:p>
           <w:p>
@@ -8258,8 +9626,18 @@
                 <w:sz w:val="19"/>
                 <w:szCs w:val="19"/>
               </w:rPr>
-              <w:t xml:space="preserve">       from tblBookingSeat</w:t>
-            </w:r>
+              <w:t xml:space="preserve">       from </w:t>
+            </w:r>
+            <w:proofErr w:type="spellStart"/>
+            <w:r>
+              <w:rPr>
+                <w:rFonts w:ascii="Courier New" w:eastAsia="Courier New" w:hAnsi="Courier New" w:cs="Courier New"/>
+                <w:sz w:val="19"/>
+                <w:szCs w:val="19"/>
+              </w:rPr>
+              <w:t>tblBookingSeat</w:t>
+            </w:r>
+            <w:proofErr w:type="spellEnd"/>
           </w:p>
           <w:p>
             <w:r>
@@ -8402,7 +9780,25 @@
                 <w:sz w:val="19"/>
                 <w:szCs w:val="19"/>
               </w:rPr>
-              <w:t>SET foodTotal to 0</w:t>
+              <w:t xml:space="preserve">SET </w:t>
+            </w:r>
+            <w:proofErr w:type="spellStart"/>
+            <w:r>
+              <w:rPr>
+                <w:rFonts w:ascii="Courier New" w:eastAsia="Courier New" w:hAnsi="Courier New" w:cs="Courier New"/>
+                <w:sz w:val="19"/>
+                <w:szCs w:val="19"/>
+              </w:rPr>
+              <w:t>foodTotal</w:t>
+            </w:r>
+            <w:proofErr w:type="spellEnd"/>
+            <w:r>
+              <w:rPr>
+                <w:rFonts w:ascii="Courier New" w:eastAsia="Courier New" w:hAnsi="Courier New" w:cs="Courier New"/>
+                <w:sz w:val="19"/>
+                <w:szCs w:val="19"/>
+              </w:rPr>
+              <w:t xml:space="preserve"> to 0</w:t>
             </w:r>
           </w:p>
           <w:p>
@@ -8422,28 +9818,84 @@
                 <w:sz w:val="19"/>
                 <w:szCs w:val="19"/>
               </w:rPr>
-              <w:t xml:space="preserve">    LOOK UP the item price in tblFoodItem</w:t>
-            </w:r>
-          </w:p>
-          <w:p>
-            <w:r>
-              <w:rPr>
-                <w:rFonts w:ascii="Courier New" w:eastAsia="Courier New" w:hAnsi="Courier New" w:cs="Courier New"/>
-                <w:sz w:val="19"/>
-                <w:szCs w:val="19"/>
-              </w:rPr>
-              <w:t xml:space="preserve">    CALCULATE lineCost as price multiplied by quantity</w:t>
-            </w:r>
-          </w:p>
-          <w:p>
-            <w:r>
-              <w:rPr>
-                <w:rFonts w:ascii="Courier New" w:eastAsia="Courier New" w:hAnsi="Courier New" w:cs="Courier New"/>
-                <w:sz w:val="19"/>
-                <w:szCs w:val="19"/>
-              </w:rPr>
-              <w:t xml:space="preserve">    ADD lineCost to foodTotal</w:t>
-            </w:r>
+              <w:t xml:space="preserve">    LOOK UP the item price in </w:t>
+            </w:r>
+            <w:proofErr w:type="spellStart"/>
+            <w:r>
+              <w:rPr>
+                <w:rFonts w:ascii="Courier New" w:eastAsia="Courier New" w:hAnsi="Courier New" w:cs="Courier New"/>
+                <w:sz w:val="19"/>
+                <w:szCs w:val="19"/>
+              </w:rPr>
+              <w:t>tblFoodItem</w:t>
+            </w:r>
+            <w:proofErr w:type="spellEnd"/>
+          </w:p>
+          <w:p>
+            <w:r>
+              <w:rPr>
+                <w:rFonts w:ascii="Courier New" w:eastAsia="Courier New" w:hAnsi="Courier New" w:cs="Courier New"/>
+                <w:sz w:val="19"/>
+                <w:szCs w:val="19"/>
+              </w:rPr>
+              <w:t xml:space="preserve">    CALCULATE </w:t>
+            </w:r>
+            <w:proofErr w:type="spellStart"/>
+            <w:r>
+              <w:rPr>
+                <w:rFonts w:ascii="Courier New" w:eastAsia="Courier New" w:hAnsi="Courier New" w:cs="Courier New"/>
+                <w:sz w:val="19"/>
+                <w:szCs w:val="19"/>
+              </w:rPr>
+              <w:t>lineCost</w:t>
+            </w:r>
+            <w:proofErr w:type="spellEnd"/>
+            <w:r>
+              <w:rPr>
+                <w:rFonts w:ascii="Courier New" w:eastAsia="Courier New" w:hAnsi="Courier New" w:cs="Courier New"/>
+                <w:sz w:val="19"/>
+                <w:szCs w:val="19"/>
+              </w:rPr>
+              <w:t xml:space="preserve"> as price multiplied by quantity</w:t>
+            </w:r>
+          </w:p>
+          <w:p>
+            <w:r>
+              <w:rPr>
+                <w:rFonts w:ascii="Courier New" w:eastAsia="Courier New" w:hAnsi="Courier New" w:cs="Courier New"/>
+                <w:sz w:val="19"/>
+                <w:szCs w:val="19"/>
+              </w:rPr>
+              <w:t xml:space="preserve">    ADD </w:t>
+            </w:r>
+            <w:proofErr w:type="spellStart"/>
+            <w:r>
+              <w:rPr>
+                <w:rFonts w:ascii="Courier New" w:eastAsia="Courier New" w:hAnsi="Courier New" w:cs="Courier New"/>
+                <w:sz w:val="19"/>
+                <w:szCs w:val="19"/>
+              </w:rPr>
+              <w:t>lineCost</w:t>
+            </w:r>
+            <w:proofErr w:type="spellEnd"/>
+            <w:r>
+              <w:rPr>
+                <w:rFonts w:ascii="Courier New" w:eastAsia="Courier New" w:hAnsi="Courier New" w:cs="Courier New"/>
+                <w:sz w:val="19"/>
+                <w:szCs w:val="19"/>
+              </w:rPr>
+              <w:t xml:space="preserve"> to </w:t>
+            </w:r>
+            <w:proofErr w:type="spellStart"/>
+            <w:r>
+              <w:rPr>
+                <w:rFonts w:ascii="Courier New" w:eastAsia="Courier New" w:hAnsi="Courier New" w:cs="Courier New"/>
+                <w:sz w:val="19"/>
+                <w:szCs w:val="19"/>
+              </w:rPr>
+              <w:t>foodTotal</w:t>
+            </w:r>
+            <w:proofErr w:type="spellEnd"/>
           </w:p>
           <w:p>
             <w:r>
@@ -8462,27 +9914,109 @@
                 <w:sz w:val="19"/>
                 <w:szCs w:val="19"/>
               </w:rPr>
-              <w:t>CALCULATE seatTotal as number of seats times the ticket price</w:t>
-            </w:r>
-          </w:p>
-          <w:p>
-            <w:r>
-              <w:rPr>
-                <w:rFonts w:ascii="Courier New" w:eastAsia="Courier New" w:hAnsi="Courier New" w:cs="Courier New"/>
-                <w:sz w:val="19"/>
-                <w:szCs w:val="19"/>
-              </w:rPr>
-              <w:t>CALCULATE totalCost as seatTotal plus foodTotal</w:t>
-            </w:r>
-          </w:p>
-          <w:p>
-            <w:r>
-              <w:rPr>
-                <w:rFonts w:ascii="Courier New" w:eastAsia="Courier New" w:hAnsi="Courier New" w:cs="Courier New"/>
-                <w:sz w:val="19"/>
-                <w:szCs w:val="19"/>
-              </w:rPr>
-              <w:t>DISPLAY totalCost to the customer</w:t>
+              <w:t xml:space="preserve">CALCULATE </w:t>
+            </w:r>
+            <w:proofErr w:type="spellStart"/>
+            <w:r>
+              <w:rPr>
+                <w:rFonts w:ascii="Courier New" w:eastAsia="Courier New" w:hAnsi="Courier New" w:cs="Courier New"/>
+                <w:sz w:val="19"/>
+                <w:szCs w:val="19"/>
+              </w:rPr>
+              <w:t>seatTotal</w:t>
+            </w:r>
+            <w:proofErr w:type="spellEnd"/>
+            <w:r>
+              <w:rPr>
+                <w:rFonts w:ascii="Courier New" w:eastAsia="Courier New" w:hAnsi="Courier New" w:cs="Courier New"/>
+                <w:sz w:val="19"/>
+                <w:szCs w:val="19"/>
+              </w:rPr>
+              <w:t xml:space="preserve"> as number of seats times the ticket price</w:t>
+            </w:r>
+          </w:p>
+          <w:p>
+            <w:r>
+              <w:rPr>
+                <w:rFonts w:ascii="Courier New" w:eastAsia="Courier New" w:hAnsi="Courier New" w:cs="Courier New"/>
+                <w:sz w:val="19"/>
+                <w:szCs w:val="19"/>
+              </w:rPr>
+              <w:t xml:space="preserve">CALCULATE </w:t>
+            </w:r>
+            <w:proofErr w:type="spellStart"/>
+            <w:r>
+              <w:rPr>
+                <w:rFonts w:ascii="Courier New" w:eastAsia="Courier New" w:hAnsi="Courier New" w:cs="Courier New"/>
+                <w:sz w:val="19"/>
+                <w:szCs w:val="19"/>
+              </w:rPr>
+              <w:t>totalCost</w:t>
+            </w:r>
+            <w:proofErr w:type="spellEnd"/>
+            <w:r>
+              <w:rPr>
+                <w:rFonts w:ascii="Courier New" w:eastAsia="Courier New" w:hAnsi="Courier New" w:cs="Courier New"/>
+                <w:sz w:val="19"/>
+                <w:szCs w:val="19"/>
+              </w:rPr>
+              <w:t xml:space="preserve"> as </w:t>
+            </w:r>
+            <w:proofErr w:type="spellStart"/>
+            <w:r>
+              <w:rPr>
+                <w:rFonts w:ascii="Courier New" w:eastAsia="Courier New" w:hAnsi="Courier New" w:cs="Courier New"/>
+                <w:sz w:val="19"/>
+                <w:szCs w:val="19"/>
+              </w:rPr>
+              <w:t>seatTotal</w:t>
+            </w:r>
+            <w:proofErr w:type="spellEnd"/>
+            <w:r>
+              <w:rPr>
+                <w:rFonts w:ascii="Courier New" w:eastAsia="Courier New" w:hAnsi="Courier New" w:cs="Courier New"/>
+                <w:sz w:val="19"/>
+                <w:szCs w:val="19"/>
+              </w:rPr>
+              <w:t xml:space="preserve"> plus </w:t>
+            </w:r>
+            <w:proofErr w:type="spellStart"/>
+            <w:r>
+              <w:rPr>
+                <w:rFonts w:ascii="Courier New" w:eastAsia="Courier New" w:hAnsi="Courier New" w:cs="Courier New"/>
+                <w:sz w:val="19"/>
+                <w:szCs w:val="19"/>
+              </w:rPr>
+              <w:t>foodTotal</w:t>
+            </w:r>
+            <w:proofErr w:type="spellEnd"/>
+          </w:p>
+          <w:p>
+            <w:r>
+              <w:rPr>
+                <w:rFonts w:ascii="Courier New" w:eastAsia="Courier New" w:hAnsi="Courier New" w:cs="Courier New"/>
+                <w:sz w:val="19"/>
+                <w:szCs w:val="19"/>
+              </w:rPr>
+              <w:t xml:space="preserve">DISPLAY </w:t>
+            </w:r>
+            <w:proofErr w:type="spellStart"/>
+            <w:r>
+              <w:rPr>
+                <w:rFonts w:ascii="Courier New" w:eastAsia="Courier New" w:hAnsi="Courier New" w:cs="Courier New"/>
+                <w:sz w:val="19"/>
+                <w:szCs w:val="19"/>
+              </w:rPr>
+              <w:t>totalCost</w:t>
+            </w:r>
+            <w:proofErr w:type="spellEnd"/>
+            <w:r>
+              <w:rPr>
+                <w:rFonts w:ascii="Courier New" w:eastAsia="Courier New" w:hAnsi="Courier New" w:cs="Courier New"/>
+                <w:sz w:val="19"/>
+                <w:szCs w:val="19"/>
+              </w:rPr>
+              <w:t xml:space="preserve"> to the customer</w:t>
             </w:r>
           </w:p>
         </w:tc>
@@ -8596,7 +10130,43 @@
                 <w:sz w:val="19"/>
                 <w:szCs w:val="19"/>
               </w:rPr>
-              <w:t xml:space="preserve">    SELECT all bookings from tblBooking where BookingDate is</w:t>
+              <w:t xml:space="preserve">    SELECT all bookings from </w:t>
+            </w:r>
+            <w:proofErr w:type="spellStart"/>
+            <w:r>
+              <w:rPr>
+                <w:rFonts w:ascii="Courier New" w:eastAsia="Courier New" w:hAnsi="Courier New" w:cs="Courier New"/>
+                <w:sz w:val="19"/>
+                <w:szCs w:val="19"/>
+              </w:rPr>
+              <w:t>tblBooking</w:t>
+            </w:r>
+            <w:proofErr w:type="spellEnd"/>
+            <w:r>
+              <w:rPr>
+                <w:rFonts w:ascii="Courier New" w:eastAsia="Courier New" w:hAnsi="Courier New" w:cs="Courier New"/>
+                <w:sz w:val="19"/>
+                <w:szCs w:val="19"/>
+              </w:rPr>
+              <w:t xml:space="preserve"> where </w:t>
+            </w:r>
+            <w:proofErr w:type="spellStart"/>
+            <w:r>
+              <w:rPr>
+                <w:rFonts w:ascii="Courier New" w:eastAsia="Courier New" w:hAnsi="Courier New" w:cs="Courier New"/>
+                <w:sz w:val="19"/>
+                <w:szCs w:val="19"/>
+              </w:rPr>
+              <w:t>BookingDate</w:t>
+            </w:r>
+            <w:proofErr w:type="spellEnd"/>
+            <w:r>
+              <w:rPr>
+                <w:rFonts w:ascii="Courier New" w:eastAsia="Courier New" w:hAnsi="Courier New" w:cs="Courier New"/>
+                <w:sz w:val="19"/>
+                <w:szCs w:val="19"/>
+              </w:rPr>
+              <w:t xml:space="preserve"> is</w:t>
             </w:r>
           </w:p>
           <w:p>
@@ -8616,17 +10186,53 @@
                 <w:sz w:val="19"/>
                 <w:szCs w:val="19"/>
               </w:rPr>
-              <w:t xml:space="preserve">    SET totalTickets to 0</w:t>
-            </w:r>
-          </w:p>
-          <w:p>
-            <w:r>
-              <w:rPr>
-                <w:rFonts w:ascii="Courier New" w:eastAsia="Courier New" w:hAnsi="Courier New" w:cs="Courier New"/>
-                <w:sz w:val="19"/>
-                <w:szCs w:val="19"/>
-              </w:rPr>
-              <w:t xml:space="preserve">    SET totalRevenue to 0</w:t>
+              <w:t xml:space="preserve">    SET </w:t>
+            </w:r>
+            <w:proofErr w:type="spellStart"/>
+            <w:r>
+              <w:rPr>
+                <w:rFonts w:ascii="Courier New" w:eastAsia="Courier New" w:hAnsi="Courier New" w:cs="Courier New"/>
+                <w:sz w:val="19"/>
+                <w:szCs w:val="19"/>
+              </w:rPr>
+              <w:t>totalTickets</w:t>
+            </w:r>
+            <w:proofErr w:type="spellEnd"/>
+            <w:r>
+              <w:rPr>
+                <w:rFonts w:ascii="Courier New" w:eastAsia="Courier New" w:hAnsi="Courier New" w:cs="Courier New"/>
+                <w:sz w:val="19"/>
+                <w:szCs w:val="19"/>
+              </w:rPr>
+              <w:t xml:space="preserve"> to 0</w:t>
+            </w:r>
+          </w:p>
+          <w:p>
+            <w:r>
+              <w:rPr>
+                <w:rFonts w:ascii="Courier New" w:eastAsia="Courier New" w:hAnsi="Courier New" w:cs="Courier New"/>
+                <w:sz w:val="19"/>
+                <w:szCs w:val="19"/>
+              </w:rPr>
+              <w:t xml:space="preserve">    SET </w:t>
+            </w:r>
+            <w:proofErr w:type="spellStart"/>
+            <w:r>
+              <w:rPr>
+                <w:rFonts w:ascii="Courier New" w:eastAsia="Courier New" w:hAnsi="Courier New" w:cs="Courier New"/>
+                <w:sz w:val="19"/>
+                <w:szCs w:val="19"/>
+              </w:rPr>
+              <w:t>totalRevenue</w:t>
+            </w:r>
+            <w:proofErr w:type="spellEnd"/>
+            <w:r>
+              <w:rPr>
+                <w:rFonts w:ascii="Courier New" w:eastAsia="Courier New" w:hAnsi="Courier New" w:cs="Courier New"/>
+                <w:sz w:val="19"/>
+                <w:szCs w:val="19"/>
+              </w:rPr>
+              <w:t xml:space="preserve"> to 0</w:t>
             </w:r>
           </w:p>
           <w:p>
@@ -8646,28 +10252,76 @@
                 <w:sz w:val="19"/>
                 <w:szCs w:val="19"/>
               </w:rPr>
-              <w:t xml:space="preserve">        COUNT the seats linked to it in tblBookingSeat</w:t>
-            </w:r>
-          </w:p>
-          <w:p>
-            <w:r>
-              <w:rPr>
-                <w:rFonts w:ascii="Courier New" w:eastAsia="Courier New" w:hAnsi="Courier New" w:cs="Courier New"/>
-                <w:sz w:val="19"/>
-                <w:szCs w:val="19"/>
-              </w:rPr>
-              <w:t xml:space="preserve">        ADD that count to totalTickets</w:t>
-            </w:r>
-          </w:p>
-          <w:p>
-            <w:r>
-              <w:rPr>
-                <w:rFonts w:ascii="Courier New" w:eastAsia="Courier New" w:hAnsi="Courier New" w:cs="Courier New"/>
-                <w:sz w:val="19"/>
-                <w:szCs w:val="19"/>
-              </w:rPr>
-              <w:t xml:space="preserve">        ADD the booking's TotalCost to totalRevenue</w:t>
-            </w:r>
+              <w:t xml:space="preserve">        COUNT the seats linked to it in </w:t>
+            </w:r>
+            <w:proofErr w:type="spellStart"/>
+            <w:r>
+              <w:rPr>
+                <w:rFonts w:ascii="Courier New" w:eastAsia="Courier New" w:hAnsi="Courier New" w:cs="Courier New"/>
+                <w:sz w:val="19"/>
+                <w:szCs w:val="19"/>
+              </w:rPr>
+              <w:t>tblBookingSeat</w:t>
+            </w:r>
+            <w:proofErr w:type="spellEnd"/>
+          </w:p>
+          <w:p>
+            <w:r>
+              <w:rPr>
+                <w:rFonts w:ascii="Courier New" w:eastAsia="Courier New" w:hAnsi="Courier New" w:cs="Courier New"/>
+                <w:sz w:val="19"/>
+                <w:szCs w:val="19"/>
+              </w:rPr>
+              <w:t xml:space="preserve">        ADD that count to </w:t>
+            </w:r>
+            <w:proofErr w:type="spellStart"/>
+            <w:r>
+              <w:rPr>
+                <w:rFonts w:ascii="Courier New" w:eastAsia="Courier New" w:hAnsi="Courier New" w:cs="Courier New"/>
+                <w:sz w:val="19"/>
+                <w:szCs w:val="19"/>
+              </w:rPr>
+              <w:t>totalTickets</w:t>
+            </w:r>
+            <w:proofErr w:type="spellEnd"/>
+          </w:p>
+          <w:p>
+            <w:r>
+              <w:rPr>
+                <w:rFonts w:ascii="Courier New" w:eastAsia="Courier New" w:hAnsi="Courier New" w:cs="Courier New"/>
+                <w:sz w:val="19"/>
+                <w:szCs w:val="19"/>
+              </w:rPr>
+              <w:t xml:space="preserve">        ADD the booking's </w:t>
+            </w:r>
+            <w:proofErr w:type="spellStart"/>
+            <w:r>
+              <w:rPr>
+                <w:rFonts w:ascii="Courier New" w:eastAsia="Courier New" w:hAnsi="Courier New" w:cs="Courier New"/>
+                <w:sz w:val="19"/>
+                <w:szCs w:val="19"/>
+              </w:rPr>
+              <w:t>TotalCost</w:t>
+            </w:r>
+            <w:proofErr w:type="spellEnd"/>
+            <w:r>
+              <w:rPr>
+                <w:rFonts w:ascii="Courier New" w:eastAsia="Courier New" w:hAnsi="Courier New" w:cs="Courier New"/>
+                <w:sz w:val="19"/>
+                <w:szCs w:val="19"/>
+              </w:rPr>
+              <w:t xml:space="preserve"> to </w:t>
+            </w:r>
+            <w:proofErr w:type="spellStart"/>
+            <w:r>
+              <w:rPr>
+                <w:rFonts w:ascii="Courier New" w:eastAsia="Courier New" w:hAnsi="Courier New" w:cs="Courier New"/>
+                <w:sz w:val="19"/>
+                <w:szCs w:val="19"/>
+              </w:rPr>
+              <w:t>totalRevenue</w:t>
+            </w:r>
+            <w:proofErr w:type="spellEnd"/>
           </w:p>
           <w:p>
             <w:r>
@@ -8686,8 +10340,36 @@
                 <w:sz w:val="19"/>
                 <w:szCs w:val="19"/>
               </w:rPr>
-              <w:t xml:space="preserve">    DISPLAY totalTickets and totalRevenue</w:t>
-            </w:r>
+              <w:t xml:space="preserve">    DISPLAY </w:t>
+            </w:r>
+            <w:proofErr w:type="spellStart"/>
+            <w:r>
+              <w:rPr>
+                <w:rFonts w:ascii="Courier New" w:eastAsia="Courier New" w:hAnsi="Courier New" w:cs="Courier New"/>
+                <w:sz w:val="19"/>
+                <w:szCs w:val="19"/>
+              </w:rPr>
+              <w:t>totalTickets</w:t>
+            </w:r>
+            <w:proofErr w:type="spellEnd"/>
+            <w:r>
+              <w:rPr>
+                <w:rFonts w:ascii="Courier New" w:eastAsia="Courier New" w:hAnsi="Courier New" w:cs="Courier New"/>
+                <w:sz w:val="19"/>
+                <w:szCs w:val="19"/>
+              </w:rPr>
+              <w:t xml:space="preserve"> and </w:t>
+            </w:r>
+            <w:proofErr w:type="spellStart"/>
+            <w:r>
+              <w:rPr>
+                <w:rFonts w:ascii="Courier New" w:eastAsia="Courier New" w:hAnsi="Courier New" w:cs="Courier New"/>
+                <w:sz w:val="19"/>
+                <w:szCs w:val="19"/>
+              </w:rPr>
+              <w:t>totalRevenue</w:t>
+            </w:r>
+            <w:proofErr w:type="spellEnd"/>
           </w:p>
           <w:p>
             <w:r>
@@ -8810,8 +10492,18 @@
                 <w:sz w:val="19"/>
                 <w:szCs w:val="19"/>
               </w:rPr>
-              <w:t xml:space="preserve">    SELECT bookings joined to customers where CustomerSurname</w:t>
-            </w:r>
+              <w:t xml:space="preserve">    SELECT bookings joined to customers where </w:t>
+            </w:r>
+            <w:proofErr w:type="spellStart"/>
+            <w:r>
+              <w:rPr>
+                <w:rFonts w:ascii="Courier New" w:eastAsia="Courier New" w:hAnsi="Courier New" w:cs="Courier New"/>
+                <w:sz w:val="19"/>
+                <w:szCs w:val="19"/>
+              </w:rPr>
+              <w:t>CustomerSurname</w:t>
+            </w:r>
+            <w:proofErr w:type="spellEnd"/>
           </w:p>
           <w:p>
             <w:r>
@@ -8909,7 +10601,15 @@
         <w:spacing w:after="160" w:line="276" w:lineRule="auto"/>
       </w:pPr>
       <w:r>
-        <w:t>When a booking is cancelled its seats need to become available again. Because availability is worked out from the link table, simply removing the booking's records from tblBookingSeat frees those seats automatically with no separate step needed.</w:t>
+        <w:t xml:space="preserve">When a booking is cancelled its seats need to become available again. Because availability is worked out from the link table, simply removing the booking's records from </w:t>
+      </w:r>
+      <w:proofErr w:type="spellStart"/>
+      <w:r>
+        <w:t>tblBookingSeat</w:t>
+      </w:r>
+      <w:proofErr w:type="spellEnd"/>
+      <w:r>
+        <w:t xml:space="preserve"> frees those seats automatically with no separate step needed.</w:t>
       </w:r>
     </w:p>
     <w:tbl>
@@ -8949,7 +10649,25 @@
                 <w:sz w:val="19"/>
                 <w:szCs w:val="19"/>
               </w:rPr>
-              <w:t>GET the BookingID of the booking to cancel</w:t>
+              <w:t xml:space="preserve">GET the </w:t>
+            </w:r>
+            <w:proofErr w:type="spellStart"/>
+            <w:r>
+              <w:rPr>
+                <w:rFonts w:ascii="Courier New" w:eastAsia="Courier New" w:hAnsi="Courier New" w:cs="Courier New"/>
+                <w:sz w:val="19"/>
+                <w:szCs w:val="19"/>
+              </w:rPr>
+              <w:t>BookingID</w:t>
+            </w:r>
+            <w:proofErr w:type="spellEnd"/>
+            <w:r>
+              <w:rPr>
+                <w:rFonts w:ascii="Courier New" w:eastAsia="Courier New" w:hAnsi="Courier New" w:cs="Courier New"/>
+                <w:sz w:val="19"/>
+                <w:szCs w:val="19"/>
+              </w:rPr>
+              <w:t xml:space="preserve"> of the booking to cancel</w:t>
             </w:r>
           </w:p>
           <w:p>
@@ -8979,28 +10697,112 @@
                 <w:sz w:val="19"/>
                 <w:szCs w:val="19"/>
               </w:rPr>
-              <w:t xml:space="preserve">    DELETE all records in tblBookingSeat for that BookingID</w:t>
-            </w:r>
-          </w:p>
-          <w:p>
-            <w:r>
-              <w:rPr>
-                <w:rFonts w:ascii="Courier New" w:eastAsia="Courier New" w:hAnsi="Courier New" w:cs="Courier New"/>
-                <w:sz w:val="19"/>
-                <w:szCs w:val="19"/>
-              </w:rPr>
-              <w:t xml:space="preserve">    DELETE all records in tblOrderItem for that BookingID</w:t>
-            </w:r>
-          </w:p>
-          <w:p>
-            <w:r>
-              <w:rPr>
-                <w:rFonts w:ascii="Courier New" w:eastAsia="Courier New" w:hAnsi="Courier New" w:cs="Courier New"/>
-                <w:sz w:val="19"/>
-                <w:szCs w:val="19"/>
-              </w:rPr>
-              <w:t xml:space="preserve">    DELETE the record in tblBooking for that BookingID</w:t>
-            </w:r>
+              <w:t xml:space="preserve">    DELETE all records in </w:t>
+            </w:r>
+            <w:proofErr w:type="spellStart"/>
+            <w:r>
+              <w:rPr>
+                <w:rFonts w:ascii="Courier New" w:eastAsia="Courier New" w:hAnsi="Courier New" w:cs="Courier New"/>
+                <w:sz w:val="19"/>
+                <w:szCs w:val="19"/>
+              </w:rPr>
+              <w:t>tblBookingSeat</w:t>
+            </w:r>
+            <w:proofErr w:type="spellEnd"/>
+            <w:r>
+              <w:rPr>
+                <w:rFonts w:ascii="Courier New" w:eastAsia="Courier New" w:hAnsi="Courier New" w:cs="Courier New"/>
+                <w:sz w:val="19"/>
+                <w:szCs w:val="19"/>
+              </w:rPr>
+              <w:t xml:space="preserve"> for that </w:t>
+            </w:r>
+            <w:proofErr w:type="spellStart"/>
+            <w:r>
+              <w:rPr>
+                <w:rFonts w:ascii="Courier New" w:eastAsia="Courier New" w:hAnsi="Courier New" w:cs="Courier New"/>
+                <w:sz w:val="19"/>
+                <w:szCs w:val="19"/>
+              </w:rPr>
+              <w:t>BookingID</w:t>
+            </w:r>
+            <w:proofErr w:type="spellEnd"/>
+          </w:p>
+          <w:p>
+            <w:r>
+              <w:rPr>
+                <w:rFonts w:ascii="Courier New" w:eastAsia="Courier New" w:hAnsi="Courier New" w:cs="Courier New"/>
+                <w:sz w:val="19"/>
+                <w:szCs w:val="19"/>
+              </w:rPr>
+              <w:t xml:space="preserve">    DELETE all records in </w:t>
+            </w:r>
+            <w:proofErr w:type="spellStart"/>
+            <w:r>
+              <w:rPr>
+                <w:rFonts w:ascii="Courier New" w:eastAsia="Courier New" w:hAnsi="Courier New" w:cs="Courier New"/>
+                <w:sz w:val="19"/>
+                <w:szCs w:val="19"/>
+              </w:rPr>
+              <w:t>tblOrderItem</w:t>
+            </w:r>
+            <w:proofErr w:type="spellEnd"/>
+            <w:r>
+              <w:rPr>
+                <w:rFonts w:ascii="Courier New" w:eastAsia="Courier New" w:hAnsi="Courier New" w:cs="Courier New"/>
+                <w:sz w:val="19"/>
+                <w:szCs w:val="19"/>
+              </w:rPr>
+              <w:t xml:space="preserve"> for that </w:t>
+            </w:r>
+            <w:proofErr w:type="spellStart"/>
+            <w:r>
+              <w:rPr>
+                <w:rFonts w:ascii="Courier New" w:eastAsia="Courier New" w:hAnsi="Courier New" w:cs="Courier New"/>
+                <w:sz w:val="19"/>
+                <w:szCs w:val="19"/>
+              </w:rPr>
+              <w:t>BookingID</w:t>
+            </w:r>
+            <w:proofErr w:type="spellEnd"/>
+          </w:p>
+          <w:p>
+            <w:r>
+              <w:rPr>
+                <w:rFonts w:ascii="Courier New" w:eastAsia="Courier New" w:hAnsi="Courier New" w:cs="Courier New"/>
+                <w:sz w:val="19"/>
+                <w:szCs w:val="19"/>
+              </w:rPr>
+              <w:t xml:space="preserve">    DELETE the record in </w:t>
+            </w:r>
+            <w:proofErr w:type="spellStart"/>
+            <w:r>
+              <w:rPr>
+                <w:rFonts w:ascii="Courier New" w:eastAsia="Courier New" w:hAnsi="Courier New" w:cs="Courier New"/>
+                <w:sz w:val="19"/>
+                <w:szCs w:val="19"/>
+              </w:rPr>
+              <w:t>tblBooking</w:t>
+            </w:r>
+            <w:proofErr w:type="spellEnd"/>
+            <w:r>
+              <w:rPr>
+                <w:rFonts w:ascii="Courier New" w:eastAsia="Courier New" w:hAnsi="Courier New" w:cs="Courier New"/>
+                <w:sz w:val="19"/>
+                <w:szCs w:val="19"/>
+              </w:rPr>
+              <w:t xml:space="preserve"> for that </w:t>
+            </w:r>
+            <w:proofErr w:type="spellStart"/>
+            <w:r>
+              <w:rPr>
+                <w:rFonts w:ascii="Courier New" w:eastAsia="Courier New" w:hAnsi="Courier New" w:cs="Courier New"/>
+                <w:sz w:val="19"/>
+                <w:szCs w:val="19"/>
+              </w:rPr>
+              <w:t>BookingID</w:t>
+            </w:r>
+            <w:proofErr w:type="spellEnd"/>
           </w:p>
           <w:p>
             <w:r>
@@ -9074,7 +10876,15 @@
         <w:spacing w:after="160" w:line="276" w:lineRule="auto"/>
       </w:pPr>
       <w:r>
-        <w:t>Validation is the process of checking that data entered into the system is sensible and complete before it is accepted and saved to the database. It cannot guarantee that data is correct, for example it cannot tell whether a customer has typed the right surname, but it can stop clearly invalid or missing data from getting in, which protects the integrity of the database. Several different types of validation are used across the Filmtopia system, and these are explained below before being applied to each input in turn.</w:t>
+        <w:t xml:space="preserve">Validation is the process of checking that data entered into the system is sensible and complete before it is accepted and saved to the database. It cannot guarantee that data is correct, for example it cannot tell whether a customer has typed the right surname, but it can stop clearly invalid or missing data from getting in, which protects the integrity of the database. Several different types of validation are used across the </w:t>
+      </w:r>
+      <w:proofErr w:type="spellStart"/>
+      <w:r>
+        <w:t>Filmtopia</w:t>
+      </w:r>
+      <w:proofErr w:type="spellEnd"/>
+      <w:r>
+        <w:t xml:space="preserve"> system, and these are explained below before being applied to each input in turn.</w:t>
       </w:r>
     </w:p>
     <w:p>
@@ -9082,7 +10892,15 @@
         <w:spacing w:after="160" w:line="276" w:lineRule="auto"/>
       </w:pPr>
       <w:r>
-        <w:t>A presence check makes sure a required field has not been left blank. A type check makes sure the data is of the right kind, for example that a number has been entered where a number is expected. A length check makes sure an entry is not longer than the field allows. A range check makes sure a number or date falls between sensible limits. A format check makes sure an entry follows a required pattern, such as a time being written as HH:MM. Finally a lookup check, sometimes called a referential check, makes sure that a chosen value actually exists in another table, for example that a screening is being created for a film that really exists. The tables below set out the validation applied to each input, grouped by the form it appears on.</w:t>
+        <w:t xml:space="preserve">A presence check makes sure a required field has not been left blank. A type check makes sure the data is of the right kind, for example that a number has been entered where a number is expected. A length check makes sure an entry is </w:t>
+      </w:r>
+      <w:proofErr w:type="spellStart"/>
+      <w:r>
+        <w:t>not longer</w:t>
+      </w:r>
+      <w:proofErr w:type="spellEnd"/>
+      <w:r>
+        <w:t xml:space="preserve"> than the field allows. A range check makes sure a number or date falls between sensible limits. A format check makes sure an entry follows a required pattern, such as a time being written as HH:MM. Finally a lookup check, sometimes called a referential check, makes sure that a chosen value actually exists in another table, for example that a screening is being created for a film that really exists. The tables below set out the validation applied to each input, grouped by the form it appears on.</w:t>
       </w:r>
     </w:p>
     <w:p>
@@ -9537,6 +11355,7 @@
             </w:tcMar>
           </w:tcPr>
           <w:p>
+            <w:proofErr w:type="spellStart"/>
             <w:r>
               <w:rPr>
                 <w:sz w:val="19"/>
@@ -9544,6 +11363,7 @@
               </w:rPr>
               <w:t>FilmTitle</w:t>
             </w:r>
+            <w:proofErr w:type="spellEnd"/>
           </w:p>
         </w:tc>
         <w:tc>
@@ -9619,6 +11439,7 @@
             </w:tcMar>
           </w:tcPr>
           <w:p>
+            <w:proofErr w:type="spellStart"/>
             <w:r>
               <w:rPr>
                 <w:sz w:val="19"/>
@@ -9626,6 +11447,7 @@
               </w:rPr>
               <w:t>FilmAgeRating</w:t>
             </w:r>
+            <w:proofErr w:type="spellEnd"/>
           </w:p>
         </w:tc>
         <w:tc>
@@ -9701,6 +11523,7 @@
             </w:tcMar>
           </w:tcPr>
           <w:p>
+            <w:proofErr w:type="spellStart"/>
             <w:r>
               <w:rPr>
                 <w:sz w:val="19"/>
@@ -9708,6 +11531,7 @@
               </w:rPr>
               <w:t>FilmDuration</w:t>
             </w:r>
+            <w:proofErr w:type="spellEnd"/>
           </w:p>
         </w:tc>
         <w:tc>
@@ -9783,6 +11607,7 @@
             </w:tcMar>
           </w:tcPr>
           <w:p>
+            <w:proofErr w:type="spellStart"/>
             <w:r>
               <w:rPr>
                 <w:sz w:val="19"/>
@@ -9790,6 +11615,7 @@
               </w:rPr>
               <w:t>FilmDescription</w:t>
             </w:r>
+            <w:proofErr w:type="spellEnd"/>
           </w:p>
         </w:tc>
         <w:tc>
@@ -10006,6 +11832,7 @@
             </w:tcMar>
           </w:tcPr>
           <w:p>
+            <w:proofErr w:type="spellStart"/>
             <w:r>
               <w:rPr>
                 <w:sz w:val="19"/>
@@ -10013,6 +11840,7 @@
               </w:rPr>
               <w:t>ScreenName</w:t>
             </w:r>
+            <w:proofErr w:type="spellEnd"/>
           </w:p>
         </w:tc>
         <w:tc>
@@ -10088,6 +11916,7 @@
             </w:tcMar>
           </w:tcPr>
           <w:p>
+            <w:proofErr w:type="spellStart"/>
             <w:r>
               <w:rPr>
                 <w:sz w:val="19"/>
@@ -10095,6 +11924,7 @@
               </w:rPr>
               <w:t>ScreenCapacity</w:t>
             </w:r>
+            <w:proofErr w:type="spellEnd"/>
           </w:p>
         </w:tc>
         <w:tc>
@@ -10496,6 +12326,7 @@
             </w:tcMar>
           </w:tcPr>
           <w:p>
+            <w:proofErr w:type="spellStart"/>
             <w:r>
               <w:rPr>
                 <w:sz w:val="19"/>
@@ -10503,6 +12334,7 @@
               </w:rPr>
               <w:t>ScreeningDate</w:t>
             </w:r>
+            <w:proofErr w:type="spellEnd"/>
           </w:p>
         </w:tc>
         <w:tc>
@@ -10578,6 +12410,7 @@
             </w:tcMar>
           </w:tcPr>
           <w:p>
+            <w:proofErr w:type="spellStart"/>
             <w:r>
               <w:rPr>
                 <w:sz w:val="19"/>
@@ -10585,6 +12418,7 @@
               </w:rPr>
               <w:t>ScreeningTime</w:t>
             </w:r>
+            <w:proofErr w:type="spellEnd"/>
           </w:p>
         </w:tc>
         <w:tc>
@@ -10660,6 +12494,7 @@
             </w:tcMar>
           </w:tcPr>
           <w:p>
+            <w:proofErr w:type="spellStart"/>
             <w:r>
               <w:rPr>
                 <w:sz w:val="19"/>
@@ -10667,6 +12502,7 @@
               </w:rPr>
               <w:t>TicketPrice</w:t>
             </w:r>
+            <w:proofErr w:type="spellEnd"/>
           </w:p>
         </w:tc>
         <w:tc>
@@ -10883,6 +12719,7 @@
             </w:tcMar>
           </w:tcPr>
           <w:p>
+            <w:proofErr w:type="spellStart"/>
             <w:r>
               <w:rPr>
                 <w:sz w:val="19"/>
@@ -10890,6 +12727,7 @@
               </w:rPr>
               <w:t>CustomerForename</w:t>
             </w:r>
+            <w:proofErr w:type="spellEnd"/>
           </w:p>
         </w:tc>
         <w:tc>
@@ -10965,6 +12803,7 @@
             </w:tcMar>
           </w:tcPr>
           <w:p>
+            <w:proofErr w:type="spellStart"/>
             <w:r>
               <w:rPr>
                 <w:sz w:val="19"/>
@@ -10972,6 +12811,7 @@
               </w:rPr>
               <w:t>CustomerSurname</w:t>
             </w:r>
+            <w:proofErr w:type="spellEnd"/>
           </w:p>
         </w:tc>
         <w:tc>
@@ -11047,6 +12887,7 @@
             </w:tcMar>
           </w:tcPr>
           <w:p>
+            <w:proofErr w:type="spellStart"/>
             <w:r>
               <w:rPr>
                 <w:sz w:val="19"/>
@@ -11054,6 +12895,7 @@
               </w:rPr>
               <w:t>CustomerEmail</w:t>
             </w:r>
+            <w:proofErr w:type="spellEnd"/>
           </w:p>
         </w:tc>
         <w:tc>
@@ -11129,6 +12971,7 @@
             </w:tcMar>
           </w:tcPr>
           <w:p>
+            <w:proofErr w:type="spellStart"/>
             <w:r>
               <w:rPr>
                 <w:sz w:val="19"/>
@@ -11136,6 +12979,7 @@
               </w:rPr>
               <w:t>CustomerPhone</w:t>
             </w:r>
+            <w:proofErr w:type="spellEnd"/>
           </w:p>
         </w:tc>
         <w:tc>

</xml_diff>

<commit_message>
added description for objective 7 in design doc
</commit_message>
<xml_diff>
--- a/Design.docx
+++ b/Design.docx
@@ -11,23 +11,13 @@
           <w:color w:val="A02B93" w:themeColor="accent5"/>
         </w:rPr>
       </w:pPr>
-      <w:proofErr w:type="spellStart"/>
       <w:r>
         <w:rPr>
           <w:b/>
           <w:bCs/>
           <w:color w:val="A02B93" w:themeColor="accent5"/>
         </w:rPr>
-        <w:t>Filmtopia</w:t>
-      </w:r>
-      <w:proofErr w:type="spellEnd"/>
-      <w:r>
-        <w:rPr>
-          <w:b/>
-          <w:bCs/>
-          <w:color w:val="A02B93" w:themeColor="accent5"/>
-        </w:rPr>
-        <w:t xml:space="preserve"> Project Design</w:t>
+        <w:t>Filmtopia Project Design</w:t>
       </w:r>
     </w:p>
     <w:p>
@@ -53,21 +43,7 @@
         <w:rPr>
           <w:rFonts w:ascii="Aptos" w:eastAsia="Aptos" w:hAnsi="Aptos" w:cs="Aptos"/>
         </w:rPr>
-        <w:t xml:space="preserve">The purpose of this section is to design the way that the user will interact with the </w:t>
-      </w:r>
-      <w:proofErr w:type="spellStart"/>
-      <w:r>
-        <w:rPr>
-          <w:rFonts w:ascii="Aptos" w:eastAsia="Aptos" w:hAnsi="Aptos" w:cs="Aptos"/>
-        </w:rPr>
-        <w:t>Filmtopia</w:t>
-      </w:r>
-      <w:proofErr w:type="spellEnd"/>
-      <w:r>
-        <w:rPr>
-          <w:rFonts w:ascii="Aptos" w:eastAsia="Aptos" w:hAnsi="Aptos" w:cs="Aptos"/>
-        </w:rPr>
-        <w:t xml:space="preserve"> system before any of it is actually built. In other words this is where I plan out every form the user will see, the information that goes into each one and the information that comes back out, so that when I move on to writing the code I already have a clear picture of what I am building rather than making it up as I go along. I have taken each objective in turn as a heading and described how the interface will behave for that objective, and for every form or report involved I have drawn a wireframe showing roughly where the labels, text boxes and buttons will sit. These drawings are deliberately kept simple so that it is obvious they are design sketches and not screenshots of a finished program.</w:t>
+        <w:t>The purpose of this section is to design the way that the user will interact with the Filmtopia system before any of it is actually built. In other words this is where I plan out every form the user will see, the information that goes into each one and the information that comes back out, so that when I move on to writing the code I already have a clear picture of what I am building rather than making it up as I go along. I have taken each objective in turn as a heading and described how the interface will behave for that objective, and for every form or report involved I have drawn a wireframe showing roughly where the labels, text boxes and buttons will sit. These drawings are deliberately kept simple so that it is obvious they are design sketches and not screenshots of a finished program.</w:t>
       </w:r>
     </w:p>
     <w:p>
@@ -81,77 +57,7 @@
         <w:rPr>
           <w:rFonts w:ascii="Aptos" w:eastAsia="Aptos" w:hAnsi="Aptos" w:cs="Aptos"/>
         </w:rPr>
-        <w:t xml:space="preserve">Before going through the objectives one at a time it is worth explaining a couple of decisions that apply across the whole system. </w:t>
-      </w:r>
-      <w:proofErr w:type="spellStart"/>
-      <w:r>
-        <w:rPr>
-          <w:rFonts w:ascii="Aptos" w:eastAsia="Aptos" w:hAnsi="Aptos" w:cs="Aptos"/>
-        </w:rPr>
-        <w:t>Filmtopia</w:t>
-      </w:r>
-      <w:proofErr w:type="spellEnd"/>
-      <w:r>
-        <w:rPr>
-          <w:rFonts w:ascii="Aptos" w:eastAsia="Aptos" w:hAnsi="Aptos" w:cs="Aptos"/>
-        </w:rPr>
-        <w:t xml:space="preserve"> is built as a Windows Forms desktop application, so every screen is a form made up of standard controls such as text boxes, labels, buttons and data grids. I have chosen to name my controls using a short prefix that describes what each one is, for example txt for a text box, </w:t>
-      </w:r>
-      <w:proofErr w:type="spellStart"/>
-      <w:r>
-        <w:rPr>
-          <w:rFonts w:ascii="Aptos" w:eastAsia="Aptos" w:hAnsi="Aptos" w:cs="Aptos"/>
-        </w:rPr>
-        <w:t>btn</w:t>
-      </w:r>
-      <w:proofErr w:type="spellEnd"/>
-      <w:r>
-        <w:rPr>
-          <w:rFonts w:ascii="Aptos" w:eastAsia="Aptos" w:hAnsi="Aptos" w:cs="Aptos"/>
-        </w:rPr>
-        <w:t xml:space="preserve"> for a button, </w:t>
-      </w:r>
-      <w:proofErr w:type="spellStart"/>
-      <w:r>
-        <w:rPr>
-          <w:rFonts w:ascii="Aptos" w:eastAsia="Aptos" w:hAnsi="Aptos" w:cs="Aptos"/>
-        </w:rPr>
-        <w:t>lbl</w:t>
-      </w:r>
-      <w:proofErr w:type="spellEnd"/>
-      <w:r>
-        <w:rPr>
-          <w:rFonts w:ascii="Aptos" w:eastAsia="Aptos" w:hAnsi="Aptos" w:cs="Aptos"/>
-        </w:rPr>
-        <w:t xml:space="preserve"> for a label, </w:t>
-      </w:r>
-      <w:proofErr w:type="spellStart"/>
-      <w:r>
-        <w:rPr>
-          <w:rFonts w:ascii="Aptos" w:eastAsia="Aptos" w:hAnsi="Aptos" w:cs="Aptos"/>
-        </w:rPr>
-        <w:t>cbo</w:t>
-      </w:r>
-      <w:proofErr w:type="spellEnd"/>
-      <w:r>
-        <w:rPr>
-          <w:rFonts w:ascii="Aptos" w:eastAsia="Aptos" w:hAnsi="Aptos" w:cs="Aptos"/>
-        </w:rPr>
-        <w:t xml:space="preserve"> for a combo box and </w:t>
-      </w:r>
-      <w:proofErr w:type="spellStart"/>
-      <w:r>
-        <w:rPr>
-          <w:rFonts w:ascii="Aptos" w:eastAsia="Aptos" w:hAnsi="Aptos" w:cs="Aptos"/>
-        </w:rPr>
-        <w:t>dgv</w:t>
-      </w:r>
-      <w:proofErr w:type="spellEnd"/>
-      <w:r>
-        <w:rPr>
-          <w:rFonts w:ascii="Aptos" w:eastAsia="Aptos" w:hAnsi="Aptos" w:cs="Aptos"/>
-        </w:rPr>
-        <w:t xml:space="preserve"> for a data grid view, followed by a word describing its job. This is because a consistent naming convention makes the code far easier to read later on and stops me getting confused between similarly named items. I have also decided not to worry too much about the finer details of colour at this stage, this is because the guidance makes clear that the interface will be refined after the prototype in section 5.2, so it makes sense to settle the layout and the flow first and then tidy up the appearance once I know everything works.</w:t>
+        <w:t>Before going through the objectives one at a time it is worth explaining a couple of decisions that apply across the whole system. Filmtopia is built as a Windows Forms desktop application, so every screen is a form made up of standard controls such as text boxes, labels, buttons and data grids. I have chosen to name my controls using a short prefix that describes what each one is, for example txt for a text box, btn for a button, lbl for a label, cbo for a combo box and dgv for a data grid view, followed by a word describing its job. This is because a consistent naming convention makes the code far easier to read later on and stops me getting confused between similarly named items. I have also decided not to worry too much about the finer details of colour at this stage, this is because the guidance makes clear that the interface will be refined after the prototype in section 5.2, so it makes sense to settle the layout and the flow first and then tidy up the appearance once I know everything works.</w:t>
       </w:r>
     </w:p>
     <w:p>
@@ -177,35 +83,7 @@
         <w:rPr>
           <w:rFonts w:ascii="Aptos" w:eastAsia="Aptos" w:hAnsi="Aptos" w:cs="Aptos"/>
         </w:rPr>
-        <w:t xml:space="preserve">The first thing any user meets when they open </w:t>
-      </w:r>
-      <w:proofErr w:type="spellStart"/>
-      <w:r>
-        <w:rPr>
-          <w:rFonts w:ascii="Aptos" w:eastAsia="Aptos" w:hAnsi="Aptos" w:cs="Aptos"/>
-        </w:rPr>
-        <w:t>Filmtopia</w:t>
-      </w:r>
-      <w:proofErr w:type="spellEnd"/>
-      <w:r>
-        <w:rPr>
-          <w:rFonts w:ascii="Aptos" w:eastAsia="Aptos" w:hAnsi="Aptos" w:cs="Aptos"/>
-        </w:rPr>
-        <w:t xml:space="preserve"> is the login screen, so this is where the design naturally starts. The objective here is to make sure that customers, staff and managers are not all able to do the same things, because a normal member of staff being able to reach the manager's sales reports or the audit log would be a serious security weakness. To achieve this the system asks for a username and a password on a small login form, checks them against the </w:t>
-      </w:r>
-      <w:proofErr w:type="spellStart"/>
-      <w:r>
-        <w:rPr>
-          <w:rFonts w:ascii="Aptos" w:eastAsia="Aptos" w:hAnsi="Aptos" w:cs="Aptos"/>
-        </w:rPr>
-        <w:t>tblLogin</w:t>
-      </w:r>
-      <w:proofErr w:type="spellEnd"/>
-      <w:r>
-        <w:rPr>
-          <w:rFonts w:ascii="Aptos" w:eastAsia="Aptos" w:hAnsi="Aptos" w:cs="Aptos"/>
-        </w:rPr>
-        <w:t xml:space="preserve"> table, and reads back an access level number that then decides what the user is allowed to see.</w:t>
+        <w:t>The first thing any user meets when they open Filmtopia is the login screen, so this is where the design naturally starts. The objective here is to make sure that customers, staff and managers are not all able to do the same things, because a normal member of staff being able to reach the manager's sales reports or the audit log would be a serious security weakness. To achieve this the system asks for a username and a password on a small login form, checks them against the tblLogin table, and reads back an access level number that then decides what the user is allowed to see.</w:t>
       </w:r>
     </w:p>
     <w:p>
@@ -216,84 +94,14 @@
         <w:rPr>
           <w:rFonts w:ascii="Aptos" w:eastAsia="Aptos" w:hAnsi="Aptos" w:cs="Aptos"/>
         </w:rPr>
-        <w:t xml:space="preserve">The login form itself is deliberately kept small and uncomplicated. It has a header panel across the top showing the name </w:t>
-      </w:r>
-      <w:proofErr w:type="spellStart"/>
-      <w:r>
-        <w:rPr>
-          <w:rFonts w:ascii="Aptos" w:eastAsia="Aptos" w:hAnsi="Aptos" w:cs="Aptos"/>
-        </w:rPr>
-        <w:t>Filmtopia</w:t>
-      </w:r>
-      <w:proofErr w:type="spellEnd"/>
-      <w:r>
-        <w:rPr>
-          <w:rFonts w:ascii="Aptos" w:eastAsia="Aptos" w:hAnsi="Aptos" w:cs="Aptos"/>
-        </w:rPr>
-        <w:t xml:space="preserve"> and the subtitle Cinema Management System </w:t>
+        <w:t xml:space="preserve">The login form itself is deliberately kept small and uncomplicated. It has a header panel across the top showing the name Filmtopia and the subtitle Cinema Management System </w:t>
       </w:r>
       <w:r>
         <w:rPr>
           <w:rFonts w:ascii="Aptos" w:eastAsia="Aptos" w:hAnsi="Aptos" w:cs="Aptos"/>
         </w:rPr>
         <w:lastRenderedPageBreak/>
-        <w:t xml:space="preserve">so the user knows straight away what they are logging into. Below that are two labels, Username and Password, each sitting next to its own text box, which I have named </w:t>
-      </w:r>
-      <w:proofErr w:type="spellStart"/>
-      <w:r>
-        <w:rPr>
-          <w:rFonts w:ascii="Aptos" w:eastAsia="Aptos" w:hAnsi="Aptos" w:cs="Aptos"/>
-        </w:rPr>
-        <w:t>txtUsername</w:t>
-      </w:r>
-      <w:proofErr w:type="spellEnd"/>
-      <w:r>
-        <w:rPr>
-          <w:rFonts w:ascii="Aptos" w:eastAsia="Aptos" w:hAnsi="Aptos" w:cs="Aptos"/>
-        </w:rPr>
-        <w:t xml:space="preserve"> and </w:t>
-      </w:r>
-      <w:proofErr w:type="spellStart"/>
-      <w:r>
-        <w:rPr>
-          <w:rFonts w:ascii="Aptos" w:eastAsia="Aptos" w:hAnsi="Aptos" w:cs="Aptos"/>
-        </w:rPr>
-        <w:t>txtPassword</w:t>
-      </w:r>
-      <w:proofErr w:type="spellEnd"/>
-      <w:r>
-        <w:rPr>
-          <w:rFonts w:ascii="Aptos" w:eastAsia="Aptos" w:hAnsi="Aptos" w:cs="Aptos"/>
-        </w:rPr>
-        <w:t xml:space="preserve">. The password box will have its characters masked so that anyone standing nearby cannot read what is being typed. Underneath the boxes are two buttons, a Log In button named </w:t>
-      </w:r>
-      <w:proofErr w:type="spellStart"/>
-      <w:r>
-        <w:rPr>
-          <w:rFonts w:ascii="Aptos" w:eastAsia="Aptos" w:hAnsi="Aptos" w:cs="Aptos"/>
-        </w:rPr>
-        <w:t>btnLogin</w:t>
-      </w:r>
-      <w:proofErr w:type="spellEnd"/>
-      <w:r>
-        <w:rPr>
-          <w:rFonts w:ascii="Aptos" w:eastAsia="Aptos" w:hAnsi="Aptos" w:cs="Aptos"/>
-        </w:rPr>
-        <w:t xml:space="preserve"> which carries out the check, and a Cancel button named </w:t>
-      </w:r>
-      <w:proofErr w:type="spellStart"/>
-      <w:r>
-        <w:rPr>
-          <w:rFonts w:ascii="Aptos" w:eastAsia="Aptos" w:hAnsi="Aptos" w:cs="Aptos"/>
-        </w:rPr>
-        <w:t>btnClose</w:t>
-      </w:r>
-      <w:proofErr w:type="spellEnd"/>
-      <w:r>
-        <w:rPr>
-          <w:rFonts w:ascii="Aptos" w:eastAsia="Aptos" w:hAnsi="Aptos" w:cs="Aptos"/>
-        </w:rPr>
-        <w:t xml:space="preserve"> which closes the program if the user changes their mind. A small version label sits at the very bottom of the form.</w:t>
+        <w:t>so the user knows straight away what they are logging into. Below that are two labels, Username and Password, each sitting next to its own text box, which I have named txtUsername and txtPassword. The password box will have its characters masked so that anyone standing nearby cannot read what is being typed. Underneath the boxes are two buttons, a Log In button named btnLogin which carries out the check, and a Cancel button named btnClose which closes the program if the user changes their mind. A small version label sits at the very bottom of the form.</w:t>
       </w:r>
     </w:p>
     <w:p>
@@ -316,31 +124,7 @@
           <w:sz w:val="22"/>
           <w:szCs w:val="22"/>
         </w:rPr>
-        <w:t>Login Form (</w:t>
-      </w:r>
-      <w:proofErr w:type="spellStart"/>
-      <w:r>
-        <w:rPr>
-          <w:rFonts w:ascii="Aptos" w:eastAsia="Aptos" w:hAnsi="Aptos" w:cs="Aptos"/>
-          <w:b/>
-          <w:bCs/>
-          <w:color w:val="A02B93"/>
-          <w:sz w:val="22"/>
-          <w:szCs w:val="22"/>
-        </w:rPr>
-        <w:t>frmLogin</w:t>
-      </w:r>
-      <w:proofErr w:type="spellEnd"/>
-      <w:r>
-        <w:rPr>
-          <w:rFonts w:ascii="Aptos" w:eastAsia="Aptos" w:hAnsi="Aptos" w:cs="Aptos"/>
-          <w:b/>
-          <w:bCs/>
-          <w:color w:val="A02B93"/>
-          <w:sz w:val="22"/>
-          <w:szCs w:val="22"/>
-        </w:rPr>
-        <w:t>)</w:t>
+        <w:t>Login Form (frmLogin)</w:t>
       </w:r>
     </w:p>
     <w:p>
@@ -351,35 +135,7 @@
         <w:rPr>
           <w:rFonts w:ascii="Aptos" w:eastAsia="Aptos" w:hAnsi="Aptos" w:cs="Aptos"/>
         </w:rPr>
-        <w:t xml:space="preserve">The only input to this form is the username and password typed by the user. The output, once the button is pressed, is either entry into the main menu or a message box telling the user that their details were not recognised. The process that happens in between is a lookup against the </w:t>
-      </w:r>
-      <w:proofErr w:type="spellStart"/>
-      <w:r>
-        <w:rPr>
-          <w:rFonts w:ascii="Aptos" w:eastAsia="Aptos" w:hAnsi="Aptos" w:cs="Aptos"/>
-        </w:rPr>
-        <w:t>tblLogin</w:t>
-      </w:r>
-      <w:proofErr w:type="spellEnd"/>
-      <w:r>
-        <w:rPr>
-          <w:rFonts w:ascii="Aptos" w:eastAsia="Aptos" w:hAnsi="Aptos" w:cs="Aptos"/>
-        </w:rPr>
-        <w:t xml:space="preserve"> table for a matching username, a comparison of the stored password, and if everything matches, the storing of that user's access level in a variable called </w:t>
-      </w:r>
-      <w:proofErr w:type="spellStart"/>
-      <w:r>
-        <w:rPr>
-          <w:rFonts w:ascii="Aptos" w:eastAsia="Aptos" w:hAnsi="Aptos" w:cs="Aptos"/>
-        </w:rPr>
-        <w:t>UserAccessLevel</w:t>
-      </w:r>
-      <w:proofErr w:type="spellEnd"/>
-      <w:r>
-        <w:rPr>
-          <w:rFonts w:ascii="Aptos" w:eastAsia="Aptos" w:hAnsi="Aptos" w:cs="Aptos"/>
-        </w:rPr>
-        <w:t xml:space="preserve"> that the rest of the program can read. I have chosen buttons here rather than, for example, expecting the user to press the Enter key, this is because a clearly labelled Log In button leaves no doubt about what to do and is friendlier for staff who are not especially technical.</w:t>
+        <w:t>The only input to this form is the username and password typed by the user. The output, once the button is pressed, is either entry into the main menu or a message box telling the user that their details were not recognised. The process that happens in between is a lookup against the tblLogin table for a matching username, a comparison of the stored password, and if everything matches, the storing of that user's access level in a variable called UserAccessLevel that the rest of the program can read. I have chosen buttons here rather than, for example, expecting the user to press the Enter key, this is because a clearly labelled Log In button leaves no doubt about what to do and is friendlier for staff who are not especially technical.</w:t>
       </w:r>
     </w:p>
     <w:p>
@@ -390,35 +146,7 @@
         <w:rPr>
           <w:rFonts w:ascii="Aptos" w:eastAsia="Aptos" w:hAnsi="Aptos" w:cs="Aptos"/>
         </w:rPr>
-        <w:t xml:space="preserve">Once a user has logged in successfully they are taken to the main menu, which is the form named </w:t>
-      </w:r>
-      <w:proofErr w:type="spellStart"/>
-      <w:r>
-        <w:rPr>
-          <w:rFonts w:ascii="Aptos" w:eastAsia="Aptos" w:hAnsi="Aptos" w:cs="Aptos"/>
-        </w:rPr>
-        <w:t>frmMainForm</w:t>
-      </w:r>
-      <w:proofErr w:type="spellEnd"/>
-      <w:r>
-        <w:rPr>
-          <w:rFonts w:ascii="Aptos" w:eastAsia="Aptos" w:hAnsi="Aptos" w:cs="Aptos"/>
-        </w:rPr>
-        <w:t xml:space="preserve"> and acts as the hub for the whole system. Every other part of </w:t>
-      </w:r>
-      <w:proofErr w:type="spellStart"/>
-      <w:r>
-        <w:rPr>
-          <w:rFonts w:ascii="Aptos" w:eastAsia="Aptos" w:hAnsi="Aptos" w:cs="Aptos"/>
-        </w:rPr>
-        <w:t>Filmtopia</w:t>
-      </w:r>
-      <w:proofErr w:type="spellEnd"/>
-      <w:r>
-        <w:rPr>
-          <w:rFonts w:ascii="Aptos" w:eastAsia="Aptos" w:hAnsi="Aptos" w:cs="Aptos"/>
-        </w:rPr>
-        <w:t xml:space="preserve"> is reached from here by pressing a button, which I felt was a far more sophisticated and easier to follow approach than burying features inside drop-down menus that a busy member of staff would have to go hunting through. The menu shows a welcome message at the top and then a column of buttons down the content area, one for each area of the system, for example Bookings, Find Booking, Screenings, Films, Screens, Food, Reports, Customers, Logs and a Logout button.</w:t>
+        <w:t>Once a user has logged in successfully they are taken to the main menu, which is the form named frmMainForm and acts as the hub for the whole system. Every other part of Filmtopia is reached from here by pressing a button, which I felt was a far more sophisticated and easier to follow approach than burying features inside drop-down menus that a busy member of staff would have to go hunting through. The menu shows a welcome message at the top and then a column of buttons down the content area, one for each area of the system, for example Bookings, Find Booking, Screenings, Films, Screens, Food, Reports, Customers, Logs and a Logout button.</w:t>
       </w:r>
     </w:p>
     <w:p>
@@ -429,35 +157,7 @@
         <w:rPr>
           <w:rFonts w:ascii="Aptos" w:eastAsia="Aptos" w:hAnsi="Aptos" w:cs="Aptos"/>
         </w:rPr>
-        <w:t xml:space="preserve">What makes this form important for the objective is that the buttons shown depend entirely on the access level that was read at login. This is because a manager, whose access level is 1, needs to see everything, whereas a normal member of staff, whose access level is 2, should only see the day to day booking functions. When a manager logs in the group box is titled </w:t>
-      </w:r>
-      <w:proofErr w:type="spellStart"/>
-      <w:r>
-        <w:rPr>
-          <w:rFonts w:ascii="Aptos" w:eastAsia="Aptos" w:hAnsi="Aptos" w:cs="Aptos"/>
-        </w:rPr>
-        <w:t>Filmtopia</w:t>
-      </w:r>
-      <w:proofErr w:type="spellEnd"/>
-      <w:r>
-        <w:rPr>
-          <w:rFonts w:ascii="Aptos" w:eastAsia="Aptos" w:hAnsi="Aptos" w:cs="Aptos"/>
-        </w:rPr>
-        <w:t xml:space="preserve"> Admin and the management buttons for Films, Screens, Food, Reports and Logs are all made visible. When a member of staff logs in those same buttons are hidden and the group box is titled </w:t>
-      </w:r>
-      <w:proofErr w:type="spellStart"/>
-      <w:r>
-        <w:rPr>
-          <w:rFonts w:ascii="Aptos" w:eastAsia="Aptos" w:hAnsi="Aptos" w:cs="Aptos"/>
-        </w:rPr>
-        <w:t>Filmtopia</w:t>
-      </w:r>
-      <w:proofErr w:type="spellEnd"/>
-      <w:r>
-        <w:rPr>
-          <w:rFonts w:ascii="Aptos" w:eastAsia="Aptos" w:hAnsi="Aptos" w:cs="Aptos"/>
-        </w:rPr>
-        <w:t xml:space="preserve"> Staff, leaving them with just the booking related functions. In this way a single form quietly enforces the whole access level objective without the staff member ever seeing an option they are not allowed to use.</w:t>
+        <w:t>What makes this form important for the objective is that the buttons shown depend entirely on the access level that was read at login. This is because a manager, whose access level is 1, needs to see everything, whereas a normal member of staff, whose access level is 2, should only see the day to day booking functions. When a manager logs in the group box is titled Filmtopia Admin and the management buttons for Films, Screens, Food, Reports and Logs are all made visible. When a member of staff logs in those same buttons are hidden and the group box is titled Filmtopia Staff, leaving them with just the booking related functions. In this way a single form quietly enforces the whole access level objective without the staff member ever seeing an option they are not allowed to use.</w:t>
       </w:r>
     </w:p>
     <w:p>
@@ -481,31 +181,7 @@
           <w:szCs w:val="22"/>
         </w:rPr>
         <w:lastRenderedPageBreak/>
-        <w:t>Main Menu (</w:t>
-      </w:r>
-      <w:proofErr w:type="spellStart"/>
-      <w:r>
-        <w:rPr>
-          <w:rFonts w:ascii="Aptos" w:eastAsia="Aptos" w:hAnsi="Aptos" w:cs="Aptos"/>
-          <w:b/>
-          <w:bCs/>
-          <w:color w:val="A02B93"/>
-          <w:sz w:val="22"/>
-          <w:szCs w:val="22"/>
-        </w:rPr>
-        <w:t>frmMainForm</w:t>
-      </w:r>
-      <w:proofErr w:type="spellEnd"/>
-      <w:r>
-        <w:rPr>
-          <w:rFonts w:ascii="Aptos" w:eastAsia="Aptos" w:hAnsi="Aptos" w:cs="Aptos"/>
-          <w:b/>
-          <w:bCs/>
-          <w:color w:val="A02B93"/>
-          <w:sz w:val="22"/>
-          <w:szCs w:val="22"/>
-        </w:rPr>
-        <w:t>)</w:t>
+        <w:t>Main Menu (frmMainForm)</w:t>
       </w:r>
     </w:p>
     <w:p>
@@ -542,21 +218,7 @@
         <w:rPr>
           <w:rFonts w:ascii="Aptos" w:eastAsia="Aptos" w:hAnsi="Aptos" w:cs="Aptos"/>
         </w:rPr>
-        <w:t xml:space="preserve">Moving on to the management side of the system, one of the first jobs a manager or member of staff needs to do is add the films that the cinema is showing, because without any films in the system there is nothing for a screening to be attached to. This objective is handled by a single form named </w:t>
-      </w:r>
-      <w:proofErr w:type="spellStart"/>
-      <w:r>
-        <w:rPr>
-          <w:rFonts w:ascii="Aptos" w:eastAsia="Aptos" w:hAnsi="Aptos" w:cs="Aptos"/>
-        </w:rPr>
-        <w:t>frmFilms</w:t>
-      </w:r>
-      <w:proofErr w:type="spellEnd"/>
-      <w:r>
-        <w:rPr>
-          <w:rFonts w:ascii="Aptos" w:eastAsia="Aptos" w:hAnsi="Aptos" w:cs="Aptos"/>
-        </w:rPr>
-        <w:t xml:space="preserve"> which lets the user add a new film, edit an existing one, or remove one that is no longer being shown.</w:t>
+        <w:t>Moving on to the management side of the system, one of the first jobs a manager or member of staff needs to do is add the films that the cinema is showing, because without any films in the system there is nothing for a screening to be attached to. This objective is handled by a single form named frmFilms which lets the user add a new film, edit an existing one, or remove one that is no longer being shown.</w:t>
       </w:r>
     </w:p>
     <w:p>
@@ -567,133 +229,7 @@
         <w:rPr>
           <w:rFonts w:ascii="Aptos" w:eastAsia="Aptos" w:hAnsi="Aptos" w:cs="Aptos"/>
         </w:rPr>
-        <w:t xml:space="preserve">The form is split into two halves. On one side is a data grid view named </w:t>
-      </w:r>
-      <w:proofErr w:type="spellStart"/>
-      <w:r>
-        <w:rPr>
-          <w:rFonts w:ascii="Aptos" w:eastAsia="Aptos" w:hAnsi="Aptos" w:cs="Aptos"/>
-        </w:rPr>
-        <w:t>dgvFilms</w:t>
-      </w:r>
-      <w:proofErr w:type="spellEnd"/>
-      <w:r>
-        <w:rPr>
-          <w:rFonts w:ascii="Aptos" w:eastAsia="Aptos" w:hAnsi="Aptos" w:cs="Aptos"/>
-        </w:rPr>
-        <w:t xml:space="preserve"> which lists every film already stored in the system, showing its title, age rating, duration and description in a table so the user can see at a glance what is already there. On the other side is a set of input boxes for the details of a film, made up of a label and a text box for each field, which I have named </w:t>
-      </w:r>
-      <w:proofErr w:type="spellStart"/>
-      <w:r>
-        <w:rPr>
-          <w:rFonts w:ascii="Aptos" w:eastAsia="Aptos" w:hAnsi="Aptos" w:cs="Aptos"/>
-        </w:rPr>
-        <w:t>txtTitle</w:t>
-      </w:r>
-      <w:proofErr w:type="spellEnd"/>
-      <w:r>
-        <w:rPr>
-          <w:rFonts w:ascii="Aptos" w:eastAsia="Aptos" w:hAnsi="Aptos" w:cs="Aptos"/>
-        </w:rPr>
-        <w:t xml:space="preserve">, </w:t>
-      </w:r>
-      <w:proofErr w:type="spellStart"/>
-      <w:r>
-        <w:rPr>
-          <w:rFonts w:ascii="Aptos" w:eastAsia="Aptos" w:hAnsi="Aptos" w:cs="Aptos"/>
-        </w:rPr>
-        <w:t>txtAgeRating</w:t>
-      </w:r>
-      <w:proofErr w:type="spellEnd"/>
-      <w:r>
-        <w:rPr>
-          <w:rFonts w:ascii="Aptos" w:eastAsia="Aptos" w:hAnsi="Aptos" w:cs="Aptos"/>
-        </w:rPr>
-        <w:t xml:space="preserve">, </w:t>
-      </w:r>
-      <w:proofErr w:type="spellStart"/>
-      <w:r>
-        <w:rPr>
-          <w:rFonts w:ascii="Aptos" w:eastAsia="Aptos" w:hAnsi="Aptos" w:cs="Aptos"/>
-        </w:rPr>
-        <w:t>txtDuration</w:t>
-      </w:r>
-      <w:proofErr w:type="spellEnd"/>
-      <w:r>
-        <w:rPr>
-          <w:rFonts w:ascii="Aptos" w:eastAsia="Aptos" w:hAnsi="Aptos" w:cs="Aptos"/>
-        </w:rPr>
-        <w:t xml:space="preserve"> and </w:t>
-      </w:r>
-      <w:proofErr w:type="spellStart"/>
-      <w:r>
-        <w:rPr>
-          <w:rFonts w:ascii="Aptos" w:eastAsia="Aptos" w:hAnsi="Aptos" w:cs="Aptos"/>
-        </w:rPr>
-        <w:t>txtDescription</w:t>
-      </w:r>
-      <w:proofErr w:type="spellEnd"/>
-      <w:r>
-        <w:rPr>
-          <w:rFonts w:ascii="Aptos" w:eastAsia="Aptos" w:hAnsi="Aptos" w:cs="Aptos"/>
-        </w:rPr>
-        <w:t xml:space="preserve">. Beneath these are four buttons, Add, Update, Delete and Clear, which I have named </w:t>
-      </w:r>
-      <w:proofErr w:type="spellStart"/>
-      <w:r>
-        <w:rPr>
-          <w:rFonts w:ascii="Aptos" w:eastAsia="Aptos" w:hAnsi="Aptos" w:cs="Aptos"/>
-        </w:rPr>
-        <w:t>btnAdd</w:t>
-      </w:r>
-      <w:proofErr w:type="spellEnd"/>
-      <w:r>
-        <w:rPr>
-          <w:rFonts w:ascii="Aptos" w:eastAsia="Aptos" w:hAnsi="Aptos" w:cs="Aptos"/>
-        </w:rPr>
-        <w:t xml:space="preserve">, </w:t>
-      </w:r>
-      <w:proofErr w:type="spellStart"/>
-      <w:r>
-        <w:rPr>
-          <w:rFonts w:ascii="Aptos" w:eastAsia="Aptos" w:hAnsi="Aptos" w:cs="Aptos"/>
-        </w:rPr>
-        <w:t>btnUpdate</w:t>
-      </w:r>
-      <w:proofErr w:type="spellEnd"/>
-      <w:r>
-        <w:rPr>
-          <w:rFonts w:ascii="Aptos" w:eastAsia="Aptos" w:hAnsi="Aptos" w:cs="Aptos"/>
-        </w:rPr>
-        <w:t xml:space="preserve">, </w:t>
-      </w:r>
-      <w:proofErr w:type="spellStart"/>
-      <w:r>
-        <w:rPr>
-          <w:rFonts w:ascii="Aptos" w:eastAsia="Aptos" w:hAnsi="Aptos" w:cs="Aptos"/>
-        </w:rPr>
-        <w:t>btnDelete</w:t>
-      </w:r>
-      <w:proofErr w:type="spellEnd"/>
-      <w:r>
-        <w:rPr>
-          <w:rFonts w:ascii="Aptos" w:eastAsia="Aptos" w:hAnsi="Aptos" w:cs="Aptos"/>
-        </w:rPr>
-        <w:t xml:space="preserve"> and </w:t>
-      </w:r>
-      <w:proofErr w:type="spellStart"/>
-      <w:r>
-        <w:rPr>
-          <w:rFonts w:ascii="Aptos" w:eastAsia="Aptos" w:hAnsi="Aptos" w:cs="Aptos"/>
-        </w:rPr>
-        <w:t>btnClear</w:t>
-      </w:r>
-      <w:proofErr w:type="spellEnd"/>
-      <w:r>
-        <w:rPr>
-          <w:rFonts w:ascii="Aptos" w:eastAsia="Aptos" w:hAnsi="Aptos" w:cs="Aptos"/>
-        </w:rPr>
-        <w:t>.</w:t>
+        <w:t>The form is split into two halves. On one side is a data grid view named dgvFilms which lists every film already stored in the system, showing its title, age rating, duration and description in a table so the user can see at a glance what is already there. On the other side is a set of input boxes for the details of a film, made up of a label and a text box for each field, which I have named txtTitle, txtAgeRating, txtDuration and txtDescription. Beneath these are four buttons, Add, Update, Delete and Clear, which I have named btnAdd, btnUpdate, btnDelete and btnClear.</w:t>
       </w:r>
     </w:p>
     <w:p>
@@ -716,31 +252,7 @@
           <w:sz w:val="22"/>
           <w:szCs w:val="22"/>
         </w:rPr>
-        <w:t>Add Films Form (</w:t>
-      </w:r>
-      <w:proofErr w:type="spellStart"/>
-      <w:r>
-        <w:rPr>
-          <w:rFonts w:ascii="Aptos" w:eastAsia="Aptos" w:hAnsi="Aptos" w:cs="Aptos"/>
-          <w:b/>
-          <w:bCs/>
-          <w:color w:val="A02B93"/>
-          <w:sz w:val="22"/>
-          <w:szCs w:val="22"/>
-        </w:rPr>
-        <w:t>frmFilms</w:t>
-      </w:r>
-      <w:proofErr w:type="spellEnd"/>
-      <w:r>
-        <w:rPr>
-          <w:rFonts w:ascii="Aptos" w:eastAsia="Aptos" w:hAnsi="Aptos" w:cs="Aptos"/>
-          <w:b/>
-          <w:bCs/>
-          <w:color w:val="A02B93"/>
-          <w:sz w:val="22"/>
-          <w:szCs w:val="22"/>
-        </w:rPr>
-        <w:t>)</w:t>
+        <w:t>Add Films Form (frmFilms)</w:t>
       </w:r>
     </w:p>
     <w:p>
@@ -751,21 +263,7 @@
         <w:rPr>
           <w:rFonts w:ascii="Aptos" w:eastAsia="Aptos" w:hAnsi="Aptos" w:cs="Aptos"/>
         </w:rPr>
-        <w:t xml:space="preserve">The inputs to this form are the four film details typed into the text boxes. The outputs are the updated list of films shown in the grid and, where appropriate, a message box confirming that a film has been added or warning the user if something has gone wrong. The processes behind the buttons are straightforward database operations, for example the Add button takes whatever is in the text boxes and inserts a new record into the </w:t>
-      </w:r>
-      <w:proofErr w:type="spellStart"/>
-      <w:r>
-        <w:rPr>
-          <w:rFonts w:ascii="Aptos" w:eastAsia="Aptos" w:hAnsi="Aptos" w:cs="Aptos"/>
-        </w:rPr>
-        <w:t>tblFilm</w:t>
-      </w:r>
-      <w:proofErr w:type="spellEnd"/>
-      <w:r>
-        <w:rPr>
-          <w:rFonts w:ascii="Aptos" w:eastAsia="Aptos" w:hAnsi="Aptos" w:cs="Aptos"/>
-        </w:rPr>
-        <w:t xml:space="preserve"> table, whereas the Update button changes the record for the film currently selected in the grid, and the Delete button removes it. The Clear button simply empties the text boxes so the user can start again.</w:t>
+        <w:t>The inputs to this form are the four film details typed into the text boxes. The outputs are the updated list of films shown in the grid and, where appropriate, a message box confirming that a film has been added or warning the user if something has gone wrong. The processes behind the buttons are straightforward database operations, for example the Add button takes whatever is in the text boxes and inserts a new record into the tblFilm table, whereas the Update button changes the record for the film currently selected in the grid, and the Delete button removes it. The Clear button simply empties the text boxes so the user can start again.</w:t>
       </w:r>
     </w:p>
     <w:p>
@@ -788,6 +286,77 @@
     </w:p>
     <w:p>
       <w:pPr>
+        <w:pStyle w:val="Heading3"/>
+        <w:spacing w:before="260" w:after="120"/>
+      </w:pPr>
+      <w:r>
+        <w:rPr>
+          <w:rFonts w:ascii="Aptos Display" w:eastAsia="Aptos Display" w:hAnsi="Aptos Display" w:cs="Aptos Display"/>
+          <w:b/>
+          <w:bCs/>
+          <w:color w:val="000000"/>
+        </w:rPr>
+        <w:t>Adding New Screenings (Objective 7)</w:t>
+      </w:r>
+    </w:p>
+    <w:p>
+      <w:pPr>
+        <w:spacing w:after="160" w:line="276" w:lineRule="auto"/>
+      </w:pPr>
+      <w:r>
+        <w:rPr>
+          <w:rFonts w:ascii="Aptos" w:eastAsia="Aptos" w:hAnsi="Aptos" w:cs="Aptos"/>
+        </w:rPr>
+        <w:t>Once films exist in the system the next job is to schedule when and where they will actually be shown, which is what this objective covers. It is handled by the form named frmScreenings, and because it is another management form for adding, editing and removing records it follows exactly the same layout as the Add Films form described above, with a data grid view named dgvScreenings listing the existing screenings on one side and a set of input controls with Add, Update, Delete and Clear buttons on the other. Rather than repeat the whole description I will refer back to the Add Films form for the general behaviour and just explain what is different here.</w:t>
+      </w:r>
+    </w:p>
+    <w:p>
+      <w:pPr>
+        <w:spacing w:after="160" w:line="276" w:lineRule="auto"/>
+      </w:pPr>
+      <w:r>
+        <w:rPr>
+          <w:rFonts w:ascii="Aptos" w:eastAsia="Aptos" w:hAnsi="Aptos" w:cs="Aptos"/>
+        </w:rPr>
+        <w:t>The difference is in the inputs. A screening has to be tied to a film that already exists and a screen that already exists, so instead of free text boxes for those two the form uses two combo boxes, named cboFilm and cboScreen, which the user picks from. This is because a member of staff should not be able to type in a film or a screen that is not really there, and choosing from a list makes that impossible. The date is entered using a date picker named dtpScreeningDate rather than a text box, this is because a proper date picker stops the user entering something that is not a real date. The time and the ticket price are entered into text boxes named txtScreeningTime, which is labelled Time in the format HH colon MM, and txtTicketPrice.</w:t>
+      </w:r>
+    </w:p>
+    <w:p>
+      <w:pPr>
+        <w:pBdr>
+          <w:top w:val="single" w:sz="6" w:space="6" w:color="A02B93"/>
+          <w:left w:val="single" w:sz="6" w:space="6" w:color="A02B93"/>
+          <w:bottom w:val="single" w:sz="6" w:space="6" w:color="A02B93"/>
+          <w:right w:val="single" w:sz="6" w:space="6" w:color="A02B93"/>
+        </w:pBdr>
+        <w:shd w:val="clear" w:color="auto" w:fill="F7E9F3"/>
+        <w:spacing w:before="120" w:after="200"/>
+      </w:pPr>
+      <w:r>
+        <w:rPr>
+          <w:rFonts w:ascii="Aptos" w:eastAsia="Aptos" w:hAnsi="Aptos" w:cs="Aptos"/>
+          <w:b/>
+          <w:bCs/>
+          <w:color w:val="A02B93"/>
+          <w:sz w:val="22"/>
+          <w:szCs w:val="22"/>
+        </w:rPr>
+        <w:t>Add Screenings Form (frmScreenings)</w:t>
+      </w:r>
+    </w:p>
+    <w:p>
+      <w:pPr>
+        <w:spacing w:after="160" w:line="276" w:lineRule="auto"/>
+      </w:pPr>
+      <w:r>
+        <w:rPr>
+          <w:rFonts w:ascii="Aptos" w:eastAsia="Aptos" w:hAnsi="Aptos" w:cs="Aptos"/>
+        </w:rPr>
+        <w:t>The inputs are therefore the chosen film, the chosen screen, the date, the time and the ticket price. The output is the updated list of screenings in the grid, along with the usual confirmation or warning message boxes. The processes behind the buttons are the same insert, update and delete operations as before, this time acting on the tblScreening table.</w:t>
+      </w:r>
+    </w:p>
+    <w:p>
+      <w:pPr>
         <w:spacing w:after="160" w:line="276" w:lineRule="auto"/>
       </w:pPr>
     </w:p>
@@ -814,23 +383,7 @@
         <w:spacing w:after="160" w:line="276" w:lineRule="auto"/>
       </w:pPr>
       <w:r>
-        <w:t xml:space="preserve">The purpose of this section is to specify the data structures that the </w:t>
-      </w:r>
-      <w:proofErr w:type="spellStart"/>
-      <w:r>
-        <w:t>Filmtopia</w:t>
-      </w:r>
-      <w:proofErr w:type="spellEnd"/>
-      <w:r>
-        <w:t xml:space="preserve"> system will use to store its data. As the system is built around a Microsoft Access database accessed through </w:t>
-      </w:r>
-      <w:proofErr w:type="spellStart"/>
-      <w:r>
-        <w:t>OleDb</w:t>
-      </w:r>
-      <w:proofErr w:type="spellEnd"/>
-      <w:r>
-        <w:t>, these data structures take the form of database tables rather than arrays or other in memory structures. Each table and the relationships between them are described below, along with the way the data in those tables will be accessed. A key aim throughout the design has been to make sure the table structure is fully normalised to third normal form so that data is never repeated unnecessarily and the database cannot end up in an inconsistent state.</w:t>
+        <w:t>The purpose of this section is to specify the data structures that the Filmtopia system will use to store its data. As the system is built around a Microsoft Access database accessed through OleDb, these data structures take the form of database tables rather than arrays or other in memory structures. Each table and the relationships between them are described below, along with the way the data in those tables will be accessed. A key aim throughout the design has been to make sure the table structure is fully normalised to third normal form so that data is never repeated unnecessarily and the database cannot end up in an inconsistent state.</w:t>
       </w:r>
     </w:p>
     <w:p>
@@ -937,23 +490,7 @@
         <w:spacing w:after="160" w:line="276" w:lineRule="auto"/>
       </w:pPr>
       <w:r>
-        <w:t xml:space="preserve">The way to resolve a many to many relationship is to create a new link table that sits between the two original entities, turning the single many to many relationship into two separate one to many relationships. For the booking and seat relationship this link table is </w:t>
-      </w:r>
-      <w:proofErr w:type="spellStart"/>
-      <w:r>
-        <w:t>tblBookingSeat</w:t>
-      </w:r>
-      <w:proofErr w:type="spellEnd"/>
-      <w:r>
-        <w:t xml:space="preserve">, and for the booking and food item relationship it is </w:t>
-      </w:r>
-      <w:proofErr w:type="spellStart"/>
-      <w:r>
-        <w:t>tblOrderItem</w:t>
-      </w:r>
-      <w:proofErr w:type="spellEnd"/>
-      <w:r>
-        <w:t>. Each link table holds its own primary key along with the two foreign keys that point back to the tables it joins. The diagram below shows the final design once these link tables have been added, with the primary key of each table shown in bold and the foreign keys shown in italics.</w:t>
+        <w:t>The way to resolve a many to many relationship is to create a new link table that sits between the two original entities, turning the single many to many relationship into two separate one to many relationships. For the booking and seat relationship this link table is tblBookingSeat, and for the booking and food item relationship it is tblOrderItem. Each link table holds its own primary key along with the two foreign keys that point back to the tables it joins. The diagram below shows the final design once these link tables have been added, with the primary key of each table shown in bold and the foreign keys shown in italics.</w:t>
       </w:r>
     </w:p>
     <w:p>
@@ -1026,55 +563,7 @@
         <w:spacing w:after="160" w:line="276" w:lineRule="auto"/>
       </w:pPr>
       <w:r>
-        <w:t xml:space="preserve">In this final design the foreign keys are produced by copying the primary key from the one end of each relationship to the many end. For example the </w:t>
-      </w:r>
-      <w:proofErr w:type="spellStart"/>
-      <w:r>
-        <w:t>ScreeningID</w:t>
-      </w:r>
-      <w:proofErr w:type="spellEnd"/>
-      <w:r>
-        <w:t xml:space="preserve"> primary key from </w:t>
-      </w:r>
-      <w:proofErr w:type="spellStart"/>
-      <w:r>
-        <w:t>tblScreening</w:t>
-      </w:r>
-      <w:proofErr w:type="spellEnd"/>
-      <w:r>
-        <w:t xml:space="preserve"> is copied into </w:t>
-      </w:r>
-      <w:proofErr w:type="spellStart"/>
-      <w:r>
-        <w:t>tblBooking</w:t>
-      </w:r>
-      <w:proofErr w:type="spellEnd"/>
-      <w:r>
-        <w:t xml:space="preserve"> as a foreign key, because one screening can have many bookings. The same pattern is followed throughout, which keeps every relationship as a clean one to many. The structure is normalised to third normal form because every non key field in each table depends only on the whole of that table's primary key, with no field depending on another non key field and no repeating groups of data anywhere in the design. Three further tables exist in the system that do not appear in this diagram because they are standalone and not related to the others through foreign keys. These are </w:t>
-      </w:r>
-      <w:proofErr w:type="spellStart"/>
-      <w:r>
-        <w:t>tblLogin</w:t>
-      </w:r>
-      <w:proofErr w:type="spellEnd"/>
-      <w:r>
-        <w:t xml:space="preserve">, which holds the user accounts, </w:t>
-      </w:r>
-      <w:proofErr w:type="spellStart"/>
-      <w:r>
-        <w:t>tblLogs</w:t>
-      </w:r>
-      <w:proofErr w:type="spellEnd"/>
-      <w:r>
-        <w:t xml:space="preserve">, which records system events, and </w:t>
-      </w:r>
-      <w:proofErr w:type="spellStart"/>
-      <w:r>
-        <w:t>tblVersionControl</w:t>
-      </w:r>
-      <w:proofErr w:type="spellEnd"/>
-      <w:r>
-        <w:t>, which holds the application version. They are included in the table designs below for completeness.</w:t>
+        <w:t>In this final design the foreign keys are produced by copying the primary key from the one end of each relationship to the many end. For example the ScreeningID primary key from tblScreening is copied into tblBooking as a foreign key, because one screening can have many bookings. The same pattern is followed throughout, which keeps every relationship as a clean one to many. The structure is normalised to third normal form because every non key field in each table depends only on the whole of that table's primary key, with no field depending on another non key field and no repeating groups of data anywhere in the design. Three further tables exist in the system that do not appear in this diagram because they are standalone and not related to the others through foreign keys. These are tblLogin, which holds the user accounts, tblLogs, which records system events, and tblVersionControl, which holds the application version. They are included in the table designs below for completeness.</w:t>
       </w:r>
     </w:p>
     <w:p>
@@ -1134,23 +623,7 @@
         <w:spacing w:after="160" w:line="276" w:lineRule="auto"/>
       </w:pPr>
       <w:r>
-        <w:t xml:space="preserve">The </w:t>
-      </w:r>
-      <w:proofErr w:type="spellStart"/>
-      <w:r>
-        <w:t>Filmtopia</w:t>
-      </w:r>
-      <w:proofErr w:type="spellEnd"/>
-      <w:r>
-        <w:t xml:space="preserve"> tables are stored within a Microsoft Access database and are accessed from the Visual Basic .NET application using SQL queries sent through an </w:t>
-      </w:r>
-      <w:proofErr w:type="spellStart"/>
-      <w:r>
-        <w:t>OleDb</w:t>
-      </w:r>
-      <w:proofErr w:type="spellEnd"/>
-      <w:r>
-        <w:t xml:space="preserve"> connection, specifically SELECT, INSERT, UPDATE and DELETE queries. The database management system stores the tables as direct access files and maintains indexes on the primary keys so that looking a record up by its primary key is fast and does not require reading through every record. Where a search is carried out on a field that is not indexed, the database falls back to a sequential search through the table.</w:t>
+        <w:t>The Filmtopia tables are stored within a Microsoft Access database and are accessed from the Visual Basic .NET application using SQL queries sent through an OleDb connection, specifically SELECT, INSERT, UPDATE and DELETE queries. The database management system stores the tables as direct access files and maintains indexes on the primary keys so that looking a record up by its primary key is fast and does not require reading through every record. Where a search is carried out on a field that is not indexed, the database falls back to a sequential search through the table.</w:t>
       </w:r>
     </w:p>
     <w:p>
@@ -1162,7 +635,6 @@
           <w:color w:val="000000" w:themeColor="text1"/>
         </w:rPr>
       </w:pPr>
-      <w:proofErr w:type="spellStart"/>
       <w:r>
         <w:rPr>
           <w:b/>
@@ -1171,7 +643,6 @@
         </w:rPr>
         <w:t>tblFilm</w:t>
       </w:r>
-      <w:proofErr w:type="spellEnd"/>
     </w:p>
     <w:p>
       <w:pPr>
@@ -1349,7 +820,6 @@
             </w:tcMar>
           </w:tcPr>
           <w:p>
-            <w:proofErr w:type="spellStart"/>
             <w:r>
               <w:rPr>
                 <w:sz w:val="19"/>
@@ -1357,7 +827,6 @@
               </w:rPr>
               <w:t>FilmID</w:t>
             </w:r>
-            <w:proofErr w:type="spellEnd"/>
           </w:p>
         </w:tc>
         <w:tc>
@@ -1445,7 +914,6 @@
             </w:tcMar>
           </w:tcPr>
           <w:p>
-            <w:proofErr w:type="spellStart"/>
             <w:r>
               <w:rPr>
                 <w:sz w:val="19"/>
@@ -1453,7 +921,6 @@
               </w:rPr>
               <w:t>FilmTitle</w:t>
             </w:r>
-            <w:proofErr w:type="spellEnd"/>
           </w:p>
         </w:tc>
         <w:tc>
@@ -1549,7 +1016,6 @@
             </w:tcMar>
           </w:tcPr>
           <w:p>
-            <w:proofErr w:type="spellStart"/>
             <w:r>
               <w:rPr>
                 <w:sz w:val="19"/>
@@ -1557,7 +1023,6 @@
               </w:rPr>
               <w:t>FilmAgeRating</w:t>
             </w:r>
-            <w:proofErr w:type="spellEnd"/>
           </w:p>
         </w:tc>
         <w:tc>
@@ -1653,7 +1118,6 @@
             </w:tcMar>
           </w:tcPr>
           <w:p>
-            <w:proofErr w:type="spellStart"/>
             <w:r>
               <w:rPr>
                 <w:sz w:val="19"/>
@@ -1661,7 +1125,6 @@
               </w:rPr>
               <w:t>FilmDuration</w:t>
             </w:r>
-            <w:proofErr w:type="spellEnd"/>
           </w:p>
         </w:tc>
         <w:tc>
@@ -1749,7 +1212,6 @@
             </w:tcMar>
           </w:tcPr>
           <w:p>
-            <w:proofErr w:type="spellStart"/>
             <w:r>
               <w:rPr>
                 <w:sz w:val="19"/>
@@ -1757,7 +1219,6 @@
               </w:rPr>
               <w:t>FilmDescription</w:t>
             </w:r>
-            <w:proofErr w:type="spellEnd"/>
           </w:p>
         </w:tc>
         <w:tc>
@@ -1856,7 +1317,6 @@
           <w:color w:val="000000" w:themeColor="text1"/>
         </w:rPr>
       </w:pPr>
-      <w:proofErr w:type="spellStart"/>
       <w:r>
         <w:rPr>
           <w:b/>
@@ -1865,7 +1325,6 @@
         </w:rPr>
         <w:t>tblScreen</w:t>
       </w:r>
-      <w:proofErr w:type="spellEnd"/>
     </w:p>
     <w:p>
       <w:pPr>
@@ -2043,7 +1502,6 @@
             </w:tcMar>
           </w:tcPr>
           <w:p>
-            <w:proofErr w:type="spellStart"/>
             <w:r>
               <w:rPr>
                 <w:sz w:val="19"/>
@@ -2051,7 +1509,6 @@
               </w:rPr>
               <w:t>ScreenID</w:t>
             </w:r>
-            <w:proofErr w:type="spellEnd"/>
           </w:p>
         </w:tc>
         <w:tc>
@@ -2139,7 +1596,6 @@
             </w:tcMar>
           </w:tcPr>
           <w:p>
-            <w:proofErr w:type="spellStart"/>
             <w:r>
               <w:rPr>
                 <w:sz w:val="19"/>
@@ -2147,7 +1603,6 @@
               </w:rPr>
               <w:t>ScreenName</w:t>
             </w:r>
-            <w:proofErr w:type="spellEnd"/>
           </w:p>
         </w:tc>
         <w:tc>
@@ -2243,7 +1698,6 @@
             </w:tcMar>
           </w:tcPr>
           <w:p>
-            <w:proofErr w:type="spellStart"/>
             <w:r>
               <w:rPr>
                 <w:sz w:val="19"/>
@@ -2251,7 +1705,6 @@
               </w:rPr>
               <w:t>ScreenCapacity</w:t>
             </w:r>
-            <w:proofErr w:type="spellEnd"/>
           </w:p>
         </w:tc>
         <w:tc>
@@ -2342,7 +1795,6 @@
           <w:color w:val="000000" w:themeColor="text1"/>
         </w:rPr>
       </w:pPr>
-      <w:proofErr w:type="spellStart"/>
       <w:r>
         <w:rPr>
           <w:b/>
@@ -2351,7 +1803,6 @@
         </w:rPr>
         <w:t>tblScreening</w:t>
       </w:r>
-      <w:proofErr w:type="spellEnd"/>
     </w:p>
     <w:p>
       <w:pPr>
@@ -2529,7 +1980,6 @@
             </w:tcMar>
           </w:tcPr>
           <w:p>
-            <w:proofErr w:type="spellStart"/>
             <w:r>
               <w:rPr>
                 <w:sz w:val="19"/>
@@ -2537,7 +1987,6 @@
               </w:rPr>
               <w:t>ScreeningID</w:t>
             </w:r>
-            <w:proofErr w:type="spellEnd"/>
           </w:p>
         </w:tc>
         <w:tc>
@@ -2625,7 +2074,6 @@
             </w:tcMar>
           </w:tcPr>
           <w:p>
-            <w:proofErr w:type="spellStart"/>
             <w:r>
               <w:rPr>
                 <w:sz w:val="19"/>
@@ -2633,7 +2081,6 @@
               </w:rPr>
               <w:t>FilmID</w:t>
             </w:r>
-            <w:proofErr w:type="spellEnd"/>
           </w:p>
         </w:tc>
         <w:tc>
@@ -2684,23 +2131,7 @@
                 <w:sz w:val="19"/>
                 <w:szCs w:val="19"/>
               </w:rPr>
-              <w:t xml:space="preserve">The film being shown (Foreign Key to </w:t>
-            </w:r>
-            <w:proofErr w:type="spellStart"/>
-            <w:r>
-              <w:rPr>
-                <w:sz w:val="19"/>
-                <w:szCs w:val="19"/>
-              </w:rPr>
-              <w:t>tblFilm</w:t>
-            </w:r>
-            <w:proofErr w:type="spellEnd"/>
-            <w:r>
-              <w:rPr>
-                <w:sz w:val="19"/>
-                <w:szCs w:val="19"/>
-              </w:rPr>
-              <w:t>)</w:t>
+              <w:t>The film being shown (Foreign Key to tblFilm)</w:t>
             </w:r>
           </w:p>
         </w:tc>
@@ -2737,7 +2168,6 @@
             </w:tcMar>
           </w:tcPr>
           <w:p>
-            <w:proofErr w:type="spellStart"/>
             <w:r>
               <w:rPr>
                 <w:sz w:val="19"/>
@@ -2745,7 +2175,6 @@
               </w:rPr>
               <w:t>ScreenID</w:t>
             </w:r>
-            <w:proofErr w:type="spellEnd"/>
           </w:p>
         </w:tc>
         <w:tc>
@@ -2796,23 +2225,7 @@
                 <w:sz w:val="19"/>
                 <w:szCs w:val="19"/>
               </w:rPr>
-              <w:t xml:space="preserve">The screen it is shown in (Foreign Key to </w:t>
-            </w:r>
-            <w:proofErr w:type="spellStart"/>
-            <w:r>
-              <w:rPr>
-                <w:sz w:val="19"/>
-                <w:szCs w:val="19"/>
-              </w:rPr>
-              <w:t>tblScreen</w:t>
-            </w:r>
-            <w:proofErr w:type="spellEnd"/>
-            <w:r>
-              <w:rPr>
-                <w:sz w:val="19"/>
-                <w:szCs w:val="19"/>
-              </w:rPr>
-              <w:t>)</w:t>
+              <w:t>The screen it is shown in (Foreign Key to tblScreen)</w:t>
             </w:r>
           </w:p>
         </w:tc>
@@ -2849,7 +2262,6 @@
             </w:tcMar>
           </w:tcPr>
           <w:p>
-            <w:proofErr w:type="spellStart"/>
             <w:r>
               <w:rPr>
                 <w:sz w:val="19"/>
@@ -2857,7 +2269,6 @@
               </w:rPr>
               <w:t>ScreeningDate</w:t>
             </w:r>
-            <w:proofErr w:type="spellEnd"/>
           </w:p>
         </w:tc>
         <w:tc>
@@ -2945,7 +2356,6 @@
             </w:tcMar>
           </w:tcPr>
           <w:p>
-            <w:proofErr w:type="spellStart"/>
             <w:r>
               <w:rPr>
                 <w:sz w:val="19"/>
@@ -2953,7 +2363,6 @@
               </w:rPr>
               <w:t>ScreeningTime</w:t>
             </w:r>
-            <w:proofErr w:type="spellEnd"/>
           </w:p>
         </w:tc>
         <w:tc>
@@ -3049,7 +2458,6 @@
             </w:tcMar>
           </w:tcPr>
           <w:p>
-            <w:proofErr w:type="spellStart"/>
             <w:r>
               <w:rPr>
                 <w:sz w:val="19"/>
@@ -3057,7 +2465,6 @@
               </w:rPr>
               <w:t>TicketPrice</w:t>
             </w:r>
-            <w:proofErr w:type="spellEnd"/>
           </w:p>
         </w:tc>
         <w:tc>
@@ -3148,7 +2555,6 @@
           <w:color w:val="000000" w:themeColor="text1"/>
         </w:rPr>
       </w:pPr>
-      <w:proofErr w:type="spellStart"/>
       <w:r>
         <w:rPr>
           <w:b/>
@@ -3157,7 +2563,6 @@
         </w:rPr>
         <w:t>tblSeat</w:t>
       </w:r>
-      <w:proofErr w:type="spellEnd"/>
     </w:p>
     <w:p>
       <w:pPr>
@@ -3335,7 +2740,6 @@
             </w:tcMar>
           </w:tcPr>
           <w:p>
-            <w:proofErr w:type="spellStart"/>
             <w:r>
               <w:rPr>
                 <w:sz w:val="19"/>
@@ -3343,7 +2747,6 @@
               </w:rPr>
               <w:t>SeatID</w:t>
             </w:r>
-            <w:proofErr w:type="spellEnd"/>
           </w:p>
         </w:tc>
         <w:tc>
@@ -3431,7 +2834,6 @@
             </w:tcMar>
           </w:tcPr>
           <w:p>
-            <w:proofErr w:type="spellStart"/>
             <w:r>
               <w:rPr>
                 <w:sz w:val="19"/>
@@ -3439,7 +2841,6 @@
               </w:rPr>
               <w:t>ScreenID</w:t>
             </w:r>
-            <w:proofErr w:type="spellEnd"/>
           </w:p>
         </w:tc>
         <w:tc>
@@ -3490,23 +2891,7 @@
                 <w:sz w:val="19"/>
                 <w:szCs w:val="19"/>
               </w:rPr>
-              <w:t xml:space="preserve">The screen the seat belongs to (Foreign Key to </w:t>
-            </w:r>
-            <w:proofErr w:type="spellStart"/>
-            <w:r>
-              <w:rPr>
-                <w:sz w:val="19"/>
-                <w:szCs w:val="19"/>
-              </w:rPr>
-              <w:t>tblScreen</w:t>
-            </w:r>
-            <w:proofErr w:type="spellEnd"/>
-            <w:r>
-              <w:rPr>
-                <w:sz w:val="19"/>
-                <w:szCs w:val="19"/>
-              </w:rPr>
-              <w:t>)</w:t>
+              <w:t>The screen the seat belongs to (Foreign Key to tblScreen)</w:t>
             </w:r>
           </w:p>
         </w:tc>
@@ -3543,7 +2928,6 @@
             </w:tcMar>
           </w:tcPr>
           <w:p>
-            <w:proofErr w:type="spellStart"/>
             <w:r>
               <w:rPr>
                 <w:sz w:val="19"/>
@@ -3551,7 +2935,6 @@
               </w:rPr>
               <w:t>SeatRow</w:t>
             </w:r>
-            <w:proofErr w:type="spellEnd"/>
           </w:p>
         </w:tc>
         <w:tc>
@@ -3647,7 +3030,6 @@
             </w:tcMar>
           </w:tcPr>
           <w:p>
-            <w:proofErr w:type="spellStart"/>
             <w:r>
               <w:rPr>
                 <w:sz w:val="19"/>
@@ -3655,7 +3037,6 @@
               </w:rPr>
               <w:t>SeatNumber</w:t>
             </w:r>
-            <w:proofErr w:type="spellEnd"/>
           </w:p>
         </w:tc>
         <w:tc>
@@ -3746,7 +3127,6 @@
           <w:color w:val="000000" w:themeColor="text1"/>
         </w:rPr>
       </w:pPr>
-      <w:proofErr w:type="spellStart"/>
       <w:r>
         <w:rPr>
           <w:b/>
@@ -3755,7 +3135,6 @@
         </w:rPr>
         <w:t>tblCustomer</w:t>
       </w:r>
-      <w:proofErr w:type="spellEnd"/>
     </w:p>
     <w:p>
       <w:pPr>
@@ -3933,7 +3312,6 @@
             </w:tcMar>
           </w:tcPr>
           <w:p>
-            <w:proofErr w:type="spellStart"/>
             <w:r>
               <w:rPr>
                 <w:sz w:val="19"/>
@@ -3941,7 +3319,6 @@
               </w:rPr>
               <w:t>CustomerID</w:t>
             </w:r>
-            <w:proofErr w:type="spellEnd"/>
           </w:p>
         </w:tc>
         <w:tc>
@@ -4029,7 +3406,6 @@
             </w:tcMar>
           </w:tcPr>
           <w:p>
-            <w:proofErr w:type="spellStart"/>
             <w:r>
               <w:rPr>
                 <w:sz w:val="19"/>
@@ -4037,7 +3413,6 @@
               </w:rPr>
               <w:t>CustomerForename</w:t>
             </w:r>
-            <w:proofErr w:type="spellEnd"/>
           </w:p>
         </w:tc>
         <w:tc>
@@ -4133,7 +3508,6 @@
             </w:tcMar>
           </w:tcPr>
           <w:p>
-            <w:proofErr w:type="spellStart"/>
             <w:r>
               <w:rPr>
                 <w:sz w:val="19"/>
@@ -4141,7 +3515,6 @@
               </w:rPr>
               <w:t>CustomerSurname</w:t>
             </w:r>
-            <w:proofErr w:type="spellEnd"/>
           </w:p>
         </w:tc>
         <w:tc>
@@ -4237,7 +3610,6 @@
             </w:tcMar>
           </w:tcPr>
           <w:p>
-            <w:proofErr w:type="spellStart"/>
             <w:r>
               <w:rPr>
                 <w:sz w:val="19"/>
@@ -4245,7 +3617,6 @@
               </w:rPr>
               <w:t>CustomerEmail</w:t>
             </w:r>
-            <w:proofErr w:type="spellEnd"/>
           </w:p>
         </w:tc>
         <w:tc>
@@ -4341,7 +3712,6 @@
             </w:tcMar>
           </w:tcPr>
           <w:p>
-            <w:proofErr w:type="spellStart"/>
             <w:r>
               <w:rPr>
                 <w:sz w:val="19"/>
@@ -4349,7 +3719,6 @@
               </w:rPr>
               <w:t>CustomerPhone</w:t>
             </w:r>
-            <w:proofErr w:type="spellEnd"/>
           </w:p>
         </w:tc>
         <w:tc>
@@ -4448,7 +3817,6 @@
           <w:color w:val="000000" w:themeColor="text1"/>
         </w:rPr>
       </w:pPr>
-      <w:proofErr w:type="spellStart"/>
       <w:r>
         <w:rPr>
           <w:b/>
@@ -4457,7 +3825,6 @@
         </w:rPr>
         <w:t>tblBooking</w:t>
       </w:r>
-      <w:proofErr w:type="spellEnd"/>
     </w:p>
     <w:p>
       <w:pPr>
@@ -4635,7 +4002,6 @@
             </w:tcMar>
           </w:tcPr>
           <w:p>
-            <w:proofErr w:type="spellStart"/>
             <w:r>
               <w:rPr>
                 <w:sz w:val="19"/>
@@ -4643,7 +4009,6 @@
               </w:rPr>
               <w:t>BookingID</w:t>
             </w:r>
-            <w:proofErr w:type="spellEnd"/>
           </w:p>
         </w:tc>
         <w:tc>
@@ -4731,7 +4096,6 @@
             </w:tcMar>
           </w:tcPr>
           <w:p>
-            <w:proofErr w:type="spellStart"/>
             <w:r>
               <w:rPr>
                 <w:sz w:val="19"/>
@@ -4739,7 +4103,6 @@
               </w:rPr>
               <w:t>CustomerID</w:t>
             </w:r>
-            <w:proofErr w:type="spellEnd"/>
           </w:p>
         </w:tc>
         <w:tc>
@@ -4790,23 +4153,7 @@
                 <w:sz w:val="19"/>
                 <w:szCs w:val="19"/>
               </w:rPr>
-              <w:t xml:space="preserve">The customer who made the booking (Foreign Key to </w:t>
-            </w:r>
-            <w:proofErr w:type="spellStart"/>
-            <w:r>
-              <w:rPr>
-                <w:sz w:val="19"/>
-                <w:szCs w:val="19"/>
-              </w:rPr>
-              <w:t>tblCustomer</w:t>
-            </w:r>
-            <w:proofErr w:type="spellEnd"/>
-            <w:r>
-              <w:rPr>
-                <w:sz w:val="19"/>
-                <w:szCs w:val="19"/>
-              </w:rPr>
-              <w:t>)</w:t>
+              <w:t>The customer who made the booking (Foreign Key to tblCustomer)</w:t>
             </w:r>
           </w:p>
         </w:tc>
@@ -4843,7 +4190,6 @@
             </w:tcMar>
           </w:tcPr>
           <w:p>
-            <w:proofErr w:type="spellStart"/>
             <w:r>
               <w:rPr>
                 <w:sz w:val="19"/>
@@ -4851,7 +4197,6 @@
               </w:rPr>
               <w:t>ScreeningID</w:t>
             </w:r>
-            <w:proofErr w:type="spellEnd"/>
           </w:p>
         </w:tc>
         <w:tc>
@@ -4902,23 +4247,7 @@
                 <w:sz w:val="19"/>
                 <w:szCs w:val="19"/>
               </w:rPr>
-              <w:t xml:space="preserve">The screening booked (Foreign Key to </w:t>
-            </w:r>
-            <w:proofErr w:type="spellStart"/>
-            <w:r>
-              <w:rPr>
-                <w:sz w:val="19"/>
-                <w:szCs w:val="19"/>
-              </w:rPr>
-              <w:t>tblScreening</w:t>
-            </w:r>
-            <w:proofErr w:type="spellEnd"/>
-            <w:r>
-              <w:rPr>
-                <w:sz w:val="19"/>
-                <w:szCs w:val="19"/>
-              </w:rPr>
-              <w:t>)</w:t>
+              <w:t>The screening booked (Foreign Key to tblScreening)</w:t>
             </w:r>
           </w:p>
         </w:tc>
@@ -4955,7 +4284,6 @@
             </w:tcMar>
           </w:tcPr>
           <w:p>
-            <w:proofErr w:type="spellStart"/>
             <w:r>
               <w:rPr>
                 <w:sz w:val="19"/>
@@ -4963,7 +4291,6 @@
               </w:rPr>
               <w:t>BookingDate</w:t>
             </w:r>
-            <w:proofErr w:type="spellEnd"/>
           </w:p>
         </w:tc>
         <w:tc>
@@ -5051,7 +4378,6 @@
             </w:tcMar>
           </w:tcPr>
           <w:p>
-            <w:proofErr w:type="spellStart"/>
             <w:r>
               <w:rPr>
                 <w:sz w:val="19"/>
@@ -5059,7 +4385,6 @@
               </w:rPr>
               <w:t>TotalCost</w:t>
             </w:r>
-            <w:proofErr w:type="spellEnd"/>
           </w:p>
         </w:tc>
         <w:tc>
@@ -5150,7 +4475,6 @@
           <w:color w:val="000000" w:themeColor="text1"/>
         </w:rPr>
       </w:pPr>
-      <w:proofErr w:type="spellStart"/>
       <w:r>
         <w:rPr>
           <w:b/>
@@ -5159,7 +4483,6 @@
         </w:rPr>
         <w:t>tblBookingSeat</w:t>
       </w:r>
-      <w:proofErr w:type="spellEnd"/>
     </w:p>
     <w:p>
       <w:pPr>
@@ -5337,7 +4660,6 @@
             </w:tcMar>
           </w:tcPr>
           <w:p>
-            <w:proofErr w:type="spellStart"/>
             <w:r>
               <w:rPr>
                 <w:sz w:val="19"/>
@@ -5345,7 +4667,6 @@
               </w:rPr>
               <w:t>BookingSeatID</w:t>
             </w:r>
-            <w:proofErr w:type="spellEnd"/>
           </w:p>
         </w:tc>
         <w:tc>
@@ -5433,7 +4754,6 @@
             </w:tcMar>
           </w:tcPr>
           <w:p>
-            <w:proofErr w:type="spellStart"/>
             <w:r>
               <w:rPr>
                 <w:sz w:val="19"/>
@@ -5441,7 +4761,6 @@
               </w:rPr>
               <w:t>BookingID</w:t>
             </w:r>
-            <w:proofErr w:type="spellEnd"/>
           </w:p>
         </w:tc>
         <w:tc>
@@ -5492,23 +4811,7 @@
                 <w:sz w:val="19"/>
                 <w:szCs w:val="19"/>
               </w:rPr>
-              <w:t xml:space="preserve">The booking this seat belongs to (Foreign Key to </w:t>
-            </w:r>
-            <w:proofErr w:type="spellStart"/>
-            <w:r>
-              <w:rPr>
-                <w:sz w:val="19"/>
-                <w:szCs w:val="19"/>
-              </w:rPr>
-              <w:t>tblBooking</w:t>
-            </w:r>
-            <w:proofErr w:type="spellEnd"/>
-            <w:r>
-              <w:rPr>
-                <w:sz w:val="19"/>
-                <w:szCs w:val="19"/>
-              </w:rPr>
-              <w:t>)</w:t>
+              <w:t>The booking this seat belongs to (Foreign Key to tblBooking)</w:t>
             </w:r>
           </w:p>
         </w:tc>
@@ -5545,7 +4848,6 @@
             </w:tcMar>
           </w:tcPr>
           <w:p>
-            <w:proofErr w:type="spellStart"/>
             <w:r>
               <w:rPr>
                 <w:sz w:val="19"/>
@@ -5553,7 +4855,6 @@
               </w:rPr>
               <w:t>SeatID</w:t>
             </w:r>
-            <w:proofErr w:type="spellEnd"/>
           </w:p>
         </w:tc>
         <w:tc>
@@ -5604,23 +4905,7 @@
                 <w:sz w:val="19"/>
                 <w:szCs w:val="19"/>
               </w:rPr>
-              <w:t xml:space="preserve">The seat that was booked (Foreign Key to </w:t>
-            </w:r>
-            <w:proofErr w:type="spellStart"/>
-            <w:r>
-              <w:rPr>
-                <w:sz w:val="19"/>
-                <w:szCs w:val="19"/>
-              </w:rPr>
-              <w:t>tblSeat</w:t>
-            </w:r>
-            <w:proofErr w:type="spellEnd"/>
-            <w:r>
-              <w:rPr>
-                <w:sz w:val="19"/>
-                <w:szCs w:val="19"/>
-              </w:rPr>
-              <w:t>)</w:t>
+              <w:t>The seat that was booked (Foreign Key to tblSeat)</w:t>
             </w:r>
           </w:p>
         </w:tc>
@@ -5660,7 +4945,6 @@
           <w:color w:val="000000" w:themeColor="text1"/>
         </w:rPr>
       </w:pPr>
-      <w:proofErr w:type="spellStart"/>
       <w:r>
         <w:rPr>
           <w:b/>
@@ -5669,7 +4953,6 @@
         </w:rPr>
         <w:t>tblFoodItem</w:t>
       </w:r>
-      <w:proofErr w:type="spellEnd"/>
     </w:p>
     <w:p>
       <w:pPr>
@@ -5847,7 +5130,6 @@
             </w:tcMar>
           </w:tcPr>
           <w:p>
-            <w:proofErr w:type="spellStart"/>
             <w:r>
               <w:rPr>
                 <w:sz w:val="19"/>
@@ -5855,7 +5137,6 @@
               </w:rPr>
               <w:t>FoodItemID</w:t>
             </w:r>
-            <w:proofErr w:type="spellEnd"/>
           </w:p>
         </w:tc>
         <w:tc>
@@ -5943,7 +5224,6 @@
             </w:tcMar>
           </w:tcPr>
           <w:p>
-            <w:proofErr w:type="spellStart"/>
             <w:r>
               <w:rPr>
                 <w:sz w:val="19"/>
@@ -5951,7 +5231,6 @@
               </w:rPr>
               <w:t>FoodItemName</w:t>
             </w:r>
-            <w:proofErr w:type="spellEnd"/>
           </w:p>
         </w:tc>
         <w:tc>
@@ -6047,7 +5326,6 @@
             </w:tcMar>
           </w:tcPr>
           <w:p>
-            <w:proofErr w:type="spellStart"/>
             <w:r>
               <w:rPr>
                 <w:sz w:val="19"/>
@@ -6055,7 +5333,6 @@
               </w:rPr>
               <w:t>FoodItemPrice</w:t>
             </w:r>
-            <w:proofErr w:type="spellEnd"/>
           </w:p>
         </w:tc>
         <w:tc>
@@ -6143,7 +5420,6 @@
             </w:tcMar>
           </w:tcPr>
           <w:p>
-            <w:proofErr w:type="spellStart"/>
             <w:r>
               <w:rPr>
                 <w:sz w:val="19"/>
@@ -6151,7 +5427,6 @@
               </w:rPr>
               <w:t>FoodItemCategory</w:t>
             </w:r>
-            <w:proofErr w:type="spellEnd"/>
           </w:p>
         </w:tc>
         <w:tc>
@@ -6250,7 +5525,6 @@
           <w:color w:val="000000" w:themeColor="text1"/>
         </w:rPr>
       </w:pPr>
-      <w:proofErr w:type="spellStart"/>
       <w:r>
         <w:rPr>
           <w:b/>
@@ -6259,7 +5533,6 @@
         </w:rPr>
         <w:t>tblOrderItem</w:t>
       </w:r>
-      <w:proofErr w:type="spellEnd"/>
     </w:p>
     <w:p>
       <w:pPr>
@@ -6437,7 +5710,6 @@
             </w:tcMar>
           </w:tcPr>
           <w:p>
-            <w:proofErr w:type="spellStart"/>
             <w:r>
               <w:rPr>
                 <w:sz w:val="19"/>
@@ -6445,7 +5717,6 @@
               </w:rPr>
               <w:t>OrderItemID</w:t>
             </w:r>
-            <w:proofErr w:type="spellEnd"/>
           </w:p>
         </w:tc>
         <w:tc>
@@ -6533,7 +5804,6 @@
             </w:tcMar>
           </w:tcPr>
           <w:p>
-            <w:proofErr w:type="spellStart"/>
             <w:r>
               <w:rPr>
                 <w:sz w:val="19"/>
@@ -6541,7 +5811,6 @@
               </w:rPr>
               <w:t>BookingID</w:t>
             </w:r>
-            <w:proofErr w:type="spellEnd"/>
           </w:p>
         </w:tc>
         <w:tc>
@@ -6592,23 +5861,7 @@
                 <w:sz w:val="19"/>
                 <w:szCs w:val="19"/>
               </w:rPr>
-              <w:t xml:space="preserve">The booking the item was added to (Foreign Key to </w:t>
-            </w:r>
-            <w:proofErr w:type="spellStart"/>
-            <w:r>
-              <w:rPr>
-                <w:sz w:val="19"/>
-                <w:szCs w:val="19"/>
-              </w:rPr>
-              <w:t>tblBooking</w:t>
-            </w:r>
-            <w:proofErr w:type="spellEnd"/>
-            <w:r>
-              <w:rPr>
-                <w:sz w:val="19"/>
-                <w:szCs w:val="19"/>
-              </w:rPr>
-              <w:t>)</w:t>
+              <w:t>The booking the item was added to (Foreign Key to tblBooking)</w:t>
             </w:r>
           </w:p>
         </w:tc>
@@ -6645,7 +5898,6 @@
             </w:tcMar>
           </w:tcPr>
           <w:p>
-            <w:proofErr w:type="spellStart"/>
             <w:r>
               <w:rPr>
                 <w:sz w:val="19"/>
@@ -6653,7 +5905,6 @@
               </w:rPr>
               <w:t>FoodItemID</w:t>
             </w:r>
-            <w:proofErr w:type="spellEnd"/>
           </w:p>
         </w:tc>
         <w:tc>
@@ -6704,23 +5955,7 @@
                 <w:sz w:val="19"/>
                 <w:szCs w:val="19"/>
               </w:rPr>
-              <w:t xml:space="preserve">The food item ordered (Foreign Key to </w:t>
-            </w:r>
-            <w:proofErr w:type="spellStart"/>
-            <w:r>
-              <w:rPr>
-                <w:sz w:val="19"/>
-                <w:szCs w:val="19"/>
-              </w:rPr>
-              <w:t>tblFoodItem</w:t>
-            </w:r>
-            <w:proofErr w:type="spellEnd"/>
-            <w:r>
-              <w:rPr>
-                <w:sz w:val="19"/>
-                <w:szCs w:val="19"/>
-              </w:rPr>
-              <w:t>)</w:t>
+              <w:t>The food item ordered (Foreign Key to tblFoodItem)</w:t>
             </w:r>
           </w:p>
         </w:tc>
@@ -6854,7 +6089,6 @@
           <w:color w:val="000000" w:themeColor="text1"/>
         </w:rPr>
       </w:pPr>
-      <w:proofErr w:type="spellStart"/>
       <w:r>
         <w:rPr>
           <w:b/>
@@ -6863,7 +6097,6 @@
         </w:rPr>
         <w:t>tblLogin</w:t>
       </w:r>
-      <w:proofErr w:type="spellEnd"/>
     </w:p>
     <w:p>
       <w:pPr>
@@ -7041,7 +6274,6 @@
             </w:tcMar>
           </w:tcPr>
           <w:p>
-            <w:proofErr w:type="spellStart"/>
             <w:r>
               <w:rPr>
                 <w:sz w:val="19"/>
@@ -7049,7 +6281,6 @@
               </w:rPr>
               <w:t>LoginID</w:t>
             </w:r>
-            <w:proofErr w:type="spellEnd"/>
           </w:p>
         </w:tc>
         <w:tc>
@@ -7319,7 +6550,6 @@
             </w:tcMar>
           </w:tcPr>
           <w:p>
-            <w:proofErr w:type="spellStart"/>
             <w:r>
               <w:rPr>
                 <w:sz w:val="19"/>
@@ -7327,7 +6557,6 @@
               </w:rPr>
               <w:t>MTIz</w:t>
             </w:r>
-            <w:proofErr w:type="spellEnd"/>
           </w:p>
         </w:tc>
       </w:tr>
@@ -7343,7 +6572,6 @@
             </w:tcMar>
           </w:tcPr>
           <w:p>
-            <w:proofErr w:type="spellStart"/>
             <w:r>
               <w:rPr>
                 <w:sz w:val="19"/>
@@ -7351,7 +6579,6 @@
               </w:rPr>
               <w:t>AccessLevel</w:t>
             </w:r>
-            <w:proofErr w:type="spellEnd"/>
           </w:p>
         </w:tc>
         <w:tc>
@@ -7442,7 +6669,6 @@
           <w:color w:val="000000" w:themeColor="text1"/>
         </w:rPr>
       </w:pPr>
-      <w:proofErr w:type="spellStart"/>
       <w:r>
         <w:rPr>
           <w:b/>
@@ -7451,7 +6677,6 @@
         </w:rPr>
         <w:t>tblLogs</w:t>
       </w:r>
-      <w:proofErr w:type="spellEnd"/>
     </w:p>
     <w:p>
       <w:pPr>
@@ -7629,7 +6854,6 @@
             </w:tcMar>
           </w:tcPr>
           <w:p>
-            <w:proofErr w:type="spellStart"/>
             <w:r>
               <w:rPr>
                 <w:sz w:val="19"/>
@@ -7637,7 +6861,6 @@
               </w:rPr>
               <w:t>LogID</w:t>
             </w:r>
-            <w:proofErr w:type="spellEnd"/>
           </w:p>
         </w:tc>
         <w:tc>
@@ -7725,7 +6948,6 @@
             </w:tcMar>
           </w:tcPr>
           <w:p>
-            <w:proofErr w:type="spellStart"/>
             <w:r>
               <w:rPr>
                 <w:sz w:val="19"/>
@@ -7733,7 +6955,6 @@
               </w:rPr>
               <w:t>LogDateTime</w:t>
             </w:r>
-            <w:proofErr w:type="spellEnd"/>
           </w:p>
         </w:tc>
         <w:tc>
@@ -7821,7 +7042,6 @@
             </w:tcMar>
           </w:tcPr>
           <w:p>
-            <w:proofErr w:type="spellStart"/>
             <w:r>
               <w:rPr>
                 <w:sz w:val="19"/>
@@ -7829,7 +7049,6 @@
               </w:rPr>
               <w:t>LogType</w:t>
             </w:r>
-            <w:proofErr w:type="spellEnd"/>
           </w:p>
         </w:tc>
         <w:tc>
@@ -7925,7 +7144,6 @@
             </w:tcMar>
           </w:tcPr>
           <w:p>
-            <w:proofErr w:type="spellStart"/>
             <w:r>
               <w:rPr>
                 <w:sz w:val="19"/>
@@ -7933,7 +7151,6 @@
               </w:rPr>
               <w:t>LogMessage</w:t>
             </w:r>
-            <w:proofErr w:type="spellEnd"/>
           </w:p>
         </w:tc>
         <w:tc>
@@ -8024,7 +7241,6 @@
           <w:color w:val="000000" w:themeColor="text1"/>
         </w:rPr>
       </w:pPr>
-      <w:proofErr w:type="spellStart"/>
       <w:r>
         <w:rPr>
           <w:b/>
@@ -8033,7 +7249,6 @@
         </w:rPr>
         <w:t>tblVersionControl</w:t>
       </w:r>
-      <w:proofErr w:type="spellEnd"/>
     </w:p>
     <w:p>
       <w:pPr>
@@ -8331,15 +7546,7 @@
         <w:spacing w:after="160" w:line="276" w:lineRule="auto"/>
       </w:pPr>
       <w:r>
-        <w:t xml:space="preserve">This section describes the processing that takes place inside the </w:t>
-      </w:r>
-      <w:proofErr w:type="spellStart"/>
-      <w:r>
-        <w:t>Filmtopia</w:t>
-      </w:r>
-      <w:proofErr w:type="spellEnd"/>
-      <w:r>
-        <w:t xml:space="preserve"> system. Rather than listing every button on every form it focuses on the stages where there is real logic going on, since these are the parts of the system that need to be thought through carefully before any code is written. Each stage is described in plain English pseudocode rather than in Visual Basic, so that the logic is clear and separate from the eventual code, and the two most important algorithms are also shown as flowcharts. Each stage is linked back to the objectives it helps to meet.</w:t>
+        <w:t>This section describes the processing that takes place inside the Filmtopia system. Rather than listing every button on every form it focuses on the stages where there is real logic going on, since these are the parts of the system that need to be thought through carefully before any code is written. Each stage is described in plain English pseudocode rather than in Visual Basic, so that the logic is clear and separate from the eventual code, and the two most important algorithms are also shown as flowcharts. Each stage is linked back to the objectives it helps to meet.</w:t>
       </w:r>
     </w:p>
     <w:p>
@@ -8455,25 +7662,27 @@
                 <w:sz w:val="19"/>
                 <w:szCs w:val="19"/>
               </w:rPr>
-              <w:t xml:space="preserve">    LOOK UP the username in </w:t>
-            </w:r>
-            <w:proofErr w:type="spellStart"/>
+              <w:t xml:space="preserve">    LOOK UP the username in tblLogin using an SQL SELECT query</w:t>
+            </w:r>
+          </w:p>
+          <w:p>
             <w:r>
               <w:rPr>
                 <w:rFonts w:ascii="Courier New" w:eastAsia="Courier New" w:hAnsi="Courier New" w:cs="Courier New"/>
                 <w:sz w:val="19"/>
                 <w:szCs w:val="19"/>
               </w:rPr>
-              <w:t>tblLogin</w:t>
-            </w:r>
-            <w:proofErr w:type="spellEnd"/>
+              <w:t xml:space="preserve">    IF no matching username is found THEN</w:t>
+            </w:r>
+          </w:p>
+          <w:p>
             <w:r>
               <w:rPr>
                 <w:rFonts w:ascii="Courier New" w:eastAsia="Courier New" w:hAnsi="Courier New" w:cs="Courier New"/>
                 <w:sz w:val="19"/>
                 <w:szCs w:val="19"/>
               </w:rPr>
-              <w:t xml:space="preserve"> using an SQL SELECT query</w:t>
+              <w:t xml:space="preserve">        DISPLAY "Login details not recognised"</w:t>
             </w:r>
           </w:p>
           <w:p>
@@ -8483,7 +7692,7 @@
                 <w:sz w:val="19"/>
                 <w:szCs w:val="19"/>
               </w:rPr>
-              <w:t xml:space="preserve">    IF no matching username is found THEN</w:t>
+              <w:t xml:space="preserve">    ELSE IF the stored password does not match the encoded password THEN</w:t>
             </w:r>
           </w:p>
           <w:p>
@@ -8503,7 +7712,7 @@
                 <w:sz w:val="19"/>
                 <w:szCs w:val="19"/>
               </w:rPr>
-              <w:t xml:space="preserve">    ELSE IF the stored password does not match the encoded password THEN</w:t>
+              <w:t xml:space="preserve">    ELSE</w:t>
             </w:r>
           </w:p>
           <w:p>
@@ -8513,45 +7722,7 @@
                 <w:sz w:val="19"/>
                 <w:szCs w:val="19"/>
               </w:rPr>
-              <w:t xml:space="preserve">        DISPLAY "Login details not recognised"</w:t>
-            </w:r>
-          </w:p>
-          <w:p>
-            <w:r>
-              <w:rPr>
-                <w:rFonts w:ascii="Courier New" w:eastAsia="Courier New" w:hAnsi="Courier New" w:cs="Courier New"/>
-                <w:sz w:val="19"/>
-                <w:szCs w:val="19"/>
-              </w:rPr>
-              <w:t xml:space="preserve">    ELSE</w:t>
-            </w:r>
-          </w:p>
-          <w:p>
-            <w:r>
-              <w:rPr>
-                <w:rFonts w:ascii="Courier New" w:eastAsia="Courier New" w:hAnsi="Courier New" w:cs="Courier New"/>
-                <w:sz w:val="19"/>
-                <w:szCs w:val="19"/>
-              </w:rPr>
-              <w:t xml:space="preserve">        STORE the user's </w:t>
-            </w:r>
-            <w:proofErr w:type="spellStart"/>
-            <w:r>
-              <w:rPr>
-                <w:rFonts w:ascii="Courier New" w:eastAsia="Courier New" w:hAnsi="Courier New" w:cs="Courier New"/>
-                <w:sz w:val="19"/>
-                <w:szCs w:val="19"/>
-              </w:rPr>
-              <w:t>AccessLevel</w:t>
-            </w:r>
-            <w:proofErr w:type="spellEnd"/>
-            <w:r>
-              <w:rPr>
-                <w:rFonts w:ascii="Courier New" w:eastAsia="Courier New" w:hAnsi="Courier New" w:cs="Courier New"/>
-                <w:sz w:val="19"/>
-                <w:szCs w:val="19"/>
-              </w:rPr>
-              <w:t xml:space="preserve"> for the session</w:t>
+              <w:t xml:space="preserve">        STORE the user's AccessLevel for the session</w:t>
             </w:r>
           </w:p>
           <w:p>
@@ -8752,25 +7923,27 @@
                 <w:sz w:val="19"/>
                 <w:szCs w:val="19"/>
               </w:rPr>
-              <w:t xml:space="preserve">SET </w:t>
-            </w:r>
-            <w:proofErr w:type="spellStart"/>
+              <w:t>SET seatsPerRow to 10</w:t>
+            </w:r>
+          </w:p>
+          <w:p>
             <w:r>
               <w:rPr>
                 <w:rFonts w:ascii="Courier New" w:eastAsia="Courier New" w:hAnsi="Courier New" w:cs="Courier New"/>
                 <w:sz w:val="19"/>
                 <w:szCs w:val="19"/>
               </w:rPr>
-              <w:t>seatsPerRow</w:t>
-            </w:r>
-            <w:proofErr w:type="spellEnd"/>
+              <w:t>SET rowLetter to "A"</w:t>
+            </w:r>
+          </w:p>
+          <w:p>
             <w:r>
               <w:rPr>
                 <w:rFonts w:ascii="Courier New" w:eastAsia="Courier New" w:hAnsi="Courier New" w:cs="Courier New"/>
                 <w:sz w:val="19"/>
                 <w:szCs w:val="19"/>
               </w:rPr>
-              <w:t xml:space="preserve"> to 10</w:t>
+              <w:t>SET seatsMade to 0</w:t>
             </w:r>
           </w:p>
           <w:p>
@@ -8780,25 +7953,27 @@
                 <w:sz w:val="19"/>
                 <w:szCs w:val="19"/>
               </w:rPr>
-              <w:t xml:space="preserve">SET </w:t>
-            </w:r>
-            <w:proofErr w:type="spellStart"/>
+              <w:t>WHILE seatsMade is less than capacity</w:t>
+            </w:r>
+          </w:p>
+          <w:p>
             <w:r>
               <w:rPr>
                 <w:rFonts w:ascii="Courier New" w:eastAsia="Courier New" w:hAnsi="Courier New" w:cs="Courier New"/>
                 <w:sz w:val="19"/>
                 <w:szCs w:val="19"/>
               </w:rPr>
-              <w:t>rowLetter</w:t>
-            </w:r>
-            <w:proofErr w:type="spellEnd"/>
+              <w:t xml:space="preserve">    FOR seatNumber from 1 to seatsPerRow</w:t>
+            </w:r>
+          </w:p>
+          <w:p>
             <w:r>
               <w:rPr>
                 <w:rFonts w:ascii="Courier New" w:eastAsia="Courier New" w:hAnsi="Courier New" w:cs="Courier New"/>
                 <w:sz w:val="19"/>
                 <w:szCs w:val="19"/>
               </w:rPr>
-              <w:t xml:space="preserve"> to "A"</w:t>
+              <w:t xml:space="preserve">        IF seatsMade is less than capacity THEN</w:t>
             </w:r>
           </w:p>
           <w:p>
@@ -8808,25 +7983,27 @@
                 <w:sz w:val="19"/>
                 <w:szCs w:val="19"/>
               </w:rPr>
-              <w:t xml:space="preserve">SET </w:t>
-            </w:r>
-            <w:proofErr w:type="spellStart"/>
+              <w:t xml:space="preserve">            INSERT a seat into tblSeat with the current ScreenID,</w:t>
+            </w:r>
+          </w:p>
+          <w:p>
             <w:r>
               <w:rPr>
                 <w:rFonts w:ascii="Courier New" w:eastAsia="Courier New" w:hAnsi="Courier New" w:cs="Courier New"/>
                 <w:sz w:val="19"/>
                 <w:szCs w:val="19"/>
               </w:rPr>
-              <w:t>seatsMade</w:t>
-            </w:r>
-            <w:proofErr w:type="spellEnd"/>
+              <w:t xml:space="preserve">                   rowLetter and seatNumber using an SQL INSERT</w:t>
+            </w:r>
+          </w:p>
+          <w:p>
             <w:r>
               <w:rPr>
                 <w:rFonts w:ascii="Courier New" w:eastAsia="Courier New" w:hAnsi="Courier New" w:cs="Courier New"/>
                 <w:sz w:val="19"/>
                 <w:szCs w:val="19"/>
               </w:rPr>
-              <w:t xml:space="preserve"> to 0</w:t>
+              <w:t xml:space="preserve">            ADD 1 to seatsMade</w:t>
             </w:r>
           </w:p>
           <w:p>
@@ -8836,261 +8013,27 @@
                 <w:sz w:val="19"/>
                 <w:szCs w:val="19"/>
               </w:rPr>
-              <w:t xml:space="preserve">WHILE </w:t>
-            </w:r>
-            <w:proofErr w:type="spellStart"/>
+              <w:t xml:space="preserve">        END IF</w:t>
+            </w:r>
+          </w:p>
+          <w:p>
             <w:r>
               <w:rPr>
                 <w:rFonts w:ascii="Courier New" w:eastAsia="Courier New" w:hAnsi="Courier New" w:cs="Courier New"/>
                 <w:sz w:val="19"/>
                 <w:szCs w:val="19"/>
               </w:rPr>
-              <w:t>seatsMade</w:t>
-            </w:r>
-            <w:proofErr w:type="spellEnd"/>
+              <w:t xml:space="preserve">    NEXT seatNumber</w:t>
+            </w:r>
+          </w:p>
+          <w:p>
             <w:r>
               <w:rPr>
                 <w:rFonts w:ascii="Courier New" w:eastAsia="Courier New" w:hAnsi="Courier New" w:cs="Courier New"/>
                 <w:sz w:val="19"/>
                 <w:szCs w:val="19"/>
               </w:rPr>
-              <w:t xml:space="preserve"> is less than capacity</w:t>
-            </w:r>
-          </w:p>
-          <w:p>
-            <w:r>
-              <w:rPr>
-                <w:rFonts w:ascii="Courier New" w:eastAsia="Courier New" w:hAnsi="Courier New" w:cs="Courier New"/>
-                <w:sz w:val="19"/>
-                <w:szCs w:val="19"/>
-              </w:rPr>
-              <w:t xml:space="preserve">    FOR </w:t>
-            </w:r>
-            <w:proofErr w:type="spellStart"/>
-            <w:r>
-              <w:rPr>
-                <w:rFonts w:ascii="Courier New" w:eastAsia="Courier New" w:hAnsi="Courier New" w:cs="Courier New"/>
-                <w:sz w:val="19"/>
-                <w:szCs w:val="19"/>
-              </w:rPr>
-              <w:t>seatNumber</w:t>
-            </w:r>
-            <w:proofErr w:type="spellEnd"/>
-            <w:r>
-              <w:rPr>
-                <w:rFonts w:ascii="Courier New" w:eastAsia="Courier New" w:hAnsi="Courier New" w:cs="Courier New"/>
-                <w:sz w:val="19"/>
-                <w:szCs w:val="19"/>
-              </w:rPr>
-              <w:t xml:space="preserve"> from 1 to </w:t>
-            </w:r>
-            <w:proofErr w:type="spellStart"/>
-            <w:r>
-              <w:rPr>
-                <w:rFonts w:ascii="Courier New" w:eastAsia="Courier New" w:hAnsi="Courier New" w:cs="Courier New"/>
-                <w:sz w:val="19"/>
-                <w:szCs w:val="19"/>
-              </w:rPr>
-              <w:t>seatsPerRow</w:t>
-            </w:r>
-            <w:proofErr w:type="spellEnd"/>
-          </w:p>
-          <w:p>
-            <w:r>
-              <w:rPr>
-                <w:rFonts w:ascii="Courier New" w:eastAsia="Courier New" w:hAnsi="Courier New" w:cs="Courier New"/>
-                <w:sz w:val="19"/>
-                <w:szCs w:val="19"/>
-              </w:rPr>
-              <w:t xml:space="preserve">        IF </w:t>
-            </w:r>
-            <w:proofErr w:type="spellStart"/>
-            <w:r>
-              <w:rPr>
-                <w:rFonts w:ascii="Courier New" w:eastAsia="Courier New" w:hAnsi="Courier New" w:cs="Courier New"/>
-                <w:sz w:val="19"/>
-                <w:szCs w:val="19"/>
-              </w:rPr>
-              <w:t>seatsMade</w:t>
-            </w:r>
-            <w:proofErr w:type="spellEnd"/>
-            <w:r>
-              <w:rPr>
-                <w:rFonts w:ascii="Courier New" w:eastAsia="Courier New" w:hAnsi="Courier New" w:cs="Courier New"/>
-                <w:sz w:val="19"/>
-                <w:szCs w:val="19"/>
-              </w:rPr>
-              <w:t xml:space="preserve"> is less than capacity THEN</w:t>
-            </w:r>
-          </w:p>
-          <w:p>
-            <w:r>
-              <w:rPr>
-                <w:rFonts w:ascii="Courier New" w:eastAsia="Courier New" w:hAnsi="Courier New" w:cs="Courier New"/>
-                <w:sz w:val="19"/>
-                <w:szCs w:val="19"/>
-              </w:rPr>
-              <w:t xml:space="preserve">            INSERT a seat into </w:t>
-            </w:r>
-            <w:proofErr w:type="spellStart"/>
-            <w:r>
-              <w:rPr>
-                <w:rFonts w:ascii="Courier New" w:eastAsia="Courier New" w:hAnsi="Courier New" w:cs="Courier New"/>
-                <w:sz w:val="19"/>
-                <w:szCs w:val="19"/>
-              </w:rPr>
-              <w:t>tblSeat</w:t>
-            </w:r>
-            <w:proofErr w:type="spellEnd"/>
-            <w:r>
-              <w:rPr>
-                <w:rFonts w:ascii="Courier New" w:eastAsia="Courier New" w:hAnsi="Courier New" w:cs="Courier New"/>
-                <w:sz w:val="19"/>
-                <w:szCs w:val="19"/>
-              </w:rPr>
-              <w:t xml:space="preserve"> with the current </w:t>
-            </w:r>
-            <w:proofErr w:type="spellStart"/>
-            <w:r>
-              <w:rPr>
-                <w:rFonts w:ascii="Courier New" w:eastAsia="Courier New" w:hAnsi="Courier New" w:cs="Courier New"/>
-                <w:sz w:val="19"/>
-                <w:szCs w:val="19"/>
-              </w:rPr>
-              <w:t>ScreenID</w:t>
-            </w:r>
-            <w:proofErr w:type="spellEnd"/>
-            <w:r>
-              <w:rPr>
-                <w:rFonts w:ascii="Courier New" w:eastAsia="Courier New" w:hAnsi="Courier New" w:cs="Courier New"/>
-                <w:sz w:val="19"/>
-                <w:szCs w:val="19"/>
-              </w:rPr>
-              <w:t>,</w:t>
-            </w:r>
-          </w:p>
-          <w:p>
-            <w:r>
-              <w:rPr>
-                <w:rFonts w:ascii="Courier New" w:eastAsia="Courier New" w:hAnsi="Courier New" w:cs="Courier New"/>
-                <w:sz w:val="19"/>
-                <w:szCs w:val="19"/>
-              </w:rPr>
-              <w:t xml:space="preserve">                   </w:t>
-            </w:r>
-            <w:proofErr w:type="spellStart"/>
-            <w:r>
-              <w:rPr>
-                <w:rFonts w:ascii="Courier New" w:eastAsia="Courier New" w:hAnsi="Courier New" w:cs="Courier New"/>
-                <w:sz w:val="19"/>
-                <w:szCs w:val="19"/>
-              </w:rPr>
-              <w:t>rowLetter</w:t>
-            </w:r>
-            <w:proofErr w:type="spellEnd"/>
-            <w:r>
-              <w:rPr>
-                <w:rFonts w:ascii="Courier New" w:eastAsia="Courier New" w:hAnsi="Courier New" w:cs="Courier New"/>
-                <w:sz w:val="19"/>
-                <w:szCs w:val="19"/>
-              </w:rPr>
-              <w:t xml:space="preserve"> and </w:t>
-            </w:r>
-            <w:proofErr w:type="spellStart"/>
-            <w:r>
-              <w:rPr>
-                <w:rFonts w:ascii="Courier New" w:eastAsia="Courier New" w:hAnsi="Courier New" w:cs="Courier New"/>
-                <w:sz w:val="19"/>
-                <w:szCs w:val="19"/>
-              </w:rPr>
-              <w:t>seatNumber</w:t>
-            </w:r>
-            <w:proofErr w:type="spellEnd"/>
-            <w:r>
-              <w:rPr>
-                <w:rFonts w:ascii="Courier New" w:eastAsia="Courier New" w:hAnsi="Courier New" w:cs="Courier New"/>
-                <w:sz w:val="19"/>
-                <w:szCs w:val="19"/>
-              </w:rPr>
-              <w:t xml:space="preserve"> using an SQL INSERT</w:t>
-            </w:r>
-          </w:p>
-          <w:p>
-            <w:r>
-              <w:rPr>
-                <w:rFonts w:ascii="Courier New" w:eastAsia="Courier New" w:hAnsi="Courier New" w:cs="Courier New"/>
-                <w:sz w:val="19"/>
-                <w:szCs w:val="19"/>
-              </w:rPr>
-              <w:t xml:space="preserve">            ADD 1 to </w:t>
-            </w:r>
-            <w:proofErr w:type="spellStart"/>
-            <w:r>
-              <w:rPr>
-                <w:rFonts w:ascii="Courier New" w:eastAsia="Courier New" w:hAnsi="Courier New" w:cs="Courier New"/>
-                <w:sz w:val="19"/>
-                <w:szCs w:val="19"/>
-              </w:rPr>
-              <w:t>seatsMade</w:t>
-            </w:r>
-            <w:proofErr w:type="spellEnd"/>
-          </w:p>
-          <w:p>
-            <w:r>
-              <w:rPr>
-                <w:rFonts w:ascii="Courier New" w:eastAsia="Courier New" w:hAnsi="Courier New" w:cs="Courier New"/>
-                <w:sz w:val="19"/>
-                <w:szCs w:val="19"/>
-              </w:rPr>
-              <w:t xml:space="preserve">        END IF</w:t>
-            </w:r>
-          </w:p>
-          <w:p>
-            <w:r>
-              <w:rPr>
-                <w:rFonts w:ascii="Courier New" w:eastAsia="Courier New" w:hAnsi="Courier New" w:cs="Courier New"/>
-                <w:sz w:val="19"/>
-                <w:szCs w:val="19"/>
-              </w:rPr>
-              <w:t xml:space="preserve">    NEXT </w:t>
-            </w:r>
-            <w:proofErr w:type="spellStart"/>
-            <w:r>
-              <w:rPr>
-                <w:rFonts w:ascii="Courier New" w:eastAsia="Courier New" w:hAnsi="Courier New" w:cs="Courier New"/>
-                <w:sz w:val="19"/>
-                <w:szCs w:val="19"/>
-              </w:rPr>
-              <w:t>seatNumber</w:t>
-            </w:r>
-            <w:proofErr w:type="spellEnd"/>
-          </w:p>
-          <w:p>
-            <w:r>
-              <w:rPr>
-                <w:rFonts w:ascii="Courier New" w:eastAsia="Courier New" w:hAnsi="Courier New" w:cs="Courier New"/>
-                <w:sz w:val="19"/>
-                <w:szCs w:val="19"/>
-              </w:rPr>
-              <w:t xml:space="preserve">    MOVE </w:t>
-            </w:r>
-            <w:proofErr w:type="spellStart"/>
-            <w:r>
-              <w:rPr>
-                <w:rFonts w:ascii="Courier New" w:eastAsia="Courier New" w:hAnsi="Courier New" w:cs="Courier New"/>
-                <w:sz w:val="19"/>
-                <w:szCs w:val="19"/>
-              </w:rPr>
-              <w:t>rowLetter</w:t>
-            </w:r>
-            <w:proofErr w:type="spellEnd"/>
-            <w:r>
-              <w:rPr>
-                <w:rFonts w:ascii="Courier New" w:eastAsia="Courier New" w:hAnsi="Courier New" w:cs="Courier New"/>
-                <w:sz w:val="19"/>
-                <w:szCs w:val="19"/>
-              </w:rPr>
-              <w:t xml:space="preserve"> on to the next letter of the alphabet</w:t>
+              <w:t xml:space="preserve">    MOVE rowLetter on to the next letter of the alphabet</w:t>
             </w:r>
           </w:p>
           <w:p>
@@ -9226,43 +8169,47 @@
                 <w:sz w:val="19"/>
                 <w:szCs w:val="19"/>
               </w:rPr>
-              <w:t xml:space="preserve">    LOOK UP </w:t>
-            </w:r>
-            <w:proofErr w:type="spellStart"/>
+              <w:t xml:space="preserve">    LOOK UP tblBookingSeat joined to tblBooking to see whether</w:t>
+            </w:r>
+          </w:p>
+          <w:p>
             <w:r>
               <w:rPr>
                 <w:rFonts w:ascii="Courier New" w:eastAsia="Courier New" w:hAnsi="Courier New" w:cs="Courier New"/>
                 <w:sz w:val="19"/>
                 <w:szCs w:val="19"/>
               </w:rPr>
-              <w:t>tblBookingSeat</w:t>
-            </w:r>
-            <w:proofErr w:type="spellEnd"/>
+              <w:t xml:space="preserve">        that seat is already booked for this screening (SQL SELECT)</w:t>
+            </w:r>
+          </w:p>
+          <w:p>
             <w:r>
               <w:rPr>
                 <w:rFonts w:ascii="Courier New" w:eastAsia="Courier New" w:hAnsi="Courier New" w:cs="Courier New"/>
                 <w:sz w:val="19"/>
                 <w:szCs w:val="19"/>
               </w:rPr>
-              <w:t xml:space="preserve"> joined to </w:t>
-            </w:r>
-            <w:proofErr w:type="spellStart"/>
+              <w:t xml:space="preserve">    IF the seat is already booked THEN</w:t>
+            </w:r>
+          </w:p>
+          <w:p>
             <w:r>
               <w:rPr>
                 <w:rFonts w:ascii="Courier New" w:eastAsia="Courier New" w:hAnsi="Courier New" w:cs="Courier New"/>
                 <w:sz w:val="19"/>
                 <w:szCs w:val="19"/>
               </w:rPr>
-              <w:t>tblBooking</w:t>
-            </w:r>
-            <w:proofErr w:type="spellEnd"/>
+              <w:t xml:space="preserve">        DISPLAY "One or more of the selected seats has been taken"</w:t>
+            </w:r>
+          </w:p>
+          <w:p>
             <w:r>
               <w:rPr>
                 <w:rFonts w:ascii="Courier New" w:eastAsia="Courier New" w:hAnsi="Courier New" w:cs="Courier New"/>
                 <w:sz w:val="19"/>
                 <w:szCs w:val="19"/>
               </w:rPr>
-              <w:t xml:space="preserve"> to see whether</w:t>
+              <w:t xml:space="preserve">        STOP the booking</w:t>
             </w:r>
           </w:p>
           <w:p>
@@ -9272,7 +8219,7 @@
                 <w:sz w:val="19"/>
                 <w:szCs w:val="19"/>
               </w:rPr>
-              <w:t xml:space="preserve">        that seat is already booked for this screening (SQL SELECT)</w:t>
+              <w:t xml:space="preserve">    END IF</w:t>
             </w:r>
           </w:p>
           <w:p>
@@ -9282,7 +8229,7 @@
                 <w:sz w:val="19"/>
                 <w:szCs w:val="19"/>
               </w:rPr>
-              <w:t xml:space="preserve">    IF the seat is already booked THEN</w:t>
+              <w:t>NEXT seat</w:t>
             </w:r>
           </w:p>
           <w:p>
@@ -9292,7 +8239,7 @@
                 <w:sz w:val="19"/>
                 <w:szCs w:val="19"/>
               </w:rPr>
-              <w:t xml:space="preserve">        DISPLAY "One or more of the selected seats has been taken"</w:t>
+              <w:t>INSERT a new record into tblBooking with the customer, screening,</w:t>
             </w:r>
           </w:p>
           <w:p>
@@ -9302,7 +8249,7 @@
                 <w:sz w:val="19"/>
                 <w:szCs w:val="19"/>
               </w:rPr>
-              <w:t xml:space="preserve">        STOP the booking</w:t>
+              <w:t xml:space="preserve">       today's date and the calculated total cost</w:t>
             </w:r>
           </w:p>
           <w:p>
@@ -9312,7 +8259,7 @@
                 <w:sz w:val="19"/>
                 <w:szCs w:val="19"/>
               </w:rPr>
-              <w:t xml:space="preserve">    END IF</w:t>
+              <w:t>GET the new BookingID that was created</w:t>
             </w:r>
           </w:p>
           <w:p>
@@ -9322,7 +8269,7 @@
                 <w:sz w:val="19"/>
                 <w:szCs w:val="19"/>
               </w:rPr>
-              <w:t>NEXT seat</w:t>
+              <w:t>FOR each chosen seat</w:t>
             </w:r>
           </w:p>
           <w:p>
@@ -9332,130 +8279,8 @@
                 <w:sz w:val="19"/>
                 <w:szCs w:val="19"/>
               </w:rPr>
-              <w:t xml:space="preserve">INSERT a new record into </w:t>
-            </w:r>
-            <w:proofErr w:type="spellStart"/>
-            <w:r>
-              <w:rPr>
-                <w:rFonts w:ascii="Courier New" w:eastAsia="Courier New" w:hAnsi="Courier New" w:cs="Courier New"/>
-                <w:sz w:val="19"/>
-                <w:szCs w:val="19"/>
-              </w:rPr>
-              <w:t>tblBooking</w:t>
-            </w:r>
-            <w:proofErr w:type="spellEnd"/>
-            <w:r>
-              <w:rPr>
-                <w:rFonts w:ascii="Courier New" w:eastAsia="Courier New" w:hAnsi="Courier New" w:cs="Courier New"/>
-                <w:sz w:val="19"/>
-                <w:szCs w:val="19"/>
-              </w:rPr>
-              <w:t xml:space="preserve"> with the customer, screening,</w:t>
-            </w:r>
-          </w:p>
-          <w:p>
-            <w:r>
-              <w:rPr>
-                <w:rFonts w:ascii="Courier New" w:eastAsia="Courier New" w:hAnsi="Courier New" w:cs="Courier New"/>
-                <w:sz w:val="19"/>
-                <w:szCs w:val="19"/>
-              </w:rPr>
-              <w:t xml:space="preserve">       today's date and the calculated total cost</w:t>
-            </w:r>
-          </w:p>
-          <w:p>
-            <w:r>
-              <w:rPr>
-                <w:rFonts w:ascii="Courier New" w:eastAsia="Courier New" w:hAnsi="Courier New" w:cs="Courier New"/>
-                <w:sz w:val="19"/>
-                <w:szCs w:val="19"/>
-              </w:rPr>
-              <w:t xml:space="preserve">GET the new </w:t>
-            </w:r>
-            <w:proofErr w:type="spellStart"/>
-            <w:r>
-              <w:rPr>
-                <w:rFonts w:ascii="Courier New" w:eastAsia="Courier New" w:hAnsi="Courier New" w:cs="Courier New"/>
-                <w:sz w:val="19"/>
-                <w:szCs w:val="19"/>
-              </w:rPr>
-              <w:t>BookingID</w:t>
-            </w:r>
-            <w:proofErr w:type="spellEnd"/>
-            <w:r>
-              <w:rPr>
-                <w:rFonts w:ascii="Courier New" w:eastAsia="Courier New" w:hAnsi="Courier New" w:cs="Courier New"/>
-                <w:sz w:val="19"/>
-                <w:szCs w:val="19"/>
-              </w:rPr>
-              <w:t xml:space="preserve"> that was created</w:t>
-            </w:r>
-          </w:p>
-          <w:p>
-            <w:r>
-              <w:rPr>
-                <w:rFonts w:ascii="Courier New" w:eastAsia="Courier New" w:hAnsi="Courier New" w:cs="Courier New"/>
-                <w:sz w:val="19"/>
-                <w:szCs w:val="19"/>
-              </w:rPr>
-              <w:t>FOR each chosen seat</w:t>
-            </w:r>
-          </w:p>
-          <w:p>
-            <w:r>
-              <w:rPr>
-                <w:rFonts w:ascii="Courier New" w:eastAsia="Courier New" w:hAnsi="Courier New" w:cs="Courier New"/>
-                <w:sz w:val="19"/>
-                <w:szCs w:val="19"/>
-              </w:rPr>
-              <w:t xml:space="preserve">    INSERT a record into </w:t>
-            </w:r>
-            <w:proofErr w:type="spellStart"/>
-            <w:r>
-              <w:rPr>
-                <w:rFonts w:ascii="Courier New" w:eastAsia="Courier New" w:hAnsi="Courier New" w:cs="Courier New"/>
-                <w:sz w:val="19"/>
-                <w:szCs w:val="19"/>
-              </w:rPr>
-              <w:t>tblBookingSeat</w:t>
-            </w:r>
-            <w:proofErr w:type="spellEnd"/>
-            <w:r>
-              <w:rPr>
-                <w:rFonts w:ascii="Courier New" w:eastAsia="Courier New" w:hAnsi="Courier New" w:cs="Courier New"/>
-                <w:sz w:val="19"/>
-                <w:szCs w:val="19"/>
-              </w:rPr>
-              <w:t xml:space="preserve"> linking </w:t>
-            </w:r>
-            <w:proofErr w:type="spellStart"/>
-            <w:r>
-              <w:rPr>
-                <w:rFonts w:ascii="Courier New" w:eastAsia="Courier New" w:hAnsi="Courier New" w:cs="Courier New"/>
-                <w:sz w:val="19"/>
-                <w:szCs w:val="19"/>
-              </w:rPr>
-              <w:t>BookingID</w:t>
-            </w:r>
-            <w:proofErr w:type="spellEnd"/>
-            <w:r>
-              <w:rPr>
-                <w:rFonts w:ascii="Courier New" w:eastAsia="Courier New" w:hAnsi="Courier New" w:cs="Courier New"/>
-                <w:sz w:val="19"/>
-                <w:szCs w:val="19"/>
-              </w:rPr>
-              <w:t xml:space="preserve"> to </w:t>
-            </w:r>
-            <w:proofErr w:type="spellStart"/>
-            <w:r>
-              <w:rPr>
-                <w:rFonts w:ascii="Courier New" w:eastAsia="Courier New" w:hAnsi="Courier New" w:cs="Courier New"/>
-                <w:sz w:val="19"/>
-                <w:szCs w:val="19"/>
-              </w:rPr>
-              <w:t>SeatID</w:t>
-            </w:r>
-            <w:proofErr w:type="spellEnd"/>
+              <w:t xml:space="preserve">    INSERT a record into tblBookingSeat linking BookingID to SeatID</w:t>
+            </w:r>
           </w:p>
           <w:p>
             <w:r>
@@ -9558,18 +8383,18 @@
                 <w:sz w:val="19"/>
                 <w:szCs w:val="19"/>
               </w:rPr>
-              <w:t xml:space="preserve">GET the selected screening and its </w:t>
-            </w:r>
-            <w:proofErr w:type="spellStart"/>
+              <w:t>GET the selected screening and its ScreenID</w:t>
+            </w:r>
+          </w:p>
+          <w:p>
             <w:r>
               <w:rPr>
                 <w:rFonts w:ascii="Courier New" w:eastAsia="Courier New" w:hAnsi="Courier New" w:cs="Courier New"/>
                 <w:sz w:val="19"/>
                 <w:szCs w:val="19"/>
               </w:rPr>
-              <w:t>ScreenID</w:t>
-            </w:r>
-            <w:proofErr w:type="spellEnd"/>
+              <w:t>SELECT all seats for that screen from tblSeat,</w:t>
+            </w:r>
           </w:p>
           <w:p>
             <w:r>
@@ -9578,66 +8403,28 @@
                 <w:sz w:val="19"/>
                 <w:szCs w:val="19"/>
               </w:rPr>
-              <w:t xml:space="preserve">SELECT all seats for that screen from </w:t>
-            </w:r>
-            <w:proofErr w:type="spellStart"/>
+              <w:t xml:space="preserve">       ordered by row then seat number</w:t>
+            </w:r>
+          </w:p>
+          <w:p>
             <w:r>
               <w:rPr>
                 <w:rFonts w:ascii="Courier New" w:eastAsia="Courier New" w:hAnsi="Courier New" w:cs="Courier New"/>
                 <w:sz w:val="19"/>
                 <w:szCs w:val="19"/>
               </w:rPr>
-              <w:t>tblSeat</w:t>
-            </w:r>
-            <w:proofErr w:type="spellEnd"/>
+              <w:t>SELECT all seats already booked for this screening</w:t>
+            </w:r>
+          </w:p>
+          <w:p>
             <w:r>
               <w:rPr>
                 <w:rFonts w:ascii="Courier New" w:eastAsia="Courier New" w:hAnsi="Courier New" w:cs="Courier New"/>
                 <w:sz w:val="19"/>
                 <w:szCs w:val="19"/>
               </w:rPr>
-              <w:t>,</w:t>
-            </w:r>
-          </w:p>
-          <w:p>
-            <w:r>
-              <w:rPr>
-                <w:rFonts w:ascii="Courier New" w:eastAsia="Courier New" w:hAnsi="Courier New" w:cs="Courier New"/>
-                <w:sz w:val="19"/>
-                <w:szCs w:val="19"/>
-              </w:rPr>
-              <w:t xml:space="preserve">       ordered by row then seat number</w:t>
-            </w:r>
-          </w:p>
-          <w:p>
-            <w:r>
-              <w:rPr>
-                <w:rFonts w:ascii="Courier New" w:eastAsia="Courier New" w:hAnsi="Courier New" w:cs="Courier New"/>
-                <w:sz w:val="19"/>
-                <w:szCs w:val="19"/>
-              </w:rPr>
-              <w:t>SELECT all seats already booked for this screening</w:t>
-            </w:r>
-          </w:p>
-          <w:p>
-            <w:r>
-              <w:rPr>
-                <w:rFonts w:ascii="Courier New" w:eastAsia="Courier New" w:hAnsi="Courier New" w:cs="Courier New"/>
-                <w:sz w:val="19"/>
-                <w:szCs w:val="19"/>
-              </w:rPr>
-              <w:t xml:space="preserve">       from </w:t>
-            </w:r>
-            <w:proofErr w:type="spellStart"/>
-            <w:r>
-              <w:rPr>
-                <w:rFonts w:ascii="Courier New" w:eastAsia="Courier New" w:hAnsi="Courier New" w:cs="Courier New"/>
-                <w:sz w:val="19"/>
-                <w:szCs w:val="19"/>
-              </w:rPr>
-              <w:t>tblBookingSeat</w:t>
-            </w:r>
-            <w:proofErr w:type="spellEnd"/>
+              <w:t xml:space="preserve">       from tblBookingSeat</w:t>
+            </w:r>
           </w:p>
           <w:p>
             <w:r>
@@ -9780,25 +8567,27 @@
                 <w:sz w:val="19"/>
                 <w:szCs w:val="19"/>
               </w:rPr>
-              <w:t xml:space="preserve">SET </w:t>
-            </w:r>
-            <w:proofErr w:type="spellStart"/>
+              <w:t>SET foodTotal to 0</w:t>
+            </w:r>
+          </w:p>
+          <w:p>
             <w:r>
               <w:rPr>
                 <w:rFonts w:ascii="Courier New" w:eastAsia="Courier New" w:hAnsi="Courier New" w:cs="Courier New"/>
                 <w:sz w:val="19"/>
                 <w:szCs w:val="19"/>
               </w:rPr>
-              <w:t>foodTotal</w:t>
-            </w:r>
-            <w:proofErr w:type="spellEnd"/>
+              <w:t>FOR each food item the customer has added</w:t>
+            </w:r>
+          </w:p>
+          <w:p>
             <w:r>
               <w:rPr>
                 <w:rFonts w:ascii="Courier New" w:eastAsia="Courier New" w:hAnsi="Courier New" w:cs="Courier New"/>
                 <w:sz w:val="19"/>
                 <w:szCs w:val="19"/>
               </w:rPr>
-              <w:t xml:space="preserve"> to 0</w:t>
+              <w:t xml:space="preserve">    LOOK UP the item price in tblFoodItem</w:t>
             </w:r>
           </w:p>
           <w:p>
@@ -9808,7 +8597,7 @@
                 <w:sz w:val="19"/>
                 <w:szCs w:val="19"/>
               </w:rPr>
-              <w:t>FOR each food item the customer has added</w:t>
+              <w:t xml:space="preserve">    CALCULATE lineCost as price multiplied by quantity</w:t>
             </w:r>
           </w:p>
           <w:p>
@@ -9818,18 +8607,18 @@
                 <w:sz w:val="19"/>
                 <w:szCs w:val="19"/>
               </w:rPr>
-              <w:t xml:space="preserve">    LOOK UP the item price in </w:t>
-            </w:r>
-            <w:proofErr w:type="spellStart"/>
+              <w:t xml:space="preserve">    ADD lineCost to foodTotal</w:t>
+            </w:r>
+          </w:p>
+          <w:p>
             <w:r>
               <w:rPr>
                 <w:rFonts w:ascii="Courier New" w:eastAsia="Courier New" w:hAnsi="Courier New" w:cs="Courier New"/>
                 <w:sz w:val="19"/>
                 <w:szCs w:val="19"/>
               </w:rPr>
-              <w:t>tblFoodItem</w:t>
-            </w:r>
-            <w:proofErr w:type="spellEnd"/>
+              <w:t>NEXT item</w:t>
+            </w:r>
           </w:p>
           <w:p>
             <w:r>
@@ -9838,185 +8627,27 @@
                 <w:sz w:val="19"/>
                 <w:szCs w:val="19"/>
               </w:rPr>
-              <w:t xml:space="preserve">    CALCULATE </w:t>
-            </w:r>
-            <w:proofErr w:type="spellStart"/>
+              <w:t>CALCULATE seatTotal as number of seats times the ticket price</w:t>
+            </w:r>
+          </w:p>
+          <w:p>
             <w:r>
               <w:rPr>
                 <w:rFonts w:ascii="Courier New" w:eastAsia="Courier New" w:hAnsi="Courier New" w:cs="Courier New"/>
                 <w:sz w:val="19"/>
                 <w:szCs w:val="19"/>
               </w:rPr>
-              <w:t>lineCost</w:t>
-            </w:r>
-            <w:proofErr w:type="spellEnd"/>
+              <w:t>CALCULATE totalCost as seatTotal plus foodTotal</w:t>
+            </w:r>
+          </w:p>
+          <w:p>
             <w:r>
               <w:rPr>
                 <w:rFonts w:ascii="Courier New" w:eastAsia="Courier New" w:hAnsi="Courier New" w:cs="Courier New"/>
                 <w:sz w:val="19"/>
                 <w:szCs w:val="19"/>
               </w:rPr>
-              <w:t xml:space="preserve"> as price multiplied by quantity</w:t>
-            </w:r>
-          </w:p>
-          <w:p>
-            <w:r>
-              <w:rPr>
-                <w:rFonts w:ascii="Courier New" w:eastAsia="Courier New" w:hAnsi="Courier New" w:cs="Courier New"/>
-                <w:sz w:val="19"/>
-                <w:szCs w:val="19"/>
-              </w:rPr>
-              <w:t xml:space="preserve">    ADD </w:t>
-            </w:r>
-            <w:proofErr w:type="spellStart"/>
-            <w:r>
-              <w:rPr>
-                <w:rFonts w:ascii="Courier New" w:eastAsia="Courier New" w:hAnsi="Courier New" w:cs="Courier New"/>
-                <w:sz w:val="19"/>
-                <w:szCs w:val="19"/>
-              </w:rPr>
-              <w:t>lineCost</w:t>
-            </w:r>
-            <w:proofErr w:type="spellEnd"/>
-            <w:r>
-              <w:rPr>
-                <w:rFonts w:ascii="Courier New" w:eastAsia="Courier New" w:hAnsi="Courier New" w:cs="Courier New"/>
-                <w:sz w:val="19"/>
-                <w:szCs w:val="19"/>
-              </w:rPr>
-              <w:t xml:space="preserve"> to </w:t>
-            </w:r>
-            <w:proofErr w:type="spellStart"/>
-            <w:r>
-              <w:rPr>
-                <w:rFonts w:ascii="Courier New" w:eastAsia="Courier New" w:hAnsi="Courier New" w:cs="Courier New"/>
-                <w:sz w:val="19"/>
-                <w:szCs w:val="19"/>
-              </w:rPr>
-              <w:t>foodTotal</w:t>
-            </w:r>
-            <w:proofErr w:type="spellEnd"/>
-          </w:p>
-          <w:p>
-            <w:r>
-              <w:rPr>
-                <w:rFonts w:ascii="Courier New" w:eastAsia="Courier New" w:hAnsi="Courier New" w:cs="Courier New"/>
-                <w:sz w:val="19"/>
-                <w:szCs w:val="19"/>
-              </w:rPr>
-              <w:t>NEXT item</w:t>
-            </w:r>
-          </w:p>
-          <w:p>
-            <w:r>
-              <w:rPr>
-                <w:rFonts w:ascii="Courier New" w:eastAsia="Courier New" w:hAnsi="Courier New" w:cs="Courier New"/>
-                <w:sz w:val="19"/>
-                <w:szCs w:val="19"/>
-              </w:rPr>
-              <w:t xml:space="preserve">CALCULATE </w:t>
-            </w:r>
-            <w:proofErr w:type="spellStart"/>
-            <w:r>
-              <w:rPr>
-                <w:rFonts w:ascii="Courier New" w:eastAsia="Courier New" w:hAnsi="Courier New" w:cs="Courier New"/>
-                <w:sz w:val="19"/>
-                <w:szCs w:val="19"/>
-              </w:rPr>
-              <w:t>seatTotal</w:t>
-            </w:r>
-            <w:proofErr w:type="spellEnd"/>
-            <w:r>
-              <w:rPr>
-                <w:rFonts w:ascii="Courier New" w:eastAsia="Courier New" w:hAnsi="Courier New" w:cs="Courier New"/>
-                <w:sz w:val="19"/>
-                <w:szCs w:val="19"/>
-              </w:rPr>
-              <w:t xml:space="preserve"> as number of seats times the ticket price</w:t>
-            </w:r>
-          </w:p>
-          <w:p>
-            <w:r>
-              <w:rPr>
-                <w:rFonts w:ascii="Courier New" w:eastAsia="Courier New" w:hAnsi="Courier New" w:cs="Courier New"/>
-                <w:sz w:val="19"/>
-                <w:szCs w:val="19"/>
-              </w:rPr>
-              <w:t xml:space="preserve">CALCULATE </w:t>
-            </w:r>
-            <w:proofErr w:type="spellStart"/>
-            <w:r>
-              <w:rPr>
-                <w:rFonts w:ascii="Courier New" w:eastAsia="Courier New" w:hAnsi="Courier New" w:cs="Courier New"/>
-                <w:sz w:val="19"/>
-                <w:szCs w:val="19"/>
-              </w:rPr>
-              <w:t>totalCost</w:t>
-            </w:r>
-            <w:proofErr w:type="spellEnd"/>
-            <w:r>
-              <w:rPr>
-                <w:rFonts w:ascii="Courier New" w:eastAsia="Courier New" w:hAnsi="Courier New" w:cs="Courier New"/>
-                <w:sz w:val="19"/>
-                <w:szCs w:val="19"/>
-              </w:rPr>
-              <w:t xml:space="preserve"> as </w:t>
-            </w:r>
-            <w:proofErr w:type="spellStart"/>
-            <w:r>
-              <w:rPr>
-                <w:rFonts w:ascii="Courier New" w:eastAsia="Courier New" w:hAnsi="Courier New" w:cs="Courier New"/>
-                <w:sz w:val="19"/>
-                <w:szCs w:val="19"/>
-              </w:rPr>
-              <w:t>seatTotal</w:t>
-            </w:r>
-            <w:proofErr w:type="spellEnd"/>
-            <w:r>
-              <w:rPr>
-                <w:rFonts w:ascii="Courier New" w:eastAsia="Courier New" w:hAnsi="Courier New" w:cs="Courier New"/>
-                <w:sz w:val="19"/>
-                <w:szCs w:val="19"/>
-              </w:rPr>
-              <w:t xml:space="preserve"> plus </w:t>
-            </w:r>
-            <w:proofErr w:type="spellStart"/>
-            <w:r>
-              <w:rPr>
-                <w:rFonts w:ascii="Courier New" w:eastAsia="Courier New" w:hAnsi="Courier New" w:cs="Courier New"/>
-                <w:sz w:val="19"/>
-                <w:szCs w:val="19"/>
-              </w:rPr>
-              <w:t>foodTotal</w:t>
-            </w:r>
-            <w:proofErr w:type="spellEnd"/>
-          </w:p>
-          <w:p>
-            <w:r>
-              <w:rPr>
-                <w:rFonts w:ascii="Courier New" w:eastAsia="Courier New" w:hAnsi="Courier New" w:cs="Courier New"/>
-                <w:sz w:val="19"/>
-                <w:szCs w:val="19"/>
-              </w:rPr>
-              <w:t xml:space="preserve">DISPLAY </w:t>
-            </w:r>
-            <w:proofErr w:type="spellStart"/>
-            <w:r>
-              <w:rPr>
-                <w:rFonts w:ascii="Courier New" w:eastAsia="Courier New" w:hAnsi="Courier New" w:cs="Courier New"/>
-                <w:sz w:val="19"/>
-                <w:szCs w:val="19"/>
-              </w:rPr>
-              <w:t>totalCost</w:t>
-            </w:r>
-            <w:proofErr w:type="spellEnd"/>
-            <w:r>
-              <w:rPr>
-                <w:rFonts w:ascii="Courier New" w:eastAsia="Courier New" w:hAnsi="Courier New" w:cs="Courier New"/>
-                <w:sz w:val="19"/>
-                <w:szCs w:val="19"/>
-              </w:rPr>
-              <w:t xml:space="preserve"> to the customer</w:t>
+              <w:t>DISPLAY totalCost to the customer</w:t>
             </w:r>
           </w:p>
         </w:tc>
@@ -10130,43 +8761,47 @@
                 <w:sz w:val="19"/>
                 <w:szCs w:val="19"/>
               </w:rPr>
-              <w:t xml:space="preserve">    SELECT all bookings from </w:t>
-            </w:r>
-            <w:proofErr w:type="spellStart"/>
+              <w:t xml:space="preserve">    SELECT all bookings from tblBooking where BookingDate is</w:t>
+            </w:r>
+          </w:p>
+          <w:p>
             <w:r>
               <w:rPr>
                 <w:rFonts w:ascii="Courier New" w:eastAsia="Courier New" w:hAnsi="Courier New" w:cs="Courier New"/>
                 <w:sz w:val="19"/>
                 <w:szCs w:val="19"/>
               </w:rPr>
-              <w:t>tblBooking</w:t>
-            </w:r>
-            <w:proofErr w:type="spellEnd"/>
+              <w:t xml:space="preserve">        between the start and end date (SQL SELECT)</w:t>
+            </w:r>
+          </w:p>
+          <w:p>
             <w:r>
               <w:rPr>
                 <w:rFonts w:ascii="Courier New" w:eastAsia="Courier New" w:hAnsi="Courier New" w:cs="Courier New"/>
                 <w:sz w:val="19"/>
                 <w:szCs w:val="19"/>
               </w:rPr>
-              <w:t xml:space="preserve"> where </w:t>
-            </w:r>
-            <w:proofErr w:type="spellStart"/>
+              <w:t xml:space="preserve">    SET totalTickets to 0</w:t>
+            </w:r>
+          </w:p>
+          <w:p>
             <w:r>
               <w:rPr>
                 <w:rFonts w:ascii="Courier New" w:eastAsia="Courier New" w:hAnsi="Courier New" w:cs="Courier New"/>
                 <w:sz w:val="19"/>
                 <w:szCs w:val="19"/>
               </w:rPr>
-              <w:t>BookingDate</w:t>
-            </w:r>
-            <w:proofErr w:type="spellEnd"/>
+              <w:t xml:space="preserve">    SET totalRevenue to 0</w:t>
+            </w:r>
+          </w:p>
+          <w:p>
             <w:r>
               <w:rPr>
                 <w:rFonts w:ascii="Courier New" w:eastAsia="Courier New" w:hAnsi="Courier New" w:cs="Courier New"/>
                 <w:sz w:val="19"/>
                 <w:szCs w:val="19"/>
               </w:rPr>
-              <w:t xml:space="preserve"> is</w:t>
+              <w:t xml:space="preserve">    FOR each booking returned</w:t>
             </w:r>
           </w:p>
           <w:p>
@@ -10176,7 +8811,7 @@
                 <w:sz w:val="19"/>
                 <w:szCs w:val="19"/>
               </w:rPr>
-              <w:t xml:space="preserve">        between the start and end date (SQL SELECT)</w:t>
+              <w:t xml:space="preserve">        COUNT the seats linked to it in tblBookingSeat</w:t>
             </w:r>
           </w:p>
           <w:p>
@@ -10186,25 +8821,27 @@
                 <w:sz w:val="19"/>
                 <w:szCs w:val="19"/>
               </w:rPr>
-              <w:t xml:space="preserve">    SET </w:t>
-            </w:r>
-            <w:proofErr w:type="spellStart"/>
+              <w:t xml:space="preserve">        ADD that count to totalTickets</w:t>
+            </w:r>
+          </w:p>
+          <w:p>
             <w:r>
               <w:rPr>
                 <w:rFonts w:ascii="Courier New" w:eastAsia="Courier New" w:hAnsi="Courier New" w:cs="Courier New"/>
                 <w:sz w:val="19"/>
                 <w:szCs w:val="19"/>
               </w:rPr>
-              <w:t>totalTickets</w:t>
-            </w:r>
-            <w:proofErr w:type="spellEnd"/>
+              <w:t xml:space="preserve">        ADD the booking's TotalCost to totalRevenue</w:t>
+            </w:r>
+          </w:p>
+          <w:p>
             <w:r>
               <w:rPr>
                 <w:rFonts w:ascii="Courier New" w:eastAsia="Courier New" w:hAnsi="Courier New" w:cs="Courier New"/>
                 <w:sz w:val="19"/>
                 <w:szCs w:val="19"/>
               </w:rPr>
-              <w:t xml:space="preserve"> to 0</w:t>
+              <w:t xml:space="preserve">    NEXT booking</w:t>
             </w:r>
           </w:p>
           <w:p>
@@ -10214,162 +8851,8 @@
                 <w:sz w:val="19"/>
                 <w:szCs w:val="19"/>
               </w:rPr>
-              <w:t xml:space="preserve">    SET </w:t>
-            </w:r>
-            <w:proofErr w:type="spellStart"/>
-            <w:r>
-              <w:rPr>
-                <w:rFonts w:ascii="Courier New" w:eastAsia="Courier New" w:hAnsi="Courier New" w:cs="Courier New"/>
-                <w:sz w:val="19"/>
-                <w:szCs w:val="19"/>
-              </w:rPr>
-              <w:t>totalRevenue</w:t>
-            </w:r>
-            <w:proofErr w:type="spellEnd"/>
-            <w:r>
-              <w:rPr>
-                <w:rFonts w:ascii="Courier New" w:eastAsia="Courier New" w:hAnsi="Courier New" w:cs="Courier New"/>
-                <w:sz w:val="19"/>
-                <w:szCs w:val="19"/>
-              </w:rPr>
-              <w:t xml:space="preserve"> to 0</w:t>
-            </w:r>
-          </w:p>
-          <w:p>
-            <w:r>
-              <w:rPr>
-                <w:rFonts w:ascii="Courier New" w:eastAsia="Courier New" w:hAnsi="Courier New" w:cs="Courier New"/>
-                <w:sz w:val="19"/>
-                <w:szCs w:val="19"/>
-              </w:rPr>
-              <w:t xml:space="preserve">    FOR each booking returned</w:t>
-            </w:r>
-          </w:p>
-          <w:p>
-            <w:r>
-              <w:rPr>
-                <w:rFonts w:ascii="Courier New" w:eastAsia="Courier New" w:hAnsi="Courier New" w:cs="Courier New"/>
-                <w:sz w:val="19"/>
-                <w:szCs w:val="19"/>
-              </w:rPr>
-              <w:t xml:space="preserve">        COUNT the seats linked to it in </w:t>
-            </w:r>
-            <w:proofErr w:type="spellStart"/>
-            <w:r>
-              <w:rPr>
-                <w:rFonts w:ascii="Courier New" w:eastAsia="Courier New" w:hAnsi="Courier New" w:cs="Courier New"/>
-                <w:sz w:val="19"/>
-                <w:szCs w:val="19"/>
-              </w:rPr>
-              <w:t>tblBookingSeat</w:t>
-            </w:r>
-            <w:proofErr w:type="spellEnd"/>
-          </w:p>
-          <w:p>
-            <w:r>
-              <w:rPr>
-                <w:rFonts w:ascii="Courier New" w:eastAsia="Courier New" w:hAnsi="Courier New" w:cs="Courier New"/>
-                <w:sz w:val="19"/>
-                <w:szCs w:val="19"/>
-              </w:rPr>
-              <w:t xml:space="preserve">        ADD that count to </w:t>
-            </w:r>
-            <w:proofErr w:type="spellStart"/>
-            <w:r>
-              <w:rPr>
-                <w:rFonts w:ascii="Courier New" w:eastAsia="Courier New" w:hAnsi="Courier New" w:cs="Courier New"/>
-                <w:sz w:val="19"/>
-                <w:szCs w:val="19"/>
-              </w:rPr>
-              <w:t>totalTickets</w:t>
-            </w:r>
-            <w:proofErr w:type="spellEnd"/>
-          </w:p>
-          <w:p>
-            <w:r>
-              <w:rPr>
-                <w:rFonts w:ascii="Courier New" w:eastAsia="Courier New" w:hAnsi="Courier New" w:cs="Courier New"/>
-                <w:sz w:val="19"/>
-                <w:szCs w:val="19"/>
-              </w:rPr>
-              <w:t xml:space="preserve">        ADD the booking's </w:t>
-            </w:r>
-            <w:proofErr w:type="spellStart"/>
-            <w:r>
-              <w:rPr>
-                <w:rFonts w:ascii="Courier New" w:eastAsia="Courier New" w:hAnsi="Courier New" w:cs="Courier New"/>
-                <w:sz w:val="19"/>
-                <w:szCs w:val="19"/>
-              </w:rPr>
-              <w:t>TotalCost</w:t>
-            </w:r>
-            <w:proofErr w:type="spellEnd"/>
-            <w:r>
-              <w:rPr>
-                <w:rFonts w:ascii="Courier New" w:eastAsia="Courier New" w:hAnsi="Courier New" w:cs="Courier New"/>
-                <w:sz w:val="19"/>
-                <w:szCs w:val="19"/>
-              </w:rPr>
-              <w:t xml:space="preserve"> to </w:t>
-            </w:r>
-            <w:proofErr w:type="spellStart"/>
-            <w:r>
-              <w:rPr>
-                <w:rFonts w:ascii="Courier New" w:eastAsia="Courier New" w:hAnsi="Courier New" w:cs="Courier New"/>
-                <w:sz w:val="19"/>
-                <w:szCs w:val="19"/>
-              </w:rPr>
-              <w:t>totalRevenue</w:t>
-            </w:r>
-            <w:proofErr w:type="spellEnd"/>
-          </w:p>
-          <w:p>
-            <w:r>
-              <w:rPr>
-                <w:rFonts w:ascii="Courier New" w:eastAsia="Courier New" w:hAnsi="Courier New" w:cs="Courier New"/>
-                <w:sz w:val="19"/>
-                <w:szCs w:val="19"/>
-              </w:rPr>
-              <w:t xml:space="preserve">    NEXT booking</w:t>
-            </w:r>
-          </w:p>
-          <w:p>
-            <w:r>
-              <w:rPr>
-                <w:rFonts w:ascii="Courier New" w:eastAsia="Courier New" w:hAnsi="Courier New" w:cs="Courier New"/>
-                <w:sz w:val="19"/>
-                <w:szCs w:val="19"/>
-              </w:rPr>
-              <w:t xml:space="preserve">    DISPLAY </w:t>
-            </w:r>
-            <w:proofErr w:type="spellStart"/>
-            <w:r>
-              <w:rPr>
-                <w:rFonts w:ascii="Courier New" w:eastAsia="Courier New" w:hAnsi="Courier New" w:cs="Courier New"/>
-                <w:sz w:val="19"/>
-                <w:szCs w:val="19"/>
-              </w:rPr>
-              <w:t>totalTickets</w:t>
-            </w:r>
-            <w:proofErr w:type="spellEnd"/>
-            <w:r>
-              <w:rPr>
-                <w:rFonts w:ascii="Courier New" w:eastAsia="Courier New" w:hAnsi="Courier New" w:cs="Courier New"/>
-                <w:sz w:val="19"/>
-                <w:szCs w:val="19"/>
-              </w:rPr>
-              <w:t xml:space="preserve"> and </w:t>
-            </w:r>
-            <w:proofErr w:type="spellStart"/>
-            <w:r>
-              <w:rPr>
-                <w:rFonts w:ascii="Courier New" w:eastAsia="Courier New" w:hAnsi="Courier New" w:cs="Courier New"/>
-                <w:sz w:val="19"/>
-                <w:szCs w:val="19"/>
-              </w:rPr>
-              <w:t>totalRevenue</w:t>
-            </w:r>
-            <w:proofErr w:type="spellEnd"/>
+              <w:t xml:space="preserve">    DISPLAY totalTickets and totalRevenue</w:t>
+            </w:r>
           </w:p>
           <w:p>
             <w:r>
@@ -10492,18 +8975,8 @@
                 <w:sz w:val="19"/>
                 <w:szCs w:val="19"/>
               </w:rPr>
-              <w:t xml:space="preserve">    SELECT bookings joined to customers where </w:t>
-            </w:r>
-            <w:proofErr w:type="spellStart"/>
-            <w:r>
-              <w:rPr>
-                <w:rFonts w:ascii="Courier New" w:eastAsia="Courier New" w:hAnsi="Courier New" w:cs="Courier New"/>
-                <w:sz w:val="19"/>
-                <w:szCs w:val="19"/>
-              </w:rPr>
-              <w:t>CustomerSurname</w:t>
-            </w:r>
-            <w:proofErr w:type="spellEnd"/>
+              <w:t xml:space="preserve">    SELECT bookings joined to customers where CustomerSurname</w:t>
+            </w:r>
           </w:p>
           <w:p>
             <w:r>
@@ -10601,15 +9074,7 @@
         <w:spacing w:after="160" w:line="276" w:lineRule="auto"/>
       </w:pPr>
       <w:r>
-        <w:t xml:space="preserve">When a booking is cancelled its seats need to become available again. Because availability is worked out from the link table, simply removing the booking's records from </w:t>
-      </w:r>
-      <w:proofErr w:type="spellStart"/>
-      <w:r>
-        <w:t>tblBookingSeat</w:t>
-      </w:r>
-      <w:proofErr w:type="spellEnd"/>
-      <w:r>
-        <w:t xml:space="preserve"> frees those seats automatically with no separate step needed.</w:t>
+        <w:t>When a booking is cancelled its seats need to become available again. Because availability is worked out from the link table, simply removing the booking's records from tblBookingSeat frees those seats automatically with no separate step needed.</w:t>
       </w:r>
     </w:p>
     <w:tbl>
@@ -10649,25 +9114,27 @@
                 <w:sz w:val="19"/>
                 <w:szCs w:val="19"/>
               </w:rPr>
-              <w:t xml:space="preserve">GET the </w:t>
-            </w:r>
-            <w:proofErr w:type="spellStart"/>
+              <w:t>GET the BookingID of the booking to cancel</w:t>
+            </w:r>
+          </w:p>
+          <w:p>
             <w:r>
               <w:rPr>
                 <w:rFonts w:ascii="Courier New" w:eastAsia="Courier New" w:hAnsi="Courier New" w:cs="Courier New"/>
                 <w:sz w:val="19"/>
                 <w:szCs w:val="19"/>
               </w:rPr>
-              <w:t>BookingID</w:t>
-            </w:r>
-            <w:proofErr w:type="spellEnd"/>
+              <w:t>DISPLAY "Are you sure you want to cancel this booking?"</w:t>
+            </w:r>
+          </w:p>
+          <w:p>
             <w:r>
               <w:rPr>
                 <w:rFonts w:ascii="Courier New" w:eastAsia="Courier New" w:hAnsi="Courier New" w:cs="Courier New"/>
                 <w:sz w:val="19"/>
                 <w:szCs w:val="19"/>
               </w:rPr>
-              <w:t xml:space="preserve"> of the booking to cancel</w:t>
+              <w:t>IF the user confirms THEN</w:t>
             </w:r>
           </w:p>
           <w:p>
@@ -10677,7 +9144,7 @@
                 <w:sz w:val="19"/>
                 <w:szCs w:val="19"/>
               </w:rPr>
-              <w:t>DISPLAY "Are you sure you want to cancel this booking?"</w:t>
+              <w:t xml:space="preserve">    DELETE all records in tblBookingSeat for that BookingID</w:t>
             </w:r>
           </w:p>
           <w:p>
@@ -10687,7 +9154,7 @@
                 <w:sz w:val="19"/>
                 <w:szCs w:val="19"/>
               </w:rPr>
-              <w:t>IF the user confirms THEN</w:t>
+              <w:t xml:space="preserve">    DELETE all records in tblOrderItem for that BookingID</w:t>
             </w:r>
           </w:p>
           <w:p>
@@ -10697,112 +9164,8 @@
                 <w:sz w:val="19"/>
                 <w:szCs w:val="19"/>
               </w:rPr>
-              <w:t xml:space="preserve">    DELETE all records in </w:t>
-            </w:r>
-            <w:proofErr w:type="spellStart"/>
-            <w:r>
-              <w:rPr>
-                <w:rFonts w:ascii="Courier New" w:eastAsia="Courier New" w:hAnsi="Courier New" w:cs="Courier New"/>
-                <w:sz w:val="19"/>
-                <w:szCs w:val="19"/>
-              </w:rPr>
-              <w:t>tblBookingSeat</w:t>
-            </w:r>
-            <w:proofErr w:type="spellEnd"/>
-            <w:r>
-              <w:rPr>
-                <w:rFonts w:ascii="Courier New" w:eastAsia="Courier New" w:hAnsi="Courier New" w:cs="Courier New"/>
-                <w:sz w:val="19"/>
-                <w:szCs w:val="19"/>
-              </w:rPr>
-              <w:t xml:space="preserve"> for that </w:t>
-            </w:r>
-            <w:proofErr w:type="spellStart"/>
-            <w:r>
-              <w:rPr>
-                <w:rFonts w:ascii="Courier New" w:eastAsia="Courier New" w:hAnsi="Courier New" w:cs="Courier New"/>
-                <w:sz w:val="19"/>
-                <w:szCs w:val="19"/>
-              </w:rPr>
-              <w:t>BookingID</w:t>
-            </w:r>
-            <w:proofErr w:type="spellEnd"/>
-          </w:p>
-          <w:p>
-            <w:r>
-              <w:rPr>
-                <w:rFonts w:ascii="Courier New" w:eastAsia="Courier New" w:hAnsi="Courier New" w:cs="Courier New"/>
-                <w:sz w:val="19"/>
-                <w:szCs w:val="19"/>
-              </w:rPr>
-              <w:t xml:space="preserve">    DELETE all records in </w:t>
-            </w:r>
-            <w:proofErr w:type="spellStart"/>
-            <w:r>
-              <w:rPr>
-                <w:rFonts w:ascii="Courier New" w:eastAsia="Courier New" w:hAnsi="Courier New" w:cs="Courier New"/>
-                <w:sz w:val="19"/>
-                <w:szCs w:val="19"/>
-              </w:rPr>
-              <w:t>tblOrderItem</w:t>
-            </w:r>
-            <w:proofErr w:type="spellEnd"/>
-            <w:r>
-              <w:rPr>
-                <w:rFonts w:ascii="Courier New" w:eastAsia="Courier New" w:hAnsi="Courier New" w:cs="Courier New"/>
-                <w:sz w:val="19"/>
-                <w:szCs w:val="19"/>
-              </w:rPr>
-              <w:t xml:space="preserve"> for that </w:t>
-            </w:r>
-            <w:proofErr w:type="spellStart"/>
-            <w:r>
-              <w:rPr>
-                <w:rFonts w:ascii="Courier New" w:eastAsia="Courier New" w:hAnsi="Courier New" w:cs="Courier New"/>
-                <w:sz w:val="19"/>
-                <w:szCs w:val="19"/>
-              </w:rPr>
-              <w:t>BookingID</w:t>
-            </w:r>
-            <w:proofErr w:type="spellEnd"/>
-          </w:p>
-          <w:p>
-            <w:r>
-              <w:rPr>
-                <w:rFonts w:ascii="Courier New" w:eastAsia="Courier New" w:hAnsi="Courier New" w:cs="Courier New"/>
-                <w:sz w:val="19"/>
-                <w:szCs w:val="19"/>
-              </w:rPr>
-              <w:t xml:space="preserve">    DELETE the record in </w:t>
-            </w:r>
-            <w:proofErr w:type="spellStart"/>
-            <w:r>
-              <w:rPr>
-                <w:rFonts w:ascii="Courier New" w:eastAsia="Courier New" w:hAnsi="Courier New" w:cs="Courier New"/>
-                <w:sz w:val="19"/>
-                <w:szCs w:val="19"/>
-              </w:rPr>
-              <w:t>tblBooking</w:t>
-            </w:r>
-            <w:proofErr w:type="spellEnd"/>
-            <w:r>
-              <w:rPr>
-                <w:rFonts w:ascii="Courier New" w:eastAsia="Courier New" w:hAnsi="Courier New" w:cs="Courier New"/>
-                <w:sz w:val="19"/>
-                <w:szCs w:val="19"/>
-              </w:rPr>
-              <w:t xml:space="preserve"> for that </w:t>
-            </w:r>
-            <w:proofErr w:type="spellStart"/>
-            <w:r>
-              <w:rPr>
-                <w:rFonts w:ascii="Courier New" w:eastAsia="Courier New" w:hAnsi="Courier New" w:cs="Courier New"/>
-                <w:sz w:val="19"/>
-                <w:szCs w:val="19"/>
-              </w:rPr>
-              <w:t>BookingID</w:t>
-            </w:r>
-            <w:proofErr w:type="spellEnd"/>
+              <w:t xml:space="preserve">    DELETE the record in tblBooking for that BookingID</w:t>
+            </w:r>
           </w:p>
           <w:p>
             <w:r>
@@ -10876,15 +9239,7 @@
         <w:spacing w:after="160" w:line="276" w:lineRule="auto"/>
       </w:pPr>
       <w:r>
-        <w:t xml:space="preserve">Validation is the process of checking that data entered into the system is sensible and complete before it is accepted and saved to the database. It cannot guarantee that data is correct, for example it cannot tell whether a customer has typed the right surname, but it can stop clearly invalid or missing data from getting in, which protects the integrity of the database. Several different types of validation are used across the </w:t>
-      </w:r>
-      <w:proofErr w:type="spellStart"/>
-      <w:r>
-        <w:t>Filmtopia</w:t>
-      </w:r>
-      <w:proofErr w:type="spellEnd"/>
-      <w:r>
-        <w:t xml:space="preserve"> system, and these are explained below before being applied to each input in turn.</w:t>
+        <w:t>Validation is the process of checking that data entered into the system is sensible and complete before it is accepted and saved to the database. It cannot guarantee that data is correct, for example it cannot tell whether a customer has typed the right surname, but it can stop clearly invalid or missing data from getting in, which protects the integrity of the database. Several different types of validation are used across the Filmtopia system, and these are explained below before being applied to each input in turn.</w:t>
       </w:r>
     </w:p>
     <w:p>
@@ -10892,15 +9247,7 @@
         <w:spacing w:after="160" w:line="276" w:lineRule="auto"/>
       </w:pPr>
       <w:r>
-        <w:t xml:space="preserve">A presence check makes sure a required field has not been left blank. A type check makes sure the data is of the right kind, for example that a number has been entered where a number is expected. A length check makes sure an entry is </w:t>
-      </w:r>
-      <w:proofErr w:type="spellStart"/>
-      <w:r>
-        <w:t>not longer</w:t>
-      </w:r>
-      <w:proofErr w:type="spellEnd"/>
-      <w:r>
-        <w:t xml:space="preserve"> than the field allows. A range check makes sure a number or date falls between sensible limits. A format check makes sure an entry follows a required pattern, such as a time being written as HH:MM. Finally a lookup check, sometimes called a referential check, makes sure that a chosen value actually exists in another table, for example that a screening is being created for a film that really exists. The tables below set out the validation applied to each input, grouped by the form it appears on.</w:t>
+        <w:t>A presence check makes sure a required field has not been left blank. A type check makes sure the data is of the right kind, for example that a number has been entered where a number is expected. A length check makes sure an entry is not longer than the field allows. A range check makes sure a number or date falls between sensible limits. A format check makes sure an entry follows a required pattern, such as a time being written as HH:MM. Finally a lookup check, sometimes called a referential check, makes sure that a chosen value actually exists in another table, for example that a screening is being created for a film that really exists. The tables below set out the validation applied to each input, grouped by the form it appears on.</w:t>
       </w:r>
     </w:p>
     <w:p>
@@ -11355,7 +9702,6 @@
             </w:tcMar>
           </w:tcPr>
           <w:p>
-            <w:proofErr w:type="spellStart"/>
             <w:r>
               <w:rPr>
                 <w:sz w:val="19"/>
@@ -11363,7 +9709,6 @@
               </w:rPr>
               <w:t>FilmTitle</w:t>
             </w:r>
-            <w:proofErr w:type="spellEnd"/>
           </w:p>
         </w:tc>
         <w:tc>
@@ -11439,7 +9784,6 @@
             </w:tcMar>
           </w:tcPr>
           <w:p>
-            <w:proofErr w:type="spellStart"/>
             <w:r>
               <w:rPr>
                 <w:sz w:val="19"/>
@@ -11447,7 +9791,6 @@
               </w:rPr>
               <w:t>FilmAgeRating</w:t>
             </w:r>
-            <w:proofErr w:type="spellEnd"/>
           </w:p>
         </w:tc>
         <w:tc>
@@ -11523,7 +9866,6 @@
             </w:tcMar>
           </w:tcPr>
           <w:p>
-            <w:proofErr w:type="spellStart"/>
             <w:r>
               <w:rPr>
                 <w:sz w:val="19"/>
@@ -11531,7 +9873,6 @@
               </w:rPr>
               <w:t>FilmDuration</w:t>
             </w:r>
-            <w:proofErr w:type="spellEnd"/>
           </w:p>
         </w:tc>
         <w:tc>
@@ -11607,7 +9948,6 @@
             </w:tcMar>
           </w:tcPr>
           <w:p>
-            <w:proofErr w:type="spellStart"/>
             <w:r>
               <w:rPr>
                 <w:sz w:val="19"/>
@@ -11615,7 +9955,6 @@
               </w:rPr>
               <w:t>FilmDescription</w:t>
             </w:r>
-            <w:proofErr w:type="spellEnd"/>
           </w:p>
         </w:tc>
         <w:tc>
@@ -11832,7 +10171,6 @@
             </w:tcMar>
           </w:tcPr>
           <w:p>
-            <w:proofErr w:type="spellStart"/>
             <w:r>
               <w:rPr>
                 <w:sz w:val="19"/>
@@ -11840,7 +10178,6 @@
               </w:rPr>
               <w:t>ScreenName</w:t>
             </w:r>
-            <w:proofErr w:type="spellEnd"/>
           </w:p>
         </w:tc>
         <w:tc>
@@ -11916,7 +10253,6 @@
             </w:tcMar>
           </w:tcPr>
           <w:p>
-            <w:proofErr w:type="spellStart"/>
             <w:r>
               <w:rPr>
                 <w:sz w:val="19"/>
@@ -11924,7 +10260,6 @@
               </w:rPr>
               <w:t>ScreenCapacity</w:t>
             </w:r>
-            <w:proofErr w:type="spellEnd"/>
           </w:p>
         </w:tc>
         <w:tc>
@@ -12326,7 +10661,6 @@
             </w:tcMar>
           </w:tcPr>
           <w:p>
-            <w:proofErr w:type="spellStart"/>
             <w:r>
               <w:rPr>
                 <w:sz w:val="19"/>
@@ -12334,7 +10668,6 @@
               </w:rPr>
               <w:t>ScreeningDate</w:t>
             </w:r>
-            <w:proofErr w:type="spellEnd"/>
           </w:p>
         </w:tc>
         <w:tc>
@@ -12410,7 +10743,6 @@
             </w:tcMar>
           </w:tcPr>
           <w:p>
-            <w:proofErr w:type="spellStart"/>
             <w:r>
               <w:rPr>
                 <w:sz w:val="19"/>
@@ -12418,7 +10750,6 @@
               </w:rPr>
               <w:t>ScreeningTime</w:t>
             </w:r>
-            <w:proofErr w:type="spellEnd"/>
           </w:p>
         </w:tc>
         <w:tc>
@@ -12494,7 +10825,6 @@
             </w:tcMar>
           </w:tcPr>
           <w:p>
-            <w:proofErr w:type="spellStart"/>
             <w:r>
               <w:rPr>
                 <w:sz w:val="19"/>
@@ -12502,7 +10832,6 @@
               </w:rPr>
               <w:t>TicketPrice</w:t>
             </w:r>
-            <w:proofErr w:type="spellEnd"/>
           </w:p>
         </w:tc>
         <w:tc>
@@ -12719,7 +11048,6 @@
             </w:tcMar>
           </w:tcPr>
           <w:p>
-            <w:proofErr w:type="spellStart"/>
             <w:r>
               <w:rPr>
                 <w:sz w:val="19"/>
@@ -12727,7 +11055,6 @@
               </w:rPr>
               <w:t>CustomerForename</w:t>
             </w:r>
-            <w:proofErr w:type="spellEnd"/>
           </w:p>
         </w:tc>
         <w:tc>
@@ -12803,7 +11130,6 @@
             </w:tcMar>
           </w:tcPr>
           <w:p>
-            <w:proofErr w:type="spellStart"/>
             <w:r>
               <w:rPr>
                 <w:sz w:val="19"/>
@@ -12811,7 +11137,6 @@
               </w:rPr>
               <w:t>CustomerSurname</w:t>
             </w:r>
-            <w:proofErr w:type="spellEnd"/>
           </w:p>
         </w:tc>
         <w:tc>
@@ -12887,7 +11212,6 @@
             </w:tcMar>
           </w:tcPr>
           <w:p>
-            <w:proofErr w:type="spellStart"/>
             <w:r>
               <w:rPr>
                 <w:sz w:val="19"/>
@@ -12895,7 +11219,6 @@
               </w:rPr>
               <w:t>CustomerEmail</w:t>
             </w:r>
-            <w:proofErr w:type="spellEnd"/>
           </w:p>
         </w:tc>
         <w:tc>
@@ -12971,7 +11294,6 @@
             </w:tcMar>
           </w:tcPr>
           <w:p>
-            <w:proofErr w:type="spellStart"/>
             <w:r>
               <w:rPr>
                 <w:sz w:val="19"/>
@@ -12979,7 +11301,6 @@
               </w:rPr>
               <w:t>CustomerPhone</w:t>
             </w:r>
-            <w:proofErr w:type="spellEnd"/>
           </w:p>
         </w:tc>
         <w:tc>
@@ -13766,7 +12087,6 @@
         <w:docPartUnique/>
       </w:docPartObj>
     </w:sdtPr>
-    <w:sdtEndPr/>
     <w:sdtContent>
       <w:p>
         <w:pPr>

</xml_diff>

<commit_message>
added description for objective 16 in design doc
</commit_message>
<xml_diff>
--- a/Design.docx
+++ b/Design.docx
@@ -353,6 +353,78 @@
           <w:rFonts w:ascii="Aptos" w:eastAsia="Aptos" w:hAnsi="Aptos" w:cs="Aptos"/>
         </w:rPr>
         <w:t>The inputs are therefore the chosen film, the chosen screen, the date, the time and the ticket price. The output is the updated list of screenings in the grid, along with the usual confirmation or warning message boxes. The processes behind the buttons are the same insert, update and delete operations as before, this time acting on the tblScreening table.</w:t>
+      </w:r>
+    </w:p>
+    <w:p>
+      <w:pPr>
+        <w:pStyle w:val="Heading3"/>
+        <w:spacing w:before="260" w:after="120"/>
+      </w:pPr>
+      <w:r>
+        <w:rPr>
+          <w:rFonts w:ascii="Aptos Display" w:eastAsia="Aptos Display" w:hAnsi="Aptos Display" w:cs="Aptos Display"/>
+          <w:b/>
+          <w:bCs/>
+          <w:color w:val="000000"/>
+        </w:rPr>
+        <w:t>Creating a Screen with Automatic Seat Generation (Objective 16)</w:t>
+      </w:r>
+    </w:p>
+    <w:p>
+      <w:pPr>
+        <w:spacing w:after="160" w:line="276" w:lineRule="auto"/>
+      </w:pPr>
+      <w:r>
+        <w:rPr>
+          <w:rFonts w:ascii="Aptos" w:eastAsia="Aptos" w:hAnsi="Aptos" w:cs="Aptos"/>
+        </w:rPr>
+        <w:t>Before a screening can be booked the cinema needs its physical screens set up in the system, each with the right number of seats. This objective is handled by the form named frmScreens, which once again uses the same familiar management layout with a data grid view named dgvScreens listing the existing screens and a small set of inputs with Add, Update, Delete and Clear buttons, so I will refer back to the Add Films form for that general behaviour. There are only two inputs here, a text box named txtName for the name of the screen and a text box named txtCapacity for how many seats it has.</w:t>
+      </w:r>
+    </w:p>
+    <w:p>
+      <w:pPr>
+        <w:spacing w:after="160" w:line="276" w:lineRule="auto"/>
+      </w:pPr>
+      <w:r>
+        <w:rPr>
+          <w:rFonts w:ascii="Aptos" w:eastAsia="Aptos" w:hAnsi="Aptos" w:cs="Aptos"/>
+        </w:rPr>
+        <w:lastRenderedPageBreak/>
+        <w:t>The interesting part of this objective, and the reason it is worth documenting separately, is what happens behind the Add button. When the user enters a name and a capacity and presses Add, the system does not just save the screen, it then automatically generates that number of seat records for it. In other words if the manager types a capacity of sixty, the system creates sixty individual seats for that screen without the manager having to type a single one of them in by hand. This was a direct response to feedback during the discussion stage, where it was pointed out that setting up every seat manually would be a nightmare, so having the system do it automatically is far more sophisticated and removes any chance of human error. If a screen is later edited and its capacity changes, the old seats are cleared out and a fresh set is generated to match, and if a screen is deleted its seats are removed first.</w:t>
+      </w:r>
+    </w:p>
+    <w:p>
+      <w:pPr>
+        <w:pBdr>
+          <w:top w:val="single" w:sz="6" w:space="6" w:color="A02B93"/>
+          <w:left w:val="single" w:sz="6" w:space="6" w:color="A02B93"/>
+          <w:bottom w:val="single" w:sz="6" w:space="6" w:color="A02B93"/>
+          <w:right w:val="single" w:sz="6" w:space="6" w:color="A02B93"/>
+        </w:pBdr>
+        <w:shd w:val="clear" w:color="auto" w:fill="F7E9F3"/>
+        <w:spacing w:before="120" w:after="200"/>
+      </w:pPr>
+      <w:r>
+        <w:rPr>
+          <w:rFonts w:ascii="Aptos" w:eastAsia="Aptos" w:hAnsi="Aptos" w:cs="Aptos"/>
+          <w:b/>
+          <w:bCs/>
+          <w:color w:val="A02B93"/>
+          <w:sz w:val="22"/>
+          <w:szCs w:val="22"/>
+        </w:rPr>
+        <w:t>Add Screens Form (frmScreens)</w:t>
+      </w:r>
+    </w:p>
+    <w:p>
+      <w:pPr>
+        <w:spacing w:after="160" w:line="276" w:lineRule="auto"/>
+      </w:pPr>
+      <w:r>
+        <w:rPr>
+          <w:rFonts w:ascii="Aptos" w:eastAsia="Aptos" w:hAnsi="Aptos" w:cs="Aptos"/>
+        </w:rPr>
+        <w:t>The inputs are the screen name and the capacity. The outputs are the updated list of screens and, crucially, a full set of seat records created in the tblSeat table for the new screen. The process behind the Add button is therefore two steps, first inserting the screen into the tblScreen table and reading back the new screen's identifier, and then looping to insert one seat record per seat into the tblSeat table so that the seats are ready for the booking form to use.</w:t>
       </w:r>
     </w:p>
     <w:p>

</xml_diff>

<commit_message>
added description for obj 1 and 2 in design
</commit_message>
<xml_diff>
--- a/Design.docx
+++ b/Design.docx
@@ -425,6 +425,95 @@
           <w:rFonts w:ascii="Aptos" w:eastAsia="Aptos" w:hAnsi="Aptos" w:cs="Aptos"/>
         </w:rPr>
         <w:t>The inputs are the screen name and the capacity. The outputs are the updated list of screens and, crucially, a full set of seat records created in the tblSeat table for the new screen. The process behind the Add button is therefore two steps, first inserting the screen into the tblScreen table and reading back the new screen's identifier, and then looping to insert one seat record per seat into the tblSeat table so that the seats are ready for the booking form to use.</w:t>
+      </w:r>
+    </w:p>
+    <w:p>
+      <w:pPr>
+        <w:pStyle w:val="Heading3"/>
+        <w:spacing w:before="260" w:after="120"/>
+      </w:pPr>
+      <w:r>
+        <w:rPr>
+          <w:rFonts w:ascii="Aptos Display" w:eastAsia="Aptos Display" w:hAnsi="Aptos Display" w:cs="Aptos Display"/>
+          <w:b/>
+          <w:bCs/>
+          <w:color w:val="000000"/>
+        </w:rPr>
+        <w:t>Adding Customer Bookings and Preventing Double Bookings (Objectives 1 and 2)</w:t>
+      </w:r>
+    </w:p>
+    <w:p>
+      <w:pPr>
+        <w:spacing w:after="160" w:line="276" w:lineRule="auto"/>
+      </w:pPr>
+      <w:r>
+        <w:rPr>
+          <w:rFonts w:ascii="Aptos" w:eastAsia="Aptos" w:hAnsi="Aptos" w:cs="Aptos"/>
+        </w:rPr>
+        <w:t>This is the heart of the whole system and the reason the project exists in the first place, so it is the most involved form to design. The objective is to let a member of staff create a booking for a customer against a particular screening, recording who the customer is, which seats they want and how many tickets that comes to, while making it impossible for a seat that has already been booked to be sold twice. Both of these objectives are handled together on the one form named frmBookings, because in practice they are the same job.</w:t>
+      </w:r>
+    </w:p>
+    <w:p>
+      <w:pPr>
+        <w:spacing w:after="160" w:line="276" w:lineRule="auto"/>
+      </w:pPr>
+      <w:r>
+        <w:rPr>
+          <w:rFonts w:ascii="Aptos" w:eastAsia="Aptos" w:hAnsi="Aptos" w:cs="Aptos"/>
+        </w:rPr>
+        <w:t xml:space="preserve">The top of the form has two combo boxes, named cboScreening and cboCustomer, where the member of staff first picks which screening the booking is for and then which customer it belongs to. There is also a check box named chkWalkIn labelled Walk-in, which lets staff take a booking for a customer who has just walked in without recording their details. The largest part of the form is a panel named pnlSeatMap which draws the seat map for the chosen screening, and next to it is a small legend made up of three coloured swatches labelled Available, Selected and Taken so the user knows what the colours mean. A label named lblTotal keeps a running count of how many seats have been selected, and along </w:t>
+      </w:r>
+      <w:r>
+        <w:rPr>
+          <w:rFonts w:ascii="Aptos" w:eastAsia="Aptos" w:hAnsi="Aptos" w:cs="Aptos"/>
+        </w:rPr>
+        <w:lastRenderedPageBreak/>
+        <w:t>the bottom are the action buttons, Create Booking named btnCreateBooking, Clear Selection named btnClear, Order Food named btnOrderFood and Sell Food Only named btnFoodOnly. A grid named dgvCustomerBookings shows the bookings the selected customer already has.</w:t>
+      </w:r>
+    </w:p>
+    <w:p>
+      <w:pPr>
+        <w:pBdr>
+          <w:top w:val="single" w:sz="6" w:space="6" w:color="A02B93"/>
+          <w:left w:val="single" w:sz="6" w:space="6" w:color="A02B93"/>
+          <w:bottom w:val="single" w:sz="6" w:space="6" w:color="A02B93"/>
+          <w:right w:val="single" w:sz="6" w:space="6" w:color="A02B93"/>
+        </w:pBdr>
+        <w:shd w:val="clear" w:color="auto" w:fill="F7E9F3"/>
+        <w:spacing w:before="120" w:after="200"/>
+      </w:pPr>
+      <w:r>
+        <w:rPr>
+          <w:rFonts w:ascii="Aptos" w:eastAsia="Aptos" w:hAnsi="Aptos" w:cs="Aptos"/>
+          <w:b/>
+          <w:bCs/>
+          <w:color w:val="A02B93"/>
+          <w:sz w:val="22"/>
+          <w:szCs w:val="22"/>
+        </w:rPr>
+        <w:t>Bookings Form (frmBookings)</w:t>
+      </w:r>
+    </w:p>
+    <w:p>
+      <w:pPr>
+        <w:spacing w:after="160" w:line="276" w:lineRule="auto"/>
+      </w:pPr>
+      <w:r>
+        <w:rPr>
+          <w:rFonts w:ascii="Aptos" w:eastAsia="Aptos" w:hAnsi="Aptos" w:cs="Aptos"/>
+        </w:rPr>
+        <w:t>The way the member of staff uses the form is that they choose a screening, choose a customer or tick the walk-in box, and the seat map then draws itself as a grid of clickable seat buttons laid out like the inside of the screen. Clicking an available seat selects it and it changes colour, and the running total updates as they go. When they are happy they press Create Booking. The inputs to the form are therefore the chosen screening, the chosen customer and the seats that are clicked. The outputs are the saved booking, a confirmation message, the refreshed seat map and the updated list of that customer's bookings. The processes behind the scenes are the insertion of a new record into the tblBooking table and the insertion of each chosen seat into the tblBookingSeat table.</w:t>
+      </w:r>
+    </w:p>
+    <w:p>
+      <w:pPr>
+        <w:spacing w:after="160" w:line="276" w:lineRule="auto"/>
+      </w:pPr>
+      <w:r>
+        <w:rPr>
+          <w:rFonts w:ascii="Aptos" w:eastAsia="Aptos" w:hAnsi="Aptos" w:cs="Aptos"/>
+        </w:rPr>
+        <w:t>Preventing double bookings, which is the whole point of Objective 2, is built directly into how the seat map is drawn. This is because when the map loads it asks the database which seats have already been booked for that screening, by looking in the tblBookingSeat table joined to the tblBooking table, and any seat that comes back as already taken is coloured with the Taken colour and, more importantly, is disabled so that it physically cannot be clicked. On top of that, as a second line of defence, when Create Booking is pressed the system checks once more that none of the selected seats have been taken by someone else in the meantime before it saves anything. In this way a seat can never be sold twice, both because a taken seat cannot be selected in the first place and because it is checked again at the moment of saving. I chose a clickable graphical seat map rather than, for example, asking staff to type in seat numbers, this is because it lets them see the whole screen at a glance and makes double booking obvious and impossible in a way that a list of numbers never could.</w:t>
       </w:r>
     </w:p>
     <w:p>

</xml_diff>

<commit_message>
added desc for obj 3 in design
</commit_message>
<xml_diff>
--- a/Design.docx
+++ b/Design.docx
@@ -11,13 +11,23 @@
           <w:color w:val="A02B93" w:themeColor="accent5"/>
         </w:rPr>
       </w:pPr>
+      <w:proofErr w:type="spellStart"/>
       <w:r>
         <w:rPr>
           <w:b/>
           <w:bCs/>
           <w:color w:val="A02B93" w:themeColor="accent5"/>
         </w:rPr>
-        <w:t>Filmtopia Project Design</w:t>
+        <w:t>Filmtopia</w:t>
+      </w:r>
+      <w:proofErr w:type="spellEnd"/>
+      <w:r>
+        <w:rPr>
+          <w:b/>
+          <w:bCs/>
+          <w:color w:val="A02B93" w:themeColor="accent5"/>
+        </w:rPr>
+        <w:t xml:space="preserve"> Project Design</w:t>
       </w:r>
     </w:p>
     <w:p>
@@ -43,7 +53,21 @@
         <w:rPr>
           <w:rFonts w:ascii="Aptos" w:eastAsia="Aptos" w:hAnsi="Aptos" w:cs="Aptos"/>
         </w:rPr>
-        <w:t>The purpose of this section is to design the way that the user will interact with the Filmtopia system before any of it is actually built. In other words this is where I plan out every form the user will see, the information that goes into each one and the information that comes back out, so that when I move on to writing the code I already have a clear picture of what I am building rather than making it up as I go along. I have taken each objective in turn as a heading and described how the interface will behave for that objective, and for every form or report involved I have drawn a wireframe showing roughly where the labels, text boxes and buttons will sit. These drawings are deliberately kept simple so that it is obvious they are design sketches and not screenshots of a finished program.</w:t>
+        <w:t xml:space="preserve">The purpose of this section is to design the way that the user will interact with the </w:t>
+      </w:r>
+      <w:proofErr w:type="spellStart"/>
+      <w:r>
+        <w:rPr>
+          <w:rFonts w:ascii="Aptos" w:eastAsia="Aptos" w:hAnsi="Aptos" w:cs="Aptos"/>
+        </w:rPr>
+        <w:t>Filmtopia</w:t>
+      </w:r>
+      <w:proofErr w:type="spellEnd"/>
+      <w:r>
+        <w:rPr>
+          <w:rFonts w:ascii="Aptos" w:eastAsia="Aptos" w:hAnsi="Aptos" w:cs="Aptos"/>
+        </w:rPr>
+        <w:t xml:space="preserve"> system before any of it is actually built. In other words this is where I plan out every form the user will see, the information that goes into each one and the information that comes back out, so that when I move on to writing the code I already have a clear picture of what I am building rather than making it up as I go along. I have taken each objective in turn as a heading and described how the interface will behave for that objective, and for every form or report involved I have drawn a wireframe showing roughly where the labels, text boxes and buttons will sit. These drawings are deliberately kept simple so that it is obvious they are design sketches and not screenshots of a finished program.</w:t>
       </w:r>
     </w:p>
     <w:p>
@@ -57,7 +81,77 @@
         <w:rPr>
           <w:rFonts w:ascii="Aptos" w:eastAsia="Aptos" w:hAnsi="Aptos" w:cs="Aptos"/>
         </w:rPr>
-        <w:t>Before going through the objectives one at a time it is worth explaining a couple of decisions that apply across the whole system. Filmtopia is built as a Windows Forms desktop application, so every screen is a form made up of standard controls such as text boxes, labels, buttons and data grids. I have chosen to name my controls using a short prefix that describes what each one is, for example txt for a text box, btn for a button, lbl for a label, cbo for a combo box and dgv for a data grid view, followed by a word describing its job. This is because a consistent naming convention makes the code far easier to read later on and stops me getting confused between similarly named items. I have also decided not to worry too much about the finer details of colour at this stage, this is because the guidance makes clear that the interface will be refined after the prototype in section 5.2, so it makes sense to settle the layout and the flow first and then tidy up the appearance once I know everything works.</w:t>
+        <w:t xml:space="preserve">Before going through the objectives one at a time it is worth explaining a couple of decisions that apply across the whole system. </w:t>
+      </w:r>
+      <w:proofErr w:type="spellStart"/>
+      <w:r>
+        <w:rPr>
+          <w:rFonts w:ascii="Aptos" w:eastAsia="Aptos" w:hAnsi="Aptos" w:cs="Aptos"/>
+        </w:rPr>
+        <w:t>Filmtopia</w:t>
+      </w:r>
+      <w:proofErr w:type="spellEnd"/>
+      <w:r>
+        <w:rPr>
+          <w:rFonts w:ascii="Aptos" w:eastAsia="Aptos" w:hAnsi="Aptos" w:cs="Aptos"/>
+        </w:rPr>
+        <w:t xml:space="preserve"> is built as a Windows Forms desktop application, so every screen is a form made up of standard controls such as text boxes, labels, buttons and data grids. I have chosen to name my controls using a short prefix that describes what each one is, for example txt for a text box, </w:t>
+      </w:r>
+      <w:proofErr w:type="spellStart"/>
+      <w:r>
+        <w:rPr>
+          <w:rFonts w:ascii="Aptos" w:eastAsia="Aptos" w:hAnsi="Aptos" w:cs="Aptos"/>
+        </w:rPr>
+        <w:t>btn</w:t>
+      </w:r>
+      <w:proofErr w:type="spellEnd"/>
+      <w:r>
+        <w:rPr>
+          <w:rFonts w:ascii="Aptos" w:eastAsia="Aptos" w:hAnsi="Aptos" w:cs="Aptos"/>
+        </w:rPr>
+        <w:t xml:space="preserve"> for a button, </w:t>
+      </w:r>
+      <w:proofErr w:type="spellStart"/>
+      <w:r>
+        <w:rPr>
+          <w:rFonts w:ascii="Aptos" w:eastAsia="Aptos" w:hAnsi="Aptos" w:cs="Aptos"/>
+        </w:rPr>
+        <w:t>lbl</w:t>
+      </w:r>
+      <w:proofErr w:type="spellEnd"/>
+      <w:r>
+        <w:rPr>
+          <w:rFonts w:ascii="Aptos" w:eastAsia="Aptos" w:hAnsi="Aptos" w:cs="Aptos"/>
+        </w:rPr>
+        <w:t xml:space="preserve"> for a label, </w:t>
+      </w:r>
+      <w:proofErr w:type="spellStart"/>
+      <w:r>
+        <w:rPr>
+          <w:rFonts w:ascii="Aptos" w:eastAsia="Aptos" w:hAnsi="Aptos" w:cs="Aptos"/>
+        </w:rPr>
+        <w:t>cbo</w:t>
+      </w:r>
+      <w:proofErr w:type="spellEnd"/>
+      <w:r>
+        <w:rPr>
+          <w:rFonts w:ascii="Aptos" w:eastAsia="Aptos" w:hAnsi="Aptos" w:cs="Aptos"/>
+        </w:rPr>
+        <w:t xml:space="preserve"> for a combo box and </w:t>
+      </w:r>
+      <w:proofErr w:type="spellStart"/>
+      <w:r>
+        <w:rPr>
+          <w:rFonts w:ascii="Aptos" w:eastAsia="Aptos" w:hAnsi="Aptos" w:cs="Aptos"/>
+        </w:rPr>
+        <w:t>dgv</w:t>
+      </w:r>
+      <w:proofErr w:type="spellEnd"/>
+      <w:r>
+        <w:rPr>
+          <w:rFonts w:ascii="Aptos" w:eastAsia="Aptos" w:hAnsi="Aptos" w:cs="Aptos"/>
+        </w:rPr>
+        <w:t xml:space="preserve"> for a data grid view, followed by a word describing its job. This is because a consistent naming convention makes the code far easier to read later on and stops me getting confused between similarly named items. I have also decided not to worry too much about the finer details of colour at this stage, this is because the guidance makes clear that the interface will be refined after the prototype in section 5.2, so it makes sense to settle the layout and the flow first and then tidy up the appearance once I know everything works.</w:t>
       </w:r>
     </w:p>
     <w:p>
@@ -83,7 +177,35 @@
         <w:rPr>
           <w:rFonts w:ascii="Aptos" w:eastAsia="Aptos" w:hAnsi="Aptos" w:cs="Aptos"/>
         </w:rPr>
-        <w:t>The first thing any user meets when they open Filmtopia is the login screen, so this is where the design naturally starts. The objective here is to make sure that customers, staff and managers are not all able to do the same things, because a normal member of staff being able to reach the manager's sales reports or the audit log would be a serious security weakness. To achieve this the system asks for a username and a password on a small login form, checks them against the tblLogin table, and reads back an access level number that then decides what the user is allowed to see.</w:t>
+        <w:t xml:space="preserve">The first thing any user meets when they open </w:t>
+      </w:r>
+      <w:proofErr w:type="spellStart"/>
+      <w:r>
+        <w:rPr>
+          <w:rFonts w:ascii="Aptos" w:eastAsia="Aptos" w:hAnsi="Aptos" w:cs="Aptos"/>
+        </w:rPr>
+        <w:t>Filmtopia</w:t>
+      </w:r>
+      <w:proofErr w:type="spellEnd"/>
+      <w:r>
+        <w:rPr>
+          <w:rFonts w:ascii="Aptos" w:eastAsia="Aptos" w:hAnsi="Aptos" w:cs="Aptos"/>
+        </w:rPr>
+        <w:t xml:space="preserve"> is the login screen, so this is where the design naturally starts. The objective here is to make sure that customers, staff and managers are not all able to do the same things, because a normal member of staff being able to reach the manager's sales reports or the audit log would be a serious security weakness. To achieve this the system asks for a username and a password on a small login form, checks them against the </w:t>
+      </w:r>
+      <w:proofErr w:type="spellStart"/>
+      <w:r>
+        <w:rPr>
+          <w:rFonts w:ascii="Aptos" w:eastAsia="Aptos" w:hAnsi="Aptos" w:cs="Aptos"/>
+        </w:rPr>
+        <w:t>tblLogin</w:t>
+      </w:r>
+      <w:proofErr w:type="spellEnd"/>
+      <w:r>
+        <w:rPr>
+          <w:rFonts w:ascii="Aptos" w:eastAsia="Aptos" w:hAnsi="Aptos" w:cs="Aptos"/>
+        </w:rPr>
+        <w:t xml:space="preserve"> table, and reads back an access level number that then decides what the user is allowed to see.</w:t>
       </w:r>
     </w:p>
     <w:p>
@@ -94,14 +216,84 @@
         <w:rPr>
           <w:rFonts w:ascii="Aptos" w:eastAsia="Aptos" w:hAnsi="Aptos" w:cs="Aptos"/>
         </w:rPr>
-        <w:t xml:space="preserve">The login form itself is deliberately kept small and uncomplicated. It has a header panel across the top showing the name Filmtopia and the subtitle Cinema Management System </w:t>
+        <w:t xml:space="preserve">The login form itself is deliberately kept small and uncomplicated. It has a header panel across the top showing the name </w:t>
+      </w:r>
+      <w:proofErr w:type="spellStart"/>
+      <w:r>
+        <w:rPr>
+          <w:rFonts w:ascii="Aptos" w:eastAsia="Aptos" w:hAnsi="Aptos" w:cs="Aptos"/>
+        </w:rPr>
+        <w:t>Filmtopia</w:t>
+      </w:r>
+      <w:proofErr w:type="spellEnd"/>
+      <w:r>
+        <w:rPr>
+          <w:rFonts w:ascii="Aptos" w:eastAsia="Aptos" w:hAnsi="Aptos" w:cs="Aptos"/>
+        </w:rPr>
+        <w:t xml:space="preserve"> and the subtitle Cinema Management System </w:t>
       </w:r>
       <w:r>
         <w:rPr>
           <w:rFonts w:ascii="Aptos" w:eastAsia="Aptos" w:hAnsi="Aptos" w:cs="Aptos"/>
         </w:rPr>
         <w:lastRenderedPageBreak/>
-        <w:t>so the user knows straight away what they are logging into. Below that are two labels, Username and Password, each sitting next to its own text box, which I have named txtUsername and txtPassword. The password box will have its characters masked so that anyone standing nearby cannot read what is being typed. Underneath the boxes are two buttons, a Log In button named btnLogin which carries out the check, and a Cancel button named btnClose which closes the program if the user changes their mind. A small version label sits at the very bottom of the form.</w:t>
+        <w:t xml:space="preserve">so the user knows straight away what they are logging into. Below that are two labels, Username and Password, each sitting next to its own text box, which I have named </w:t>
+      </w:r>
+      <w:proofErr w:type="spellStart"/>
+      <w:r>
+        <w:rPr>
+          <w:rFonts w:ascii="Aptos" w:eastAsia="Aptos" w:hAnsi="Aptos" w:cs="Aptos"/>
+        </w:rPr>
+        <w:t>txtUsername</w:t>
+      </w:r>
+      <w:proofErr w:type="spellEnd"/>
+      <w:r>
+        <w:rPr>
+          <w:rFonts w:ascii="Aptos" w:eastAsia="Aptos" w:hAnsi="Aptos" w:cs="Aptos"/>
+        </w:rPr>
+        <w:t xml:space="preserve"> and </w:t>
+      </w:r>
+      <w:proofErr w:type="spellStart"/>
+      <w:r>
+        <w:rPr>
+          <w:rFonts w:ascii="Aptos" w:eastAsia="Aptos" w:hAnsi="Aptos" w:cs="Aptos"/>
+        </w:rPr>
+        <w:t>txtPassword</w:t>
+      </w:r>
+      <w:proofErr w:type="spellEnd"/>
+      <w:r>
+        <w:rPr>
+          <w:rFonts w:ascii="Aptos" w:eastAsia="Aptos" w:hAnsi="Aptos" w:cs="Aptos"/>
+        </w:rPr>
+        <w:t xml:space="preserve">. The password box will have its characters masked so that anyone standing nearby cannot read what is being typed. Underneath the boxes are two buttons, a Log In button named </w:t>
+      </w:r>
+      <w:proofErr w:type="spellStart"/>
+      <w:r>
+        <w:rPr>
+          <w:rFonts w:ascii="Aptos" w:eastAsia="Aptos" w:hAnsi="Aptos" w:cs="Aptos"/>
+        </w:rPr>
+        <w:t>btnLogin</w:t>
+      </w:r>
+      <w:proofErr w:type="spellEnd"/>
+      <w:r>
+        <w:rPr>
+          <w:rFonts w:ascii="Aptos" w:eastAsia="Aptos" w:hAnsi="Aptos" w:cs="Aptos"/>
+        </w:rPr>
+        <w:t xml:space="preserve"> which carries out the check, and a Cancel button named </w:t>
+      </w:r>
+      <w:proofErr w:type="spellStart"/>
+      <w:r>
+        <w:rPr>
+          <w:rFonts w:ascii="Aptos" w:eastAsia="Aptos" w:hAnsi="Aptos" w:cs="Aptos"/>
+        </w:rPr>
+        <w:t>btnClose</w:t>
+      </w:r>
+      <w:proofErr w:type="spellEnd"/>
+      <w:r>
+        <w:rPr>
+          <w:rFonts w:ascii="Aptos" w:eastAsia="Aptos" w:hAnsi="Aptos" w:cs="Aptos"/>
+        </w:rPr>
+        <w:t xml:space="preserve"> which closes the program if the user changes their mind. A small version label sits at the very bottom of the form.</w:t>
       </w:r>
     </w:p>
     <w:p>
@@ -124,7 +316,31 @@
           <w:sz w:val="22"/>
           <w:szCs w:val="22"/>
         </w:rPr>
-        <w:t>Login Form (frmLogin)</w:t>
+        <w:t>Login Form (</w:t>
+      </w:r>
+      <w:proofErr w:type="spellStart"/>
+      <w:r>
+        <w:rPr>
+          <w:rFonts w:ascii="Aptos" w:eastAsia="Aptos" w:hAnsi="Aptos" w:cs="Aptos"/>
+          <w:b/>
+          <w:bCs/>
+          <w:color w:val="A02B93"/>
+          <w:sz w:val="22"/>
+          <w:szCs w:val="22"/>
+        </w:rPr>
+        <w:t>frmLogin</w:t>
+      </w:r>
+      <w:proofErr w:type="spellEnd"/>
+      <w:r>
+        <w:rPr>
+          <w:rFonts w:ascii="Aptos" w:eastAsia="Aptos" w:hAnsi="Aptos" w:cs="Aptos"/>
+          <w:b/>
+          <w:bCs/>
+          <w:color w:val="A02B93"/>
+          <w:sz w:val="22"/>
+          <w:szCs w:val="22"/>
+        </w:rPr>
+        <w:t>)</w:t>
       </w:r>
     </w:p>
     <w:p>
@@ -135,7 +351,35 @@
         <w:rPr>
           <w:rFonts w:ascii="Aptos" w:eastAsia="Aptos" w:hAnsi="Aptos" w:cs="Aptos"/>
         </w:rPr>
-        <w:t>The only input to this form is the username and password typed by the user. The output, once the button is pressed, is either entry into the main menu or a message box telling the user that their details were not recognised. The process that happens in between is a lookup against the tblLogin table for a matching username, a comparison of the stored password, and if everything matches, the storing of that user's access level in a variable called UserAccessLevel that the rest of the program can read. I have chosen buttons here rather than, for example, expecting the user to press the Enter key, this is because a clearly labelled Log In button leaves no doubt about what to do and is friendlier for staff who are not especially technical.</w:t>
+        <w:t xml:space="preserve">The only input to this form is the username and password typed by the user. The output, once the button is pressed, is either entry into the main menu or a message box telling the user that their details were not recognised. The process that happens in between is a lookup against the </w:t>
+      </w:r>
+      <w:proofErr w:type="spellStart"/>
+      <w:r>
+        <w:rPr>
+          <w:rFonts w:ascii="Aptos" w:eastAsia="Aptos" w:hAnsi="Aptos" w:cs="Aptos"/>
+        </w:rPr>
+        <w:t>tblLogin</w:t>
+      </w:r>
+      <w:proofErr w:type="spellEnd"/>
+      <w:r>
+        <w:rPr>
+          <w:rFonts w:ascii="Aptos" w:eastAsia="Aptos" w:hAnsi="Aptos" w:cs="Aptos"/>
+        </w:rPr>
+        <w:t xml:space="preserve"> table for a matching username, a comparison of the stored password, and if everything matches, the storing of that user's access level in a variable called </w:t>
+      </w:r>
+      <w:proofErr w:type="spellStart"/>
+      <w:r>
+        <w:rPr>
+          <w:rFonts w:ascii="Aptos" w:eastAsia="Aptos" w:hAnsi="Aptos" w:cs="Aptos"/>
+        </w:rPr>
+        <w:t>UserAccessLevel</w:t>
+      </w:r>
+      <w:proofErr w:type="spellEnd"/>
+      <w:r>
+        <w:rPr>
+          <w:rFonts w:ascii="Aptos" w:eastAsia="Aptos" w:hAnsi="Aptos" w:cs="Aptos"/>
+        </w:rPr>
+        <w:t xml:space="preserve"> that the rest of the program can read. I have chosen buttons here rather than, for example, expecting the user to press the Enter key, this is because a clearly labelled Log In button leaves no doubt about what to do and is friendlier for staff who are not especially technical.</w:t>
       </w:r>
     </w:p>
     <w:p>
@@ -146,7 +390,35 @@
         <w:rPr>
           <w:rFonts w:ascii="Aptos" w:eastAsia="Aptos" w:hAnsi="Aptos" w:cs="Aptos"/>
         </w:rPr>
-        <w:t>Once a user has logged in successfully they are taken to the main menu, which is the form named frmMainForm and acts as the hub for the whole system. Every other part of Filmtopia is reached from here by pressing a button, which I felt was a far more sophisticated and easier to follow approach than burying features inside drop-down menus that a busy member of staff would have to go hunting through. The menu shows a welcome message at the top and then a column of buttons down the content area, one for each area of the system, for example Bookings, Find Booking, Screenings, Films, Screens, Food, Reports, Customers, Logs and a Logout button.</w:t>
+        <w:t xml:space="preserve">Once a user has logged in successfully they are taken to the main menu, which is the form named </w:t>
+      </w:r>
+      <w:proofErr w:type="spellStart"/>
+      <w:r>
+        <w:rPr>
+          <w:rFonts w:ascii="Aptos" w:eastAsia="Aptos" w:hAnsi="Aptos" w:cs="Aptos"/>
+        </w:rPr>
+        <w:t>frmMainForm</w:t>
+      </w:r>
+      <w:proofErr w:type="spellEnd"/>
+      <w:r>
+        <w:rPr>
+          <w:rFonts w:ascii="Aptos" w:eastAsia="Aptos" w:hAnsi="Aptos" w:cs="Aptos"/>
+        </w:rPr>
+        <w:t xml:space="preserve"> and acts as the hub for the whole system. Every other part of </w:t>
+      </w:r>
+      <w:proofErr w:type="spellStart"/>
+      <w:r>
+        <w:rPr>
+          <w:rFonts w:ascii="Aptos" w:eastAsia="Aptos" w:hAnsi="Aptos" w:cs="Aptos"/>
+        </w:rPr>
+        <w:t>Filmtopia</w:t>
+      </w:r>
+      <w:proofErr w:type="spellEnd"/>
+      <w:r>
+        <w:rPr>
+          <w:rFonts w:ascii="Aptos" w:eastAsia="Aptos" w:hAnsi="Aptos" w:cs="Aptos"/>
+        </w:rPr>
+        <w:t xml:space="preserve"> is reached from here by pressing a button, which I felt was a far more sophisticated and easier to follow approach than burying features inside drop-down menus that a busy member of staff would have to go hunting through. The menu shows a welcome message at the top and then a column of buttons down the content area, one for each area of the system, for example Bookings, Find Booking, Screenings, Films, Screens, Food, Reports, Customers, Logs and a Logout button.</w:t>
       </w:r>
     </w:p>
     <w:p>
@@ -157,7 +429,35 @@
         <w:rPr>
           <w:rFonts w:ascii="Aptos" w:eastAsia="Aptos" w:hAnsi="Aptos" w:cs="Aptos"/>
         </w:rPr>
-        <w:t>What makes this form important for the objective is that the buttons shown depend entirely on the access level that was read at login. This is because a manager, whose access level is 1, needs to see everything, whereas a normal member of staff, whose access level is 2, should only see the day to day booking functions. When a manager logs in the group box is titled Filmtopia Admin and the management buttons for Films, Screens, Food, Reports and Logs are all made visible. When a member of staff logs in those same buttons are hidden and the group box is titled Filmtopia Staff, leaving them with just the booking related functions. In this way a single form quietly enforces the whole access level objective without the staff member ever seeing an option they are not allowed to use.</w:t>
+        <w:t xml:space="preserve">What makes this form important for the objective is that the buttons shown depend entirely on the access level that was read at login. This is because a manager, whose access level is 1, needs to see everything, whereas a normal member of staff, whose access level is 2, should only see the day to day booking functions. When a manager logs in the group box is titled </w:t>
+      </w:r>
+      <w:proofErr w:type="spellStart"/>
+      <w:r>
+        <w:rPr>
+          <w:rFonts w:ascii="Aptos" w:eastAsia="Aptos" w:hAnsi="Aptos" w:cs="Aptos"/>
+        </w:rPr>
+        <w:t>Filmtopia</w:t>
+      </w:r>
+      <w:proofErr w:type="spellEnd"/>
+      <w:r>
+        <w:rPr>
+          <w:rFonts w:ascii="Aptos" w:eastAsia="Aptos" w:hAnsi="Aptos" w:cs="Aptos"/>
+        </w:rPr>
+        <w:t xml:space="preserve"> Admin and the management buttons for Films, Screens, Food, Reports and Logs are all made visible. When a member of staff logs in those same buttons are hidden and the group box is titled </w:t>
+      </w:r>
+      <w:proofErr w:type="spellStart"/>
+      <w:r>
+        <w:rPr>
+          <w:rFonts w:ascii="Aptos" w:eastAsia="Aptos" w:hAnsi="Aptos" w:cs="Aptos"/>
+        </w:rPr>
+        <w:t>Filmtopia</w:t>
+      </w:r>
+      <w:proofErr w:type="spellEnd"/>
+      <w:r>
+        <w:rPr>
+          <w:rFonts w:ascii="Aptos" w:eastAsia="Aptos" w:hAnsi="Aptos" w:cs="Aptos"/>
+        </w:rPr>
+        <w:t xml:space="preserve"> Staff, leaving them with just the booking related functions. In this way a single form quietly enforces the whole access level objective without the staff member ever seeing an option they are not allowed to use.</w:t>
       </w:r>
     </w:p>
     <w:p>
@@ -181,7 +481,31 @@
           <w:szCs w:val="22"/>
         </w:rPr>
         <w:lastRenderedPageBreak/>
-        <w:t>Main Menu (frmMainForm)</w:t>
+        <w:t>Main Menu (</w:t>
+      </w:r>
+      <w:proofErr w:type="spellStart"/>
+      <w:r>
+        <w:rPr>
+          <w:rFonts w:ascii="Aptos" w:eastAsia="Aptos" w:hAnsi="Aptos" w:cs="Aptos"/>
+          <w:b/>
+          <w:bCs/>
+          <w:color w:val="A02B93"/>
+          <w:sz w:val="22"/>
+          <w:szCs w:val="22"/>
+        </w:rPr>
+        <w:t>frmMainForm</w:t>
+      </w:r>
+      <w:proofErr w:type="spellEnd"/>
+      <w:r>
+        <w:rPr>
+          <w:rFonts w:ascii="Aptos" w:eastAsia="Aptos" w:hAnsi="Aptos" w:cs="Aptos"/>
+          <w:b/>
+          <w:bCs/>
+          <w:color w:val="A02B93"/>
+          <w:sz w:val="22"/>
+          <w:szCs w:val="22"/>
+        </w:rPr>
+        <w:t>)</w:t>
       </w:r>
     </w:p>
     <w:p>
@@ -218,7 +542,21 @@
         <w:rPr>
           <w:rFonts w:ascii="Aptos" w:eastAsia="Aptos" w:hAnsi="Aptos" w:cs="Aptos"/>
         </w:rPr>
-        <w:t>Moving on to the management side of the system, one of the first jobs a manager or member of staff needs to do is add the films that the cinema is showing, because without any films in the system there is nothing for a screening to be attached to. This objective is handled by a single form named frmFilms which lets the user add a new film, edit an existing one, or remove one that is no longer being shown.</w:t>
+        <w:t xml:space="preserve">Moving on to the management side of the system, one of the first jobs a manager or member of staff needs to do is add the films that the cinema is showing, because without any films in the system there is nothing for a screening to be attached to. This objective is handled by a single form named </w:t>
+      </w:r>
+      <w:proofErr w:type="spellStart"/>
+      <w:r>
+        <w:rPr>
+          <w:rFonts w:ascii="Aptos" w:eastAsia="Aptos" w:hAnsi="Aptos" w:cs="Aptos"/>
+        </w:rPr>
+        <w:t>frmFilms</w:t>
+      </w:r>
+      <w:proofErr w:type="spellEnd"/>
+      <w:r>
+        <w:rPr>
+          <w:rFonts w:ascii="Aptos" w:eastAsia="Aptos" w:hAnsi="Aptos" w:cs="Aptos"/>
+        </w:rPr>
+        <w:t xml:space="preserve"> which lets the user add a new film, edit an existing one, or remove one that is no longer being shown.</w:t>
       </w:r>
     </w:p>
     <w:p>
@@ -229,7 +567,133 @@
         <w:rPr>
           <w:rFonts w:ascii="Aptos" w:eastAsia="Aptos" w:hAnsi="Aptos" w:cs="Aptos"/>
         </w:rPr>
-        <w:t>The form is split into two halves. On one side is a data grid view named dgvFilms which lists every film already stored in the system, showing its title, age rating, duration and description in a table so the user can see at a glance what is already there. On the other side is a set of input boxes for the details of a film, made up of a label and a text box for each field, which I have named txtTitle, txtAgeRating, txtDuration and txtDescription. Beneath these are four buttons, Add, Update, Delete and Clear, which I have named btnAdd, btnUpdate, btnDelete and btnClear.</w:t>
+        <w:t xml:space="preserve">The form is split into two halves. On one side is a data grid view named </w:t>
+      </w:r>
+      <w:proofErr w:type="spellStart"/>
+      <w:r>
+        <w:rPr>
+          <w:rFonts w:ascii="Aptos" w:eastAsia="Aptos" w:hAnsi="Aptos" w:cs="Aptos"/>
+        </w:rPr>
+        <w:t>dgvFilms</w:t>
+      </w:r>
+      <w:proofErr w:type="spellEnd"/>
+      <w:r>
+        <w:rPr>
+          <w:rFonts w:ascii="Aptos" w:eastAsia="Aptos" w:hAnsi="Aptos" w:cs="Aptos"/>
+        </w:rPr>
+        <w:t xml:space="preserve"> which lists every film already stored in the system, showing its title, age rating, duration and description in a table so the user can see at a glance what is already there. On the other side is a set of input boxes for the details of a film, made up of a label and a text box for each field, which I have named </w:t>
+      </w:r>
+      <w:proofErr w:type="spellStart"/>
+      <w:r>
+        <w:rPr>
+          <w:rFonts w:ascii="Aptos" w:eastAsia="Aptos" w:hAnsi="Aptos" w:cs="Aptos"/>
+        </w:rPr>
+        <w:t>txtTitle</w:t>
+      </w:r>
+      <w:proofErr w:type="spellEnd"/>
+      <w:r>
+        <w:rPr>
+          <w:rFonts w:ascii="Aptos" w:eastAsia="Aptos" w:hAnsi="Aptos" w:cs="Aptos"/>
+        </w:rPr>
+        <w:t xml:space="preserve">, </w:t>
+      </w:r>
+      <w:proofErr w:type="spellStart"/>
+      <w:r>
+        <w:rPr>
+          <w:rFonts w:ascii="Aptos" w:eastAsia="Aptos" w:hAnsi="Aptos" w:cs="Aptos"/>
+        </w:rPr>
+        <w:t>txtAgeRating</w:t>
+      </w:r>
+      <w:proofErr w:type="spellEnd"/>
+      <w:r>
+        <w:rPr>
+          <w:rFonts w:ascii="Aptos" w:eastAsia="Aptos" w:hAnsi="Aptos" w:cs="Aptos"/>
+        </w:rPr>
+        <w:t xml:space="preserve">, </w:t>
+      </w:r>
+      <w:proofErr w:type="spellStart"/>
+      <w:r>
+        <w:rPr>
+          <w:rFonts w:ascii="Aptos" w:eastAsia="Aptos" w:hAnsi="Aptos" w:cs="Aptos"/>
+        </w:rPr>
+        <w:t>txtDuration</w:t>
+      </w:r>
+      <w:proofErr w:type="spellEnd"/>
+      <w:r>
+        <w:rPr>
+          <w:rFonts w:ascii="Aptos" w:eastAsia="Aptos" w:hAnsi="Aptos" w:cs="Aptos"/>
+        </w:rPr>
+        <w:t xml:space="preserve"> and </w:t>
+      </w:r>
+      <w:proofErr w:type="spellStart"/>
+      <w:r>
+        <w:rPr>
+          <w:rFonts w:ascii="Aptos" w:eastAsia="Aptos" w:hAnsi="Aptos" w:cs="Aptos"/>
+        </w:rPr>
+        <w:t>txtDescription</w:t>
+      </w:r>
+      <w:proofErr w:type="spellEnd"/>
+      <w:r>
+        <w:rPr>
+          <w:rFonts w:ascii="Aptos" w:eastAsia="Aptos" w:hAnsi="Aptos" w:cs="Aptos"/>
+        </w:rPr>
+        <w:t xml:space="preserve">. Beneath these are four buttons, Add, Update, Delete and Clear, which I have named </w:t>
+      </w:r>
+      <w:proofErr w:type="spellStart"/>
+      <w:r>
+        <w:rPr>
+          <w:rFonts w:ascii="Aptos" w:eastAsia="Aptos" w:hAnsi="Aptos" w:cs="Aptos"/>
+        </w:rPr>
+        <w:t>btnAdd</w:t>
+      </w:r>
+      <w:proofErr w:type="spellEnd"/>
+      <w:r>
+        <w:rPr>
+          <w:rFonts w:ascii="Aptos" w:eastAsia="Aptos" w:hAnsi="Aptos" w:cs="Aptos"/>
+        </w:rPr>
+        <w:t xml:space="preserve">, </w:t>
+      </w:r>
+      <w:proofErr w:type="spellStart"/>
+      <w:r>
+        <w:rPr>
+          <w:rFonts w:ascii="Aptos" w:eastAsia="Aptos" w:hAnsi="Aptos" w:cs="Aptos"/>
+        </w:rPr>
+        <w:t>btnUpdate</w:t>
+      </w:r>
+      <w:proofErr w:type="spellEnd"/>
+      <w:r>
+        <w:rPr>
+          <w:rFonts w:ascii="Aptos" w:eastAsia="Aptos" w:hAnsi="Aptos" w:cs="Aptos"/>
+        </w:rPr>
+        <w:t xml:space="preserve">, </w:t>
+      </w:r>
+      <w:proofErr w:type="spellStart"/>
+      <w:r>
+        <w:rPr>
+          <w:rFonts w:ascii="Aptos" w:eastAsia="Aptos" w:hAnsi="Aptos" w:cs="Aptos"/>
+        </w:rPr>
+        <w:t>btnDelete</w:t>
+      </w:r>
+      <w:proofErr w:type="spellEnd"/>
+      <w:r>
+        <w:rPr>
+          <w:rFonts w:ascii="Aptos" w:eastAsia="Aptos" w:hAnsi="Aptos" w:cs="Aptos"/>
+        </w:rPr>
+        <w:t xml:space="preserve"> and </w:t>
+      </w:r>
+      <w:proofErr w:type="spellStart"/>
+      <w:r>
+        <w:rPr>
+          <w:rFonts w:ascii="Aptos" w:eastAsia="Aptos" w:hAnsi="Aptos" w:cs="Aptos"/>
+        </w:rPr>
+        <w:t>btnClear</w:t>
+      </w:r>
+      <w:proofErr w:type="spellEnd"/>
+      <w:r>
+        <w:rPr>
+          <w:rFonts w:ascii="Aptos" w:eastAsia="Aptos" w:hAnsi="Aptos" w:cs="Aptos"/>
+        </w:rPr>
+        <w:t>.</w:t>
       </w:r>
     </w:p>
     <w:p>
@@ -252,7 +716,31 @@
           <w:sz w:val="22"/>
           <w:szCs w:val="22"/>
         </w:rPr>
-        <w:t>Add Films Form (frmFilms)</w:t>
+        <w:t>Add Films Form (</w:t>
+      </w:r>
+      <w:proofErr w:type="spellStart"/>
+      <w:r>
+        <w:rPr>
+          <w:rFonts w:ascii="Aptos" w:eastAsia="Aptos" w:hAnsi="Aptos" w:cs="Aptos"/>
+          <w:b/>
+          <w:bCs/>
+          <w:color w:val="A02B93"/>
+          <w:sz w:val="22"/>
+          <w:szCs w:val="22"/>
+        </w:rPr>
+        <w:t>frmFilms</w:t>
+      </w:r>
+      <w:proofErr w:type="spellEnd"/>
+      <w:r>
+        <w:rPr>
+          <w:rFonts w:ascii="Aptos" w:eastAsia="Aptos" w:hAnsi="Aptos" w:cs="Aptos"/>
+          <w:b/>
+          <w:bCs/>
+          <w:color w:val="A02B93"/>
+          <w:sz w:val="22"/>
+          <w:szCs w:val="22"/>
+        </w:rPr>
+        <w:t>)</w:t>
       </w:r>
     </w:p>
     <w:p>
@@ -263,7 +751,21 @@
         <w:rPr>
           <w:rFonts w:ascii="Aptos" w:eastAsia="Aptos" w:hAnsi="Aptos" w:cs="Aptos"/>
         </w:rPr>
-        <w:t>The inputs to this form are the four film details typed into the text boxes. The outputs are the updated list of films shown in the grid and, where appropriate, a message box confirming that a film has been added or warning the user if something has gone wrong. The processes behind the buttons are straightforward database operations, for example the Add button takes whatever is in the text boxes and inserts a new record into the tblFilm table, whereas the Update button changes the record for the film currently selected in the grid, and the Delete button removes it. The Clear button simply empties the text boxes so the user can start again.</w:t>
+        <w:t xml:space="preserve">The inputs to this form are the four film details typed into the text boxes. The outputs are the updated list of films shown in the grid and, where appropriate, a message box confirming that a film has been added or warning the user if something has gone wrong. The processes behind the buttons are straightforward database operations, for example the Add button takes whatever is in the text boxes and inserts a new record into the </w:t>
+      </w:r>
+      <w:proofErr w:type="spellStart"/>
+      <w:r>
+        <w:rPr>
+          <w:rFonts w:ascii="Aptos" w:eastAsia="Aptos" w:hAnsi="Aptos" w:cs="Aptos"/>
+        </w:rPr>
+        <w:t>tblFilm</w:t>
+      </w:r>
+      <w:proofErr w:type="spellEnd"/>
+      <w:r>
+        <w:rPr>
+          <w:rFonts w:ascii="Aptos" w:eastAsia="Aptos" w:hAnsi="Aptos" w:cs="Aptos"/>
+        </w:rPr>
+        <w:t xml:space="preserve"> table, whereas the Update button changes the record for the film currently selected in the grid, and the Delete button removes it. The Clear button simply empties the text boxes so the user can start again.</w:t>
       </w:r>
     </w:p>
     <w:p>
@@ -307,7 +809,35 @@
         <w:rPr>
           <w:rFonts w:ascii="Aptos" w:eastAsia="Aptos" w:hAnsi="Aptos" w:cs="Aptos"/>
         </w:rPr>
-        <w:t>Once films exist in the system the next job is to schedule when and where they will actually be shown, which is what this objective covers. It is handled by the form named frmScreenings, and because it is another management form for adding, editing and removing records it follows exactly the same layout as the Add Films form described above, with a data grid view named dgvScreenings listing the existing screenings on one side and a set of input controls with Add, Update, Delete and Clear buttons on the other. Rather than repeat the whole description I will refer back to the Add Films form for the general behaviour and just explain what is different here.</w:t>
+        <w:t xml:space="preserve">Once films exist in the system the next job is to schedule when and where they will actually be shown, which is what this objective covers. It is handled by the form named </w:t>
+      </w:r>
+      <w:proofErr w:type="spellStart"/>
+      <w:r>
+        <w:rPr>
+          <w:rFonts w:ascii="Aptos" w:eastAsia="Aptos" w:hAnsi="Aptos" w:cs="Aptos"/>
+        </w:rPr>
+        <w:t>frmScreenings</w:t>
+      </w:r>
+      <w:proofErr w:type="spellEnd"/>
+      <w:r>
+        <w:rPr>
+          <w:rFonts w:ascii="Aptos" w:eastAsia="Aptos" w:hAnsi="Aptos" w:cs="Aptos"/>
+        </w:rPr>
+        <w:t xml:space="preserve">, and because it is another management form for adding, editing and removing records it follows exactly the same layout as the Add Films form described above, with a data grid view named </w:t>
+      </w:r>
+      <w:proofErr w:type="spellStart"/>
+      <w:r>
+        <w:rPr>
+          <w:rFonts w:ascii="Aptos" w:eastAsia="Aptos" w:hAnsi="Aptos" w:cs="Aptos"/>
+        </w:rPr>
+        <w:t>dgvScreenings</w:t>
+      </w:r>
+      <w:proofErr w:type="spellEnd"/>
+      <w:r>
+        <w:rPr>
+          <w:rFonts w:ascii="Aptos" w:eastAsia="Aptos" w:hAnsi="Aptos" w:cs="Aptos"/>
+        </w:rPr>
+        <w:t xml:space="preserve"> listing the existing screenings on one side and a set of input controls with Add, Update, Delete and Clear buttons on the other. Rather than repeat the whole description I will refer back to the Add Films form for the general behaviour and just explain what is different here.</w:t>
       </w:r>
     </w:p>
     <w:p>
@@ -318,7 +848,77 @@
         <w:rPr>
           <w:rFonts w:ascii="Aptos" w:eastAsia="Aptos" w:hAnsi="Aptos" w:cs="Aptos"/>
         </w:rPr>
-        <w:t>The difference is in the inputs. A screening has to be tied to a film that already exists and a screen that already exists, so instead of free text boxes for those two the form uses two combo boxes, named cboFilm and cboScreen, which the user picks from. This is because a member of staff should not be able to type in a film or a screen that is not really there, and choosing from a list makes that impossible. The date is entered using a date picker named dtpScreeningDate rather than a text box, this is because a proper date picker stops the user entering something that is not a real date. The time and the ticket price are entered into text boxes named txtScreeningTime, which is labelled Time in the format HH colon MM, and txtTicketPrice.</w:t>
+        <w:t xml:space="preserve">The difference is in the inputs. A screening has to be tied to a film that already exists and a screen that already exists, so instead of free text boxes for those two the form uses two combo boxes, named </w:t>
+      </w:r>
+      <w:proofErr w:type="spellStart"/>
+      <w:r>
+        <w:rPr>
+          <w:rFonts w:ascii="Aptos" w:eastAsia="Aptos" w:hAnsi="Aptos" w:cs="Aptos"/>
+        </w:rPr>
+        <w:t>cboFilm</w:t>
+      </w:r>
+      <w:proofErr w:type="spellEnd"/>
+      <w:r>
+        <w:rPr>
+          <w:rFonts w:ascii="Aptos" w:eastAsia="Aptos" w:hAnsi="Aptos" w:cs="Aptos"/>
+        </w:rPr>
+        <w:t xml:space="preserve"> and </w:t>
+      </w:r>
+      <w:proofErr w:type="spellStart"/>
+      <w:r>
+        <w:rPr>
+          <w:rFonts w:ascii="Aptos" w:eastAsia="Aptos" w:hAnsi="Aptos" w:cs="Aptos"/>
+        </w:rPr>
+        <w:t>cboScreen</w:t>
+      </w:r>
+      <w:proofErr w:type="spellEnd"/>
+      <w:r>
+        <w:rPr>
+          <w:rFonts w:ascii="Aptos" w:eastAsia="Aptos" w:hAnsi="Aptos" w:cs="Aptos"/>
+        </w:rPr>
+        <w:t xml:space="preserve">, which the user picks from. This is because a member of staff should not be able to type in a film or a screen that is not really there, and choosing from a list makes that impossible. The date is entered using a date picker named </w:t>
+      </w:r>
+      <w:proofErr w:type="spellStart"/>
+      <w:r>
+        <w:rPr>
+          <w:rFonts w:ascii="Aptos" w:eastAsia="Aptos" w:hAnsi="Aptos" w:cs="Aptos"/>
+        </w:rPr>
+        <w:t>dtpScreeningDate</w:t>
+      </w:r>
+      <w:proofErr w:type="spellEnd"/>
+      <w:r>
+        <w:rPr>
+          <w:rFonts w:ascii="Aptos" w:eastAsia="Aptos" w:hAnsi="Aptos" w:cs="Aptos"/>
+        </w:rPr>
+        <w:t xml:space="preserve"> rather than a text box, this is because a proper date picker stops the user entering something that is not a real date. The time and the ticket price are entered into text boxes named </w:t>
+      </w:r>
+      <w:proofErr w:type="spellStart"/>
+      <w:r>
+        <w:rPr>
+          <w:rFonts w:ascii="Aptos" w:eastAsia="Aptos" w:hAnsi="Aptos" w:cs="Aptos"/>
+        </w:rPr>
+        <w:t>txtScreeningTime</w:t>
+      </w:r>
+      <w:proofErr w:type="spellEnd"/>
+      <w:r>
+        <w:rPr>
+          <w:rFonts w:ascii="Aptos" w:eastAsia="Aptos" w:hAnsi="Aptos" w:cs="Aptos"/>
+        </w:rPr>
+        <w:t xml:space="preserve">, which is labelled Time in the format HH colon MM, and </w:t>
+      </w:r>
+      <w:proofErr w:type="spellStart"/>
+      <w:r>
+        <w:rPr>
+          <w:rFonts w:ascii="Aptos" w:eastAsia="Aptos" w:hAnsi="Aptos" w:cs="Aptos"/>
+        </w:rPr>
+        <w:t>txtTicketPrice</w:t>
+      </w:r>
+      <w:proofErr w:type="spellEnd"/>
+      <w:r>
+        <w:rPr>
+          <w:rFonts w:ascii="Aptos" w:eastAsia="Aptos" w:hAnsi="Aptos" w:cs="Aptos"/>
+        </w:rPr>
+        <w:t>.</w:t>
       </w:r>
     </w:p>
     <w:p>
@@ -341,7 +941,31 @@
           <w:sz w:val="22"/>
           <w:szCs w:val="22"/>
         </w:rPr>
-        <w:t>Add Screenings Form (frmScreenings)</w:t>
+        <w:t>Add Screenings Form (</w:t>
+      </w:r>
+      <w:proofErr w:type="spellStart"/>
+      <w:r>
+        <w:rPr>
+          <w:rFonts w:ascii="Aptos" w:eastAsia="Aptos" w:hAnsi="Aptos" w:cs="Aptos"/>
+          <w:b/>
+          <w:bCs/>
+          <w:color w:val="A02B93"/>
+          <w:sz w:val="22"/>
+          <w:szCs w:val="22"/>
+        </w:rPr>
+        <w:t>frmScreenings</w:t>
+      </w:r>
+      <w:proofErr w:type="spellEnd"/>
+      <w:r>
+        <w:rPr>
+          <w:rFonts w:ascii="Aptos" w:eastAsia="Aptos" w:hAnsi="Aptos" w:cs="Aptos"/>
+          <w:b/>
+          <w:bCs/>
+          <w:color w:val="A02B93"/>
+          <w:sz w:val="22"/>
+          <w:szCs w:val="22"/>
+        </w:rPr>
+        <w:t>)</w:t>
       </w:r>
     </w:p>
     <w:p>
@@ -352,7 +976,21 @@
         <w:rPr>
           <w:rFonts w:ascii="Aptos" w:eastAsia="Aptos" w:hAnsi="Aptos" w:cs="Aptos"/>
         </w:rPr>
-        <w:t>The inputs are therefore the chosen film, the chosen screen, the date, the time and the ticket price. The output is the updated list of screenings in the grid, along with the usual confirmation or warning message boxes. The processes behind the buttons are the same insert, update and delete operations as before, this time acting on the tblScreening table.</w:t>
+        <w:t xml:space="preserve">The inputs are therefore the chosen film, the chosen screen, the date, the time and the ticket price. The output is the updated list of screenings in the grid, along with the usual confirmation or warning message boxes. The processes behind the buttons are the same insert, update and delete operations as before, this time acting on the </w:t>
+      </w:r>
+      <w:proofErr w:type="spellStart"/>
+      <w:r>
+        <w:rPr>
+          <w:rFonts w:ascii="Aptos" w:eastAsia="Aptos" w:hAnsi="Aptos" w:cs="Aptos"/>
+        </w:rPr>
+        <w:t>tblScreening</w:t>
+      </w:r>
+      <w:proofErr w:type="spellEnd"/>
+      <w:r>
+        <w:rPr>
+          <w:rFonts w:ascii="Aptos" w:eastAsia="Aptos" w:hAnsi="Aptos" w:cs="Aptos"/>
+        </w:rPr>
+        <w:t xml:space="preserve"> table.</w:t>
       </w:r>
     </w:p>
     <w:p>
@@ -378,7 +1016,63 @@
         <w:rPr>
           <w:rFonts w:ascii="Aptos" w:eastAsia="Aptos" w:hAnsi="Aptos" w:cs="Aptos"/>
         </w:rPr>
-        <w:t>Before a screening can be booked the cinema needs its physical screens set up in the system, each with the right number of seats. This objective is handled by the form named frmScreens, which once again uses the same familiar management layout with a data grid view named dgvScreens listing the existing screens and a small set of inputs with Add, Update, Delete and Clear buttons, so I will refer back to the Add Films form for that general behaviour. There are only two inputs here, a text box named txtName for the name of the screen and a text box named txtCapacity for how many seats it has.</w:t>
+        <w:t xml:space="preserve">Before a screening can be booked the cinema needs its physical screens set up in the system, each with the right number of seats. This objective is handled by the form named </w:t>
+      </w:r>
+      <w:proofErr w:type="spellStart"/>
+      <w:r>
+        <w:rPr>
+          <w:rFonts w:ascii="Aptos" w:eastAsia="Aptos" w:hAnsi="Aptos" w:cs="Aptos"/>
+        </w:rPr>
+        <w:t>frmScreens</w:t>
+      </w:r>
+      <w:proofErr w:type="spellEnd"/>
+      <w:r>
+        <w:rPr>
+          <w:rFonts w:ascii="Aptos" w:eastAsia="Aptos" w:hAnsi="Aptos" w:cs="Aptos"/>
+        </w:rPr>
+        <w:t xml:space="preserve">, which once again uses the same familiar management layout with a data grid view named </w:t>
+      </w:r>
+      <w:proofErr w:type="spellStart"/>
+      <w:r>
+        <w:rPr>
+          <w:rFonts w:ascii="Aptos" w:eastAsia="Aptos" w:hAnsi="Aptos" w:cs="Aptos"/>
+        </w:rPr>
+        <w:t>dgvScreens</w:t>
+      </w:r>
+      <w:proofErr w:type="spellEnd"/>
+      <w:r>
+        <w:rPr>
+          <w:rFonts w:ascii="Aptos" w:eastAsia="Aptos" w:hAnsi="Aptos" w:cs="Aptos"/>
+        </w:rPr>
+        <w:t xml:space="preserve"> listing the existing screens and a small set of inputs with Add, Update, Delete and Clear buttons, so I will refer back to the Add Films form for that general behaviour. There are only two inputs here, a text box named </w:t>
+      </w:r>
+      <w:proofErr w:type="spellStart"/>
+      <w:r>
+        <w:rPr>
+          <w:rFonts w:ascii="Aptos" w:eastAsia="Aptos" w:hAnsi="Aptos" w:cs="Aptos"/>
+        </w:rPr>
+        <w:t>txtName</w:t>
+      </w:r>
+      <w:proofErr w:type="spellEnd"/>
+      <w:r>
+        <w:rPr>
+          <w:rFonts w:ascii="Aptos" w:eastAsia="Aptos" w:hAnsi="Aptos" w:cs="Aptos"/>
+        </w:rPr>
+        <w:t xml:space="preserve"> for the name of the screen and a text box named </w:t>
+      </w:r>
+      <w:proofErr w:type="spellStart"/>
+      <w:r>
+        <w:rPr>
+          <w:rFonts w:ascii="Aptos" w:eastAsia="Aptos" w:hAnsi="Aptos" w:cs="Aptos"/>
+        </w:rPr>
+        <w:t>txtCapacity</w:t>
+      </w:r>
+      <w:proofErr w:type="spellEnd"/>
+      <w:r>
+        <w:rPr>
+          <w:rFonts w:ascii="Aptos" w:eastAsia="Aptos" w:hAnsi="Aptos" w:cs="Aptos"/>
+        </w:rPr>
+        <w:t xml:space="preserve"> for how many seats it has.</w:t>
       </w:r>
     </w:p>
     <w:p>
@@ -413,7 +1107,31 @@
           <w:sz w:val="22"/>
           <w:szCs w:val="22"/>
         </w:rPr>
-        <w:t>Add Screens Form (frmScreens)</w:t>
+        <w:t>Add Screens Form (</w:t>
+      </w:r>
+      <w:proofErr w:type="spellStart"/>
+      <w:r>
+        <w:rPr>
+          <w:rFonts w:ascii="Aptos" w:eastAsia="Aptos" w:hAnsi="Aptos" w:cs="Aptos"/>
+          <w:b/>
+          <w:bCs/>
+          <w:color w:val="A02B93"/>
+          <w:sz w:val="22"/>
+          <w:szCs w:val="22"/>
+        </w:rPr>
+        <w:t>frmScreens</w:t>
+      </w:r>
+      <w:proofErr w:type="spellEnd"/>
+      <w:r>
+        <w:rPr>
+          <w:rFonts w:ascii="Aptos" w:eastAsia="Aptos" w:hAnsi="Aptos" w:cs="Aptos"/>
+          <w:b/>
+          <w:bCs/>
+          <w:color w:val="A02B93"/>
+          <w:sz w:val="22"/>
+          <w:szCs w:val="22"/>
+        </w:rPr>
+        <w:t>)</w:t>
       </w:r>
     </w:p>
     <w:p>
@@ -424,7 +1142,49 @@
         <w:rPr>
           <w:rFonts w:ascii="Aptos" w:eastAsia="Aptos" w:hAnsi="Aptos" w:cs="Aptos"/>
         </w:rPr>
-        <w:t>The inputs are the screen name and the capacity. The outputs are the updated list of screens and, crucially, a full set of seat records created in the tblSeat table for the new screen. The process behind the Add button is therefore two steps, first inserting the screen into the tblScreen table and reading back the new screen's identifier, and then looping to insert one seat record per seat into the tblSeat table so that the seats are ready for the booking form to use.</w:t>
+        <w:t xml:space="preserve">The inputs are the screen name and the capacity. The outputs are the updated list of screens and, crucially, a full set of seat records created in the </w:t>
+      </w:r>
+      <w:proofErr w:type="spellStart"/>
+      <w:r>
+        <w:rPr>
+          <w:rFonts w:ascii="Aptos" w:eastAsia="Aptos" w:hAnsi="Aptos" w:cs="Aptos"/>
+        </w:rPr>
+        <w:t>tblSeat</w:t>
+      </w:r>
+      <w:proofErr w:type="spellEnd"/>
+      <w:r>
+        <w:rPr>
+          <w:rFonts w:ascii="Aptos" w:eastAsia="Aptos" w:hAnsi="Aptos" w:cs="Aptos"/>
+        </w:rPr>
+        <w:t xml:space="preserve"> table for the new screen. The process behind the Add button is therefore two steps, first inserting the screen into the </w:t>
+      </w:r>
+      <w:proofErr w:type="spellStart"/>
+      <w:r>
+        <w:rPr>
+          <w:rFonts w:ascii="Aptos" w:eastAsia="Aptos" w:hAnsi="Aptos" w:cs="Aptos"/>
+        </w:rPr>
+        <w:t>tblScreen</w:t>
+      </w:r>
+      <w:proofErr w:type="spellEnd"/>
+      <w:r>
+        <w:rPr>
+          <w:rFonts w:ascii="Aptos" w:eastAsia="Aptos" w:hAnsi="Aptos" w:cs="Aptos"/>
+        </w:rPr>
+        <w:t xml:space="preserve"> table and reading back the new screen's identifier, and then looping to insert one seat record per seat into the </w:t>
+      </w:r>
+      <w:proofErr w:type="spellStart"/>
+      <w:r>
+        <w:rPr>
+          <w:rFonts w:ascii="Aptos" w:eastAsia="Aptos" w:hAnsi="Aptos" w:cs="Aptos"/>
+        </w:rPr>
+        <w:t>tblSeat</w:t>
+      </w:r>
+      <w:proofErr w:type="spellEnd"/>
+      <w:r>
+        <w:rPr>
+          <w:rFonts w:ascii="Aptos" w:eastAsia="Aptos" w:hAnsi="Aptos" w:cs="Aptos"/>
+        </w:rPr>
+        <w:t xml:space="preserve"> table so that the seats are ready for the booking form to use.</w:t>
       </w:r>
     </w:p>
     <w:p>
@@ -450,7 +1210,21 @@
         <w:rPr>
           <w:rFonts w:ascii="Aptos" w:eastAsia="Aptos" w:hAnsi="Aptos" w:cs="Aptos"/>
         </w:rPr>
-        <w:t>This is the heart of the whole system and the reason the project exists in the first place, so it is the most involved form to design. The objective is to let a member of staff create a booking for a customer against a particular screening, recording who the customer is, which seats they want and how many tickets that comes to, while making it impossible for a seat that has already been booked to be sold twice. Both of these objectives are handled together on the one form named frmBookings, because in practice they are the same job.</w:t>
+        <w:t xml:space="preserve">This is the heart of the whole system and the reason the project exists in the first place, so it is the most involved form to design. The objective is to let a member of staff create a booking for a customer against a particular screening, recording who the customer is, which seats they want and how many tickets that comes to, while making it impossible for a seat that has already been booked to be sold twice. Both of these objectives are handled together on the one form named </w:t>
+      </w:r>
+      <w:proofErr w:type="spellStart"/>
+      <w:r>
+        <w:rPr>
+          <w:rFonts w:ascii="Aptos" w:eastAsia="Aptos" w:hAnsi="Aptos" w:cs="Aptos"/>
+        </w:rPr>
+        <w:t>frmBookings</w:t>
+      </w:r>
+      <w:proofErr w:type="spellEnd"/>
+      <w:r>
+        <w:rPr>
+          <w:rFonts w:ascii="Aptos" w:eastAsia="Aptos" w:hAnsi="Aptos" w:cs="Aptos"/>
+        </w:rPr>
+        <w:t>, because in practice they are the same job.</w:t>
       </w:r>
     </w:p>
     <w:p>
@@ -461,14 +1235,154 @@
         <w:rPr>
           <w:rFonts w:ascii="Aptos" w:eastAsia="Aptos" w:hAnsi="Aptos" w:cs="Aptos"/>
         </w:rPr>
-        <w:t xml:space="preserve">The top of the form has two combo boxes, named cboScreening and cboCustomer, where the member of staff first picks which screening the booking is for and then which customer it belongs to. There is also a check box named chkWalkIn labelled Walk-in, which lets staff take a booking for a customer who has just walked in without recording their details. The largest part of the form is a panel named pnlSeatMap which draws the seat map for the chosen screening, and next to it is a small legend made up of three coloured swatches labelled Available, Selected and Taken so the user knows what the colours mean. A label named lblTotal keeps a running count of how many seats have been selected, and along </w:t>
+        <w:t xml:space="preserve">The top of the form has two combo boxes, named </w:t>
+      </w:r>
+      <w:proofErr w:type="spellStart"/>
+      <w:r>
+        <w:rPr>
+          <w:rFonts w:ascii="Aptos" w:eastAsia="Aptos" w:hAnsi="Aptos" w:cs="Aptos"/>
+        </w:rPr>
+        <w:t>cboScreening</w:t>
+      </w:r>
+      <w:proofErr w:type="spellEnd"/>
+      <w:r>
+        <w:rPr>
+          <w:rFonts w:ascii="Aptos" w:eastAsia="Aptos" w:hAnsi="Aptos" w:cs="Aptos"/>
+        </w:rPr>
+        <w:t xml:space="preserve"> and </w:t>
+      </w:r>
+      <w:proofErr w:type="spellStart"/>
+      <w:r>
+        <w:rPr>
+          <w:rFonts w:ascii="Aptos" w:eastAsia="Aptos" w:hAnsi="Aptos" w:cs="Aptos"/>
+        </w:rPr>
+        <w:t>cboCustomer</w:t>
+      </w:r>
+      <w:proofErr w:type="spellEnd"/>
+      <w:r>
+        <w:rPr>
+          <w:rFonts w:ascii="Aptos" w:eastAsia="Aptos" w:hAnsi="Aptos" w:cs="Aptos"/>
+        </w:rPr>
+        <w:t xml:space="preserve">, where the member of staff first picks which screening the booking is for and then which customer it belongs to. There is also a check box named </w:t>
+      </w:r>
+      <w:proofErr w:type="spellStart"/>
+      <w:r>
+        <w:rPr>
+          <w:rFonts w:ascii="Aptos" w:eastAsia="Aptos" w:hAnsi="Aptos" w:cs="Aptos"/>
+        </w:rPr>
+        <w:t>chkWalkIn</w:t>
+      </w:r>
+      <w:proofErr w:type="spellEnd"/>
+      <w:r>
+        <w:rPr>
+          <w:rFonts w:ascii="Aptos" w:eastAsia="Aptos" w:hAnsi="Aptos" w:cs="Aptos"/>
+        </w:rPr>
+        <w:t xml:space="preserve"> labelled Walk-in, which lets staff take a booking for a customer who has just walked in without recording their details. The largest part of the form is a panel named </w:t>
+      </w:r>
+      <w:proofErr w:type="spellStart"/>
+      <w:r>
+        <w:rPr>
+          <w:rFonts w:ascii="Aptos" w:eastAsia="Aptos" w:hAnsi="Aptos" w:cs="Aptos"/>
+        </w:rPr>
+        <w:t>pnlSeatMap</w:t>
+      </w:r>
+      <w:proofErr w:type="spellEnd"/>
+      <w:r>
+        <w:rPr>
+          <w:rFonts w:ascii="Aptos" w:eastAsia="Aptos" w:hAnsi="Aptos" w:cs="Aptos"/>
+        </w:rPr>
+        <w:t xml:space="preserve"> which draws the seat map for the chosen screening, and next to it is a small legend made up of three coloured swatches labelled Available, Selected and Taken so the user knows what the colours mean. A label named </w:t>
+      </w:r>
+      <w:proofErr w:type="spellStart"/>
+      <w:r>
+        <w:rPr>
+          <w:rFonts w:ascii="Aptos" w:eastAsia="Aptos" w:hAnsi="Aptos" w:cs="Aptos"/>
+        </w:rPr>
+        <w:t>lblTotal</w:t>
+      </w:r>
+      <w:proofErr w:type="spellEnd"/>
+      <w:r>
+        <w:rPr>
+          <w:rFonts w:ascii="Aptos" w:eastAsia="Aptos" w:hAnsi="Aptos" w:cs="Aptos"/>
+        </w:rPr>
+        <w:t xml:space="preserve"> keeps a running count of how many seats have been selected, and along </w:t>
       </w:r>
       <w:r>
         <w:rPr>
           <w:rFonts w:ascii="Aptos" w:eastAsia="Aptos" w:hAnsi="Aptos" w:cs="Aptos"/>
         </w:rPr>
         <w:lastRenderedPageBreak/>
-        <w:t>the bottom are the action buttons, Create Booking named btnCreateBooking, Clear Selection named btnClear, Order Food named btnOrderFood and Sell Food Only named btnFoodOnly. A grid named dgvCustomerBookings shows the bookings the selected customer already has.</w:t>
+        <w:t xml:space="preserve">the bottom are the action buttons, Create Booking named </w:t>
+      </w:r>
+      <w:proofErr w:type="spellStart"/>
+      <w:r>
+        <w:rPr>
+          <w:rFonts w:ascii="Aptos" w:eastAsia="Aptos" w:hAnsi="Aptos" w:cs="Aptos"/>
+        </w:rPr>
+        <w:t>btnCreateBooking</w:t>
+      </w:r>
+      <w:proofErr w:type="spellEnd"/>
+      <w:r>
+        <w:rPr>
+          <w:rFonts w:ascii="Aptos" w:eastAsia="Aptos" w:hAnsi="Aptos" w:cs="Aptos"/>
+        </w:rPr>
+        <w:t xml:space="preserve">, Clear Selection named </w:t>
+      </w:r>
+      <w:proofErr w:type="spellStart"/>
+      <w:r>
+        <w:rPr>
+          <w:rFonts w:ascii="Aptos" w:eastAsia="Aptos" w:hAnsi="Aptos" w:cs="Aptos"/>
+        </w:rPr>
+        <w:t>btnClear</w:t>
+      </w:r>
+      <w:proofErr w:type="spellEnd"/>
+      <w:r>
+        <w:rPr>
+          <w:rFonts w:ascii="Aptos" w:eastAsia="Aptos" w:hAnsi="Aptos" w:cs="Aptos"/>
+        </w:rPr>
+        <w:t xml:space="preserve">, Order Food named </w:t>
+      </w:r>
+      <w:proofErr w:type="spellStart"/>
+      <w:r>
+        <w:rPr>
+          <w:rFonts w:ascii="Aptos" w:eastAsia="Aptos" w:hAnsi="Aptos" w:cs="Aptos"/>
+        </w:rPr>
+        <w:t>btnOrderFood</w:t>
+      </w:r>
+      <w:proofErr w:type="spellEnd"/>
+      <w:r>
+        <w:rPr>
+          <w:rFonts w:ascii="Aptos" w:eastAsia="Aptos" w:hAnsi="Aptos" w:cs="Aptos"/>
+        </w:rPr>
+        <w:t xml:space="preserve"> and Sell Food Only named </w:t>
+      </w:r>
+      <w:proofErr w:type="spellStart"/>
+      <w:r>
+        <w:rPr>
+          <w:rFonts w:ascii="Aptos" w:eastAsia="Aptos" w:hAnsi="Aptos" w:cs="Aptos"/>
+        </w:rPr>
+        <w:t>btnFoodOnly</w:t>
+      </w:r>
+      <w:proofErr w:type="spellEnd"/>
+      <w:r>
+        <w:rPr>
+          <w:rFonts w:ascii="Aptos" w:eastAsia="Aptos" w:hAnsi="Aptos" w:cs="Aptos"/>
+        </w:rPr>
+        <w:t xml:space="preserve">. A grid named </w:t>
+      </w:r>
+      <w:proofErr w:type="spellStart"/>
+      <w:r>
+        <w:rPr>
+          <w:rFonts w:ascii="Aptos" w:eastAsia="Aptos" w:hAnsi="Aptos" w:cs="Aptos"/>
+        </w:rPr>
+        <w:t>dgvCustomerBookings</w:t>
+      </w:r>
+      <w:proofErr w:type="spellEnd"/>
+      <w:r>
+        <w:rPr>
+          <w:rFonts w:ascii="Aptos" w:eastAsia="Aptos" w:hAnsi="Aptos" w:cs="Aptos"/>
+        </w:rPr>
+        <w:t xml:space="preserve"> shows the bookings the selected customer already has.</w:t>
       </w:r>
     </w:p>
     <w:p>
@@ -491,7 +1405,31 @@
           <w:sz w:val="22"/>
           <w:szCs w:val="22"/>
         </w:rPr>
-        <w:t>Bookings Form (frmBookings)</w:t>
+        <w:t>Bookings Form (</w:t>
+      </w:r>
+      <w:proofErr w:type="spellStart"/>
+      <w:r>
+        <w:rPr>
+          <w:rFonts w:ascii="Aptos" w:eastAsia="Aptos" w:hAnsi="Aptos" w:cs="Aptos"/>
+          <w:b/>
+          <w:bCs/>
+          <w:color w:val="A02B93"/>
+          <w:sz w:val="22"/>
+          <w:szCs w:val="22"/>
+        </w:rPr>
+        <w:t>frmBookings</w:t>
+      </w:r>
+      <w:proofErr w:type="spellEnd"/>
+      <w:r>
+        <w:rPr>
+          <w:rFonts w:ascii="Aptos" w:eastAsia="Aptos" w:hAnsi="Aptos" w:cs="Aptos"/>
+          <w:b/>
+          <w:bCs/>
+          <w:color w:val="A02B93"/>
+          <w:sz w:val="22"/>
+          <w:szCs w:val="22"/>
+        </w:rPr>
+        <w:t>)</w:t>
       </w:r>
     </w:p>
     <w:p>
@@ -502,7 +1440,35 @@
         <w:rPr>
           <w:rFonts w:ascii="Aptos" w:eastAsia="Aptos" w:hAnsi="Aptos" w:cs="Aptos"/>
         </w:rPr>
-        <w:t>The way the member of staff uses the form is that they choose a screening, choose a customer or tick the walk-in box, and the seat map then draws itself as a grid of clickable seat buttons laid out like the inside of the screen. Clicking an available seat selects it and it changes colour, and the running total updates as they go. When they are happy they press Create Booking. The inputs to the form are therefore the chosen screening, the chosen customer and the seats that are clicked. The outputs are the saved booking, a confirmation message, the refreshed seat map and the updated list of that customer's bookings. The processes behind the scenes are the insertion of a new record into the tblBooking table and the insertion of each chosen seat into the tblBookingSeat table.</w:t>
+        <w:t xml:space="preserve">The way the member of staff uses the form is that they choose a screening, choose a customer or tick the walk-in box, and the seat map then draws itself as a grid of clickable seat buttons laid out like the inside of the screen. Clicking an available seat selects it and it changes colour, and the running total updates as they go. When they are happy they press Create Booking. The inputs to the form are therefore the chosen screening, the chosen customer and the seats that are clicked. The outputs are the saved booking, a confirmation message, the refreshed seat map and the updated list of that customer's bookings. The processes behind the scenes are the insertion of a new record into the </w:t>
+      </w:r>
+      <w:proofErr w:type="spellStart"/>
+      <w:r>
+        <w:rPr>
+          <w:rFonts w:ascii="Aptos" w:eastAsia="Aptos" w:hAnsi="Aptos" w:cs="Aptos"/>
+        </w:rPr>
+        <w:t>tblBooking</w:t>
+      </w:r>
+      <w:proofErr w:type="spellEnd"/>
+      <w:r>
+        <w:rPr>
+          <w:rFonts w:ascii="Aptos" w:eastAsia="Aptos" w:hAnsi="Aptos" w:cs="Aptos"/>
+        </w:rPr>
+        <w:t xml:space="preserve"> table and the insertion of each chosen seat into the </w:t>
+      </w:r>
+      <w:proofErr w:type="spellStart"/>
+      <w:r>
+        <w:rPr>
+          <w:rFonts w:ascii="Aptos" w:eastAsia="Aptos" w:hAnsi="Aptos" w:cs="Aptos"/>
+        </w:rPr>
+        <w:t>tblBookingSeat</w:t>
+      </w:r>
+      <w:proofErr w:type="spellEnd"/>
+      <w:r>
+        <w:rPr>
+          <w:rFonts w:ascii="Aptos" w:eastAsia="Aptos" w:hAnsi="Aptos" w:cs="Aptos"/>
+        </w:rPr>
+        <w:t xml:space="preserve"> table.</w:t>
       </w:r>
     </w:p>
     <w:p>
@@ -513,7 +1479,101 @@
         <w:rPr>
           <w:rFonts w:ascii="Aptos" w:eastAsia="Aptos" w:hAnsi="Aptos" w:cs="Aptos"/>
         </w:rPr>
-        <w:t>Preventing double bookings, which is the whole point of Objective 2, is built directly into how the seat map is drawn. This is because when the map loads it asks the database which seats have already been booked for that screening, by looking in the tblBookingSeat table joined to the tblBooking table, and any seat that comes back as already taken is coloured with the Taken colour and, more importantly, is disabled so that it physically cannot be clicked. On top of that, as a second line of defence, when Create Booking is pressed the system checks once more that none of the selected seats have been taken by someone else in the meantime before it saves anything. In this way a seat can never be sold twice, both because a taken seat cannot be selected in the first place and because it is checked again at the moment of saving. I chose a clickable graphical seat map rather than, for example, asking staff to type in seat numbers, this is because it lets them see the whole screen at a glance and makes double booking obvious and impossible in a way that a list of numbers never could.</w:t>
+        <w:t xml:space="preserve">Preventing double bookings, which is the whole point of Objective 2, is built directly into how the seat map is drawn. This is because when the map loads it asks the database which seats have already been booked for that screening, by looking in the </w:t>
+      </w:r>
+      <w:proofErr w:type="spellStart"/>
+      <w:r>
+        <w:rPr>
+          <w:rFonts w:ascii="Aptos" w:eastAsia="Aptos" w:hAnsi="Aptos" w:cs="Aptos"/>
+        </w:rPr>
+        <w:t>tblBookingSeat</w:t>
+      </w:r>
+      <w:proofErr w:type="spellEnd"/>
+      <w:r>
+        <w:rPr>
+          <w:rFonts w:ascii="Aptos" w:eastAsia="Aptos" w:hAnsi="Aptos" w:cs="Aptos"/>
+        </w:rPr>
+        <w:t xml:space="preserve"> table joined to the </w:t>
+      </w:r>
+      <w:proofErr w:type="spellStart"/>
+      <w:r>
+        <w:rPr>
+          <w:rFonts w:ascii="Aptos" w:eastAsia="Aptos" w:hAnsi="Aptos" w:cs="Aptos"/>
+        </w:rPr>
+        <w:t>tblBooking</w:t>
+      </w:r>
+      <w:proofErr w:type="spellEnd"/>
+      <w:r>
+        <w:rPr>
+          <w:rFonts w:ascii="Aptos" w:eastAsia="Aptos" w:hAnsi="Aptos" w:cs="Aptos"/>
+        </w:rPr>
+        <w:t xml:space="preserve"> table, and any seat that comes back as already taken is coloured with the Taken colour and, more importantly, is disabled so that it physically cannot be clicked. On top of that, as a second line of defence, when Create Booking is pressed the system checks once more that none of the selected seats have been taken by someone else in the meantime before it saves anything. In this way a seat can never be sold twice, both because a taken seat cannot be selected in the first place and because it is checked again at the moment of saving. I chose a clickable graphical seat map rather than, for example, asking staff to type in seat numbers, this is because it lets them see the whole screen at a glance and makes double booking obvious and impossible in a way that a list of numbers never could.</w:t>
+      </w:r>
+    </w:p>
+    <w:p>
+      <w:pPr>
+        <w:pStyle w:val="Heading3"/>
+        <w:spacing w:before="260" w:after="120"/>
+      </w:pPr>
+      <w:r>
+        <w:rPr>
+          <w:rFonts w:ascii="Aptos Display" w:eastAsia="Aptos Display" w:hAnsi="Aptos Display" w:cs="Aptos Display"/>
+          <w:b/>
+          <w:bCs/>
+          <w:color w:val="000000"/>
+        </w:rPr>
+        <w:t>Displaying the Graphical Seat Map (Objective 3)</w:t>
+      </w:r>
+    </w:p>
+    <w:p>
+      <w:pPr>
+        <w:spacing w:after="160" w:line="276" w:lineRule="auto"/>
+      </w:pPr>
+      <w:r>
+        <w:rPr>
+          <w:rFonts w:ascii="Aptos" w:eastAsia="Aptos" w:hAnsi="Aptos" w:cs="Aptos"/>
+        </w:rPr>
+        <w:t xml:space="preserve">This objective is really a closer look at the seat map that has just been described on the booking form, so rather than design a separate screen for it I will refer back to the </w:t>
+      </w:r>
+      <w:proofErr w:type="spellStart"/>
+      <w:r>
+        <w:rPr>
+          <w:rFonts w:ascii="Aptos" w:eastAsia="Aptos" w:hAnsi="Aptos" w:cs="Aptos"/>
+        </w:rPr>
+        <w:t>frmBookings</w:t>
+      </w:r>
+      <w:proofErr w:type="spellEnd"/>
+      <w:r>
+        <w:rPr>
+          <w:rFonts w:ascii="Aptos" w:eastAsia="Aptos" w:hAnsi="Aptos" w:cs="Aptos"/>
+        </w:rPr>
+        <w:t xml:space="preserve"> form above. The seat map is the panel named </w:t>
+      </w:r>
+      <w:proofErr w:type="spellStart"/>
+      <w:r>
+        <w:rPr>
+          <w:rFonts w:ascii="Aptos" w:eastAsia="Aptos" w:hAnsi="Aptos" w:cs="Aptos"/>
+        </w:rPr>
+        <w:t>pnlSeatMap</w:t>
+      </w:r>
+      <w:proofErr w:type="spellEnd"/>
+      <w:r>
+        <w:rPr>
+          <w:rFonts w:ascii="Aptos" w:eastAsia="Aptos" w:hAnsi="Aptos" w:cs="Aptos"/>
+        </w:rPr>
+        <w:t>, and its job is to show, for a chosen screening, exactly which seats are free and which are already booked. It does this by drawing one button for every seat in the chosen screen, arranged in rows so that it looks like the layout of a real cinema, with a label above reading SCREEN so the user can tell which way round they are looking.</w:t>
+      </w:r>
+    </w:p>
+    <w:p>
+      <w:pPr>
+        <w:spacing w:after="160" w:line="276" w:lineRule="auto"/>
+      </w:pPr>
+      <w:r>
+        <w:rPr>
+          <w:rFonts w:ascii="Aptos" w:eastAsia="Aptos" w:hAnsi="Aptos" w:cs="Aptos"/>
+        </w:rPr>
+        <w:lastRenderedPageBreak/>
+        <w:t>Every seat button is shown in one of three colours, and this is the output the user cares about. An available seat is shown in the Available colour and can be clicked, a seat the user has just clicked is shown in the Selected colour, and a seat that has already been booked by someone else is shown in the Taken colour and cannot be clicked at all. The small legend of coloured swatches next to the map explains which colour means what. The only input to the seat map is the clicks the user makes on the available seats, and behind the scenes the colours are worked out by comparing the full list of seats for the screen against the list of seats already booked for that screening. I have kept the fine detail of the exact colours to be settled in section 5.2, but the important design decision here is the three state system of available, selected and taken, because it is what makes the availability instantly readable.</w:t>
       </w:r>
     </w:p>
     <w:p>
@@ -544,7 +1604,23 @@
         <w:spacing w:after="160" w:line="276" w:lineRule="auto"/>
       </w:pPr>
       <w:r>
-        <w:t>The purpose of this section is to specify the data structures that the Filmtopia system will use to store its data. As the system is built around a Microsoft Access database accessed through OleDb, these data structures take the form of database tables rather than arrays or other in memory structures. Each table and the relationships between them are described below, along with the way the data in those tables will be accessed. A key aim throughout the design has been to make sure the table structure is fully normalised to third normal form so that data is never repeated unnecessarily and the database cannot end up in an inconsistent state.</w:t>
+        <w:t xml:space="preserve">The purpose of this section is to specify the data structures that the </w:t>
+      </w:r>
+      <w:proofErr w:type="spellStart"/>
+      <w:r>
+        <w:t>Filmtopia</w:t>
+      </w:r>
+      <w:proofErr w:type="spellEnd"/>
+      <w:r>
+        <w:t xml:space="preserve"> system will use to store its data. As the system is built around a Microsoft Access database accessed through </w:t>
+      </w:r>
+      <w:proofErr w:type="spellStart"/>
+      <w:r>
+        <w:t>OleDb</w:t>
+      </w:r>
+      <w:proofErr w:type="spellEnd"/>
+      <w:r>
+        <w:t>, these data structures take the form of database tables rather than arrays or other in memory structures. Each table and the relationships between them are described below, along with the way the data in those tables will be accessed. A key aim throughout the design has been to make sure the table structure is fully normalised to third normal form so that data is never repeated unnecessarily and the database cannot end up in an inconsistent state.</w:t>
       </w:r>
     </w:p>
     <w:p>
@@ -651,7 +1727,23 @@
         <w:spacing w:after="160" w:line="276" w:lineRule="auto"/>
       </w:pPr>
       <w:r>
-        <w:t>The way to resolve a many to many relationship is to create a new link table that sits between the two original entities, turning the single many to many relationship into two separate one to many relationships. For the booking and seat relationship this link table is tblBookingSeat, and for the booking and food item relationship it is tblOrderItem. Each link table holds its own primary key along with the two foreign keys that point back to the tables it joins. The diagram below shows the final design once these link tables have been added, with the primary key of each table shown in bold and the foreign keys shown in italics.</w:t>
+        <w:t xml:space="preserve">The way to resolve a many to many relationship is to create a new link table that sits between the two original entities, turning the single many to many relationship into two separate one to many relationships. For the booking and seat relationship this link table is </w:t>
+      </w:r>
+      <w:proofErr w:type="spellStart"/>
+      <w:r>
+        <w:t>tblBookingSeat</w:t>
+      </w:r>
+      <w:proofErr w:type="spellEnd"/>
+      <w:r>
+        <w:t xml:space="preserve">, and for the booking and food item relationship it is </w:t>
+      </w:r>
+      <w:proofErr w:type="spellStart"/>
+      <w:r>
+        <w:t>tblOrderItem</w:t>
+      </w:r>
+      <w:proofErr w:type="spellEnd"/>
+      <w:r>
+        <w:t>. Each link table holds its own primary key along with the two foreign keys that point back to the tables it joins. The diagram below shows the final design once these link tables have been added, with the primary key of each table shown in bold and the foreign keys shown in italics.</w:t>
       </w:r>
     </w:p>
     <w:p>
@@ -724,7 +1816,55 @@
         <w:spacing w:after="160" w:line="276" w:lineRule="auto"/>
       </w:pPr>
       <w:r>
-        <w:t>In this final design the foreign keys are produced by copying the primary key from the one end of each relationship to the many end. For example the ScreeningID primary key from tblScreening is copied into tblBooking as a foreign key, because one screening can have many bookings. The same pattern is followed throughout, which keeps every relationship as a clean one to many. The structure is normalised to third normal form because every non key field in each table depends only on the whole of that table's primary key, with no field depending on another non key field and no repeating groups of data anywhere in the design. Three further tables exist in the system that do not appear in this diagram because they are standalone and not related to the others through foreign keys. These are tblLogin, which holds the user accounts, tblLogs, which records system events, and tblVersionControl, which holds the application version. They are included in the table designs below for completeness.</w:t>
+        <w:t xml:space="preserve">In this final design the foreign keys are produced by copying the primary key from the one end of each relationship to the many end. For example the </w:t>
+      </w:r>
+      <w:proofErr w:type="spellStart"/>
+      <w:r>
+        <w:t>ScreeningID</w:t>
+      </w:r>
+      <w:proofErr w:type="spellEnd"/>
+      <w:r>
+        <w:t xml:space="preserve"> primary key from </w:t>
+      </w:r>
+      <w:proofErr w:type="spellStart"/>
+      <w:r>
+        <w:t>tblScreening</w:t>
+      </w:r>
+      <w:proofErr w:type="spellEnd"/>
+      <w:r>
+        <w:t xml:space="preserve"> is copied into </w:t>
+      </w:r>
+      <w:proofErr w:type="spellStart"/>
+      <w:r>
+        <w:t>tblBooking</w:t>
+      </w:r>
+      <w:proofErr w:type="spellEnd"/>
+      <w:r>
+        <w:t xml:space="preserve"> as a foreign key, because one screening can have many bookings. The same pattern is followed throughout, which keeps every relationship as a clean one to many. The structure is normalised to third normal form because every non key field in each table depends only on the whole of that table's primary key, with no field depending on another non key field and no repeating groups of data anywhere in the design. Three further tables exist in the system that do not appear in this diagram because they are standalone and not related to the others through foreign keys. These are </w:t>
+      </w:r>
+      <w:proofErr w:type="spellStart"/>
+      <w:r>
+        <w:t>tblLogin</w:t>
+      </w:r>
+      <w:proofErr w:type="spellEnd"/>
+      <w:r>
+        <w:t xml:space="preserve">, which holds the user accounts, </w:t>
+      </w:r>
+      <w:proofErr w:type="spellStart"/>
+      <w:r>
+        <w:t>tblLogs</w:t>
+      </w:r>
+      <w:proofErr w:type="spellEnd"/>
+      <w:r>
+        <w:t xml:space="preserve">, which records system events, and </w:t>
+      </w:r>
+      <w:proofErr w:type="spellStart"/>
+      <w:r>
+        <w:t>tblVersionControl</w:t>
+      </w:r>
+      <w:proofErr w:type="spellEnd"/>
+      <w:r>
+        <w:t>, which holds the application version. They are included in the table designs below for completeness.</w:t>
       </w:r>
     </w:p>
     <w:p>
@@ -784,7 +1924,23 @@
         <w:spacing w:after="160" w:line="276" w:lineRule="auto"/>
       </w:pPr>
       <w:r>
-        <w:t>The Filmtopia tables are stored within a Microsoft Access database and are accessed from the Visual Basic .NET application using SQL queries sent through an OleDb connection, specifically SELECT, INSERT, UPDATE and DELETE queries. The database management system stores the tables as direct access files and maintains indexes on the primary keys so that looking a record up by its primary key is fast and does not require reading through every record. Where a search is carried out on a field that is not indexed, the database falls back to a sequential search through the table.</w:t>
+        <w:t xml:space="preserve">The </w:t>
+      </w:r>
+      <w:proofErr w:type="spellStart"/>
+      <w:r>
+        <w:t>Filmtopia</w:t>
+      </w:r>
+      <w:proofErr w:type="spellEnd"/>
+      <w:r>
+        <w:t xml:space="preserve"> tables are stored within a Microsoft Access database and are accessed from the Visual Basic .NET application using SQL queries sent through an </w:t>
+      </w:r>
+      <w:proofErr w:type="spellStart"/>
+      <w:r>
+        <w:t>OleDb</w:t>
+      </w:r>
+      <w:proofErr w:type="spellEnd"/>
+      <w:r>
+        <w:t xml:space="preserve"> connection, specifically SELECT, INSERT, UPDATE and DELETE queries. The database management system stores the tables as direct access files and maintains indexes on the primary keys so that looking a record up by its primary key is fast and does not require reading through every record. Where a search is carried out on a field that is not indexed, the database falls back to a sequential search through the table.</w:t>
       </w:r>
     </w:p>
     <w:p>
@@ -796,6 +1952,7 @@
           <w:color w:val="000000" w:themeColor="text1"/>
         </w:rPr>
       </w:pPr>
+      <w:proofErr w:type="spellStart"/>
       <w:r>
         <w:rPr>
           <w:b/>
@@ -804,6 +1961,7 @@
         </w:rPr>
         <w:t>tblFilm</w:t>
       </w:r>
+      <w:proofErr w:type="spellEnd"/>
     </w:p>
     <w:p>
       <w:pPr>
@@ -981,6 +2139,7 @@
             </w:tcMar>
           </w:tcPr>
           <w:p>
+            <w:proofErr w:type="spellStart"/>
             <w:r>
               <w:rPr>
                 <w:sz w:val="19"/>
@@ -988,6 +2147,7 @@
               </w:rPr>
               <w:t>FilmID</w:t>
             </w:r>
+            <w:proofErr w:type="spellEnd"/>
           </w:p>
         </w:tc>
         <w:tc>
@@ -1075,6 +2235,7 @@
             </w:tcMar>
           </w:tcPr>
           <w:p>
+            <w:proofErr w:type="spellStart"/>
             <w:r>
               <w:rPr>
                 <w:sz w:val="19"/>
@@ -1082,6 +2243,7 @@
               </w:rPr>
               <w:t>FilmTitle</w:t>
             </w:r>
+            <w:proofErr w:type="spellEnd"/>
           </w:p>
         </w:tc>
         <w:tc>
@@ -1177,6 +2339,7 @@
             </w:tcMar>
           </w:tcPr>
           <w:p>
+            <w:proofErr w:type="spellStart"/>
             <w:r>
               <w:rPr>
                 <w:sz w:val="19"/>
@@ -1184,6 +2347,7 @@
               </w:rPr>
               <w:t>FilmAgeRating</w:t>
             </w:r>
+            <w:proofErr w:type="spellEnd"/>
           </w:p>
         </w:tc>
         <w:tc>
@@ -1279,6 +2443,7 @@
             </w:tcMar>
           </w:tcPr>
           <w:p>
+            <w:proofErr w:type="spellStart"/>
             <w:r>
               <w:rPr>
                 <w:sz w:val="19"/>
@@ -1286,6 +2451,7 @@
               </w:rPr>
               <w:t>FilmDuration</w:t>
             </w:r>
+            <w:proofErr w:type="spellEnd"/>
           </w:p>
         </w:tc>
         <w:tc>
@@ -1373,6 +2539,7 @@
             </w:tcMar>
           </w:tcPr>
           <w:p>
+            <w:proofErr w:type="spellStart"/>
             <w:r>
               <w:rPr>
                 <w:sz w:val="19"/>
@@ -1380,6 +2547,7 @@
               </w:rPr>
               <w:t>FilmDescription</w:t>
             </w:r>
+            <w:proofErr w:type="spellEnd"/>
           </w:p>
         </w:tc>
         <w:tc>
@@ -1478,6 +2646,7 @@
           <w:color w:val="000000" w:themeColor="text1"/>
         </w:rPr>
       </w:pPr>
+      <w:proofErr w:type="spellStart"/>
       <w:r>
         <w:rPr>
           <w:b/>
@@ -1486,6 +2655,7 @@
         </w:rPr>
         <w:t>tblScreen</w:t>
       </w:r>
+      <w:proofErr w:type="spellEnd"/>
     </w:p>
     <w:p>
       <w:pPr>
@@ -1663,6 +2833,7 @@
             </w:tcMar>
           </w:tcPr>
           <w:p>
+            <w:proofErr w:type="spellStart"/>
             <w:r>
               <w:rPr>
                 <w:sz w:val="19"/>
@@ -1670,6 +2841,7 @@
               </w:rPr>
               <w:t>ScreenID</w:t>
             </w:r>
+            <w:proofErr w:type="spellEnd"/>
           </w:p>
         </w:tc>
         <w:tc>
@@ -1757,6 +2929,7 @@
             </w:tcMar>
           </w:tcPr>
           <w:p>
+            <w:proofErr w:type="spellStart"/>
             <w:r>
               <w:rPr>
                 <w:sz w:val="19"/>
@@ -1764,6 +2937,7 @@
               </w:rPr>
               <w:t>ScreenName</w:t>
             </w:r>
+            <w:proofErr w:type="spellEnd"/>
           </w:p>
         </w:tc>
         <w:tc>
@@ -1859,6 +3033,7 @@
             </w:tcMar>
           </w:tcPr>
           <w:p>
+            <w:proofErr w:type="spellStart"/>
             <w:r>
               <w:rPr>
                 <w:sz w:val="19"/>
@@ -1866,6 +3041,7 @@
               </w:rPr>
               <w:t>ScreenCapacity</w:t>
             </w:r>
+            <w:proofErr w:type="spellEnd"/>
           </w:p>
         </w:tc>
         <w:tc>
@@ -1956,6 +3132,7 @@
           <w:color w:val="000000" w:themeColor="text1"/>
         </w:rPr>
       </w:pPr>
+      <w:proofErr w:type="spellStart"/>
       <w:r>
         <w:rPr>
           <w:b/>
@@ -1964,6 +3141,7 @@
         </w:rPr>
         <w:t>tblScreening</w:t>
       </w:r>
+      <w:proofErr w:type="spellEnd"/>
     </w:p>
     <w:p>
       <w:pPr>
@@ -2141,6 +3319,7 @@
             </w:tcMar>
           </w:tcPr>
           <w:p>
+            <w:proofErr w:type="spellStart"/>
             <w:r>
               <w:rPr>
                 <w:sz w:val="19"/>
@@ -2148,6 +3327,7 @@
               </w:rPr>
               <w:t>ScreeningID</w:t>
             </w:r>
+            <w:proofErr w:type="spellEnd"/>
           </w:p>
         </w:tc>
         <w:tc>
@@ -2235,6 +3415,7 @@
             </w:tcMar>
           </w:tcPr>
           <w:p>
+            <w:proofErr w:type="spellStart"/>
             <w:r>
               <w:rPr>
                 <w:sz w:val="19"/>
@@ -2242,6 +3423,7 @@
               </w:rPr>
               <w:t>FilmID</w:t>
             </w:r>
+            <w:proofErr w:type="spellEnd"/>
           </w:p>
         </w:tc>
         <w:tc>
@@ -2292,7 +3474,23 @@
                 <w:sz w:val="19"/>
                 <w:szCs w:val="19"/>
               </w:rPr>
-              <w:t>The film being shown (Foreign Key to tblFilm)</w:t>
+              <w:t xml:space="preserve">The film being shown (Foreign Key to </w:t>
+            </w:r>
+            <w:proofErr w:type="spellStart"/>
+            <w:r>
+              <w:rPr>
+                <w:sz w:val="19"/>
+                <w:szCs w:val="19"/>
+              </w:rPr>
+              <w:t>tblFilm</w:t>
+            </w:r>
+            <w:proofErr w:type="spellEnd"/>
+            <w:r>
+              <w:rPr>
+                <w:sz w:val="19"/>
+                <w:szCs w:val="19"/>
+              </w:rPr>
+              <w:t>)</w:t>
             </w:r>
           </w:p>
         </w:tc>
@@ -2329,6 +3527,7 @@
             </w:tcMar>
           </w:tcPr>
           <w:p>
+            <w:proofErr w:type="spellStart"/>
             <w:r>
               <w:rPr>
                 <w:sz w:val="19"/>
@@ -2336,6 +3535,7 @@
               </w:rPr>
               <w:t>ScreenID</w:t>
             </w:r>
+            <w:proofErr w:type="spellEnd"/>
           </w:p>
         </w:tc>
         <w:tc>
@@ -2386,7 +3586,23 @@
                 <w:sz w:val="19"/>
                 <w:szCs w:val="19"/>
               </w:rPr>
-              <w:t>The screen it is shown in (Foreign Key to tblScreen)</w:t>
+              <w:t xml:space="preserve">The screen it is shown in (Foreign Key to </w:t>
+            </w:r>
+            <w:proofErr w:type="spellStart"/>
+            <w:r>
+              <w:rPr>
+                <w:sz w:val="19"/>
+                <w:szCs w:val="19"/>
+              </w:rPr>
+              <w:t>tblScreen</w:t>
+            </w:r>
+            <w:proofErr w:type="spellEnd"/>
+            <w:r>
+              <w:rPr>
+                <w:sz w:val="19"/>
+                <w:szCs w:val="19"/>
+              </w:rPr>
+              <w:t>)</w:t>
             </w:r>
           </w:p>
         </w:tc>
@@ -2423,6 +3639,7 @@
             </w:tcMar>
           </w:tcPr>
           <w:p>
+            <w:proofErr w:type="spellStart"/>
             <w:r>
               <w:rPr>
                 <w:sz w:val="19"/>
@@ -2430,6 +3647,7 @@
               </w:rPr>
               <w:t>ScreeningDate</w:t>
             </w:r>
+            <w:proofErr w:type="spellEnd"/>
           </w:p>
         </w:tc>
         <w:tc>
@@ -2517,6 +3735,7 @@
             </w:tcMar>
           </w:tcPr>
           <w:p>
+            <w:proofErr w:type="spellStart"/>
             <w:r>
               <w:rPr>
                 <w:sz w:val="19"/>
@@ -2524,6 +3743,7 @@
               </w:rPr>
               <w:t>ScreeningTime</w:t>
             </w:r>
+            <w:proofErr w:type="spellEnd"/>
           </w:p>
         </w:tc>
         <w:tc>
@@ -2619,6 +3839,7 @@
             </w:tcMar>
           </w:tcPr>
           <w:p>
+            <w:proofErr w:type="spellStart"/>
             <w:r>
               <w:rPr>
                 <w:sz w:val="19"/>
@@ -2626,6 +3847,7 @@
               </w:rPr>
               <w:t>TicketPrice</w:t>
             </w:r>
+            <w:proofErr w:type="spellEnd"/>
           </w:p>
         </w:tc>
         <w:tc>
@@ -2716,6 +3938,7 @@
           <w:color w:val="000000" w:themeColor="text1"/>
         </w:rPr>
       </w:pPr>
+      <w:proofErr w:type="spellStart"/>
       <w:r>
         <w:rPr>
           <w:b/>
@@ -2724,6 +3947,7 @@
         </w:rPr>
         <w:t>tblSeat</w:t>
       </w:r>
+      <w:proofErr w:type="spellEnd"/>
     </w:p>
     <w:p>
       <w:pPr>
@@ -2901,6 +4125,7 @@
             </w:tcMar>
           </w:tcPr>
           <w:p>
+            <w:proofErr w:type="spellStart"/>
             <w:r>
               <w:rPr>
                 <w:sz w:val="19"/>
@@ -2908,6 +4133,7 @@
               </w:rPr>
               <w:t>SeatID</w:t>
             </w:r>
+            <w:proofErr w:type="spellEnd"/>
           </w:p>
         </w:tc>
         <w:tc>
@@ -2995,6 +4221,7 @@
             </w:tcMar>
           </w:tcPr>
           <w:p>
+            <w:proofErr w:type="spellStart"/>
             <w:r>
               <w:rPr>
                 <w:sz w:val="19"/>
@@ -3002,6 +4229,7 @@
               </w:rPr>
               <w:t>ScreenID</w:t>
             </w:r>
+            <w:proofErr w:type="spellEnd"/>
           </w:p>
         </w:tc>
         <w:tc>
@@ -3052,7 +4280,23 @@
                 <w:sz w:val="19"/>
                 <w:szCs w:val="19"/>
               </w:rPr>
-              <w:t>The screen the seat belongs to (Foreign Key to tblScreen)</w:t>
+              <w:t xml:space="preserve">The screen the seat belongs to (Foreign Key to </w:t>
+            </w:r>
+            <w:proofErr w:type="spellStart"/>
+            <w:r>
+              <w:rPr>
+                <w:sz w:val="19"/>
+                <w:szCs w:val="19"/>
+              </w:rPr>
+              <w:t>tblScreen</w:t>
+            </w:r>
+            <w:proofErr w:type="spellEnd"/>
+            <w:r>
+              <w:rPr>
+                <w:sz w:val="19"/>
+                <w:szCs w:val="19"/>
+              </w:rPr>
+              <w:t>)</w:t>
             </w:r>
           </w:p>
         </w:tc>
@@ -3089,6 +4333,7 @@
             </w:tcMar>
           </w:tcPr>
           <w:p>
+            <w:proofErr w:type="spellStart"/>
             <w:r>
               <w:rPr>
                 <w:sz w:val="19"/>
@@ -3096,6 +4341,7 @@
               </w:rPr>
               <w:t>SeatRow</w:t>
             </w:r>
+            <w:proofErr w:type="spellEnd"/>
           </w:p>
         </w:tc>
         <w:tc>
@@ -3191,6 +4437,7 @@
             </w:tcMar>
           </w:tcPr>
           <w:p>
+            <w:proofErr w:type="spellStart"/>
             <w:r>
               <w:rPr>
                 <w:sz w:val="19"/>
@@ -3198,6 +4445,7 @@
               </w:rPr>
               <w:t>SeatNumber</w:t>
             </w:r>
+            <w:proofErr w:type="spellEnd"/>
           </w:p>
         </w:tc>
         <w:tc>
@@ -3288,6 +4536,7 @@
           <w:color w:val="000000" w:themeColor="text1"/>
         </w:rPr>
       </w:pPr>
+      <w:proofErr w:type="spellStart"/>
       <w:r>
         <w:rPr>
           <w:b/>
@@ -3296,6 +4545,7 @@
         </w:rPr>
         <w:t>tblCustomer</w:t>
       </w:r>
+      <w:proofErr w:type="spellEnd"/>
     </w:p>
     <w:p>
       <w:pPr>
@@ -3473,6 +4723,7 @@
             </w:tcMar>
           </w:tcPr>
           <w:p>
+            <w:proofErr w:type="spellStart"/>
             <w:r>
               <w:rPr>
                 <w:sz w:val="19"/>
@@ -3480,6 +4731,7 @@
               </w:rPr>
               <w:t>CustomerID</w:t>
             </w:r>
+            <w:proofErr w:type="spellEnd"/>
           </w:p>
         </w:tc>
         <w:tc>
@@ -3567,6 +4819,7 @@
             </w:tcMar>
           </w:tcPr>
           <w:p>
+            <w:proofErr w:type="spellStart"/>
             <w:r>
               <w:rPr>
                 <w:sz w:val="19"/>
@@ -3574,6 +4827,7 @@
               </w:rPr>
               <w:t>CustomerForename</w:t>
             </w:r>
+            <w:proofErr w:type="spellEnd"/>
           </w:p>
         </w:tc>
         <w:tc>
@@ -3669,6 +4923,7 @@
             </w:tcMar>
           </w:tcPr>
           <w:p>
+            <w:proofErr w:type="spellStart"/>
             <w:r>
               <w:rPr>
                 <w:sz w:val="19"/>
@@ -3676,6 +4931,7 @@
               </w:rPr>
               <w:t>CustomerSurname</w:t>
             </w:r>
+            <w:proofErr w:type="spellEnd"/>
           </w:p>
         </w:tc>
         <w:tc>
@@ -3771,6 +5027,7 @@
             </w:tcMar>
           </w:tcPr>
           <w:p>
+            <w:proofErr w:type="spellStart"/>
             <w:r>
               <w:rPr>
                 <w:sz w:val="19"/>
@@ -3778,6 +5035,7 @@
               </w:rPr>
               <w:t>CustomerEmail</w:t>
             </w:r>
+            <w:proofErr w:type="spellEnd"/>
           </w:p>
         </w:tc>
         <w:tc>
@@ -3873,6 +5131,7 @@
             </w:tcMar>
           </w:tcPr>
           <w:p>
+            <w:proofErr w:type="spellStart"/>
             <w:r>
               <w:rPr>
                 <w:sz w:val="19"/>
@@ -3880,6 +5139,7 @@
               </w:rPr>
               <w:t>CustomerPhone</w:t>
             </w:r>
+            <w:proofErr w:type="spellEnd"/>
           </w:p>
         </w:tc>
         <w:tc>
@@ -3978,6 +5238,7 @@
           <w:color w:val="000000" w:themeColor="text1"/>
         </w:rPr>
       </w:pPr>
+      <w:proofErr w:type="spellStart"/>
       <w:r>
         <w:rPr>
           <w:b/>
@@ -3986,6 +5247,7 @@
         </w:rPr>
         <w:t>tblBooking</w:t>
       </w:r>
+      <w:proofErr w:type="spellEnd"/>
     </w:p>
     <w:p>
       <w:pPr>
@@ -4163,6 +5425,7 @@
             </w:tcMar>
           </w:tcPr>
           <w:p>
+            <w:proofErr w:type="spellStart"/>
             <w:r>
               <w:rPr>
                 <w:sz w:val="19"/>
@@ -4170,6 +5433,7 @@
               </w:rPr>
               <w:t>BookingID</w:t>
             </w:r>
+            <w:proofErr w:type="spellEnd"/>
           </w:p>
         </w:tc>
         <w:tc>
@@ -4257,6 +5521,7 @@
             </w:tcMar>
           </w:tcPr>
           <w:p>
+            <w:proofErr w:type="spellStart"/>
             <w:r>
               <w:rPr>
                 <w:sz w:val="19"/>
@@ -4264,6 +5529,7 @@
               </w:rPr>
               <w:t>CustomerID</w:t>
             </w:r>
+            <w:proofErr w:type="spellEnd"/>
           </w:p>
         </w:tc>
         <w:tc>
@@ -4314,7 +5580,23 @@
                 <w:sz w:val="19"/>
                 <w:szCs w:val="19"/>
               </w:rPr>
-              <w:t>The customer who made the booking (Foreign Key to tblCustomer)</w:t>
+              <w:t xml:space="preserve">The customer who made the booking (Foreign Key to </w:t>
+            </w:r>
+            <w:proofErr w:type="spellStart"/>
+            <w:r>
+              <w:rPr>
+                <w:sz w:val="19"/>
+                <w:szCs w:val="19"/>
+              </w:rPr>
+              <w:t>tblCustomer</w:t>
+            </w:r>
+            <w:proofErr w:type="spellEnd"/>
+            <w:r>
+              <w:rPr>
+                <w:sz w:val="19"/>
+                <w:szCs w:val="19"/>
+              </w:rPr>
+              <w:t>)</w:t>
             </w:r>
           </w:p>
         </w:tc>
@@ -4351,6 +5633,7 @@
             </w:tcMar>
           </w:tcPr>
           <w:p>
+            <w:proofErr w:type="spellStart"/>
             <w:r>
               <w:rPr>
                 <w:sz w:val="19"/>
@@ -4358,6 +5641,7 @@
               </w:rPr>
               <w:t>ScreeningID</w:t>
             </w:r>
+            <w:proofErr w:type="spellEnd"/>
           </w:p>
         </w:tc>
         <w:tc>
@@ -4408,7 +5692,23 @@
                 <w:sz w:val="19"/>
                 <w:szCs w:val="19"/>
               </w:rPr>
-              <w:t>The screening booked (Foreign Key to tblScreening)</w:t>
+              <w:t xml:space="preserve">The screening booked (Foreign Key to </w:t>
+            </w:r>
+            <w:proofErr w:type="spellStart"/>
+            <w:r>
+              <w:rPr>
+                <w:sz w:val="19"/>
+                <w:szCs w:val="19"/>
+              </w:rPr>
+              <w:t>tblScreening</w:t>
+            </w:r>
+            <w:proofErr w:type="spellEnd"/>
+            <w:r>
+              <w:rPr>
+                <w:sz w:val="19"/>
+                <w:szCs w:val="19"/>
+              </w:rPr>
+              <w:t>)</w:t>
             </w:r>
           </w:p>
         </w:tc>
@@ -4445,6 +5745,7 @@
             </w:tcMar>
           </w:tcPr>
           <w:p>
+            <w:proofErr w:type="spellStart"/>
             <w:r>
               <w:rPr>
                 <w:sz w:val="19"/>
@@ -4452,6 +5753,7 @@
               </w:rPr>
               <w:t>BookingDate</w:t>
             </w:r>
+            <w:proofErr w:type="spellEnd"/>
           </w:p>
         </w:tc>
         <w:tc>
@@ -4539,6 +5841,7 @@
             </w:tcMar>
           </w:tcPr>
           <w:p>
+            <w:proofErr w:type="spellStart"/>
             <w:r>
               <w:rPr>
                 <w:sz w:val="19"/>
@@ -4546,6 +5849,7 @@
               </w:rPr>
               <w:t>TotalCost</w:t>
             </w:r>
+            <w:proofErr w:type="spellEnd"/>
           </w:p>
         </w:tc>
         <w:tc>
@@ -4636,6 +5940,7 @@
           <w:color w:val="000000" w:themeColor="text1"/>
         </w:rPr>
       </w:pPr>
+      <w:proofErr w:type="spellStart"/>
       <w:r>
         <w:rPr>
           <w:b/>
@@ -4644,6 +5949,7 @@
         </w:rPr>
         <w:t>tblBookingSeat</w:t>
       </w:r>
+      <w:proofErr w:type="spellEnd"/>
     </w:p>
     <w:p>
       <w:pPr>
@@ -4821,6 +6127,7 @@
             </w:tcMar>
           </w:tcPr>
           <w:p>
+            <w:proofErr w:type="spellStart"/>
             <w:r>
               <w:rPr>
                 <w:sz w:val="19"/>
@@ -4828,6 +6135,7 @@
               </w:rPr>
               <w:t>BookingSeatID</w:t>
             </w:r>
+            <w:proofErr w:type="spellEnd"/>
           </w:p>
         </w:tc>
         <w:tc>
@@ -4915,6 +6223,7 @@
             </w:tcMar>
           </w:tcPr>
           <w:p>
+            <w:proofErr w:type="spellStart"/>
             <w:r>
               <w:rPr>
                 <w:sz w:val="19"/>
@@ -4922,6 +6231,7 @@
               </w:rPr>
               <w:t>BookingID</w:t>
             </w:r>
+            <w:proofErr w:type="spellEnd"/>
           </w:p>
         </w:tc>
         <w:tc>
@@ -4972,7 +6282,23 @@
                 <w:sz w:val="19"/>
                 <w:szCs w:val="19"/>
               </w:rPr>
-              <w:t>The booking this seat belongs to (Foreign Key to tblBooking)</w:t>
+              <w:t xml:space="preserve">The booking this seat belongs to (Foreign Key to </w:t>
+            </w:r>
+            <w:proofErr w:type="spellStart"/>
+            <w:r>
+              <w:rPr>
+                <w:sz w:val="19"/>
+                <w:szCs w:val="19"/>
+              </w:rPr>
+              <w:t>tblBooking</w:t>
+            </w:r>
+            <w:proofErr w:type="spellEnd"/>
+            <w:r>
+              <w:rPr>
+                <w:sz w:val="19"/>
+                <w:szCs w:val="19"/>
+              </w:rPr>
+              <w:t>)</w:t>
             </w:r>
           </w:p>
         </w:tc>
@@ -5009,6 +6335,7 @@
             </w:tcMar>
           </w:tcPr>
           <w:p>
+            <w:proofErr w:type="spellStart"/>
             <w:r>
               <w:rPr>
                 <w:sz w:val="19"/>
@@ -5016,6 +6343,7 @@
               </w:rPr>
               <w:t>SeatID</w:t>
             </w:r>
+            <w:proofErr w:type="spellEnd"/>
           </w:p>
         </w:tc>
         <w:tc>
@@ -5066,7 +6394,23 @@
                 <w:sz w:val="19"/>
                 <w:szCs w:val="19"/>
               </w:rPr>
-              <w:t>The seat that was booked (Foreign Key to tblSeat)</w:t>
+              <w:t xml:space="preserve">The seat that was booked (Foreign Key to </w:t>
+            </w:r>
+            <w:proofErr w:type="spellStart"/>
+            <w:r>
+              <w:rPr>
+                <w:sz w:val="19"/>
+                <w:szCs w:val="19"/>
+              </w:rPr>
+              <w:t>tblSeat</w:t>
+            </w:r>
+            <w:proofErr w:type="spellEnd"/>
+            <w:r>
+              <w:rPr>
+                <w:sz w:val="19"/>
+                <w:szCs w:val="19"/>
+              </w:rPr>
+              <w:t>)</w:t>
             </w:r>
           </w:p>
         </w:tc>
@@ -5106,6 +6450,7 @@
           <w:color w:val="000000" w:themeColor="text1"/>
         </w:rPr>
       </w:pPr>
+      <w:proofErr w:type="spellStart"/>
       <w:r>
         <w:rPr>
           <w:b/>
@@ -5114,6 +6459,7 @@
         </w:rPr>
         <w:t>tblFoodItem</w:t>
       </w:r>
+      <w:proofErr w:type="spellEnd"/>
     </w:p>
     <w:p>
       <w:pPr>
@@ -5291,6 +6637,7 @@
             </w:tcMar>
           </w:tcPr>
           <w:p>
+            <w:proofErr w:type="spellStart"/>
             <w:r>
               <w:rPr>
                 <w:sz w:val="19"/>
@@ -5298,6 +6645,7 @@
               </w:rPr>
               <w:t>FoodItemID</w:t>
             </w:r>
+            <w:proofErr w:type="spellEnd"/>
           </w:p>
         </w:tc>
         <w:tc>
@@ -5385,6 +6733,7 @@
             </w:tcMar>
           </w:tcPr>
           <w:p>
+            <w:proofErr w:type="spellStart"/>
             <w:r>
               <w:rPr>
                 <w:sz w:val="19"/>
@@ -5392,6 +6741,7 @@
               </w:rPr>
               <w:t>FoodItemName</w:t>
             </w:r>
+            <w:proofErr w:type="spellEnd"/>
           </w:p>
         </w:tc>
         <w:tc>
@@ -5487,6 +6837,7 @@
             </w:tcMar>
           </w:tcPr>
           <w:p>
+            <w:proofErr w:type="spellStart"/>
             <w:r>
               <w:rPr>
                 <w:sz w:val="19"/>
@@ -5494,6 +6845,7 @@
               </w:rPr>
               <w:t>FoodItemPrice</w:t>
             </w:r>
+            <w:proofErr w:type="spellEnd"/>
           </w:p>
         </w:tc>
         <w:tc>
@@ -5581,6 +6933,7 @@
             </w:tcMar>
           </w:tcPr>
           <w:p>
+            <w:proofErr w:type="spellStart"/>
             <w:r>
               <w:rPr>
                 <w:sz w:val="19"/>
@@ -5588,6 +6941,7 @@
               </w:rPr>
               <w:t>FoodItemCategory</w:t>
             </w:r>
+            <w:proofErr w:type="spellEnd"/>
           </w:p>
         </w:tc>
         <w:tc>
@@ -5686,6 +7040,7 @@
           <w:color w:val="000000" w:themeColor="text1"/>
         </w:rPr>
       </w:pPr>
+      <w:proofErr w:type="spellStart"/>
       <w:r>
         <w:rPr>
           <w:b/>
@@ -5694,6 +7049,7 @@
         </w:rPr>
         <w:t>tblOrderItem</w:t>
       </w:r>
+      <w:proofErr w:type="spellEnd"/>
     </w:p>
     <w:p>
       <w:pPr>
@@ -5871,6 +7227,7 @@
             </w:tcMar>
           </w:tcPr>
           <w:p>
+            <w:proofErr w:type="spellStart"/>
             <w:r>
               <w:rPr>
                 <w:sz w:val="19"/>
@@ -5878,6 +7235,7 @@
               </w:rPr>
               <w:t>OrderItemID</w:t>
             </w:r>
+            <w:proofErr w:type="spellEnd"/>
           </w:p>
         </w:tc>
         <w:tc>
@@ -5965,6 +7323,7 @@
             </w:tcMar>
           </w:tcPr>
           <w:p>
+            <w:proofErr w:type="spellStart"/>
             <w:r>
               <w:rPr>
                 <w:sz w:val="19"/>
@@ -5972,6 +7331,7 @@
               </w:rPr>
               <w:t>BookingID</w:t>
             </w:r>
+            <w:proofErr w:type="spellEnd"/>
           </w:p>
         </w:tc>
         <w:tc>
@@ -6022,7 +7382,23 @@
                 <w:sz w:val="19"/>
                 <w:szCs w:val="19"/>
               </w:rPr>
-              <w:t>The booking the item was added to (Foreign Key to tblBooking)</w:t>
+              <w:t xml:space="preserve">The booking the item was added to (Foreign Key to </w:t>
+            </w:r>
+            <w:proofErr w:type="spellStart"/>
+            <w:r>
+              <w:rPr>
+                <w:sz w:val="19"/>
+                <w:szCs w:val="19"/>
+              </w:rPr>
+              <w:t>tblBooking</w:t>
+            </w:r>
+            <w:proofErr w:type="spellEnd"/>
+            <w:r>
+              <w:rPr>
+                <w:sz w:val="19"/>
+                <w:szCs w:val="19"/>
+              </w:rPr>
+              <w:t>)</w:t>
             </w:r>
           </w:p>
         </w:tc>
@@ -6059,6 +7435,7 @@
             </w:tcMar>
           </w:tcPr>
           <w:p>
+            <w:proofErr w:type="spellStart"/>
             <w:r>
               <w:rPr>
                 <w:sz w:val="19"/>
@@ -6066,6 +7443,7 @@
               </w:rPr>
               <w:t>FoodItemID</w:t>
             </w:r>
+            <w:proofErr w:type="spellEnd"/>
           </w:p>
         </w:tc>
         <w:tc>
@@ -6116,7 +7494,23 @@
                 <w:sz w:val="19"/>
                 <w:szCs w:val="19"/>
               </w:rPr>
-              <w:t>The food item ordered (Foreign Key to tblFoodItem)</w:t>
+              <w:t xml:space="preserve">The food item ordered (Foreign Key to </w:t>
+            </w:r>
+            <w:proofErr w:type="spellStart"/>
+            <w:r>
+              <w:rPr>
+                <w:sz w:val="19"/>
+                <w:szCs w:val="19"/>
+              </w:rPr>
+              <w:t>tblFoodItem</w:t>
+            </w:r>
+            <w:proofErr w:type="spellEnd"/>
+            <w:r>
+              <w:rPr>
+                <w:sz w:val="19"/>
+                <w:szCs w:val="19"/>
+              </w:rPr>
+              <w:t>)</w:t>
             </w:r>
           </w:p>
         </w:tc>
@@ -6250,6 +7644,7 @@
           <w:color w:val="000000" w:themeColor="text1"/>
         </w:rPr>
       </w:pPr>
+      <w:proofErr w:type="spellStart"/>
       <w:r>
         <w:rPr>
           <w:b/>
@@ -6258,6 +7653,7 @@
         </w:rPr>
         <w:t>tblLogin</w:t>
       </w:r>
+      <w:proofErr w:type="spellEnd"/>
     </w:p>
     <w:p>
       <w:pPr>
@@ -6435,6 +7831,7 @@
             </w:tcMar>
           </w:tcPr>
           <w:p>
+            <w:proofErr w:type="spellStart"/>
             <w:r>
               <w:rPr>
                 <w:sz w:val="19"/>
@@ -6442,6 +7839,7 @@
               </w:rPr>
               <w:t>LoginID</w:t>
             </w:r>
+            <w:proofErr w:type="spellEnd"/>
           </w:p>
         </w:tc>
         <w:tc>
@@ -6711,6 +8109,7 @@
             </w:tcMar>
           </w:tcPr>
           <w:p>
+            <w:proofErr w:type="spellStart"/>
             <w:r>
               <w:rPr>
                 <w:sz w:val="19"/>
@@ -6718,6 +8117,7 @@
               </w:rPr>
               <w:t>MTIz</w:t>
             </w:r>
+            <w:proofErr w:type="spellEnd"/>
           </w:p>
         </w:tc>
       </w:tr>
@@ -6733,6 +8133,7 @@
             </w:tcMar>
           </w:tcPr>
           <w:p>
+            <w:proofErr w:type="spellStart"/>
             <w:r>
               <w:rPr>
                 <w:sz w:val="19"/>
@@ -6740,6 +8141,7 @@
               </w:rPr>
               <w:t>AccessLevel</w:t>
             </w:r>
+            <w:proofErr w:type="spellEnd"/>
           </w:p>
         </w:tc>
         <w:tc>
@@ -6830,6 +8232,7 @@
           <w:color w:val="000000" w:themeColor="text1"/>
         </w:rPr>
       </w:pPr>
+      <w:proofErr w:type="spellStart"/>
       <w:r>
         <w:rPr>
           <w:b/>
@@ -6838,6 +8241,7 @@
         </w:rPr>
         <w:t>tblLogs</w:t>
       </w:r>
+      <w:proofErr w:type="spellEnd"/>
     </w:p>
     <w:p>
       <w:pPr>
@@ -7015,6 +8419,7 @@
             </w:tcMar>
           </w:tcPr>
           <w:p>
+            <w:proofErr w:type="spellStart"/>
             <w:r>
               <w:rPr>
                 <w:sz w:val="19"/>
@@ -7022,6 +8427,7 @@
               </w:rPr>
               <w:t>LogID</w:t>
             </w:r>
+            <w:proofErr w:type="spellEnd"/>
           </w:p>
         </w:tc>
         <w:tc>
@@ -7109,6 +8515,7 @@
             </w:tcMar>
           </w:tcPr>
           <w:p>
+            <w:proofErr w:type="spellStart"/>
             <w:r>
               <w:rPr>
                 <w:sz w:val="19"/>
@@ -7116,6 +8523,7 @@
               </w:rPr>
               <w:t>LogDateTime</w:t>
             </w:r>
+            <w:proofErr w:type="spellEnd"/>
           </w:p>
         </w:tc>
         <w:tc>
@@ -7203,6 +8611,7 @@
             </w:tcMar>
           </w:tcPr>
           <w:p>
+            <w:proofErr w:type="spellStart"/>
             <w:r>
               <w:rPr>
                 <w:sz w:val="19"/>
@@ -7210,6 +8619,7 @@
               </w:rPr>
               <w:t>LogType</w:t>
             </w:r>
+            <w:proofErr w:type="spellEnd"/>
           </w:p>
         </w:tc>
         <w:tc>
@@ -7305,6 +8715,7 @@
             </w:tcMar>
           </w:tcPr>
           <w:p>
+            <w:proofErr w:type="spellStart"/>
             <w:r>
               <w:rPr>
                 <w:sz w:val="19"/>
@@ -7312,6 +8723,7 @@
               </w:rPr>
               <w:t>LogMessage</w:t>
             </w:r>
+            <w:proofErr w:type="spellEnd"/>
           </w:p>
         </w:tc>
         <w:tc>
@@ -7402,6 +8814,7 @@
           <w:color w:val="000000" w:themeColor="text1"/>
         </w:rPr>
       </w:pPr>
+      <w:proofErr w:type="spellStart"/>
       <w:r>
         <w:rPr>
           <w:b/>
@@ -7410,6 +8823,7 @@
         </w:rPr>
         <w:t>tblVersionControl</w:t>
       </w:r>
+      <w:proofErr w:type="spellEnd"/>
     </w:p>
     <w:p>
       <w:pPr>
@@ -7707,7 +9121,15 @@
         <w:spacing w:after="160" w:line="276" w:lineRule="auto"/>
       </w:pPr>
       <w:r>
-        <w:t>This section describes the processing that takes place inside the Filmtopia system. Rather than listing every button on every form it focuses on the stages where there is real logic going on, since these are the parts of the system that need to be thought through carefully before any code is written. Each stage is described in plain English pseudocode rather than in Visual Basic, so that the logic is clear and separate from the eventual code, and the two most important algorithms are also shown as flowcharts. Each stage is linked back to the objectives it helps to meet.</w:t>
+        <w:t xml:space="preserve">This section describes the processing that takes place inside the </w:t>
+      </w:r>
+      <w:proofErr w:type="spellStart"/>
+      <w:r>
+        <w:t>Filmtopia</w:t>
+      </w:r>
+      <w:proofErr w:type="spellEnd"/>
+      <w:r>
+        <w:t xml:space="preserve"> system. Rather than listing every button on every form it focuses on the stages where there is real logic going on, since these are the parts of the system that need to be thought through carefully before any code is written. Each stage is described in plain English pseudocode rather than in Visual Basic, so that the logic is clear and separate from the eventual code, and the two most important algorithms are also shown as flowcharts. Each stage is linked back to the objectives it helps to meet.</w:t>
       </w:r>
     </w:p>
     <w:p>
@@ -7823,7 +9245,25 @@
                 <w:sz w:val="19"/>
                 <w:szCs w:val="19"/>
               </w:rPr>
-              <w:t xml:space="preserve">    LOOK UP the username in tblLogin using an SQL SELECT query</w:t>
+              <w:t xml:space="preserve">    LOOK UP the username in </w:t>
+            </w:r>
+            <w:proofErr w:type="spellStart"/>
+            <w:r>
+              <w:rPr>
+                <w:rFonts w:ascii="Courier New" w:eastAsia="Courier New" w:hAnsi="Courier New" w:cs="Courier New"/>
+                <w:sz w:val="19"/>
+                <w:szCs w:val="19"/>
+              </w:rPr>
+              <w:t>tblLogin</w:t>
+            </w:r>
+            <w:proofErr w:type="spellEnd"/>
+            <w:r>
+              <w:rPr>
+                <w:rFonts w:ascii="Courier New" w:eastAsia="Courier New" w:hAnsi="Courier New" w:cs="Courier New"/>
+                <w:sz w:val="19"/>
+                <w:szCs w:val="19"/>
+              </w:rPr>
+              <w:t xml:space="preserve"> using an SQL SELECT query</w:t>
             </w:r>
           </w:p>
           <w:p>
@@ -7883,7 +9323,25 @@
                 <w:sz w:val="19"/>
                 <w:szCs w:val="19"/>
               </w:rPr>
-              <w:t xml:space="preserve">        STORE the user's AccessLevel for the session</w:t>
+              <w:t xml:space="preserve">        STORE the user's </w:t>
+            </w:r>
+            <w:proofErr w:type="spellStart"/>
+            <w:r>
+              <w:rPr>
+                <w:rFonts w:ascii="Courier New" w:eastAsia="Courier New" w:hAnsi="Courier New" w:cs="Courier New"/>
+                <w:sz w:val="19"/>
+                <w:szCs w:val="19"/>
+              </w:rPr>
+              <w:t>AccessLevel</w:t>
+            </w:r>
+            <w:proofErr w:type="spellEnd"/>
+            <w:r>
+              <w:rPr>
+                <w:rFonts w:ascii="Courier New" w:eastAsia="Courier New" w:hAnsi="Courier New" w:cs="Courier New"/>
+                <w:sz w:val="19"/>
+                <w:szCs w:val="19"/>
+              </w:rPr>
+              <w:t xml:space="preserve"> for the session</w:t>
             </w:r>
           </w:p>
           <w:p>
@@ -8084,88 +9542,288 @@
                 <w:sz w:val="19"/>
                 <w:szCs w:val="19"/>
               </w:rPr>
-              <w:t>SET seatsPerRow to 10</w:t>
-            </w:r>
-          </w:p>
-          <w:p>
-            <w:r>
-              <w:rPr>
-                <w:rFonts w:ascii="Courier New" w:eastAsia="Courier New" w:hAnsi="Courier New" w:cs="Courier New"/>
-                <w:sz w:val="19"/>
-                <w:szCs w:val="19"/>
-              </w:rPr>
-              <w:t>SET rowLetter to "A"</w:t>
-            </w:r>
-          </w:p>
-          <w:p>
-            <w:r>
-              <w:rPr>
-                <w:rFonts w:ascii="Courier New" w:eastAsia="Courier New" w:hAnsi="Courier New" w:cs="Courier New"/>
-                <w:sz w:val="19"/>
-                <w:szCs w:val="19"/>
-              </w:rPr>
-              <w:t>SET seatsMade to 0</w:t>
-            </w:r>
-          </w:p>
-          <w:p>
-            <w:r>
-              <w:rPr>
-                <w:rFonts w:ascii="Courier New" w:eastAsia="Courier New" w:hAnsi="Courier New" w:cs="Courier New"/>
-                <w:sz w:val="19"/>
-                <w:szCs w:val="19"/>
-              </w:rPr>
-              <w:t>WHILE seatsMade is less than capacity</w:t>
-            </w:r>
-          </w:p>
-          <w:p>
-            <w:r>
-              <w:rPr>
-                <w:rFonts w:ascii="Courier New" w:eastAsia="Courier New" w:hAnsi="Courier New" w:cs="Courier New"/>
-                <w:sz w:val="19"/>
-                <w:szCs w:val="19"/>
-              </w:rPr>
-              <w:t xml:space="preserve">    FOR seatNumber from 1 to seatsPerRow</w:t>
-            </w:r>
-          </w:p>
-          <w:p>
-            <w:r>
-              <w:rPr>
-                <w:rFonts w:ascii="Courier New" w:eastAsia="Courier New" w:hAnsi="Courier New" w:cs="Courier New"/>
-                <w:sz w:val="19"/>
-                <w:szCs w:val="19"/>
-              </w:rPr>
-              <w:t xml:space="preserve">        IF seatsMade is less than capacity THEN</w:t>
-            </w:r>
-          </w:p>
-          <w:p>
-            <w:r>
-              <w:rPr>
-                <w:rFonts w:ascii="Courier New" w:eastAsia="Courier New" w:hAnsi="Courier New" w:cs="Courier New"/>
-                <w:sz w:val="19"/>
-                <w:szCs w:val="19"/>
-              </w:rPr>
-              <w:t xml:space="preserve">            INSERT a seat into tblSeat with the current ScreenID,</w:t>
-            </w:r>
-          </w:p>
-          <w:p>
-            <w:r>
-              <w:rPr>
-                <w:rFonts w:ascii="Courier New" w:eastAsia="Courier New" w:hAnsi="Courier New" w:cs="Courier New"/>
-                <w:sz w:val="19"/>
-                <w:szCs w:val="19"/>
-              </w:rPr>
-              <w:t xml:space="preserve">                   rowLetter and seatNumber using an SQL INSERT</w:t>
-            </w:r>
-          </w:p>
-          <w:p>
-            <w:r>
-              <w:rPr>
-                <w:rFonts w:ascii="Courier New" w:eastAsia="Courier New" w:hAnsi="Courier New" w:cs="Courier New"/>
-                <w:sz w:val="19"/>
-                <w:szCs w:val="19"/>
-              </w:rPr>
-              <w:t xml:space="preserve">            ADD 1 to seatsMade</w:t>
-            </w:r>
+              <w:t xml:space="preserve">SET </w:t>
+            </w:r>
+            <w:proofErr w:type="spellStart"/>
+            <w:r>
+              <w:rPr>
+                <w:rFonts w:ascii="Courier New" w:eastAsia="Courier New" w:hAnsi="Courier New" w:cs="Courier New"/>
+                <w:sz w:val="19"/>
+                <w:szCs w:val="19"/>
+              </w:rPr>
+              <w:t>seatsPerRow</w:t>
+            </w:r>
+            <w:proofErr w:type="spellEnd"/>
+            <w:r>
+              <w:rPr>
+                <w:rFonts w:ascii="Courier New" w:eastAsia="Courier New" w:hAnsi="Courier New" w:cs="Courier New"/>
+                <w:sz w:val="19"/>
+                <w:szCs w:val="19"/>
+              </w:rPr>
+              <w:t xml:space="preserve"> to 10</w:t>
+            </w:r>
+          </w:p>
+          <w:p>
+            <w:r>
+              <w:rPr>
+                <w:rFonts w:ascii="Courier New" w:eastAsia="Courier New" w:hAnsi="Courier New" w:cs="Courier New"/>
+                <w:sz w:val="19"/>
+                <w:szCs w:val="19"/>
+              </w:rPr>
+              <w:t xml:space="preserve">SET </w:t>
+            </w:r>
+            <w:proofErr w:type="spellStart"/>
+            <w:r>
+              <w:rPr>
+                <w:rFonts w:ascii="Courier New" w:eastAsia="Courier New" w:hAnsi="Courier New" w:cs="Courier New"/>
+                <w:sz w:val="19"/>
+                <w:szCs w:val="19"/>
+              </w:rPr>
+              <w:t>rowLetter</w:t>
+            </w:r>
+            <w:proofErr w:type="spellEnd"/>
+            <w:r>
+              <w:rPr>
+                <w:rFonts w:ascii="Courier New" w:eastAsia="Courier New" w:hAnsi="Courier New" w:cs="Courier New"/>
+                <w:sz w:val="19"/>
+                <w:szCs w:val="19"/>
+              </w:rPr>
+              <w:t xml:space="preserve"> to "A"</w:t>
+            </w:r>
+          </w:p>
+          <w:p>
+            <w:r>
+              <w:rPr>
+                <w:rFonts w:ascii="Courier New" w:eastAsia="Courier New" w:hAnsi="Courier New" w:cs="Courier New"/>
+                <w:sz w:val="19"/>
+                <w:szCs w:val="19"/>
+              </w:rPr>
+              <w:t xml:space="preserve">SET </w:t>
+            </w:r>
+            <w:proofErr w:type="spellStart"/>
+            <w:r>
+              <w:rPr>
+                <w:rFonts w:ascii="Courier New" w:eastAsia="Courier New" w:hAnsi="Courier New" w:cs="Courier New"/>
+                <w:sz w:val="19"/>
+                <w:szCs w:val="19"/>
+              </w:rPr>
+              <w:t>seatsMade</w:t>
+            </w:r>
+            <w:proofErr w:type="spellEnd"/>
+            <w:r>
+              <w:rPr>
+                <w:rFonts w:ascii="Courier New" w:eastAsia="Courier New" w:hAnsi="Courier New" w:cs="Courier New"/>
+                <w:sz w:val="19"/>
+                <w:szCs w:val="19"/>
+              </w:rPr>
+              <w:t xml:space="preserve"> to 0</w:t>
+            </w:r>
+          </w:p>
+          <w:p>
+            <w:r>
+              <w:rPr>
+                <w:rFonts w:ascii="Courier New" w:eastAsia="Courier New" w:hAnsi="Courier New" w:cs="Courier New"/>
+                <w:sz w:val="19"/>
+                <w:szCs w:val="19"/>
+              </w:rPr>
+              <w:t xml:space="preserve">WHILE </w:t>
+            </w:r>
+            <w:proofErr w:type="spellStart"/>
+            <w:r>
+              <w:rPr>
+                <w:rFonts w:ascii="Courier New" w:eastAsia="Courier New" w:hAnsi="Courier New" w:cs="Courier New"/>
+                <w:sz w:val="19"/>
+                <w:szCs w:val="19"/>
+              </w:rPr>
+              <w:t>seatsMade</w:t>
+            </w:r>
+            <w:proofErr w:type="spellEnd"/>
+            <w:r>
+              <w:rPr>
+                <w:rFonts w:ascii="Courier New" w:eastAsia="Courier New" w:hAnsi="Courier New" w:cs="Courier New"/>
+                <w:sz w:val="19"/>
+                <w:szCs w:val="19"/>
+              </w:rPr>
+              <w:t xml:space="preserve"> is less than capacity</w:t>
+            </w:r>
+          </w:p>
+          <w:p>
+            <w:r>
+              <w:rPr>
+                <w:rFonts w:ascii="Courier New" w:eastAsia="Courier New" w:hAnsi="Courier New" w:cs="Courier New"/>
+                <w:sz w:val="19"/>
+                <w:szCs w:val="19"/>
+              </w:rPr>
+              <w:t xml:space="preserve">    FOR </w:t>
+            </w:r>
+            <w:proofErr w:type="spellStart"/>
+            <w:r>
+              <w:rPr>
+                <w:rFonts w:ascii="Courier New" w:eastAsia="Courier New" w:hAnsi="Courier New" w:cs="Courier New"/>
+                <w:sz w:val="19"/>
+                <w:szCs w:val="19"/>
+              </w:rPr>
+              <w:t>seatNumber</w:t>
+            </w:r>
+            <w:proofErr w:type="spellEnd"/>
+            <w:r>
+              <w:rPr>
+                <w:rFonts w:ascii="Courier New" w:eastAsia="Courier New" w:hAnsi="Courier New" w:cs="Courier New"/>
+                <w:sz w:val="19"/>
+                <w:szCs w:val="19"/>
+              </w:rPr>
+              <w:t xml:space="preserve"> from 1 to </w:t>
+            </w:r>
+            <w:proofErr w:type="spellStart"/>
+            <w:r>
+              <w:rPr>
+                <w:rFonts w:ascii="Courier New" w:eastAsia="Courier New" w:hAnsi="Courier New" w:cs="Courier New"/>
+                <w:sz w:val="19"/>
+                <w:szCs w:val="19"/>
+              </w:rPr>
+              <w:t>seatsPerRow</w:t>
+            </w:r>
+            <w:proofErr w:type="spellEnd"/>
+          </w:p>
+          <w:p>
+            <w:r>
+              <w:rPr>
+                <w:rFonts w:ascii="Courier New" w:eastAsia="Courier New" w:hAnsi="Courier New" w:cs="Courier New"/>
+                <w:sz w:val="19"/>
+                <w:szCs w:val="19"/>
+              </w:rPr>
+              <w:t xml:space="preserve">        IF </w:t>
+            </w:r>
+            <w:proofErr w:type="spellStart"/>
+            <w:r>
+              <w:rPr>
+                <w:rFonts w:ascii="Courier New" w:eastAsia="Courier New" w:hAnsi="Courier New" w:cs="Courier New"/>
+                <w:sz w:val="19"/>
+                <w:szCs w:val="19"/>
+              </w:rPr>
+              <w:t>seatsMade</w:t>
+            </w:r>
+            <w:proofErr w:type="spellEnd"/>
+            <w:r>
+              <w:rPr>
+                <w:rFonts w:ascii="Courier New" w:eastAsia="Courier New" w:hAnsi="Courier New" w:cs="Courier New"/>
+                <w:sz w:val="19"/>
+                <w:szCs w:val="19"/>
+              </w:rPr>
+              <w:t xml:space="preserve"> is less than capacity THEN</w:t>
+            </w:r>
+          </w:p>
+          <w:p>
+            <w:r>
+              <w:rPr>
+                <w:rFonts w:ascii="Courier New" w:eastAsia="Courier New" w:hAnsi="Courier New" w:cs="Courier New"/>
+                <w:sz w:val="19"/>
+                <w:szCs w:val="19"/>
+              </w:rPr>
+              <w:t xml:space="preserve">            INSERT a seat into </w:t>
+            </w:r>
+            <w:proofErr w:type="spellStart"/>
+            <w:r>
+              <w:rPr>
+                <w:rFonts w:ascii="Courier New" w:eastAsia="Courier New" w:hAnsi="Courier New" w:cs="Courier New"/>
+                <w:sz w:val="19"/>
+                <w:szCs w:val="19"/>
+              </w:rPr>
+              <w:t>tblSeat</w:t>
+            </w:r>
+            <w:proofErr w:type="spellEnd"/>
+            <w:r>
+              <w:rPr>
+                <w:rFonts w:ascii="Courier New" w:eastAsia="Courier New" w:hAnsi="Courier New" w:cs="Courier New"/>
+                <w:sz w:val="19"/>
+                <w:szCs w:val="19"/>
+              </w:rPr>
+              <w:t xml:space="preserve"> with the current </w:t>
+            </w:r>
+            <w:proofErr w:type="spellStart"/>
+            <w:r>
+              <w:rPr>
+                <w:rFonts w:ascii="Courier New" w:eastAsia="Courier New" w:hAnsi="Courier New" w:cs="Courier New"/>
+                <w:sz w:val="19"/>
+                <w:szCs w:val="19"/>
+              </w:rPr>
+              <w:t>ScreenID</w:t>
+            </w:r>
+            <w:proofErr w:type="spellEnd"/>
+            <w:r>
+              <w:rPr>
+                <w:rFonts w:ascii="Courier New" w:eastAsia="Courier New" w:hAnsi="Courier New" w:cs="Courier New"/>
+                <w:sz w:val="19"/>
+                <w:szCs w:val="19"/>
+              </w:rPr>
+              <w:t>,</w:t>
+            </w:r>
+          </w:p>
+          <w:p>
+            <w:r>
+              <w:rPr>
+                <w:rFonts w:ascii="Courier New" w:eastAsia="Courier New" w:hAnsi="Courier New" w:cs="Courier New"/>
+                <w:sz w:val="19"/>
+                <w:szCs w:val="19"/>
+              </w:rPr>
+              <w:t xml:space="preserve">                   </w:t>
+            </w:r>
+            <w:proofErr w:type="spellStart"/>
+            <w:r>
+              <w:rPr>
+                <w:rFonts w:ascii="Courier New" w:eastAsia="Courier New" w:hAnsi="Courier New" w:cs="Courier New"/>
+                <w:sz w:val="19"/>
+                <w:szCs w:val="19"/>
+              </w:rPr>
+              <w:t>rowLetter</w:t>
+            </w:r>
+            <w:proofErr w:type="spellEnd"/>
+            <w:r>
+              <w:rPr>
+                <w:rFonts w:ascii="Courier New" w:eastAsia="Courier New" w:hAnsi="Courier New" w:cs="Courier New"/>
+                <w:sz w:val="19"/>
+                <w:szCs w:val="19"/>
+              </w:rPr>
+              <w:t xml:space="preserve"> and </w:t>
+            </w:r>
+            <w:proofErr w:type="spellStart"/>
+            <w:r>
+              <w:rPr>
+                <w:rFonts w:ascii="Courier New" w:eastAsia="Courier New" w:hAnsi="Courier New" w:cs="Courier New"/>
+                <w:sz w:val="19"/>
+                <w:szCs w:val="19"/>
+              </w:rPr>
+              <w:t>seatNumber</w:t>
+            </w:r>
+            <w:proofErr w:type="spellEnd"/>
+            <w:r>
+              <w:rPr>
+                <w:rFonts w:ascii="Courier New" w:eastAsia="Courier New" w:hAnsi="Courier New" w:cs="Courier New"/>
+                <w:sz w:val="19"/>
+                <w:szCs w:val="19"/>
+              </w:rPr>
+              <w:t xml:space="preserve"> using an SQL INSERT</w:t>
+            </w:r>
+          </w:p>
+          <w:p>
+            <w:r>
+              <w:rPr>
+                <w:rFonts w:ascii="Courier New" w:eastAsia="Courier New" w:hAnsi="Courier New" w:cs="Courier New"/>
+                <w:sz w:val="19"/>
+                <w:szCs w:val="19"/>
+              </w:rPr>
+              <w:t xml:space="preserve">            ADD 1 to </w:t>
+            </w:r>
+            <w:proofErr w:type="spellStart"/>
+            <w:r>
+              <w:rPr>
+                <w:rFonts w:ascii="Courier New" w:eastAsia="Courier New" w:hAnsi="Courier New" w:cs="Courier New"/>
+                <w:sz w:val="19"/>
+                <w:szCs w:val="19"/>
+              </w:rPr>
+              <w:t>seatsMade</w:t>
+            </w:r>
+            <w:proofErr w:type="spellEnd"/>
           </w:p>
           <w:p>
             <w:r>
@@ -8184,17 +9842,45 @@
                 <w:sz w:val="19"/>
                 <w:szCs w:val="19"/>
               </w:rPr>
-              <w:t xml:space="preserve">    NEXT seatNumber</w:t>
-            </w:r>
-          </w:p>
-          <w:p>
-            <w:r>
-              <w:rPr>
-                <w:rFonts w:ascii="Courier New" w:eastAsia="Courier New" w:hAnsi="Courier New" w:cs="Courier New"/>
-                <w:sz w:val="19"/>
-                <w:szCs w:val="19"/>
-              </w:rPr>
-              <w:t xml:space="preserve">    MOVE rowLetter on to the next letter of the alphabet</w:t>
+              <w:t xml:space="preserve">    NEXT </w:t>
+            </w:r>
+            <w:proofErr w:type="spellStart"/>
+            <w:r>
+              <w:rPr>
+                <w:rFonts w:ascii="Courier New" w:eastAsia="Courier New" w:hAnsi="Courier New" w:cs="Courier New"/>
+                <w:sz w:val="19"/>
+                <w:szCs w:val="19"/>
+              </w:rPr>
+              <w:t>seatNumber</w:t>
+            </w:r>
+            <w:proofErr w:type="spellEnd"/>
+          </w:p>
+          <w:p>
+            <w:r>
+              <w:rPr>
+                <w:rFonts w:ascii="Courier New" w:eastAsia="Courier New" w:hAnsi="Courier New" w:cs="Courier New"/>
+                <w:sz w:val="19"/>
+                <w:szCs w:val="19"/>
+              </w:rPr>
+              <w:t xml:space="preserve">    MOVE </w:t>
+            </w:r>
+            <w:proofErr w:type="spellStart"/>
+            <w:r>
+              <w:rPr>
+                <w:rFonts w:ascii="Courier New" w:eastAsia="Courier New" w:hAnsi="Courier New" w:cs="Courier New"/>
+                <w:sz w:val="19"/>
+                <w:szCs w:val="19"/>
+              </w:rPr>
+              <w:t>rowLetter</w:t>
+            </w:r>
+            <w:proofErr w:type="spellEnd"/>
+            <w:r>
+              <w:rPr>
+                <w:rFonts w:ascii="Courier New" w:eastAsia="Courier New" w:hAnsi="Courier New" w:cs="Courier New"/>
+                <w:sz w:val="19"/>
+                <w:szCs w:val="19"/>
+              </w:rPr>
+              <w:t xml:space="preserve"> on to the next letter of the alphabet</w:t>
             </w:r>
           </w:p>
           <w:p>
@@ -8330,7 +10016,43 @@
                 <w:sz w:val="19"/>
                 <w:szCs w:val="19"/>
               </w:rPr>
-              <w:t xml:space="preserve">    LOOK UP tblBookingSeat joined to tblBooking to see whether</w:t>
+              <w:t xml:space="preserve">    LOOK UP </w:t>
+            </w:r>
+            <w:proofErr w:type="spellStart"/>
+            <w:r>
+              <w:rPr>
+                <w:rFonts w:ascii="Courier New" w:eastAsia="Courier New" w:hAnsi="Courier New" w:cs="Courier New"/>
+                <w:sz w:val="19"/>
+                <w:szCs w:val="19"/>
+              </w:rPr>
+              <w:t>tblBookingSeat</w:t>
+            </w:r>
+            <w:proofErr w:type="spellEnd"/>
+            <w:r>
+              <w:rPr>
+                <w:rFonts w:ascii="Courier New" w:eastAsia="Courier New" w:hAnsi="Courier New" w:cs="Courier New"/>
+                <w:sz w:val="19"/>
+                <w:szCs w:val="19"/>
+              </w:rPr>
+              <w:t xml:space="preserve"> joined to </w:t>
+            </w:r>
+            <w:proofErr w:type="spellStart"/>
+            <w:r>
+              <w:rPr>
+                <w:rFonts w:ascii="Courier New" w:eastAsia="Courier New" w:hAnsi="Courier New" w:cs="Courier New"/>
+                <w:sz w:val="19"/>
+                <w:szCs w:val="19"/>
+              </w:rPr>
+              <w:t>tblBooking</w:t>
+            </w:r>
+            <w:proofErr w:type="spellEnd"/>
+            <w:r>
+              <w:rPr>
+                <w:rFonts w:ascii="Courier New" w:eastAsia="Courier New" w:hAnsi="Courier New" w:cs="Courier New"/>
+                <w:sz w:val="19"/>
+                <w:szCs w:val="19"/>
+              </w:rPr>
+              <w:t xml:space="preserve"> to see whether</w:t>
             </w:r>
           </w:p>
           <w:p>
@@ -8400,7 +10122,25 @@
                 <w:sz w:val="19"/>
                 <w:szCs w:val="19"/>
               </w:rPr>
-              <w:t>INSERT a new record into tblBooking with the customer, screening,</w:t>
+              <w:t xml:space="preserve">INSERT a new record into </w:t>
+            </w:r>
+            <w:proofErr w:type="spellStart"/>
+            <w:r>
+              <w:rPr>
+                <w:rFonts w:ascii="Courier New" w:eastAsia="Courier New" w:hAnsi="Courier New" w:cs="Courier New"/>
+                <w:sz w:val="19"/>
+                <w:szCs w:val="19"/>
+              </w:rPr>
+              <w:t>tblBooking</w:t>
+            </w:r>
+            <w:proofErr w:type="spellEnd"/>
+            <w:r>
+              <w:rPr>
+                <w:rFonts w:ascii="Courier New" w:eastAsia="Courier New" w:hAnsi="Courier New" w:cs="Courier New"/>
+                <w:sz w:val="19"/>
+                <w:szCs w:val="19"/>
+              </w:rPr>
+              <w:t xml:space="preserve"> with the customer, screening,</w:t>
             </w:r>
           </w:p>
           <w:p>
@@ -8420,7 +10160,25 @@
                 <w:sz w:val="19"/>
                 <w:szCs w:val="19"/>
               </w:rPr>
-              <w:t>GET the new BookingID that was created</w:t>
+              <w:t xml:space="preserve">GET the new </w:t>
+            </w:r>
+            <w:proofErr w:type="spellStart"/>
+            <w:r>
+              <w:rPr>
+                <w:rFonts w:ascii="Courier New" w:eastAsia="Courier New" w:hAnsi="Courier New" w:cs="Courier New"/>
+                <w:sz w:val="19"/>
+                <w:szCs w:val="19"/>
+              </w:rPr>
+              <w:t>BookingID</w:t>
+            </w:r>
+            <w:proofErr w:type="spellEnd"/>
+            <w:r>
+              <w:rPr>
+                <w:rFonts w:ascii="Courier New" w:eastAsia="Courier New" w:hAnsi="Courier New" w:cs="Courier New"/>
+                <w:sz w:val="19"/>
+                <w:szCs w:val="19"/>
+              </w:rPr>
+              <w:t xml:space="preserve"> that was created</w:t>
             </w:r>
           </w:p>
           <w:p>
@@ -8440,8 +10198,54 @@
                 <w:sz w:val="19"/>
                 <w:szCs w:val="19"/>
               </w:rPr>
-              <w:t xml:space="preserve">    INSERT a record into tblBookingSeat linking BookingID to SeatID</w:t>
-            </w:r>
+              <w:t xml:space="preserve">    INSERT a record into </w:t>
+            </w:r>
+            <w:proofErr w:type="spellStart"/>
+            <w:r>
+              <w:rPr>
+                <w:rFonts w:ascii="Courier New" w:eastAsia="Courier New" w:hAnsi="Courier New" w:cs="Courier New"/>
+                <w:sz w:val="19"/>
+                <w:szCs w:val="19"/>
+              </w:rPr>
+              <w:t>tblBookingSeat</w:t>
+            </w:r>
+            <w:proofErr w:type="spellEnd"/>
+            <w:r>
+              <w:rPr>
+                <w:rFonts w:ascii="Courier New" w:eastAsia="Courier New" w:hAnsi="Courier New" w:cs="Courier New"/>
+                <w:sz w:val="19"/>
+                <w:szCs w:val="19"/>
+              </w:rPr>
+              <w:t xml:space="preserve"> linking </w:t>
+            </w:r>
+            <w:proofErr w:type="spellStart"/>
+            <w:r>
+              <w:rPr>
+                <w:rFonts w:ascii="Courier New" w:eastAsia="Courier New" w:hAnsi="Courier New" w:cs="Courier New"/>
+                <w:sz w:val="19"/>
+                <w:szCs w:val="19"/>
+              </w:rPr>
+              <w:t>BookingID</w:t>
+            </w:r>
+            <w:proofErr w:type="spellEnd"/>
+            <w:r>
+              <w:rPr>
+                <w:rFonts w:ascii="Courier New" w:eastAsia="Courier New" w:hAnsi="Courier New" w:cs="Courier New"/>
+                <w:sz w:val="19"/>
+                <w:szCs w:val="19"/>
+              </w:rPr>
+              <w:t xml:space="preserve"> to </w:t>
+            </w:r>
+            <w:proofErr w:type="spellStart"/>
+            <w:r>
+              <w:rPr>
+                <w:rFonts w:ascii="Courier New" w:eastAsia="Courier New" w:hAnsi="Courier New" w:cs="Courier New"/>
+                <w:sz w:val="19"/>
+                <w:szCs w:val="19"/>
+              </w:rPr>
+              <w:t>SeatID</w:t>
+            </w:r>
+            <w:proofErr w:type="spellEnd"/>
           </w:p>
           <w:p>
             <w:r>
@@ -8544,17 +10348,45 @@
                 <w:sz w:val="19"/>
                 <w:szCs w:val="19"/>
               </w:rPr>
-              <w:t>GET the selected screening and its ScreenID</w:t>
-            </w:r>
-          </w:p>
-          <w:p>
-            <w:r>
-              <w:rPr>
-                <w:rFonts w:ascii="Courier New" w:eastAsia="Courier New" w:hAnsi="Courier New" w:cs="Courier New"/>
-                <w:sz w:val="19"/>
-                <w:szCs w:val="19"/>
-              </w:rPr>
-              <w:t>SELECT all seats for that screen from tblSeat,</w:t>
+              <w:t xml:space="preserve">GET the selected screening and its </w:t>
+            </w:r>
+            <w:proofErr w:type="spellStart"/>
+            <w:r>
+              <w:rPr>
+                <w:rFonts w:ascii="Courier New" w:eastAsia="Courier New" w:hAnsi="Courier New" w:cs="Courier New"/>
+                <w:sz w:val="19"/>
+                <w:szCs w:val="19"/>
+              </w:rPr>
+              <w:t>ScreenID</w:t>
+            </w:r>
+            <w:proofErr w:type="spellEnd"/>
+          </w:p>
+          <w:p>
+            <w:r>
+              <w:rPr>
+                <w:rFonts w:ascii="Courier New" w:eastAsia="Courier New" w:hAnsi="Courier New" w:cs="Courier New"/>
+                <w:sz w:val="19"/>
+                <w:szCs w:val="19"/>
+              </w:rPr>
+              <w:t xml:space="preserve">SELECT all seats for that screen from </w:t>
+            </w:r>
+            <w:proofErr w:type="spellStart"/>
+            <w:r>
+              <w:rPr>
+                <w:rFonts w:ascii="Courier New" w:eastAsia="Courier New" w:hAnsi="Courier New" w:cs="Courier New"/>
+                <w:sz w:val="19"/>
+                <w:szCs w:val="19"/>
+              </w:rPr>
+              <w:t>tblSeat</w:t>
+            </w:r>
+            <w:proofErr w:type="spellEnd"/>
+            <w:r>
+              <w:rPr>
+                <w:rFonts w:ascii="Courier New" w:eastAsia="Courier New" w:hAnsi="Courier New" w:cs="Courier New"/>
+                <w:sz w:val="19"/>
+                <w:szCs w:val="19"/>
+              </w:rPr>
+              <w:t>,</w:t>
             </w:r>
           </w:p>
           <w:p>
@@ -8584,8 +10416,18 @@
                 <w:sz w:val="19"/>
                 <w:szCs w:val="19"/>
               </w:rPr>
-              <w:t xml:space="preserve">       from tblBookingSeat</w:t>
-            </w:r>
+              <w:t xml:space="preserve">       from </w:t>
+            </w:r>
+            <w:proofErr w:type="spellStart"/>
+            <w:r>
+              <w:rPr>
+                <w:rFonts w:ascii="Courier New" w:eastAsia="Courier New" w:hAnsi="Courier New" w:cs="Courier New"/>
+                <w:sz w:val="19"/>
+                <w:szCs w:val="19"/>
+              </w:rPr>
+              <w:t>tblBookingSeat</w:t>
+            </w:r>
+            <w:proofErr w:type="spellEnd"/>
           </w:p>
           <w:p>
             <w:r>
@@ -8728,7 +10570,25 @@
                 <w:sz w:val="19"/>
                 <w:szCs w:val="19"/>
               </w:rPr>
-              <w:t>SET foodTotal to 0</w:t>
+              <w:t xml:space="preserve">SET </w:t>
+            </w:r>
+            <w:proofErr w:type="spellStart"/>
+            <w:r>
+              <w:rPr>
+                <w:rFonts w:ascii="Courier New" w:eastAsia="Courier New" w:hAnsi="Courier New" w:cs="Courier New"/>
+                <w:sz w:val="19"/>
+                <w:szCs w:val="19"/>
+              </w:rPr>
+              <w:t>foodTotal</w:t>
+            </w:r>
+            <w:proofErr w:type="spellEnd"/>
+            <w:r>
+              <w:rPr>
+                <w:rFonts w:ascii="Courier New" w:eastAsia="Courier New" w:hAnsi="Courier New" w:cs="Courier New"/>
+                <w:sz w:val="19"/>
+                <w:szCs w:val="19"/>
+              </w:rPr>
+              <w:t xml:space="preserve"> to 0</w:t>
             </w:r>
           </w:p>
           <w:p>
@@ -8748,28 +10608,84 @@
                 <w:sz w:val="19"/>
                 <w:szCs w:val="19"/>
               </w:rPr>
-              <w:t xml:space="preserve">    LOOK UP the item price in tblFoodItem</w:t>
-            </w:r>
-          </w:p>
-          <w:p>
-            <w:r>
-              <w:rPr>
-                <w:rFonts w:ascii="Courier New" w:eastAsia="Courier New" w:hAnsi="Courier New" w:cs="Courier New"/>
-                <w:sz w:val="19"/>
-                <w:szCs w:val="19"/>
-              </w:rPr>
-              <w:t xml:space="preserve">    CALCULATE lineCost as price multiplied by quantity</w:t>
-            </w:r>
-          </w:p>
-          <w:p>
-            <w:r>
-              <w:rPr>
-                <w:rFonts w:ascii="Courier New" w:eastAsia="Courier New" w:hAnsi="Courier New" w:cs="Courier New"/>
-                <w:sz w:val="19"/>
-                <w:szCs w:val="19"/>
-              </w:rPr>
-              <w:t xml:space="preserve">    ADD lineCost to foodTotal</w:t>
-            </w:r>
+              <w:t xml:space="preserve">    LOOK UP the item price in </w:t>
+            </w:r>
+            <w:proofErr w:type="spellStart"/>
+            <w:r>
+              <w:rPr>
+                <w:rFonts w:ascii="Courier New" w:eastAsia="Courier New" w:hAnsi="Courier New" w:cs="Courier New"/>
+                <w:sz w:val="19"/>
+                <w:szCs w:val="19"/>
+              </w:rPr>
+              <w:t>tblFoodItem</w:t>
+            </w:r>
+            <w:proofErr w:type="spellEnd"/>
+          </w:p>
+          <w:p>
+            <w:r>
+              <w:rPr>
+                <w:rFonts w:ascii="Courier New" w:eastAsia="Courier New" w:hAnsi="Courier New" w:cs="Courier New"/>
+                <w:sz w:val="19"/>
+                <w:szCs w:val="19"/>
+              </w:rPr>
+              <w:t xml:space="preserve">    CALCULATE </w:t>
+            </w:r>
+            <w:proofErr w:type="spellStart"/>
+            <w:r>
+              <w:rPr>
+                <w:rFonts w:ascii="Courier New" w:eastAsia="Courier New" w:hAnsi="Courier New" w:cs="Courier New"/>
+                <w:sz w:val="19"/>
+                <w:szCs w:val="19"/>
+              </w:rPr>
+              <w:t>lineCost</w:t>
+            </w:r>
+            <w:proofErr w:type="spellEnd"/>
+            <w:r>
+              <w:rPr>
+                <w:rFonts w:ascii="Courier New" w:eastAsia="Courier New" w:hAnsi="Courier New" w:cs="Courier New"/>
+                <w:sz w:val="19"/>
+                <w:szCs w:val="19"/>
+              </w:rPr>
+              <w:t xml:space="preserve"> as price multiplied by quantity</w:t>
+            </w:r>
+          </w:p>
+          <w:p>
+            <w:r>
+              <w:rPr>
+                <w:rFonts w:ascii="Courier New" w:eastAsia="Courier New" w:hAnsi="Courier New" w:cs="Courier New"/>
+                <w:sz w:val="19"/>
+                <w:szCs w:val="19"/>
+              </w:rPr>
+              <w:t xml:space="preserve">    ADD </w:t>
+            </w:r>
+            <w:proofErr w:type="spellStart"/>
+            <w:r>
+              <w:rPr>
+                <w:rFonts w:ascii="Courier New" w:eastAsia="Courier New" w:hAnsi="Courier New" w:cs="Courier New"/>
+                <w:sz w:val="19"/>
+                <w:szCs w:val="19"/>
+              </w:rPr>
+              <w:t>lineCost</w:t>
+            </w:r>
+            <w:proofErr w:type="spellEnd"/>
+            <w:r>
+              <w:rPr>
+                <w:rFonts w:ascii="Courier New" w:eastAsia="Courier New" w:hAnsi="Courier New" w:cs="Courier New"/>
+                <w:sz w:val="19"/>
+                <w:szCs w:val="19"/>
+              </w:rPr>
+              <w:t xml:space="preserve"> to </w:t>
+            </w:r>
+            <w:proofErr w:type="spellStart"/>
+            <w:r>
+              <w:rPr>
+                <w:rFonts w:ascii="Courier New" w:eastAsia="Courier New" w:hAnsi="Courier New" w:cs="Courier New"/>
+                <w:sz w:val="19"/>
+                <w:szCs w:val="19"/>
+              </w:rPr>
+              <w:t>foodTotal</w:t>
+            </w:r>
+            <w:proofErr w:type="spellEnd"/>
           </w:p>
           <w:p>
             <w:r>
@@ -8788,27 +10704,109 @@
                 <w:sz w:val="19"/>
                 <w:szCs w:val="19"/>
               </w:rPr>
-              <w:t>CALCULATE seatTotal as number of seats times the ticket price</w:t>
-            </w:r>
-          </w:p>
-          <w:p>
-            <w:r>
-              <w:rPr>
-                <w:rFonts w:ascii="Courier New" w:eastAsia="Courier New" w:hAnsi="Courier New" w:cs="Courier New"/>
-                <w:sz w:val="19"/>
-                <w:szCs w:val="19"/>
-              </w:rPr>
-              <w:t>CALCULATE totalCost as seatTotal plus foodTotal</w:t>
-            </w:r>
-          </w:p>
-          <w:p>
-            <w:r>
-              <w:rPr>
-                <w:rFonts w:ascii="Courier New" w:eastAsia="Courier New" w:hAnsi="Courier New" w:cs="Courier New"/>
-                <w:sz w:val="19"/>
-                <w:szCs w:val="19"/>
-              </w:rPr>
-              <w:t>DISPLAY totalCost to the customer</w:t>
+              <w:t xml:space="preserve">CALCULATE </w:t>
+            </w:r>
+            <w:proofErr w:type="spellStart"/>
+            <w:r>
+              <w:rPr>
+                <w:rFonts w:ascii="Courier New" w:eastAsia="Courier New" w:hAnsi="Courier New" w:cs="Courier New"/>
+                <w:sz w:val="19"/>
+                <w:szCs w:val="19"/>
+              </w:rPr>
+              <w:t>seatTotal</w:t>
+            </w:r>
+            <w:proofErr w:type="spellEnd"/>
+            <w:r>
+              <w:rPr>
+                <w:rFonts w:ascii="Courier New" w:eastAsia="Courier New" w:hAnsi="Courier New" w:cs="Courier New"/>
+                <w:sz w:val="19"/>
+                <w:szCs w:val="19"/>
+              </w:rPr>
+              <w:t xml:space="preserve"> as number of seats times the ticket price</w:t>
+            </w:r>
+          </w:p>
+          <w:p>
+            <w:r>
+              <w:rPr>
+                <w:rFonts w:ascii="Courier New" w:eastAsia="Courier New" w:hAnsi="Courier New" w:cs="Courier New"/>
+                <w:sz w:val="19"/>
+                <w:szCs w:val="19"/>
+              </w:rPr>
+              <w:t xml:space="preserve">CALCULATE </w:t>
+            </w:r>
+            <w:proofErr w:type="spellStart"/>
+            <w:r>
+              <w:rPr>
+                <w:rFonts w:ascii="Courier New" w:eastAsia="Courier New" w:hAnsi="Courier New" w:cs="Courier New"/>
+                <w:sz w:val="19"/>
+                <w:szCs w:val="19"/>
+              </w:rPr>
+              <w:t>totalCost</w:t>
+            </w:r>
+            <w:proofErr w:type="spellEnd"/>
+            <w:r>
+              <w:rPr>
+                <w:rFonts w:ascii="Courier New" w:eastAsia="Courier New" w:hAnsi="Courier New" w:cs="Courier New"/>
+                <w:sz w:val="19"/>
+                <w:szCs w:val="19"/>
+              </w:rPr>
+              <w:t xml:space="preserve"> as </w:t>
+            </w:r>
+            <w:proofErr w:type="spellStart"/>
+            <w:r>
+              <w:rPr>
+                <w:rFonts w:ascii="Courier New" w:eastAsia="Courier New" w:hAnsi="Courier New" w:cs="Courier New"/>
+                <w:sz w:val="19"/>
+                <w:szCs w:val="19"/>
+              </w:rPr>
+              <w:t>seatTotal</w:t>
+            </w:r>
+            <w:proofErr w:type="spellEnd"/>
+            <w:r>
+              <w:rPr>
+                <w:rFonts w:ascii="Courier New" w:eastAsia="Courier New" w:hAnsi="Courier New" w:cs="Courier New"/>
+                <w:sz w:val="19"/>
+                <w:szCs w:val="19"/>
+              </w:rPr>
+              <w:t xml:space="preserve"> plus </w:t>
+            </w:r>
+            <w:proofErr w:type="spellStart"/>
+            <w:r>
+              <w:rPr>
+                <w:rFonts w:ascii="Courier New" w:eastAsia="Courier New" w:hAnsi="Courier New" w:cs="Courier New"/>
+                <w:sz w:val="19"/>
+                <w:szCs w:val="19"/>
+              </w:rPr>
+              <w:t>foodTotal</w:t>
+            </w:r>
+            <w:proofErr w:type="spellEnd"/>
+          </w:p>
+          <w:p>
+            <w:r>
+              <w:rPr>
+                <w:rFonts w:ascii="Courier New" w:eastAsia="Courier New" w:hAnsi="Courier New" w:cs="Courier New"/>
+                <w:sz w:val="19"/>
+                <w:szCs w:val="19"/>
+              </w:rPr>
+              <w:t xml:space="preserve">DISPLAY </w:t>
+            </w:r>
+            <w:proofErr w:type="spellStart"/>
+            <w:r>
+              <w:rPr>
+                <w:rFonts w:ascii="Courier New" w:eastAsia="Courier New" w:hAnsi="Courier New" w:cs="Courier New"/>
+                <w:sz w:val="19"/>
+                <w:szCs w:val="19"/>
+              </w:rPr>
+              <w:t>totalCost</w:t>
+            </w:r>
+            <w:proofErr w:type="spellEnd"/>
+            <w:r>
+              <w:rPr>
+                <w:rFonts w:ascii="Courier New" w:eastAsia="Courier New" w:hAnsi="Courier New" w:cs="Courier New"/>
+                <w:sz w:val="19"/>
+                <w:szCs w:val="19"/>
+              </w:rPr>
+              <w:t xml:space="preserve"> to the customer</w:t>
             </w:r>
           </w:p>
         </w:tc>
@@ -8922,7 +10920,43 @@
                 <w:sz w:val="19"/>
                 <w:szCs w:val="19"/>
               </w:rPr>
-              <w:t xml:space="preserve">    SELECT all bookings from tblBooking where BookingDate is</w:t>
+              <w:t xml:space="preserve">    SELECT all bookings from </w:t>
+            </w:r>
+            <w:proofErr w:type="spellStart"/>
+            <w:r>
+              <w:rPr>
+                <w:rFonts w:ascii="Courier New" w:eastAsia="Courier New" w:hAnsi="Courier New" w:cs="Courier New"/>
+                <w:sz w:val="19"/>
+                <w:szCs w:val="19"/>
+              </w:rPr>
+              <w:t>tblBooking</w:t>
+            </w:r>
+            <w:proofErr w:type="spellEnd"/>
+            <w:r>
+              <w:rPr>
+                <w:rFonts w:ascii="Courier New" w:eastAsia="Courier New" w:hAnsi="Courier New" w:cs="Courier New"/>
+                <w:sz w:val="19"/>
+                <w:szCs w:val="19"/>
+              </w:rPr>
+              <w:t xml:space="preserve"> where </w:t>
+            </w:r>
+            <w:proofErr w:type="spellStart"/>
+            <w:r>
+              <w:rPr>
+                <w:rFonts w:ascii="Courier New" w:eastAsia="Courier New" w:hAnsi="Courier New" w:cs="Courier New"/>
+                <w:sz w:val="19"/>
+                <w:szCs w:val="19"/>
+              </w:rPr>
+              <w:t>BookingDate</w:t>
+            </w:r>
+            <w:proofErr w:type="spellEnd"/>
+            <w:r>
+              <w:rPr>
+                <w:rFonts w:ascii="Courier New" w:eastAsia="Courier New" w:hAnsi="Courier New" w:cs="Courier New"/>
+                <w:sz w:val="19"/>
+                <w:szCs w:val="19"/>
+              </w:rPr>
+              <w:t xml:space="preserve"> is</w:t>
             </w:r>
           </w:p>
           <w:p>
@@ -8942,17 +10976,53 @@
                 <w:sz w:val="19"/>
                 <w:szCs w:val="19"/>
               </w:rPr>
-              <w:t xml:space="preserve">    SET totalTickets to 0</w:t>
-            </w:r>
-          </w:p>
-          <w:p>
-            <w:r>
-              <w:rPr>
-                <w:rFonts w:ascii="Courier New" w:eastAsia="Courier New" w:hAnsi="Courier New" w:cs="Courier New"/>
-                <w:sz w:val="19"/>
-                <w:szCs w:val="19"/>
-              </w:rPr>
-              <w:t xml:space="preserve">    SET totalRevenue to 0</w:t>
+              <w:t xml:space="preserve">    SET </w:t>
+            </w:r>
+            <w:proofErr w:type="spellStart"/>
+            <w:r>
+              <w:rPr>
+                <w:rFonts w:ascii="Courier New" w:eastAsia="Courier New" w:hAnsi="Courier New" w:cs="Courier New"/>
+                <w:sz w:val="19"/>
+                <w:szCs w:val="19"/>
+              </w:rPr>
+              <w:t>totalTickets</w:t>
+            </w:r>
+            <w:proofErr w:type="spellEnd"/>
+            <w:r>
+              <w:rPr>
+                <w:rFonts w:ascii="Courier New" w:eastAsia="Courier New" w:hAnsi="Courier New" w:cs="Courier New"/>
+                <w:sz w:val="19"/>
+                <w:szCs w:val="19"/>
+              </w:rPr>
+              <w:t xml:space="preserve"> to 0</w:t>
+            </w:r>
+          </w:p>
+          <w:p>
+            <w:r>
+              <w:rPr>
+                <w:rFonts w:ascii="Courier New" w:eastAsia="Courier New" w:hAnsi="Courier New" w:cs="Courier New"/>
+                <w:sz w:val="19"/>
+                <w:szCs w:val="19"/>
+              </w:rPr>
+              <w:t xml:space="preserve">    SET </w:t>
+            </w:r>
+            <w:proofErr w:type="spellStart"/>
+            <w:r>
+              <w:rPr>
+                <w:rFonts w:ascii="Courier New" w:eastAsia="Courier New" w:hAnsi="Courier New" w:cs="Courier New"/>
+                <w:sz w:val="19"/>
+                <w:szCs w:val="19"/>
+              </w:rPr>
+              <w:t>totalRevenue</w:t>
+            </w:r>
+            <w:proofErr w:type="spellEnd"/>
+            <w:r>
+              <w:rPr>
+                <w:rFonts w:ascii="Courier New" w:eastAsia="Courier New" w:hAnsi="Courier New" w:cs="Courier New"/>
+                <w:sz w:val="19"/>
+                <w:szCs w:val="19"/>
+              </w:rPr>
+              <w:t xml:space="preserve"> to 0</w:t>
             </w:r>
           </w:p>
           <w:p>
@@ -8972,28 +11042,76 @@
                 <w:sz w:val="19"/>
                 <w:szCs w:val="19"/>
               </w:rPr>
-              <w:t xml:space="preserve">        COUNT the seats linked to it in tblBookingSeat</w:t>
-            </w:r>
-          </w:p>
-          <w:p>
-            <w:r>
-              <w:rPr>
-                <w:rFonts w:ascii="Courier New" w:eastAsia="Courier New" w:hAnsi="Courier New" w:cs="Courier New"/>
-                <w:sz w:val="19"/>
-                <w:szCs w:val="19"/>
-              </w:rPr>
-              <w:t xml:space="preserve">        ADD that count to totalTickets</w:t>
-            </w:r>
-          </w:p>
-          <w:p>
-            <w:r>
-              <w:rPr>
-                <w:rFonts w:ascii="Courier New" w:eastAsia="Courier New" w:hAnsi="Courier New" w:cs="Courier New"/>
-                <w:sz w:val="19"/>
-                <w:szCs w:val="19"/>
-              </w:rPr>
-              <w:t xml:space="preserve">        ADD the booking's TotalCost to totalRevenue</w:t>
-            </w:r>
+              <w:t xml:space="preserve">        COUNT the seats linked to it in </w:t>
+            </w:r>
+            <w:proofErr w:type="spellStart"/>
+            <w:r>
+              <w:rPr>
+                <w:rFonts w:ascii="Courier New" w:eastAsia="Courier New" w:hAnsi="Courier New" w:cs="Courier New"/>
+                <w:sz w:val="19"/>
+                <w:szCs w:val="19"/>
+              </w:rPr>
+              <w:t>tblBookingSeat</w:t>
+            </w:r>
+            <w:proofErr w:type="spellEnd"/>
+          </w:p>
+          <w:p>
+            <w:r>
+              <w:rPr>
+                <w:rFonts w:ascii="Courier New" w:eastAsia="Courier New" w:hAnsi="Courier New" w:cs="Courier New"/>
+                <w:sz w:val="19"/>
+                <w:szCs w:val="19"/>
+              </w:rPr>
+              <w:t xml:space="preserve">        ADD that count to </w:t>
+            </w:r>
+            <w:proofErr w:type="spellStart"/>
+            <w:r>
+              <w:rPr>
+                <w:rFonts w:ascii="Courier New" w:eastAsia="Courier New" w:hAnsi="Courier New" w:cs="Courier New"/>
+                <w:sz w:val="19"/>
+                <w:szCs w:val="19"/>
+              </w:rPr>
+              <w:t>totalTickets</w:t>
+            </w:r>
+            <w:proofErr w:type="spellEnd"/>
+          </w:p>
+          <w:p>
+            <w:r>
+              <w:rPr>
+                <w:rFonts w:ascii="Courier New" w:eastAsia="Courier New" w:hAnsi="Courier New" w:cs="Courier New"/>
+                <w:sz w:val="19"/>
+                <w:szCs w:val="19"/>
+              </w:rPr>
+              <w:t xml:space="preserve">        ADD the booking's </w:t>
+            </w:r>
+            <w:proofErr w:type="spellStart"/>
+            <w:r>
+              <w:rPr>
+                <w:rFonts w:ascii="Courier New" w:eastAsia="Courier New" w:hAnsi="Courier New" w:cs="Courier New"/>
+                <w:sz w:val="19"/>
+                <w:szCs w:val="19"/>
+              </w:rPr>
+              <w:t>TotalCost</w:t>
+            </w:r>
+            <w:proofErr w:type="spellEnd"/>
+            <w:r>
+              <w:rPr>
+                <w:rFonts w:ascii="Courier New" w:eastAsia="Courier New" w:hAnsi="Courier New" w:cs="Courier New"/>
+                <w:sz w:val="19"/>
+                <w:szCs w:val="19"/>
+              </w:rPr>
+              <w:t xml:space="preserve"> to </w:t>
+            </w:r>
+            <w:proofErr w:type="spellStart"/>
+            <w:r>
+              <w:rPr>
+                <w:rFonts w:ascii="Courier New" w:eastAsia="Courier New" w:hAnsi="Courier New" w:cs="Courier New"/>
+                <w:sz w:val="19"/>
+                <w:szCs w:val="19"/>
+              </w:rPr>
+              <w:t>totalRevenue</w:t>
+            </w:r>
+            <w:proofErr w:type="spellEnd"/>
           </w:p>
           <w:p>
             <w:r>
@@ -9012,8 +11130,36 @@
                 <w:sz w:val="19"/>
                 <w:szCs w:val="19"/>
               </w:rPr>
-              <w:t xml:space="preserve">    DISPLAY totalTickets and totalRevenue</w:t>
-            </w:r>
+              <w:t xml:space="preserve">    DISPLAY </w:t>
+            </w:r>
+            <w:proofErr w:type="spellStart"/>
+            <w:r>
+              <w:rPr>
+                <w:rFonts w:ascii="Courier New" w:eastAsia="Courier New" w:hAnsi="Courier New" w:cs="Courier New"/>
+                <w:sz w:val="19"/>
+                <w:szCs w:val="19"/>
+              </w:rPr>
+              <w:t>totalTickets</w:t>
+            </w:r>
+            <w:proofErr w:type="spellEnd"/>
+            <w:r>
+              <w:rPr>
+                <w:rFonts w:ascii="Courier New" w:eastAsia="Courier New" w:hAnsi="Courier New" w:cs="Courier New"/>
+                <w:sz w:val="19"/>
+                <w:szCs w:val="19"/>
+              </w:rPr>
+              <w:t xml:space="preserve"> and </w:t>
+            </w:r>
+            <w:proofErr w:type="spellStart"/>
+            <w:r>
+              <w:rPr>
+                <w:rFonts w:ascii="Courier New" w:eastAsia="Courier New" w:hAnsi="Courier New" w:cs="Courier New"/>
+                <w:sz w:val="19"/>
+                <w:szCs w:val="19"/>
+              </w:rPr>
+              <w:t>totalRevenue</w:t>
+            </w:r>
+            <w:proofErr w:type="spellEnd"/>
           </w:p>
           <w:p>
             <w:r>
@@ -9136,8 +11282,18 @@
                 <w:sz w:val="19"/>
                 <w:szCs w:val="19"/>
               </w:rPr>
-              <w:t xml:space="preserve">    SELECT bookings joined to customers where CustomerSurname</w:t>
-            </w:r>
+              <w:t xml:space="preserve">    SELECT bookings joined to customers where </w:t>
+            </w:r>
+            <w:proofErr w:type="spellStart"/>
+            <w:r>
+              <w:rPr>
+                <w:rFonts w:ascii="Courier New" w:eastAsia="Courier New" w:hAnsi="Courier New" w:cs="Courier New"/>
+                <w:sz w:val="19"/>
+                <w:szCs w:val="19"/>
+              </w:rPr>
+              <w:t>CustomerSurname</w:t>
+            </w:r>
+            <w:proofErr w:type="spellEnd"/>
           </w:p>
           <w:p>
             <w:r>
@@ -9235,7 +11391,15 @@
         <w:spacing w:after="160" w:line="276" w:lineRule="auto"/>
       </w:pPr>
       <w:r>
-        <w:t>When a booking is cancelled its seats need to become available again. Because availability is worked out from the link table, simply removing the booking's records from tblBookingSeat frees those seats automatically with no separate step needed.</w:t>
+        <w:t xml:space="preserve">When a booking is cancelled its seats need to become available again. Because availability is worked out from the link table, simply removing the booking's records from </w:t>
+      </w:r>
+      <w:proofErr w:type="spellStart"/>
+      <w:r>
+        <w:t>tblBookingSeat</w:t>
+      </w:r>
+      <w:proofErr w:type="spellEnd"/>
+      <w:r>
+        <w:t xml:space="preserve"> frees those seats automatically with no separate step needed.</w:t>
       </w:r>
     </w:p>
     <w:tbl>
@@ -9275,7 +11439,25 @@
                 <w:sz w:val="19"/>
                 <w:szCs w:val="19"/>
               </w:rPr>
-              <w:t>GET the BookingID of the booking to cancel</w:t>
+              <w:t xml:space="preserve">GET the </w:t>
+            </w:r>
+            <w:proofErr w:type="spellStart"/>
+            <w:r>
+              <w:rPr>
+                <w:rFonts w:ascii="Courier New" w:eastAsia="Courier New" w:hAnsi="Courier New" w:cs="Courier New"/>
+                <w:sz w:val="19"/>
+                <w:szCs w:val="19"/>
+              </w:rPr>
+              <w:t>BookingID</w:t>
+            </w:r>
+            <w:proofErr w:type="spellEnd"/>
+            <w:r>
+              <w:rPr>
+                <w:rFonts w:ascii="Courier New" w:eastAsia="Courier New" w:hAnsi="Courier New" w:cs="Courier New"/>
+                <w:sz w:val="19"/>
+                <w:szCs w:val="19"/>
+              </w:rPr>
+              <w:t xml:space="preserve"> of the booking to cancel</w:t>
             </w:r>
           </w:p>
           <w:p>
@@ -9305,28 +11487,112 @@
                 <w:sz w:val="19"/>
                 <w:szCs w:val="19"/>
               </w:rPr>
-              <w:t xml:space="preserve">    DELETE all records in tblBookingSeat for that BookingID</w:t>
-            </w:r>
-          </w:p>
-          <w:p>
-            <w:r>
-              <w:rPr>
-                <w:rFonts w:ascii="Courier New" w:eastAsia="Courier New" w:hAnsi="Courier New" w:cs="Courier New"/>
-                <w:sz w:val="19"/>
-                <w:szCs w:val="19"/>
-              </w:rPr>
-              <w:t xml:space="preserve">    DELETE all records in tblOrderItem for that BookingID</w:t>
-            </w:r>
-          </w:p>
-          <w:p>
-            <w:r>
-              <w:rPr>
-                <w:rFonts w:ascii="Courier New" w:eastAsia="Courier New" w:hAnsi="Courier New" w:cs="Courier New"/>
-                <w:sz w:val="19"/>
-                <w:szCs w:val="19"/>
-              </w:rPr>
-              <w:t xml:space="preserve">    DELETE the record in tblBooking for that BookingID</w:t>
-            </w:r>
+              <w:t xml:space="preserve">    DELETE all records in </w:t>
+            </w:r>
+            <w:proofErr w:type="spellStart"/>
+            <w:r>
+              <w:rPr>
+                <w:rFonts w:ascii="Courier New" w:eastAsia="Courier New" w:hAnsi="Courier New" w:cs="Courier New"/>
+                <w:sz w:val="19"/>
+                <w:szCs w:val="19"/>
+              </w:rPr>
+              <w:t>tblBookingSeat</w:t>
+            </w:r>
+            <w:proofErr w:type="spellEnd"/>
+            <w:r>
+              <w:rPr>
+                <w:rFonts w:ascii="Courier New" w:eastAsia="Courier New" w:hAnsi="Courier New" w:cs="Courier New"/>
+                <w:sz w:val="19"/>
+                <w:szCs w:val="19"/>
+              </w:rPr>
+              <w:t xml:space="preserve"> for that </w:t>
+            </w:r>
+            <w:proofErr w:type="spellStart"/>
+            <w:r>
+              <w:rPr>
+                <w:rFonts w:ascii="Courier New" w:eastAsia="Courier New" w:hAnsi="Courier New" w:cs="Courier New"/>
+                <w:sz w:val="19"/>
+                <w:szCs w:val="19"/>
+              </w:rPr>
+              <w:t>BookingID</w:t>
+            </w:r>
+            <w:proofErr w:type="spellEnd"/>
+          </w:p>
+          <w:p>
+            <w:r>
+              <w:rPr>
+                <w:rFonts w:ascii="Courier New" w:eastAsia="Courier New" w:hAnsi="Courier New" w:cs="Courier New"/>
+                <w:sz w:val="19"/>
+                <w:szCs w:val="19"/>
+              </w:rPr>
+              <w:t xml:space="preserve">    DELETE all records in </w:t>
+            </w:r>
+            <w:proofErr w:type="spellStart"/>
+            <w:r>
+              <w:rPr>
+                <w:rFonts w:ascii="Courier New" w:eastAsia="Courier New" w:hAnsi="Courier New" w:cs="Courier New"/>
+                <w:sz w:val="19"/>
+                <w:szCs w:val="19"/>
+              </w:rPr>
+              <w:t>tblOrderItem</w:t>
+            </w:r>
+            <w:proofErr w:type="spellEnd"/>
+            <w:r>
+              <w:rPr>
+                <w:rFonts w:ascii="Courier New" w:eastAsia="Courier New" w:hAnsi="Courier New" w:cs="Courier New"/>
+                <w:sz w:val="19"/>
+                <w:szCs w:val="19"/>
+              </w:rPr>
+              <w:t xml:space="preserve"> for that </w:t>
+            </w:r>
+            <w:proofErr w:type="spellStart"/>
+            <w:r>
+              <w:rPr>
+                <w:rFonts w:ascii="Courier New" w:eastAsia="Courier New" w:hAnsi="Courier New" w:cs="Courier New"/>
+                <w:sz w:val="19"/>
+                <w:szCs w:val="19"/>
+              </w:rPr>
+              <w:t>BookingID</w:t>
+            </w:r>
+            <w:proofErr w:type="spellEnd"/>
+          </w:p>
+          <w:p>
+            <w:r>
+              <w:rPr>
+                <w:rFonts w:ascii="Courier New" w:eastAsia="Courier New" w:hAnsi="Courier New" w:cs="Courier New"/>
+                <w:sz w:val="19"/>
+                <w:szCs w:val="19"/>
+              </w:rPr>
+              <w:t xml:space="preserve">    DELETE the record in </w:t>
+            </w:r>
+            <w:proofErr w:type="spellStart"/>
+            <w:r>
+              <w:rPr>
+                <w:rFonts w:ascii="Courier New" w:eastAsia="Courier New" w:hAnsi="Courier New" w:cs="Courier New"/>
+                <w:sz w:val="19"/>
+                <w:szCs w:val="19"/>
+              </w:rPr>
+              <w:t>tblBooking</w:t>
+            </w:r>
+            <w:proofErr w:type="spellEnd"/>
+            <w:r>
+              <w:rPr>
+                <w:rFonts w:ascii="Courier New" w:eastAsia="Courier New" w:hAnsi="Courier New" w:cs="Courier New"/>
+                <w:sz w:val="19"/>
+                <w:szCs w:val="19"/>
+              </w:rPr>
+              <w:t xml:space="preserve"> for that </w:t>
+            </w:r>
+            <w:proofErr w:type="spellStart"/>
+            <w:r>
+              <w:rPr>
+                <w:rFonts w:ascii="Courier New" w:eastAsia="Courier New" w:hAnsi="Courier New" w:cs="Courier New"/>
+                <w:sz w:val="19"/>
+                <w:szCs w:val="19"/>
+              </w:rPr>
+              <w:t>BookingID</w:t>
+            </w:r>
+            <w:proofErr w:type="spellEnd"/>
           </w:p>
           <w:p>
             <w:r>
@@ -9400,7 +11666,15 @@
         <w:spacing w:after="160" w:line="276" w:lineRule="auto"/>
       </w:pPr>
       <w:r>
-        <w:t>Validation is the process of checking that data entered into the system is sensible and complete before it is accepted and saved to the database. It cannot guarantee that data is correct, for example it cannot tell whether a customer has typed the right surname, but it can stop clearly invalid or missing data from getting in, which protects the integrity of the database. Several different types of validation are used across the Filmtopia system, and these are explained below before being applied to each input in turn.</w:t>
+        <w:t xml:space="preserve">Validation is the process of checking that data entered into the system is sensible and complete before it is accepted and saved to the database. It cannot guarantee that data is correct, for example it cannot tell whether a customer has typed the right surname, but it can stop clearly invalid or missing data from getting in, which protects the integrity of the database. Several different types of validation are used across the </w:t>
+      </w:r>
+      <w:proofErr w:type="spellStart"/>
+      <w:r>
+        <w:t>Filmtopia</w:t>
+      </w:r>
+      <w:proofErr w:type="spellEnd"/>
+      <w:r>
+        <w:t xml:space="preserve"> system, and these are explained below before being applied to each input in turn.</w:t>
       </w:r>
     </w:p>
     <w:p>
@@ -9408,7 +11682,15 @@
         <w:spacing w:after="160" w:line="276" w:lineRule="auto"/>
       </w:pPr>
       <w:r>
-        <w:t>A presence check makes sure a required field has not been left blank. A type check makes sure the data is of the right kind, for example that a number has been entered where a number is expected. A length check makes sure an entry is not longer than the field allows. A range check makes sure a number or date falls between sensible limits. A format check makes sure an entry follows a required pattern, such as a time being written as HH:MM. Finally a lookup check, sometimes called a referential check, makes sure that a chosen value actually exists in another table, for example that a screening is being created for a film that really exists. The tables below set out the validation applied to each input, grouped by the form it appears on.</w:t>
+        <w:t xml:space="preserve">A presence check makes sure a required field has not been left blank. A type check makes sure the data is of the right kind, for example that a number has been entered where a number is expected. A length check makes sure an entry is </w:t>
+      </w:r>
+      <w:proofErr w:type="spellStart"/>
+      <w:r>
+        <w:t>not longer</w:t>
+      </w:r>
+      <w:proofErr w:type="spellEnd"/>
+      <w:r>
+        <w:t xml:space="preserve"> than the field allows. A range check makes sure a number or date falls between sensible limits. A format check makes sure an entry follows a required pattern, such as a time being written as HH:MM. Finally a lookup check, sometimes called a referential check, makes sure that a chosen value actually exists in another table, for example that a screening is being created for a film that really exists. The tables below set out the validation applied to each input, grouped by the form it appears on.</w:t>
       </w:r>
     </w:p>
     <w:p>
@@ -9863,6 +12145,7 @@
             </w:tcMar>
           </w:tcPr>
           <w:p>
+            <w:proofErr w:type="spellStart"/>
             <w:r>
               <w:rPr>
                 <w:sz w:val="19"/>
@@ -9870,6 +12153,7 @@
               </w:rPr>
               <w:t>FilmTitle</w:t>
             </w:r>
+            <w:proofErr w:type="spellEnd"/>
           </w:p>
         </w:tc>
         <w:tc>
@@ -9945,6 +12229,7 @@
             </w:tcMar>
           </w:tcPr>
           <w:p>
+            <w:proofErr w:type="spellStart"/>
             <w:r>
               <w:rPr>
                 <w:sz w:val="19"/>
@@ -9952,6 +12237,7 @@
               </w:rPr>
               <w:t>FilmAgeRating</w:t>
             </w:r>
+            <w:proofErr w:type="spellEnd"/>
           </w:p>
         </w:tc>
         <w:tc>
@@ -10027,6 +12313,7 @@
             </w:tcMar>
           </w:tcPr>
           <w:p>
+            <w:proofErr w:type="spellStart"/>
             <w:r>
               <w:rPr>
                 <w:sz w:val="19"/>
@@ -10034,6 +12321,7 @@
               </w:rPr>
               <w:t>FilmDuration</w:t>
             </w:r>
+            <w:proofErr w:type="spellEnd"/>
           </w:p>
         </w:tc>
         <w:tc>
@@ -10109,6 +12397,7 @@
             </w:tcMar>
           </w:tcPr>
           <w:p>
+            <w:proofErr w:type="spellStart"/>
             <w:r>
               <w:rPr>
                 <w:sz w:val="19"/>
@@ -10116,6 +12405,7 @@
               </w:rPr>
               <w:t>FilmDescription</w:t>
             </w:r>
+            <w:proofErr w:type="spellEnd"/>
           </w:p>
         </w:tc>
         <w:tc>
@@ -10332,6 +12622,7 @@
             </w:tcMar>
           </w:tcPr>
           <w:p>
+            <w:proofErr w:type="spellStart"/>
             <w:r>
               <w:rPr>
                 <w:sz w:val="19"/>
@@ -10339,6 +12630,7 @@
               </w:rPr>
               <w:t>ScreenName</w:t>
             </w:r>
+            <w:proofErr w:type="spellEnd"/>
           </w:p>
         </w:tc>
         <w:tc>
@@ -10414,6 +12706,7 @@
             </w:tcMar>
           </w:tcPr>
           <w:p>
+            <w:proofErr w:type="spellStart"/>
             <w:r>
               <w:rPr>
                 <w:sz w:val="19"/>
@@ -10421,6 +12714,7 @@
               </w:rPr>
               <w:t>ScreenCapacity</w:t>
             </w:r>
+            <w:proofErr w:type="spellEnd"/>
           </w:p>
         </w:tc>
         <w:tc>
@@ -10822,6 +13116,7 @@
             </w:tcMar>
           </w:tcPr>
           <w:p>
+            <w:proofErr w:type="spellStart"/>
             <w:r>
               <w:rPr>
                 <w:sz w:val="19"/>
@@ -10829,6 +13124,7 @@
               </w:rPr>
               <w:t>ScreeningDate</w:t>
             </w:r>
+            <w:proofErr w:type="spellEnd"/>
           </w:p>
         </w:tc>
         <w:tc>
@@ -10904,6 +13200,7 @@
             </w:tcMar>
           </w:tcPr>
           <w:p>
+            <w:proofErr w:type="spellStart"/>
             <w:r>
               <w:rPr>
                 <w:sz w:val="19"/>
@@ -10911,6 +13208,7 @@
               </w:rPr>
               <w:t>ScreeningTime</w:t>
             </w:r>
+            <w:proofErr w:type="spellEnd"/>
           </w:p>
         </w:tc>
         <w:tc>
@@ -10986,6 +13284,7 @@
             </w:tcMar>
           </w:tcPr>
           <w:p>
+            <w:proofErr w:type="spellStart"/>
             <w:r>
               <w:rPr>
                 <w:sz w:val="19"/>
@@ -10993,6 +13292,7 @@
               </w:rPr>
               <w:t>TicketPrice</w:t>
             </w:r>
+            <w:proofErr w:type="spellEnd"/>
           </w:p>
         </w:tc>
         <w:tc>
@@ -11209,6 +13509,7 @@
             </w:tcMar>
           </w:tcPr>
           <w:p>
+            <w:proofErr w:type="spellStart"/>
             <w:r>
               <w:rPr>
                 <w:sz w:val="19"/>
@@ -11216,6 +13517,7 @@
               </w:rPr>
               <w:t>CustomerForename</w:t>
             </w:r>
+            <w:proofErr w:type="spellEnd"/>
           </w:p>
         </w:tc>
         <w:tc>
@@ -11291,6 +13593,7 @@
             </w:tcMar>
           </w:tcPr>
           <w:p>
+            <w:proofErr w:type="spellStart"/>
             <w:r>
               <w:rPr>
                 <w:sz w:val="19"/>
@@ -11298,6 +13601,7 @@
               </w:rPr>
               <w:t>CustomerSurname</w:t>
             </w:r>
+            <w:proofErr w:type="spellEnd"/>
           </w:p>
         </w:tc>
         <w:tc>
@@ -11373,6 +13677,7 @@
             </w:tcMar>
           </w:tcPr>
           <w:p>
+            <w:proofErr w:type="spellStart"/>
             <w:r>
               <w:rPr>
                 <w:sz w:val="19"/>
@@ -11380,6 +13685,7 @@
               </w:rPr>
               <w:t>CustomerEmail</w:t>
             </w:r>
+            <w:proofErr w:type="spellEnd"/>
           </w:p>
         </w:tc>
         <w:tc>
@@ -11455,6 +13761,7 @@
             </w:tcMar>
           </w:tcPr>
           <w:p>
+            <w:proofErr w:type="spellStart"/>
             <w:r>
               <w:rPr>
                 <w:sz w:val="19"/>
@@ -11462,6 +13769,7 @@
               </w:rPr>
               <w:t>CustomerPhone</w:t>
             </w:r>
+            <w:proofErr w:type="spellEnd"/>
           </w:p>
         </w:tc>
         <w:tc>

</xml_diff>

<commit_message>
added desc for obj 5 in design
</commit_message>
<xml_diff>
--- a/Design.docx
+++ b/Design.docx
@@ -11,23 +11,13 @@
           <w:color w:val="A02B93" w:themeColor="accent5"/>
         </w:rPr>
       </w:pPr>
-      <w:proofErr w:type="spellStart"/>
       <w:r>
         <w:rPr>
           <w:b/>
           <w:bCs/>
           <w:color w:val="A02B93" w:themeColor="accent5"/>
         </w:rPr>
-        <w:t>Filmtopia</w:t>
-      </w:r>
-      <w:proofErr w:type="spellEnd"/>
-      <w:r>
-        <w:rPr>
-          <w:b/>
-          <w:bCs/>
-          <w:color w:val="A02B93" w:themeColor="accent5"/>
-        </w:rPr>
-        <w:t xml:space="preserve"> Project Design</w:t>
+        <w:t>Filmtopia Project Design</w:t>
       </w:r>
     </w:p>
     <w:p>
@@ -53,105 +43,21 @@
         <w:rPr>
           <w:rFonts w:ascii="Aptos" w:eastAsia="Aptos" w:hAnsi="Aptos" w:cs="Aptos"/>
         </w:rPr>
-        <w:t xml:space="preserve">The purpose of this section is to design the way that the user will interact with the </w:t>
-      </w:r>
-      <w:proofErr w:type="spellStart"/>
-      <w:r>
+        <w:t>The purpose of this section is to design the way that the user will interact with the Filmtopia system before any of it is actually built. In other words this is where I plan out every form the user will see, the information that goes into each one and the information that comes back out, so that when I move on to writing the code I already have a clear picture of what I am building rather than making it up as I go along. I have taken each objective in turn as a heading and described how the interface will behave for that objective, and for every form or report involved I have drawn a wireframe showing roughly where the labels, text boxes and buttons will sit. These drawings are deliberately kept simple so that it is obvious they are design sketches and not screenshots of a finished program.</w:t>
+      </w:r>
+    </w:p>
+    <w:p>
+      <w:pPr>
+        <w:spacing w:after="160" w:line="276" w:lineRule="auto"/>
         <w:rPr>
           <w:rFonts w:ascii="Aptos" w:eastAsia="Aptos" w:hAnsi="Aptos" w:cs="Aptos"/>
         </w:rPr>
-        <w:t>Filmtopia</w:t>
-      </w:r>
-      <w:proofErr w:type="spellEnd"/>
+      </w:pPr>
       <w:r>
         <w:rPr>
           <w:rFonts w:ascii="Aptos" w:eastAsia="Aptos" w:hAnsi="Aptos" w:cs="Aptos"/>
         </w:rPr>
-        <w:t xml:space="preserve"> system before any of it is actually built. In other words this is where I plan out every form the user will see, the information that goes into each one and the information that comes back out, so that when I move on to writing the code I already have a clear picture of what I am building rather than making it up as I go along. I have taken each objective in turn as a heading and described how the interface will behave for that objective, and for every form or report involved I have drawn a wireframe showing roughly where the labels, text boxes and buttons will sit. These drawings are deliberately kept simple so that it is obvious they are design sketches and not screenshots of a finished program.</w:t>
-      </w:r>
-    </w:p>
-    <w:p>
-      <w:pPr>
-        <w:spacing w:after="160" w:line="276" w:lineRule="auto"/>
-        <w:rPr>
-          <w:rFonts w:ascii="Aptos" w:eastAsia="Aptos" w:hAnsi="Aptos" w:cs="Aptos"/>
-        </w:rPr>
-      </w:pPr>
-      <w:r>
-        <w:rPr>
-          <w:rFonts w:ascii="Aptos" w:eastAsia="Aptos" w:hAnsi="Aptos" w:cs="Aptos"/>
-        </w:rPr>
-        <w:t xml:space="preserve">Before going through the objectives one at a time it is worth explaining a couple of decisions that apply across the whole system. </w:t>
-      </w:r>
-      <w:proofErr w:type="spellStart"/>
-      <w:r>
-        <w:rPr>
-          <w:rFonts w:ascii="Aptos" w:eastAsia="Aptos" w:hAnsi="Aptos" w:cs="Aptos"/>
-        </w:rPr>
-        <w:t>Filmtopia</w:t>
-      </w:r>
-      <w:proofErr w:type="spellEnd"/>
-      <w:r>
-        <w:rPr>
-          <w:rFonts w:ascii="Aptos" w:eastAsia="Aptos" w:hAnsi="Aptos" w:cs="Aptos"/>
-        </w:rPr>
-        <w:t xml:space="preserve"> is built as a Windows Forms desktop application, so every screen is a form made up of standard controls such as text boxes, labels, buttons and data grids. I have chosen to name my controls using a short prefix that describes what each one is, for example txt for a text box, </w:t>
-      </w:r>
-      <w:proofErr w:type="spellStart"/>
-      <w:r>
-        <w:rPr>
-          <w:rFonts w:ascii="Aptos" w:eastAsia="Aptos" w:hAnsi="Aptos" w:cs="Aptos"/>
-        </w:rPr>
-        <w:t>btn</w:t>
-      </w:r>
-      <w:proofErr w:type="spellEnd"/>
-      <w:r>
-        <w:rPr>
-          <w:rFonts w:ascii="Aptos" w:eastAsia="Aptos" w:hAnsi="Aptos" w:cs="Aptos"/>
-        </w:rPr>
-        <w:t xml:space="preserve"> for a button, </w:t>
-      </w:r>
-      <w:proofErr w:type="spellStart"/>
-      <w:r>
-        <w:rPr>
-          <w:rFonts w:ascii="Aptos" w:eastAsia="Aptos" w:hAnsi="Aptos" w:cs="Aptos"/>
-        </w:rPr>
-        <w:t>lbl</w:t>
-      </w:r>
-      <w:proofErr w:type="spellEnd"/>
-      <w:r>
-        <w:rPr>
-          <w:rFonts w:ascii="Aptos" w:eastAsia="Aptos" w:hAnsi="Aptos" w:cs="Aptos"/>
-        </w:rPr>
-        <w:t xml:space="preserve"> for a label, </w:t>
-      </w:r>
-      <w:proofErr w:type="spellStart"/>
-      <w:r>
-        <w:rPr>
-          <w:rFonts w:ascii="Aptos" w:eastAsia="Aptos" w:hAnsi="Aptos" w:cs="Aptos"/>
-        </w:rPr>
-        <w:t>cbo</w:t>
-      </w:r>
-      <w:proofErr w:type="spellEnd"/>
-      <w:r>
-        <w:rPr>
-          <w:rFonts w:ascii="Aptos" w:eastAsia="Aptos" w:hAnsi="Aptos" w:cs="Aptos"/>
-        </w:rPr>
-        <w:t xml:space="preserve"> for a combo box and </w:t>
-      </w:r>
-      <w:proofErr w:type="spellStart"/>
-      <w:r>
-        <w:rPr>
-          <w:rFonts w:ascii="Aptos" w:eastAsia="Aptos" w:hAnsi="Aptos" w:cs="Aptos"/>
-        </w:rPr>
-        <w:t>dgv</w:t>
-      </w:r>
-      <w:proofErr w:type="spellEnd"/>
-      <w:r>
-        <w:rPr>
-          <w:rFonts w:ascii="Aptos" w:eastAsia="Aptos" w:hAnsi="Aptos" w:cs="Aptos"/>
-        </w:rPr>
-        <w:t xml:space="preserve"> for a data grid view, followed by a word describing its job. This is because a consistent naming convention makes the code far easier to read later on and stops me getting confused between similarly named items. I have also decided not to worry too much about the finer details of colour at this stage, this is because the guidance makes clear that the interface will be refined after the prototype in section 5.2, so it makes sense to settle the layout and the flow first and then tidy up the appearance once I know everything works.</w:t>
+        <w:t>Before going through the objectives one at a time it is worth explaining a couple of decisions that apply across the whole system. Filmtopia is built as a Windows Forms desktop application, so every screen is a form made up of standard controls such as text boxes, labels, buttons and data grids. I have chosen to name my controls using a short prefix that describes what each one is, for example txt for a text box, btn for a button, lbl for a label, cbo for a combo box and dgv for a data grid view, followed by a word describing its job. This is because a consistent naming convention makes the code far easier to read later on and stops me getting confused between similarly named items. I have also decided not to worry too much about the finer details of colour at this stage, this is because the guidance makes clear that the interface will be refined after the prototype in section 5.2, so it makes sense to settle the layout and the flow first and then tidy up the appearance once I know everything works.</w:t>
       </w:r>
     </w:p>
     <w:p>
@@ -177,123 +83,25 @@
         <w:rPr>
           <w:rFonts w:ascii="Aptos" w:eastAsia="Aptos" w:hAnsi="Aptos" w:cs="Aptos"/>
         </w:rPr>
-        <w:t xml:space="preserve">The first thing any user meets when they open </w:t>
-      </w:r>
-      <w:proofErr w:type="spellStart"/>
+        <w:t>The first thing any user meets when they open Filmtopia is the login screen, so this is where the design naturally starts. The objective here is to make sure that customers, staff and managers are not all able to do the same things, because a normal member of staff being able to reach the manager's sales reports or the audit log would be a serious security weakness. To achieve this the system asks for a username and a password on a small login form, checks them against the tblLogin table, and reads back an access level number that then decides what the user is allowed to see.</w:t>
+      </w:r>
+    </w:p>
+    <w:p>
+      <w:pPr>
+        <w:spacing w:after="160" w:line="276" w:lineRule="auto"/>
+      </w:pPr>
       <w:r>
         <w:rPr>
           <w:rFonts w:ascii="Aptos" w:eastAsia="Aptos" w:hAnsi="Aptos" w:cs="Aptos"/>
         </w:rPr>
-        <w:t>Filmtopia</w:t>
-      </w:r>
-      <w:proofErr w:type="spellEnd"/>
+        <w:t xml:space="preserve">The login form itself is deliberately kept small and uncomplicated. It has a header panel across the top showing the name Filmtopia and the subtitle Cinema Management System </w:t>
+      </w:r>
       <w:r>
         <w:rPr>
           <w:rFonts w:ascii="Aptos" w:eastAsia="Aptos" w:hAnsi="Aptos" w:cs="Aptos"/>
         </w:rPr>
-        <w:t xml:space="preserve"> is the login screen, so this is where the design naturally starts. The objective here is to make sure that customers, staff and managers are not all able to do the same things, because a normal member of staff being able to reach the manager's sales reports or the audit log would be a serious security weakness. To achieve this the system asks for a username and a password on a small login form, checks them against the </w:t>
-      </w:r>
-      <w:proofErr w:type="spellStart"/>
-      <w:r>
-        <w:rPr>
-          <w:rFonts w:ascii="Aptos" w:eastAsia="Aptos" w:hAnsi="Aptos" w:cs="Aptos"/>
-        </w:rPr>
-        <w:t>tblLogin</w:t>
-      </w:r>
-      <w:proofErr w:type="spellEnd"/>
-      <w:r>
-        <w:rPr>
-          <w:rFonts w:ascii="Aptos" w:eastAsia="Aptos" w:hAnsi="Aptos" w:cs="Aptos"/>
-        </w:rPr>
-        <w:t xml:space="preserve"> table, and reads back an access level number that then decides what the user is allowed to see.</w:t>
-      </w:r>
-    </w:p>
-    <w:p>
-      <w:pPr>
-        <w:spacing w:after="160" w:line="276" w:lineRule="auto"/>
-      </w:pPr>
-      <w:r>
-        <w:rPr>
-          <w:rFonts w:ascii="Aptos" w:eastAsia="Aptos" w:hAnsi="Aptos" w:cs="Aptos"/>
-        </w:rPr>
-        <w:t xml:space="preserve">The login form itself is deliberately kept small and uncomplicated. It has a header panel across the top showing the name </w:t>
-      </w:r>
-      <w:proofErr w:type="spellStart"/>
-      <w:r>
-        <w:rPr>
-          <w:rFonts w:ascii="Aptos" w:eastAsia="Aptos" w:hAnsi="Aptos" w:cs="Aptos"/>
-        </w:rPr>
-        <w:t>Filmtopia</w:t>
-      </w:r>
-      <w:proofErr w:type="spellEnd"/>
-      <w:r>
-        <w:rPr>
-          <w:rFonts w:ascii="Aptos" w:eastAsia="Aptos" w:hAnsi="Aptos" w:cs="Aptos"/>
-        </w:rPr>
-        <w:t xml:space="preserve"> and the subtitle Cinema Management System </w:t>
-      </w:r>
-      <w:r>
-        <w:rPr>
-          <w:rFonts w:ascii="Aptos" w:eastAsia="Aptos" w:hAnsi="Aptos" w:cs="Aptos"/>
-        </w:rPr>
         <w:lastRenderedPageBreak/>
-        <w:t xml:space="preserve">so the user knows straight away what they are logging into. Below that are two labels, Username and Password, each sitting next to its own text box, which I have named </w:t>
-      </w:r>
-      <w:proofErr w:type="spellStart"/>
-      <w:r>
-        <w:rPr>
-          <w:rFonts w:ascii="Aptos" w:eastAsia="Aptos" w:hAnsi="Aptos" w:cs="Aptos"/>
-        </w:rPr>
-        <w:t>txtUsername</w:t>
-      </w:r>
-      <w:proofErr w:type="spellEnd"/>
-      <w:r>
-        <w:rPr>
-          <w:rFonts w:ascii="Aptos" w:eastAsia="Aptos" w:hAnsi="Aptos" w:cs="Aptos"/>
-        </w:rPr>
-        <w:t xml:space="preserve"> and </w:t>
-      </w:r>
-      <w:proofErr w:type="spellStart"/>
-      <w:r>
-        <w:rPr>
-          <w:rFonts w:ascii="Aptos" w:eastAsia="Aptos" w:hAnsi="Aptos" w:cs="Aptos"/>
-        </w:rPr>
-        <w:t>txtPassword</w:t>
-      </w:r>
-      <w:proofErr w:type="spellEnd"/>
-      <w:r>
-        <w:rPr>
-          <w:rFonts w:ascii="Aptos" w:eastAsia="Aptos" w:hAnsi="Aptos" w:cs="Aptos"/>
-        </w:rPr>
-        <w:t xml:space="preserve">. The password box will have its characters masked so that anyone standing nearby cannot read what is being typed. Underneath the boxes are two buttons, a Log In button named </w:t>
-      </w:r>
-      <w:proofErr w:type="spellStart"/>
-      <w:r>
-        <w:rPr>
-          <w:rFonts w:ascii="Aptos" w:eastAsia="Aptos" w:hAnsi="Aptos" w:cs="Aptos"/>
-        </w:rPr>
-        <w:t>btnLogin</w:t>
-      </w:r>
-      <w:proofErr w:type="spellEnd"/>
-      <w:r>
-        <w:rPr>
-          <w:rFonts w:ascii="Aptos" w:eastAsia="Aptos" w:hAnsi="Aptos" w:cs="Aptos"/>
-        </w:rPr>
-        <w:t xml:space="preserve"> which carries out the check, and a Cancel button named </w:t>
-      </w:r>
-      <w:proofErr w:type="spellStart"/>
-      <w:r>
-        <w:rPr>
-          <w:rFonts w:ascii="Aptos" w:eastAsia="Aptos" w:hAnsi="Aptos" w:cs="Aptos"/>
-        </w:rPr>
-        <w:t>btnClose</w:t>
-      </w:r>
-      <w:proofErr w:type="spellEnd"/>
-      <w:r>
-        <w:rPr>
-          <w:rFonts w:ascii="Aptos" w:eastAsia="Aptos" w:hAnsi="Aptos" w:cs="Aptos"/>
-        </w:rPr>
-        <w:t xml:space="preserve"> which closes the program if the user changes their mind. A small version label sits at the very bottom of the form.</w:t>
+        <w:t>so the user knows straight away what they are logging into. Below that are two labels, Username and Password, each sitting next to its own text box, which I have named txtUsername and txtPassword. The password box will have its characters masked so that anyone standing nearby cannot read what is being typed. Underneath the boxes are two buttons, a Log In button named btnLogin which carries out the check, and a Cancel button named btnClose which closes the program if the user changes their mind. A small version label sits at the very bottom of the form.</w:t>
       </w:r>
     </w:p>
     <w:p>
@@ -316,31 +124,29 @@
           <w:sz w:val="22"/>
           <w:szCs w:val="22"/>
         </w:rPr>
-        <w:t>Login Form (</w:t>
-      </w:r>
-      <w:proofErr w:type="spellStart"/>
+        <w:t>Login Form (frmLogin)</w:t>
+      </w:r>
+    </w:p>
+    <w:p>
+      <w:pPr>
+        <w:spacing w:after="160" w:line="276" w:lineRule="auto"/>
+      </w:pPr>
       <w:r>
         <w:rPr>
           <w:rFonts w:ascii="Aptos" w:eastAsia="Aptos" w:hAnsi="Aptos" w:cs="Aptos"/>
-          <w:b/>
-          <w:bCs/>
-          <w:color w:val="A02B93"/>
-          <w:sz w:val="22"/>
-          <w:szCs w:val="22"/>
-        </w:rPr>
-        <w:t>frmLogin</w:t>
-      </w:r>
-      <w:proofErr w:type="spellEnd"/>
+        </w:rPr>
+        <w:t>The only input to this form is the username and password typed by the user. The output, once the button is pressed, is either entry into the main menu or a message box telling the user that their details were not recognised. The process that happens in between is a lookup against the tblLogin table for a matching username, a comparison of the stored password, and if everything matches, the storing of that user's access level in a variable called UserAccessLevel that the rest of the program can read. I have chosen buttons here rather than, for example, expecting the user to press the Enter key, this is because a clearly labelled Log In button leaves no doubt about what to do and is friendlier for staff who are not especially technical.</w:t>
+      </w:r>
+    </w:p>
+    <w:p>
+      <w:pPr>
+        <w:spacing w:after="160" w:line="276" w:lineRule="auto"/>
+      </w:pPr>
       <w:r>
         <w:rPr>
           <w:rFonts w:ascii="Aptos" w:eastAsia="Aptos" w:hAnsi="Aptos" w:cs="Aptos"/>
-          <w:b/>
-          <w:bCs/>
-          <w:color w:val="A02B93"/>
-          <w:sz w:val="22"/>
-          <w:szCs w:val="22"/>
-        </w:rPr>
-        <w:t>)</w:t>
+        </w:rPr>
+        <w:t>Once a user has logged in successfully they are taken to the main menu, which is the form named frmMainForm and acts as the hub for the whole system. Every other part of Filmtopia is reached from here by pressing a button, which I felt was a far more sophisticated and easier to follow approach than burying features inside drop-down menus that a busy member of staff would have to go hunting through. The menu shows a welcome message at the top and then a column of buttons down the content area, one for each area of the system, for example Bookings, Find Booking, Screenings, Films, Screens, Food, Reports, Customers, Logs and a Logout button.</w:t>
       </w:r>
     </w:p>
     <w:p>
@@ -351,113 +157,7 @@
         <w:rPr>
           <w:rFonts w:ascii="Aptos" w:eastAsia="Aptos" w:hAnsi="Aptos" w:cs="Aptos"/>
         </w:rPr>
-        <w:t xml:space="preserve">The only input to this form is the username and password typed by the user. The output, once the button is pressed, is either entry into the main menu or a message box telling the user that their details were not recognised. The process that happens in between is a lookup against the </w:t>
-      </w:r>
-      <w:proofErr w:type="spellStart"/>
-      <w:r>
-        <w:rPr>
-          <w:rFonts w:ascii="Aptos" w:eastAsia="Aptos" w:hAnsi="Aptos" w:cs="Aptos"/>
-        </w:rPr>
-        <w:t>tblLogin</w:t>
-      </w:r>
-      <w:proofErr w:type="spellEnd"/>
-      <w:r>
-        <w:rPr>
-          <w:rFonts w:ascii="Aptos" w:eastAsia="Aptos" w:hAnsi="Aptos" w:cs="Aptos"/>
-        </w:rPr>
-        <w:t xml:space="preserve"> table for a matching username, a comparison of the stored password, and if everything matches, the storing of that user's access level in a variable called </w:t>
-      </w:r>
-      <w:proofErr w:type="spellStart"/>
-      <w:r>
-        <w:rPr>
-          <w:rFonts w:ascii="Aptos" w:eastAsia="Aptos" w:hAnsi="Aptos" w:cs="Aptos"/>
-        </w:rPr>
-        <w:t>UserAccessLevel</w:t>
-      </w:r>
-      <w:proofErr w:type="spellEnd"/>
-      <w:r>
-        <w:rPr>
-          <w:rFonts w:ascii="Aptos" w:eastAsia="Aptos" w:hAnsi="Aptos" w:cs="Aptos"/>
-        </w:rPr>
-        <w:t xml:space="preserve"> that the rest of the program can read. I have chosen buttons here rather than, for example, expecting the user to press the Enter key, this is because a clearly labelled Log In button leaves no doubt about what to do and is friendlier for staff who are not especially technical.</w:t>
-      </w:r>
-    </w:p>
-    <w:p>
-      <w:pPr>
-        <w:spacing w:after="160" w:line="276" w:lineRule="auto"/>
-      </w:pPr>
-      <w:r>
-        <w:rPr>
-          <w:rFonts w:ascii="Aptos" w:eastAsia="Aptos" w:hAnsi="Aptos" w:cs="Aptos"/>
-        </w:rPr>
-        <w:t xml:space="preserve">Once a user has logged in successfully they are taken to the main menu, which is the form named </w:t>
-      </w:r>
-      <w:proofErr w:type="spellStart"/>
-      <w:r>
-        <w:rPr>
-          <w:rFonts w:ascii="Aptos" w:eastAsia="Aptos" w:hAnsi="Aptos" w:cs="Aptos"/>
-        </w:rPr>
-        <w:t>frmMainForm</w:t>
-      </w:r>
-      <w:proofErr w:type="spellEnd"/>
-      <w:r>
-        <w:rPr>
-          <w:rFonts w:ascii="Aptos" w:eastAsia="Aptos" w:hAnsi="Aptos" w:cs="Aptos"/>
-        </w:rPr>
-        <w:t xml:space="preserve"> and acts as the hub for the whole system. Every other part of </w:t>
-      </w:r>
-      <w:proofErr w:type="spellStart"/>
-      <w:r>
-        <w:rPr>
-          <w:rFonts w:ascii="Aptos" w:eastAsia="Aptos" w:hAnsi="Aptos" w:cs="Aptos"/>
-        </w:rPr>
-        <w:t>Filmtopia</w:t>
-      </w:r>
-      <w:proofErr w:type="spellEnd"/>
-      <w:r>
-        <w:rPr>
-          <w:rFonts w:ascii="Aptos" w:eastAsia="Aptos" w:hAnsi="Aptos" w:cs="Aptos"/>
-        </w:rPr>
-        <w:t xml:space="preserve"> is reached from here by pressing a button, which I felt was a far more sophisticated and easier to follow approach than burying features inside drop-down menus that a busy member of staff would have to go hunting through. The menu shows a welcome message at the top and then a column of buttons down the content area, one for each area of the system, for example Bookings, Find Booking, Screenings, Films, Screens, Food, Reports, Customers, Logs and a Logout button.</w:t>
-      </w:r>
-    </w:p>
-    <w:p>
-      <w:pPr>
-        <w:spacing w:after="160" w:line="276" w:lineRule="auto"/>
-      </w:pPr>
-      <w:r>
-        <w:rPr>
-          <w:rFonts w:ascii="Aptos" w:eastAsia="Aptos" w:hAnsi="Aptos" w:cs="Aptos"/>
-        </w:rPr>
-        <w:t xml:space="preserve">What makes this form important for the objective is that the buttons shown depend entirely on the access level that was read at login. This is because a manager, whose access level is 1, needs to see everything, whereas a normal member of staff, whose access level is 2, should only see the day to day booking functions. When a manager logs in the group box is titled </w:t>
-      </w:r>
-      <w:proofErr w:type="spellStart"/>
-      <w:r>
-        <w:rPr>
-          <w:rFonts w:ascii="Aptos" w:eastAsia="Aptos" w:hAnsi="Aptos" w:cs="Aptos"/>
-        </w:rPr>
-        <w:t>Filmtopia</w:t>
-      </w:r>
-      <w:proofErr w:type="spellEnd"/>
-      <w:r>
-        <w:rPr>
-          <w:rFonts w:ascii="Aptos" w:eastAsia="Aptos" w:hAnsi="Aptos" w:cs="Aptos"/>
-        </w:rPr>
-        <w:t xml:space="preserve"> Admin and the management buttons for Films, Screens, Food, Reports and Logs are all made visible. When a member of staff logs in those same buttons are hidden and the group box is titled </w:t>
-      </w:r>
-      <w:proofErr w:type="spellStart"/>
-      <w:r>
-        <w:rPr>
-          <w:rFonts w:ascii="Aptos" w:eastAsia="Aptos" w:hAnsi="Aptos" w:cs="Aptos"/>
-        </w:rPr>
-        <w:t>Filmtopia</w:t>
-      </w:r>
-      <w:proofErr w:type="spellEnd"/>
-      <w:r>
-        <w:rPr>
-          <w:rFonts w:ascii="Aptos" w:eastAsia="Aptos" w:hAnsi="Aptos" w:cs="Aptos"/>
-        </w:rPr>
-        <w:t xml:space="preserve"> Staff, leaving them with just the booking related functions. In this way a single form quietly enforces the whole access level objective without the staff member ever seeing an option they are not allowed to use.</w:t>
+        <w:t>What makes this form important for the objective is that the buttons shown depend entirely on the access level that was read at login. This is because a manager, whose access level is 1, needs to see everything, whereas a normal member of staff, whose access level is 2, should only see the day to day booking functions. When a manager logs in the group box is titled Filmtopia Admin and the management buttons for Films, Screens, Food, Reports and Logs are all made visible. When a member of staff logs in those same buttons are hidden and the group box is titled Filmtopia Staff, leaving them with just the booking related functions. In this way a single form quietly enforces the whole access level objective without the staff member ever seeing an option they are not allowed to use.</w:t>
       </w:r>
     </w:p>
     <w:p>
@@ -481,31 +181,7 @@
           <w:szCs w:val="22"/>
         </w:rPr>
         <w:lastRenderedPageBreak/>
-        <w:t>Main Menu (</w:t>
-      </w:r>
-      <w:proofErr w:type="spellStart"/>
-      <w:r>
-        <w:rPr>
-          <w:rFonts w:ascii="Aptos" w:eastAsia="Aptos" w:hAnsi="Aptos" w:cs="Aptos"/>
-          <w:b/>
-          <w:bCs/>
-          <w:color w:val="A02B93"/>
-          <w:sz w:val="22"/>
-          <w:szCs w:val="22"/>
-        </w:rPr>
-        <w:t>frmMainForm</w:t>
-      </w:r>
-      <w:proofErr w:type="spellEnd"/>
-      <w:r>
-        <w:rPr>
-          <w:rFonts w:ascii="Aptos" w:eastAsia="Aptos" w:hAnsi="Aptos" w:cs="Aptos"/>
-          <w:b/>
-          <w:bCs/>
-          <w:color w:val="A02B93"/>
-          <w:sz w:val="22"/>
-          <w:szCs w:val="22"/>
-        </w:rPr>
-        <w:t>)</w:t>
+        <w:t>Main Menu (frmMainForm)</w:t>
       </w:r>
     </w:p>
     <w:p>
@@ -542,158 +218,18 @@
         <w:rPr>
           <w:rFonts w:ascii="Aptos" w:eastAsia="Aptos" w:hAnsi="Aptos" w:cs="Aptos"/>
         </w:rPr>
-        <w:t xml:space="preserve">Moving on to the management side of the system, one of the first jobs a manager or member of staff needs to do is add the films that the cinema is showing, because without any films in the system there is nothing for a screening to be attached to. This objective is handled by a single form named </w:t>
-      </w:r>
-      <w:proofErr w:type="spellStart"/>
+        <w:t>Moving on to the management side of the system, one of the first jobs a manager or member of staff needs to do is add the films that the cinema is showing, because without any films in the system there is nothing for a screening to be attached to. This objective is handled by a single form named frmFilms which lets the user add a new film, edit an existing one, or remove one that is no longer being shown.</w:t>
+      </w:r>
+    </w:p>
+    <w:p>
+      <w:pPr>
+        <w:spacing w:after="160" w:line="276" w:lineRule="auto"/>
+      </w:pPr>
       <w:r>
         <w:rPr>
           <w:rFonts w:ascii="Aptos" w:eastAsia="Aptos" w:hAnsi="Aptos" w:cs="Aptos"/>
         </w:rPr>
-        <w:t>frmFilms</w:t>
-      </w:r>
-      <w:proofErr w:type="spellEnd"/>
-      <w:r>
-        <w:rPr>
-          <w:rFonts w:ascii="Aptos" w:eastAsia="Aptos" w:hAnsi="Aptos" w:cs="Aptos"/>
-        </w:rPr>
-        <w:t xml:space="preserve"> which lets the user add a new film, edit an existing one, or remove one that is no longer being shown.</w:t>
-      </w:r>
-    </w:p>
-    <w:p>
-      <w:pPr>
-        <w:spacing w:after="160" w:line="276" w:lineRule="auto"/>
-      </w:pPr>
-      <w:r>
-        <w:rPr>
-          <w:rFonts w:ascii="Aptos" w:eastAsia="Aptos" w:hAnsi="Aptos" w:cs="Aptos"/>
-        </w:rPr>
-        <w:t xml:space="preserve">The form is split into two halves. On one side is a data grid view named </w:t>
-      </w:r>
-      <w:proofErr w:type="spellStart"/>
-      <w:r>
-        <w:rPr>
-          <w:rFonts w:ascii="Aptos" w:eastAsia="Aptos" w:hAnsi="Aptos" w:cs="Aptos"/>
-        </w:rPr>
-        <w:t>dgvFilms</w:t>
-      </w:r>
-      <w:proofErr w:type="spellEnd"/>
-      <w:r>
-        <w:rPr>
-          <w:rFonts w:ascii="Aptos" w:eastAsia="Aptos" w:hAnsi="Aptos" w:cs="Aptos"/>
-        </w:rPr>
-        <w:t xml:space="preserve"> which lists every film already stored in the system, showing its title, age rating, duration and description in a table so the user can see at a glance what is already there. On the other side is a set of input boxes for the details of a film, made up of a label and a text box for each field, which I have named </w:t>
-      </w:r>
-      <w:proofErr w:type="spellStart"/>
-      <w:r>
-        <w:rPr>
-          <w:rFonts w:ascii="Aptos" w:eastAsia="Aptos" w:hAnsi="Aptos" w:cs="Aptos"/>
-        </w:rPr>
-        <w:t>txtTitle</w:t>
-      </w:r>
-      <w:proofErr w:type="spellEnd"/>
-      <w:r>
-        <w:rPr>
-          <w:rFonts w:ascii="Aptos" w:eastAsia="Aptos" w:hAnsi="Aptos" w:cs="Aptos"/>
-        </w:rPr>
-        <w:t xml:space="preserve">, </w:t>
-      </w:r>
-      <w:proofErr w:type="spellStart"/>
-      <w:r>
-        <w:rPr>
-          <w:rFonts w:ascii="Aptos" w:eastAsia="Aptos" w:hAnsi="Aptos" w:cs="Aptos"/>
-        </w:rPr>
-        <w:t>txtAgeRating</w:t>
-      </w:r>
-      <w:proofErr w:type="spellEnd"/>
-      <w:r>
-        <w:rPr>
-          <w:rFonts w:ascii="Aptos" w:eastAsia="Aptos" w:hAnsi="Aptos" w:cs="Aptos"/>
-        </w:rPr>
-        <w:t xml:space="preserve">, </w:t>
-      </w:r>
-      <w:proofErr w:type="spellStart"/>
-      <w:r>
-        <w:rPr>
-          <w:rFonts w:ascii="Aptos" w:eastAsia="Aptos" w:hAnsi="Aptos" w:cs="Aptos"/>
-        </w:rPr>
-        <w:t>txtDuration</w:t>
-      </w:r>
-      <w:proofErr w:type="spellEnd"/>
-      <w:r>
-        <w:rPr>
-          <w:rFonts w:ascii="Aptos" w:eastAsia="Aptos" w:hAnsi="Aptos" w:cs="Aptos"/>
-        </w:rPr>
-        <w:t xml:space="preserve"> and </w:t>
-      </w:r>
-      <w:proofErr w:type="spellStart"/>
-      <w:r>
-        <w:rPr>
-          <w:rFonts w:ascii="Aptos" w:eastAsia="Aptos" w:hAnsi="Aptos" w:cs="Aptos"/>
-        </w:rPr>
-        <w:t>txtDescription</w:t>
-      </w:r>
-      <w:proofErr w:type="spellEnd"/>
-      <w:r>
-        <w:rPr>
-          <w:rFonts w:ascii="Aptos" w:eastAsia="Aptos" w:hAnsi="Aptos" w:cs="Aptos"/>
-        </w:rPr>
-        <w:t xml:space="preserve">. Beneath these are four buttons, Add, Update, Delete and Clear, which I have named </w:t>
-      </w:r>
-      <w:proofErr w:type="spellStart"/>
-      <w:r>
-        <w:rPr>
-          <w:rFonts w:ascii="Aptos" w:eastAsia="Aptos" w:hAnsi="Aptos" w:cs="Aptos"/>
-        </w:rPr>
-        <w:t>btnAdd</w:t>
-      </w:r>
-      <w:proofErr w:type="spellEnd"/>
-      <w:r>
-        <w:rPr>
-          <w:rFonts w:ascii="Aptos" w:eastAsia="Aptos" w:hAnsi="Aptos" w:cs="Aptos"/>
-        </w:rPr>
-        <w:t xml:space="preserve">, </w:t>
-      </w:r>
-      <w:proofErr w:type="spellStart"/>
-      <w:r>
-        <w:rPr>
-          <w:rFonts w:ascii="Aptos" w:eastAsia="Aptos" w:hAnsi="Aptos" w:cs="Aptos"/>
-        </w:rPr>
-        <w:t>btnUpdate</w:t>
-      </w:r>
-      <w:proofErr w:type="spellEnd"/>
-      <w:r>
-        <w:rPr>
-          <w:rFonts w:ascii="Aptos" w:eastAsia="Aptos" w:hAnsi="Aptos" w:cs="Aptos"/>
-        </w:rPr>
-        <w:t xml:space="preserve">, </w:t>
-      </w:r>
-      <w:proofErr w:type="spellStart"/>
-      <w:r>
-        <w:rPr>
-          <w:rFonts w:ascii="Aptos" w:eastAsia="Aptos" w:hAnsi="Aptos" w:cs="Aptos"/>
-        </w:rPr>
-        <w:t>btnDelete</w:t>
-      </w:r>
-      <w:proofErr w:type="spellEnd"/>
-      <w:r>
-        <w:rPr>
-          <w:rFonts w:ascii="Aptos" w:eastAsia="Aptos" w:hAnsi="Aptos" w:cs="Aptos"/>
-        </w:rPr>
-        <w:t xml:space="preserve"> and </w:t>
-      </w:r>
-      <w:proofErr w:type="spellStart"/>
-      <w:r>
-        <w:rPr>
-          <w:rFonts w:ascii="Aptos" w:eastAsia="Aptos" w:hAnsi="Aptos" w:cs="Aptos"/>
-        </w:rPr>
-        <w:t>btnClear</w:t>
-      </w:r>
-      <w:proofErr w:type="spellEnd"/>
-      <w:r>
-        <w:rPr>
-          <w:rFonts w:ascii="Aptos" w:eastAsia="Aptos" w:hAnsi="Aptos" w:cs="Aptos"/>
-        </w:rPr>
-        <w:t>.</w:t>
+        <w:t>The form is split into two halves. On one side is a data grid view named dgvFilms which lists every film already stored in the system, showing its title, age rating, duration and description in a table so the user can see at a glance what is already there. On the other side is a set of input boxes for the details of a film, made up of a label and a text box for each field, which I have named txtTitle, txtAgeRating, txtDuration and txtDescription. Beneath these are four buttons, Add, Update, Delete and Clear, which I have named btnAdd, btnUpdate, btnDelete and btnClear.</w:t>
       </w:r>
     </w:p>
     <w:p>
@@ -716,56 +252,18 @@
           <w:sz w:val="22"/>
           <w:szCs w:val="22"/>
         </w:rPr>
-        <w:t>Add Films Form (</w:t>
-      </w:r>
-      <w:proofErr w:type="spellStart"/>
+        <w:t>Add Films Form (frmFilms)</w:t>
+      </w:r>
+    </w:p>
+    <w:p>
+      <w:pPr>
+        <w:spacing w:after="160" w:line="276" w:lineRule="auto"/>
+      </w:pPr>
       <w:r>
         <w:rPr>
           <w:rFonts w:ascii="Aptos" w:eastAsia="Aptos" w:hAnsi="Aptos" w:cs="Aptos"/>
-          <w:b/>
-          <w:bCs/>
-          <w:color w:val="A02B93"/>
-          <w:sz w:val="22"/>
-          <w:szCs w:val="22"/>
-        </w:rPr>
-        <w:t>frmFilms</w:t>
-      </w:r>
-      <w:proofErr w:type="spellEnd"/>
-      <w:r>
-        <w:rPr>
-          <w:rFonts w:ascii="Aptos" w:eastAsia="Aptos" w:hAnsi="Aptos" w:cs="Aptos"/>
-          <w:b/>
-          <w:bCs/>
-          <w:color w:val="A02B93"/>
-          <w:sz w:val="22"/>
-          <w:szCs w:val="22"/>
-        </w:rPr>
-        <w:t>)</w:t>
-      </w:r>
-    </w:p>
-    <w:p>
-      <w:pPr>
-        <w:spacing w:after="160" w:line="276" w:lineRule="auto"/>
-      </w:pPr>
-      <w:r>
-        <w:rPr>
-          <w:rFonts w:ascii="Aptos" w:eastAsia="Aptos" w:hAnsi="Aptos" w:cs="Aptos"/>
-        </w:rPr>
-        <w:t xml:space="preserve">The inputs to this form are the four film details typed into the text boxes. The outputs are the updated list of films shown in the grid and, where appropriate, a message box confirming that a film has been added or warning the user if something has gone wrong. The processes behind the buttons are straightforward database operations, for example the Add button takes whatever is in the text boxes and inserts a new record into the </w:t>
-      </w:r>
-      <w:proofErr w:type="spellStart"/>
-      <w:r>
-        <w:rPr>
-          <w:rFonts w:ascii="Aptos" w:eastAsia="Aptos" w:hAnsi="Aptos" w:cs="Aptos"/>
-        </w:rPr>
-        <w:t>tblFilm</w:t>
-      </w:r>
-      <w:proofErr w:type="spellEnd"/>
-      <w:r>
-        <w:rPr>
-          <w:rFonts w:ascii="Aptos" w:eastAsia="Aptos" w:hAnsi="Aptos" w:cs="Aptos"/>
-        </w:rPr>
-        <w:t xml:space="preserve"> table, whereas the Update button changes the record for the film currently selected in the grid, and the Delete button removes it. The Clear button simply empties the text boxes so the user can start again.</w:t>
+        </w:rPr>
+        <w:t>The inputs to this form are the four film details typed into the text boxes. The outputs are the updated list of films shown in the grid and, where appropriate, a message box confirming that a film has been added or warning the user if something has gone wrong. The processes behind the buttons are straightforward database operations, for example the Add button takes whatever is in the text boxes and inserts a new record into the tblFilm table, whereas the Update button changes the record for the film currently selected in the grid, and the Delete button removes it. The Clear button simply empties the text boxes so the user can start again.</w:t>
       </w:r>
     </w:p>
     <w:p>
@@ -809,116 +307,18 @@
         <w:rPr>
           <w:rFonts w:ascii="Aptos" w:eastAsia="Aptos" w:hAnsi="Aptos" w:cs="Aptos"/>
         </w:rPr>
-        <w:t xml:space="preserve">Once films exist in the system the next job is to schedule when and where they will actually be shown, which is what this objective covers. It is handled by the form named </w:t>
-      </w:r>
-      <w:proofErr w:type="spellStart"/>
+        <w:t>Once films exist in the system the next job is to schedule when and where they will actually be shown, which is what this objective covers. It is handled by the form named frmScreenings, and because it is another management form for adding, editing and removing records it follows exactly the same layout as the Add Films form described above, with a data grid view named dgvScreenings listing the existing screenings on one side and a set of input controls with Add, Update, Delete and Clear buttons on the other. Rather than repeat the whole description I will refer back to the Add Films form for the general behaviour and just explain what is different here.</w:t>
+      </w:r>
+    </w:p>
+    <w:p>
+      <w:pPr>
+        <w:spacing w:after="160" w:line="276" w:lineRule="auto"/>
+      </w:pPr>
       <w:r>
         <w:rPr>
           <w:rFonts w:ascii="Aptos" w:eastAsia="Aptos" w:hAnsi="Aptos" w:cs="Aptos"/>
         </w:rPr>
-        <w:t>frmScreenings</w:t>
-      </w:r>
-      <w:proofErr w:type="spellEnd"/>
-      <w:r>
-        <w:rPr>
-          <w:rFonts w:ascii="Aptos" w:eastAsia="Aptos" w:hAnsi="Aptos" w:cs="Aptos"/>
-        </w:rPr>
-        <w:t xml:space="preserve">, and because it is another management form for adding, editing and removing records it follows exactly the same layout as the Add Films form described above, with a data grid view named </w:t>
-      </w:r>
-      <w:proofErr w:type="spellStart"/>
-      <w:r>
-        <w:rPr>
-          <w:rFonts w:ascii="Aptos" w:eastAsia="Aptos" w:hAnsi="Aptos" w:cs="Aptos"/>
-        </w:rPr>
-        <w:t>dgvScreenings</w:t>
-      </w:r>
-      <w:proofErr w:type="spellEnd"/>
-      <w:r>
-        <w:rPr>
-          <w:rFonts w:ascii="Aptos" w:eastAsia="Aptos" w:hAnsi="Aptos" w:cs="Aptos"/>
-        </w:rPr>
-        <w:t xml:space="preserve"> listing the existing screenings on one side and a set of input controls with Add, Update, Delete and Clear buttons on the other. Rather than repeat the whole description I will refer back to the Add Films form for the general behaviour and just explain what is different here.</w:t>
-      </w:r>
-    </w:p>
-    <w:p>
-      <w:pPr>
-        <w:spacing w:after="160" w:line="276" w:lineRule="auto"/>
-      </w:pPr>
-      <w:r>
-        <w:rPr>
-          <w:rFonts w:ascii="Aptos" w:eastAsia="Aptos" w:hAnsi="Aptos" w:cs="Aptos"/>
-        </w:rPr>
-        <w:t xml:space="preserve">The difference is in the inputs. A screening has to be tied to a film that already exists and a screen that already exists, so instead of free text boxes for those two the form uses two combo boxes, named </w:t>
-      </w:r>
-      <w:proofErr w:type="spellStart"/>
-      <w:r>
-        <w:rPr>
-          <w:rFonts w:ascii="Aptos" w:eastAsia="Aptos" w:hAnsi="Aptos" w:cs="Aptos"/>
-        </w:rPr>
-        <w:t>cboFilm</w:t>
-      </w:r>
-      <w:proofErr w:type="spellEnd"/>
-      <w:r>
-        <w:rPr>
-          <w:rFonts w:ascii="Aptos" w:eastAsia="Aptos" w:hAnsi="Aptos" w:cs="Aptos"/>
-        </w:rPr>
-        <w:t xml:space="preserve"> and </w:t>
-      </w:r>
-      <w:proofErr w:type="spellStart"/>
-      <w:r>
-        <w:rPr>
-          <w:rFonts w:ascii="Aptos" w:eastAsia="Aptos" w:hAnsi="Aptos" w:cs="Aptos"/>
-        </w:rPr>
-        <w:t>cboScreen</w:t>
-      </w:r>
-      <w:proofErr w:type="spellEnd"/>
-      <w:r>
-        <w:rPr>
-          <w:rFonts w:ascii="Aptos" w:eastAsia="Aptos" w:hAnsi="Aptos" w:cs="Aptos"/>
-        </w:rPr>
-        <w:t xml:space="preserve">, which the user picks from. This is because a member of staff should not be able to type in a film or a screen that is not really there, and choosing from a list makes that impossible. The date is entered using a date picker named </w:t>
-      </w:r>
-      <w:proofErr w:type="spellStart"/>
-      <w:r>
-        <w:rPr>
-          <w:rFonts w:ascii="Aptos" w:eastAsia="Aptos" w:hAnsi="Aptos" w:cs="Aptos"/>
-        </w:rPr>
-        <w:t>dtpScreeningDate</w:t>
-      </w:r>
-      <w:proofErr w:type="spellEnd"/>
-      <w:r>
-        <w:rPr>
-          <w:rFonts w:ascii="Aptos" w:eastAsia="Aptos" w:hAnsi="Aptos" w:cs="Aptos"/>
-        </w:rPr>
-        <w:t xml:space="preserve"> rather than a text box, this is because a proper date picker stops the user entering something that is not a real date. The time and the ticket price are entered into text boxes named </w:t>
-      </w:r>
-      <w:proofErr w:type="spellStart"/>
-      <w:r>
-        <w:rPr>
-          <w:rFonts w:ascii="Aptos" w:eastAsia="Aptos" w:hAnsi="Aptos" w:cs="Aptos"/>
-        </w:rPr>
-        <w:t>txtScreeningTime</w:t>
-      </w:r>
-      <w:proofErr w:type="spellEnd"/>
-      <w:r>
-        <w:rPr>
-          <w:rFonts w:ascii="Aptos" w:eastAsia="Aptos" w:hAnsi="Aptos" w:cs="Aptos"/>
-        </w:rPr>
-        <w:t xml:space="preserve">, which is labelled Time in the format HH colon MM, and </w:t>
-      </w:r>
-      <w:proofErr w:type="spellStart"/>
-      <w:r>
-        <w:rPr>
-          <w:rFonts w:ascii="Aptos" w:eastAsia="Aptos" w:hAnsi="Aptos" w:cs="Aptos"/>
-        </w:rPr>
-        <w:t>txtTicketPrice</w:t>
-      </w:r>
-      <w:proofErr w:type="spellEnd"/>
-      <w:r>
-        <w:rPr>
-          <w:rFonts w:ascii="Aptos" w:eastAsia="Aptos" w:hAnsi="Aptos" w:cs="Aptos"/>
-        </w:rPr>
-        <w:t>.</w:t>
+        <w:t>The difference is in the inputs. A screening has to be tied to a film that already exists and a screen that already exists, so instead of free text boxes for those two the form uses two combo boxes, named cboFilm and cboScreen, which the user picks from. This is because a member of staff should not be able to type in a film or a screen that is not really there, and choosing from a list makes that impossible. The date is entered using a date picker named dtpScreeningDate rather than a text box, this is because a proper date picker stops the user entering something that is not a real date. The time and the ticket price are entered into text boxes named txtScreeningTime, which is labelled Time in the format HH colon MM, and txtTicketPrice.</w:t>
       </w:r>
     </w:p>
     <w:p>
@@ -941,56 +341,18 @@
           <w:sz w:val="22"/>
           <w:szCs w:val="22"/>
         </w:rPr>
-        <w:t>Add Screenings Form (</w:t>
-      </w:r>
-      <w:proofErr w:type="spellStart"/>
+        <w:t>Add Screenings Form (frmScreenings)</w:t>
+      </w:r>
+    </w:p>
+    <w:p>
+      <w:pPr>
+        <w:spacing w:after="160" w:line="276" w:lineRule="auto"/>
+      </w:pPr>
       <w:r>
         <w:rPr>
           <w:rFonts w:ascii="Aptos" w:eastAsia="Aptos" w:hAnsi="Aptos" w:cs="Aptos"/>
-          <w:b/>
-          <w:bCs/>
-          <w:color w:val="A02B93"/>
-          <w:sz w:val="22"/>
-          <w:szCs w:val="22"/>
-        </w:rPr>
-        <w:t>frmScreenings</w:t>
-      </w:r>
-      <w:proofErr w:type="spellEnd"/>
-      <w:r>
-        <w:rPr>
-          <w:rFonts w:ascii="Aptos" w:eastAsia="Aptos" w:hAnsi="Aptos" w:cs="Aptos"/>
-          <w:b/>
-          <w:bCs/>
-          <w:color w:val="A02B93"/>
-          <w:sz w:val="22"/>
-          <w:szCs w:val="22"/>
-        </w:rPr>
-        <w:t>)</w:t>
-      </w:r>
-    </w:p>
-    <w:p>
-      <w:pPr>
-        <w:spacing w:after="160" w:line="276" w:lineRule="auto"/>
-      </w:pPr>
-      <w:r>
-        <w:rPr>
-          <w:rFonts w:ascii="Aptos" w:eastAsia="Aptos" w:hAnsi="Aptos" w:cs="Aptos"/>
-        </w:rPr>
-        <w:t xml:space="preserve">The inputs are therefore the chosen film, the chosen screen, the date, the time and the ticket price. The output is the updated list of screenings in the grid, along with the usual confirmation or warning message boxes. The processes behind the buttons are the same insert, update and delete operations as before, this time acting on the </w:t>
-      </w:r>
-      <w:proofErr w:type="spellStart"/>
-      <w:r>
-        <w:rPr>
-          <w:rFonts w:ascii="Aptos" w:eastAsia="Aptos" w:hAnsi="Aptos" w:cs="Aptos"/>
-        </w:rPr>
-        <w:t>tblScreening</w:t>
-      </w:r>
-      <w:proofErr w:type="spellEnd"/>
-      <w:r>
-        <w:rPr>
-          <w:rFonts w:ascii="Aptos" w:eastAsia="Aptos" w:hAnsi="Aptos" w:cs="Aptos"/>
-        </w:rPr>
-        <w:t xml:space="preserve"> table.</w:t>
+        </w:rPr>
+        <w:t>The inputs are therefore the chosen film, the chosen screen, the date, the time and the ticket price. The output is the updated list of screenings in the grid, along with the usual confirmation or warning message boxes. The processes behind the buttons are the same insert, update and delete operations as before, this time acting on the tblScreening table.</w:t>
       </w:r>
     </w:p>
     <w:p>
@@ -1016,63 +378,7 @@
         <w:rPr>
           <w:rFonts w:ascii="Aptos" w:eastAsia="Aptos" w:hAnsi="Aptos" w:cs="Aptos"/>
         </w:rPr>
-        <w:t xml:space="preserve">Before a screening can be booked the cinema needs its physical screens set up in the system, each with the right number of seats. This objective is handled by the form named </w:t>
-      </w:r>
-      <w:proofErr w:type="spellStart"/>
-      <w:r>
-        <w:rPr>
-          <w:rFonts w:ascii="Aptos" w:eastAsia="Aptos" w:hAnsi="Aptos" w:cs="Aptos"/>
-        </w:rPr>
-        <w:t>frmScreens</w:t>
-      </w:r>
-      <w:proofErr w:type="spellEnd"/>
-      <w:r>
-        <w:rPr>
-          <w:rFonts w:ascii="Aptos" w:eastAsia="Aptos" w:hAnsi="Aptos" w:cs="Aptos"/>
-        </w:rPr>
-        <w:t xml:space="preserve">, which once again uses the same familiar management layout with a data grid view named </w:t>
-      </w:r>
-      <w:proofErr w:type="spellStart"/>
-      <w:r>
-        <w:rPr>
-          <w:rFonts w:ascii="Aptos" w:eastAsia="Aptos" w:hAnsi="Aptos" w:cs="Aptos"/>
-        </w:rPr>
-        <w:t>dgvScreens</w:t>
-      </w:r>
-      <w:proofErr w:type="spellEnd"/>
-      <w:r>
-        <w:rPr>
-          <w:rFonts w:ascii="Aptos" w:eastAsia="Aptos" w:hAnsi="Aptos" w:cs="Aptos"/>
-        </w:rPr>
-        <w:t xml:space="preserve"> listing the existing screens and a small set of inputs with Add, Update, Delete and Clear buttons, so I will refer back to the Add Films form for that general behaviour. There are only two inputs here, a text box named </w:t>
-      </w:r>
-      <w:proofErr w:type="spellStart"/>
-      <w:r>
-        <w:rPr>
-          <w:rFonts w:ascii="Aptos" w:eastAsia="Aptos" w:hAnsi="Aptos" w:cs="Aptos"/>
-        </w:rPr>
-        <w:t>txtName</w:t>
-      </w:r>
-      <w:proofErr w:type="spellEnd"/>
-      <w:r>
-        <w:rPr>
-          <w:rFonts w:ascii="Aptos" w:eastAsia="Aptos" w:hAnsi="Aptos" w:cs="Aptos"/>
-        </w:rPr>
-        <w:t xml:space="preserve"> for the name of the screen and a text box named </w:t>
-      </w:r>
-      <w:proofErr w:type="spellStart"/>
-      <w:r>
-        <w:rPr>
-          <w:rFonts w:ascii="Aptos" w:eastAsia="Aptos" w:hAnsi="Aptos" w:cs="Aptos"/>
-        </w:rPr>
-        <w:t>txtCapacity</w:t>
-      </w:r>
-      <w:proofErr w:type="spellEnd"/>
-      <w:r>
-        <w:rPr>
-          <w:rFonts w:ascii="Aptos" w:eastAsia="Aptos" w:hAnsi="Aptos" w:cs="Aptos"/>
-        </w:rPr>
-        <w:t xml:space="preserve"> for how many seats it has.</w:t>
+        <w:t>Before a screening can be booked the cinema needs its physical screens set up in the system, each with the right number of seats. This objective is handled by the form named frmScreens, which once again uses the same familiar management layout with a data grid view named dgvScreens listing the existing screens and a small set of inputs with Add, Update, Delete and Clear buttons, so I will refer back to the Add Films form for that general behaviour. There are only two inputs here, a text box named txtName for the name of the screen and a text box named txtCapacity for how many seats it has.</w:t>
       </w:r>
     </w:p>
     <w:p>
@@ -1107,84 +413,18 @@
           <w:sz w:val="22"/>
           <w:szCs w:val="22"/>
         </w:rPr>
-        <w:t>Add Screens Form (</w:t>
-      </w:r>
-      <w:proofErr w:type="spellStart"/>
+        <w:t>Add Screens Form (frmScreens)</w:t>
+      </w:r>
+    </w:p>
+    <w:p>
+      <w:pPr>
+        <w:spacing w:after="160" w:line="276" w:lineRule="auto"/>
+      </w:pPr>
       <w:r>
         <w:rPr>
           <w:rFonts w:ascii="Aptos" w:eastAsia="Aptos" w:hAnsi="Aptos" w:cs="Aptos"/>
-          <w:b/>
-          <w:bCs/>
-          <w:color w:val="A02B93"/>
-          <w:sz w:val="22"/>
-          <w:szCs w:val="22"/>
-        </w:rPr>
-        <w:t>frmScreens</w:t>
-      </w:r>
-      <w:proofErr w:type="spellEnd"/>
-      <w:r>
-        <w:rPr>
-          <w:rFonts w:ascii="Aptos" w:eastAsia="Aptos" w:hAnsi="Aptos" w:cs="Aptos"/>
-          <w:b/>
-          <w:bCs/>
-          <w:color w:val="A02B93"/>
-          <w:sz w:val="22"/>
-          <w:szCs w:val="22"/>
-        </w:rPr>
-        <w:t>)</w:t>
-      </w:r>
-    </w:p>
-    <w:p>
-      <w:pPr>
-        <w:spacing w:after="160" w:line="276" w:lineRule="auto"/>
-      </w:pPr>
-      <w:r>
-        <w:rPr>
-          <w:rFonts w:ascii="Aptos" w:eastAsia="Aptos" w:hAnsi="Aptos" w:cs="Aptos"/>
-        </w:rPr>
-        <w:t xml:space="preserve">The inputs are the screen name and the capacity. The outputs are the updated list of screens and, crucially, a full set of seat records created in the </w:t>
-      </w:r>
-      <w:proofErr w:type="spellStart"/>
-      <w:r>
-        <w:rPr>
-          <w:rFonts w:ascii="Aptos" w:eastAsia="Aptos" w:hAnsi="Aptos" w:cs="Aptos"/>
-        </w:rPr>
-        <w:t>tblSeat</w:t>
-      </w:r>
-      <w:proofErr w:type="spellEnd"/>
-      <w:r>
-        <w:rPr>
-          <w:rFonts w:ascii="Aptos" w:eastAsia="Aptos" w:hAnsi="Aptos" w:cs="Aptos"/>
-        </w:rPr>
-        <w:t xml:space="preserve"> table for the new screen. The process behind the Add button is therefore two steps, first inserting the screen into the </w:t>
-      </w:r>
-      <w:proofErr w:type="spellStart"/>
-      <w:r>
-        <w:rPr>
-          <w:rFonts w:ascii="Aptos" w:eastAsia="Aptos" w:hAnsi="Aptos" w:cs="Aptos"/>
-        </w:rPr>
-        <w:t>tblScreen</w:t>
-      </w:r>
-      <w:proofErr w:type="spellEnd"/>
-      <w:r>
-        <w:rPr>
-          <w:rFonts w:ascii="Aptos" w:eastAsia="Aptos" w:hAnsi="Aptos" w:cs="Aptos"/>
-        </w:rPr>
-        <w:t xml:space="preserve"> table and reading back the new screen's identifier, and then looping to insert one seat record per seat into the </w:t>
-      </w:r>
-      <w:proofErr w:type="spellStart"/>
-      <w:r>
-        <w:rPr>
-          <w:rFonts w:ascii="Aptos" w:eastAsia="Aptos" w:hAnsi="Aptos" w:cs="Aptos"/>
-        </w:rPr>
-        <w:t>tblSeat</w:t>
-      </w:r>
-      <w:proofErr w:type="spellEnd"/>
-      <w:r>
-        <w:rPr>
-          <w:rFonts w:ascii="Aptos" w:eastAsia="Aptos" w:hAnsi="Aptos" w:cs="Aptos"/>
-        </w:rPr>
-        <w:t xml:space="preserve"> table so that the seats are ready for the booking form to use.</w:t>
+        </w:rPr>
+        <w:t>The inputs are the screen name and the capacity. The outputs are the updated list of screens and, crucially, a full set of seat records created in the tblSeat table for the new screen. The process behind the Add button is therefore two steps, first inserting the screen into the tblScreen table and reading back the new screen's identifier, and then looping to insert one seat record per seat into the tblSeat table so that the seats are ready for the booking form to use.</w:t>
       </w:r>
     </w:p>
     <w:p>
@@ -1210,179 +450,25 @@
         <w:rPr>
           <w:rFonts w:ascii="Aptos" w:eastAsia="Aptos" w:hAnsi="Aptos" w:cs="Aptos"/>
         </w:rPr>
-        <w:t xml:space="preserve">This is the heart of the whole system and the reason the project exists in the first place, so it is the most involved form to design. The objective is to let a member of staff create a booking for a customer against a particular screening, recording who the customer is, which seats they want and how many tickets that comes to, while making it impossible for a seat that has already been booked to be sold twice. Both of these objectives are handled together on the one form named </w:t>
-      </w:r>
-      <w:proofErr w:type="spellStart"/>
+        <w:t>This is the heart of the whole system and the reason the project exists in the first place, so it is the most involved form to design. The objective is to let a member of staff create a booking for a customer against a particular screening, recording who the customer is, which seats they want and how many tickets that comes to, while making it impossible for a seat that has already been booked to be sold twice. Both of these objectives are handled together on the one form named frmBookings, because in practice they are the same job.</w:t>
+      </w:r>
+    </w:p>
+    <w:p>
+      <w:pPr>
+        <w:spacing w:after="160" w:line="276" w:lineRule="auto"/>
+      </w:pPr>
       <w:r>
         <w:rPr>
           <w:rFonts w:ascii="Aptos" w:eastAsia="Aptos" w:hAnsi="Aptos" w:cs="Aptos"/>
         </w:rPr>
-        <w:t>frmBookings</w:t>
-      </w:r>
-      <w:proofErr w:type="spellEnd"/>
+        <w:t xml:space="preserve">The top of the form has two combo boxes, named cboScreening and cboCustomer, where the member of staff first picks which screening the booking is for and then which customer it belongs to. There is also a check box named chkWalkIn labelled Walk-in, which lets staff take a booking for a customer who has just walked in without recording their details. The largest part of the form is a panel named pnlSeatMap which draws the seat map for the chosen screening, and next to it is a small legend made up of three coloured swatches labelled Available, Selected and Taken so the user knows what the colours mean. A label named lblTotal keeps a running count of how many seats have been selected, and along </w:t>
+      </w:r>
       <w:r>
         <w:rPr>
           <w:rFonts w:ascii="Aptos" w:eastAsia="Aptos" w:hAnsi="Aptos" w:cs="Aptos"/>
         </w:rPr>
-        <w:t>, because in practice they are the same job.</w:t>
-      </w:r>
-    </w:p>
-    <w:p>
-      <w:pPr>
-        <w:spacing w:after="160" w:line="276" w:lineRule="auto"/>
-      </w:pPr>
-      <w:r>
-        <w:rPr>
-          <w:rFonts w:ascii="Aptos" w:eastAsia="Aptos" w:hAnsi="Aptos" w:cs="Aptos"/>
-        </w:rPr>
-        <w:t xml:space="preserve">The top of the form has two combo boxes, named </w:t>
-      </w:r>
-      <w:proofErr w:type="spellStart"/>
-      <w:r>
-        <w:rPr>
-          <w:rFonts w:ascii="Aptos" w:eastAsia="Aptos" w:hAnsi="Aptos" w:cs="Aptos"/>
-        </w:rPr>
-        <w:t>cboScreening</w:t>
-      </w:r>
-      <w:proofErr w:type="spellEnd"/>
-      <w:r>
-        <w:rPr>
-          <w:rFonts w:ascii="Aptos" w:eastAsia="Aptos" w:hAnsi="Aptos" w:cs="Aptos"/>
-        </w:rPr>
-        <w:t xml:space="preserve"> and </w:t>
-      </w:r>
-      <w:proofErr w:type="spellStart"/>
-      <w:r>
-        <w:rPr>
-          <w:rFonts w:ascii="Aptos" w:eastAsia="Aptos" w:hAnsi="Aptos" w:cs="Aptos"/>
-        </w:rPr>
-        <w:t>cboCustomer</w:t>
-      </w:r>
-      <w:proofErr w:type="spellEnd"/>
-      <w:r>
-        <w:rPr>
-          <w:rFonts w:ascii="Aptos" w:eastAsia="Aptos" w:hAnsi="Aptos" w:cs="Aptos"/>
-        </w:rPr>
-        <w:t xml:space="preserve">, where the member of staff first picks which screening the booking is for and then which customer it belongs to. There is also a check box named </w:t>
-      </w:r>
-      <w:proofErr w:type="spellStart"/>
-      <w:r>
-        <w:rPr>
-          <w:rFonts w:ascii="Aptos" w:eastAsia="Aptos" w:hAnsi="Aptos" w:cs="Aptos"/>
-        </w:rPr>
-        <w:t>chkWalkIn</w:t>
-      </w:r>
-      <w:proofErr w:type="spellEnd"/>
-      <w:r>
-        <w:rPr>
-          <w:rFonts w:ascii="Aptos" w:eastAsia="Aptos" w:hAnsi="Aptos" w:cs="Aptos"/>
-        </w:rPr>
-        <w:t xml:space="preserve"> labelled Walk-in, which lets staff take a booking for a customer who has just walked in without recording their details. The largest part of the form is a panel named </w:t>
-      </w:r>
-      <w:proofErr w:type="spellStart"/>
-      <w:r>
-        <w:rPr>
-          <w:rFonts w:ascii="Aptos" w:eastAsia="Aptos" w:hAnsi="Aptos" w:cs="Aptos"/>
-        </w:rPr>
-        <w:t>pnlSeatMap</w:t>
-      </w:r>
-      <w:proofErr w:type="spellEnd"/>
-      <w:r>
-        <w:rPr>
-          <w:rFonts w:ascii="Aptos" w:eastAsia="Aptos" w:hAnsi="Aptos" w:cs="Aptos"/>
-        </w:rPr>
-        <w:t xml:space="preserve"> which draws the seat map for the chosen screening, and next to it is a small legend made up of three coloured swatches labelled Available, Selected and Taken so the user knows what the colours mean. A label named </w:t>
-      </w:r>
-      <w:proofErr w:type="spellStart"/>
-      <w:r>
-        <w:rPr>
-          <w:rFonts w:ascii="Aptos" w:eastAsia="Aptos" w:hAnsi="Aptos" w:cs="Aptos"/>
-        </w:rPr>
-        <w:t>lblTotal</w:t>
-      </w:r>
-      <w:proofErr w:type="spellEnd"/>
-      <w:r>
-        <w:rPr>
-          <w:rFonts w:ascii="Aptos" w:eastAsia="Aptos" w:hAnsi="Aptos" w:cs="Aptos"/>
-        </w:rPr>
-        <w:t xml:space="preserve"> keeps a running count of how many seats have been selected, and along </w:t>
-      </w:r>
-      <w:r>
-        <w:rPr>
-          <w:rFonts w:ascii="Aptos" w:eastAsia="Aptos" w:hAnsi="Aptos" w:cs="Aptos"/>
-        </w:rPr>
         <w:lastRenderedPageBreak/>
-        <w:t xml:space="preserve">the bottom are the action buttons, Create Booking named </w:t>
-      </w:r>
-      <w:proofErr w:type="spellStart"/>
-      <w:r>
-        <w:rPr>
-          <w:rFonts w:ascii="Aptos" w:eastAsia="Aptos" w:hAnsi="Aptos" w:cs="Aptos"/>
-        </w:rPr>
-        <w:t>btnCreateBooking</w:t>
-      </w:r>
-      <w:proofErr w:type="spellEnd"/>
-      <w:r>
-        <w:rPr>
-          <w:rFonts w:ascii="Aptos" w:eastAsia="Aptos" w:hAnsi="Aptos" w:cs="Aptos"/>
-        </w:rPr>
-        <w:t xml:space="preserve">, Clear Selection named </w:t>
-      </w:r>
-      <w:proofErr w:type="spellStart"/>
-      <w:r>
-        <w:rPr>
-          <w:rFonts w:ascii="Aptos" w:eastAsia="Aptos" w:hAnsi="Aptos" w:cs="Aptos"/>
-        </w:rPr>
-        <w:t>btnClear</w:t>
-      </w:r>
-      <w:proofErr w:type="spellEnd"/>
-      <w:r>
-        <w:rPr>
-          <w:rFonts w:ascii="Aptos" w:eastAsia="Aptos" w:hAnsi="Aptos" w:cs="Aptos"/>
-        </w:rPr>
-        <w:t xml:space="preserve">, Order Food named </w:t>
-      </w:r>
-      <w:proofErr w:type="spellStart"/>
-      <w:r>
-        <w:rPr>
-          <w:rFonts w:ascii="Aptos" w:eastAsia="Aptos" w:hAnsi="Aptos" w:cs="Aptos"/>
-        </w:rPr>
-        <w:t>btnOrderFood</w:t>
-      </w:r>
-      <w:proofErr w:type="spellEnd"/>
-      <w:r>
-        <w:rPr>
-          <w:rFonts w:ascii="Aptos" w:eastAsia="Aptos" w:hAnsi="Aptos" w:cs="Aptos"/>
-        </w:rPr>
-        <w:t xml:space="preserve"> and Sell Food Only named </w:t>
-      </w:r>
-      <w:proofErr w:type="spellStart"/>
-      <w:r>
-        <w:rPr>
-          <w:rFonts w:ascii="Aptos" w:eastAsia="Aptos" w:hAnsi="Aptos" w:cs="Aptos"/>
-        </w:rPr>
-        <w:t>btnFoodOnly</w:t>
-      </w:r>
-      <w:proofErr w:type="spellEnd"/>
-      <w:r>
-        <w:rPr>
-          <w:rFonts w:ascii="Aptos" w:eastAsia="Aptos" w:hAnsi="Aptos" w:cs="Aptos"/>
-        </w:rPr>
-        <w:t xml:space="preserve">. A grid named </w:t>
-      </w:r>
-      <w:proofErr w:type="spellStart"/>
-      <w:r>
-        <w:rPr>
-          <w:rFonts w:ascii="Aptos" w:eastAsia="Aptos" w:hAnsi="Aptos" w:cs="Aptos"/>
-        </w:rPr>
-        <w:t>dgvCustomerBookings</w:t>
-      </w:r>
-      <w:proofErr w:type="spellEnd"/>
-      <w:r>
-        <w:rPr>
-          <w:rFonts w:ascii="Aptos" w:eastAsia="Aptos" w:hAnsi="Aptos" w:cs="Aptos"/>
-        </w:rPr>
-        <w:t xml:space="preserve"> shows the bookings the selected customer already has.</w:t>
+        <w:t>the bottom are the action buttons, Create Booking named btnCreateBooking, Clear Selection named btnClear, Order Food named btnOrderFood and Sell Food Only named btnFoodOnly. A grid named dgvCustomerBookings shows the bookings the selected customer already has.</w:t>
       </w:r>
     </w:p>
     <w:p>
@@ -1405,9 +491,117 @@
           <w:sz w:val="22"/>
           <w:szCs w:val="22"/>
         </w:rPr>
-        <w:t>Bookings Form (</w:t>
-      </w:r>
-      <w:proofErr w:type="spellStart"/>
+        <w:t>Bookings Form (frmBookings)</w:t>
+      </w:r>
+    </w:p>
+    <w:p>
+      <w:pPr>
+        <w:spacing w:after="160" w:line="276" w:lineRule="auto"/>
+      </w:pPr>
+      <w:r>
+        <w:rPr>
+          <w:rFonts w:ascii="Aptos" w:eastAsia="Aptos" w:hAnsi="Aptos" w:cs="Aptos"/>
+        </w:rPr>
+        <w:t>The way the member of staff uses the form is that they choose a screening, choose a customer or tick the walk-in box, and the seat map then draws itself as a grid of clickable seat buttons laid out like the inside of the screen. Clicking an available seat selects it and it changes colour, and the running total updates as they go. When they are happy they press Create Booking. The inputs to the form are therefore the chosen screening, the chosen customer and the seats that are clicked. The outputs are the saved booking, a confirmation message, the refreshed seat map and the updated list of that customer's bookings. The processes behind the scenes are the insertion of a new record into the tblBooking table and the insertion of each chosen seat into the tblBookingSeat table.</w:t>
+      </w:r>
+    </w:p>
+    <w:p>
+      <w:pPr>
+        <w:spacing w:after="160" w:line="276" w:lineRule="auto"/>
+      </w:pPr>
+      <w:r>
+        <w:rPr>
+          <w:rFonts w:ascii="Aptos" w:eastAsia="Aptos" w:hAnsi="Aptos" w:cs="Aptos"/>
+        </w:rPr>
+        <w:t>Preventing double bookings, which is the whole point of Objective 2, is built directly into how the seat map is drawn. This is because when the map loads it asks the database which seats have already been booked for that screening, by looking in the tblBookingSeat table joined to the tblBooking table, and any seat that comes back as already taken is coloured with the Taken colour and, more importantly, is disabled so that it physically cannot be clicked. On top of that, as a second line of defence, when Create Booking is pressed the system checks once more that none of the selected seats have been taken by someone else in the meantime before it saves anything. In this way a seat can never be sold twice, both because a taken seat cannot be selected in the first place and because it is checked again at the moment of saving. I chose a clickable graphical seat map rather than, for example, asking staff to type in seat numbers, this is because it lets them see the whole screen at a glance and makes double booking obvious and impossible in a way that a list of numbers never could.</w:t>
+      </w:r>
+    </w:p>
+    <w:p>
+      <w:pPr>
+        <w:pStyle w:val="Heading3"/>
+        <w:spacing w:before="260" w:after="120"/>
+      </w:pPr>
+      <w:r>
+        <w:rPr>
+          <w:rFonts w:ascii="Aptos Display" w:eastAsia="Aptos Display" w:hAnsi="Aptos Display" w:cs="Aptos Display"/>
+          <w:b/>
+          <w:bCs/>
+          <w:color w:val="000000"/>
+        </w:rPr>
+        <w:t>Displaying the Graphical Seat Map (Objective 3)</w:t>
+      </w:r>
+    </w:p>
+    <w:p>
+      <w:pPr>
+        <w:spacing w:after="160" w:line="276" w:lineRule="auto"/>
+      </w:pPr>
+      <w:r>
+        <w:rPr>
+          <w:rFonts w:ascii="Aptos" w:eastAsia="Aptos" w:hAnsi="Aptos" w:cs="Aptos"/>
+        </w:rPr>
+        <w:t>This objective is really a closer look at the seat map that has just been described on the booking form, so rather than design a separate screen for it I will refer back to the frmBookings form above. The seat map is the panel named pnlSeatMap, and its job is to show, for a chosen screening, exactly which seats are free and which are already booked. It does this by drawing one button for every seat in the chosen screen, arranged in rows so that it looks like the layout of a real cinema, with a label above reading SCREEN so the user can tell which way round they are looking.</w:t>
+      </w:r>
+    </w:p>
+    <w:p>
+      <w:pPr>
+        <w:spacing w:after="160" w:line="276" w:lineRule="auto"/>
+      </w:pPr>
+      <w:r>
+        <w:rPr>
+          <w:rFonts w:ascii="Aptos" w:eastAsia="Aptos" w:hAnsi="Aptos" w:cs="Aptos"/>
+        </w:rPr>
+        <w:lastRenderedPageBreak/>
+        <w:t>Every seat button is shown in one of three colours, and this is the output the user cares about. An available seat is shown in the Available colour and can be clicked, a seat the user has just clicked is shown in the Selected colour, and a seat that has already been booked by someone else is shown in the Taken colour and cannot be clicked at all. The small legend of coloured swatches next to the map explains which colour means what. The only input to the seat map is the clicks the user makes on the available seats, and behind the scenes the colours are worked out by comparing the full list of seats for the screen against the list of seats already booked for that screening. I have kept the fine detail of the exact colours to be settled in section 5.2, but the important design decision here is the three state system of available, selected and taken, because it is what makes the availability instantly readable.</w:t>
+      </w:r>
+    </w:p>
+    <w:p>
+      <w:pPr>
+        <w:pStyle w:val="Heading3"/>
+        <w:spacing w:before="260" w:after="120"/>
+      </w:pPr>
+      <w:r>
+        <w:rPr>
+          <w:rFonts w:ascii="Aptos Display" w:eastAsia="Aptos Display" w:hAnsi="Aptos Display" w:cs="Aptos Display"/>
+          <w:b/>
+          <w:bCs/>
+          <w:color w:val="000000"/>
+        </w:rPr>
+        <w:t>Adding Food and Drink to an Order (Objective 5)</w:t>
+      </w:r>
+    </w:p>
+    <w:p>
+      <w:pPr>
+        <w:spacing w:after="160" w:line="276" w:lineRule="auto"/>
+      </w:pPr>
+      <w:r>
+        <w:rPr>
+          <w:rFonts w:ascii="Aptos" w:eastAsia="Aptos" w:hAnsi="Aptos" w:cs="Aptos"/>
+        </w:rPr>
+        <w:t>One of the main aims of Filmtopia was that a customer should be able to add food and drink onto their ticket booking in the same visit, so that it feels like one joined-up transaction rather than two separate ones. This objective is handled by the form named frmFoodOrder, which is opened straight from the booking form by pressing the Order Food button once a booking has been made, or by pressing Sell Food Only if the customer only wants snacks and no seat. Opening it directly from the booking is a deliberate design choice, this is because it keeps the whole thing as a single flowing process for the member of staff.</w:t>
+      </w:r>
+    </w:p>
+    <w:p>
+      <w:pPr>
+        <w:spacing w:after="160" w:line="276" w:lineRule="auto"/>
+      </w:pPr>
+      <w:r>
+        <w:rPr>
+          <w:rFonts w:ascii="Aptos" w:eastAsia="Aptos" w:hAnsi="Aptos" w:cs="Aptos"/>
+        </w:rPr>
+        <w:t>At the top of the form a label named lblBookingInfo shows which booking the food is being added to, so there is no confusion about whose order it is. Below that is a combo box named cboFoodItem where the user picks a food or drink item from the list the cinema sells, a label named lblPrice which shows the price of the chosen item, and a text box named txtQuantity for how many they want, which sensibly defaults to one. A grid named dgvOrderItems builds up the list of items that have been added to the order, and a label named lblTotal keeps a running total of the cost. The buttons are Add To Order named btnAddItem, Remove Selected named btnRemoveItem, and Close named btnClose.</w:t>
+      </w:r>
+    </w:p>
+    <w:p>
+      <w:pPr>
+        <w:pBdr>
+          <w:top w:val="single" w:sz="6" w:space="6" w:color="A02B93"/>
+          <w:left w:val="single" w:sz="6" w:space="6" w:color="A02B93"/>
+          <w:bottom w:val="single" w:sz="6" w:space="6" w:color="A02B93"/>
+          <w:right w:val="single" w:sz="6" w:space="6" w:color="A02B93"/>
+        </w:pBdr>
+        <w:shd w:val="clear" w:color="auto" w:fill="F7E9F3"/>
+        <w:spacing w:before="120" w:after="200"/>
+      </w:pPr>
       <w:r>
         <w:rPr>
           <w:rFonts w:ascii="Aptos" w:eastAsia="Aptos" w:hAnsi="Aptos" w:cs="Aptos"/>
@@ -1417,163 +611,25 @@
           <w:sz w:val="22"/>
           <w:szCs w:val="22"/>
         </w:rPr>
-        <w:t>frmBookings</w:t>
-      </w:r>
-      <w:proofErr w:type="spellEnd"/>
+        <w:t>Food Order Form (frmFoodOrder)</w:t>
+      </w:r>
+    </w:p>
+    <w:p>
+      <w:pPr>
+        <w:spacing w:after="160" w:line="276" w:lineRule="auto"/>
+      </w:pPr>
       <w:r>
         <w:rPr>
           <w:rFonts w:ascii="Aptos" w:eastAsia="Aptos" w:hAnsi="Aptos" w:cs="Aptos"/>
-          <w:b/>
-          <w:bCs/>
-          <w:color w:val="A02B93"/>
-          <w:sz w:val="22"/>
-          <w:szCs w:val="22"/>
-        </w:rPr>
-        <w:t>)</w:t>
-      </w:r>
-    </w:p>
-    <w:p>
-      <w:pPr>
-        <w:spacing w:after="160" w:line="276" w:lineRule="auto"/>
-      </w:pPr>
+        </w:rPr>
+        <w:t xml:space="preserve">The inputs to this form are the food item chosen and the quantity. The outputs are the growing list of items in the grid, the updated running total, and the items being saved against the booking. The process behind the Add To Order button is to insert the chosen item and quantity into the tblOrderItem table linked to the booking, and then to recalculate and display the new total. I chose a combo box for the items rather than a text box because the food menu is a fixed list, so picking from it is both faster and stops the user entering </w:t>
+      </w:r>
       <w:r>
         <w:rPr>
           <w:rFonts w:ascii="Aptos" w:eastAsia="Aptos" w:hAnsi="Aptos" w:cs="Aptos"/>
         </w:rPr>
-        <w:t xml:space="preserve">The way the member of staff uses the form is that they choose a screening, choose a customer or tick the walk-in box, and the seat map then draws itself as a grid of clickable seat buttons laid out like the inside of the screen. Clicking an available seat selects it and it changes colour, and the running total updates as they go. When they are happy they press Create Booking. The inputs to the form are therefore the chosen screening, the chosen customer and the seats that are clicked. The outputs are the saved booking, a confirmation message, the refreshed seat map and the updated list of that customer's bookings. The processes behind the scenes are the insertion of a new record into the </w:t>
-      </w:r>
-      <w:proofErr w:type="spellStart"/>
-      <w:r>
-        <w:rPr>
-          <w:rFonts w:ascii="Aptos" w:eastAsia="Aptos" w:hAnsi="Aptos" w:cs="Aptos"/>
-        </w:rPr>
-        <w:t>tblBooking</w:t>
-      </w:r>
-      <w:proofErr w:type="spellEnd"/>
-      <w:r>
-        <w:rPr>
-          <w:rFonts w:ascii="Aptos" w:eastAsia="Aptos" w:hAnsi="Aptos" w:cs="Aptos"/>
-        </w:rPr>
-        <w:t xml:space="preserve"> table and the insertion of each chosen seat into the </w:t>
-      </w:r>
-      <w:proofErr w:type="spellStart"/>
-      <w:r>
-        <w:rPr>
-          <w:rFonts w:ascii="Aptos" w:eastAsia="Aptos" w:hAnsi="Aptos" w:cs="Aptos"/>
-        </w:rPr>
-        <w:t>tblBookingSeat</w:t>
-      </w:r>
-      <w:proofErr w:type="spellEnd"/>
-      <w:r>
-        <w:rPr>
-          <w:rFonts w:ascii="Aptos" w:eastAsia="Aptos" w:hAnsi="Aptos" w:cs="Aptos"/>
-        </w:rPr>
-        <w:t xml:space="preserve"> table.</w:t>
-      </w:r>
-    </w:p>
-    <w:p>
-      <w:pPr>
-        <w:spacing w:after="160" w:line="276" w:lineRule="auto"/>
-      </w:pPr>
-      <w:r>
-        <w:rPr>
-          <w:rFonts w:ascii="Aptos" w:eastAsia="Aptos" w:hAnsi="Aptos" w:cs="Aptos"/>
-        </w:rPr>
-        <w:t xml:space="preserve">Preventing double bookings, which is the whole point of Objective 2, is built directly into how the seat map is drawn. This is because when the map loads it asks the database which seats have already been booked for that screening, by looking in the </w:t>
-      </w:r>
-      <w:proofErr w:type="spellStart"/>
-      <w:r>
-        <w:rPr>
-          <w:rFonts w:ascii="Aptos" w:eastAsia="Aptos" w:hAnsi="Aptos" w:cs="Aptos"/>
-        </w:rPr>
-        <w:t>tblBookingSeat</w:t>
-      </w:r>
-      <w:proofErr w:type="spellEnd"/>
-      <w:r>
-        <w:rPr>
-          <w:rFonts w:ascii="Aptos" w:eastAsia="Aptos" w:hAnsi="Aptos" w:cs="Aptos"/>
-        </w:rPr>
-        <w:t xml:space="preserve"> table joined to the </w:t>
-      </w:r>
-      <w:proofErr w:type="spellStart"/>
-      <w:r>
-        <w:rPr>
-          <w:rFonts w:ascii="Aptos" w:eastAsia="Aptos" w:hAnsi="Aptos" w:cs="Aptos"/>
-        </w:rPr>
-        <w:t>tblBooking</w:t>
-      </w:r>
-      <w:proofErr w:type="spellEnd"/>
-      <w:r>
-        <w:rPr>
-          <w:rFonts w:ascii="Aptos" w:eastAsia="Aptos" w:hAnsi="Aptos" w:cs="Aptos"/>
-        </w:rPr>
-        <w:t xml:space="preserve"> table, and any seat that comes back as already taken is coloured with the Taken colour and, more importantly, is disabled so that it physically cannot be clicked. On top of that, as a second line of defence, when Create Booking is pressed the system checks once more that none of the selected seats have been taken by someone else in the meantime before it saves anything. In this way a seat can never be sold twice, both because a taken seat cannot be selected in the first place and because it is checked again at the moment of saving. I chose a clickable graphical seat map rather than, for example, asking staff to type in seat numbers, this is because it lets them see the whole screen at a glance and makes double booking obvious and impossible in a way that a list of numbers never could.</w:t>
-      </w:r>
-    </w:p>
-    <w:p>
-      <w:pPr>
-        <w:pStyle w:val="Heading3"/>
-        <w:spacing w:before="260" w:after="120"/>
-      </w:pPr>
-      <w:r>
-        <w:rPr>
-          <w:rFonts w:ascii="Aptos Display" w:eastAsia="Aptos Display" w:hAnsi="Aptos Display" w:cs="Aptos Display"/>
-          <w:b/>
-          <w:bCs/>
-          <w:color w:val="000000"/>
-        </w:rPr>
-        <w:t>Displaying the Graphical Seat Map (Objective 3)</w:t>
-      </w:r>
-    </w:p>
-    <w:p>
-      <w:pPr>
-        <w:spacing w:after="160" w:line="276" w:lineRule="auto"/>
-      </w:pPr>
-      <w:r>
-        <w:rPr>
-          <w:rFonts w:ascii="Aptos" w:eastAsia="Aptos" w:hAnsi="Aptos" w:cs="Aptos"/>
-        </w:rPr>
-        <w:t xml:space="preserve">This objective is really a closer look at the seat map that has just been described on the booking form, so rather than design a separate screen for it I will refer back to the </w:t>
-      </w:r>
-      <w:proofErr w:type="spellStart"/>
-      <w:r>
-        <w:rPr>
-          <w:rFonts w:ascii="Aptos" w:eastAsia="Aptos" w:hAnsi="Aptos" w:cs="Aptos"/>
-        </w:rPr>
-        <w:t>frmBookings</w:t>
-      </w:r>
-      <w:proofErr w:type="spellEnd"/>
-      <w:r>
-        <w:rPr>
-          <w:rFonts w:ascii="Aptos" w:eastAsia="Aptos" w:hAnsi="Aptos" w:cs="Aptos"/>
-        </w:rPr>
-        <w:t xml:space="preserve"> form above. The seat map is the panel named </w:t>
-      </w:r>
-      <w:proofErr w:type="spellStart"/>
-      <w:r>
-        <w:rPr>
-          <w:rFonts w:ascii="Aptos" w:eastAsia="Aptos" w:hAnsi="Aptos" w:cs="Aptos"/>
-        </w:rPr>
-        <w:t>pnlSeatMap</w:t>
-      </w:r>
-      <w:proofErr w:type="spellEnd"/>
-      <w:r>
-        <w:rPr>
-          <w:rFonts w:ascii="Aptos" w:eastAsia="Aptos" w:hAnsi="Aptos" w:cs="Aptos"/>
-        </w:rPr>
-        <w:t>, and its job is to show, for a chosen screening, exactly which seats are free and which are already booked. It does this by drawing one button for every seat in the chosen screen, arranged in rows so that it looks like the layout of a real cinema, with a label above reading SCREEN so the user can tell which way round they are looking.</w:t>
-      </w:r>
-    </w:p>
-    <w:p>
-      <w:pPr>
-        <w:spacing w:after="160" w:line="276" w:lineRule="auto"/>
-      </w:pPr>
-      <w:r>
-        <w:rPr>
-          <w:rFonts w:ascii="Aptos" w:eastAsia="Aptos" w:hAnsi="Aptos" w:cs="Aptos"/>
-        </w:rPr>
         <w:lastRenderedPageBreak/>
-        <w:t>Every seat button is shown in one of three colours, and this is the output the user cares about. An available seat is shown in the Available colour and can be clicked, a seat the user has just clicked is shown in the Selected colour, and a seat that has already been booked by someone else is shown in the Taken colour and cannot be clicked at all. The small legend of coloured swatches next to the map explains which colour means what. The only input to the seat map is the clicks the user makes on the available seats, and behind the scenes the colours are worked out by comparing the full list of seats for the screen against the list of seats already booked for that screening. I have kept the fine detail of the exact colours to be settled in section 5.2, but the important design decision here is the three state system of available, selected and taken, because it is what makes the availability instantly readable.</w:t>
+        <w:t>something the cinema does not sell, and defaulting the quantity to one saves the most common case of a single item being typed every time.</w:t>
       </w:r>
     </w:p>
     <w:p>
@@ -1604,23 +660,7 @@
         <w:spacing w:after="160" w:line="276" w:lineRule="auto"/>
       </w:pPr>
       <w:r>
-        <w:t xml:space="preserve">The purpose of this section is to specify the data structures that the </w:t>
-      </w:r>
-      <w:proofErr w:type="spellStart"/>
-      <w:r>
-        <w:t>Filmtopia</w:t>
-      </w:r>
-      <w:proofErr w:type="spellEnd"/>
-      <w:r>
-        <w:t xml:space="preserve"> system will use to store its data. As the system is built around a Microsoft Access database accessed through </w:t>
-      </w:r>
-      <w:proofErr w:type="spellStart"/>
-      <w:r>
-        <w:t>OleDb</w:t>
-      </w:r>
-      <w:proofErr w:type="spellEnd"/>
-      <w:r>
-        <w:t>, these data structures take the form of database tables rather than arrays or other in memory structures. Each table and the relationships between them are described below, along with the way the data in those tables will be accessed. A key aim throughout the design has been to make sure the table structure is fully normalised to third normal form so that data is never repeated unnecessarily and the database cannot end up in an inconsistent state.</w:t>
+        <w:t>The purpose of this section is to specify the data structures that the Filmtopia system will use to store its data. As the system is built around a Microsoft Access database accessed through OleDb, these data structures take the form of database tables rather than arrays or other in memory structures. Each table and the relationships between them are described below, along with the way the data in those tables will be accessed. A key aim throughout the design has been to make sure the table structure is fully normalised to third normal form so that data is never repeated unnecessarily and the database cannot end up in an inconsistent state.</w:t>
       </w:r>
     </w:p>
     <w:p>
@@ -1727,23 +767,7 @@
         <w:spacing w:after="160" w:line="276" w:lineRule="auto"/>
       </w:pPr>
       <w:r>
-        <w:t xml:space="preserve">The way to resolve a many to many relationship is to create a new link table that sits between the two original entities, turning the single many to many relationship into two separate one to many relationships. For the booking and seat relationship this link table is </w:t>
-      </w:r>
-      <w:proofErr w:type="spellStart"/>
-      <w:r>
-        <w:t>tblBookingSeat</w:t>
-      </w:r>
-      <w:proofErr w:type="spellEnd"/>
-      <w:r>
-        <w:t xml:space="preserve">, and for the booking and food item relationship it is </w:t>
-      </w:r>
-      <w:proofErr w:type="spellStart"/>
-      <w:r>
-        <w:t>tblOrderItem</w:t>
-      </w:r>
-      <w:proofErr w:type="spellEnd"/>
-      <w:r>
-        <w:t>. Each link table holds its own primary key along with the two foreign keys that point back to the tables it joins. The diagram below shows the final design once these link tables have been added, with the primary key of each table shown in bold and the foreign keys shown in italics.</w:t>
+        <w:t>The way to resolve a many to many relationship is to create a new link table that sits between the two original entities, turning the single many to many relationship into two separate one to many relationships. For the booking and seat relationship this link table is tblBookingSeat, and for the booking and food item relationship it is tblOrderItem. Each link table holds its own primary key along with the two foreign keys that point back to the tables it joins. The diagram below shows the final design once these link tables have been added, with the primary key of each table shown in bold and the foreign keys shown in italics.</w:t>
       </w:r>
     </w:p>
     <w:p>
@@ -1816,55 +840,7 @@
         <w:spacing w:after="160" w:line="276" w:lineRule="auto"/>
       </w:pPr>
       <w:r>
-        <w:t xml:space="preserve">In this final design the foreign keys are produced by copying the primary key from the one end of each relationship to the many end. For example the </w:t>
-      </w:r>
-      <w:proofErr w:type="spellStart"/>
-      <w:r>
-        <w:t>ScreeningID</w:t>
-      </w:r>
-      <w:proofErr w:type="spellEnd"/>
-      <w:r>
-        <w:t xml:space="preserve"> primary key from </w:t>
-      </w:r>
-      <w:proofErr w:type="spellStart"/>
-      <w:r>
-        <w:t>tblScreening</w:t>
-      </w:r>
-      <w:proofErr w:type="spellEnd"/>
-      <w:r>
-        <w:t xml:space="preserve"> is copied into </w:t>
-      </w:r>
-      <w:proofErr w:type="spellStart"/>
-      <w:r>
-        <w:t>tblBooking</w:t>
-      </w:r>
-      <w:proofErr w:type="spellEnd"/>
-      <w:r>
-        <w:t xml:space="preserve"> as a foreign key, because one screening can have many bookings. The same pattern is followed throughout, which keeps every relationship as a clean one to many. The structure is normalised to third normal form because every non key field in each table depends only on the whole of that table's primary key, with no field depending on another non key field and no repeating groups of data anywhere in the design. Three further tables exist in the system that do not appear in this diagram because they are standalone and not related to the others through foreign keys. These are </w:t>
-      </w:r>
-      <w:proofErr w:type="spellStart"/>
-      <w:r>
-        <w:t>tblLogin</w:t>
-      </w:r>
-      <w:proofErr w:type="spellEnd"/>
-      <w:r>
-        <w:t xml:space="preserve">, which holds the user accounts, </w:t>
-      </w:r>
-      <w:proofErr w:type="spellStart"/>
-      <w:r>
-        <w:t>tblLogs</w:t>
-      </w:r>
-      <w:proofErr w:type="spellEnd"/>
-      <w:r>
-        <w:t xml:space="preserve">, which records system events, and </w:t>
-      </w:r>
-      <w:proofErr w:type="spellStart"/>
-      <w:r>
-        <w:t>tblVersionControl</w:t>
-      </w:r>
-      <w:proofErr w:type="spellEnd"/>
-      <w:r>
-        <w:t>, which holds the application version. They are included in the table designs below for completeness.</w:t>
+        <w:t>In this final design the foreign keys are produced by copying the primary key from the one end of each relationship to the many end. For example the ScreeningID primary key from tblScreening is copied into tblBooking as a foreign key, because one screening can have many bookings. The same pattern is followed throughout, which keeps every relationship as a clean one to many. The structure is normalised to third normal form because every non key field in each table depends only on the whole of that table's primary key, with no field depending on another non key field and no repeating groups of data anywhere in the design. Three further tables exist in the system that do not appear in this diagram because they are standalone and not related to the others through foreign keys. These are tblLogin, which holds the user accounts, tblLogs, which records system events, and tblVersionControl, which holds the application version. They are included in the table designs below for completeness.</w:t>
       </w:r>
     </w:p>
     <w:p>
@@ -1924,23 +900,7 @@
         <w:spacing w:after="160" w:line="276" w:lineRule="auto"/>
       </w:pPr>
       <w:r>
-        <w:t xml:space="preserve">The </w:t>
-      </w:r>
-      <w:proofErr w:type="spellStart"/>
-      <w:r>
-        <w:t>Filmtopia</w:t>
-      </w:r>
-      <w:proofErr w:type="spellEnd"/>
-      <w:r>
-        <w:t xml:space="preserve"> tables are stored within a Microsoft Access database and are accessed from the Visual Basic .NET application using SQL queries sent through an </w:t>
-      </w:r>
-      <w:proofErr w:type="spellStart"/>
-      <w:r>
-        <w:t>OleDb</w:t>
-      </w:r>
-      <w:proofErr w:type="spellEnd"/>
-      <w:r>
-        <w:t xml:space="preserve"> connection, specifically SELECT, INSERT, UPDATE and DELETE queries. The database management system stores the tables as direct access files and maintains indexes on the primary keys so that looking a record up by its primary key is fast and does not require reading through every record. Where a search is carried out on a field that is not indexed, the database falls back to a sequential search through the table.</w:t>
+        <w:t>The Filmtopia tables are stored within a Microsoft Access database and are accessed from the Visual Basic .NET application using SQL queries sent through an OleDb connection, specifically SELECT, INSERT, UPDATE and DELETE queries. The database management system stores the tables as direct access files and maintains indexes on the primary keys so that looking a record up by its primary key is fast and does not require reading through every record. Where a search is carried out on a field that is not indexed, the database falls back to a sequential search through the table.</w:t>
       </w:r>
     </w:p>
     <w:p>
@@ -1952,7 +912,6 @@
           <w:color w:val="000000" w:themeColor="text1"/>
         </w:rPr>
       </w:pPr>
-      <w:proofErr w:type="spellStart"/>
       <w:r>
         <w:rPr>
           <w:b/>
@@ -1961,7 +920,6 @@
         </w:rPr>
         <w:t>tblFilm</w:t>
       </w:r>
-      <w:proofErr w:type="spellEnd"/>
     </w:p>
     <w:p>
       <w:pPr>
@@ -2139,7 +1097,6 @@
             </w:tcMar>
           </w:tcPr>
           <w:p>
-            <w:proofErr w:type="spellStart"/>
             <w:r>
               <w:rPr>
                 <w:sz w:val="19"/>
@@ -2147,7 +1104,6 @@
               </w:rPr>
               <w:t>FilmID</w:t>
             </w:r>
-            <w:proofErr w:type="spellEnd"/>
           </w:p>
         </w:tc>
         <w:tc>
@@ -2235,7 +1191,6 @@
             </w:tcMar>
           </w:tcPr>
           <w:p>
-            <w:proofErr w:type="spellStart"/>
             <w:r>
               <w:rPr>
                 <w:sz w:val="19"/>
@@ -2243,7 +1198,6 @@
               </w:rPr>
               <w:t>FilmTitle</w:t>
             </w:r>
-            <w:proofErr w:type="spellEnd"/>
           </w:p>
         </w:tc>
         <w:tc>
@@ -2339,7 +1293,6 @@
             </w:tcMar>
           </w:tcPr>
           <w:p>
-            <w:proofErr w:type="spellStart"/>
             <w:r>
               <w:rPr>
                 <w:sz w:val="19"/>
@@ -2347,7 +1300,6 @@
               </w:rPr>
               <w:t>FilmAgeRating</w:t>
             </w:r>
-            <w:proofErr w:type="spellEnd"/>
           </w:p>
         </w:tc>
         <w:tc>
@@ -2443,7 +1395,6 @@
             </w:tcMar>
           </w:tcPr>
           <w:p>
-            <w:proofErr w:type="spellStart"/>
             <w:r>
               <w:rPr>
                 <w:sz w:val="19"/>
@@ -2451,7 +1402,6 @@
               </w:rPr>
               <w:t>FilmDuration</w:t>
             </w:r>
-            <w:proofErr w:type="spellEnd"/>
           </w:p>
         </w:tc>
         <w:tc>
@@ -2539,7 +1489,6 @@
             </w:tcMar>
           </w:tcPr>
           <w:p>
-            <w:proofErr w:type="spellStart"/>
             <w:r>
               <w:rPr>
                 <w:sz w:val="19"/>
@@ -2547,7 +1496,6 @@
               </w:rPr>
               <w:t>FilmDescription</w:t>
             </w:r>
-            <w:proofErr w:type="spellEnd"/>
           </w:p>
         </w:tc>
         <w:tc>
@@ -2646,7 +1594,6 @@
           <w:color w:val="000000" w:themeColor="text1"/>
         </w:rPr>
       </w:pPr>
-      <w:proofErr w:type="spellStart"/>
       <w:r>
         <w:rPr>
           <w:b/>
@@ -2655,7 +1602,6 @@
         </w:rPr>
         <w:t>tblScreen</w:t>
       </w:r>
-      <w:proofErr w:type="spellEnd"/>
     </w:p>
     <w:p>
       <w:pPr>
@@ -2833,7 +1779,6 @@
             </w:tcMar>
           </w:tcPr>
           <w:p>
-            <w:proofErr w:type="spellStart"/>
             <w:r>
               <w:rPr>
                 <w:sz w:val="19"/>
@@ -2841,7 +1786,6 @@
               </w:rPr>
               <w:t>ScreenID</w:t>
             </w:r>
-            <w:proofErr w:type="spellEnd"/>
           </w:p>
         </w:tc>
         <w:tc>
@@ -2929,7 +1873,6 @@
             </w:tcMar>
           </w:tcPr>
           <w:p>
-            <w:proofErr w:type="spellStart"/>
             <w:r>
               <w:rPr>
                 <w:sz w:val="19"/>
@@ -2937,7 +1880,6 @@
               </w:rPr>
               <w:t>ScreenName</w:t>
             </w:r>
-            <w:proofErr w:type="spellEnd"/>
           </w:p>
         </w:tc>
         <w:tc>
@@ -3033,7 +1975,6 @@
             </w:tcMar>
           </w:tcPr>
           <w:p>
-            <w:proofErr w:type="spellStart"/>
             <w:r>
               <w:rPr>
                 <w:sz w:val="19"/>
@@ -3041,7 +1982,6 @@
               </w:rPr>
               <w:t>ScreenCapacity</w:t>
             </w:r>
-            <w:proofErr w:type="spellEnd"/>
           </w:p>
         </w:tc>
         <w:tc>
@@ -3132,7 +2072,6 @@
           <w:color w:val="000000" w:themeColor="text1"/>
         </w:rPr>
       </w:pPr>
-      <w:proofErr w:type="spellStart"/>
       <w:r>
         <w:rPr>
           <w:b/>
@@ -3141,7 +2080,6 @@
         </w:rPr>
         <w:t>tblScreening</w:t>
       </w:r>
-      <w:proofErr w:type="spellEnd"/>
     </w:p>
     <w:p>
       <w:pPr>
@@ -3319,7 +2257,6 @@
             </w:tcMar>
           </w:tcPr>
           <w:p>
-            <w:proofErr w:type="spellStart"/>
             <w:r>
               <w:rPr>
                 <w:sz w:val="19"/>
@@ -3327,7 +2264,6 @@
               </w:rPr>
               <w:t>ScreeningID</w:t>
             </w:r>
-            <w:proofErr w:type="spellEnd"/>
           </w:p>
         </w:tc>
         <w:tc>
@@ -3415,7 +2351,6 @@
             </w:tcMar>
           </w:tcPr>
           <w:p>
-            <w:proofErr w:type="spellStart"/>
             <w:r>
               <w:rPr>
                 <w:sz w:val="19"/>
@@ -3423,7 +2358,6 @@
               </w:rPr>
               <w:t>FilmID</w:t>
             </w:r>
-            <w:proofErr w:type="spellEnd"/>
           </w:p>
         </w:tc>
         <w:tc>
@@ -3474,23 +2408,7 @@
                 <w:sz w:val="19"/>
                 <w:szCs w:val="19"/>
               </w:rPr>
-              <w:t xml:space="preserve">The film being shown (Foreign Key to </w:t>
-            </w:r>
-            <w:proofErr w:type="spellStart"/>
-            <w:r>
-              <w:rPr>
-                <w:sz w:val="19"/>
-                <w:szCs w:val="19"/>
-              </w:rPr>
-              <w:t>tblFilm</w:t>
-            </w:r>
-            <w:proofErr w:type="spellEnd"/>
-            <w:r>
-              <w:rPr>
-                <w:sz w:val="19"/>
-                <w:szCs w:val="19"/>
-              </w:rPr>
-              <w:t>)</w:t>
+              <w:t>The film being shown (Foreign Key to tblFilm)</w:t>
             </w:r>
           </w:p>
         </w:tc>
@@ -3527,7 +2445,6 @@
             </w:tcMar>
           </w:tcPr>
           <w:p>
-            <w:proofErr w:type="spellStart"/>
             <w:r>
               <w:rPr>
                 <w:sz w:val="19"/>
@@ -3535,7 +2452,6 @@
               </w:rPr>
               <w:t>ScreenID</w:t>
             </w:r>
-            <w:proofErr w:type="spellEnd"/>
           </w:p>
         </w:tc>
         <w:tc>
@@ -3586,23 +2502,7 @@
                 <w:sz w:val="19"/>
                 <w:szCs w:val="19"/>
               </w:rPr>
-              <w:t xml:space="preserve">The screen it is shown in (Foreign Key to </w:t>
-            </w:r>
-            <w:proofErr w:type="spellStart"/>
-            <w:r>
-              <w:rPr>
-                <w:sz w:val="19"/>
-                <w:szCs w:val="19"/>
-              </w:rPr>
-              <w:t>tblScreen</w:t>
-            </w:r>
-            <w:proofErr w:type="spellEnd"/>
-            <w:r>
-              <w:rPr>
-                <w:sz w:val="19"/>
-                <w:szCs w:val="19"/>
-              </w:rPr>
-              <w:t>)</w:t>
+              <w:t>The screen it is shown in (Foreign Key to tblScreen)</w:t>
             </w:r>
           </w:p>
         </w:tc>
@@ -3639,7 +2539,6 @@
             </w:tcMar>
           </w:tcPr>
           <w:p>
-            <w:proofErr w:type="spellStart"/>
             <w:r>
               <w:rPr>
                 <w:sz w:val="19"/>
@@ -3647,7 +2546,6 @@
               </w:rPr>
               <w:t>ScreeningDate</w:t>
             </w:r>
-            <w:proofErr w:type="spellEnd"/>
           </w:p>
         </w:tc>
         <w:tc>
@@ -3735,7 +2633,6 @@
             </w:tcMar>
           </w:tcPr>
           <w:p>
-            <w:proofErr w:type="spellStart"/>
             <w:r>
               <w:rPr>
                 <w:sz w:val="19"/>
@@ -3743,7 +2640,6 @@
               </w:rPr>
               <w:t>ScreeningTime</w:t>
             </w:r>
-            <w:proofErr w:type="spellEnd"/>
           </w:p>
         </w:tc>
         <w:tc>
@@ -3839,7 +2735,6 @@
             </w:tcMar>
           </w:tcPr>
           <w:p>
-            <w:proofErr w:type="spellStart"/>
             <w:r>
               <w:rPr>
                 <w:sz w:val="19"/>
@@ -3847,7 +2742,6 @@
               </w:rPr>
               <w:t>TicketPrice</w:t>
             </w:r>
-            <w:proofErr w:type="spellEnd"/>
           </w:p>
         </w:tc>
         <w:tc>
@@ -3938,7 +2832,6 @@
           <w:color w:val="000000" w:themeColor="text1"/>
         </w:rPr>
       </w:pPr>
-      <w:proofErr w:type="spellStart"/>
       <w:r>
         <w:rPr>
           <w:b/>
@@ -3947,7 +2840,6 @@
         </w:rPr>
         <w:t>tblSeat</w:t>
       </w:r>
-      <w:proofErr w:type="spellEnd"/>
     </w:p>
     <w:p>
       <w:pPr>
@@ -4125,7 +3017,6 @@
             </w:tcMar>
           </w:tcPr>
           <w:p>
-            <w:proofErr w:type="spellStart"/>
             <w:r>
               <w:rPr>
                 <w:sz w:val="19"/>
@@ -4133,7 +3024,6 @@
               </w:rPr>
               <w:t>SeatID</w:t>
             </w:r>
-            <w:proofErr w:type="spellEnd"/>
           </w:p>
         </w:tc>
         <w:tc>
@@ -4221,7 +3111,6 @@
             </w:tcMar>
           </w:tcPr>
           <w:p>
-            <w:proofErr w:type="spellStart"/>
             <w:r>
               <w:rPr>
                 <w:sz w:val="19"/>
@@ -4229,7 +3118,6 @@
               </w:rPr>
               <w:t>ScreenID</w:t>
             </w:r>
-            <w:proofErr w:type="spellEnd"/>
           </w:p>
         </w:tc>
         <w:tc>
@@ -4280,23 +3168,7 @@
                 <w:sz w:val="19"/>
                 <w:szCs w:val="19"/>
               </w:rPr>
-              <w:t xml:space="preserve">The screen the seat belongs to (Foreign Key to </w:t>
-            </w:r>
-            <w:proofErr w:type="spellStart"/>
-            <w:r>
-              <w:rPr>
-                <w:sz w:val="19"/>
-                <w:szCs w:val="19"/>
-              </w:rPr>
-              <w:t>tblScreen</w:t>
-            </w:r>
-            <w:proofErr w:type="spellEnd"/>
-            <w:r>
-              <w:rPr>
-                <w:sz w:val="19"/>
-                <w:szCs w:val="19"/>
-              </w:rPr>
-              <w:t>)</w:t>
+              <w:t>The screen the seat belongs to (Foreign Key to tblScreen)</w:t>
             </w:r>
           </w:p>
         </w:tc>
@@ -4333,7 +3205,6 @@
             </w:tcMar>
           </w:tcPr>
           <w:p>
-            <w:proofErr w:type="spellStart"/>
             <w:r>
               <w:rPr>
                 <w:sz w:val="19"/>
@@ -4341,7 +3212,6 @@
               </w:rPr>
               <w:t>SeatRow</w:t>
             </w:r>
-            <w:proofErr w:type="spellEnd"/>
           </w:p>
         </w:tc>
         <w:tc>
@@ -4437,7 +3307,6 @@
             </w:tcMar>
           </w:tcPr>
           <w:p>
-            <w:proofErr w:type="spellStart"/>
             <w:r>
               <w:rPr>
                 <w:sz w:val="19"/>
@@ -4445,7 +3314,6 @@
               </w:rPr>
               <w:t>SeatNumber</w:t>
             </w:r>
-            <w:proofErr w:type="spellEnd"/>
           </w:p>
         </w:tc>
         <w:tc>
@@ -4536,7 +3404,6 @@
           <w:color w:val="000000" w:themeColor="text1"/>
         </w:rPr>
       </w:pPr>
-      <w:proofErr w:type="spellStart"/>
       <w:r>
         <w:rPr>
           <w:b/>
@@ -4545,7 +3412,6 @@
         </w:rPr>
         <w:t>tblCustomer</w:t>
       </w:r>
-      <w:proofErr w:type="spellEnd"/>
     </w:p>
     <w:p>
       <w:pPr>
@@ -4723,7 +3589,6 @@
             </w:tcMar>
           </w:tcPr>
           <w:p>
-            <w:proofErr w:type="spellStart"/>
             <w:r>
               <w:rPr>
                 <w:sz w:val="19"/>
@@ -4731,7 +3596,6 @@
               </w:rPr>
               <w:t>CustomerID</w:t>
             </w:r>
-            <w:proofErr w:type="spellEnd"/>
           </w:p>
         </w:tc>
         <w:tc>
@@ -4819,7 +3683,6 @@
             </w:tcMar>
           </w:tcPr>
           <w:p>
-            <w:proofErr w:type="spellStart"/>
             <w:r>
               <w:rPr>
                 <w:sz w:val="19"/>
@@ -4827,7 +3690,6 @@
               </w:rPr>
               <w:t>CustomerForename</w:t>
             </w:r>
-            <w:proofErr w:type="spellEnd"/>
           </w:p>
         </w:tc>
         <w:tc>
@@ -4923,7 +3785,6 @@
             </w:tcMar>
           </w:tcPr>
           <w:p>
-            <w:proofErr w:type="spellStart"/>
             <w:r>
               <w:rPr>
                 <w:sz w:val="19"/>
@@ -4931,7 +3792,6 @@
               </w:rPr>
               <w:t>CustomerSurname</w:t>
             </w:r>
-            <w:proofErr w:type="spellEnd"/>
           </w:p>
         </w:tc>
         <w:tc>
@@ -5027,7 +3887,6 @@
             </w:tcMar>
           </w:tcPr>
           <w:p>
-            <w:proofErr w:type="spellStart"/>
             <w:r>
               <w:rPr>
                 <w:sz w:val="19"/>
@@ -5035,7 +3894,6 @@
               </w:rPr>
               <w:t>CustomerEmail</w:t>
             </w:r>
-            <w:proofErr w:type="spellEnd"/>
           </w:p>
         </w:tc>
         <w:tc>
@@ -5131,7 +3989,6 @@
             </w:tcMar>
           </w:tcPr>
           <w:p>
-            <w:proofErr w:type="spellStart"/>
             <w:r>
               <w:rPr>
                 <w:sz w:val="19"/>
@@ -5139,7 +3996,6 @@
               </w:rPr>
               <w:t>CustomerPhone</w:t>
             </w:r>
-            <w:proofErr w:type="spellEnd"/>
           </w:p>
         </w:tc>
         <w:tc>
@@ -5238,7 +4094,6 @@
           <w:color w:val="000000" w:themeColor="text1"/>
         </w:rPr>
       </w:pPr>
-      <w:proofErr w:type="spellStart"/>
       <w:r>
         <w:rPr>
           <w:b/>
@@ -5247,7 +4102,6 @@
         </w:rPr>
         <w:t>tblBooking</w:t>
       </w:r>
-      <w:proofErr w:type="spellEnd"/>
     </w:p>
     <w:p>
       <w:pPr>
@@ -5425,7 +4279,6 @@
             </w:tcMar>
           </w:tcPr>
           <w:p>
-            <w:proofErr w:type="spellStart"/>
             <w:r>
               <w:rPr>
                 <w:sz w:val="19"/>
@@ -5433,7 +4286,6 @@
               </w:rPr>
               <w:t>BookingID</w:t>
             </w:r>
-            <w:proofErr w:type="spellEnd"/>
           </w:p>
         </w:tc>
         <w:tc>
@@ -5521,7 +4373,6 @@
             </w:tcMar>
           </w:tcPr>
           <w:p>
-            <w:proofErr w:type="spellStart"/>
             <w:r>
               <w:rPr>
                 <w:sz w:val="19"/>
@@ -5529,7 +4380,6 @@
               </w:rPr>
               <w:t>CustomerID</w:t>
             </w:r>
-            <w:proofErr w:type="spellEnd"/>
           </w:p>
         </w:tc>
         <w:tc>
@@ -5580,23 +4430,7 @@
                 <w:sz w:val="19"/>
                 <w:szCs w:val="19"/>
               </w:rPr>
-              <w:t xml:space="preserve">The customer who made the booking (Foreign Key to </w:t>
-            </w:r>
-            <w:proofErr w:type="spellStart"/>
-            <w:r>
-              <w:rPr>
-                <w:sz w:val="19"/>
-                <w:szCs w:val="19"/>
-              </w:rPr>
-              <w:t>tblCustomer</w:t>
-            </w:r>
-            <w:proofErr w:type="spellEnd"/>
-            <w:r>
-              <w:rPr>
-                <w:sz w:val="19"/>
-                <w:szCs w:val="19"/>
-              </w:rPr>
-              <w:t>)</w:t>
+              <w:t>The customer who made the booking (Foreign Key to tblCustomer)</w:t>
             </w:r>
           </w:p>
         </w:tc>
@@ -5633,7 +4467,6 @@
             </w:tcMar>
           </w:tcPr>
           <w:p>
-            <w:proofErr w:type="spellStart"/>
             <w:r>
               <w:rPr>
                 <w:sz w:val="19"/>
@@ -5641,7 +4474,6 @@
               </w:rPr>
               <w:t>ScreeningID</w:t>
             </w:r>
-            <w:proofErr w:type="spellEnd"/>
           </w:p>
         </w:tc>
         <w:tc>
@@ -5692,23 +4524,7 @@
                 <w:sz w:val="19"/>
                 <w:szCs w:val="19"/>
               </w:rPr>
-              <w:t xml:space="preserve">The screening booked (Foreign Key to </w:t>
-            </w:r>
-            <w:proofErr w:type="spellStart"/>
-            <w:r>
-              <w:rPr>
-                <w:sz w:val="19"/>
-                <w:szCs w:val="19"/>
-              </w:rPr>
-              <w:t>tblScreening</w:t>
-            </w:r>
-            <w:proofErr w:type="spellEnd"/>
-            <w:r>
-              <w:rPr>
-                <w:sz w:val="19"/>
-                <w:szCs w:val="19"/>
-              </w:rPr>
-              <w:t>)</w:t>
+              <w:t>The screening booked (Foreign Key to tblScreening)</w:t>
             </w:r>
           </w:p>
         </w:tc>
@@ -5745,7 +4561,6 @@
             </w:tcMar>
           </w:tcPr>
           <w:p>
-            <w:proofErr w:type="spellStart"/>
             <w:r>
               <w:rPr>
                 <w:sz w:val="19"/>
@@ -5753,7 +4568,6 @@
               </w:rPr>
               <w:t>BookingDate</w:t>
             </w:r>
-            <w:proofErr w:type="spellEnd"/>
           </w:p>
         </w:tc>
         <w:tc>
@@ -5841,7 +4655,6 @@
             </w:tcMar>
           </w:tcPr>
           <w:p>
-            <w:proofErr w:type="spellStart"/>
             <w:r>
               <w:rPr>
                 <w:sz w:val="19"/>
@@ -5849,7 +4662,6 @@
               </w:rPr>
               <w:t>TotalCost</w:t>
             </w:r>
-            <w:proofErr w:type="spellEnd"/>
           </w:p>
         </w:tc>
         <w:tc>
@@ -5940,7 +4752,6 @@
           <w:color w:val="000000" w:themeColor="text1"/>
         </w:rPr>
       </w:pPr>
-      <w:proofErr w:type="spellStart"/>
       <w:r>
         <w:rPr>
           <w:b/>
@@ -5949,7 +4760,6 @@
         </w:rPr>
         <w:t>tblBookingSeat</w:t>
       </w:r>
-      <w:proofErr w:type="spellEnd"/>
     </w:p>
     <w:p>
       <w:pPr>
@@ -6127,7 +4937,6 @@
             </w:tcMar>
           </w:tcPr>
           <w:p>
-            <w:proofErr w:type="spellStart"/>
             <w:r>
               <w:rPr>
                 <w:sz w:val="19"/>
@@ -6135,7 +4944,6 @@
               </w:rPr>
               <w:t>BookingSeatID</w:t>
             </w:r>
-            <w:proofErr w:type="spellEnd"/>
           </w:p>
         </w:tc>
         <w:tc>
@@ -6223,7 +5031,6 @@
             </w:tcMar>
           </w:tcPr>
           <w:p>
-            <w:proofErr w:type="spellStart"/>
             <w:r>
               <w:rPr>
                 <w:sz w:val="19"/>
@@ -6231,7 +5038,6 @@
               </w:rPr>
               <w:t>BookingID</w:t>
             </w:r>
-            <w:proofErr w:type="spellEnd"/>
           </w:p>
         </w:tc>
         <w:tc>
@@ -6282,23 +5088,7 @@
                 <w:sz w:val="19"/>
                 <w:szCs w:val="19"/>
               </w:rPr>
-              <w:t xml:space="preserve">The booking this seat belongs to (Foreign Key to </w:t>
-            </w:r>
-            <w:proofErr w:type="spellStart"/>
-            <w:r>
-              <w:rPr>
-                <w:sz w:val="19"/>
-                <w:szCs w:val="19"/>
-              </w:rPr>
-              <w:t>tblBooking</w:t>
-            </w:r>
-            <w:proofErr w:type="spellEnd"/>
-            <w:r>
-              <w:rPr>
-                <w:sz w:val="19"/>
-                <w:szCs w:val="19"/>
-              </w:rPr>
-              <w:t>)</w:t>
+              <w:t>The booking this seat belongs to (Foreign Key to tblBooking)</w:t>
             </w:r>
           </w:p>
         </w:tc>
@@ -6335,7 +5125,6 @@
             </w:tcMar>
           </w:tcPr>
           <w:p>
-            <w:proofErr w:type="spellStart"/>
             <w:r>
               <w:rPr>
                 <w:sz w:val="19"/>
@@ -6343,7 +5132,6 @@
               </w:rPr>
               <w:t>SeatID</w:t>
             </w:r>
-            <w:proofErr w:type="spellEnd"/>
           </w:p>
         </w:tc>
         <w:tc>
@@ -6394,23 +5182,7 @@
                 <w:sz w:val="19"/>
                 <w:szCs w:val="19"/>
               </w:rPr>
-              <w:t xml:space="preserve">The seat that was booked (Foreign Key to </w:t>
-            </w:r>
-            <w:proofErr w:type="spellStart"/>
-            <w:r>
-              <w:rPr>
-                <w:sz w:val="19"/>
-                <w:szCs w:val="19"/>
-              </w:rPr>
-              <w:t>tblSeat</w:t>
-            </w:r>
-            <w:proofErr w:type="spellEnd"/>
-            <w:r>
-              <w:rPr>
-                <w:sz w:val="19"/>
-                <w:szCs w:val="19"/>
-              </w:rPr>
-              <w:t>)</w:t>
+              <w:t>The seat that was booked (Foreign Key to tblSeat)</w:t>
             </w:r>
           </w:p>
         </w:tc>
@@ -6450,7 +5222,6 @@
           <w:color w:val="000000" w:themeColor="text1"/>
         </w:rPr>
       </w:pPr>
-      <w:proofErr w:type="spellStart"/>
       <w:r>
         <w:rPr>
           <w:b/>
@@ -6459,7 +5230,6 @@
         </w:rPr>
         <w:t>tblFoodItem</w:t>
       </w:r>
-      <w:proofErr w:type="spellEnd"/>
     </w:p>
     <w:p>
       <w:pPr>
@@ -6637,7 +5407,6 @@
             </w:tcMar>
           </w:tcPr>
           <w:p>
-            <w:proofErr w:type="spellStart"/>
             <w:r>
               <w:rPr>
                 <w:sz w:val="19"/>
@@ -6645,7 +5414,6 @@
               </w:rPr>
               <w:t>FoodItemID</w:t>
             </w:r>
-            <w:proofErr w:type="spellEnd"/>
           </w:p>
         </w:tc>
         <w:tc>
@@ -6733,7 +5501,6 @@
             </w:tcMar>
           </w:tcPr>
           <w:p>
-            <w:proofErr w:type="spellStart"/>
             <w:r>
               <w:rPr>
                 <w:sz w:val="19"/>
@@ -6741,7 +5508,6 @@
               </w:rPr>
               <w:t>FoodItemName</w:t>
             </w:r>
-            <w:proofErr w:type="spellEnd"/>
           </w:p>
         </w:tc>
         <w:tc>
@@ -6837,7 +5603,6 @@
             </w:tcMar>
           </w:tcPr>
           <w:p>
-            <w:proofErr w:type="spellStart"/>
             <w:r>
               <w:rPr>
                 <w:sz w:val="19"/>
@@ -6845,7 +5610,6 @@
               </w:rPr>
               <w:t>FoodItemPrice</w:t>
             </w:r>
-            <w:proofErr w:type="spellEnd"/>
           </w:p>
         </w:tc>
         <w:tc>
@@ -6933,7 +5697,6 @@
             </w:tcMar>
           </w:tcPr>
           <w:p>
-            <w:proofErr w:type="spellStart"/>
             <w:r>
               <w:rPr>
                 <w:sz w:val="19"/>
@@ -6941,7 +5704,6 @@
               </w:rPr>
               <w:t>FoodItemCategory</w:t>
             </w:r>
-            <w:proofErr w:type="spellEnd"/>
           </w:p>
         </w:tc>
         <w:tc>
@@ -7040,7 +5802,6 @@
           <w:color w:val="000000" w:themeColor="text1"/>
         </w:rPr>
       </w:pPr>
-      <w:proofErr w:type="spellStart"/>
       <w:r>
         <w:rPr>
           <w:b/>
@@ -7049,7 +5810,6 @@
         </w:rPr>
         <w:t>tblOrderItem</w:t>
       </w:r>
-      <w:proofErr w:type="spellEnd"/>
     </w:p>
     <w:p>
       <w:pPr>
@@ -7227,7 +5987,6 @@
             </w:tcMar>
           </w:tcPr>
           <w:p>
-            <w:proofErr w:type="spellStart"/>
             <w:r>
               <w:rPr>
                 <w:sz w:val="19"/>
@@ -7235,7 +5994,6 @@
               </w:rPr>
               <w:t>OrderItemID</w:t>
             </w:r>
-            <w:proofErr w:type="spellEnd"/>
           </w:p>
         </w:tc>
         <w:tc>
@@ -7323,7 +6081,6 @@
             </w:tcMar>
           </w:tcPr>
           <w:p>
-            <w:proofErr w:type="spellStart"/>
             <w:r>
               <w:rPr>
                 <w:sz w:val="19"/>
@@ -7331,7 +6088,6 @@
               </w:rPr>
               <w:t>BookingID</w:t>
             </w:r>
-            <w:proofErr w:type="spellEnd"/>
           </w:p>
         </w:tc>
         <w:tc>
@@ -7382,23 +6138,7 @@
                 <w:sz w:val="19"/>
                 <w:szCs w:val="19"/>
               </w:rPr>
-              <w:t xml:space="preserve">The booking the item was added to (Foreign Key to </w:t>
-            </w:r>
-            <w:proofErr w:type="spellStart"/>
-            <w:r>
-              <w:rPr>
-                <w:sz w:val="19"/>
-                <w:szCs w:val="19"/>
-              </w:rPr>
-              <w:t>tblBooking</w:t>
-            </w:r>
-            <w:proofErr w:type="spellEnd"/>
-            <w:r>
-              <w:rPr>
-                <w:sz w:val="19"/>
-                <w:szCs w:val="19"/>
-              </w:rPr>
-              <w:t>)</w:t>
+              <w:t>The booking the item was added to (Foreign Key to tblBooking)</w:t>
             </w:r>
           </w:p>
         </w:tc>
@@ -7435,7 +6175,6 @@
             </w:tcMar>
           </w:tcPr>
           <w:p>
-            <w:proofErr w:type="spellStart"/>
             <w:r>
               <w:rPr>
                 <w:sz w:val="19"/>
@@ -7443,7 +6182,6 @@
               </w:rPr>
               <w:t>FoodItemID</w:t>
             </w:r>
-            <w:proofErr w:type="spellEnd"/>
           </w:p>
         </w:tc>
         <w:tc>
@@ -7494,23 +6232,7 @@
                 <w:sz w:val="19"/>
                 <w:szCs w:val="19"/>
               </w:rPr>
-              <w:t xml:space="preserve">The food item ordered (Foreign Key to </w:t>
-            </w:r>
-            <w:proofErr w:type="spellStart"/>
-            <w:r>
-              <w:rPr>
-                <w:sz w:val="19"/>
-                <w:szCs w:val="19"/>
-              </w:rPr>
-              <w:t>tblFoodItem</w:t>
-            </w:r>
-            <w:proofErr w:type="spellEnd"/>
-            <w:r>
-              <w:rPr>
-                <w:sz w:val="19"/>
-                <w:szCs w:val="19"/>
-              </w:rPr>
-              <w:t>)</w:t>
+              <w:t>The food item ordered (Foreign Key to tblFoodItem)</w:t>
             </w:r>
           </w:p>
         </w:tc>
@@ -7644,7 +6366,6 @@
           <w:color w:val="000000" w:themeColor="text1"/>
         </w:rPr>
       </w:pPr>
-      <w:proofErr w:type="spellStart"/>
       <w:r>
         <w:rPr>
           <w:b/>
@@ -7653,7 +6374,6 @@
         </w:rPr>
         <w:t>tblLogin</w:t>
       </w:r>
-      <w:proofErr w:type="spellEnd"/>
     </w:p>
     <w:p>
       <w:pPr>
@@ -7831,7 +6551,6 @@
             </w:tcMar>
           </w:tcPr>
           <w:p>
-            <w:proofErr w:type="spellStart"/>
             <w:r>
               <w:rPr>
                 <w:sz w:val="19"/>
@@ -7839,7 +6558,6 @@
               </w:rPr>
               <w:t>LoginID</w:t>
             </w:r>
-            <w:proofErr w:type="spellEnd"/>
           </w:p>
         </w:tc>
         <w:tc>
@@ -8109,7 +6827,6 @@
             </w:tcMar>
           </w:tcPr>
           <w:p>
-            <w:proofErr w:type="spellStart"/>
             <w:r>
               <w:rPr>
                 <w:sz w:val="19"/>
@@ -8117,7 +6834,6 @@
               </w:rPr>
               <w:t>MTIz</w:t>
             </w:r>
-            <w:proofErr w:type="spellEnd"/>
           </w:p>
         </w:tc>
       </w:tr>
@@ -8133,7 +6849,6 @@
             </w:tcMar>
           </w:tcPr>
           <w:p>
-            <w:proofErr w:type="spellStart"/>
             <w:r>
               <w:rPr>
                 <w:sz w:val="19"/>
@@ -8141,7 +6856,6 @@
               </w:rPr>
               <w:t>AccessLevel</w:t>
             </w:r>
-            <w:proofErr w:type="spellEnd"/>
           </w:p>
         </w:tc>
         <w:tc>
@@ -8232,7 +6946,6 @@
           <w:color w:val="000000" w:themeColor="text1"/>
         </w:rPr>
       </w:pPr>
-      <w:proofErr w:type="spellStart"/>
       <w:r>
         <w:rPr>
           <w:b/>
@@ -8241,7 +6954,6 @@
         </w:rPr>
         <w:t>tblLogs</w:t>
       </w:r>
-      <w:proofErr w:type="spellEnd"/>
     </w:p>
     <w:p>
       <w:pPr>
@@ -8419,7 +7131,6 @@
             </w:tcMar>
           </w:tcPr>
           <w:p>
-            <w:proofErr w:type="spellStart"/>
             <w:r>
               <w:rPr>
                 <w:sz w:val="19"/>
@@ -8427,7 +7138,6 @@
               </w:rPr>
               <w:t>LogID</w:t>
             </w:r>
-            <w:proofErr w:type="spellEnd"/>
           </w:p>
         </w:tc>
         <w:tc>
@@ -8515,7 +7225,6 @@
             </w:tcMar>
           </w:tcPr>
           <w:p>
-            <w:proofErr w:type="spellStart"/>
             <w:r>
               <w:rPr>
                 <w:sz w:val="19"/>
@@ -8523,7 +7232,6 @@
               </w:rPr>
               <w:t>LogDateTime</w:t>
             </w:r>
-            <w:proofErr w:type="spellEnd"/>
           </w:p>
         </w:tc>
         <w:tc>
@@ -8611,7 +7319,6 @@
             </w:tcMar>
           </w:tcPr>
           <w:p>
-            <w:proofErr w:type="spellStart"/>
             <w:r>
               <w:rPr>
                 <w:sz w:val="19"/>
@@ -8619,7 +7326,6 @@
               </w:rPr>
               <w:t>LogType</w:t>
             </w:r>
-            <w:proofErr w:type="spellEnd"/>
           </w:p>
         </w:tc>
         <w:tc>
@@ -8715,7 +7421,6 @@
             </w:tcMar>
           </w:tcPr>
           <w:p>
-            <w:proofErr w:type="spellStart"/>
             <w:r>
               <w:rPr>
                 <w:sz w:val="19"/>
@@ -8723,7 +7428,6 @@
               </w:rPr>
               <w:t>LogMessage</w:t>
             </w:r>
-            <w:proofErr w:type="spellEnd"/>
           </w:p>
         </w:tc>
         <w:tc>
@@ -8814,7 +7518,6 @@
           <w:color w:val="000000" w:themeColor="text1"/>
         </w:rPr>
       </w:pPr>
-      <w:proofErr w:type="spellStart"/>
       <w:r>
         <w:rPr>
           <w:b/>
@@ -8823,7 +7526,6 @@
         </w:rPr>
         <w:t>tblVersionControl</w:t>
       </w:r>
-      <w:proofErr w:type="spellEnd"/>
     </w:p>
     <w:p>
       <w:pPr>
@@ -9121,15 +7823,7 @@
         <w:spacing w:after="160" w:line="276" w:lineRule="auto"/>
       </w:pPr>
       <w:r>
-        <w:t xml:space="preserve">This section describes the processing that takes place inside the </w:t>
-      </w:r>
-      <w:proofErr w:type="spellStart"/>
-      <w:r>
-        <w:t>Filmtopia</w:t>
-      </w:r>
-      <w:proofErr w:type="spellEnd"/>
-      <w:r>
-        <w:t xml:space="preserve"> system. Rather than listing every button on every form it focuses on the stages where there is real logic going on, since these are the parts of the system that need to be thought through carefully before any code is written. Each stage is described in plain English pseudocode rather than in Visual Basic, so that the logic is clear and separate from the eventual code, and the two most important algorithms are also shown as flowcharts. Each stage is linked back to the objectives it helps to meet.</w:t>
+        <w:t>This section describes the processing that takes place inside the Filmtopia system. Rather than listing every button on every form it focuses on the stages where there is real logic going on, since these are the parts of the system that need to be thought through carefully before any code is written. Each stage is described in plain English pseudocode rather than in Visual Basic, so that the logic is clear and separate from the eventual code, and the two most important algorithms are also shown as flowcharts. Each stage is linked back to the objectives it helps to meet.</w:t>
       </w:r>
     </w:p>
     <w:p>
@@ -9245,25 +7939,27 @@
                 <w:sz w:val="19"/>
                 <w:szCs w:val="19"/>
               </w:rPr>
-              <w:t xml:space="preserve">    LOOK UP the username in </w:t>
-            </w:r>
-            <w:proofErr w:type="spellStart"/>
+              <w:t xml:space="preserve">    LOOK UP the username in tblLogin using an SQL SELECT query</w:t>
+            </w:r>
+          </w:p>
+          <w:p>
             <w:r>
               <w:rPr>
                 <w:rFonts w:ascii="Courier New" w:eastAsia="Courier New" w:hAnsi="Courier New" w:cs="Courier New"/>
                 <w:sz w:val="19"/>
                 <w:szCs w:val="19"/>
               </w:rPr>
-              <w:t>tblLogin</w:t>
-            </w:r>
-            <w:proofErr w:type="spellEnd"/>
+              <w:t xml:space="preserve">    IF no matching username is found THEN</w:t>
+            </w:r>
+          </w:p>
+          <w:p>
             <w:r>
               <w:rPr>
                 <w:rFonts w:ascii="Courier New" w:eastAsia="Courier New" w:hAnsi="Courier New" w:cs="Courier New"/>
                 <w:sz w:val="19"/>
                 <w:szCs w:val="19"/>
               </w:rPr>
-              <w:t xml:space="preserve"> using an SQL SELECT query</w:t>
+              <w:t xml:space="preserve">        DISPLAY "Login details not recognised"</w:t>
             </w:r>
           </w:p>
           <w:p>
@@ -9273,7 +7969,7 @@
                 <w:sz w:val="19"/>
                 <w:szCs w:val="19"/>
               </w:rPr>
-              <w:t xml:space="preserve">    IF no matching username is found THEN</w:t>
+              <w:t xml:space="preserve">    ELSE IF the stored password does not match the encoded password THEN</w:t>
             </w:r>
           </w:p>
           <w:p>
@@ -9293,7 +7989,7 @@
                 <w:sz w:val="19"/>
                 <w:szCs w:val="19"/>
               </w:rPr>
-              <w:t xml:space="preserve">    ELSE IF the stored password does not match the encoded password THEN</w:t>
+              <w:t xml:space="preserve">    ELSE</w:t>
             </w:r>
           </w:p>
           <w:p>
@@ -9303,45 +7999,7 @@
                 <w:sz w:val="19"/>
                 <w:szCs w:val="19"/>
               </w:rPr>
-              <w:t xml:space="preserve">        DISPLAY "Login details not recognised"</w:t>
-            </w:r>
-          </w:p>
-          <w:p>
-            <w:r>
-              <w:rPr>
-                <w:rFonts w:ascii="Courier New" w:eastAsia="Courier New" w:hAnsi="Courier New" w:cs="Courier New"/>
-                <w:sz w:val="19"/>
-                <w:szCs w:val="19"/>
-              </w:rPr>
-              <w:t xml:space="preserve">    ELSE</w:t>
-            </w:r>
-          </w:p>
-          <w:p>
-            <w:r>
-              <w:rPr>
-                <w:rFonts w:ascii="Courier New" w:eastAsia="Courier New" w:hAnsi="Courier New" w:cs="Courier New"/>
-                <w:sz w:val="19"/>
-                <w:szCs w:val="19"/>
-              </w:rPr>
-              <w:t xml:space="preserve">        STORE the user's </w:t>
-            </w:r>
-            <w:proofErr w:type="spellStart"/>
-            <w:r>
-              <w:rPr>
-                <w:rFonts w:ascii="Courier New" w:eastAsia="Courier New" w:hAnsi="Courier New" w:cs="Courier New"/>
-                <w:sz w:val="19"/>
-                <w:szCs w:val="19"/>
-              </w:rPr>
-              <w:t>AccessLevel</w:t>
-            </w:r>
-            <w:proofErr w:type="spellEnd"/>
-            <w:r>
-              <w:rPr>
-                <w:rFonts w:ascii="Courier New" w:eastAsia="Courier New" w:hAnsi="Courier New" w:cs="Courier New"/>
-                <w:sz w:val="19"/>
-                <w:szCs w:val="19"/>
-              </w:rPr>
-              <w:t xml:space="preserve"> for the session</w:t>
+              <w:t xml:space="preserve">        STORE the user's AccessLevel for the session</w:t>
             </w:r>
           </w:p>
           <w:p>
@@ -9542,25 +8200,27 @@
                 <w:sz w:val="19"/>
                 <w:szCs w:val="19"/>
               </w:rPr>
-              <w:t xml:space="preserve">SET </w:t>
-            </w:r>
-            <w:proofErr w:type="spellStart"/>
+              <w:t>SET seatsPerRow to 10</w:t>
+            </w:r>
+          </w:p>
+          <w:p>
             <w:r>
               <w:rPr>
                 <w:rFonts w:ascii="Courier New" w:eastAsia="Courier New" w:hAnsi="Courier New" w:cs="Courier New"/>
                 <w:sz w:val="19"/>
                 <w:szCs w:val="19"/>
               </w:rPr>
-              <w:t>seatsPerRow</w:t>
-            </w:r>
-            <w:proofErr w:type="spellEnd"/>
+              <w:t>SET rowLetter to "A"</w:t>
+            </w:r>
+          </w:p>
+          <w:p>
             <w:r>
               <w:rPr>
                 <w:rFonts w:ascii="Courier New" w:eastAsia="Courier New" w:hAnsi="Courier New" w:cs="Courier New"/>
                 <w:sz w:val="19"/>
                 <w:szCs w:val="19"/>
               </w:rPr>
-              <w:t xml:space="preserve"> to 10</w:t>
+              <w:t>SET seatsMade to 0</w:t>
             </w:r>
           </w:p>
           <w:p>
@@ -9570,25 +8230,27 @@
                 <w:sz w:val="19"/>
                 <w:szCs w:val="19"/>
               </w:rPr>
-              <w:t xml:space="preserve">SET </w:t>
-            </w:r>
-            <w:proofErr w:type="spellStart"/>
+              <w:t>WHILE seatsMade is less than capacity</w:t>
+            </w:r>
+          </w:p>
+          <w:p>
             <w:r>
               <w:rPr>
                 <w:rFonts w:ascii="Courier New" w:eastAsia="Courier New" w:hAnsi="Courier New" w:cs="Courier New"/>
                 <w:sz w:val="19"/>
                 <w:szCs w:val="19"/>
               </w:rPr>
-              <w:t>rowLetter</w:t>
-            </w:r>
-            <w:proofErr w:type="spellEnd"/>
+              <w:t xml:space="preserve">    FOR seatNumber from 1 to seatsPerRow</w:t>
+            </w:r>
+          </w:p>
+          <w:p>
             <w:r>
               <w:rPr>
                 <w:rFonts w:ascii="Courier New" w:eastAsia="Courier New" w:hAnsi="Courier New" w:cs="Courier New"/>
                 <w:sz w:val="19"/>
                 <w:szCs w:val="19"/>
               </w:rPr>
-              <w:t xml:space="preserve"> to "A"</w:t>
+              <w:t xml:space="preserve">        IF seatsMade is less than capacity THEN</w:t>
             </w:r>
           </w:p>
           <w:p>
@@ -9598,25 +8260,27 @@
                 <w:sz w:val="19"/>
                 <w:szCs w:val="19"/>
               </w:rPr>
-              <w:t xml:space="preserve">SET </w:t>
-            </w:r>
-            <w:proofErr w:type="spellStart"/>
+              <w:t xml:space="preserve">            INSERT a seat into tblSeat with the current ScreenID,</w:t>
+            </w:r>
+          </w:p>
+          <w:p>
             <w:r>
               <w:rPr>
                 <w:rFonts w:ascii="Courier New" w:eastAsia="Courier New" w:hAnsi="Courier New" w:cs="Courier New"/>
                 <w:sz w:val="19"/>
                 <w:szCs w:val="19"/>
               </w:rPr>
-              <w:t>seatsMade</w:t>
-            </w:r>
-            <w:proofErr w:type="spellEnd"/>
+              <w:t xml:space="preserve">                   rowLetter and seatNumber using an SQL INSERT</w:t>
+            </w:r>
+          </w:p>
+          <w:p>
             <w:r>
               <w:rPr>
                 <w:rFonts w:ascii="Courier New" w:eastAsia="Courier New" w:hAnsi="Courier New" w:cs="Courier New"/>
                 <w:sz w:val="19"/>
                 <w:szCs w:val="19"/>
               </w:rPr>
-              <w:t xml:space="preserve"> to 0</w:t>
+              <w:t xml:space="preserve">            ADD 1 to seatsMade</w:t>
             </w:r>
           </w:p>
           <w:p>
@@ -9626,261 +8290,27 @@
                 <w:sz w:val="19"/>
                 <w:szCs w:val="19"/>
               </w:rPr>
-              <w:t xml:space="preserve">WHILE </w:t>
-            </w:r>
-            <w:proofErr w:type="spellStart"/>
+              <w:t xml:space="preserve">        END IF</w:t>
+            </w:r>
+          </w:p>
+          <w:p>
             <w:r>
               <w:rPr>
                 <w:rFonts w:ascii="Courier New" w:eastAsia="Courier New" w:hAnsi="Courier New" w:cs="Courier New"/>
                 <w:sz w:val="19"/>
                 <w:szCs w:val="19"/>
               </w:rPr>
-              <w:t>seatsMade</w:t>
-            </w:r>
-            <w:proofErr w:type="spellEnd"/>
+              <w:t xml:space="preserve">    NEXT seatNumber</w:t>
+            </w:r>
+          </w:p>
+          <w:p>
             <w:r>
               <w:rPr>
                 <w:rFonts w:ascii="Courier New" w:eastAsia="Courier New" w:hAnsi="Courier New" w:cs="Courier New"/>
                 <w:sz w:val="19"/>
                 <w:szCs w:val="19"/>
               </w:rPr>
-              <w:t xml:space="preserve"> is less than capacity</w:t>
-            </w:r>
-          </w:p>
-          <w:p>
-            <w:r>
-              <w:rPr>
-                <w:rFonts w:ascii="Courier New" w:eastAsia="Courier New" w:hAnsi="Courier New" w:cs="Courier New"/>
-                <w:sz w:val="19"/>
-                <w:szCs w:val="19"/>
-              </w:rPr>
-              <w:t xml:space="preserve">    FOR </w:t>
-            </w:r>
-            <w:proofErr w:type="spellStart"/>
-            <w:r>
-              <w:rPr>
-                <w:rFonts w:ascii="Courier New" w:eastAsia="Courier New" w:hAnsi="Courier New" w:cs="Courier New"/>
-                <w:sz w:val="19"/>
-                <w:szCs w:val="19"/>
-              </w:rPr>
-              <w:t>seatNumber</w:t>
-            </w:r>
-            <w:proofErr w:type="spellEnd"/>
-            <w:r>
-              <w:rPr>
-                <w:rFonts w:ascii="Courier New" w:eastAsia="Courier New" w:hAnsi="Courier New" w:cs="Courier New"/>
-                <w:sz w:val="19"/>
-                <w:szCs w:val="19"/>
-              </w:rPr>
-              <w:t xml:space="preserve"> from 1 to </w:t>
-            </w:r>
-            <w:proofErr w:type="spellStart"/>
-            <w:r>
-              <w:rPr>
-                <w:rFonts w:ascii="Courier New" w:eastAsia="Courier New" w:hAnsi="Courier New" w:cs="Courier New"/>
-                <w:sz w:val="19"/>
-                <w:szCs w:val="19"/>
-              </w:rPr>
-              <w:t>seatsPerRow</w:t>
-            </w:r>
-            <w:proofErr w:type="spellEnd"/>
-          </w:p>
-          <w:p>
-            <w:r>
-              <w:rPr>
-                <w:rFonts w:ascii="Courier New" w:eastAsia="Courier New" w:hAnsi="Courier New" w:cs="Courier New"/>
-                <w:sz w:val="19"/>
-                <w:szCs w:val="19"/>
-              </w:rPr>
-              <w:t xml:space="preserve">        IF </w:t>
-            </w:r>
-            <w:proofErr w:type="spellStart"/>
-            <w:r>
-              <w:rPr>
-                <w:rFonts w:ascii="Courier New" w:eastAsia="Courier New" w:hAnsi="Courier New" w:cs="Courier New"/>
-                <w:sz w:val="19"/>
-                <w:szCs w:val="19"/>
-              </w:rPr>
-              <w:t>seatsMade</w:t>
-            </w:r>
-            <w:proofErr w:type="spellEnd"/>
-            <w:r>
-              <w:rPr>
-                <w:rFonts w:ascii="Courier New" w:eastAsia="Courier New" w:hAnsi="Courier New" w:cs="Courier New"/>
-                <w:sz w:val="19"/>
-                <w:szCs w:val="19"/>
-              </w:rPr>
-              <w:t xml:space="preserve"> is less than capacity THEN</w:t>
-            </w:r>
-          </w:p>
-          <w:p>
-            <w:r>
-              <w:rPr>
-                <w:rFonts w:ascii="Courier New" w:eastAsia="Courier New" w:hAnsi="Courier New" w:cs="Courier New"/>
-                <w:sz w:val="19"/>
-                <w:szCs w:val="19"/>
-              </w:rPr>
-              <w:t xml:space="preserve">            INSERT a seat into </w:t>
-            </w:r>
-            <w:proofErr w:type="spellStart"/>
-            <w:r>
-              <w:rPr>
-                <w:rFonts w:ascii="Courier New" w:eastAsia="Courier New" w:hAnsi="Courier New" w:cs="Courier New"/>
-                <w:sz w:val="19"/>
-                <w:szCs w:val="19"/>
-              </w:rPr>
-              <w:t>tblSeat</w:t>
-            </w:r>
-            <w:proofErr w:type="spellEnd"/>
-            <w:r>
-              <w:rPr>
-                <w:rFonts w:ascii="Courier New" w:eastAsia="Courier New" w:hAnsi="Courier New" w:cs="Courier New"/>
-                <w:sz w:val="19"/>
-                <w:szCs w:val="19"/>
-              </w:rPr>
-              <w:t xml:space="preserve"> with the current </w:t>
-            </w:r>
-            <w:proofErr w:type="spellStart"/>
-            <w:r>
-              <w:rPr>
-                <w:rFonts w:ascii="Courier New" w:eastAsia="Courier New" w:hAnsi="Courier New" w:cs="Courier New"/>
-                <w:sz w:val="19"/>
-                <w:szCs w:val="19"/>
-              </w:rPr>
-              <w:t>ScreenID</w:t>
-            </w:r>
-            <w:proofErr w:type="spellEnd"/>
-            <w:r>
-              <w:rPr>
-                <w:rFonts w:ascii="Courier New" w:eastAsia="Courier New" w:hAnsi="Courier New" w:cs="Courier New"/>
-                <w:sz w:val="19"/>
-                <w:szCs w:val="19"/>
-              </w:rPr>
-              <w:t>,</w:t>
-            </w:r>
-          </w:p>
-          <w:p>
-            <w:r>
-              <w:rPr>
-                <w:rFonts w:ascii="Courier New" w:eastAsia="Courier New" w:hAnsi="Courier New" w:cs="Courier New"/>
-                <w:sz w:val="19"/>
-                <w:szCs w:val="19"/>
-              </w:rPr>
-              <w:t xml:space="preserve">                   </w:t>
-            </w:r>
-            <w:proofErr w:type="spellStart"/>
-            <w:r>
-              <w:rPr>
-                <w:rFonts w:ascii="Courier New" w:eastAsia="Courier New" w:hAnsi="Courier New" w:cs="Courier New"/>
-                <w:sz w:val="19"/>
-                <w:szCs w:val="19"/>
-              </w:rPr>
-              <w:t>rowLetter</w:t>
-            </w:r>
-            <w:proofErr w:type="spellEnd"/>
-            <w:r>
-              <w:rPr>
-                <w:rFonts w:ascii="Courier New" w:eastAsia="Courier New" w:hAnsi="Courier New" w:cs="Courier New"/>
-                <w:sz w:val="19"/>
-                <w:szCs w:val="19"/>
-              </w:rPr>
-              <w:t xml:space="preserve"> and </w:t>
-            </w:r>
-            <w:proofErr w:type="spellStart"/>
-            <w:r>
-              <w:rPr>
-                <w:rFonts w:ascii="Courier New" w:eastAsia="Courier New" w:hAnsi="Courier New" w:cs="Courier New"/>
-                <w:sz w:val="19"/>
-                <w:szCs w:val="19"/>
-              </w:rPr>
-              <w:t>seatNumber</w:t>
-            </w:r>
-            <w:proofErr w:type="spellEnd"/>
-            <w:r>
-              <w:rPr>
-                <w:rFonts w:ascii="Courier New" w:eastAsia="Courier New" w:hAnsi="Courier New" w:cs="Courier New"/>
-                <w:sz w:val="19"/>
-                <w:szCs w:val="19"/>
-              </w:rPr>
-              <w:t xml:space="preserve"> using an SQL INSERT</w:t>
-            </w:r>
-          </w:p>
-          <w:p>
-            <w:r>
-              <w:rPr>
-                <w:rFonts w:ascii="Courier New" w:eastAsia="Courier New" w:hAnsi="Courier New" w:cs="Courier New"/>
-                <w:sz w:val="19"/>
-                <w:szCs w:val="19"/>
-              </w:rPr>
-              <w:t xml:space="preserve">            ADD 1 to </w:t>
-            </w:r>
-            <w:proofErr w:type="spellStart"/>
-            <w:r>
-              <w:rPr>
-                <w:rFonts w:ascii="Courier New" w:eastAsia="Courier New" w:hAnsi="Courier New" w:cs="Courier New"/>
-                <w:sz w:val="19"/>
-                <w:szCs w:val="19"/>
-              </w:rPr>
-              <w:t>seatsMade</w:t>
-            </w:r>
-            <w:proofErr w:type="spellEnd"/>
-          </w:p>
-          <w:p>
-            <w:r>
-              <w:rPr>
-                <w:rFonts w:ascii="Courier New" w:eastAsia="Courier New" w:hAnsi="Courier New" w:cs="Courier New"/>
-                <w:sz w:val="19"/>
-                <w:szCs w:val="19"/>
-              </w:rPr>
-              <w:t xml:space="preserve">        END IF</w:t>
-            </w:r>
-          </w:p>
-          <w:p>
-            <w:r>
-              <w:rPr>
-                <w:rFonts w:ascii="Courier New" w:eastAsia="Courier New" w:hAnsi="Courier New" w:cs="Courier New"/>
-                <w:sz w:val="19"/>
-                <w:szCs w:val="19"/>
-              </w:rPr>
-              <w:t xml:space="preserve">    NEXT </w:t>
-            </w:r>
-            <w:proofErr w:type="spellStart"/>
-            <w:r>
-              <w:rPr>
-                <w:rFonts w:ascii="Courier New" w:eastAsia="Courier New" w:hAnsi="Courier New" w:cs="Courier New"/>
-                <w:sz w:val="19"/>
-                <w:szCs w:val="19"/>
-              </w:rPr>
-              <w:t>seatNumber</w:t>
-            </w:r>
-            <w:proofErr w:type="spellEnd"/>
-          </w:p>
-          <w:p>
-            <w:r>
-              <w:rPr>
-                <w:rFonts w:ascii="Courier New" w:eastAsia="Courier New" w:hAnsi="Courier New" w:cs="Courier New"/>
-                <w:sz w:val="19"/>
-                <w:szCs w:val="19"/>
-              </w:rPr>
-              <w:t xml:space="preserve">    MOVE </w:t>
-            </w:r>
-            <w:proofErr w:type="spellStart"/>
-            <w:r>
-              <w:rPr>
-                <w:rFonts w:ascii="Courier New" w:eastAsia="Courier New" w:hAnsi="Courier New" w:cs="Courier New"/>
-                <w:sz w:val="19"/>
-                <w:szCs w:val="19"/>
-              </w:rPr>
-              <w:t>rowLetter</w:t>
-            </w:r>
-            <w:proofErr w:type="spellEnd"/>
-            <w:r>
-              <w:rPr>
-                <w:rFonts w:ascii="Courier New" w:eastAsia="Courier New" w:hAnsi="Courier New" w:cs="Courier New"/>
-                <w:sz w:val="19"/>
-                <w:szCs w:val="19"/>
-              </w:rPr>
-              <w:t xml:space="preserve"> on to the next letter of the alphabet</w:t>
+              <w:t xml:space="preserve">    MOVE rowLetter on to the next letter of the alphabet</w:t>
             </w:r>
           </w:p>
           <w:p>
@@ -10016,43 +8446,47 @@
                 <w:sz w:val="19"/>
                 <w:szCs w:val="19"/>
               </w:rPr>
-              <w:t xml:space="preserve">    LOOK UP </w:t>
-            </w:r>
-            <w:proofErr w:type="spellStart"/>
+              <w:t xml:space="preserve">    LOOK UP tblBookingSeat joined to tblBooking to see whether</w:t>
+            </w:r>
+          </w:p>
+          <w:p>
             <w:r>
               <w:rPr>
                 <w:rFonts w:ascii="Courier New" w:eastAsia="Courier New" w:hAnsi="Courier New" w:cs="Courier New"/>
                 <w:sz w:val="19"/>
                 <w:szCs w:val="19"/>
               </w:rPr>
-              <w:t>tblBookingSeat</w:t>
-            </w:r>
-            <w:proofErr w:type="spellEnd"/>
+              <w:t xml:space="preserve">        that seat is already booked for this screening (SQL SELECT)</w:t>
+            </w:r>
+          </w:p>
+          <w:p>
             <w:r>
               <w:rPr>
                 <w:rFonts w:ascii="Courier New" w:eastAsia="Courier New" w:hAnsi="Courier New" w:cs="Courier New"/>
                 <w:sz w:val="19"/>
                 <w:szCs w:val="19"/>
               </w:rPr>
-              <w:t xml:space="preserve"> joined to </w:t>
-            </w:r>
-            <w:proofErr w:type="spellStart"/>
+              <w:t xml:space="preserve">    IF the seat is already booked THEN</w:t>
+            </w:r>
+          </w:p>
+          <w:p>
             <w:r>
               <w:rPr>
                 <w:rFonts w:ascii="Courier New" w:eastAsia="Courier New" w:hAnsi="Courier New" w:cs="Courier New"/>
                 <w:sz w:val="19"/>
                 <w:szCs w:val="19"/>
               </w:rPr>
-              <w:t>tblBooking</w:t>
-            </w:r>
-            <w:proofErr w:type="spellEnd"/>
+              <w:t xml:space="preserve">        DISPLAY "One or more of the selected seats has been taken"</w:t>
+            </w:r>
+          </w:p>
+          <w:p>
             <w:r>
               <w:rPr>
                 <w:rFonts w:ascii="Courier New" w:eastAsia="Courier New" w:hAnsi="Courier New" w:cs="Courier New"/>
                 <w:sz w:val="19"/>
                 <w:szCs w:val="19"/>
               </w:rPr>
-              <w:t xml:space="preserve"> to see whether</w:t>
+              <w:t xml:space="preserve">        STOP the booking</w:t>
             </w:r>
           </w:p>
           <w:p>
@@ -10062,7 +8496,7 @@
                 <w:sz w:val="19"/>
                 <w:szCs w:val="19"/>
               </w:rPr>
-              <w:t xml:space="preserve">        that seat is already booked for this screening (SQL SELECT)</w:t>
+              <w:t xml:space="preserve">    END IF</w:t>
             </w:r>
           </w:p>
           <w:p>
@@ -10072,7 +8506,7 @@
                 <w:sz w:val="19"/>
                 <w:szCs w:val="19"/>
               </w:rPr>
-              <w:t xml:space="preserve">    IF the seat is already booked THEN</w:t>
+              <w:t>NEXT seat</w:t>
             </w:r>
           </w:p>
           <w:p>
@@ -10082,7 +8516,7 @@
                 <w:sz w:val="19"/>
                 <w:szCs w:val="19"/>
               </w:rPr>
-              <w:t xml:space="preserve">        DISPLAY "One or more of the selected seats has been taken"</w:t>
+              <w:t>INSERT a new record into tblBooking with the customer, screening,</w:t>
             </w:r>
           </w:p>
           <w:p>
@@ -10092,7 +8526,7 @@
                 <w:sz w:val="19"/>
                 <w:szCs w:val="19"/>
               </w:rPr>
-              <w:t xml:space="preserve">        STOP the booking</w:t>
+              <w:t xml:space="preserve">       today's date and the calculated total cost</w:t>
             </w:r>
           </w:p>
           <w:p>
@@ -10102,7 +8536,7 @@
                 <w:sz w:val="19"/>
                 <w:szCs w:val="19"/>
               </w:rPr>
-              <w:t xml:space="preserve">    END IF</w:t>
+              <w:t>GET the new BookingID that was created</w:t>
             </w:r>
           </w:p>
           <w:p>
@@ -10112,7 +8546,7 @@
                 <w:sz w:val="19"/>
                 <w:szCs w:val="19"/>
               </w:rPr>
-              <w:t>NEXT seat</w:t>
+              <w:t>FOR each chosen seat</w:t>
             </w:r>
           </w:p>
           <w:p>
@@ -10122,130 +8556,8 @@
                 <w:sz w:val="19"/>
                 <w:szCs w:val="19"/>
               </w:rPr>
-              <w:t xml:space="preserve">INSERT a new record into </w:t>
-            </w:r>
-            <w:proofErr w:type="spellStart"/>
-            <w:r>
-              <w:rPr>
-                <w:rFonts w:ascii="Courier New" w:eastAsia="Courier New" w:hAnsi="Courier New" w:cs="Courier New"/>
-                <w:sz w:val="19"/>
-                <w:szCs w:val="19"/>
-              </w:rPr>
-              <w:t>tblBooking</w:t>
-            </w:r>
-            <w:proofErr w:type="spellEnd"/>
-            <w:r>
-              <w:rPr>
-                <w:rFonts w:ascii="Courier New" w:eastAsia="Courier New" w:hAnsi="Courier New" w:cs="Courier New"/>
-                <w:sz w:val="19"/>
-                <w:szCs w:val="19"/>
-              </w:rPr>
-              <w:t xml:space="preserve"> with the customer, screening,</w:t>
-            </w:r>
-          </w:p>
-          <w:p>
-            <w:r>
-              <w:rPr>
-                <w:rFonts w:ascii="Courier New" w:eastAsia="Courier New" w:hAnsi="Courier New" w:cs="Courier New"/>
-                <w:sz w:val="19"/>
-                <w:szCs w:val="19"/>
-              </w:rPr>
-              <w:t xml:space="preserve">       today's date and the calculated total cost</w:t>
-            </w:r>
-          </w:p>
-          <w:p>
-            <w:r>
-              <w:rPr>
-                <w:rFonts w:ascii="Courier New" w:eastAsia="Courier New" w:hAnsi="Courier New" w:cs="Courier New"/>
-                <w:sz w:val="19"/>
-                <w:szCs w:val="19"/>
-              </w:rPr>
-              <w:t xml:space="preserve">GET the new </w:t>
-            </w:r>
-            <w:proofErr w:type="spellStart"/>
-            <w:r>
-              <w:rPr>
-                <w:rFonts w:ascii="Courier New" w:eastAsia="Courier New" w:hAnsi="Courier New" w:cs="Courier New"/>
-                <w:sz w:val="19"/>
-                <w:szCs w:val="19"/>
-              </w:rPr>
-              <w:t>BookingID</w:t>
-            </w:r>
-            <w:proofErr w:type="spellEnd"/>
-            <w:r>
-              <w:rPr>
-                <w:rFonts w:ascii="Courier New" w:eastAsia="Courier New" w:hAnsi="Courier New" w:cs="Courier New"/>
-                <w:sz w:val="19"/>
-                <w:szCs w:val="19"/>
-              </w:rPr>
-              <w:t xml:space="preserve"> that was created</w:t>
-            </w:r>
-          </w:p>
-          <w:p>
-            <w:r>
-              <w:rPr>
-                <w:rFonts w:ascii="Courier New" w:eastAsia="Courier New" w:hAnsi="Courier New" w:cs="Courier New"/>
-                <w:sz w:val="19"/>
-                <w:szCs w:val="19"/>
-              </w:rPr>
-              <w:t>FOR each chosen seat</w:t>
-            </w:r>
-          </w:p>
-          <w:p>
-            <w:r>
-              <w:rPr>
-                <w:rFonts w:ascii="Courier New" w:eastAsia="Courier New" w:hAnsi="Courier New" w:cs="Courier New"/>
-                <w:sz w:val="19"/>
-                <w:szCs w:val="19"/>
-              </w:rPr>
-              <w:t xml:space="preserve">    INSERT a record into </w:t>
-            </w:r>
-            <w:proofErr w:type="spellStart"/>
-            <w:r>
-              <w:rPr>
-                <w:rFonts w:ascii="Courier New" w:eastAsia="Courier New" w:hAnsi="Courier New" w:cs="Courier New"/>
-                <w:sz w:val="19"/>
-                <w:szCs w:val="19"/>
-              </w:rPr>
-              <w:t>tblBookingSeat</w:t>
-            </w:r>
-            <w:proofErr w:type="spellEnd"/>
-            <w:r>
-              <w:rPr>
-                <w:rFonts w:ascii="Courier New" w:eastAsia="Courier New" w:hAnsi="Courier New" w:cs="Courier New"/>
-                <w:sz w:val="19"/>
-                <w:szCs w:val="19"/>
-              </w:rPr>
-              <w:t xml:space="preserve"> linking </w:t>
-            </w:r>
-            <w:proofErr w:type="spellStart"/>
-            <w:r>
-              <w:rPr>
-                <w:rFonts w:ascii="Courier New" w:eastAsia="Courier New" w:hAnsi="Courier New" w:cs="Courier New"/>
-                <w:sz w:val="19"/>
-                <w:szCs w:val="19"/>
-              </w:rPr>
-              <w:t>BookingID</w:t>
-            </w:r>
-            <w:proofErr w:type="spellEnd"/>
-            <w:r>
-              <w:rPr>
-                <w:rFonts w:ascii="Courier New" w:eastAsia="Courier New" w:hAnsi="Courier New" w:cs="Courier New"/>
-                <w:sz w:val="19"/>
-                <w:szCs w:val="19"/>
-              </w:rPr>
-              <w:t xml:space="preserve"> to </w:t>
-            </w:r>
-            <w:proofErr w:type="spellStart"/>
-            <w:r>
-              <w:rPr>
-                <w:rFonts w:ascii="Courier New" w:eastAsia="Courier New" w:hAnsi="Courier New" w:cs="Courier New"/>
-                <w:sz w:val="19"/>
-                <w:szCs w:val="19"/>
-              </w:rPr>
-              <w:t>SeatID</w:t>
-            </w:r>
-            <w:proofErr w:type="spellEnd"/>
+              <w:t xml:space="preserve">    INSERT a record into tblBookingSeat linking BookingID to SeatID</w:t>
+            </w:r>
           </w:p>
           <w:p>
             <w:r>
@@ -10348,18 +8660,18 @@
                 <w:sz w:val="19"/>
                 <w:szCs w:val="19"/>
               </w:rPr>
-              <w:t xml:space="preserve">GET the selected screening and its </w:t>
-            </w:r>
-            <w:proofErr w:type="spellStart"/>
+              <w:t>GET the selected screening and its ScreenID</w:t>
+            </w:r>
+          </w:p>
+          <w:p>
             <w:r>
               <w:rPr>
                 <w:rFonts w:ascii="Courier New" w:eastAsia="Courier New" w:hAnsi="Courier New" w:cs="Courier New"/>
                 <w:sz w:val="19"/>
                 <w:szCs w:val="19"/>
               </w:rPr>
-              <w:t>ScreenID</w:t>
-            </w:r>
-            <w:proofErr w:type="spellEnd"/>
+              <w:t>SELECT all seats for that screen from tblSeat,</w:t>
+            </w:r>
           </w:p>
           <w:p>
             <w:r>
@@ -10368,66 +8680,28 @@
                 <w:sz w:val="19"/>
                 <w:szCs w:val="19"/>
               </w:rPr>
-              <w:t xml:space="preserve">SELECT all seats for that screen from </w:t>
-            </w:r>
-            <w:proofErr w:type="spellStart"/>
+              <w:t xml:space="preserve">       ordered by row then seat number</w:t>
+            </w:r>
+          </w:p>
+          <w:p>
             <w:r>
               <w:rPr>
                 <w:rFonts w:ascii="Courier New" w:eastAsia="Courier New" w:hAnsi="Courier New" w:cs="Courier New"/>
                 <w:sz w:val="19"/>
                 <w:szCs w:val="19"/>
               </w:rPr>
-              <w:t>tblSeat</w:t>
-            </w:r>
-            <w:proofErr w:type="spellEnd"/>
+              <w:t>SELECT all seats already booked for this screening</w:t>
+            </w:r>
+          </w:p>
+          <w:p>
             <w:r>
               <w:rPr>
                 <w:rFonts w:ascii="Courier New" w:eastAsia="Courier New" w:hAnsi="Courier New" w:cs="Courier New"/>
                 <w:sz w:val="19"/>
                 <w:szCs w:val="19"/>
               </w:rPr>
-              <w:t>,</w:t>
-            </w:r>
-          </w:p>
-          <w:p>
-            <w:r>
-              <w:rPr>
-                <w:rFonts w:ascii="Courier New" w:eastAsia="Courier New" w:hAnsi="Courier New" w:cs="Courier New"/>
-                <w:sz w:val="19"/>
-                <w:szCs w:val="19"/>
-              </w:rPr>
-              <w:t xml:space="preserve">       ordered by row then seat number</w:t>
-            </w:r>
-          </w:p>
-          <w:p>
-            <w:r>
-              <w:rPr>
-                <w:rFonts w:ascii="Courier New" w:eastAsia="Courier New" w:hAnsi="Courier New" w:cs="Courier New"/>
-                <w:sz w:val="19"/>
-                <w:szCs w:val="19"/>
-              </w:rPr>
-              <w:t>SELECT all seats already booked for this screening</w:t>
-            </w:r>
-          </w:p>
-          <w:p>
-            <w:r>
-              <w:rPr>
-                <w:rFonts w:ascii="Courier New" w:eastAsia="Courier New" w:hAnsi="Courier New" w:cs="Courier New"/>
-                <w:sz w:val="19"/>
-                <w:szCs w:val="19"/>
-              </w:rPr>
-              <w:t xml:space="preserve">       from </w:t>
-            </w:r>
-            <w:proofErr w:type="spellStart"/>
-            <w:r>
-              <w:rPr>
-                <w:rFonts w:ascii="Courier New" w:eastAsia="Courier New" w:hAnsi="Courier New" w:cs="Courier New"/>
-                <w:sz w:val="19"/>
-                <w:szCs w:val="19"/>
-              </w:rPr>
-              <w:t>tblBookingSeat</w:t>
-            </w:r>
-            <w:proofErr w:type="spellEnd"/>
+              <w:t xml:space="preserve">       from tblBookingSeat</w:t>
+            </w:r>
           </w:p>
           <w:p>
             <w:r>
@@ -10570,25 +8844,27 @@
                 <w:sz w:val="19"/>
                 <w:szCs w:val="19"/>
               </w:rPr>
-              <w:t xml:space="preserve">SET </w:t>
-            </w:r>
-            <w:proofErr w:type="spellStart"/>
+              <w:t>SET foodTotal to 0</w:t>
+            </w:r>
+          </w:p>
+          <w:p>
             <w:r>
               <w:rPr>
                 <w:rFonts w:ascii="Courier New" w:eastAsia="Courier New" w:hAnsi="Courier New" w:cs="Courier New"/>
                 <w:sz w:val="19"/>
                 <w:szCs w:val="19"/>
               </w:rPr>
-              <w:t>foodTotal</w:t>
-            </w:r>
-            <w:proofErr w:type="spellEnd"/>
+              <w:t>FOR each food item the customer has added</w:t>
+            </w:r>
+          </w:p>
+          <w:p>
             <w:r>
               <w:rPr>
                 <w:rFonts w:ascii="Courier New" w:eastAsia="Courier New" w:hAnsi="Courier New" w:cs="Courier New"/>
                 <w:sz w:val="19"/>
                 <w:szCs w:val="19"/>
               </w:rPr>
-              <w:t xml:space="preserve"> to 0</w:t>
+              <w:t xml:space="preserve">    LOOK UP the item price in tblFoodItem</w:t>
             </w:r>
           </w:p>
           <w:p>
@@ -10598,7 +8874,7 @@
                 <w:sz w:val="19"/>
                 <w:szCs w:val="19"/>
               </w:rPr>
-              <w:t>FOR each food item the customer has added</w:t>
+              <w:t xml:space="preserve">    CALCULATE lineCost as price multiplied by quantity</w:t>
             </w:r>
           </w:p>
           <w:p>
@@ -10608,18 +8884,18 @@
                 <w:sz w:val="19"/>
                 <w:szCs w:val="19"/>
               </w:rPr>
-              <w:t xml:space="preserve">    LOOK UP the item price in </w:t>
-            </w:r>
-            <w:proofErr w:type="spellStart"/>
+              <w:t xml:space="preserve">    ADD lineCost to foodTotal</w:t>
+            </w:r>
+          </w:p>
+          <w:p>
             <w:r>
               <w:rPr>
                 <w:rFonts w:ascii="Courier New" w:eastAsia="Courier New" w:hAnsi="Courier New" w:cs="Courier New"/>
                 <w:sz w:val="19"/>
                 <w:szCs w:val="19"/>
               </w:rPr>
-              <w:t>tblFoodItem</w:t>
-            </w:r>
-            <w:proofErr w:type="spellEnd"/>
+              <w:t>NEXT item</w:t>
+            </w:r>
           </w:p>
           <w:p>
             <w:r>
@@ -10628,185 +8904,27 @@
                 <w:sz w:val="19"/>
                 <w:szCs w:val="19"/>
               </w:rPr>
-              <w:t xml:space="preserve">    CALCULATE </w:t>
-            </w:r>
-            <w:proofErr w:type="spellStart"/>
+              <w:t>CALCULATE seatTotal as number of seats times the ticket price</w:t>
+            </w:r>
+          </w:p>
+          <w:p>
             <w:r>
               <w:rPr>
                 <w:rFonts w:ascii="Courier New" w:eastAsia="Courier New" w:hAnsi="Courier New" w:cs="Courier New"/>
                 <w:sz w:val="19"/>
                 <w:szCs w:val="19"/>
               </w:rPr>
-              <w:t>lineCost</w:t>
-            </w:r>
-            <w:proofErr w:type="spellEnd"/>
+              <w:t>CALCULATE totalCost as seatTotal plus foodTotal</w:t>
+            </w:r>
+          </w:p>
+          <w:p>
             <w:r>
               <w:rPr>
                 <w:rFonts w:ascii="Courier New" w:eastAsia="Courier New" w:hAnsi="Courier New" w:cs="Courier New"/>
                 <w:sz w:val="19"/>
                 <w:szCs w:val="19"/>
               </w:rPr>
-              <w:t xml:space="preserve"> as price multiplied by quantity</w:t>
-            </w:r>
-          </w:p>
-          <w:p>
-            <w:r>
-              <w:rPr>
-                <w:rFonts w:ascii="Courier New" w:eastAsia="Courier New" w:hAnsi="Courier New" w:cs="Courier New"/>
-                <w:sz w:val="19"/>
-                <w:szCs w:val="19"/>
-              </w:rPr>
-              <w:t xml:space="preserve">    ADD </w:t>
-            </w:r>
-            <w:proofErr w:type="spellStart"/>
-            <w:r>
-              <w:rPr>
-                <w:rFonts w:ascii="Courier New" w:eastAsia="Courier New" w:hAnsi="Courier New" w:cs="Courier New"/>
-                <w:sz w:val="19"/>
-                <w:szCs w:val="19"/>
-              </w:rPr>
-              <w:t>lineCost</w:t>
-            </w:r>
-            <w:proofErr w:type="spellEnd"/>
-            <w:r>
-              <w:rPr>
-                <w:rFonts w:ascii="Courier New" w:eastAsia="Courier New" w:hAnsi="Courier New" w:cs="Courier New"/>
-                <w:sz w:val="19"/>
-                <w:szCs w:val="19"/>
-              </w:rPr>
-              <w:t xml:space="preserve"> to </w:t>
-            </w:r>
-            <w:proofErr w:type="spellStart"/>
-            <w:r>
-              <w:rPr>
-                <w:rFonts w:ascii="Courier New" w:eastAsia="Courier New" w:hAnsi="Courier New" w:cs="Courier New"/>
-                <w:sz w:val="19"/>
-                <w:szCs w:val="19"/>
-              </w:rPr>
-              <w:t>foodTotal</w:t>
-            </w:r>
-            <w:proofErr w:type="spellEnd"/>
-          </w:p>
-          <w:p>
-            <w:r>
-              <w:rPr>
-                <w:rFonts w:ascii="Courier New" w:eastAsia="Courier New" w:hAnsi="Courier New" w:cs="Courier New"/>
-                <w:sz w:val="19"/>
-                <w:szCs w:val="19"/>
-              </w:rPr>
-              <w:t>NEXT item</w:t>
-            </w:r>
-          </w:p>
-          <w:p>
-            <w:r>
-              <w:rPr>
-                <w:rFonts w:ascii="Courier New" w:eastAsia="Courier New" w:hAnsi="Courier New" w:cs="Courier New"/>
-                <w:sz w:val="19"/>
-                <w:szCs w:val="19"/>
-              </w:rPr>
-              <w:t xml:space="preserve">CALCULATE </w:t>
-            </w:r>
-            <w:proofErr w:type="spellStart"/>
-            <w:r>
-              <w:rPr>
-                <w:rFonts w:ascii="Courier New" w:eastAsia="Courier New" w:hAnsi="Courier New" w:cs="Courier New"/>
-                <w:sz w:val="19"/>
-                <w:szCs w:val="19"/>
-              </w:rPr>
-              <w:t>seatTotal</w:t>
-            </w:r>
-            <w:proofErr w:type="spellEnd"/>
-            <w:r>
-              <w:rPr>
-                <w:rFonts w:ascii="Courier New" w:eastAsia="Courier New" w:hAnsi="Courier New" w:cs="Courier New"/>
-                <w:sz w:val="19"/>
-                <w:szCs w:val="19"/>
-              </w:rPr>
-              <w:t xml:space="preserve"> as number of seats times the ticket price</w:t>
-            </w:r>
-          </w:p>
-          <w:p>
-            <w:r>
-              <w:rPr>
-                <w:rFonts w:ascii="Courier New" w:eastAsia="Courier New" w:hAnsi="Courier New" w:cs="Courier New"/>
-                <w:sz w:val="19"/>
-                <w:szCs w:val="19"/>
-              </w:rPr>
-              <w:t xml:space="preserve">CALCULATE </w:t>
-            </w:r>
-            <w:proofErr w:type="spellStart"/>
-            <w:r>
-              <w:rPr>
-                <w:rFonts w:ascii="Courier New" w:eastAsia="Courier New" w:hAnsi="Courier New" w:cs="Courier New"/>
-                <w:sz w:val="19"/>
-                <w:szCs w:val="19"/>
-              </w:rPr>
-              <w:t>totalCost</w:t>
-            </w:r>
-            <w:proofErr w:type="spellEnd"/>
-            <w:r>
-              <w:rPr>
-                <w:rFonts w:ascii="Courier New" w:eastAsia="Courier New" w:hAnsi="Courier New" w:cs="Courier New"/>
-                <w:sz w:val="19"/>
-                <w:szCs w:val="19"/>
-              </w:rPr>
-              <w:t xml:space="preserve"> as </w:t>
-            </w:r>
-            <w:proofErr w:type="spellStart"/>
-            <w:r>
-              <w:rPr>
-                <w:rFonts w:ascii="Courier New" w:eastAsia="Courier New" w:hAnsi="Courier New" w:cs="Courier New"/>
-                <w:sz w:val="19"/>
-                <w:szCs w:val="19"/>
-              </w:rPr>
-              <w:t>seatTotal</w:t>
-            </w:r>
-            <w:proofErr w:type="spellEnd"/>
-            <w:r>
-              <w:rPr>
-                <w:rFonts w:ascii="Courier New" w:eastAsia="Courier New" w:hAnsi="Courier New" w:cs="Courier New"/>
-                <w:sz w:val="19"/>
-                <w:szCs w:val="19"/>
-              </w:rPr>
-              <w:t xml:space="preserve"> plus </w:t>
-            </w:r>
-            <w:proofErr w:type="spellStart"/>
-            <w:r>
-              <w:rPr>
-                <w:rFonts w:ascii="Courier New" w:eastAsia="Courier New" w:hAnsi="Courier New" w:cs="Courier New"/>
-                <w:sz w:val="19"/>
-                <w:szCs w:val="19"/>
-              </w:rPr>
-              <w:t>foodTotal</w:t>
-            </w:r>
-            <w:proofErr w:type="spellEnd"/>
-          </w:p>
-          <w:p>
-            <w:r>
-              <w:rPr>
-                <w:rFonts w:ascii="Courier New" w:eastAsia="Courier New" w:hAnsi="Courier New" w:cs="Courier New"/>
-                <w:sz w:val="19"/>
-                <w:szCs w:val="19"/>
-              </w:rPr>
-              <w:t xml:space="preserve">DISPLAY </w:t>
-            </w:r>
-            <w:proofErr w:type="spellStart"/>
-            <w:r>
-              <w:rPr>
-                <w:rFonts w:ascii="Courier New" w:eastAsia="Courier New" w:hAnsi="Courier New" w:cs="Courier New"/>
-                <w:sz w:val="19"/>
-                <w:szCs w:val="19"/>
-              </w:rPr>
-              <w:t>totalCost</w:t>
-            </w:r>
-            <w:proofErr w:type="spellEnd"/>
-            <w:r>
-              <w:rPr>
-                <w:rFonts w:ascii="Courier New" w:eastAsia="Courier New" w:hAnsi="Courier New" w:cs="Courier New"/>
-                <w:sz w:val="19"/>
-                <w:szCs w:val="19"/>
-              </w:rPr>
-              <w:t xml:space="preserve"> to the customer</w:t>
+              <w:t>DISPLAY totalCost to the customer</w:t>
             </w:r>
           </w:p>
         </w:tc>
@@ -10920,43 +9038,47 @@
                 <w:sz w:val="19"/>
                 <w:szCs w:val="19"/>
               </w:rPr>
-              <w:t xml:space="preserve">    SELECT all bookings from </w:t>
-            </w:r>
-            <w:proofErr w:type="spellStart"/>
+              <w:t xml:space="preserve">    SELECT all bookings from tblBooking where BookingDate is</w:t>
+            </w:r>
+          </w:p>
+          <w:p>
             <w:r>
               <w:rPr>
                 <w:rFonts w:ascii="Courier New" w:eastAsia="Courier New" w:hAnsi="Courier New" w:cs="Courier New"/>
                 <w:sz w:val="19"/>
                 <w:szCs w:val="19"/>
               </w:rPr>
-              <w:t>tblBooking</w:t>
-            </w:r>
-            <w:proofErr w:type="spellEnd"/>
+              <w:t xml:space="preserve">        between the start and end date (SQL SELECT)</w:t>
+            </w:r>
+          </w:p>
+          <w:p>
             <w:r>
               <w:rPr>
                 <w:rFonts w:ascii="Courier New" w:eastAsia="Courier New" w:hAnsi="Courier New" w:cs="Courier New"/>
                 <w:sz w:val="19"/>
                 <w:szCs w:val="19"/>
               </w:rPr>
-              <w:t xml:space="preserve"> where </w:t>
-            </w:r>
-            <w:proofErr w:type="spellStart"/>
+              <w:t xml:space="preserve">    SET totalTickets to 0</w:t>
+            </w:r>
+          </w:p>
+          <w:p>
             <w:r>
               <w:rPr>
                 <w:rFonts w:ascii="Courier New" w:eastAsia="Courier New" w:hAnsi="Courier New" w:cs="Courier New"/>
                 <w:sz w:val="19"/>
                 <w:szCs w:val="19"/>
               </w:rPr>
-              <w:t>BookingDate</w:t>
-            </w:r>
-            <w:proofErr w:type="spellEnd"/>
+              <w:t xml:space="preserve">    SET totalRevenue to 0</w:t>
+            </w:r>
+          </w:p>
+          <w:p>
             <w:r>
               <w:rPr>
                 <w:rFonts w:ascii="Courier New" w:eastAsia="Courier New" w:hAnsi="Courier New" w:cs="Courier New"/>
                 <w:sz w:val="19"/>
                 <w:szCs w:val="19"/>
               </w:rPr>
-              <w:t xml:space="preserve"> is</w:t>
+              <w:t xml:space="preserve">    FOR each booking returned</w:t>
             </w:r>
           </w:p>
           <w:p>
@@ -10966,7 +9088,7 @@
                 <w:sz w:val="19"/>
                 <w:szCs w:val="19"/>
               </w:rPr>
-              <w:t xml:space="preserve">        between the start and end date (SQL SELECT)</w:t>
+              <w:t xml:space="preserve">        COUNT the seats linked to it in tblBookingSeat</w:t>
             </w:r>
           </w:p>
           <w:p>
@@ -10976,25 +9098,27 @@
                 <w:sz w:val="19"/>
                 <w:szCs w:val="19"/>
               </w:rPr>
-              <w:t xml:space="preserve">    SET </w:t>
-            </w:r>
-            <w:proofErr w:type="spellStart"/>
+              <w:t xml:space="preserve">        ADD that count to totalTickets</w:t>
+            </w:r>
+          </w:p>
+          <w:p>
             <w:r>
               <w:rPr>
                 <w:rFonts w:ascii="Courier New" w:eastAsia="Courier New" w:hAnsi="Courier New" w:cs="Courier New"/>
                 <w:sz w:val="19"/>
                 <w:szCs w:val="19"/>
               </w:rPr>
-              <w:t>totalTickets</w:t>
-            </w:r>
-            <w:proofErr w:type="spellEnd"/>
+              <w:t xml:space="preserve">        ADD the booking's TotalCost to totalRevenue</w:t>
+            </w:r>
+          </w:p>
+          <w:p>
             <w:r>
               <w:rPr>
                 <w:rFonts w:ascii="Courier New" w:eastAsia="Courier New" w:hAnsi="Courier New" w:cs="Courier New"/>
                 <w:sz w:val="19"/>
                 <w:szCs w:val="19"/>
               </w:rPr>
-              <w:t xml:space="preserve"> to 0</w:t>
+              <w:t xml:space="preserve">    NEXT booking</w:t>
             </w:r>
           </w:p>
           <w:p>
@@ -11004,162 +9128,8 @@
                 <w:sz w:val="19"/>
                 <w:szCs w:val="19"/>
               </w:rPr>
-              <w:t xml:space="preserve">    SET </w:t>
-            </w:r>
-            <w:proofErr w:type="spellStart"/>
-            <w:r>
-              <w:rPr>
-                <w:rFonts w:ascii="Courier New" w:eastAsia="Courier New" w:hAnsi="Courier New" w:cs="Courier New"/>
-                <w:sz w:val="19"/>
-                <w:szCs w:val="19"/>
-              </w:rPr>
-              <w:t>totalRevenue</w:t>
-            </w:r>
-            <w:proofErr w:type="spellEnd"/>
-            <w:r>
-              <w:rPr>
-                <w:rFonts w:ascii="Courier New" w:eastAsia="Courier New" w:hAnsi="Courier New" w:cs="Courier New"/>
-                <w:sz w:val="19"/>
-                <w:szCs w:val="19"/>
-              </w:rPr>
-              <w:t xml:space="preserve"> to 0</w:t>
-            </w:r>
-          </w:p>
-          <w:p>
-            <w:r>
-              <w:rPr>
-                <w:rFonts w:ascii="Courier New" w:eastAsia="Courier New" w:hAnsi="Courier New" w:cs="Courier New"/>
-                <w:sz w:val="19"/>
-                <w:szCs w:val="19"/>
-              </w:rPr>
-              <w:t xml:space="preserve">    FOR each booking returned</w:t>
-            </w:r>
-          </w:p>
-          <w:p>
-            <w:r>
-              <w:rPr>
-                <w:rFonts w:ascii="Courier New" w:eastAsia="Courier New" w:hAnsi="Courier New" w:cs="Courier New"/>
-                <w:sz w:val="19"/>
-                <w:szCs w:val="19"/>
-              </w:rPr>
-              <w:t xml:space="preserve">        COUNT the seats linked to it in </w:t>
-            </w:r>
-            <w:proofErr w:type="spellStart"/>
-            <w:r>
-              <w:rPr>
-                <w:rFonts w:ascii="Courier New" w:eastAsia="Courier New" w:hAnsi="Courier New" w:cs="Courier New"/>
-                <w:sz w:val="19"/>
-                <w:szCs w:val="19"/>
-              </w:rPr>
-              <w:t>tblBookingSeat</w:t>
-            </w:r>
-            <w:proofErr w:type="spellEnd"/>
-          </w:p>
-          <w:p>
-            <w:r>
-              <w:rPr>
-                <w:rFonts w:ascii="Courier New" w:eastAsia="Courier New" w:hAnsi="Courier New" w:cs="Courier New"/>
-                <w:sz w:val="19"/>
-                <w:szCs w:val="19"/>
-              </w:rPr>
-              <w:t xml:space="preserve">        ADD that count to </w:t>
-            </w:r>
-            <w:proofErr w:type="spellStart"/>
-            <w:r>
-              <w:rPr>
-                <w:rFonts w:ascii="Courier New" w:eastAsia="Courier New" w:hAnsi="Courier New" w:cs="Courier New"/>
-                <w:sz w:val="19"/>
-                <w:szCs w:val="19"/>
-              </w:rPr>
-              <w:t>totalTickets</w:t>
-            </w:r>
-            <w:proofErr w:type="spellEnd"/>
-          </w:p>
-          <w:p>
-            <w:r>
-              <w:rPr>
-                <w:rFonts w:ascii="Courier New" w:eastAsia="Courier New" w:hAnsi="Courier New" w:cs="Courier New"/>
-                <w:sz w:val="19"/>
-                <w:szCs w:val="19"/>
-              </w:rPr>
-              <w:t xml:space="preserve">        ADD the booking's </w:t>
-            </w:r>
-            <w:proofErr w:type="spellStart"/>
-            <w:r>
-              <w:rPr>
-                <w:rFonts w:ascii="Courier New" w:eastAsia="Courier New" w:hAnsi="Courier New" w:cs="Courier New"/>
-                <w:sz w:val="19"/>
-                <w:szCs w:val="19"/>
-              </w:rPr>
-              <w:t>TotalCost</w:t>
-            </w:r>
-            <w:proofErr w:type="spellEnd"/>
-            <w:r>
-              <w:rPr>
-                <w:rFonts w:ascii="Courier New" w:eastAsia="Courier New" w:hAnsi="Courier New" w:cs="Courier New"/>
-                <w:sz w:val="19"/>
-                <w:szCs w:val="19"/>
-              </w:rPr>
-              <w:t xml:space="preserve"> to </w:t>
-            </w:r>
-            <w:proofErr w:type="spellStart"/>
-            <w:r>
-              <w:rPr>
-                <w:rFonts w:ascii="Courier New" w:eastAsia="Courier New" w:hAnsi="Courier New" w:cs="Courier New"/>
-                <w:sz w:val="19"/>
-                <w:szCs w:val="19"/>
-              </w:rPr>
-              <w:t>totalRevenue</w:t>
-            </w:r>
-            <w:proofErr w:type="spellEnd"/>
-          </w:p>
-          <w:p>
-            <w:r>
-              <w:rPr>
-                <w:rFonts w:ascii="Courier New" w:eastAsia="Courier New" w:hAnsi="Courier New" w:cs="Courier New"/>
-                <w:sz w:val="19"/>
-                <w:szCs w:val="19"/>
-              </w:rPr>
-              <w:t xml:space="preserve">    NEXT booking</w:t>
-            </w:r>
-          </w:p>
-          <w:p>
-            <w:r>
-              <w:rPr>
-                <w:rFonts w:ascii="Courier New" w:eastAsia="Courier New" w:hAnsi="Courier New" w:cs="Courier New"/>
-                <w:sz w:val="19"/>
-                <w:szCs w:val="19"/>
-              </w:rPr>
-              <w:t xml:space="preserve">    DISPLAY </w:t>
-            </w:r>
-            <w:proofErr w:type="spellStart"/>
-            <w:r>
-              <w:rPr>
-                <w:rFonts w:ascii="Courier New" w:eastAsia="Courier New" w:hAnsi="Courier New" w:cs="Courier New"/>
-                <w:sz w:val="19"/>
-                <w:szCs w:val="19"/>
-              </w:rPr>
-              <w:t>totalTickets</w:t>
-            </w:r>
-            <w:proofErr w:type="spellEnd"/>
-            <w:r>
-              <w:rPr>
-                <w:rFonts w:ascii="Courier New" w:eastAsia="Courier New" w:hAnsi="Courier New" w:cs="Courier New"/>
-                <w:sz w:val="19"/>
-                <w:szCs w:val="19"/>
-              </w:rPr>
-              <w:t xml:space="preserve"> and </w:t>
-            </w:r>
-            <w:proofErr w:type="spellStart"/>
-            <w:r>
-              <w:rPr>
-                <w:rFonts w:ascii="Courier New" w:eastAsia="Courier New" w:hAnsi="Courier New" w:cs="Courier New"/>
-                <w:sz w:val="19"/>
-                <w:szCs w:val="19"/>
-              </w:rPr>
-              <w:t>totalRevenue</w:t>
-            </w:r>
-            <w:proofErr w:type="spellEnd"/>
+              <w:t xml:space="preserve">    DISPLAY totalTickets and totalRevenue</w:t>
+            </w:r>
           </w:p>
           <w:p>
             <w:r>
@@ -11282,18 +9252,8 @@
                 <w:sz w:val="19"/>
                 <w:szCs w:val="19"/>
               </w:rPr>
-              <w:t xml:space="preserve">    SELECT bookings joined to customers where </w:t>
-            </w:r>
-            <w:proofErr w:type="spellStart"/>
-            <w:r>
-              <w:rPr>
-                <w:rFonts w:ascii="Courier New" w:eastAsia="Courier New" w:hAnsi="Courier New" w:cs="Courier New"/>
-                <w:sz w:val="19"/>
-                <w:szCs w:val="19"/>
-              </w:rPr>
-              <w:t>CustomerSurname</w:t>
-            </w:r>
-            <w:proofErr w:type="spellEnd"/>
+              <w:t xml:space="preserve">    SELECT bookings joined to customers where CustomerSurname</w:t>
+            </w:r>
           </w:p>
           <w:p>
             <w:r>
@@ -11391,15 +9351,7 @@
         <w:spacing w:after="160" w:line="276" w:lineRule="auto"/>
       </w:pPr>
       <w:r>
-        <w:t xml:space="preserve">When a booking is cancelled its seats need to become available again. Because availability is worked out from the link table, simply removing the booking's records from </w:t>
-      </w:r>
-      <w:proofErr w:type="spellStart"/>
-      <w:r>
-        <w:t>tblBookingSeat</w:t>
-      </w:r>
-      <w:proofErr w:type="spellEnd"/>
-      <w:r>
-        <w:t xml:space="preserve"> frees those seats automatically with no separate step needed.</w:t>
+        <w:t>When a booking is cancelled its seats need to become available again. Because availability is worked out from the link table, simply removing the booking's records from tblBookingSeat frees those seats automatically with no separate step needed.</w:t>
       </w:r>
     </w:p>
     <w:tbl>
@@ -11439,25 +9391,27 @@
                 <w:sz w:val="19"/>
                 <w:szCs w:val="19"/>
               </w:rPr>
-              <w:t xml:space="preserve">GET the </w:t>
-            </w:r>
-            <w:proofErr w:type="spellStart"/>
+              <w:t>GET the BookingID of the booking to cancel</w:t>
+            </w:r>
+          </w:p>
+          <w:p>
             <w:r>
               <w:rPr>
                 <w:rFonts w:ascii="Courier New" w:eastAsia="Courier New" w:hAnsi="Courier New" w:cs="Courier New"/>
                 <w:sz w:val="19"/>
                 <w:szCs w:val="19"/>
               </w:rPr>
-              <w:t>BookingID</w:t>
-            </w:r>
-            <w:proofErr w:type="spellEnd"/>
+              <w:t>DISPLAY "Are you sure you want to cancel this booking?"</w:t>
+            </w:r>
+          </w:p>
+          <w:p>
             <w:r>
               <w:rPr>
                 <w:rFonts w:ascii="Courier New" w:eastAsia="Courier New" w:hAnsi="Courier New" w:cs="Courier New"/>
                 <w:sz w:val="19"/>
                 <w:szCs w:val="19"/>
               </w:rPr>
-              <w:t xml:space="preserve"> of the booking to cancel</w:t>
+              <w:t>IF the user confirms THEN</w:t>
             </w:r>
           </w:p>
           <w:p>
@@ -11467,7 +9421,7 @@
                 <w:sz w:val="19"/>
                 <w:szCs w:val="19"/>
               </w:rPr>
-              <w:t>DISPLAY "Are you sure you want to cancel this booking?"</w:t>
+              <w:t xml:space="preserve">    DELETE all records in tblBookingSeat for that BookingID</w:t>
             </w:r>
           </w:p>
           <w:p>
@@ -11477,7 +9431,7 @@
                 <w:sz w:val="19"/>
                 <w:szCs w:val="19"/>
               </w:rPr>
-              <w:t>IF the user confirms THEN</w:t>
+              <w:t xml:space="preserve">    DELETE all records in tblOrderItem for that BookingID</w:t>
             </w:r>
           </w:p>
           <w:p>
@@ -11487,112 +9441,8 @@
                 <w:sz w:val="19"/>
                 <w:szCs w:val="19"/>
               </w:rPr>
-              <w:t xml:space="preserve">    DELETE all records in </w:t>
-            </w:r>
-            <w:proofErr w:type="spellStart"/>
-            <w:r>
-              <w:rPr>
-                <w:rFonts w:ascii="Courier New" w:eastAsia="Courier New" w:hAnsi="Courier New" w:cs="Courier New"/>
-                <w:sz w:val="19"/>
-                <w:szCs w:val="19"/>
-              </w:rPr>
-              <w:t>tblBookingSeat</w:t>
-            </w:r>
-            <w:proofErr w:type="spellEnd"/>
-            <w:r>
-              <w:rPr>
-                <w:rFonts w:ascii="Courier New" w:eastAsia="Courier New" w:hAnsi="Courier New" w:cs="Courier New"/>
-                <w:sz w:val="19"/>
-                <w:szCs w:val="19"/>
-              </w:rPr>
-              <w:t xml:space="preserve"> for that </w:t>
-            </w:r>
-            <w:proofErr w:type="spellStart"/>
-            <w:r>
-              <w:rPr>
-                <w:rFonts w:ascii="Courier New" w:eastAsia="Courier New" w:hAnsi="Courier New" w:cs="Courier New"/>
-                <w:sz w:val="19"/>
-                <w:szCs w:val="19"/>
-              </w:rPr>
-              <w:t>BookingID</w:t>
-            </w:r>
-            <w:proofErr w:type="spellEnd"/>
-          </w:p>
-          <w:p>
-            <w:r>
-              <w:rPr>
-                <w:rFonts w:ascii="Courier New" w:eastAsia="Courier New" w:hAnsi="Courier New" w:cs="Courier New"/>
-                <w:sz w:val="19"/>
-                <w:szCs w:val="19"/>
-              </w:rPr>
-              <w:t xml:space="preserve">    DELETE all records in </w:t>
-            </w:r>
-            <w:proofErr w:type="spellStart"/>
-            <w:r>
-              <w:rPr>
-                <w:rFonts w:ascii="Courier New" w:eastAsia="Courier New" w:hAnsi="Courier New" w:cs="Courier New"/>
-                <w:sz w:val="19"/>
-                <w:szCs w:val="19"/>
-              </w:rPr>
-              <w:t>tblOrderItem</w:t>
-            </w:r>
-            <w:proofErr w:type="spellEnd"/>
-            <w:r>
-              <w:rPr>
-                <w:rFonts w:ascii="Courier New" w:eastAsia="Courier New" w:hAnsi="Courier New" w:cs="Courier New"/>
-                <w:sz w:val="19"/>
-                <w:szCs w:val="19"/>
-              </w:rPr>
-              <w:t xml:space="preserve"> for that </w:t>
-            </w:r>
-            <w:proofErr w:type="spellStart"/>
-            <w:r>
-              <w:rPr>
-                <w:rFonts w:ascii="Courier New" w:eastAsia="Courier New" w:hAnsi="Courier New" w:cs="Courier New"/>
-                <w:sz w:val="19"/>
-                <w:szCs w:val="19"/>
-              </w:rPr>
-              <w:t>BookingID</w:t>
-            </w:r>
-            <w:proofErr w:type="spellEnd"/>
-          </w:p>
-          <w:p>
-            <w:r>
-              <w:rPr>
-                <w:rFonts w:ascii="Courier New" w:eastAsia="Courier New" w:hAnsi="Courier New" w:cs="Courier New"/>
-                <w:sz w:val="19"/>
-                <w:szCs w:val="19"/>
-              </w:rPr>
-              <w:t xml:space="preserve">    DELETE the record in </w:t>
-            </w:r>
-            <w:proofErr w:type="spellStart"/>
-            <w:r>
-              <w:rPr>
-                <w:rFonts w:ascii="Courier New" w:eastAsia="Courier New" w:hAnsi="Courier New" w:cs="Courier New"/>
-                <w:sz w:val="19"/>
-                <w:szCs w:val="19"/>
-              </w:rPr>
-              <w:t>tblBooking</w:t>
-            </w:r>
-            <w:proofErr w:type="spellEnd"/>
-            <w:r>
-              <w:rPr>
-                <w:rFonts w:ascii="Courier New" w:eastAsia="Courier New" w:hAnsi="Courier New" w:cs="Courier New"/>
-                <w:sz w:val="19"/>
-                <w:szCs w:val="19"/>
-              </w:rPr>
-              <w:t xml:space="preserve"> for that </w:t>
-            </w:r>
-            <w:proofErr w:type="spellStart"/>
-            <w:r>
-              <w:rPr>
-                <w:rFonts w:ascii="Courier New" w:eastAsia="Courier New" w:hAnsi="Courier New" w:cs="Courier New"/>
-                <w:sz w:val="19"/>
-                <w:szCs w:val="19"/>
-              </w:rPr>
-              <w:t>BookingID</w:t>
-            </w:r>
-            <w:proofErr w:type="spellEnd"/>
+              <w:t xml:space="preserve">    DELETE the record in tblBooking for that BookingID</w:t>
+            </w:r>
           </w:p>
           <w:p>
             <w:r>
@@ -11666,15 +9516,7 @@
         <w:spacing w:after="160" w:line="276" w:lineRule="auto"/>
       </w:pPr>
       <w:r>
-        <w:t xml:space="preserve">Validation is the process of checking that data entered into the system is sensible and complete before it is accepted and saved to the database. It cannot guarantee that data is correct, for example it cannot tell whether a customer has typed the right surname, but it can stop clearly invalid or missing data from getting in, which protects the integrity of the database. Several different types of validation are used across the </w:t>
-      </w:r>
-      <w:proofErr w:type="spellStart"/>
-      <w:r>
-        <w:t>Filmtopia</w:t>
-      </w:r>
-      <w:proofErr w:type="spellEnd"/>
-      <w:r>
-        <w:t xml:space="preserve"> system, and these are explained below before being applied to each input in turn.</w:t>
+        <w:t>Validation is the process of checking that data entered into the system is sensible and complete before it is accepted and saved to the database. It cannot guarantee that data is correct, for example it cannot tell whether a customer has typed the right surname, but it can stop clearly invalid or missing data from getting in, which protects the integrity of the database. Several different types of validation are used across the Filmtopia system, and these are explained below before being applied to each input in turn.</w:t>
       </w:r>
     </w:p>
     <w:p>
@@ -11682,15 +9524,7 @@
         <w:spacing w:after="160" w:line="276" w:lineRule="auto"/>
       </w:pPr>
       <w:r>
-        <w:t xml:space="preserve">A presence check makes sure a required field has not been left blank. A type check makes sure the data is of the right kind, for example that a number has been entered where a number is expected. A length check makes sure an entry is </w:t>
-      </w:r>
-      <w:proofErr w:type="spellStart"/>
-      <w:r>
-        <w:t>not longer</w:t>
-      </w:r>
-      <w:proofErr w:type="spellEnd"/>
-      <w:r>
-        <w:t xml:space="preserve"> than the field allows. A range check makes sure a number or date falls between sensible limits. A format check makes sure an entry follows a required pattern, such as a time being written as HH:MM. Finally a lookup check, sometimes called a referential check, makes sure that a chosen value actually exists in another table, for example that a screening is being created for a film that really exists. The tables below set out the validation applied to each input, grouped by the form it appears on.</w:t>
+        <w:t>A presence check makes sure a required field has not been left blank. A type check makes sure the data is of the right kind, for example that a number has been entered where a number is expected. A length check makes sure an entry is not longer than the field allows. A range check makes sure a number or date falls between sensible limits. A format check makes sure an entry follows a required pattern, such as a time being written as HH:MM. Finally a lookup check, sometimes called a referential check, makes sure that a chosen value actually exists in another table, for example that a screening is being created for a film that really exists. The tables below set out the validation applied to each input, grouped by the form it appears on.</w:t>
       </w:r>
     </w:p>
     <w:p>
@@ -12145,7 +9979,6 @@
             </w:tcMar>
           </w:tcPr>
           <w:p>
-            <w:proofErr w:type="spellStart"/>
             <w:r>
               <w:rPr>
                 <w:sz w:val="19"/>
@@ -12153,7 +9986,6 @@
               </w:rPr>
               <w:t>FilmTitle</w:t>
             </w:r>
-            <w:proofErr w:type="spellEnd"/>
           </w:p>
         </w:tc>
         <w:tc>
@@ -12229,7 +10061,6 @@
             </w:tcMar>
           </w:tcPr>
           <w:p>
-            <w:proofErr w:type="spellStart"/>
             <w:r>
               <w:rPr>
                 <w:sz w:val="19"/>
@@ -12237,7 +10068,6 @@
               </w:rPr>
               <w:t>FilmAgeRating</w:t>
             </w:r>
-            <w:proofErr w:type="spellEnd"/>
           </w:p>
         </w:tc>
         <w:tc>
@@ -12313,7 +10143,6 @@
             </w:tcMar>
           </w:tcPr>
           <w:p>
-            <w:proofErr w:type="spellStart"/>
             <w:r>
               <w:rPr>
                 <w:sz w:val="19"/>
@@ -12321,7 +10150,6 @@
               </w:rPr>
               <w:t>FilmDuration</w:t>
             </w:r>
-            <w:proofErr w:type="spellEnd"/>
           </w:p>
         </w:tc>
         <w:tc>
@@ -12397,7 +10225,6 @@
             </w:tcMar>
           </w:tcPr>
           <w:p>
-            <w:proofErr w:type="spellStart"/>
             <w:r>
               <w:rPr>
                 <w:sz w:val="19"/>
@@ -12405,7 +10232,6 @@
               </w:rPr>
               <w:t>FilmDescription</w:t>
             </w:r>
-            <w:proofErr w:type="spellEnd"/>
           </w:p>
         </w:tc>
         <w:tc>
@@ -12622,7 +10448,6 @@
             </w:tcMar>
           </w:tcPr>
           <w:p>
-            <w:proofErr w:type="spellStart"/>
             <w:r>
               <w:rPr>
                 <w:sz w:val="19"/>
@@ -12630,7 +10455,6 @@
               </w:rPr>
               <w:t>ScreenName</w:t>
             </w:r>
-            <w:proofErr w:type="spellEnd"/>
           </w:p>
         </w:tc>
         <w:tc>
@@ -12706,7 +10530,6 @@
             </w:tcMar>
           </w:tcPr>
           <w:p>
-            <w:proofErr w:type="spellStart"/>
             <w:r>
               <w:rPr>
                 <w:sz w:val="19"/>
@@ -12714,7 +10537,6 @@
               </w:rPr>
               <w:t>ScreenCapacity</w:t>
             </w:r>
-            <w:proofErr w:type="spellEnd"/>
           </w:p>
         </w:tc>
         <w:tc>
@@ -13116,7 +10938,6 @@
             </w:tcMar>
           </w:tcPr>
           <w:p>
-            <w:proofErr w:type="spellStart"/>
             <w:r>
               <w:rPr>
                 <w:sz w:val="19"/>
@@ -13124,7 +10945,6 @@
               </w:rPr>
               <w:t>ScreeningDate</w:t>
             </w:r>
-            <w:proofErr w:type="spellEnd"/>
           </w:p>
         </w:tc>
         <w:tc>
@@ -13200,7 +11020,6 @@
             </w:tcMar>
           </w:tcPr>
           <w:p>
-            <w:proofErr w:type="spellStart"/>
             <w:r>
               <w:rPr>
                 <w:sz w:val="19"/>
@@ -13208,7 +11027,6 @@
               </w:rPr>
               <w:t>ScreeningTime</w:t>
             </w:r>
-            <w:proofErr w:type="spellEnd"/>
           </w:p>
         </w:tc>
         <w:tc>
@@ -13284,7 +11102,6 @@
             </w:tcMar>
           </w:tcPr>
           <w:p>
-            <w:proofErr w:type="spellStart"/>
             <w:r>
               <w:rPr>
                 <w:sz w:val="19"/>
@@ -13292,7 +11109,6 @@
               </w:rPr>
               <w:t>TicketPrice</w:t>
             </w:r>
-            <w:proofErr w:type="spellEnd"/>
           </w:p>
         </w:tc>
         <w:tc>
@@ -13509,7 +11325,6 @@
             </w:tcMar>
           </w:tcPr>
           <w:p>
-            <w:proofErr w:type="spellStart"/>
             <w:r>
               <w:rPr>
                 <w:sz w:val="19"/>
@@ -13517,7 +11332,6 @@
               </w:rPr>
               <w:t>CustomerForename</w:t>
             </w:r>
-            <w:proofErr w:type="spellEnd"/>
           </w:p>
         </w:tc>
         <w:tc>
@@ -13593,7 +11407,6 @@
             </w:tcMar>
           </w:tcPr>
           <w:p>
-            <w:proofErr w:type="spellStart"/>
             <w:r>
               <w:rPr>
                 <w:sz w:val="19"/>
@@ -13601,7 +11414,6 @@
               </w:rPr>
               <w:t>CustomerSurname</w:t>
             </w:r>
-            <w:proofErr w:type="spellEnd"/>
           </w:p>
         </w:tc>
         <w:tc>
@@ -13677,7 +11489,6 @@
             </w:tcMar>
           </w:tcPr>
           <w:p>
-            <w:proofErr w:type="spellStart"/>
             <w:r>
               <w:rPr>
                 <w:sz w:val="19"/>
@@ -13685,7 +11496,6 @@
               </w:rPr>
               <w:t>CustomerEmail</w:t>
             </w:r>
-            <w:proofErr w:type="spellEnd"/>
           </w:p>
         </w:tc>
         <w:tc>
@@ -13761,7 +11571,6 @@
             </w:tcMar>
           </w:tcPr>
           <w:p>
-            <w:proofErr w:type="spellStart"/>
             <w:r>
               <w:rPr>
                 <w:sz w:val="19"/>
@@ -13769,7 +11578,6 @@
               </w:rPr>
               <w:t>CustomerPhone</w:t>
             </w:r>
-            <w:proofErr w:type="spellEnd"/>
           </w:p>
         </w:tc>
         <w:tc>

</xml_diff>

<commit_message>
added desc for obj 11 in design
</commit_message>
<xml_diff>
--- a/Design.docx
+++ b/Design.docx
@@ -630,6 +630,77 @@
         </w:rPr>
         <w:lastRenderedPageBreak/>
         <w:t>something the cinema does not sell, and defaulting the quantity to one saves the most common case of a single item being typed every time.</w:t>
+      </w:r>
+    </w:p>
+    <w:p>
+      <w:pPr>
+        <w:pStyle w:val="Heading3"/>
+        <w:spacing w:before="260" w:after="120"/>
+      </w:pPr>
+      <w:r>
+        <w:rPr>
+          <w:rFonts w:ascii="Aptos Display" w:eastAsia="Aptos Display" w:hAnsi="Aptos Display" w:cs="Aptos Display"/>
+          <w:b/>
+          <w:bCs/>
+          <w:color w:val="000000"/>
+        </w:rPr>
+        <w:t>Searching for a Booking (Objective 11)</w:t>
+      </w:r>
+    </w:p>
+    <w:p>
+      <w:pPr>
+        <w:spacing w:after="160" w:line="276" w:lineRule="auto"/>
+      </w:pPr>
+      <w:r>
+        <w:rPr>
+          <w:rFonts w:ascii="Aptos" w:eastAsia="Aptos" w:hAnsi="Aptos" w:cs="Aptos"/>
+        </w:rPr>
+        <w:t>Staff often need to find a booking again after it has been made, for example if a customer rings up about it, so this objective provides a way to search for one. It is handled by the form named frmBookingSearch, which is reached from the Find Booking button on the main menu. This same form also handles cancelling a booking and viewing the screening register, which are the next two objectives, because they all naturally belong together in one place. For the search itself the form has a text box named txtSearch, labelled Booking ID or Customer Name, a Search button named btnSearch, a Show All button named btnShowAll, and a grid named dgvBookings where the results appear.</w:t>
+      </w:r>
+    </w:p>
+    <w:p>
+      <w:pPr>
+        <w:pBdr>
+          <w:top w:val="single" w:sz="6" w:space="6" w:color="A02B93"/>
+          <w:left w:val="single" w:sz="6" w:space="6" w:color="A02B93"/>
+          <w:bottom w:val="single" w:sz="6" w:space="6" w:color="A02B93"/>
+          <w:right w:val="single" w:sz="6" w:space="6" w:color="A02B93"/>
+        </w:pBdr>
+        <w:shd w:val="clear" w:color="auto" w:fill="F7E9F3"/>
+        <w:spacing w:before="120" w:after="200"/>
+      </w:pPr>
+      <w:r>
+        <w:rPr>
+          <w:rFonts w:ascii="Aptos" w:eastAsia="Aptos" w:hAnsi="Aptos" w:cs="Aptos"/>
+          <w:b/>
+          <w:bCs/>
+          <w:color w:val="A02B93"/>
+          <w:sz w:val="22"/>
+          <w:szCs w:val="22"/>
+        </w:rPr>
+        <w:t>Booking Search Form (frmBookingSearch)</w:t>
+      </w:r>
+      <w:r>
+        <w:rPr>
+          <w:rFonts w:ascii="Aptos" w:eastAsia="Aptos" w:hAnsi="Aptos" w:cs="Aptos"/>
+          <w:i/>
+          <w:iCs/>
+          <w:color w:val="555555"/>
+          <w:sz w:val="20"/>
+          <w:szCs w:val="20"/>
+        </w:rPr>
+        <w:t>.</w:t>
+      </w:r>
+    </w:p>
+    <w:p>
+      <w:pPr>
+        <w:spacing w:after="160" w:line="276" w:lineRule="auto"/>
+      </w:pPr>
+      <w:r>
+        <w:rPr>
+          <w:rFonts w:ascii="Aptos" w:eastAsia="Aptos" w:hAnsi="Aptos" w:cs="Aptos"/>
+        </w:rPr>
+        <w:t>The way it works is that the member of staff types either a booking reference or the customer's name into the search box and presses Search, and any matching bookings appear in the grid. If they would rather just see everything, the Show All button lists every booking in the system. The input is therefore the text typed into the search box, the output is the list of matching bookings, and the process behind it is a query against the tblBooking table, joined to the customer details, that looks for a booking whose identifier matches the number typed or whose customer name contains the text typed. I chose to have a single search box that accepts either a booking reference or a name, this is because staff will sometimes have the reference to hand and sometimes only the customer's name, so accepting both keeps it flexible, and the Show All button gives them a simple fallback when they are not sure what to search for.</w:t>
       </w:r>
     </w:p>
     <w:p>

</xml_diff>

<commit_message>
added desc for obj 12 in design
</commit_message>
<xml_diff>
--- a/Design.docx
+++ b/Design.docx
@@ -11,13 +11,23 @@
           <w:color w:val="A02B93" w:themeColor="accent5"/>
         </w:rPr>
       </w:pPr>
+      <w:proofErr w:type="spellStart"/>
       <w:r>
         <w:rPr>
           <w:b/>
           <w:bCs/>
           <w:color w:val="A02B93" w:themeColor="accent5"/>
         </w:rPr>
-        <w:t>Filmtopia Project Design</w:t>
+        <w:t>Filmtopia</w:t>
+      </w:r>
+      <w:proofErr w:type="spellEnd"/>
+      <w:r>
+        <w:rPr>
+          <w:b/>
+          <w:bCs/>
+          <w:color w:val="A02B93" w:themeColor="accent5"/>
+        </w:rPr>
+        <w:t xml:space="preserve"> Project Design</w:t>
       </w:r>
     </w:p>
     <w:p>
@@ -43,7 +53,21 @@
         <w:rPr>
           <w:rFonts w:ascii="Aptos" w:eastAsia="Aptos" w:hAnsi="Aptos" w:cs="Aptos"/>
         </w:rPr>
-        <w:t>The purpose of this section is to design the way that the user will interact with the Filmtopia system before any of it is actually built. In other words this is where I plan out every form the user will see, the information that goes into each one and the information that comes back out, so that when I move on to writing the code I already have a clear picture of what I am building rather than making it up as I go along. I have taken each objective in turn as a heading and described how the interface will behave for that objective, and for every form or report involved I have drawn a wireframe showing roughly where the labels, text boxes and buttons will sit. These drawings are deliberately kept simple so that it is obvious they are design sketches and not screenshots of a finished program.</w:t>
+        <w:t xml:space="preserve">The purpose of this section is to design the way that the user will interact with the </w:t>
+      </w:r>
+      <w:proofErr w:type="spellStart"/>
+      <w:r>
+        <w:rPr>
+          <w:rFonts w:ascii="Aptos" w:eastAsia="Aptos" w:hAnsi="Aptos" w:cs="Aptos"/>
+        </w:rPr>
+        <w:t>Filmtopia</w:t>
+      </w:r>
+      <w:proofErr w:type="spellEnd"/>
+      <w:r>
+        <w:rPr>
+          <w:rFonts w:ascii="Aptos" w:eastAsia="Aptos" w:hAnsi="Aptos" w:cs="Aptos"/>
+        </w:rPr>
+        <w:t xml:space="preserve"> system before any of it is actually built. In other words this is where I plan out every form the user will see, the information that goes into each one and the information that comes back out, so that when I move on to writing the code I already have a clear picture of what I am building rather than making it up as I go along. I have taken each objective in turn as a heading and described how the interface will behave for that objective, and for every form or report involved I have drawn a wireframe showing roughly where the labels, text boxes and buttons will sit. These drawings are deliberately kept simple so that it is obvious they are design sketches and not screenshots of a finished program.</w:t>
       </w:r>
     </w:p>
     <w:p>
@@ -57,7 +81,77 @@
         <w:rPr>
           <w:rFonts w:ascii="Aptos" w:eastAsia="Aptos" w:hAnsi="Aptos" w:cs="Aptos"/>
         </w:rPr>
-        <w:t>Before going through the objectives one at a time it is worth explaining a couple of decisions that apply across the whole system. Filmtopia is built as a Windows Forms desktop application, so every screen is a form made up of standard controls such as text boxes, labels, buttons and data grids. I have chosen to name my controls using a short prefix that describes what each one is, for example txt for a text box, btn for a button, lbl for a label, cbo for a combo box and dgv for a data grid view, followed by a word describing its job. This is because a consistent naming convention makes the code far easier to read later on and stops me getting confused between similarly named items. I have also decided not to worry too much about the finer details of colour at this stage, this is because the guidance makes clear that the interface will be refined after the prototype in section 5.2, so it makes sense to settle the layout and the flow first and then tidy up the appearance once I know everything works.</w:t>
+        <w:t xml:space="preserve">Before going through the objectives one at a time it is worth explaining a couple of decisions that apply across the whole system. </w:t>
+      </w:r>
+      <w:proofErr w:type="spellStart"/>
+      <w:r>
+        <w:rPr>
+          <w:rFonts w:ascii="Aptos" w:eastAsia="Aptos" w:hAnsi="Aptos" w:cs="Aptos"/>
+        </w:rPr>
+        <w:t>Filmtopia</w:t>
+      </w:r>
+      <w:proofErr w:type="spellEnd"/>
+      <w:r>
+        <w:rPr>
+          <w:rFonts w:ascii="Aptos" w:eastAsia="Aptos" w:hAnsi="Aptos" w:cs="Aptos"/>
+        </w:rPr>
+        <w:t xml:space="preserve"> is built as a Windows Forms desktop application, so every screen is a form made up of standard controls such as text boxes, labels, buttons and data grids. I have chosen to name my controls using a short prefix that describes what each one is, for example txt for a text box, </w:t>
+      </w:r>
+      <w:proofErr w:type="spellStart"/>
+      <w:r>
+        <w:rPr>
+          <w:rFonts w:ascii="Aptos" w:eastAsia="Aptos" w:hAnsi="Aptos" w:cs="Aptos"/>
+        </w:rPr>
+        <w:t>btn</w:t>
+      </w:r>
+      <w:proofErr w:type="spellEnd"/>
+      <w:r>
+        <w:rPr>
+          <w:rFonts w:ascii="Aptos" w:eastAsia="Aptos" w:hAnsi="Aptos" w:cs="Aptos"/>
+        </w:rPr>
+        <w:t xml:space="preserve"> for a button, </w:t>
+      </w:r>
+      <w:proofErr w:type="spellStart"/>
+      <w:r>
+        <w:rPr>
+          <w:rFonts w:ascii="Aptos" w:eastAsia="Aptos" w:hAnsi="Aptos" w:cs="Aptos"/>
+        </w:rPr>
+        <w:t>lbl</w:t>
+      </w:r>
+      <w:proofErr w:type="spellEnd"/>
+      <w:r>
+        <w:rPr>
+          <w:rFonts w:ascii="Aptos" w:eastAsia="Aptos" w:hAnsi="Aptos" w:cs="Aptos"/>
+        </w:rPr>
+        <w:t xml:space="preserve"> for a label, </w:t>
+      </w:r>
+      <w:proofErr w:type="spellStart"/>
+      <w:r>
+        <w:rPr>
+          <w:rFonts w:ascii="Aptos" w:eastAsia="Aptos" w:hAnsi="Aptos" w:cs="Aptos"/>
+        </w:rPr>
+        <w:t>cbo</w:t>
+      </w:r>
+      <w:proofErr w:type="spellEnd"/>
+      <w:r>
+        <w:rPr>
+          <w:rFonts w:ascii="Aptos" w:eastAsia="Aptos" w:hAnsi="Aptos" w:cs="Aptos"/>
+        </w:rPr>
+        <w:t xml:space="preserve"> for a combo box and </w:t>
+      </w:r>
+      <w:proofErr w:type="spellStart"/>
+      <w:r>
+        <w:rPr>
+          <w:rFonts w:ascii="Aptos" w:eastAsia="Aptos" w:hAnsi="Aptos" w:cs="Aptos"/>
+        </w:rPr>
+        <w:t>dgv</w:t>
+      </w:r>
+      <w:proofErr w:type="spellEnd"/>
+      <w:r>
+        <w:rPr>
+          <w:rFonts w:ascii="Aptos" w:eastAsia="Aptos" w:hAnsi="Aptos" w:cs="Aptos"/>
+        </w:rPr>
+        <w:t xml:space="preserve"> for a data grid view, followed by a word describing its job. This is because a consistent naming convention makes the code far easier to read later on and stops me getting confused between similarly named items. I have also decided not to worry too much about the finer details of colour at this stage, this is because the guidance makes clear that the interface will be refined after the prototype in section 5.2, so it makes sense to settle the layout and the flow first and then tidy up the appearance once I know everything works.</w:t>
       </w:r>
     </w:p>
     <w:p>
@@ -83,7 +177,35 @@
         <w:rPr>
           <w:rFonts w:ascii="Aptos" w:eastAsia="Aptos" w:hAnsi="Aptos" w:cs="Aptos"/>
         </w:rPr>
-        <w:t>The first thing any user meets when they open Filmtopia is the login screen, so this is where the design naturally starts. The objective here is to make sure that customers, staff and managers are not all able to do the same things, because a normal member of staff being able to reach the manager's sales reports or the audit log would be a serious security weakness. To achieve this the system asks for a username and a password on a small login form, checks them against the tblLogin table, and reads back an access level number that then decides what the user is allowed to see.</w:t>
+        <w:t xml:space="preserve">The first thing any user meets when they open </w:t>
+      </w:r>
+      <w:proofErr w:type="spellStart"/>
+      <w:r>
+        <w:rPr>
+          <w:rFonts w:ascii="Aptos" w:eastAsia="Aptos" w:hAnsi="Aptos" w:cs="Aptos"/>
+        </w:rPr>
+        <w:t>Filmtopia</w:t>
+      </w:r>
+      <w:proofErr w:type="spellEnd"/>
+      <w:r>
+        <w:rPr>
+          <w:rFonts w:ascii="Aptos" w:eastAsia="Aptos" w:hAnsi="Aptos" w:cs="Aptos"/>
+        </w:rPr>
+        <w:t xml:space="preserve"> is the login screen, so this is where the design naturally starts. The objective here is to make sure that customers, staff and managers are not all able to do the same things, because a normal member of staff being able to reach the manager's sales reports or the audit log would be a serious security weakness. To achieve this the system asks for a username and a password on a small login form, checks them against the </w:t>
+      </w:r>
+      <w:proofErr w:type="spellStart"/>
+      <w:r>
+        <w:rPr>
+          <w:rFonts w:ascii="Aptos" w:eastAsia="Aptos" w:hAnsi="Aptos" w:cs="Aptos"/>
+        </w:rPr>
+        <w:t>tblLogin</w:t>
+      </w:r>
+      <w:proofErr w:type="spellEnd"/>
+      <w:r>
+        <w:rPr>
+          <w:rFonts w:ascii="Aptos" w:eastAsia="Aptos" w:hAnsi="Aptos" w:cs="Aptos"/>
+        </w:rPr>
+        <w:t xml:space="preserve"> table, and reads back an access level number that then decides what the user is allowed to see.</w:t>
       </w:r>
     </w:p>
     <w:p>
@@ -94,14 +216,84 @@
         <w:rPr>
           <w:rFonts w:ascii="Aptos" w:eastAsia="Aptos" w:hAnsi="Aptos" w:cs="Aptos"/>
         </w:rPr>
-        <w:t xml:space="preserve">The login form itself is deliberately kept small and uncomplicated. It has a header panel across the top showing the name Filmtopia and the subtitle Cinema Management System </w:t>
+        <w:t xml:space="preserve">The login form itself is deliberately kept small and uncomplicated. It has a header panel across the top showing the name </w:t>
+      </w:r>
+      <w:proofErr w:type="spellStart"/>
+      <w:r>
+        <w:rPr>
+          <w:rFonts w:ascii="Aptos" w:eastAsia="Aptos" w:hAnsi="Aptos" w:cs="Aptos"/>
+        </w:rPr>
+        <w:t>Filmtopia</w:t>
+      </w:r>
+      <w:proofErr w:type="spellEnd"/>
+      <w:r>
+        <w:rPr>
+          <w:rFonts w:ascii="Aptos" w:eastAsia="Aptos" w:hAnsi="Aptos" w:cs="Aptos"/>
+        </w:rPr>
+        <w:t xml:space="preserve"> and the subtitle Cinema Management System </w:t>
       </w:r>
       <w:r>
         <w:rPr>
           <w:rFonts w:ascii="Aptos" w:eastAsia="Aptos" w:hAnsi="Aptos" w:cs="Aptos"/>
         </w:rPr>
         <w:lastRenderedPageBreak/>
-        <w:t>so the user knows straight away what they are logging into. Below that are two labels, Username and Password, each sitting next to its own text box, which I have named txtUsername and txtPassword. The password box will have its characters masked so that anyone standing nearby cannot read what is being typed. Underneath the boxes are two buttons, a Log In button named btnLogin which carries out the check, and a Cancel button named btnClose which closes the program if the user changes their mind. A small version label sits at the very bottom of the form.</w:t>
+        <w:t xml:space="preserve">so the user knows straight away what they are logging into. Below that are two labels, Username and Password, each sitting next to its own text box, which I have named </w:t>
+      </w:r>
+      <w:proofErr w:type="spellStart"/>
+      <w:r>
+        <w:rPr>
+          <w:rFonts w:ascii="Aptos" w:eastAsia="Aptos" w:hAnsi="Aptos" w:cs="Aptos"/>
+        </w:rPr>
+        <w:t>txtUsername</w:t>
+      </w:r>
+      <w:proofErr w:type="spellEnd"/>
+      <w:r>
+        <w:rPr>
+          <w:rFonts w:ascii="Aptos" w:eastAsia="Aptos" w:hAnsi="Aptos" w:cs="Aptos"/>
+        </w:rPr>
+        <w:t xml:space="preserve"> and </w:t>
+      </w:r>
+      <w:proofErr w:type="spellStart"/>
+      <w:r>
+        <w:rPr>
+          <w:rFonts w:ascii="Aptos" w:eastAsia="Aptos" w:hAnsi="Aptos" w:cs="Aptos"/>
+        </w:rPr>
+        <w:t>txtPassword</w:t>
+      </w:r>
+      <w:proofErr w:type="spellEnd"/>
+      <w:r>
+        <w:rPr>
+          <w:rFonts w:ascii="Aptos" w:eastAsia="Aptos" w:hAnsi="Aptos" w:cs="Aptos"/>
+        </w:rPr>
+        <w:t xml:space="preserve">. The password box will have its characters masked so that anyone standing nearby cannot read what is being typed. Underneath the boxes are two buttons, a Log In button named </w:t>
+      </w:r>
+      <w:proofErr w:type="spellStart"/>
+      <w:r>
+        <w:rPr>
+          <w:rFonts w:ascii="Aptos" w:eastAsia="Aptos" w:hAnsi="Aptos" w:cs="Aptos"/>
+        </w:rPr>
+        <w:t>btnLogin</w:t>
+      </w:r>
+      <w:proofErr w:type="spellEnd"/>
+      <w:r>
+        <w:rPr>
+          <w:rFonts w:ascii="Aptos" w:eastAsia="Aptos" w:hAnsi="Aptos" w:cs="Aptos"/>
+        </w:rPr>
+        <w:t xml:space="preserve"> which carries out the check, and a Cancel button named </w:t>
+      </w:r>
+      <w:proofErr w:type="spellStart"/>
+      <w:r>
+        <w:rPr>
+          <w:rFonts w:ascii="Aptos" w:eastAsia="Aptos" w:hAnsi="Aptos" w:cs="Aptos"/>
+        </w:rPr>
+        <w:t>btnClose</w:t>
+      </w:r>
+      <w:proofErr w:type="spellEnd"/>
+      <w:r>
+        <w:rPr>
+          <w:rFonts w:ascii="Aptos" w:eastAsia="Aptos" w:hAnsi="Aptos" w:cs="Aptos"/>
+        </w:rPr>
+        <w:t xml:space="preserve"> which closes the program if the user changes their mind. A small version label sits at the very bottom of the form.</w:t>
       </w:r>
     </w:p>
     <w:p>
@@ -124,7 +316,31 @@
           <w:sz w:val="22"/>
           <w:szCs w:val="22"/>
         </w:rPr>
-        <w:t>Login Form (frmLogin)</w:t>
+        <w:t>Login Form (</w:t>
+      </w:r>
+      <w:proofErr w:type="spellStart"/>
+      <w:r>
+        <w:rPr>
+          <w:rFonts w:ascii="Aptos" w:eastAsia="Aptos" w:hAnsi="Aptos" w:cs="Aptos"/>
+          <w:b/>
+          <w:bCs/>
+          <w:color w:val="A02B93"/>
+          <w:sz w:val="22"/>
+          <w:szCs w:val="22"/>
+        </w:rPr>
+        <w:t>frmLogin</w:t>
+      </w:r>
+      <w:proofErr w:type="spellEnd"/>
+      <w:r>
+        <w:rPr>
+          <w:rFonts w:ascii="Aptos" w:eastAsia="Aptos" w:hAnsi="Aptos" w:cs="Aptos"/>
+          <w:b/>
+          <w:bCs/>
+          <w:color w:val="A02B93"/>
+          <w:sz w:val="22"/>
+          <w:szCs w:val="22"/>
+        </w:rPr>
+        <w:t>)</w:t>
       </w:r>
     </w:p>
     <w:p>
@@ -135,7 +351,35 @@
         <w:rPr>
           <w:rFonts w:ascii="Aptos" w:eastAsia="Aptos" w:hAnsi="Aptos" w:cs="Aptos"/>
         </w:rPr>
-        <w:t>The only input to this form is the username and password typed by the user. The output, once the button is pressed, is either entry into the main menu or a message box telling the user that their details were not recognised. The process that happens in between is a lookup against the tblLogin table for a matching username, a comparison of the stored password, and if everything matches, the storing of that user's access level in a variable called UserAccessLevel that the rest of the program can read. I have chosen buttons here rather than, for example, expecting the user to press the Enter key, this is because a clearly labelled Log In button leaves no doubt about what to do and is friendlier for staff who are not especially technical.</w:t>
+        <w:t xml:space="preserve">The only input to this form is the username and password typed by the user. The output, once the button is pressed, is either entry into the main menu or a message box telling the user that their details were not recognised. The process that happens in between is a lookup against the </w:t>
+      </w:r>
+      <w:proofErr w:type="spellStart"/>
+      <w:r>
+        <w:rPr>
+          <w:rFonts w:ascii="Aptos" w:eastAsia="Aptos" w:hAnsi="Aptos" w:cs="Aptos"/>
+        </w:rPr>
+        <w:t>tblLogin</w:t>
+      </w:r>
+      <w:proofErr w:type="spellEnd"/>
+      <w:r>
+        <w:rPr>
+          <w:rFonts w:ascii="Aptos" w:eastAsia="Aptos" w:hAnsi="Aptos" w:cs="Aptos"/>
+        </w:rPr>
+        <w:t xml:space="preserve"> table for a matching username, a comparison of the stored password, and if everything matches, the storing of that user's access level in a variable called </w:t>
+      </w:r>
+      <w:proofErr w:type="spellStart"/>
+      <w:r>
+        <w:rPr>
+          <w:rFonts w:ascii="Aptos" w:eastAsia="Aptos" w:hAnsi="Aptos" w:cs="Aptos"/>
+        </w:rPr>
+        <w:t>UserAccessLevel</w:t>
+      </w:r>
+      <w:proofErr w:type="spellEnd"/>
+      <w:r>
+        <w:rPr>
+          <w:rFonts w:ascii="Aptos" w:eastAsia="Aptos" w:hAnsi="Aptos" w:cs="Aptos"/>
+        </w:rPr>
+        <w:t xml:space="preserve"> that the rest of the program can read. I have chosen buttons here rather than, for example, expecting the user to press the Enter key, this is because a clearly labelled Log In button leaves no doubt about what to do and is friendlier for staff who are not especially technical.</w:t>
       </w:r>
     </w:p>
     <w:p>
@@ -146,7 +390,35 @@
         <w:rPr>
           <w:rFonts w:ascii="Aptos" w:eastAsia="Aptos" w:hAnsi="Aptos" w:cs="Aptos"/>
         </w:rPr>
-        <w:t>Once a user has logged in successfully they are taken to the main menu, which is the form named frmMainForm and acts as the hub for the whole system. Every other part of Filmtopia is reached from here by pressing a button, which I felt was a far more sophisticated and easier to follow approach than burying features inside drop-down menus that a busy member of staff would have to go hunting through. The menu shows a welcome message at the top and then a column of buttons down the content area, one for each area of the system, for example Bookings, Find Booking, Screenings, Films, Screens, Food, Reports, Customers, Logs and a Logout button.</w:t>
+        <w:t xml:space="preserve">Once a user has logged in successfully they are taken to the main menu, which is the form named </w:t>
+      </w:r>
+      <w:proofErr w:type="spellStart"/>
+      <w:r>
+        <w:rPr>
+          <w:rFonts w:ascii="Aptos" w:eastAsia="Aptos" w:hAnsi="Aptos" w:cs="Aptos"/>
+        </w:rPr>
+        <w:t>frmMainForm</w:t>
+      </w:r>
+      <w:proofErr w:type="spellEnd"/>
+      <w:r>
+        <w:rPr>
+          <w:rFonts w:ascii="Aptos" w:eastAsia="Aptos" w:hAnsi="Aptos" w:cs="Aptos"/>
+        </w:rPr>
+        <w:t xml:space="preserve"> and acts as the hub for the whole system. Every other part of </w:t>
+      </w:r>
+      <w:proofErr w:type="spellStart"/>
+      <w:r>
+        <w:rPr>
+          <w:rFonts w:ascii="Aptos" w:eastAsia="Aptos" w:hAnsi="Aptos" w:cs="Aptos"/>
+        </w:rPr>
+        <w:t>Filmtopia</w:t>
+      </w:r>
+      <w:proofErr w:type="spellEnd"/>
+      <w:r>
+        <w:rPr>
+          <w:rFonts w:ascii="Aptos" w:eastAsia="Aptos" w:hAnsi="Aptos" w:cs="Aptos"/>
+        </w:rPr>
+        <w:t xml:space="preserve"> is reached from here by pressing a button, which I felt was a far more sophisticated and easier to follow approach than burying features inside drop-down menus that a busy member of staff would have to go hunting through. The menu shows a welcome message at the top and then a column of buttons down the content area, one for each area of the system, for example Bookings, Find Booking, Screenings, Films, Screens, Food, Reports, Customers, Logs and a Logout button.</w:t>
       </w:r>
     </w:p>
     <w:p>
@@ -157,7 +429,35 @@
         <w:rPr>
           <w:rFonts w:ascii="Aptos" w:eastAsia="Aptos" w:hAnsi="Aptos" w:cs="Aptos"/>
         </w:rPr>
-        <w:t>What makes this form important for the objective is that the buttons shown depend entirely on the access level that was read at login. This is because a manager, whose access level is 1, needs to see everything, whereas a normal member of staff, whose access level is 2, should only see the day to day booking functions. When a manager logs in the group box is titled Filmtopia Admin and the management buttons for Films, Screens, Food, Reports and Logs are all made visible. When a member of staff logs in those same buttons are hidden and the group box is titled Filmtopia Staff, leaving them with just the booking related functions. In this way a single form quietly enforces the whole access level objective without the staff member ever seeing an option they are not allowed to use.</w:t>
+        <w:t xml:space="preserve">What makes this form important for the objective is that the buttons shown depend entirely on the access level that was read at login. This is because a manager, whose access level is 1, needs to see everything, whereas a normal member of staff, whose access level is 2, should only see the day to day booking functions. When a manager logs in the group box is titled </w:t>
+      </w:r>
+      <w:proofErr w:type="spellStart"/>
+      <w:r>
+        <w:rPr>
+          <w:rFonts w:ascii="Aptos" w:eastAsia="Aptos" w:hAnsi="Aptos" w:cs="Aptos"/>
+        </w:rPr>
+        <w:t>Filmtopia</w:t>
+      </w:r>
+      <w:proofErr w:type="spellEnd"/>
+      <w:r>
+        <w:rPr>
+          <w:rFonts w:ascii="Aptos" w:eastAsia="Aptos" w:hAnsi="Aptos" w:cs="Aptos"/>
+        </w:rPr>
+        <w:t xml:space="preserve"> Admin and the management buttons for Films, Screens, Food, Reports and Logs are all made visible. When a member of staff logs in those same buttons are hidden and the group box is titled </w:t>
+      </w:r>
+      <w:proofErr w:type="spellStart"/>
+      <w:r>
+        <w:rPr>
+          <w:rFonts w:ascii="Aptos" w:eastAsia="Aptos" w:hAnsi="Aptos" w:cs="Aptos"/>
+        </w:rPr>
+        <w:t>Filmtopia</w:t>
+      </w:r>
+      <w:proofErr w:type="spellEnd"/>
+      <w:r>
+        <w:rPr>
+          <w:rFonts w:ascii="Aptos" w:eastAsia="Aptos" w:hAnsi="Aptos" w:cs="Aptos"/>
+        </w:rPr>
+        <w:t xml:space="preserve"> Staff, leaving them with just the booking related functions. In this way a single form quietly enforces the whole access level objective without the staff member ever seeing an option they are not allowed to use.</w:t>
       </w:r>
     </w:p>
     <w:p>
@@ -181,7 +481,31 @@
           <w:szCs w:val="22"/>
         </w:rPr>
         <w:lastRenderedPageBreak/>
-        <w:t>Main Menu (frmMainForm)</w:t>
+        <w:t>Main Menu (</w:t>
+      </w:r>
+      <w:proofErr w:type="spellStart"/>
+      <w:r>
+        <w:rPr>
+          <w:rFonts w:ascii="Aptos" w:eastAsia="Aptos" w:hAnsi="Aptos" w:cs="Aptos"/>
+          <w:b/>
+          <w:bCs/>
+          <w:color w:val="A02B93"/>
+          <w:sz w:val="22"/>
+          <w:szCs w:val="22"/>
+        </w:rPr>
+        <w:t>frmMainForm</w:t>
+      </w:r>
+      <w:proofErr w:type="spellEnd"/>
+      <w:r>
+        <w:rPr>
+          <w:rFonts w:ascii="Aptos" w:eastAsia="Aptos" w:hAnsi="Aptos" w:cs="Aptos"/>
+          <w:b/>
+          <w:bCs/>
+          <w:color w:val="A02B93"/>
+          <w:sz w:val="22"/>
+          <w:szCs w:val="22"/>
+        </w:rPr>
+        <w:t>)</w:t>
       </w:r>
     </w:p>
     <w:p>
@@ -218,7 +542,21 @@
         <w:rPr>
           <w:rFonts w:ascii="Aptos" w:eastAsia="Aptos" w:hAnsi="Aptos" w:cs="Aptos"/>
         </w:rPr>
-        <w:t>Moving on to the management side of the system, one of the first jobs a manager or member of staff needs to do is add the films that the cinema is showing, because without any films in the system there is nothing for a screening to be attached to. This objective is handled by a single form named frmFilms which lets the user add a new film, edit an existing one, or remove one that is no longer being shown.</w:t>
+        <w:t xml:space="preserve">Moving on to the management side of the system, one of the first jobs a manager or member of staff needs to do is add the films that the cinema is showing, because without any films in the system there is nothing for a screening to be attached to. This objective is handled by a single form named </w:t>
+      </w:r>
+      <w:proofErr w:type="spellStart"/>
+      <w:r>
+        <w:rPr>
+          <w:rFonts w:ascii="Aptos" w:eastAsia="Aptos" w:hAnsi="Aptos" w:cs="Aptos"/>
+        </w:rPr>
+        <w:t>frmFilms</w:t>
+      </w:r>
+      <w:proofErr w:type="spellEnd"/>
+      <w:r>
+        <w:rPr>
+          <w:rFonts w:ascii="Aptos" w:eastAsia="Aptos" w:hAnsi="Aptos" w:cs="Aptos"/>
+        </w:rPr>
+        <w:t xml:space="preserve"> which lets the user add a new film, edit an existing one, or remove one that is no longer being shown.</w:t>
       </w:r>
     </w:p>
     <w:p>
@@ -229,7 +567,133 @@
         <w:rPr>
           <w:rFonts w:ascii="Aptos" w:eastAsia="Aptos" w:hAnsi="Aptos" w:cs="Aptos"/>
         </w:rPr>
-        <w:t>The form is split into two halves. On one side is a data grid view named dgvFilms which lists every film already stored in the system, showing its title, age rating, duration and description in a table so the user can see at a glance what is already there. On the other side is a set of input boxes for the details of a film, made up of a label and a text box for each field, which I have named txtTitle, txtAgeRating, txtDuration and txtDescription. Beneath these are four buttons, Add, Update, Delete and Clear, which I have named btnAdd, btnUpdate, btnDelete and btnClear.</w:t>
+        <w:t xml:space="preserve">The form is split into two halves. On one side is a data grid view named </w:t>
+      </w:r>
+      <w:proofErr w:type="spellStart"/>
+      <w:r>
+        <w:rPr>
+          <w:rFonts w:ascii="Aptos" w:eastAsia="Aptos" w:hAnsi="Aptos" w:cs="Aptos"/>
+        </w:rPr>
+        <w:t>dgvFilms</w:t>
+      </w:r>
+      <w:proofErr w:type="spellEnd"/>
+      <w:r>
+        <w:rPr>
+          <w:rFonts w:ascii="Aptos" w:eastAsia="Aptos" w:hAnsi="Aptos" w:cs="Aptos"/>
+        </w:rPr>
+        <w:t xml:space="preserve"> which lists every film already stored in the system, showing its title, age rating, duration and description in a table so the user can see at a glance what is already there. On the other side is a set of input boxes for the details of a film, made up of a label and a text box for each field, which I have named </w:t>
+      </w:r>
+      <w:proofErr w:type="spellStart"/>
+      <w:r>
+        <w:rPr>
+          <w:rFonts w:ascii="Aptos" w:eastAsia="Aptos" w:hAnsi="Aptos" w:cs="Aptos"/>
+        </w:rPr>
+        <w:t>txtTitle</w:t>
+      </w:r>
+      <w:proofErr w:type="spellEnd"/>
+      <w:r>
+        <w:rPr>
+          <w:rFonts w:ascii="Aptos" w:eastAsia="Aptos" w:hAnsi="Aptos" w:cs="Aptos"/>
+        </w:rPr>
+        <w:t xml:space="preserve">, </w:t>
+      </w:r>
+      <w:proofErr w:type="spellStart"/>
+      <w:r>
+        <w:rPr>
+          <w:rFonts w:ascii="Aptos" w:eastAsia="Aptos" w:hAnsi="Aptos" w:cs="Aptos"/>
+        </w:rPr>
+        <w:t>txtAgeRating</w:t>
+      </w:r>
+      <w:proofErr w:type="spellEnd"/>
+      <w:r>
+        <w:rPr>
+          <w:rFonts w:ascii="Aptos" w:eastAsia="Aptos" w:hAnsi="Aptos" w:cs="Aptos"/>
+        </w:rPr>
+        <w:t xml:space="preserve">, </w:t>
+      </w:r>
+      <w:proofErr w:type="spellStart"/>
+      <w:r>
+        <w:rPr>
+          <w:rFonts w:ascii="Aptos" w:eastAsia="Aptos" w:hAnsi="Aptos" w:cs="Aptos"/>
+        </w:rPr>
+        <w:t>txtDuration</w:t>
+      </w:r>
+      <w:proofErr w:type="spellEnd"/>
+      <w:r>
+        <w:rPr>
+          <w:rFonts w:ascii="Aptos" w:eastAsia="Aptos" w:hAnsi="Aptos" w:cs="Aptos"/>
+        </w:rPr>
+        <w:t xml:space="preserve"> and </w:t>
+      </w:r>
+      <w:proofErr w:type="spellStart"/>
+      <w:r>
+        <w:rPr>
+          <w:rFonts w:ascii="Aptos" w:eastAsia="Aptos" w:hAnsi="Aptos" w:cs="Aptos"/>
+        </w:rPr>
+        <w:t>txtDescription</w:t>
+      </w:r>
+      <w:proofErr w:type="spellEnd"/>
+      <w:r>
+        <w:rPr>
+          <w:rFonts w:ascii="Aptos" w:eastAsia="Aptos" w:hAnsi="Aptos" w:cs="Aptos"/>
+        </w:rPr>
+        <w:t xml:space="preserve">. Beneath these are four buttons, Add, Update, Delete and Clear, which I have named </w:t>
+      </w:r>
+      <w:proofErr w:type="spellStart"/>
+      <w:r>
+        <w:rPr>
+          <w:rFonts w:ascii="Aptos" w:eastAsia="Aptos" w:hAnsi="Aptos" w:cs="Aptos"/>
+        </w:rPr>
+        <w:t>btnAdd</w:t>
+      </w:r>
+      <w:proofErr w:type="spellEnd"/>
+      <w:r>
+        <w:rPr>
+          <w:rFonts w:ascii="Aptos" w:eastAsia="Aptos" w:hAnsi="Aptos" w:cs="Aptos"/>
+        </w:rPr>
+        <w:t xml:space="preserve">, </w:t>
+      </w:r>
+      <w:proofErr w:type="spellStart"/>
+      <w:r>
+        <w:rPr>
+          <w:rFonts w:ascii="Aptos" w:eastAsia="Aptos" w:hAnsi="Aptos" w:cs="Aptos"/>
+        </w:rPr>
+        <w:t>btnUpdate</w:t>
+      </w:r>
+      <w:proofErr w:type="spellEnd"/>
+      <w:r>
+        <w:rPr>
+          <w:rFonts w:ascii="Aptos" w:eastAsia="Aptos" w:hAnsi="Aptos" w:cs="Aptos"/>
+        </w:rPr>
+        <w:t xml:space="preserve">, </w:t>
+      </w:r>
+      <w:proofErr w:type="spellStart"/>
+      <w:r>
+        <w:rPr>
+          <w:rFonts w:ascii="Aptos" w:eastAsia="Aptos" w:hAnsi="Aptos" w:cs="Aptos"/>
+        </w:rPr>
+        <w:t>btnDelete</w:t>
+      </w:r>
+      <w:proofErr w:type="spellEnd"/>
+      <w:r>
+        <w:rPr>
+          <w:rFonts w:ascii="Aptos" w:eastAsia="Aptos" w:hAnsi="Aptos" w:cs="Aptos"/>
+        </w:rPr>
+        <w:t xml:space="preserve"> and </w:t>
+      </w:r>
+      <w:proofErr w:type="spellStart"/>
+      <w:r>
+        <w:rPr>
+          <w:rFonts w:ascii="Aptos" w:eastAsia="Aptos" w:hAnsi="Aptos" w:cs="Aptos"/>
+        </w:rPr>
+        <w:t>btnClear</w:t>
+      </w:r>
+      <w:proofErr w:type="spellEnd"/>
+      <w:r>
+        <w:rPr>
+          <w:rFonts w:ascii="Aptos" w:eastAsia="Aptos" w:hAnsi="Aptos" w:cs="Aptos"/>
+        </w:rPr>
+        <w:t>.</w:t>
       </w:r>
     </w:p>
     <w:p>
@@ -252,7 +716,31 @@
           <w:sz w:val="22"/>
           <w:szCs w:val="22"/>
         </w:rPr>
-        <w:t>Add Films Form (frmFilms)</w:t>
+        <w:t>Add Films Form (</w:t>
+      </w:r>
+      <w:proofErr w:type="spellStart"/>
+      <w:r>
+        <w:rPr>
+          <w:rFonts w:ascii="Aptos" w:eastAsia="Aptos" w:hAnsi="Aptos" w:cs="Aptos"/>
+          <w:b/>
+          <w:bCs/>
+          <w:color w:val="A02B93"/>
+          <w:sz w:val="22"/>
+          <w:szCs w:val="22"/>
+        </w:rPr>
+        <w:t>frmFilms</w:t>
+      </w:r>
+      <w:proofErr w:type="spellEnd"/>
+      <w:r>
+        <w:rPr>
+          <w:rFonts w:ascii="Aptos" w:eastAsia="Aptos" w:hAnsi="Aptos" w:cs="Aptos"/>
+          <w:b/>
+          <w:bCs/>
+          <w:color w:val="A02B93"/>
+          <w:sz w:val="22"/>
+          <w:szCs w:val="22"/>
+        </w:rPr>
+        <w:t>)</w:t>
       </w:r>
     </w:p>
     <w:p>
@@ -263,7 +751,21 @@
         <w:rPr>
           <w:rFonts w:ascii="Aptos" w:eastAsia="Aptos" w:hAnsi="Aptos" w:cs="Aptos"/>
         </w:rPr>
-        <w:t>The inputs to this form are the four film details typed into the text boxes. The outputs are the updated list of films shown in the grid and, where appropriate, a message box confirming that a film has been added or warning the user if something has gone wrong. The processes behind the buttons are straightforward database operations, for example the Add button takes whatever is in the text boxes and inserts a new record into the tblFilm table, whereas the Update button changes the record for the film currently selected in the grid, and the Delete button removes it. The Clear button simply empties the text boxes so the user can start again.</w:t>
+        <w:t xml:space="preserve">The inputs to this form are the four film details typed into the text boxes. The outputs are the updated list of films shown in the grid and, where appropriate, a message box confirming that a film has been added or warning the user if something has gone wrong. The processes behind the buttons are straightforward database operations, for example the Add button takes whatever is in the text boxes and inserts a new record into the </w:t>
+      </w:r>
+      <w:proofErr w:type="spellStart"/>
+      <w:r>
+        <w:rPr>
+          <w:rFonts w:ascii="Aptos" w:eastAsia="Aptos" w:hAnsi="Aptos" w:cs="Aptos"/>
+        </w:rPr>
+        <w:t>tblFilm</w:t>
+      </w:r>
+      <w:proofErr w:type="spellEnd"/>
+      <w:r>
+        <w:rPr>
+          <w:rFonts w:ascii="Aptos" w:eastAsia="Aptos" w:hAnsi="Aptos" w:cs="Aptos"/>
+        </w:rPr>
+        <w:t xml:space="preserve"> table, whereas the Update button changes the record for the film currently selected in the grid, and the Delete button removes it. The Clear button simply empties the text boxes so the user can start again.</w:t>
       </w:r>
     </w:p>
     <w:p>
@@ -307,7 +809,35 @@
         <w:rPr>
           <w:rFonts w:ascii="Aptos" w:eastAsia="Aptos" w:hAnsi="Aptos" w:cs="Aptos"/>
         </w:rPr>
-        <w:t>Once films exist in the system the next job is to schedule when and where they will actually be shown, which is what this objective covers. It is handled by the form named frmScreenings, and because it is another management form for adding, editing and removing records it follows exactly the same layout as the Add Films form described above, with a data grid view named dgvScreenings listing the existing screenings on one side and a set of input controls with Add, Update, Delete and Clear buttons on the other. Rather than repeat the whole description I will refer back to the Add Films form for the general behaviour and just explain what is different here.</w:t>
+        <w:t xml:space="preserve">Once films exist in the system the next job is to schedule when and where they will actually be shown, which is what this objective covers. It is handled by the form named </w:t>
+      </w:r>
+      <w:proofErr w:type="spellStart"/>
+      <w:r>
+        <w:rPr>
+          <w:rFonts w:ascii="Aptos" w:eastAsia="Aptos" w:hAnsi="Aptos" w:cs="Aptos"/>
+        </w:rPr>
+        <w:t>frmScreenings</w:t>
+      </w:r>
+      <w:proofErr w:type="spellEnd"/>
+      <w:r>
+        <w:rPr>
+          <w:rFonts w:ascii="Aptos" w:eastAsia="Aptos" w:hAnsi="Aptos" w:cs="Aptos"/>
+        </w:rPr>
+        <w:t xml:space="preserve">, and because it is another management form for adding, editing and removing records it follows exactly the same layout as the Add Films form described above, with a data grid view named </w:t>
+      </w:r>
+      <w:proofErr w:type="spellStart"/>
+      <w:r>
+        <w:rPr>
+          <w:rFonts w:ascii="Aptos" w:eastAsia="Aptos" w:hAnsi="Aptos" w:cs="Aptos"/>
+        </w:rPr>
+        <w:t>dgvScreenings</w:t>
+      </w:r>
+      <w:proofErr w:type="spellEnd"/>
+      <w:r>
+        <w:rPr>
+          <w:rFonts w:ascii="Aptos" w:eastAsia="Aptos" w:hAnsi="Aptos" w:cs="Aptos"/>
+        </w:rPr>
+        <w:t xml:space="preserve"> listing the existing screenings on one side and a set of input controls with Add, Update, Delete and Clear buttons on the other. Rather than repeat the whole description I will refer back to the Add Films form for the general behaviour and just explain what is different here.</w:t>
       </w:r>
     </w:p>
     <w:p>
@@ -318,7 +848,77 @@
         <w:rPr>
           <w:rFonts w:ascii="Aptos" w:eastAsia="Aptos" w:hAnsi="Aptos" w:cs="Aptos"/>
         </w:rPr>
-        <w:t>The difference is in the inputs. A screening has to be tied to a film that already exists and a screen that already exists, so instead of free text boxes for those two the form uses two combo boxes, named cboFilm and cboScreen, which the user picks from. This is because a member of staff should not be able to type in a film or a screen that is not really there, and choosing from a list makes that impossible. The date is entered using a date picker named dtpScreeningDate rather than a text box, this is because a proper date picker stops the user entering something that is not a real date. The time and the ticket price are entered into text boxes named txtScreeningTime, which is labelled Time in the format HH colon MM, and txtTicketPrice.</w:t>
+        <w:t xml:space="preserve">The difference is in the inputs. A screening has to be tied to a film that already exists and a screen that already exists, so instead of free text boxes for those two the form uses two combo boxes, named </w:t>
+      </w:r>
+      <w:proofErr w:type="spellStart"/>
+      <w:r>
+        <w:rPr>
+          <w:rFonts w:ascii="Aptos" w:eastAsia="Aptos" w:hAnsi="Aptos" w:cs="Aptos"/>
+        </w:rPr>
+        <w:t>cboFilm</w:t>
+      </w:r>
+      <w:proofErr w:type="spellEnd"/>
+      <w:r>
+        <w:rPr>
+          <w:rFonts w:ascii="Aptos" w:eastAsia="Aptos" w:hAnsi="Aptos" w:cs="Aptos"/>
+        </w:rPr>
+        <w:t xml:space="preserve"> and </w:t>
+      </w:r>
+      <w:proofErr w:type="spellStart"/>
+      <w:r>
+        <w:rPr>
+          <w:rFonts w:ascii="Aptos" w:eastAsia="Aptos" w:hAnsi="Aptos" w:cs="Aptos"/>
+        </w:rPr>
+        <w:t>cboScreen</w:t>
+      </w:r>
+      <w:proofErr w:type="spellEnd"/>
+      <w:r>
+        <w:rPr>
+          <w:rFonts w:ascii="Aptos" w:eastAsia="Aptos" w:hAnsi="Aptos" w:cs="Aptos"/>
+        </w:rPr>
+        <w:t xml:space="preserve">, which the user picks from. This is because a member of staff should not be able to type in a film or a screen that is not really there, and choosing from a list makes that impossible. The date is entered using a date picker named </w:t>
+      </w:r>
+      <w:proofErr w:type="spellStart"/>
+      <w:r>
+        <w:rPr>
+          <w:rFonts w:ascii="Aptos" w:eastAsia="Aptos" w:hAnsi="Aptos" w:cs="Aptos"/>
+        </w:rPr>
+        <w:t>dtpScreeningDate</w:t>
+      </w:r>
+      <w:proofErr w:type="spellEnd"/>
+      <w:r>
+        <w:rPr>
+          <w:rFonts w:ascii="Aptos" w:eastAsia="Aptos" w:hAnsi="Aptos" w:cs="Aptos"/>
+        </w:rPr>
+        <w:t xml:space="preserve"> rather than a text box, this is because a proper date picker stops the user entering something that is not a real date. The time and the ticket price are entered into text boxes named </w:t>
+      </w:r>
+      <w:proofErr w:type="spellStart"/>
+      <w:r>
+        <w:rPr>
+          <w:rFonts w:ascii="Aptos" w:eastAsia="Aptos" w:hAnsi="Aptos" w:cs="Aptos"/>
+        </w:rPr>
+        <w:t>txtScreeningTime</w:t>
+      </w:r>
+      <w:proofErr w:type="spellEnd"/>
+      <w:r>
+        <w:rPr>
+          <w:rFonts w:ascii="Aptos" w:eastAsia="Aptos" w:hAnsi="Aptos" w:cs="Aptos"/>
+        </w:rPr>
+        <w:t xml:space="preserve">, which is labelled Time in the format HH colon MM, and </w:t>
+      </w:r>
+      <w:proofErr w:type="spellStart"/>
+      <w:r>
+        <w:rPr>
+          <w:rFonts w:ascii="Aptos" w:eastAsia="Aptos" w:hAnsi="Aptos" w:cs="Aptos"/>
+        </w:rPr>
+        <w:t>txtTicketPrice</w:t>
+      </w:r>
+      <w:proofErr w:type="spellEnd"/>
+      <w:r>
+        <w:rPr>
+          <w:rFonts w:ascii="Aptos" w:eastAsia="Aptos" w:hAnsi="Aptos" w:cs="Aptos"/>
+        </w:rPr>
+        <w:t>.</w:t>
       </w:r>
     </w:p>
     <w:p>
@@ -341,7 +941,31 @@
           <w:sz w:val="22"/>
           <w:szCs w:val="22"/>
         </w:rPr>
-        <w:t>Add Screenings Form (frmScreenings)</w:t>
+        <w:t>Add Screenings Form (</w:t>
+      </w:r>
+      <w:proofErr w:type="spellStart"/>
+      <w:r>
+        <w:rPr>
+          <w:rFonts w:ascii="Aptos" w:eastAsia="Aptos" w:hAnsi="Aptos" w:cs="Aptos"/>
+          <w:b/>
+          <w:bCs/>
+          <w:color w:val="A02B93"/>
+          <w:sz w:val="22"/>
+          <w:szCs w:val="22"/>
+        </w:rPr>
+        <w:t>frmScreenings</w:t>
+      </w:r>
+      <w:proofErr w:type="spellEnd"/>
+      <w:r>
+        <w:rPr>
+          <w:rFonts w:ascii="Aptos" w:eastAsia="Aptos" w:hAnsi="Aptos" w:cs="Aptos"/>
+          <w:b/>
+          <w:bCs/>
+          <w:color w:val="A02B93"/>
+          <w:sz w:val="22"/>
+          <w:szCs w:val="22"/>
+        </w:rPr>
+        <w:t>)</w:t>
       </w:r>
     </w:p>
     <w:p>
@@ -352,7 +976,21 @@
         <w:rPr>
           <w:rFonts w:ascii="Aptos" w:eastAsia="Aptos" w:hAnsi="Aptos" w:cs="Aptos"/>
         </w:rPr>
-        <w:t>The inputs are therefore the chosen film, the chosen screen, the date, the time and the ticket price. The output is the updated list of screenings in the grid, along with the usual confirmation or warning message boxes. The processes behind the buttons are the same insert, update and delete operations as before, this time acting on the tblScreening table.</w:t>
+        <w:t xml:space="preserve">The inputs are therefore the chosen film, the chosen screen, the date, the time and the ticket price. The output is the updated list of screenings in the grid, along with the usual confirmation or warning message boxes. The processes behind the buttons are the same insert, update and delete operations as before, this time acting on the </w:t>
+      </w:r>
+      <w:proofErr w:type="spellStart"/>
+      <w:r>
+        <w:rPr>
+          <w:rFonts w:ascii="Aptos" w:eastAsia="Aptos" w:hAnsi="Aptos" w:cs="Aptos"/>
+        </w:rPr>
+        <w:t>tblScreening</w:t>
+      </w:r>
+      <w:proofErr w:type="spellEnd"/>
+      <w:r>
+        <w:rPr>
+          <w:rFonts w:ascii="Aptos" w:eastAsia="Aptos" w:hAnsi="Aptos" w:cs="Aptos"/>
+        </w:rPr>
+        <w:t xml:space="preserve"> table.</w:t>
       </w:r>
     </w:p>
     <w:p>
@@ -378,7 +1016,63 @@
         <w:rPr>
           <w:rFonts w:ascii="Aptos" w:eastAsia="Aptos" w:hAnsi="Aptos" w:cs="Aptos"/>
         </w:rPr>
-        <w:t>Before a screening can be booked the cinema needs its physical screens set up in the system, each with the right number of seats. This objective is handled by the form named frmScreens, which once again uses the same familiar management layout with a data grid view named dgvScreens listing the existing screens and a small set of inputs with Add, Update, Delete and Clear buttons, so I will refer back to the Add Films form for that general behaviour. There are only two inputs here, a text box named txtName for the name of the screen and a text box named txtCapacity for how many seats it has.</w:t>
+        <w:t xml:space="preserve">Before a screening can be booked the cinema needs its physical screens set up in the system, each with the right number of seats. This objective is handled by the form named </w:t>
+      </w:r>
+      <w:proofErr w:type="spellStart"/>
+      <w:r>
+        <w:rPr>
+          <w:rFonts w:ascii="Aptos" w:eastAsia="Aptos" w:hAnsi="Aptos" w:cs="Aptos"/>
+        </w:rPr>
+        <w:t>frmScreens</w:t>
+      </w:r>
+      <w:proofErr w:type="spellEnd"/>
+      <w:r>
+        <w:rPr>
+          <w:rFonts w:ascii="Aptos" w:eastAsia="Aptos" w:hAnsi="Aptos" w:cs="Aptos"/>
+        </w:rPr>
+        <w:t xml:space="preserve">, which once again uses the same familiar management layout with a data grid view named </w:t>
+      </w:r>
+      <w:proofErr w:type="spellStart"/>
+      <w:r>
+        <w:rPr>
+          <w:rFonts w:ascii="Aptos" w:eastAsia="Aptos" w:hAnsi="Aptos" w:cs="Aptos"/>
+        </w:rPr>
+        <w:t>dgvScreens</w:t>
+      </w:r>
+      <w:proofErr w:type="spellEnd"/>
+      <w:r>
+        <w:rPr>
+          <w:rFonts w:ascii="Aptos" w:eastAsia="Aptos" w:hAnsi="Aptos" w:cs="Aptos"/>
+        </w:rPr>
+        <w:t xml:space="preserve"> listing the existing screens and a small set of inputs with Add, Update, Delete and Clear buttons, so I will refer back to the Add Films form for that general behaviour. There are only two inputs here, a text box named </w:t>
+      </w:r>
+      <w:proofErr w:type="spellStart"/>
+      <w:r>
+        <w:rPr>
+          <w:rFonts w:ascii="Aptos" w:eastAsia="Aptos" w:hAnsi="Aptos" w:cs="Aptos"/>
+        </w:rPr>
+        <w:t>txtName</w:t>
+      </w:r>
+      <w:proofErr w:type="spellEnd"/>
+      <w:r>
+        <w:rPr>
+          <w:rFonts w:ascii="Aptos" w:eastAsia="Aptos" w:hAnsi="Aptos" w:cs="Aptos"/>
+        </w:rPr>
+        <w:t xml:space="preserve"> for the name of the screen and a text box named </w:t>
+      </w:r>
+      <w:proofErr w:type="spellStart"/>
+      <w:r>
+        <w:rPr>
+          <w:rFonts w:ascii="Aptos" w:eastAsia="Aptos" w:hAnsi="Aptos" w:cs="Aptos"/>
+        </w:rPr>
+        <w:t>txtCapacity</w:t>
+      </w:r>
+      <w:proofErr w:type="spellEnd"/>
+      <w:r>
+        <w:rPr>
+          <w:rFonts w:ascii="Aptos" w:eastAsia="Aptos" w:hAnsi="Aptos" w:cs="Aptos"/>
+        </w:rPr>
+        <w:t xml:space="preserve"> for how many seats it has.</w:t>
       </w:r>
     </w:p>
     <w:p>
@@ -413,7 +1107,31 @@
           <w:sz w:val="22"/>
           <w:szCs w:val="22"/>
         </w:rPr>
-        <w:t>Add Screens Form (frmScreens)</w:t>
+        <w:t>Add Screens Form (</w:t>
+      </w:r>
+      <w:proofErr w:type="spellStart"/>
+      <w:r>
+        <w:rPr>
+          <w:rFonts w:ascii="Aptos" w:eastAsia="Aptos" w:hAnsi="Aptos" w:cs="Aptos"/>
+          <w:b/>
+          <w:bCs/>
+          <w:color w:val="A02B93"/>
+          <w:sz w:val="22"/>
+          <w:szCs w:val="22"/>
+        </w:rPr>
+        <w:t>frmScreens</w:t>
+      </w:r>
+      <w:proofErr w:type="spellEnd"/>
+      <w:r>
+        <w:rPr>
+          <w:rFonts w:ascii="Aptos" w:eastAsia="Aptos" w:hAnsi="Aptos" w:cs="Aptos"/>
+          <w:b/>
+          <w:bCs/>
+          <w:color w:val="A02B93"/>
+          <w:sz w:val="22"/>
+          <w:szCs w:val="22"/>
+        </w:rPr>
+        <w:t>)</w:t>
       </w:r>
     </w:p>
     <w:p>
@@ -424,7 +1142,49 @@
         <w:rPr>
           <w:rFonts w:ascii="Aptos" w:eastAsia="Aptos" w:hAnsi="Aptos" w:cs="Aptos"/>
         </w:rPr>
-        <w:t>The inputs are the screen name and the capacity. The outputs are the updated list of screens and, crucially, a full set of seat records created in the tblSeat table for the new screen. The process behind the Add button is therefore two steps, first inserting the screen into the tblScreen table and reading back the new screen's identifier, and then looping to insert one seat record per seat into the tblSeat table so that the seats are ready for the booking form to use.</w:t>
+        <w:t xml:space="preserve">The inputs are the screen name and the capacity. The outputs are the updated list of screens and, crucially, a full set of seat records created in the </w:t>
+      </w:r>
+      <w:proofErr w:type="spellStart"/>
+      <w:r>
+        <w:rPr>
+          <w:rFonts w:ascii="Aptos" w:eastAsia="Aptos" w:hAnsi="Aptos" w:cs="Aptos"/>
+        </w:rPr>
+        <w:t>tblSeat</w:t>
+      </w:r>
+      <w:proofErr w:type="spellEnd"/>
+      <w:r>
+        <w:rPr>
+          <w:rFonts w:ascii="Aptos" w:eastAsia="Aptos" w:hAnsi="Aptos" w:cs="Aptos"/>
+        </w:rPr>
+        <w:t xml:space="preserve"> table for the new screen. The process behind the Add button is therefore two steps, first inserting the screen into the </w:t>
+      </w:r>
+      <w:proofErr w:type="spellStart"/>
+      <w:r>
+        <w:rPr>
+          <w:rFonts w:ascii="Aptos" w:eastAsia="Aptos" w:hAnsi="Aptos" w:cs="Aptos"/>
+        </w:rPr>
+        <w:t>tblScreen</w:t>
+      </w:r>
+      <w:proofErr w:type="spellEnd"/>
+      <w:r>
+        <w:rPr>
+          <w:rFonts w:ascii="Aptos" w:eastAsia="Aptos" w:hAnsi="Aptos" w:cs="Aptos"/>
+        </w:rPr>
+        <w:t xml:space="preserve"> table and reading back the new screen's identifier, and then looping to insert one seat record per seat into the </w:t>
+      </w:r>
+      <w:proofErr w:type="spellStart"/>
+      <w:r>
+        <w:rPr>
+          <w:rFonts w:ascii="Aptos" w:eastAsia="Aptos" w:hAnsi="Aptos" w:cs="Aptos"/>
+        </w:rPr>
+        <w:t>tblSeat</w:t>
+      </w:r>
+      <w:proofErr w:type="spellEnd"/>
+      <w:r>
+        <w:rPr>
+          <w:rFonts w:ascii="Aptos" w:eastAsia="Aptos" w:hAnsi="Aptos" w:cs="Aptos"/>
+        </w:rPr>
+        <w:t xml:space="preserve"> table so that the seats are ready for the booking form to use.</w:t>
       </w:r>
     </w:p>
     <w:p>
@@ -450,7 +1210,21 @@
         <w:rPr>
           <w:rFonts w:ascii="Aptos" w:eastAsia="Aptos" w:hAnsi="Aptos" w:cs="Aptos"/>
         </w:rPr>
-        <w:t>This is the heart of the whole system and the reason the project exists in the first place, so it is the most involved form to design. The objective is to let a member of staff create a booking for a customer against a particular screening, recording who the customer is, which seats they want and how many tickets that comes to, while making it impossible for a seat that has already been booked to be sold twice. Both of these objectives are handled together on the one form named frmBookings, because in practice they are the same job.</w:t>
+        <w:t xml:space="preserve">This is the heart of the whole system and the reason the project exists in the first place, so it is the most involved form to design. The objective is to let a member of staff create a booking for a customer against a particular screening, recording who the customer is, which seats they want and how many tickets that comes to, while making it impossible for a seat that has already been booked to be sold twice. Both of these objectives are handled together on the one form named </w:t>
+      </w:r>
+      <w:proofErr w:type="spellStart"/>
+      <w:r>
+        <w:rPr>
+          <w:rFonts w:ascii="Aptos" w:eastAsia="Aptos" w:hAnsi="Aptos" w:cs="Aptos"/>
+        </w:rPr>
+        <w:t>frmBookings</w:t>
+      </w:r>
+      <w:proofErr w:type="spellEnd"/>
+      <w:r>
+        <w:rPr>
+          <w:rFonts w:ascii="Aptos" w:eastAsia="Aptos" w:hAnsi="Aptos" w:cs="Aptos"/>
+        </w:rPr>
+        <w:t>, because in practice they are the same job.</w:t>
       </w:r>
     </w:p>
     <w:p>
@@ -461,14 +1235,154 @@
         <w:rPr>
           <w:rFonts w:ascii="Aptos" w:eastAsia="Aptos" w:hAnsi="Aptos" w:cs="Aptos"/>
         </w:rPr>
-        <w:t xml:space="preserve">The top of the form has two combo boxes, named cboScreening and cboCustomer, where the member of staff first picks which screening the booking is for and then which customer it belongs to. There is also a check box named chkWalkIn labelled Walk-in, which lets staff take a booking for a customer who has just walked in without recording their details. The largest part of the form is a panel named pnlSeatMap which draws the seat map for the chosen screening, and next to it is a small legend made up of three coloured swatches labelled Available, Selected and Taken so the user knows what the colours mean. A label named lblTotal keeps a running count of how many seats have been selected, and along </w:t>
+        <w:t xml:space="preserve">The top of the form has two combo boxes, named </w:t>
+      </w:r>
+      <w:proofErr w:type="spellStart"/>
+      <w:r>
+        <w:rPr>
+          <w:rFonts w:ascii="Aptos" w:eastAsia="Aptos" w:hAnsi="Aptos" w:cs="Aptos"/>
+        </w:rPr>
+        <w:t>cboScreening</w:t>
+      </w:r>
+      <w:proofErr w:type="spellEnd"/>
+      <w:r>
+        <w:rPr>
+          <w:rFonts w:ascii="Aptos" w:eastAsia="Aptos" w:hAnsi="Aptos" w:cs="Aptos"/>
+        </w:rPr>
+        <w:t xml:space="preserve"> and </w:t>
+      </w:r>
+      <w:proofErr w:type="spellStart"/>
+      <w:r>
+        <w:rPr>
+          <w:rFonts w:ascii="Aptos" w:eastAsia="Aptos" w:hAnsi="Aptos" w:cs="Aptos"/>
+        </w:rPr>
+        <w:t>cboCustomer</w:t>
+      </w:r>
+      <w:proofErr w:type="spellEnd"/>
+      <w:r>
+        <w:rPr>
+          <w:rFonts w:ascii="Aptos" w:eastAsia="Aptos" w:hAnsi="Aptos" w:cs="Aptos"/>
+        </w:rPr>
+        <w:t xml:space="preserve">, where the member of staff first picks which screening the booking is for and then which customer it belongs to. There is also a check box named </w:t>
+      </w:r>
+      <w:proofErr w:type="spellStart"/>
+      <w:r>
+        <w:rPr>
+          <w:rFonts w:ascii="Aptos" w:eastAsia="Aptos" w:hAnsi="Aptos" w:cs="Aptos"/>
+        </w:rPr>
+        <w:t>chkWalkIn</w:t>
+      </w:r>
+      <w:proofErr w:type="spellEnd"/>
+      <w:r>
+        <w:rPr>
+          <w:rFonts w:ascii="Aptos" w:eastAsia="Aptos" w:hAnsi="Aptos" w:cs="Aptos"/>
+        </w:rPr>
+        <w:t xml:space="preserve"> labelled Walk-in, which lets staff take a booking for a customer who has just walked in without recording their details. The largest part of the form is a panel named </w:t>
+      </w:r>
+      <w:proofErr w:type="spellStart"/>
+      <w:r>
+        <w:rPr>
+          <w:rFonts w:ascii="Aptos" w:eastAsia="Aptos" w:hAnsi="Aptos" w:cs="Aptos"/>
+        </w:rPr>
+        <w:t>pnlSeatMap</w:t>
+      </w:r>
+      <w:proofErr w:type="spellEnd"/>
+      <w:r>
+        <w:rPr>
+          <w:rFonts w:ascii="Aptos" w:eastAsia="Aptos" w:hAnsi="Aptos" w:cs="Aptos"/>
+        </w:rPr>
+        <w:t xml:space="preserve"> which draws the seat map for the chosen screening, and next to it is a small legend made up of three coloured swatches labelled Available, Selected and Taken so the user knows what the colours mean. A label named </w:t>
+      </w:r>
+      <w:proofErr w:type="spellStart"/>
+      <w:r>
+        <w:rPr>
+          <w:rFonts w:ascii="Aptos" w:eastAsia="Aptos" w:hAnsi="Aptos" w:cs="Aptos"/>
+        </w:rPr>
+        <w:t>lblTotal</w:t>
+      </w:r>
+      <w:proofErr w:type="spellEnd"/>
+      <w:r>
+        <w:rPr>
+          <w:rFonts w:ascii="Aptos" w:eastAsia="Aptos" w:hAnsi="Aptos" w:cs="Aptos"/>
+        </w:rPr>
+        <w:t xml:space="preserve"> keeps a running count of how many seats have been selected, and along </w:t>
       </w:r>
       <w:r>
         <w:rPr>
           <w:rFonts w:ascii="Aptos" w:eastAsia="Aptos" w:hAnsi="Aptos" w:cs="Aptos"/>
         </w:rPr>
         <w:lastRenderedPageBreak/>
-        <w:t>the bottom are the action buttons, Create Booking named btnCreateBooking, Clear Selection named btnClear, Order Food named btnOrderFood and Sell Food Only named btnFoodOnly. A grid named dgvCustomerBookings shows the bookings the selected customer already has.</w:t>
+        <w:t xml:space="preserve">the bottom are the action buttons, Create Booking named </w:t>
+      </w:r>
+      <w:proofErr w:type="spellStart"/>
+      <w:r>
+        <w:rPr>
+          <w:rFonts w:ascii="Aptos" w:eastAsia="Aptos" w:hAnsi="Aptos" w:cs="Aptos"/>
+        </w:rPr>
+        <w:t>btnCreateBooking</w:t>
+      </w:r>
+      <w:proofErr w:type="spellEnd"/>
+      <w:r>
+        <w:rPr>
+          <w:rFonts w:ascii="Aptos" w:eastAsia="Aptos" w:hAnsi="Aptos" w:cs="Aptos"/>
+        </w:rPr>
+        <w:t xml:space="preserve">, Clear Selection named </w:t>
+      </w:r>
+      <w:proofErr w:type="spellStart"/>
+      <w:r>
+        <w:rPr>
+          <w:rFonts w:ascii="Aptos" w:eastAsia="Aptos" w:hAnsi="Aptos" w:cs="Aptos"/>
+        </w:rPr>
+        <w:t>btnClear</w:t>
+      </w:r>
+      <w:proofErr w:type="spellEnd"/>
+      <w:r>
+        <w:rPr>
+          <w:rFonts w:ascii="Aptos" w:eastAsia="Aptos" w:hAnsi="Aptos" w:cs="Aptos"/>
+        </w:rPr>
+        <w:t xml:space="preserve">, Order Food named </w:t>
+      </w:r>
+      <w:proofErr w:type="spellStart"/>
+      <w:r>
+        <w:rPr>
+          <w:rFonts w:ascii="Aptos" w:eastAsia="Aptos" w:hAnsi="Aptos" w:cs="Aptos"/>
+        </w:rPr>
+        <w:t>btnOrderFood</w:t>
+      </w:r>
+      <w:proofErr w:type="spellEnd"/>
+      <w:r>
+        <w:rPr>
+          <w:rFonts w:ascii="Aptos" w:eastAsia="Aptos" w:hAnsi="Aptos" w:cs="Aptos"/>
+        </w:rPr>
+        <w:t xml:space="preserve"> and Sell Food Only named </w:t>
+      </w:r>
+      <w:proofErr w:type="spellStart"/>
+      <w:r>
+        <w:rPr>
+          <w:rFonts w:ascii="Aptos" w:eastAsia="Aptos" w:hAnsi="Aptos" w:cs="Aptos"/>
+        </w:rPr>
+        <w:t>btnFoodOnly</w:t>
+      </w:r>
+      <w:proofErr w:type="spellEnd"/>
+      <w:r>
+        <w:rPr>
+          <w:rFonts w:ascii="Aptos" w:eastAsia="Aptos" w:hAnsi="Aptos" w:cs="Aptos"/>
+        </w:rPr>
+        <w:t xml:space="preserve">. A grid named </w:t>
+      </w:r>
+      <w:proofErr w:type="spellStart"/>
+      <w:r>
+        <w:rPr>
+          <w:rFonts w:ascii="Aptos" w:eastAsia="Aptos" w:hAnsi="Aptos" w:cs="Aptos"/>
+        </w:rPr>
+        <w:t>dgvCustomerBookings</w:t>
+      </w:r>
+      <w:proofErr w:type="spellEnd"/>
+      <w:r>
+        <w:rPr>
+          <w:rFonts w:ascii="Aptos" w:eastAsia="Aptos" w:hAnsi="Aptos" w:cs="Aptos"/>
+        </w:rPr>
+        <w:t xml:space="preserve"> shows the bookings the selected customer already has.</w:t>
       </w:r>
     </w:p>
     <w:p>
@@ -491,7 +1405,31 @@
           <w:sz w:val="22"/>
           <w:szCs w:val="22"/>
         </w:rPr>
-        <w:t>Bookings Form (frmBookings)</w:t>
+        <w:t>Bookings Form (</w:t>
+      </w:r>
+      <w:proofErr w:type="spellStart"/>
+      <w:r>
+        <w:rPr>
+          <w:rFonts w:ascii="Aptos" w:eastAsia="Aptos" w:hAnsi="Aptos" w:cs="Aptos"/>
+          <w:b/>
+          <w:bCs/>
+          <w:color w:val="A02B93"/>
+          <w:sz w:val="22"/>
+          <w:szCs w:val="22"/>
+        </w:rPr>
+        <w:t>frmBookings</w:t>
+      </w:r>
+      <w:proofErr w:type="spellEnd"/>
+      <w:r>
+        <w:rPr>
+          <w:rFonts w:ascii="Aptos" w:eastAsia="Aptos" w:hAnsi="Aptos" w:cs="Aptos"/>
+          <w:b/>
+          <w:bCs/>
+          <w:color w:val="A02B93"/>
+          <w:sz w:val="22"/>
+          <w:szCs w:val="22"/>
+        </w:rPr>
+        <w:t>)</w:t>
       </w:r>
     </w:p>
     <w:p>
@@ -502,7 +1440,35 @@
         <w:rPr>
           <w:rFonts w:ascii="Aptos" w:eastAsia="Aptos" w:hAnsi="Aptos" w:cs="Aptos"/>
         </w:rPr>
-        <w:t>The way the member of staff uses the form is that they choose a screening, choose a customer or tick the walk-in box, and the seat map then draws itself as a grid of clickable seat buttons laid out like the inside of the screen. Clicking an available seat selects it and it changes colour, and the running total updates as they go. When they are happy they press Create Booking. The inputs to the form are therefore the chosen screening, the chosen customer and the seats that are clicked. The outputs are the saved booking, a confirmation message, the refreshed seat map and the updated list of that customer's bookings. The processes behind the scenes are the insertion of a new record into the tblBooking table and the insertion of each chosen seat into the tblBookingSeat table.</w:t>
+        <w:t xml:space="preserve">The way the member of staff uses the form is that they choose a screening, choose a customer or tick the walk-in box, and the seat map then draws itself as a grid of clickable seat buttons laid out like the inside of the screen. Clicking an available seat selects it and it changes colour, and the running total updates as they go. When they are happy they press Create Booking. The inputs to the form are therefore the chosen screening, the chosen customer and the seats that are clicked. The outputs are the saved booking, a confirmation message, the refreshed seat map and the updated list of that customer's bookings. The processes behind the scenes are the insertion of a new record into the </w:t>
+      </w:r>
+      <w:proofErr w:type="spellStart"/>
+      <w:r>
+        <w:rPr>
+          <w:rFonts w:ascii="Aptos" w:eastAsia="Aptos" w:hAnsi="Aptos" w:cs="Aptos"/>
+        </w:rPr>
+        <w:t>tblBooking</w:t>
+      </w:r>
+      <w:proofErr w:type="spellEnd"/>
+      <w:r>
+        <w:rPr>
+          <w:rFonts w:ascii="Aptos" w:eastAsia="Aptos" w:hAnsi="Aptos" w:cs="Aptos"/>
+        </w:rPr>
+        <w:t xml:space="preserve"> table and the insertion of each chosen seat into the </w:t>
+      </w:r>
+      <w:proofErr w:type="spellStart"/>
+      <w:r>
+        <w:rPr>
+          <w:rFonts w:ascii="Aptos" w:eastAsia="Aptos" w:hAnsi="Aptos" w:cs="Aptos"/>
+        </w:rPr>
+        <w:t>tblBookingSeat</w:t>
+      </w:r>
+      <w:proofErr w:type="spellEnd"/>
+      <w:r>
+        <w:rPr>
+          <w:rFonts w:ascii="Aptos" w:eastAsia="Aptos" w:hAnsi="Aptos" w:cs="Aptos"/>
+        </w:rPr>
+        <w:t xml:space="preserve"> table.</w:t>
       </w:r>
     </w:p>
     <w:p>
@@ -513,7 +1479,35 @@
         <w:rPr>
           <w:rFonts w:ascii="Aptos" w:eastAsia="Aptos" w:hAnsi="Aptos" w:cs="Aptos"/>
         </w:rPr>
-        <w:t>Preventing double bookings, which is the whole point of Objective 2, is built directly into how the seat map is drawn. This is because when the map loads it asks the database which seats have already been booked for that screening, by looking in the tblBookingSeat table joined to the tblBooking table, and any seat that comes back as already taken is coloured with the Taken colour and, more importantly, is disabled so that it physically cannot be clicked. On top of that, as a second line of defence, when Create Booking is pressed the system checks once more that none of the selected seats have been taken by someone else in the meantime before it saves anything. In this way a seat can never be sold twice, both because a taken seat cannot be selected in the first place and because it is checked again at the moment of saving. I chose a clickable graphical seat map rather than, for example, asking staff to type in seat numbers, this is because it lets them see the whole screen at a glance and makes double booking obvious and impossible in a way that a list of numbers never could.</w:t>
+        <w:t xml:space="preserve">Preventing double bookings, which is the whole point of Objective 2, is built directly into how the seat map is drawn. This is because when the map loads it asks the database which seats have already been booked for that screening, by looking in the </w:t>
+      </w:r>
+      <w:proofErr w:type="spellStart"/>
+      <w:r>
+        <w:rPr>
+          <w:rFonts w:ascii="Aptos" w:eastAsia="Aptos" w:hAnsi="Aptos" w:cs="Aptos"/>
+        </w:rPr>
+        <w:t>tblBookingSeat</w:t>
+      </w:r>
+      <w:proofErr w:type="spellEnd"/>
+      <w:r>
+        <w:rPr>
+          <w:rFonts w:ascii="Aptos" w:eastAsia="Aptos" w:hAnsi="Aptos" w:cs="Aptos"/>
+        </w:rPr>
+        <w:t xml:space="preserve"> table joined to the </w:t>
+      </w:r>
+      <w:proofErr w:type="spellStart"/>
+      <w:r>
+        <w:rPr>
+          <w:rFonts w:ascii="Aptos" w:eastAsia="Aptos" w:hAnsi="Aptos" w:cs="Aptos"/>
+        </w:rPr>
+        <w:t>tblBooking</w:t>
+      </w:r>
+      <w:proofErr w:type="spellEnd"/>
+      <w:r>
+        <w:rPr>
+          <w:rFonts w:ascii="Aptos" w:eastAsia="Aptos" w:hAnsi="Aptos" w:cs="Aptos"/>
+        </w:rPr>
+        <w:t xml:space="preserve"> table, and any seat that comes back as already taken is coloured with the Taken colour and, more importantly, is disabled so that it physically cannot be clicked. On top of that, as a second line of defence, when Create Booking is pressed the system checks once more that none of the selected seats have been taken by someone else in the meantime before it saves anything. In this way a seat can never be sold twice, both because a taken seat cannot be selected in the first place and because it is checked again at the moment of saving. I chose a clickable graphical seat map rather than, for example, asking staff to type in seat numbers, this is because it lets them see the whole screen at a glance and makes double booking obvious and impossible in a way that a list of numbers never could.</w:t>
       </w:r>
     </w:p>
     <w:p>
@@ -539,7 +1533,35 @@
         <w:rPr>
           <w:rFonts w:ascii="Aptos" w:eastAsia="Aptos" w:hAnsi="Aptos" w:cs="Aptos"/>
         </w:rPr>
-        <w:t>This objective is really a closer look at the seat map that has just been described on the booking form, so rather than design a separate screen for it I will refer back to the frmBookings form above. The seat map is the panel named pnlSeatMap, and its job is to show, for a chosen screening, exactly which seats are free and which are already booked. It does this by drawing one button for every seat in the chosen screen, arranged in rows so that it looks like the layout of a real cinema, with a label above reading SCREEN so the user can tell which way round they are looking.</w:t>
+        <w:t xml:space="preserve">This objective is really a closer look at the seat map that has just been described on the booking form, so rather than design a separate screen for it I will refer back to the </w:t>
+      </w:r>
+      <w:proofErr w:type="spellStart"/>
+      <w:r>
+        <w:rPr>
+          <w:rFonts w:ascii="Aptos" w:eastAsia="Aptos" w:hAnsi="Aptos" w:cs="Aptos"/>
+        </w:rPr>
+        <w:t>frmBookings</w:t>
+      </w:r>
+      <w:proofErr w:type="spellEnd"/>
+      <w:r>
+        <w:rPr>
+          <w:rFonts w:ascii="Aptos" w:eastAsia="Aptos" w:hAnsi="Aptos" w:cs="Aptos"/>
+        </w:rPr>
+        <w:t xml:space="preserve"> form above. The seat map is the panel named </w:t>
+      </w:r>
+      <w:proofErr w:type="spellStart"/>
+      <w:r>
+        <w:rPr>
+          <w:rFonts w:ascii="Aptos" w:eastAsia="Aptos" w:hAnsi="Aptos" w:cs="Aptos"/>
+        </w:rPr>
+        <w:t>pnlSeatMap</w:t>
+      </w:r>
+      <w:proofErr w:type="spellEnd"/>
+      <w:r>
+        <w:rPr>
+          <w:rFonts w:ascii="Aptos" w:eastAsia="Aptos" w:hAnsi="Aptos" w:cs="Aptos"/>
+        </w:rPr>
+        <w:t>, and its job is to show, for a chosen screening, exactly which seats are free and which are already booked. It does this by drawing one button for every seat in the chosen screen, arranged in rows so that it looks like the layout of a real cinema, with a label above reading SCREEN so the user can tell which way round they are looking.</w:t>
       </w:r>
     </w:p>
     <w:p>
@@ -577,7 +1599,35 @@
         <w:rPr>
           <w:rFonts w:ascii="Aptos" w:eastAsia="Aptos" w:hAnsi="Aptos" w:cs="Aptos"/>
         </w:rPr>
-        <w:t>One of the main aims of Filmtopia was that a customer should be able to add food and drink onto their ticket booking in the same visit, so that it feels like one joined-up transaction rather than two separate ones. This objective is handled by the form named frmFoodOrder, which is opened straight from the booking form by pressing the Order Food button once a booking has been made, or by pressing Sell Food Only if the customer only wants snacks and no seat. Opening it directly from the booking is a deliberate design choice, this is because it keeps the whole thing as a single flowing process for the member of staff.</w:t>
+        <w:t xml:space="preserve">One of the main aims of </w:t>
+      </w:r>
+      <w:proofErr w:type="spellStart"/>
+      <w:r>
+        <w:rPr>
+          <w:rFonts w:ascii="Aptos" w:eastAsia="Aptos" w:hAnsi="Aptos" w:cs="Aptos"/>
+        </w:rPr>
+        <w:t>Filmtopia</w:t>
+      </w:r>
+      <w:proofErr w:type="spellEnd"/>
+      <w:r>
+        <w:rPr>
+          <w:rFonts w:ascii="Aptos" w:eastAsia="Aptos" w:hAnsi="Aptos" w:cs="Aptos"/>
+        </w:rPr>
+        <w:t xml:space="preserve"> was that a customer should be able to add food and drink onto their ticket booking in the same visit, so that it feels like one joined-up transaction rather than two separate ones. This objective is handled by the form named </w:t>
+      </w:r>
+      <w:proofErr w:type="spellStart"/>
+      <w:r>
+        <w:rPr>
+          <w:rFonts w:ascii="Aptos" w:eastAsia="Aptos" w:hAnsi="Aptos" w:cs="Aptos"/>
+        </w:rPr>
+        <w:t>frmFoodOrder</w:t>
+      </w:r>
+      <w:proofErr w:type="spellEnd"/>
+      <w:r>
+        <w:rPr>
+          <w:rFonts w:ascii="Aptos" w:eastAsia="Aptos" w:hAnsi="Aptos" w:cs="Aptos"/>
+        </w:rPr>
+        <w:t>, which is opened straight from the booking form by pressing the Order Food button once a booking has been made, or by pressing Sell Food Only if the customer only wants snacks and no seat. Opening it directly from the booking is a deliberate design choice, this is because it keeps the whole thing as a single flowing process for the member of staff.</w:t>
       </w:r>
     </w:p>
     <w:p>
@@ -588,7 +1638,133 @@
         <w:rPr>
           <w:rFonts w:ascii="Aptos" w:eastAsia="Aptos" w:hAnsi="Aptos" w:cs="Aptos"/>
         </w:rPr>
-        <w:t>At the top of the form a label named lblBookingInfo shows which booking the food is being added to, so there is no confusion about whose order it is. Below that is a combo box named cboFoodItem where the user picks a food or drink item from the list the cinema sells, a label named lblPrice which shows the price of the chosen item, and a text box named txtQuantity for how many they want, which sensibly defaults to one. A grid named dgvOrderItems builds up the list of items that have been added to the order, and a label named lblTotal keeps a running total of the cost. The buttons are Add To Order named btnAddItem, Remove Selected named btnRemoveItem, and Close named btnClose.</w:t>
+        <w:t xml:space="preserve">At the top of the form a label named </w:t>
+      </w:r>
+      <w:proofErr w:type="spellStart"/>
+      <w:r>
+        <w:rPr>
+          <w:rFonts w:ascii="Aptos" w:eastAsia="Aptos" w:hAnsi="Aptos" w:cs="Aptos"/>
+        </w:rPr>
+        <w:t>lblBookingInfo</w:t>
+      </w:r>
+      <w:proofErr w:type="spellEnd"/>
+      <w:r>
+        <w:rPr>
+          <w:rFonts w:ascii="Aptos" w:eastAsia="Aptos" w:hAnsi="Aptos" w:cs="Aptos"/>
+        </w:rPr>
+        <w:t xml:space="preserve"> shows which booking the food is being added to, so there is no confusion about whose order it is. Below that is a combo box named </w:t>
+      </w:r>
+      <w:proofErr w:type="spellStart"/>
+      <w:r>
+        <w:rPr>
+          <w:rFonts w:ascii="Aptos" w:eastAsia="Aptos" w:hAnsi="Aptos" w:cs="Aptos"/>
+        </w:rPr>
+        <w:t>cboFoodItem</w:t>
+      </w:r>
+      <w:proofErr w:type="spellEnd"/>
+      <w:r>
+        <w:rPr>
+          <w:rFonts w:ascii="Aptos" w:eastAsia="Aptos" w:hAnsi="Aptos" w:cs="Aptos"/>
+        </w:rPr>
+        <w:t xml:space="preserve"> where the user picks a food or drink item from the list the cinema sells, a label named </w:t>
+      </w:r>
+      <w:proofErr w:type="spellStart"/>
+      <w:r>
+        <w:rPr>
+          <w:rFonts w:ascii="Aptos" w:eastAsia="Aptos" w:hAnsi="Aptos" w:cs="Aptos"/>
+        </w:rPr>
+        <w:t>lblPrice</w:t>
+      </w:r>
+      <w:proofErr w:type="spellEnd"/>
+      <w:r>
+        <w:rPr>
+          <w:rFonts w:ascii="Aptos" w:eastAsia="Aptos" w:hAnsi="Aptos" w:cs="Aptos"/>
+        </w:rPr>
+        <w:t xml:space="preserve"> which shows the price of the chosen item, and a text box named </w:t>
+      </w:r>
+      <w:proofErr w:type="spellStart"/>
+      <w:r>
+        <w:rPr>
+          <w:rFonts w:ascii="Aptos" w:eastAsia="Aptos" w:hAnsi="Aptos" w:cs="Aptos"/>
+        </w:rPr>
+        <w:t>txtQuantity</w:t>
+      </w:r>
+      <w:proofErr w:type="spellEnd"/>
+      <w:r>
+        <w:rPr>
+          <w:rFonts w:ascii="Aptos" w:eastAsia="Aptos" w:hAnsi="Aptos" w:cs="Aptos"/>
+        </w:rPr>
+        <w:t xml:space="preserve"> for how many they want, which sensibly defaults to one. A grid named </w:t>
+      </w:r>
+      <w:proofErr w:type="spellStart"/>
+      <w:r>
+        <w:rPr>
+          <w:rFonts w:ascii="Aptos" w:eastAsia="Aptos" w:hAnsi="Aptos" w:cs="Aptos"/>
+        </w:rPr>
+        <w:t>dgvOrderItems</w:t>
+      </w:r>
+      <w:proofErr w:type="spellEnd"/>
+      <w:r>
+        <w:rPr>
+          <w:rFonts w:ascii="Aptos" w:eastAsia="Aptos" w:hAnsi="Aptos" w:cs="Aptos"/>
+        </w:rPr>
+        <w:t xml:space="preserve"> builds up the list of items that have been added to the order, and a label named </w:t>
+      </w:r>
+      <w:proofErr w:type="spellStart"/>
+      <w:r>
+        <w:rPr>
+          <w:rFonts w:ascii="Aptos" w:eastAsia="Aptos" w:hAnsi="Aptos" w:cs="Aptos"/>
+        </w:rPr>
+        <w:t>lblTotal</w:t>
+      </w:r>
+      <w:proofErr w:type="spellEnd"/>
+      <w:r>
+        <w:rPr>
+          <w:rFonts w:ascii="Aptos" w:eastAsia="Aptos" w:hAnsi="Aptos" w:cs="Aptos"/>
+        </w:rPr>
+        <w:t xml:space="preserve"> keeps a running total of the cost. The buttons are Add To Order named </w:t>
+      </w:r>
+      <w:proofErr w:type="spellStart"/>
+      <w:r>
+        <w:rPr>
+          <w:rFonts w:ascii="Aptos" w:eastAsia="Aptos" w:hAnsi="Aptos" w:cs="Aptos"/>
+        </w:rPr>
+        <w:t>btnAddItem</w:t>
+      </w:r>
+      <w:proofErr w:type="spellEnd"/>
+      <w:r>
+        <w:rPr>
+          <w:rFonts w:ascii="Aptos" w:eastAsia="Aptos" w:hAnsi="Aptos" w:cs="Aptos"/>
+        </w:rPr>
+        <w:t xml:space="preserve">, Remove Selected named </w:t>
+      </w:r>
+      <w:proofErr w:type="spellStart"/>
+      <w:r>
+        <w:rPr>
+          <w:rFonts w:ascii="Aptos" w:eastAsia="Aptos" w:hAnsi="Aptos" w:cs="Aptos"/>
+        </w:rPr>
+        <w:t>btnRemoveItem</w:t>
+      </w:r>
+      <w:proofErr w:type="spellEnd"/>
+      <w:r>
+        <w:rPr>
+          <w:rFonts w:ascii="Aptos" w:eastAsia="Aptos" w:hAnsi="Aptos" w:cs="Aptos"/>
+        </w:rPr>
+        <w:t xml:space="preserve">, and Close named </w:t>
+      </w:r>
+      <w:proofErr w:type="spellStart"/>
+      <w:r>
+        <w:rPr>
+          <w:rFonts w:ascii="Aptos" w:eastAsia="Aptos" w:hAnsi="Aptos" w:cs="Aptos"/>
+        </w:rPr>
+        <w:t>btnClose</w:t>
+      </w:r>
+      <w:proofErr w:type="spellEnd"/>
+      <w:r>
+        <w:rPr>
+          <w:rFonts w:ascii="Aptos" w:eastAsia="Aptos" w:hAnsi="Aptos" w:cs="Aptos"/>
+        </w:rPr>
+        <w:t>.</w:t>
       </w:r>
     </w:p>
     <w:p>
@@ -611,7 +1787,31 @@
           <w:sz w:val="22"/>
           <w:szCs w:val="22"/>
         </w:rPr>
-        <w:t>Food Order Form (frmFoodOrder)</w:t>
+        <w:t>Food Order Form (</w:t>
+      </w:r>
+      <w:proofErr w:type="spellStart"/>
+      <w:r>
+        <w:rPr>
+          <w:rFonts w:ascii="Aptos" w:eastAsia="Aptos" w:hAnsi="Aptos" w:cs="Aptos"/>
+          <w:b/>
+          <w:bCs/>
+          <w:color w:val="A02B93"/>
+          <w:sz w:val="22"/>
+          <w:szCs w:val="22"/>
+        </w:rPr>
+        <w:t>frmFoodOrder</w:t>
+      </w:r>
+      <w:proofErr w:type="spellEnd"/>
+      <w:r>
+        <w:rPr>
+          <w:rFonts w:ascii="Aptos" w:eastAsia="Aptos" w:hAnsi="Aptos" w:cs="Aptos"/>
+          <w:b/>
+          <w:bCs/>
+          <w:color w:val="A02B93"/>
+          <w:sz w:val="22"/>
+          <w:szCs w:val="22"/>
+        </w:rPr>
+        <w:t>)</w:t>
       </w:r>
     </w:p>
     <w:p>
@@ -622,7 +1822,21 @@
         <w:rPr>
           <w:rFonts w:ascii="Aptos" w:eastAsia="Aptos" w:hAnsi="Aptos" w:cs="Aptos"/>
         </w:rPr>
-        <w:t xml:space="preserve">The inputs to this form are the food item chosen and the quantity. The outputs are the growing list of items in the grid, the updated running total, and the items being saved against the booking. The process behind the Add To Order button is to insert the chosen item and quantity into the tblOrderItem table linked to the booking, and then to recalculate and display the new total. I chose a combo box for the items rather than a text box because the food menu is a fixed list, so picking from it is both faster and stops the user entering </w:t>
+        <w:t xml:space="preserve">The inputs to this form are the food item chosen and the quantity. The outputs are the growing list of items in the grid, the updated running total, and the items being saved against the booking. The process behind the Add To Order button is to insert the chosen item and quantity into the </w:t>
+      </w:r>
+      <w:proofErr w:type="spellStart"/>
+      <w:r>
+        <w:rPr>
+          <w:rFonts w:ascii="Aptos" w:eastAsia="Aptos" w:hAnsi="Aptos" w:cs="Aptos"/>
+        </w:rPr>
+        <w:t>tblOrderItem</w:t>
+      </w:r>
+      <w:proofErr w:type="spellEnd"/>
+      <w:r>
+        <w:rPr>
+          <w:rFonts w:ascii="Aptos" w:eastAsia="Aptos" w:hAnsi="Aptos" w:cs="Aptos"/>
+        </w:rPr>
+        <w:t xml:space="preserve"> table linked to the booking, and then to recalculate and display the new total. I chose a combo box for the items rather than a text box because the food menu is a fixed list, so picking from it is both faster and stops the user entering </w:t>
       </w:r>
       <w:r>
         <w:rPr>
@@ -655,7 +1869,77 @@
         <w:rPr>
           <w:rFonts w:ascii="Aptos" w:eastAsia="Aptos" w:hAnsi="Aptos" w:cs="Aptos"/>
         </w:rPr>
-        <w:t>Staff often need to find a booking again after it has been made, for example if a customer rings up about it, so this objective provides a way to search for one. It is handled by the form named frmBookingSearch, which is reached from the Find Booking button on the main menu. This same form also handles cancelling a booking and viewing the screening register, which are the next two objectives, because they all naturally belong together in one place. For the search itself the form has a text box named txtSearch, labelled Booking ID or Customer Name, a Search button named btnSearch, a Show All button named btnShowAll, and a grid named dgvBookings where the results appear.</w:t>
+        <w:t xml:space="preserve">Staff often need to find a booking again after it has been made, for example if a customer rings up about it, so this objective provides a way to search for one. It is handled by the form named </w:t>
+      </w:r>
+      <w:proofErr w:type="spellStart"/>
+      <w:r>
+        <w:rPr>
+          <w:rFonts w:ascii="Aptos" w:eastAsia="Aptos" w:hAnsi="Aptos" w:cs="Aptos"/>
+        </w:rPr>
+        <w:t>frmBookingSearch</w:t>
+      </w:r>
+      <w:proofErr w:type="spellEnd"/>
+      <w:r>
+        <w:rPr>
+          <w:rFonts w:ascii="Aptos" w:eastAsia="Aptos" w:hAnsi="Aptos" w:cs="Aptos"/>
+        </w:rPr>
+        <w:t xml:space="preserve">, which is reached from the Find Booking button on the main menu. This same form also handles cancelling a booking and viewing the screening register, which are the next two objectives, because they all naturally belong together in one place. For the search itself the form has a text box named </w:t>
+      </w:r>
+      <w:proofErr w:type="spellStart"/>
+      <w:r>
+        <w:rPr>
+          <w:rFonts w:ascii="Aptos" w:eastAsia="Aptos" w:hAnsi="Aptos" w:cs="Aptos"/>
+        </w:rPr>
+        <w:t>txtSearch</w:t>
+      </w:r>
+      <w:proofErr w:type="spellEnd"/>
+      <w:r>
+        <w:rPr>
+          <w:rFonts w:ascii="Aptos" w:eastAsia="Aptos" w:hAnsi="Aptos" w:cs="Aptos"/>
+        </w:rPr>
+        <w:t xml:space="preserve">, labelled Booking ID or Customer Name, a Search button named </w:t>
+      </w:r>
+      <w:proofErr w:type="spellStart"/>
+      <w:r>
+        <w:rPr>
+          <w:rFonts w:ascii="Aptos" w:eastAsia="Aptos" w:hAnsi="Aptos" w:cs="Aptos"/>
+        </w:rPr>
+        <w:t>btnSearch</w:t>
+      </w:r>
+      <w:proofErr w:type="spellEnd"/>
+      <w:r>
+        <w:rPr>
+          <w:rFonts w:ascii="Aptos" w:eastAsia="Aptos" w:hAnsi="Aptos" w:cs="Aptos"/>
+        </w:rPr>
+        <w:t xml:space="preserve">, a Show All button named </w:t>
+      </w:r>
+      <w:proofErr w:type="spellStart"/>
+      <w:r>
+        <w:rPr>
+          <w:rFonts w:ascii="Aptos" w:eastAsia="Aptos" w:hAnsi="Aptos" w:cs="Aptos"/>
+        </w:rPr>
+        <w:t>btnShowAll</w:t>
+      </w:r>
+      <w:proofErr w:type="spellEnd"/>
+      <w:r>
+        <w:rPr>
+          <w:rFonts w:ascii="Aptos" w:eastAsia="Aptos" w:hAnsi="Aptos" w:cs="Aptos"/>
+        </w:rPr>
+        <w:t xml:space="preserve">, and a grid named </w:t>
+      </w:r>
+      <w:proofErr w:type="spellStart"/>
+      <w:r>
+        <w:rPr>
+          <w:rFonts w:ascii="Aptos" w:eastAsia="Aptos" w:hAnsi="Aptos" w:cs="Aptos"/>
+        </w:rPr>
+        <w:t>dgvBookings</w:t>
+      </w:r>
+      <w:proofErr w:type="spellEnd"/>
+      <w:r>
+        <w:rPr>
+          <w:rFonts w:ascii="Aptos" w:eastAsia="Aptos" w:hAnsi="Aptos" w:cs="Aptos"/>
+        </w:rPr>
+        <w:t xml:space="preserve"> where the results appear.</w:t>
       </w:r>
     </w:p>
     <w:p>
@@ -678,7 +1962,31 @@
           <w:sz w:val="22"/>
           <w:szCs w:val="22"/>
         </w:rPr>
-        <w:t>Booking Search Form (frmBookingSearch)</w:t>
+        <w:t>Booking Search Form (</w:t>
+      </w:r>
+      <w:proofErr w:type="spellStart"/>
+      <w:r>
+        <w:rPr>
+          <w:rFonts w:ascii="Aptos" w:eastAsia="Aptos" w:hAnsi="Aptos" w:cs="Aptos"/>
+          <w:b/>
+          <w:bCs/>
+          <w:color w:val="A02B93"/>
+          <w:sz w:val="22"/>
+          <w:szCs w:val="22"/>
+        </w:rPr>
+        <w:t>frmBookingSearch</w:t>
+      </w:r>
+      <w:proofErr w:type="spellEnd"/>
+      <w:r>
+        <w:rPr>
+          <w:rFonts w:ascii="Aptos" w:eastAsia="Aptos" w:hAnsi="Aptos" w:cs="Aptos"/>
+          <w:b/>
+          <w:bCs/>
+          <w:color w:val="A02B93"/>
+          <w:sz w:val="22"/>
+          <w:szCs w:val="22"/>
+        </w:rPr>
+        <w:t>)</w:t>
       </w:r>
       <w:r>
         <w:rPr>
@@ -700,7 +2008,121 @@
         <w:rPr>
           <w:rFonts w:ascii="Aptos" w:eastAsia="Aptos" w:hAnsi="Aptos" w:cs="Aptos"/>
         </w:rPr>
-        <w:t>The way it works is that the member of staff types either a booking reference or the customer's name into the search box and presses Search, and any matching bookings appear in the grid. If they would rather just see everything, the Show All button lists every booking in the system. The input is therefore the text typed into the search box, the output is the list of matching bookings, and the process behind it is a query against the tblBooking table, joined to the customer details, that looks for a booking whose identifier matches the number typed or whose customer name contains the text typed. I chose to have a single search box that accepts either a booking reference or a name, this is because staff will sometimes have the reference to hand and sometimes only the customer's name, so accepting both keeps it flexible, and the Show All button gives them a simple fallback when they are not sure what to search for.</w:t>
+        <w:t xml:space="preserve">The way it works is that the member of staff types either a booking reference or the customer's name into the search box and presses Search, and any matching bookings appear in the grid. If they would rather just see everything, the Show All button lists every booking in the system. The input is therefore the text typed into the search box, the output is the list of matching bookings, and the process behind it is a query against the </w:t>
+      </w:r>
+      <w:proofErr w:type="spellStart"/>
+      <w:r>
+        <w:rPr>
+          <w:rFonts w:ascii="Aptos" w:eastAsia="Aptos" w:hAnsi="Aptos" w:cs="Aptos"/>
+        </w:rPr>
+        <w:t>tblBooking</w:t>
+      </w:r>
+      <w:proofErr w:type="spellEnd"/>
+      <w:r>
+        <w:rPr>
+          <w:rFonts w:ascii="Aptos" w:eastAsia="Aptos" w:hAnsi="Aptos" w:cs="Aptos"/>
+        </w:rPr>
+        <w:t xml:space="preserve"> table, joined to the customer details, that looks for a booking whose identifier matches the number typed or whose customer name contains the text typed. I chose to have a single search box that accepts either a booking reference or a name, this is because staff will sometimes have the reference to hand and sometimes only the customer's name, so accepting both keeps it flexible, and the Show All button gives them a simple fallback when they are not sure what to search for.</w:t>
+      </w:r>
+    </w:p>
+    <w:p>
+      <w:pPr>
+        <w:pStyle w:val="Heading3"/>
+        <w:spacing w:before="260" w:after="120"/>
+      </w:pPr>
+      <w:r>
+        <w:rPr>
+          <w:rFonts w:ascii="Aptos Display" w:eastAsia="Aptos Display" w:hAnsi="Aptos Display" w:cs="Aptos Display"/>
+          <w:b/>
+          <w:bCs/>
+          <w:color w:val="000000"/>
+        </w:rPr>
+        <w:t>Cancelling a Booking (Objective 12)</w:t>
+      </w:r>
+    </w:p>
+    <w:p>
+      <w:pPr>
+        <w:spacing w:after="160" w:line="276" w:lineRule="auto"/>
+      </w:pPr>
+      <w:r>
+        <w:rPr>
+          <w:rFonts w:ascii="Aptos" w:eastAsia="Aptos" w:hAnsi="Aptos" w:cs="Aptos"/>
+        </w:rPr>
+        <w:t xml:space="preserve">Cancelling a booking is done on the same </w:t>
+      </w:r>
+      <w:proofErr w:type="spellStart"/>
+      <w:r>
+        <w:rPr>
+          <w:rFonts w:ascii="Aptos" w:eastAsia="Aptos" w:hAnsi="Aptos" w:cs="Aptos"/>
+        </w:rPr>
+        <w:t>frmBookingSearch</w:t>
+      </w:r>
+      <w:proofErr w:type="spellEnd"/>
+      <w:r>
+        <w:rPr>
+          <w:rFonts w:ascii="Aptos" w:eastAsia="Aptos" w:hAnsi="Aptos" w:cs="Aptos"/>
+        </w:rPr>
+        <w:t xml:space="preserve"> form that was just described, so I will refer back to it rather than design a new screen. Once a member of staff has found the booking they want using the search, they select it in the results grid and press the Cancel Booking button named </w:t>
+      </w:r>
+      <w:proofErr w:type="spellStart"/>
+      <w:r>
+        <w:rPr>
+          <w:rFonts w:ascii="Aptos" w:eastAsia="Aptos" w:hAnsi="Aptos" w:cs="Aptos"/>
+        </w:rPr>
+        <w:t>btnCancelBooking</w:t>
+      </w:r>
+      <w:proofErr w:type="spellEnd"/>
+      <w:r>
+        <w:rPr>
+          <w:rFonts w:ascii="Aptos" w:eastAsia="Aptos" w:hAnsi="Aptos" w:cs="Aptos"/>
+        </w:rPr>
+        <w:t>. The input is simply the booking that is selected, and there is no new information to type in. The output is the booking being removed and a confirmation that it has been cancelled.</w:t>
+      </w:r>
+    </w:p>
+    <w:p>
+      <w:pPr>
+        <w:spacing w:after="160" w:line="276" w:lineRule="auto"/>
+      </w:pPr>
+      <w:r>
+        <w:rPr>
+          <w:rFonts w:ascii="Aptos" w:eastAsia="Aptos" w:hAnsi="Aptos" w:cs="Aptos"/>
+        </w:rPr>
+        <w:t xml:space="preserve">The important part of this objective is what the process does behind the scenes, because cancelling a booking is not just about deleting it, it also has to free up the seats it was using. This is because if the seats were not released then those seats would stay marked as </w:t>
+      </w:r>
+      <w:r>
+        <w:rPr>
+          <w:rFonts w:ascii="Aptos" w:eastAsia="Aptos" w:hAnsi="Aptos" w:cs="Aptos"/>
+        </w:rPr>
+        <w:lastRenderedPageBreak/>
+        <w:t xml:space="preserve">taken forever and could never be sold again, which would be detrimental to the cinema. So when a booking is cancelled the system first removes that booking's seats from the </w:t>
+      </w:r>
+      <w:proofErr w:type="spellStart"/>
+      <w:r>
+        <w:rPr>
+          <w:rFonts w:ascii="Aptos" w:eastAsia="Aptos" w:hAnsi="Aptos" w:cs="Aptos"/>
+        </w:rPr>
+        <w:t>tblBookingSeat</w:t>
+      </w:r>
+      <w:proofErr w:type="spellEnd"/>
+      <w:r>
+        <w:rPr>
+          <w:rFonts w:ascii="Aptos" w:eastAsia="Aptos" w:hAnsi="Aptos" w:cs="Aptos"/>
+        </w:rPr>
+        <w:t xml:space="preserve"> table, which immediately makes them available again on the seat map, and then removes the booking itself from the </w:t>
+      </w:r>
+      <w:proofErr w:type="spellStart"/>
+      <w:r>
+        <w:rPr>
+          <w:rFonts w:ascii="Aptos" w:eastAsia="Aptos" w:hAnsi="Aptos" w:cs="Aptos"/>
+        </w:rPr>
+        <w:t>tblBooking</w:t>
+      </w:r>
+      <w:proofErr w:type="spellEnd"/>
+      <w:r>
+        <w:rPr>
+          <w:rFonts w:ascii="Aptos" w:eastAsia="Aptos" w:hAnsi="Aptos" w:cs="Aptos"/>
+        </w:rPr>
+        <w:t xml:space="preserve"> table. In this way the cancelled seats go straight back to showing as available the next time that screening's seat map is opened.</w:t>
       </w:r>
     </w:p>
     <w:p>
@@ -731,7 +2153,23 @@
         <w:spacing w:after="160" w:line="276" w:lineRule="auto"/>
       </w:pPr>
       <w:r>
-        <w:t>The purpose of this section is to specify the data structures that the Filmtopia system will use to store its data. As the system is built around a Microsoft Access database accessed through OleDb, these data structures take the form of database tables rather than arrays or other in memory structures. Each table and the relationships between them are described below, along with the way the data in those tables will be accessed. A key aim throughout the design has been to make sure the table structure is fully normalised to third normal form so that data is never repeated unnecessarily and the database cannot end up in an inconsistent state.</w:t>
+        <w:t xml:space="preserve">The purpose of this section is to specify the data structures that the </w:t>
+      </w:r>
+      <w:proofErr w:type="spellStart"/>
+      <w:r>
+        <w:t>Filmtopia</w:t>
+      </w:r>
+      <w:proofErr w:type="spellEnd"/>
+      <w:r>
+        <w:t xml:space="preserve"> system will use to store its data. As the system is built around a Microsoft Access database accessed through </w:t>
+      </w:r>
+      <w:proofErr w:type="spellStart"/>
+      <w:r>
+        <w:t>OleDb</w:t>
+      </w:r>
+      <w:proofErr w:type="spellEnd"/>
+      <w:r>
+        <w:t>, these data structures take the form of database tables rather than arrays or other in memory structures. Each table and the relationships between them are described below, along with the way the data in those tables will be accessed. A key aim throughout the design has been to make sure the table structure is fully normalised to third normal form so that data is never repeated unnecessarily and the database cannot end up in an inconsistent state.</w:t>
       </w:r>
     </w:p>
     <w:p>
@@ -838,7 +2276,23 @@
         <w:spacing w:after="160" w:line="276" w:lineRule="auto"/>
       </w:pPr>
       <w:r>
-        <w:t>The way to resolve a many to many relationship is to create a new link table that sits between the two original entities, turning the single many to many relationship into two separate one to many relationships. For the booking and seat relationship this link table is tblBookingSeat, and for the booking and food item relationship it is tblOrderItem. Each link table holds its own primary key along with the two foreign keys that point back to the tables it joins. The diagram below shows the final design once these link tables have been added, with the primary key of each table shown in bold and the foreign keys shown in italics.</w:t>
+        <w:t xml:space="preserve">The way to resolve a many to many relationship is to create a new link table that sits between the two original entities, turning the single many to many relationship into two separate one to many relationships. For the booking and seat relationship this link table is </w:t>
+      </w:r>
+      <w:proofErr w:type="spellStart"/>
+      <w:r>
+        <w:t>tblBookingSeat</w:t>
+      </w:r>
+      <w:proofErr w:type="spellEnd"/>
+      <w:r>
+        <w:t xml:space="preserve">, and for the booking and food item relationship it is </w:t>
+      </w:r>
+      <w:proofErr w:type="spellStart"/>
+      <w:r>
+        <w:t>tblOrderItem</w:t>
+      </w:r>
+      <w:proofErr w:type="spellEnd"/>
+      <w:r>
+        <w:t>. Each link table holds its own primary key along with the two foreign keys that point back to the tables it joins. The diagram below shows the final design once these link tables have been added, with the primary key of each table shown in bold and the foreign keys shown in italics.</w:t>
       </w:r>
     </w:p>
     <w:p>
@@ -911,7 +2365,55 @@
         <w:spacing w:after="160" w:line="276" w:lineRule="auto"/>
       </w:pPr>
       <w:r>
-        <w:t>In this final design the foreign keys are produced by copying the primary key from the one end of each relationship to the many end. For example the ScreeningID primary key from tblScreening is copied into tblBooking as a foreign key, because one screening can have many bookings. The same pattern is followed throughout, which keeps every relationship as a clean one to many. The structure is normalised to third normal form because every non key field in each table depends only on the whole of that table's primary key, with no field depending on another non key field and no repeating groups of data anywhere in the design. Three further tables exist in the system that do not appear in this diagram because they are standalone and not related to the others through foreign keys. These are tblLogin, which holds the user accounts, tblLogs, which records system events, and tblVersionControl, which holds the application version. They are included in the table designs below for completeness.</w:t>
+        <w:t xml:space="preserve">In this final design the foreign keys are produced by copying the primary key from the one end of each relationship to the many end. For example the </w:t>
+      </w:r>
+      <w:proofErr w:type="spellStart"/>
+      <w:r>
+        <w:t>ScreeningID</w:t>
+      </w:r>
+      <w:proofErr w:type="spellEnd"/>
+      <w:r>
+        <w:t xml:space="preserve"> primary key from </w:t>
+      </w:r>
+      <w:proofErr w:type="spellStart"/>
+      <w:r>
+        <w:t>tblScreening</w:t>
+      </w:r>
+      <w:proofErr w:type="spellEnd"/>
+      <w:r>
+        <w:t xml:space="preserve"> is copied into </w:t>
+      </w:r>
+      <w:proofErr w:type="spellStart"/>
+      <w:r>
+        <w:t>tblBooking</w:t>
+      </w:r>
+      <w:proofErr w:type="spellEnd"/>
+      <w:r>
+        <w:t xml:space="preserve"> as a foreign key, because one screening can have many bookings. The same pattern is followed throughout, which keeps every relationship as a clean one to many. The structure is normalised to third normal form because every non key field in each table depends only on the whole of that table's primary key, with no field depending on another non key field and no repeating groups of data anywhere in the design. Three further tables exist in the system that do not appear in this diagram because they are standalone and not related to the others through foreign keys. These are </w:t>
+      </w:r>
+      <w:proofErr w:type="spellStart"/>
+      <w:r>
+        <w:t>tblLogin</w:t>
+      </w:r>
+      <w:proofErr w:type="spellEnd"/>
+      <w:r>
+        <w:t xml:space="preserve">, which holds the user accounts, </w:t>
+      </w:r>
+      <w:proofErr w:type="spellStart"/>
+      <w:r>
+        <w:t>tblLogs</w:t>
+      </w:r>
+      <w:proofErr w:type="spellEnd"/>
+      <w:r>
+        <w:t xml:space="preserve">, which records system events, and </w:t>
+      </w:r>
+      <w:proofErr w:type="spellStart"/>
+      <w:r>
+        <w:t>tblVersionControl</w:t>
+      </w:r>
+      <w:proofErr w:type="spellEnd"/>
+      <w:r>
+        <w:t>, which holds the application version. They are included in the table designs below for completeness.</w:t>
       </w:r>
     </w:p>
     <w:p>
@@ -971,7 +2473,23 @@
         <w:spacing w:after="160" w:line="276" w:lineRule="auto"/>
       </w:pPr>
       <w:r>
-        <w:t>The Filmtopia tables are stored within a Microsoft Access database and are accessed from the Visual Basic .NET application using SQL queries sent through an OleDb connection, specifically SELECT, INSERT, UPDATE and DELETE queries. The database management system stores the tables as direct access files and maintains indexes on the primary keys so that looking a record up by its primary key is fast and does not require reading through every record. Where a search is carried out on a field that is not indexed, the database falls back to a sequential search through the table.</w:t>
+        <w:t xml:space="preserve">The </w:t>
+      </w:r>
+      <w:proofErr w:type="spellStart"/>
+      <w:r>
+        <w:t>Filmtopia</w:t>
+      </w:r>
+      <w:proofErr w:type="spellEnd"/>
+      <w:r>
+        <w:t xml:space="preserve"> tables are stored within a Microsoft Access database and are accessed from the Visual Basic .NET application using SQL queries sent through an </w:t>
+      </w:r>
+      <w:proofErr w:type="spellStart"/>
+      <w:r>
+        <w:t>OleDb</w:t>
+      </w:r>
+      <w:proofErr w:type="spellEnd"/>
+      <w:r>
+        <w:t xml:space="preserve"> connection, specifically SELECT, INSERT, UPDATE and DELETE queries. The database management system stores the tables as direct access files and maintains indexes on the primary keys so that looking a record up by its primary key is fast and does not require reading through every record. Where a search is carried out on a field that is not indexed, the database falls back to a sequential search through the table.</w:t>
       </w:r>
     </w:p>
     <w:p>
@@ -983,6 +2501,7 @@
           <w:color w:val="000000" w:themeColor="text1"/>
         </w:rPr>
       </w:pPr>
+      <w:proofErr w:type="spellStart"/>
       <w:r>
         <w:rPr>
           <w:b/>
@@ -991,6 +2510,7 @@
         </w:rPr>
         <w:t>tblFilm</w:t>
       </w:r>
+      <w:proofErr w:type="spellEnd"/>
     </w:p>
     <w:p>
       <w:pPr>
@@ -1168,6 +2688,7 @@
             </w:tcMar>
           </w:tcPr>
           <w:p>
+            <w:proofErr w:type="spellStart"/>
             <w:r>
               <w:rPr>
                 <w:sz w:val="19"/>
@@ -1175,6 +2696,7 @@
               </w:rPr>
               <w:t>FilmID</w:t>
             </w:r>
+            <w:proofErr w:type="spellEnd"/>
           </w:p>
         </w:tc>
         <w:tc>
@@ -1262,6 +2784,7 @@
             </w:tcMar>
           </w:tcPr>
           <w:p>
+            <w:proofErr w:type="spellStart"/>
             <w:r>
               <w:rPr>
                 <w:sz w:val="19"/>
@@ -1269,6 +2792,7 @@
               </w:rPr>
               <w:t>FilmTitle</w:t>
             </w:r>
+            <w:proofErr w:type="spellEnd"/>
           </w:p>
         </w:tc>
         <w:tc>
@@ -1364,6 +2888,7 @@
             </w:tcMar>
           </w:tcPr>
           <w:p>
+            <w:proofErr w:type="spellStart"/>
             <w:r>
               <w:rPr>
                 <w:sz w:val="19"/>
@@ -1371,6 +2896,7 @@
               </w:rPr>
               <w:t>FilmAgeRating</w:t>
             </w:r>
+            <w:proofErr w:type="spellEnd"/>
           </w:p>
         </w:tc>
         <w:tc>
@@ -1466,6 +2992,7 @@
             </w:tcMar>
           </w:tcPr>
           <w:p>
+            <w:proofErr w:type="spellStart"/>
             <w:r>
               <w:rPr>
                 <w:sz w:val="19"/>
@@ -1473,6 +3000,7 @@
               </w:rPr>
               <w:t>FilmDuration</w:t>
             </w:r>
+            <w:proofErr w:type="spellEnd"/>
           </w:p>
         </w:tc>
         <w:tc>
@@ -1560,6 +3088,7 @@
             </w:tcMar>
           </w:tcPr>
           <w:p>
+            <w:proofErr w:type="spellStart"/>
             <w:r>
               <w:rPr>
                 <w:sz w:val="19"/>
@@ -1567,6 +3096,7 @@
               </w:rPr>
               <w:t>FilmDescription</w:t>
             </w:r>
+            <w:proofErr w:type="spellEnd"/>
           </w:p>
         </w:tc>
         <w:tc>
@@ -1665,6 +3195,7 @@
           <w:color w:val="000000" w:themeColor="text1"/>
         </w:rPr>
       </w:pPr>
+      <w:proofErr w:type="spellStart"/>
       <w:r>
         <w:rPr>
           <w:b/>
@@ -1673,6 +3204,7 @@
         </w:rPr>
         <w:t>tblScreen</w:t>
       </w:r>
+      <w:proofErr w:type="spellEnd"/>
     </w:p>
     <w:p>
       <w:pPr>
@@ -1850,6 +3382,7 @@
             </w:tcMar>
           </w:tcPr>
           <w:p>
+            <w:proofErr w:type="spellStart"/>
             <w:r>
               <w:rPr>
                 <w:sz w:val="19"/>
@@ -1857,6 +3390,7 @@
               </w:rPr>
               <w:t>ScreenID</w:t>
             </w:r>
+            <w:proofErr w:type="spellEnd"/>
           </w:p>
         </w:tc>
         <w:tc>
@@ -1944,6 +3478,7 @@
             </w:tcMar>
           </w:tcPr>
           <w:p>
+            <w:proofErr w:type="spellStart"/>
             <w:r>
               <w:rPr>
                 <w:sz w:val="19"/>
@@ -1951,6 +3486,7 @@
               </w:rPr>
               <w:t>ScreenName</w:t>
             </w:r>
+            <w:proofErr w:type="spellEnd"/>
           </w:p>
         </w:tc>
         <w:tc>
@@ -2046,6 +3582,7 @@
             </w:tcMar>
           </w:tcPr>
           <w:p>
+            <w:proofErr w:type="spellStart"/>
             <w:r>
               <w:rPr>
                 <w:sz w:val="19"/>
@@ -2053,6 +3590,7 @@
               </w:rPr>
               <w:t>ScreenCapacity</w:t>
             </w:r>
+            <w:proofErr w:type="spellEnd"/>
           </w:p>
         </w:tc>
         <w:tc>
@@ -2143,6 +3681,7 @@
           <w:color w:val="000000" w:themeColor="text1"/>
         </w:rPr>
       </w:pPr>
+      <w:proofErr w:type="spellStart"/>
       <w:r>
         <w:rPr>
           <w:b/>
@@ -2151,6 +3690,7 @@
         </w:rPr>
         <w:t>tblScreening</w:t>
       </w:r>
+      <w:proofErr w:type="spellEnd"/>
     </w:p>
     <w:p>
       <w:pPr>
@@ -2328,6 +3868,7 @@
             </w:tcMar>
           </w:tcPr>
           <w:p>
+            <w:proofErr w:type="spellStart"/>
             <w:r>
               <w:rPr>
                 <w:sz w:val="19"/>
@@ -2335,6 +3876,7 @@
               </w:rPr>
               <w:t>ScreeningID</w:t>
             </w:r>
+            <w:proofErr w:type="spellEnd"/>
           </w:p>
         </w:tc>
         <w:tc>
@@ -2422,6 +3964,7 @@
             </w:tcMar>
           </w:tcPr>
           <w:p>
+            <w:proofErr w:type="spellStart"/>
             <w:r>
               <w:rPr>
                 <w:sz w:val="19"/>
@@ -2429,6 +3972,7 @@
               </w:rPr>
               <w:t>FilmID</w:t>
             </w:r>
+            <w:proofErr w:type="spellEnd"/>
           </w:p>
         </w:tc>
         <w:tc>
@@ -2479,7 +4023,23 @@
                 <w:sz w:val="19"/>
                 <w:szCs w:val="19"/>
               </w:rPr>
-              <w:t>The film being shown (Foreign Key to tblFilm)</w:t>
+              <w:t xml:space="preserve">The film being shown (Foreign Key to </w:t>
+            </w:r>
+            <w:proofErr w:type="spellStart"/>
+            <w:r>
+              <w:rPr>
+                <w:sz w:val="19"/>
+                <w:szCs w:val="19"/>
+              </w:rPr>
+              <w:t>tblFilm</w:t>
+            </w:r>
+            <w:proofErr w:type="spellEnd"/>
+            <w:r>
+              <w:rPr>
+                <w:sz w:val="19"/>
+                <w:szCs w:val="19"/>
+              </w:rPr>
+              <w:t>)</w:t>
             </w:r>
           </w:p>
         </w:tc>
@@ -2516,6 +4076,7 @@
             </w:tcMar>
           </w:tcPr>
           <w:p>
+            <w:proofErr w:type="spellStart"/>
             <w:r>
               <w:rPr>
                 <w:sz w:val="19"/>
@@ -2523,6 +4084,7 @@
               </w:rPr>
               <w:t>ScreenID</w:t>
             </w:r>
+            <w:proofErr w:type="spellEnd"/>
           </w:p>
         </w:tc>
         <w:tc>
@@ -2573,7 +4135,23 @@
                 <w:sz w:val="19"/>
                 <w:szCs w:val="19"/>
               </w:rPr>
-              <w:t>The screen it is shown in (Foreign Key to tblScreen)</w:t>
+              <w:t xml:space="preserve">The screen it is shown in (Foreign Key to </w:t>
+            </w:r>
+            <w:proofErr w:type="spellStart"/>
+            <w:r>
+              <w:rPr>
+                <w:sz w:val="19"/>
+                <w:szCs w:val="19"/>
+              </w:rPr>
+              <w:t>tblScreen</w:t>
+            </w:r>
+            <w:proofErr w:type="spellEnd"/>
+            <w:r>
+              <w:rPr>
+                <w:sz w:val="19"/>
+                <w:szCs w:val="19"/>
+              </w:rPr>
+              <w:t>)</w:t>
             </w:r>
           </w:p>
         </w:tc>
@@ -2610,6 +4188,7 @@
             </w:tcMar>
           </w:tcPr>
           <w:p>
+            <w:proofErr w:type="spellStart"/>
             <w:r>
               <w:rPr>
                 <w:sz w:val="19"/>
@@ -2617,6 +4196,7 @@
               </w:rPr>
               <w:t>ScreeningDate</w:t>
             </w:r>
+            <w:proofErr w:type="spellEnd"/>
           </w:p>
         </w:tc>
         <w:tc>
@@ -2704,6 +4284,7 @@
             </w:tcMar>
           </w:tcPr>
           <w:p>
+            <w:proofErr w:type="spellStart"/>
             <w:r>
               <w:rPr>
                 <w:sz w:val="19"/>
@@ -2711,6 +4292,7 @@
               </w:rPr>
               <w:t>ScreeningTime</w:t>
             </w:r>
+            <w:proofErr w:type="spellEnd"/>
           </w:p>
         </w:tc>
         <w:tc>
@@ -2806,6 +4388,7 @@
             </w:tcMar>
           </w:tcPr>
           <w:p>
+            <w:proofErr w:type="spellStart"/>
             <w:r>
               <w:rPr>
                 <w:sz w:val="19"/>
@@ -2813,6 +4396,7 @@
               </w:rPr>
               <w:t>TicketPrice</w:t>
             </w:r>
+            <w:proofErr w:type="spellEnd"/>
           </w:p>
         </w:tc>
         <w:tc>
@@ -2903,6 +4487,7 @@
           <w:color w:val="000000" w:themeColor="text1"/>
         </w:rPr>
       </w:pPr>
+      <w:proofErr w:type="spellStart"/>
       <w:r>
         <w:rPr>
           <w:b/>
@@ -2911,6 +4496,7 @@
         </w:rPr>
         <w:t>tblSeat</w:t>
       </w:r>
+      <w:proofErr w:type="spellEnd"/>
     </w:p>
     <w:p>
       <w:pPr>
@@ -3088,6 +4674,7 @@
             </w:tcMar>
           </w:tcPr>
           <w:p>
+            <w:proofErr w:type="spellStart"/>
             <w:r>
               <w:rPr>
                 <w:sz w:val="19"/>
@@ -3095,6 +4682,7 @@
               </w:rPr>
               <w:t>SeatID</w:t>
             </w:r>
+            <w:proofErr w:type="spellEnd"/>
           </w:p>
         </w:tc>
         <w:tc>
@@ -3182,6 +4770,7 @@
             </w:tcMar>
           </w:tcPr>
           <w:p>
+            <w:proofErr w:type="spellStart"/>
             <w:r>
               <w:rPr>
                 <w:sz w:val="19"/>
@@ -3189,6 +4778,7 @@
               </w:rPr>
               <w:t>ScreenID</w:t>
             </w:r>
+            <w:proofErr w:type="spellEnd"/>
           </w:p>
         </w:tc>
         <w:tc>
@@ -3239,7 +4829,23 @@
                 <w:sz w:val="19"/>
                 <w:szCs w:val="19"/>
               </w:rPr>
-              <w:t>The screen the seat belongs to (Foreign Key to tblScreen)</w:t>
+              <w:t xml:space="preserve">The screen the seat belongs to (Foreign Key to </w:t>
+            </w:r>
+            <w:proofErr w:type="spellStart"/>
+            <w:r>
+              <w:rPr>
+                <w:sz w:val="19"/>
+                <w:szCs w:val="19"/>
+              </w:rPr>
+              <w:t>tblScreen</w:t>
+            </w:r>
+            <w:proofErr w:type="spellEnd"/>
+            <w:r>
+              <w:rPr>
+                <w:sz w:val="19"/>
+                <w:szCs w:val="19"/>
+              </w:rPr>
+              <w:t>)</w:t>
             </w:r>
           </w:p>
         </w:tc>
@@ -3276,6 +4882,7 @@
             </w:tcMar>
           </w:tcPr>
           <w:p>
+            <w:proofErr w:type="spellStart"/>
             <w:r>
               <w:rPr>
                 <w:sz w:val="19"/>
@@ -3283,6 +4890,7 @@
               </w:rPr>
               <w:t>SeatRow</w:t>
             </w:r>
+            <w:proofErr w:type="spellEnd"/>
           </w:p>
         </w:tc>
         <w:tc>
@@ -3378,6 +4986,7 @@
             </w:tcMar>
           </w:tcPr>
           <w:p>
+            <w:proofErr w:type="spellStart"/>
             <w:r>
               <w:rPr>
                 <w:sz w:val="19"/>
@@ -3385,6 +4994,7 @@
               </w:rPr>
               <w:t>SeatNumber</w:t>
             </w:r>
+            <w:proofErr w:type="spellEnd"/>
           </w:p>
         </w:tc>
         <w:tc>
@@ -3475,6 +5085,7 @@
           <w:color w:val="000000" w:themeColor="text1"/>
         </w:rPr>
       </w:pPr>
+      <w:proofErr w:type="spellStart"/>
       <w:r>
         <w:rPr>
           <w:b/>
@@ -3483,6 +5094,7 @@
         </w:rPr>
         <w:t>tblCustomer</w:t>
       </w:r>
+      <w:proofErr w:type="spellEnd"/>
     </w:p>
     <w:p>
       <w:pPr>
@@ -3660,6 +5272,7 @@
             </w:tcMar>
           </w:tcPr>
           <w:p>
+            <w:proofErr w:type="spellStart"/>
             <w:r>
               <w:rPr>
                 <w:sz w:val="19"/>
@@ -3667,6 +5280,7 @@
               </w:rPr>
               <w:t>CustomerID</w:t>
             </w:r>
+            <w:proofErr w:type="spellEnd"/>
           </w:p>
         </w:tc>
         <w:tc>
@@ -3754,6 +5368,7 @@
             </w:tcMar>
           </w:tcPr>
           <w:p>
+            <w:proofErr w:type="spellStart"/>
             <w:r>
               <w:rPr>
                 <w:sz w:val="19"/>
@@ -3761,6 +5376,7 @@
               </w:rPr>
               <w:t>CustomerForename</w:t>
             </w:r>
+            <w:proofErr w:type="spellEnd"/>
           </w:p>
         </w:tc>
         <w:tc>
@@ -3856,6 +5472,7 @@
             </w:tcMar>
           </w:tcPr>
           <w:p>
+            <w:proofErr w:type="spellStart"/>
             <w:r>
               <w:rPr>
                 <w:sz w:val="19"/>
@@ -3863,6 +5480,7 @@
               </w:rPr>
               <w:t>CustomerSurname</w:t>
             </w:r>
+            <w:proofErr w:type="spellEnd"/>
           </w:p>
         </w:tc>
         <w:tc>
@@ -3958,6 +5576,7 @@
             </w:tcMar>
           </w:tcPr>
           <w:p>
+            <w:proofErr w:type="spellStart"/>
             <w:r>
               <w:rPr>
                 <w:sz w:val="19"/>
@@ -3965,6 +5584,7 @@
               </w:rPr>
               <w:t>CustomerEmail</w:t>
             </w:r>
+            <w:proofErr w:type="spellEnd"/>
           </w:p>
         </w:tc>
         <w:tc>
@@ -4060,6 +5680,7 @@
             </w:tcMar>
           </w:tcPr>
           <w:p>
+            <w:proofErr w:type="spellStart"/>
             <w:r>
               <w:rPr>
                 <w:sz w:val="19"/>
@@ -4067,6 +5688,7 @@
               </w:rPr>
               <w:t>CustomerPhone</w:t>
             </w:r>
+            <w:proofErr w:type="spellEnd"/>
           </w:p>
         </w:tc>
         <w:tc>
@@ -4165,6 +5787,7 @@
           <w:color w:val="000000" w:themeColor="text1"/>
         </w:rPr>
       </w:pPr>
+      <w:proofErr w:type="spellStart"/>
       <w:r>
         <w:rPr>
           <w:b/>
@@ -4173,6 +5796,7 @@
         </w:rPr>
         <w:t>tblBooking</w:t>
       </w:r>
+      <w:proofErr w:type="spellEnd"/>
     </w:p>
     <w:p>
       <w:pPr>
@@ -4350,6 +5974,7 @@
             </w:tcMar>
           </w:tcPr>
           <w:p>
+            <w:proofErr w:type="spellStart"/>
             <w:r>
               <w:rPr>
                 <w:sz w:val="19"/>
@@ -4357,6 +5982,7 @@
               </w:rPr>
               <w:t>BookingID</w:t>
             </w:r>
+            <w:proofErr w:type="spellEnd"/>
           </w:p>
         </w:tc>
         <w:tc>
@@ -4444,6 +6070,7 @@
             </w:tcMar>
           </w:tcPr>
           <w:p>
+            <w:proofErr w:type="spellStart"/>
             <w:r>
               <w:rPr>
                 <w:sz w:val="19"/>
@@ -4451,6 +6078,7 @@
               </w:rPr>
               <w:t>CustomerID</w:t>
             </w:r>
+            <w:proofErr w:type="spellEnd"/>
           </w:p>
         </w:tc>
         <w:tc>
@@ -4501,7 +6129,23 @@
                 <w:sz w:val="19"/>
                 <w:szCs w:val="19"/>
               </w:rPr>
-              <w:t>The customer who made the booking (Foreign Key to tblCustomer)</w:t>
+              <w:t xml:space="preserve">The customer who made the booking (Foreign Key to </w:t>
+            </w:r>
+            <w:proofErr w:type="spellStart"/>
+            <w:r>
+              <w:rPr>
+                <w:sz w:val="19"/>
+                <w:szCs w:val="19"/>
+              </w:rPr>
+              <w:t>tblCustomer</w:t>
+            </w:r>
+            <w:proofErr w:type="spellEnd"/>
+            <w:r>
+              <w:rPr>
+                <w:sz w:val="19"/>
+                <w:szCs w:val="19"/>
+              </w:rPr>
+              <w:t>)</w:t>
             </w:r>
           </w:p>
         </w:tc>
@@ -4538,6 +6182,7 @@
             </w:tcMar>
           </w:tcPr>
           <w:p>
+            <w:proofErr w:type="spellStart"/>
             <w:r>
               <w:rPr>
                 <w:sz w:val="19"/>
@@ -4545,6 +6190,7 @@
               </w:rPr>
               <w:t>ScreeningID</w:t>
             </w:r>
+            <w:proofErr w:type="spellEnd"/>
           </w:p>
         </w:tc>
         <w:tc>
@@ -4595,7 +6241,23 @@
                 <w:sz w:val="19"/>
                 <w:szCs w:val="19"/>
               </w:rPr>
-              <w:t>The screening booked (Foreign Key to tblScreening)</w:t>
+              <w:t xml:space="preserve">The screening booked (Foreign Key to </w:t>
+            </w:r>
+            <w:proofErr w:type="spellStart"/>
+            <w:r>
+              <w:rPr>
+                <w:sz w:val="19"/>
+                <w:szCs w:val="19"/>
+              </w:rPr>
+              <w:t>tblScreening</w:t>
+            </w:r>
+            <w:proofErr w:type="spellEnd"/>
+            <w:r>
+              <w:rPr>
+                <w:sz w:val="19"/>
+                <w:szCs w:val="19"/>
+              </w:rPr>
+              <w:t>)</w:t>
             </w:r>
           </w:p>
         </w:tc>
@@ -4632,6 +6294,7 @@
             </w:tcMar>
           </w:tcPr>
           <w:p>
+            <w:proofErr w:type="spellStart"/>
             <w:r>
               <w:rPr>
                 <w:sz w:val="19"/>
@@ -4639,6 +6302,7 @@
               </w:rPr>
               <w:t>BookingDate</w:t>
             </w:r>
+            <w:proofErr w:type="spellEnd"/>
           </w:p>
         </w:tc>
         <w:tc>
@@ -4726,6 +6390,7 @@
             </w:tcMar>
           </w:tcPr>
           <w:p>
+            <w:proofErr w:type="spellStart"/>
             <w:r>
               <w:rPr>
                 <w:sz w:val="19"/>
@@ -4733,6 +6398,7 @@
               </w:rPr>
               <w:t>TotalCost</w:t>
             </w:r>
+            <w:proofErr w:type="spellEnd"/>
           </w:p>
         </w:tc>
         <w:tc>
@@ -4823,6 +6489,7 @@
           <w:color w:val="000000" w:themeColor="text1"/>
         </w:rPr>
       </w:pPr>
+      <w:proofErr w:type="spellStart"/>
       <w:r>
         <w:rPr>
           <w:b/>
@@ -4831,6 +6498,7 @@
         </w:rPr>
         <w:t>tblBookingSeat</w:t>
       </w:r>
+      <w:proofErr w:type="spellEnd"/>
     </w:p>
     <w:p>
       <w:pPr>
@@ -5008,6 +6676,7 @@
             </w:tcMar>
           </w:tcPr>
           <w:p>
+            <w:proofErr w:type="spellStart"/>
             <w:r>
               <w:rPr>
                 <w:sz w:val="19"/>
@@ -5015,6 +6684,7 @@
               </w:rPr>
               <w:t>BookingSeatID</w:t>
             </w:r>
+            <w:proofErr w:type="spellEnd"/>
           </w:p>
         </w:tc>
         <w:tc>
@@ -5102,6 +6772,7 @@
             </w:tcMar>
           </w:tcPr>
           <w:p>
+            <w:proofErr w:type="spellStart"/>
             <w:r>
               <w:rPr>
                 <w:sz w:val="19"/>
@@ -5109,6 +6780,7 @@
               </w:rPr>
               <w:t>BookingID</w:t>
             </w:r>
+            <w:proofErr w:type="spellEnd"/>
           </w:p>
         </w:tc>
         <w:tc>
@@ -5159,7 +6831,23 @@
                 <w:sz w:val="19"/>
                 <w:szCs w:val="19"/>
               </w:rPr>
-              <w:t>The booking this seat belongs to (Foreign Key to tblBooking)</w:t>
+              <w:t xml:space="preserve">The booking this seat belongs to (Foreign Key to </w:t>
+            </w:r>
+            <w:proofErr w:type="spellStart"/>
+            <w:r>
+              <w:rPr>
+                <w:sz w:val="19"/>
+                <w:szCs w:val="19"/>
+              </w:rPr>
+              <w:t>tblBooking</w:t>
+            </w:r>
+            <w:proofErr w:type="spellEnd"/>
+            <w:r>
+              <w:rPr>
+                <w:sz w:val="19"/>
+                <w:szCs w:val="19"/>
+              </w:rPr>
+              <w:t>)</w:t>
             </w:r>
           </w:p>
         </w:tc>
@@ -5196,6 +6884,7 @@
             </w:tcMar>
           </w:tcPr>
           <w:p>
+            <w:proofErr w:type="spellStart"/>
             <w:r>
               <w:rPr>
                 <w:sz w:val="19"/>
@@ -5203,6 +6892,7 @@
               </w:rPr>
               <w:t>SeatID</w:t>
             </w:r>
+            <w:proofErr w:type="spellEnd"/>
           </w:p>
         </w:tc>
         <w:tc>
@@ -5253,7 +6943,23 @@
                 <w:sz w:val="19"/>
                 <w:szCs w:val="19"/>
               </w:rPr>
-              <w:t>The seat that was booked (Foreign Key to tblSeat)</w:t>
+              <w:t xml:space="preserve">The seat that was booked (Foreign Key to </w:t>
+            </w:r>
+            <w:proofErr w:type="spellStart"/>
+            <w:r>
+              <w:rPr>
+                <w:sz w:val="19"/>
+                <w:szCs w:val="19"/>
+              </w:rPr>
+              <w:t>tblSeat</w:t>
+            </w:r>
+            <w:proofErr w:type="spellEnd"/>
+            <w:r>
+              <w:rPr>
+                <w:sz w:val="19"/>
+                <w:szCs w:val="19"/>
+              </w:rPr>
+              <w:t>)</w:t>
             </w:r>
           </w:p>
         </w:tc>
@@ -5293,6 +6999,7 @@
           <w:color w:val="000000" w:themeColor="text1"/>
         </w:rPr>
       </w:pPr>
+      <w:proofErr w:type="spellStart"/>
       <w:r>
         <w:rPr>
           <w:b/>
@@ -5301,6 +7008,7 @@
         </w:rPr>
         <w:t>tblFoodItem</w:t>
       </w:r>
+      <w:proofErr w:type="spellEnd"/>
     </w:p>
     <w:p>
       <w:pPr>
@@ -5478,6 +7186,7 @@
             </w:tcMar>
           </w:tcPr>
           <w:p>
+            <w:proofErr w:type="spellStart"/>
             <w:r>
               <w:rPr>
                 <w:sz w:val="19"/>
@@ -5485,6 +7194,7 @@
               </w:rPr>
               <w:t>FoodItemID</w:t>
             </w:r>
+            <w:proofErr w:type="spellEnd"/>
           </w:p>
         </w:tc>
         <w:tc>
@@ -5572,6 +7282,7 @@
             </w:tcMar>
           </w:tcPr>
           <w:p>
+            <w:proofErr w:type="spellStart"/>
             <w:r>
               <w:rPr>
                 <w:sz w:val="19"/>
@@ -5579,6 +7290,7 @@
               </w:rPr>
               <w:t>FoodItemName</w:t>
             </w:r>
+            <w:proofErr w:type="spellEnd"/>
           </w:p>
         </w:tc>
         <w:tc>
@@ -5674,6 +7386,7 @@
             </w:tcMar>
           </w:tcPr>
           <w:p>
+            <w:proofErr w:type="spellStart"/>
             <w:r>
               <w:rPr>
                 <w:sz w:val="19"/>
@@ -5681,6 +7394,7 @@
               </w:rPr>
               <w:t>FoodItemPrice</w:t>
             </w:r>
+            <w:proofErr w:type="spellEnd"/>
           </w:p>
         </w:tc>
         <w:tc>
@@ -5768,6 +7482,7 @@
             </w:tcMar>
           </w:tcPr>
           <w:p>
+            <w:proofErr w:type="spellStart"/>
             <w:r>
               <w:rPr>
                 <w:sz w:val="19"/>
@@ -5775,6 +7490,7 @@
               </w:rPr>
               <w:t>FoodItemCategory</w:t>
             </w:r>
+            <w:proofErr w:type="spellEnd"/>
           </w:p>
         </w:tc>
         <w:tc>
@@ -5873,6 +7589,7 @@
           <w:color w:val="000000" w:themeColor="text1"/>
         </w:rPr>
       </w:pPr>
+      <w:proofErr w:type="spellStart"/>
       <w:r>
         <w:rPr>
           <w:b/>
@@ -5881,6 +7598,7 @@
         </w:rPr>
         <w:t>tblOrderItem</w:t>
       </w:r>
+      <w:proofErr w:type="spellEnd"/>
     </w:p>
     <w:p>
       <w:pPr>
@@ -6058,6 +7776,7 @@
             </w:tcMar>
           </w:tcPr>
           <w:p>
+            <w:proofErr w:type="spellStart"/>
             <w:r>
               <w:rPr>
                 <w:sz w:val="19"/>
@@ -6065,6 +7784,7 @@
               </w:rPr>
               <w:t>OrderItemID</w:t>
             </w:r>
+            <w:proofErr w:type="spellEnd"/>
           </w:p>
         </w:tc>
         <w:tc>
@@ -6152,6 +7872,7 @@
             </w:tcMar>
           </w:tcPr>
           <w:p>
+            <w:proofErr w:type="spellStart"/>
             <w:r>
               <w:rPr>
                 <w:sz w:val="19"/>
@@ -6159,6 +7880,7 @@
               </w:rPr>
               <w:t>BookingID</w:t>
             </w:r>
+            <w:proofErr w:type="spellEnd"/>
           </w:p>
         </w:tc>
         <w:tc>
@@ -6209,7 +7931,23 @@
                 <w:sz w:val="19"/>
                 <w:szCs w:val="19"/>
               </w:rPr>
-              <w:t>The booking the item was added to (Foreign Key to tblBooking)</w:t>
+              <w:t xml:space="preserve">The booking the item was added to (Foreign Key to </w:t>
+            </w:r>
+            <w:proofErr w:type="spellStart"/>
+            <w:r>
+              <w:rPr>
+                <w:sz w:val="19"/>
+                <w:szCs w:val="19"/>
+              </w:rPr>
+              <w:t>tblBooking</w:t>
+            </w:r>
+            <w:proofErr w:type="spellEnd"/>
+            <w:r>
+              <w:rPr>
+                <w:sz w:val="19"/>
+                <w:szCs w:val="19"/>
+              </w:rPr>
+              <w:t>)</w:t>
             </w:r>
           </w:p>
         </w:tc>
@@ -6246,6 +7984,7 @@
             </w:tcMar>
           </w:tcPr>
           <w:p>
+            <w:proofErr w:type="spellStart"/>
             <w:r>
               <w:rPr>
                 <w:sz w:val="19"/>
@@ -6253,6 +7992,7 @@
               </w:rPr>
               <w:t>FoodItemID</w:t>
             </w:r>
+            <w:proofErr w:type="spellEnd"/>
           </w:p>
         </w:tc>
         <w:tc>
@@ -6303,7 +8043,23 @@
                 <w:sz w:val="19"/>
                 <w:szCs w:val="19"/>
               </w:rPr>
-              <w:t>The food item ordered (Foreign Key to tblFoodItem)</w:t>
+              <w:t xml:space="preserve">The food item ordered (Foreign Key to </w:t>
+            </w:r>
+            <w:proofErr w:type="spellStart"/>
+            <w:r>
+              <w:rPr>
+                <w:sz w:val="19"/>
+                <w:szCs w:val="19"/>
+              </w:rPr>
+              <w:t>tblFoodItem</w:t>
+            </w:r>
+            <w:proofErr w:type="spellEnd"/>
+            <w:r>
+              <w:rPr>
+                <w:sz w:val="19"/>
+                <w:szCs w:val="19"/>
+              </w:rPr>
+              <w:t>)</w:t>
             </w:r>
           </w:p>
         </w:tc>
@@ -6437,6 +8193,7 @@
           <w:color w:val="000000" w:themeColor="text1"/>
         </w:rPr>
       </w:pPr>
+      <w:proofErr w:type="spellStart"/>
       <w:r>
         <w:rPr>
           <w:b/>
@@ -6445,6 +8202,7 @@
         </w:rPr>
         <w:t>tblLogin</w:t>
       </w:r>
+      <w:proofErr w:type="spellEnd"/>
     </w:p>
     <w:p>
       <w:pPr>
@@ -6622,6 +8380,7 @@
             </w:tcMar>
           </w:tcPr>
           <w:p>
+            <w:proofErr w:type="spellStart"/>
             <w:r>
               <w:rPr>
                 <w:sz w:val="19"/>
@@ -6629,6 +8388,7 @@
               </w:rPr>
               <w:t>LoginID</w:t>
             </w:r>
+            <w:proofErr w:type="spellEnd"/>
           </w:p>
         </w:tc>
         <w:tc>
@@ -6898,6 +8658,7 @@
             </w:tcMar>
           </w:tcPr>
           <w:p>
+            <w:proofErr w:type="spellStart"/>
             <w:r>
               <w:rPr>
                 <w:sz w:val="19"/>
@@ -6905,6 +8666,7 @@
               </w:rPr>
               <w:t>MTIz</w:t>
             </w:r>
+            <w:proofErr w:type="spellEnd"/>
           </w:p>
         </w:tc>
       </w:tr>
@@ -6920,6 +8682,7 @@
             </w:tcMar>
           </w:tcPr>
           <w:p>
+            <w:proofErr w:type="spellStart"/>
             <w:r>
               <w:rPr>
                 <w:sz w:val="19"/>
@@ -6927,6 +8690,7 @@
               </w:rPr>
               <w:t>AccessLevel</w:t>
             </w:r>
+            <w:proofErr w:type="spellEnd"/>
           </w:p>
         </w:tc>
         <w:tc>
@@ -7017,6 +8781,7 @@
           <w:color w:val="000000" w:themeColor="text1"/>
         </w:rPr>
       </w:pPr>
+      <w:proofErr w:type="spellStart"/>
       <w:r>
         <w:rPr>
           <w:b/>
@@ -7025,6 +8790,7 @@
         </w:rPr>
         <w:t>tblLogs</w:t>
       </w:r>
+      <w:proofErr w:type="spellEnd"/>
     </w:p>
     <w:p>
       <w:pPr>
@@ -7202,6 +8968,7 @@
             </w:tcMar>
           </w:tcPr>
           <w:p>
+            <w:proofErr w:type="spellStart"/>
             <w:r>
               <w:rPr>
                 <w:sz w:val="19"/>
@@ -7209,6 +8976,7 @@
               </w:rPr>
               <w:t>LogID</w:t>
             </w:r>
+            <w:proofErr w:type="spellEnd"/>
           </w:p>
         </w:tc>
         <w:tc>
@@ -7296,6 +9064,7 @@
             </w:tcMar>
           </w:tcPr>
           <w:p>
+            <w:proofErr w:type="spellStart"/>
             <w:r>
               <w:rPr>
                 <w:sz w:val="19"/>
@@ -7303,6 +9072,7 @@
               </w:rPr>
               <w:t>LogDateTime</w:t>
             </w:r>
+            <w:proofErr w:type="spellEnd"/>
           </w:p>
         </w:tc>
         <w:tc>
@@ -7390,6 +9160,7 @@
             </w:tcMar>
           </w:tcPr>
           <w:p>
+            <w:proofErr w:type="spellStart"/>
             <w:r>
               <w:rPr>
                 <w:sz w:val="19"/>
@@ -7397,6 +9168,7 @@
               </w:rPr>
               <w:t>LogType</w:t>
             </w:r>
+            <w:proofErr w:type="spellEnd"/>
           </w:p>
         </w:tc>
         <w:tc>
@@ -7492,6 +9264,7 @@
             </w:tcMar>
           </w:tcPr>
           <w:p>
+            <w:proofErr w:type="spellStart"/>
             <w:r>
               <w:rPr>
                 <w:sz w:val="19"/>
@@ -7499,6 +9272,7 @@
               </w:rPr>
               <w:t>LogMessage</w:t>
             </w:r>
+            <w:proofErr w:type="spellEnd"/>
           </w:p>
         </w:tc>
         <w:tc>
@@ -7589,6 +9363,7 @@
           <w:color w:val="000000" w:themeColor="text1"/>
         </w:rPr>
       </w:pPr>
+      <w:proofErr w:type="spellStart"/>
       <w:r>
         <w:rPr>
           <w:b/>
@@ -7597,6 +9372,7 @@
         </w:rPr>
         <w:t>tblVersionControl</w:t>
       </w:r>
+      <w:proofErr w:type="spellEnd"/>
     </w:p>
     <w:p>
       <w:pPr>
@@ -7894,7 +9670,15 @@
         <w:spacing w:after="160" w:line="276" w:lineRule="auto"/>
       </w:pPr>
       <w:r>
-        <w:t>This section describes the processing that takes place inside the Filmtopia system. Rather than listing every button on every form it focuses on the stages where there is real logic going on, since these are the parts of the system that need to be thought through carefully before any code is written. Each stage is described in plain English pseudocode rather than in Visual Basic, so that the logic is clear and separate from the eventual code, and the two most important algorithms are also shown as flowcharts. Each stage is linked back to the objectives it helps to meet.</w:t>
+        <w:t xml:space="preserve">This section describes the processing that takes place inside the </w:t>
+      </w:r>
+      <w:proofErr w:type="spellStart"/>
+      <w:r>
+        <w:t>Filmtopia</w:t>
+      </w:r>
+      <w:proofErr w:type="spellEnd"/>
+      <w:r>
+        <w:t xml:space="preserve"> system. Rather than listing every button on every form it focuses on the stages where there is real logic going on, since these are the parts of the system that need to be thought through carefully before any code is written. Each stage is described in plain English pseudocode rather than in Visual Basic, so that the logic is clear and separate from the eventual code, and the two most important algorithms are also shown as flowcharts. Each stage is linked back to the objectives it helps to meet.</w:t>
       </w:r>
     </w:p>
     <w:p>
@@ -8010,7 +9794,25 @@
                 <w:sz w:val="19"/>
                 <w:szCs w:val="19"/>
               </w:rPr>
-              <w:t xml:space="preserve">    LOOK UP the username in tblLogin using an SQL SELECT query</w:t>
+              <w:t xml:space="preserve">    LOOK UP the username in </w:t>
+            </w:r>
+            <w:proofErr w:type="spellStart"/>
+            <w:r>
+              <w:rPr>
+                <w:rFonts w:ascii="Courier New" w:eastAsia="Courier New" w:hAnsi="Courier New" w:cs="Courier New"/>
+                <w:sz w:val="19"/>
+                <w:szCs w:val="19"/>
+              </w:rPr>
+              <w:t>tblLogin</w:t>
+            </w:r>
+            <w:proofErr w:type="spellEnd"/>
+            <w:r>
+              <w:rPr>
+                <w:rFonts w:ascii="Courier New" w:eastAsia="Courier New" w:hAnsi="Courier New" w:cs="Courier New"/>
+                <w:sz w:val="19"/>
+                <w:szCs w:val="19"/>
+              </w:rPr>
+              <w:t xml:space="preserve"> using an SQL SELECT query</w:t>
             </w:r>
           </w:p>
           <w:p>
@@ -8070,7 +9872,25 @@
                 <w:sz w:val="19"/>
                 <w:szCs w:val="19"/>
               </w:rPr>
-              <w:t xml:space="preserve">        STORE the user's AccessLevel for the session</w:t>
+              <w:t xml:space="preserve">        STORE the user's </w:t>
+            </w:r>
+            <w:proofErr w:type="spellStart"/>
+            <w:r>
+              <w:rPr>
+                <w:rFonts w:ascii="Courier New" w:eastAsia="Courier New" w:hAnsi="Courier New" w:cs="Courier New"/>
+                <w:sz w:val="19"/>
+                <w:szCs w:val="19"/>
+              </w:rPr>
+              <w:t>AccessLevel</w:t>
+            </w:r>
+            <w:proofErr w:type="spellEnd"/>
+            <w:r>
+              <w:rPr>
+                <w:rFonts w:ascii="Courier New" w:eastAsia="Courier New" w:hAnsi="Courier New" w:cs="Courier New"/>
+                <w:sz w:val="19"/>
+                <w:szCs w:val="19"/>
+              </w:rPr>
+              <w:t xml:space="preserve"> for the session</w:t>
             </w:r>
           </w:p>
           <w:p>
@@ -8271,88 +10091,288 @@
                 <w:sz w:val="19"/>
                 <w:szCs w:val="19"/>
               </w:rPr>
-              <w:t>SET seatsPerRow to 10</w:t>
-            </w:r>
-          </w:p>
-          <w:p>
-            <w:r>
-              <w:rPr>
-                <w:rFonts w:ascii="Courier New" w:eastAsia="Courier New" w:hAnsi="Courier New" w:cs="Courier New"/>
-                <w:sz w:val="19"/>
-                <w:szCs w:val="19"/>
-              </w:rPr>
-              <w:t>SET rowLetter to "A"</w:t>
-            </w:r>
-          </w:p>
-          <w:p>
-            <w:r>
-              <w:rPr>
-                <w:rFonts w:ascii="Courier New" w:eastAsia="Courier New" w:hAnsi="Courier New" w:cs="Courier New"/>
-                <w:sz w:val="19"/>
-                <w:szCs w:val="19"/>
-              </w:rPr>
-              <w:t>SET seatsMade to 0</w:t>
-            </w:r>
-          </w:p>
-          <w:p>
-            <w:r>
-              <w:rPr>
-                <w:rFonts w:ascii="Courier New" w:eastAsia="Courier New" w:hAnsi="Courier New" w:cs="Courier New"/>
-                <w:sz w:val="19"/>
-                <w:szCs w:val="19"/>
-              </w:rPr>
-              <w:t>WHILE seatsMade is less than capacity</w:t>
-            </w:r>
-          </w:p>
-          <w:p>
-            <w:r>
-              <w:rPr>
-                <w:rFonts w:ascii="Courier New" w:eastAsia="Courier New" w:hAnsi="Courier New" w:cs="Courier New"/>
-                <w:sz w:val="19"/>
-                <w:szCs w:val="19"/>
-              </w:rPr>
-              <w:t xml:space="preserve">    FOR seatNumber from 1 to seatsPerRow</w:t>
-            </w:r>
-          </w:p>
-          <w:p>
-            <w:r>
-              <w:rPr>
-                <w:rFonts w:ascii="Courier New" w:eastAsia="Courier New" w:hAnsi="Courier New" w:cs="Courier New"/>
-                <w:sz w:val="19"/>
-                <w:szCs w:val="19"/>
-              </w:rPr>
-              <w:t xml:space="preserve">        IF seatsMade is less than capacity THEN</w:t>
-            </w:r>
-          </w:p>
-          <w:p>
-            <w:r>
-              <w:rPr>
-                <w:rFonts w:ascii="Courier New" w:eastAsia="Courier New" w:hAnsi="Courier New" w:cs="Courier New"/>
-                <w:sz w:val="19"/>
-                <w:szCs w:val="19"/>
-              </w:rPr>
-              <w:t xml:space="preserve">            INSERT a seat into tblSeat with the current ScreenID,</w:t>
-            </w:r>
-          </w:p>
-          <w:p>
-            <w:r>
-              <w:rPr>
-                <w:rFonts w:ascii="Courier New" w:eastAsia="Courier New" w:hAnsi="Courier New" w:cs="Courier New"/>
-                <w:sz w:val="19"/>
-                <w:szCs w:val="19"/>
-              </w:rPr>
-              <w:t xml:space="preserve">                   rowLetter and seatNumber using an SQL INSERT</w:t>
-            </w:r>
-          </w:p>
-          <w:p>
-            <w:r>
-              <w:rPr>
-                <w:rFonts w:ascii="Courier New" w:eastAsia="Courier New" w:hAnsi="Courier New" w:cs="Courier New"/>
-                <w:sz w:val="19"/>
-                <w:szCs w:val="19"/>
-              </w:rPr>
-              <w:t xml:space="preserve">            ADD 1 to seatsMade</w:t>
-            </w:r>
+              <w:t xml:space="preserve">SET </w:t>
+            </w:r>
+            <w:proofErr w:type="spellStart"/>
+            <w:r>
+              <w:rPr>
+                <w:rFonts w:ascii="Courier New" w:eastAsia="Courier New" w:hAnsi="Courier New" w:cs="Courier New"/>
+                <w:sz w:val="19"/>
+                <w:szCs w:val="19"/>
+              </w:rPr>
+              <w:t>seatsPerRow</w:t>
+            </w:r>
+            <w:proofErr w:type="spellEnd"/>
+            <w:r>
+              <w:rPr>
+                <w:rFonts w:ascii="Courier New" w:eastAsia="Courier New" w:hAnsi="Courier New" w:cs="Courier New"/>
+                <w:sz w:val="19"/>
+                <w:szCs w:val="19"/>
+              </w:rPr>
+              <w:t xml:space="preserve"> to 10</w:t>
+            </w:r>
+          </w:p>
+          <w:p>
+            <w:r>
+              <w:rPr>
+                <w:rFonts w:ascii="Courier New" w:eastAsia="Courier New" w:hAnsi="Courier New" w:cs="Courier New"/>
+                <w:sz w:val="19"/>
+                <w:szCs w:val="19"/>
+              </w:rPr>
+              <w:t xml:space="preserve">SET </w:t>
+            </w:r>
+            <w:proofErr w:type="spellStart"/>
+            <w:r>
+              <w:rPr>
+                <w:rFonts w:ascii="Courier New" w:eastAsia="Courier New" w:hAnsi="Courier New" w:cs="Courier New"/>
+                <w:sz w:val="19"/>
+                <w:szCs w:val="19"/>
+              </w:rPr>
+              <w:t>rowLetter</w:t>
+            </w:r>
+            <w:proofErr w:type="spellEnd"/>
+            <w:r>
+              <w:rPr>
+                <w:rFonts w:ascii="Courier New" w:eastAsia="Courier New" w:hAnsi="Courier New" w:cs="Courier New"/>
+                <w:sz w:val="19"/>
+                <w:szCs w:val="19"/>
+              </w:rPr>
+              <w:t xml:space="preserve"> to "A"</w:t>
+            </w:r>
+          </w:p>
+          <w:p>
+            <w:r>
+              <w:rPr>
+                <w:rFonts w:ascii="Courier New" w:eastAsia="Courier New" w:hAnsi="Courier New" w:cs="Courier New"/>
+                <w:sz w:val="19"/>
+                <w:szCs w:val="19"/>
+              </w:rPr>
+              <w:t xml:space="preserve">SET </w:t>
+            </w:r>
+            <w:proofErr w:type="spellStart"/>
+            <w:r>
+              <w:rPr>
+                <w:rFonts w:ascii="Courier New" w:eastAsia="Courier New" w:hAnsi="Courier New" w:cs="Courier New"/>
+                <w:sz w:val="19"/>
+                <w:szCs w:val="19"/>
+              </w:rPr>
+              <w:t>seatsMade</w:t>
+            </w:r>
+            <w:proofErr w:type="spellEnd"/>
+            <w:r>
+              <w:rPr>
+                <w:rFonts w:ascii="Courier New" w:eastAsia="Courier New" w:hAnsi="Courier New" w:cs="Courier New"/>
+                <w:sz w:val="19"/>
+                <w:szCs w:val="19"/>
+              </w:rPr>
+              <w:t xml:space="preserve"> to 0</w:t>
+            </w:r>
+          </w:p>
+          <w:p>
+            <w:r>
+              <w:rPr>
+                <w:rFonts w:ascii="Courier New" w:eastAsia="Courier New" w:hAnsi="Courier New" w:cs="Courier New"/>
+                <w:sz w:val="19"/>
+                <w:szCs w:val="19"/>
+              </w:rPr>
+              <w:t xml:space="preserve">WHILE </w:t>
+            </w:r>
+            <w:proofErr w:type="spellStart"/>
+            <w:r>
+              <w:rPr>
+                <w:rFonts w:ascii="Courier New" w:eastAsia="Courier New" w:hAnsi="Courier New" w:cs="Courier New"/>
+                <w:sz w:val="19"/>
+                <w:szCs w:val="19"/>
+              </w:rPr>
+              <w:t>seatsMade</w:t>
+            </w:r>
+            <w:proofErr w:type="spellEnd"/>
+            <w:r>
+              <w:rPr>
+                <w:rFonts w:ascii="Courier New" w:eastAsia="Courier New" w:hAnsi="Courier New" w:cs="Courier New"/>
+                <w:sz w:val="19"/>
+                <w:szCs w:val="19"/>
+              </w:rPr>
+              <w:t xml:space="preserve"> is less than capacity</w:t>
+            </w:r>
+          </w:p>
+          <w:p>
+            <w:r>
+              <w:rPr>
+                <w:rFonts w:ascii="Courier New" w:eastAsia="Courier New" w:hAnsi="Courier New" w:cs="Courier New"/>
+                <w:sz w:val="19"/>
+                <w:szCs w:val="19"/>
+              </w:rPr>
+              <w:t xml:space="preserve">    FOR </w:t>
+            </w:r>
+            <w:proofErr w:type="spellStart"/>
+            <w:r>
+              <w:rPr>
+                <w:rFonts w:ascii="Courier New" w:eastAsia="Courier New" w:hAnsi="Courier New" w:cs="Courier New"/>
+                <w:sz w:val="19"/>
+                <w:szCs w:val="19"/>
+              </w:rPr>
+              <w:t>seatNumber</w:t>
+            </w:r>
+            <w:proofErr w:type="spellEnd"/>
+            <w:r>
+              <w:rPr>
+                <w:rFonts w:ascii="Courier New" w:eastAsia="Courier New" w:hAnsi="Courier New" w:cs="Courier New"/>
+                <w:sz w:val="19"/>
+                <w:szCs w:val="19"/>
+              </w:rPr>
+              <w:t xml:space="preserve"> from 1 to </w:t>
+            </w:r>
+            <w:proofErr w:type="spellStart"/>
+            <w:r>
+              <w:rPr>
+                <w:rFonts w:ascii="Courier New" w:eastAsia="Courier New" w:hAnsi="Courier New" w:cs="Courier New"/>
+                <w:sz w:val="19"/>
+                <w:szCs w:val="19"/>
+              </w:rPr>
+              <w:t>seatsPerRow</w:t>
+            </w:r>
+            <w:proofErr w:type="spellEnd"/>
+          </w:p>
+          <w:p>
+            <w:r>
+              <w:rPr>
+                <w:rFonts w:ascii="Courier New" w:eastAsia="Courier New" w:hAnsi="Courier New" w:cs="Courier New"/>
+                <w:sz w:val="19"/>
+                <w:szCs w:val="19"/>
+              </w:rPr>
+              <w:t xml:space="preserve">        IF </w:t>
+            </w:r>
+            <w:proofErr w:type="spellStart"/>
+            <w:r>
+              <w:rPr>
+                <w:rFonts w:ascii="Courier New" w:eastAsia="Courier New" w:hAnsi="Courier New" w:cs="Courier New"/>
+                <w:sz w:val="19"/>
+                <w:szCs w:val="19"/>
+              </w:rPr>
+              <w:t>seatsMade</w:t>
+            </w:r>
+            <w:proofErr w:type="spellEnd"/>
+            <w:r>
+              <w:rPr>
+                <w:rFonts w:ascii="Courier New" w:eastAsia="Courier New" w:hAnsi="Courier New" w:cs="Courier New"/>
+                <w:sz w:val="19"/>
+                <w:szCs w:val="19"/>
+              </w:rPr>
+              <w:t xml:space="preserve"> is less than capacity THEN</w:t>
+            </w:r>
+          </w:p>
+          <w:p>
+            <w:r>
+              <w:rPr>
+                <w:rFonts w:ascii="Courier New" w:eastAsia="Courier New" w:hAnsi="Courier New" w:cs="Courier New"/>
+                <w:sz w:val="19"/>
+                <w:szCs w:val="19"/>
+              </w:rPr>
+              <w:t xml:space="preserve">            INSERT a seat into </w:t>
+            </w:r>
+            <w:proofErr w:type="spellStart"/>
+            <w:r>
+              <w:rPr>
+                <w:rFonts w:ascii="Courier New" w:eastAsia="Courier New" w:hAnsi="Courier New" w:cs="Courier New"/>
+                <w:sz w:val="19"/>
+                <w:szCs w:val="19"/>
+              </w:rPr>
+              <w:t>tblSeat</w:t>
+            </w:r>
+            <w:proofErr w:type="spellEnd"/>
+            <w:r>
+              <w:rPr>
+                <w:rFonts w:ascii="Courier New" w:eastAsia="Courier New" w:hAnsi="Courier New" w:cs="Courier New"/>
+                <w:sz w:val="19"/>
+                <w:szCs w:val="19"/>
+              </w:rPr>
+              <w:t xml:space="preserve"> with the current </w:t>
+            </w:r>
+            <w:proofErr w:type="spellStart"/>
+            <w:r>
+              <w:rPr>
+                <w:rFonts w:ascii="Courier New" w:eastAsia="Courier New" w:hAnsi="Courier New" w:cs="Courier New"/>
+                <w:sz w:val="19"/>
+                <w:szCs w:val="19"/>
+              </w:rPr>
+              <w:t>ScreenID</w:t>
+            </w:r>
+            <w:proofErr w:type="spellEnd"/>
+            <w:r>
+              <w:rPr>
+                <w:rFonts w:ascii="Courier New" w:eastAsia="Courier New" w:hAnsi="Courier New" w:cs="Courier New"/>
+                <w:sz w:val="19"/>
+                <w:szCs w:val="19"/>
+              </w:rPr>
+              <w:t>,</w:t>
+            </w:r>
+          </w:p>
+          <w:p>
+            <w:r>
+              <w:rPr>
+                <w:rFonts w:ascii="Courier New" w:eastAsia="Courier New" w:hAnsi="Courier New" w:cs="Courier New"/>
+                <w:sz w:val="19"/>
+                <w:szCs w:val="19"/>
+              </w:rPr>
+              <w:t xml:space="preserve">                   </w:t>
+            </w:r>
+            <w:proofErr w:type="spellStart"/>
+            <w:r>
+              <w:rPr>
+                <w:rFonts w:ascii="Courier New" w:eastAsia="Courier New" w:hAnsi="Courier New" w:cs="Courier New"/>
+                <w:sz w:val="19"/>
+                <w:szCs w:val="19"/>
+              </w:rPr>
+              <w:t>rowLetter</w:t>
+            </w:r>
+            <w:proofErr w:type="spellEnd"/>
+            <w:r>
+              <w:rPr>
+                <w:rFonts w:ascii="Courier New" w:eastAsia="Courier New" w:hAnsi="Courier New" w:cs="Courier New"/>
+                <w:sz w:val="19"/>
+                <w:szCs w:val="19"/>
+              </w:rPr>
+              <w:t xml:space="preserve"> and </w:t>
+            </w:r>
+            <w:proofErr w:type="spellStart"/>
+            <w:r>
+              <w:rPr>
+                <w:rFonts w:ascii="Courier New" w:eastAsia="Courier New" w:hAnsi="Courier New" w:cs="Courier New"/>
+                <w:sz w:val="19"/>
+                <w:szCs w:val="19"/>
+              </w:rPr>
+              <w:t>seatNumber</w:t>
+            </w:r>
+            <w:proofErr w:type="spellEnd"/>
+            <w:r>
+              <w:rPr>
+                <w:rFonts w:ascii="Courier New" w:eastAsia="Courier New" w:hAnsi="Courier New" w:cs="Courier New"/>
+                <w:sz w:val="19"/>
+                <w:szCs w:val="19"/>
+              </w:rPr>
+              <w:t xml:space="preserve"> using an SQL INSERT</w:t>
+            </w:r>
+          </w:p>
+          <w:p>
+            <w:r>
+              <w:rPr>
+                <w:rFonts w:ascii="Courier New" w:eastAsia="Courier New" w:hAnsi="Courier New" w:cs="Courier New"/>
+                <w:sz w:val="19"/>
+                <w:szCs w:val="19"/>
+              </w:rPr>
+              <w:t xml:space="preserve">            ADD 1 to </w:t>
+            </w:r>
+            <w:proofErr w:type="spellStart"/>
+            <w:r>
+              <w:rPr>
+                <w:rFonts w:ascii="Courier New" w:eastAsia="Courier New" w:hAnsi="Courier New" w:cs="Courier New"/>
+                <w:sz w:val="19"/>
+                <w:szCs w:val="19"/>
+              </w:rPr>
+              <w:t>seatsMade</w:t>
+            </w:r>
+            <w:proofErr w:type="spellEnd"/>
           </w:p>
           <w:p>
             <w:r>
@@ -8371,17 +10391,45 @@
                 <w:sz w:val="19"/>
                 <w:szCs w:val="19"/>
               </w:rPr>
-              <w:t xml:space="preserve">    NEXT seatNumber</w:t>
-            </w:r>
-          </w:p>
-          <w:p>
-            <w:r>
-              <w:rPr>
-                <w:rFonts w:ascii="Courier New" w:eastAsia="Courier New" w:hAnsi="Courier New" w:cs="Courier New"/>
-                <w:sz w:val="19"/>
-                <w:szCs w:val="19"/>
-              </w:rPr>
-              <w:t xml:space="preserve">    MOVE rowLetter on to the next letter of the alphabet</w:t>
+              <w:t xml:space="preserve">    NEXT </w:t>
+            </w:r>
+            <w:proofErr w:type="spellStart"/>
+            <w:r>
+              <w:rPr>
+                <w:rFonts w:ascii="Courier New" w:eastAsia="Courier New" w:hAnsi="Courier New" w:cs="Courier New"/>
+                <w:sz w:val="19"/>
+                <w:szCs w:val="19"/>
+              </w:rPr>
+              <w:t>seatNumber</w:t>
+            </w:r>
+            <w:proofErr w:type="spellEnd"/>
+          </w:p>
+          <w:p>
+            <w:r>
+              <w:rPr>
+                <w:rFonts w:ascii="Courier New" w:eastAsia="Courier New" w:hAnsi="Courier New" w:cs="Courier New"/>
+                <w:sz w:val="19"/>
+                <w:szCs w:val="19"/>
+              </w:rPr>
+              <w:t xml:space="preserve">    MOVE </w:t>
+            </w:r>
+            <w:proofErr w:type="spellStart"/>
+            <w:r>
+              <w:rPr>
+                <w:rFonts w:ascii="Courier New" w:eastAsia="Courier New" w:hAnsi="Courier New" w:cs="Courier New"/>
+                <w:sz w:val="19"/>
+                <w:szCs w:val="19"/>
+              </w:rPr>
+              <w:t>rowLetter</w:t>
+            </w:r>
+            <w:proofErr w:type="spellEnd"/>
+            <w:r>
+              <w:rPr>
+                <w:rFonts w:ascii="Courier New" w:eastAsia="Courier New" w:hAnsi="Courier New" w:cs="Courier New"/>
+                <w:sz w:val="19"/>
+                <w:szCs w:val="19"/>
+              </w:rPr>
+              <w:t xml:space="preserve"> on to the next letter of the alphabet</w:t>
             </w:r>
           </w:p>
           <w:p>
@@ -8517,7 +10565,43 @@
                 <w:sz w:val="19"/>
                 <w:szCs w:val="19"/>
               </w:rPr>
-              <w:t xml:space="preserve">    LOOK UP tblBookingSeat joined to tblBooking to see whether</w:t>
+              <w:t xml:space="preserve">    LOOK UP </w:t>
+            </w:r>
+            <w:proofErr w:type="spellStart"/>
+            <w:r>
+              <w:rPr>
+                <w:rFonts w:ascii="Courier New" w:eastAsia="Courier New" w:hAnsi="Courier New" w:cs="Courier New"/>
+                <w:sz w:val="19"/>
+                <w:szCs w:val="19"/>
+              </w:rPr>
+              <w:t>tblBookingSeat</w:t>
+            </w:r>
+            <w:proofErr w:type="spellEnd"/>
+            <w:r>
+              <w:rPr>
+                <w:rFonts w:ascii="Courier New" w:eastAsia="Courier New" w:hAnsi="Courier New" w:cs="Courier New"/>
+                <w:sz w:val="19"/>
+                <w:szCs w:val="19"/>
+              </w:rPr>
+              <w:t xml:space="preserve"> joined to </w:t>
+            </w:r>
+            <w:proofErr w:type="spellStart"/>
+            <w:r>
+              <w:rPr>
+                <w:rFonts w:ascii="Courier New" w:eastAsia="Courier New" w:hAnsi="Courier New" w:cs="Courier New"/>
+                <w:sz w:val="19"/>
+                <w:szCs w:val="19"/>
+              </w:rPr>
+              <w:t>tblBooking</w:t>
+            </w:r>
+            <w:proofErr w:type="spellEnd"/>
+            <w:r>
+              <w:rPr>
+                <w:rFonts w:ascii="Courier New" w:eastAsia="Courier New" w:hAnsi="Courier New" w:cs="Courier New"/>
+                <w:sz w:val="19"/>
+                <w:szCs w:val="19"/>
+              </w:rPr>
+              <w:t xml:space="preserve"> to see whether</w:t>
             </w:r>
           </w:p>
           <w:p>
@@ -8587,7 +10671,25 @@
                 <w:sz w:val="19"/>
                 <w:szCs w:val="19"/>
               </w:rPr>
-              <w:t>INSERT a new record into tblBooking with the customer, screening,</w:t>
+              <w:t xml:space="preserve">INSERT a new record into </w:t>
+            </w:r>
+            <w:proofErr w:type="spellStart"/>
+            <w:r>
+              <w:rPr>
+                <w:rFonts w:ascii="Courier New" w:eastAsia="Courier New" w:hAnsi="Courier New" w:cs="Courier New"/>
+                <w:sz w:val="19"/>
+                <w:szCs w:val="19"/>
+              </w:rPr>
+              <w:t>tblBooking</w:t>
+            </w:r>
+            <w:proofErr w:type="spellEnd"/>
+            <w:r>
+              <w:rPr>
+                <w:rFonts w:ascii="Courier New" w:eastAsia="Courier New" w:hAnsi="Courier New" w:cs="Courier New"/>
+                <w:sz w:val="19"/>
+                <w:szCs w:val="19"/>
+              </w:rPr>
+              <w:t xml:space="preserve"> with the customer, screening,</w:t>
             </w:r>
           </w:p>
           <w:p>
@@ -8607,7 +10709,25 @@
                 <w:sz w:val="19"/>
                 <w:szCs w:val="19"/>
               </w:rPr>
-              <w:t>GET the new BookingID that was created</w:t>
+              <w:t xml:space="preserve">GET the new </w:t>
+            </w:r>
+            <w:proofErr w:type="spellStart"/>
+            <w:r>
+              <w:rPr>
+                <w:rFonts w:ascii="Courier New" w:eastAsia="Courier New" w:hAnsi="Courier New" w:cs="Courier New"/>
+                <w:sz w:val="19"/>
+                <w:szCs w:val="19"/>
+              </w:rPr>
+              <w:t>BookingID</w:t>
+            </w:r>
+            <w:proofErr w:type="spellEnd"/>
+            <w:r>
+              <w:rPr>
+                <w:rFonts w:ascii="Courier New" w:eastAsia="Courier New" w:hAnsi="Courier New" w:cs="Courier New"/>
+                <w:sz w:val="19"/>
+                <w:szCs w:val="19"/>
+              </w:rPr>
+              <w:t xml:space="preserve"> that was created</w:t>
             </w:r>
           </w:p>
           <w:p>
@@ -8627,8 +10747,54 @@
                 <w:sz w:val="19"/>
                 <w:szCs w:val="19"/>
               </w:rPr>
-              <w:t xml:space="preserve">    INSERT a record into tblBookingSeat linking BookingID to SeatID</w:t>
-            </w:r>
+              <w:t xml:space="preserve">    INSERT a record into </w:t>
+            </w:r>
+            <w:proofErr w:type="spellStart"/>
+            <w:r>
+              <w:rPr>
+                <w:rFonts w:ascii="Courier New" w:eastAsia="Courier New" w:hAnsi="Courier New" w:cs="Courier New"/>
+                <w:sz w:val="19"/>
+                <w:szCs w:val="19"/>
+              </w:rPr>
+              <w:t>tblBookingSeat</w:t>
+            </w:r>
+            <w:proofErr w:type="spellEnd"/>
+            <w:r>
+              <w:rPr>
+                <w:rFonts w:ascii="Courier New" w:eastAsia="Courier New" w:hAnsi="Courier New" w:cs="Courier New"/>
+                <w:sz w:val="19"/>
+                <w:szCs w:val="19"/>
+              </w:rPr>
+              <w:t xml:space="preserve"> linking </w:t>
+            </w:r>
+            <w:proofErr w:type="spellStart"/>
+            <w:r>
+              <w:rPr>
+                <w:rFonts w:ascii="Courier New" w:eastAsia="Courier New" w:hAnsi="Courier New" w:cs="Courier New"/>
+                <w:sz w:val="19"/>
+                <w:szCs w:val="19"/>
+              </w:rPr>
+              <w:t>BookingID</w:t>
+            </w:r>
+            <w:proofErr w:type="spellEnd"/>
+            <w:r>
+              <w:rPr>
+                <w:rFonts w:ascii="Courier New" w:eastAsia="Courier New" w:hAnsi="Courier New" w:cs="Courier New"/>
+                <w:sz w:val="19"/>
+                <w:szCs w:val="19"/>
+              </w:rPr>
+              <w:t xml:space="preserve"> to </w:t>
+            </w:r>
+            <w:proofErr w:type="spellStart"/>
+            <w:r>
+              <w:rPr>
+                <w:rFonts w:ascii="Courier New" w:eastAsia="Courier New" w:hAnsi="Courier New" w:cs="Courier New"/>
+                <w:sz w:val="19"/>
+                <w:szCs w:val="19"/>
+              </w:rPr>
+              <w:t>SeatID</w:t>
+            </w:r>
+            <w:proofErr w:type="spellEnd"/>
           </w:p>
           <w:p>
             <w:r>
@@ -8731,17 +10897,45 @@
                 <w:sz w:val="19"/>
                 <w:szCs w:val="19"/>
               </w:rPr>
-              <w:t>GET the selected screening and its ScreenID</w:t>
-            </w:r>
-          </w:p>
-          <w:p>
-            <w:r>
-              <w:rPr>
-                <w:rFonts w:ascii="Courier New" w:eastAsia="Courier New" w:hAnsi="Courier New" w:cs="Courier New"/>
-                <w:sz w:val="19"/>
-                <w:szCs w:val="19"/>
-              </w:rPr>
-              <w:t>SELECT all seats for that screen from tblSeat,</w:t>
+              <w:t xml:space="preserve">GET the selected screening and its </w:t>
+            </w:r>
+            <w:proofErr w:type="spellStart"/>
+            <w:r>
+              <w:rPr>
+                <w:rFonts w:ascii="Courier New" w:eastAsia="Courier New" w:hAnsi="Courier New" w:cs="Courier New"/>
+                <w:sz w:val="19"/>
+                <w:szCs w:val="19"/>
+              </w:rPr>
+              <w:t>ScreenID</w:t>
+            </w:r>
+            <w:proofErr w:type="spellEnd"/>
+          </w:p>
+          <w:p>
+            <w:r>
+              <w:rPr>
+                <w:rFonts w:ascii="Courier New" w:eastAsia="Courier New" w:hAnsi="Courier New" w:cs="Courier New"/>
+                <w:sz w:val="19"/>
+                <w:szCs w:val="19"/>
+              </w:rPr>
+              <w:t xml:space="preserve">SELECT all seats for that screen from </w:t>
+            </w:r>
+            <w:proofErr w:type="spellStart"/>
+            <w:r>
+              <w:rPr>
+                <w:rFonts w:ascii="Courier New" w:eastAsia="Courier New" w:hAnsi="Courier New" w:cs="Courier New"/>
+                <w:sz w:val="19"/>
+                <w:szCs w:val="19"/>
+              </w:rPr>
+              <w:t>tblSeat</w:t>
+            </w:r>
+            <w:proofErr w:type="spellEnd"/>
+            <w:r>
+              <w:rPr>
+                <w:rFonts w:ascii="Courier New" w:eastAsia="Courier New" w:hAnsi="Courier New" w:cs="Courier New"/>
+                <w:sz w:val="19"/>
+                <w:szCs w:val="19"/>
+              </w:rPr>
+              <w:t>,</w:t>
             </w:r>
           </w:p>
           <w:p>
@@ -8771,8 +10965,18 @@
                 <w:sz w:val="19"/>
                 <w:szCs w:val="19"/>
               </w:rPr>
-              <w:t xml:space="preserve">       from tblBookingSeat</w:t>
-            </w:r>
+              <w:t xml:space="preserve">       from </w:t>
+            </w:r>
+            <w:proofErr w:type="spellStart"/>
+            <w:r>
+              <w:rPr>
+                <w:rFonts w:ascii="Courier New" w:eastAsia="Courier New" w:hAnsi="Courier New" w:cs="Courier New"/>
+                <w:sz w:val="19"/>
+                <w:szCs w:val="19"/>
+              </w:rPr>
+              <w:t>tblBookingSeat</w:t>
+            </w:r>
+            <w:proofErr w:type="spellEnd"/>
           </w:p>
           <w:p>
             <w:r>
@@ -8915,7 +11119,25 @@
                 <w:sz w:val="19"/>
                 <w:szCs w:val="19"/>
               </w:rPr>
-              <w:t>SET foodTotal to 0</w:t>
+              <w:t xml:space="preserve">SET </w:t>
+            </w:r>
+            <w:proofErr w:type="spellStart"/>
+            <w:r>
+              <w:rPr>
+                <w:rFonts w:ascii="Courier New" w:eastAsia="Courier New" w:hAnsi="Courier New" w:cs="Courier New"/>
+                <w:sz w:val="19"/>
+                <w:szCs w:val="19"/>
+              </w:rPr>
+              <w:t>foodTotal</w:t>
+            </w:r>
+            <w:proofErr w:type="spellEnd"/>
+            <w:r>
+              <w:rPr>
+                <w:rFonts w:ascii="Courier New" w:eastAsia="Courier New" w:hAnsi="Courier New" w:cs="Courier New"/>
+                <w:sz w:val="19"/>
+                <w:szCs w:val="19"/>
+              </w:rPr>
+              <w:t xml:space="preserve"> to 0</w:t>
             </w:r>
           </w:p>
           <w:p>
@@ -8935,28 +11157,84 @@
                 <w:sz w:val="19"/>
                 <w:szCs w:val="19"/>
               </w:rPr>
-              <w:t xml:space="preserve">    LOOK UP the item price in tblFoodItem</w:t>
-            </w:r>
-          </w:p>
-          <w:p>
-            <w:r>
-              <w:rPr>
-                <w:rFonts w:ascii="Courier New" w:eastAsia="Courier New" w:hAnsi="Courier New" w:cs="Courier New"/>
-                <w:sz w:val="19"/>
-                <w:szCs w:val="19"/>
-              </w:rPr>
-              <w:t xml:space="preserve">    CALCULATE lineCost as price multiplied by quantity</w:t>
-            </w:r>
-          </w:p>
-          <w:p>
-            <w:r>
-              <w:rPr>
-                <w:rFonts w:ascii="Courier New" w:eastAsia="Courier New" w:hAnsi="Courier New" w:cs="Courier New"/>
-                <w:sz w:val="19"/>
-                <w:szCs w:val="19"/>
-              </w:rPr>
-              <w:t xml:space="preserve">    ADD lineCost to foodTotal</w:t>
-            </w:r>
+              <w:t xml:space="preserve">    LOOK UP the item price in </w:t>
+            </w:r>
+            <w:proofErr w:type="spellStart"/>
+            <w:r>
+              <w:rPr>
+                <w:rFonts w:ascii="Courier New" w:eastAsia="Courier New" w:hAnsi="Courier New" w:cs="Courier New"/>
+                <w:sz w:val="19"/>
+                <w:szCs w:val="19"/>
+              </w:rPr>
+              <w:t>tblFoodItem</w:t>
+            </w:r>
+            <w:proofErr w:type="spellEnd"/>
+          </w:p>
+          <w:p>
+            <w:r>
+              <w:rPr>
+                <w:rFonts w:ascii="Courier New" w:eastAsia="Courier New" w:hAnsi="Courier New" w:cs="Courier New"/>
+                <w:sz w:val="19"/>
+                <w:szCs w:val="19"/>
+              </w:rPr>
+              <w:t xml:space="preserve">    CALCULATE </w:t>
+            </w:r>
+            <w:proofErr w:type="spellStart"/>
+            <w:r>
+              <w:rPr>
+                <w:rFonts w:ascii="Courier New" w:eastAsia="Courier New" w:hAnsi="Courier New" w:cs="Courier New"/>
+                <w:sz w:val="19"/>
+                <w:szCs w:val="19"/>
+              </w:rPr>
+              <w:t>lineCost</w:t>
+            </w:r>
+            <w:proofErr w:type="spellEnd"/>
+            <w:r>
+              <w:rPr>
+                <w:rFonts w:ascii="Courier New" w:eastAsia="Courier New" w:hAnsi="Courier New" w:cs="Courier New"/>
+                <w:sz w:val="19"/>
+                <w:szCs w:val="19"/>
+              </w:rPr>
+              <w:t xml:space="preserve"> as price multiplied by quantity</w:t>
+            </w:r>
+          </w:p>
+          <w:p>
+            <w:r>
+              <w:rPr>
+                <w:rFonts w:ascii="Courier New" w:eastAsia="Courier New" w:hAnsi="Courier New" w:cs="Courier New"/>
+                <w:sz w:val="19"/>
+                <w:szCs w:val="19"/>
+              </w:rPr>
+              <w:t xml:space="preserve">    ADD </w:t>
+            </w:r>
+            <w:proofErr w:type="spellStart"/>
+            <w:r>
+              <w:rPr>
+                <w:rFonts w:ascii="Courier New" w:eastAsia="Courier New" w:hAnsi="Courier New" w:cs="Courier New"/>
+                <w:sz w:val="19"/>
+                <w:szCs w:val="19"/>
+              </w:rPr>
+              <w:t>lineCost</w:t>
+            </w:r>
+            <w:proofErr w:type="spellEnd"/>
+            <w:r>
+              <w:rPr>
+                <w:rFonts w:ascii="Courier New" w:eastAsia="Courier New" w:hAnsi="Courier New" w:cs="Courier New"/>
+                <w:sz w:val="19"/>
+                <w:szCs w:val="19"/>
+              </w:rPr>
+              <w:t xml:space="preserve"> to </w:t>
+            </w:r>
+            <w:proofErr w:type="spellStart"/>
+            <w:r>
+              <w:rPr>
+                <w:rFonts w:ascii="Courier New" w:eastAsia="Courier New" w:hAnsi="Courier New" w:cs="Courier New"/>
+                <w:sz w:val="19"/>
+                <w:szCs w:val="19"/>
+              </w:rPr>
+              <w:t>foodTotal</w:t>
+            </w:r>
+            <w:proofErr w:type="spellEnd"/>
           </w:p>
           <w:p>
             <w:r>
@@ -8975,27 +11253,109 @@
                 <w:sz w:val="19"/>
                 <w:szCs w:val="19"/>
               </w:rPr>
-              <w:t>CALCULATE seatTotal as number of seats times the ticket price</w:t>
-            </w:r>
-          </w:p>
-          <w:p>
-            <w:r>
-              <w:rPr>
-                <w:rFonts w:ascii="Courier New" w:eastAsia="Courier New" w:hAnsi="Courier New" w:cs="Courier New"/>
-                <w:sz w:val="19"/>
-                <w:szCs w:val="19"/>
-              </w:rPr>
-              <w:t>CALCULATE totalCost as seatTotal plus foodTotal</w:t>
-            </w:r>
-          </w:p>
-          <w:p>
-            <w:r>
-              <w:rPr>
-                <w:rFonts w:ascii="Courier New" w:eastAsia="Courier New" w:hAnsi="Courier New" w:cs="Courier New"/>
-                <w:sz w:val="19"/>
-                <w:szCs w:val="19"/>
-              </w:rPr>
-              <w:t>DISPLAY totalCost to the customer</w:t>
+              <w:t xml:space="preserve">CALCULATE </w:t>
+            </w:r>
+            <w:proofErr w:type="spellStart"/>
+            <w:r>
+              <w:rPr>
+                <w:rFonts w:ascii="Courier New" w:eastAsia="Courier New" w:hAnsi="Courier New" w:cs="Courier New"/>
+                <w:sz w:val="19"/>
+                <w:szCs w:val="19"/>
+              </w:rPr>
+              <w:t>seatTotal</w:t>
+            </w:r>
+            <w:proofErr w:type="spellEnd"/>
+            <w:r>
+              <w:rPr>
+                <w:rFonts w:ascii="Courier New" w:eastAsia="Courier New" w:hAnsi="Courier New" w:cs="Courier New"/>
+                <w:sz w:val="19"/>
+                <w:szCs w:val="19"/>
+              </w:rPr>
+              <w:t xml:space="preserve"> as number of seats times the ticket price</w:t>
+            </w:r>
+          </w:p>
+          <w:p>
+            <w:r>
+              <w:rPr>
+                <w:rFonts w:ascii="Courier New" w:eastAsia="Courier New" w:hAnsi="Courier New" w:cs="Courier New"/>
+                <w:sz w:val="19"/>
+                <w:szCs w:val="19"/>
+              </w:rPr>
+              <w:t xml:space="preserve">CALCULATE </w:t>
+            </w:r>
+            <w:proofErr w:type="spellStart"/>
+            <w:r>
+              <w:rPr>
+                <w:rFonts w:ascii="Courier New" w:eastAsia="Courier New" w:hAnsi="Courier New" w:cs="Courier New"/>
+                <w:sz w:val="19"/>
+                <w:szCs w:val="19"/>
+              </w:rPr>
+              <w:t>totalCost</w:t>
+            </w:r>
+            <w:proofErr w:type="spellEnd"/>
+            <w:r>
+              <w:rPr>
+                <w:rFonts w:ascii="Courier New" w:eastAsia="Courier New" w:hAnsi="Courier New" w:cs="Courier New"/>
+                <w:sz w:val="19"/>
+                <w:szCs w:val="19"/>
+              </w:rPr>
+              <w:t xml:space="preserve"> as </w:t>
+            </w:r>
+            <w:proofErr w:type="spellStart"/>
+            <w:r>
+              <w:rPr>
+                <w:rFonts w:ascii="Courier New" w:eastAsia="Courier New" w:hAnsi="Courier New" w:cs="Courier New"/>
+                <w:sz w:val="19"/>
+                <w:szCs w:val="19"/>
+              </w:rPr>
+              <w:t>seatTotal</w:t>
+            </w:r>
+            <w:proofErr w:type="spellEnd"/>
+            <w:r>
+              <w:rPr>
+                <w:rFonts w:ascii="Courier New" w:eastAsia="Courier New" w:hAnsi="Courier New" w:cs="Courier New"/>
+                <w:sz w:val="19"/>
+                <w:szCs w:val="19"/>
+              </w:rPr>
+              <w:t xml:space="preserve"> plus </w:t>
+            </w:r>
+            <w:proofErr w:type="spellStart"/>
+            <w:r>
+              <w:rPr>
+                <w:rFonts w:ascii="Courier New" w:eastAsia="Courier New" w:hAnsi="Courier New" w:cs="Courier New"/>
+                <w:sz w:val="19"/>
+                <w:szCs w:val="19"/>
+              </w:rPr>
+              <w:t>foodTotal</w:t>
+            </w:r>
+            <w:proofErr w:type="spellEnd"/>
+          </w:p>
+          <w:p>
+            <w:r>
+              <w:rPr>
+                <w:rFonts w:ascii="Courier New" w:eastAsia="Courier New" w:hAnsi="Courier New" w:cs="Courier New"/>
+                <w:sz w:val="19"/>
+                <w:szCs w:val="19"/>
+              </w:rPr>
+              <w:t xml:space="preserve">DISPLAY </w:t>
+            </w:r>
+            <w:proofErr w:type="spellStart"/>
+            <w:r>
+              <w:rPr>
+                <w:rFonts w:ascii="Courier New" w:eastAsia="Courier New" w:hAnsi="Courier New" w:cs="Courier New"/>
+                <w:sz w:val="19"/>
+                <w:szCs w:val="19"/>
+              </w:rPr>
+              <w:t>totalCost</w:t>
+            </w:r>
+            <w:proofErr w:type="spellEnd"/>
+            <w:r>
+              <w:rPr>
+                <w:rFonts w:ascii="Courier New" w:eastAsia="Courier New" w:hAnsi="Courier New" w:cs="Courier New"/>
+                <w:sz w:val="19"/>
+                <w:szCs w:val="19"/>
+              </w:rPr>
+              <w:t xml:space="preserve"> to the customer</w:t>
             </w:r>
           </w:p>
         </w:tc>
@@ -9109,7 +11469,43 @@
                 <w:sz w:val="19"/>
                 <w:szCs w:val="19"/>
               </w:rPr>
-              <w:t xml:space="preserve">    SELECT all bookings from tblBooking where BookingDate is</w:t>
+              <w:t xml:space="preserve">    SELECT all bookings from </w:t>
+            </w:r>
+            <w:proofErr w:type="spellStart"/>
+            <w:r>
+              <w:rPr>
+                <w:rFonts w:ascii="Courier New" w:eastAsia="Courier New" w:hAnsi="Courier New" w:cs="Courier New"/>
+                <w:sz w:val="19"/>
+                <w:szCs w:val="19"/>
+              </w:rPr>
+              <w:t>tblBooking</w:t>
+            </w:r>
+            <w:proofErr w:type="spellEnd"/>
+            <w:r>
+              <w:rPr>
+                <w:rFonts w:ascii="Courier New" w:eastAsia="Courier New" w:hAnsi="Courier New" w:cs="Courier New"/>
+                <w:sz w:val="19"/>
+                <w:szCs w:val="19"/>
+              </w:rPr>
+              <w:t xml:space="preserve"> where </w:t>
+            </w:r>
+            <w:proofErr w:type="spellStart"/>
+            <w:r>
+              <w:rPr>
+                <w:rFonts w:ascii="Courier New" w:eastAsia="Courier New" w:hAnsi="Courier New" w:cs="Courier New"/>
+                <w:sz w:val="19"/>
+                <w:szCs w:val="19"/>
+              </w:rPr>
+              <w:t>BookingDate</w:t>
+            </w:r>
+            <w:proofErr w:type="spellEnd"/>
+            <w:r>
+              <w:rPr>
+                <w:rFonts w:ascii="Courier New" w:eastAsia="Courier New" w:hAnsi="Courier New" w:cs="Courier New"/>
+                <w:sz w:val="19"/>
+                <w:szCs w:val="19"/>
+              </w:rPr>
+              <w:t xml:space="preserve"> is</w:t>
             </w:r>
           </w:p>
           <w:p>
@@ -9129,17 +11525,53 @@
                 <w:sz w:val="19"/>
                 <w:szCs w:val="19"/>
               </w:rPr>
-              <w:t xml:space="preserve">    SET totalTickets to 0</w:t>
-            </w:r>
-          </w:p>
-          <w:p>
-            <w:r>
-              <w:rPr>
-                <w:rFonts w:ascii="Courier New" w:eastAsia="Courier New" w:hAnsi="Courier New" w:cs="Courier New"/>
-                <w:sz w:val="19"/>
-                <w:szCs w:val="19"/>
-              </w:rPr>
-              <w:t xml:space="preserve">    SET totalRevenue to 0</w:t>
+              <w:t xml:space="preserve">    SET </w:t>
+            </w:r>
+            <w:proofErr w:type="spellStart"/>
+            <w:r>
+              <w:rPr>
+                <w:rFonts w:ascii="Courier New" w:eastAsia="Courier New" w:hAnsi="Courier New" w:cs="Courier New"/>
+                <w:sz w:val="19"/>
+                <w:szCs w:val="19"/>
+              </w:rPr>
+              <w:t>totalTickets</w:t>
+            </w:r>
+            <w:proofErr w:type="spellEnd"/>
+            <w:r>
+              <w:rPr>
+                <w:rFonts w:ascii="Courier New" w:eastAsia="Courier New" w:hAnsi="Courier New" w:cs="Courier New"/>
+                <w:sz w:val="19"/>
+                <w:szCs w:val="19"/>
+              </w:rPr>
+              <w:t xml:space="preserve"> to 0</w:t>
+            </w:r>
+          </w:p>
+          <w:p>
+            <w:r>
+              <w:rPr>
+                <w:rFonts w:ascii="Courier New" w:eastAsia="Courier New" w:hAnsi="Courier New" w:cs="Courier New"/>
+                <w:sz w:val="19"/>
+                <w:szCs w:val="19"/>
+              </w:rPr>
+              <w:t xml:space="preserve">    SET </w:t>
+            </w:r>
+            <w:proofErr w:type="spellStart"/>
+            <w:r>
+              <w:rPr>
+                <w:rFonts w:ascii="Courier New" w:eastAsia="Courier New" w:hAnsi="Courier New" w:cs="Courier New"/>
+                <w:sz w:val="19"/>
+                <w:szCs w:val="19"/>
+              </w:rPr>
+              <w:t>totalRevenue</w:t>
+            </w:r>
+            <w:proofErr w:type="spellEnd"/>
+            <w:r>
+              <w:rPr>
+                <w:rFonts w:ascii="Courier New" w:eastAsia="Courier New" w:hAnsi="Courier New" w:cs="Courier New"/>
+                <w:sz w:val="19"/>
+                <w:szCs w:val="19"/>
+              </w:rPr>
+              <w:t xml:space="preserve"> to 0</w:t>
             </w:r>
           </w:p>
           <w:p>
@@ -9159,28 +11591,76 @@
                 <w:sz w:val="19"/>
                 <w:szCs w:val="19"/>
               </w:rPr>
-              <w:t xml:space="preserve">        COUNT the seats linked to it in tblBookingSeat</w:t>
-            </w:r>
-          </w:p>
-          <w:p>
-            <w:r>
-              <w:rPr>
-                <w:rFonts w:ascii="Courier New" w:eastAsia="Courier New" w:hAnsi="Courier New" w:cs="Courier New"/>
-                <w:sz w:val="19"/>
-                <w:szCs w:val="19"/>
-              </w:rPr>
-              <w:t xml:space="preserve">        ADD that count to totalTickets</w:t>
-            </w:r>
-          </w:p>
-          <w:p>
-            <w:r>
-              <w:rPr>
-                <w:rFonts w:ascii="Courier New" w:eastAsia="Courier New" w:hAnsi="Courier New" w:cs="Courier New"/>
-                <w:sz w:val="19"/>
-                <w:szCs w:val="19"/>
-              </w:rPr>
-              <w:t xml:space="preserve">        ADD the booking's TotalCost to totalRevenue</w:t>
-            </w:r>
+              <w:t xml:space="preserve">        COUNT the seats linked to it in </w:t>
+            </w:r>
+            <w:proofErr w:type="spellStart"/>
+            <w:r>
+              <w:rPr>
+                <w:rFonts w:ascii="Courier New" w:eastAsia="Courier New" w:hAnsi="Courier New" w:cs="Courier New"/>
+                <w:sz w:val="19"/>
+                <w:szCs w:val="19"/>
+              </w:rPr>
+              <w:t>tblBookingSeat</w:t>
+            </w:r>
+            <w:proofErr w:type="spellEnd"/>
+          </w:p>
+          <w:p>
+            <w:r>
+              <w:rPr>
+                <w:rFonts w:ascii="Courier New" w:eastAsia="Courier New" w:hAnsi="Courier New" w:cs="Courier New"/>
+                <w:sz w:val="19"/>
+                <w:szCs w:val="19"/>
+              </w:rPr>
+              <w:t xml:space="preserve">        ADD that count to </w:t>
+            </w:r>
+            <w:proofErr w:type="spellStart"/>
+            <w:r>
+              <w:rPr>
+                <w:rFonts w:ascii="Courier New" w:eastAsia="Courier New" w:hAnsi="Courier New" w:cs="Courier New"/>
+                <w:sz w:val="19"/>
+                <w:szCs w:val="19"/>
+              </w:rPr>
+              <w:t>totalTickets</w:t>
+            </w:r>
+            <w:proofErr w:type="spellEnd"/>
+          </w:p>
+          <w:p>
+            <w:r>
+              <w:rPr>
+                <w:rFonts w:ascii="Courier New" w:eastAsia="Courier New" w:hAnsi="Courier New" w:cs="Courier New"/>
+                <w:sz w:val="19"/>
+                <w:szCs w:val="19"/>
+              </w:rPr>
+              <w:t xml:space="preserve">        ADD the booking's </w:t>
+            </w:r>
+            <w:proofErr w:type="spellStart"/>
+            <w:r>
+              <w:rPr>
+                <w:rFonts w:ascii="Courier New" w:eastAsia="Courier New" w:hAnsi="Courier New" w:cs="Courier New"/>
+                <w:sz w:val="19"/>
+                <w:szCs w:val="19"/>
+              </w:rPr>
+              <w:t>TotalCost</w:t>
+            </w:r>
+            <w:proofErr w:type="spellEnd"/>
+            <w:r>
+              <w:rPr>
+                <w:rFonts w:ascii="Courier New" w:eastAsia="Courier New" w:hAnsi="Courier New" w:cs="Courier New"/>
+                <w:sz w:val="19"/>
+                <w:szCs w:val="19"/>
+              </w:rPr>
+              <w:t xml:space="preserve"> to </w:t>
+            </w:r>
+            <w:proofErr w:type="spellStart"/>
+            <w:r>
+              <w:rPr>
+                <w:rFonts w:ascii="Courier New" w:eastAsia="Courier New" w:hAnsi="Courier New" w:cs="Courier New"/>
+                <w:sz w:val="19"/>
+                <w:szCs w:val="19"/>
+              </w:rPr>
+              <w:t>totalRevenue</w:t>
+            </w:r>
+            <w:proofErr w:type="spellEnd"/>
           </w:p>
           <w:p>
             <w:r>
@@ -9199,8 +11679,36 @@
                 <w:sz w:val="19"/>
                 <w:szCs w:val="19"/>
               </w:rPr>
-              <w:t xml:space="preserve">    DISPLAY totalTickets and totalRevenue</w:t>
-            </w:r>
+              <w:t xml:space="preserve">    DISPLAY </w:t>
+            </w:r>
+            <w:proofErr w:type="spellStart"/>
+            <w:r>
+              <w:rPr>
+                <w:rFonts w:ascii="Courier New" w:eastAsia="Courier New" w:hAnsi="Courier New" w:cs="Courier New"/>
+                <w:sz w:val="19"/>
+                <w:szCs w:val="19"/>
+              </w:rPr>
+              <w:t>totalTickets</w:t>
+            </w:r>
+            <w:proofErr w:type="spellEnd"/>
+            <w:r>
+              <w:rPr>
+                <w:rFonts w:ascii="Courier New" w:eastAsia="Courier New" w:hAnsi="Courier New" w:cs="Courier New"/>
+                <w:sz w:val="19"/>
+                <w:szCs w:val="19"/>
+              </w:rPr>
+              <w:t xml:space="preserve"> and </w:t>
+            </w:r>
+            <w:proofErr w:type="spellStart"/>
+            <w:r>
+              <w:rPr>
+                <w:rFonts w:ascii="Courier New" w:eastAsia="Courier New" w:hAnsi="Courier New" w:cs="Courier New"/>
+                <w:sz w:val="19"/>
+                <w:szCs w:val="19"/>
+              </w:rPr>
+              <w:t>totalRevenue</w:t>
+            </w:r>
+            <w:proofErr w:type="spellEnd"/>
           </w:p>
           <w:p>
             <w:r>
@@ -9323,8 +11831,18 @@
                 <w:sz w:val="19"/>
                 <w:szCs w:val="19"/>
               </w:rPr>
-              <w:t xml:space="preserve">    SELECT bookings joined to customers where CustomerSurname</w:t>
-            </w:r>
+              <w:t xml:space="preserve">    SELECT bookings joined to customers where </w:t>
+            </w:r>
+            <w:proofErr w:type="spellStart"/>
+            <w:r>
+              <w:rPr>
+                <w:rFonts w:ascii="Courier New" w:eastAsia="Courier New" w:hAnsi="Courier New" w:cs="Courier New"/>
+                <w:sz w:val="19"/>
+                <w:szCs w:val="19"/>
+              </w:rPr>
+              <w:t>CustomerSurname</w:t>
+            </w:r>
+            <w:proofErr w:type="spellEnd"/>
           </w:p>
           <w:p>
             <w:r>
@@ -9422,7 +11940,15 @@
         <w:spacing w:after="160" w:line="276" w:lineRule="auto"/>
       </w:pPr>
       <w:r>
-        <w:t>When a booking is cancelled its seats need to become available again. Because availability is worked out from the link table, simply removing the booking's records from tblBookingSeat frees those seats automatically with no separate step needed.</w:t>
+        <w:t xml:space="preserve">When a booking is cancelled its seats need to become available again. Because availability is worked out from the link table, simply removing the booking's records from </w:t>
+      </w:r>
+      <w:proofErr w:type="spellStart"/>
+      <w:r>
+        <w:t>tblBookingSeat</w:t>
+      </w:r>
+      <w:proofErr w:type="spellEnd"/>
+      <w:r>
+        <w:t xml:space="preserve"> frees those seats automatically with no separate step needed.</w:t>
       </w:r>
     </w:p>
     <w:tbl>
@@ -9462,7 +11988,25 @@
                 <w:sz w:val="19"/>
                 <w:szCs w:val="19"/>
               </w:rPr>
-              <w:t>GET the BookingID of the booking to cancel</w:t>
+              <w:t xml:space="preserve">GET the </w:t>
+            </w:r>
+            <w:proofErr w:type="spellStart"/>
+            <w:r>
+              <w:rPr>
+                <w:rFonts w:ascii="Courier New" w:eastAsia="Courier New" w:hAnsi="Courier New" w:cs="Courier New"/>
+                <w:sz w:val="19"/>
+                <w:szCs w:val="19"/>
+              </w:rPr>
+              <w:t>BookingID</w:t>
+            </w:r>
+            <w:proofErr w:type="spellEnd"/>
+            <w:r>
+              <w:rPr>
+                <w:rFonts w:ascii="Courier New" w:eastAsia="Courier New" w:hAnsi="Courier New" w:cs="Courier New"/>
+                <w:sz w:val="19"/>
+                <w:szCs w:val="19"/>
+              </w:rPr>
+              <w:t xml:space="preserve"> of the booking to cancel</w:t>
             </w:r>
           </w:p>
           <w:p>
@@ -9492,28 +12036,112 @@
                 <w:sz w:val="19"/>
                 <w:szCs w:val="19"/>
               </w:rPr>
-              <w:t xml:space="preserve">    DELETE all records in tblBookingSeat for that BookingID</w:t>
-            </w:r>
-          </w:p>
-          <w:p>
-            <w:r>
-              <w:rPr>
-                <w:rFonts w:ascii="Courier New" w:eastAsia="Courier New" w:hAnsi="Courier New" w:cs="Courier New"/>
-                <w:sz w:val="19"/>
-                <w:szCs w:val="19"/>
-              </w:rPr>
-              <w:t xml:space="preserve">    DELETE all records in tblOrderItem for that BookingID</w:t>
-            </w:r>
-          </w:p>
-          <w:p>
-            <w:r>
-              <w:rPr>
-                <w:rFonts w:ascii="Courier New" w:eastAsia="Courier New" w:hAnsi="Courier New" w:cs="Courier New"/>
-                <w:sz w:val="19"/>
-                <w:szCs w:val="19"/>
-              </w:rPr>
-              <w:t xml:space="preserve">    DELETE the record in tblBooking for that BookingID</w:t>
-            </w:r>
+              <w:t xml:space="preserve">    DELETE all records in </w:t>
+            </w:r>
+            <w:proofErr w:type="spellStart"/>
+            <w:r>
+              <w:rPr>
+                <w:rFonts w:ascii="Courier New" w:eastAsia="Courier New" w:hAnsi="Courier New" w:cs="Courier New"/>
+                <w:sz w:val="19"/>
+                <w:szCs w:val="19"/>
+              </w:rPr>
+              <w:t>tblBookingSeat</w:t>
+            </w:r>
+            <w:proofErr w:type="spellEnd"/>
+            <w:r>
+              <w:rPr>
+                <w:rFonts w:ascii="Courier New" w:eastAsia="Courier New" w:hAnsi="Courier New" w:cs="Courier New"/>
+                <w:sz w:val="19"/>
+                <w:szCs w:val="19"/>
+              </w:rPr>
+              <w:t xml:space="preserve"> for that </w:t>
+            </w:r>
+            <w:proofErr w:type="spellStart"/>
+            <w:r>
+              <w:rPr>
+                <w:rFonts w:ascii="Courier New" w:eastAsia="Courier New" w:hAnsi="Courier New" w:cs="Courier New"/>
+                <w:sz w:val="19"/>
+                <w:szCs w:val="19"/>
+              </w:rPr>
+              <w:t>BookingID</w:t>
+            </w:r>
+            <w:proofErr w:type="spellEnd"/>
+          </w:p>
+          <w:p>
+            <w:r>
+              <w:rPr>
+                <w:rFonts w:ascii="Courier New" w:eastAsia="Courier New" w:hAnsi="Courier New" w:cs="Courier New"/>
+                <w:sz w:val="19"/>
+                <w:szCs w:val="19"/>
+              </w:rPr>
+              <w:t xml:space="preserve">    DELETE all records in </w:t>
+            </w:r>
+            <w:proofErr w:type="spellStart"/>
+            <w:r>
+              <w:rPr>
+                <w:rFonts w:ascii="Courier New" w:eastAsia="Courier New" w:hAnsi="Courier New" w:cs="Courier New"/>
+                <w:sz w:val="19"/>
+                <w:szCs w:val="19"/>
+              </w:rPr>
+              <w:t>tblOrderItem</w:t>
+            </w:r>
+            <w:proofErr w:type="spellEnd"/>
+            <w:r>
+              <w:rPr>
+                <w:rFonts w:ascii="Courier New" w:eastAsia="Courier New" w:hAnsi="Courier New" w:cs="Courier New"/>
+                <w:sz w:val="19"/>
+                <w:szCs w:val="19"/>
+              </w:rPr>
+              <w:t xml:space="preserve"> for that </w:t>
+            </w:r>
+            <w:proofErr w:type="spellStart"/>
+            <w:r>
+              <w:rPr>
+                <w:rFonts w:ascii="Courier New" w:eastAsia="Courier New" w:hAnsi="Courier New" w:cs="Courier New"/>
+                <w:sz w:val="19"/>
+                <w:szCs w:val="19"/>
+              </w:rPr>
+              <w:t>BookingID</w:t>
+            </w:r>
+            <w:proofErr w:type="spellEnd"/>
+          </w:p>
+          <w:p>
+            <w:r>
+              <w:rPr>
+                <w:rFonts w:ascii="Courier New" w:eastAsia="Courier New" w:hAnsi="Courier New" w:cs="Courier New"/>
+                <w:sz w:val="19"/>
+                <w:szCs w:val="19"/>
+              </w:rPr>
+              <w:t xml:space="preserve">    DELETE the record in </w:t>
+            </w:r>
+            <w:proofErr w:type="spellStart"/>
+            <w:r>
+              <w:rPr>
+                <w:rFonts w:ascii="Courier New" w:eastAsia="Courier New" w:hAnsi="Courier New" w:cs="Courier New"/>
+                <w:sz w:val="19"/>
+                <w:szCs w:val="19"/>
+              </w:rPr>
+              <w:t>tblBooking</w:t>
+            </w:r>
+            <w:proofErr w:type="spellEnd"/>
+            <w:r>
+              <w:rPr>
+                <w:rFonts w:ascii="Courier New" w:eastAsia="Courier New" w:hAnsi="Courier New" w:cs="Courier New"/>
+                <w:sz w:val="19"/>
+                <w:szCs w:val="19"/>
+              </w:rPr>
+              <w:t xml:space="preserve"> for that </w:t>
+            </w:r>
+            <w:proofErr w:type="spellStart"/>
+            <w:r>
+              <w:rPr>
+                <w:rFonts w:ascii="Courier New" w:eastAsia="Courier New" w:hAnsi="Courier New" w:cs="Courier New"/>
+                <w:sz w:val="19"/>
+                <w:szCs w:val="19"/>
+              </w:rPr>
+              <w:t>BookingID</w:t>
+            </w:r>
+            <w:proofErr w:type="spellEnd"/>
           </w:p>
           <w:p>
             <w:r>
@@ -9587,7 +12215,15 @@
         <w:spacing w:after="160" w:line="276" w:lineRule="auto"/>
       </w:pPr>
       <w:r>
-        <w:t>Validation is the process of checking that data entered into the system is sensible and complete before it is accepted and saved to the database. It cannot guarantee that data is correct, for example it cannot tell whether a customer has typed the right surname, but it can stop clearly invalid or missing data from getting in, which protects the integrity of the database. Several different types of validation are used across the Filmtopia system, and these are explained below before being applied to each input in turn.</w:t>
+        <w:t xml:space="preserve">Validation is the process of checking that data entered into the system is sensible and complete before it is accepted and saved to the database. It cannot guarantee that data is correct, for example it cannot tell whether a customer has typed the right surname, but it can stop clearly invalid or missing data from getting in, which protects the integrity of the database. Several different types of validation are used across the </w:t>
+      </w:r>
+      <w:proofErr w:type="spellStart"/>
+      <w:r>
+        <w:t>Filmtopia</w:t>
+      </w:r>
+      <w:proofErr w:type="spellEnd"/>
+      <w:r>
+        <w:t xml:space="preserve"> system, and these are explained below before being applied to each input in turn.</w:t>
       </w:r>
     </w:p>
     <w:p>
@@ -9595,7 +12231,15 @@
         <w:spacing w:after="160" w:line="276" w:lineRule="auto"/>
       </w:pPr>
       <w:r>
-        <w:t>A presence check makes sure a required field has not been left blank. A type check makes sure the data is of the right kind, for example that a number has been entered where a number is expected. A length check makes sure an entry is not longer than the field allows. A range check makes sure a number or date falls between sensible limits. A format check makes sure an entry follows a required pattern, such as a time being written as HH:MM. Finally a lookup check, sometimes called a referential check, makes sure that a chosen value actually exists in another table, for example that a screening is being created for a film that really exists. The tables below set out the validation applied to each input, grouped by the form it appears on.</w:t>
+        <w:t xml:space="preserve">A presence check makes sure a required field has not been left blank. A type check makes sure the data is of the right kind, for example that a number has been entered where a number is expected. A length check makes sure an entry is </w:t>
+      </w:r>
+      <w:proofErr w:type="spellStart"/>
+      <w:r>
+        <w:t>not longer</w:t>
+      </w:r>
+      <w:proofErr w:type="spellEnd"/>
+      <w:r>
+        <w:t xml:space="preserve"> than the field allows. A range check makes sure a number or date falls between sensible limits. A format check makes sure an entry follows a required pattern, such as a time being written as HH:MM. Finally a lookup check, sometimes called a referential check, makes sure that a chosen value actually exists in another table, for example that a screening is being created for a film that really exists. The tables below set out the validation applied to each input, grouped by the form it appears on.</w:t>
       </w:r>
     </w:p>
     <w:p>
@@ -10050,6 +12694,7 @@
             </w:tcMar>
           </w:tcPr>
           <w:p>
+            <w:proofErr w:type="spellStart"/>
             <w:r>
               <w:rPr>
                 <w:sz w:val="19"/>
@@ -10057,6 +12702,7 @@
               </w:rPr>
               <w:t>FilmTitle</w:t>
             </w:r>
+            <w:proofErr w:type="spellEnd"/>
           </w:p>
         </w:tc>
         <w:tc>
@@ -10132,6 +12778,7 @@
             </w:tcMar>
           </w:tcPr>
           <w:p>
+            <w:proofErr w:type="spellStart"/>
             <w:r>
               <w:rPr>
                 <w:sz w:val="19"/>
@@ -10139,6 +12786,7 @@
               </w:rPr>
               <w:t>FilmAgeRating</w:t>
             </w:r>
+            <w:proofErr w:type="spellEnd"/>
           </w:p>
         </w:tc>
         <w:tc>
@@ -10214,6 +12862,7 @@
             </w:tcMar>
           </w:tcPr>
           <w:p>
+            <w:proofErr w:type="spellStart"/>
             <w:r>
               <w:rPr>
                 <w:sz w:val="19"/>
@@ -10221,6 +12870,7 @@
               </w:rPr>
               <w:t>FilmDuration</w:t>
             </w:r>
+            <w:proofErr w:type="spellEnd"/>
           </w:p>
         </w:tc>
         <w:tc>
@@ -10296,6 +12946,7 @@
             </w:tcMar>
           </w:tcPr>
           <w:p>
+            <w:proofErr w:type="spellStart"/>
             <w:r>
               <w:rPr>
                 <w:sz w:val="19"/>
@@ -10303,6 +12954,7 @@
               </w:rPr>
               <w:t>FilmDescription</w:t>
             </w:r>
+            <w:proofErr w:type="spellEnd"/>
           </w:p>
         </w:tc>
         <w:tc>
@@ -10519,6 +13171,7 @@
             </w:tcMar>
           </w:tcPr>
           <w:p>
+            <w:proofErr w:type="spellStart"/>
             <w:r>
               <w:rPr>
                 <w:sz w:val="19"/>
@@ -10526,6 +13179,7 @@
               </w:rPr>
               <w:t>ScreenName</w:t>
             </w:r>
+            <w:proofErr w:type="spellEnd"/>
           </w:p>
         </w:tc>
         <w:tc>
@@ -10601,6 +13255,7 @@
             </w:tcMar>
           </w:tcPr>
           <w:p>
+            <w:proofErr w:type="spellStart"/>
             <w:r>
               <w:rPr>
                 <w:sz w:val="19"/>
@@ -10608,6 +13263,7 @@
               </w:rPr>
               <w:t>ScreenCapacity</w:t>
             </w:r>
+            <w:proofErr w:type="spellEnd"/>
           </w:p>
         </w:tc>
         <w:tc>
@@ -11009,6 +13665,7 @@
             </w:tcMar>
           </w:tcPr>
           <w:p>
+            <w:proofErr w:type="spellStart"/>
             <w:r>
               <w:rPr>
                 <w:sz w:val="19"/>
@@ -11016,6 +13673,7 @@
               </w:rPr>
               <w:t>ScreeningDate</w:t>
             </w:r>
+            <w:proofErr w:type="spellEnd"/>
           </w:p>
         </w:tc>
         <w:tc>
@@ -11091,6 +13749,7 @@
             </w:tcMar>
           </w:tcPr>
           <w:p>
+            <w:proofErr w:type="spellStart"/>
             <w:r>
               <w:rPr>
                 <w:sz w:val="19"/>
@@ -11098,6 +13757,7 @@
               </w:rPr>
               <w:t>ScreeningTime</w:t>
             </w:r>
+            <w:proofErr w:type="spellEnd"/>
           </w:p>
         </w:tc>
         <w:tc>
@@ -11173,6 +13833,7 @@
             </w:tcMar>
           </w:tcPr>
           <w:p>
+            <w:proofErr w:type="spellStart"/>
             <w:r>
               <w:rPr>
                 <w:sz w:val="19"/>
@@ -11180,6 +13841,7 @@
               </w:rPr>
               <w:t>TicketPrice</w:t>
             </w:r>
+            <w:proofErr w:type="spellEnd"/>
           </w:p>
         </w:tc>
         <w:tc>
@@ -11396,6 +14058,7 @@
             </w:tcMar>
           </w:tcPr>
           <w:p>
+            <w:proofErr w:type="spellStart"/>
             <w:r>
               <w:rPr>
                 <w:sz w:val="19"/>
@@ -11403,6 +14066,7 @@
               </w:rPr>
               <w:t>CustomerForename</w:t>
             </w:r>
+            <w:proofErr w:type="spellEnd"/>
           </w:p>
         </w:tc>
         <w:tc>
@@ -11478,6 +14142,7 @@
             </w:tcMar>
           </w:tcPr>
           <w:p>
+            <w:proofErr w:type="spellStart"/>
             <w:r>
               <w:rPr>
                 <w:sz w:val="19"/>
@@ -11485,6 +14150,7 @@
               </w:rPr>
               <w:t>CustomerSurname</w:t>
             </w:r>
+            <w:proofErr w:type="spellEnd"/>
           </w:p>
         </w:tc>
         <w:tc>
@@ -11560,6 +14226,7 @@
             </w:tcMar>
           </w:tcPr>
           <w:p>
+            <w:proofErr w:type="spellStart"/>
             <w:r>
               <w:rPr>
                 <w:sz w:val="19"/>
@@ -11567,6 +14234,7 @@
               </w:rPr>
               <w:t>CustomerEmail</w:t>
             </w:r>
+            <w:proofErr w:type="spellEnd"/>
           </w:p>
         </w:tc>
         <w:tc>
@@ -11642,6 +14310,7 @@
             </w:tcMar>
           </w:tcPr>
           <w:p>
+            <w:proofErr w:type="spellStart"/>
             <w:r>
               <w:rPr>
                 <w:sz w:val="19"/>
@@ -11649,6 +14318,7 @@
               </w:rPr>
               <w:t>CustomerPhone</w:t>
             </w:r>
+            <w:proofErr w:type="spellEnd"/>
           </w:p>
         </w:tc>
         <w:tc>

</xml_diff>

<commit_message>
added desc for obj 9 in design
</commit_message>
<xml_diff>
--- a/Design.docx
+++ b/Design.docx
@@ -2123,6 +2123,113 @@
           <w:rFonts w:ascii="Aptos" w:eastAsia="Aptos" w:hAnsi="Aptos" w:cs="Aptos"/>
         </w:rPr>
         <w:t xml:space="preserve"> table. In this way the cancelled seats go straight back to showing as available the next time that screening's seat map is opened.</w:t>
+      </w:r>
+    </w:p>
+    <w:p>
+      <w:pPr>
+        <w:pStyle w:val="Heading3"/>
+        <w:spacing w:before="260" w:after="120"/>
+      </w:pPr>
+      <w:r>
+        <w:rPr>
+          <w:rFonts w:ascii="Aptos Display" w:eastAsia="Aptos Display" w:hAnsi="Aptos Display" w:cs="Aptos Display"/>
+          <w:b/>
+          <w:bCs/>
+          <w:color w:val="000000"/>
+        </w:rPr>
+        <w:t>Viewing the Booking Register (Objective 9)</w:t>
+      </w:r>
+    </w:p>
+    <w:p>
+      <w:pPr>
+        <w:spacing w:after="160" w:line="276" w:lineRule="auto"/>
+      </w:pPr>
+      <w:r>
+        <w:rPr>
+          <w:rFonts w:ascii="Aptos" w:eastAsia="Aptos" w:hAnsi="Aptos" w:cs="Aptos"/>
+        </w:rPr>
+        <w:t xml:space="preserve">The last job handled by the </w:t>
+      </w:r>
+      <w:proofErr w:type="spellStart"/>
+      <w:r>
+        <w:rPr>
+          <w:rFonts w:ascii="Aptos" w:eastAsia="Aptos" w:hAnsi="Aptos" w:cs="Aptos"/>
+        </w:rPr>
+        <w:t>frmBookingSearch</w:t>
+      </w:r>
+      <w:proofErr w:type="spellEnd"/>
+      <w:r>
+        <w:rPr>
+          <w:rFonts w:ascii="Aptos" w:eastAsia="Aptos" w:hAnsi="Aptos" w:cs="Aptos"/>
+        </w:rPr>
+        <w:t xml:space="preserve"> form is letting the manager or staff see a register of every booking for a particular screening, so that they can see who is coming and how full the screening is. I will refer back to that form for the overall layout and just describe the register part here. This part of the form has a combo box named </w:t>
+      </w:r>
+      <w:proofErr w:type="spellStart"/>
+      <w:r>
+        <w:rPr>
+          <w:rFonts w:ascii="Aptos" w:eastAsia="Aptos" w:hAnsi="Aptos" w:cs="Aptos"/>
+        </w:rPr>
+        <w:t>cboRegisterScreening</w:t>
+      </w:r>
+      <w:proofErr w:type="spellEnd"/>
+      <w:r>
+        <w:rPr>
+          <w:rFonts w:ascii="Aptos" w:eastAsia="Aptos" w:hAnsi="Aptos" w:cs="Aptos"/>
+        </w:rPr>
+        <w:t xml:space="preserve"> where the user picks the screening they are interested in, a Load Register button named </w:t>
+      </w:r>
+      <w:proofErr w:type="spellStart"/>
+      <w:r>
+        <w:rPr>
+          <w:rFonts w:ascii="Aptos" w:eastAsia="Aptos" w:hAnsi="Aptos" w:cs="Aptos"/>
+        </w:rPr>
+        <w:t>btnLoadRegister</w:t>
+      </w:r>
+      <w:proofErr w:type="spellEnd"/>
+      <w:r>
+        <w:rPr>
+          <w:rFonts w:ascii="Aptos" w:eastAsia="Aptos" w:hAnsi="Aptos" w:cs="Aptos"/>
+        </w:rPr>
+        <w:t xml:space="preserve">, a grid named </w:t>
+      </w:r>
+      <w:proofErr w:type="spellStart"/>
+      <w:r>
+        <w:rPr>
+          <w:rFonts w:ascii="Aptos" w:eastAsia="Aptos" w:hAnsi="Aptos" w:cs="Aptos"/>
+        </w:rPr>
+        <w:t>dgvRegister</w:t>
+      </w:r>
+      <w:proofErr w:type="spellEnd"/>
+      <w:r>
+        <w:rPr>
+          <w:rFonts w:ascii="Aptos" w:eastAsia="Aptos" w:hAnsi="Aptos" w:cs="Aptos"/>
+        </w:rPr>
+        <w:t xml:space="preserve"> where the register appears, and an Export CSV button named </w:t>
+      </w:r>
+      <w:proofErr w:type="spellStart"/>
+      <w:r>
+        <w:rPr>
+          <w:rFonts w:ascii="Aptos" w:eastAsia="Aptos" w:hAnsi="Aptos" w:cs="Aptos"/>
+        </w:rPr>
+        <w:t>btnExportRegister</w:t>
+      </w:r>
+      <w:proofErr w:type="spellEnd"/>
+      <w:r>
+        <w:rPr>
+          <w:rFonts w:ascii="Aptos" w:eastAsia="Aptos" w:hAnsi="Aptos" w:cs="Aptos"/>
+        </w:rPr>
+        <w:t>.</w:t>
+      </w:r>
+    </w:p>
+    <w:p>
+      <w:pPr>
+        <w:spacing w:after="160" w:line="276" w:lineRule="auto"/>
+      </w:pPr>
+      <w:r>
+        <w:rPr>
+          <w:rFonts w:ascii="Aptos" w:eastAsia="Aptos" w:hAnsi="Aptos" w:cs="Aptos"/>
+        </w:rPr>
+        <w:t>The way it is used is that the user picks a screening and presses Load Register, and the grid then fills with every booking for that screening, showing the customer names, the seats they have booked and the number of tickets. The input is the chosen screening, and the output is the full register shown in the grid. There is also the option to press Export CSV, which takes whatever is currently shown in the register and writes it out to a comma separated values file that can be opened in a spreadsheet, which is useful if the manager wants to print it or keep a copy. The process behind loading the register is a query that pulls back all of the bookings for the chosen screening, and the export process simply writes those same rows out to a file line by line.</w:t>
       </w:r>
     </w:p>
     <w:p>

</xml_diff>

<commit_message>
added desc for obj 17 in design
</commit_message>
<xml_diff>
--- a/Design.docx
+++ b/Design.docx
@@ -843,6 +843,66 @@
         </w:rPr>
         <w:lastRenderedPageBreak/>
         <w:t>The manager uses it by choosing a from date and a to date and pressing Run Report, at which point the grid fills with the sales for each film over that period and the three labels update to show the total ticket revenue, the total food revenue and the grand total of the two added together. The inputs are the two dates, and the outputs are the breakdown by film in the grid together with the three revenue totals. The process behind the button is a query that adds up the ticket sales and the food sales that fall within the chosen dates and groups them by film. I chose to use date pickers rather than text boxes for the dates so that the manager cannot enter something that is not a real date, and I chose to show both a breakdown by film and the overall totals, this is because the manager will want to see the headline figure at a glance but may also want to know which films in particular are selling well.</w:t>
+      </w:r>
+    </w:p>
+    <w:p>
+      <w:pPr>
+        <w:pStyle w:val="Heading3"/>
+        <w:spacing w:before="260" w:after="120"/>
+      </w:pPr>
+      <w:r>
+        <w:rPr>
+          <w:rFonts w:ascii="Aptos Display" w:eastAsia="Aptos Display" w:hAnsi="Aptos Display" w:cs="Aptos Display"/>
+          <w:b/>
+          <w:bCs/>
+          <w:color w:val="000000"/>
+        </w:rPr>
+        <w:t>Maintaining an Audit Log (Objective 17)</w:t>
+      </w:r>
+    </w:p>
+    <w:p>
+      <w:pPr>
+        <w:spacing w:after="160" w:line="276" w:lineRule="auto"/>
+      </w:pPr>
+      <w:r>
+        <w:rPr>
+          <w:rFonts w:ascii="Aptos" w:eastAsia="Aptos" w:hAnsi="Aptos" w:cs="Aptos"/>
+        </w:rPr>
+        <w:t>The final objective in this section is the audit log, which quietly records the important actions that staff and managers carry out in the system, such as creating a booking, cancelling a booking or adding a new film or screening. The point of it is that if something goes wrong, for example a billing mistake, the manager can look back and see what happened and who did it, rather than the mistake simply disappearing. Because it is a management tool it is only available to a manager, and it is reached from the Logs button on the main menu. It is handled by the form named frmLogs, which is the simplest form in the whole system as it only needs a grid named dgvLogs to display the log entries and a Refresh button named btnRefresh to reload them.</w:t>
+      </w:r>
+    </w:p>
+    <w:p>
+      <w:pPr>
+        <w:pBdr>
+          <w:top w:val="single" w:sz="6" w:space="6" w:color="A02B93"/>
+          <w:left w:val="single" w:sz="6" w:space="6" w:color="A02B93"/>
+          <w:bottom w:val="single" w:sz="6" w:space="6" w:color="A02B93"/>
+          <w:right w:val="single" w:sz="6" w:space="6" w:color="A02B93"/>
+        </w:pBdr>
+        <w:shd w:val="clear" w:color="auto" w:fill="F7E9F3"/>
+        <w:spacing w:before="120" w:after="200"/>
+      </w:pPr>
+      <w:r>
+        <w:rPr>
+          <w:rFonts w:ascii="Aptos" w:eastAsia="Aptos" w:hAnsi="Aptos" w:cs="Aptos"/>
+          <w:b/>
+          <w:bCs/>
+          <w:color w:val="A02B93"/>
+          <w:sz w:val="22"/>
+          <w:szCs w:val="22"/>
+        </w:rPr>
+        <w:t>Logs Form (frmLogs)</w:t>
+      </w:r>
+    </w:p>
+    <w:p>
+      <w:pPr>
+        <w:spacing w:after="160" w:line="276" w:lineRule="auto"/>
+      </w:pPr>
+      <w:r>
+        <w:rPr>
+          <w:rFonts w:ascii="Aptos" w:eastAsia="Aptos" w:hAnsi="Aptos" w:cs="Aptos"/>
+        </w:rPr>
+        <w:t>There are effectively no inputs to this form beyond pressing Refresh, because its whole job is to display information rather than collect it. The output is the list of logged actions shown in the grid, each entry showing when it happened, who did it and what they did. The process behind it is simply a query that reads the entries back from the tblLogs table in order, with the most recent shown first. I deliberately made this grid read-only so that the log cannot be edited from within the program, this is because a log that could be changed would be worthless, the entire value of an audit log comes from the fact that nobody can quietly alter it after the event.</w:t>
       </w:r>
     </w:p>
     <w:p>
@@ -9721,6 +9781,7 @@
           <w:bCs/>
           <w:color w:val="000000" w:themeColor="text1"/>
         </w:rPr>
+        <w:lastRenderedPageBreak/>
         <w:t>Validation</w:t>
       </w:r>
     </w:p>

</xml_diff>

<commit_message>
added design for frmLogin in design
</commit_message>
<xml_diff>
--- a/Design.docx
+++ b/Design.docx
@@ -294,6 +294,753 @@
           <w:rFonts w:ascii="Aptos" w:eastAsia="Aptos" w:hAnsi="Aptos" w:cs="Aptos"/>
         </w:rPr>
         <w:t xml:space="preserve"> which closes the program if the user changes their mind. A small version label sits at the very bottom of the form.</w:t>
+      </w:r>
+    </w:p>
+    <w:p>
+      <w:pPr>
+        <w:pBdr>
+          <w:top w:val="single" w:sz="6" w:space="6" w:color="A02B93"/>
+          <w:left w:val="single" w:sz="6" w:space="6" w:color="A02B93"/>
+          <w:bottom w:val="single" w:sz="6" w:space="6" w:color="A02B93"/>
+          <w:right w:val="single" w:sz="6" w:space="0" w:color="A02B93"/>
+        </w:pBdr>
+        <w:shd w:val="clear" w:color="auto" w:fill="F7E9F3"/>
+        <w:spacing w:before="120" w:after="200"/>
+        <w:rPr>
+          <w:rFonts w:ascii="Aptos" w:eastAsia="Aptos" w:hAnsi="Aptos" w:cs="Aptos"/>
+          <w:b/>
+          <w:bCs/>
+          <w:color w:val="A02B93"/>
+          <w:sz w:val="22"/>
+          <w:szCs w:val="22"/>
+        </w:rPr>
+      </w:pPr>
+      <w:r>
+        <w:rPr>
+          <w:rFonts w:ascii="Aptos" w:eastAsia="Aptos" w:hAnsi="Aptos" w:cs="Aptos"/>
+          <w:b/>
+          <w:bCs/>
+          <w:color w:val="A02B93"/>
+          <w:sz w:val="22"/>
+          <w:szCs w:val="22"/>
+        </w:rPr>
+        <w:t>Login Form (</w:t>
+      </w:r>
+      <w:proofErr w:type="spellStart"/>
+      <w:r>
+        <w:rPr>
+          <w:rFonts w:ascii="Aptos" w:eastAsia="Aptos" w:hAnsi="Aptos" w:cs="Aptos"/>
+          <w:b/>
+          <w:bCs/>
+          <w:color w:val="A02B93"/>
+          <w:sz w:val="22"/>
+          <w:szCs w:val="22"/>
+        </w:rPr>
+        <w:t>frmLogin</w:t>
+      </w:r>
+      <w:proofErr w:type="spellEnd"/>
+      <w:r>
+        <w:rPr>
+          <w:rFonts w:ascii="Aptos" w:eastAsia="Aptos" w:hAnsi="Aptos" w:cs="Aptos"/>
+          <w:b/>
+          <w:bCs/>
+          <w:color w:val="A02B93"/>
+          <w:sz w:val="22"/>
+          <w:szCs w:val="22"/>
+        </w:rPr>
+        <w:t>)</w:t>
+      </w:r>
+    </w:p>
+    <w:p>
+      <w:pPr>
+        <w:pBdr>
+          <w:top w:val="single" w:sz="6" w:space="6" w:color="A02B93"/>
+          <w:left w:val="single" w:sz="6" w:space="6" w:color="A02B93"/>
+          <w:bottom w:val="single" w:sz="6" w:space="6" w:color="A02B93"/>
+          <w:right w:val="single" w:sz="6" w:space="0" w:color="A02B93"/>
+        </w:pBdr>
+        <w:shd w:val="clear" w:color="auto" w:fill="F7E9F3"/>
+        <w:spacing w:before="120" w:after="200"/>
+      </w:pPr>
+      <w:r>
+        <w:rPr>
+          <w:noProof/>
+        </w:rPr>
+        <mc:AlternateContent>
+          <mc:Choice Requires="wpc">
+            <w:drawing>
+              <wp:inline distT="0" distB="0" distL="0" distR="0" wp14:anchorId="25BE6B75" wp14:editId="3F5A0022">
+                <wp:extent cx="5486400" cy="3676650"/>
+                <wp:effectExtent l="0" t="0" r="19050" b="0"/>
+                <wp:docPr id="233146271" name="Canvas 3"/>
+                <wp:cNvGraphicFramePr>
+                  <a:graphicFrameLocks xmlns:a="http://schemas.openxmlformats.org/drawingml/2006/main" noChangeAspect="1"/>
+                </wp:cNvGraphicFramePr>
+                <a:graphic xmlns:a="http://schemas.openxmlformats.org/drawingml/2006/main">
+                  <a:graphicData uri="http://schemas.microsoft.com/office/word/2010/wordprocessingCanvas">
+                    <wpc:wpc>
+                      <wpc:bg>
+                        <a:solidFill>
+                          <a:prstClr val="white"/>
+                        </a:solidFill>
+                      </wpc:bg>
+                      <wpc:whole/>
+                      <wps:wsp>
+                        <wps:cNvPr id="865836450" name="Rectangle 865836450"/>
+                        <wps:cNvSpPr/>
+                        <wps:spPr>
+                          <a:xfrm>
+                            <a:off x="1" y="0"/>
+                            <a:ext cx="5486398" cy="800100"/>
+                          </a:xfrm>
+                          <a:prstGeom prst="rect">
+                            <a:avLst/>
+                          </a:prstGeom>
+                        </wps:spPr>
+                        <wps:style>
+                          <a:lnRef idx="3">
+                            <a:schemeClr val="lt1"/>
+                          </a:lnRef>
+                          <a:fillRef idx="1">
+                            <a:schemeClr val="accent5"/>
+                          </a:fillRef>
+                          <a:effectRef idx="1">
+                            <a:schemeClr val="accent5"/>
+                          </a:effectRef>
+                          <a:fontRef idx="minor">
+                            <a:schemeClr val="lt1"/>
+                          </a:fontRef>
+                        </wps:style>
+                        <wps:txbx>
+                          <w:txbxContent>
+                            <w:p>
+                              <w:pPr>
+                                <w:rPr>
+                                  <w:b/>
+                                  <w:bCs/>
+                                  <w:sz w:val="72"/>
+                                  <w:szCs w:val="72"/>
+                                </w:rPr>
+                              </w:pPr>
+                              <w:proofErr w:type="spellStart"/>
+                              <w:r>
+                                <w:rPr>
+                                  <w:b/>
+                                  <w:bCs/>
+                                  <w:sz w:val="72"/>
+                                  <w:szCs w:val="72"/>
+                                </w:rPr>
+                                <w:t>Filmtopia</w:t>
+                              </w:r>
+                              <w:proofErr w:type="spellEnd"/>
+                            </w:p>
+                          </w:txbxContent>
+                        </wps:txbx>
+                        <wps:bodyPr rot="0" spcFirstLastPara="0" vertOverflow="overflow" horzOverflow="overflow" vert="horz" wrap="square" lIns="91440" tIns="45720" rIns="91440" bIns="45720" numCol="1" spcCol="0" rtlCol="0" fromWordArt="0" anchor="t" anchorCtr="0" forceAA="0" compatLnSpc="1">
+                          <a:prstTxWarp prst="textNoShape">
+                            <a:avLst/>
+                          </a:prstTxWarp>
+                          <a:noAutofit/>
+                        </wps:bodyPr>
+                      </wps:wsp>
+                      <wps:wsp>
+                        <wps:cNvPr id="897422575" name="Rectangle 897422575"/>
+                        <wps:cNvSpPr/>
+                        <wps:spPr>
+                          <a:xfrm>
+                            <a:off x="228600" y="1276875"/>
+                            <a:ext cx="4892040" cy="254745"/>
+                          </a:xfrm>
+                          <a:prstGeom prst="rect">
+                            <a:avLst/>
+                          </a:prstGeom>
+                          <a:ln w="3175"/>
+                        </wps:spPr>
+                        <wps:style>
+                          <a:lnRef idx="2">
+                            <a:schemeClr val="dk1"/>
+                          </a:lnRef>
+                          <a:fillRef idx="1">
+                            <a:schemeClr val="lt1"/>
+                          </a:fillRef>
+                          <a:effectRef idx="0">
+                            <a:schemeClr val="dk1"/>
+                          </a:effectRef>
+                          <a:fontRef idx="minor">
+                            <a:schemeClr val="dk1"/>
+                          </a:fontRef>
+                        </wps:style>
+                        <wps:bodyPr rot="0" spcFirstLastPara="0" vertOverflow="overflow" horzOverflow="overflow" vert="horz" wrap="square" lIns="91440" tIns="45720" rIns="91440" bIns="45720" numCol="1" spcCol="0" rtlCol="0" fromWordArt="0" anchor="ctr" anchorCtr="0" forceAA="0" compatLnSpc="1">
+                          <a:prstTxWarp prst="textNoShape">
+                            <a:avLst/>
+                          </a:prstTxWarp>
+                          <a:noAutofit/>
+                        </wps:bodyPr>
+                      </wps:wsp>
+                      <wps:wsp>
+                        <wps:cNvPr id="374235855" name="Rectangle 374235855"/>
+                        <wps:cNvSpPr/>
+                        <wps:spPr>
+                          <a:xfrm>
+                            <a:off x="228600" y="1963080"/>
+                            <a:ext cx="4892040" cy="254635"/>
+                          </a:xfrm>
+                          <a:prstGeom prst="rect">
+                            <a:avLst/>
+                          </a:prstGeom>
+                          <a:ln w="3175"/>
+                        </wps:spPr>
+                        <wps:style>
+                          <a:lnRef idx="2">
+                            <a:schemeClr val="dk1"/>
+                          </a:lnRef>
+                          <a:fillRef idx="1">
+                            <a:schemeClr val="lt1"/>
+                          </a:fillRef>
+                          <a:effectRef idx="0">
+                            <a:schemeClr val="dk1"/>
+                          </a:effectRef>
+                          <a:fontRef idx="minor">
+                            <a:schemeClr val="dk1"/>
+                          </a:fontRef>
+                        </wps:style>
+                        <wps:bodyPr rot="0" spcFirstLastPara="0" vert="horz" wrap="square" lIns="91440" tIns="45720" rIns="91440" bIns="45720" numCol="1" spcCol="0" rtlCol="0" fromWordArt="0" anchor="ctr" anchorCtr="0" forceAA="0" compatLnSpc="1">
+                          <a:prstTxWarp prst="textNoShape">
+                            <a:avLst/>
+                          </a:prstTxWarp>
+                          <a:noAutofit/>
+                        </wps:bodyPr>
+                      </wps:wsp>
+                      <wps:wsp>
+                        <wps:cNvPr id="1057171587" name="Text Box 1057171587"/>
+                        <wps:cNvSpPr txBox="1"/>
+                        <wps:spPr>
+                          <a:xfrm>
+                            <a:off x="152400" y="990600"/>
+                            <a:ext cx="758825" cy="266700"/>
+                          </a:xfrm>
+                          <a:prstGeom prst="rect">
+                            <a:avLst/>
+                          </a:prstGeom>
+                          <a:solidFill>
+                            <a:schemeClr val="lt1"/>
+                          </a:solidFill>
+                          <a:ln w="6350">
+                            <a:solidFill>
+                              <a:schemeClr val="bg1"/>
+                            </a:solidFill>
+                          </a:ln>
+                        </wps:spPr>
+                        <wps:txbx>
+                          <w:txbxContent>
+                            <w:p>
+                              <w:pPr>
+                                <w:rPr>
+                                  <w:sz w:val="20"/>
+                                  <w:szCs w:val="20"/>
+                                </w:rPr>
+                              </w:pPr>
+                              <w:r>
+                                <w:rPr>
+                                  <w:sz w:val="20"/>
+                                  <w:szCs w:val="20"/>
+                                </w:rPr>
+                                <w:t>Username</w:t>
+                              </w:r>
+                            </w:p>
+                          </w:txbxContent>
+                        </wps:txbx>
+                        <wps:bodyPr rot="0" spcFirstLastPara="0" vertOverflow="overflow" horzOverflow="overflow" vert="horz" wrap="none" lIns="91440" tIns="45720" rIns="91440" bIns="45720" numCol="1" spcCol="0" rtlCol="0" fromWordArt="0" anchor="t" anchorCtr="0" forceAA="0" compatLnSpc="1">
+                          <a:prstTxWarp prst="textNoShape">
+                            <a:avLst/>
+                          </a:prstTxWarp>
+                          <a:noAutofit/>
+                        </wps:bodyPr>
+                      </wps:wsp>
+                      <wps:wsp>
+                        <wps:cNvPr id="1334862160" name="Text Box 1"/>
+                        <wps:cNvSpPr txBox="1"/>
+                        <wps:spPr>
+                          <a:xfrm>
+                            <a:off x="152400" y="1673520"/>
+                            <a:ext cx="718185" cy="266700"/>
+                          </a:xfrm>
+                          <a:prstGeom prst="rect">
+                            <a:avLst/>
+                          </a:prstGeom>
+                          <a:solidFill>
+                            <a:schemeClr val="lt1"/>
+                          </a:solidFill>
+                          <a:ln w="6350">
+                            <a:solidFill>
+                              <a:schemeClr val="bg1"/>
+                            </a:solidFill>
+                          </a:ln>
+                        </wps:spPr>
+                        <wps:txbx>
+                          <w:txbxContent>
+                            <w:p>
+                              <w:pPr>
+                                <w:rPr>
+                                  <w:rFonts w:ascii="Aptos" w:eastAsia="Aptos" w:hAnsi="Aptos"/>
+                                  <w:sz w:val="20"/>
+                                  <w:szCs w:val="20"/>
+                                  <w14:ligatures w14:val="none"/>
+                                </w:rPr>
+                              </w:pPr>
+                              <w:r>
+                                <w:rPr>
+                                  <w:rFonts w:ascii="Aptos" w:eastAsia="Aptos" w:hAnsi="Aptos"/>
+                                  <w:sz w:val="20"/>
+                                  <w:szCs w:val="20"/>
+                                </w:rPr>
+                                <w:t>Password</w:t>
+                              </w:r>
+                            </w:p>
+                          </w:txbxContent>
+                        </wps:txbx>
+                        <wps:bodyPr rot="0" spcFirstLastPara="0" vert="horz" wrap="none" lIns="91440" tIns="45720" rIns="91440" bIns="45720" numCol="1" spcCol="0" rtlCol="0" fromWordArt="0" anchor="t" anchorCtr="0" forceAA="0" compatLnSpc="1">
+                          <a:prstTxWarp prst="textNoShape">
+                            <a:avLst/>
+                          </a:prstTxWarp>
+                          <a:noAutofit/>
+                        </wps:bodyPr>
+                      </wps:wsp>
+                      <wps:wsp>
+                        <wps:cNvPr id="1422544659" name="Rectangle 1422544659"/>
+                        <wps:cNvSpPr/>
+                        <wps:spPr>
+                          <a:xfrm>
+                            <a:off x="203200" y="2500194"/>
+                            <a:ext cx="4933950" cy="446206"/>
+                          </a:xfrm>
+                          <a:prstGeom prst="rect">
+                            <a:avLst/>
+                          </a:prstGeom>
+                        </wps:spPr>
+                        <wps:style>
+                          <a:lnRef idx="3">
+                            <a:schemeClr val="lt1"/>
+                          </a:lnRef>
+                          <a:fillRef idx="1">
+                            <a:schemeClr val="accent5"/>
+                          </a:fillRef>
+                          <a:effectRef idx="1">
+                            <a:schemeClr val="accent5"/>
+                          </a:effectRef>
+                          <a:fontRef idx="minor">
+                            <a:schemeClr val="lt1"/>
+                          </a:fontRef>
+                        </wps:style>
+                        <wps:txbx>
+                          <w:txbxContent>
+                            <w:p>
+                              <w:pPr>
+                                <w:ind w:left="2160" w:firstLine="720"/>
+                                <w:rPr>
+                                  <w:rFonts w:eastAsia="Aptos"/>
+                                  <w:b/>
+                                  <w:bCs/>
+                                  <w:sz w:val="48"/>
+                                  <w:szCs w:val="48"/>
+                                  <w14:ligatures w14:val="none"/>
+                                </w:rPr>
+                              </w:pPr>
+                              <w:r>
+                                <w:rPr>
+                                  <w:rFonts w:eastAsia="Aptos"/>
+                                  <w:b/>
+                                  <w:bCs/>
+                                  <w:sz w:val="48"/>
+                                  <w:szCs w:val="48"/>
+                                </w:rPr>
+                                <w:t>Log In</w:t>
+                              </w:r>
+                            </w:p>
+                            <w:p/>
+                          </w:txbxContent>
+                        </wps:txbx>
+                        <wps:bodyPr rot="0" spcFirstLastPara="0" vert="horz" wrap="square" lIns="91440" tIns="45720" rIns="91440" bIns="45720" numCol="1" spcCol="0" rtlCol="0" fromWordArt="0" anchor="ctr" anchorCtr="0" forceAA="0" compatLnSpc="1">
+                          <a:prstTxWarp prst="textNoShape">
+                            <a:avLst/>
+                          </a:prstTxWarp>
+                          <a:noAutofit/>
+                        </wps:bodyPr>
+                      </wps:wsp>
+                      <wps:wsp>
+                        <wps:cNvPr id="351570122" name="Rectangle 351570122"/>
+                        <wps:cNvSpPr/>
+                        <wps:spPr>
+                          <a:xfrm>
+                            <a:off x="203200" y="3048000"/>
+                            <a:ext cx="4933950" cy="445770"/>
+                          </a:xfrm>
+                          <a:prstGeom prst="rect">
+                            <a:avLst/>
+                          </a:prstGeom>
+                        </wps:spPr>
+                        <wps:style>
+                          <a:lnRef idx="2">
+                            <a:schemeClr val="dk1"/>
+                          </a:lnRef>
+                          <a:fillRef idx="1">
+                            <a:schemeClr val="lt1"/>
+                          </a:fillRef>
+                          <a:effectRef idx="0">
+                            <a:schemeClr val="dk1"/>
+                          </a:effectRef>
+                          <a:fontRef idx="minor">
+                            <a:schemeClr val="dk1"/>
+                          </a:fontRef>
+                        </wps:style>
+                        <wps:txbx>
+                          <w:txbxContent>
+                            <w:p>
+                              <w:pPr>
+                                <w:ind w:left="2160" w:firstLine="720"/>
+                                <w:rPr>
+                                  <w:rFonts w:eastAsia="Aptos"/>
+                                  <w:color w:val="BFBFBF" w:themeColor="background1" w:themeShade="BF"/>
+                                  <w:sz w:val="44"/>
+                                  <w:szCs w:val="44"/>
+                                  <w14:ligatures w14:val="none"/>
+                                </w:rPr>
+                              </w:pPr>
+                              <w:r>
+                                <w:rPr>
+                                  <w:rFonts w:eastAsia="Aptos"/>
+                                  <w:color w:val="BFBFBF" w:themeColor="background1" w:themeShade="BF"/>
+                                  <w:sz w:val="44"/>
+                                  <w:szCs w:val="44"/>
+                                </w:rPr>
+                                <w:t>Cancel</w:t>
+                              </w:r>
+                            </w:p>
+                            <w:p>
+                              <w:pPr>
+                                <w:rPr>
+                                  <w:rFonts w:eastAsia="Aptos"/>
+                                </w:rPr>
+                              </w:pPr>
+                              <w:r>
+                                <w:rPr>
+                                  <w:rFonts w:eastAsia="Aptos"/>
+                                </w:rPr>
+                                <w:t> </w:t>
+                              </w:r>
+                            </w:p>
+                          </w:txbxContent>
+                        </wps:txbx>
+                        <wps:bodyPr rot="0" spcFirstLastPara="0" vert="horz" wrap="square" lIns="91440" tIns="45720" rIns="91440" bIns="45720" numCol="1" spcCol="0" rtlCol="0" fromWordArt="0" anchor="ctr" anchorCtr="0" forceAA="0" compatLnSpc="1">
+                          <a:prstTxWarp prst="textNoShape">
+                            <a:avLst/>
+                          </a:prstTxWarp>
+                          <a:noAutofit/>
+                        </wps:bodyPr>
+                      </wps:wsp>
+                    </wpc:wpc>
+                  </a:graphicData>
+                </a:graphic>
+              </wp:inline>
+            </w:drawing>
+          </mc:Choice>
+          <mc:Fallback>
+            <w:pict>
+              <v:group w14:anchorId="25BE6B75" id="Canvas 3" o:spid="_x0000_s1026" editas="canvas" style="width:6in;height:289.5pt;mso-position-horizontal-relative:char;mso-position-vertical-relative:line" coordsize="54864,36766" o:gfxdata="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">
+                <v:shapetype id="_x0000_t75" coordsize="21600,21600" o:spt="75" o:preferrelative="t" path="m@4@5l@4@11@9@11@9@5xe" filled="f" stroked="f">
+                  <v:stroke joinstyle="miter"/>
+                  <v:formulas>
+                    <v:f eqn="if lineDrawn pixelLineWidth 0"/>
+                    <v:f eqn="sum @0 1 0"/>
+                    <v:f eqn="sum 0 0 @1"/>
+                    <v:f eqn="prod @2 1 2"/>
+                    <v:f eqn="prod @3 21600 pixelWidth"/>
+                    <v:f eqn="prod @3 21600 pixelHeight"/>
+                    <v:f eqn="sum @0 0 1"/>
+                    <v:f eqn="prod @6 1 2"/>
+                    <v:f eqn="prod @7 21600 pixelWidth"/>
+                    <v:f eqn="sum @8 21600 0"/>
+                    <v:f eqn="prod @7 21600 pixelHeight"/>
+                    <v:f eqn="sum @10 21600 0"/>
+                  </v:formulas>
+                  <v:path o:extrusionok="f" gradientshapeok="t" o:connecttype="rect"/>
+                  <o:lock v:ext="edit" aspectratio="t"/>
+                </v:shapetype>
+                <v:shape id="_x0000_s1027" type="#_x0000_t75" style="position:absolute;width:54864;height:36766;visibility:visible;mso-wrap-style:square" filled="t">
+                  <v:fill o:detectmouseclick="t"/>
+                  <v:path o:connecttype="none"/>
+                </v:shape>
+                <v:rect id="Rectangle 865836450" o:spid="_x0000_s1028" style="position:absolute;width:54863;height:8001;visibility:visible;mso-wrap-style:square;v-text-anchor:top" o:gfxdata="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" fillcolor="#a02b93 [3208]" strokecolor="white [3201]" strokeweight="1.5pt">
+                  <v:textbox>
+                    <w:txbxContent>
+                      <w:p>
+                        <w:pPr>
+                          <w:rPr>
+                            <w:b/>
+                            <w:bCs/>
+                            <w:sz w:val="72"/>
+                            <w:szCs w:val="72"/>
+                          </w:rPr>
+                        </w:pPr>
+                        <w:proofErr w:type="spellStart"/>
+                        <w:r>
+                          <w:rPr>
+                            <w:b/>
+                            <w:bCs/>
+                            <w:sz w:val="72"/>
+                            <w:szCs w:val="72"/>
+                          </w:rPr>
+                          <w:t>Filmtopia</w:t>
+                        </w:r>
+                        <w:proofErr w:type="spellEnd"/>
+                      </w:p>
+                    </w:txbxContent>
+                  </v:textbox>
+                </v:rect>
+                <v:rect id="Rectangle 897422575" o:spid="_x0000_s1029" style="position:absolute;left:2286;top:12768;width:48920;height:2548;visibility:visible;mso-wrap-style:square;v-text-anchor:middle" o:gfxdata="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" fillcolor="white [3201]" strokecolor="black [3200]" strokeweight=".25pt"/>
+                <v:rect id="Rectangle 374235855" o:spid="_x0000_s1030" style="position:absolute;left:2286;top:19630;width:48920;height:2547;visibility:visible;mso-wrap-style:square;v-text-anchor:middle" o:gfxdata="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" fillcolor="white [3201]" strokecolor="black [3200]" strokeweight=".25pt"/>
+                <v:shapetype id="_x0000_t202" coordsize="21600,21600" o:spt="202" path="m,l,21600r21600,l21600,xe">
+                  <v:stroke joinstyle="miter"/>
+                  <v:path gradientshapeok="t" o:connecttype="rect"/>
+                </v:shapetype>
+                <v:shape id="Text Box 1057171587" o:spid="_x0000_s1031" type="#_x0000_t202" style="position:absolute;left:1524;top:9906;width:7588;height:2667;visibility:visible;mso-wrap-style:none;v-text-anchor:top" o:gfxdata="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" fillcolor="white [3201]" strokecolor="white [3212]" strokeweight=".5pt">
+                  <v:textbox>
+                    <w:txbxContent>
+                      <w:p>
+                        <w:pPr>
+                          <w:rPr>
+                            <w:sz w:val="20"/>
+                            <w:szCs w:val="20"/>
+                          </w:rPr>
+                        </w:pPr>
+                        <w:r>
+                          <w:rPr>
+                            <w:sz w:val="20"/>
+                            <w:szCs w:val="20"/>
+                          </w:rPr>
+                          <w:t>Username</w:t>
+                        </w:r>
+                      </w:p>
+                    </w:txbxContent>
+                  </v:textbox>
+                </v:shape>
+                <v:shape id="Text Box 1" o:spid="_x0000_s1032" type="#_x0000_t202" style="position:absolute;left:1524;top:16735;width:7181;height:2667;visibility:visible;mso-wrap-style:none;v-text-anchor:top" o:gfxdata="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" fillcolor="white [3201]" strokecolor="white [3212]" strokeweight=".5pt">
+                  <v:textbox>
+                    <w:txbxContent>
+                      <w:p>
+                        <w:pPr>
+                          <w:rPr>
+                            <w:rFonts w:ascii="Aptos" w:eastAsia="Aptos" w:hAnsi="Aptos"/>
+                            <w:sz w:val="20"/>
+                            <w:szCs w:val="20"/>
+                            <w14:ligatures w14:val="none"/>
+                          </w:rPr>
+                        </w:pPr>
+                        <w:r>
+                          <w:rPr>
+                            <w:rFonts w:ascii="Aptos" w:eastAsia="Aptos" w:hAnsi="Aptos"/>
+                            <w:sz w:val="20"/>
+                            <w:szCs w:val="20"/>
+                          </w:rPr>
+                          <w:t>Password</w:t>
+                        </w:r>
+                      </w:p>
+                    </w:txbxContent>
+                  </v:textbox>
+                </v:shape>
+                <v:rect id="Rectangle 1422544659" o:spid="_x0000_s1033" style="position:absolute;left:2032;top:25001;width:49339;height:4463;visibility:visible;mso-wrap-style:square;v-text-anchor:middle" o:gfxdata="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" fillcolor="#a02b93 [3208]" strokecolor="white [3201]" strokeweight="1.5pt">
+                  <v:textbox>
+                    <w:txbxContent>
+                      <w:p>
+                        <w:pPr>
+                          <w:ind w:left="2160" w:firstLine="720"/>
+                          <w:rPr>
+                            <w:rFonts w:eastAsia="Aptos"/>
+                            <w:b/>
+                            <w:bCs/>
+                            <w:sz w:val="48"/>
+                            <w:szCs w:val="48"/>
+                            <w14:ligatures w14:val="none"/>
+                          </w:rPr>
+                        </w:pPr>
+                        <w:r>
+                          <w:rPr>
+                            <w:rFonts w:eastAsia="Aptos"/>
+                            <w:b/>
+                            <w:bCs/>
+                            <w:sz w:val="48"/>
+                            <w:szCs w:val="48"/>
+                          </w:rPr>
+                          <w:t>Log In</w:t>
+                        </w:r>
+                      </w:p>
+                      <w:p/>
+                    </w:txbxContent>
+                  </v:textbox>
+                </v:rect>
+                <v:rect id="Rectangle 351570122" o:spid="_x0000_s1034" style="position:absolute;left:2032;top:30480;width:49339;height:4457;visibility:visible;mso-wrap-style:square;v-text-anchor:middle" o:gfxdata="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" fillcolor="white [3201]" strokecolor="black [3200]" strokeweight="1pt">
+                  <v:textbox>
+                    <w:txbxContent>
+                      <w:p>
+                        <w:pPr>
+                          <w:ind w:left="2160" w:firstLine="720"/>
+                          <w:rPr>
+                            <w:rFonts w:eastAsia="Aptos"/>
+                            <w:color w:val="BFBFBF" w:themeColor="background1" w:themeShade="BF"/>
+                            <w:sz w:val="44"/>
+                            <w:szCs w:val="44"/>
+                            <w14:ligatures w14:val="none"/>
+                          </w:rPr>
+                        </w:pPr>
+                        <w:r>
+                          <w:rPr>
+                            <w:rFonts w:eastAsia="Aptos"/>
+                            <w:color w:val="BFBFBF" w:themeColor="background1" w:themeShade="BF"/>
+                            <w:sz w:val="44"/>
+                            <w:szCs w:val="44"/>
+                          </w:rPr>
+                          <w:t>Cancel</w:t>
+                        </w:r>
+                      </w:p>
+                      <w:p>
+                        <w:pPr>
+                          <w:rPr>
+                            <w:rFonts w:eastAsia="Aptos"/>
+                          </w:rPr>
+                        </w:pPr>
+                        <w:r>
+                          <w:rPr>
+                            <w:rFonts w:eastAsia="Aptos"/>
+                          </w:rPr>
+                          <w:t> </w:t>
+                        </w:r>
+                      </w:p>
+                    </w:txbxContent>
+                  </v:textbox>
+                </v:rect>
+                <w10:anchorlock/>
+              </v:group>
+            </w:pict>
+          </mc:Fallback>
+        </mc:AlternateContent>
+      </w:r>
+    </w:p>
+    <w:p>
+      <w:pPr>
+        <w:spacing w:after="160" w:line="276" w:lineRule="auto"/>
+      </w:pPr>
+      <w:r>
+        <w:rPr>
+          <w:rFonts w:ascii="Aptos" w:eastAsia="Aptos" w:hAnsi="Aptos" w:cs="Aptos"/>
+        </w:rPr>
+        <w:t xml:space="preserve">The only input to this form is the username and password typed by the user. The output, once the button is pressed, is either entry into the main menu or a message box telling the user that their details were not recognised. The process that happens in between is a lookup against the </w:t>
+      </w:r>
+      <w:proofErr w:type="spellStart"/>
+      <w:r>
+        <w:rPr>
+          <w:rFonts w:ascii="Aptos" w:eastAsia="Aptos" w:hAnsi="Aptos" w:cs="Aptos"/>
+        </w:rPr>
+        <w:t>tblLogin</w:t>
+      </w:r>
+      <w:proofErr w:type="spellEnd"/>
+      <w:r>
+        <w:rPr>
+          <w:rFonts w:ascii="Aptos" w:eastAsia="Aptos" w:hAnsi="Aptos" w:cs="Aptos"/>
+        </w:rPr>
+        <w:t xml:space="preserve"> table for a matching username, a comparison of the stored password, and if everything matches, the storing of that user's access level in a variable called </w:t>
+      </w:r>
+      <w:proofErr w:type="spellStart"/>
+      <w:r>
+        <w:rPr>
+          <w:rFonts w:ascii="Aptos" w:eastAsia="Aptos" w:hAnsi="Aptos" w:cs="Aptos"/>
+        </w:rPr>
+        <w:t>UserAccessLevel</w:t>
+      </w:r>
+      <w:proofErr w:type="spellEnd"/>
+      <w:r>
+        <w:rPr>
+          <w:rFonts w:ascii="Aptos" w:eastAsia="Aptos" w:hAnsi="Aptos" w:cs="Aptos"/>
+        </w:rPr>
+        <w:t xml:space="preserve"> that the rest of the program can read. I have chosen buttons here rather than, for example, expecting the user to press the Enter key, this is because a clearly labelled Log In button leaves no doubt about what to do and is friendlier for staff who are not especially technical.</w:t>
+      </w:r>
+    </w:p>
+    <w:p>
+      <w:pPr>
+        <w:spacing w:after="160" w:line="276" w:lineRule="auto"/>
+      </w:pPr>
+      <w:r>
+        <w:rPr>
+          <w:rFonts w:ascii="Aptos" w:eastAsia="Aptos" w:hAnsi="Aptos" w:cs="Aptos"/>
+        </w:rPr>
+        <w:lastRenderedPageBreak/>
+        <w:t xml:space="preserve">Once a user has logged in successfully they are taken to the main menu, which is the form named </w:t>
+      </w:r>
+      <w:proofErr w:type="spellStart"/>
+      <w:r>
+        <w:rPr>
+          <w:rFonts w:ascii="Aptos" w:eastAsia="Aptos" w:hAnsi="Aptos" w:cs="Aptos"/>
+        </w:rPr>
+        <w:t>frmMainForm</w:t>
+      </w:r>
+      <w:proofErr w:type="spellEnd"/>
+      <w:r>
+        <w:rPr>
+          <w:rFonts w:ascii="Aptos" w:eastAsia="Aptos" w:hAnsi="Aptos" w:cs="Aptos"/>
+        </w:rPr>
+        <w:t xml:space="preserve"> and acts as the hub for the whole system. Every other part of </w:t>
+      </w:r>
+      <w:proofErr w:type="spellStart"/>
+      <w:r>
+        <w:rPr>
+          <w:rFonts w:ascii="Aptos" w:eastAsia="Aptos" w:hAnsi="Aptos" w:cs="Aptos"/>
+        </w:rPr>
+        <w:t>Filmtopia</w:t>
+      </w:r>
+      <w:proofErr w:type="spellEnd"/>
+      <w:r>
+        <w:rPr>
+          <w:rFonts w:ascii="Aptos" w:eastAsia="Aptos" w:hAnsi="Aptos" w:cs="Aptos"/>
+        </w:rPr>
+        <w:t xml:space="preserve"> is reached from here by pressing a button, which I felt was a far more sophisticated and easier to follow approach than burying features inside drop-down menus that a busy member of staff would have to go hunting through. The menu shows a welcome message at the top and then a column of buttons down the content area, one for each area of the system, for example Bookings, Find Booking, Screenings, Films, Screens, Food, Reports, Customers, Logs and a Logout button.</w:t>
+      </w:r>
+    </w:p>
+    <w:p>
+      <w:pPr>
+        <w:spacing w:after="160" w:line="276" w:lineRule="auto"/>
+      </w:pPr>
+      <w:r>
+        <w:rPr>
+          <w:rFonts w:ascii="Aptos" w:eastAsia="Aptos" w:hAnsi="Aptos" w:cs="Aptos"/>
+        </w:rPr>
+        <w:t xml:space="preserve">What makes this form important for the objective is that the buttons shown depend entirely on the access level that was read at login. This is because a manager, whose access level is 1, needs to see everything, whereas a normal member of staff, whose access level is 2, should only see the day to day booking functions. When a manager logs in the group box is titled </w:t>
+      </w:r>
+      <w:proofErr w:type="spellStart"/>
+      <w:r>
+        <w:rPr>
+          <w:rFonts w:ascii="Aptos" w:eastAsia="Aptos" w:hAnsi="Aptos" w:cs="Aptos"/>
+        </w:rPr>
+        <w:t>Filmtopia</w:t>
+      </w:r>
+      <w:proofErr w:type="spellEnd"/>
+      <w:r>
+        <w:rPr>
+          <w:rFonts w:ascii="Aptos" w:eastAsia="Aptos" w:hAnsi="Aptos" w:cs="Aptos"/>
+        </w:rPr>
+        <w:t xml:space="preserve"> Admin and the management buttons for Films, Screens, Food, Reports and Logs are all made visible. When a member of staff logs in those same buttons are hidden and the group box is titled </w:t>
+      </w:r>
+      <w:proofErr w:type="spellStart"/>
+      <w:r>
+        <w:rPr>
+          <w:rFonts w:ascii="Aptos" w:eastAsia="Aptos" w:hAnsi="Aptos" w:cs="Aptos"/>
+        </w:rPr>
+        <w:t>Filmtopia</w:t>
+      </w:r>
+      <w:proofErr w:type="spellEnd"/>
+      <w:r>
+        <w:rPr>
+          <w:rFonts w:ascii="Aptos" w:eastAsia="Aptos" w:hAnsi="Aptos" w:cs="Aptos"/>
+        </w:rPr>
+        <w:t xml:space="preserve"> Staff, leaving them with just the booking related functions. In this way a single form quietly enforces the whole access level objective without the staff member ever seeing an option they are not allowed to use.</w:t>
       </w:r>
     </w:p>
     <w:p>
@@ -316,7 +1063,7 @@
           <w:sz w:val="22"/>
           <w:szCs w:val="22"/>
         </w:rPr>
-        <w:t>Login Form (</w:t>
+        <w:t>Main Menu (</w:t>
       </w:r>
       <w:proofErr w:type="spellStart"/>
       <w:r>
@@ -328,7 +1075,7 @@
           <w:sz w:val="22"/>
           <w:szCs w:val="22"/>
         </w:rPr>
-        <w:t>frmLogin</w:t>
+        <w:t>frmMainForm</w:t>
       </w:r>
       <w:proofErr w:type="spellEnd"/>
       <w:r>
@@ -351,35 +1098,22 @@
         <w:rPr>
           <w:rFonts w:ascii="Aptos" w:eastAsia="Aptos" w:hAnsi="Aptos" w:cs="Aptos"/>
         </w:rPr>
-        <w:t xml:space="preserve">The only input to this form is the username and password typed by the user. The output, once the button is pressed, is either entry into the main menu or a message box telling the user that their details were not recognised. The process that happens in between is a lookup against the </w:t>
-      </w:r>
-      <w:proofErr w:type="spellStart"/>
-      <w:r>
-        <w:rPr>
-          <w:rFonts w:ascii="Aptos" w:eastAsia="Aptos" w:hAnsi="Aptos" w:cs="Aptos"/>
-        </w:rPr>
-        <w:t>tblLogin</w:t>
-      </w:r>
-      <w:proofErr w:type="spellEnd"/>
-      <w:r>
-        <w:rPr>
-          <w:rFonts w:ascii="Aptos" w:eastAsia="Aptos" w:hAnsi="Aptos" w:cs="Aptos"/>
-        </w:rPr>
-        <w:t xml:space="preserve"> table for a matching username, a comparison of the stored password, and if everything matches, the storing of that user's access level in a variable called </w:t>
-      </w:r>
-      <w:proofErr w:type="spellStart"/>
-      <w:r>
-        <w:rPr>
-          <w:rFonts w:ascii="Aptos" w:eastAsia="Aptos" w:hAnsi="Aptos" w:cs="Aptos"/>
-        </w:rPr>
-        <w:t>UserAccessLevel</w:t>
-      </w:r>
-      <w:proofErr w:type="spellEnd"/>
-      <w:r>
-        <w:rPr>
-          <w:rFonts w:ascii="Aptos" w:eastAsia="Aptos" w:hAnsi="Aptos" w:cs="Aptos"/>
-        </w:rPr>
-        <w:t xml:space="preserve"> that the rest of the program can read. I have chosen buttons here rather than, for example, expecting the user to press the Enter key, this is because a clearly labelled Log In button leaves no doubt about what to do and is friendlier for staff who are not especially technical.</w:t>
+        <w:t>The input to the main menu is simply the button the user chooses to press. The output is the opening of whichever form that button is linked to. There is no data entry on this screen at all, this is because its only job is navigation, and keeping it free of clutter makes it obvious where everything lives.</w:t>
+      </w:r>
+    </w:p>
+    <w:p>
+      <w:pPr>
+        <w:pStyle w:val="Heading3"/>
+        <w:spacing w:before="260" w:after="120"/>
+      </w:pPr>
+      <w:r>
+        <w:rPr>
+          <w:rFonts w:ascii="Aptos Display" w:eastAsia="Aptos Display" w:hAnsi="Aptos Display" w:cs="Aptos Display"/>
+          <w:b/>
+          <w:bCs/>
+          <w:color w:val="000000"/>
+        </w:rPr>
+        <w:t>Adding New Films (Objective 6)</w:t>
       </w:r>
     </w:p>
     <w:p>
@@ -390,35 +1124,21 @@
         <w:rPr>
           <w:rFonts w:ascii="Aptos" w:eastAsia="Aptos" w:hAnsi="Aptos" w:cs="Aptos"/>
         </w:rPr>
-        <w:t xml:space="preserve">Once a user has logged in successfully they are taken to the main menu, which is the form named </w:t>
+        <w:t xml:space="preserve">Moving on to the management side of the system, one of the first jobs a manager or member of staff needs to do is add the films that the cinema is showing, because without any films in the system there is nothing for a screening to be attached to. This objective is handled by a single form named </w:t>
       </w:r>
       <w:proofErr w:type="spellStart"/>
       <w:r>
         <w:rPr>
           <w:rFonts w:ascii="Aptos" w:eastAsia="Aptos" w:hAnsi="Aptos" w:cs="Aptos"/>
         </w:rPr>
-        <w:t>frmMainForm</w:t>
+        <w:t>frmFilms</w:t>
       </w:r>
       <w:proofErr w:type="spellEnd"/>
       <w:r>
         <w:rPr>
           <w:rFonts w:ascii="Aptos" w:eastAsia="Aptos" w:hAnsi="Aptos" w:cs="Aptos"/>
         </w:rPr>
-        <w:t xml:space="preserve"> and acts as the hub for the whole system. Every other part of </w:t>
-      </w:r>
-      <w:proofErr w:type="spellStart"/>
-      <w:r>
-        <w:rPr>
-          <w:rFonts w:ascii="Aptos" w:eastAsia="Aptos" w:hAnsi="Aptos" w:cs="Aptos"/>
-        </w:rPr>
-        <w:t>Filmtopia</w:t>
-      </w:r>
-      <w:proofErr w:type="spellEnd"/>
-      <w:r>
-        <w:rPr>
-          <w:rFonts w:ascii="Aptos" w:eastAsia="Aptos" w:hAnsi="Aptos" w:cs="Aptos"/>
-        </w:rPr>
-        <w:t xml:space="preserve"> is reached from here by pressing a button, which I felt was a far more sophisticated and easier to follow approach than burying features inside drop-down menus that a busy member of staff would have to go hunting through. The menu shows a welcome message at the top and then a column of buttons down the content area, one for each area of the system, for example Bookings, Find Booking, Screenings, Films, Screens, Food, Reports, Customers, Logs and a Logout button.</w:t>
+        <w:t xml:space="preserve"> which lets the user add a new film, edit an existing one, or remove one that is no longer being shown.</w:t>
       </w:r>
     </w:p>
     <w:p>
@@ -429,35 +1149,140 @@
         <w:rPr>
           <w:rFonts w:ascii="Aptos" w:eastAsia="Aptos" w:hAnsi="Aptos" w:cs="Aptos"/>
         </w:rPr>
-        <w:t xml:space="preserve">What makes this form important for the objective is that the buttons shown depend entirely on the access level that was read at login. This is because a manager, whose access level is 1, needs to see everything, whereas a normal member of staff, whose access level is 2, should only see the day to day booking functions. When a manager logs in the group box is titled </w:t>
+        <w:t xml:space="preserve">The form is split into two halves. On one side is a data grid view named </w:t>
       </w:r>
       <w:proofErr w:type="spellStart"/>
       <w:r>
         <w:rPr>
           <w:rFonts w:ascii="Aptos" w:eastAsia="Aptos" w:hAnsi="Aptos" w:cs="Aptos"/>
         </w:rPr>
-        <w:t>Filmtopia</w:t>
+        <w:t>dgvFilms</w:t>
       </w:r>
       <w:proofErr w:type="spellEnd"/>
       <w:r>
         <w:rPr>
           <w:rFonts w:ascii="Aptos" w:eastAsia="Aptos" w:hAnsi="Aptos" w:cs="Aptos"/>
         </w:rPr>
-        <w:t xml:space="preserve"> Admin and the management buttons for Films, Screens, Food, Reports and Logs are all made visible. When a member of staff logs in those same buttons are hidden and the group box is titled </w:t>
+        <w:t xml:space="preserve"> which lists every film already stored in the system, showing its title, age rating, duration and description in a table so the user can see at a glance what is already there. On the other side is a set of input boxes for the details of a film, made up of a label and a text box for each field, which I have named </w:t>
       </w:r>
       <w:proofErr w:type="spellStart"/>
       <w:r>
         <w:rPr>
           <w:rFonts w:ascii="Aptos" w:eastAsia="Aptos" w:hAnsi="Aptos" w:cs="Aptos"/>
         </w:rPr>
-        <w:t>Filmtopia</w:t>
+        <w:t>txtTitle</w:t>
       </w:r>
       <w:proofErr w:type="spellEnd"/>
       <w:r>
         <w:rPr>
           <w:rFonts w:ascii="Aptos" w:eastAsia="Aptos" w:hAnsi="Aptos" w:cs="Aptos"/>
         </w:rPr>
-        <w:t xml:space="preserve"> Staff, leaving them with just the booking related functions. In this way a single form quietly enforces the whole access level objective without the staff member ever seeing an option they are not allowed to use.</w:t>
+        <w:t xml:space="preserve">, </w:t>
+      </w:r>
+      <w:proofErr w:type="spellStart"/>
+      <w:r>
+        <w:rPr>
+          <w:rFonts w:ascii="Aptos" w:eastAsia="Aptos" w:hAnsi="Aptos" w:cs="Aptos"/>
+        </w:rPr>
+        <w:t>txtAgeRating</w:t>
+      </w:r>
+      <w:proofErr w:type="spellEnd"/>
+      <w:r>
+        <w:rPr>
+          <w:rFonts w:ascii="Aptos" w:eastAsia="Aptos" w:hAnsi="Aptos" w:cs="Aptos"/>
+        </w:rPr>
+        <w:t xml:space="preserve">, </w:t>
+      </w:r>
+      <w:proofErr w:type="spellStart"/>
+      <w:r>
+        <w:rPr>
+          <w:rFonts w:ascii="Aptos" w:eastAsia="Aptos" w:hAnsi="Aptos" w:cs="Aptos"/>
+        </w:rPr>
+        <w:t>txtDuration</w:t>
+      </w:r>
+      <w:proofErr w:type="spellEnd"/>
+      <w:r>
+        <w:rPr>
+          <w:rFonts w:ascii="Aptos" w:eastAsia="Aptos" w:hAnsi="Aptos" w:cs="Aptos"/>
+        </w:rPr>
+        <w:t xml:space="preserve"> and </w:t>
+      </w:r>
+      <w:proofErr w:type="spellStart"/>
+      <w:r>
+        <w:rPr>
+          <w:rFonts w:ascii="Aptos" w:eastAsia="Aptos" w:hAnsi="Aptos" w:cs="Aptos"/>
+        </w:rPr>
+        <w:t>txtDescription</w:t>
+      </w:r>
+      <w:proofErr w:type="spellEnd"/>
+      <w:r>
+        <w:rPr>
+          <w:rFonts w:ascii="Aptos" w:eastAsia="Aptos" w:hAnsi="Aptos" w:cs="Aptos"/>
+        </w:rPr>
+        <w:t xml:space="preserve">. </w:t>
+      </w:r>
+      <w:r>
+        <w:rPr>
+          <w:rFonts w:ascii="Aptos" w:eastAsia="Aptos" w:hAnsi="Aptos" w:cs="Aptos"/>
+        </w:rPr>
+        <w:lastRenderedPageBreak/>
+        <w:t xml:space="preserve">Beneath these are four buttons, Add, Update, Delete and Clear, which I have named </w:t>
+      </w:r>
+      <w:proofErr w:type="spellStart"/>
+      <w:r>
+        <w:rPr>
+          <w:rFonts w:ascii="Aptos" w:eastAsia="Aptos" w:hAnsi="Aptos" w:cs="Aptos"/>
+        </w:rPr>
+        <w:t>btnAdd</w:t>
+      </w:r>
+      <w:proofErr w:type="spellEnd"/>
+      <w:r>
+        <w:rPr>
+          <w:rFonts w:ascii="Aptos" w:eastAsia="Aptos" w:hAnsi="Aptos" w:cs="Aptos"/>
+        </w:rPr>
+        <w:t xml:space="preserve">, </w:t>
+      </w:r>
+      <w:proofErr w:type="spellStart"/>
+      <w:r>
+        <w:rPr>
+          <w:rFonts w:ascii="Aptos" w:eastAsia="Aptos" w:hAnsi="Aptos" w:cs="Aptos"/>
+        </w:rPr>
+        <w:t>btnUpdate</w:t>
+      </w:r>
+      <w:proofErr w:type="spellEnd"/>
+      <w:r>
+        <w:rPr>
+          <w:rFonts w:ascii="Aptos" w:eastAsia="Aptos" w:hAnsi="Aptos" w:cs="Aptos"/>
+        </w:rPr>
+        <w:t xml:space="preserve">, </w:t>
+      </w:r>
+      <w:proofErr w:type="spellStart"/>
+      <w:r>
+        <w:rPr>
+          <w:rFonts w:ascii="Aptos" w:eastAsia="Aptos" w:hAnsi="Aptos" w:cs="Aptos"/>
+        </w:rPr>
+        <w:t>btnDelete</w:t>
+      </w:r>
+      <w:proofErr w:type="spellEnd"/>
+      <w:r>
+        <w:rPr>
+          <w:rFonts w:ascii="Aptos" w:eastAsia="Aptos" w:hAnsi="Aptos" w:cs="Aptos"/>
+        </w:rPr>
+        <w:t xml:space="preserve"> and </w:t>
+      </w:r>
+      <w:proofErr w:type="spellStart"/>
+      <w:r>
+        <w:rPr>
+          <w:rFonts w:ascii="Aptos" w:eastAsia="Aptos" w:hAnsi="Aptos" w:cs="Aptos"/>
+        </w:rPr>
+        <w:t>btnClear</w:t>
+      </w:r>
+      <w:proofErr w:type="spellEnd"/>
+      <w:r>
+        <w:rPr>
+          <w:rFonts w:ascii="Aptos" w:eastAsia="Aptos" w:hAnsi="Aptos" w:cs="Aptos"/>
+        </w:rPr>
+        <w:t>.</w:t>
       </w:r>
     </w:p>
     <w:p>
@@ -480,8 +1305,7 @@
           <w:sz w:val="22"/>
           <w:szCs w:val="22"/>
         </w:rPr>
-        <w:lastRenderedPageBreak/>
-        <w:t>Main Menu (</w:t>
+        <w:t>Add Films Form (</w:t>
       </w:r>
       <w:proofErr w:type="spellStart"/>
       <w:r>
@@ -493,7 +1317,7 @@
           <w:sz w:val="22"/>
           <w:szCs w:val="22"/>
         </w:rPr>
-        <w:t>frmMainForm</w:t>
+        <w:t>frmFilms</w:t>
       </w:r>
       <w:proofErr w:type="spellEnd"/>
       <w:r>
@@ -516,7 +1340,32 @@
         <w:rPr>
           <w:rFonts w:ascii="Aptos" w:eastAsia="Aptos" w:hAnsi="Aptos" w:cs="Aptos"/>
         </w:rPr>
-        <w:t>The input to the main menu is simply the button the user chooses to press. The output is the opening of whichever form that button is linked to. There is no data entry on this screen at all, this is because its only job is navigation, and keeping it free of clutter makes it obvious where everything lives.</w:t>
+        <w:t xml:space="preserve">The inputs to this form are the four film details typed into the text boxes. The outputs are the updated list of films shown in the grid and, where appropriate, a message box confirming that a film has been added or warning the user if something has gone wrong. The processes behind the buttons are straightforward database operations, for example the Add button takes whatever is in the text boxes and inserts a new record into the </w:t>
+      </w:r>
+      <w:proofErr w:type="spellStart"/>
+      <w:r>
+        <w:rPr>
+          <w:rFonts w:ascii="Aptos" w:eastAsia="Aptos" w:hAnsi="Aptos" w:cs="Aptos"/>
+        </w:rPr>
+        <w:t>tblFilm</w:t>
+      </w:r>
+      <w:proofErr w:type="spellEnd"/>
+      <w:r>
+        <w:rPr>
+          <w:rFonts w:ascii="Aptos" w:eastAsia="Aptos" w:hAnsi="Aptos" w:cs="Aptos"/>
+        </w:rPr>
+        <w:t xml:space="preserve"> table, whereas the Update button changes the record for the film currently selected in the grid, and the Delete button removes it. The Clear button simply empties the text boxes so the user can start again.</w:t>
+      </w:r>
+    </w:p>
+    <w:p>
+      <w:pPr>
+        <w:spacing w:after="160" w:line="276" w:lineRule="auto"/>
+      </w:pPr>
+      <w:r>
+        <w:rPr>
+          <w:rFonts w:ascii="Aptos" w:eastAsia="Aptos" w:hAnsi="Aptos" w:cs="Aptos"/>
+        </w:rPr>
+        <w:t>I have laid the form out with the list on one side and the editing boxes on the other, this is because it lets the user see the existing data and the thing they are editing at the same time rather than flipping between two separate screens. I have again used clearly labelled buttons for each action, this is because it makes it obvious what each one does and avoids the user accidentally deleting a film when they only meant to update it. This same pattern, a list on one side and input boxes with Add, Update, Delete and Clear buttons on the other, is reused across several of the management forms, so where a later objective uses the same layout I will refer back to this description rather than repeating it.</w:t>
       </w:r>
     </w:p>
     <w:p>
@@ -531,7 +1380,7 @@
           <w:bCs/>
           <w:color w:val="000000"/>
         </w:rPr>
-        <w:t>Adding New Films (Objective 6)</w:t>
+        <w:t>Adding New Screenings (Objective 7)</w:t>
       </w:r>
     </w:p>
     <w:p>
@@ -542,21 +1391,35 @@
         <w:rPr>
           <w:rFonts w:ascii="Aptos" w:eastAsia="Aptos" w:hAnsi="Aptos" w:cs="Aptos"/>
         </w:rPr>
-        <w:t xml:space="preserve">Moving on to the management side of the system, one of the first jobs a manager or member of staff needs to do is add the films that the cinema is showing, because without any films in the system there is nothing for a screening to be attached to. This objective is handled by a single form named </w:t>
+        <w:t xml:space="preserve">Once films exist in the system the next job is to schedule when and where they will actually be shown, which is what this objective covers. It is handled by the form named </w:t>
       </w:r>
       <w:proofErr w:type="spellStart"/>
       <w:r>
         <w:rPr>
           <w:rFonts w:ascii="Aptos" w:eastAsia="Aptos" w:hAnsi="Aptos" w:cs="Aptos"/>
         </w:rPr>
-        <w:t>frmFilms</w:t>
+        <w:t>frmScreenings</w:t>
       </w:r>
       <w:proofErr w:type="spellEnd"/>
       <w:r>
         <w:rPr>
           <w:rFonts w:ascii="Aptos" w:eastAsia="Aptos" w:hAnsi="Aptos" w:cs="Aptos"/>
         </w:rPr>
-        <w:t xml:space="preserve"> which lets the user add a new film, edit an existing one, or remove one that is no longer being shown.</w:t>
+        <w:t xml:space="preserve">, and because it is another management form for adding, editing and removing records it follows exactly the same layout as the Add Films form described above, with a data grid view named </w:t>
+      </w:r>
+      <w:proofErr w:type="spellStart"/>
+      <w:r>
+        <w:rPr>
+          <w:rFonts w:ascii="Aptos" w:eastAsia="Aptos" w:hAnsi="Aptos" w:cs="Aptos"/>
+        </w:rPr>
+        <w:t>dgvScreenings</w:t>
+      </w:r>
+      <w:proofErr w:type="spellEnd"/>
+      <w:r>
+        <w:rPr>
+          <w:rFonts w:ascii="Aptos" w:eastAsia="Aptos" w:hAnsi="Aptos" w:cs="Aptos"/>
+        </w:rPr>
+        <w:t xml:space="preserve"> listing the existing screenings on one side and a set of input controls with Add, Update, Delete and Clear buttons on the other. Rather than repeat the whole description I will refer back to the Add Films form for the general behaviour and just explain what is different here.</w:t>
       </w:r>
     </w:p>
     <w:p>
@@ -567,126 +1430,77 @@
         <w:rPr>
           <w:rFonts w:ascii="Aptos" w:eastAsia="Aptos" w:hAnsi="Aptos" w:cs="Aptos"/>
         </w:rPr>
-        <w:t xml:space="preserve">The form is split into two halves. On one side is a data grid view named </w:t>
+        <w:t xml:space="preserve">The difference is in the inputs. A screening has to be tied to a film that already exists and a screen that already exists, so instead of free text boxes for those two the form uses two combo boxes, named </w:t>
       </w:r>
       <w:proofErr w:type="spellStart"/>
       <w:r>
         <w:rPr>
           <w:rFonts w:ascii="Aptos" w:eastAsia="Aptos" w:hAnsi="Aptos" w:cs="Aptos"/>
         </w:rPr>
-        <w:t>dgvFilms</w:t>
+        <w:t>cboFilm</w:t>
       </w:r>
       <w:proofErr w:type="spellEnd"/>
       <w:r>
         <w:rPr>
           <w:rFonts w:ascii="Aptos" w:eastAsia="Aptos" w:hAnsi="Aptos" w:cs="Aptos"/>
         </w:rPr>
-        <w:t xml:space="preserve"> which lists every film already stored in the system, showing its title, age rating, duration and description in a table so the user can see at a glance what is already there. On the other side is a set of input boxes for the details of a film, made up of a label and a text box for each field, which I have named </w:t>
+        <w:t xml:space="preserve"> and </w:t>
       </w:r>
       <w:proofErr w:type="spellStart"/>
       <w:r>
         <w:rPr>
           <w:rFonts w:ascii="Aptos" w:eastAsia="Aptos" w:hAnsi="Aptos" w:cs="Aptos"/>
         </w:rPr>
-        <w:t>txtTitle</w:t>
+        <w:t>cboScreen</w:t>
       </w:r>
       <w:proofErr w:type="spellEnd"/>
       <w:r>
         <w:rPr>
           <w:rFonts w:ascii="Aptos" w:eastAsia="Aptos" w:hAnsi="Aptos" w:cs="Aptos"/>
         </w:rPr>
-        <w:t xml:space="preserve">, </w:t>
+        <w:t xml:space="preserve">, which the user picks from. This is because a member of staff should not be able to type in a film or a screen that is not really there, and choosing from a list makes that impossible. The date is entered using a date picker named </w:t>
       </w:r>
       <w:proofErr w:type="spellStart"/>
       <w:r>
         <w:rPr>
           <w:rFonts w:ascii="Aptos" w:eastAsia="Aptos" w:hAnsi="Aptos" w:cs="Aptos"/>
         </w:rPr>
-        <w:t>txtAgeRating</w:t>
+        <w:t>dtpScreeningDate</w:t>
       </w:r>
       <w:proofErr w:type="spellEnd"/>
       <w:r>
         <w:rPr>
           <w:rFonts w:ascii="Aptos" w:eastAsia="Aptos" w:hAnsi="Aptos" w:cs="Aptos"/>
         </w:rPr>
-        <w:t xml:space="preserve">, </w:t>
+        <w:t xml:space="preserve"> rather than a text box, this is because a proper date picker stops </w:t>
+      </w:r>
+      <w:r>
+        <w:rPr>
+          <w:rFonts w:ascii="Aptos" w:eastAsia="Aptos" w:hAnsi="Aptos" w:cs="Aptos"/>
+        </w:rPr>
+        <w:lastRenderedPageBreak/>
+        <w:t xml:space="preserve">the user entering something that is not a real date. The time and the ticket price are entered into text boxes named </w:t>
       </w:r>
       <w:proofErr w:type="spellStart"/>
       <w:r>
         <w:rPr>
           <w:rFonts w:ascii="Aptos" w:eastAsia="Aptos" w:hAnsi="Aptos" w:cs="Aptos"/>
         </w:rPr>
-        <w:t>txtDuration</w:t>
+        <w:t>txtScreeningTime</w:t>
       </w:r>
       <w:proofErr w:type="spellEnd"/>
       <w:r>
         <w:rPr>
           <w:rFonts w:ascii="Aptos" w:eastAsia="Aptos" w:hAnsi="Aptos" w:cs="Aptos"/>
         </w:rPr>
-        <w:t xml:space="preserve"> and </w:t>
+        <w:t xml:space="preserve">, which is labelled Time in the format HH colon MM, and </w:t>
       </w:r>
       <w:proofErr w:type="spellStart"/>
       <w:r>
         <w:rPr>
           <w:rFonts w:ascii="Aptos" w:eastAsia="Aptos" w:hAnsi="Aptos" w:cs="Aptos"/>
         </w:rPr>
-        <w:t>txtDescription</w:t>
-      </w:r>
-      <w:proofErr w:type="spellEnd"/>
-      <w:r>
-        <w:rPr>
-          <w:rFonts w:ascii="Aptos" w:eastAsia="Aptos" w:hAnsi="Aptos" w:cs="Aptos"/>
-        </w:rPr>
-        <w:t xml:space="preserve">. Beneath these are four buttons, Add, Update, Delete and Clear, which I have named </w:t>
-      </w:r>
-      <w:proofErr w:type="spellStart"/>
-      <w:r>
-        <w:rPr>
-          <w:rFonts w:ascii="Aptos" w:eastAsia="Aptos" w:hAnsi="Aptos" w:cs="Aptos"/>
-        </w:rPr>
-        <w:t>btnAdd</w:t>
-      </w:r>
-      <w:proofErr w:type="spellEnd"/>
-      <w:r>
-        <w:rPr>
-          <w:rFonts w:ascii="Aptos" w:eastAsia="Aptos" w:hAnsi="Aptos" w:cs="Aptos"/>
-        </w:rPr>
-        <w:t xml:space="preserve">, </w:t>
-      </w:r>
-      <w:proofErr w:type="spellStart"/>
-      <w:r>
-        <w:rPr>
-          <w:rFonts w:ascii="Aptos" w:eastAsia="Aptos" w:hAnsi="Aptos" w:cs="Aptos"/>
-        </w:rPr>
-        <w:t>btnUpdate</w:t>
-      </w:r>
-      <w:proofErr w:type="spellEnd"/>
-      <w:r>
-        <w:rPr>
-          <w:rFonts w:ascii="Aptos" w:eastAsia="Aptos" w:hAnsi="Aptos" w:cs="Aptos"/>
-        </w:rPr>
-        <w:t xml:space="preserve">, </w:t>
-      </w:r>
-      <w:proofErr w:type="spellStart"/>
-      <w:r>
-        <w:rPr>
-          <w:rFonts w:ascii="Aptos" w:eastAsia="Aptos" w:hAnsi="Aptos" w:cs="Aptos"/>
-        </w:rPr>
-        <w:t>btnDelete</w:t>
-      </w:r>
-      <w:proofErr w:type="spellEnd"/>
-      <w:r>
-        <w:rPr>
-          <w:rFonts w:ascii="Aptos" w:eastAsia="Aptos" w:hAnsi="Aptos" w:cs="Aptos"/>
-        </w:rPr>
-        <w:t xml:space="preserve"> and </w:t>
-      </w:r>
-      <w:proofErr w:type="spellStart"/>
-      <w:r>
-        <w:rPr>
-          <w:rFonts w:ascii="Aptos" w:eastAsia="Aptos" w:hAnsi="Aptos" w:cs="Aptos"/>
-        </w:rPr>
-        <w:t>btnClear</w:t>
+        <w:t>txtTicketPrice</w:t>
       </w:r>
       <w:proofErr w:type="spellEnd"/>
       <w:r>
@@ -716,7 +1530,7 @@
           <w:sz w:val="22"/>
           <w:szCs w:val="22"/>
         </w:rPr>
-        <w:t>Add Films Form (</w:t>
+        <w:t>Add Screenings Form (</w:t>
       </w:r>
       <w:proofErr w:type="spellStart"/>
       <w:r>
@@ -728,7 +1542,7 @@
           <w:sz w:val="22"/>
           <w:szCs w:val="22"/>
         </w:rPr>
-        <w:t>frmFilms</w:t>
+        <w:t>frmScreenings</w:t>
       </w:r>
       <w:proofErr w:type="spellEnd"/>
       <w:r>
@@ -751,39 +1565,21 @@
         <w:rPr>
           <w:rFonts w:ascii="Aptos" w:eastAsia="Aptos" w:hAnsi="Aptos" w:cs="Aptos"/>
         </w:rPr>
-        <w:t xml:space="preserve">The inputs to this form are the four film details typed into the text boxes. The outputs are the updated list of films shown in the grid and, where appropriate, a message box confirming that a film has been added or warning the user if something has gone wrong. The processes behind the buttons are straightforward database operations, for example the Add button takes whatever is in the text boxes and inserts a new record into the </w:t>
+        <w:t xml:space="preserve">The inputs are therefore the chosen film, the chosen screen, the date, the time and the ticket price. The output is the updated list of screenings in the grid, along with the usual confirmation or warning message boxes. The processes behind the buttons are the same insert, update and delete operations as before, this time acting on the </w:t>
       </w:r>
       <w:proofErr w:type="spellStart"/>
       <w:r>
         <w:rPr>
           <w:rFonts w:ascii="Aptos" w:eastAsia="Aptos" w:hAnsi="Aptos" w:cs="Aptos"/>
         </w:rPr>
-        <w:t>tblFilm</w:t>
+        <w:t>tblScreening</w:t>
       </w:r>
       <w:proofErr w:type="spellEnd"/>
       <w:r>
         <w:rPr>
           <w:rFonts w:ascii="Aptos" w:eastAsia="Aptos" w:hAnsi="Aptos" w:cs="Aptos"/>
         </w:rPr>
-        <w:t xml:space="preserve"> table, whereas the Update button changes the record for the film currently selected in the grid, and the Delete button removes it. The Clear button simply empties the text boxes so the user can start again.</w:t>
-      </w:r>
-    </w:p>
-    <w:p>
-      <w:pPr>
-        <w:spacing w:after="160" w:line="276" w:lineRule="auto"/>
-      </w:pPr>
-      <w:r>
-        <w:rPr>
-          <w:rFonts w:ascii="Aptos" w:eastAsia="Aptos" w:hAnsi="Aptos" w:cs="Aptos"/>
-        </w:rPr>
-        <w:t xml:space="preserve">I have laid the form out with the list on one side and the editing boxes on the other, this is because it lets the user see the existing data and the thing they are editing at the same time rather than flipping between two separate screens. I have again used clearly labelled buttons for each action, this is because it makes it obvious what each one does and avoids the user accidentally deleting a film when they only meant to update it. This same pattern, a list on one side and input boxes with Add, Update, Delete and Clear buttons on the other, </w:t>
-      </w:r>
-      <w:r>
-        <w:rPr>
-          <w:rFonts w:ascii="Aptos" w:eastAsia="Aptos" w:hAnsi="Aptos" w:cs="Aptos"/>
-        </w:rPr>
-        <w:lastRenderedPageBreak/>
-        <w:t>is reused across several of the management forms, so where a later objective uses the same layout I will refer back to this description rather than repeating it.</w:t>
+        <w:t xml:space="preserve"> table.</w:t>
       </w:r>
     </w:p>
     <w:p>
@@ -798,7 +1594,7 @@
           <w:bCs/>
           <w:color w:val="000000"/>
         </w:rPr>
-        <w:t>Adding New Screenings (Objective 7)</w:t>
+        <w:t>Creating a Screen with Automatic Seat Generation (Objective 16)</w:t>
       </w:r>
     </w:p>
     <w:p>
@@ -809,35 +1605,63 @@
         <w:rPr>
           <w:rFonts w:ascii="Aptos" w:eastAsia="Aptos" w:hAnsi="Aptos" w:cs="Aptos"/>
         </w:rPr>
-        <w:t xml:space="preserve">Once films exist in the system the next job is to schedule when and where they will actually be shown, which is what this objective covers. It is handled by the form named </w:t>
+        <w:t xml:space="preserve">Before a screening can be booked the cinema needs its physical screens set up in the system, each with the right number of seats. This objective is handled by the form named </w:t>
       </w:r>
       <w:proofErr w:type="spellStart"/>
       <w:r>
         <w:rPr>
           <w:rFonts w:ascii="Aptos" w:eastAsia="Aptos" w:hAnsi="Aptos" w:cs="Aptos"/>
         </w:rPr>
-        <w:t>frmScreenings</w:t>
+        <w:t>frmScreens</w:t>
       </w:r>
       <w:proofErr w:type="spellEnd"/>
       <w:r>
         <w:rPr>
           <w:rFonts w:ascii="Aptos" w:eastAsia="Aptos" w:hAnsi="Aptos" w:cs="Aptos"/>
         </w:rPr>
-        <w:t xml:space="preserve">, and because it is another management form for adding, editing and removing records it follows exactly the same layout as the Add Films form described above, with a data grid view named </w:t>
+        <w:t xml:space="preserve">, which once again uses the same familiar management layout with a data grid view named </w:t>
       </w:r>
       <w:proofErr w:type="spellStart"/>
       <w:r>
         <w:rPr>
           <w:rFonts w:ascii="Aptos" w:eastAsia="Aptos" w:hAnsi="Aptos" w:cs="Aptos"/>
         </w:rPr>
-        <w:t>dgvScreenings</w:t>
+        <w:t>dgvScreens</w:t>
       </w:r>
       <w:proofErr w:type="spellEnd"/>
       <w:r>
         <w:rPr>
           <w:rFonts w:ascii="Aptos" w:eastAsia="Aptos" w:hAnsi="Aptos" w:cs="Aptos"/>
         </w:rPr>
-        <w:t xml:space="preserve"> listing the existing screenings on one side and a set of input controls with Add, Update, Delete and Clear buttons on the other. Rather than repeat the whole description I will refer back to the Add Films form for the general behaviour and just explain what is different here.</w:t>
+        <w:t xml:space="preserve"> listing the existing screens and a small set of inputs with Add, Update, Delete and Clear buttons, so I will refer back to the Add Films form for that general behaviour. There are only two inputs here, a text box named </w:t>
+      </w:r>
+      <w:proofErr w:type="spellStart"/>
+      <w:r>
+        <w:rPr>
+          <w:rFonts w:ascii="Aptos" w:eastAsia="Aptos" w:hAnsi="Aptos" w:cs="Aptos"/>
+        </w:rPr>
+        <w:t>txtName</w:t>
+      </w:r>
+      <w:proofErr w:type="spellEnd"/>
+      <w:r>
+        <w:rPr>
+          <w:rFonts w:ascii="Aptos" w:eastAsia="Aptos" w:hAnsi="Aptos" w:cs="Aptos"/>
+        </w:rPr>
+        <w:t xml:space="preserve"> for the name of the screen and a text box named </w:t>
+      </w:r>
+      <w:proofErr w:type="spellStart"/>
+      <w:r>
+        <w:rPr>
+          <w:rFonts w:ascii="Aptos" w:eastAsia="Aptos" w:hAnsi="Aptos" w:cs="Aptos"/>
+        </w:rPr>
+        <w:t>txtCapacity</w:t>
+      </w:r>
+      <w:proofErr w:type="spellEnd"/>
+      <w:r>
+        <w:rPr>
+          <w:rFonts w:ascii="Aptos" w:eastAsia="Aptos" w:hAnsi="Aptos" w:cs="Aptos"/>
+        </w:rPr>
+        <w:t xml:space="preserve"> for how many seats it has.</w:t>
       </w:r>
     </w:p>
     <w:p>
@@ -848,77 +1672,7 @@
         <w:rPr>
           <w:rFonts w:ascii="Aptos" w:eastAsia="Aptos" w:hAnsi="Aptos" w:cs="Aptos"/>
         </w:rPr>
-        <w:t xml:space="preserve">The difference is in the inputs. A screening has to be tied to a film that already exists and a screen that already exists, so instead of free text boxes for those two the form uses two combo boxes, named </w:t>
-      </w:r>
-      <w:proofErr w:type="spellStart"/>
-      <w:r>
-        <w:rPr>
-          <w:rFonts w:ascii="Aptos" w:eastAsia="Aptos" w:hAnsi="Aptos" w:cs="Aptos"/>
-        </w:rPr>
-        <w:t>cboFilm</w:t>
-      </w:r>
-      <w:proofErr w:type="spellEnd"/>
-      <w:r>
-        <w:rPr>
-          <w:rFonts w:ascii="Aptos" w:eastAsia="Aptos" w:hAnsi="Aptos" w:cs="Aptos"/>
-        </w:rPr>
-        <w:t xml:space="preserve"> and </w:t>
-      </w:r>
-      <w:proofErr w:type="spellStart"/>
-      <w:r>
-        <w:rPr>
-          <w:rFonts w:ascii="Aptos" w:eastAsia="Aptos" w:hAnsi="Aptos" w:cs="Aptos"/>
-        </w:rPr>
-        <w:t>cboScreen</w:t>
-      </w:r>
-      <w:proofErr w:type="spellEnd"/>
-      <w:r>
-        <w:rPr>
-          <w:rFonts w:ascii="Aptos" w:eastAsia="Aptos" w:hAnsi="Aptos" w:cs="Aptos"/>
-        </w:rPr>
-        <w:t xml:space="preserve">, which the user picks from. This is because a member of staff should not be able to type in a film or a screen that is not really there, and choosing from a list makes that impossible. The date is entered using a date picker named </w:t>
-      </w:r>
-      <w:proofErr w:type="spellStart"/>
-      <w:r>
-        <w:rPr>
-          <w:rFonts w:ascii="Aptos" w:eastAsia="Aptos" w:hAnsi="Aptos" w:cs="Aptos"/>
-        </w:rPr>
-        <w:t>dtpScreeningDate</w:t>
-      </w:r>
-      <w:proofErr w:type="spellEnd"/>
-      <w:r>
-        <w:rPr>
-          <w:rFonts w:ascii="Aptos" w:eastAsia="Aptos" w:hAnsi="Aptos" w:cs="Aptos"/>
-        </w:rPr>
-        <w:t xml:space="preserve"> rather than a text box, this is because a proper date picker stops the user entering something that is not a real date. The time and the ticket price are entered into text boxes named </w:t>
-      </w:r>
-      <w:proofErr w:type="spellStart"/>
-      <w:r>
-        <w:rPr>
-          <w:rFonts w:ascii="Aptos" w:eastAsia="Aptos" w:hAnsi="Aptos" w:cs="Aptos"/>
-        </w:rPr>
-        <w:t>txtScreeningTime</w:t>
-      </w:r>
-      <w:proofErr w:type="spellEnd"/>
-      <w:r>
-        <w:rPr>
-          <w:rFonts w:ascii="Aptos" w:eastAsia="Aptos" w:hAnsi="Aptos" w:cs="Aptos"/>
-        </w:rPr>
-        <w:t xml:space="preserve">, which is labelled Time in the format HH colon MM, and </w:t>
-      </w:r>
-      <w:proofErr w:type="spellStart"/>
-      <w:r>
-        <w:rPr>
-          <w:rFonts w:ascii="Aptos" w:eastAsia="Aptos" w:hAnsi="Aptos" w:cs="Aptos"/>
-        </w:rPr>
-        <w:t>txtTicketPrice</w:t>
-      </w:r>
-      <w:proofErr w:type="spellEnd"/>
-      <w:r>
-        <w:rPr>
-          <w:rFonts w:ascii="Aptos" w:eastAsia="Aptos" w:hAnsi="Aptos" w:cs="Aptos"/>
-        </w:rPr>
-        <w:t>.</w:t>
+        <w:t>The interesting part of this objective, and the reason it is worth documenting separately, is what happens behind the Add button. When the user enters a name and a capacity and presses Add, the system does not just save the screen, it then automatically generates that number of seat records for it. In other words if the manager types a capacity of sixty, the system creates sixty individual seats for that screen without the manager having to type a single one of them in by hand. This was a direct response to feedback during the discussion stage, where it was pointed out that setting up every seat manually would be a nightmare, so having the system do it automatically is far more sophisticated and removes any chance of human error. If a screen is later edited and its capacity changes, the old seats are cleared out and a fresh set is generated to match, and if a screen is deleted its seats are removed first.</w:t>
       </w:r>
     </w:p>
     <w:p>
@@ -941,7 +1695,7 @@
           <w:sz w:val="22"/>
           <w:szCs w:val="22"/>
         </w:rPr>
-        <w:t>Add Screenings Form (</w:t>
+        <w:t>Add Screens Form (</w:t>
       </w:r>
       <w:proofErr w:type="spellStart"/>
       <w:r>
@@ -953,7 +1707,7 @@
           <w:sz w:val="22"/>
           <w:szCs w:val="22"/>
         </w:rPr>
-        <w:t>frmScreenings</w:t>
+        <w:t>frmScreens</w:t>
       </w:r>
       <w:proofErr w:type="spellEnd"/>
       <w:r>
@@ -976,21 +1730,56 @@
         <w:rPr>
           <w:rFonts w:ascii="Aptos" w:eastAsia="Aptos" w:hAnsi="Aptos" w:cs="Aptos"/>
         </w:rPr>
-        <w:t xml:space="preserve">The inputs are therefore the chosen film, the chosen screen, the date, the time and the ticket price. The output is the updated list of screenings in the grid, along with the usual confirmation or warning message boxes. The processes behind the buttons are the same insert, update and delete operations as before, this time acting on the </w:t>
+        <w:t xml:space="preserve">The inputs are the screen name and the capacity. The outputs are the updated list of screens and, crucially, a full set of seat records created in the </w:t>
       </w:r>
       <w:proofErr w:type="spellStart"/>
       <w:r>
         <w:rPr>
           <w:rFonts w:ascii="Aptos" w:eastAsia="Aptos" w:hAnsi="Aptos" w:cs="Aptos"/>
         </w:rPr>
-        <w:t>tblScreening</w:t>
+        <w:t>tblSeat</w:t>
       </w:r>
       <w:proofErr w:type="spellEnd"/>
       <w:r>
         <w:rPr>
           <w:rFonts w:ascii="Aptos" w:eastAsia="Aptos" w:hAnsi="Aptos" w:cs="Aptos"/>
         </w:rPr>
-        <w:t xml:space="preserve"> table.</w:t>
+        <w:t xml:space="preserve"> table for the new screen. The process behind the Add button is therefore two steps, first inserting the screen into the </w:t>
+      </w:r>
+      <w:proofErr w:type="spellStart"/>
+      <w:r>
+        <w:rPr>
+          <w:rFonts w:ascii="Aptos" w:eastAsia="Aptos" w:hAnsi="Aptos" w:cs="Aptos"/>
+        </w:rPr>
+        <w:t>tblScreen</w:t>
+      </w:r>
+      <w:proofErr w:type="spellEnd"/>
+      <w:r>
+        <w:rPr>
+          <w:rFonts w:ascii="Aptos" w:eastAsia="Aptos" w:hAnsi="Aptos" w:cs="Aptos"/>
+        </w:rPr>
+        <w:t xml:space="preserve"> table and reading back the new screen's identifier, and then looping to </w:t>
+      </w:r>
+      <w:r>
+        <w:rPr>
+          <w:rFonts w:ascii="Aptos" w:eastAsia="Aptos" w:hAnsi="Aptos" w:cs="Aptos"/>
+        </w:rPr>
+        <w:lastRenderedPageBreak/>
+        <w:t xml:space="preserve">insert one seat record per seat into the </w:t>
+      </w:r>
+      <w:proofErr w:type="spellStart"/>
+      <w:r>
+        <w:rPr>
+          <w:rFonts w:ascii="Aptos" w:eastAsia="Aptos" w:hAnsi="Aptos" w:cs="Aptos"/>
+        </w:rPr>
+        <w:t>tblSeat</w:t>
+      </w:r>
+      <w:proofErr w:type="spellEnd"/>
+      <w:r>
+        <w:rPr>
+          <w:rFonts w:ascii="Aptos" w:eastAsia="Aptos" w:hAnsi="Aptos" w:cs="Aptos"/>
+        </w:rPr>
+        <w:t xml:space="preserve"> table so that the seats are ready for the booking form to use.</w:t>
       </w:r>
     </w:p>
     <w:p>
@@ -1005,7 +1794,7 @@
           <w:bCs/>
           <w:color w:val="000000"/>
         </w:rPr>
-        <w:t>Creating a Screen with Automatic Seat Generation (Objective 16)</w:t>
+        <w:t>Adding Customer Bookings and Preventing Double Bookings (Objectives 1 and 2)</w:t>
       </w:r>
     </w:p>
     <w:p>
@@ -1016,63 +1805,21 @@
         <w:rPr>
           <w:rFonts w:ascii="Aptos" w:eastAsia="Aptos" w:hAnsi="Aptos" w:cs="Aptos"/>
         </w:rPr>
-        <w:t xml:space="preserve">Before a screening can be booked the cinema needs its physical screens set up in the system, each with the right number of seats. This objective is handled by the form named </w:t>
+        <w:t xml:space="preserve">This is the heart of the whole system and the reason the project exists in the first place, so it is the most involved form to design. The objective is to let a member of staff create a booking for a customer against a particular screening, recording who the customer is, which seats they want and how many tickets that comes to, while making it impossible for a seat that has already been booked to be sold twice. Both of these objectives are handled together on the one form named </w:t>
       </w:r>
       <w:proofErr w:type="spellStart"/>
       <w:r>
         <w:rPr>
           <w:rFonts w:ascii="Aptos" w:eastAsia="Aptos" w:hAnsi="Aptos" w:cs="Aptos"/>
         </w:rPr>
-        <w:t>frmScreens</w:t>
+        <w:t>frmBookings</w:t>
       </w:r>
       <w:proofErr w:type="spellEnd"/>
       <w:r>
         <w:rPr>
           <w:rFonts w:ascii="Aptos" w:eastAsia="Aptos" w:hAnsi="Aptos" w:cs="Aptos"/>
         </w:rPr>
-        <w:t xml:space="preserve">, which once again uses the same familiar management layout with a data grid view named </w:t>
-      </w:r>
-      <w:proofErr w:type="spellStart"/>
-      <w:r>
-        <w:rPr>
-          <w:rFonts w:ascii="Aptos" w:eastAsia="Aptos" w:hAnsi="Aptos" w:cs="Aptos"/>
-        </w:rPr>
-        <w:t>dgvScreens</w:t>
-      </w:r>
-      <w:proofErr w:type="spellEnd"/>
-      <w:r>
-        <w:rPr>
-          <w:rFonts w:ascii="Aptos" w:eastAsia="Aptos" w:hAnsi="Aptos" w:cs="Aptos"/>
-        </w:rPr>
-        <w:t xml:space="preserve"> listing the existing screens and a small set of inputs with Add, Update, Delete and Clear buttons, so I will refer back to the Add Films form for that general behaviour. There are only two inputs here, a text box named </w:t>
-      </w:r>
-      <w:proofErr w:type="spellStart"/>
-      <w:r>
-        <w:rPr>
-          <w:rFonts w:ascii="Aptos" w:eastAsia="Aptos" w:hAnsi="Aptos" w:cs="Aptos"/>
-        </w:rPr>
-        <w:t>txtName</w:t>
-      </w:r>
-      <w:proofErr w:type="spellEnd"/>
-      <w:r>
-        <w:rPr>
-          <w:rFonts w:ascii="Aptos" w:eastAsia="Aptos" w:hAnsi="Aptos" w:cs="Aptos"/>
-        </w:rPr>
-        <w:t xml:space="preserve"> for the name of the screen and a text box named </w:t>
-      </w:r>
-      <w:proofErr w:type="spellStart"/>
-      <w:r>
-        <w:rPr>
-          <w:rFonts w:ascii="Aptos" w:eastAsia="Aptos" w:hAnsi="Aptos" w:cs="Aptos"/>
-        </w:rPr>
-        <w:t>txtCapacity</w:t>
-      </w:r>
-      <w:proofErr w:type="spellEnd"/>
-      <w:r>
-        <w:rPr>
-          <w:rFonts w:ascii="Aptos" w:eastAsia="Aptos" w:hAnsi="Aptos" w:cs="Aptos"/>
-        </w:rPr>
-        <w:t xml:space="preserve"> for how many seats it has.</w:t>
+        <w:t>, because in practice they are the same job.</w:t>
       </w:r>
     </w:p>
     <w:p>
@@ -1083,8 +1830,147 @@
         <w:rPr>
           <w:rFonts w:ascii="Aptos" w:eastAsia="Aptos" w:hAnsi="Aptos" w:cs="Aptos"/>
         </w:rPr>
-        <w:lastRenderedPageBreak/>
-        <w:t>The interesting part of this objective, and the reason it is worth documenting separately, is what happens behind the Add button. When the user enters a name and a capacity and presses Add, the system does not just save the screen, it then automatically generates that number of seat records for it. In other words if the manager types a capacity of sixty, the system creates sixty individual seats for that screen without the manager having to type a single one of them in by hand. This was a direct response to feedback during the discussion stage, where it was pointed out that setting up every seat manually would be a nightmare, so having the system do it automatically is far more sophisticated and removes any chance of human error. If a screen is later edited and its capacity changes, the old seats are cleared out and a fresh set is generated to match, and if a screen is deleted its seats are removed first.</w:t>
+        <w:t xml:space="preserve">The top of the form has two combo boxes, named </w:t>
+      </w:r>
+      <w:proofErr w:type="spellStart"/>
+      <w:r>
+        <w:rPr>
+          <w:rFonts w:ascii="Aptos" w:eastAsia="Aptos" w:hAnsi="Aptos" w:cs="Aptos"/>
+        </w:rPr>
+        <w:t>cboScreening</w:t>
+      </w:r>
+      <w:proofErr w:type="spellEnd"/>
+      <w:r>
+        <w:rPr>
+          <w:rFonts w:ascii="Aptos" w:eastAsia="Aptos" w:hAnsi="Aptos" w:cs="Aptos"/>
+        </w:rPr>
+        <w:t xml:space="preserve"> and </w:t>
+      </w:r>
+      <w:proofErr w:type="spellStart"/>
+      <w:r>
+        <w:rPr>
+          <w:rFonts w:ascii="Aptos" w:eastAsia="Aptos" w:hAnsi="Aptos" w:cs="Aptos"/>
+        </w:rPr>
+        <w:t>cboCustomer</w:t>
+      </w:r>
+      <w:proofErr w:type="spellEnd"/>
+      <w:r>
+        <w:rPr>
+          <w:rFonts w:ascii="Aptos" w:eastAsia="Aptos" w:hAnsi="Aptos" w:cs="Aptos"/>
+        </w:rPr>
+        <w:t xml:space="preserve">, where the member of staff first picks which screening the booking is for and then which customer it belongs to. There is also a check box named </w:t>
+      </w:r>
+      <w:proofErr w:type="spellStart"/>
+      <w:r>
+        <w:rPr>
+          <w:rFonts w:ascii="Aptos" w:eastAsia="Aptos" w:hAnsi="Aptos" w:cs="Aptos"/>
+        </w:rPr>
+        <w:t>chkWalkIn</w:t>
+      </w:r>
+      <w:proofErr w:type="spellEnd"/>
+      <w:r>
+        <w:rPr>
+          <w:rFonts w:ascii="Aptos" w:eastAsia="Aptos" w:hAnsi="Aptos" w:cs="Aptos"/>
+        </w:rPr>
+        <w:t xml:space="preserve"> labelled Walk-in, which lets staff take a booking for a customer who has just walked in without recording their details. The largest part of the form is a panel named </w:t>
+      </w:r>
+      <w:proofErr w:type="spellStart"/>
+      <w:r>
+        <w:rPr>
+          <w:rFonts w:ascii="Aptos" w:eastAsia="Aptos" w:hAnsi="Aptos" w:cs="Aptos"/>
+        </w:rPr>
+        <w:t>pnlSeatMap</w:t>
+      </w:r>
+      <w:proofErr w:type="spellEnd"/>
+      <w:r>
+        <w:rPr>
+          <w:rFonts w:ascii="Aptos" w:eastAsia="Aptos" w:hAnsi="Aptos" w:cs="Aptos"/>
+        </w:rPr>
+        <w:t xml:space="preserve"> which draws the seat map for the chosen screening, and next to it is a small legend made up of three coloured swatches labelled Available, Selected and Taken so the user knows what the colours mean. A label named </w:t>
+      </w:r>
+      <w:proofErr w:type="spellStart"/>
+      <w:r>
+        <w:rPr>
+          <w:rFonts w:ascii="Aptos" w:eastAsia="Aptos" w:hAnsi="Aptos" w:cs="Aptos"/>
+        </w:rPr>
+        <w:t>lblTotal</w:t>
+      </w:r>
+      <w:proofErr w:type="spellEnd"/>
+      <w:r>
+        <w:rPr>
+          <w:rFonts w:ascii="Aptos" w:eastAsia="Aptos" w:hAnsi="Aptos" w:cs="Aptos"/>
+        </w:rPr>
+        <w:t xml:space="preserve"> keeps a running count of how many seats have been selected, and along the bottom are the action buttons, Create Booking named </w:t>
+      </w:r>
+      <w:proofErr w:type="spellStart"/>
+      <w:r>
+        <w:rPr>
+          <w:rFonts w:ascii="Aptos" w:eastAsia="Aptos" w:hAnsi="Aptos" w:cs="Aptos"/>
+        </w:rPr>
+        <w:t>btnCreateBooking</w:t>
+      </w:r>
+      <w:proofErr w:type="spellEnd"/>
+      <w:r>
+        <w:rPr>
+          <w:rFonts w:ascii="Aptos" w:eastAsia="Aptos" w:hAnsi="Aptos" w:cs="Aptos"/>
+        </w:rPr>
+        <w:t xml:space="preserve">, Clear Selection named </w:t>
+      </w:r>
+      <w:proofErr w:type="spellStart"/>
+      <w:r>
+        <w:rPr>
+          <w:rFonts w:ascii="Aptos" w:eastAsia="Aptos" w:hAnsi="Aptos" w:cs="Aptos"/>
+        </w:rPr>
+        <w:t>btnClear</w:t>
+      </w:r>
+      <w:proofErr w:type="spellEnd"/>
+      <w:r>
+        <w:rPr>
+          <w:rFonts w:ascii="Aptos" w:eastAsia="Aptos" w:hAnsi="Aptos" w:cs="Aptos"/>
+        </w:rPr>
+        <w:t xml:space="preserve">, Order Food named </w:t>
+      </w:r>
+      <w:proofErr w:type="spellStart"/>
+      <w:r>
+        <w:rPr>
+          <w:rFonts w:ascii="Aptos" w:eastAsia="Aptos" w:hAnsi="Aptos" w:cs="Aptos"/>
+        </w:rPr>
+        <w:t>btnOrderFood</w:t>
+      </w:r>
+      <w:proofErr w:type="spellEnd"/>
+      <w:r>
+        <w:rPr>
+          <w:rFonts w:ascii="Aptos" w:eastAsia="Aptos" w:hAnsi="Aptos" w:cs="Aptos"/>
+        </w:rPr>
+        <w:t xml:space="preserve"> and Sell Food Only named </w:t>
+      </w:r>
+      <w:proofErr w:type="spellStart"/>
+      <w:r>
+        <w:rPr>
+          <w:rFonts w:ascii="Aptos" w:eastAsia="Aptos" w:hAnsi="Aptos" w:cs="Aptos"/>
+        </w:rPr>
+        <w:t>btnFoodOnly</w:t>
+      </w:r>
+      <w:proofErr w:type="spellEnd"/>
+      <w:r>
+        <w:rPr>
+          <w:rFonts w:ascii="Aptos" w:eastAsia="Aptos" w:hAnsi="Aptos" w:cs="Aptos"/>
+        </w:rPr>
+        <w:t xml:space="preserve">. A grid named </w:t>
+      </w:r>
+      <w:proofErr w:type="spellStart"/>
+      <w:r>
+        <w:rPr>
+          <w:rFonts w:ascii="Aptos" w:eastAsia="Aptos" w:hAnsi="Aptos" w:cs="Aptos"/>
+        </w:rPr>
+        <w:t>dgvCustomerBookings</w:t>
+      </w:r>
+      <w:proofErr w:type="spellEnd"/>
+      <w:r>
+        <w:rPr>
+          <w:rFonts w:ascii="Aptos" w:eastAsia="Aptos" w:hAnsi="Aptos" w:cs="Aptos"/>
+        </w:rPr>
+        <w:t xml:space="preserve"> shows the bookings the selected customer already has.</w:t>
       </w:r>
     </w:p>
     <w:p>
@@ -1107,7 +1993,7 @@
           <w:sz w:val="22"/>
           <w:szCs w:val="22"/>
         </w:rPr>
-        <w:t>Add Screens Form (</w:t>
+        <w:t>Bookings Form (</w:t>
       </w:r>
       <w:proofErr w:type="spellStart"/>
       <w:r>
@@ -1119,7 +2005,7 @@
           <w:sz w:val="22"/>
           <w:szCs w:val="22"/>
         </w:rPr>
-        <w:t>frmScreens</w:t>
+        <w:t>frmBookings</w:t>
       </w:r>
       <w:proofErr w:type="spellEnd"/>
       <w:r>
@@ -1142,49 +2028,81 @@
         <w:rPr>
           <w:rFonts w:ascii="Aptos" w:eastAsia="Aptos" w:hAnsi="Aptos" w:cs="Aptos"/>
         </w:rPr>
-        <w:t xml:space="preserve">The inputs are the screen name and the capacity. The outputs are the updated list of screens and, crucially, a full set of seat records created in the </w:t>
+        <w:t xml:space="preserve">The way the member of staff uses the form is that they choose a screening, choose a customer or tick the walk-in box, and the seat map then draws itself as a grid of clickable seat buttons laid out like the inside of the screen. Clicking an available seat selects it and it changes colour, and the running total updates as they go. When they are happy they press Create Booking. The inputs to the form are therefore the chosen screening, the chosen customer and the seats that are clicked. The outputs are the saved booking, a confirmation message, the refreshed seat map and the updated list of that customer's bookings. The processes behind the scenes are the insertion of a new record into the </w:t>
       </w:r>
       <w:proofErr w:type="spellStart"/>
       <w:r>
         <w:rPr>
           <w:rFonts w:ascii="Aptos" w:eastAsia="Aptos" w:hAnsi="Aptos" w:cs="Aptos"/>
         </w:rPr>
-        <w:t>tblSeat</w:t>
+        <w:t>tblBooking</w:t>
       </w:r>
       <w:proofErr w:type="spellEnd"/>
       <w:r>
         <w:rPr>
           <w:rFonts w:ascii="Aptos" w:eastAsia="Aptos" w:hAnsi="Aptos" w:cs="Aptos"/>
         </w:rPr>
-        <w:t xml:space="preserve"> table for the new screen. The process behind the Add button is therefore two steps, first inserting the screen into the </w:t>
+        <w:t xml:space="preserve"> table and the insertion of each chosen seat into the </w:t>
       </w:r>
       <w:proofErr w:type="spellStart"/>
       <w:r>
         <w:rPr>
           <w:rFonts w:ascii="Aptos" w:eastAsia="Aptos" w:hAnsi="Aptos" w:cs="Aptos"/>
         </w:rPr>
-        <w:t>tblScreen</w:t>
+        <w:t>tblBookingSeat</w:t>
       </w:r>
       <w:proofErr w:type="spellEnd"/>
       <w:r>
         <w:rPr>
           <w:rFonts w:ascii="Aptos" w:eastAsia="Aptos" w:hAnsi="Aptos" w:cs="Aptos"/>
         </w:rPr>
-        <w:t xml:space="preserve"> table and reading back the new screen's identifier, and then looping to insert one seat record per seat into the </w:t>
+        <w:t xml:space="preserve"> table.</w:t>
+      </w:r>
+    </w:p>
+    <w:p>
+      <w:pPr>
+        <w:spacing w:after="160" w:line="276" w:lineRule="auto"/>
+      </w:pPr>
+      <w:r>
+        <w:rPr>
+          <w:rFonts w:ascii="Aptos" w:eastAsia="Aptos" w:hAnsi="Aptos" w:cs="Aptos"/>
+        </w:rPr>
+        <w:t xml:space="preserve">Preventing double bookings, which is the whole point of Objective 2, is built directly into how the seat map is drawn. This is because when the map loads it asks the database which </w:t>
+      </w:r>
+      <w:r>
+        <w:rPr>
+          <w:rFonts w:ascii="Aptos" w:eastAsia="Aptos" w:hAnsi="Aptos" w:cs="Aptos"/>
+        </w:rPr>
+        <w:lastRenderedPageBreak/>
+        <w:t xml:space="preserve">seats have already been booked for that screening, by looking in the </w:t>
       </w:r>
       <w:proofErr w:type="spellStart"/>
       <w:r>
         <w:rPr>
           <w:rFonts w:ascii="Aptos" w:eastAsia="Aptos" w:hAnsi="Aptos" w:cs="Aptos"/>
         </w:rPr>
-        <w:t>tblSeat</w:t>
+        <w:t>tblBookingSeat</w:t>
       </w:r>
       <w:proofErr w:type="spellEnd"/>
       <w:r>
         <w:rPr>
           <w:rFonts w:ascii="Aptos" w:eastAsia="Aptos" w:hAnsi="Aptos" w:cs="Aptos"/>
         </w:rPr>
-        <w:t xml:space="preserve"> table so that the seats are ready for the booking form to use.</w:t>
+        <w:t xml:space="preserve"> table joined to the </w:t>
+      </w:r>
+      <w:proofErr w:type="spellStart"/>
+      <w:r>
+        <w:rPr>
+          <w:rFonts w:ascii="Aptos" w:eastAsia="Aptos" w:hAnsi="Aptos" w:cs="Aptos"/>
+        </w:rPr>
+        <w:t>tblBooking</w:t>
+      </w:r>
+      <w:proofErr w:type="spellEnd"/>
+      <w:r>
+        <w:rPr>
+          <w:rFonts w:ascii="Aptos" w:eastAsia="Aptos" w:hAnsi="Aptos" w:cs="Aptos"/>
+        </w:rPr>
+        <w:t xml:space="preserve"> table, and any seat that comes back as already taken is coloured with the Taken colour and, more importantly, is disabled so that it physically cannot be clicked. On top of that, as a second line of defence, when Create Booking is pressed the system checks once more that none of the selected seats have been taken by someone else in the meantime before it saves anything. In this way a seat can never be sold twice, both because a taken seat cannot be selected in the first place and because it is checked again at the moment of saving. I chose a clickable graphical seat map rather than, for example, asking staff to type in seat numbers, this is because it lets them see the whole screen at a glance and makes double booking obvious and impossible in a way that a list of numbers never could.</w:t>
       </w:r>
     </w:p>
     <w:p>
@@ -1199,7 +2117,7 @@
           <w:bCs/>
           <w:color w:val="000000"/>
         </w:rPr>
-        <w:t>Adding Customer Bookings and Preventing Double Bookings (Objectives 1 and 2)</w:t>
+        <w:t>Displaying the Graphical Seat Map (Objective 3)</w:t>
       </w:r>
     </w:p>
     <w:p>
@@ -1210,7 +2128,7 @@
         <w:rPr>
           <w:rFonts w:ascii="Aptos" w:eastAsia="Aptos" w:hAnsi="Aptos" w:cs="Aptos"/>
         </w:rPr>
-        <w:t xml:space="preserve">This is the heart of the whole system and the reason the project exists in the first place, so it is the most involved form to design. The objective is to let a member of staff create a booking for a customer against a particular screening, recording who the customer is, which seats they want and how many tickets that comes to, while making it impossible for a seat that has already been booked to be sold twice. Both of these objectives are handled together on the one form named </w:t>
+        <w:t xml:space="preserve">This objective is really a closer look at the seat map that has just been described on the booking form, so rather than design a separate screen for it I will refer back to the </w:t>
       </w:r>
       <w:proofErr w:type="spellStart"/>
       <w:r>
@@ -1224,7 +2142,21 @@
         <w:rPr>
           <w:rFonts w:ascii="Aptos" w:eastAsia="Aptos" w:hAnsi="Aptos" w:cs="Aptos"/>
         </w:rPr>
-        <w:t>, because in practice they are the same job.</w:t>
+        <w:t xml:space="preserve"> form above. The seat map is the panel named </w:t>
+      </w:r>
+      <w:proofErr w:type="spellStart"/>
+      <w:r>
+        <w:rPr>
+          <w:rFonts w:ascii="Aptos" w:eastAsia="Aptos" w:hAnsi="Aptos" w:cs="Aptos"/>
+        </w:rPr>
+        <w:t>pnlSeatMap</w:t>
+      </w:r>
+      <w:proofErr w:type="spellEnd"/>
+      <w:r>
+        <w:rPr>
+          <w:rFonts w:ascii="Aptos" w:eastAsia="Aptos" w:hAnsi="Aptos" w:cs="Aptos"/>
+        </w:rPr>
+        <w:t>, and its job is to show, for a chosen screening, exactly which seats are free and which are already booked. It does this by drawing one button for every seat in the chosen screen, arranged in rows so that it looks like the layout of a real cinema, with a label above reading SCREEN so the user can tell which way round they are looking.</w:t>
       </w:r>
     </w:p>
     <w:p>
@@ -1235,69 +2167,155 @@
         <w:rPr>
           <w:rFonts w:ascii="Aptos" w:eastAsia="Aptos" w:hAnsi="Aptos" w:cs="Aptos"/>
         </w:rPr>
-        <w:t xml:space="preserve">The top of the form has two combo boxes, named </w:t>
+        <w:t>Every seat button is shown in one of three colours, and this is the output the user cares about. An available seat is shown in the Available colour and can be clicked, a seat the user has just clicked is shown in the Selected colour, and a seat that has already been booked by someone else is shown in the Taken colour and cannot be clicked at all. The small legend of coloured swatches next to the map explains which colour means what. The only input to the seat map is the clicks the user makes on the available seats, and behind the scenes the colours are worked out by comparing the full list of seats for the screen against the list of seats already booked for that screening. I have kept the fine detail of the exact colours to be settled in section 5.2, but the important design decision here is the three state system of available, selected and taken, because it is what makes the availability instantly readable.</w:t>
+      </w:r>
+    </w:p>
+    <w:p>
+      <w:pPr>
+        <w:pStyle w:val="Heading3"/>
+        <w:spacing w:before="260" w:after="120"/>
+      </w:pPr>
+      <w:r>
+        <w:rPr>
+          <w:rFonts w:ascii="Aptos Display" w:eastAsia="Aptos Display" w:hAnsi="Aptos Display" w:cs="Aptos Display"/>
+          <w:b/>
+          <w:bCs/>
+          <w:color w:val="000000"/>
+        </w:rPr>
+        <w:t>Adding Food and Drink to an Order (Objective 5)</w:t>
+      </w:r>
+    </w:p>
+    <w:p>
+      <w:pPr>
+        <w:spacing w:after="160" w:line="276" w:lineRule="auto"/>
+      </w:pPr>
+      <w:r>
+        <w:rPr>
+          <w:rFonts w:ascii="Aptos" w:eastAsia="Aptos" w:hAnsi="Aptos" w:cs="Aptos"/>
+        </w:rPr>
+        <w:t xml:space="preserve">One of the main aims of </w:t>
       </w:r>
       <w:proofErr w:type="spellStart"/>
       <w:r>
         <w:rPr>
           <w:rFonts w:ascii="Aptos" w:eastAsia="Aptos" w:hAnsi="Aptos" w:cs="Aptos"/>
         </w:rPr>
-        <w:t>cboScreening</w:t>
+        <w:t>Filmtopia</w:t>
       </w:r>
       <w:proofErr w:type="spellEnd"/>
       <w:r>
         <w:rPr>
           <w:rFonts w:ascii="Aptos" w:eastAsia="Aptos" w:hAnsi="Aptos" w:cs="Aptos"/>
         </w:rPr>
-        <w:t xml:space="preserve"> and </w:t>
+        <w:t xml:space="preserve"> was that a customer should be able to add food and drink onto their ticket booking in the same visit, so that it feels like one joined-up transaction rather than two separate ones. This objective is handled by the form named </w:t>
       </w:r>
       <w:proofErr w:type="spellStart"/>
       <w:r>
         <w:rPr>
           <w:rFonts w:ascii="Aptos" w:eastAsia="Aptos" w:hAnsi="Aptos" w:cs="Aptos"/>
         </w:rPr>
-        <w:t>cboCustomer</w:t>
+        <w:t>frmFoodOrder</w:t>
       </w:r>
       <w:proofErr w:type="spellEnd"/>
       <w:r>
         <w:rPr>
           <w:rFonts w:ascii="Aptos" w:eastAsia="Aptos" w:hAnsi="Aptos" w:cs="Aptos"/>
         </w:rPr>
-        <w:t xml:space="preserve">, where the member of staff first picks which screening the booking is for and then which customer it belongs to. There is also a check box named </w:t>
+        <w:t xml:space="preserve">, which is opened straight from the booking form by pressing the Order Food </w:t>
+      </w:r>
+      <w:r>
+        <w:rPr>
+          <w:rFonts w:ascii="Aptos" w:eastAsia="Aptos" w:hAnsi="Aptos" w:cs="Aptos"/>
+        </w:rPr>
+        <w:lastRenderedPageBreak/>
+        <w:t>button once a booking has been made, or by pressing Sell Food Only if the customer only wants snacks and no seat. Opening it directly from the booking is a deliberate design choice, this is because it keeps the whole thing as a single flowing process for the member of staff.</w:t>
+      </w:r>
+    </w:p>
+    <w:p>
+      <w:pPr>
+        <w:spacing w:after="160" w:line="276" w:lineRule="auto"/>
+      </w:pPr>
+      <w:r>
+        <w:rPr>
+          <w:rFonts w:ascii="Aptos" w:eastAsia="Aptos" w:hAnsi="Aptos" w:cs="Aptos"/>
+        </w:rPr>
+        <w:t xml:space="preserve">At the top of the form a label named </w:t>
       </w:r>
       <w:proofErr w:type="spellStart"/>
       <w:r>
         <w:rPr>
           <w:rFonts w:ascii="Aptos" w:eastAsia="Aptos" w:hAnsi="Aptos" w:cs="Aptos"/>
         </w:rPr>
-        <w:t>chkWalkIn</w:t>
+        <w:t>lblBookingInfo</w:t>
       </w:r>
       <w:proofErr w:type="spellEnd"/>
       <w:r>
         <w:rPr>
           <w:rFonts w:ascii="Aptos" w:eastAsia="Aptos" w:hAnsi="Aptos" w:cs="Aptos"/>
         </w:rPr>
-        <w:t xml:space="preserve"> labelled Walk-in, which lets staff take a booking for a customer who has just walked in without recording their details. The largest part of the form is a panel named </w:t>
+        <w:t xml:space="preserve"> shows which booking the food is being added to, so there is no confusion about whose order it is. Below that is a combo box named </w:t>
       </w:r>
       <w:proofErr w:type="spellStart"/>
       <w:r>
         <w:rPr>
           <w:rFonts w:ascii="Aptos" w:eastAsia="Aptos" w:hAnsi="Aptos" w:cs="Aptos"/>
         </w:rPr>
-        <w:t>pnlSeatMap</w:t>
+        <w:t>cboFoodItem</w:t>
       </w:r>
       <w:proofErr w:type="spellEnd"/>
       <w:r>
         <w:rPr>
           <w:rFonts w:ascii="Aptos" w:eastAsia="Aptos" w:hAnsi="Aptos" w:cs="Aptos"/>
         </w:rPr>
-        <w:t xml:space="preserve"> which draws the seat map for the chosen screening, and next to it is a small legend made up of three coloured swatches labelled Available, Selected and Taken so the user knows what the colours mean. A label named </w:t>
+        <w:t xml:space="preserve"> where the user picks a food or drink item from the list the cinema sells, a label named </w:t>
       </w:r>
       <w:proofErr w:type="spellStart"/>
       <w:r>
         <w:rPr>
           <w:rFonts w:ascii="Aptos" w:eastAsia="Aptos" w:hAnsi="Aptos" w:cs="Aptos"/>
         </w:rPr>
+        <w:t>lblPrice</w:t>
+      </w:r>
+      <w:proofErr w:type="spellEnd"/>
+      <w:r>
+        <w:rPr>
+          <w:rFonts w:ascii="Aptos" w:eastAsia="Aptos" w:hAnsi="Aptos" w:cs="Aptos"/>
+        </w:rPr>
+        <w:t xml:space="preserve"> which shows the price of the chosen item, and a text box named </w:t>
+      </w:r>
+      <w:proofErr w:type="spellStart"/>
+      <w:r>
+        <w:rPr>
+          <w:rFonts w:ascii="Aptos" w:eastAsia="Aptos" w:hAnsi="Aptos" w:cs="Aptos"/>
+        </w:rPr>
+        <w:t>txtQuantity</w:t>
+      </w:r>
+      <w:proofErr w:type="spellEnd"/>
+      <w:r>
+        <w:rPr>
+          <w:rFonts w:ascii="Aptos" w:eastAsia="Aptos" w:hAnsi="Aptos" w:cs="Aptos"/>
+        </w:rPr>
+        <w:t xml:space="preserve"> for how many they want, which sensibly defaults to one. A grid named </w:t>
+      </w:r>
+      <w:proofErr w:type="spellStart"/>
+      <w:r>
+        <w:rPr>
+          <w:rFonts w:ascii="Aptos" w:eastAsia="Aptos" w:hAnsi="Aptos" w:cs="Aptos"/>
+        </w:rPr>
+        <w:t>dgvOrderItems</w:t>
+      </w:r>
+      <w:proofErr w:type="spellEnd"/>
+      <w:r>
+        <w:rPr>
+          <w:rFonts w:ascii="Aptos" w:eastAsia="Aptos" w:hAnsi="Aptos" w:cs="Aptos"/>
+        </w:rPr>
+        <w:t xml:space="preserve"> builds up the list of items that have been added to the order, and a label named </w:t>
+      </w:r>
+      <w:proofErr w:type="spellStart"/>
+      <w:r>
+        <w:rPr>
+          <w:rFonts w:ascii="Aptos" w:eastAsia="Aptos" w:hAnsi="Aptos" w:cs="Aptos"/>
+        </w:rPr>
         <w:t>lblTotal</w:t>
       </w:r>
       <w:proofErr w:type="spellEnd"/>
@@ -1305,84 +2323,49 @@
         <w:rPr>
           <w:rFonts w:ascii="Aptos" w:eastAsia="Aptos" w:hAnsi="Aptos" w:cs="Aptos"/>
         </w:rPr>
-        <w:t xml:space="preserve"> keeps a running count of how many seats have been selected, and along </w:t>
-      </w:r>
-      <w:r>
-        <w:rPr>
-          <w:rFonts w:ascii="Aptos" w:eastAsia="Aptos" w:hAnsi="Aptos" w:cs="Aptos"/>
-        </w:rPr>
-        <w:lastRenderedPageBreak/>
-        <w:t xml:space="preserve">the bottom are the action buttons, Create Booking named </w:t>
+        <w:t xml:space="preserve"> keeps a running total of the cost. The buttons are Add To Order named </w:t>
       </w:r>
       <w:proofErr w:type="spellStart"/>
       <w:r>
         <w:rPr>
           <w:rFonts w:ascii="Aptos" w:eastAsia="Aptos" w:hAnsi="Aptos" w:cs="Aptos"/>
         </w:rPr>
-        <w:t>btnCreateBooking</w:t>
+        <w:t>btnAddItem</w:t>
       </w:r>
       <w:proofErr w:type="spellEnd"/>
       <w:r>
         <w:rPr>
           <w:rFonts w:ascii="Aptos" w:eastAsia="Aptos" w:hAnsi="Aptos" w:cs="Aptos"/>
         </w:rPr>
-        <w:t xml:space="preserve">, Clear Selection named </w:t>
+        <w:t xml:space="preserve">, Remove Selected named </w:t>
       </w:r>
       <w:proofErr w:type="spellStart"/>
       <w:r>
         <w:rPr>
           <w:rFonts w:ascii="Aptos" w:eastAsia="Aptos" w:hAnsi="Aptos" w:cs="Aptos"/>
         </w:rPr>
-        <w:t>btnClear</w:t>
+        <w:t>btnRemoveItem</w:t>
       </w:r>
       <w:proofErr w:type="spellEnd"/>
       <w:r>
         <w:rPr>
           <w:rFonts w:ascii="Aptos" w:eastAsia="Aptos" w:hAnsi="Aptos" w:cs="Aptos"/>
         </w:rPr>
-        <w:t xml:space="preserve">, Order Food named </w:t>
+        <w:t xml:space="preserve">, and Close named </w:t>
       </w:r>
       <w:proofErr w:type="spellStart"/>
       <w:r>
         <w:rPr>
           <w:rFonts w:ascii="Aptos" w:eastAsia="Aptos" w:hAnsi="Aptos" w:cs="Aptos"/>
         </w:rPr>
-        <w:t>btnOrderFood</w:t>
+        <w:t>btnClose</w:t>
       </w:r>
       <w:proofErr w:type="spellEnd"/>
       <w:r>
         <w:rPr>
           <w:rFonts w:ascii="Aptos" w:eastAsia="Aptos" w:hAnsi="Aptos" w:cs="Aptos"/>
         </w:rPr>
-        <w:t xml:space="preserve"> and Sell Food Only named </w:t>
-      </w:r>
-      <w:proofErr w:type="spellStart"/>
-      <w:r>
-        <w:rPr>
-          <w:rFonts w:ascii="Aptos" w:eastAsia="Aptos" w:hAnsi="Aptos" w:cs="Aptos"/>
-        </w:rPr>
-        <w:t>btnFoodOnly</w:t>
-      </w:r>
-      <w:proofErr w:type="spellEnd"/>
-      <w:r>
-        <w:rPr>
-          <w:rFonts w:ascii="Aptos" w:eastAsia="Aptos" w:hAnsi="Aptos" w:cs="Aptos"/>
-        </w:rPr>
-        <w:t xml:space="preserve">. A grid named </w:t>
-      </w:r>
-      <w:proofErr w:type="spellStart"/>
-      <w:r>
-        <w:rPr>
-          <w:rFonts w:ascii="Aptos" w:eastAsia="Aptos" w:hAnsi="Aptos" w:cs="Aptos"/>
-        </w:rPr>
-        <w:t>dgvCustomerBookings</w:t>
-      </w:r>
-      <w:proofErr w:type="spellEnd"/>
-      <w:r>
-        <w:rPr>
-          <w:rFonts w:ascii="Aptos" w:eastAsia="Aptos" w:hAnsi="Aptos" w:cs="Aptos"/>
-        </w:rPr>
-        <w:t xml:space="preserve"> shows the bookings the selected customer already has.</w:t>
+        <w:t>.</w:t>
       </w:r>
     </w:p>
     <w:p>
@@ -1405,7 +2388,7 @@
           <w:sz w:val="22"/>
           <w:szCs w:val="22"/>
         </w:rPr>
-        <w:t>Bookings Form (</w:t>
+        <w:t>Food Order Form (</w:t>
       </w:r>
       <w:proofErr w:type="spellStart"/>
       <w:r>
@@ -1417,7 +2400,7 @@
           <w:sz w:val="22"/>
           <w:szCs w:val="22"/>
         </w:rPr>
-        <w:t>frmBookings</w:t>
+        <w:t>frmFoodOrder</w:t>
       </w:r>
       <w:proofErr w:type="spellEnd"/>
       <w:r>
@@ -1440,74 +2423,21 @@
         <w:rPr>
           <w:rFonts w:ascii="Aptos" w:eastAsia="Aptos" w:hAnsi="Aptos" w:cs="Aptos"/>
         </w:rPr>
-        <w:t xml:space="preserve">The way the member of staff uses the form is that they choose a screening, choose a customer or tick the walk-in box, and the seat map then draws itself as a grid of clickable seat buttons laid out like the inside of the screen. Clicking an available seat selects it and it changes colour, and the running total updates as they go. When they are happy they press Create Booking. The inputs to the form are therefore the chosen screening, the chosen customer and the seats that are clicked. The outputs are the saved booking, a confirmation message, the refreshed seat map and the updated list of that customer's bookings. The processes behind the scenes are the insertion of a new record into the </w:t>
+        <w:t xml:space="preserve">The inputs to this form are the food item chosen and the quantity. The outputs are the growing list of items in the grid, the updated running total, and the items being saved against the booking. The process behind the Add To Order button is to insert the chosen item and quantity into the </w:t>
       </w:r>
       <w:proofErr w:type="spellStart"/>
       <w:r>
         <w:rPr>
           <w:rFonts w:ascii="Aptos" w:eastAsia="Aptos" w:hAnsi="Aptos" w:cs="Aptos"/>
         </w:rPr>
-        <w:t>tblBooking</w:t>
+        <w:t>tblOrderItem</w:t>
       </w:r>
       <w:proofErr w:type="spellEnd"/>
       <w:r>
         <w:rPr>
           <w:rFonts w:ascii="Aptos" w:eastAsia="Aptos" w:hAnsi="Aptos" w:cs="Aptos"/>
         </w:rPr>
-        <w:t xml:space="preserve"> table and the insertion of each chosen seat into the </w:t>
-      </w:r>
-      <w:proofErr w:type="spellStart"/>
-      <w:r>
-        <w:rPr>
-          <w:rFonts w:ascii="Aptos" w:eastAsia="Aptos" w:hAnsi="Aptos" w:cs="Aptos"/>
-        </w:rPr>
-        <w:t>tblBookingSeat</w:t>
-      </w:r>
-      <w:proofErr w:type="spellEnd"/>
-      <w:r>
-        <w:rPr>
-          <w:rFonts w:ascii="Aptos" w:eastAsia="Aptos" w:hAnsi="Aptos" w:cs="Aptos"/>
-        </w:rPr>
-        <w:t xml:space="preserve"> table.</w:t>
-      </w:r>
-    </w:p>
-    <w:p>
-      <w:pPr>
-        <w:spacing w:after="160" w:line="276" w:lineRule="auto"/>
-      </w:pPr>
-      <w:r>
-        <w:rPr>
-          <w:rFonts w:ascii="Aptos" w:eastAsia="Aptos" w:hAnsi="Aptos" w:cs="Aptos"/>
-        </w:rPr>
-        <w:t xml:space="preserve">Preventing double bookings, which is the whole point of Objective 2, is built directly into how the seat map is drawn. This is because when the map loads it asks the database which seats have already been booked for that screening, by looking in the </w:t>
-      </w:r>
-      <w:proofErr w:type="spellStart"/>
-      <w:r>
-        <w:rPr>
-          <w:rFonts w:ascii="Aptos" w:eastAsia="Aptos" w:hAnsi="Aptos" w:cs="Aptos"/>
-        </w:rPr>
-        <w:t>tblBookingSeat</w:t>
-      </w:r>
-      <w:proofErr w:type="spellEnd"/>
-      <w:r>
-        <w:rPr>
-          <w:rFonts w:ascii="Aptos" w:eastAsia="Aptos" w:hAnsi="Aptos" w:cs="Aptos"/>
-        </w:rPr>
-        <w:t xml:space="preserve"> table joined to the </w:t>
-      </w:r>
-      <w:proofErr w:type="spellStart"/>
-      <w:r>
-        <w:rPr>
-          <w:rFonts w:ascii="Aptos" w:eastAsia="Aptos" w:hAnsi="Aptos" w:cs="Aptos"/>
-        </w:rPr>
-        <w:t>tblBooking</w:t>
-      </w:r>
-      <w:proofErr w:type="spellEnd"/>
-      <w:r>
-        <w:rPr>
-          <w:rFonts w:ascii="Aptos" w:eastAsia="Aptos" w:hAnsi="Aptos" w:cs="Aptos"/>
-        </w:rPr>
-        <w:t xml:space="preserve"> table, and any seat that comes back as already taken is coloured with the Taken colour and, more importantly, is disabled so that it physically cannot be clicked. On top of that, as a second line of defence, when Create Booking is pressed the system checks once more that none of the selected seats have been taken by someone else in the meantime before it saves anything. In this way a seat can never be sold twice, both because a taken seat cannot be selected in the first place and because it is checked again at the moment of saving. I chose a clickable graphical seat map rather than, for example, asking staff to type in seat numbers, this is because it lets them see the whole screen at a glance and makes double booking obvious and impossible in a way that a list of numbers never could.</w:t>
+        <w:t xml:space="preserve"> table linked to the booking, and then to recalculate and display the new total. I chose a combo box for the items rather than a text box because the food menu is a fixed list, so picking from it is both faster and stops the user entering something the cinema does not sell, and defaulting the quantity to one saves the most common case of a single item being typed every time.</w:t>
       </w:r>
     </w:p>
     <w:p>
@@ -1522,7 +2452,7 @@
           <w:bCs/>
           <w:color w:val="000000"/>
         </w:rPr>
-        <w:t>Displaying the Graphical Seat Map (Objective 3)</w:t>
+        <w:t>Searching for a Booking (Objective 11)</w:t>
       </w:r>
     </w:p>
     <w:p>
@@ -1533,238 +2463,77 @@
         <w:rPr>
           <w:rFonts w:ascii="Aptos" w:eastAsia="Aptos" w:hAnsi="Aptos" w:cs="Aptos"/>
         </w:rPr>
-        <w:t xml:space="preserve">This objective is really a closer look at the seat map that has just been described on the booking form, so rather than design a separate screen for it I will refer back to the </w:t>
+        <w:t xml:space="preserve">Staff often need to find a booking again after it has been made, for example if a customer rings up about it, so this objective provides a way to search for one. It is handled by the form named </w:t>
       </w:r>
       <w:proofErr w:type="spellStart"/>
       <w:r>
         <w:rPr>
           <w:rFonts w:ascii="Aptos" w:eastAsia="Aptos" w:hAnsi="Aptos" w:cs="Aptos"/>
         </w:rPr>
-        <w:t>frmBookings</w:t>
+        <w:t>frmBookingSearch</w:t>
       </w:r>
       <w:proofErr w:type="spellEnd"/>
       <w:r>
         <w:rPr>
           <w:rFonts w:ascii="Aptos" w:eastAsia="Aptos" w:hAnsi="Aptos" w:cs="Aptos"/>
         </w:rPr>
-        <w:t xml:space="preserve"> form above. The seat map is the panel named </w:t>
+        <w:t xml:space="preserve">, which is reached from the Find Booking button on the main menu. This same form also handles cancelling a booking and viewing the screening register, which are the next two objectives, because they all naturally belong together in one place. For the search itself the form has a text box named </w:t>
       </w:r>
       <w:proofErr w:type="spellStart"/>
       <w:r>
         <w:rPr>
           <w:rFonts w:ascii="Aptos" w:eastAsia="Aptos" w:hAnsi="Aptos" w:cs="Aptos"/>
         </w:rPr>
-        <w:t>pnlSeatMap</w:t>
+        <w:t>txtSearch</w:t>
       </w:r>
       <w:proofErr w:type="spellEnd"/>
       <w:r>
         <w:rPr>
           <w:rFonts w:ascii="Aptos" w:eastAsia="Aptos" w:hAnsi="Aptos" w:cs="Aptos"/>
         </w:rPr>
-        <w:t>, and its job is to show, for a chosen screening, exactly which seats are free and which are already booked. It does this by drawing one button for every seat in the chosen screen, arranged in rows so that it looks like the layout of a real cinema, with a label above reading SCREEN so the user can tell which way round they are looking.</w:t>
-      </w:r>
-    </w:p>
-    <w:p>
-      <w:pPr>
-        <w:spacing w:after="160" w:line="276" w:lineRule="auto"/>
-      </w:pPr>
-      <w:r>
-        <w:rPr>
-          <w:rFonts w:ascii="Aptos" w:eastAsia="Aptos" w:hAnsi="Aptos" w:cs="Aptos"/>
-        </w:rPr>
-        <w:lastRenderedPageBreak/>
-        <w:t>Every seat button is shown in one of three colours, and this is the output the user cares about. An available seat is shown in the Available colour and can be clicked, a seat the user has just clicked is shown in the Selected colour, and a seat that has already been booked by someone else is shown in the Taken colour and cannot be clicked at all. The small legend of coloured swatches next to the map explains which colour means what. The only input to the seat map is the clicks the user makes on the available seats, and behind the scenes the colours are worked out by comparing the full list of seats for the screen against the list of seats already booked for that screening. I have kept the fine detail of the exact colours to be settled in section 5.2, but the important design decision here is the three state system of available, selected and taken, because it is what makes the availability instantly readable.</w:t>
-      </w:r>
-    </w:p>
-    <w:p>
-      <w:pPr>
-        <w:pStyle w:val="Heading3"/>
-        <w:spacing w:before="260" w:after="120"/>
-      </w:pPr>
-      <w:r>
-        <w:rPr>
-          <w:rFonts w:ascii="Aptos Display" w:eastAsia="Aptos Display" w:hAnsi="Aptos Display" w:cs="Aptos Display"/>
-          <w:b/>
-          <w:bCs/>
-          <w:color w:val="000000"/>
-        </w:rPr>
-        <w:t>Adding Food and Drink to an Order (Objective 5)</w:t>
-      </w:r>
-    </w:p>
-    <w:p>
-      <w:pPr>
-        <w:spacing w:after="160" w:line="276" w:lineRule="auto"/>
-      </w:pPr>
-      <w:r>
-        <w:rPr>
-          <w:rFonts w:ascii="Aptos" w:eastAsia="Aptos" w:hAnsi="Aptos" w:cs="Aptos"/>
-        </w:rPr>
-        <w:t xml:space="preserve">One of the main aims of </w:t>
+        <w:t xml:space="preserve">, labelled Booking ID or Customer Name, a Search button named </w:t>
       </w:r>
       <w:proofErr w:type="spellStart"/>
       <w:r>
         <w:rPr>
           <w:rFonts w:ascii="Aptos" w:eastAsia="Aptos" w:hAnsi="Aptos" w:cs="Aptos"/>
         </w:rPr>
-        <w:t>Filmtopia</w:t>
+        <w:t>btnSearch</w:t>
       </w:r>
       <w:proofErr w:type="spellEnd"/>
       <w:r>
         <w:rPr>
           <w:rFonts w:ascii="Aptos" w:eastAsia="Aptos" w:hAnsi="Aptos" w:cs="Aptos"/>
         </w:rPr>
-        <w:t xml:space="preserve"> was that a customer should be able to add food and drink onto their ticket booking in the same visit, so that it feels like one joined-up transaction rather than two separate ones. This objective is handled by the form named </w:t>
+        <w:t xml:space="preserve">, a Show All button named </w:t>
       </w:r>
       <w:proofErr w:type="spellStart"/>
       <w:r>
         <w:rPr>
           <w:rFonts w:ascii="Aptos" w:eastAsia="Aptos" w:hAnsi="Aptos" w:cs="Aptos"/>
         </w:rPr>
-        <w:t>frmFoodOrder</w:t>
+        <w:t>btnShowAll</w:t>
       </w:r>
       <w:proofErr w:type="spellEnd"/>
       <w:r>
         <w:rPr>
           <w:rFonts w:ascii="Aptos" w:eastAsia="Aptos" w:hAnsi="Aptos" w:cs="Aptos"/>
         </w:rPr>
-        <w:t>, which is opened straight from the booking form by pressing the Order Food button once a booking has been made, or by pressing Sell Food Only if the customer only wants snacks and no seat. Opening it directly from the booking is a deliberate design choice, this is because it keeps the whole thing as a single flowing process for the member of staff.</w:t>
-      </w:r>
-    </w:p>
-    <w:p>
-      <w:pPr>
-        <w:spacing w:after="160" w:line="276" w:lineRule="auto"/>
-      </w:pPr>
-      <w:r>
-        <w:rPr>
-          <w:rFonts w:ascii="Aptos" w:eastAsia="Aptos" w:hAnsi="Aptos" w:cs="Aptos"/>
-        </w:rPr>
-        <w:t xml:space="preserve">At the top of the form a label named </w:t>
+        <w:t xml:space="preserve">, and a grid named </w:t>
       </w:r>
       <w:proofErr w:type="spellStart"/>
       <w:r>
         <w:rPr>
           <w:rFonts w:ascii="Aptos" w:eastAsia="Aptos" w:hAnsi="Aptos" w:cs="Aptos"/>
         </w:rPr>
-        <w:t>lblBookingInfo</w:t>
+        <w:t>dgvBookings</w:t>
       </w:r>
       <w:proofErr w:type="spellEnd"/>
       <w:r>
         <w:rPr>
           <w:rFonts w:ascii="Aptos" w:eastAsia="Aptos" w:hAnsi="Aptos" w:cs="Aptos"/>
         </w:rPr>
-        <w:t xml:space="preserve"> shows which booking the food is being added to, so there is no confusion about whose order it is. Below that is a combo box named </w:t>
-      </w:r>
-      <w:proofErr w:type="spellStart"/>
-      <w:r>
-        <w:rPr>
-          <w:rFonts w:ascii="Aptos" w:eastAsia="Aptos" w:hAnsi="Aptos" w:cs="Aptos"/>
-        </w:rPr>
-        <w:t>cboFoodItem</w:t>
-      </w:r>
-      <w:proofErr w:type="spellEnd"/>
-      <w:r>
-        <w:rPr>
-          <w:rFonts w:ascii="Aptos" w:eastAsia="Aptos" w:hAnsi="Aptos" w:cs="Aptos"/>
-        </w:rPr>
-        <w:t xml:space="preserve"> where the user picks a food or drink item from the list the cinema sells, a label named </w:t>
-      </w:r>
-      <w:proofErr w:type="spellStart"/>
-      <w:r>
-        <w:rPr>
-          <w:rFonts w:ascii="Aptos" w:eastAsia="Aptos" w:hAnsi="Aptos" w:cs="Aptos"/>
-        </w:rPr>
-        <w:t>lblPrice</w:t>
-      </w:r>
-      <w:proofErr w:type="spellEnd"/>
-      <w:r>
-        <w:rPr>
-          <w:rFonts w:ascii="Aptos" w:eastAsia="Aptos" w:hAnsi="Aptos" w:cs="Aptos"/>
-        </w:rPr>
-        <w:t xml:space="preserve"> which shows the price of the chosen item, and a text box named </w:t>
-      </w:r>
-      <w:proofErr w:type="spellStart"/>
-      <w:r>
-        <w:rPr>
-          <w:rFonts w:ascii="Aptos" w:eastAsia="Aptos" w:hAnsi="Aptos" w:cs="Aptos"/>
-        </w:rPr>
-        <w:t>txtQuantity</w:t>
-      </w:r>
-      <w:proofErr w:type="spellEnd"/>
-      <w:r>
-        <w:rPr>
-          <w:rFonts w:ascii="Aptos" w:eastAsia="Aptos" w:hAnsi="Aptos" w:cs="Aptos"/>
-        </w:rPr>
-        <w:t xml:space="preserve"> for how many they want, which sensibly defaults to one. A grid named </w:t>
-      </w:r>
-      <w:proofErr w:type="spellStart"/>
-      <w:r>
-        <w:rPr>
-          <w:rFonts w:ascii="Aptos" w:eastAsia="Aptos" w:hAnsi="Aptos" w:cs="Aptos"/>
-        </w:rPr>
-        <w:t>dgvOrderItems</w:t>
-      </w:r>
-      <w:proofErr w:type="spellEnd"/>
-      <w:r>
-        <w:rPr>
-          <w:rFonts w:ascii="Aptos" w:eastAsia="Aptos" w:hAnsi="Aptos" w:cs="Aptos"/>
-        </w:rPr>
-        <w:t xml:space="preserve"> builds up the list of items that have been added to the order, and a label named </w:t>
-      </w:r>
-      <w:proofErr w:type="spellStart"/>
-      <w:r>
-        <w:rPr>
-          <w:rFonts w:ascii="Aptos" w:eastAsia="Aptos" w:hAnsi="Aptos" w:cs="Aptos"/>
-        </w:rPr>
-        <w:t>lblTotal</w:t>
-      </w:r>
-      <w:proofErr w:type="spellEnd"/>
-      <w:r>
-        <w:rPr>
-          <w:rFonts w:ascii="Aptos" w:eastAsia="Aptos" w:hAnsi="Aptos" w:cs="Aptos"/>
-        </w:rPr>
-        <w:t xml:space="preserve"> keeps a running total of the cost. The buttons are Add To Order named </w:t>
-      </w:r>
-      <w:proofErr w:type="spellStart"/>
-      <w:r>
-        <w:rPr>
-          <w:rFonts w:ascii="Aptos" w:eastAsia="Aptos" w:hAnsi="Aptos" w:cs="Aptos"/>
-        </w:rPr>
-        <w:t>btnAddItem</w:t>
-      </w:r>
-      <w:proofErr w:type="spellEnd"/>
-      <w:r>
-        <w:rPr>
-          <w:rFonts w:ascii="Aptos" w:eastAsia="Aptos" w:hAnsi="Aptos" w:cs="Aptos"/>
-        </w:rPr>
-        <w:t xml:space="preserve">, Remove Selected named </w:t>
-      </w:r>
-      <w:proofErr w:type="spellStart"/>
-      <w:r>
-        <w:rPr>
-          <w:rFonts w:ascii="Aptos" w:eastAsia="Aptos" w:hAnsi="Aptos" w:cs="Aptos"/>
-        </w:rPr>
-        <w:t>btnRemoveItem</w:t>
-      </w:r>
-      <w:proofErr w:type="spellEnd"/>
-      <w:r>
-        <w:rPr>
-          <w:rFonts w:ascii="Aptos" w:eastAsia="Aptos" w:hAnsi="Aptos" w:cs="Aptos"/>
-        </w:rPr>
-        <w:t xml:space="preserve">, and Close named </w:t>
-      </w:r>
-      <w:proofErr w:type="spellStart"/>
-      <w:r>
-        <w:rPr>
-          <w:rFonts w:ascii="Aptos" w:eastAsia="Aptos" w:hAnsi="Aptos" w:cs="Aptos"/>
-        </w:rPr>
-        <w:t>btnClose</w:t>
-      </w:r>
-      <w:proofErr w:type="spellEnd"/>
-      <w:r>
-        <w:rPr>
-          <w:rFonts w:ascii="Aptos" w:eastAsia="Aptos" w:hAnsi="Aptos" w:cs="Aptos"/>
-        </w:rPr>
-        <w:t>.</w:t>
+        <w:t xml:space="preserve"> where the results appear.</w:t>
       </w:r>
     </w:p>
     <w:p>
@@ -1787,7 +2556,7 @@
           <w:sz w:val="22"/>
           <w:szCs w:val="22"/>
         </w:rPr>
-        <w:t>Food Order Form (</w:t>
+        <w:t>Booking Search Form (</w:t>
       </w:r>
       <w:proofErr w:type="spellStart"/>
       <w:r>
@@ -1799,7 +2568,7 @@
           <w:sz w:val="22"/>
           <w:szCs w:val="22"/>
         </w:rPr>
-        <w:t>frmFoodOrder</w:t>
+        <w:t>frmBookingSearch</w:t>
       </w:r>
       <w:proofErr w:type="spellEnd"/>
       <w:r>
@@ -1813,6 +2582,17 @@
         </w:rPr>
         <w:t>)</w:t>
       </w:r>
+      <w:r>
+        <w:rPr>
+          <w:rFonts w:ascii="Aptos" w:eastAsia="Aptos" w:hAnsi="Aptos" w:cs="Aptos"/>
+          <w:i/>
+          <w:iCs/>
+          <w:color w:val="555555"/>
+          <w:sz w:val="20"/>
+          <w:szCs w:val="20"/>
+        </w:rPr>
+        <w:t>.</w:t>
+      </w:r>
     </w:p>
     <w:p>
       <w:pPr>
@@ -1822,28 +2602,28 @@
         <w:rPr>
           <w:rFonts w:ascii="Aptos" w:eastAsia="Aptos" w:hAnsi="Aptos" w:cs="Aptos"/>
         </w:rPr>
-        <w:t xml:space="preserve">The inputs to this form are the food item chosen and the quantity. The outputs are the growing list of items in the grid, the updated running total, and the items being saved against the booking. The process behind the Add To Order button is to insert the chosen item and quantity into the </w:t>
+        <w:t xml:space="preserve">The way it works is that the member of staff types either a booking reference or the customer's name into the search box and presses Search, and any matching bookings </w:t>
+      </w:r>
+      <w:r>
+        <w:rPr>
+          <w:rFonts w:ascii="Aptos" w:eastAsia="Aptos" w:hAnsi="Aptos" w:cs="Aptos"/>
+        </w:rPr>
+        <w:lastRenderedPageBreak/>
+        <w:t xml:space="preserve">appear in the grid. If they would rather just see everything, the Show All button lists every booking in the system. The input is therefore the text typed into the search box, the output is the list of matching bookings, and the process behind it is a query against the </w:t>
       </w:r>
       <w:proofErr w:type="spellStart"/>
       <w:r>
         <w:rPr>
           <w:rFonts w:ascii="Aptos" w:eastAsia="Aptos" w:hAnsi="Aptos" w:cs="Aptos"/>
         </w:rPr>
-        <w:t>tblOrderItem</w:t>
+        <w:t>tblBooking</w:t>
       </w:r>
       <w:proofErr w:type="spellEnd"/>
       <w:r>
         <w:rPr>
           <w:rFonts w:ascii="Aptos" w:eastAsia="Aptos" w:hAnsi="Aptos" w:cs="Aptos"/>
         </w:rPr>
-        <w:t xml:space="preserve"> table linked to the booking, and then to recalculate and display the new total. I chose a combo box for the items rather than a text box because the food menu is a fixed list, so picking from it is both faster and stops the user entering </w:t>
-      </w:r>
-      <w:r>
-        <w:rPr>
-          <w:rFonts w:ascii="Aptos" w:eastAsia="Aptos" w:hAnsi="Aptos" w:cs="Aptos"/>
-        </w:rPr>
-        <w:lastRenderedPageBreak/>
-        <w:t>something the cinema does not sell, and defaulting the quantity to one saves the most common case of a single item being typed every time.</w:t>
+        <w:t xml:space="preserve"> table, joined to the customer details, that looks for a booking whose identifier matches the number typed or whose customer name contains the text typed. I chose to have a single search box that accepts either a booking reference or a name, this is because staff will sometimes have the reference to hand and sometimes only the customer's name, so accepting both keeps it flexible, and the Show All button gives them a simple fallback when they are not sure what to search for.</w:t>
       </w:r>
     </w:p>
     <w:p>
@@ -1858,7 +2638,7 @@
           <w:bCs/>
           <w:color w:val="000000"/>
         </w:rPr>
-        <w:t>Searching for a Booking (Objective 11)</w:t>
+        <w:t>Cancelling a Booking (Objective 12)</w:t>
       </w:r>
     </w:p>
     <w:p>
@@ -1869,7 +2649,7 @@
         <w:rPr>
           <w:rFonts w:ascii="Aptos" w:eastAsia="Aptos" w:hAnsi="Aptos" w:cs="Aptos"/>
         </w:rPr>
-        <w:t xml:space="preserve">Staff often need to find a booking again after it has been made, for example if a customer rings up about it, so this objective provides a way to search for one. It is handled by the form named </w:t>
+        <w:t xml:space="preserve">Cancelling a booking is done on the same </w:t>
       </w:r>
       <w:proofErr w:type="spellStart"/>
       <w:r>
@@ -1883,63 +2663,312 @@
         <w:rPr>
           <w:rFonts w:ascii="Aptos" w:eastAsia="Aptos" w:hAnsi="Aptos" w:cs="Aptos"/>
         </w:rPr>
-        <w:t xml:space="preserve">, which is reached from the Find Booking button on the main menu. This same form also handles cancelling a booking and viewing the screening register, which are the next two objectives, because they all naturally belong together in one place. For the search itself the form has a text box named </w:t>
+        <w:t xml:space="preserve"> form that was just described, so I will refer back to it rather than design a new screen. Once a member of staff has found the booking they want using the search, they select it in the results grid and press the Cancel Booking button named </w:t>
       </w:r>
       <w:proofErr w:type="spellStart"/>
       <w:r>
         <w:rPr>
           <w:rFonts w:ascii="Aptos" w:eastAsia="Aptos" w:hAnsi="Aptos" w:cs="Aptos"/>
         </w:rPr>
-        <w:t>txtSearch</w:t>
+        <w:t>btnCancelBooking</w:t>
       </w:r>
       <w:proofErr w:type="spellEnd"/>
       <w:r>
         <w:rPr>
           <w:rFonts w:ascii="Aptos" w:eastAsia="Aptos" w:hAnsi="Aptos" w:cs="Aptos"/>
         </w:rPr>
-        <w:t xml:space="preserve">, labelled Booking ID or Customer Name, a Search button named </w:t>
+        <w:t>. The input is simply the booking that is selected, and there is no new information to type in. The output is the booking being removed and a confirmation that it has been cancelled.</w:t>
+      </w:r>
+    </w:p>
+    <w:p>
+      <w:pPr>
+        <w:spacing w:after="160" w:line="276" w:lineRule="auto"/>
+      </w:pPr>
+      <w:r>
+        <w:rPr>
+          <w:rFonts w:ascii="Aptos" w:eastAsia="Aptos" w:hAnsi="Aptos" w:cs="Aptos"/>
+        </w:rPr>
+        <w:t xml:space="preserve">The important part of this objective is what the process does behind the scenes, because cancelling a booking is not just about deleting it, it also has to free up the seats it was using. This is because if the seats were not released then those seats would stay marked as taken forever and could never be sold again, which would be detrimental to the cinema. So when a booking is cancelled the system first removes that booking's seats from the </w:t>
       </w:r>
       <w:proofErr w:type="spellStart"/>
       <w:r>
         <w:rPr>
           <w:rFonts w:ascii="Aptos" w:eastAsia="Aptos" w:hAnsi="Aptos" w:cs="Aptos"/>
         </w:rPr>
-        <w:t>btnSearch</w:t>
+        <w:t>tblBookingSeat</w:t>
       </w:r>
       <w:proofErr w:type="spellEnd"/>
       <w:r>
         <w:rPr>
           <w:rFonts w:ascii="Aptos" w:eastAsia="Aptos" w:hAnsi="Aptos" w:cs="Aptos"/>
         </w:rPr>
-        <w:t xml:space="preserve">, a Show All button named </w:t>
+        <w:t xml:space="preserve"> table, which immediately makes them available again on the seat map, and then removes the booking itself from the </w:t>
       </w:r>
       <w:proofErr w:type="spellStart"/>
       <w:r>
         <w:rPr>
           <w:rFonts w:ascii="Aptos" w:eastAsia="Aptos" w:hAnsi="Aptos" w:cs="Aptos"/>
         </w:rPr>
-        <w:t>btnShowAll</w:t>
+        <w:t>tblBooking</w:t>
       </w:r>
       <w:proofErr w:type="spellEnd"/>
       <w:r>
         <w:rPr>
           <w:rFonts w:ascii="Aptos" w:eastAsia="Aptos" w:hAnsi="Aptos" w:cs="Aptos"/>
         </w:rPr>
-        <w:t xml:space="preserve">, and a grid named </w:t>
+        <w:t xml:space="preserve"> table. In this way the cancelled seats go straight back to showing as available the next time that screening's seat map is opened.</w:t>
+      </w:r>
+    </w:p>
+    <w:p>
+      <w:pPr>
+        <w:pStyle w:val="Heading3"/>
+        <w:spacing w:before="260" w:after="120"/>
+      </w:pPr>
+      <w:r>
+        <w:rPr>
+          <w:rFonts w:ascii="Aptos Display" w:eastAsia="Aptos Display" w:hAnsi="Aptos Display" w:cs="Aptos Display"/>
+          <w:b/>
+          <w:bCs/>
+          <w:color w:val="000000"/>
+        </w:rPr>
+        <w:t>Viewing the Booking Register (Objective 9)</w:t>
+      </w:r>
+    </w:p>
+    <w:p>
+      <w:pPr>
+        <w:spacing w:after="160" w:line="276" w:lineRule="auto"/>
+      </w:pPr>
+      <w:r>
+        <w:rPr>
+          <w:rFonts w:ascii="Aptos" w:eastAsia="Aptos" w:hAnsi="Aptos" w:cs="Aptos"/>
+        </w:rPr>
+        <w:t xml:space="preserve">The last job handled by the </w:t>
       </w:r>
       <w:proofErr w:type="spellStart"/>
       <w:r>
         <w:rPr>
           <w:rFonts w:ascii="Aptos" w:eastAsia="Aptos" w:hAnsi="Aptos" w:cs="Aptos"/>
         </w:rPr>
-        <w:t>dgvBookings</w:t>
+        <w:t>frmBookingSearch</w:t>
       </w:r>
       <w:proofErr w:type="spellEnd"/>
       <w:r>
         <w:rPr>
           <w:rFonts w:ascii="Aptos" w:eastAsia="Aptos" w:hAnsi="Aptos" w:cs="Aptos"/>
         </w:rPr>
-        <w:t xml:space="preserve"> where the results appear.</w:t>
+        <w:t xml:space="preserve"> form is letting the manager or staff see a register of every booking for a particular screening, so that they can see who is coming and how full the screening is. I will refer back to that form for the overall layout and just describe the register part here. This part of the form has a combo box named </w:t>
+      </w:r>
+      <w:proofErr w:type="spellStart"/>
+      <w:r>
+        <w:rPr>
+          <w:rFonts w:ascii="Aptos" w:eastAsia="Aptos" w:hAnsi="Aptos" w:cs="Aptos"/>
+        </w:rPr>
+        <w:t>cboRegisterScreening</w:t>
+      </w:r>
+      <w:proofErr w:type="spellEnd"/>
+      <w:r>
+        <w:rPr>
+          <w:rFonts w:ascii="Aptos" w:eastAsia="Aptos" w:hAnsi="Aptos" w:cs="Aptos"/>
+        </w:rPr>
+        <w:t xml:space="preserve"> where the user picks the screening they are interested in, a Load Register button named </w:t>
+      </w:r>
+      <w:proofErr w:type="spellStart"/>
+      <w:r>
+        <w:rPr>
+          <w:rFonts w:ascii="Aptos" w:eastAsia="Aptos" w:hAnsi="Aptos" w:cs="Aptos"/>
+        </w:rPr>
+        <w:t>btnLoadRegister</w:t>
+      </w:r>
+      <w:proofErr w:type="spellEnd"/>
+      <w:r>
+        <w:rPr>
+          <w:rFonts w:ascii="Aptos" w:eastAsia="Aptos" w:hAnsi="Aptos" w:cs="Aptos"/>
+        </w:rPr>
+        <w:t xml:space="preserve">, a grid named </w:t>
+      </w:r>
+      <w:proofErr w:type="spellStart"/>
+      <w:r>
+        <w:rPr>
+          <w:rFonts w:ascii="Aptos" w:eastAsia="Aptos" w:hAnsi="Aptos" w:cs="Aptos"/>
+        </w:rPr>
+        <w:t>dgvRegister</w:t>
+      </w:r>
+      <w:proofErr w:type="spellEnd"/>
+      <w:r>
+        <w:rPr>
+          <w:rFonts w:ascii="Aptos" w:eastAsia="Aptos" w:hAnsi="Aptos" w:cs="Aptos"/>
+        </w:rPr>
+        <w:t xml:space="preserve"> where the register appears, and an Export CSV button named </w:t>
+      </w:r>
+      <w:proofErr w:type="spellStart"/>
+      <w:r>
+        <w:rPr>
+          <w:rFonts w:ascii="Aptos" w:eastAsia="Aptos" w:hAnsi="Aptos" w:cs="Aptos"/>
+        </w:rPr>
+        <w:t>btnExportRegister</w:t>
+      </w:r>
+      <w:proofErr w:type="spellEnd"/>
+      <w:r>
+        <w:rPr>
+          <w:rFonts w:ascii="Aptos" w:eastAsia="Aptos" w:hAnsi="Aptos" w:cs="Aptos"/>
+        </w:rPr>
+        <w:t>.</w:t>
+      </w:r>
+    </w:p>
+    <w:p>
+      <w:pPr>
+        <w:spacing w:after="160" w:line="276" w:lineRule="auto"/>
+      </w:pPr>
+      <w:r>
+        <w:rPr>
+          <w:rFonts w:ascii="Aptos" w:eastAsia="Aptos" w:hAnsi="Aptos" w:cs="Aptos"/>
+        </w:rPr>
+        <w:t xml:space="preserve">The way it is used is that the user picks a screening and presses Load Register, and the grid then fills with every booking for that screening, showing the customer names, the seats they have booked and the number of tickets. The input is the chosen screening, and the </w:t>
+      </w:r>
+      <w:r>
+        <w:rPr>
+          <w:rFonts w:ascii="Aptos" w:eastAsia="Aptos" w:hAnsi="Aptos" w:cs="Aptos"/>
+        </w:rPr>
+        <w:lastRenderedPageBreak/>
+        <w:t>output is the full register shown in the grid. There is also the option to press Export CSV, which takes whatever is currently shown in the register and writes it out to a comma separated values file that can be opened in a spreadsheet, which is useful if the manager wants to print it or keep a copy. The process behind loading the register is a query that pulls back all of the bookings for the chosen screening, and the export process simply writes those same rows out to a file line by line.</w:t>
+      </w:r>
+    </w:p>
+    <w:p>
+      <w:pPr>
+        <w:pStyle w:val="Heading3"/>
+        <w:spacing w:before="260" w:after="120"/>
+      </w:pPr>
+      <w:r>
+        <w:rPr>
+          <w:rFonts w:ascii="Aptos Display" w:eastAsia="Aptos Display" w:hAnsi="Aptos Display" w:cs="Aptos Display"/>
+          <w:b/>
+          <w:bCs/>
+          <w:color w:val="000000"/>
+        </w:rPr>
+        <w:t>Viewing a Sales Report (Objective 8)</w:t>
+      </w:r>
+    </w:p>
+    <w:p>
+      <w:pPr>
+        <w:spacing w:after="160" w:line="276" w:lineRule="auto"/>
+      </w:pPr>
+      <w:r>
+        <w:rPr>
+          <w:rFonts w:ascii="Aptos" w:eastAsia="Aptos" w:hAnsi="Aptos" w:cs="Aptos"/>
+        </w:rPr>
+        <w:t xml:space="preserve">This objective gives the manager an overview of how the cinema is performing, and because it is a management function it is only available when a manager is logged in. It is handled by the form named </w:t>
+      </w:r>
+      <w:proofErr w:type="spellStart"/>
+      <w:r>
+        <w:rPr>
+          <w:rFonts w:ascii="Aptos" w:eastAsia="Aptos" w:hAnsi="Aptos" w:cs="Aptos"/>
+        </w:rPr>
+        <w:t>frmSalesReport</w:t>
+      </w:r>
+      <w:proofErr w:type="spellEnd"/>
+      <w:r>
+        <w:rPr>
+          <w:rFonts w:ascii="Aptos" w:eastAsia="Aptos" w:hAnsi="Aptos" w:cs="Aptos"/>
+        </w:rPr>
+        <w:t xml:space="preserve">, reached from the Reports button on the main menu. The form is kept deliberately simple, with two date pickers named </w:t>
+      </w:r>
+      <w:proofErr w:type="spellStart"/>
+      <w:r>
+        <w:rPr>
+          <w:rFonts w:ascii="Aptos" w:eastAsia="Aptos" w:hAnsi="Aptos" w:cs="Aptos"/>
+        </w:rPr>
+        <w:t>dtpFrom</w:t>
+      </w:r>
+      <w:proofErr w:type="spellEnd"/>
+      <w:r>
+        <w:rPr>
+          <w:rFonts w:ascii="Aptos" w:eastAsia="Aptos" w:hAnsi="Aptos" w:cs="Aptos"/>
+        </w:rPr>
+        <w:t xml:space="preserve"> and </w:t>
+      </w:r>
+      <w:proofErr w:type="spellStart"/>
+      <w:r>
+        <w:rPr>
+          <w:rFonts w:ascii="Aptos" w:eastAsia="Aptos" w:hAnsi="Aptos" w:cs="Aptos"/>
+        </w:rPr>
+        <w:t>dtpTo</w:t>
+      </w:r>
+      <w:proofErr w:type="spellEnd"/>
+      <w:r>
+        <w:rPr>
+          <w:rFonts w:ascii="Aptos" w:eastAsia="Aptos" w:hAnsi="Aptos" w:cs="Aptos"/>
+        </w:rPr>
+        <w:t xml:space="preserve"> where the manager chooses the start and end of the period they want to look at, a Run Report button named </w:t>
+      </w:r>
+      <w:proofErr w:type="spellStart"/>
+      <w:r>
+        <w:rPr>
+          <w:rFonts w:ascii="Aptos" w:eastAsia="Aptos" w:hAnsi="Aptos" w:cs="Aptos"/>
+        </w:rPr>
+        <w:t>btnRunReport</w:t>
+      </w:r>
+      <w:proofErr w:type="spellEnd"/>
+      <w:r>
+        <w:rPr>
+          <w:rFonts w:ascii="Aptos" w:eastAsia="Aptos" w:hAnsi="Aptos" w:cs="Aptos"/>
+        </w:rPr>
+        <w:t xml:space="preserve">, a grid named </w:t>
+      </w:r>
+      <w:proofErr w:type="spellStart"/>
+      <w:r>
+        <w:rPr>
+          <w:rFonts w:ascii="Aptos" w:eastAsia="Aptos" w:hAnsi="Aptos" w:cs="Aptos"/>
+        </w:rPr>
+        <w:t>dgvSalesByFilm</w:t>
+      </w:r>
+      <w:proofErr w:type="spellEnd"/>
+      <w:r>
+        <w:rPr>
+          <w:rFonts w:ascii="Aptos" w:eastAsia="Aptos" w:hAnsi="Aptos" w:cs="Aptos"/>
+        </w:rPr>
+        <w:t xml:space="preserve"> which breaks the sales down film by film, and three summary labels named </w:t>
+      </w:r>
+      <w:proofErr w:type="spellStart"/>
+      <w:r>
+        <w:rPr>
+          <w:rFonts w:ascii="Aptos" w:eastAsia="Aptos" w:hAnsi="Aptos" w:cs="Aptos"/>
+        </w:rPr>
+        <w:t>lblTicketRevenue</w:t>
+      </w:r>
+      <w:proofErr w:type="spellEnd"/>
+      <w:r>
+        <w:rPr>
+          <w:rFonts w:ascii="Aptos" w:eastAsia="Aptos" w:hAnsi="Aptos" w:cs="Aptos"/>
+        </w:rPr>
+        <w:t xml:space="preserve">, </w:t>
+      </w:r>
+      <w:proofErr w:type="spellStart"/>
+      <w:r>
+        <w:rPr>
+          <w:rFonts w:ascii="Aptos" w:eastAsia="Aptos" w:hAnsi="Aptos" w:cs="Aptos"/>
+        </w:rPr>
+        <w:t>lblFoodRevenue</w:t>
+      </w:r>
+      <w:proofErr w:type="spellEnd"/>
+      <w:r>
+        <w:rPr>
+          <w:rFonts w:ascii="Aptos" w:eastAsia="Aptos" w:hAnsi="Aptos" w:cs="Aptos"/>
+        </w:rPr>
+        <w:t xml:space="preserve"> and </w:t>
+      </w:r>
+      <w:proofErr w:type="spellStart"/>
+      <w:r>
+        <w:rPr>
+          <w:rFonts w:ascii="Aptos" w:eastAsia="Aptos" w:hAnsi="Aptos" w:cs="Aptos"/>
+        </w:rPr>
+        <w:t>lblGrandTotal</w:t>
+      </w:r>
+      <w:proofErr w:type="spellEnd"/>
+      <w:r>
+        <w:rPr>
+          <w:rFonts w:ascii="Aptos" w:eastAsia="Aptos" w:hAnsi="Aptos" w:cs="Aptos"/>
+        </w:rPr>
+        <w:t>.</w:t>
       </w:r>
     </w:p>
     <w:p>
@@ -1962,7 +2991,7 @@
           <w:sz w:val="22"/>
           <w:szCs w:val="22"/>
         </w:rPr>
-        <w:t>Booking Search Form (</w:t>
+        <w:t>Sales Report Form (</w:t>
       </w:r>
       <w:proofErr w:type="spellStart"/>
       <w:r>
@@ -1974,7 +3003,7 @@
           <w:sz w:val="22"/>
           <w:szCs w:val="22"/>
         </w:rPr>
-        <w:t>frmBookingSearch</w:t>
+        <w:t>frmSalesReport</w:t>
       </w:r>
       <w:proofErr w:type="spellEnd"/>
       <w:r>
@@ -1988,17 +3017,6 @@
         </w:rPr>
         <w:t>)</w:t>
       </w:r>
-      <w:r>
-        <w:rPr>
-          <w:rFonts w:ascii="Aptos" w:eastAsia="Aptos" w:hAnsi="Aptos" w:cs="Aptos"/>
-          <w:i/>
-          <w:iCs/>
-          <w:color w:val="555555"/>
-          <w:sz w:val="20"/>
-          <w:szCs w:val="20"/>
-        </w:rPr>
-        <w:t>.</w:t>
-      </w:r>
     </w:p>
     <w:p>
       <w:pPr>
@@ -2008,21 +3026,7 @@
         <w:rPr>
           <w:rFonts w:ascii="Aptos" w:eastAsia="Aptos" w:hAnsi="Aptos" w:cs="Aptos"/>
         </w:rPr>
-        <w:t xml:space="preserve">The way it works is that the member of staff types either a booking reference or the customer's name into the search box and presses Search, and any matching bookings appear in the grid. If they would rather just see everything, the Show All button lists every booking in the system. The input is therefore the text typed into the search box, the output is the list of matching bookings, and the process behind it is a query against the </w:t>
-      </w:r>
-      <w:proofErr w:type="spellStart"/>
-      <w:r>
-        <w:rPr>
-          <w:rFonts w:ascii="Aptos" w:eastAsia="Aptos" w:hAnsi="Aptos" w:cs="Aptos"/>
-        </w:rPr>
-        <w:t>tblBooking</w:t>
-      </w:r>
-      <w:proofErr w:type="spellEnd"/>
-      <w:r>
-        <w:rPr>
-          <w:rFonts w:ascii="Aptos" w:eastAsia="Aptos" w:hAnsi="Aptos" w:cs="Aptos"/>
-        </w:rPr>
-        <w:t xml:space="preserve"> table, joined to the customer details, that looks for a booking whose identifier matches the number typed or whose customer name contains the text typed. I chose to have a single search box that accepts either a booking reference or a name, this is because staff will sometimes have the reference to hand and sometimes only the customer's name, so accepting both keeps it flexible, and the Show All button gives them a simple fallback when they are not sure what to search for.</w:t>
+        <w:t>The manager uses it by choosing a from date and a to date and pressing Run Report, at which point the grid fills with the sales for each film over that period and the three labels update to show the total ticket revenue, the total food revenue and the grand total of the two added together. The inputs are the two dates, and the outputs are the breakdown by film in the grid together with the three revenue totals. The process behind the button is a query that adds up the ticket sales and the food sales that fall within the chosen dates and groups them by film. I chose to use date pickers rather than text boxes for the dates so that the manager cannot enter something that is not a real date, and I chose to show both a breakdown by film and the overall totals, this is because the manager will want to see the headline figure at a glance but may also want to know which films in particular are selling well.</w:t>
       </w:r>
     </w:p>
     <w:p>
@@ -2037,7 +3041,7 @@
           <w:bCs/>
           <w:color w:val="000000"/>
         </w:rPr>
-        <w:t>Cancelling a Booking (Objective 12)</w:t>
+        <w:t>Maintaining an Audit Log (Objective 17)</w:t>
       </w:r>
     </w:p>
     <w:p>
@@ -2048,326 +3052,56 @@
         <w:rPr>
           <w:rFonts w:ascii="Aptos" w:eastAsia="Aptos" w:hAnsi="Aptos" w:cs="Aptos"/>
         </w:rPr>
-        <w:t xml:space="preserve">Cancelling a booking is done on the same </w:t>
+        <w:t xml:space="preserve">The final objective in this section is the audit log, which quietly records the important actions that staff and managers carry out in the system, such as creating a booking, cancelling a booking or adding a new film or screening. The point of it is that if something goes wrong, for example a billing mistake, the manager can look back and see what happened and who did it, rather than the mistake simply disappearing. Because it is a management tool it is only available to a manager, and it is reached from the Logs button </w:t>
+      </w:r>
+      <w:r>
+        <w:rPr>
+          <w:rFonts w:ascii="Aptos" w:eastAsia="Aptos" w:hAnsi="Aptos" w:cs="Aptos"/>
+        </w:rPr>
+        <w:lastRenderedPageBreak/>
+        <w:t xml:space="preserve">on the main menu. It is handled by the form named </w:t>
       </w:r>
       <w:proofErr w:type="spellStart"/>
       <w:r>
         <w:rPr>
           <w:rFonts w:ascii="Aptos" w:eastAsia="Aptos" w:hAnsi="Aptos" w:cs="Aptos"/>
         </w:rPr>
-        <w:t>frmBookingSearch</w:t>
+        <w:t>frmLogs</w:t>
       </w:r>
       <w:proofErr w:type="spellEnd"/>
       <w:r>
         <w:rPr>
           <w:rFonts w:ascii="Aptos" w:eastAsia="Aptos" w:hAnsi="Aptos" w:cs="Aptos"/>
         </w:rPr>
-        <w:t xml:space="preserve"> form that was just described, so I will refer back to it rather than design a new screen. Once a member of staff has found the booking they want using the search, they select it in the results grid and press the Cancel Booking button named </w:t>
+        <w:t xml:space="preserve">, which is the simplest form in the whole system as it only needs a grid named </w:t>
       </w:r>
       <w:proofErr w:type="spellStart"/>
       <w:r>
         <w:rPr>
           <w:rFonts w:ascii="Aptos" w:eastAsia="Aptos" w:hAnsi="Aptos" w:cs="Aptos"/>
         </w:rPr>
-        <w:t>btnCancelBooking</w:t>
+        <w:t>dgvLogs</w:t>
       </w:r>
       <w:proofErr w:type="spellEnd"/>
       <w:r>
         <w:rPr>
           <w:rFonts w:ascii="Aptos" w:eastAsia="Aptos" w:hAnsi="Aptos" w:cs="Aptos"/>
         </w:rPr>
-        <w:t>. The input is simply the booking that is selected, and there is no new information to type in. The output is the booking being removed and a confirmation that it has been cancelled.</w:t>
-      </w:r>
-    </w:p>
-    <w:p>
-      <w:pPr>
-        <w:spacing w:after="160" w:line="276" w:lineRule="auto"/>
-      </w:pPr>
-      <w:r>
-        <w:rPr>
-          <w:rFonts w:ascii="Aptos" w:eastAsia="Aptos" w:hAnsi="Aptos" w:cs="Aptos"/>
-        </w:rPr>
-        <w:t xml:space="preserve">The important part of this objective is what the process does behind the scenes, because cancelling a booking is not just about deleting it, it also has to free up the seats it was using. This is because if the seats were not released then those seats would stay marked as </w:t>
-      </w:r>
-      <w:r>
-        <w:rPr>
-          <w:rFonts w:ascii="Aptos" w:eastAsia="Aptos" w:hAnsi="Aptos" w:cs="Aptos"/>
-        </w:rPr>
-        <w:lastRenderedPageBreak/>
-        <w:t xml:space="preserve">taken forever and could never be sold again, which would be detrimental to the cinema. So when a booking is cancelled the system first removes that booking's seats from the </w:t>
+        <w:t xml:space="preserve"> to display the log entries and a Refresh button named </w:t>
       </w:r>
       <w:proofErr w:type="spellStart"/>
       <w:r>
         <w:rPr>
           <w:rFonts w:ascii="Aptos" w:eastAsia="Aptos" w:hAnsi="Aptos" w:cs="Aptos"/>
         </w:rPr>
-        <w:t>tblBookingSeat</w:t>
+        <w:t>btnRefresh</w:t>
       </w:r>
       <w:proofErr w:type="spellEnd"/>
       <w:r>
         <w:rPr>
           <w:rFonts w:ascii="Aptos" w:eastAsia="Aptos" w:hAnsi="Aptos" w:cs="Aptos"/>
         </w:rPr>
-        <w:t xml:space="preserve"> table, which immediately makes them available again on the seat map, and then removes the booking itself from the </w:t>
-      </w:r>
-      <w:proofErr w:type="spellStart"/>
-      <w:r>
-        <w:rPr>
-          <w:rFonts w:ascii="Aptos" w:eastAsia="Aptos" w:hAnsi="Aptos" w:cs="Aptos"/>
-        </w:rPr>
-        <w:t>tblBooking</w:t>
-      </w:r>
-      <w:proofErr w:type="spellEnd"/>
-      <w:r>
-        <w:rPr>
-          <w:rFonts w:ascii="Aptos" w:eastAsia="Aptos" w:hAnsi="Aptos" w:cs="Aptos"/>
-        </w:rPr>
-        <w:t xml:space="preserve"> table. In this way the cancelled seats go straight back to showing as available the next time that screening's seat map is opened.</w:t>
-      </w:r>
-    </w:p>
-    <w:p>
-      <w:pPr>
-        <w:pStyle w:val="Heading3"/>
-        <w:spacing w:before="260" w:after="120"/>
-      </w:pPr>
-      <w:r>
-        <w:rPr>
-          <w:rFonts w:ascii="Aptos Display" w:eastAsia="Aptos Display" w:hAnsi="Aptos Display" w:cs="Aptos Display"/>
-          <w:b/>
-          <w:bCs/>
-          <w:color w:val="000000"/>
-        </w:rPr>
-        <w:t>Viewing the Booking Register (Objective 9)</w:t>
-      </w:r>
-    </w:p>
-    <w:p>
-      <w:pPr>
-        <w:spacing w:after="160" w:line="276" w:lineRule="auto"/>
-      </w:pPr>
-      <w:r>
-        <w:rPr>
-          <w:rFonts w:ascii="Aptos" w:eastAsia="Aptos" w:hAnsi="Aptos" w:cs="Aptos"/>
-        </w:rPr>
-        <w:t xml:space="preserve">The last job handled by the </w:t>
-      </w:r>
-      <w:proofErr w:type="spellStart"/>
-      <w:r>
-        <w:rPr>
-          <w:rFonts w:ascii="Aptos" w:eastAsia="Aptos" w:hAnsi="Aptos" w:cs="Aptos"/>
-        </w:rPr>
-        <w:t>frmBookingSearch</w:t>
-      </w:r>
-      <w:proofErr w:type="spellEnd"/>
-      <w:r>
-        <w:rPr>
-          <w:rFonts w:ascii="Aptos" w:eastAsia="Aptos" w:hAnsi="Aptos" w:cs="Aptos"/>
-        </w:rPr>
-        <w:t xml:space="preserve"> form is letting the manager or staff see a register of every booking for a particular screening, so that they can see who is coming and how full the screening is. I will refer back to that form for the overall layout and just describe the register part here. This part of the form has a combo box named </w:t>
-      </w:r>
-      <w:proofErr w:type="spellStart"/>
-      <w:r>
-        <w:rPr>
-          <w:rFonts w:ascii="Aptos" w:eastAsia="Aptos" w:hAnsi="Aptos" w:cs="Aptos"/>
-        </w:rPr>
-        <w:t>cboRegisterScreening</w:t>
-      </w:r>
-      <w:proofErr w:type="spellEnd"/>
-      <w:r>
-        <w:rPr>
-          <w:rFonts w:ascii="Aptos" w:eastAsia="Aptos" w:hAnsi="Aptos" w:cs="Aptos"/>
-        </w:rPr>
-        <w:t xml:space="preserve"> where the user picks the screening they are interested in, a Load Register button named </w:t>
-      </w:r>
-      <w:proofErr w:type="spellStart"/>
-      <w:r>
-        <w:rPr>
-          <w:rFonts w:ascii="Aptos" w:eastAsia="Aptos" w:hAnsi="Aptos" w:cs="Aptos"/>
-        </w:rPr>
-        <w:t>btnLoadRegister</w:t>
-      </w:r>
-      <w:proofErr w:type="spellEnd"/>
-      <w:r>
-        <w:rPr>
-          <w:rFonts w:ascii="Aptos" w:eastAsia="Aptos" w:hAnsi="Aptos" w:cs="Aptos"/>
-        </w:rPr>
-        <w:t xml:space="preserve">, a grid named </w:t>
-      </w:r>
-      <w:proofErr w:type="spellStart"/>
-      <w:r>
-        <w:rPr>
-          <w:rFonts w:ascii="Aptos" w:eastAsia="Aptos" w:hAnsi="Aptos" w:cs="Aptos"/>
-        </w:rPr>
-        <w:t>dgvRegister</w:t>
-      </w:r>
-      <w:proofErr w:type="spellEnd"/>
-      <w:r>
-        <w:rPr>
-          <w:rFonts w:ascii="Aptos" w:eastAsia="Aptos" w:hAnsi="Aptos" w:cs="Aptos"/>
-        </w:rPr>
-        <w:t xml:space="preserve"> where the register appears, and an Export CSV button named </w:t>
-      </w:r>
-      <w:proofErr w:type="spellStart"/>
-      <w:r>
-        <w:rPr>
-          <w:rFonts w:ascii="Aptos" w:eastAsia="Aptos" w:hAnsi="Aptos" w:cs="Aptos"/>
-        </w:rPr>
-        <w:t>btnExportRegister</w:t>
-      </w:r>
-      <w:proofErr w:type="spellEnd"/>
-      <w:r>
-        <w:rPr>
-          <w:rFonts w:ascii="Aptos" w:eastAsia="Aptos" w:hAnsi="Aptos" w:cs="Aptos"/>
-        </w:rPr>
-        <w:t>.</w:t>
-      </w:r>
-    </w:p>
-    <w:p>
-      <w:pPr>
-        <w:spacing w:after="160" w:line="276" w:lineRule="auto"/>
-      </w:pPr>
-      <w:r>
-        <w:rPr>
-          <w:rFonts w:ascii="Aptos" w:eastAsia="Aptos" w:hAnsi="Aptos" w:cs="Aptos"/>
-        </w:rPr>
-        <w:t>The way it is used is that the user picks a screening and presses Load Register, and the grid then fills with every booking for that screening, showing the customer names, the seats they have booked and the number of tickets. The input is the chosen screening, and the output is the full register shown in the grid. There is also the option to press Export CSV, which takes whatever is currently shown in the register and writes it out to a comma separated values file that can be opened in a spreadsheet, which is useful if the manager wants to print it or keep a copy. The process behind loading the register is a query that pulls back all of the bookings for the chosen screening, and the export process simply writes those same rows out to a file line by line.</w:t>
-      </w:r>
-    </w:p>
-    <w:p>
-      <w:pPr>
-        <w:pStyle w:val="Heading3"/>
-        <w:spacing w:before="260" w:after="120"/>
-      </w:pPr>
-      <w:r>
-        <w:rPr>
-          <w:rFonts w:ascii="Aptos Display" w:eastAsia="Aptos Display" w:hAnsi="Aptos Display" w:cs="Aptos Display"/>
-          <w:b/>
-          <w:bCs/>
-          <w:color w:val="000000"/>
-        </w:rPr>
-        <w:t>Viewing a Sales Report (Objective 8)</w:t>
-      </w:r>
-    </w:p>
-    <w:p>
-      <w:pPr>
-        <w:spacing w:after="160" w:line="276" w:lineRule="auto"/>
-      </w:pPr>
-      <w:r>
-        <w:rPr>
-          <w:rFonts w:ascii="Aptos" w:eastAsia="Aptos" w:hAnsi="Aptos" w:cs="Aptos"/>
-        </w:rPr>
-        <w:t xml:space="preserve">This objective gives the manager an overview of how the cinema is performing, and because it is a management function it is only available when a manager is logged in. It is handled by the form named </w:t>
-      </w:r>
-      <w:proofErr w:type="spellStart"/>
-      <w:r>
-        <w:rPr>
-          <w:rFonts w:ascii="Aptos" w:eastAsia="Aptos" w:hAnsi="Aptos" w:cs="Aptos"/>
-        </w:rPr>
-        <w:t>frmSalesReport</w:t>
-      </w:r>
-      <w:proofErr w:type="spellEnd"/>
-      <w:r>
-        <w:rPr>
-          <w:rFonts w:ascii="Aptos" w:eastAsia="Aptos" w:hAnsi="Aptos" w:cs="Aptos"/>
-        </w:rPr>
-        <w:t xml:space="preserve">, reached from the Reports button on the main menu. The form is kept deliberately simple, with two date pickers named </w:t>
-      </w:r>
-      <w:proofErr w:type="spellStart"/>
-      <w:r>
-        <w:rPr>
-          <w:rFonts w:ascii="Aptos" w:eastAsia="Aptos" w:hAnsi="Aptos" w:cs="Aptos"/>
-        </w:rPr>
-        <w:t>dtpFrom</w:t>
-      </w:r>
-      <w:proofErr w:type="spellEnd"/>
-      <w:r>
-        <w:rPr>
-          <w:rFonts w:ascii="Aptos" w:eastAsia="Aptos" w:hAnsi="Aptos" w:cs="Aptos"/>
-        </w:rPr>
-        <w:t xml:space="preserve"> and </w:t>
-      </w:r>
-      <w:proofErr w:type="spellStart"/>
-      <w:r>
-        <w:rPr>
-          <w:rFonts w:ascii="Aptos" w:eastAsia="Aptos" w:hAnsi="Aptos" w:cs="Aptos"/>
-        </w:rPr>
-        <w:t>dtpTo</w:t>
-      </w:r>
-      <w:proofErr w:type="spellEnd"/>
-      <w:r>
-        <w:rPr>
-          <w:rFonts w:ascii="Aptos" w:eastAsia="Aptos" w:hAnsi="Aptos" w:cs="Aptos"/>
-        </w:rPr>
-        <w:t xml:space="preserve"> where the manager chooses the start and end of the period they want to look at, a Run Report button named </w:t>
-      </w:r>
-      <w:proofErr w:type="spellStart"/>
-      <w:r>
-        <w:rPr>
-          <w:rFonts w:ascii="Aptos" w:eastAsia="Aptos" w:hAnsi="Aptos" w:cs="Aptos"/>
-        </w:rPr>
-        <w:t>btnRunReport</w:t>
-      </w:r>
-      <w:proofErr w:type="spellEnd"/>
-      <w:r>
-        <w:rPr>
-          <w:rFonts w:ascii="Aptos" w:eastAsia="Aptos" w:hAnsi="Aptos" w:cs="Aptos"/>
-        </w:rPr>
-        <w:t xml:space="preserve">, a grid named </w:t>
-      </w:r>
-      <w:proofErr w:type="spellStart"/>
-      <w:r>
-        <w:rPr>
-          <w:rFonts w:ascii="Aptos" w:eastAsia="Aptos" w:hAnsi="Aptos" w:cs="Aptos"/>
-        </w:rPr>
-        <w:t>dgvSalesByFilm</w:t>
-      </w:r>
-      <w:proofErr w:type="spellEnd"/>
-      <w:r>
-        <w:rPr>
-          <w:rFonts w:ascii="Aptos" w:eastAsia="Aptos" w:hAnsi="Aptos" w:cs="Aptos"/>
-        </w:rPr>
-        <w:t xml:space="preserve"> which breaks the sales down film by film, and three summary labels named </w:t>
-      </w:r>
-      <w:proofErr w:type="spellStart"/>
-      <w:r>
-        <w:rPr>
-          <w:rFonts w:ascii="Aptos" w:eastAsia="Aptos" w:hAnsi="Aptos" w:cs="Aptos"/>
-        </w:rPr>
-        <w:t>lblTicketRevenue</w:t>
-      </w:r>
-      <w:proofErr w:type="spellEnd"/>
-      <w:r>
-        <w:rPr>
-          <w:rFonts w:ascii="Aptos" w:eastAsia="Aptos" w:hAnsi="Aptos" w:cs="Aptos"/>
-        </w:rPr>
-        <w:t xml:space="preserve">, </w:t>
-      </w:r>
-      <w:proofErr w:type="spellStart"/>
-      <w:r>
-        <w:rPr>
-          <w:rFonts w:ascii="Aptos" w:eastAsia="Aptos" w:hAnsi="Aptos" w:cs="Aptos"/>
-        </w:rPr>
-        <w:t>lblFoodRevenue</w:t>
-      </w:r>
-      <w:proofErr w:type="spellEnd"/>
-      <w:r>
-        <w:rPr>
-          <w:rFonts w:ascii="Aptos" w:eastAsia="Aptos" w:hAnsi="Aptos" w:cs="Aptos"/>
-        </w:rPr>
-        <w:t xml:space="preserve"> and </w:t>
-      </w:r>
-      <w:proofErr w:type="spellStart"/>
-      <w:r>
-        <w:rPr>
-          <w:rFonts w:ascii="Aptos" w:eastAsia="Aptos" w:hAnsi="Aptos" w:cs="Aptos"/>
-        </w:rPr>
-        <w:t>lblGrandTotal</w:t>
-      </w:r>
-      <w:proofErr w:type="spellEnd"/>
-      <w:r>
-        <w:rPr>
-          <w:rFonts w:ascii="Aptos" w:eastAsia="Aptos" w:hAnsi="Aptos" w:cs="Aptos"/>
-        </w:rPr>
-        <w:t>.</w:t>
+        <w:t xml:space="preserve"> to reload them.</w:t>
       </w:r>
     </w:p>
     <w:p>
@@ -2390,7 +3124,7 @@
           <w:sz w:val="22"/>
           <w:szCs w:val="22"/>
         </w:rPr>
-        <w:t>Sales Report Form (</w:t>
+        <w:t>Logs Form (</w:t>
       </w:r>
       <w:proofErr w:type="spellStart"/>
       <w:r>
@@ -2402,7 +3136,7 @@
           <w:sz w:val="22"/>
           <w:szCs w:val="22"/>
         </w:rPr>
-        <w:t>frmSalesReport</w:t>
+        <w:t>frmLogs</w:t>
       </w:r>
       <w:proofErr w:type="spellEnd"/>
       <w:r>
@@ -2425,8 +3159,21 @@
         <w:rPr>
           <w:rFonts w:ascii="Aptos" w:eastAsia="Aptos" w:hAnsi="Aptos" w:cs="Aptos"/>
         </w:rPr>
-        <w:lastRenderedPageBreak/>
-        <w:t>The manager uses it by choosing a from date and a to date and pressing Run Report, at which point the grid fills with the sales for each film over that period and the three labels update to show the total ticket revenue, the total food revenue and the grand total of the two added together. The inputs are the two dates, and the outputs are the breakdown by film in the grid together with the three revenue totals. The process behind the button is a query that adds up the ticket sales and the food sales that fall within the chosen dates and groups them by film. I chose to use date pickers rather than text boxes for the dates so that the manager cannot enter something that is not a real date, and I chose to show both a breakdown by film and the overall totals, this is because the manager will want to see the headline figure at a glance but may also want to know which films in particular are selling well.</w:t>
+        <w:t xml:space="preserve">There are effectively no inputs to this form beyond pressing Refresh, because its whole job is to display information rather than collect it. The output is the list of logged actions shown in the grid, each entry showing when it happened, who did it and what they did. The process behind it is simply a query that reads the entries back from the </w:t>
+      </w:r>
+      <w:proofErr w:type="spellStart"/>
+      <w:r>
+        <w:rPr>
+          <w:rFonts w:ascii="Aptos" w:eastAsia="Aptos" w:hAnsi="Aptos" w:cs="Aptos"/>
+        </w:rPr>
+        <w:t>tblLogs</w:t>
+      </w:r>
+      <w:proofErr w:type="spellEnd"/>
+      <w:r>
+        <w:rPr>
+          <w:rFonts w:ascii="Aptos" w:eastAsia="Aptos" w:hAnsi="Aptos" w:cs="Aptos"/>
+        </w:rPr>
+        <w:t xml:space="preserve"> table in order, with the most recent shown first. I deliberately made this grid read-only so that the log cannot be edited from within the program, this is because a log that could be changed would be worthless, the entire value of an audit log comes from the fact that nobody can quietly alter it after the event.</w:t>
       </w:r>
     </w:p>
     <w:p>
@@ -2441,7 +3188,7 @@
           <w:bCs/>
           <w:color w:val="000000"/>
         </w:rPr>
-        <w:t>Maintaining an Audit Log (Objective 17)</w:t>
+        <w:t>Overview Diagram of the User Interface</w:t>
       </w:r>
     </w:p>
     <w:p>
@@ -2452,49 +3199,21 @@
         <w:rPr>
           <w:rFonts w:ascii="Aptos" w:eastAsia="Aptos" w:hAnsi="Aptos" w:cs="Aptos"/>
         </w:rPr>
-        <w:t xml:space="preserve">The final objective in this section is the audit log, which quietly records the important actions that staff and managers carry out in the system, such as creating a booking, cancelling a booking or adding a new film or screening. The point of it is that if something goes wrong, for example a billing mistake, the manager can look back and see what happened and who did it, rather than the mistake simply disappearing. Because it is a management tool it is only available to a manager, and it is reached from the Logs button on the main menu. It is handled by the form named </w:t>
+        <w:t xml:space="preserve">Finally, to pull all of these forms together, the overview diagram below shows how the different screens of </w:t>
       </w:r>
       <w:proofErr w:type="spellStart"/>
       <w:r>
         <w:rPr>
           <w:rFonts w:ascii="Aptos" w:eastAsia="Aptos" w:hAnsi="Aptos" w:cs="Aptos"/>
         </w:rPr>
-        <w:t>frmLogs</w:t>
+        <w:t>Filmtopia</w:t>
       </w:r>
       <w:proofErr w:type="spellEnd"/>
       <w:r>
         <w:rPr>
           <w:rFonts w:ascii="Aptos" w:eastAsia="Aptos" w:hAnsi="Aptos" w:cs="Aptos"/>
         </w:rPr>
-        <w:t xml:space="preserve">, which is the simplest form in the whole system as it only needs a grid named </w:t>
-      </w:r>
-      <w:proofErr w:type="spellStart"/>
-      <w:r>
-        <w:rPr>
-          <w:rFonts w:ascii="Aptos" w:eastAsia="Aptos" w:hAnsi="Aptos" w:cs="Aptos"/>
-        </w:rPr>
-        <w:t>dgvLogs</w:t>
-      </w:r>
-      <w:proofErr w:type="spellEnd"/>
-      <w:r>
-        <w:rPr>
-          <w:rFonts w:ascii="Aptos" w:eastAsia="Aptos" w:hAnsi="Aptos" w:cs="Aptos"/>
-        </w:rPr>
-        <w:t xml:space="preserve"> to display the log entries and a Refresh button named </w:t>
-      </w:r>
-      <w:proofErr w:type="spellStart"/>
-      <w:r>
-        <w:rPr>
-          <w:rFonts w:ascii="Aptos" w:eastAsia="Aptos" w:hAnsi="Aptos" w:cs="Aptos"/>
-        </w:rPr>
-        <w:t>btnRefresh</w:t>
-      </w:r>
-      <w:proofErr w:type="spellEnd"/>
-      <w:r>
-        <w:rPr>
-          <w:rFonts w:ascii="Aptos" w:eastAsia="Aptos" w:hAnsi="Aptos" w:cs="Aptos"/>
-        </w:rPr>
-        <w:t xml:space="preserve"> to reload them.</w:t>
+        <w:t xml:space="preserve"> connect to one another. It shows the login form at the top as the single entry point into the system, an arrow leading from it into the main menu, and then further arrows fanning out from the main menu to each of the forms it can open. This makes it easy to see at a glance that every part of the system is reached through the menu, and that the menu itself can only be reached by logging in first.</w:t>
       </w:r>
     </w:p>
     <w:p>
@@ -2517,71 +3236,30 @@
           <w:sz w:val="22"/>
           <w:szCs w:val="22"/>
         </w:rPr>
-        <w:t>Logs Form (</w:t>
-      </w:r>
-      <w:proofErr w:type="spellStart"/>
-      <w:r>
-        <w:rPr>
-          <w:rFonts w:ascii="Aptos" w:eastAsia="Aptos" w:hAnsi="Aptos" w:cs="Aptos"/>
-          <w:b/>
-          <w:bCs/>
-          <w:color w:val="A02B93"/>
-          <w:sz w:val="22"/>
-          <w:szCs w:val="22"/>
-        </w:rPr>
-        <w:t>frmLogs</w:t>
-      </w:r>
-      <w:proofErr w:type="spellEnd"/>
-      <w:r>
-        <w:rPr>
-          <w:rFonts w:ascii="Aptos" w:eastAsia="Aptos" w:hAnsi="Aptos" w:cs="Aptos"/>
-          <w:b/>
-          <w:bCs/>
-          <w:color w:val="A02B93"/>
-          <w:sz w:val="22"/>
-          <w:szCs w:val="22"/>
-        </w:rPr>
-        <w:t>)</w:t>
+        <w:t>How the forms connect:</w:t>
       </w:r>
     </w:p>
     <w:p>
       <w:pPr>
         <w:spacing w:after="160" w:line="276" w:lineRule="auto"/>
       </w:pPr>
-      <w:r>
-        <w:rPr>
-          <w:rFonts w:ascii="Aptos" w:eastAsia="Aptos" w:hAnsi="Aptos" w:cs="Aptos"/>
-        </w:rPr>
-        <w:t xml:space="preserve">There are effectively no inputs to this form beyond pressing Refresh, because its whole job is to display information rather than collect it. The output is the list of logged actions shown in the grid, each entry showing when it happened, who did it and what they did. The process behind it is simply a query that reads the entries back from the </w:t>
-      </w:r>
-      <w:proofErr w:type="spellStart"/>
-      <w:r>
-        <w:rPr>
-          <w:rFonts w:ascii="Aptos" w:eastAsia="Aptos" w:hAnsi="Aptos" w:cs="Aptos"/>
-        </w:rPr>
-        <w:t>tblLogs</w:t>
-      </w:r>
-      <w:proofErr w:type="spellEnd"/>
-      <w:r>
-        <w:rPr>
-          <w:rFonts w:ascii="Aptos" w:eastAsia="Aptos" w:hAnsi="Aptos" w:cs="Aptos"/>
-        </w:rPr>
-        <w:t xml:space="preserve"> table in order, with the most recent shown first. I deliberately made this grid read-only so that the log cannot be edited from within the program, this is because a log that could be changed would be worthless, the entire value of an audit log comes from the fact that nobody can quietly alter it after the event.</w:t>
-      </w:r>
     </w:p>
     <w:p>
       <w:pPr>
-        <w:pStyle w:val="Heading3"/>
-        <w:spacing w:before="260" w:after="120"/>
-      </w:pPr>
-      <w:r>
-        <w:rPr>
-          <w:rFonts w:ascii="Aptos Display" w:eastAsia="Aptos Display" w:hAnsi="Aptos Display" w:cs="Aptos Display"/>
+        <w:pStyle w:val="Heading2"/>
+        <w:rPr>
           <w:b/>
           <w:bCs/>
-          <w:color w:val="000000"/>
-        </w:rPr>
-        <w:t>Overview Diagram of the User Interface</w:t>
+          <w:color w:val="000000" w:themeColor="text1"/>
+        </w:rPr>
+      </w:pPr>
+      <w:r>
+        <w:rPr>
+          <w:b/>
+          <w:bCs/>
+          <w:color w:val="000000" w:themeColor="text1"/>
+        </w:rPr>
+        <w:t>Data Structures and Methods of Access</w:t>
       </w:r>
     </w:p>
     <w:p>
@@ -2589,86 +3267,28 @@
         <w:spacing w:after="160" w:line="276" w:lineRule="auto"/>
       </w:pPr>
       <w:r>
-        <w:rPr>
-          <w:rFonts w:ascii="Aptos" w:eastAsia="Aptos" w:hAnsi="Aptos" w:cs="Aptos"/>
-        </w:rPr>
-        <w:t xml:space="preserve">Finally, to pull all of these forms together, the overview diagram below shows how the different screens of </w:t>
+        <w:t xml:space="preserve">The purpose of this section is to specify the data structures that the </w:t>
       </w:r>
       <w:proofErr w:type="spellStart"/>
       <w:r>
-        <w:rPr>
-          <w:rFonts w:ascii="Aptos" w:eastAsia="Aptos" w:hAnsi="Aptos" w:cs="Aptos"/>
-        </w:rPr>
         <w:t>Filmtopia</w:t>
       </w:r>
       <w:proofErr w:type="spellEnd"/>
       <w:r>
-        <w:rPr>
-          <w:rFonts w:ascii="Aptos" w:eastAsia="Aptos" w:hAnsi="Aptos" w:cs="Aptos"/>
-        </w:rPr>
-        <w:t xml:space="preserve"> connect to one another. It shows the login form at the top as the single entry point into the system, an arrow leading from it into the main menu, and </w:t>
-      </w:r>
-      <w:r>
-        <w:rPr>
-          <w:rFonts w:ascii="Aptos" w:eastAsia="Aptos" w:hAnsi="Aptos" w:cs="Aptos"/>
-        </w:rPr>
-        <w:lastRenderedPageBreak/>
-        <w:t>then further arrows fanning out from the main menu to each of the forms it can open. This makes it easy to see at a glance that every part of the system is reached through the menu, and that the menu itself can only be reached by logging in first.</w:t>
+        <w:t xml:space="preserve"> system will use to store its data. As the system is built around a Microsoft Access database accessed through </w:t>
+      </w:r>
+      <w:proofErr w:type="spellStart"/>
+      <w:r>
+        <w:t>OleDb</w:t>
+      </w:r>
+      <w:proofErr w:type="spellEnd"/>
+      <w:r>
+        <w:t>, these data structures take the form of database tables rather than arrays or other in memory structures. Each table and the relationships between them are described below, along with the way the data in those tables will be accessed. A key aim throughout the design has been to make sure the table structure is fully normalised to third normal form so that data is never repeated unnecessarily and the database cannot end up in an inconsistent state.</w:t>
       </w:r>
     </w:p>
     <w:p>
       <w:pPr>
-        <w:pBdr>
-          <w:top w:val="single" w:sz="6" w:space="6" w:color="A02B93"/>
-          <w:left w:val="single" w:sz="6" w:space="6" w:color="A02B93"/>
-          <w:bottom w:val="single" w:sz="6" w:space="6" w:color="A02B93"/>
-          <w:right w:val="single" w:sz="6" w:space="6" w:color="A02B93"/>
-        </w:pBdr>
-        <w:shd w:val="clear" w:color="auto" w:fill="F7E9F3"/>
-        <w:spacing w:before="120" w:after="200"/>
-      </w:pPr>
-      <w:r>
-        <w:rPr>
-          <w:rFonts w:ascii="Aptos" w:eastAsia="Aptos" w:hAnsi="Aptos" w:cs="Aptos"/>
-          <w:b/>
-          <w:bCs/>
-          <w:color w:val="A02B93"/>
-          <w:sz w:val="22"/>
-          <w:szCs w:val="22"/>
-        </w:rPr>
-        <w:t>H</w:t>
-      </w:r>
-      <w:r>
-        <w:rPr>
-          <w:rFonts w:ascii="Aptos" w:eastAsia="Aptos" w:hAnsi="Aptos" w:cs="Aptos"/>
-          <w:b/>
-          <w:bCs/>
-          <w:color w:val="A02B93"/>
-          <w:sz w:val="22"/>
-          <w:szCs w:val="22"/>
-        </w:rPr>
-        <w:t>ow the forms connect</w:t>
-      </w:r>
-      <w:r>
-        <w:rPr>
-          <w:rFonts w:ascii="Aptos" w:eastAsia="Aptos" w:hAnsi="Aptos" w:cs="Aptos"/>
-          <w:b/>
-          <w:bCs/>
-          <w:color w:val="A02B93"/>
-          <w:sz w:val="22"/>
-          <w:szCs w:val="22"/>
-        </w:rPr>
-        <w:t>:</w:t>
-      </w:r>
-    </w:p>
-    <w:p>
-      <w:pPr>
-        <w:spacing w:after="160" w:line="276" w:lineRule="auto"/>
-      </w:pPr>
-    </w:p>
-    <w:p>
-      <w:pPr>
-        <w:pStyle w:val="Heading2"/>
+        <w:pStyle w:val="Heading3"/>
         <w:rPr>
           <w:b/>
           <w:bCs/>
@@ -2681,48 +3301,7 @@
           <w:bCs/>
           <w:color w:val="000000" w:themeColor="text1"/>
         </w:rPr>
-        <w:t>Data Structures and Methods of Access</w:t>
-      </w:r>
-    </w:p>
-    <w:p>
-      <w:pPr>
-        <w:spacing w:after="160" w:line="276" w:lineRule="auto"/>
-      </w:pPr>
-      <w:r>
-        <w:t xml:space="preserve">The purpose of this section is to specify the data structures that the </w:t>
-      </w:r>
-      <w:proofErr w:type="spellStart"/>
-      <w:r>
-        <w:t>Filmtopia</w:t>
-      </w:r>
-      <w:proofErr w:type="spellEnd"/>
-      <w:r>
-        <w:t xml:space="preserve"> system will use to store its data. As the system is built around a Microsoft Access database accessed through </w:t>
-      </w:r>
-      <w:proofErr w:type="spellStart"/>
-      <w:r>
-        <w:t>OleDb</w:t>
-      </w:r>
-      <w:proofErr w:type="spellEnd"/>
-      <w:r>
-        <w:t>, these data structures take the form of database tables rather than arrays or other in memory structures. Each table and the relationships between them are described below, along with the way the data in those tables will be accessed. A key aim throughout the design has been to make sure the table structure is fully normalised to third normal form so that data is never repeated unnecessarily and the database cannot end up in an inconsistent state.</w:t>
-      </w:r>
-    </w:p>
-    <w:p>
-      <w:pPr>
-        <w:pStyle w:val="Heading3"/>
-        <w:rPr>
-          <w:b/>
-          <w:bCs/>
-          <w:color w:val="000000" w:themeColor="text1"/>
-        </w:rPr>
-      </w:pPr>
-      <w:r>
-        <w:rPr>
-          <w:b/>
-          <w:bCs/>
-          <w:color w:val="000000" w:themeColor="text1"/>
-        </w:rPr>
+        <w:lastRenderedPageBreak/>
         <w:t>Entity Relationship Design</w:t>
       </w:r>
     </w:p>
@@ -2840,6 +3419,7 @@
         <w:rPr>
           <w:noProof/>
         </w:rPr>
+        <w:lastRenderedPageBreak/>
         <w:drawing>
           <wp:inline distT="0" distB="0" distL="0" distR="0" wp14:anchorId="76DA8415" wp14:editId="380A0CDF">
             <wp:extent cx="5715000" cy="4400550"/>
@@ -2975,7 +3555,11 @@
         <w:spacing w:after="160" w:line="276" w:lineRule="auto"/>
       </w:pPr>
       <w:r>
-        <w:t>Each of the entities identified above becomes a table in the Microsoft Access database. This part of the section describes each table in turn, explaining its purpose, the number of records it is expected to hold in the real system and the fields it contains. Before the individual tables, the methods used to access the data are explained.</w:t>
+        <w:t xml:space="preserve">Each of the entities identified above becomes a table in the Microsoft Access database. This part of the section describes each table in turn, explaining its purpose, the number of </w:t>
+      </w:r>
+      <w:r>
+        <w:lastRenderedPageBreak/>
+        <w:t>records it is expected to hold in the real system and the fields it contains. Before the individual tables, the methods used to access the data are explained.</w:t>
       </w:r>
     </w:p>
     <w:p>
@@ -3738,6 +4322,7 @@
           <w:bCs/>
           <w:color w:val="000000" w:themeColor="text1"/>
         </w:rPr>
+        <w:lastRenderedPageBreak/>
         <w:t>tblScreen</w:t>
       </w:r>
       <w:proofErr w:type="spellEnd"/>
@@ -5312,6 +5897,7 @@
                 <w:sz w:val="19"/>
                 <w:szCs w:val="19"/>
               </w:rPr>
+              <w:lastRenderedPageBreak/>
               <w:t>ScreenID</w:t>
             </w:r>
             <w:proofErr w:type="spellEnd"/>
@@ -7053,6 +7639,7 @@
           <w:b/>
           <w:bCs/>
         </w:rPr>
+        <w:lastRenderedPageBreak/>
         <w:t xml:space="preserve">Expected number of records: </w:t>
       </w:r>
       <w:r>
@@ -8757,6 +9344,7 @@
           <w:b/>
           <w:bCs/>
         </w:rPr>
+        <w:lastRenderedPageBreak/>
         <w:t xml:space="preserve">Expected number of records: </w:t>
       </w:r>
       <w:r>
@@ -10198,6 +10786,7 @@
           <w:bCs/>
           <w:color w:val="000000" w:themeColor="text1"/>
         </w:rPr>
+        <w:lastRenderedPageBreak/>
         <w:t>Processing Stages</w:t>
       </w:r>
     </w:p>
@@ -10683,6 +11272,7 @@
                 <w:sz w:val="19"/>
                 <w:szCs w:val="19"/>
               </w:rPr>
+              <w:lastRenderedPageBreak/>
               <w:t xml:space="preserve">SET </w:t>
             </w:r>
             <w:proofErr w:type="spellStart"/>
@@ -11433,6 +12023,7 @@
                 <w:sz w:val="19"/>
                 <w:szCs w:val="19"/>
               </w:rPr>
+              <w:lastRenderedPageBreak/>
               <w:t xml:space="preserve">GET the selected screening and its </w:t>
             </w:r>
             <w:proofErr w:type="spellStart"/>
@@ -12767,6 +13358,7 @@
         <w:spacing w:after="160" w:line="276" w:lineRule="auto"/>
       </w:pPr>
       <w:r>
+        <w:lastRenderedPageBreak/>
         <w:t xml:space="preserve">A presence check makes sure a required field has not been left blank. A type check makes sure the data is of the right kind, for example that a number has been entered where a number is expected. A length check makes sure an entry is </w:t>
       </w:r>
       <w:proofErr w:type="spellStart"/>
@@ -14042,6 +14634,7 @@
                 <w:sz w:val="19"/>
                 <w:szCs w:val="19"/>
               </w:rPr>
+              <w:lastRenderedPageBreak/>
               <w:t>Film</w:t>
             </w:r>
           </w:p>

</xml_diff>

<commit_message>
after such a long mindblock im just gonna do the designs on word as quickly as possible, they take AGES to do neatly though.
</commit_message>
<xml_diff>
--- a/Design.docx
+++ b/Design.docx
@@ -349,6 +349,17 @@
           <w:szCs w:val="22"/>
         </w:rPr>
         <w:t>)</w:t>
+      </w:r>
+      <w:r>
+        <w:rPr>
+          <w:rFonts w:ascii="Aptos" w:eastAsia="Aptos" w:hAnsi="Aptos" w:cs="Aptos"/>
+          <w:b/>
+          <w:bCs/>
+          <w:color w:val="A02B93"/>
+          <w:sz w:val="22"/>
+          <w:szCs w:val="22"/>
+        </w:rPr>
+        <w:t xml:space="preserve"> </w:t>
       </w:r>
     </w:p>
     <w:p>

</xml_diff>

<commit_message>
added design for frmMainForm in design.
</commit_message>
<xml_diff>
--- a/Design.docx
+++ b/Design.docx
@@ -1064,8 +1064,6 @@
         </w:pBdr>
         <w:shd w:val="clear" w:color="auto" w:fill="F7E9F3"/>
         <w:spacing w:before="120" w:after="200"/>
-      </w:pPr>
-      <w:r>
         <w:rPr>
           <w:rFonts w:ascii="Aptos" w:eastAsia="Aptos" w:hAnsi="Aptos" w:cs="Aptos"/>
           <w:b/>
@@ -1074,9 +1072,7 @@
           <w:sz w:val="22"/>
           <w:szCs w:val="22"/>
         </w:rPr>
-        <w:t>Main Menu (</w:t>
-      </w:r>
-      <w:proofErr w:type="spellStart"/>
+      </w:pPr>
       <w:r>
         <w:rPr>
           <w:rFonts w:ascii="Aptos" w:eastAsia="Aptos" w:hAnsi="Aptos" w:cs="Aptos"/>
@@ -1086,9 +1082,9 @@
           <w:sz w:val="22"/>
           <w:szCs w:val="22"/>
         </w:rPr>
-        <w:t>frmMainForm</w:t>
-      </w:r>
-      <w:proofErr w:type="spellEnd"/>
+        <w:t>Main Menu (</w:t>
+      </w:r>
+      <w:proofErr w:type="spellStart"/>
       <w:r>
         <w:rPr>
           <w:rFonts w:ascii="Aptos" w:eastAsia="Aptos" w:hAnsi="Aptos" w:cs="Aptos"/>
@@ -1098,202 +1094,19 @@
           <w:sz w:val="22"/>
           <w:szCs w:val="22"/>
         </w:rPr>
-        <w:t>)</w:t>
-      </w:r>
-    </w:p>
-    <w:p>
-      <w:pPr>
-        <w:spacing w:after="160" w:line="276" w:lineRule="auto"/>
-      </w:pPr>
-      <w:r>
-        <w:rPr>
-          <w:rFonts w:ascii="Aptos" w:eastAsia="Aptos" w:hAnsi="Aptos" w:cs="Aptos"/>
-        </w:rPr>
-        <w:t>The input to the main menu is simply the button the user chooses to press. The output is the opening of whichever form that button is linked to. There is no data entry on this screen at all, this is because its only job is navigation, and keeping it free of clutter makes it obvious where everything lives.</w:t>
-      </w:r>
-    </w:p>
-    <w:p>
-      <w:pPr>
-        <w:pStyle w:val="Heading3"/>
-        <w:spacing w:before="260" w:after="120"/>
-      </w:pPr>
-      <w:r>
-        <w:rPr>
-          <w:rFonts w:ascii="Aptos Display" w:eastAsia="Aptos Display" w:hAnsi="Aptos Display" w:cs="Aptos Display"/>
+        <w:t>frmMainForm</w:t>
+      </w:r>
+      <w:proofErr w:type="spellEnd"/>
+      <w:r>
+        <w:rPr>
+          <w:rFonts w:ascii="Aptos" w:eastAsia="Aptos" w:hAnsi="Aptos" w:cs="Aptos"/>
           <w:b/>
           <w:bCs/>
-          <w:color w:val="000000"/>
-        </w:rPr>
-        <w:t>Adding New Films (Objective 6)</w:t>
-      </w:r>
-    </w:p>
-    <w:p>
-      <w:pPr>
-        <w:spacing w:after="160" w:line="276" w:lineRule="auto"/>
-      </w:pPr>
-      <w:r>
-        <w:rPr>
-          <w:rFonts w:ascii="Aptos" w:eastAsia="Aptos" w:hAnsi="Aptos" w:cs="Aptos"/>
-        </w:rPr>
-        <w:t xml:space="preserve">Moving on to the management side of the system, one of the first jobs a manager or member of staff needs to do is add the films that the cinema is showing, because without any films in the system there is nothing for a screening to be attached to. This objective is handled by a single form named </w:t>
-      </w:r>
-      <w:proofErr w:type="spellStart"/>
-      <w:r>
-        <w:rPr>
-          <w:rFonts w:ascii="Aptos" w:eastAsia="Aptos" w:hAnsi="Aptos" w:cs="Aptos"/>
-        </w:rPr>
-        <w:t>frmFilms</w:t>
-      </w:r>
-      <w:proofErr w:type="spellEnd"/>
-      <w:r>
-        <w:rPr>
-          <w:rFonts w:ascii="Aptos" w:eastAsia="Aptos" w:hAnsi="Aptos" w:cs="Aptos"/>
-        </w:rPr>
-        <w:t xml:space="preserve"> which lets the user add a new film, edit an existing one, or remove one that is no longer being shown.</w:t>
-      </w:r>
-    </w:p>
-    <w:p>
-      <w:pPr>
-        <w:spacing w:after="160" w:line="276" w:lineRule="auto"/>
-      </w:pPr>
-      <w:r>
-        <w:rPr>
-          <w:rFonts w:ascii="Aptos" w:eastAsia="Aptos" w:hAnsi="Aptos" w:cs="Aptos"/>
-        </w:rPr>
-        <w:t xml:space="preserve">The form is split into two halves. On one side is a data grid view named </w:t>
-      </w:r>
-      <w:proofErr w:type="spellStart"/>
-      <w:r>
-        <w:rPr>
-          <w:rFonts w:ascii="Aptos" w:eastAsia="Aptos" w:hAnsi="Aptos" w:cs="Aptos"/>
-        </w:rPr>
-        <w:t>dgvFilms</w:t>
-      </w:r>
-      <w:proofErr w:type="spellEnd"/>
-      <w:r>
-        <w:rPr>
-          <w:rFonts w:ascii="Aptos" w:eastAsia="Aptos" w:hAnsi="Aptos" w:cs="Aptos"/>
-        </w:rPr>
-        <w:t xml:space="preserve"> which lists every film already stored in the system, showing its title, age rating, duration and description in a table so the user can see at a glance what is already there. On the other side is a set of input boxes for the details of a film, made up of a label and a text box for each field, which I have named </w:t>
-      </w:r>
-      <w:proofErr w:type="spellStart"/>
-      <w:r>
-        <w:rPr>
-          <w:rFonts w:ascii="Aptos" w:eastAsia="Aptos" w:hAnsi="Aptos" w:cs="Aptos"/>
-        </w:rPr>
-        <w:t>txtTitle</w:t>
-      </w:r>
-      <w:proofErr w:type="spellEnd"/>
-      <w:r>
-        <w:rPr>
-          <w:rFonts w:ascii="Aptos" w:eastAsia="Aptos" w:hAnsi="Aptos" w:cs="Aptos"/>
-        </w:rPr>
-        <w:t xml:space="preserve">, </w:t>
-      </w:r>
-      <w:proofErr w:type="spellStart"/>
-      <w:r>
-        <w:rPr>
-          <w:rFonts w:ascii="Aptos" w:eastAsia="Aptos" w:hAnsi="Aptos" w:cs="Aptos"/>
-        </w:rPr>
-        <w:t>txtAgeRating</w:t>
-      </w:r>
-      <w:proofErr w:type="spellEnd"/>
-      <w:r>
-        <w:rPr>
-          <w:rFonts w:ascii="Aptos" w:eastAsia="Aptos" w:hAnsi="Aptos" w:cs="Aptos"/>
-        </w:rPr>
-        <w:t xml:space="preserve">, </w:t>
-      </w:r>
-      <w:proofErr w:type="spellStart"/>
-      <w:r>
-        <w:rPr>
-          <w:rFonts w:ascii="Aptos" w:eastAsia="Aptos" w:hAnsi="Aptos" w:cs="Aptos"/>
-        </w:rPr>
-        <w:t>txtDuration</w:t>
-      </w:r>
-      <w:proofErr w:type="spellEnd"/>
-      <w:r>
-        <w:rPr>
-          <w:rFonts w:ascii="Aptos" w:eastAsia="Aptos" w:hAnsi="Aptos" w:cs="Aptos"/>
-        </w:rPr>
-        <w:t xml:space="preserve"> and </w:t>
-      </w:r>
-      <w:proofErr w:type="spellStart"/>
-      <w:r>
-        <w:rPr>
-          <w:rFonts w:ascii="Aptos" w:eastAsia="Aptos" w:hAnsi="Aptos" w:cs="Aptos"/>
-        </w:rPr>
-        <w:t>txtDescription</w:t>
-      </w:r>
-      <w:proofErr w:type="spellEnd"/>
-      <w:r>
-        <w:rPr>
-          <w:rFonts w:ascii="Aptos" w:eastAsia="Aptos" w:hAnsi="Aptos" w:cs="Aptos"/>
-        </w:rPr>
-        <w:t xml:space="preserve">. </w:t>
-      </w:r>
-      <w:r>
-        <w:rPr>
-          <w:rFonts w:ascii="Aptos" w:eastAsia="Aptos" w:hAnsi="Aptos" w:cs="Aptos"/>
-        </w:rPr>
-        <w:lastRenderedPageBreak/>
-        <w:t xml:space="preserve">Beneath these are four buttons, Add, Update, Delete and Clear, which I have named </w:t>
-      </w:r>
-      <w:proofErr w:type="spellStart"/>
-      <w:r>
-        <w:rPr>
-          <w:rFonts w:ascii="Aptos" w:eastAsia="Aptos" w:hAnsi="Aptos" w:cs="Aptos"/>
-        </w:rPr>
-        <w:t>btnAdd</w:t>
-      </w:r>
-      <w:proofErr w:type="spellEnd"/>
-      <w:r>
-        <w:rPr>
-          <w:rFonts w:ascii="Aptos" w:eastAsia="Aptos" w:hAnsi="Aptos" w:cs="Aptos"/>
-        </w:rPr>
-        <w:t xml:space="preserve">, </w:t>
-      </w:r>
-      <w:proofErr w:type="spellStart"/>
-      <w:r>
-        <w:rPr>
-          <w:rFonts w:ascii="Aptos" w:eastAsia="Aptos" w:hAnsi="Aptos" w:cs="Aptos"/>
-        </w:rPr>
-        <w:t>btnUpdate</w:t>
-      </w:r>
-      <w:proofErr w:type="spellEnd"/>
-      <w:r>
-        <w:rPr>
-          <w:rFonts w:ascii="Aptos" w:eastAsia="Aptos" w:hAnsi="Aptos" w:cs="Aptos"/>
-        </w:rPr>
-        <w:t xml:space="preserve">, </w:t>
-      </w:r>
-      <w:proofErr w:type="spellStart"/>
-      <w:r>
-        <w:rPr>
-          <w:rFonts w:ascii="Aptos" w:eastAsia="Aptos" w:hAnsi="Aptos" w:cs="Aptos"/>
-        </w:rPr>
-        <w:t>btnDelete</w:t>
-      </w:r>
-      <w:proofErr w:type="spellEnd"/>
-      <w:r>
-        <w:rPr>
-          <w:rFonts w:ascii="Aptos" w:eastAsia="Aptos" w:hAnsi="Aptos" w:cs="Aptos"/>
-        </w:rPr>
-        <w:t xml:space="preserve"> and </w:t>
-      </w:r>
-      <w:proofErr w:type="spellStart"/>
-      <w:r>
-        <w:rPr>
-          <w:rFonts w:ascii="Aptos" w:eastAsia="Aptos" w:hAnsi="Aptos" w:cs="Aptos"/>
-        </w:rPr>
-        <w:t>btnClear</w:t>
-      </w:r>
-      <w:proofErr w:type="spellEnd"/>
-      <w:r>
-        <w:rPr>
-          <w:rFonts w:ascii="Aptos" w:eastAsia="Aptos" w:hAnsi="Aptos" w:cs="Aptos"/>
-        </w:rPr>
-        <w:t>.</w:t>
+          <w:color w:val="A02B93"/>
+          <w:sz w:val="22"/>
+          <w:szCs w:val="22"/>
+        </w:rPr>
+        <w:t>)</w:t>
       </w:r>
     </w:p>
     <w:p>
@@ -1309,38 +1122,1918 @@
       </w:pPr>
       <w:r>
         <w:rPr>
-          <w:rFonts w:ascii="Aptos" w:eastAsia="Aptos" w:hAnsi="Aptos" w:cs="Aptos"/>
-          <w:b/>
-          <w:bCs/>
-          <w:color w:val="A02B93"/>
-          <w:sz w:val="22"/>
-          <w:szCs w:val="22"/>
-        </w:rPr>
-        <w:t>Add Films Form (</w:t>
-      </w:r>
-      <w:proofErr w:type="spellStart"/>
-      <w:r>
-        <w:rPr>
-          <w:rFonts w:ascii="Aptos" w:eastAsia="Aptos" w:hAnsi="Aptos" w:cs="Aptos"/>
-          <w:b/>
-          <w:bCs/>
-          <w:color w:val="A02B93"/>
-          <w:sz w:val="22"/>
-          <w:szCs w:val="22"/>
-        </w:rPr>
-        <w:t>frmFilms</w:t>
-      </w:r>
-      <w:proofErr w:type="spellEnd"/>
-      <w:r>
-        <w:rPr>
-          <w:rFonts w:ascii="Aptos" w:eastAsia="Aptos" w:hAnsi="Aptos" w:cs="Aptos"/>
-          <w:b/>
-          <w:bCs/>
-          <w:color w:val="A02B93"/>
-          <w:sz w:val="22"/>
-          <w:szCs w:val="22"/>
-        </w:rPr>
-        <w:t>)</w:t>
+          <w:noProof/>
+        </w:rPr>
+        <mc:AlternateContent>
+          <mc:Choice Requires="wpc">
+            <w:drawing>
+              <wp:inline distT="0" distB="0" distL="0" distR="0" wp14:anchorId="5E1AF47B" wp14:editId="1305C04B">
+                <wp:extent cx="5486400" cy="3296920"/>
+                <wp:effectExtent l="0" t="0" r="19050" b="0"/>
+                <wp:docPr id="850462073" name="Canvas 5"/>
+                <wp:cNvGraphicFramePr>
+                  <a:graphicFrameLocks xmlns:a="http://schemas.openxmlformats.org/drawingml/2006/main" noChangeAspect="1"/>
+                </wp:cNvGraphicFramePr>
+                <a:graphic xmlns:a="http://schemas.openxmlformats.org/drawingml/2006/main">
+                  <a:graphicData uri="http://schemas.microsoft.com/office/word/2010/wordprocessingCanvas">
+                    <wpc:wpc>
+                      <wpc:bg>
+                        <a:solidFill>
+                          <a:prstClr val="white"/>
+                        </a:solidFill>
+                      </wpc:bg>
+                      <wpc:whole/>
+                      <wps:wsp>
+                        <wps:cNvPr id="1567915412" name="Rectangle 1567915412"/>
+                        <wps:cNvSpPr/>
+                        <wps:spPr>
+                          <a:xfrm>
+                            <a:off x="9071" y="1"/>
+                            <a:ext cx="918029" cy="3261360"/>
+                          </a:xfrm>
+                          <a:prstGeom prst="rect">
+                            <a:avLst/>
+                          </a:prstGeom>
+                        </wps:spPr>
+                        <wps:style>
+                          <a:lnRef idx="2">
+                            <a:schemeClr val="accent5">
+                              <a:shade val="15000"/>
+                            </a:schemeClr>
+                          </a:lnRef>
+                          <a:fillRef idx="1">
+                            <a:schemeClr val="accent5"/>
+                          </a:fillRef>
+                          <a:effectRef idx="0">
+                            <a:schemeClr val="accent5"/>
+                          </a:effectRef>
+                          <a:fontRef idx="minor">
+                            <a:schemeClr val="lt1"/>
+                          </a:fontRef>
+                        </wps:style>
+                        <wps:bodyPr rot="0" spcFirstLastPara="0" vertOverflow="overflow" horzOverflow="overflow" vert="horz" wrap="square" lIns="91440" tIns="45720" rIns="91440" bIns="45720" numCol="1" spcCol="0" rtlCol="0" fromWordArt="0" anchor="ctr" anchorCtr="0" forceAA="0" compatLnSpc="1">
+                          <a:prstTxWarp prst="textNoShape">
+                            <a:avLst/>
+                          </a:prstTxWarp>
+                          <a:noAutofit/>
+                        </wps:bodyPr>
+                      </wps:wsp>
+                      <wps:wsp>
+                        <wps:cNvPr id="1199104866" name="Text Box 1199104866"/>
+                        <wps:cNvSpPr txBox="1"/>
+                        <wps:spPr>
+                          <a:xfrm>
+                            <a:off x="9071" y="0"/>
+                            <a:ext cx="946150" cy="243840"/>
+                          </a:xfrm>
+                          <a:prstGeom prst="rect">
+                            <a:avLst/>
+                          </a:prstGeom>
+                          <a:ln/>
+                        </wps:spPr>
+                        <wps:style>
+                          <a:lnRef idx="2">
+                            <a:schemeClr val="accent5">
+                              <a:shade val="15000"/>
+                            </a:schemeClr>
+                          </a:lnRef>
+                          <a:fillRef idx="1">
+                            <a:schemeClr val="accent5"/>
+                          </a:fillRef>
+                          <a:effectRef idx="0">
+                            <a:schemeClr val="accent5"/>
+                          </a:effectRef>
+                          <a:fontRef idx="minor">
+                            <a:schemeClr val="lt1"/>
+                          </a:fontRef>
+                        </wps:style>
+                        <wps:txbx>
+                          <w:txbxContent>
+                            <w:p>
+                              <w:pPr>
+                                <w:rPr>
+                                  <w:b/>
+                                  <w:bCs/>
+                                  <w:sz w:val="14"/>
+                                  <w:szCs w:val="14"/>
+                                </w:rPr>
+                              </w:pPr>
+                              <w:proofErr w:type="spellStart"/>
+                              <w:r>
+                                <w:rPr>
+                                  <w:b/>
+                                  <w:bCs/>
+                                  <w:sz w:val="14"/>
+                                  <w:szCs w:val="14"/>
+                                </w:rPr>
+                                <w:t>Filmtopia</w:t>
+                              </w:r>
+                              <w:proofErr w:type="spellEnd"/>
+                              <w:r>
+                                <w:rPr>
+                                  <w:b/>
+                                  <w:bCs/>
+                                  <w:sz w:val="14"/>
+                                  <w:szCs w:val="14"/>
+                                </w:rPr>
+                                <w:t xml:space="preserve"> Manager</w:t>
+                              </w:r>
+                              <w:r>
+                                <w:rPr>
+                                  <w:b/>
+                                  <w:bCs/>
+                                  <w:sz w:val="14"/>
+                                  <w:szCs w:val="14"/>
+                                </w:rPr>
+                                <w:t xml:space="preserve">      </w:t>
+                              </w:r>
+                              <w:r>
+                                <w:rPr>
+                                  <w:sz w:val="28"/>
+                                  <w:szCs w:val="28"/>
+                                </w:rPr>
+                                <w:t xml:space="preserve">              </w:t>
+                              </w:r>
+                            </w:p>
+                          </w:txbxContent>
+                        </wps:txbx>
+                        <wps:bodyPr rot="0" spcFirstLastPara="0" vertOverflow="overflow" horzOverflow="overflow" vert="horz" wrap="none" lIns="91440" tIns="45720" rIns="91440" bIns="45720" numCol="1" spcCol="0" rtlCol="0" fromWordArt="0" anchor="t" anchorCtr="0" forceAA="0" compatLnSpc="1">
+                          <a:prstTxWarp prst="textNoShape">
+                            <a:avLst/>
+                          </a:prstTxWarp>
+                          <a:noAutofit/>
+                        </wps:bodyPr>
+                      </wps:wsp>
+                      <wps:wsp>
+                        <wps:cNvPr id="2036808941" name="Text Box 2036808941"/>
+                        <wps:cNvSpPr txBox="1"/>
+                        <wps:spPr>
+                          <a:xfrm>
+                            <a:off x="9070" y="628650"/>
+                            <a:ext cx="905329" cy="215900"/>
+                          </a:xfrm>
+                          <a:prstGeom prst="rect">
+                            <a:avLst/>
+                          </a:prstGeom>
+                          <a:ln/>
+                        </wps:spPr>
+                        <wps:style>
+                          <a:lnRef idx="2">
+                            <a:schemeClr val="accent5">
+                              <a:shade val="15000"/>
+                            </a:schemeClr>
+                          </a:lnRef>
+                          <a:fillRef idx="1">
+                            <a:schemeClr val="accent5"/>
+                          </a:fillRef>
+                          <a:effectRef idx="0">
+                            <a:schemeClr val="accent5"/>
+                          </a:effectRef>
+                          <a:fontRef idx="minor">
+                            <a:schemeClr val="lt1"/>
+                          </a:fontRef>
+                        </wps:style>
+                        <wps:txbx>
+                          <w:txbxContent>
+                            <w:p>
+                              <w:pPr>
+                                <w:rPr>
+                                  <w:sz w:val="12"/>
+                                  <w:szCs w:val="12"/>
+                                </w:rPr>
+                              </w:pPr>
+                              <w:r>
+                                <w:rPr>
+                                  <w:sz w:val="12"/>
+                                  <w:szCs w:val="12"/>
+                                </w:rPr>
+                                <w:t>Bookings</w:t>
+                              </w:r>
+                            </w:p>
+                          </w:txbxContent>
+                        </wps:txbx>
+                        <wps:bodyPr rot="0" spcFirstLastPara="0" vertOverflow="overflow" horzOverflow="overflow" vert="horz" wrap="square" lIns="91440" tIns="45720" rIns="91440" bIns="45720" numCol="1" spcCol="0" rtlCol="0" fromWordArt="0" anchor="t" anchorCtr="0" forceAA="0" compatLnSpc="1">
+                          <a:prstTxWarp prst="textNoShape">
+                            <a:avLst/>
+                          </a:prstTxWarp>
+                          <a:noAutofit/>
+                        </wps:bodyPr>
+                      </wps:wsp>
+                      <wps:wsp>
+                        <wps:cNvPr id="817942222" name="Text Box 1"/>
+                        <wps:cNvSpPr txBox="1"/>
+                        <wps:spPr>
+                          <a:xfrm>
+                            <a:off x="9070" y="884850"/>
+                            <a:ext cx="904875" cy="215900"/>
+                          </a:xfrm>
+                          <a:prstGeom prst="rect">
+                            <a:avLst/>
+                          </a:prstGeom>
+                          <a:ln/>
+                        </wps:spPr>
+                        <wps:style>
+                          <a:lnRef idx="2">
+                            <a:schemeClr val="accent5">
+                              <a:shade val="15000"/>
+                            </a:schemeClr>
+                          </a:lnRef>
+                          <a:fillRef idx="1">
+                            <a:schemeClr val="accent5"/>
+                          </a:fillRef>
+                          <a:effectRef idx="0">
+                            <a:schemeClr val="accent5"/>
+                          </a:effectRef>
+                          <a:fontRef idx="minor">
+                            <a:schemeClr val="lt1"/>
+                          </a:fontRef>
+                        </wps:style>
+                        <wps:txbx>
+                          <w:txbxContent>
+                            <w:p>
+                              <w:pPr>
+                                <w:rPr>
+                                  <w:rFonts w:eastAsia="Aptos"/>
+                                  <w:sz w:val="12"/>
+                                  <w:szCs w:val="12"/>
+                                  <w14:ligatures w14:val="none"/>
+                                </w:rPr>
+                              </w:pPr>
+                              <w:r>
+                                <w:rPr>
+                                  <w:rFonts w:eastAsia="Aptos"/>
+                                  <w:sz w:val="12"/>
+                                  <w:szCs w:val="12"/>
+                                </w:rPr>
+                                <w:t>Find Booking</w:t>
+                              </w:r>
+                            </w:p>
+                          </w:txbxContent>
+                        </wps:txbx>
+                        <wps:bodyPr rot="0" spcFirstLastPara="0" vert="horz" wrap="square" lIns="91440" tIns="45720" rIns="91440" bIns="45720" numCol="1" spcCol="0" rtlCol="0" fromWordArt="0" anchor="t" anchorCtr="0" forceAA="0" compatLnSpc="1">
+                          <a:prstTxWarp prst="textNoShape">
+                            <a:avLst/>
+                          </a:prstTxWarp>
+                          <a:noAutofit/>
+                        </wps:bodyPr>
+                      </wps:wsp>
+                      <wps:wsp>
+                        <wps:cNvPr id="1316712679" name="Text Box 1"/>
+                        <wps:cNvSpPr txBox="1"/>
+                        <wps:spPr>
+                          <a:xfrm>
+                            <a:off x="9070" y="1137580"/>
+                            <a:ext cx="904875" cy="215900"/>
+                          </a:xfrm>
+                          <a:prstGeom prst="rect">
+                            <a:avLst/>
+                          </a:prstGeom>
+                          <a:ln/>
+                        </wps:spPr>
+                        <wps:style>
+                          <a:lnRef idx="2">
+                            <a:schemeClr val="accent5">
+                              <a:shade val="15000"/>
+                            </a:schemeClr>
+                          </a:lnRef>
+                          <a:fillRef idx="1">
+                            <a:schemeClr val="accent5"/>
+                          </a:fillRef>
+                          <a:effectRef idx="0">
+                            <a:schemeClr val="accent5"/>
+                          </a:effectRef>
+                          <a:fontRef idx="minor">
+                            <a:schemeClr val="lt1"/>
+                          </a:fontRef>
+                        </wps:style>
+                        <wps:txbx>
+                          <w:txbxContent>
+                            <w:p>
+                              <w:pPr>
+                                <w:rPr>
+                                  <w:rFonts w:eastAsia="Aptos"/>
+                                  <w:sz w:val="12"/>
+                                  <w:szCs w:val="12"/>
+                                  <w14:ligatures w14:val="none"/>
+                                </w:rPr>
+                              </w:pPr>
+                              <w:r>
+                                <w:rPr>
+                                  <w:rFonts w:eastAsia="Aptos"/>
+                                  <w:sz w:val="12"/>
+                                  <w:szCs w:val="12"/>
+                                </w:rPr>
+                                <w:t>Screenings</w:t>
+                              </w:r>
+                            </w:p>
+                          </w:txbxContent>
+                        </wps:txbx>
+                        <wps:bodyPr rot="0" spcFirstLastPara="0" vert="horz" wrap="square" lIns="91440" tIns="45720" rIns="91440" bIns="45720" numCol="1" spcCol="0" rtlCol="0" fromWordArt="0" anchor="t" anchorCtr="0" forceAA="0" compatLnSpc="1">
+                          <a:prstTxWarp prst="textNoShape">
+                            <a:avLst/>
+                          </a:prstTxWarp>
+                          <a:noAutofit/>
+                        </wps:bodyPr>
+                      </wps:wsp>
+                      <wps:wsp>
+                        <wps:cNvPr id="1723039186" name="Text Box 1"/>
+                        <wps:cNvSpPr txBox="1"/>
+                        <wps:spPr>
+                          <a:xfrm>
+                            <a:off x="9070" y="1380150"/>
+                            <a:ext cx="904875" cy="215900"/>
+                          </a:xfrm>
+                          <a:prstGeom prst="rect">
+                            <a:avLst/>
+                          </a:prstGeom>
+                          <a:ln/>
+                        </wps:spPr>
+                        <wps:style>
+                          <a:lnRef idx="2">
+                            <a:schemeClr val="accent5">
+                              <a:shade val="15000"/>
+                            </a:schemeClr>
+                          </a:lnRef>
+                          <a:fillRef idx="1">
+                            <a:schemeClr val="accent5"/>
+                          </a:fillRef>
+                          <a:effectRef idx="0">
+                            <a:schemeClr val="accent5"/>
+                          </a:effectRef>
+                          <a:fontRef idx="minor">
+                            <a:schemeClr val="lt1"/>
+                          </a:fontRef>
+                        </wps:style>
+                        <wps:txbx>
+                          <w:txbxContent>
+                            <w:p>
+                              <w:pPr>
+                                <w:rPr>
+                                  <w:rFonts w:eastAsia="Aptos"/>
+                                  <w:sz w:val="12"/>
+                                  <w:szCs w:val="12"/>
+                                  <w14:ligatures w14:val="none"/>
+                                </w:rPr>
+                              </w:pPr>
+                              <w:r>
+                                <w:rPr>
+                                  <w:rFonts w:eastAsia="Aptos"/>
+                                  <w:sz w:val="12"/>
+                                  <w:szCs w:val="12"/>
+                                </w:rPr>
+                                <w:t>Customers</w:t>
+                              </w:r>
+                            </w:p>
+                          </w:txbxContent>
+                        </wps:txbx>
+                        <wps:bodyPr rot="0" spcFirstLastPara="0" vert="horz" wrap="square" lIns="91440" tIns="45720" rIns="91440" bIns="45720" numCol="1" spcCol="0" rtlCol="0" fromWordArt="0" anchor="t" anchorCtr="0" forceAA="0" compatLnSpc="1">
+                          <a:prstTxWarp prst="textNoShape">
+                            <a:avLst/>
+                          </a:prstTxWarp>
+                          <a:noAutofit/>
+                        </wps:bodyPr>
+                      </wps:wsp>
+                      <wps:wsp>
+                        <wps:cNvPr id="771219604" name="Text Box 1"/>
+                        <wps:cNvSpPr txBox="1"/>
+                        <wps:spPr>
+                          <a:xfrm>
+                            <a:off x="9070" y="1620180"/>
+                            <a:ext cx="904875" cy="215900"/>
+                          </a:xfrm>
+                          <a:prstGeom prst="rect">
+                            <a:avLst/>
+                          </a:prstGeom>
+                          <a:solidFill>
+                            <a:srgbClr val="AD1457"/>
+                          </a:solidFill>
+                          <a:ln/>
+                        </wps:spPr>
+                        <wps:style>
+                          <a:lnRef idx="2">
+                            <a:schemeClr val="accent5">
+                              <a:shade val="15000"/>
+                            </a:schemeClr>
+                          </a:lnRef>
+                          <a:fillRef idx="1">
+                            <a:schemeClr val="accent5"/>
+                          </a:fillRef>
+                          <a:effectRef idx="0">
+                            <a:schemeClr val="accent5"/>
+                          </a:effectRef>
+                          <a:fontRef idx="minor">
+                            <a:schemeClr val="lt1"/>
+                          </a:fontRef>
+                        </wps:style>
+                        <wps:txbx>
+                          <w:txbxContent>
+                            <w:p>
+                              <w:pPr>
+                                <w:rPr>
+                                  <w:rFonts w:eastAsia="Aptos"/>
+                                  <w:sz w:val="12"/>
+                                  <w:szCs w:val="12"/>
+                                  <w14:ligatures w14:val="none"/>
+                                </w:rPr>
+                              </w:pPr>
+                              <w:r>
+                                <w:rPr>
+                                  <w:rFonts w:eastAsia="Aptos"/>
+                                  <w:sz w:val="12"/>
+                                  <w:szCs w:val="12"/>
+                                </w:rPr>
+                                <w:t>Films</w:t>
+                              </w:r>
+                            </w:p>
+                          </w:txbxContent>
+                        </wps:txbx>
+                        <wps:bodyPr rot="0" spcFirstLastPara="0" vert="horz" wrap="square" lIns="91440" tIns="45720" rIns="91440" bIns="45720" numCol="1" spcCol="0" rtlCol="0" fromWordArt="0" anchor="t" anchorCtr="0" forceAA="0" compatLnSpc="1">
+                          <a:prstTxWarp prst="textNoShape">
+                            <a:avLst/>
+                          </a:prstTxWarp>
+                          <a:noAutofit/>
+                        </wps:bodyPr>
+                      </wps:wsp>
+                      <wps:wsp>
+                        <wps:cNvPr id="670175078" name="Rectangle 670175078"/>
+                        <wps:cNvSpPr/>
+                        <wps:spPr>
+                          <a:xfrm>
+                            <a:off x="935650" y="0"/>
+                            <a:ext cx="4550750" cy="628650"/>
+                          </a:xfrm>
+                          <a:prstGeom prst="rect">
+                            <a:avLst/>
+                          </a:prstGeom>
+                        </wps:spPr>
+                        <wps:style>
+                          <a:lnRef idx="2">
+                            <a:schemeClr val="accent5">
+                              <a:shade val="15000"/>
+                            </a:schemeClr>
+                          </a:lnRef>
+                          <a:fillRef idx="1">
+                            <a:schemeClr val="accent5"/>
+                          </a:fillRef>
+                          <a:effectRef idx="0">
+                            <a:schemeClr val="accent5"/>
+                          </a:effectRef>
+                          <a:fontRef idx="minor">
+                            <a:schemeClr val="lt1"/>
+                          </a:fontRef>
+                        </wps:style>
+                        <wps:bodyPr rot="0" spcFirstLastPara="0" vert="horz" wrap="square" lIns="91440" tIns="45720" rIns="91440" bIns="45720" numCol="1" spcCol="0" rtlCol="0" fromWordArt="0" anchor="ctr" anchorCtr="0" forceAA="0" compatLnSpc="1">
+                          <a:prstTxWarp prst="textNoShape">
+                            <a:avLst/>
+                          </a:prstTxWarp>
+                          <a:noAutofit/>
+                        </wps:bodyPr>
+                      </wps:wsp>
+                      <wps:wsp>
+                        <wps:cNvPr id="55668069" name="Text Box 1"/>
+                        <wps:cNvSpPr txBox="1"/>
+                        <wps:spPr>
+                          <a:xfrm>
+                            <a:off x="9070" y="1856400"/>
+                            <a:ext cx="904875" cy="215900"/>
+                          </a:xfrm>
+                          <a:prstGeom prst="rect">
+                            <a:avLst/>
+                          </a:prstGeom>
+                          <a:ln/>
+                        </wps:spPr>
+                        <wps:style>
+                          <a:lnRef idx="2">
+                            <a:schemeClr val="accent5">
+                              <a:shade val="15000"/>
+                            </a:schemeClr>
+                          </a:lnRef>
+                          <a:fillRef idx="1">
+                            <a:schemeClr val="accent5"/>
+                          </a:fillRef>
+                          <a:effectRef idx="0">
+                            <a:schemeClr val="accent5"/>
+                          </a:effectRef>
+                          <a:fontRef idx="minor">
+                            <a:schemeClr val="lt1"/>
+                          </a:fontRef>
+                        </wps:style>
+                        <wps:txbx>
+                          <w:txbxContent>
+                            <w:p>
+                              <w:pPr>
+                                <w:rPr>
+                                  <w:rFonts w:eastAsia="Aptos"/>
+                                  <w:sz w:val="12"/>
+                                  <w:szCs w:val="12"/>
+                                  <w14:ligatures w14:val="none"/>
+                                </w:rPr>
+                              </w:pPr>
+                              <w:r>
+                                <w:rPr>
+                                  <w:rFonts w:eastAsia="Aptos"/>
+                                  <w:sz w:val="12"/>
+                                  <w:szCs w:val="12"/>
+                                </w:rPr>
+                                <w:t>Screens</w:t>
+                              </w:r>
+                            </w:p>
+                          </w:txbxContent>
+                        </wps:txbx>
+                        <wps:bodyPr rot="0" spcFirstLastPara="0" vert="horz" wrap="square" lIns="91440" tIns="45720" rIns="91440" bIns="45720" numCol="1" spcCol="0" rtlCol="0" fromWordArt="0" anchor="t" anchorCtr="0" forceAA="0" compatLnSpc="1">
+                          <a:prstTxWarp prst="textNoShape">
+                            <a:avLst/>
+                          </a:prstTxWarp>
+                          <a:noAutofit/>
+                        </wps:bodyPr>
+                      </wps:wsp>
+                      <wps:wsp>
+                        <wps:cNvPr id="7521400" name="Text Box 1"/>
+                        <wps:cNvSpPr txBox="1"/>
+                        <wps:spPr>
+                          <a:xfrm>
+                            <a:off x="9070" y="2092620"/>
+                            <a:ext cx="904875" cy="215900"/>
+                          </a:xfrm>
+                          <a:prstGeom prst="rect">
+                            <a:avLst/>
+                          </a:prstGeom>
+                          <a:ln/>
+                        </wps:spPr>
+                        <wps:style>
+                          <a:lnRef idx="2">
+                            <a:schemeClr val="accent5">
+                              <a:shade val="15000"/>
+                            </a:schemeClr>
+                          </a:lnRef>
+                          <a:fillRef idx="1">
+                            <a:schemeClr val="accent5"/>
+                          </a:fillRef>
+                          <a:effectRef idx="0">
+                            <a:schemeClr val="accent5"/>
+                          </a:effectRef>
+                          <a:fontRef idx="minor">
+                            <a:schemeClr val="lt1"/>
+                          </a:fontRef>
+                        </wps:style>
+                        <wps:txbx>
+                          <w:txbxContent>
+                            <w:p>
+                              <w:pPr>
+                                <w:rPr>
+                                  <w:rFonts w:eastAsia="Aptos"/>
+                                  <w:sz w:val="12"/>
+                                  <w:szCs w:val="12"/>
+                                  <w14:ligatures w14:val="none"/>
+                                </w:rPr>
+                              </w:pPr>
+                              <w:r>
+                                <w:rPr>
+                                  <w:rFonts w:eastAsia="Aptos"/>
+                                  <w:sz w:val="12"/>
+                                  <w:szCs w:val="12"/>
+                                </w:rPr>
+                                <w:t>Food</w:t>
+                              </w:r>
+                            </w:p>
+                          </w:txbxContent>
+                        </wps:txbx>
+                        <wps:bodyPr rot="0" spcFirstLastPara="0" vert="horz" wrap="square" lIns="91440" tIns="45720" rIns="91440" bIns="45720" numCol="1" spcCol="0" rtlCol="0" fromWordArt="0" anchor="t" anchorCtr="0" forceAA="0" compatLnSpc="1">
+                          <a:prstTxWarp prst="textNoShape">
+                            <a:avLst/>
+                          </a:prstTxWarp>
+                          <a:noAutofit/>
+                        </wps:bodyPr>
+                      </wps:wsp>
+                      <wps:wsp>
+                        <wps:cNvPr id="498782950" name="Text Box 1"/>
+                        <wps:cNvSpPr txBox="1"/>
+                        <wps:spPr>
+                          <a:xfrm>
+                            <a:off x="9070" y="2323760"/>
+                            <a:ext cx="904875" cy="215900"/>
+                          </a:xfrm>
+                          <a:prstGeom prst="rect">
+                            <a:avLst/>
+                          </a:prstGeom>
+                          <a:ln/>
+                        </wps:spPr>
+                        <wps:style>
+                          <a:lnRef idx="2">
+                            <a:schemeClr val="accent5">
+                              <a:shade val="15000"/>
+                            </a:schemeClr>
+                          </a:lnRef>
+                          <a:fillRef idx="1">
+                            <a:schemeClr val="accent5"/>
+                          </a:fillRef>
+                          <a:effectRef idx="0">
+                            <a:schemeClr val="accent5"/>
+                          </a:effectRef>
+                          <a:fontRef idx="minor">
+                            <a:schemeClr val="lt1"/>
+                          </a:fontRef>
+                        </wps:style>
+                        <wps:txbx>
+                          <w:txbxContent>
+                            <w:p>
+                              <w:pPr>
+                                <w:rPr>
+                                  <w:rFonts w:eastAsia="Aptos"/>
+                                  <w:sz w:val="12"/>
+                                  <w:szCs w:val="12"/>
+                                </w:rPr>
+                              </w:pPr>
+                              <w:r>
+                                <w:rPr>
+                                  <w:rFonts w:eastAsia="Aptos"/>
+                                  <w:sz w:val="12"/>
+                                  <w:szCs w:val="12"/>
+                                </w:rPr>
+                                <w:t>Reports</w:t>
+                              </w:r>
+                            </w:p>
+                          </w:txbxContent>
+                        </wps:txbx>
+                        <wps:bodyPr rot="0" spcFirstLastPara="0" vert="horz" wrap="square" lIns="91440" tIns="45720" rIns="91440" bIns="45720" numCol="1" spcCol="0" rtlCol="0" fromWordArt="0" anchor="t" anchorCtr="0" forceAA="0" compatLnSpc="1">
+                          <a:prstTxWarp prst="textNoShape">
+                            <a:avLst/>
+                          </a:prstTxWarp>
+                          <a:noAutofit/>
+                        </wps:bodyPr>
+                      </wps:wsp>
+                      <wps:wsp>
+                        <wps:cNvPr id="1703451666" name="Text Box 1"/>
+                        <wps:cNvSpPr txBox="1"/>
+                        <wps:spPr>
+                          <a:xfrm>
+                            <a:off x="9524" y="2557440"/>
+                            <a:ext cx="904875" cy="215900"/>
+                          </a:xfrm>
+                          <a:prstGeom prst="rect">
+                            <a:avLst/>
+                          </a:prstGeom>
+                          <a:ln/>
+                        </wps:spPr>
+                        <wps:style>
+                          <a:lnRef idx="2">
+                            <a:schemeClr val="accent5">
+                              <a:shade val="15000"/>
+                            </a:schemeClr>
+                          </a:lnRef>
+                          <a:fillRef idx="1">
+                            <a:schemeClr val="accent5"/>
+                          </a:fillRef>
+                          <a:effectRef idx="0">
+                            <a:schemeClr val="accent5"/>
+                          </a:effectRef>
+                          <a:fontRef idx="minor">
+                            <a:schemeClr val="lt1"/>
+                          </a:fontRef>
+                        </wps:style>
+                        <wps:txbx>
+                          <w:txbxContent>
+                            <w:p>
+                              <w:pPr>
+                                <w:rPr>
+                                  <w:rFonts w:eastAsia="Aptos"/>
+                                  <w:sz w:val="12"/>
+                                  <w:szCs w:val="12"/>
+                                  <w14:ligatures w14:val="none"/>
+                                </w:rPr>
+                              </w:pPr>
+                              <w:r>
+                                <w:rPr>
+                                  <w:rFonts w:eastAsia="Aptos"/>
+                                  <w:sz w:val="12"/>
+                                  <w:szCs w:val="12"/>
+                                </w:rPr>
+                                <w:t>Logs</w:t>
+                              </w:r>
+                            </w:p>
+                          </w:txbxContent>
+                        </wps:txbx>
+                        <wps:bodyPr rot="0" spcFirstLastPara="0" vert="horz" wrap="square" lIns="91440" tIns="45720" rIns="91440" bIns="45720" numCol="1" spcCol="0" rtlCol="0" fromWordArt="0" anchor="t" anchorCtr="0" forceAA="0" compatLnSpc="1">
+                          <a:prstTxWarp prst="textNoShape">
+                            <a:avLst/>
+                          </a:prstTxWarp>
+                          <a:noAutofit/>
+                        </wps:bodyPr>
+                      </wps:wsp>
+                      <wps:wsp>
+                        <wps:cNvPr id="1570497022" name="Text Box 1"/>
+                        <wps:cNvSpPr txBox="1"/>
+                        <wps:spPr>
+                          <a:xfrm>
+                            <a:off x="9070" y="2793660"/>
+                            <a:ext cx="904875" cy="215900"/>
+                          </a:xfrm>
+                          <a:prstGeom prst="rect">
+                            <a:avLst/>
+                          </a:prstGeom>
+                          <a:ln/>
+                        </wps:spPr>
+                        <wps:style>
+                          <a:lnRef idx="2">
+                            <a:schemeClr val="accent5">
+                              <a:shade val="15000"/>
+                            </a:schemeClr>
+                          </a:lnRef>
+                          <a:fillRef idx="1">
+                            <a:schemeClr val="accent5"/>
+                          </a:fillRef>
+                          <a:effectRef idx="0">
+                            <a:schemeClr val="accent5"/>
+                          </a:effectRef>
+                          <a:fontRef idx="minor">
+                            <a:schemeClr val="lt1"/>
+                          </a:fontRef>
+                        </wps:style>
+                        <wps:txbx>
+                          <w:txbxContent>
+                            <w:p>
+                              <w:pPr>
+                                <w:rPr>
+                                  <w:rFonts w:eastAsia="Aptos"/>
+                                  <w:sz w:val="12"/>
+                                  <w:szCs w:val="12"/>
+                                </w:rPr>
+                              </w:pPr>
+                              <w:r>
+                                <w:rPr>
+                                  <w:rFonts w:eastAsia="Aptos"/>
+                                  <w:sz w:val="12"/>
+                                  <w:szCs w:val="12"/>
+                                </w:rPr>
+                                <w:t>Settings</w:t>
+                              </w:r>
+                            </w:p>
+                          </w:txbxContent>
+                        </wps:txbx>
+                        <wps:bodyPr rot="0" spcFirstLastPara="0" vert="horz" wrap="square" lIns="91440" tIns="45720" rIns="91440" bIns="45720" numCol="1" spcCol="0" rtlCol="0" fromWordArt="0" anchor="t" anchorCtr="0" forceAA="0" compatLnSpc="1">
+                          <a:prstTxWarp prst="textNoShape">
+                            <a:avLst/>
+                          </a:prstTxWarp>
+                          <a:noAutofit/>
+                        </wps:bodyPr>
+                      </wps:wsp>
+                      <wps:wsp>
+                        <wps:cNvPr id="1862148042" name="Text Box 1"/>
+                        <wps:cNvSpPr txBox="1"/>
+                        <wps:spPr>
+                          <a:xfrm>
+                            <a:off x="9524" y="3009560"/>
+                            <a:ext cx="904875" cy="243840"/>
+                          </a:xfrm>
+                          <a:prstGeom prst="rect">
+                            <a:avLst/>
+                          </a:prstGeom>
+                          <a:gradFill flip="none" rotWithShape="1">
+                            <a:gsLst>
+                              <a:gs pos="0">
+                                <a:schemeClr val="accent5">
+                                  <a:lumMod val="67000"/>
+                                </a:schemeClr>
+                              </a:gs>
+                              <a:gs pos="48000">
+                                <a:schemeClr val="accent5">
+                                  <a:lumMod val="97000"/>
+                                  <a:lumOff val="3000"/>
+                                </a:schemeClr>
+                              </a:gs>
+                              <a:gs pos="100000">
+                                <a:schemeClr val="accent5">
+                                  <a:lumMod val="60000"/>
+                                  <a:lumOff val="40000"/>
+                                </a:schemeClr>
+                              </a:gs>
+                            </a:gsLst>
+                            <a:lin ang="16200000" scaled="1"/>
+                            <a:tileRect/>
+                          </a:gradFill>
+                          <a:ln>
+                            <a:noFill/>
+                          </a:ln>
+                        </wps:spPr>
+                        <wps:style>
+                          <a:lnRef idx="0">
+                            <a:scrgbClr r="0" g="0" b="0"/>
+                          </a:lnRef>
+                          <a:fillRef idx="0">
+                            <a:scrgbClr r="0" g="0" b="0"/>
+                          </a:fillRef>
+                          <a:effectRef idx="0">
+                            <a:scrgbClr r="0" g="0" b="0"/>
+                          </a:effectRef>
+                          <a:fontRef idx="minor">
+                            <a:schemeClr val="lt1"/>
+                          </a:fontRef>
+                        </wps:style>
+                        <wps:txbx>
+                          <w:txbxContent>
+                            <w:p>
+                              <w:pPr>
+                                <w:rPr>
+                                  <w:rFonts w:eastAsia="Aptos"/>
+                                  <w:b/>
+                                  <w:bCs/>
+                                  <w:sz w:val="12"/>
+                                  <w:szCs w:val="12"/>
+                                  <w14:ligatures w14:val="none"/>
+                                </w:rPr>
+                              </w:pPr>
+                              <w:r>
+                                <w:rPr>
+                                  <w:rFonts w:eastAsia="Aptos"/>
+                                  <w:b/>
+                                  <w:bCs/>
+                                  <w:sz w:val="12"/>
+                                  <w:szCs w:val="12"/>
+                                </w:rPr>
+                                <w:t>-Log out</w:t>
+                              </w:r>
+                            </w:p>
+                          </w:txbxContent>
+                        </wps:txbx>
+                        <wps:bodyPr rot="0" spcFirstLastPara="0" vert="horz" wrap="square" lIns="91440" tIns="45720" rIns="91440" bIns="45720" numCol="1" spcCol="0" rtlCol="0" fromWordArt="0" anchor="t" anchorCtr="0" forceAA="0" compatLnSpc="1">
+                          <a:prstTxWarp prst="textNoShape">
+                            <a:avLst/>
+                          </a:prstTxWarp>
+                          <a:noAutofit/>
+                        </wps:bodyPr>
+                      </wps:wsp>
+                      <wps:wsp>
+                        <wps:cNvPr id="193255244" name="Text Box 193255244"/>
+                        <wps:cNvSpPr txBox="1"/>
+                        <wps:spPr>
+                          <a:xfrm>
+                            <a:off x="1168401" y="1219200"/>
+                            <a:ext cx="3234266" cy="1854200"/>
+                          </a:xfrm>
+                          <a:prstGeom prst="rect">
+                            <a:avLst/>
+                          </a:prstGeom>
+                          <a:solidFill>
+                            <a:schemeClr val="lt1"/>
+                          </a:solidFill>
+                          <a:ln w="6350">
+                            <a:solidFill>
+                              <a:prstClr val="black"/>
+                            </a:solidFill>
+                          </a:ln>
+                        </wps:spPr>
+                        <wps:txbx>
+                          <w:txbxContent>
+                            <w:p>
+                              <w:pPr>
+                                <w:autoSpaceDE w:val="0"/>
+                                <w:autoSpaceDN w:val="0"/>
+                                <w:adjustRightInd w:val="0"/>
+                                <w:rPr>
+                                  <w:rFonts w:ascii="Segoe UI" w:hAnsi="Segoe UI" w:cs="Segoe UI"/>
+                                  <w:kern w:val="0"/>
+                                  <w:sz w:val="14"/>
+                                  <w:szCs w:val="14"/>
+                                  <w:lang w:val="en-US"/>
+                                </w:rPr>
+                              </w:pPr>
+                              <w:r>
+                                <w:rPr>
+                                  <w:rFonts w:ascii="Segoe UI" w:hAnsi="Segoe UI" w:cs="Segoe UI"/>
+                                  <w:kern w:val="0"/>
+                                  <w:sz w:val="14"/>
+                                  <w:szCs w:val="14"/>
+                                  <w:lang w:val="en-US"/>
+                                </w:rPr>
+                                <w:t>Use the buttons on the left to get around the system:</w:t>
+                              </w:r>
+                            </w:p>
+                            <w:p>
+                              <w:pPr>
+                                <w:autoSpaceDE w:val="0"/>
+                                <w:autoSpaceDN w:val="0"/>
+                                <w:adjustRightInd w:val="0"/>
+                                <w:rPr>
+                                  <w:rFonts w:ascii="Segoe UI" w:hAnsi="Segoe UI" w:cs="Segoe UI"/>
+                                  <w:kern w:val="0"/>
+                                  <w:sz w:val="14"/>
+                                  <w:szCs w:val="14"/>
+                                  <w:lang w:val="en-US"/>
+                                </w:rPr>
+                              </w:pPr>
+                            </w:p>
+                            <w:p>
+                              <w:pPr>
+                                <w:autoSpaceDE w:val="0"/>
+                                <w:autoSpaceDN w:val="0"/>
+                                <w:adjustRightInd w:val="0"/>
+                                <w:rPr>
+                                  <w:rFonts w:ascii="Segoe UI" w:hAnsi="Segoe UI" w:cs="Segoe UI"/>
+                                  <w:kern w:val="0"/>
+                                  <w:sz w:val="14"/>
+                                  <w:szCs w:val="14"/>
+                                  <w:lang w:val="en-US"/>
+                                </w:rPr>
+                              </w:pPr>
+                              <w:r>
+                                <w:rPr>
+                                  <w:rFonts w:ascii="Segoe UI" w:hAnsi="Segoe UI" w:cs="Segoe UI"/>
+                                  <w:kern w:val="0"/>
+                                  <w:sz w:val="14"/>
+                                  <w:szCs w:val="14"/>
+                                  <w:lang w:val="en-US"/>
+                                </w:rPr>
+                                <w:t>- Bookings: make and manage customer bookings</w:t>
+                              </w:r>
+                            </w:p>
+                            <w:p>
+                              <w:pPr>
+                                <w:autoSpaceDE w:val="0"/>
+                                <w:autoSpaceDN w:val="0"/>
+                                <w:adjustRightInd w:val="0"/>
+                                <w:rPr>
+                                  <w:rFonts w:ascii="Segoe UI" w:hAnsi="Segoe UI" w:cs="Segoe UI"/>
+                                  <w:kern w:val="0"/>
+                                  <w:sz w:val="14"/>
+                                  <w:szCs w:val="14"/>
+                                  <w:lang w:val="en-US"/>
+                                </w:rPr>
+                              </w:pPr>
+                              <w:r>
+                                <w:rPr>
+                                  <w:rFonts w:ascii="Segoe UI" w:hAnsi="Segoe UI" w:cs="Segoe UI"/>
+                                  <w:kern w:val="0"/>
+                                  <w:sz w:val="14"/>
+                                  <w:szCs w:val="14"/>
+                                  <w:lang w:val="en-US"/>
+                                </w:rPr>
+                                <w:t>- Find Booking: search for a booking and cancel it</w:t>
+                              </w:r>
+                            </w:p>
+                            <w:p>
+                              <w:pPr>
+                                <w:autoSpaceDE w:val="0"/>
+                                <w:autoSpaceDN w:val="0"/>
+                                <w:adjustRightInd w:val="0"/>
+                                <w:rPr>
+                                  <w:rFonts w:ascii="Segoe UI" w:hAnsi="Segoe UI" w:cs="Segoe UI"/>
+                                  <w:kern w:val="0"/>
+                                  <w:sz w:val="14"/>
+                                  <w:szCs w:val="14"/>
+                                  <w:lang w:val="en-US"/>
+                                </w:rPr>
+                              </w:pPr>
+                              <w:r>
+                                <w:rPr>
+                                  <w:rFonts w:ascii="Segoe UI" w:hAnsi="Segoe UI" w:cs="Segoe UI"/>
+                                  <w:kern w:val="0"/>
+                                  <w:sz w:val="14"/>
+                                  <w:szCs w:val="14"/>
+                                  <w:lang w:val="en-US"/>
+                                </w:rPr>
+                                <w:t>- Screenings: see what films are showing and when</w:t>
+                              </w:r>
+                            </w:p>
+                            <w:p>
+                              <w:pPr>
+                                <w:autoSpaceDE w:val="0"/>
+                                <w:autoSpaceDN w:val="0"/>
+                                <w:adjustRightInd w:val="0"/>
+                                <w:rPr>
+                                  <w:rFonts w:ascii="Segoe UI" w:hAnsi="Segoe UI" w:cs="Segoe UI"/>
+                                  <w:kern w:val="0"/>
+                                  <w:sz w:val="14"/>
+                                  <w:szCs w:val="14"/>
+                                  <w:lang w:val="en-US"/>
+                                </w:rPr>
+                              </w:pPr>
+                              <w:r>
+                                <w:rPr>
+                                  <w:rFonts w:ascii="Segoe UI" w:hAnsi="Segoe UI" w:cs="Segoe UI"/>
+                                  <w:kern w:val="0"/>
+                                  <w:sz w:val="14"/>
+                                  <w:szCs w:val="14"/>
+                                  <w:lang w:val="en-US"/>
+                                </w:rPr>
+                                <w:t>- Customers: look up customer details</w:t>
+                              </w:r>
+                            </w:p>
+                            <w:p>
+                              <w:pPr>
+                                <w:autoSpaceDE w:val="0"/>
+                                <w:autoSpaceDN w:val="0"/>
+                                <w:adjustRightInd w:val="0"/>
+                                <w:rPr>
+                                  <w:rFonts w:ascii="Segoe UI" w:hAnsi="Segoe UI" w:cs="Segoe UI"/>
+                                  <w:kern w:val="0"/>
+                                  <w:sz w:val="14"/>
+                                  <w:szCs w:val="14"/>
+                                  <w:lang w:val="en-US"/>
+                                </w:rPr>
+                              </w:pPr>
+                              <w:r>
+                                <w:rPr>
+                                  <w:rFonts w:ascii="Segoe UI" w:hAnsi="Segoe UI" w:cs="Segoe UI"/>
+                                  <w:kern w:val="0"/>
+                                  <w:sz w:val="14"/>
+                                  <w:szCs w:val="14"/>
+                                  <w:lang w:val="en-US"/>
+                                </w:rPr>
+                                <w:t>- Films: add and edit films (managers only)</w:t>
+                              </w:r>
+                            </w:p>
+                            <w:p>
+                              <w:pPr>
+                                <w:autoSpaceDE w:val="0"/>
+                                <w:autoSpaceDN w:val="0"/>
+                                <w:adjustRightInd w:val="0"/>
+                                <w:rPr>
+                                  <w:rFonts w:ascii="Segoe UI" w:hAnsi="Segoe UI" w:cs="Segoe UI"/>
+                                  <w:kern w:val="0"/>
+                                  <w:sz w:val="14"/>
+                                  <w:szCs w:val="14"/>
+                                  <w:lang w:val="en-US"/>
+                                </w:rPr>
+                              </w:pPr>
+                              <w:r>
+                                <w:rPr>
+                                  <w:rFonts w:ascii="Segoe UI" w:hAnsi="Segoe UI" w:cs="Segoe UI"/>
+                                  <w:kern w:val="0"/>
+                                  <w:sz w:val="14"/>
+                                  <w:szCs w:val="14"/>
+                                  <w:lang w:val="en-US"/>
+                                </w:rPr>
+                                <w:t>- Screens: set up screens and seating (managers only)</w:t>
+                              </w:r>
+                            </w:p>
+                            <w:p>
+                              <w:pPr>
+                                <w:autoSpaceDE w:val="0"/>
+                                <w:autoSpaceDN w:val="0"/>
+                                <w:adjustRightInd w:val="0"/>
+                                <w:rPr>
+                                  <w:rFonts w:ascii="Segoe UI" w:hAnsi="Segoe UI" w:cs="Segoe UI"/>
+                                  <w:kern w:val="0"/>
+                                  <w:sz w:val="14"/>
+                                  <w:szCs w:val="14"/>
+                                  <w:lang w:val="en-US"/>
+                                </w:rPr>
+                              </w:pPr>
+                              <w:r>
+                                <w:rPr>
+                                  <w:rFonts w:ascii="Segoe UI" w:hAnsi="Segoe UI" w:cs="Segoe UI"/>
+                                  <w:kern w:val="0"/>
+                                  <w:sz w:val="14"/>
+                                  <w:szCs w:val="14"/>
+                                  <w:lang w:val="en-US"/>
+                                </w:rPr>
+                                <w:t>- Food: manage food and drink items (managers only)</w:t>
+                              </w:r>
+                            </w:p>
+                            <w:p>
+                              <w:pPr>
+                                <w:autoSpaceDE w:val="0"/>
+                                <w:autoSpaceDN w:val="0"/>
+                                <w:adjustRightInd w:val="0"/>
+                                <w:rPr>
+                                  <w:rFonts w:ascii="Segoe UI" w:hAnsi="Segoe UI" w:cs="Segoe UI"/>
+                                  <w:kern w:val="0"/>
+                                  <w:sz w:val="14"/>
+                                  <w:szCs w:val="14"/>
+                                  <w:lang w:val="en-US"/>
+                                </w:rPr>
+                              </w:pPr>
+                              <w:r>
+                                <w:rPr>
+                                  <w:rFonts w:ascii="Segoe UI" w:hAnsi="Segoe UI" w:cs="Segoe UI"/>
+                                  <w:kern w:val="0"/>
+                                  <w:sz w:val="14"/>
+                                  <w:szCs w:val="14"/>
+                                  <w:lang w:val="en-US"/>
+                                </w:rPr>
+                                <w:t>- Reports: view sales reports (managers only)</w:t>
+                              </w:r>
+                            </w:p>
+                            <w:p>
+                              <w:pPr>
+                                <w:autoSpaceDE w:val="0"/>
+                                <w:autoSpaceDN w:val="0"/>
+                                <w:adjustRightInd w:val="0"/>
+                                <w:rPr>
+                                  <w:rFonts w:ascii="Segoe UI" w:hAnsi="Segoe UI" w:cs="Segoe UI"/>
+                                  <w:kern w:val="0"/>
+                                  <w:sz w:val="14"/>
+                                  <w:szCs w:val="14"/>
+                                  <w:lang w:val="en-US"/>
+                                </w:rPr>
+                              </w:pPr>
+                              <w:r>
+                                <w:rPr>
+                                  <w:rFonts w:ascii="Segoe UI" w:hAnsi="Segoe UI" w:cs="Segoe UI"/>
+                                  <w:kern w:val="0"/>
+                                  <w:sz w:val="14"/>
+                                  <w:szCs w:val="14"/>
+                                  <w:lang w:val="en-US"/>
+                                </w:rPr>
+                                <w:t>- Logs: view a history of actions taken in the system (managers only)</w:t>
+                              </w:r>
+                            </w:p>
+                            <w:p>
+                              <w:pPr>
+                                <w:autoSpaceDE w:val="0"/>
+                                <w:autoSpaceDN w:val="0"/>
+                                <w:adjustRightInd w:val="0"/>
+                                <w:rPr>
+                                  <w:rFonts w:ascii="Segoe UI" w:hAnsi="Segoe UI" w:cs="Segoe UI"/>
+                                  <w:kern w:val="0"/>
+                                  <w:sz w:val="14"/>
+                                  <w:szCs w:val="14"/>
+                                  <w:lang w:val="en-US"/>
+                                </w:rPr>
+                              </w:pPr>
+                            </w:p>
+                            <w:p>
+                              <w:pPr>
+                                <w:autoSpaceDE w:val="0"/>
+                                <w:autoSpaceDN w:val="0"/>
+                                <w:adjustRightInd w:val="0"/>
+                                <w:rPr>
+                                  <w:rFonts w:ascii="Segoe UI" w:hAnsi="Segoe UI" w:cs="Segoe UI"/>
+                                  <w:kern w:val="0"/>
+                                  <w:sz w:val="14"/>
+                                  <w:szCs w:val="14"/>
+                                  <w:lang w:val="en-US"/>
+                                </w:rPr>
+                              </w:pPr>
+                              <w:r>
+                                <w:rPr>
+                                  <w:rFonts w:ascii="Segoe UI" w:hAnsi="Segoe UI" w:cs="Segoe UI"/>
+                                  <w:kern w:val="0"/>
+                                  <w:sz w:val="14"/>
+                                  <w:szCs w:val="14"/>
+                                  <w:lang w:val="en-US"/>
+                                </w:rPr>
+                                <w:t>Use the Log out button at the bottom when you are finished.</w:t>
+                              </w:r>
+                            </w:p>
+                            <w:p>
+                              <w:pPr>
+                                <w:rPr>
+                                  <w:sz w:val="20"/>
+                                  <w:szCs w:val="20"/>
+                                  <w:lang w:val="en-US"/>
+                                </w:rPr>
+                              </w:pPr>
+                            </w:p>
+                          </w:txbxContent>
+                        </wps:txbx>
+                        <wps:bodyPr rot="0" spcFirstLastPara="0" vertOverflow="overflow" horzOverflow="overflow" vert="horz" wrap="square" lIns="91440" tIns="45720" rIns="91440" bIns="45720" numCol="1" spcCol="0" rtlCol="0" fromWordArt="0" anchor="t" anchorCtr="0" forceAA="0" compatLnSpc="1">
+                          <a:prstTxWarp prst="textNoShape">
+                            <a:avLst/>
+                          </a:prstTxWarp>
+                          <a:noAutofit/>
+                        </wps:bodyPr>
+                      </wps:wsp>
+                      <wps:wsp>
+                        <wps:cNvPr id="760575158" name="Text Box 760575158"/>
+                        <wps:cNvSpPr txBox="1"/>
+                        <wps:spPr>
+                          <a:xfrm>
+                            <a:off x="1151466" y="884850"/>
+                            <a:ext cx="1693333" cy="283550"/>
+                          </a:xfrm>
+                          <a:prstGeom prst="rect">
+                            <a:avLst/>
+                          </a:prstGeom>
+                          <a:noFill/>
+                          <a:ln>
+                            <a:noFill/>
+                          </a:ln>
+                        </wps:spPr>
+                        <wps:style>
+                          <a:lnRef idx="0">
+                            <a:scrgbClr r="0" g="0" b="0"/>
+                          </a:lnRef>
+                          <a:fillRef idx="0">
+                            <a:scrgbClr r="0" g="0" b="0"/>
+                          </a:fillRef>
+                          <a:effectRef idx="0">
+                            <a:scrgbClr r="0" g="0" b="0"/>
+                          </a:effectRef>
+                          <a:fontRef idx="minor">
+                            <a:schemeClr val="dk1"/>
+                          </a:fontRef>
+                        </wps:style>
+                        <wps:txbx>
+                          <w:txbxContent>
+                            <w:p>
+                              <w:pPr>
+                                <w:rPr>
+                                  <w:b/>
+                                  <w:bCs/>
+                                  <w:color w:val="A02B93" w:themeColor="accent5"/>
+                                </w:rPr>
+                              </w:pPr>
+                              <w:r>
+                                <w:rPr>
+                                  <w:b/>
+                                  <w:bCs/>
+                                  <w:color w:val="A02B93" w:themeColor="accent5"/>
+                                </w:rPr>
+                                <w:t>Welcome</w:t>
+                              </w:r>
+                              <w:r>
+                                <w:rPr>
+                                  <w:b/>
+                                  <w:bCs/>
+                                  <w:color w:val="A02B93" w:themeColor="accent5"/>
+                                </w:rPr>
+                                <w:t>!</w:t>
+                              </w:r>
+                            </w:p>
+                          </w:txbxContent>
+                        </wps:txbx>
+                        <wps:bodyPr rot="0" spcFirstLastPara="0" vertOverflow="overflow" horzOverflow="overflow" vert="horz" wrap="square" lIns="91440" tIns="45720" rIns="91440" bIns="45720" numCol="1" spcCol="0" rtlCol="0" fromWordArt="0" anchor="t" anchorCtr="0" forceAA="0" compatLnSpc="1">
+                          <a:prstTxWarp prst="textNoShape">
+                            <a:avLst/>
+                          </a:prstTxWarp>
+                          <a:noAutofit/>
+                        </wps:bodyPr>
+                      </wps:wsp>
+                    </wpc:wpc>
+                  </a:graphicData>
+                </a:graphic>
+              </wp:inline>
+            </w:drawing>
+          </mc:Choice>
+          <mc:Fallback>
+            <w:pict>
+              <v:group w14:anchorId="5E1AF47B" id="Canvas 5" o:spid="_x0000_s1035" editas="canvas" style="width:6in;height:259.6pt;mso-position-horizontal-relative:char;mso-position-vertical-relative:line" coordsize="54864,32969" o:gfxdata="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">
+                <v:shape id="_x0000_s1036" type="#_x0000_t75" style="position:absolute;width:54864;height:32969;visibility:visible;mso-wrap-style:square" filled="t">
+                  <v:fill o:detectmouseclick="t"/>
+                  <v:path o:connecttype="none"/>
+                </v:shape>
+                <v:rect id="Rectangle 1567915412" o:spid="_x0000_s1037" style="position:absolute;left:90;width:9181;height:32613;visibility:visible;mso-wrap-style:square;v-text-anchor:middle" o:gfxdata="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" fillcolor="#a02b93 [3208]" strokecolor="#170615 [488]" strokeweight="1pt"/>
+                <v:shape id="Text Box 1199104866" o:spid="_x0000_s1038" type="#_x0000_t202" style="position:absolute;left:90;width:9462;height:2438;visibility:visible;mso-wrap-style:none;v-text-anchor:top" o:gfxdata="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" fillcolor="#a02b93 [3208]" strokecolor="#170615 [488]" strokeweight="1pt">
+                  <v:textbox>
+                    <w:txbxContent>
+                      <w:p>
+                        <w:pPr>
+                          <w:rPr>
+                            <w:b/>
+                            <w:bCs/>
+                            <w:sz w:val="14"/>
+                            <w:szCs w:val="14"/>
+                          </w:rPr>
+                        </w:pPr>
+                        <w:proofErr w:type="spellStart"/>
+                        <w:r>
+                          <w:rPr>
+                            <w:b/>
+                            <w:bCs/>
+                            <w:sz w:val="14"/>
+                            <w:szCs w:val="14"/>
+                          </w:rPr>
+                          <w:t>Filmtopia</w:t>
+                        </w:r>
+                        <w:proofErr w:type="spellEnd"/>
+                        <w:r>
+                          <w:rPr>
+                            <w:b/>
+                            <w:bCs/>
+                            <w:sz w:val="14"/>
+                            <w:szCs w:val="14"/>
+                          </w:rPr>
+                          <w:t xml:space="preserve"> Manager</w:t>
+                        </w:r>
+                        <w:r>
+                          <w:rPr>
+                            <w:b/>
+                            <w:bCs/>
+                            <w:sz w:val="14"/>
+                            <w:szCs w:val="14"/>
+                          </w:rPr>
+                          <w:t xml:space="preserve">      </w:t>
+                        </w:r>
+                        <w:r>
+                          <w:rPr>
+                            <w:sz w:val="28"/>
+                            <w:szCs w:val="28"/>
+                          </w:rPr>
+                          <w:t xml:space="preserve">              </w:t>
+                        </w:r>
+                      </w:p>
+                    </w:txbxContent>
+                  </v:textbox>
+                </v:shape>
+                <v:shape id="Text Box 2036808941" o:spid="_x0000_s1039" type="#_x0000_t202" style="position:absolute;left:90;top:6286;width:9053;height:2159;visibility:visible;mso-wrap-style:square;v-text-anchor:top" o:gfxdata="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" fillcolor="#a02b93 [3208]" strokecolor="#170615 [488]" strokeweight="1pt">
+                  <v:textbox>
+                    <w:txbxContent>
+                      <w:p>
+                        <w:pPr>
+                          <w:rPr>
+                            <w:sz w:val="12"/>
+                            <w:szCs w:val="12"/>
+                          </w:rPr>
+                        </w:pPr>
+                        <w:r>
+                          <w:rPr>
+                            <w:sz w:val="12"/>
+                            <w:szCs w:val="12"/>
+                          </w:rPr>
+                          <w:t>Bookings</w:t>
+                        </w:r>
+                      </w:p>
+                    </w:txbxContent>
+                  </v:textbox>
+                </v:shape>
+                <v:shape id="Text Box 1" o:spid="_x0000_s1040" type="#_x0000_t202" style="position:absolute;left:90;top:8848;width:9049;height:2159;visibility:visible;mso-wrap-style:square;v-text-anchor:top" o:gfxdata="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" fillcolor="#a02b93 [3208]" strokecolor="#170615 [488]" strokeweight="1pt">
+                  <v:textbox>
+                    <w:txbxContent>
+                      <w:p>
+                        <w:pPr>
+                          <w:rPr>
+                            <w:rFonts w:eastAsia="Aptos"/>
+                            <w:sz w:val="12"/>
+                            <w:szCs w:val="12"/>
+                            <w14:ligatures w14:val="none"/>
+                          </w:rPr>
+                        </w:pPr>
+                        <w:r>
+                          <w:rPr>
+                            <w:rFonts w:eastAsia="Aptos"/>
+                            <w:sz w:val="12"/>
+                            <w:szCs w:val="12"/>
+                          </w:rPr>
+                          <w:t>Find Booking</w:t>
+                        </w:r>
+                      </w:p>
+                    </w:txbxContent>
+                  </v:textbox>
+                </v:shape>
+                <v:shape id="Text Box 1" o:spid="_x0000_s1041" type="#_x0000_t202" style="position:absolute;left:90;top:11375;width:9049;height:2159;visibility:visible;mso-wrap-style:square;v-text-anchor:top" o:gfxdata="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" fillcolor="#a02b93 [3208]" strokecolor="#170615 [488]" strokeweight="1pt">
+                  <v:textbox>
+                    <w:txbxContent>
+                      <w:p>
+                        <w:pPr>
+                          <w:rPr>
+                            <w:rFonts w:eastAsia="Aptos"/>
+                            <w:sz w:val="12"/>
+                            <w:szCs w:val="12"/>
+                            <w14:ligatures w14:val="none"/>
+                          </w:rPr>
+                        </w:pPr>
+                        <w:r>
+                          <w:rPr>
+                            <w:rFonts w:eastAsia="Aptos"/>
+                            <w:sz w:val="12"/>
+                            <w:szCs w:val="12"/>
+                          </w:rPr>
+                          <w:t>Screenings</w:t>
+                        </w:r>
+                      </w:p>
+                    </w:txbxContent>
+                  </v:textbox>
+                </v:shape>
+                <v:shape id="Text Box 1" o:spid="_x0000_s1042" type="#_x0000_t202" style="position:absolute;left:90;top:13801;width:9049;height:2159;visibility:visible;mso-wrap-style:square;v-text-anchor:top" o:gfxdata="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" fillcolor="#a02b93 [3208]" strokecolor="#170615 [488]" strokeweight="1pt">
+                  <v:textbox>
+                    <w:txbxContent>
+                      <w:p>
+                        <w:pPr>
+                          <w:rPr>
+                            <w:rFonts w:eastAsia="Aptos"/>
+                            <w:sz w:val="12"/>
+                            <w:szCs w:val="12"/>
+                            <w14:ligatures w14:val="none"/>
+                          </w:rPr>
+                        </w:pPr>
+                        <w:r>
+                          <w:rPr>
+                            <w:rFonts w:eastAsia="Aptos"/>
+                            <w:sz w:val="12"/>
+                            <w:szCs w:val="12"/>
+                          </w:rPr>
+                          <w:t>Customers</w:t>
+                        </w:r>
+                      </w:p>
+                    </w:txbxContent>
+                  </v:textbox>
+                </v:shape>
+                <v:shape id="Text Box 1" o:spid="_x0000_s1043" type="#_x0000_t202" style="position:absolute;left:90;top:16201;width:9049;height:2159;visibility:visible;mso-wrap-style:square;v-text-anchor:top" o:gfxdata="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" fillcolor="#ad1457" strokecolor="#170615 [488]" strokeweight="1pt">
+                  <v:textbox>
+                    <w:txbxContent>
+                      <w:p>
+                        <w:pPr>
+                          <w:rPr>
+                            <w:rFonts w:eastAsia="Aptos"/>
+                            <w:sz w:val="12"/>
+                            <w:szCs w:val="12"/>
+                            <w14:ligatures w14:val="none"/>
+                          </w:rPr>
+                        </w:pPr>
+                        <w:r>
+                          <w:rPr>
+                            <w:rFonts w:eastAsia="Aptos"/>
+                            <w:sz w:val="12"/>
+                            <w:szCs w:val="12"/>
+                          </w:rPr>
+                          <w:t>Films</w:t>
+                        </w:r>
+                      </w:p>
+                    </w:txbxContent>
+                  </v:textbox>
+                </v:shape>
+                <v:rect id="Rectangle 670175078" o:spid="_x0000_s1044" style="position:absolute;left:9356;width:45508;height:6286;visibility:visible;mso-wrap-style:square;v-text-anchor:middle" o:gfxdata="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" fillcolor="#a02b93 [3208]" strokecolor="#170615 [488]" strokeweight="1pt"/>
+                <v:shape id="Text Box 1" o:spid="_x0000_s1045" type="#_x0000_t202" style="position:absolute;left:90;top:18564;width:9049;height:2159;visibility:visible;mso-wrap-style:square;v-text-anchor:top" o:gfxdata="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" fillcolor="#a02b93 [3208]" strokecolor="#170615 [488]" strokeweight="1pt">
+                  <v:textbox>
+                    <w:txbxContent>
+                      <w:p>
+                        <w:pPr>
+                          <w:rPr>
+                            <w:rFonts w:eastAsia="Aptos"/>
+                            <w:sz w:val="12"/>
+                            <w:szCs w:val="12"/>
+                            <w14:ligatures w14:val="none"/>
+                          </w:rPr>
+                        </w:pPr>
+                        <w:r>
+                          <w:rPr>
+                            <w:rFonts w:eastAsia="Aptos"/>
+                            <w:sz w:val="12"/>
+                            <w:szCs w:val="12"/>
+                          </w:rPr>
+                          <w:t>Screens</w:t>
+                        </w:r>
+                      </w:p>
+                    </w:txbxContent>
+                  </v:textbox>
+                </v:shape>
+                <v:shape id="Text Box 1" o:spid="_x0000_s1046" type="#_x0000_t202" style="position:absolute;left:90;top:20926;width:9049;height:2159;visibility:visible;mso-wrap-style:square;v-text-anchor:top" o:gfxdata="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" fillcolor="#a02b93 [3208]" strokecolor="#170615 [488]" strokeweight="1pt">
+                  <v:textbox>
+                    <w:txbxContent>
+                      <w:p>
+                        <w:pPr>
+                          <w:rPr>
+                            <w:rFonts w:eastAsia="Aptos"/>
+                            <w:sz w:val="12"/>
+                            <w:szCs w:val="12"/>
+                            <w14:ligatures w14:val="none"/>
+                          </w:rPr>
+                        </w:pPr>
+                        <w:r>
+                          <w:rPr>
+                            <w:rFonts w:eastAsia="Aptos"/>
+                            <w:sz w:val="12"/>
+                            <w:szCs w:val="12"/>
+                          </w:rPr>
+                          <w:t>Food</w:t>
+                        </w:r>
+                      </w:p>
+                    </w:txbxContent>
+                  </v:textbox>
+                </v:shape>
+                <v:shape id="Text Box 1" o:spid="_x0000_s1047" type="#_x0000_t202" style="position:absolute;left:90;top:23237;width:9049;height:2159;visibility:visible;mso-wrap-style:square;v-text-anchor:top" o:gfxdata="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" fillcolor="#a02b93 [3208]" strokecolor="#170615 [488]" strokeweight="1pt">
+                  <v:textbox>
+                    <w:txbxContent>
+                      <w:p>
+                        <w:pPr>
+                          <w:rPr>
+                            <w:rFonts w:eastAsia="Aptos"/>
+                            <w:sz w:val="12"/>
+                            <w:szCs w:val="12"/>
+                          </w:rPr>
+                        </w:pPr>
+                        <w:r>
+                          <w:rPr>
+                            <w:rFonts w:eastAsia="Aptos"/>
+                            <w:sz w:val="12"/>
+                            <w:szCs w:val="12"/>
+                          </w:rPr>
+                          <w:t>Reports</w:t>
+                        </w:r>
+                      </w:p>
+                    </w:txbxContent>
+                  </v:textbox>
+                </v:shape>
+                <v:shape id="Text Box 1" o:spid="_x0000_s1048" type="#_x0000_t202" style="position:absolute;left:95;top:25574;width:9048;height:2159;visibility:visible;mso-wrap-style:square;v-text-anchor:top" o:gfxdata="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" fillcolor="#a02b93 [3208]" strokecolor="#170615 [488]" strokeweight="1pt">
+                  <v:textbox>
+                    <w:txbxContent>
+                      <w:p>
+                        <w:pPr>
+                          <w:rPr>
+                            <w:rFonts w:eastAsia="Aptos"/>
+                            <w:sz w:val="12"/>
+                            <w:szCs w:val="12"/>
+                            <w14:ligatures w14:val="none"/>
+                          </w:rPr>
+                        </w:pPr>
+                        <w:r>
+                          <w:rPr>
+                            <w:rFonts w:eastAsia="Aptos"/>
+                            <w:sz w:val="12"/>
+                            <w:szCs w:val="12"/>
+                          </w:rPr>
+                          <w:t>Logs</w:t>
+                        </w:r>
+                      </w:p>
+                    </w:txbxContent>
+                  </v:textbox>
+                </v:shape>
+                <v:shape id="Text Box 1" o:spid="_x0000_s1049" type="#_x0000_t202" style="position:absolute;left:90;top:27936;width:9049;height:2159;visibility:visible;mso-wrap-style:square;v-text-anchor:top" o:gfxdata="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" fillcolor="#a02b93 [3208]" strokecolor="#170615 [488]" strokeweight="1pt">
+                  <v:textbox>
+                    <w:txbxContent>
+                      <w:p>
+                        <w:pPr>
+                          <w:rPr>
+                            <w:rFonts w:eastAsia="Aptos"/>
+                            <w:sz w:val="12"/>
+                            <w:szCs w:val="12"/>
+                          </w:rPr>
+                        </w:pPr>
+                        <w:r>
+                          <w:rPr>
+                            <w:rFonts w:eastAsia="Aptos"/>
+                            <w:sz w:val="12"/>
+                            <w:szCs w:val="12"/>
+                          </w:rPr>
+                          <w:t>Settings</w:t>
+                        </w:r>
+                      </w:p>
+                    </w:txbxContent>
+                  </v:textbox>
+                </v:shape>
+                <v:shape id="Text Box 1" o:spid="_x0000_s1050" type="#_x0000_t202" style="position:absolute;left:95;top:30095;width:9048;height:2439;visibility:visible;mso-wrap-style:square;v-text-anchor:top" o:gfxdata="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" fillcolor="#6a1c61 [2152]" stroked="f">
+                  <v:fill color2="#d86dcb [1944]" rotate="t" angle="180" colors="0 #6b1d62;31457f #a72d9a;1 #d86ecc" focus="100%" type="gradient"/>
+                  <v:textbox>
+                    <w:txbxContent>
+                      <w:p>
+                        <w:pPr>
+                          <w:rPr>
+                            <w:rFonts w:eastAsia="Aptos"/>
+                            <w:b/>
+                            <w:bCs/>
+                            <w:sz w:val="12"/>
+                            <w:szCs w:val="12"/>
+                            <w14:ligatures w14:val="none"/>
+                          </w:rPr>
+                        </w:pPr>
+                        <w:r>
+                          <w:rPr>
+                            <w:rFonts w:eastAsia="Aptos"/>
+                            <w:b/>
+                            <w:bCs/>
+                            <w:sz w:val="12"/>
+                            <w:szCs w:val="12"/>
+                          </w:rPr>
+                          <w:t>-Log out</w:t>
+                        </w:r>
+                      </w:p>
+                    </w:txbxContent>
+                  </v:textbox>
+                </v:shape>
+                <v:shape id="Text Box 193255244" o:spid="_x0000_s1051" type="#_x0000_t202" style="position:absolute;left:11684;top:12192;width:32342;height:18542;visibility:visible;mso-wrap-style:square;v-text-anchor:top" o:gfxdata="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" fillcolor="white [3201]" strokeweight=".5pt">
+                  <v:textbox>
+                    <w:txbxContent>
+                      <w:p>
+                        <w:pPr>
+                          <w:autoSpaceDE w:val="0"/>
+                          <w:autoSpaceDN w:val="0"/>
+                          <w:adjustRightInd w:val="0"/>
+                          <w:rPr>
+                            <w:rFonts w:ascii="Segoe UI" w:hAnsi="Segoe UI" w:cs="Segoe UI"/>
+                            <w:kern w:val="0"/>
+                            <w:sz w:val="14"/>
+                            <w:szCs w:val="14"/>
+                            <w:lang w:val="en-US"/>
+                          </w:rPr>
+                        </w:pPr>
+                        <w:r>
+                          <w:rPr>
+                            <w:rFonts w:ascii="Segoe UI" w:hAnsi="Segoe UI" w:cs="Segoe UI"/>
+                            <w:kern w:val="0"/>
+                            <w:sz w:val="14"/>
+                            <w:szCs w:val="14"/>
+                            <w:lang w:val="en-US"/>
+                          </w:rPr>
+                          <w:t>Use the buttons on the left to get around the system:</w:t>
+                        </w:r>
+                      </w:p>
+                      <w:p>
+                        <w:pPr>
+                          <w:autoSpaceDE w:val="0"/>
+                          <w:autoSpaceDN w:val="0"/>
+                          <w:adjustRightInd w:val="0"/>
+                          <w:rPr>
+                            <w:rFonts w:ascii="Segoe UI" w:hAnsi="Segoe UI" w:cs="Segoe UI"/>
+                            <w:kern w:val="0"/>
+                            <w:sz w:val="14"/>
+                            <w:szCs w:val="14"/>
+                            <w:lang w:val="en-US"/>
+                          </w:rPr>
+                        </w:pPr>
+                      </w:p>
+                      <w:p>
+                        <w:pPr>
+                          <w:autoSpaceDE w:val="0"/>
+                          <w:autoSpaceDN w:val="0"/>
+                          <w:adjustRightInd w:val="0"/>
+                          <w:rPr>
+                            <w:rFonts w:ascii="Segoe UI" w:hAnsi="Segoe UI" w:cs="Segoe UI"/>
+                            <w:kern w:val="0"/>
+                            <w:sz w:val="14"/>
+                            <w:szCs w:val="14"/>
+                            <w:lang w:val="en-US"/>
+                          </w:rPr>
+                        </w:pPr>
+                        <w:r>
+                          <w:rPr>
+                            <w:rFonts w:ascii="Segoe UI" w:hAnsi="Segoe UI" w:cs="Segoe UI"/>
+                            <w:kern w:val="0"/>
+                            <w:sz w:val="14"/>
+                            <w:szCs w:val="14"/>
+                            <w:lang w:val="en-US"/>
+                          </w:rPr>
+                          <w:t>- Bookings: make and manage customer bookings</w:t>
+                        </w:r>
+                      </w:p>
+                      <w:p>
+                        <w:pPr>
+                          <w:autoSpaceDE w:val="0"/>
+                          <w:autoSpaceDN w:val="0"/>
+                          <w:adjustRightInd w:val="0"/>
+                          <w:rPr>
+                            <w:rFonts w:ascii="Segoe UI" w:hAnsi="Segoe UI" w:cs="Segoe UI"/>
+                            <w:kern w:val="0"/>
+                            <w:sz w:val="14"/>
+                            <w:szCs w:val="14"/>
+                            <w:lang w:val="en-US"/>
+                          </w:rPr>
+                        </w:pPr>
+                        <w:r>
+                          <w:rPr>
+                            <w:rFonts w:ascii="Segoe UI" w:hAnsi="Segoe UI" w:cs="Segoe UI"/>
+                            <w:kern w:val="0"/>
+                            <w:sz w:val="14"/>
+                            <w:szCs w:val="14"/>
+                            <w:lang w:val="en-US"/>
+                          </w:rPr>
+                          <w:t>- Find Booking: search for a booking and cancel it</w:t>
+                        </w:r>
+                      </w:p>
+                      <w:p>
+                        <w:pPr>
+                          <w:autoSpaceDE w:val="0"/>
+                          <w:autoSpaceDN w:val="0"/>
+                          <w:adjustRightInd w:val="0"/>
+                          <w:rPr>
+                            <w:rFonts w:ascii="Segoe UI" w:hAnsi="Segoe UI" w:cs="Segoe UI"/>
+                            <w:kern w:val="0"/>
+                            <w:sz w:val="14"/>
+                            <w:szCs w:val="14"/>
+                            <w:lang w:val="en-US"/>
+                          </w:rPr>
+                        </w:pPr>
+                        <w:r>
+                          <w:rPr>
+                            <w:rFonts w:ascii="Segoe UI" w:hAnsi="Segoe UI" w:cs="Segoe UI"/>
+                            <w:kern w:val="0"/>
+                            <w:sz w:val="14"/>
+                            <w:szCs w:val="14"/>
+                            <w:lang w:val="en-US"/>
+                          </w:rPr>
+                          <w:t>- Screenings: see what films are showing and when</w:t>
+                        </w:r>
+                      </w:p>
+                      <w:p>
+                        <w:pPr>
+                          <w:autoSpaceDE w:val="0"/>
+                          <w:autoSpaceDN w:val="0"/>
+                          <w:adjustRightInd w:val="0"/>
+                          <w:rPr>
+                            <w:rFonts w:ascii="Segoe UI" w:hAnsi="Segoe UI" w:cs="Segoe UI"/>
+                            <w:kern w:val="0"/>
+                            <w:sz w:val="14"/>
+                            <w:szCs w:val="14"/>
+                            <w:lang w:val="en-US"/>
+                          </w:rPr>
+                        </w:pPr>
+                        <w:r>
+                          <w:rPr>
+                            <w:rFonts w:ascii="Segoe UI" w:hAnsi="Segoe UI" w:cs="Segoe UI"/>
+                            <w:kern w:val="0"/>
+                            <w:sz w:val="14"/>
+                            <w:szCs w:val="14"/>
+                            <w:lang w:val="en-US"/>
+                          </w:rPr>
+                          <w:t>- Customers: look up customer details</w:t>
+                        </w:r>
+                      </w:p>
+                      <w:p>
+                        <w:pPr>
+                          <w:autoSpaceDE w:val="0"/>
+                          <w:autoSpaceDN w:val="0"/>
+                          <w:adjustRightInd w:val="0"/>
+                          <w:rPr>
+                            <w:rFonts w:ascii="Segoe UI" w:hAnsi="Segoe UI" w:cs="Segoe UI"/>
+                            <w:kern w:val="0"/>
+                            <w:sz w:val="14"/>
+                            <w:szCs w:val="14"/>
+                            <w:lang w:val="en-US"/>
+                          </w:rPr>
+                        </w:pPr>
+                        <w:r>
+                          <w:rPr>
+                            <w:rFonts w:ascii="Segoe UI" w:hAnsi="Segoe UI" w:cs="Segoe UI"/>
+                            <w:kern w:val="0"/>
+                            <w:sz w:val="14"/>
+                            <w:szCs w:val="14"/>
+                            <w:lang w:val="en-US"/>
+                          </w:rPr>
+                          <w:t>- Films: add and edit films (managers only)</w:t>
+                        </w:r>
+                      </w:p>
+                      <w:p>
+                        <w:pPr>
+                          <w:autoSpaceDE w:val="0"/>
+                          <w:autoSpaceDN w:val="0"/>
+                          <w:adjustRightInd w:val="0"/>
+                          <w:rPr>
+                            <w:rFonts w:ascii="Segoe UI" w:hAnsi="Segoe UI" w:cs="Segoe UI"/>
+                            <w:kern w:val="0"/>
+                            <w:sz w:val="14"/>
+                            <w:szCs w:val="14"/>
+                            <w:lang w:val="en-US"/>
+                          </w:rPr>
+                        </w:pPr>
+                        <w:r>
+                          <w:rPr>
+                            <w:rFonts w:ascii="Segoe UI" w:hAnsi="Segoe UI" w:cs="Segoe UI"/>
+                            <w:kern w:val="0"/>
+                            <w:sz w:val="14"/>
+                            <w:szCs w:val="14"/>
+                            <w:lang w:val="en-US"/>
+                          </w:rPr>
+                          <w:t>- Screens: set up screens and seating (managers only)</w:t>
+                        </w:r>
+                      </w:p>
+                      <w:p>
+                        <w:pPr>
+                          <w:autoSpaceDE w:val="0"/>
+                          <w:autoSpaceDN w:val="0"/>
+                          <w:adjustRightInd w:val="0"/>
+                          <w:rPr>
+                            <w:rFonts w:ascii="Segoe UI" w:hAnsi="Segoe UI" w:cs="Segoe UI"/>
+                            <w:kern w:val="0"/>
+                            <w:sz w:val="14"/>
+                            <w:szCs w:val="14"/>
+                            <w:lang w:val="en-US"/>
+                          </w:rPr>
+                        </w:pPr>
+                        <w:r>
+                          <w:rPr>
+                            <w:rFonts w:ascii="Segoe UI" w:hAnsi="Segoe UI" w:cs="Segoe UI"/>
+                            <w:kern w:val="0"/>
+                            <w:sz w:val="14"/>
+                            <w:szCs w:val="14"/>
+                            <w:lang w:val="en-US"/>
+                          </w:rPr>
+                          <w:t>- Food: manage food and drink items (managers only)</w:t>
+                        </w:r>
+                      </w:p>
+                      <w:p>
+                        <w:pPr>
+                          <w:autoSpaceDE w:val="0"/>
+                          <w:autoSpaceDN w:val="0"/>
+                          <w:adjustRightInd w:val="0"/>
+                          <w:rPr>
+                            <w:rFonts w:ascii="Segoe UI" w:hAnsi="Segoe UI" w:cs="Segoe UI"/>
+                            <w:kern w:val="0"/>
+                            <w:sz w:val="14"/>
+                            <w:szCs w:val="14"/>
+                            <w:lang w:val="en-US"/>
+                          </w:rPr>
+                        </w:pPr>
+                        <w:r>
+                          <w:rPr>
+                            <w:rFonts w:ascii="Segoe UI" w:hAnsi="Segoe UI" w:cs="Segoe UI"/>
+                            <w:kern w:val="0"/>
+                            <w:sz w:val="14"/>
+                            <w:szCs w:val="14"/>
+                            <w:lang w:val="en-US"/>
+                          </w:rPr>
+                          <w:t>- Reports: view sales reports (managers only)</w:t>
+                        </w:r>
+                      </w:p>
+                      <w:p>
+                        <w:pPr>
+                          <w:autoSpaceDE w:val="0"/>
+                          <w:autoSpaceDN w:val="0"/>
+                          <w:adjustRightInd w:val="0"/>
+                          <w:rPr>
+                            <w:rFonts w:ascii="Segoe UI" w:hAnsi="Segoe UI" w:cs="Segoe UI"/>
+                            <w:kern w:val="0"/>
+                            <w:sz w:val="14"/>
+                            <w:szCs w:val="14"/>
+                            <w:lang w:val="en-US"/>
+                          </w:rPr>
+                        </w:pPr>
+                        <w:r>
+                          <w:rPr>
+                            <w:rFonts w:ascii="Segoe UI" w:hAnsi="Segoe UI" w:cs="Segoe UI"/>
+                            <w:kern w:val="0"/>
+                            <w:sz w:val="14"/>
+                            <w:szCs w:val="14"/>
+                            <w:lang w:val="en-US"/>
+                          </w:rPr>
+                          <w:t>- Logs: view a history of actions taken in the system (managers only)</w:t>
+                        </w:r>
+                      </w:p>
+                      <w:p>
+                        <w:pPr>
+                          <w:autoSpaceDE w:val="0"/>
+                          <w:autoSpaceDN w:val="0"/>
+                          <w:adjustRightInd w:val="0"/>
+                          <w:rPr>
+                            <w:rFonts w:ascii="Segoe UI" w:hAnsi="Segoe UI" w:cs="Segoe UI"/>
+                            <w:kern w:val="0"/>
+                            <w:sz w:val="14"/>
+                            <w:szCs w:val="14"/>
+                            <w:lang w:val="en-US"/>
+                          </w:rPr>
+                        </w:pPr>
+                      </w:p>
+                      <w:p>
+                        <w:pPr>
+                          <w:autoSpaceDE w:val="0"/>
+                          <w:autoSpaceDN w:val="0"/>
+                          <w:adjustRightInd w:val="0"/>
+                          <w:rPr>
+                            <w:rFonts w:ascii="Segoe UI" w:hAnsi="Segoe UI" w:cs="Segoe UI"/>
+                            <w:kern w:val="0"/>
+                            <w:sz w:val="14"/>
+                            <w:szCs w:val="14"/>
+                            <w:lang w:val="en-US"/>
+                          </w:rPr>
+                        </w:pPr>
+                        <w:r>
+                          <w:rPr>
+                            <w:rFonts w:ascii="Segoe UI" w:hAnsi="Segoe UI" w:cs="Segoe UI"/>
+                            <w:kern w:val="0"/>
+                            <w:sz w:val="14"/>
+                            <w:szCs w:val="14"/>
+                            <w:lang w:val="en-US"/>
+                          </w:rPr>
+                          <w:t>Use the Log out button at the bottom when you are finished.</w:t>
+                        </w:r>
+                      </w:p>
+                      <w:p>
+                        <w:pPr>
+                          <w:rPr>
+                            <w:sz w:val="20"/>
+                            <w:szCs w:val="20"/>
+                            <w:lang w:val="en-US"/>
+                          </w:rPr>
+                        </w:pPr>
+                      </w:p>
+                    </w:txbxContent>
+                  </v:textbox>
+                </v:shape>
+                <v:shape id="Text Box 760575158" o:spid="_x0000_s1052" type="#_x0000_t202" style="position:absolute;left:11514;top:8848;width:16933;height:2836;visibility:visible;mso-wrap-style:square;v-text-anchor:top" o:gfxdata="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" filled="f" stroked="f">
+                  <v:textbox>
+                    <w:txbxContent>
+                      <w:p>
+                        <w:pPr>
+                          <w:rPr>
+                            <w:b/>
+                            <w:bCs/>
+                            <w:color w:val="A02B93" w:themeColor="accent5"/>
+                          </w:rPr>
+                        </w:pPr>
+                        <w:r>
+                          <w:rPr>
+                            <w:b/>
+                            <w:bCs/>
+                            <w:color w:val="A02B93" w:themeColor="accent5"/>
+                          </w:rPr>
+                          <w:t>Welcome</w:t>
+                        </w:r>
+                        <w:r>
+                          <w:rPr>
+                            <w:b/>
+                            <w:bCs/>
+                            <w:color w:val="A02B93" w:themeColor="accent5"/>
+                          </w:rPr>
+                          <w:t>!</w:t>
+                        </w:r>
+                      </w:p>
+                    </w:txbxContent>
+                  </v:textbox>
+                </v:shape>
+                <w10:anchorlock/>
+              </v:group>
+            </w:pict>
+          </mc:Fallback>
+        </mc:AlternateContent>
       </w:r>
     </w:p>
     <w:p>
@@ -1351,32 +3044,14 @@
         <w:rPr>
           <w:rFonts w:ascii="Aptos" w:eastAsia="Aptos" w:hAnsi="Aptos" w:cs="Aptos"/>
         </w:rPr>
-        <w:t xml:space="preserve">The inputs to this form are the four film details typed into the text boxes. The outputs are the updated list of films shown in the grid and, where appropriate, a message box confirming that a film has been added or warning the user if something has gone wrong. The processes behind the buttons are straightforward database operations, for example the Add button takes whatever is in the text boxes and inserts a new record into the </w:t>
-      </w:r>
-      <w:proofErr w:type="spellStart"/>
-      <w:r>
-        <w:rPr>
-          <w:rFonts w:ascii="Aptos" w:eastAsia="Aptos" w:hAnsi="Aptos" w:cs="Aptos"/>
-        </w:rPr>
-        <w:t>tblFilm</w:t>
-      </w:r>
-      <w:proofErr w:type="spellEnd"/>
-      <w:r>
-        <w:rPr>
-          <w:rFonts w:ascii="Aptos" w:eastAsia="Aptos" w:hAnsi="Aptos" w:cs="Aptos"/>
-        </w:rPr>
-        <w:t xml:space="preserve"> table, whereas the Update button changes the record for the film currently selected in the grid, and the Delete button removes it. The Clear button simply empties the text boxes so the user can start again.</w:t>
-      </w:r>
-    </w:p>
-    <w:p>
-      <w:pPr>
-        <w:spacing w:after="160" w:line="276" w:lineRule="auto"/>
-      </w:pPr>
-      <w:r>
-        <w:rPr>
-          <w:rFonts w:ascii="Aptos" w:eastAsia="Aptos" w:hAnsi="Aptos" w:cs="Aptos"/>
-        </w:rPr>
-        <w:t>I have laid the form out with the list on one side and the editing boxes on the other, this is because it lets the user see the existing data and the thing they are editing at the same time rather than flipping between two separate screens. I have again used clearly labelled buttons for each action, this is because it makes it obvious what each one does and avoids the user accidentally deleting a film when they only meant to update it. This same pattern, a list on one side and input boxes with Add, Update, Delete and Clear buttons on the other, is reused across several of the management forms, so where a later objective uses the same layout I will refer back to this description rather than repeating it.</w:t>
+        <w:t xml:space="preserve">The input to the main menu is simply the button the user chooses to press. The output is the opening of whichever form that button is linked to. There is no data entry on this screen </w:t>
+      </w:r>
+      <w:r>
+        <w:rPr>
+          <w:rFonts w:ascii="Aptos" w:eastAsia="Aptos" w:hAnsi="Aptos" w:cs="Aptos"/>
+        </w:rPr>
+        <w:lastRenderedPageBreak/>
+        <w:t>at all, this is because its only job is navigation, and keeping it free of clutter makes it obvious where everything lives.</w:t>
       </w:r>
     </w:p>
     <w:p>
@@ -1391,7 +3066,7 @@
           <w:bCs/>
           <w:color w:val="000000"/>
         </w:rPr>
-        <w:t>Adding New Screenings (Objective 7)</w:t>
+        <w:t>Adding New Films (Objective 6)</w:t>
       </w:r>
     </w:p>
     <w:p>
@@ -1402,35 +3077,21 @@
         <w:rPr>
           <w:rFonts w:ascii="Aptos" w:eastAsia="Aptos" w:hAnsi="Aptos" w:cs="Aptos"/>
         </w:rPr>
-        <w:t xml:space="preserve">Once films exist in the system the next job is to schedule when and where they will actually be shown, which is what this objective covers. It is handled by the form named </w:t>
+        <w:t xml:space="preserve">Moving on to the management side of the system, one of the first jobs a manager or member of staff needs to do is add the films that the cinema is showing, because without any films in the system there is nothing for a screening to be attached to. This objective is handled by a single form named </w:t>
       </w:r>
       <w:proofErr w:type="spellStart"/>
       <w:r>
         <w:rPr>
           <w:rFonts w:ascii="Aptos" w:eastAsia="Aptos" w:hAnsi="Aptos" w:cs="Aptos"/>
         </w:rPr>
-        <w:t>frmScreenings</w:t>
+        <w:t>frmFilms</w:t>
       </w:r>
       <w:proofErr w:type="spellEnd"/>
       <w:r>
         <w:rPr>
           <w:rFonts w:ascii="Aptos" w:eastAsia="Aptos" w:hAnsi="Aptos" w:cs="Aptos"/>
         </w:rPr>
-        <w:t xml:space="preserve">, and because it is another management form for adding, editing and removing records it follows exactly the same layout as the Add Films form described above, with a data grid view named </w:t>
-      </w:r>
-      <w:proofErr w:type="spellStart"/>
-      <w:r>
-        <w:rPr>
-          <w:rFonts w:ascii="Aptos" w:eastAsia="Aptos" w:hAnsi="Aptos" w:cs="Aptos"/>
-        </w:rPr>
-        <w:t>dgvScreenings</w:t>
-      </w:r>
-      <w:proofErr w:type="spellEnd"/>
-      <w:r>
-        <w:rPr>
-          <w:rFonts w:ascii="Aptos" w:eastAsia="Aptos" w:hAnsi="Aptos" w:cs="Aptos"/>
-        </w:rPr>
-        <w:t xml:space="preserve"> listing the existing screenings on one side and a set of input controls with Add, Update, Delete and Clear buttons on the other. Rather than repeat the whole description I will refer back to the Add Films form for the general behaviour and just explain what is different here.</w:t>
+        <w:t xml:space="preserve"> which lets the user add a new film, edit an existing one, or remove one that is no longer being shown.</w:t>
       </w:r>
     </w:p>
     <w:p>
@@ -1441,20 +3102,62 @@
         <w:rPr>
           <w:rFonts w:ascii="Aptos" w:eastAsia="Aptos" w:hAnsi="Aptos" w:cs="Aptos"/>
         </w:rPr>
-        <w:t xml:space="preserve">The difference is in the inputs. A screening has to be tied to a film that already exists and a screen that already exists, so instead of free text boxes for those two the form uses two combo boxes, named </w:t>
+        <w:t xml:space="preserve">The form is split into two halves. On one side is a data grid view named </w:t>
       </w:r>
       <w:proofErr w:type="spellStart"/>
       <w:r>
         <w:rPr>
           <w:rFonts w:ascii="Aptos" w:eastAsia="Aptos" w:hAnsi="Aptos" w:cs="Aptos"/>
         </w:rPr>
-        <w:t>cboFilm</w:t>
+        <w:t>dgvFilms</w:t>
       </w:r>
       <w:proofErr w:type="spellEnd"/>
       <w:r>
         <w:rPr>
           <w:rFonts w:ascii="Aptos" w:eastAsia="Aptos" w:hAnsi="Aptos" w:cs="Aptos"/>
         </w:rPr>
+        <w:t xml:space="preserve"> which lists every film already stored in the system, showing its title, age rating, duration and description in a table so the user can see at a glance what is already there. On the other side is a set of input boxes for the details of a film, made up of a label and a text box for each field, which I have named </w:t>
+      </w:r>
+      <w:proofErr w:type="spellStart"/>
+      <w:r>
+        <w:rPr>
+          <w:rFonts w:ascii="Aptos" w:eastAsia="Aptos" w:hAnsi="Aptos" w:cs="Aptos"/>
+        </w:rPr>
+        <w:t>txtTitle</w:t>
+      </w:r>
+      <w:proofErr w:type="spellEnd"/>
+      <w:r>
+        <w:rPr>
+          <w:rFonts w:ascii="Aptos" w:eastAsia="Aptos" w:hAnsi="Aptos" w:cs="Aptos"/>
+        </w:rPr>
+        <w:t xml:space="preserve">, </w:t>
+      </w:r>
+      <w:proofErr w:type="spellStart"/>
+      <w:r>
+        <w:rPr>
+          <w:rFonts w:ascii="Aptos" w:eastAsia="Aptos" w:hAnsi="Aptos" w:cs="Aptos"/>
+        </w:rPr>
+        <w:t>txtAgeRating</w:t>
+      </w:r>
+      <w:proofErr w:type="spellEnd"/>
+      <w:r>
+        <w:rPr>
+          <w:rFonts w:ascii="Aptos" w:eastAsia="Aptos" w:hAnsi="Aptos" w:cs="Aptos"/>
+        </w:rPr>
+        <w:t xml:space="preserve">, </w:t>
+      </w:r>
+      <w:proofErr w:type="spellStart"/>
+      <w:r>
+        <w:rPr>
+          <w:rFonts w:ascii="Aptos" w:eastAsia="Aptos" w:hAnsi="Aptos" w:cs="Aptos"/>
+        </w:rPr>
+        <w:t>txtDuration</w:t>
+      </w:r>
+      <w:proofErr w:type="spellEnd"/>
+      <w:r>
+        <w:rPr>
+          <w:rFonts w:ascii="Aptos" w:eastAsia="Aptos" w:hAnsi="Aptos" w:cs="Aptos"/>
+        </w:rPr>
         <w:t xml:space="preserve"> and </w:t>
       </w:r>
       <w:proofErr w:type="spellStart"/>
@@ -1462,63 +3165,125 @@
         <w:rPr>
           <w:rFonts w:ascii="Aptos" w:eastAsia="Aptos" w:hAnsi="Aptos" w:cs="Aptos"/>
         </w:rPr>
-        <w:t>cboScreen</w:t>
+        <w:t>txtDescription</w:t>
       </w:r>
       <w:proofErr w:type="spellEnd"/>
       <w:r>
         <w:rPr>
           <w:rFonts w:ascii="Aptos" w:eastAsia="Aptos" w:hAnsi="Aptos" w:cs="Aptos"/>
         </w:rPr>
-        <w:t xml:space="preserve">, which the user picks from. This is because a member of staff should not be able to type in a film or a screen that is not really there, and choosing from a list makes that impossible. The date is entered using a date picker named </w:t>
+        <w:t xml:space="preserve">. Beneath these are four buttons, Add, Update, Delete and Clear, which I have named </w:t>
       </w:r>
       <w:proofErr w:type="spellStart"/>
       <w:r>
         <w:rPr>
           <w:rFonts w:ascii="Aptos" w:eastAsia="Aptos" w:hAnsi="Aptos" w:cs="Aptos"/>
         </w:rPr>
-        <w:t>dtpScreeningDate</w:t>
+        <w:t>btnAdd</w:t>
       </w:r>
       <w:proofErr w:type="spellEnd"/>
       <w:r>
         <w:rPr>
           <w:rFonts w:ascii="Aptos" w:eastAsia="Aptos" w:hAnsi="Aptos" w:cs="Aptos"/>
         </w:rPr>
-        <w:t xml:space="preserve"> rather than a text box, this is because a proper date picker stops </w:t>
-      </w:r>
-      <w:r>
-        <w:rPr>
-          <w:rFonts w:ascii="Aptos" w:eastAsia="Aptos" w:hAnsi="Aptos" w:cs="Aptos"/>
-        </w:rPr>
-        <w:lastRenderedPageBreak/>
-        <w:t xml:space="preserve">the user entering something that is not a real date. The time and the ticket price are entered into text boxes named </w:t>
+        <w:t xml:space="preserve">, </w:t>
       </w:r>
       <w:proofErr w:type="spellStart"/>
       <w:r>
         <w:rPr>
           <w:rFonts w:ascii="Aptos" w:eastAsia="Aptos" w:hAnsi="Aptos" w:cs="Aptos"/>
         </w:rPr>
-        <w:t>txtScreeningTime</w:t>
+        <w:t>btnUpdate</w:t>
       </w:r>
       <w:proofErr w:type="spellEnd"/>
       <w:r>
         <w:rPr>
           <w:rFonts w:ascii="Aptos" w:eastAsia="Aptos" w:hAnsi="Aptos" w:cs="Aptos"/>
         </w:rPr>
-        <w:t xml:space="preserve">, which is labelled Time in the format HH colon MM, and </w:t>
+        <w:t xml:space="preserve">, </w:t>
       </w:r>
       <w:proofErr w:type="spellStart"/>
       <w:r>
         <w:rPr>
           <w:rFonts w:ascii="Aptos" w:eastAsia="Aptos" w:hAnsi="Aptos" w:cs="Aptos"/>
         </w:rPr>
-        <w:t>txtTicketPrice</w:t>
+        <w:t>btnDelete</w:t>
       </w:r>
       <w:proofErr w:type="spellEnd"/>
       <w:r>
         <w:rPr>
           <w:rFonts w:ascii="Aptos" w:eastAsia="Aptos" w:hAnsi="Aptos" w:cs="Aptos"/>
         </w:rPr>
+        <w:t xml:space="preserve"> and </w:t>
+      </w:r>
+      <w:proofErr w:type="spellStart"/>
+      <w:r>
+        <w:rPr>
+          <w:rFonts w:ascii="Aptos" w:eastAsia="Aptos" w:hAnsi="Aptos" w:cs="Aptos"/>
+        </w:rPr>
+        <w:t>btnClear</w:t>
+      </w:r>
+      <w:proofErr w:type="spellEnd"/>
+      <w:r>
+        <w:rPr>
+          <w:rFonts w:ascii="Aptos" w:eastAsia="Aptos" w:hAnsi="Aptos" w:cs="Aptos"/>
+        </w:rPr>
         <w:t>.</w:t>
+      </w:r>
+    </w:p>
+    <w:p>
+      <w:pPr>
+        <w:pBdr>
+          <w:top w:val="single" w:sz="6" w:space="6" w:color="A02B93"/>
+          <w:left w:val="single" w:sz="6" w:space="6" w:color="A02B93"/>
+          <w:bottom w:val="single" w:sz="6" w:space="6" w:color="A02B93"/>
+          <w:right w:val="single" w:sz="6" w:space="6" w:color="A02B93"/>
+        </w:pBdr>
+        <w:shd w:val="clear" w:color="auto" w:fill="F7E9F3"/>
+        <w:spacing w:before="120" w:after="200"/>
+        <w:rPr>
+          <w:rFonts w:ascii="Aptos" w:eastAsia="Aptos" w:hAnsi="Aptos" w:cs="Aptos"/>
+          <w:b/>
+          <w:bCs/>
+          <w:color w:val="A02B93"/>
+          <w:sz w:val="22"/>
+          <w:szCs w:val="22"/>
+        </w:rPr>
+      </w:pPr>
+      <w:r>
+        <w:rPr>
+          <w:rFonts w:ascii="Aptos" w:eastAsia="Aptos" w:hAnsi="Aptos" w:cs="Aptos"/>
+          <w:b/>
+          <w:bCs/>
+          <w:color w:val="A02B93"/>
+          <w:sz w:val="22"/>
+          <w:szCs w:val="22"/>
+        </w:rPr>
+        <w:t>Add Films Form (</w:t>
+      </w:r>
+      <w:proofErr w:type="spellStart"/>
+      <w:r>
+        <w:rPr>
+          <w:rFonts w:ascii="Aptos" w:eastAsia="Aptos" w:hAnsi="Aptos" w:cs="Aptos"/>
+          <w:b/>
+          <w:bCs/>
+          <w:color w:val="A02B93"/>
+          <w:sz w:val="22"/>
+          <w:szCs w:val="22"/>
+        </w:rPr>
+        <w:t>frmFilms</w:t>
+      </w:r>
+      <w:proofErr w:type="spellEnd"/>
+      <w:r>
+        <w:rPr>
+          <w:rFonts w:ascii="Aptos" w:eastAsia="Aptos" w:hAnsi="Aptos" w:cs="Aptos"/>
+          <w:b/>
+          <w:bCs/>
+          <w:color w:val="A02B93"/>
+          <w:sz w:val="22"/>
+          <w:szCs w:val="22"/>
+        </w:rPr>
+        <w:t>)</w:t>
       </w:r>
     </w:p>
     <w:p>
@@ -1534,38 +3299,45 @@
       </w:pPr>
       <w:r>
         <w:rPr>
-          <w:rFonts w:ascii="Aptos" w:eastAsia="Aptos" w:hAnsi="Aptos" w:cs="Aptos"/>
-          <w:b/>
-          <w:bCs/>
-          <w:color w:val="A02B93"/>
-          <w:sz w:val="22"/>
-          <w:szCs w:val="22"/>
-        </w:rPr>
-        <w:t>Add Screenings Form (</w:t>
-      </w:r>
-      <w:proofErr w:type="spellStart"/>
-      <w:r>
-        <w:rPr>
-          <w:rFonts w:ascii="Aptos" w:eastAsia="Aptos" w:hAnsi="Aptos" w:cs="Aptos"/>
-          <w:b/>
-          <w:bCs/>
-          <w:color w:val="A02B93"/>
-          <w:sz w:val="22"/>
-          <w:szCs w:val="22"/>
-        </w:rPr>
-        <w:t>frmScreenings</w:t>
-      </w:r>
-      <w:proofErr w:type="spellEnd"/>
-      <w:r>
-        <w:rPr>
-          <w:rFonts w:ascii="Aptos" w:eastAsia="Aptos" w:hAnsi="Aptos" w:cs="Aptos"/>
-          <w:b/>
-          <w:bCs/>
-          <w:color w:val="A02B93"/>
-          <w:sz w:val="22"/>
-          <w:szCs w:val="22"/>
-        </w:rPr>
-        <w:t>)</w:t>
+          <w:noProof/>
+        </w:rPr>
+        <mc:AlternateContent>
+          <mc:Choice Requires="wpc">
+            <w:drawing>
+              <wp:inline distT="0" distB="0" distL="0" distR="0" wp14:anchorId="15269588" wp14:editId="044332E4">
+                <wp:extent cx="5486400" cy="3200400"/>
+                <wp:effectExtent l="0" t="0" r="0" b="0"/>
+                <wp:docPr id="1459371715" name="Canvas 6"/>
+                <wp:cNvGraphicFramePr>
+                  <a:graphicFrameLocks xmlns:a="http://schemas.openxmlformats.org/drawingml/2006/main" noChangeAspect="1"/>
+                </wp:cNvGraphicFramePr>
+                <a:graphic xmlns:a="http://schemas.openxmlformats.org/drawingml/2006/main">
+                  <a:graphicData uri="http://schemas.microsoft.com/office/word/2010/wordprocessingCanvas">
+                    <wpc:wpc>
+                      <wpc:bg>
+                        <a:solidFill>
+                          <a:prstClr val="white"/>
+                        </a:solidFill>
+                      </wpc:bg>
+                      <wpc:whole/>
+                    </wpc:wpc>
+                  </a:graphicData>
+                </a:graphic>
+              </wp:inline>
+            </w:drawing>
+          </mc:Choice>
+          <mc:Fallback>
+            <w:pict>
+              <v:group w14:anchorId="0F347F99" id="Canvas 6" o:spid="_x0000_s1026" editas="canvas" style="width:6in;height:252pt;mso-position-horizontal-relative:char;mso-position-vertical-relative:line" coordsize="54864,32004" o:gfxdata="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">
+                <v:shape id="_x0000_s1027" type="#_x0000_t75" style="position:absolute;width:54864;height:32004;visibility:visible;mso-wrap-style:square" filled="t">
+                  <v:fill o:detectmouseclick="t"/>
+                  <v:path o:connecttype="none"/>
+                </v:shape>
+                <w10:anchorlock/>
+              </v:group>
+            </w:pict>
+          </mc:Fallback>
+        </mc:AlternateContent>
       </w:r>
     </w:p>
     <w:p>
@@ -1576,21 +3348,39 @@
         <w:rPr>
           <w:rFonts w:ascii="Aptos" w:eastAsia="Aptos" w:hAnsi="Aptos" w:cs="Aptos"/>
         </w:rPr>
-        <w:t xml:space="preserve">The inputs are therefore the chosen film, the chosen screen, the date, the time and the ticket price. The output is the updated list of screenings in the grid, along with the usual confirmation or warning message boxes. The processes behind the buttons are the same insert, update and delete operations as before, this time acting on the </w:t>
+        <w:t xml:space="preserve">The inputs to this form are the four film details typed into the text boxes. The outputs are the updated list of films shown in the grid and, where appropriate, a message box confirming that a film has been added or warning the user if something has gone wrong. </w:t>
+      </w:r>
+      <w:r>
+        <w:rPr>
+          <w:rFonts w:ascii="Aptos" w:eastAsia="Aptos" w:hAnsi="Aptos" w:cs="Aptos"/>
+        </w:rPr>
+        <w:lastRenderedPageBreak/>
+        <w:t xml:space="preserve">The processes behind the buttons are straightforward database operations, for example the Add button takes whatever is in the text boxes and inserts a new record into the </w:t>
       </w:r>
       <w:proofErr w:type="spellStart"/>
       <w:r>
         <w:rPr>
           <w:rFonts w:ascii="Aptos" w:eastAsia="Aptos" w:hAnsi="Aptos" w:cs="Aptos"/>
         </w:rPr>
-        <w:t>tblScreening</w:t>
+        <w:t>tblFilm</w:t>
       </w:r>
       <w:proofErr w:type="spellEnd"/>
       <w:r>
         <w:rPr>
           <w:rFonts w:ascii="Aptos" w:eastAsia="Aptos" w:hAnsi="Aptos" w:cs="Aptos"/>
         </w:rPr>
-        <w:t xml:space="preserve"> table.</w:t>
+        <w:t xml:space="preserve"> table, whereas the Update button changes the record for the film currently selected in the grid, and the Delete button removes it. The Clear button simply empties the text boxes so the user can start again.</w:t>
+      </w:r>
+    </w:p>
+    <w:p>
+      <w:pPr>
+        <w:spacing w:after="160" w:line="276" w:lineRule="auto"/>
+      </w:pPr>
+      <w:r>
+        <w:rPr>
+          <w:rFonts w:ascii="Aptos" w:eastAsia="Aptos" w:hAnsi="Aptos" w:cs="Aptos"/>
+        </w:rPr>
+        <w:t>I have laid the form out with the list on one side and the editing boxes on the other, this is because it lets the user see the existing data and the thing they are editing at the same time rather than flipping between two separate screens. I have again used clearly labelled buttons for each action, this is because it makes it obvious what each one does and avoids the user accidentally deleting a film when they only meant to update it. This same pattern, a list on one side and input boxes with Add, Update, Delete and Clear buttons on the other, is reused across several of the management forms, so where a later objective uses the same layout I will refer back to this description rather than repeating it.</w:t>
       </w:r>
     </w:p>
     <w:p>
@@ -1605,7 +3395,7 @@
           <w:bCs/>
           <w:color w:val="000000"/>
         </w:rPr>
-        <w:t>Creating a Screen with Automatic Seat Generation (Objective 16)</w:t>
+        <w:t>Adding New Screenings (Objective 7)</w:t>
       </w:r>
     </w:p>
     <w:p>
@@ -1616,63 +3406,35 @@
         <w:rPr>
           <w:rFonts w:ascii="Aptos" w:eastAsia="Aptos" w:hAnsi="Aptos" w:cs="Aptos"/>
         </w:rPr>
-        <w:t xml:space="preserve">Before a screening can be booked the cinema needs its physical screens set up in the system, each with the right number of seats. This objective is handled by the form named </w:t>
+        <w:t xml:space="preserve">Once films exist in the system the next job is to schedule when and where they will actually be shown, which is what this objective covers. It is handled by the form named </w:t>
       </w:r>
       <w:proofErr w:type="spellStart"/>
       <w:r>
         <w:rPr>
           <w:rFonts w:ascii="Aptos" w:eastAsia="Aptos" w:hAnsi="Aptos" w:cs="Aptos"/>
         </w:rPr>
-        <w:t>frmScreens</w:t>
+        <w:t>frmScreenings</w:t>
       </w:r>
       <w:proofErr w:type="spellEnd"/>
       <w:r>
         <w:rPr>
           <w:rFonts w:ascii="Aptos" w:eastAsia="Aptos" w:hAnsi="Aptos" w:cs="Aptos"/>
         </w:rPr>
-        <w:t xml:space="preserve">, which once again uses the same familiar management layout with a data grid view named </w:t>
+        <w:t xml:space="preserve">, and because it is another management form for adding, editing and removing records it follows exactly the same layout as the Add Films form described above, with a data grid view named </w:t>
       </w:r>
       <w:proofErr w:type="spellStart"/>
       <w:r>
         <w:rPr>
           <w:rFonts w:ascii="Aptos" w:eastAsia="Aptos" w:hAnsi="Aptos" w:cs="Aptos"/>
         </w:rPr>
-        <w:t>dgvScreens</w:t>
+        <w:t>dgvScreenings</w:t>
       </w:r>
       <w:proofErr w:type="spellEnd"/>
       <w:r>
         <w:rPr>
           <w:rFonts w:ascii="Aptos" w:eastAsia="Aptos" w:hAnsi="Aptos" w:cs="Aptos"/>
         </w:rPr>
-        <w:t xml:space="preserve"> listing the existing screens and a small set of inputs with Add, Update, Delete and Clear buttons, so I will refer back to the Add Films form for that general behaviour. There are only two inputs here, a text box named </w:t>
-      </w:r>
-      <w:proofErr w:type="spellStart"/>
-      <w:r>
-        <w:rPr>
-          <w:rFonts w:ascii="Aptos" w:eastAsia="Aptos" w:hAnsi="Aptos" w:cs="Aptos"/>
-        </w:rPr>
-        <w:t>txtName</w:t>
-      </w:r>
-      <w:proofErr w:type="spellEnd"/>
-      <w:r>
-        <w:rPr>
-          <w:rFonts w:ascii="Aptos" w:eastAsia="Aptos" w:hAnsi="Aptos" w:cs="Aptos"/>
-        </w:rPr>
-        <w:t xml:space="preserve"> for the name of the screen and a text box named </w:t>
-      </w:r>
-      <w:proofErr w:type="spellStart"/>
-      <w:r>
-        <w:rPr>
-          <w:rFonts w:ascii="Aptos" w:eastAsia="Aptos" w:hAnsi="Aptos" w:cs="Aptos"/>
-        </w:rPr>
-        <w:t>txtCapacity</w:t>
-      </w:r>
-      <w:proofErr w:type="spellEnd"/>
-      <w:r>
-        <w:rPr>
-          <w:rFonts w:ascii="Aptos" w:eastAsia="Aptos" w:hAnsi="Aptos" w:cs="Aptos"/>
-        </w:rPr>
-        <w:t xml:space="preserve"> for how many seats it has.</w:t>
+        <w:t xml:space="preserve"> listing the existing screenings on one side and a set of input controls with Add, Update, Delete and Clear buttons on the other. Rather than repeat the whole description I will refer back to the Add Films form for the general behaviour and just explain what is different here.</w:t>
       </w:r>
     </w:p>
     <w:p>
@@ -1683,7 +3445,77 @@
         <w:rPr>
           <w:rFonts w:ascii="Aptos" w:eastAsia="Aptos" w:hAnsi="Aptos" w:cs="Aptos"/>
         </w:rPr>
-        <w:t>The interesting part of this objective, and the reason it is worth documenting separately, is what happens behind the Add button. When the user enters a name and a capacity and presses Add, the system does not just save the screen, it then automatically generates that number of seat records for it. In other words if the manager types a capacity of sixty, the system creates sixty individual seats for that screen without the manager having to type a single one of them in by hand. This was a direct response to feedback during the discussion stage, where it was pointed out that setting up every seat manually would be a nightmare, so having the system do it automatically is far more sophisticated and removes any chance of human error. If a screen is later edited and its capacity changes, the old seats are cleared out and a fresh set is generated to match, and if a screen is deleted its seats are removed first.</w:t>
+        <w:t xml:space="preserve">The difference is in the inputs. A screening has to be tied to a film that already exists and a screen that already exists, so instead of free text boxes for those two the form uses two combo boxes, named </w:t>
+      </w:r>
+      <w:proofErr w:type="spellStart"/>
+      <w:r>
+        <w:rPr>
+          <w:rFonts w:ascii="Aptos" w:eastAsia="Aptos" w:hAnsi="Aptos" w:cs="Aptos"/>
+        </w:rPr>
+        <w:t>cboFilm</w:t>
+      </w:r>
+      <w:proofErr w:type="spellEnd"/>
+      <w:r>
+        <w:rPr>
+          <w:rFonts w:ascii="Aptos" w:eastAsia="Aptos" w:hAnsi="Aptos" w:cs="Aptos"/>
+        </w:rPr>
+        <w:t xml:space="preserve"> and </w:t>
+      </w:r>
+      <w:proofErr w:type="spellStart"/>
+      <w:r>
+        <w:rPr>
+          <w:rFonts w:ascii="Aptos" w:eastAsia="Aptos" w:hAnsi="Aptos" w:cs="Aptos"/>
+        </w:rPr>
+        <w:t>cboScreen</w:t>
+      </w:r>
+      <w:proofErr w:type="spellEnd"/>
+      <w:r>
+        <w:rPr>
+          <w:rFonts w:ascii="Aptos" w:eastAsia="Aptos" w:hAnsi="Aptos" w:cs="Aptos"/>
+        </w:rPr>
+        <w:t xml:space="preserve">, which the user picks from. This is because a member of staff should not be able to type in a film or a screen that is not really there, and choosing from a list makes that impossible. The date is entered using a date picker named </w:t>
+      </w:r>
+      <w:proofErr w:type="spellStart"/>
+      <w:r>
+        <w:rPr>
+          <w:rFonts w:ascii="Aptos" w:eastAsia="Aptos" w:hAnsi="Aptos" w:cs="Aptos"/>
+        </w:rPr>
+        <w:t>dtpScreeningDate</w:t>
+      </w:r>
+      <w:proofErr w:type="spellEnd"/>
+      <w:r>
+        <w:rPr>
+          <w:rFonts w:ascii="Aptos" w:eastAsia="Aptos" w:hAnsi="Aptos" w:cs="Aptos"/>
+        </w:rPr>
+        <w:t xml:space="preserve"> rather than a text box, this is because a proper date picker stops the user entering something that is not a real date. The time and the ticket price are entered into text boxes named </w:t>
+      </w:r>
+      <w:proofErr w:type="spellStart"/>
+      <w:r>
+        <w:rPr>
+          <w:rFonts w:ascii="Aptos" w:eastAsia="Aptos" w:hAnsi="Aptos" w:cs="Aptos"/>
+        </w:rPr>
+        <w:t>txtScreeningTime</w:t>
+      </w:r>
+      <w:proofErr w:type="spellEnd"/>
+      <w:r>
+        <w:rPr>
+          <w:rFonts w:ascii="Aptos" w:eastAsia="Aptos" w:hAnsi="Aptos" w:cs="Aptos"/>
+        </w:rPr>
+        <w:t xml:space="preserve">, which is labelled Time in the format HH colon MM, and </w:t>
+      </w:r>
+      <w:proofErr w:type="spellStart"/>
+      <w:r>
+        <w:rPr>
+          <w:rFonts w:ascii="Aptos" w:eastAsia="Aptos" w:hAnsi="Aptos" w:cs="Aptos"/>
+        </w:rPr>
+        <w:t>txtTicketPrice</w:t>
+      </w:r>
+      <w:proofErr w:type="spellEnd"/>
+      <w:r>
+        <w:rPr>
+          <w:rFonts w:ascii="Aptos" w:eastAsia="Aptos" w:hAnsi="Aptos" w:cs="Aptos"/>
+        </w:rPr>
+        <w:t>.</w:t>
       </w:r>
     </w:p>
     <w:p>
@@ -1706,7 +3538,7 @@
           <w:sz w:val="22"/>
           <w:szCs w:val="22"/>
         </w:rPr>
-        <w:t>Add Screens Form (</w:t>
+        <w:t>Add Screenings Form (</w:t>
       </w:r>
       <w:proofErr w:type="spellStart"/>
       <w:r>
@@ -1718,7 +3550,7 @@
           <w:sz w:val="22"/>
           <w:szCs w:val="22"/>
         </w:rPr>
-        <w:t>frmScreens</w:t>
+        <w:t>frmScreenings</w:t>
       </w:r>
       <w:proofErr w:type="spellEnd"/>
       <w:r>
@@ -1741,56 +3573,28 @@
         <w:rPr>
           <w:rFonts w:ascii="Aptos" w:eastAsia="Aptos" w:hAnsi="Aptos" w:cs="Aptos"/>
         </w:rPr>
-        <w:t xml:space="preserve">The inputs are the screen name and the capacity. The outputs are the updated list of screens and, crucially, a full set of seat records created in the </w:t>
+        <w:t xml:space="preserve">The inputs are therefore the chosen film, the chosen screen, the date, the time and the ticket price. The output is the updated list of screenings in the grid, along with the usual </w:t>
+      </w:r>
+      <w:r>
+        <w:rPr>
+          <w:rFonts w:ascii="Aptos" w:eastAsia="Aptos" w:hAnsi="Aptos" w:cs="Aptos"/>
+        </w:rPr>
+        <w:lastRenderedPageBreak/>
+        <w:t xml:space="preserve">confirmation or warning message boxes. The processes behind the buttons are the same insert, update and delete operations as before, this time acting on the </w:t>
       </w:r>
       <w:proofErr w:type="spellStart"/>
       <w:r>
         <w:rPr>
           <w:rFonts w:ascii="Aptos" w:eastAsia="Aptos" w:hAnsi="Aptos" w:cs="Aptos"/>
         </w:rPr>
-        <w:t>tblSeat</w:t>
+        <w:t>tblScreening</w:t>
       </w:r>
       <w:proofErr w:type="spellEnd"/>
       <w:r>
         <w:rPr>
           <w:rFonts w:ascii="Aptos" w:eastAsia="Aptos" w:hAnsi="Aptos" w:cs="Aptos"/>
         </w:rPr>
-        <w:t xml:space="preserve"> table for the new screen. The process behind the Add button is therefore two steps, first inserting the screen into the </w:t>
-      </w:r>
-      <w:proofErr w:type="spellStart"/>
-      <w:r>
-        <w:rPr>
-          <w:rFonts w:ascii="Aptos" w:eastAsia="Aptos" w:hAnsi="Aptos" w:cs="Aptos"/>
-        </w:rPr>
-        <w:t>tblScreen</w:t>
-      </w:r>
-      <w:proofErr w:type="spellEnd"/>
-      <w:r>
-        <w:rPr>
-          <w:rFonts w:ascii="Aptos" w:eastAsia="Aptos" w:hAnsi="Aptos" w:cs="Aptos"/>
-        </w:rPr>
-        <w:t xml:space="preserve"> table and reading back the new screen's identifier, and then looping to </w:t>
-      </w:r>
-      <w:r>
-        <w:rPr>
-          <w:rFonts w:ascii="Aptos" w:eastAsia="Aptos" w:hAnsi="Aptos" w:cs="Aptos"/>
-        </w:rPr>
-        <w:lastRenderedPageBreak/>
-        <w:t xml:space="preserve">insert one seat record per seat into the </w:t>
-      </w:r>
-      <w:proofErr w:type="spellStart"/>
-      <w:r>
-        <w:rPr>
-          <w:rFonts w:ascii="Aptos" w:eastAsia="Aptos" w:hAnsi="Aptos" w:cs="Aptos"/>
-        </w:rPr>
-        <w:t>tblSeat</w:t>
-      </w:r>
-      <w:proofErr w:type="spellEnd"/>
-      <w:r>
-        <w:rPr>
-          <w:rFonts w:ascii="Aptos" w:eastAsia="Aptos" w:hAnsi="Aptos" w:cs="Aptos"/>
-        </w:rPr>
-        <w:t xml:space="preserve"> table so that the seats are ready for the booking form to use.</w:t>
+        <w:t xml:space="preserve"> table.</w:t>
       </w:r>
     </w:p>
     <w:p>
@@ -1805,7 +3609,7 @@
           <w:bCs/>
           <w:color w:val="000000"/>
         </w:rPr>
-        <w:t>Adding Customer Bookings and Preventing Double Bookings (Objectives 1 and 2)</w:t>
+        <w:t>Creating a Screen with Automatic Seat Generation (Objective 16)</w:t>
       </w:r>
     </w:p>
     <w:p>
@@ -1816,21 +3620,63 @@
         <w:rPr>
           <w:rFonts w:ascii="Aptos" w:eastAsia="Aptos" w:hAnsi="Aptos" w:cs="Aptos"/>
         </w:rPr>
-        <w:t xml:space="preserve">This is the heart of the whole system and the reason the project exists in the first place, so it is the most involved form to design. The objective is to let a member of staff create a booking for a customer against a particular screening, recording who the customer is, which seats they want and how many tickets that comes to, while making it impossible for a seat that has already been booked to be sold twice. Both of these objectives are handled together on the one form named </w:t>
+        <w:t xml:space="preserve">Before a screening can be booked the cinema needs its physical screens set up in the system, each with the right number of seats. This objective is handled by the form named </w:t>
       </w:r>
       <w:proofErr w:type="spellStart"/>
       <w:r>
         <w:rPr>
           <w:rFonts w:ascii="Aptos" w:eastAsia="Aptos" w:hAnsi="Aptos" w:cs="Aptos"/>
         </w:rPr>
-        <w:t>frmBookings</w:t>
+        <w:t>frmScreens</w:t>
       </w:r>
       <w:proofErr w:type="spellEnd"/>
       <w:r>
         <w:rPr>
           <w:rFonts w:ascii="Aptos" w:eastAsia="Aptos" w:hAnsi="Aptos" w:cs="Aptos"/>
         </w:rPr>
-        <w:t>, because in practice they are the same job.</w:t>
+        <w:t xml:space="preserve">, which once again uses the same familiar management layout with a data grid view named </w:t>
+      </w:r>
+      <w:proofErr w:type="spellStart"/>
+      <w:r>
+        <w:rPr>
+          <w:rFonts w:ascii="Aptos" w:eastAsia="Aptos" w:hAnsi="Aptos" w:cs="Aptos"/>
+        </w:rPr>
+        <w:t>dgvScreens</w:t>
+      </w:r>
+      <w:proofErr w:type="spellEnd"/>
+      <w:r>
+        <w:rPr>
+          <w:rFonts w:ascii="Aptos" w:eastAsia="Aptos" w:hAnsi="Aptos" w:cs="Aptos"/>
+        </w:rPr>
+        <w:t xml:space="preserve"> listing the existing screens and a small set of inputs with Add, Update, Delete and Clear buttons, so I will refer back to the Add Films form for that general behaviour. There are only two inputs here, a text box named </w:t>
+      </w:r>
+      <w:proofErr w:type="spellStart"/>
+      <w:r>
+        <w:rPr>
+          <w:rFonts w:ascii="Aptos" w:eastAsia="Aptos" w:hAnsi="Aptos" w:cs="Aptos"/>
+        </w:rPr>
+        <w:t>txtName</w:t>
+      </w:r>
+      <w:proofErr w:type="spellEnd"/>
+      <w:r>
+        <w:rPr>
+          <w:rFonts w:ascii="Aptos" w:eastAsia="Aptos" w:hAnsi="Aptos" w:cs="Aptos"/>
+        </w:rPr>
+        <w:t xml:space="preserve"> for the name of the screen and a text box named </w:t>
+      </w:r>
+      <w:proofErr w:type="spellStart"/>
+      <w:r>
+        <w:rPr>
+          <w:rFonts w:ascii="Aptos" w:eastAsia="Aptos" w:hAnsi="Aptos" w:cs="Aptos"/>
+        </w:rPr>
+        <w:t>txtCapacity</w:t>
+      </w:r>
+      <w:proofErr w:type="spellEnd"/>
+      <w:r>
+        <w:rPr>
+          <w:rFonts w:ascii="Aptos" w:eastAsia="Aptos" w:hAnsi="Aptos" w:cs="Aptos"/>
+        </w:rPr>
+        <w:t xml:space="preserve"> for how many seats it has.</w:t>
       </w:r>
     </w:p>
     <w:p>
@@ -1841,147 +3687,7 @@
         <w:rPr>
           <w:rFonts w:ascii="Aptos" w:eastAsia="Aptos" w:hAnsi="Aptos" w:cs="Aptos"/>
         </w:rPr>
-        <w:t xml:space="preserve">The top of the form has two combo boxes, named </w:t>
-      </w:r>
-      <w:proofErr w:type="spellStart"/>
-      <w:r>
-        <w:rPr>
-          <w:rFonts w:ascii="Aptos" w:eastAsia="Aptos" w:hAnsi="Aptos" w:cs="Aptos"/>
-        </w:rPr>
-        <w:t>cboScreening</w:t>
-      </w:r>
-      <w:proofErr w:type="spellEnd"/>
-      <w:r>
-        <w:rPr>
-          <w:rFonts w:ascii="Aptos" w:eastAsia="Aptos" w:hAnsi="Aptos" w:cs="Aptos"/>
-        </w:rPr>
-        <w:t xml:space="preserve"> and </w:t>
-      </w:r>
-      <w:proofErr w:type="spellStart"/>
-      <w:r>
-        <w:rPr>
-          <w:rFonts w:ascii="Aptos" w:eastAsia="Aptos" w:hAnsi="Aptos" w:cs="Aptos"/>
-        </w:rPr>
-        <w:t>cboCustomer</w:t>
-      </w:r>
-      <w:proofErr w:type="spellEnd"/>
-      <w:r>
-        <w:rPr>
-          <w:rFonts w:ascii="Aptos" w:eastAsia="Aptos" w:hAnsi="Aptos" w:cs="Aptos"/>
-        </w:rPr>
-        <w:t xml:space="preserve">, where the member of staff first picks which screening the booking is for and then which customer it belongs to. There is also a check box named </w:t>
-      </w:r>
-      <w:proofErr w:type="spellStart"/>
-      <w:r>
-        <w:rPr>
-          <w:rFonts w:ascii="Aptos" w:eastAsia="Aptos" w:hAnsi="Aptos" w:cs="Aptos"/>
-        </w:rPr>
-        <w:t>chkWalkIn</w:t>
-      </w:r>
-      <w:proofErr w:type="spellEnd"/>
-      <w:r>
-        <w:rPr>
-          <w:rFonts w:ascii="Aptos" w:eastAsia="Aptos" w:hAnsi="Aptos" w:cs="Aptos"/>
-        </w:rPr>
-        <w:t xml:space="preserve"> labelled Walk-in, which lets staff take a booking for a customer who has just walked in without recording their details. The largest part of the form is a panel named </w:t>
-      </w:r>
-      <w:proofErr w:type="spellStart"/>
-      <w:r>
-        <w:rPr>
-          <w:rFonts w:ascii="Aptos" w:eastAsia="Aptos" w:hAnsi="Aptos" w:cs="Aptos"/>
-        </w:rPr>
-        <w:t>pnlSeatMap</w:t>
-      </w:r>
-      <w:proofErr w:type="spellEnd"/>
-      <w:r>
-        <w:rPr>
-          <w:rFonts w:ascii="Aptos" w:eastAsia="Aptos" w:hAnsi="Aptos" w:cs="Aptos"/>
-        </w:rPr>
-        <w:t xml:space="preserve"> which draws the seat map for the chosen screening, and next to it is a small legend made up of three coloured swatches labelled Available, Selected and Taken so the user knows what the colours mean. A label named </w:t>
-      </w:r>
-      <w:proofErr w:type="spellStart"/>
-      <w:r>
-        <w:rPr>
-          <w:rFonts w:ascii="Aptos" w:eastAsia="Aptos" w:hAnsi="Aptos" w:cs="Aptos"/>
-        </w:rPr>
-        <w:t>lblTotal</w:t>
-      </w:r>
-      <w:proofErr w:type="spellEnd"/>
-      <w:r>
-        <w:rPr>
-          <w:rFonts w:ascii="Aptos" w:eastAsia="Aptos" w:hAnsi="Aptos" w:cs="Aptos"/>
-        </w:rPr>
-        <w:t xml:space="preserve"> keeps a running count of how many seats have been selected, and along the bottom are the action buttons, Create Booking named </w:t>
-      </w:r>
-      <w:proofErr w:type="spellStart"/>
-      <w:r>
-        <w:rPr>
-          <w:rFonts w:ascii="Aptos" w:eastAsia="Aptos" w:hAnsi="Aptos" w:cs="Aptos"/>
-        </w:rPr>
-        <w:t>btnCreateBooking</w:t>
-      </w:r>
-      <w:proofErr w:type="spellEnd"/>
-      <w:r>
-        <w:rPr>
-          <w:rFonts w:ascii="Aptos" w:eastAsia="Aptos" w:hAnsi="Aptos" w:cs="Aptos"/>
-        </w:rPr>
-        <w:t xml:space="preserve">, Clear Selection named </w:t>
-      </w:r>
-      <w:proofErr w:type="spellStart"/>
-      <w:r>
-        <w:rPr>
-          <w:rFonts w:ascii="Aptos" w:eastAsia="Aptos" w:hAnsi="Aptos" w:cs="Aptos"/>
-        </w:rPr>
-        <w:t>btnClear</w:t>
-      </w:r>
-      <w:proofErr w:type="spellEnd"/>
-      <w:r>
-        <w:rPr>
-          <w:rFonts w:ascii="Aptos" w:eastAsia="Aptos" w:hAnsi="Aptos" w:cs="Aptos"/>
-        </w:rPr>
-        <w:t xml:space="preserve">, Order Food named </w:t>
-      </w:r>
-      <w:proofErr w:type="spellStart"/>
-      <w:r>
-        <w:rPr>
-          <w:rFonts w:ascii="Aptos" w:eastAsia="Aptos" w:hAnsi="Aptos" w:cs="Aptos"/>
-        </w:rPr>
-        <w:t>btnOrderFood</w:t>
-      </w:r>
-      <w:proofErr w:type="spellEnd"/>
-      <w:r>
-        <w:rPr>
-          <w:rFonts w:ascii="Aptos" w:eastAsia="Aptos" w:hAnsi="Aptos" w:cs="Aptos"/>
-        </w:rPr>
-        <w:t xml:space="preserve"> and Sell Food Only named </w:t>
-      </w:r>
-      <w:proofErr w:type="spellStart"/>
-      <w:r>
-        <w:rPr>
-          <w:rFonts w:ascii="Aptos" w:eastAsia="Aptos" w:hAnsi="Aptos" w:cs="Aptos"/>
-        </w:rPr>
-        <w:t>btnFoodOnly</w:t>
-      </w:r>
-      <w:proofErr w:type="spellEnd"/>
-      <w:r>
-        <w:rPr>
-          <w:rFonts w:ascii="Aptos" w:eastAsia="Aptos" w:hAnsi="Aptos" w:cs="Aptos"/>
-        </w:rPr>
-        <w:t xml:space="preserve">. A grid named </w:t>
-      </w:r>
-      <w:proofErr w:type="spellStart"/>
-      <w:r>
-        <w:rPr>
-          <w:rFonts w:ascii="Aptos" w:eastAsia="Aptos" w:hAnsi="Aptos" w:cs="Aptos"/>
-        </w:rPr>
-        <w:t>dgvCustomerBookings</w:t>
-      </w:r>
-      <w:proofErr w:type="spellEnd"/>
-      <w:r>
-        <w:rPr>
-          <w:rFonts w:ascii="Aptos" w:eastAsia="Aptos" w:hAnsi="Aptos" w:cs="Aptos"/>
-        </w:rPr>
-        <w:t xml:space="preserve"> shows the bookings the selected customer already has.</w:t>
+        <w:t>The interesting part of this objective, and the reason it is worth documenting separately, is what happens behind the Add button. When the user enters a name and a capacity and presses Add, the system does not just save the screen, it then automatically generates that number of seat records for it. In other words if the manager types a capacity of sixty, the system creates sixty individual seats for that screen without the manager having to type a single one of them in by hand. This was a direct response to feedback during the discussion stage, where it was pointed out that setting up every seat manually would be a nightmare, so having the system do it automatically is far more sophisticated and removes any chance of human error. If a screen is later edited and its capacity changes, the old seats are cleared out and a fresh set is generated to match, and if a screen is deleted its seats are removed first.</w:t>
       </w:r>
     </w:p>
     <w:p>
@@ -2004,7 +3710,7 @@
           <w:sz w:val="22"/>
           <w:szCs w:val="22"/>
         </w:rPr>
-        <w:t>Bookings Form (</w:t>
+        <w:t>Add Screens Form (</w:t>
       </w:r>
       <w:proofErr w:type="spellStart"/>
       <w:r>
@@ -2016,7 +3722,7 @@
           <w:sz w:val="22"/>
           <w:szCs w:val="22"/>
         </w:rPr>
-        <w:t>frmBookings</w:t>
+        <w:t>frmScreens</w:t>
       </w:r>
       <w:proofErr w:type="spellEnd"/>
       <w:r>
@@ -2039,81 +3745,49 @@
         <w:rPr>
           <w:rFonts w:ascii="Aptos" w:eastAsia="Aptos" w:hAnsi="Aptos" w:cs="Aptos"/>
         </w:rPr>
-        <w:t xml:space="preserve">The way the member of staff uses the form is that they choose a screening, choose a customer or tick the walk-in box, and the seat map then draws itself as a grid of clickable seat buttons laid out like the inside of the screen. Clicking an available seat selects it and it changes colour, and the running total updates as they go. When they are happy they press Create Booking. The inputs to the form are therefore the chosen screening, the chosen customer and the seats that are clicked. The outputs are the saved booking, a confirmation message, the refreshed seat map and the updated list of that customer's bookings. The processes behind the scenes are the insertion of a new record into the </w:t>
+        <w:t xml:space="preserve">The inputs are the screen name and the capacity. The outputs are the updated list of screens and, crucially, a full set of seat records created in the </w:t>
       </w:r>
       <w:proofErr w:type="spellStart"/>
       <w:r>
         <w:rPr>
           <w:rFonts w:ascii="Aptos" w:eastAsia="Aptos" w:hAnsi="Aptos" w:cs="Aptos"/>
         </w:rPr>
-        <w:t>tblBooking</w:t>
+        <w:t>tblSeat</w:t>
       </w:r>
       <w:proofErr w:type="spellEnd"/>
       <w:r>
         <w:rPr>
           <w:rFonts w:ascii="Aptos" w:eastAsia="Aptos" w:hAnsi="Aptos" w:cs="Aptos"/>
         </w:rPr>
-        <w:t xml:space="preserve"> table and the insertion of each chosen seat into the </w:t>
+        <w:t xml:space="preserve"> table for the new screen. The process behind the Add button is therefore two steps, first inserting the screen into the </w:t>
       </w:r>
       <w:proofErr w:type="spellStart"/>
       <w:r>
         <w:rPr>
           <w:rFonts w:ascii="Aptos" w:eastAsia="Aptos" w:hAnsi="Aptos" w:cs="Aptos"/>
         </w:rPr>
-        <w:t>tblBookingSeat</w:t>
+        <w:t>tblScreen</w:t>
       </w:r>
       <w:proofErr w:type="spellEnd"/>
       <w:r>
         <w:rPr>
           <w:rFonts w:ascii="Aptos" w:eastAsia="Aptos" w:hAnsi="Aptos" w:cs="Aptos"/>
         </w:rPr>
-        <w:t xml:space="preserve"> table.</w:t>
-      </w:r>
-    </w:p>
-    <w:p>
-      <w:pPr>
-        <w:spacing w:after="160" w:line="276" w:lineRule="auto"/>
-      </w:pPr>
-      <w:r>
-        <w:rPr>
-          <w:rFonts w:ascii="Aptos" w:eastAsia="Aptos" w:hAnsi="Aptos" w:cs="Aptos"/>
-        </w:rPr>
-        <w:t xml:space="preserve">Preventing double bookings, which is the whole point of Objective 2, is built directly into how the seat map is drawn. This is because when the map loads it asks the database which </w:t>
-      </w:r>
-      <w:r>
-        <w:rPr>
-          <w:rFonts w:ascii="Aptos" w:eastAsia="Aptos" w:hAnsi="Aptos" w:cs="Aptos"/>
-        </w:rPr>
-        <w:lastRenderedPageBreak/>
-        <w:t xml:space="preserve">seats have already been booked for that screening, by looking in the </w:t>
+        <w:t xml:space="preserve"> table and reading back the new screen's identifier, and then looping to insert one seat record per seat into the </w:t>
       </w:r>
       <w:proofErr w:type="spellStart"/>
       <w:r>
         <w:rPr>
           <w:rFonts w:ascii="Aptos" w:eastAsia="Aptos" w:hAnsi="Aptos" w:cs="Aptos"/>
         </w:rPr>
-        <w:t>tblBookingSeat</w:t>
+        <w:t>tblSeat</w:t>
       </w:r>
       <w:proofErr w:type="spellEnd"/>
       <w:r>
         <w:rPr>
           <w:rFonts w:ascii="Aptos" w:eastAsia="Aptos" w:hAnsi="Aptos" w:cs="Aptos"/>
         </w:rPr>
-        <w:t xml:space="preserve"> table joined to the </w:t>
-      </w:r>
-      <w:proofErr w:type="spellStart"/>
-      <w:r>
-        <w:rPr>
-          <w:rFonts w:ascii="Aptos" w:eastAsia="Aptos" w:hAnsi="Aptos" w:cs="Aptos"/>
-        </w:rPr>
-        <w:t>tblBooking</w:t>
-      </w:r>
-      <w:proofErr w:type="spellEnd"/>
-      <w:r>
-        <w:rPr>
-          <w:rFonts w:ascii="Aptos" w:eastAsia="Aptos" w:hAnsi="Aptos" w:cs="Aptos"/>
-        </w:rPr>
-        <w:t xml:space="preserve"> table, and any seat that comes back as already taken is coloured with the Taken colour and, more importantly, is disabled so that it physically cannot be clicked. On top of that, as a second line of defence, when Create Booking is pressed the system checks once more that none of the selected seats have been taken by someone else in the meantime before it saves anything. In this way a seat can never be sold twice, both because a taken seat cannot be selected in the first place and because it is checked again at the moment of saving. I chose a clickable graphical seat map rather than, for example, asking staff to type in seat numbers, this is because it lets them see the whole screen at a glance and makes double booking obvious and impossible in a way that a list of numbers never could.</w:t>
+        <w:t xml:space="preserve"> table so that the seats are ready for the booking form to use.</w:t>
       </w:r>
     </w:p>
     <w:p>
@@ -2128,7 +3802,7 @@
           <w:bCs/>
           <w:color w:val="000000"/>
         </w:rPr>
-        <w:t>Displaying the Graphical Seat Map (Objective 3)</w:t>
+        <w:t>Adding Customer Bookings and Preventing Double Bookings (Objectives 1 and 2)</w:t>
       </w:r>
     </w:p>
     <w:p>
@@ -2139,7 +3813,14 @@
         <w:rPr>
           <w:rFonts w:ascii="Aptos" w:eastAsia="Aptos" w:hAnsi="Aptos" w:cs="Aptos"/>
         </w:rPr>
-        <w:t xml:space="preserve">This objective is really a closer look at the seat map that has just been described on the booking form, so rather than design a separate screen for it I will refer back to the </w:t>
+        <w:t xml:space="preserve">This is the heart of the whole system and the reason the project exists in the first place, so it is the most involved form to design. The objective is to let a member of staff create a booking for a customer against a particular screening, recording who the customer is, </w:t>
+      </w:r>
+      <w:r>
+        <w:rPr>
+          <w:rFonts w:ascii="Aptos" w:eastAsia="Aptos" w:hAnsi="Aptos" w:cs="Aptos"/>
+        </w:rPr>
+        <w:lastRenderedPageBreak/>
+        <w:t xml:space="preserve">which seats they want and how many tickets that comes to, while making it impossible for a seat that has already been booked to be sold twice. Both of these objectives are handled together on the one form named </w:t>
       </w:r>
       <w:proofErr w:type="spellStart"/>
       <w:r>
@@ -2153,21 +3834,7 @@
         <w:rPr>
           <w:rFonts w:ascii="Aptos" w:eastAsia="Aptos" w:hAnsi="Aptos" w:cs="Aptos"/>
         </w:rPr>
-        <w:t xml:space="preserve"> form above. The seat map is the panel named </w:t>
-      </w:r>
-      <w:proofErr w:type="spellStart"/>
-      <w:r>
-        <w:rPr>
-          <w:rFonts w:ascii="Aptos" w:eastAsia="Aptos" w:hAnsi="Aptos" w:cs="Aptos"/>
-        </w:rPr>
-        <w:t>pnlSeatMap</w:t>
-      </w:r>
-      <w:proofErr w:type="spellEnd"/>
-      <w:r>
-        <w:rPr>
-          <w:rFonts w:ascii="Aptos" w:eastAsia="Aptos" w:hAnsi="Aptos" w:cs="Aptos"/>
-        </w:rPr>
-        <w:t>, and its job is to show, for a chosen screening, exactly which seats are free and which are already booked. It does this by drawing one button for every seat in the chosen screen, arranged in rows so that it looks like the layout of a real cinema, with a label above reading SCREEN so the user can tell which way round they are looking.</w:t>
+        <w:t>, because in practice they are the same job.</w:t>
       </w:r>
     </w:p>
     <w:p>
@@ -2178,205 +3845,147 @@
         <w:rPr>
           <w:rFonts w:ascii="Aptos" w:eastAsia="Aptos" w:hAnsi="Aptos" w:cs="Aptos"/>
         </w:rPr>
-        <w:t>Every seat button is shown in one of three colours, and this is the output the user cares about. An available seat is shown in the Available colour and can be clicked, a seat the user has just clicked is shown in the Selected colour, and a seat that has already been booked by someone else is shown in the Taken colour and cannot be clicked at all. The small legend of coloured swatches next to the map explains which colour means what. The only input to the seat map is the clicks the user makes on the available seats, and behind the scenes the colours are worked out by comparing the full list of seats for the screen against the list of seats already booked for that screening. I have kept the fine detail of the exact colours to be settled in section 5.2, but the important design decision here is the three state system of available, selected and taken, because it is what makes the availability instantly readable.</w:t>
-      </w:r>
-    </w:p>
-    <w:p>
-      <w:pPr>
-        <w:pStyle w:val="Heading3"/>
-        <w:spacing w:before="260" w:after="120"/>
-      </w:pPr>
-      <w:r>
-        <w:rPr>
-          <w:rFonts w:ascii="Aptos Display" w:eastAsia="Aptos Display" w:hAnsi="Aptos Display" w:cs="Aptos Display"/>
-          <w:b/>
-          <w:bCs/>
-          <w:color w:val="000000"/>
-        </w:rPr>
-        <w:t>Adding Food and Drink to an Order (Objective 5)</w:t>
-      </w:r>
-    </w:p>
-    <w:p>
-      <w:pPr>
-        <w:spacing w:after="160" w:line="276" w:lineRule="auto"/>
-      </w:pPr>
-      <w:r>
-        <w:rPr>
-          <w:rFonts w:ascii="Aptos" w:eastAsia="Aptos" w:hAnsi="Aptos" w:cs="Aptos"/>
-        </w:rPr>
-        <w:t xml:space="preserve">One of the main aims of </w:t>
+        <w:t xml:space="preserve">The top of the form has two combo boxes, named </w:t>
       </w:r>
       <w:proofErr w:type="spellStart"/>
       <w:r>
         <w:rPr>
           <w:rFonts w:ascii="Aptos" w:eastAsia="Aptos" w:hAnsi="Aptos" w:cs="Aptos"/>
         </w:rPr>
-        <w:t>Filmtopia</w:t>
+        <w:t>cboScreening</w:t>
       </w:r>
       <w:proofErr w:type="spellEnd"/>
       <w:r>
         <w:rPr>
           <w:rFonts w:ascii="Aptos" w:eastAsia="Aptos" w:hAnsi="Aptos" w:cs="Aptos"/>
         </w:rPr>
-        <w:t xml:space="preserve"> was that a customer should be able to add food and drink onto their ticket booking in the same visit, so that it feels like one joined-up transaction rather than two separate ones. This objective is handled by the form named </w:t>
+        <w:t xml:space="preserve"> and </w:t>
       </w:r>
       <w:proofErr w:type="spellStart"/>
       <w:r>
         <w:rPr>
           <w:rFonts w:ascii="Aptos" w:eastAsia="Aptos" w:hAnsi="Aptos" w:cs="Aptos"/>
         </w:rPr>
-        <w:t>frmFoodOrder</w:t>
+        <w:t>cboCustomer</w:t>
       </w:r>
       <w:proofErr w:type="spellEnd"/>
       <w:r>
         <w:rPr>
           <w:rFonts w:ascii="Aptos" w:eastAsia="Aptos" w:hAnsi="Aptos" w:cs="Aptos"/>
         </w:rPr>
-        <w:t xml:space="preserve">, which is opened straight from the booking form by pressing the Order Food </w:t>
-      </w:r>
-      <w:r>
-        <w:rPr>
-          <w:rFonts w:ascii="Aptos" w:eastAsia="Aptos" w:hAnsi="Aptos" w:cs="Aptos"/>
-        </w:rPr>
-        <w:lastRenderedPageBreak/>
-        <w:t>button once a booking has been made, or by pressing Sell Food Only if the customer only wants snacks and no seat. Opening it directly from the booking is a deliberate design choice, this is because it keeps the whole thing as a single flowing process for the member of staff.</w:t>
-      </w:r>
-    </w:p>
-    <w:p>
-      <w:pPr>
-        <w:spacing w:after="160" w:line="276" w:lineRule="auto"/>
-      </w:pPr>
-      <w:r>
-        <w:rPr>
-          <w:rFonts w:ascii="Aptos" w:eastAsia="Aptos" w:hAnsi="Aptos" w:cs="Aptos"/>
-        </w:rPr>
-        <w:t xml:space="preserve">At the top of the form a label named </w:t>
+        <w:t xml:space="preserve">, where the member of staff first picks which screening the booking is for and then which customer it belongs to. There is also a check box named </w:t>
       </w:r>
       <w:proofErr w:type="spellStart"/>
       <w:r>
         <w:rPr>
           <w:rFonts w:ascii="Aptos" w:eastAsia="Aptos" w:hAnsi="Aptos" w:cs="Aptos"/>
         </w:rPr>
-        <w:t>lblBookingInfo</w:t>
+        <w:t>chkWalkIn</w:t>
       </w:r>
       <w:proofErr w:type="spellEnd"/>
       <w:r>
         <w:rPr>
           <w:rFonts w:ascii="Aptos" w:eastAsia="Aptos" w:hAnsi="Aptos" w:cs="Aptos"/>
         </w:rPr>
-        <w:t xml:space="preserve"> shows which booking the food is being added to, so there is no confusion about whose order it is. Below that is a combo box named </w:t>
+        <w:t xml:space="preserve"> labelled Walk-in, which lets staff take a booking for a customer who has just walked in without recording their details. The largest part of the form is a panel named </w:t>
       </w:r>
       <w:proofErr w:type="spellStart"/>
       <w:r>
         <w:rPr>
           <w:rFonts w:ascii="Aptos" w:eastAsia="Aptos" w:hAnsi="Aptos" w:cs="Aptos"/>
         </w:rPr>
-        <w:t>cboFoodItem</w:t>
+        <w:t>pnlSeatMap</w:t>
       </w:r>
       <w:proofErr w:type="spellEnd"/>
       <w:r>
         <w:rPr>
           <w:rFonts w:ascii="Aptos" w:eastAsia="Aptos" w:hAnsi="Aptos" w:cs="Aptos"/>
         </w:rPr>
-        <w:t xml:space="preserve"> where the user picks a food or drink item from the list the cinema sells, a label named </w:t>
+        <w:t xml:space="preserve"> which draws the seat map for the chosen screening, and next to it is a small legend made up of three coloured swatches labelled Available, Selected and Taken so the user knows what the colours mean. A label named </w:t>
       </w:r>
       <w:proofErr w:type="spellStart"/>
       <w:r>
         <w:rPr>
           <w:rFonts w:ascii="Aptos" w:eastAsia="Aptos" w:hAnsi="Aptos" w:cs="Aptos"/>
         </w:rPr>
-        <w:t>lblPrice</w:t>
+        <w:t>lblTotal</w:t>
       </w:r>
       <w:proofErr w:type="spellEnd"/>
       <w:r>
         <w:rPr>
           <w:rFonts w:ascii="Aptos" w:eastAsia="Aptos" w:hAnsi="Aptos" w:cs="Aptos"/>
         </w:rPr>
-        <w:t xml:space="preserve"> which shows the price of the chosen item, and a text box named </w:t>
+        <w:t xml:space="preserve"> keeps a running count of how many seats have been selected, and along the bottom are the action buttons, Create Booking named </w:t>
       </w:r>
       <w:proofErr w:type="spellStart"/>
       <w:r>
         <w:rPr>
           <w:rFonts w:ascii="Aptos" w:eastAsia="Aptos" w:hAnsi="Aptos" w:cs="Aptos"/>
         </w:rPr>
-        <w:t>txtQuantity</w:t>
+        <w:t>btnCreateBooking</w:t>
       </w:r>
       <w:proofErr w:type="spellEnd"/>
       <w:r>
         <w:rPr>
           <w:rFonts w:ascii="Aptos" w:eastAsia="Aptos" w:hAnsi="Aptos" w:cs="Aptos"/>
         </w:rPr>
-        <w:t xml:space="preserve"> for how many they want, which sensibly defaults to one. A grid named </w:t>
+        <w:t xml:space="preserve">, Clear Selection named </w:t>
       </w:r>
       <w:proofErr w:type="spellStart"/>
       <w:r>
         <w:rPr>
           <w:rFonts w:ascii="Aptos" w:eastAsia="Aptos" w:hAnsi="Aptos" w:cs="Aptos"/>
         </w:rPr>
-        <w:t>dgvOrderItems</w:t>
+        <w:t>btnClear</w:t>
       </w:r>
       <w:proofErr w:type="spellEnd"/>
       <w:r>
         <w:rPr>
           <w:rFonts w:ascii="Aptos" w:eastAsia="Aptos" w:hAnsi="Aptos" w:cs="Aptos"/>
         </w:rPr>
-        <w:t xml:space="preserve"> builds up the list of items that have been added to the order, and a label named </w:t>
+        <w:t xml:space="preserve">, Order Food named </w:t>
       </w:r>
       <w:proofErr w:type="spellStart"/>
       <w:r>
         <w:rPr>
           <w:rFonts w:ascii="Aptos" w:eastAsia="Aptos" w:hAnsi="Aptos" w:cs="Aptos"/>
         </w:rPr>
-        <w:t>lblTotal</w:t>
+        <w:t>btnOrderFood</w:t>
       </w:r>
       <w:proofErr w:type="spellEnd"/>
       <w:r>
         <w:rPr>
           <w:rFonts w:ascii="Aptos" w:eastAsia="Aptos" w:hAnsi="Aptos" w:cs="Aptos"/>
         </w:rPr>
-        <w:t xml:space="preserve"> keeps a running total of the cost. The buttons are Add To Order named </w:t>
+        <w:t xml:space="preserve"> and Sell Food Only named </w:t>
       </w:r>
       <w:proofErr w:type="spellStart"/>
       <w:r>
         <w:rPr>
           <w:rFonts w:ascii="Aptos" w:eastAsia="Aptos" w:hAnsi="Aptos" w:cs="Aptos"/>
         </w:rPr>
-        <w:t>btnAddItem</w:t>
+        <w:t>btnFoodOnly</w:t>
       </w:r>
       <w:proofErr w:type="spellEnd"/>
       <w:r>
         <w:rPr>
           <w:rFonts w:ascii="Aptos" w:eastAsia="Aptos" w:hAnsi="Aptos" w:cs="Aptos"/>
         </w:rPr>
-        <w:t xml:space="preserve">, Remove Selected named </w:t>
+        <w:t xml:space="preserve">. A grid named </w:t>
       </w:r>
       <w:proofErr w:type="spellStart"/>
       <w:r>
         <w:rPr>
           <w:rFonts w:ascii="Aptos" w:eastAsia="Aptos" w:hAnsi="Aptos" w:cs="Aptos"/>
         </w:rPr>
-        <w:t>btnRemoveItem</w:t>
+        <w:t>dgvCustomerBookings</w:t>
       </w:r>
       <w:proofErr w:type="spellEnd"/>
       <w:r>
         <w:rPr>
           <w:rFonts w:ascii="Aptos" w:eastAsia="Aptos" w:hAnsi="Aptos" w:cs="Aptos"/>
         </w:rPr>
-        <w:t xml:space="preserve">, and Close named </w:t>
-      </w:r>
-      <w:proofErr w:type="spellStart"/>
-      <w:r>
-        <w:rPr>
-          <w:rFonts w:ascii="Aptos" w:eastAsia="Aptos" w:hAnsi="Aptos" w:cs="Aptos"/>
-        </w:rPr>
-        <w:t>btnClose</w:t>
-      </w:r>
-      <w:proofErr w:type="spellEnd"/>
-      <w:r>
-        <w:rPr>
-          <w:rFonts w:ascii="Aptos" w:eastAsia="Aptos" w:hAnsi="Aptos" w:cs="Aptos"/>
-        </w:rPr>
-        <w:t>.</w:t>
+        <w:t xml:space="preserve"> shows the bookings the selected customer already has.</w:t>
       </w:r>
     </w:p>
     <w:p>
@@ -2399,7 +4008,7 @@
           <w:sz w:val="22"/>
           <w:szCs w:val="22"/>
         </w:rPr>
-        <w:t>Food Order Form (</w:t>
+        <w:t>Bookings Form (</w:t>
       </w:r>
       <w:proofErr w:type="spellStart"/>
       <w:r>
@@ -2411,7 +4020,7 @@
           <w:sz w:val="22"/>
           <w:szCs w:val="22"/>
         </w:rPr>
-        <w:t>frmFoodOrder</w:t>
+        <w:t>frmBookings</w:t>
       </w:r>
       <w:proofErr w:type="spellEnd"/>
       <w:r>
@@ -2434,21 +4043,81 @@
         <w:rPr>
           <w:rFonts w:ascii="Aptos" w:eastAsia="Aptos" w:hAnsi="Aptos" w:cs="Aptos"/>
         </w:rPr>
-        <w:t xml:space="preserve">The inputs to this form are the food item chosen and the quantity. The outputs are the growing list of items in the grid, the updated running total, and the items being saved against the booking. The process behind the Add To Order button is to insert the chosen item and quantity into the </w:t>
+        <w:t xml:space="preserve">The way the member of staff uses the form is that they choose a screening, choose a customer or tick the walk-in box, and the seat map then draws itself as a grid of clickable seat buttons laid out like the inside of the screen. Clicking an available seat selects it and it changes colour, and the running total updates as they go. When they are happy they press Create Booking. The inputs to the form are therefore the chosen screening, the chosen customer and the seats that are clicked. The outputs are the saved booking, a confirmation message, the refreshed seat map and the updated list of that customer's bookings. The processes behind the scenes are the insertion of a new record into the </w:t>
       </w:r>
       <w:proofErr w:type="spellStart"/>
       <w:r>
         <w:rPr>
           <w:rFonts w:ascii="Aptos" w:eastAsia="Aptos" w:hAnsi="Aptos" w:cs="Aptos"/>
         </w:rPr>
-        <w:t>tblOrderItem</w:t>
+        <w:t>tblBooking</w:t>
       </w:r>
       <w:proofErr w:type="spellEnd"/>
       <w:r>
         <w:rPr>
           <w:rFonts w:ascii="Aptos" w:eastAsia="Aptos" w:hAnsi="Aptos" w:cs="Aptos"/>
         </w:rPr>
-        <w:t xml:space="preserve"> table linked to the booking, and then to recalculate and display the new total. I chose a combo box for the items rather than a text box because the food menu is a fixed list, so picking from it is both faster and stops the user entering something the cinema does not sell, and defaulting the quantity to one saves the most common case of a single item being typed every time.</w:t>
+        <w:t xml:space="preserve"> table and the insertion of each chosen seat into the </w:t>
+      </w:r>
+      <w:proofErr w:type="spellStart"/>
+      <w:r>
+        <w:rPr>
+          <w:rFonts w:ascii="Aptos" w:eastAsia="Aptos" w:hAnsi="Aptos" w:cs="Aptos"/>
+        </w:rPr>
+        <w:t>tblBookingSeat</w:t>
+      </w:r>
+      <w:proofErr w:type="spellEnd"/>
+      <w:r>
+        <w:rPr>
+          <w:rFonts w:ascii="Aptos" w:eastAsia="Aptos" w:hAnsi="Aptos" w:cs="Aptos"/>
+        </w:rPr>
+        <w:t xml:space="preserve"> table.</w:t>
+      </w:r>
+    </w:p>
+    <w:p>
+      <w:pPr>
+        <w:spacing w:after="160" w:line="276" w:lineRule="auto"/>
+      </w:pPr>
+      <w:r>
+        <w:rPr>
+          <w:rFonts w:ascii="Aptos" w:eastAsia="Aptos" w:hAnsi="Aptos" w:cs="Aptos"/>
+        </w:rPr>
+        <w:t xml:space="preserve">Preventing double bookings, which is the whole point of Objective 2, is built directly into how the seat map is drawn. This is because when the map loads it asks the database which seats have already been booked for that screening, by looking in the </w:t>
+      </w:r>
+      <w:proofErr w:type="spellStart"/>
+      <w:r>
+        <w:rPr>
+          <w:rFonts w:ascii="Aptos" w:eastAsia="Aptos" w:hAnsi="Aptos" w:cs="Aptos"/>
+        </w:rPr>
+        <w:t>tblBookingSeat</w:t>
+      </w:r>
+      <w:proofErr w:type="spellEnd"/>
+      <w:r>
+        <w:rPr>
+          <w:rFonts w:ascii="Aptos" w:eastAsia="Aptos" w:hAnsi="Aptos" w:cs="Aptos"/>
+        </w:rPr>
+        <w:t xml:space="preserve"> table joined to the </w:t>
+      </w:r>
+      <w:proofErr w:type="spellStart"/>
+      <w:r>
+        <w:rPr>
+          <w:rFonts w:ascii="Aptos" w:eastAsia="Aptos" w:hAnsi="Aptos" w:cs="Aptos"/>
+        </w:rPr>
+        <w:t>tblBooking</w:t>
+      </w:r>
+      <w:proofErr w:type="spellEnd"/>
+      <w:r>
+        <w:rPr>
+          <w:rFonts w:ascii="Aptos" w:eastAsia="Aptos" w:hAnsi="Aptos" w:cs="Aptos"/>
+        </w:rPr>
+        <w:t xml:space="preserve"> table, and any seat that comes back as already taken is coloured with the Taken colour and, more importantly, is disabled so that it physically cannot be clicked. On top of that, as a second line of defence, when Create Booking is pressed the system checks once more that none of the selected seats have been taken by someone else in the meantime before it saves anything. In this way a seat can never be sold twice, both because a taken seat cannot be selected in the first place and because it is checked again at the moment of saving. I chose a clickable graphical seat map rather than, for </w:t>
+      </w:r>
+      <w:r>
+        <w:rPr>
+          <w:rFonts w:ascii="Aptos" w:eastAsia="Aptos" w:hAnsi="Aptos" w:cs="Aptos"/>
+        </w:rPr>
+        <w:lastRenderedPageBreak/>
+        <w:t>example, asking staff to type in seat numbers, this is because it lets them see the whole screen at a glance and makes double booking obvious and impossible in a way that a list of numbers never could.</w:t>
       </w:r>
     </w:p>
     <w:p>
@@ -2463,7 +4132,7 @@
           <w:bCs/>
           <w:color w:val="000000"/>
         </w:rPr>
-        <w:t>Searching for a Booking (Objective 11)</w:t>
+        <w:t>Displaying the Graphical Seat Map (Objective 3)</w:t>
       </w:r>
     </w:p>
     <w:p>
@@ -2474,77 +4143,244 @@
         <w:rPr>
           <w:rFonts w:ascii="Aptos" w:eastAsia="Aptos" w:hAnsi="Aptos" w:cs="Aptos"/>
         </w:rPr>
-        <w:t xml:space="preserve">Staff often need to find a booking again after it has been made, for example if a customer rings up about it, so this objective provides a way to search for one. It is handled by the form named </w:t>
+        <w:t xml:space="preserve">This objective is really a closer look at the seat map that has just been described on the booking form, so rather than design a separate screen for it I will refer back to the </w:t>
       </w:r>
       <w:proofErr w:type="spellStart"/>
       <w:r>
         <w:rPr>
           <w:rFonts w:ascii="Aptos" w:eastAsia="Aptos" w:hAnsi="Aptos" w:cs="Aptos"/>
         </w:rPr>
-        <w:t>frmBookingSearch</w:t>
+        <w:t>frmBookings</w:t>
       </w:r>
       <w:proofErr w:type="spellEnd"/>
       <w:r>
         <w:rPr>
           <w:rFonts w:ascii="Aptos" w:eastAsia="Aptos" w:hAnsi="Aptos" w:cs="Aptos"/>
         </w:rPr>
-        <w:t xml:space="preserve">, which is reached from the Find Booking button on the main menu. This same form also handles cancelling a booking and viewing the screening register, which are the next two objectives, because they all naturally belong together in one place. For the search itself the form has a text box named </w:t>
+        <w:t xml:space="preserve"> form above. The seat map is the panel named </w:t>
       </w:r>
       <w:proofErr w:type="spellStart"/>
       <w:r>
         <w:rPr>
           <w:rFonts w:ascii="Aptos" w:eastAsia="Aptos" w:hAnsi="Aptos" w:cs="Aptos"/>
         </w:rPr>
-        <w:t>txtSearch</w:t>
+        <w:t>pnlSeatMap</w:t>
       </w:r>
       <w:proofErr w:type="spellEnd"/>
       <w:r>
         <w:rPr>
           <w:rFonts w:ascii="Aptos" w:eastAsia="Aptos" w:hAnsi="Aptos" w:cs="Aptos"/>
         </w:rPr>
-        <w:t xml:space="preserve">, labelled Booking ID or Customer Name, a Search button named </w:t>
+        <w:t>, and its job is to show, for a chosen screening, exactly which seats are free and which are already booked. It does this by drawing one button for every seat in the chosen screen, arranged in rows so that it looks like the layout of a real cinema, with a label above reading SCREEN so the user can tell which way round they are looking.</w:t>
+      </w:r>
+    </w:p>
+    <w:p>
+      <w:pPr>
+        <w:spacing w:after="160" w:line="276" w:lineRule="auto"/>
+      </w:pPr>
+      <w:r>
+        <w:rPr>
+          <w:rFonts w:ascii="Aptos" w:eastAsia="Aptos" w:hAnsi="Aptos" w:cs="Aptos"/>
+        </w:rPr>
+        <w:t>Every seat button is shown in one of three colours, and this is the output the user cares about. An available seat is shown in the Available colour and can be clicked, a seat the user has just clicked is shown in the Selected colour, and a seat that has already been booked by someone else is shown in the Taken colour and cannot be clicked at all. The small legend of coloured swatches next to the map explains which colour means what. The only input to the seat map is the clicks the user makes on the available seats, and behind the scenes the colours are worked out by comparing the full list of seats for the screen against the list of seats already booked for that screening. I have kept the fine detail of the exact colours to be settled in section 5.2, but the important design decision here is the three state system of available, selected and taken, because it is what makes the availability instantly readable.</w:t>
+      </w:r>
+    </w:p>
+    <w:p>
+      <w:pPr>
+        <w:pStyle w:val="Heading3"/>
+        <w:spacing w:before="260" w:after="120"/>
+      </w:pPr>
+      <w:r>
+        <w:rPr>
+          <w:rFonts w:ascii="Aptos Display" w:eastAsia="Aptos Display" w:hAnsi="Aptos Display" w:cs="Aptos Display"/>
+          <w:b/>
+          <w:bCs/>
+          <w:color w:val="000000"/>
+        </w:rPr>
+        <w:t>Adding Food and Drink to an Order (Objective 5)</w:t>
+      </w:r>
+    </w:p>
+    <w:p>
+      <w:pPr>
+        <w:spacing w:after="160" w:line="276" w:lineRule="auto"/>
+      </w:pPr>
+      <w:r>
+        <w:rPr>
+          <w:rFonts w:ascii="Aptos" w:eastAsia="Aptos" w:hAnsi="Aptos" w:cs="Aptos"/>
+        </w:rPr>
+        <w:t xml:space="preserve">One of the main aims of </w:t>
       </w:r>
       <w:proofErr w:type="spellStart"/>
       <w:r>
         <w:rPr>
           <w:rFonts w:ascii="Aptos" w:eastAsia="Aptos" w:hAnsi="Aptos" w:cs="Aptos"/>
         </w:rPr>
-        <w:t>btnSearch</w:t>
+        <w:t>Filmtopia</w:t>
       </w:r>
       <w:proofErr w:type="spellEnd"/>
       <w:r>
         <w:rPr>
           <w:rFonts w:ascii="Aptos" w:eastAsia="Aptos" w:hAnsi="Aptos" w:cs="Aptos"/>
         </w:rPr>
-        <w:t xml:space="preserve">, a Show All button named </w:t>
+        <w:t xml:space="preserve"> was that a customer should be able to add food and drink onto their ticket booking in the same visit, so that it feels like one joined-up transaction rather than two separate ones. This objective is handled by the form named </w:t>
       </w:r>
       <w:proofErr w:type="spellStart"/>
       <w:r>
         <w:rPr>
           <w:rFonts w:ascii="Aptos" w:eastAsia="Aptos" w:hAnsi="Aptos" w:cs="Aptos"/>
         </w:rPr>
-        <w:t>btnShowAll</w:t>
+        <w:t>frmFoodOrder</w:t>
       </w:r>
       <w:proofErr w:type="spellEnd"/>
       <w:r>
         <w:rPr>
           <w:rFonts w:ascii="Aptos" w:eastAsia="Aptos" w:hAnsi="Aptos" w:cs="Aptos"/>
         </w:rPr>
-        <w:t xml:space="preserve">, and a grid named </w:t>
+        <w:t>, which is opened straight from the booking form by pressing the Order Food button once a booking has been made, or by pressing Sell Food Only if the customer only wants snacks and no seat. Opening it directly from the booking is a deliberate design choice, this is because it keeps the whole thing as a single flowing process for the member of staff.</w:t>
+      </w:r>
+    </w:p>
+    <w:p>
+      <w:pPr>
+        <w:spacing w:after="160" w:line="276" w:lineRule="auto"/>
+      </w:pPr>
+      <w:r>
+        <w:rPr>
+          <w:rFonts w:ascii="Aptos" w:eastAsia="Aptos" w:hAnsi="Aptos" w:cs="Aptos"/>
+        </w:rPr>
+        <w:t xml:space="preserve">At the top of the form a label named </w:t>
       </w:r>
       <w:proofErr w:type="spellStart"/>
       <w:r>
         <w:rPr>
           <w:rFonts w:ascii="Aptos" w:eastAsia="Aptos" w:hAnsi="Aptos" w:cs="Aptos"/>
         </w:rPr>
-        <w:t>dgvBookings</w:t>
+        <w:t>lblBookingInfo</w:t>
       </w:r>
       <w:proofErr w:type="spellEnd"/>
       <w:r>
         <w:rPr>
           <w:rFonts w:ascii="Aptos" w:eastAsia="Aptos" w:hAnsi="Aptos" w:cs="Aptos"/>
         </w:rPr>
-        <w:t xml:space="preserve"> where the results appear.</w:t>
+        <w:t xml:space="preserve"> shows which booking the food is being added to, so there is no confusion about whose order it is. Below that is a combo box named </w:t>
+      </w:r>
+      <w:proofErr w:type="spellStart"/>
+      <w:r>
+        <w:rPr>
+          <w:rFonts w:ascii="Aptos" w:eastAsia="Aptos" w:hAnsi="Aptos" w:cs="Aptos"/>
+        </w:rPr>
+        <w:t>cboFoodItem</w:t>
+      </w:r>
+      <w:proofErr w:type="spellEnd"/>
+      <w:r>
+        <w:rPr>
+          <w:rFonts w:ascii="Aptos" w:eastAsia="Aptos" w:hAnsi="Aptos" w:cs="Aptos"/>
+        </w:rPr>
+        <w:t xml:space="preserve"> where the user picks a food or drink item from the list the cinema sells, a label named </w:t>
+      </w:r>
+      <w:proofErr w:type="spellStart"/>
+      <w:r>
+        <w:rPr>
+          <w:rFonts w:ascii="Aptos" w:eastAsia="Aptos" w:hAnsi="Aptos" w:cs="Aptos"/>
+        </w:rPr>
+        <w:t>lblPrice</w:t>
+      </w:r>
+      <w:proofErr w:type="spellEnd"/>
+      <w:r>
+        <w:rPr>
+          <w:rFonts w:ascii="Aptos" w:eastAsia="Aptos" w:hAnsi="Aptos" w:cs="Aptos"/>
+        </w:rPr>
+        <w:t xml:space="preserve"> which shows the price of the chosen item, and a text box </w:t>
+      </w:r>
+      <w:r>
+        <w:rPr>
+          <w:rFonts w:ascii="Aptos" w:eastAsia="Aptos" w:hAnsi="Aptos" w:cs="Aptos"/>
+        </w:rPr>
+        <w:lastRenderedPageBreak/>
+        <w:t xml:space="preserve">named </w:t>
+      </w:r>
+      <w:proofErr w:type="spellStart"/>
+      <w:r>
+        <w:rPr>
+          <w:rFonts w:ascii="Aptos" w:eastAsia="Aptos" w:hAnsi="Aptos" w:cs="Aptos"/>
+        </w:rPr>
+        <w:t>txtQuantity</w:t>
+      </w:r>
+      <w:proofErr w:type="spellEnd"/>
+      <w:r>
+        <w:rPr>
+          <w:rFonts w:ascii="Aptos" w:eastAsia="Aptos" w:hAnsi="Aptos" w:cs="Aptos"/>
+        </w:rPr>
+        <w:t xml:space="preserve"> for how many they want, which sensibly defaults to one. A grid named </w:t>
+      </w:r>
+      <w:proofErr w:type="spellStart"/>
+      <w:r>
+        <w:rPr>
+          <w:rFonts w:ascii="Aptos" w:eastAsia="Aptos" w:hAnsi="Aptos" w:cs="Aptos"/>
+        </w:rPr>
+        <w:t>dgvOrderItems</w:t>
+      </w:r>
+      <w:proofErr w:type="spellEnd"/>
+      <w:r>
+        <w:rPr>
+          <w:rFonts w:ascii="Aptos" w:eastAsia="Aptos" w:hAnsi="Aptos" w:cs="Aptos"/>
+        </w:rPr>
+        <w:t xml:space="preserve"> builds up the list of items that have been added to the order, and a label named </w:t>
+      </w:r>
+      <w:proofErr w:type="spellStart"/>
+      <w:r>
+        <w:rPr>
+          <w:rFonts w:ascii="Aptos" w:eastAsia="Aptos" w:hAnsi="Aptos" w:cs="Aptos"/>
+        </w:rPr>
+        <w:t>lblTotal</w:t>
+      </w:r>
+      <w:proofErr w:type="spellEnd"/>
+      <w:r>
+        <w:rPr>
+          <w:rFonts w:ascii="Aptos" w:eastAsia="Aptos" w:hAnsi="Aptos" w:cs="Aptos"/>
+        </w:rPr>
+        <w:t xml:space="preserve"> keeps a running total of the cost. The buttons are Add To Order named </w:t>
+      </w:r>
+      <w:proofErr w:type="spellStart"/>
+      <w:r>
+        <w:rPr>
+          <w:rFonts w:ascii="Aptos" w:eastAsia="Aptos" w:hAnsi="Aptos" w:cs="Aptos"/>
+        </w:rPr>
+        <w:t>btnAddItem</w:t>
+      </w:r>
+      <w:proofErr w:type="spellEnd"/>
+      <w:r>
+        <w:rPr>
+          <w:rFonts w:ascii="Aptos" w:eastAsia="Aptos" w:hAnsi="Aptos" w:cs="Aptos"/>
+        </w:rPr>
+        <w:t xml:space="preserve">, Remove Selected named </w:t>
+      </w:r>
+      <w:proofErr w:type="spellStart"/>
+      <w:r>
+        <w:rPr>
+          <w:rFonts w:ascii="Aptos" w:eastAsia="Aptos" w:hAnsi="Aptos" w:cs="Aptos"/>
+        </w:rPr>
+        <w:t>btnRemoveItem</w:t>
+      </w:r>
+      <w:proofErr w:type="spellEnd"/>
+      <w:r>
+        <w:rPr>
+          <w:rFonts w:ascii="Aptos" w:eastAsia="Aptos" w:hAnsi="Aptos" w:cs="Aptos"/>
+        </w:rPr>
+        <w:t xml:space="preserve">, and Close named </w:t>
+      </w:r>
+      <w:proofErr w:type="spellStart"/>
+      <w:r>
+        <w:rPr>
+          <w:rFonts w:ascii="Aptos" w:eastAsia="Aptos" w:hAnsi="Aptos" w:cs="Aptos"/>
+        </w:rPr>
+        <w:t>btnClose</w:t>
+      </w:r>
+      <w:proofErr w:type="spellEnd"/>
+      <w:r>
+        <w:rPr>
+          <w:rFonts w:ascii="Aptos" w:eastAsia="Aptos" w:hAnsi="Aptos" w:cs="Aptos"/>
+        </w:rPr>
+        <w:t>.</w:t>
       </w:r>
     </w:p>
     <w:p>
@@ -2567,7 +4403,7 @@
           <w:sz w:val="22"/>
           <w:szCs w:val="22"/>
         </w:rPr>
-        <w:t>Booking Search Form (</w:t>
+        <w:t>Food Order Form (</w:t>
       </w:r>
       <w:proofErr w:type="spellStart"/>
       <w:r>
@@ -2579,7 +4415,7 @@
           <w:sz w:val="22"/>
           <w:szCs w:val="22"/>
         </w:rPr>
-        <w:t>frmBookingSearch</w:t>
+        <w:t>frmFoodOrder</w:t>
       </w:r>
       <w:proofErr w:type="spellEnd"/>
       <w:r>
@@ -2593,17 +4429,6 @@
         </w:rPr>
         <w:t>)</w:t>
       </w:r>
-      <w:r>
-        <w:rPr>
-          <w:rFonts w:ascii="Aptos" w:eastAsia="Aptos" w:hAnsi="Aptos" w:cs="Aptos"/>
-          <w:i/>
-          <w:iCs/>
-          <w:color w:val="555555"/>
-          <w:sz w:val="20"/>
-          <w:szCs w:val="20"/>
-        </w:rPr>
-        <w:t>.</w:t>
-      </w:r>
     </w:p>
     <w:p>
       <w:pPr>
@@ -2613,28 +4438,21 @@
         <w:rPr>
           <w:rFonts w:ascii="Aptos" w:eastAsia="Aptos" w:hAnsi="Aptos" w:cs="Aptos"/>
         </w:rPr>
-        <w:t xml:space="preserve">The way it works is that the member of staff types either a booking reference or the customer's name into the search box and presses Search, and any matching bookings </w:t>
-      </w:r>
-      <w:r>
-        <w:rPr>
-          <w:rFonts w:ascii="Aptos" w:eastAsia="Aptos" w:hAnsi="Aptos" w:cs="Aptos"/>
-        </w:rPr>
-        <w:lastRenderedPageBreak/>
-        <w:t xml:space="preserve">appear in the grid. If they would rather just see everything, the Show All button lists every booking in the system. The input is therefore the text typed into the search box, the output is the list of matching bookings, and the process behind it is a query against the </w:t>
+        <w:t xml:space="preserve">The inputs to this form are the food item chosen and the quantity. The outputs are the growing list of items in the grid, the updated running total, and the items being saved against the booking. The process behind the Add To Order button is to insert the chosen item and quantity into the </w:t>
       </w:r>
       <w:proofErr w:type="spellStart"/>
       <w:r>
         <w:rPr>
           <w:rFonts w:ascii="Aptos" w:eastAsia="Aptos" w:hAnsi="Aptos" w:cs="Aptos"/>
         </w:rPr>
-        <w:t>tblBooking</w:t>
+        <w:t>tblOrderItem</w:t>
       </w:r>
       <w:proofErr w:type="spellEnd"/>
       <w:r>
         <w:rPr>
           <w:rFonts w:ascii="Aptos" w:eastAsia="Aptos" w:hAnsi="Aptos" w:cs="Aptos"/>
         </w:rPr>
-        <w:t xml:space="preserve"> table, joined to the customer details, that looks for a booking whose identifier matches the number typed or whose customer name contains the text typed. I chose to have a single search box that accepts either a booking reference or a name, this is because staff will sometimes have the reference to hand and sometimes only the customer's name, so accepting both keeps it flexible, and the Show All button gives them a simple fallback when they are not sure what to search for.</w:t>
+        <w:t xml:space="preserve"> table linked to the booking, and then to recalculate and display the new total. I chose a combo box for the items rather than a text box because the food menu is a fixed list, so picking from it is both faster and stops the user entering something the cinema does not sell, and defaulting the quantity to one saves the most common case of a single item being typed every time.</w:t>
       </w:r>
     </w:p>
     <w:p>
@@ -2649,7 +4467,7 @@
           <w:bCs/>
           <w:color w:val="000000"/>
         </w:rPr>
-        <w:t>Cancelling a Booking (Objective 12)</w:t>
+        <w:t>Searching for a Booking (Objective 11)</w:t>
       </w:r>
     </w:p>
     <w:p>
@@ -2660,7 +4478,7 @@
         <w:rPr>
           <w:rFonts w:ascii="Aptos" w:eastAsia="Aptos" w:hAnsi="Aptos" w:cs="Aptos"/>
         </w:rPr>
-        <w:t xml:space="preserve">Cancelling a booking is done on the same </w:t>
+        <w:t xml:space="preserve">Staff often need to find a booking again after it has been made, for example if a customer rings up about it, so this objective provides a way to search for one. It is handled by the form named </w:t>
       </w:r>
       <w:proofErr w:type="spellStart"/>
       <w:r>
@@ -2674,312 +4492,63 @@
         <w:rPr>
           <w:rFonts w:ascii="Aptos" w:eastAsia="Aptos" w:hAnsi="Aptos" w:cs="Aptos"/>
         </w:rPr>
-        <w:t xml:space="preserve"> form that was just described, so I will refer back to it rather than design a new screen. Once a member of staff has found the booking they want using the search, they select it in the results grid and press the Cancel Booking button named </w:t>
+        <w:t xml:space="preserve">, which is reached from the Find Booking button on the main menu. This same form also handles cancelling a booking and viewing the screening register, which are the next two objectives, because they all naturally belong together in one place. For the search itself the form has a text box named </w:t>
       </w:r>
       <w:proofErr w:type="spellStart"/>
       <w:r>
         <w:rPr>
           <w:rFonts w:ascii="Aptos" w:eastAsia="Aptos" w:hAnsi="Aptos" w:cs="Aptos"/>
         </w:rPr>
-        <w:t>btnCancelBooking</w:t>
+        <w:t>txtSearch</w:t>
       </w:r>
       <w:proofErr w:type="spellEnd"/>
       <w:r>
         <w:rPr>
           <w:rFonts w:ascii="Aptos" w:eastAsia="Aptos" w:hAnsi="Aptos" w:cs="Aptos"/>
         </w:rPr>
-        <w:t>. The input is simply the booking that is selected, and there is no new information to type in. The output is the booking being removed and a confirmation that it has been cancelled.</w:t>
-      </w:r>
-    </w:p>
-    <w:p>
-      <w:pPr>
-        <w:spacing w:after="160" w:line="276" w:lineRule="auto"/>
-      </w:pPr>
-      <w:r>
-        <w:rPr>
-          <w:rFonts w:ascii="Aptos" w:eastAsia="Aptos" w:hAnsi="Aptos" w:cs="Aptos"/>
-        </w:rPr>
-        <w:t xml:space="preserve">The important part of this objective is what the process does behind the scenes, because cancelling a booking is not just about deleting it, it also has to free up the seats it was using. This is because if the seats were not released then those seats would stay marked as taken forever and could never be sold again, which would be detrimental to the cinema. So when a booking is cancelled the system first removes that booking's seats from the </w:t>
+        <w:t xml:space="preserve">, labelled Booking ID or Customer Name, a Search button named </w:t>
       </w:r>
       <w:proofErr w:type="spellStart"/>
       <w:r>
         <w:rPr>
           <w:rFonts w:ascii="Aptos" w:eastAsia="Aptos" w:hAnsi="Aptos" w:cs="Aptos"/>
         </w:rPr>
-        <w:t>tblBookingSeat</w:t>
+        <w:t>btnSearch</w:t>
       </w:r>
       <w:proofErr w:type="spellEnd"/>
       <w:r>
         <w:rPr>
           <w:rFonts w:ascii="Aptos" w:eastAsia="Aptos" w:hAnsi="Aptos" w:cs="Aptos"/>
         </w:rPr>
-        <w:t xml:space="preserve"> table, which immediately makes them available again on the seat map, and then removes the booking itself from the </w:t>
+        <w:t xml:space="preserve">, a Show All button named </w:t>
       </w:r>
       <w:proofErr w:type="spellStart"/>
       <w:r>
         <w:rPr>
           <w:rFonts w:ascii="Aptos" w:eastAsia="Aptos" w:hAnsi="Aptos" w:cs="Aptos"/>
         </w:rPr>
-        <w:t>tblBooking</w:t>
+        <w:t>btnShowAll</w:t>
       </w:r>
       <w:proofErr w:type="spellEnd"/>
       <w:r>
         <w:rPr>
           <w:rFonts w:ascii="Aptos" w:eastAsia="Aptos" w:hAnsi="Aptos" w:cs="Aptos"/>
         </w:rPr>
-        <w:t xml:space="preserve"> table. In this way the cancelled seats go straight back to showing as available the next time that screening's seat map is opened.</w:t>
-      </w:r>
-    </w:p>
-    <w:p>
-      <w:pPr>
-        <w:pStyle w:val="Heading3"/>
-        <w:spacing w:before="260" w:after="120"/>
-      </w:pPr>
-      <w:r>
-        <w:rPr>
-          <w:rFonts w:ascii="Aptos Display" w:eastAsia="Aptos Display" w:hAnsi="Aptos Display" w:cs="Aptos Display"/>
-          <w:b/>
-          <w:bCs/>
-          <w:color w:val="000000"/>
-        </w:rPr>
-        <w:t>Viewing the Booking Register (Objective 9)</w:t>
-      </w:r>
-    </w:p>
-    <w:p>
-      <w:pPr>
-        <w:spacing w:after="160" w:line="276" w:lineRule="auto"/>
-      </w:pPr>
-      <w:r>
-        <w:rPr>
-          <w:rFonts w:ascii="Aptos" w:eastAsia="Aptos" w:hAnsi="Aptos" w:cs="Aptos"/>
-        </w:rPr>
-        <w:t xml:space="preserve">The last job handled by the </w:t>
+        <w:t xml:space="preserve">, and a grid named </w:t>
       </w:r>
       <w:proofErr w:type="spellStart"/>
       <w:r>
         <w:rPr>
           <w:rFonts w:ascii="Aptos" w:eastAsia="Aptos" w:hAnsi="Aptos" w:cs="Aptos"/>
         </w:rPr>
-        <w:t>frmBookingSearch</w:t>
+        <w:t>dgvBookings</w:t>
       </w:r>
       <w:proofErr w:type="spellEnd"/>
       <w:r>
         <w:rPr>
           <w:rFonts w:ascii="Aptos" w:eastAsia="Aptos" w:hAnsi="Aptos" w:cs="Aptos"/>
         </w:rPr>
-        <w:t xml:space="preserve"> form is letting the manager or staff see a register of every booking for a particular screening, so that they can see who is coming and how full the screening is. I will refer back to that form for the overall layout and just describe the register part here. This part of the form has a combo box named </w:t>
-      </w:r>
-      <w:proofErr w:type="spellStart"/>
-      <w:r>
-        <w:rPr>
-          <w:rFonts w:ascii="Aptos" w:eastAsia="Aptos" w:hAnsi="Aptos" w:cs="Aptos"/>
-        </w:rPr>
-        <w:t>cboRegisterScreening</w:t>
-      </w:r>
-      <w:proofErr w:type="spellEnd"/>
-      <w:r>
-        <w:rPr>
-          <w:rFonts w:ascii="Aptos" w:eastAsia="Aptos" w:hAnsi="Aptos" w:cs="Aptos"/>
-        </w:rPr>
-        <w:t xml:space="preserve"> where the user picks the screening they are interested in, a Load Register button named </w:t>
-      </w:r>
-      <w:proofErr w:type="spellStart"/>
-      <w:r>
-        <w:rPr>
-          <w:rFonts w:ascii="Aptos" w:eastAsia="Aptos" w:hAnsi="Aptos" w:cs="Aptos"/>
-        </w:rPr>
-        <w:t>btnLoadRegister</w:t>
-      </w:r>
-      <w:proofErr w:type="spellEnd"/>
-      <w:r>
-        <w:rPr>
-          <w:rFonts w:ascii="Aptos" w:eastAsia="Aptos" w:hAnsi="Aptos" w:cs="Aptos"/>
-        </w:rPr>
-        <w:t xml:space="preserve">, a grid named </w:t>
-      </w:r>
-      <w:proofErr w:type="spellStart"/>
-      <w:r>
-        <w:rPr>
-          <w:rFonts w:ascii="Aptos" w:eastAsia="Aptos" w:hAnsi="Aptos" w:cs="Aptos"/>
-        </w:rPr>
-        <w:t>dgvRegister</w:t>
-      </w:r>
-      <w:proofErr w:type="spellEnd"/>
-      <w:r>
-        <w:rPr>
-          <w:rFonts w:ascii="Aptos" w:eastAsia="Aptos" w:hAnsi="Aptos" w:cs="Aptos"/>
-        </w:rPr>
-        <w:t xml:space="preserve"> where the register appears, and an Export CSV button named </w:t>
-      </w:r>
-      <w:proofErr w:type="spellStart"/>
-      <w:r>
-        <w:rPr>
-          <w:rFonts w:ascii="Aptos" w:eastAsia="Aptos" w:hAnsi="Aptos" w:cs="Aptos"/>
-        </w:rPr>
-        <w:t>btnExportRegister</w:t>
-      </w:r>
-      <w:proofErr w:type="spellEnd"/>
-      <w:r>
-        <w:rPr>
-          <w:rFonts w:ascii="Aptos" w:eastAsia="Aptos" w:hAnsi="Aptos" w:cs="Aptos"/>
-        </w:rPr>
-        <w:t>.</w:t>
-      </w:r>
-    </w:p>
-    <w:p>
-      <w:pPr>
-        <w:spacing w:after="160" w:line="276" w:lineRule="auto"/>
-      </w:pPr>
-      <w:r>
-        <w:rPr>
-          <w:rFonts w:ascii="Aptos" w:eastAsia="Aptos" w:hAnsi="Aptos" w:cs="Aptos"/>
-        </w:rPr>
-        <w:t xml:space="preserve">The way it is used is that the user picks a screening and presses Load Register, and the grid then fills with every booking for that screening, showing the customer names, the seats they have booked and the number of tickets. The input is the chosen screening, and the </w:t>
-      </w:r>
-      <w:r>
-        <w:rPr>
-          <w:rFonts w:ascii="Aptos" w:eastAsia="Aptos" w:hAnsi="Aptos" w:cs="Aptos"/>
-        </w:rPr>
-        <w:lastRenderedPageBreak/>
-        <w:t>output is the full register shown in the grid. There is also the option to press Export CSV, which takes whatever is currently shown in the register and writes it out to a comma separated values file that can be opened in a spreadsheet, which is useful if the manager wants to print it or keep a copy. The process behind loading the register is a query that pulls back all of the bookings for the chosen screening, and the export process simply writes those same rows out to a file line by line.</w:t>
-      </w:r>
-    </w:p>
-    <w:p>
-      <w:pPr>
-        <w:pStyle w:val="Heading3"/>
-        <w:spacing w:before="260" w:after="120"/>
-      </w:pPr>
-      <w:r>
-        <w:rPr>
-          <w:rFonts w:ascii="Aptos Display" w:eastAsia="Aptos Display" w:hAnsi="Aptos Display" w:cs="Aptos Display"/>
-          <w:b/>
-          <w:bCs/>
-          <w:color w:val="000000"/>
-        </w:rPr>
-        <w:t>Viewing a Sales Report (Objective 8)</w:t>
-      </w:r>
-    </w:p>
-    <w:p>
-      <w:pPr>
-        <w:spacing w:after="160" w:line="276" w:lineRule="auto"/>
-      </w:pPr>
-      <w:r>
-        <w:rPr>
-          <w:rFonts w:ascii="Aptos" w:eastAsia="Aptos" w:hAnsi="Aptos" w:cs="Aptos"/>
-        </w:rPr>
-        <w:t xml:space="preserve">This objective gives the manager an overview of how the cinema is performing, and because it is a management function it is only available when a manager is logged in. It is handled by the form named </w:t>
-      </w:r>
-      <w:proofErr w:type="spellStart"/>
-      <w:r>
-        <w:rPr>
-          <w:rFonts w:ascii="Aptos" w:eastAsia="Aptos" w:hAnsi="Aptos" w:cs="Aptos"/>
-        </w:rPr>
-        <w:t>frmSalesReport</w:t>
-      </w:r>
-      <w:proofErr w:type="spellEnd"/>
-      <w:r>
-        <w:rPr>
-          <w:rFonts w:ascii="Aptos" w:eastAsia="Aptos" w:hAnsi="Aptos" w:cs="Aptos"/>
-        </w:rPr>
-        <w:t xml:space="preserve">, reached from the Reports button on the main menu. The form is kept deliberately simple, with two date pickers named </w:t>
-      </w:r>
-      <w:proofErr w:type="spellStart"/>
-      <w:r>
-        <w:rPr>
-          <w:rFonts w:ascii="Aptos" w:eastAsia="Aptos" w:hAnsi="Aptos" w:cs="Aptos"/>
-        </w:rPr>
-        <w:t>dtpFrom</w:t>
-      </w:r>
-      <w:proofErr w:type="spellEnd"/>
-      <w:r>
-        <w:rPr>
-          <w:rFonts w:ascii="Aptos" w:eastAsia="Aptos" w:hAnsi="Aptos" w:cs="Aptos"/>
-        </w:rPr>
-        <w:t xml:space="preserve"> and </w:t>
-      </w:r>
-      <w:proofErr w:type="spellStart"/>
-      <w:r>
-        <w:rPr>
-          <w:rFonts w:ascii="Aptos" w:eastAsia="Aptos" w:hAnsi="Aptos" w:cs="Aptos"/>
-        </w:rPr>
-        <w:t>dtpTo</w:t>
-      </w:r>
-      <w:proofErr w:type="spellEnd"/>
-      <w:r>
-        <w:rPr>
-          <w:rFonts w:ascii="Aptos" w:eastAsia="Aptos" w:hAnsi="Aptos" w:cs="Aptos"/>
-        </w:rPr>
-        <w:t xml:space="preserve"> where the manager chooses the start and end of the period they want to look at, a Run Report button named </w:t>
-      </w:r>
-      <w:proofErr w:type="spellStart"/>
-      <w:r>
-        <w:rPr>
-          <w:rFonts w:ascii="Aptos" w:eastAsia="Aptos" w:hAnsi="Aptos" w:cs="Aptos"/>
-        </w:rPr>
-        <w:t>btnRunReport</w:t>
-      </w:r>
-      <w:proofErr w:type="spellEnd"/>
-      <w:r>
-        <w:rPr>
-          <w:rFonts w:ascii="Aptos" w:eastAsia="Aptos" w:hAnsi="Aptos" w:cs="Aptos"/>
-        </w:rPr>
-        <w:t xml:space="preserve">, a grid named </w:t>
-      </w:r>
-      <w:proofErr w:type="spellStart"/>
-      <w:r>
-        <w:rPr>
-          <w:rFonts w:ascii="Aptos" w:eastAsia="Aptos" w:hAnsi="Aptos" w:cs="Aptos"/>
-        </w:rPr>
-        <w:t>dgvSalesByFilm</w:t>
-      </w:r>
-      <w:proofErr w:type="spellEnd"/>
-      <w:r>
-        <w:rPr>
-          <w:rFonts w:ascii="Aptos" w:eastAsia="Aptos" w:hAnsi="Aptos" w:cs="Aptos"/>
-        </w:rPr>
-        <w:t xml:space="preserve"> which breaks the sales down film by film, and three summary labels named </w:t>
-      </w:r>
-      <w:proofErr w:type="spellStart"/>
-      <w:r>
-        <w:rPr>
-          <w:rFonts w:ascii="Aptos" w:eastAsia="Aptos" w:hAnsi="Aptos" w:cs="Aptos"/>
-        </w:rPr>
-        <w:t>lblTicketRevenue</w:t>
-      </w:r>
-      <w:proofErr w:type="spellEnd"/>
-      <w:r>
-        <w:rPr>
-          <w:rFonts w:ascii="Aptos" w:eastAsia="Aptos" w:hAnsi="Aptos" w:cs="Aptos"/>
-        </w:rPr>
-        <w:t xml:space="preserve">, </w:t>
-      </w:r>
-      <w:proofErr w:type="spellStart"/>
-      <w:r>
-        <w:rPr>
-          <w:rFonts w:ascii="Aptos" w:eastAsia="Aptos" w:hAnsi="Aptos" w:cs="Aptos"/>
-        </w:rPr>
-        <w:t>lblFoodRevenue</w:t>
-      </w:r>
-      <w:proofErr w:type="spellEnd"/>
-      <w:r>
-        <w:rPr>
-          <w:rFonts w:ascii="Aptos" w:eastAsia="Aptos" w:hAnsi="Aptos" w:cs="Aptos"/>
-        </w:rPr>
-        <w:t xml:space="preserve"> and </w:t>
-      </w:r>
-      <w:proofErr w:type="spellStart"/>
-      <w:r>
-        <w:rPr>
-          <w:rFonts w:ascii="Aptos" w:eastAsia="Aptos" w:hAnsi="Aptos" w:cs="Aptos"/>
-        </w:rPr>
-        <w:t>lblGrandTotal</w:t>
-      </w:r>
-      <w:proofErr w:type="spellEnd"/>
-      <w:r>
-        <w:rPr>
-          <w:rFonts w:ascii="Aptos" w:eastAsia="Aptos" w:hAnsi="Aptos" w:cs="Aptos"/>
-        </w:rPr>
-        <w:t>.</w:t>
+        <w:t xml:space="preserve"> where the results appear.</w:t>
       </w:r>
     </w:p>
     <w:p>
@@ -3002,7 +4571,7 @@
           <w:sz w:val="22"/>
           <w:szCs w:val="22"/>
         </w:rPr>
-        <w:t>Sales Report Form (</w:t>
+        <w:t>Booking Search Form (</w:t>
       </w:r>
       <w:proofErr w:type="spellStart"/>
       <w:r>
@@ -3014,7 +4583,7 @@
           <w:sz w:val="22"/>
           <w:szCs w:val="22"/>
         </w:rPr>
-        <w:t>frmSalesReport</w:t>
+        <w:t>frmBookingSearch</w:t>
       </w:r>
       <w:proofErr w:type="spellEnd"/>
       <w:r>
@@ -3028,6 +4597,17 @@
         </w:rPr>
         <w:t>)</w:t>
       </w:r>
+      <w:r>
+        <w:rPr>
+          <w:rFonts w:ascii="Aptos" w:eastAsia="Aptos" w:hAnsi="Aptos" w:cs="Aptos"/>
+          <w:i/>
+          <w:iCs/>
+          <w:color w:val="555555"/>
+          <w:sz w:val="20"/>
+          <w:szCs w:val="20"/>
+        </w:rPr>
+        <w:t>.</w:t>
+      </w:r>
     </w:p>
     <w:p>
       <w:pPr>
@@ -3037,7 +4617,28 @@
         <w:rPr>
           <w:rFonts w:ascii="Aptos" w:eastAsia="Aptos" w:hAnsi="Aptos" w:cs="Aptos"/>
         </w:rPr>
-        <w:t>The manager uses it by choosing a from date and a to date and pressing Run Report, at which point the grid fills with the sales for each film over that period and the three labels update to show the total ticket revenue, the total food revenue and the grand total of the two added together. The inputs are the two dates, and the outputs are the breakdown by film in the grid together with the three revenue totals. The process behind the button is a query that adds up the ticket sales and the food sales that fall within the chosen dates and groups them by film. I chose to use date pickers rather than text boxes for the dates so that the manager cannot enter something that is not a real date, and I chose to show both a breakdown by film and the overall totals, this is because the manager will want to see the headline figure at a glance but may also want to know which films in particular are selling well.</w:t>
+        <w:t xml:space="preserve">The way it works is that the member of staff types either a booking reference or the customer's name into the search box and presses Search, and any matching bookings appear in the grid. If they would rather just see everything, the Show All button lists every booking in the system. The input is therefore the text typed into the search box, the output is the list of matching bookings, and the process behind it is a query against the </w:t>
+      </w:r>
+      <w:proofErr w:type="spellStart"/>
+      <w:r>
+        <w:rPr>
+          <w:rFonts w:ascii="Aptos" w:eastAsia="Aptos" w:hAnsi="Aptos" w:cs="Aptos"/>
+        </w:rPr>
+        <w:t>tblBooking</w:t>
+      </w:r>
+      <w:proofErr w:type="spellEnd"/>
+      <w:r>
+        <w:rPr>
+          <w:rFonts w:ascii="Aptos" w:eastAsia="Aptos" w:hAnsi="Aptos" w:cs="Aptos"/>
+        </w:rPr>
+        <w:t xml:space="preserve"> table, joined to the customer details, that looks for a booking whose identifier matches the number typed or whose customer name contains the text typed. I chose to have a single search box that accepts either a booking reference or a name, this is because staff will sometimes have the reference to hand and sometimes only the customer's name, so </w:t>
+      </w:r>
+      <w:r>
+        <w:rPr>
+          <w:rFonts w:ascii="Aptos" w:eastAsia="Aptos" w:hAnsi="Aptos" w:cs="Aptos"/>
+        </w:rPr>
+        <w:lastRenderedPageBreak/>
+        <w:t>accepting both keeps it flexible, and the Show All button gives them a simple fallback when they are not sure what to search for.</w:t>
       </w:r>
     </w:p>
     <w:p>
@@ -3052,7 +4653,7 @@
           <w:bCs/>
           <w:color w:val="000000"/>
         </w:rPr>
-        <w:t>Maintaining an Audit Log (Objective 17)</w:t>
+        <w:t>Cancelling a Booking (Objective 12)</w:t>
       </w:r>
     </w:p>
     <w:p>
@@ -3063,56 +4664,320 @@
         <w:rPr>
           <w:rFonts w:ascii="Aptos" w:eastAsia="Aptos" w:hAnsi="Aptos" w:cs="Aptos"/>
         </w:rPr>
-        <w:t xml:space="preserve">The final objective in this section is the audit log, which quietly records the important actions that staff and managers carry out in the system, such as creating a booking, cancelling a booking or adding a new film or screening. The point of it is that if something goes wrong, for example a billing mistake, the manager can look back and see what happened and who did it, rather than the mistake simply disappearing. Because it is a management tool it is only available to a manager, and it is reached from the Logs button </w:t>
-      </w:r>
-      <w:r>
-        <w:rPr>
-          <w:rFonts w:ascii="Aptos" w:eastAsia="Aptos" w:hAnsi="Aptos" w:cs="Aptos"/>
+        <w:t xml:space="preserve">Cancelling a booking is done on the same </w:t>
+      </w:r>
+      <w:proofErr w:type="spellStart"/>
+      <w:r>
+        <w:rPr>
+          <w:rFonts w:ascii="Aptos" w:eastAsia="Aptos" w:hAnsi="Aptos" w:cs="Aptos"/>
+        </w:rPr>
+        <w:t>frmBookingSearch</w:t>
+      </w:r>
+      <w:proofErr w:type="spellEnd"/>
+      <w:r>
+        <w:rPr>
+          <w:rFonts w:ascii="Aptos" w:eastAsia="Aptos" w:hAnsi="Aptos" w:cs="Aptos"/>
+        </w:rPr>
+        <w:t xml:space="preserve"> form that was just described, so I will refer back to it rather than design a new screen. Once a member of staff has found the booking they want using the search, they select it in the results grid and press the Cancel Booking button named </w:t>
+      </w:r>
+      <w:proofErr w:type="spellStart"/>
+      <w:r>
+        <w:rPr>
+          <w:rFonts w:ascii="Aptos" w:eastAsia="Aptos" w:hAnsi="Aptos" w:cs="Aptos"/>
+        </w:rPr>
+        <w:t>btnCancelBooking</w:t>
+      </w:r>
+      <w:proofErr w:type="spellEnd"/>
+      <w:r>
+        <w:rPr>
+          <w:rFonts w:ascii="Aptos" w:eastAsia="Aptos" w:hAnsi="Aptos" w:cs="Aptos"/>
+        </w:rPr>
+        <w:t>. The input is simply the booking that is selected, and there is no new information to type in. The output is the booking being removed and a confirmation that it has been cancelled.</w:t>
+      </w:r>
+    </w:p>
+    <w:p>
+      <w:pPr>
+        <w:spacing w:after="160" w:line="276" w:lineRule="auto"/>
+      </w:pPr>
+      <w:r>
+        <w:rPr>
+          <w:rFonts w:ascii="Aptos" w:eastAsia="Aptos" w:hAnsi="Aptos" w:cs="Aptos"/>
+        </w:rPr>
+        <w:t xml:space="preserve">The important part of this objective is what the process does behind the scenes, because cancelling a booking is not just about deleting it, it also has to free up the seats it was using. This is because if the seats were not released then those seats would stay marked as taken forever and could never be sold again, which would be detrimental to the cinema. So when a booking is cancelled the system first removes that booking's seats from the </w:t>
+      </w:r>
+      <w:proofErr w:type="spellStart"/>
+      <w:r>
+        <w:rPr>
+          <w:rFonts w:ascii="Aptos" w:eastAsia="Aptos" w:hAnsi="Aptos" w:cs="Aptos"/>
+        </w:rPr>
+        <w:t>tblBookingSeat</w:t>
+      </w:r>
+      <w:proofErr w:type="spellEnd"/>
+      <w:r>
+        <w:rPr>
+          <w:rFonts w:ascii="Aptos" w:eastAsia="Aptos" w:hAnsi="Aptos" w:cs="Aptos"/>
+        </w:rPr>
+        <w:t xml:space="preserve"> table, which immediately makes them available again on the seat map, and then removes the booking itself from the </w:t>
+      </w:r>
+      <w:proofErr w:type="spellStart"/>
+      <w:r>
+        <w:rPr>
+          <w:rFonts w:ascii="Aptos" w:eastAsia="Aptos" w:hAnsi="Aptos" w:cs="Aptos"/>
+        </w:rPr>
+        <w:t>tblBooking</w:t>
+      </w:r>
+      <w:proofErr w:type="spellEnd"/>
+      <w:r>
+        <w:rPr>
+          <w:rFonts w:ascii="Aptos" w:eastAsia="Aptos" w:hAnsi="Aptos" w:cs="Aptos"/>
+        </w:rPr>
+        <w:t xml:space="preserve"> table. In this way the cancelled seats go straight back to showing as available the next time that screening's seat map is opened.</w:t>
+      </w:r>
+    </w:p>
+    <w:p>
+      <w:pPr>
+        <w:pStyle w:val="Heading3"/>
+        <w:spacing w:before="260" w:after="120"/>
+      </w:pPr>
+      <w:r>
+        <w:rPr>
+          <w:rFonts w:ascii="Aptos Display" w:eastAsia="Aptos Display" w:hAnsi="Aptos Display" w:cs="Aptos Display"/>
+          <w:b/>
+          <w:bCs/>
+          <w:color w:val="000000"/>
+        </w:rPr>
+        <w:t>Viewing the Booking Register (Objective 9)</w:t>
+      </w:r>
+    </w:p>
+    <w:p>
+      <w:pPr>
+        <w:spacing w:after="160" w:line="276" w:lineRule="auto"/>
+      </w:pPr>
+      <w:r>
+        <w:rPr>
+          <w:rFonts w:ascii="Aptos" w:eastAsia="Aptos" w:hAnsi="Aptos" w:cs="Aptos"/>
+        </w:rPr>
+        <w:t xml:space="preserve">The last job handled by the </w:t>
+      </w:r>
+      <w:proofErr w:type="spellStart"/>
+      <w:r>
+        <w:rPr>
+          <w:rFonts w:ascii="Aptos" w:eastAsia="Aptos" w:hAnsi="Aptos" w:cs="Aptos"/>
+        </w:rPr>
+        <w:t>frmBookingSearch</w:t>
+      </w:r>
+      <w:proofErr w:type="spellEnd"/>
+      <w:r>
+        <w:rPr>
+          <w:rFonts w:ascii="Aptos" w:eastAsia="Aptos" w:hAnsi="Aptos" w:cs="Aptos"/>
+        </w:rPr>
+        <w:t xml:space="preserve"> form is letting the manager or staff see a register of every booking for a particular screening, so that they can see who is coming and how full the screening is. I will refer back to that form for the overall layout and just describe the register part here. This part of the form has a combo box named </w:t>
+      </w:r>
+      <w:proofErr w:type="spellStart"/>
+      <w:r>
+        <w:rPr>
+          <w:rFonts w:ascii="Aptos" w:eastAsia="Aptos" w:hAnsi="Aptos" w:cs="Aptos"/>
+        </w:rPr>
+        <w:t>cboRegisterScreening</w:t>
+      </w:r>
+      <w:proofErr w:type="spellEnd"/>
+      <w:r>
+        <w:rPr>
+          <w:rFonts w:ascii="Aptos" w:eastAsia="Aptos" w:hAnsi="Aptos" w:cs="Aptos"/>
+        </w:rPr>
+        <w:t xml:space="preserve"> where the user picks the screening they are interested in, a Load Register button named </w:t>
+      </w:r>
+      <w:proofErr w:type="spellStart"/>
+      <w:r>
+        <w:rPr>
+          <w:rFonts w:ascii="Aptos" w:eastAsia="Aptos" w:hAnsi="Aptos" w:cs="Aptos"/>
+        </w:rPr>
+        <w:t>btnLoadRegister</w:t>
+      </w:r>
+      <w:proofErr w:type="spellEnd"/>
+      <w:r>
+        <w:rPr>
+          <w:rFonts w:ascii="Aptos" w:eastAsia="Aptos" w:hAnsi="Aptos" w:cs="Aptos"/>
+        </w:rPr>
+        <w:t xml:space="preserve">, a grid named </w:t>
+      </w:r>
+      <w:proofErr w:type="spellStart"/>
+      <w:r>
+        <w:rPr>
+          <w:rFonts w:ascii="Aptos" w:eastAsia="Aptos" w:hAnsi="Aptos" w:cs="Aptos"/>
+        </w:rPr>
+        <w:t>dgvRegister</w:t>
+      </w:r>
+      <w:proofErr w:type="spellEnd"/>
+      <w:r>
+        <w:rPr>
+          <w:rFonts w:ascii="Aptos" w:eastAsia="Aptos" w:hAnsi="Aptos" w:cs="Aptos"/>
+        </w:rPr>
+        <w:t xml:space="preserve"> where the register appears, and an Export CSV button named </w:t>
+      </w:r>
+      <w:proofErr w:type="spellStart"/>
+      <w:r>
+        <w:rPr>
+          <w:rFonts w:ascii="Aptos" w:eastAsia="Aptos" w:hAnsi="Aptos" w:cs="Aptos"/>
+        </w:rPr>
+        <w:t>btnExportRegister</w:t>
+      </w:r>
+      <w:proofErr w:type="spellEnd"/>
+      <w:r>
+        <w:rPr>
+          <w:rFonts w:ascii="Aptos" w:eastAsia="Aptos" w:hAnsi="Aptos" w:cs="Aptos"/>
+        </w:rPr>
+        <w:t>.</w:t>
+      </w:r>
+    </w:p>
+    <w:p>
+      <w:pPr>
+        <w:spacing w:after="160" w:line="276" w:lineRule="auto"/>
+      </w:pPr>
+      <w:r>
+        <w:rPr>
+          <w:rFonts w:ascii="Aptos" w:eastAsia="Aptos" w:hAnsi="Aptos" w:cs="Aptos"/>
+        </w:rPr>
+        <w:t>The way it is used is that the user picks a screening and presses Load Register, and the grid then fills with every booking for that screening, showing the customer names, the seats they have booked and the number of tickets. The input is the chosen screening, and the output is the full register shown in the grid. There is also the option to press Export CSV, which takes whatever is currently shown in the register and writes it out to a comma separated values file that can be opened in a spreadsheet, which is useful if the manager wants to print it or keep a copy. The process behind loading the register is a query that pulls back all of the bookings for the chosen screening, and the export process simply writes those same rows out to a file line by line.</w:t>
+      </w:r>
+    </w:p>
+    <w:p>
+      <w:pPr>
+        <w:pStyle w:val="Heading3"/>
+        <w:spacing w:before="260" w:after="120"/>
+      </w:pPr>
+      <w:r>
+        <w:rPr>
+          <w:rFonts w:ascii="Aptos Display" w:eastAsia="Aptos Display" w:hAnsi="Aptos Display" w:cs="Aptos Display"/>
+          <w:b/>
+          <w:bCs/>
+          <w:color w:val="000000"/>
         </w:rPr>
         <w:lastRenderedPageBreak/>
-        <w:t xml:space="preserve">on the main menu. It is handled by the form named </w:t>
+        <w:t>Viewing a Sales Report (Objective 8)</w:t>
+      </w:r>
+    </w:p>
+    <w:p>
+      <w:pPr>
+        <w:spacing w:after="160" w:line="276" w:lineRule="auto"/>
+      </w:pPr>
+      <w:r>
+        <w:rPr>
+          <w:rFonts w:ascii="Aptos" w:eastAsia="Aptos" w:hAnsi="Aptos" w:cs="Aptos"/>
+        </w:rPr>
+        <w:t xml:space="preserve">This objective gives the manager an overview of how the cinema is performing, and because it is a management function it is only available when a manager is logged in. It is handled by the form named </w:t>
       </w:r>
       <w:proofErr w:type="spellStart"/>
       <w:r>
         <w:rPr>
           <w:rFonts w:ascii="Aptos" w:eastAsia="Aptos" w:hAnsi="Aptos" w:cs="Aptos"/>
         </w:rPr>
-        <w:t>frmLogs</w:t>
+        <w:t>frmSalesReport</w:t>
       </w:r>
       <w:proofErr w:type="spellEnd"/>
       <w:r>
         <w:rPr>
           <w:rFonts w:ascii="Aptos" w:eastAsia="Aptos" w:hAnsi="Aptos" w:cs="Aptos"/>
         </w:rPr>
-        <w:t xml:space="preserve">, which is the simplest form in the whole system as it only needs a grid named </w:t>
+        <w:t xml:space="preserve">, reached from the Reports button on the main menu. The form is kept deliberately simple, with two date pickers named </w:t>
       </w:r>
       <w:proofErr w:type="spellStart"/>
       <w:r>
         <w:rPr>
           <w:rFonts w:ascii="Aptos" w:eastAsia="Aptos" w:hAnsi="Aptos" w:cs="Aptos"/>
         </w:rPr>
-        <w:t>dgvLogs</w:t>
+        <w:t>dtpFrom</w:t>
       </w:r>
       <w:proofErr w:type="spellEnd"/>
       <w:r>
         <w:rPr>
           <w:rFonts w:ascii="Aptos" w:eastAsia="Aptos" w:hAnsi="Aptos" w:cs="Aptos"/>
         </w:rPr>
-        <w:t xml:space="preserve"> to display the log entries and a Refresh button named </w:t>
+        <w:t xml:space="preserve"> and </w:t>
       </w:r>
       <w:proofErr w:type="spellStart"/>
       <w:r>
         <w:rPr>
           <w:rFonts w:ascii="Aptos" w:eastAsia="Aptos" w:hAnsi="Aptos" w:cs="Aptos"/>
         </w:rPr>
-        <w:t>btnRefresh</w:t>
+        <w:t>dtpTo</w:t>
       </w:r>
       <w:proofErr w:type="spellEnd"/>
       <w:r>
         <w:rPr>
           <w:rFonts w:ascii="Aptos" w:eastAsia="Aptos" w:hAnsi="Aptos" w:cs="Aptos"/>
         </w:rPr>
-        <w:t xml:space="preserve"> to reload them.</w:t>
+        <w:t xml:space="preserve"> where the manager chooses the start and end of the period they want to look at, a Run Report button named </w:t>
+      </w:r>
+      <w:proofErr w:type="spellStart"/>
+      <w:r>
+        <w:rPr>
+          <w:rFonts w:ascii="Aptos" w:eastAsia="Aptos" w:hAnsi="Aptos" w:cs="Aptos"/>
+        </w:rPr>
+        <w:t>btnRunReport</w:t>
+      </w:r>
+      <w:proofErr w:type="spellEnd"/>
+      <w:r>
+        <w:rPr>
+          <w:rFonts w:ascii="Aptos" w:eastAsia="Aptos" w:hAnsi="Aptos" w:cs="Aptos"/>
+        </w:rPr>
+        <w:t xml:space="preserve">, a grid named </w:t>
+      </w:r>
+      <w:proofErr w:type="spellStart"/>
+      <w:r>
+        <w:rPr>
+          <w:rFonts w:ascii="Aptos" w:eastAsia="Aptos" w:hAnsi="Aptos" w:cs="Aptos"/>
+        </w:rPr>
+        <w:t>dgvSalesByFilm</w:t>
+      </w:r>
+      <w:proofErr w:type="spellEnd"/>
+      <w:r>
+        <w:rPr>
+          <w:rFonts w:ascii="Aptos" w:eastAsia="Aptos" w:hAnsi="Aptos" w:cs="Aptos"/>
+        </w:rPr>
+        <w:t xml:space="preserve"> which breaks the sales down film by film, and three summary labels named </w:t>
+      </w:r>
+      <w:proofErr w:type="spellStart"/>
+      <w:r>
+        <w:rPr>
+          <w:rFonts w:ascii="Aptos" w:eastAsia="Aptos" w:hAnsi="Aptos" w:cs="Aptos"/>
+        </w:rPr>
+        <w:t>lblTicketRevenue</w:t>
+      </w:r>
+      <w:proofErr w:type="spellEnd"/>
+      <w:r>
+        <w:rPr>
+          <w:rFonts w:ascii="Aptos" w:eastAsia="Aptos" w:hAnsi="Aptos" w:cs="Aptos"/>
+        </w:rPr>
+        <w:t xml:space="preserve">, </w:t>
+      </w:r>
+      <w:proofErr w:type="spellStart"/>
+      <w:r>
+        <w:rPr>
+          <w:rFonts w:ascii="Aptos" w:eastAsia="Aptos" w:hAnsi="Aptos" w:cs="Aptos"/>
+        </w:rPr>
+        <w:t>lblFoodRevenue</w:t>
+      </w:r>
+      <w:proofErr w:type="spellEnd"/>
+      <w:r>
+        <w:rPr>
+          <w:rFonts w:ascii="Aptos" w:eastAsia="Aptos" w:hAnsi="Aptos" w:cs="Aptos"/>
+        </w:rPr>
+        <w:t xml:space="preserve"> and </w:t>
+      </w:r>
+      <w:proofErr w:type="spellStart"/>
+      <w:r>
+        <w:rPr>
+          <w:rFonts w:ascii="Aptos" w:eastAsia="Aptos" w:hAnsi="Aptos" w:cs="Aptos"/>
+        </w:rPr>
+        <w:t>lblGrandTotal</w:t>
+      </w:r>
+      <w:proofErr w:type="spellEnd"/>
+      <w:r>
+        <w:rPr>
+          <w:rFonts w:ascii="Aptos" w:eastAsia="Aptos" w:hAnsi="Aptos" w:cs="Aptos"/>
+        </w:rPr>
+        <w:t>.</w:t>
       </w:r>
     </w:p>
     <w:p>
@@ -3135,7 +5000,7 @@
           <w:sz w:val="22"/>
           <w:szCs w:val="22"/>
         </w:rPr>
-        <w:t>Logs Form (</w:t>
+        <w:t>Sales Report Form (</w:t>
       </w:r>
       <w:proofErr w:type="spellStart"/>
       <w:r>
@@ -3147,7 +5012,7 @@
           <w:sz w:val="22"/>
           <w:szCs w:val="22"/>
         </w:rPr>
-        <w:t>frmLogs</w:t>
+        <w:t>frmSalesReport</w:t>
       </w:r>
       <w:proofErr w:type="spellEnd"/>
       <w:r>
@@ -3170,21 +5035,7 @@
         <w:rPr>
           <w:rFonts w:ascii="Aptos" w:eastAsia="Aptos" w:hAnsi="Aptos" w:cs="Aptos"/>
         </w:rPr>
-        <w:t xml:space="preserve">There are effectively no inputs to this form beyond pressing Refresh, because its whole job is to display information rather than collect it. The output is the list of logged actions shown in the grid, each entry showing when it happened, who did it and what they did. The process behind it is simply a query that reads the entries back from the </w:t>
-      </w:r>
-      <w:proofErr w:type="spellStart"/>
-      <w:r>
-        <w:rPr>
-          <w:rFonts w:ascii="Aptos" w:eastAsia="Aptos" w:hAnsi="Aptos" w:cs="Aptos"/>
-        </w:rPr>
-        <w:t>tblLogs</w:t>
-      </w:r>
-      <w:proofErr w:type="spellEnd"/>
-      <w:r>
-        <w:rPr>
-          <w:rFonts w:ascii="Aptos" w:eastAsia="Aptos" w:hAnsi="Aptos" w:cs="Aptos"/>
-        </w:rPr>
-        <w:t xml:space="preserve"> table in order, with the most recent shown first. I deliberately made this grid read-only so that the log cannot be edited from within the program, this is because a log that could be changed would be worthless, the entire value of an audit log comes from the fact that nobody can quietly alter it after the event.</w:t>
+        <w:t>The manager uses it by choosing a from date and a to date and pressing Run Report, at which point the grid fills with the sales for each film over that period and the three labels update to show the total ticket revenue, the total food revenue and the grand total of the two added together. The inputs are the two dates, and the outputs are the breakdown by film in the grid together with the three revenue totals. The process behind the button is a query that adds up the ticket sales and the food sales that fall within the chosen dates and groups them by film. I chose to use date pickers rather than text boxes for the dates so that the manager cannot enter something that is not a real date, and I chose to show both a breakdown by film and the overall totals, this is because the manager will want to see the headline figure at a glance but may also want to know which films in particular are selling well.</w:t>
       </w:r>
     </w:p>
     <w:p>
@@ -3199,7 +5050,7 @@
           <w:bCs/>
           <w:color w:val="000000"/>
         </w:rPr>
-        <w:t>Overview Diagram of the User Interface</w:t>
+        <w:t>Maintaining an Audit Log (Objective 17)</w:t>
       </w:r>
     </w:p>
     <w:p>
@@ -3210,21 +5061,49 @@
         <w:rPr>
           <w:rFonts w:ascii="Aptos" w:eastAsia="Aptos" w:hAnsi="Aptos" w:cs="Aptos"/>
         </w:rPr>
-        <w:t xml:space="preserve">Finally, to pull all of these forms together, the overview diagram below shows how the different screens of </w:t>
+        <w:t xml:space="preserve">The final objective in this section is the audit log, which quietly records the important actions that staff and managers carry out in the system, such as creating a booking, cancelling a booking or adding a new film or screening. The point of it is that if something goes wrong, for example a billing mistake, the manager can look back and see what happened and who did it, rather than the mistake simply disappearing. Because it is a management tool it is only available to a manager, and it is reached from the Logs button on the main menu. It is handled by the form named </w:t>
       </w:r>
       <w:proofErr w:type="spellStart"/>
       <w:r>
         <w:rPr>
           <w:rFonts w:ascii="Aptos" w:eastAsia="Aptos" w:hAnsi="Aptos" w:cs="Aptos"/>
         </w:rPr>
-        <w:t>Filmtopia</w:t>
+        <w:t>frmLogs</w:t>
       </w:r>
       <w:proofErr w:type="spellEnd"/>
       <w:r>
         <w:rPr>
           <w:rFonts w:ascii="Aptos" w:eastAsia="Aptos" w:hAnsi="Aptos" w:cs="Aptos"/>
         </w:rPr>
-        <w:t xml:space="preserve"> connect to one another. It shows the login form at the top as the single entry point into the system, an arrow leading from it into the main menu, and then further arrows fanning out from the main menu to each of the forms it can open. This makes it easy to see at a glance that every part of the system is reached through the menu, and that the menu itself can only be reached by logging in first.</w:t>
+        <w:t xml:space="preserve">, which is the simplest form in the whole system as it only needs a grid named </w:t>
+      </w:r>
+      <w:proofErr w:type="spellStart"/>
+      <w:r>
+        <w:rPr>
+          <w:rFonts w:ascii="Aptos" w:eastAsia="Aptos" w:hAnsi="Aptos" w:cs="Aptos"/>
+        </w:rPr>
+        <w:t>dgvLogs</w:t>
+      </w:r>
+      <w:proofErr w:type="spellEnd"/>
+      <w:r>
+        <w:rPr>
+          <w:rFonts w:ascii="Aptos" w:eastAsia="Aptos" w:hAnsi="Aptos" w:cs="Aptos"/>
+        </w:rPr>
+        <w:t xml:space="preserve"> to display the log entries and a Refresh button named </w:t>
+      </w:r>
+      <w:proofErr w:type="spellStart"/>
+      <w:r>
+        <w:rPr>
+          <w:rFonts w:ascii="Aptos" w:eastAsia="Aptos" w:hAnsi="Aptos" w:cs="Aptos"/>
+        </w:rPr>
+        <w:t>btnRefresh</w:t>
+      </w:r>
+      <w:proofErr w:type="spellEnd"/>
+      <w:r>
+        <w:rPr>
+          <w:rFonts w:ascii="Aptos" w:eastAsia="Aptos" w:hAnsi="Aptos" w:cs="Aptos"/>
+        </w:rPr>
+        <w:t xml:space="preserve"> to reload them.</w:t>
       </w:r>
     </w:p>
     <w:p>
@@ -3247,6 +5126,119 @@
           <w:sz w:val="22"/>
           <w:szCs w:val="22"/>
         </w:rPr>
+        <w:t>Logs Form (</w:t>
+      </w:r>
+      <w:proofErr w:type="spellStart"/>
+      <w:r>
+        <w:rPr>
+          <w:rFonts w:ascii="Aptos" w:eastAsia="Aptos" w:hAnsi="Aptos" w:cs="Aptos"/>
+          <w:b/>
+          <w:bCs/>
+          <w:color w:val="A02B93"/>
+          <w:sz w:val="22"/>
+          <w:szCs w:val="22"/>
+        </w:rPr>
+        <w:t>frmLogs</w:t>
+      </w:r>
+      <w:proofErr w:type="spellEnd"/>
+      <w:r>
+        <w:rPr>
+          <w:rFonts w:ascii="Aptos" w:eastAsia="Aptos" w:hAnsi="Aptos" w:cs="Aptos"/>
+          <w:b/>
+          <w:bCs/>
+          <w:color w:val="A02B93"/>
+          <w:sz w:val="22"/>
+          <w:szCs w:val="22"/>
+        </w:rPr>
+        <w:t>)</w:t>
+      </w:r>
+    </w:p>
+    <w:p>
+      <w:pPr>
+        <w:spacing w:after="160" w:line="276" w:lineRule="auto"/>
+      </w:pPr>
+      <w:r>
+        <w:rPr>
+          <w:rFonts w:ascii="Aptos" w:eastAsia="Aptos" w:hAnsi="Aptos" w:cs="Aptos"/>
+        </w:rPr>
+        <w:lastRenderedPageBreak/>
+        <w:t xml:space="preserve">There are effectively no inputs to this form beyond pressing Refresh, because its whole job is to display information rather than collect it. The output is the list of logged actions shown in the grid, each entry showing when it happened, who did it and what they did. The process behind it is simply a query that reads the entries back from the </w:t>
+      </w:r>
+      <w:proofErr w:type="spellStart"/>
+      <w:r>
+        <w:rPr>
+          <w:rFonts w:ascii="Aptos" w:eastAsia="Aptos" w:hAnsi="Aptos" w:cs="Aptos"/>
+        </w:rPr>
+        <w:t>tblLogs</w:t>
+      </w:r>
+      <w:proofErr w:type="spellEnd"/>
+      <w:r>
+        <w:rPr>
+          <w:rFonts w:ascii="Aptos" w:eastAsia="Aptos" w:hAnsi="Aptos" w:cs="Aptos"/>
+        </w:rPr>
+        <w:t xml:space="preserve"> table in order, with the most recent shown first. I deliberately made this grid read-only so that the log cannot be edited from within the program, this is because a log that could be changed would be worthless, the entire value of an audit log comes from the fact that nobody can quietly alter it after the event.</w:t>
+      </w:r>
+    </w:p>
+    <w:p>
+      <w:pPr>
+        <w:pStyle w:val="Heading3"/>
+        <w:spacing w:before="260" w:after="120"/>
+      </w:pPr>
+      <w:r>
+        <w:rPr>
+          <w:rFonts w:ascii="Aptos Display" w:eastAsia="Aptos Display" w:hAnsi="Aptos Display" w:cs="Aptos Display"/>
+          <w:b/>
+          <w:bCs/>
+          <w:color w:val="000000"/>
+        </w:rPr>
+        <w:t>Overview Diagram of the User Interface</w:t>
+      </w:r>
+    </w:p>
+    <w:p>
+      <w:pPr>
+        <w:spacing w:after="160" w:line="276" w:lineRule="auto"/>
+      </w:pPr>
+      <w:r>
+        <w:rPr>
+          <w:rFonts w:ascii="Aptos" w:eastAsia="Aptos" w:hAnsi="Aptos" w:cs="Aptos"/>
+        </w:rPr>
+        <w:t xml:space="preserve">Finally, to pull all of these forms together, the overview diagram below shows how the different screens of </w:t>
+      </w:r>
+      <w:proofErr w:type="spellStart"/>
+      <w:r>
+        <w:rPr>
+          <w:rFonts w:ascii="Aptos" w:eastAsia="Aptos" w:hAnsi="Aptos" w:cs="Aptos"/>
+        </w:rPr>
+        <w:t>Filmtopia</w:t>
+      </w:r>
+      <w:proofErr w:type="spellEnd"/>
+      <w:r>
+        <w:rPr>
+          <w:rFonts w:ascii="Aptos" w:eastAsia="Aptos" w:hAnsi="Aptos" w:cs="Aptos"/>
+        </w:rPr>
+        <w:t xml:space="preserve"> connect to one another. It shows the login form at the top as the single entry point into the system, an arrow leading from it into the main menu, and then further arrows fanning out from the main menu to each of the forms it can open. This makes it easy to see at a glance that every part of the system is reached through the menu, and that the menu itself can only be reached by logging in first.</w:t>
+      </w:r>
+    </w:p>
+    <w:p>
+      <w:pPr>
+        <w:pBdr>
+          <w:top w:val="single" w:sz="6" w:space="6" w:color="A02B93"/>
+          <w:left w:val="single" w:sz="6" w:space="6" w:color="A02B93"/>
+          <w:bottom w:val="single" w:sz="6" w:space="6" w:color="A02B93"/>
+          <w:right w:val="single" w:sz="6" w:space="6" w:color="A02B93"/>
+        </w:pBdr>
+        <w:shd w:val="clear" w:color="auto" w:fill="F7E9F3"/>
+        <w:spacing w:before="120" w:after="200"/>
+      </w:pPr>
+      <w:r>
+        <w:rPr>
+          <w:rFonts w:ascii="Aptos" w:eastAsia="Aptos" w:hAnsi="Aptos" w:cs="Aptos"/>
+          <w:b/>
+          <w:bCs/>
+          <w:color w:val="A02B93"/>
+          <w:sz w:val="22"/>
+          <w:szCs w:val="22"/>
+        </w:rPr>
         <w:t>How the forms connect:</w:t>
       </w:r>
     </w:p>
@@ -3312,7 +5304,6 @@
           <w:bCs/>
           <w:color w:val="000000" w:themeColor="text1"/>
         </w:rPr>
-        <w:lastRenderedPageBreak/>
         <w:t>Entity Relationship Design</w:t>
       </w:r>
     </w:p>
@@ -3333,6 +5324,7 @@
         <w:rPr>
           <w:noProof/>
         </w:rPr>
+        <w:lastRenderedPageBreak/>
         <w:drawing>
           <wp:inline distT="0" distB="0" distL="0" distR="0" wp14:anchorId="7A33AE35" wp14:editId="2BAF158D">
             <wp:extent cx="5715000" cy="1428750"/>
@@ -13250,6 +15242,7 @@
                 <w:sz w:val="19"/>
                 <w:szCs w:val="19"/>
               </w:rPr>
+              <w:lastRenderedPageBreak/>
               <w:t xml:space="preserve">    DELETE the record in </w:t>
             </w:r>
             <w:proofErr w:type="spellStart"/>
@@ -13369,7 +15362,6 @@
         <w:spacing w:after="160" w:line="276" w:lineRule="auto"/>
       </w:pPr>
       <w:r>
-        <w:lastRenderedPageBreak/>
         <w:t xml:space="preserve">A presence check makes sure a required field has not been left blank. A type check makes sure the data is of the right kind, for example that a number has been entered where a number is expected. A length check makes sure an entry is </w:t>
       </w:r>
       <w:proofErr w:type="spellStart"/>
@@ -14007,6 +15999,7 @@
                 <w:sz w:val="19"/>
                 <w:szCs w:val="19"/>
               </w:rPr>
+              <w:lastRenderedPageBreak/>
               <w:t>FilmDuration</w:t>
             </w:r>
             <w:proofErr w:type="spellEnd"/>
@@ -14645,7 +16638,6 @@
                 <w:sz w:val="19"/>
                 <w:szCs w:val="19"/>
               </w:rPr>
-              <w:lastRenderedPageBreak/>
               <w:t>Film</w:t>
             </w:r>
           </w:p>
@@ -15543,6 +17535,7 @@
           <w:bCs/>
           <w:color w:val="000000" w:themeColor="text1"/>
         </w:rPr>
+        <w:lastRenderedPageBreak/>
         <w:t>Seat Selection and Food Order (Booking)</w:t>
       </w:r>
     </w:p>
@@ -16245,6 +18238,7 @@
         <w:docPartUnique/>
       </w:docPartObj>
     </w:sdtPr>
+    <w:sdtEndPr/>
     <w:sdtContent>
       <w:p>
         <w:pPr>

</xml_diff>

<commit_message>
added design for frmFilms in design
</commit_message>
<xml_diff>
--- a/Design.docx
+++ b/Design.docx
@@ -380,9 +380,9 @@
         <mc:AlternateContent>
           <mc:Choice Requires="wpc">
             <w:drawing>
-              <wp:inline distT="0" distB="0" distL="0" distR="0" wp14:anchorId="25BE6B75" wp14:editId="3F5A0022">
-                <wp:extent cx="5486400" cy="3676650"/>
-                <wp:effectExtent l="0" t="0" r="19050" b="0"/>
+              <wp:inline distT="0" distB="0" distL="0" distR="0" wp14:anchorId="25BE6B75" wp14:editId="1F92EBDF">
+                <wp:extent cx="5486400" cy="3878580"/>
+                <wp:effectExtent l="0" t="0" r="19050" b="7620"/>
                 <wp:docPr id="233146271" name="Canvas 3"/>
                 <wp:cNvGraphicFramePr>
                   <a:graphicFrameLocks xmlns:a="http://schemas.openxmlformats.org/drawingml/2006/main" noChangeAspect="1"/>
@@ -749,6 +749,74 @@
                           <a:noAutofit/>
                         </wps:bodyPr>
                       </wps:wsp>
+                      <wps:wsp>
+                        <wps:cNvPr id="2002020425" name="Text Box 2002020425"/>
+                        <wps:cNvSpPr txBox="1"/>
+                        <wps:spPr>
+                          <a:xfrm>
+                            <a:off x="203200" y="3550920"/>
+                            <a:ext cx="2233930" cy="236220"/>
+                          </a:xfrm>
+                          <a:prstGeom prst="rect">
+                            <a:avLst/>
+                          </a:prstGeom>
+                          <a:noFill/>
+                          <a:ln>
+                            <a:noFill/>
+                          </a:ln>
+                        </wps:spPr>
+                        <wps:style>
+                          <a:lnRef idx="0">
+                            <a:scrgbClr r="0" g="0" b="0"/>
+                          </a:lnRef>
+                          <a:fillRef idx="0">
+                            <a:scrgbClr r="0" g="0" b="0"/>
+                          </a:fillRef>
+                          <a:effectRef idx="0">
+                            <a:scrgbClr r="0" g="0" b="0"/>
+                          </a:effectRef>
+                          <a:fontRef idx="minor">
+                            <a:schemeClr val="dk1"/>
+                          </a:fontRef>
+                        </wps:style>
+                        <wps:txbx>
+                          <w:txbxContent>
+                            <w:p>
+                              <w:pPr>
+                                <w:rPr>
+                                  <w:color w:val="808080" w:themeColor="background1" w:themeShade="80"/>
+                                  <w:sz w:val="20"/>
+                                  <w:szCs w:val="20"/>
+                                </w:rPr>
+                              </w:pPr>
+                              <w:proofErr w:type="spellStart"/>
+                              <w:r>
+                                <w:rPr>
+                                  <w:color w:val="808080" w:themeColor="background1" w:themeShade="80"/>
+                                  <w:sz w:val="20"/>
+                                  <w:szCs w:val="20"/>
+                                </w:rPr>
+                                <w:t>Filmtopia</w:t>
+                              </w:r>
+                              <w:proofErr w:type="spellEnd"/>
+                              <w:r>
+                                <w:rPr>
+                                  <w:color w:val="808080" w:themeColor="background1" w:themeShade="80"/>
+                                  <w:sz w:val="20"/>
+                                  <w:szCs w:val="20"/>
+                                </w:rPr>
+                                <w:t xml:space="preserve"> Management System v1.0.2</w:t>
+                              </w:r>
+                            </w:p>
+                          </w:txbxContent>
+                        </wps:txbx>
+                        <wps:bodyPr rot="0" spcFirstLastPara="0" vertOverflow="overflow" horzOverflow="overflow" vert="horz" wrap="none" lIns="91440" tIns="45720" rIns="91440" bIns="45720" numCol="1" spcCol="0" rtlCol="0" fromWordArt="0" anchor="t" anchorCtr="0" forceAA="0" compatLnSpc="1">
+                          <a:prstTxWarp prst="textNoShape">
+                            <a:avLst/>
+                          </a:prstTxWarp>
+                          <a:noAutofit/>
+                        </wps:bodyPr>
+                      </wps:wsp>
                     </wpc:wpc>
                   </a:graphicData>
                 </a:graphic>
@@ -757,7 +825,7 @@
           </mc:Choice>
           <mc:Fallback>
             <w:pict>
-              <v:group w14:anchorId="25BE6B75" id="Canvas 3" o:spid="_x0000_s1026" editas="canvas" style="width:6in;height:289.5pt;mso-position-horizontal-relative:char;mso-position-vertical-relative:line" coordsize="54864,36766" o:gfxdata="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">
+              <v:group w14:anchorId="25BE6B75" id="Canvas 3" o:spid="_x0000_s1026" editas="canvas" style="width:6in;height:305.4pt;mso-position-horizontal-relative:char;mso-position-vertical-relative:line" coordsize="54864,38785" o:gfxdata="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">
                 <v:shapetype id="_x0000_t75" coordsize="21600,21600" o:spt="75" o:preferrelative="t" path="m@4@5l@4@11@9@11@9@5xe" filled="f" stroked="f">
                   <v:stroke joinstyle="miter"/>
                   <v:formulas>
@@ -777,7 +845,7 @@
                   <v:path o:extrusionok="f" gradientshapeok="t" o:connecttype="rect"/>
                   <o:lock v:ext="edit" aspectratio="t"/>
                 </v:shapetype>
-                <v:shape id="_x0000_s1027" type="#_x0000_t75" style="position:absolute;width:54864;height:36766;visibility:visible;mso-wrap-style:square" filled="t">
+                <v:shape id="_x0000_s1027" type="#_x0000_t75" style="position:absolute;width:54864;height:38785;visibility:visible;mso-wrap-style:square" filled="t">
                   <v:fill o:detectmouseclick="t"/>
                   <v:path o:connecttype="none"/>
                 </v:shape>
@@ -929,6 +997,39 @@
                     </w:txbxContent>
                   </v:textbox>
                 </v:rect>
+                <v:shape id="Text Box 2002020425" o:spid="_x0000_s1035" type="#_x0000_t202" style="position:absolute;left:2032;top:35509;width:22339;height:2362;visibility:visible;mso-wrap-style:none;v-text-anchor:top" o:gfxdata="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" filled="f" stroked="f">
+                  <v:textbox>
+                    <w:txbxContent>
+                      <w:p>
+                        <w:pPr>
+                          <w:rPr>
+                            <w:color w:val="808080" w:themeColor="background1" w:themeShade="80"/>
+                            <w:sz w:val="20"/>
+                            <w:szCs w:val="20"/>
+                          </w:rPr>
+                        </w:pPr>
+                        <w:proofErr w:type="spellStart"/>
+                        <w:r>
+                          <w:rPr>
+                            <w:color w:val="808080" w:themeColor="background1" w:themeShade="80"/>
+                            <w:sz w:val="20"/>
+                            <w:szCs w:val="20"/>
+                          </w:rPr>
+                          <w:t>Filmtopia</w:t>
+                        </w:r>
+                        <w:proofErr w:type="spellEnd"/>
+                        <w:r>
+                          <w:rPr>
+                            <w:color w:val="808080" w:themeColor="background1" w:themeShade="80"/>
+                            <w:sz w:val="20"/>
+                            <w:szCs w:val="20"/>
+                          </w:rPr>
+                          <w:t xml:space="preserve"> Management System v1.0.2</w:t>
+                        </w:r>
+                      </w:p>
+                    </w:txbxContent>
+                  </v:textbox>
+                </v:shape>
                 <w10:anchorlock/>
               </v:group>
             </w:pict>
@@ -2368,13 +2469,13 @@
           </mc:Choice>
           <mc:Fallback>
             <w:pict>
-              <v:group w14:anchorId="5E1AF47B" id="Canvas 5" o:spid="_x0000_s1035" editas="canvas" style="width:6in;height:259.6pt;mso-position-horizontal-relative:char;mso-position-vertical-relative:line" coordsize="54864,32969" o:gfxdata="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">
-                <v:shape id="_x0000_s1036" type="#_x0000_t75" style="position:absolute;width:54864;height:32969;visibility:visible;mso-wrap-style:square" filled="t">
+              <v:group w14:anchorId="5E1AF47B" id="Canvas 5" o:spid="_x0000_s1036" editas="canvas" style="width:6in;height:259.6pt;mso-position-horizontal-relative:char;mso-position-vertical-relative:line" coordsize="54864,32969" o:gfxdata="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">
+                <v:shape id="_x0000_s1037" type="#_x0000_t75" style="position:absolute;width:54864;height:32969;visibility:visible;mso-wrap-style:square" filled="t">
                   <v:fill o:detectmouseclick="t"/>
                   <v:path o:connecttype="none"/>
                 </v:shape>
-                <v:rect id="Rectangle 1567915412" o:spid="_x0000_s1037" style="position:absolute;left:90;width:9181;height:32613;visibility:visible;mso-wrap-style:square;v-text-anchor:middle" o:gfxdata="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" fillcolor="#a02b93 [3208]" strokecolor="#170615 [488]" strokeweight="1pt"/>
-                <v:shape id="Text Box 1199104866" o:spid="_x0000_s1038" type="#_x0000_t202" style="position:absolute;left:90;width:9462;height:2438;visibility:visible;mso-wrap-style:none;v-text-anchor:top" o:gfxdata="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" fillcolor="#a02b93 [3208]" strokecolor="#170615 [488]" strokeweight="1pt">
+                <v:rect id="Rectangle 1567915412" o:spid="_x0000_s1038" style="position:absolute;left:90;width:9181;height:32613;visibility:visible;mso-wrap-style:square;v-text-anchor:middle" o:gfxdata="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" fillcolor="#a02b93 [3208]" strokecolor="#170615 [488]" strokeweight="1pt"/>
+                <v:shape id="Text Box 1199104866" o:spid="_x0000_s1039" type="#_x0000_t202" style="position:absolute;left:90;width:9462;height:2438;visibility:visible;mso-wrap-style:none;v-text-anchor:top" o:gfxdata="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" fillcolor="#a02b93 [3208]" strokecolor="#170615 [488]" strokeweight="1pt">
                   <v:textbox>
                     <w:txbxContent>
                       <w:p>
@@ -2426,7 +2527,7 @@
                     </w:txbxContent>
                   </v:textbox>
                 </v:shape>
-                <v:shape id="Text Box 2036808941" o:spid="_x0000_s1039" type="#_x0000_t202" style="position:absolute;left:90;top:6286;width:9053;height:2159;visibility:visible;mso-wrap-style:square;v-text-anchor:top" o:gfxdata="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" fillcolor="#a02b93 [3208]" strokecolor="#170615 [488]" strokeweight="1pt">
+                <v:shape id="Text Box 2036808941" o:spid="_x0000_s1040" type="#_x0000_t202" style="position:absolute;left:90;top:6286;width:9053;height:2159;visibility:visible;mso-wrap-style:square;v-text-anchor:top" o:gfxdata="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" fillcolor="#a02b93 [3208]" strokecolor="#170615 [488]" strokeweight="1pt">
                   <v:textbox>
                     <w:txbxContent>
                       <w:p>
@@ -2447,7 +2548,7 @@
                     </w:txbxContent>
                   </v:textbox>
                 </v:shape>
-                <v:shape id="Text Box 1" o:spid="_x0000_s1040" type="#_x0000_t202" style="position:absolute;left:90;top:8848;width:9049;height:2159;visibility:visible;mso-wrap-style:square;v-text-anchor:top" o:gfxdata="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" fillcolor="#a02b93 [3208]" strokecolor="#170615 [488]" strokeweight="1pt">
+                <v:shape id="Text Box 1" o:spid="_x0000_s1041" type="#_x0000_t202" style="position:absolute;left:90;top:8848;width:9049;height:2159;visibility:visible;mso-wrap-style:square;v-text-anchor:top" o:gfxdata="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" fillcolor="#a02b93 [3208]" strokecolor="#170615 [488]" strokeweight="1pt">
                   <v:textbox>
                     <w:txbxContent>
                       <w:p>
@@ -2471,7 +2572,7 @@
                     </w:txbxContent>
                   </v:textbox>
                 </v:shape>
-                <v:shape id="Text Box 1" o:spid="_x0000_s1041" type="#_x0000_t202" style="position:absolute;left:90;top:11375;width:9049;height:2159;visibility:visible;mso-wrap-style:square;v-text-anchor:top" o:gfxdata="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" fillcolor="#a02b93 [3208]" strokecolor="#170615 [488]" strokeweight="1pt">
+                <v:shape id="Text Box 1" o:spid="_x0000_s1042" type="#_x0000_t202" style="position:absolute;left:90;top:11375;width:9049;height:2159;visibility:visible;mso-wrap-style:square;v-text-anchor:top" o:gfxdata="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" fillcolor="#a02b93 [3208]" strokecolor="#170615 [488]" strokeweight="1pt">
                   <v:textbox>
                     <w:txbxContent>
                       <w:p>
@@ -2495,7 +2596,7 @@
                     </w:txbxContent>
                   </v:textbox>
                 </v:shape>
-                <v:shape id="Text Box 1" o:spid="_x0000_s1042" type="#_x0000_t202" style="position:absolute;left:90;top:13801;width:9049;height:2159;visibility:visible;mso-wrap-style:square;v-text-anchor:top" o:gfxdata="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" fillcolor="#a02b93 [3208]" strokecolor="#170615 [488]" strokeweight="1pt">
+                <v:shape id="Text Box 1" o:spid="_x0000_s1043" type="#_x0000_t202" style="position:absolute;left:90;top:13801;width:9049;height:2159;visibility:visible;mso-wrap-style:square;v-text-anchor:top" o:gfxdata="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" fillcolor="#a02b93 [3208]" strokecolor="#170615 [488]" strokeweight="1pt">
                   <v:textbox>
                     <w:txbxContent>
                       <w:p>
@@ -2519,7 +2620,7 @@
                     </w:txbxContent>
                   </v:textbox>
                 </v:shape>
-                <v:shape id="Text Box 1" o:spid="_x0000_s1043" type="#_x0000_t202" style="position:absolute;left:90;top:16201;width:9049;height:2159;visibility:visible;mso-wrap-style:square;v-text-anchor:top" o:gfxdata="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" fillcolor="#ad1457" strokecolor="#170615 [488]" strokeweight="1pt">
+                <v:shape id="Text Box 1" o:spid="_x0000_s1044" type="#_x0000_t202" style="position:absolute;left:90;top:16201;width:9049;height:2159;visibility:visible;mso-wrap-style:square;v-text-anchor:top" o:gfxdata="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" fillcolor="#ad1457" strokecolor="#170615 [488]" strokeweight="1pt">
                   <v:textbox>
                     <w:txbxContent>
                       <w:p>
@@ -2543,8 +2644,8 @@
                     </w:txbxContent>
                   </v:textbox>
                 </v:shape>
-                <v:rect id="Rectangle 670175078" o:spid="_x0000_s1044" style="position:absolute;left:9356;width:45508;height:6286;visibility:visible;mso-wrap-style:square;v-text-anchor:middle" o:gfxdata="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" fillcolor="#a02b93 [3208]" strokecolor="#170615 [488]" strokeweight="1pt"/>
-                <v:shape id="Text Box 1" o:spid="_x0000_s1045" type="#_x0000_t202" style="position:absolute;left:90;top:18564;width:9049;height:2159;visibility:visible;mso-wrap-style:square;v-text-anchor:top" o:gfxdata="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" fillcolor="#a02b93 [3208]" strokecolor="#170615 [488]" strokeweight="1pt">
+                <v:rect id="Rectangle 670175078" o:spid="_x0000_s1045" style="position:absolute;left:9356;width:45508;height:6286;visibility:visible;mso-wrap-style:square;v-text-anchor:middle" o:gfxdata="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" fillcolor="#a02b93 [3208]" strokecolor="#170615 [488]" strokeweight="1pt"/>
+                <v:shape id="Text Box 1" o:spid="_x0000_s1046" type="#_x0000_t202" style="position:absolute;left:90;top:18564;width:9049;height:2159;visibility:visible;mso-wrap-style:square;v-text-anchor:top" o:gfxdata="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" fillcolor="#a02b93 [3208]" strokecolor="#170615 [488]" strokeweight="1pt">
                   <v:textbox>
                     <w:txbxContent>
                       <w:p>
@@ -2568,7 +2669,7 @@
                     </w:txbxContent>
                   </v:textbox>
                 </v:shape>
-                <v:shape id="Text Box 1" o:spid="_x0000_s1046" type="#_x0000_t202" style="position:absolute;left:90;top:20926;width:9049;height:2159;visibility:visible;mso-wrap-style:square;v-text-anchor:top" o:gfxdata="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" fillcolor="#a02b93 [3208]" strokecolor="#170615 [488]" strokeweight="1pt">
+                <v:shape id="Text Box 1" o:spid="_x0000_s1047" type="#_x0000_t202" style="position:absolute;left:90;top:20926;width:9049;height:2159;visibility:visible;mso-wrap-style:square;v-text-anchor:top" o:gfxdata="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" fillcolor="#a02b93 [3208]" strokecolor="#170615 [488]" strokeweight="1pt">
                   <v:textbox>
                     <w:txbxContent>
                       <w:p>
@@ -2592,7 +2693,7 @@
                     </w:txbxContent>
                   </v:textbox>
                 </v:shape>
-                <v:shape id="Text Box 1" o:spid="_x0000_s1047" type="#_x0000_t202" style="position:absolute;left:90;top:23237;width:9049;height:2159;visibility:visible;mso-wrap-style:square;v-text-anchor:top" o:gfxdata="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" fillcolor="#a02b93 [3208]" strokecolor="#170615 [488]" strokeweight="1pt">
+                <v:shape id="Text Box 1" o:spid="_x0000_s1048" type="#_x0000_t202" style="position:absolute;left:90;top:23237;width:9049;height:2159;visibility:visible;mso-wrap-style:square;v-text-anchor:top" o:gfxdata="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" fillcolor="#a02b93 [3208]" strokecolor="#170615 [488]" strokeweight="1pt">
                   <v:textbox>
                     <w:txbxContent>
                       <w:p>
@@ -2615,7 +2716,7 @@
                     </w:txbxContent>
                   </v:textbox>
                 </v:shape>
-                <v:shape id="Text Box 1" o:spid="_x0000_s1048" type="#_x0000_t202" style="position:absolute;left:95;top:25574;width:9048;height:2159;visibility:visible;mso-wrap-style:square;v-text-anchor:top" o:gfxdata="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" fillcolor="#a02b93 [3208]" strokecolor="#170615 [488]" strokeweight="1pt">
+                <v:shape id="Text Box 1" o:spid="_x0000_s1049" type="#_x0000_t202" style="position:absolute;left:95;top:25574;width:9048;height:2159;visibility:visible;mso-wrap-style:square;v-text-anchor:top" o:gfxdata="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" fillcolor="#a02b93 [3208]" strokecolor="#170615 [488]" strokeweight="1pt">
                   <v:textbox>
                     <w:txbxContent>
                       <w:p>
@@ -2639,7 +2740,7 @@
                     </w:txbxContent>
                   </v:textbox>
                 </v:shape>
-                <v:shape id="Text Box 1" o:spid="_x0000_s1049" type="#_x0000_t202" style="position:absolute;left:90;top:27936;width:9049;height:2159;visibility:visible;mso-wrap-style:square;v-text-anchor:top" o:gfxdata="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" fillcolor="#a02b93 [3208]" strokecolor="#170615 [488]" strokeweight="1pt">
+                <v:shape id="Text Box 1" o:spid="_x0000_s1050" type="#_x0000_t202" style="position:absolute;left:90;top:27936;width:9049;height:2159;visibility:visible;mso-wrap-style:square;v-text-anchor:top" o:gfxdata="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" fillcolor="#a02b93 [3208]" strokecolor="#170615 [488]" strokeweight="1pt">
                   <v:textbox>
                     <w:txbxContent>
                       <w:p>
@@ -2662,7 +2763,7 @@
                     </w:txbxContent>
                   </v:textbox>
                 </v:shape>
-                <v:shape id="Text Box 1" o:spid="_x0000_s1050" type="#_x0000_t202" style="position:absolute;left:95;top:30095;width:9048;height:2439;visibility:visible;mso-wrap-style:square;v-text-anchor:top" o:gfxdata="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" fillcolor="#6a1c61 [2152]" stroked="f">
+                <v:shape id="Text Box 1" o:spid="_x0000_s1051" type="#_x0000_t202" style="position:absolute;left:95;top:30095;width:9048;height:2439;visibility:visible;mso-wrap-style:square;v-text-anchor:top" o:gfxdata="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" fillcolor="#6a1c61 [2152]" stroked="f">
                   <v:fill color2="#d86dcb [1944]" rotate="t" angle="180" colors="0 #6b1d62;31457f #a72d9a;1 #d86ecc" focus="100%" type="gradient"/>
                   <v:textbox>
                     <w:txbxContent>
@@ -2691,7 +2792,7 @@
                     </w:txbxContent>
                   </v:textbox>
                 </v:shape>
-                <v:shape id="Text Box 193255244" o:spid="_x0000_s1051" type="#_x0000_t202" style="position:absolute;left:11684;top:12192;width:32342;height:18542;visibility:visible;mso-wrap-style:square;v-text-anchor:top" o:gfxdata="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" fillcolor="white [3201]" strokeweight=".5pt">
+                <v:shape id="Text Box 193255244" o:spid="_x0000_s1052" type="#_x0000_t202" style="position:absolute;left:11684;top:12192;width:32342;height:18542;visibility:visible;mso-wrap-style:square;v-text-anchor:top" o:gfxdata="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" fillcolor="white [3201]" strokeweight=".5pt">
                   <v:textbox>
                     <w:txbxContent>
                       <w:p>
@@ -2998,7 +3099,7 @@
                     </w:txbxContent>
                   </v:textbox>
                 </v:shape>
-                <v:shape id="Text Box 760575158" o:spid="_x0000_s1052" type="#_x0000_t202" style="position:absolute;left:11514;top:8848;width:16933;height:2836;visibility:visible;mso-wrap-style:square;v-text-anchor:top" o:gfxdata="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" filled="f" stroked="f">
+                <v:shape id="Text Box 760575158" o:spid="_x0000_s1053" type="#_x0000_t202" style="position:absolute;left:11514;top:8848;width:16933;height:2836;visibility:visible;mso-wrap-style:square;v-text-anchor:top" o:gfxdata="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" filled="f" stroked="f">
                   <v:textbox>
                     <w:txbxContent>
                       <w:p>
@@ -3304,8 +3405,8 @@
         <mc:AlternateContent>
           <mc:Choice Requires="wpc">
             <w:drawing>
-              <wp:inline distT="0" distB="0" distL="0" distR="0" wp14:anchorId="15269588" wp14:editId="044332E4">
-                <wp:extent cx="5486400" cy="3200400"/>
+              <wp:inline distT="0" distB="0" distL="0" distR="0" wp14:anchorId="15269588" wp14:editId="64510286">
+                <wp:extent cx="5486400" cy="3790950"/>
                 <wp:effectExtent l="0" t="0" r="0" b="0"/>
                 <wp:docPr id="1459371715" name="Canvas 6"/>
                 <wp:cNvGraphicFramePr>
@@ -3320,6 +3421,739 @@
                         </a:solidFill>
                       </wpc:bg>
                       <wpc:whole/>
+                      <wps:wsp>
+                        <wps:cNvPr id="2141474156" name="Rectangle 2141474156"/>
+                        <wps:cNvSpPr/>
+                        <wps:spPr>
+                          <a:xfrm>
+                            <a:off x="82550" y="63500"/>
+                            <a:ext cx="5314950" cy="1644650"/>
+                          </a:xfrm>
+                          <a:prstGeom prst="rect">
+                            <a:avLst/>
+                          </a:prstGeom>
+                        </wps:spPr>
+                        <wps:style>
+                          <a:lnRef idx="1">
+                            <a:schemeClr val="dk1"/>
+                          </a:lnRef>
+                          <a:fillRef idx="2">
+                            <a:schemeClr val="dk1"/>
+                          </a:fillRef>
+                          <a:effectRef idx="1">
+                            <a:schemeClr val="dk1"/>
+                          </a:effectRef>
+                          <a:fontRef idx="minor">
+                            <a:schemeClr val="dk1"/>
+                          </a:fontRef>
+                        </wps:style>
+                        <wps:txbx>
+                          <w:txbxContent>
+                            <w:p>
+                              <w:pPr>
+                                <w:rPr>
+                                  <w:b/>
+                                  <w:bCs/>
+                                </w:rPr>
+                              </w:pPr>
+                              <w:r>
+                                <w:tab/>
+                              </w:r>
+                              <w:r>
+                                <w:tab/>
+                              </w:r>
+                              <w:r>
+                                <w:tab/>
+                              </w:r>
+                              <w:r>
+                                <w:rPr>
+                                  <w:b/>
+                                  <w:bCs/>
+                                </w:rPr>
+                                <w:t>[Data grid view box with current films</w:t>
+                              </w:r>
+                              <w:r>
+                                <w:rPr>
+                                  <w:b/>
+                                  <w:bCs/>
+                                </w:rPr>
+                                <w:t>]</w:t>
+                              </w:r>
+                            </w:p>
+                          </w:txbxContent>
+                        </wps:txbx>
+                        <wps:bodyPr rot="0" spcFirstLastPara="0" vertOverflow="overflow" horzOverflow="overflow" vert="horz" wrap="square" lIns="91440" tIns="45720" rIns="91440" bIns="45720" numCol="1" spcCol="0" rtlCol="0" fromWordArt="0" anchor="ctr" anchorCtr="0" forceAA="0" compatLnSpc="1">
+                          <a:prstTxWarp prst="textNoShape">
+                            <a:avLst/>
+                          </a:prstTxWarp>
+                          <a:noAutofit/>
+                        </wps:bodyPr>
+                      </wps:wsp>
+                      <wps:wsp>
+                        <wps:cNvPr id="1702352441" name="Text Box 1702352441"/>
+                        <wps:cNvSpPr txBox="1"/>
+                        <wps:spPr>
+                          <a:xfrm>
+                            <a:off x="127000" y="2139950"/>
+                            <a:ext cx="742950" cy="241300"/>
+                          </a:xfrm>
+                          <a:prstGeom prst="rect">
+                            <a:avLst/>
+                          </a:prstGeom>
+                          <a:noFill/>
+                          <a:ln>
+                            <a:noFill/>
+                          </a:ln>
+                        </wps:spPr>
+                        <wps:style>
+                          <a:lnRef idx="0">
+                            <a:scrgbClr r="0" g="0" b="0"/>
+                          </a:lnRef>
+                          <a:fillRef idx="0">
+                            <a:scrgbClr r="0" g="0" b="0"/>
+                          </a:fillRef>
+                          <a:effectRef idx="0">
+                            <a:scrgbClr r="0" g="0" b="0"/>
+                          </a:effectRef>
+                          <a:fontRef idx="minor">
+                            <a:schemeClr val="dk1"/>
+                          </a:fontRef>
+                        </wps:style>
+                        <wps:txbx>
+                          <w:txbxContent>
+                            <w:p>
+                              <w:pPr>
+                                <w:rPr>
+                                  <w:sz w:val="20"/>
+                                  <w:szCs w:val="20"/>
+                                </w:rPr>
+                              </w:pPr>
+                              <w:r>
+                                <w:rPr>
+                                  <w:sz w:val="20"/>
+                                  <w:szCs w:val="20"/>
+                                </w:rPr>
+                                <w:t>Title</w:t>
+                              </w:r>
+                            </w:p>
+                          </w:txbxContent>
+                        </wps:txbx>
+                        <wps:bodyPr rot="0" spcFirstLastPara="0" vertOverflow="overflow" horzOverflow="overflow" vert="horz" wrap="square" lIns="91440" tIns="45720" rIns="91440" bIns="45720" numCol="1" spcCol="0" rtlCol="0" fromWordArt="0" anchor="t" anchorCtr="0" forceAA="0" compatLnSpc="1">
+                          <a:prstTxWarp prst="textNoShape">
+                            <a:avLst/>
+                          </a:prstTxWarp>
+                          <a:noAutofit/>
+                        </wps:bodyPr>
+                      </wps:wsp>
+                      <wps:wsp>
+                        <wps:cNvPr id="1491727382" name="Text Box 1"/>
+                        <wps:cNvSpPr txBox="1"/>
+                        <wps:spPr>
+                          <a:xfrm>
+                            <a:off x="116500" y="2427900"/>
+                            <a:ext cx="1109050" cy="270850"/>
+                          </a:xfrm>
+                          <a:prstGeom prst="rect">
+                            <a:avLst/>
+                          </a:prstGeom>
+                          <a:noFill/>
+                          <a:ln>
+                            <a:noFill/>
+                          </a:ln>
+                        </wps:spPr>
+                        <wps:style>
+                          <a:lnRef idx="0">
+                            <a:scrgbClr r="0" g="0" b="0"/>
+                          </a:lnRef>
+                          <a:fillRef idx="0">
+                            <a:scrgbClr r="0" g="0" b="0"/>
+                          </a:fillRef>
+                          <a:effectRef idx="0">
+                            <a:scrgbClr r="0" g="0" b="0"/>
+                          </a:effectRef>
+                          <a:fontRef idx="minor">
+                            <a:schemeClr val="dk1"/>
+                          </a:fontRef>
+                        </wps:style>
+                        <wps:txbx>
+                          <w:txbxContent>
+                            <w:p>
+                              <w:pPr>
+                                <w:rPr>
+                                  <w:rFonts w:eastAsia="Aptos"/>
+                                  <w:sz w:val="20"/>
+                                  <w:szCs w:val="20"/>
+                                </w:rPr>
+                              </w:pPr>
+                              <w:r>
+                                <w:rPr>
+                                  <w:rFonts w:eastAsia="Aptos"/>
+                                  <w:sz w:val="20"/>
+                                  <w:szCs w:val="20"/>
+                                </w:rPr>
+                                <w:t>Age Rating</w:t>
+                              </w:r>
+                            </w:p>
+                            <w:p>
+                              <w:pPr>
+                                <w:rPr>
+                                  <w:rFonts w:eastAsia="Aptos"/>
+                                  <w:sz w:val="20"/>
+                                  <w:szCs w:val="20"/>
+                                  <w14:ligatures w14:val="none"/>
+                                </w:rPr>
+                              </w:pPr>
+                            </w:p>
+                          </w:txbxContent>
+                        </wps:txbx>
+                        <wps:bodyPr rot="0" spcFirstLastPara="0" vert="horz" wrap="square" lIns="91440" tIns="45720" rIns="91440" bIns="45720" numCol="1" spcCol="0" rtlCol="0" fromWordArt="0" anchor="t" anchorCtr="0" forceAA="0" compatLnSpc="1">
+                          <a:prstTxWarp prst="textNoShape">
+                            <a:avLst/>
+                          </a:prstTxWarp>
+                          <a:noAutofit/>
+                        </wps:bodyPr>
+                      </wps:wsp>
+                      <wps:wsp>
+                        <wps:cNvPr id="1671603429" name="Text Box 1"/>
+                        <wps:cNvSpPr txBox="1"/>
+                        <wps:spPr>
+                          <a:xfrm>
+                            <a:off x="116500" y="2764450"/>
+                            <a:ext cx="797900" cy="241300"/>
+                          </a:xfrm>
+                          <a:prstGeom prst="rect">
+                            <a:avLst/>
+                          </a:prstGeom>
+                          <a:noFill/>
+                          <a:ln>
+                            <a:noFill/>
+                          </a:ln>
+                        </wps:spPr>
+                        <wps:style>
+                          <a:lnRef idx="0">
+                            <a:scrgbClr r="0" g="0" b="0"/>
+                          </a:lnRef>
+                          <a:fillRef idx="0">
+                            <a:scrgbClr r="0" g="0" b="0"/>
+                          </a:fillRef>
+                          <a:effectRef idx="0">
+                            <a:scrgbClr r="0" g="0" b="0"/>
+                          </a:effectRef>
+                          <a:fontRef idx="minor">
+                            <a:schemeClr val="dk1"/>
+                          </a:fontRef>
+                        </wps:style>
+                        <wps:txbx>
+                          <w:txbxContent>
+                            <w:p>
+                              <w:pPr>
+                                <w:rPr>
+                                  <w:rFonts w:eastAsia="Aptos"/>
+                                  <w14:ligatures w14:val="none"/>
+                                </w:rPr>
+                              </w:pPr>
+                              <w:r>
+                                <w:rPr>
+                                  <w:rFonts w:eastAsia="Aptos"/>
+                                  <w:sz w:val="20"/>
+                                  <w:szCs w:val="20"/>
+                                </w:rPr>
+                                <w:t>Duration</w:t>
+                              </w:r>
+                            </w:p>
+                          </w:txbxContent>
+                        </wps:txbx>
+                        <wps:bodyPr rot="0" spcFirstLastPara="0" vert="horz" wrap="square" lIns="91440" tIns="45720" rIns="91440" bIns="45720" numCol="1" spcCol="0" rtlCol="0" fromWordArt="0" anchor="t" anchorCtr="0" forceAA="0" compatLnSpc="1">
+                          <a:prstTxWarp prst="textNoShape">
+                            <a:avLst/>
+                          </a:prstTxWarp>
+                          <a:noAutofit/>
+                        </wps:bodyPr>
+                      </wps:wsp>
+                      <wps:wsp>
+                        <wps:cNvPr id="527430911" name="Text Box 1"/>
+                        <wps:cNvSpPr txBox="1"/>
+                        <wps:spPr>
+                          <a:xfrm>
+                            <a:off x="110150" y="3132750"/>
+                            <a:ext cx="988400" cy="241300"/>
+                          </a:xfrm>
+                          <a:prstGeom prst="rect">
+                            <a:avLst/>
+                          </a:prstGeom>
+                          <a:noFill/>
+                          <a:ln>
+                            <a:noFill/>
+                          </a:ln>
+                        </wps:spPr>
+                        <wps:style>
+                          <a:lnRef idx="0">
+                            <a:scrgbClr r="0" g="0" b="0"/>
+                          </a:lnRef>
+                          <a:fillRef idx="0">
+                            <a:scrgbClr r="0" g="0" b="0"/>
+                          </a:fillRef>
+                          <a:effectRef idx="0">
+                            <a:scrgbClr r="0" g="0" b="0"/>
+                          </a:effectRef>
+                          <a:fontRef idx="minor">
+                            <a:schemeClr val="dk1"/>
+                          </a:fontRef>
+                        </wps:style>
+                        <wps:txbx>
+                          <w:txbxContent>
+                            <w:p>
+                              <w:pPr>
+                                <w:rPr>
+                                  <w:rFonts w:eastAsia="Aptos"/>
+                                  <w:sz w:val="20"/>
+                                  <w:szCs w:val="20"/>
+                                  <w14:ligatures w14:val="none"/>
+                                </w:rPr>
+                              </w:pPr>
+                              <w:r>
+                                <w:rPr>
+                                  <w:rFonts w:eastAsia="Aptos"/>
+                                  <w:sz w:val="20"/>
+                                  <w:szCs w:val="20"/>
+                                </w:rPr>
+                                <w:t>Description</w:t>
+                              </w:r>
+                            </w:p>
+                          </w:txbxContent>
+                        </wps:txbx>
+                        <wps:bodyPr rot="0" spcFirstLastPara="0" vert="horz" wrap="square" lIns="91440" tIns="45720" rIns="91440" bIns="45720" numCol="1" spcCol="0" rtlCol="0" fromWordArt="0" anchor="t" anchorCtr="0" forceAA="0" compatLnSpc="1">
+                          <a:prstTxWarp prst="textNoShape">
+                            <a:avLst/>
+                          </a:prstTxWarp>
+                          <a:noAutofit/>
+                        </wps:bodyPr>
+                      </wps:wsp>
+                      <wps:wsp>
+                        <wps:cNvPr id="925199054" name="Rectangle 925199054"/>
+                        <wps:cNvSpPr/>
+                        <wps:spPr>
+                          <a:xfrm>
+                            <a:off x="884948" y="2203450"/>
+                            <a:ext cx="1630680" cy="123190"/>
+                          </a:xfrm>
+                          <a:prstGeom prst="rect">
+                            <a:avLst/>
+                          </a:prstGeom>
+                        </wps:spPr>
+                        <wps:style>
+                          <a:lnRef idx="2">
+                            <a:schemeClr val="dk1"/>
+                          </a:lnRef>
+                          <a:fillRef idx="1">
+                            <a:schemeClr val="lt1"/>
+                          </a:fillRef>
+                          <a:effectRef idx="0">
+                            <a:schemeClr val="dk1"/>
+                          </a:effectRef>
+                          <a:fontRef idx="minor">
+                            <a:schemeClr val="dk1"/>
+                          </a:fontRef>
+                        </wps:style>
+                        <wps:bodyPr rot="0" spcFirstLastPara="0" vertOverflow="overflow" horzOverflow="overflow" vert="horz" wrap="square" lIns="91440" tIns="45720" rIns="91440" bIns="45720" numCol="1" spcCol="0" rtlCol="0" fromWordArt="0" anchor="ctr" anchorCtr="0" forceAA="0" compatLnSpc="1">
+                          <a:prstTxWarp prst="textNoShape">
+                            <a:avLst/>
+                          </a:prstTxWarp>
+                          <a:noAutofit/>
+                        </wps:bodyPr>
+                      </wps:wsp>
+                      <wps:wsp>
+                        <wps:cNvPr id="1140903702" name="Rectangle 1140903702"/>
+                        <wps:cNvSpPr/>
+                        <wps:spPr>
+                          <a:xfrm>
+                            <a:off x="884948" y="2491400"/>
+                            <a:ext cx="747490" cy="123190"/>
+                          </a:xfrm>
+                          <a:prstGeom prst="rect">
+                            <a:avLst/>
+                          </a:prstGeom>
+                        </wps:spPr>
+                        <wps:style>
+                          <a:lnRef idx="2">
+                            <a:schemeClr val="dk1"/>
+                          </a:lnRef>
+                          <a:fillRef idx="1">
+                            <a:schemeClr val="lt1"/>
+                          </a:fillRef>
+                          <a:effectRef idx="0">
+                            <a:schemeClr val="dk1"/>
+                          </a:effectRef>
+                          <a:fontRef idx="minor">
+                            <a:schemeClr val="dk1"/>
+                          </a:fontRef>
+                        </wps:style>
+                        <wps:bodyPr rot="0" spcFirstLastPara="0" vert="horz" wrap="square" lIns="91440" tIns="45720" rIns="91440" bIns="45720" numCol="1" spcCol="0" rtlCol="0" fromWordArt="0" anchor="ctr" anchorCtr="0" forceAA="0" compatLnSpc="1">
+                          <a:prstTxWarp prst="textNoShape">
+                            <a:avLst/>
+                          </a:prstTxWarp>
+                          <a:noAutofit/>
+                        </wps:bodyPr>
+                      </wps:wsp>
+                      <wps:wsp>
+                        <wps:cNvPr id="1172848525" name="Rectangle 1172848525"/>
+                        <wps:cNvSpPr/>
+                        <wps:spPr>
+                          <a:xfrm>
+                            <a:off x="884948" y="2811440"/>
+                            <a:ext cx="747490" cy="123190"/>
+                          </a:xfrm>
+                          <a:prstGeom prst="rect">
+                            <a:avLst/>
+                          </a:prstGeom>
+                        </wps:spPr>
+                        <wps:style>
+                          <a:lnRef idx="2">
+                            <a:schemeClr val="dk1"/>
+                          </a:lnRef>
+                          <a:fillRef idx="1">
+                            <a:schemeClr val="lt1"/>
+                          </a:fillRef>
+                          <a:effectRef idx="0">
+                            <a:schemeClr val="dk1"/>
+                          </a:effectRef>
+                          <a:fontRef idx="minor">
+                            <a:schemeClr val="dk1"/>
+                          </a:fontRef>
+                        </wps:style>
+                        <wps:bodyPr rot="0" spcFirstLastPara="0" vert="horz" wrap="square" lIns="91440" tIns="45720" rIns="91440" bIns="45720" numCol="1" spcCol="0" rtlCol="0" fromWordArt="0" anchor="ctr" anchorCtr="0" forceAA="0" compatLnSpc="1">
+                          <a:prstTxWarp prst="textNoShape">
+                            <a:avLst/>
+                          </a:prstTxWarp>
+                          <a:noAutofit/>
+                        </wps:bodyPr>
+                      </wps:wsp>
+                      <wps:wsp>
+                        <wps:cNvPr id="876624803" name="Rectangle 876624803"/>
+                        <wps:cNvSpPr/>
+                        <wps:spPr>
+                          <a:xfrm>
+                            <a:off x="891199" y="3187360"/>
+                            <a:ext cx="1835067" cy="470240"/>
+                          </a:xfrm>
+                          <a:prstGeom prst="rect">
+                            <a:avLst/>
+                          </a:prstGeom>
+                        </wps:spPr>
+                        <wps:style>
+                          <a:lnRef idx="2">
+                            <a:schemeClr val="dk1"/>
+                          </a:lnRef>
+                          <a:fillRef idx="1">
+                            <a:schemeClr val="lt1"/>
+                          </a:fillRef>
+                          <a:effectRef idx="0">
+                            <a:schemeClr val="dk1"/>
+                          </a:effectRef>
+                          <a:fontRef idx="minor">
+                            <a:schemeClr val="dk1"/>
+                          </a:fontRef>
+                        </wps:style>
+                        <wps:bodyPr rot="0" spcFirstLastPara="0" vert="horz" wrap="square" lIns="91440" tIns="45720" rIns="91440" bIns="45720" numCol="1" spcCol="0" rtlCol="0" fromWordArt="0" anchor="ctr" anchorCtr="0" forceAA="0" compatLnSpc="1">
+                          <a:prstTxWarp prst="textNoShape">
+                            <a:avLst/>
+                          </a:prstTxWarp>
+                          <a:noAutofit/>
+                        </wps:bodyPr>
+                      </wps:wsp>
+                      <wps:wsp>
+                        <wps:cNvPr id="1524458042" name="Rectangle 1524458042"/>
+                        <wps:cNvSpPr/>
+                        <wps:spPr>
+                          <a:xfrm>
+                            <a:off x="3067050" y="2184400"/>
+                            <a:ext cx="508000" cy="317500"/>
+                          </a:xfrm>
+                          <a:prstGeom prst="rect">
+                            <a:avLst/>
+                          </a:prstGeom>
+                        </wps:spPr>
+                        <wps:style>
+                          <a:lnRef idx="1">
+                            <a:schemeClr val="dk1"/>
+                          </a:lnRef>
+                          <a:fillRef idx="2">
+                            <a:schemeClr val="dk1"/>
+                          </a:fillRef>
+                          <a:effectRef idx="1">
+                            <a:schemeClr val="dk1"/>
+                          </a:effectRef>
+                          <a:fontRef idx="minor">
+                            <a:schemeClr val="dk1"/>
+                          </a:fontRef>
+                        </wps:style>
+                        <wps:txbx>
+                          <w:txbxContent>
+                            <w:p>
+                              <w:pPr>
+                                <w:jc w:val="center"/>
+                                <w:rPr>
+                                  <w:sz w:val="16"/>
+                                  <w:szCs w:val="16"/>
+                                </w:rPr>
+                              </w:pPr>
+                              <w:r>
+                                <w:rPr>
+                                  <w:sz w:val="16"/>
+                                  <w:szCs w:val="16"/>
+                                </w:rPr>
+                                <w:t>Add</w:t>
+                              </w:r>
+                            </w:p>
+                          </w:txbxContent>
+                        </wps:txbx>
+                        <wps:bodyPr rot="0" spcFirstLastPara="0" vertOverflow="overflow" horzOverflow="overflow" vert="horz" wrap="square" lIns="91440" tIns="45720" rIns="91440" bIns="45720" numCol="1" spcCol="0" rtlCol="0" fromWordArt="0" anchor="ctr" anchorCtr="0" forceAA="0" compatLnSpc="1">
+                          <a:prstTxWarp prst="textNoShape">
+                            <a:avLst/>
+                          </a:prstTxWarp>
+                          <a:noAutofit/>
+                        </wps:bodyPr>
+                      </wps:wsp>
+                      <wps:wsp>
+                        <wps:cNvPr id="359030829" name="Rectangle 359030829"/>
+                        <wps:cNvSpPr/>
+                        <wps:spPr>
+                          <a:xfrm>
+                            <a:off x="3761400" y="2184400"/>
+                            <a:ext cx="550250" cy="317500"/>
+                          </a:xfrm>
+                          <a:prstGeom prst="rect">
+                            <a:avLst/>
+                          </a:prstGeom>
+                        </wps:spPr>
+                        <wps:style>
+                          <a:lnRef idx="1">
+                            <a:schemeClr val="dk1"/>
+                          </a:lnRef>
+                          <a:fillRef idx="2">
+                            <a:schemeClr val="dk1"/>
+                          </a:fillRef>
+                          <a:effectRef idx="1">
+                            <a:schemeClr val="dk1"/>
+                          </a:effectRef>
+                          <a:fontRef idx="minor">
+                            <a:schemeClr val="dk1"/>
+                          </a:fontRef>
+                        </wps:style>
+                        <wps:txbx>
+                          <w:txbxContent>
+                            <w:p>
+                              <w:pPr>
+                                <w:jc w:val="center"/>
+                                <w:rPr>
+                                  <w:rFonts w:eastAsia="Aptos"/>
+                                  <w:sz w:val="16"/>
+                                  <w:szCs w:val="16"/>
+                                  <w14:ligatures w14:val="none"/>
+                                </w:rPr>
+                              </w:pPr>
+                              <w:r>
+                                <w:rPr>
+                                  <w:rFonts w:eastAsia="Aptos"/>
+                                  <w:sz w:val="16"/>
+                                  <w:szCs w:val="16"/>
+                                </w:rPr>
+                                <w:t>Update</w:t>
+                              </w:r>
+                            </w:p>
+                          </w:txbxContent>
+                        </wps:txbx>
+                        <wps:bodyPr rot="0" spcFirstLastPara="0" vert="horz" wrap="square" lIns="91440" tIns="45720" rIns="91440" bIns="45720" numCol="1" spcCol="0" rtlCol="0" fromWordArt="0" anchor="ctr" anchorCtr="0" forceAA="0" compatLnSpc="1">
+                          <a:prstTxWarp prst="textNoShape">
+                            <a:avLst/>
+                          </a:prstTxWarp>
+                          <a:noAutofit/>
+                        </wps:bodyPr>
+                      </wps:wsp>
+                      <wps:wsp>
+                        <wps:cNvPr id="649865248" name="Rectangle 649865248"/>
+                        <wps:cNvSpPr/>
+                        <wps:spPr>
+                          <a:xfrm>
+                            <a:off x="3056550" y="2573950"/>
+                            <a:ext cx="549910" cy="317500"/>
+                          </a:xfrm>
+                          <a:prstGeom prst="rect">
+                            <a:avLst/>
+                          </a:prstGeom>
+                        </wps:spPr>
+                        <wps:style>
+                          <a:lnRef idx="1">
+                            <a:schemeClr val="dk1"/>
+                          </a:lnRef>
+                          <a:fillRef idx="2">
+                            <a:schemeClr val="dk1"/>
+                          </a:fillRef>
+                          <a:effectRef idx="1">
+                            <a:schemeClr val="dk1"/>
+                          </a:effectRef>
+                          <a:fontRef idx="minor">
+                            <a:schemeClr val="dk1"/>
+                          </a:fontRef>
+                        </wps:style>
+                        <wps:txbx>
+                          <w:txbxContent>
+                            <w:p>
+                              <w:pPr>
+                                <w:jc w:val="center"/>
+                                <w:rPr>
+                                  <w:rFonts w:eastAsia="Aptos"/>
+                                  <w:sz w:val="16"/>
+                                  <w:szCs w:val="16"/>
+                                  <w14:ligatures w14:val="none"/>
+                                </w:rPr>
+                              </w:pPr>
+                              <w:r>
+                                <w:rPr>
+                                  <w:rFonts w:eastAsia="Aptos"/>
+                                  <w:sz w:val="16"/>
+                                  <w:szCs w:val="16"/>
+                                </w:rPr>
+                                <w:t>Delete</w:t>
+                              </w:r>
+                            </w:p>
+                          </w:txbxContent>
+                        </wps:txbx>
+                        <wps:bodyPr rot="0" spcFirstLastPara="0" vert="horz" wrap="square" lIns="91440" tIns="45720" rIns="91440" bIns="45720" numCol="1" spcCol="0" rtlCol="0" fromWordArt="0" anchor="ctr" anchorCtr="0" forceAA="0" compatLnSpc="1">
+                          <a:prstTxWarp prst="textNoShape">
+                            <a:avLst/>
+                          </a:prstTxWarp>
+                          <a:noAutofit/>
+                        </wps:bodyPr>
+                      </wps:wsp>
+                      <wps:wsp>
+                        <wps:cNvPr id="63755391" name="Rectangle 63755391"/>
+                        <wps:cNvSpPr/>
+                        <wps:spPr>
+                          <a:xfrm>
+                            <a:off x="3755050" y="2580300"/>
+                            <a:ext cx="549910" cy="317500"/>
+                          </a:xfrm>
+                          <a:prstGeom prst="rect">
+                            <a:avLst/>
+                          </a:prstGeom>
+                        </wps:spPr>
+                        <wps:style>
+                          <a:lnRef idx="1">
+                            <a:schemeClr val="dk1"/>
+                          </a:lnRef>
+                          <a:fillRef idx="2">
+                            <a:schemeClr val="dk1"/>
+                          </a:fillRef>
+                          <a:effectRef idx="1">
+                            <a:schemeClr val="dk1"/>
+                          </a:effectRef>
+                          <a:fontRef idx="minor">
+                            <a:schemeClr val="dk1"/>
+                          </a:fontRef>
+                        </wps:style>
+                        <wps:txbx>
+                          <w:txbxContent>
+                            <w:p>
+                              <w:pPr>
+                                <w:jc w:val="center"/>
+                                <w:rPr>
+                                  <w:rFonts w:eastAsia="Aptos"/>
+                                  <w:sz w:val="16"/>
+                                  <w:szCs w:val="16"/>
+                                  <w14:ligatures w14:val="none"/>
+                                </w:rPr>
+                              </w:pPr>
+                              <w:r>
+                                <w:rPr>
+                                  <w:rFonts w:eastAsia="Aptos"/>
+                                  <w:sz w:val="16"/>
+                                  <w:szCs w:val="16"/>
+                                </w:rPr>
+                                <w:t>Clear</w:t>
+                              </w:r>
+                            </w:p>
+                          </w:txbxContent>
+                        </wps:txbx>
+                        <wps:bodyPr rot="0" spcFirstLastPara="0" vert="horz" wrap="square" lIns="91440" tIns="45720" rIns="91440" bIns="45720" numCol="1" spcCol="0" rtlCol="0" fromWordArt="0" anchor="ctr" anchorCtr="0" forceAA="0" compatLnSpc="1">
+                          <a:prstTxWarp prst="textNoShape">
+                            <a:avLst/>
+                          </a:prstTxWarp>
+                          <a:noAutofit/>
+                        </wps:bodyPr>
+                      </wps:wsp>
+                      <wps:wsp>
+                        <wps:cNvPr id="463096482" name="Text Box 1"/>
+                        <wps:cNvSpPr txBox="1"/>
+                        <wps:spPr>
+                          <a:xfrm>
+                            <a:off x="3056550" y="3397333"/>
+                            <a:ext cx="2233930" cy="236220"/>
+                          </a:xfrm>
+                          <a:prstGeom prst="rect">
+                            <a:avLst/>
+                          </a:prstGeom>
+                          <a:noFill/>
+                          <a:ln>
+                            <a:noFill/>
+                          </a:ln>
+                        </wps:spPr>
+                        <wps:style>
+                          <a:lnRef idx="0">
+                            <a:scrgbClr r="0" g="0" b="0"/>
+                          </a:lnRef>
+                          <a:fillRef idx="0">
+                            <a:scrgbClr r="0" g="0" b="0"/>
+                          </a:fillRef>
+                          <a:effectRef idx="0">
+                            <a:scrgbClr r="0" g="0" b="0"/>
+                          </a:effectRef>
+                          <a:fontRef idx="minor">
+                            <a:schemeClr val="dk1"/>
+                          </a:fontRef>
+                        </wps:style>
+                        <wps:txbx>
+                          <w:txbxContent>
+                            <w:p>
+                              <w:pPr>
+                                <w:rPr>
+                                  <w:rFonts w:eastAsia="Aptos"/>
+                                  <w:color w:val="808080"/>
+                                  <w:sz w:val="20"/>
+                                  <w:szCs w:val="20"/>
+                                  <w14:ligatures w14:val="none"/>
+                                </w:rPr>
+                              </w:pPr>
+                              <w:proofErr w:type="spellStart"/>
+                              <w:r>
+                                <w:rPr>
+                                  <w:rFonts w:eastAsia="Aptos"/>
+                                  <w:color w:val="808080"/>
+                                  <w:sz w:val="20"/>
+                                  <w:szCs w:val="20"/>
+                                </w:rPr>
+                                <w:t>Filmtopia</w:t>
+                              </w:r>
+                              <w:proofErr w:type="spellEnd"/>
+                              <w:r>
+                                <w:rPr>
+                                  <w:rFonts w:eastAsia="Aptos"/>
+                                  <w:color w:val="808080"/>
+                                  <w:sz w:val="20"/>
+                                  <w:szCs w:val="20"/>
+                                </w:rPr>
+                                <w:t xml:space="preserve"> Management System v1.0.2</w:t>
+                              </w:r>
+                            </w:p>
+                          </w:txbxContent>
+                        </wps:txbx>
+                        <wps:bodyPr rot="0" spcFirstLastPara="0" vert="horz" wrap="none" lIns="91440" tIns="45720" rIns="91440" bIns="45720" numCol="1" spcCol="0" rtlCol="0" fromWordArt="0" anchor="t" anchorCtr="0" forceAA="0" compatLnSpc="1">
+                          <a:prstTxWarp prst="textNoShape">
+                            <a:avLst/>
+                          </a:prstTxWarp>
+                          <a:noAutofit/>
+                        </wps:bodyPr>
+                      </wps:wsp>
                     </wpc:wpc>
                   </a:graphicData>
                 </a:graphic>
@@ -3328,10 +4162,300 @@
           </mc:Choice>
           <mc:Fallback>
             <w:pict>
-              <v:group w14:anchorId="0F347F99" id="Canvas 6" o:spid="_x0000_s1026" editas="canvas" style="width:6in;height:252pt;mso-position-horizontal-relative:char;mso-position-vertical-relative:line" coordsize="54864,32004" o:gfxdata="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">
-                <v:shape id="_x0000_s1027" type="#_x0000_t75" style="position:absolute;width:54864;height:32004;visibility:visible;mso-wrap-style:square" filled="t">
+              <v:group w14:anchorId="15269588" id="Canvas 6" o:spid="_x0000_s1054" editas="canvas" style="width:6in;height:298.5pt;mso-position-horizontal-relative:char;mso-position-vertical-relative:line" coordsize="54864,37909" o:gfxdata="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">
+                <v:shape id="_x0000_s1055" type="#_x0000_t75" style="position:absolute;width:54864;height:37909;visibility:visible;mso-wrap-style:square" filled="t">
                   <v:fill o:detectmouseclick="t"/>
                   <v:path o:connecttype="none"/>
+                </v:shape>
+                <v:rect id="Rectangle 2141474156" o:spid="_x0000_s1056" style="position:absolute;left:825;top:635;width:53150;height:16446;visibility:visible;mso-wrap-style:square;v-text-anchor:middle" o:gfxdata="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" fillcolor="#555 [2160]" strokecolor="black [3200]" strokeweight=".5pt">
+                  <v:fill color2="#313131 [2608]" rotate="t" colors="0 #9b9b9b;.5 #8e8e8e;1 #797979" focus="100%" type="gradient">
+                    <o:fill v:ext="view" type="gradientUnscaled"/>
+                  </v:fill>
+                  <v:textbox>
+                    <w:txbxContent>
+                      <w:p>
+                        <w:pPr>
+                          <w:rPr>
+                            <w:b/>
+                            <w:bCs/>
+                          </w:rPr>
+                        </w:pPr>
+                        <w:r>
+                          <w:tab/>
+                        </w:r>
+                        <w:r>
+                          <w:tab/>
+                        </w:r>
+                        <w:r>
+                          <w:tab/>
+                        </w:r>
+                        <w:r>
+                          <w:rPr>
+                            <w:b/>
+                            <w:bCs/>
+                          </w:rPr>
+                          <w:t>[Data grid view box with current films</w:t>
+                        </w:r>
+                        <w:r>
+                          <w:rPr>
+                            <w:b/>
+                            <w:bCs/>
+                          </w:rPr>
+                          <w:t>]</w:t>
+                        </w:r>
+                      </w:p>
+                    </w:txbxContent>
+                  </v:textbox>
+                </v:rect>
+                <v:shape id="Text Box 1702352441" o:spid="_x0000_s1057" type="#_x0000_t202" style="position:absolute;left:1270;top:21399;width:7429;height:2413;visibility:visible;mso-wrap-style:square;v-text-anchor:top" o:gfxdata="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" filled="f" stroked="f">
+                  <v:textbox>
+                    <w:txbxContent>
+                      <w:p>
+                        <w:pPr>
+                          <w:rPr>
+                            <w:sz w:val="20"/>
+                            <w:szCs w:val="20"/>
+                          </w:rPr>
+                        </w:pPr>
+                        <w:r>
+                          <w:rPr>
+                            <w:sz w:val="20"/>
+                            <w:szCs w:val="20"/>
+                          </w:rPr>
+                          <w:t>Title</w:t>
+                        </w:r>
+                      </w:p>
+                    </w:txbxContent>
+                  </v:textbox>
+                </v:shape>
+                <v:shape id="Text Box 1" o:spid="_x0000_s1058" type="#_x0000_t202" style="position:absolute;left:1165;top:24279;width:11090;height:2708;visibility:visible;mso-wrap-style:square;v-text-anchor:top" o:gfxdata="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" filled="f" stroked="f">
+                  <v:textbox>
+                    <w:txbxContent>
+                      <w:p>
+                        <w:pPr>
+                          <w:rPr>
+                            <w:rFonts w:eastAsia="Aptos"/>
+                            <w:sz w:val="20"/>
+                            <w:szCs w:val="20"/>
+                          </w:rPr>
+                        </w:pPr>
+                        <w:r>
+                          <w:rPr>
+                            <w:rFonts w:eastAsia="Aptos"/>
+                            <w:sz w:val="20"/>
+                            <w:szCs w:val="20"/>
+                          </w:rPr>
+                          <w:t>Age Rating</w:t>
+                        </w:r>
+                      </w:p>
+                      <w:p>
+                        <w:pPr>
+                          <w:rPr>
+                            <w:rFonts w:eastAsia="Aptos"/>
+                            <w:sz w:val="20"/>
+                            <w:szCs w:val="20"/>
+                            <w14:ligatures w14:val="none"/>
+                          </w:rPr>
+                        </w:pPr>
+                      </w:p>
+                    </w:txbxContent>
+                  </v:textbox>
+                </v:shape>
+                <v:shape id="Text Box 1" o:spid="_x0000_s1059" type="#_x0000_t202" style="position:absolute;left:1165;top:27644;width:7979;height:2413;visibility:visible;mso-wrap-style:square;v-text-anchor:top" o:gfxdata="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" filled="f" stroked="f">
+                  <v:textbox>
+                    <w:txbxContent>
+                      <w:p>
+                        <w:pPr>
+                          <w:rPr>
+                            <w:rFonts w:eastAsia="Aptos"/>
+                            <w14:ligatures w14:val="none"/>
+                          </w:rPr>
+                        </w:pPr>
+                        <w:r>
+                          <w:rPr>
+                            <w:rFonts w:eastAsia="Aptos"/>
+                            <w:sz w:val="20"/>
+                            <w:szCs w:val="20"/>
+                          </w:rPr>
+                          <w:t>Duration</w:t>
+                        </w:r>
+                      </w:p>
+                    </w:txbxContent>
+                  </v:textbox>
+                </v:shape>
+                <v:shape id="Text Box 1" o:spid="_x0000_s1060" type="#_x0000_t202" style="position:absolute;left:1101;top:31327;width:9884;height:2413;visibility:visible;mso-wrap-style:square;v-text-anchor:top" o:gfxdata="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" filled="f" stroked="f">
+                  <v:textbox>
+                    <w:txbxContent>
+                      <w:p>
+                        <w:pPr>
+                          <w:rPr>
+                            <w:rFonts w:eastAsia="Aptos"/>
+                            <w:sz w:val="20"/>
+                            <w:szCs w:val="20"/>
+                            <w14:ligatures w14:val="none"/>
+                          </w:rPr>
+                        </w:pPr>
+                        <w:r>
+                          <w:rPr>
+                            <w:rFonts w:eastAsia="Aptos"/>
+                            <w:sz w:val="20"/>
+                            <w:szCs w:val="20"/>
+                          </w:rPr>
+                          <w:t>Description</w:t>
+                        </w:r>
+                      </w:p>
+                    </w:txbxContent>
+                  </v:textbox>
+                </v:shape>
+                <v:rect id="Rectangle 925199054" o:spid="_x0000_s1061" style="position:absolute;left:8849;top:22034;width:16307;height:1232;visibility:visible;mso-wrap-style:square;v-text-anchor:middle" o:gfxdata="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" fillcolor="white [3201]" strokecolor="black [3200]" strokeweight="1pt"/>
+                <v:rect id="Rectangle 1140903702" o:spid="_x0000_s1062" style="position:absolute;left:8849;top:24914;width:7475;height:1231;visibility:visible;mso-wrap-style:square;v-text-anchor:middle" o:gfxdata="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" fillcolor="white [3201]" strokecolor="black [3200]" strokeweight="1pt"/>
+                <v:rect id="Rectangle 1172848525" o:spid="_x0000_s1063" style="position:absolute;left:8849;top:28114;width:7475;height:1232;visibility:visible;mso-wrap-style:square;v-text-anchor:middle" o:gfxdata="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" fillcolor="white [3201]" strokecolor="black [3200]" strokeweight="1pt"/>
+                <v:rect id="Rectangle 876624803" o:spid="_x0000_s1064" style="position:absolute;left:8911;top:31873;width:18351;height:4703;visibility:visible;mso-wrap-style:square;v-text-anchor:middle" o:gfxdata="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" fillcolor="white [3201]" strokecolor="black [3200]" strokeweight="1pt"/>
+                <v:rect id="Rectangle 1524458042" o:spid="_x0000_s1065" style="position:absolute;left:30670;top:21844;width:5080;height:3175;visibility:visible;mso-wrap-style:square;v-text-anchor:middle" o:gfxdata="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" fillcolor="#555 [2160]" strokecolor="black [3200]" strokeweight=".5pt">
+                  <v:fill color2="#313131 [2608]" rotate="t" colors="0 #9b9b9b;.5 #8e8e8e;1 #797979" focus="100%" type="gradient">
+                    <o:fill v:ext="view" type="gradientUnscaled"/>
+                  </v:fill>
+                  <v:textbox>
+                    <w:txbxContent>
+                      <w:p>
+                        <w:pPr>
+                          <w:jc w:val="center"/>
+                          <w:rPr>
+                            <w:sz w:val="16"/>
+                            <w:szCs w:val="16"/>
+                          </w:rPr>
+                        </w:pPr>
+                        <w:r>
+                          <w:rPr>
+                            <w:sz w:val="16"/>
+                            <w:szCs w:val="16"/>
+                          </w:rPr>
+                          <w:t>Add</w:t>
+                        </w:r>
+                      </w:p>
+                    </w:txbxContent>
+                  </v:textbox>
+                </v:rect>
+                <v:rect id="Rectangle 359030829" o:spid="_x0000_s1066" style="position:absolute;left:37614;top:21844;width:5502;height:3175;visibility:visible;mso-wrap-style:square;v-text-anchor:middle" o:gfxdata="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" fillcolor="#555 [2160]" strokecolor="black [3200]" strokeweight=".5pt">
+                  <v:fill color2="#313131 [2608]" rotate="t" colors="0 #9b9b9b;.5 #8e8e8e;1 #797979" focus="100%" type="gradient">
+                    <o:fill v:ext="view" type="gradientUnscaled"/>
+                  </v:fill>
+                  <v:textbox>
+                    <w:txbxContent>
+                      <w:p>
+                        <w:pPr>
+                          <w:jc w:val="center"/>
+                          <w:rPr>
+                            <w:rFonts w:eastAsia="Aptos"/>
+                            <w:sz w:val="16"/>
+                            <w:szCs w:val="16"/>
+                            <w14:ligatures w14:val="none"/>
+                          </w:rPr>
+                        </w:pPr>
+                        <w:r>
+                          <w:rPr>
+                            <w:rFonts w:eastAsia="Aptos"/>
+                            <w:sz w:val="16"/>
+                            <w:szCs w:val="16"/>
+                          </w:rPr>
+                          <w:t>Update</w:t>
+                        </w:r>
+                      </w:p>
+                    </w:txbxContent>
+                  </v:textbox>
+                </v:rect>
+                <v:rect id="Rectangle 649865248" o:spid="_x0000_s1067" style="position:absolute;left:30565;top:25739;width:5499;height:3175;visibility:visible;mso-wrap-style:square;v-text-anchor:middle" o:gfxdata="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" fillcolor="#555 [2160]" strokecolor="black [3200]" strokeweight=".5pt">
+                  <v:fill color2="#313131 [2608]" rotate="t" colors="0 #9b9b9b;.5 #8e8e8e;1 #797979" focus="100%" type="gradient">
+                    <o:fill v:ext="view" type="gradientUnscaled"/>
+                  </v:fill>
+                  <v:textbox>
+                    <w:txbxContent>
+                      <w:p>
+                        <w:pPr>
+                          <w:jc w:val="center"/>
+                          <w:rPr>
+                            <w:rFonts w:eastAsia="Aptos"/>
+                            <w:sz w:val="16"/>
+                            <w:szCs w:val="16"/>
+                            <w14:ligatures w14:val="none"/>
+                          </w:rPr>
+                        </w:pPr>
+                        <w:r>
+                          <w:rPr>
+                            <w:rFonts w:eastAsia="Aptos"/>
+       